<commit_message>
Update PROGRESS.md, FEATURES.docx, and generate-docs.js for Session 2
- PROGRESS.md: Full rewrite to reflect all screens built in Session 2
- scripts/generate-docs.js: Added sections 3.10–3.21, updated roadmap (Done status),
  added Session 2 changelog entry, expanded directory structure
- FEATURES.docx: Regenerated with all updated content
</commit_message>
<xml_diff>
--- a/FEATURES.docx
+++ b/FEATURES.docx
@@ -45,7 +45,7 @@
           <w:sz w:val="20"/>
           <w:szCs w:val="20"/>
         </w:rPr>
-        <w:t xml:space="preserve">Generated: 2026-05-12</w:t>
+        <w:t xml:space="preserve">Generated: 2026-05-15</w:t>
       </w:r>
     </w:p>
     <w:p>
@@ -1569,7 +1569,7 @@
           <w:bCs/>
           <w:color w:val="1D2D3E"/>
         </w:rPr>
-        <w:t xml:space="preserve">3. Implemented Features (Session 1)</w:t>
+        <w:t xml:space="preserve">3. Implemented Features (Sessions 1–2)</w:t>
       </w:r>
     </w:p>
     <w:p>
@@ -2412,6 +2412,1135 @@
           <w:szCs w:val="22"/>
         </w:rPr>
         <w:t xml:space="preserve">SectionHeader — section title with optional right-side meta text</w:t>
+      </w:r>
+    </w:p>
+    <w:p>
+      <w:pPr>
+        <w:spacing w:after="80"/>
+      </w:pPr>
+      <w:r>
+        <w:rPr>
+          <w:color w:val="1D2D3E"/>
+          <w:sz w:val="22"/>
+          <w:szCs w:val="22"/>
+        </w:rPr>
+        <w:t xml:space="preserve"/>
+      </w:r>
+    </w:p>
+    <w:p>
+      <w:pPr>
+        <w:pStyle w:val="Heading2"/>
+        <w:spacing w:after="120" w:before="300"/>
+      </w:pPr>
+      <w:r>
+        <w:rPr>
+          <w:b/>
+          <w:bCs/>
+          <w:color w:val="1D2D3E"/>
+        </w:rPr>
+        <w:t xml:space="preserve">3.10 Inventory Screen (src/screens/inventory/InventoryScreen.tsx)</w:t>
+      </w:r>
+    </w:p>
+    <w:p>
+      <w:pPr>
+        <w:pStyle w:val="ListParagraph"/>
+        <w:numPr>
+          <w:ilvl w:val="0"/>
+          <w:numId w:val="1"/>
+        </w:numPr>
+        <w:spacing w:after="40"/>
+      </w:pPr>
+      <w:r>
+        <w:rPr>
+          <w:color w:val="1D2D3E"/>
+          <w:sz w:val="22"/>
+          <w:szCs w:val="22"/>
+        </w:rPr>
+        <w:t xml:space="preserve">Internal tab view: Stock Balances and Stock Ledger</w:t>
+      </w:r>
+    </w:p>
+    <w:p>
+      <w:pPr>
+        <w:pStyle w:val="ListParagraph"/>
+        <w:numPr>
+          <w:ilvl w:val="0"/>
+          <w:numId w:val="1"/>
+        </w:numPr>
+        <w:spacing w:after="40"/>
+      </w:pPr>
+      <w:r>
+        <w:rPr>
+          <w:color w:val="1D2D3E"/>
+          <w:sz w:val="22"/>
+          <w:szCs w:val="22"/>
+        </w:rPr>
+        <w:t xml:space="preserve">Stock Balances: item/warehouse/qty cards with color-coded quantity levels</w:t>
+      </w:r>
+    </w:p>
+    <w:p>
+      <w:pPr>
+        <w:pStyle w:val="ListParagraph"/>
+        <w:numPr>
+          <w:ilvl w:val="0"/>
+          <w:numId w:val="1"/>
+        </w:numPr>
+        <w:spacing w:after="40"/>
+      </w:pPr>
+      <w:r>
+        <w:rPr>
+          <w:color w:val="1D2D3E"/>
+          <w:sz w:val="22"/>
+          <w:szCs w:val="22"/>
+        </w:rPr>
+        <w:t xml:space="preserve">Stock Ledger: movement log with IN/OUT/balance amounts and voucher type badges</w:t>
+      </w:r>
+    </w:p>
+    <w:p>
+      <w:pPr>
+        <w:pStyle w:val="ListParagraph"/>
+        <w:numPr>
+          <w:ilvl w:val="0"/>
+          <w:numId w:val="1"/>
+        </w:numPr>
+        <w:spacing w:after="40"/>
+      </w:pPr>
+      <w:r>
+        <w:rPr>
+          <w:color w:val="1D2D3E"/>
+          <w:sz w:val="22"/>
+          <w:szCs w:val="22"/>
+        </w:rPr>
+        <w:t xml:space="preserve">Search filter across both tabs (item name, warehouse)</w:t>
+      </w:r>
+    </w:p>
+    <w:p>
+      <w:pPr>
+        <w:pStyle w:val="ListParagraph"/>
+        <w:numPr>
+          <w:ilvl w:val="0"/>
+          <w:numId w:val="1"/>
+        </w:numPr>
+        <w:spacing w:after="40"/>
+      </w:pPr>
+      <w:r>
+        <w:rPr>
+          <w:color w:val="1D2D3E"/>
+          <w:sz w:val="22"/>
+          <w:szCs w:val="22"/>
+        </w:rPr>
+        <w:t xml:space="preserve">Pull-to-refresh, loading and empty states</w:t>
+      </w:r>
+    </w:p>
+    <w:p>
+      <w:pPr>
+        <w:spacing w:after="80"/>
+      </w:pPr>
+      <w:r>
+        <w:rPr>
+          <w:color w:val="1D2D3E"/>
+          <w:sz w:val="22"/>
+          <w:szCs w:val="22"/>
+        </w:rPr>
+        <w:t xml:space="preserve"/>
+      </w:r>
+    </w:p>
+    <w:p>
+      <w:pPr>
+        <w:pStyle w:val="Heading2"/>
+        <w:spacing w:after="120" w:before="300"/>
+      </w:pPr>
+      <w:r>
+        <w:rPr>
+          <w:b/>
+          <w:bCs/>
+          <w:color w:val="1D2D3E"/>
+        </w:rPr>
+        <w:t xml:space="preserve">3.11 Materials Screen (src/screens/materials/MaterialsScreen.tsx)</w:t>
+      </w:r>
+    </w:p>
+    <w:p>
+      <w:pPr>
+        <w:pStyle w:val="ListParagraph"/>
+        <w:numPr>
+          <w:ilvl w:val="0"/>
+          <w:numId w:val="1"/>
+        </w:numPr>
+        <w:spacing w:after="40"/>
+      </w:pPr>
+      <w:r>
+        <w:rPr>
+          <w:color w:val="1D2D3E"/>
+          <w:sz w:val="22"/>
+          <w:szCs w:val="22"/>
+        </w:rPr>
+        <w:t xml:space="preserve">Searchable list by name, code, type, category</w:t>
+      </w:r>
+    </w:p>
+    <w:p>
+      <w:pPr>
+        <w:pStyle w:val="ListParagraph"/>
+        <w:numPr>
+          <w:ilvl w:val="0"/>
+          <w:numId w:val="1"/>
+        </w:numPr>
+        <w:spacing w:after="40"/>
+      </w:pPr>
+      <w:r>
+        <w:rPr>
+          <w:color w:val="1D2D3E"/>
+          <w:sz w:val="22"/>
+          <w:szCs w:val="22"/>
+        </w:rPr>
+        <w:t xml:space="preserve">Horizontal type filter chips fetched from /api/mobile/materials?view=types</w:t>
+      </w:r>
+    </w:p>
+    <w:p>
+      <w:pPr>
+        <w:pStyle w:val="ListParagraph"/>
+        <w:numPr>
+          <w:ilvl w:val="0"/>
+          <w:numId w:val="1"/>
+        </w:numPr>
+        <w:spacing w:after="40"/>
+      </w:pPr>
+      <w:r>
+        <w:rPr>
+          <w:color w:val="1D2D3E"/>
+          <w:sz w:val="22"/>
+          <w:szCs w:val="22"/>
+        </w:rPr>
+        <w:t xml:space="preserve">Material cards: name, code, type badge, status badge (Active/Inactive), unit chip</w:t>
+      </w:r>
+    </w:p>
+    <w:p>
+      <w:pPr>
+        <w:spacing w:after="80"/>
+      </w:pPr>
+      <w:r>
+        <w:rPr>
+          <w:color w:val="1D2D3E"/>
+          <w:sz w:val="22"/>
+          <w:szCs w:val="22"/>
+        </w:rPr>
+        <w:t xml:space="preserve"/>
+      </w:r>
+    </w:p>
+    <w:p>
+      <w:pPr>
+        <w:pStyle w:val="Heading2"/>
+        <w:spacing w:after="120" w:before="300"/>
+      </w:pPr>
+      <w:r>
+        <w:rPr>
+          <w:b/>
+          <w:bCs/>
+          <w:color w:val="1D2D3E"/>
+        </w:rPr>
+        <w:t xml:space="preserve">3.12 Purchase Orders Screen (src/screens/purchaseOrders/)</w:t>
+      </w:r>
+    </w:p>
+    <w:p>
+      <w:pPr>
+        <w:pStyle w:val="ListParagraph"/>
+        <w:numPr>
+          <w:ilvl w:val="0"/>
+          <w:numId w:val="1"/>
+        </w:numPr>
+        <w:spacing w:after="40"/>
+      </w:pPr>
+      <w:r>
+        <w:rPr>
+          <w:color w:val="1D2D3E"/>
+          <w:sz w:val="22"/>
+          <w:szCs w:val="22"/>
+        </w:rPr>
+        <w:t xml:space="preserve">Three status tabs: All / Open / In Progress</w:t>
+      </w:r>
+    </w:p>
+    <w:p>
+      <w:pPr>
+        <w:pStyle w:val="ListParagraph"/>
+        <w:numPr>
+          <w:ilvl w:val="0"/>
+          <w:numId w:val="1"/>
+        </w:numPr>
+        <w:spacing w:after="40"/>
+      </w:pPr>
+      <w:r>
+        <w:rPr>
+          <w:color w:val="1D2D3E"/>
+          <w:sz w:val="22"/>
+          <w:szCs w:val="22"/>
+        </w:rPr>
+        <w:t xml:space="preserve">PO cards with: PO number, vendor, date, status badge, total amount, progress bar</w:t>
+      </w:r>
+    </w:p>
+    <w:p>
+      <w:pPr>
+        <w:pStyle w:val="ListParagraph"/>
+        <w:numPr>
+          <w:ilvl w:val="0"/>
+          <w:numId w:val="1"/>
+        </w:numPr>
+        <w:spacing w:after="40"/>
+      </w:pPr>
+      <w:r>
+        <w:rPr>
+          <w:color w:val="1D2D3E"/>
+          <w:sz w:val="22"/>
+          <w:szCs w:val="22"/>
+        </w:rPr>
+        <w:t xml:space="preserve">Detail screen: PO header, receipt progress bar, line items with qty ordered/received/pending</w:t>
+      </w:r>
+    </w:p>
+    <w:p>
+      <w:pPr>
+        <w:spacing w:after="80"/>
+      </w:pPr>
+      <w:r>
+        <w:rPr>
+          <w:color w:val="1D2D3E"/>
+          <w:sz w:val="22"/>
+          <w:szCs w:val="22"/>
+        </w:rPr>
+        <w:t xml:space="preserve"/>
+      </w:r>
+    </w:p>
+    <w:p>
+      <w:pPr>
+        <w:pStyle w:val="Heading2"/>
+        <w:spacing w:after="120" w:before="300"/>
+      </w:pPr>
+      <w:r>
+        <w:rPr>
+          <w:b/>
+          <w:bCs/>
+          <w:color w:val="1D2D3E"/>
+        </w:rPr>
+        <w:t xml:space="preserve">3.13 Sales Orders Screen (src/screens/salesOrders/)</w:t>
+      </w:r>
+    </w:p>
+    <w:p>
+      <w:pPr>
+        <w:pStyle w:val="ListParagraph"/>
+        <w:numPr>
+          <w:ilvl w:val="0"/>
+          <w:numId w:val="1"/>
+        </w:numPr>
+        <w:spacing w:after="40"/>
+      </w:pPr>
+      <w:r>
+        <w:rPr>
+          <w:color w:val="1D2D3E"/>
+          <w:sz w:val="22"/>
+          <w:szCs w:val="22"/>
+        </w:rPr>
+        <w:t xml:space="preserve">Four status tabs: All / Open / Approved / Closed</w:t>
+      </w:r>
+    </w:p>
+    <w:p>
+      <w:pPr>
+        <w:pStyle w:val="ListParagraph"/>
+        <w:numPr>
+          <w:ilvl w:val="0"/>
+          <w:numId w:val="1"/>
+        </w:numPr>
+        <w:spacing w:after="40"/>
+      </w:pPr>
+      <w:r>
+        <w:rPr>
+          <w:color w:val="1D2D3E"/>
+          <w:sz w:val="22"/>
+          <w:szCs w:val="22"/>
+        </w:rPr>
+        <w:t xml:space="preserve">SO cards with: SO number, customer, date, status badge, total amount</w:t>
+      </w:r>
+    </w:p>
+    <w:p>
+      <w:pPr>
+        <w:pStyle w:val="ListParagraph"/>
+        <w:numPr>
+          <w:ilvl w:val="0"/>
+          <w:numId w:val="1"/>
+        </w:numPr>
+        <w:spacing w:after="40"/>
+      </w:pPr>
+      <w:r>
+        <w:rPr>
+          <w:color w:val="1D2D3E"/>
+          <w:sz w:val="22"/>
+          <w:szCs w:val="22"/>
+        </w:rPr>
+        <w:t xml:space="preserve">Detail screen: SO header, line items list, total row</w:t>
+      </w:r>
+    </w:p>
+    <w:p>
+      <w:pPr>
+        <w:spacing w:after="80"/>
+      </w:pPr>
+      <w:r>
+        <w:rPr>
+          <w:color w:val="1D2D3E"/>
+          <w:sz w:val="22"/>
+          <w:szCs w:val="22"/>
+        </w:rPr>
+        <w:t xml:space="preserve"/>
+      </w:r>
+    </w:p>
+    <w:p>
+      <w:pPr>
+        <w:pStyle w:val="Heading2"/>
+        <w:spacing w:after="120" w:before="300"/>
+      </w:pPr>
+      <w:r>
+        <w:rPr>
+          <w:b/>
+          <w:bCs/>
+          <w:color w:val="1D2D3E"/>
+        </w:rPr>
+        <w:t xml:space="preserve">3.14 GRN Screen (src/screens/grn/GRNScreen.tsx)</w:t>
+      </w:r>
+    </w:p>
+    <w:p>
+      <w:pPr>
+        <w:pStyle w:val="ListParagraph"/>
+        <w:numPr>
+          <w:ilvl w:val="0"/>
+          <w:numId w:val="1"/>
+        </w:numPr>
+        <w:spacing w:after="40"/>
+      </w:pPr>
+      <w:r>
+        <w:rPr>
+          <w:color w:val="1D2D3E"/>
+          <w:sz w:val="22"/>
+          <w:szCs w:val="22"/>
+        </w:rPr>
+        <w:t xml:space="preserve">Goods receipt progress view per purchase order</w:t>
+      </w:r>
+    </w:p>
+    <w:p>
+      <w:pPr>
+        <w:pStyle w:val="ListParagraph"/>
+        <w:numPr>
+          <w:ilvl w:val="0"/>
+          <w:numId w:val="1"/>
+        </w:numPr>
+        <w:spacing w:after="40"/>
+      </w:pPr>
+      <w:r>
+        <w:rPr>
+          <w:color w:val="1D2D3E"/>
+          <w:sz w:val="22"/>
+          <w:szCs w:val="22"/>
+        </w:rPr>
+        <w:t xml:space="preserve">Overall summary card: PO count, overall % received, progress bar</w:t>
+      </w:r>
+    </w:p>
+    <w:p>
+      <w:pPr>
+        <w:pStyle w:val="ListParagraph"/>
+        <w:numPr>
+          <w:ilvl w:val="0"/>
+          <w:numId w:val="1"/>
+        </w:numPr>
+        <w:spacing w:after="40"/>
+      </w:pPr>
+      <w:r>
+        <w:rPr>
+          <w:color w:val="1D2D3E"/>
+          <w:sz w:val="22"/>
+          <w:szCs w:val="22"/>
+        </w:rPr>
+        <w:t xml:space="preserve">Per-PO cards: receipt progress, optional line item preview</w:t>
+      </w:r>
+    </w:p>
+    <w:p>
+      <w:pPr>
+        <w:spacing w:after="80"/>
+      </w:pPr>
+      <w:r>
+        <w:rPr>
+          <w:color w:val="1D2D3E"/>
+          <w:sz w:val="22"/>
+          <w:szCs w:val="22"/>
+        </w:rPr>
+        <w:t xml:space="preserve"/>
+      </w:r>
+    </w:p>
+    <w:p>
+      <w:pPr>
+        <w:pStyle w:val="Heading2"/>
+        <w:spacing w:after="120" w:before="300"/>
+      </w:pPr>
+      <w:r>
+        <w:rPr>
+          <w:b/>
+          <w:bCs/>
+          <w:color w:val="1D2D3E"/>
+        </w:rPr>
+        <w:t xml:space="preserve">3.15 Accounts Payable Screen (src/screens/finance/AccountsPayableScreen.tsx)</w:t>
+      </w:r>
+    </w:p>
+    <w:p>
+      <w:pPr>
+        <w:pStyle w:val="ListParagraph"/>
+        <w:numPr>
+          <w:ilvl w:val="0"/>
+          <w:numId w:val="1"/>
+        </w:numPr>
+        <w:spacing w:after="40"/>
+      </w:pPr>
+      <w:r>
+        <w:rPr>
+          <w:color w:val="1D2D3E"/>
+          <w:sz w:val="22"/>
+          <w:szCs w:val="22"/>
+        </w:rPr>
+        <w:t xml:space="preserve">Three tabs: Summary / Bills / Vendors</w:t>
+      </w:r>
+    </w:p>
+    <w:p>
+      <w:pPr>
+        <w:pStyle w:val="ListParagraph"/>
+        <w:numPr>
+          <w:ilvl w:val="0"/>
+          <w:numId w:val="1"/>
+        </w:numPr>
+        <w:spacing w:after="40"/>
+      </w:pPr>
+      <w:r>
+        <w:rPr>
+          <w:color w:val="1D2D3E"/>
+          <w:sz w:val="22"/>
+          <w:szCs w:val="22"/>
+        </w:rPr>
+        <w:t xml:space="preserve">Summary: KPI cards (outstanding, overdue, vendor count, bill count) + aging analysis bars</w:t>
+      </w:r>
+    </w:p>
+    <w:p>
+      <w:pPr>
+        <w:pStyle w:val="ListParagraph"/>
+        <w:numPr>
+          <w:ilvl w:val="0"/>
+          <w:numId w:val="1"/>
+        </w:numPr>
+        <w:spacing w:after="40"/>
+      </w:pPr>
+      <w:r>
+        <w:rPr>
+          <w:color w:val="1D2D3E"/>
+          <w:sz w:val="22"/>
+          <w:szCs w:val="22"/>
+        </w:rPr>
+        <w:t xml:space="preserve">Bills: bill cards with status, amounts, due date</w:t>
+      </w:r>
+    </w:p>
+    <w:p>
+      <w:pPr>
+        <w:pStyle w:val="ListParagraph"/>
+        <w:numPr>
+          <w:ilvl w:val="0"/>
+          <w:numId w:val="1"/>
+        </w:numPr>
+        <w:spacing w:after="40"/>
+      </w:pPr>
+      <w:r>
+        <w:rPr>
+          <w:color w:val="1D2D3E"/>
+          <w:sz w:val="22"/>
+          <w:szCs w:val="22"/>
+        </w:rPr>
+        <w:t xml:space="preserve">Vendors: vendor cards with outstanding/overdue balances</w:t>
+      </w:r>
+    </w:p>
+    <w:p>
+      <w:pPr>
+        <w:spacing w:after="80"/>
+      </w:pPr>
+      <w:r>
+        <w:rPr>
+          <w:color w:val="1D2D3E"/>
+          <w:sz w:val="22"/>
+          <w:szCs w:val="22"/>
+        </w:rPr>
+        <w:t xml:space="preserve"/>
+      </w:r>
+    </w:p>
+    <w:p>
+      <w:pPr>
+        <w:pStyle w:val="Heading2"/>
+        <w:spacing w:after="120" w:before="300"/>
+      </w:pPr>
+      <w:r>
+        <w:rPr>
+          <w:b/>
+          <w:bCs/>
+          <w:color w:val="1D2D3E"/>
+        </w:rPr>
+        <w:t xml:space="preserve">3.16 Accounts Receivable Screen (src/screens/finance/AccountsReceivableScreen.tsx)</w:t>
+      </w:r>
+    </w:p>
+    <w:p>
+      <w:pPr>
+        <w:pStyle w:val="ListParagraph"/>
+        <w:numPr>
+          <w:ilvl w:val="0"/>
+          <w:numId w:val="1"/>
+        </w:numPr>
+        <w:spacing w:after="40"/>
+      </w:pPr>
+      <w:r>
+        <w:rPr>
+          <w:color w:val="1D2D3E"/>
+          <w:sz w:val="22"/>
+          <w:szCs w:val="22"/>
+        </w:rPr>
+        <w:t xml:space="preserve">Three tabs: Summary / Invoices / Customers</w:t>
+      </w:r>
+    </w:p>
+    <w:p>
+      <w:pPr>
+        <w:pStyle w:val="ListParagraph"/>
+        <w:numPr>
+          <w:ilvl w:val="0"/>
+          <w:numId w:val="1"/>
+        </w:numPr>
+        <w:spacing w:after="40"/>
+      </w:pPr>
+      <w:r>
+        <w:rPr>
+          <w:color w:val="1D2D3E"/>
+          <w:sz w:val="22"/>
+          <w:szCs w:val="22"/>
+        </w:rPr>
+        <w:t xml:space="preserve">Summary: KPI cards + aging analysis bars (same pattern as AP)</w:t>
+      </w:r>
+    </w:p>
+    <w:p>
+      <w:pPr>
+        <w:pStyle w:val="ListParagraph"/>
+        <w:numPr>
+          <w:ilvl w:val="0"/>
+          <w:numId w:val="1"/>
+        </w:numPr>
+        <w:spacing w:after="40"/>
+      </w:pPr>
+      <w:r>
+        <w:rPr>
+          <w:color w:val="1D2D3E"/>
+          <w:sz w:val="22"/>
+          <w:szCs w:val="22"/>
+        </w:rPr>
+        <w:t xml:space="preserve">Invoices: invoice cards with outstanding amounts</w:t>
+      </w:r>
+    </w:p>
+    <w:p>
+      <w:pPr>
+        <w:pStyle w:val="ListParagraph"/>
+        <w:numPr>
+          <w:ilvl w:val="0"/>
+          <w:numId w:val="1"/>
+        </w:numPr>
+        <w:spacing w:after="40"/>
+      </w:pPr>
+      <w:r>
+        <w:rPr>
+          <w:color w:val="1D2D3E"/>
+          <w:sz w:val="22"/>
+          <w:szCs w:val="22"/>
+        </w:rPr>
+        <w:t xml:space="preserve">Customers: customer cards with outstanding/overdue balances</w:t>
+      </w:r>
+    </w:p>
+    <w:p>
+      <w:pPr>
+        <w:spacing w:after="80"/>
+      </w:pPr>
+      <w:r>
+        <w:rPr>
+          <w:color w:val="1D2D3E"/>
+          <w:sz w:val="22"/>
+          <w:szCs w:val="22"/>
+        </w:rPr>
+        <w:t xml:space="preserve"/>
+      </w:r>
+    </w:p>
+    <w:p>
+      <w:pPr>
+        <w:pStyle w:val="Heading2"/>
+        <w:spacing w:after="120" w:before="300"/>
+      </w:pPr>
+      <w:r>
+        <w:rPr>
+          <w:b/>
+          <w:bCs/>
+          <w:color w:val="1D2D3E"/>
+        </w:rPr>
+        <w:t xml:space="preserve">3.17 Journal Entries Screen (src/screens/journalEntries/JournalEntriesScreen.tsx)</w:t>
+      </w:r>
+    </w:p>
+    <w:p>
+      <w:pPr>
+        <w:pStyle w:val="ListParagraph"/>
+        <w:numPr>
+          <w:ilvl w:val="0"/>
+          <w:numId w:val="1"/>
+        </w:numPr>
+        <w:spacing w:after="40"/>
+      </w:pPr>
+      <w:r>
+        <w:rPr>
+          <w:color w:val="1D2D3E"/>
+          <w:sz w:val="22"/>
+          <w:szCs w:val="22"/>
+        </w:rPr>
+        <w:t xml:space="preserve">Searchable list: voucher number, narration</w:t>
+      </w:r>
+    </w:p>
+    <w:p>
+      <w:pPr>
+        <w:pStyle w:val="ListParagraph"/>
+        <w:numPr>
+          <w:ilvl w:val="0"/>
+          <w:numId w:val="1"/>
+        </w:numPr>
+        <w:spacing w:after="40"/>
+      </w:pPr>
+      <w:r>
+        <w:rPr>
+          <w:color w:val="1D2D3E"/>
+          <w:sz w:val="22"/>
+          <w:szCs w:val="22"/>
+        </w:rPr>
+        <w:t xml:space="preserve">Voucher type filter chips (JV, GRN, PAY, REC, INV, SO, PO, DN)</w:t>
+      </w:r>
+    </w:p>
+    <w:p>
+      <w:pPr>
+        <w:pStyle w:val="ListParagraph"/>
+        <w:numPr>
+          <w:ilvl w:val="0"/>
+          <w:numId w:val="1"/>
+        </w:numPr>
+        <w:spacing w:after="40"/>
+      </w:pPr>
+      <w:r>
+        <w:rPr>
+          <w:color w:val="1D2D3E"/>
+          <w:sz w:val="22"/>
+          <w:szCs w:val="22"/>
+        </w:rPr>
+        <w:t xml:space="preserve">Cards with colored type badge, status badge (POSTED/DRAFT/VOID), debit/credit totals</w:t>
+      </w:r>
+    </w:p>
+    <w:p>
+      <w:pPr>
+        <w:pStyle w:val="ListParagraph"/>
+        <w:numPr>
+          <w:ilvl w:val="0"/>
+          <w:numId w:val="1"/>
+        </w:numPr>
+        <w:spacing w:after="40"/>
+      </w:pPr>
+      <w:r>
+        <w:rPr>
+          <w:color w:val="1D2D3E"/>
+          <w:sz w:val="22"/>
+          <w:szCs w:val="22"/>
+        </w:rPr>
+        <w:t xml:space="preserve">Expandable cards reveal journal lines (account, debit, credit)</w:t>
+      </w:r>
+    </w:p>
+    <w:p>
+      <w:pPr>
+        <w:spacing w:after="80"/>
+      </w:pPr>
+      <w:r>
+        <w:rPr>
+          <w:color w:val="1D2D3E"/>
+          <w:sz w:val="22"/>
+          <w:szCs w:val="22"/>
+        </w:rPr>
+        <w:t xml:space="preserve"/>
+      </w:r>
+    </w:p>
+    <w:p>
+      <w:pPr>
+        <w:pStyle w:val="Heading2"/>
+        <w:spacing w:after="120" w:before="300"/>
+      </w:pPr>
+      <w:r>
+        <w:rPr>
+          <w:b/>
+          <w:bCs/>
+          <w:color w:val="1D2D3E"/>
+        </w:rPr>
+        <w:t xml:space="preserve">3.18 Trial Balance Screen (src/screens/trialBalance/TrialBalanceScreen.tsx)</w:t>
+      </w:r>
+    </w:p>
+    <w:p>
+      <w:pPr>
+        <w:pStyle w:val="ListParagraph"/>
+        <w:numPr>
+          <w:ilvl w:val="0"/>
+          <w:numId w:val="1"/>
+        </w:numPr>
+        <w:spacing w:after="40"/>
+      </w:pPr>
+      <w:r>
+        <w:rPr>
+          <w:color w:val="1D2D3E"/>
+          <w:sz w:val="22"/>
+          <w:szCs w:val="22"/>
+        </w:rPr>
+        <w:t xml:space="preserve">Company selector dropdown (populated from /api/options/companies)</w:t>
+      </w:r>
+    </w:p>
+    <w:p>
+      <w:pPr>
+        <w:pStyle w:val="ListParagraph"/>
+        <w:numPr>
+          <w:ilvl w:val="0"/>
+          <w:numId w:val="1"/>
+        </w:numPr>
+        <w:spacing w:after="40"/>
+      </w:pPr>
+      <w:r>
+        <w:rPr>
+          <w:color w:val="1D2D3E"/>
+          <w:sz w:val="22"/>
+          <w:szCs w:val="22"/>
+        </w:rPr>
+        <w:t xml:space="preserve">As-of date text input (YYYY-MM-DD format, Run Report button)</w:t>
+      </w:r>
+    </w:p>
+    <w:p>
+      <w:pPr>
+        <w:pStyle w:val="ListParagraph"/>
+        <w:numPr>
+          <w:ilvl w:val="0"/>
+          <w:numId w:val="1"/>
+        </w:numPr>
+        <w:spacing w:after="40"/>
+      </w:pPr>
+      <w:r>
+        <w:rPr>
+          <w:color w:val="1D2D3E"/>
+          <w:sz w:val="22"/>
+          <w:szCs w:val="22"/>
+        </w:rPr>
+        <w:t xml:space="preserve">Account search filter</w:t>
+      </w:r>
+    </w:p>
+    <w:p>
+      <w:pPr>
+        <w:pStyle w:val="ListParagraph"/>
+        <w:numPr>
+          <w:ilvl w:val="0"/>
+          <w:numId w:val="1"/>
+        </w:numPr>
+        <w:spacing w:after="40"/>
+      </w:pPr>
+      <w:r>
+        <w:rPr>
+          <w:color w:val="1D2D3E"/>
+          <w:sz w:val="22"/>
+          <w:szCs w:val="22"/>
+        </w:rPr>
+        <w:t xml:space="preserve">Summary card: total debit / total credit with balance diff warning</w:t>
+      </w:r>
+    </w:p>
+    <w:p>
+      <w:pPr>
+        <w:pStyle w:val="ListParagraph"/>
+        <w:numPr>
+          <w:ilvl w:val="0"/>
+          <w:numId w:val="1"/>
+        </w:numPr>
+        <w:spacing w:after="40"/>
+      </w:pPr>
+      <w:r>
+        <w:rPr>
+          <w:color w:val="1D2D3E"/>
+          <w:sz w:val="22"/>
+          <w:szCs w:val="22"/>
+        </w:rPr>
+        <w:t xml:space="preserve">Hierarchical account table with group headers, level-based indentation</w:t>
+      </w:r>
+    </w:p>
+    <w:p>
+      <w:pPr>
+        <w:spacing w:after="80"/>
+      </w:pPr>
+      <w:r>
+        <w:rPr>
+          <w:color w:val="1D2D3E"/>
+          <w:sz w:val="22"/>
+          <w:szCs w:val="22"/>
+        </w:rPr>
+        <w:t xml:space="preserve"/>
+      </w:r>
+    </w:p>
+    <w:p>
+      <w:pPr>
+        <w:pStyle w:val="Heading2"/>
+        <w:spacing w:after="120" w:before="300"/>
+      </w:pPr>
+      <w:r>
+        <w:rPr>
+          <w:b/>
+          <w:bCs/>
+          <w:color w:val="1D2D3E"/>
+        </w:rPr>
+        <w:t xml:space="preserve">3.19 Business Partners Screen (src/screens/partners/PartnersScreen.tsx)</w:t>
+      </w:r>
+    </w:p>
+    <w:p>
+      <w:pPr>
+        <w:pStyle w:val="ListParagraph"/>
+        <w:numPr>
+          <w:ilvl w:val="0"/>
+          <w:numId w:val="1"/>
+        </w:numPr>
+        <w:spacing w:after="40"/>
+      </w:pPr>
+      <w:r>
+        <w:rPr>
+          <w:color w:val="1D2D3E"/>
+          <w:sz w:val="22"/>
+          <w:szCs w:val="22"/>
+        </w:rPr>
+        <w:t xml:space="preserve">Searchable list (name, code, email)</w:t>
+      </w:r>
+    </w:p>
+    <w:p>
+      <w:pPr>
+        <w:pStyle w:val="ListParagraph"/>
+        <w:numPr>
+          <w:ilvl w:val="0"/>
+          <w:numId w:val="1"/>
+        </w:numPr>
+        <w:spacing w:after="40"/>
+      </w:pPr>
+      <w:r>
+        <w:rPr>
+          <w:color w:val="1D2D3E"/>
+          <w:sz w:val="22"/>
+          <w:szCs w:val="22"/>
+        </w:rPr>
+        <w:t xml:space="preserve">Role filter tabs: All / Customers / Vendors</w:t>
+      </w:r>
+    </w:p>
+    <w:p>
+      <w:pPr>
+        <w:pStyle w:val="ListParagraph"/>
+        <w:numPr>
+          <w:ilvl w:val="0"/>
+          <w:numId w:val="1"/>
+        </w:numPr>
+        <w:spacing w:after="40"/>
+      </w:pPr>
+      <w:r>
+        <w:rPr>
+          <w:color w:val="1D2D3E"/>
+          <w:sz w:val="22"/>
+          <w:szCs w:val="22"/>
+        </w:rPr>
+        <w:t xml:space="preserve">Partner cards: avatar initials, name, code, role badges (Customer=green, Vendor=blue)</w:t>
+      </w:r>
+    </w:p>
+    <w:p>
+      <w:pPr>
+        <w:pStyle w:val="ListParagraph"/>
+        <w:numPr>
+          <w:ilvl w:val="0"/>
+          <w:numId w:val="1"/>
+        </w:numPr>
+        <w:spacing w:after="40"/>
+      </w:pPr>
+      <w:r>
+        <w:rPr>
+          <w:color w:val="1D2D3E"/>
+          <w:sz w:val="22"/>
+          <w:szCs w:val="22"/>
+        </w:rPr>
+        <w:t xml:space="preserve">Contact info: email, phone, company</w:t>
+      </w:r>
+    </w:p>
+    <w:p>
+      <w:pPr>
+        <w:spacing w:after="80"/>
+      </w:pPr>
+      <w:r>
+        <w:rPr>
+          <w:color w:val="1D2D3E"/>
+          <w:sz w:val="22"/>
+          <w:szCs w:val="22"/>
+        </w:rPr>
+        <w:t xml:space="preserve"/>
+      </w:r>
+    </w:p>
+    <w:p>
+      <w:pPr>
+        <w:pStyle w:val="Heading2"/>
+        <w:spacing w:after="120" w:before="300"/>
+      </w:pPr>
+      <w:r>
+        <w:rPr>
+          <w:b/>
+          <w:bCs/>
+          <w:color w:val="1D2D3E"/>
+        </w:rPr>
+        <w:t xml:space="preserve">3.20 Companies Screen (src/screens/companies/CompaniesScreen.tsx)</w:t>
+      </w:r>
+    </w:p>
+    <w:p>
+      <w:pPr>
+        <w:pStyle w:val="ListParagraph"/>
+        <w:numPr>
+          <w:ilvl w:val="0"/>
+          <w:numId w:val="1"/>
+        </w:numPr>
+        <w:spacing w:after="40"/>
+      </w:pPr>
+      <w:r>
+        <w:rPr>
+          <w:color w:val="1D2D3E"/>
+          <w:sz w:val="22"/>
+          <w:szCs w:val="22"/>
+        </w:rPr>
+        <w:t xml:space="preserve">Company list with logo circle (initial letter), name, code, active/inactive status badge</w:t>
+      </w:r>
+    </w:p>
+    <w:p>
+      <w:pPr>
+        <w:pStyle w:val="ListParagraph"/>
+        <w:numPr>
+          <w:ilvl w:val="0"/>
+          <w:numId w:val="1"/>
+        </w:numPr>
+        <w:spacing w:after="40"/>
+      </w:pPr>
+      <w:r>
+        <w:rPr>
+          <w:color w:val="1D2D3E"/>
+          <w:sz w:val="22"/>
+          <w:szCs w:val="22"/>
+        </w:rPr>
+        <w:t xml:space="preserve">Detail grid: currency, fiscal year, phone, email, address</w:t>
+      </w:r>
+    </w:p>
+    <w:p>
+      <w:pPr>
+        <w:spacing w:after="80"/>
+      </w:pPr>
+      <w:r>
+        <w:rPr>
+          <w:color w:val="1D2D3E"/>
+          <w:sz w:val="22"/>
+          <w:szCs w:val="22"/>
+        </w:rPr>
+        <w:t xml:space="preserve"/>
+      </w:r>
+    </w:p>
+    <w:p>
+      <w:pPr>
+        <w:pStyle w:val="Heading2"/>
+        <w:spacing w:after="120" w:before="300"/>
+      </w:pPr>
+      <w:r>
+        <w:rPr>
+          <w:b/>
+          <w:bCs/>
+          <w:color w:val="1D2D3E"/>
+        </w:rPr>
+        <w:t xml:space="preserve">3.21 Navigation Architecture</w:t>
+      </w:r>
+    </w:p>
+    <w:p>
+      <w:pPr>
+        <w:pStyle w:val="ListParagraph"/>
+        <w:numPr>
+          <w:ilvl w:val="0"/>
+          <w:numId w:val="1"/>
+        </w:numPr>
+        <w:spacing w:after="40"/>
+      </w:pPr>
+      <w:r>
+        <w:rPr>
+          <w:color w:val="1D2D3E"/>
+          <w:sz w:val="22"/>
+          <w:szCs w:val="22"/>
+        </w:rPr>
+        <w:t xml:space="preserve">AppNavigator (bottom tabs): Dashboard, Inventory, Finance, More</w:t>
+      </w:r>
+    </w:p>
+    <w:p>
+      <w:pPr>
+        <w:pStyle w:val="ListParagraph"/>
+        <w:numPr>
+          <w:ilvl w:val="0"/>
+          <w:numId w:val="1"/>
+        </w:numPr>
+        <w:spacing w:after="40"/>
+      </w:pPr>
+      <w:r>
+        <w:rPr>
+          <w:color w:val="1D2D3E"/>
+          <w:sz w:val="22"/>
+          <w:szCs w:val="22"/>
+        </w:rPr>
+        <w:t xml:space="preserve">FinanceNavigator (stack): FinanceMenu → AccountsPayable, AccountsReceivable, JournalEntries, TrialBalance</w:t>
+      </w:r>
+    </w:p>
+    <w:p>
+      <w:pPr>
+        <w:pStyle w:val="ListParagraph"/>
+        <w:numPr>
+          <w:ilvl w:val="0"/>
+          <w:numId w:val="1"/>
+        </w:numPr>
+        <w:spacing w:after="40"/>
+      </w:pPr>
+      <w:r>
+        <w:rPr>
+          <w:color w:val="1D2D3E"/>
+          <w:sz w:val="22"/>
+          <w:szCs w:val="22"/>
+        </w:rPr>
+        <w:t xml:space="preserve">MoreNavigator (stack): MoreMenu → Materials, PurchaseOrders, PurchaseOrderDetail, SalesOrders, SalesOrderDetail, GRN, Partners, Companies</w:t>
+      </w:r>
+    </w:p>
+    <w:p>
+      <w:pPr>
+        <w:pStyle w:val="ListParagraph"/>
+        <w:numPr>
+          <w:ilvl w:val="0"/>
+          <w:numId w:val="1"/>
+        </w:numPr>
+        <w:spacing w:after="40"/>
+      </w:pPr>
+      <w:r>
+        <w:rPr>
+          <w:color w:val="1D2D3E"/>
+          <w:sz w:val="22"/>
+          <w:szCs w:val="22"/>
+        </w:rPr>
+        <w:t xml:space="preserve">Dashboard Quick Actions wired to real screens via tab navigation</w:t>
+      </w:r>
+    </w:p>
+    <w:p>
+      <w:pPr>
+        <w:spacing w:after="80"/>
+      </w:pPr>
+      <w:r>
+        <w:rPr>
+          <w:color w:val="1D2D3E"/>
+          <w:sz w:val="22"/>
+          <w:szCs w:val="22"/>
+        </w:rPr>
+        <w:t xml:space="preserve"/>
       </w:r>
     </w:p>
     <w:p>
@@ -2758,7 +3887,7 @@
                 <w:sz w:val="20"/>
                 <w:szCs w:val="20"/>
               </w:rPr>
-              <w:t xml:space="preserve">Planned</w:t>
+              <w:t xml:space="preserve">Done</w:t>
             </w:r>
           </w:p>
         </w:tc>
@@ -2837,7 +3966,7 @@
                 <w:sz w:val="20"/>
                 <w:szCs w:val="20"/>
               </w:rPr>
-              <w:t xml:space="preserve">Planned</w:t>
+              <w:t xml:space="preserve">Done</w:t>
             </w:r>
           </w:p>
         </w:tc>
@@ -2910,7 +4039,7 @@
                 <w:sz w:val="20"/>
                 <w:szCs w:val="20"/>
               </w:rPr>
-              <w:t xml:space="preserve">Planned</w:t>
+              <w:t xml:space="preserve">Done</w:t>
             </w:r>
           </w:p>
         </w:tc>
@@ -2989,7 +4118,7 @@
                 <w:sz w:val="20"/>
                 <w:szCs w:val="20"/>
               </w:rPr>
-              <w:t xml:space="preserve">Planned</w:t>
+              <w:t xml:space="preserve">Done</w:t>
             </w:r>
           </w:p>
         </w:tc>
@@ -3062,7 +4191,7 @@
                 <w:sz w:val="20"/>
                 <w:szCs w:val="20"/>
               </w:rPr>
-              <w:t xml:space="preserve">Planned</w:t>
+              <w:t xml:space="preserve">Done</w:t>
             </w:r>
           </w:p>
         </w:tc>
@@ -3141,7 +4270,7 @@
                 <w:sz w:val="20"/>
                 <w:szCs w:val="20"/>
               </w:rPr>
-              <w:t xml:space="preserve">Planned</w:t>
+              <w:t xml:space="preserve">Done</w:t>
             </w:r>
           </w:p>
         </w:tc>
@@ -3214,7 +4343,7 @@
                 <w:sz w:val="20"/>
                 <w:szCs w:val="20"/>
               </w:rPr>
-              <w:t xml:space="preserve">Planned</w:t>
+              <w:t xml:space="preserve">Done</w:t>
             </w:r>
           </w:p>
         </w:tc>
@@ -3293,7 +4422,7 @@
                 <w:sz w:val="20"/>
                 <w:szCs w:val="20"/>
               </w:rPr>
-              <w:t xml:space="preserve">Planned</w:t>
+              <w:t xml:space="preserve">Done</w:t>
             </w:r>
           </w:p>
         </w:tc>
@@ -3366,7 +4495,7 @@
                 <w:sz w:val="20"/>
                 <w:szCs w:val="20"/>
               </w:rPr>
-              <w:t xml:space="preserve">Planned</w:t>
+              <w:t xml:space="preserve">Done</w:t>
             </w:r>
           </w:p>
         </w:tc>
@@ -3518,7 +4647,7 @@
                 <w:sz w:val="20"/>
                 <w:szCs w:val="20"/>
               </w:rPr>
-              <w:t xml:space="preserve">Planned</w:t>
+              <w:t xml:space="preserve">Done</w:t>
             </w:r>
           </w:p>
         </w:tc>
@@ -3597,7 +4726,7 @@
                 <w:sz w:val="20"/>
                 <w:szCs w:val="20"/>
               </w:rPr>
-              <w:t xml:space="preserve">Planned</w:t>
+              <w:t xml:space="preserve">Done</w:t>
             </w:r>
           </w:p>
         </w:tc>
@@ -3670,7 +4799,7 @@
                 <w:sz w:val="20"/>
                 <w:szCs w:val="20"/>
               </w:rPr>
-              <w:t xml:space="preserve">Planned</w:t>
+              <w:t xml:space="preserve">Done</w:t>
             </w:r>
           </w:p>
         </w:tc>
@@ -3822,7 +4951,7 @@
                 <w:sz w:val="20"/>
                 <w:szCs w:val="20"/>
               </w:rPr>
-              <w:t xml:space="preserve">Planned</w:t>
+              <w:t xml:space="preserve">Partial</w:t>
             </w:r>
           </w:p>
         </w:tc>
@@ -4076,18 +5205,198 @@
       <w:pPr>
         <w:pStyle w:val="ListParagraph"/>
         <w:numPr>
-          <w:ilvl w:val="0"/>
-          <w:numId w:val="1"/>
-        </w:numPr>
-        <w:spacing w:after="40"/>
-      </w:pPr>
-      <w:r>
-        <w:rPr>
-          <w:color w:val="1D2D3E"/>
-          <w:sz w:val="22"/>
-          <w:szCs w:val="22"/>
-        </w:rPr>
-        <w:t xml:space="preserve">src/components/ — Shared UI components</w:t>
+          <w:ilvl w:val="1"/>
+          <w:numId w:val="1"/>
+        </w:numPr>
+        <w:spacing w:after="40"/>
+      </w:pPr>
+      <w:r>
+        <w:rPr>
+          <w:color w:val="1D2D3E"/>
+          <w:sz w:val="22"/>
+          <w:szCs w:val="22"/>
+        </w:rPr>
+        <w:t xml:space="preserve">inventory.ts — Stock balances and ledger</w:t>
+      </w:r>
+    </w:p>
+    <w:p>
+      <w:pPr>
+        <w:pStyle w:val="ListParagraph"/>
+        <w:numPr>
+          <w:ilvl w:val="1"/>
+          <w:numId w:val="1"/>
+        </w:numPr>
+        <w:spacing w:after="40"/>
+      </w:pPr>
+      <w:r>
+        <w:rPr>
+          <w:color w:val="1D2D3E"/>
+          <w:sz w:val="22"/>
+          <w:szCs w:val="22"/>
+        </w:rPr>
+        <w:t xml:space="preserve">materials.ts — Material master list and types</w:t>
+      </w:r>
+    </w:p>
+    <w:p>
+      <w:pPr>
+        <w:pStyle w:val="ListParagraph"/>
+        <w:numPr>
+          <w:ilvl w:val="1"/>
+          <w:numId w:val="1"/>
+        </w:numPr>
+        <w:spacing w:after="40"/>
+      </w:pPr>
+      <w:r>
+        <w:rPr>
+          <w:color w:val="1D2D3E"/>
+          <w:sz w:val="22"/>
+          <w:szCs w:val="22"/>
+        </w:rPr>
+        <w:t xml:space="preserve">purchaseOrders.ts — PO list and detail</w:t>
+      </w:r>
+    </w:p>
+    <w:p>
+      <w:pPr>
+        <w:pStyle w:val="ListParagraph"/>
+        <w:numPr>
+          <w:ilvl w:val="1"/>
+          <w:numId w:val="1"/>
+        </w:numPr>
+        <w:spacing w:after="40"/>
+      </w:pPr>
+      <w:r>
+        <w:rPr>
+          <w:color w:val="1D2D3E"/>
+          <w:sz w:val="22"/>
+          <w:szCs w:val="22"/>
+        </w:rPr>
+        <w:t xml:space="preserve">salesOrders.ts — SO list and detail</w:t>
+      </w:r>
+    </w:p>
+    <w:p>
+      <w:pPr>
+        <w:pStyle w:val="ListParagraph"/>
+        <w:numPr>
+          <w:ilvl w:val="1"/>
+          <w:numId w:val="1"/>
+        </w:numPr>
+        <w:spacing w:after="40"/>
+      </w:pPr>
+      <w:r>
+        <w:rPr>
+          <w:color w:val="1D2D3E"/>
+          <w:sz w:val="22"/>
+          <w:szCs w:val="22"/>
+        </w:rPr>
+        <w:t xml:space="preserve">accountsPayable.ts — AP summary, bills, vendors</w:t>
+      </w:r>
+    </w:p>
+    <w:p>
+      <w:pPr>
+        <w:pStyle w:val="ListParagraph"/>
+        <w:numPr>
+          <w:ilvl w:val="1"/>
+          <w:numId w:val="1"/>
+        </w:numPr>
+        <w:spacing w:after="40"/>
+      </w:pPr>
+      <w:r>
+        <w:rPr>
+          <w:color w:val="1D2D3E"/>
+          <w:sz w:val="22"/>
+          <w:szCs w:val="22"/>
+        </w:rPr>
+        <w:t xml:space="preserve">accountsReceivable.ts — AR summary, invoices, customers</w:t>
+      </w:r>
+    </w:p>
+    <w:p>
+      <w:pPr>
+        <w:pStyle w:val="ListParagraph"/>
+        <w:numPr>
+          <w:ilvl w:val="1"/>
+          <w:numId w:val="1"/>
+        </w:numPr>
+        <w:spacing w:after="40"/>
+      </w:pPr>
+      <w:r>
+        <w:rPr>
+          <w:color w:val="1D2D3E"/>
+          <w:sz w:val="22"/>
+          <w:szCs w:val="22"/>
+        </w:rPr>
+        <w:t xml:space="preserve">journalEntries.ts — Journal entry list with filters</w:t>
+      </w:r>
+    </w:p>
+    <w:p>
+      <w:pPr>
+        <w:pStyle w:val="ListParagraph"/>
+        <w:numPr>
+          <w:ilvl w:val="1"/>
+          <w:numId w:val="1"/>
+        </w:numPr>
+        <w:spacing w:after="40"/>
+      </w:pPr>
+      <w:r>
+        <w:rPr>
+          <w:color w:val="1D2D3E"/>
+          <w:sz w:val="22"/>
+          <w:szCs w:val="22"/>
+        </w:rPr>
+        <w:t xml:space="preserve">trialBalance.ts — Trial balance with company/date params</w:t>
+      </w:r>
+    </w:p>
+    <w:p>
+      <w:pPr>
+        <w:pStyle w:val="ListParagraph"/>
+        <w:numPr>
+          <w:ilvl w:val="1"/>
+          <w:numId w:val="1"/>
+        </w:numPr>
+        <w:spacing w:after="40"/>
+      </w:pPr>
+      <w:r>
+        <w:rPr>
+          <w:color w:val="1D2D3E"/>
+          <w:sz w:val="22"/>
+          <w:szCs w:val="22"/>
+        </w:rPr>
+        <w:t xml:space="preserve">partners.ts — Business partners list</w:t>
+      </w:r>
+    </w:p>
+    <w:p>
+      <w:pPr>
+        <w:pStyle w:val="ListParagraph"/>
+        <w:numPr>
+          <w:ilvl w:val="1"/>
+          <w:numId w:val="1"/>
+        </w:numPr>
+        <w:spacing w:after="40"/>
+      </w:pPr>
+      <w:r>
+        <w:rPr>
+          <w:color w:val="1D2D3E"/>
+          <w:sz w:val="22"/>
+          <w:szCs w:val="22"/>
+        </w:rPr>
+        <w:t xml:space="preserve">companies.ts — Company details</w:t>
+      </w:r>
+    </w:p>
+    <w:p>
+      <w:pPr>
+        <w:pStyle w:val="ListParagraph"/>
+        <w:numPr>
+          <w:ilvl w:val="0"/>
+          <w:numId w:val="1"/>
+        </w:numPr>
+        <w:spacing w:after="40"/>
+      </w:pPr>
+      <w:r>
+        <w:rPr>
+          <w:color w:val="1D2D3E"/>
+          <w:sz w:val="22"/>
+          <w:szCs w:val="22"/>
+        </w:rPr>
+        <w:t xml:space="preserve">src/components/ — Shared UI components (LoadingView, ErrorView, KPICard, SectionHeader)</w:t>
       </w:r>
     </w:p>
     <w:p>
@@ -4124,6 +5433,78 @@
           <w:szCs w:val="22"/>
         </w:rPr>
         <w:t xml:space="preserve">src/navigation/ — Navigation stack definitions</w:t>
+      </w:r>
+    </w:p>
+    <w:p>
+      <w:pPr>
+        <w:pStyle w:val="ListParagraph"/>
+        <w:numPr>
+          <w:ilvl w:val="1"/>
+          <w:numId w:val="1"/>
+        </w:numPr>
+        <w:spacing w:after="40"/>
+      </w:pPr>
+      <w:r>
+        <w:rPr>
+          <w:color w:val="1D2D3E"/>
+          <w:sz w:val="22"/>
+          <w:szCs w:val="22"/>
+        </w:rPr>
+        <w:t xml:space="preserve">AppNavigator.tsx — Bottom tabs with type-safe nested navigator params</w:t>
+      </w:r>
+    </w:p>
+    <w:p>
+      <w:pPr>
+        <w:pStyle w:val="ListParagraph"/>
+        <w:numPr>
+          <w:ilvl w:val="1"/>
+          <w:numId w:val="1"/>
+        </w:numPr>
+        <w:spacing w:after="40"/>
+      </w:pPr>
+      <w:r>
+        <w:rPr>
+          <w:color w:val="1D2D3E"/>
+          <w:sz w:val="22"/>
+          <w:szCs w:val="22"/>
+        </w:rPr>
+        <w:t xml:space="preserve">FinanceNavigator.tsx — Stack for Finance tab screens</w:t>
+      </w:r>
+    </w:p>
+    <w:p>
+      <w:pPr>
+        <w:pStyle w:val="ListParagraph"/>
+        <w:numPr>
+          <w:ilvl w:val="1"/>
+          <w:numId w:val="1"/>
+        </w:numPr>
+        <w:spacing w:after="40"/>
+      </w:pPr>
+      <w:r>
+        <w:rPr>
+          <w:color w:val="1D2D3E"/>
+          <w:sz w:val="22"/>
+          <w:szCs w:val="22"/>
+        </w:rPr>
+        <w:t xml:space="preserve">MoreNavigator.tsx — Stack for More tab screens</w:t>
+      </w:r>
+    </w:p>
+    <w:p>
+      <w:pPr>
+        <w:pStyle w:val="ListParagraph"/>
+        <w:numPr>
+          <w:ilvl w:val="1"/>
+          <w:numId w:val="1"/>
+        </w:numPr>
+        <w:spacing w:after="40"/>
+      </w:pPr>
+      <w:r>
+        <w:rPr>
+          <w:color w:val="1D2D3E"/>
+          <w:sz w:val="22"/>
+          <w:szCs w:val="22"/>
+        </w:rPr>
+        <w:t xml:space="preserve">AuthNavigator.tsx — Stack for unauthenticated screens</w:t>
       </w:r>
     </w:p>
     <w:p>
@@ -4579,6 +5960,267 @@
           <w:szCs w:val="22"/>
         </w:rPr>
         <w:t xml:space="preserve">Bottom tab navigation (Dashboard, Inventory, Finance, More)</w:t>
+      </w:r>
+    </w:p>
+    <w:p>
+      <w:pPr>
+        <w:spacing w:after="80"/>
+      </w:pPr>
+      <w:r>
+        <w:rPr>
+          <w:color w:val="1D2D3E"/>
+          <w:sz w:val="22"/>
+          <w:szCs w:val="22"/>
+        </w:rPr>
+        <w:t xml:space="preserve"/>
+      </w:r>
+    </w:p>
+    <w:p>
+      <w:pPr>
+        <w:pStyle w:val="Heading2"/>
+        <w:spacing w:after="120" w:before="300"/>
+      </w:pPr>
+      <w:r>
+        <w:rPr>
+          <w:b/>
+          <w:bCs/>
+          <w:color w:val="1D2D3E"/>
+        </w:rPr>
+        <w:t xml:space="preserve">Session 2 — 2026-05-15</w:t>
+      </w:r>
+    </w:p>
+    <w:p>
+      <w:pPr>
+        <w:pStyle w:val="ListParagraph"/>
+        <w:numPr>
+          <w:ilvl w:val="0"/>
+          <w:numId w:val="1"/>
+        </w:numPr>
+        <w:spacing w:after="40"/>
+      </w:pPr>
+      <w:r>
+        <w:rPr>
+          <w:color w:val="1D2D3E"/>
+          <w:sz w:val="22"/>
+          <w:szCs w:val="22"/>
+        </w:rPr>
+        <w:t xml:space="preserve">Phase 1: Inventory screen (stock balances + ledger tab view, search)</w:t>
+      </w:r>
+    </w:p>
+    <w:p>
+      <w:pPr>
+        <w:pStyle w:val="ListParagraph"/>
+        <w:numPr>
+          <w:ilvl w:val="0"/>
+          <w:numId w:val="1"/>
+        </w:numPr>
+        <w:spacing w:after="40"/>
+      </w:pPr>
+      <w:r>
+        <w:rPr>
+          <w:color w:val="1D2D3E"/>
+          <w:sz w:val="22"/>
+          <w:szCs w:val="22"/>
+        </w:rPr>
+        <w:t xml:space="preserve">Phase 1: Materials screen (searchable list, type filter chips, status badges)</w:t>
+      </w:r>
+    </w:p>
+    <w:p>
+      <w:pPr>
+        <w:pStyle w:val="ListParagraph"/>
+        <w:numPr>
+          <w:ilvl w:val="0"/>
+          <w:numId w:val="1"/>
+        </w:numPr>
+        <w:spacing w:after="40"/>
+      </w:pPr>
+      <w:r>
+        <w:rPr>
+          <w:color w:val="1D2D3E"/>
+          <w:sz w:val="22"/>
+          <w:szCs w:val="22"/>
+        </w:rPr>
+        <w:t xml:space="preserve">Phase 1: Purchase Orders screen (All/Open/In Progress tabs, PO detail with progress bar)</w:t>
+      </w:r>
+    </w:p>
+    <w:p>
+      <w:pPr>
+        <w:pStyle w:val="ListParagraph"/>
+        <w:numPr>
+          <w:ilvl w:val="0"/>
+          <w:numId w:val="1"/>
+        </w:numPr>
+        <w:spacing w:after="40"/>
+      </w:pPr>
+      <w:r>
+        <w:rPr>
+          <w:color w:val="1D2D3E"/>
+          <w:sz w:val="22"/>
+          <w:szCs w:val="22"/>
+        </w:rPr>
+        <w:t xml:space="preserve">Phase 2: Sales Orders screen (All/Open/Approved/Closed tabs, SO detail with line items)</w:t>
+      </w:r>
+    </w:p>
+    <w:p>
+      <w:pPr>
+        <w:pStyle w:val="ListParagraph"/>
+        <w:numPr>
+          <w:ilvl w:val="0"/>
+          <w:numId w:val="1"/>
+        </w:numPr>
+        <w:spacing w:after="40"/>
+      </w:pPr>
+      <w:r>
+        <w:rPr>
+          <w:color w:val="1D2D3E"/>
+          <w:sz w:val="22"/>
+          <w:szCs w:val="22"/>
+        </w:rPr>
+        <w:t xml:space="preserve">Phase 2: GRN screen (receipt progress per PO, overall summary card)</w:t>
+      </w:r>
+    </w:p>
+    <w:p>
+      <w:pPr>
+        <w:pStyle w:val="ListParagraph"/>
+        <w:numPr>
+          <w:ilvl w:val="0"/>
+          <w:numId w:val="1"/>
+        </w:numPr>
+        <w:spacing w:after="40"/>
+      </w:pPr>
+      <w:r>
+        <w:rPr>
+          <w:color w:val="1D2D3E"/>
+          <w:sz w:val="22"/>
+          <w:szCs w:val="22"/>
+        </w:rPr>
+        <w:t xml:space="preserve">Phase 3: Accounts Payable screen (summary/aging, bills, vendors tabs)</w:t>
+      </w:r>
+    </w:p>
+    <w:p>
+      <w:pPr>
+        <w:pStyle w:val="ListParagraph"/>
+        <w:numPr>
+          <w:ilvl w:val="0"/>
+          <w:numId w:val="1"/>
+        </w:numPr>
+        <w:spacing w:after="40"/>
+      </w:pPr>
+      <w:r>
+        <w:rPr>
+          <w:color w:val="1D2D3E"/>
+          <w:sz w:val="22"/>
+          <w:szCs w:val="22"/>
+        </w:rPr>
+        <w:t xml:space="preserve">Phase 3: Accounts Receivable screen (summary/aging, invoices, customers tabs)</w:t>
+      </w:r>
+    </w:p>
+    <w:p>
+      <w:pPr>
+        <w:pStyle w:val="ListParagraph"/>
+        <w:numPr>
+          <w:ilvl w:val="0"/>
+          <w:numId w:val="1"/>
+        </w:numPr>
+        <w:spacing w:after="40"/>
+      </w:pPr>
+      <w:r>
+        <w:rPr>
+          <w:color w:val="1D2D3E"/>
+          <w:sz w:val="22"/>
+          <w:szCs w:val="22"/>
+        </w:rPr>
+        <w:t xml:space="preserve">Phase 3: Journal Entries screen (type filter chips, expandable cards with journal lines)</w:t>
+      </w:r>
+    </w:p>
+    <w:p>
+      <w:pPr>
+        <w:pStyle w:val="ListParagraph"/>
+        <w:numPr>
+          <w:ilvl w:val="0"/>
+          <w:numId w:val="1"/>
+        </w:numPr>
+        <w:spacing w:after="40"/>
+      </w:pPr>
+      <w:r>
+        <w:rPr>
+          <w:color w:val="1D2D3E"/>
+          <w:sz w:val="22"/>
+          <w:szCs w:val="22"/>
+        </w:rPr>
+        <w:t xml:space="preserve">Phase 4: Trial Balance screen (company selector, date input, hierarchical account table)</w:t>
+      </w:r>
+    </w:p>
+    <w:p>
+      <w:pPr>
+        <w:pStyle w:val="ListParagraph"/>
+        <w:numPr>
+          <w:ilvl w:val="0"/>
+          <w:numId w:val="1"/>
+        </w:numPr>
+        <w:spacing w:after="40"/>
+      </w:pPr>
+      <w:r>
+        <w:rPr>
+          <w:color w:val="1D2D3E"/>
+          <w:sz w:val="22"/>
+          <w:szCs w:val="22"/>
+        </w:rPr>
+        <w:t xml:space="preserve">Phase 5: Business Partners screen (role filter, customer/vendor badges)</w:t>
+      </w:r>
+    </w:p>
+    <w:p>
+      <w:pPr>
+        <w:pStyle w:val="ListParagraph"/>
+        <w:numPr>
+          <w:ilvl w:val="0"/>
+          <w:numId w:val="1"/>
+        </w:numPr>
+        <w:spacing w:after="40"/>
+      </w:pPr>
+      <w:r>
+        <w:rPr>
+          <w:color w:val="1D2D3E"/>
+          <w:sz w:val="22"/>
+          <w:szCs w:val="22"/>
+        </w:rPr>
+        <w:t xml:space="preserve">Phase 5: Companies screen (company cards with fiscal year, status, contact info)</w:t>
+      </w:r>
+    </w:p>
+    <w:p>
+      <w:pPr>
+        <w:pStyle w:val="ListParagraph"/>
+        <w:numPr>
+          <w:ilvl w:val="0"/>
+          <w:numId w:val="1"/>
+        </w:numPr>
+        <w:spacing w:after="40"/>
+      </w:pPr>
+      <w:r>
+        <w:rPr>
+          <w:color w:val="1D2D3E"/>
+          <w:sz w:val="22"/>
+          <w:szCs w:val="22"/>
+        </w:rPr>
+        <w:t xml:space="preserve">Phase 6: FinanceNavigator and MoreNavigator stack navigators wired up</w:t>
+      </w:r>
+    </w:p>
+    <w:p>
+      <w:pPr>
+        <w:pStyle w:val="ListParagraph"/>
+        <w:numPr>
+          <w:ilvl w:val="0"/>
+          <w:numId w:val="1"/>
+        </w:numPr>
+        <w:spacing w:after="40"/>
+      </w:pPr>
+      <w:r>
+        <w:rPr>
+          <w:color w:val="1D2D3E"/>
+          <w:sz w:val="22"/>
+          <w:szCs w:val="22"/>
+        </w:rPr>
+        <w:t xml:space="preserve">Phase 6: Dashboard Quick Action tiles wired to real screens via tab navigation</w:t>
       </w:r>
     </w:p>
     <w:p>

</xml_diff>

<commit_message>
Final session 2 docs update: PROGRESS.md, FEATURES.docx, generate-docs.js
- PROGRESS.md: Updated with Financial Reports and Global Company Filter as Done
- scripts/generate-docs.js: Added sections 3.21-3.23, updated roadmap table, session 2 changelog
- FEATURES.docx: Regenerated with all final content
</commit_message>
<xml_diff>
--- a/FEATURES.docx
+++ b/FEATURES.docx
@@ -3455,7 +3455,223 @@
           <w:bCs/>
           <w:color w:val="1D2D3E"/>
         </w:rPr>
-        <w:t xml:space="preserve">3.21 Navigation Architecture</w:t>
+        <w:t xml:space="preserve">3.21 Financial Reports Screen (src/screens/financialReports/)</w:t>
+      </w:r>
+    </w:p>
+    <w:p>
+      <w:pPr>
+        <w:pStyle w:val="ListParagraph"/>
+        <w:numPr>
+          <w:ilvl w:val="0"/>
+          <w:numId w:val="1"/>
+        </w:numPr>
+        <w:spacing w:after="40"/>
+      </w:pPr>
+      <w:r>
+        <w:rPr>
+          <w:color w:val="1D2D3E"/>
+          <w:sz w:val="22"/>
+          <w:szCs w:val="22"/>
+        </w:rPr>
+        <w:t xml:space="preserve">Two tabs: Profit &amp; Loss / Balance Sheet</w:t>
+      </w:r>
+    </w:p>
+    <w:p>
+      <w:pPr>
+        <w:pStyle w:val="ListParagraph"/>
+        <w:numPr>
+          <w:ilvl w:val="0"/>
+          <w:numId w:val="1"/>
+        </w:numPr>
+        <w:spacing w:after="40"/>
+      </w:pPr>
+      <w:r>
+        <w:rPr>
+          <w:color w:val="1D2D3E"/>
+          <w:sz w:val="22"/>
+          <w:szCs w:val="22"/>
+        </w:rPr>
+        <w:t xml:space="preserve">P&amp;L: revenue vs expense sections, net income summary card</w:t>
+      </w:r>
+    </w:p>
+    <w:p>
+      <w:pPr>
+        <w:pStyle w:val="ListParagraph"/>
+        <w:numPr>
+          <w:ilvl w:val="0"/>
+          <w:numId w:val="1"/>
+        </w:numPr>
+        <w:spacing w:after="40"/>
+      </w:pPr>
+      <w:r>
+        <w:rPr>
+          <w:color w:val="1D2D3E"/>
+          <w:sz w:val="22"/>
+          <w:szCs w:val="22"/>
+        </w:rPr>
+        <w:t xml:space="preserve">Balance Sheet: assets, liabilities, equity sections with balance check warning</w:t>
+      </w:r>
+    </w:p>
+    <w:p>
+      <w:pPr>
+        <w:pStyle w:val="ListParagraph"/>
+        <w:numPr>
+          <w:ilvl w:val="0"/>
+          <w:numId w:val="1"/>
+        </w:numPr>
+        <w:spacing w:after="40"/>
+      </w:pPr>
+      <w:r>
+        <w:rPr>
+          <w:color w:val="1D2D3E"/>
+          <w:sz w:val="22"/>
+          <w:szCs w:val="22"/>
+        </w:rPr>
+        <w:t xml:space="preserve">Company selector + as-of date picker (same pattern as Trial Balance)</w:t>
+      </w:r>
+    </w:p>
+    <w:p>
+      <w:pPr>
+        <w:pStyle w:val="ListParagraph"/>
+        <w:numPr>
+          <w:ilvl w:val="0"/>
+          <w:numId w:val="1"/>
+        </w:numPr>
+        <w:spacing w:after="40"/>
+      </w:pPr>
+      <w:r>
+        <w:rPr>
+          <w:color w:val="1D2D3E"/>
+          <w:sz w:val="22"/>
+          <w:szCs w:val="22"/>
+        </w:rPr>
+        <w:t xml:space="preserve">Accounts classified by account_type keyword matching</w:t>
+      </w:r>
+    </w:p>
+    <w:p>
+      <w:pPr>
+        <w:spacing w:after="80"/>
+      </w:pPr>
+      <w:r>
+        <w:rPr>
+          <w:color w:val="1D2D3E"/>
+          <w:sz w:val="22"/>
+          <w:szCs w:val="22"/>
+        </w:rPr>
+        <w:t xml:space="preserve"/>
+      </w:r>
+    </w:p>
+    <w:p>
+      <w:pPr>
+        <w:pStyle w:val="Heading2"/>
+        <w:spacing w:after="120" w:before="300"/>
+      </w:pPr>
+      <w:r>
+        <w:rPr>
+          <w:b/>
+          <w:bCs/>
+          <w:color w:val="1D2D3E"/>
+        </w:rPr>
+        <w:t xml:space="preserve">3.22 Global Company Filter</w:t>
+      </w:r>
+    </w:p>
+    <w:p>
+      <w:pPr>
+        <w:pStyle w:val="ListParagraph"/>
+        <w:numPr>
+          <w:ilvl w:val="0"/>
+          <w:numId w:val="1"/>
+        </w:numPr>
+        <w:spacing w:after="40"/>
+      </w:pPr>
+      <w:r>
+        <w:rPr>
+          <w:color w:val="1D2D3E"/>
+          <w:sz w:val="22"/>
+          <w:szCs w:val="22"/>
+        </w:rPr>
+        <w:t xml:space="preserve">CompanyContext (src/context/CompanyContext.tsx) — global state: companies list, selectedCompany, companyId</w:t>
+      </w:r>
+    </w:p>
+    <w:p>
+      <w:pPr>
+        <w:pStyle w:val="ListParagraph"/>
+        <w:numPr>
+          <w:ilvl w:val="0"/>
+          <w:numId w:val="1"/>
+        </w:numPr>
+        <w:spacing w:after="40"/>
+      </w:pPr>
+      <w:r>
+        <w:rPr>
+          <w:color w:val="1D2D3E"/>
+          <w:sz w:val="22"/>
+          <w:szCs w:val="22"/>
+        </w:rPr>
+        <w:t xml:space="preserve">CompanyPicker (src/components/CompanyPicker.tsx) — horizontal scrollable company chips</w:t>
+      </w:r>
+    </w:p>
+    <w:p>
+      <w:pPr>
+        <w:pStyle w:val="ListParagraph"/>
+        <w:numPr>
+          <w:ilvl w:val="0"/>
+          <w:numId w:val="1"/>
+        </w:numPr>
+        <w:spacing w:after="40"/>
+      </w:pPr>
+      <w:r>
+        <w:rPr>
+          <w:color w:val="1D2D3E"/>
+          <w:sz w:val="22"/>
+          <w:szCs w:val="22"/>
+        </w:rPr>
+        <w:t xml:space="preserve">CompanyProvider wrapped around app in App.tsx</w:t>
+      </w:r>
+    </w:p>
+    <w:p>
+      <w:pPr>
+        <w:pStyle w:val="ListParagraph"/>
+        <w:numPr>
+          <w:ilvl w:val="0"/>
+          <w:numId w:val="1"/>
+        </w:numPr>
+        <w:spacing w:after="40"/>
+      </w:pPr>
+      <w:r>
+        <w:rPr>
+          <w:color w:val="1D2D3E"/>
+          <w:sz w:val="22"/>
+          <w:szCs w:val="22"/>
+        </w:rPr>
+        <w:t xml:space="preserve">Inventory, Accounts Payable, Accounts Receivable screens use companyId from context</w:t>
+      </w:r>
+    </w:p>
+    <w:p>
+      <w:pPr>
+        <w:spacing w:after="80"/>
+      </w:pPr>
+      <w:r>
+        <w:rPr>
+          <w:color w:val="1D2D3E"/>
+          <w:sz w:val="22"/>
+          <w:szCs w:val="22"/>
+        </w:rPr>
+        <w:t xml:space="preserve"/>
+      </w:r>
+    </w:p>
+    <w:p>
+      <w:pPr>
+        <w:pStyle w:val="Heading2"/>
+        <w:spacing w:after="120" w:before="300"/>
+      </w:pPr>
+      <w:r>
+        <w:rPr>
+          <w:b/>
+          <w:bCs/>
+          <w:color w:val="1D2D3E"/>
+        </w:rPr>
+        <w:t xml:space="preserve">3.23 Navigation Architecture</w:t>
       </w:r>
     </w:p>
     <w:p>
@@ -4574,7 +4790,7 @@
                 <w:sz w:val="20"/>
                 <w:szCs w:val="20"/>
               </w:rPr>
-              <w:t xml:space="preserve">Planned</w:t>
+              <w:t xml:space="preserve">Done</w:t>
             </w:r>
           </w:p>
         </w:tc>
@@ -4878,7 +5094,7 @@
                 <w:sz w:val="20"/>
                 <w:szCs w:val="20"/>
               </w:rPr>
-              <w:t xml:space="preserve">Planned</w:t>
+              <w:t xml:space="preserve">Done</w:t>
             </w:r>
           </w:p>
         </w:tc>
@@ -4898,7 +5114,7 @@
                 <w:sz w:val="20"/>
                 <w:szCs w:val="20"/>
               </w:rPr>
-              <w:t xml:space="preserve">—</w:t>
+              <w:t xml:space="preserve">CompanyContext + CompanyPicker</w:t>
             </w:r>
           </w:p>
         </w:tc>
@@ -4951,7 +5167,7 @@
                 <w:sz w:val="20"/>
                 <w:szCs w:val="20"/>
               </w:rPr>
-              <w:t xml:space="preserve">Partial</w:t>
+              <w:t xml:space="preserve">Done</w:t>
             </w:r>
           </w:p>
         </w:tc>
@@ -6166,6 +6382,24 @@
           <w:sz w:val="22"/>
           <w:szCs w:val="22"/>
         </w:rPr>
+        <w:t xml:space="preserve">Phase 4: Financial Reports screen (P&amp;L and Balance Sheet tabs computed from trial balance)</w:t>
+      </w:r>
+    </w:p>
+    <w:p>
+      <w:pPr>
+        <w:pStyle w:val="ListParagraph"/>
+        <w:numPr>
+          <w:ilvl w:val="0"/>
+          <w:numId w:val="1"/>
+        </w:numPr>
+        <w:spacing w:after="40"/>
+      </w:pPr>
+      <w:r>
+        <w:rPr>
+          <w:color w:val="1D2D3E"/>
+          <w:sz w:val="22"/>
+          <w:szCs w:val="22"/>
+        </w:rPr>
         <w:t xml:space="preserve">Phase 5: Business Partners screen (role filter, customer/vendor badges)</w:t>
       </w:r>
     </w:p>
@@ -6221,6 +6455,42 @@
           <w:szCs w:val="22"/>
         </w:rPr>
         <w:t xml:space="preserve">Phase 6: Dashboard Quick Action tiles wired to real screens via tab navigation</w:t>
+      </w:r>
+    </w:p>
+    <w:p>
+      <w:pPr>
+        <w:pStyle w:val="ListParagraph"/>
+        <w:numPr>
+          <w:ilvl w:val="0"/>
+          <w:numId w:val="1"/>
+        </w:numPr>
+        <w:spacing w:after="40"/>
+      </w:pPr>
+      <w:r>
+        <w:rPr>
+          <w:color w:val="1D2D3E"/>
+          <w:sz w:val="22"/>
+          <w:szCs w:val="22"/>
+        </w:rPr>
+        <w:t xml:space="preserve">Phase 6: CompanyContext and CompanyPicker for global company filtering</w:t>
+      </w:r>
+    </w:p>
+    <w:p>
+      <w:pPr>
+        <w:pStyle w:val="ListParagraph"/>
+        <w:numPr>
+          <w:ilvl w:val="0"/>
+          <w:numId w:val="1"/>
+        </w:numPr>
+        <w:spacing w:after="40"/>
+      </w:pPr>
+      <w:r>
+        <w:rPr>
+          <w:color w:val="1D2D3E"/>
+          <w:sz w:val="22"/>
+          <w:szCs w:val="22"/>
+        </w:rPr>
+        <w:t xml:space="preserve">Phase 6: Inventory, AP, AR screens use global company filter</w:t>
       </w:r>
     </w:p>
     <w:p>

</xml_diff>

<commit_message>
Update PROGRESS.md, generate-docs.js, and FEATURES.docx for Session 2
</commit_message>
<xml_diff>
--- a/FEATURES.docx
+++ b/FEATURES.docx
@@ -45,7 +45,7 @@
           <w:sz w:val="20"/>
           <w:szCs w:val="20"/>
         </w:rPr>
-        <w:t xml:space="preserve">Generated: 2026-05-12</w:t>
+        <w:t xml:space="preserve">Generated: 2026-05-16</w:t>
       </w:r>
     </w:p>
     <w:p>
@@ -428,7 +428,7 @@
           <w:bCs/>
           <w:color w:val="1D2D3E"/>
         </w:rPr>
-        <w:t xml:space="preserve">2.2 API Layer</w:t>
+        <w:t xml:space="preserve">2.2 Navigation Architecture (Updated Session 2)</w:t>
       </w:r>
     </w:p>
     <w:p>
@@ -441,7 +441,133 @@
           <w:sz w:val="22"/>
           <w:szCs w:val="22"/>
         </w:rPr>
-        <w:t xml:space="preserve">The web app exposes dedicated REST endpoints under /api/mobile/ for the mobile app. Each endpoint accepts query parameters for filtering and returns JSON. Authentication is required on all endpoints.</w:t>
+        <w:t xml:space="preserve">The app uses a two-level navigation structure:</w:t>
+      </w:r>
+    </w:p>
+    <w:p>
+      <w:pPr>
+        <w:pStyle w:val="ListParagraph"/>
+        <w:numPr>
+          <w:ilvl w:val="0"/>
+          <w:numId w:val="1"/>
+        </w:numPr>
+        <w:spacing w:after="40"/>
+      </w:pPr>
+      <w:r>
+        <w:rPr>
+          <w:color w:val="1D2D3E"/>
+          <w:sz w:val="22"/>
+          <w:szCs w:val="22"/>
+        </w:rPr>
+        <w:t xml:space="preserve">AppStack (native stack) — root navigator when authenticated</w:t>
+      </w:r>
+    </w:p>
+    <w:p>
+      <w:pPr>
+        <w:pStyle w:val="ListParagraph"/>
+        <w:numPr>
+          <w:ilvl w:val="1"/>
+          <w:numId w:val="1"/>
+        </w:numPr>
+        <w:spacing w:after="40"/>
+      </w:pPr>
+      <w:r>
+        <w:rPr>
+          <w:color w:val="1D2D3E"/>
+          <w:sz w:val="22"/>
+          <w:szCs w:val="22"/>
+        </w:rPr>
+        <w:t xml:space="preserve">  Tabs screen — bottom tab navigator (Dashboard, Inventory, Finance, More)</w:t>
+      </w:r>
+    </w:p>
+    <w:p>
+      <w:pPr>
+        <w:pStyle w:val="ListParagraph"/>
+        <w:numPr>
+          <w:ilvl w:val="1"/>
+          <w:numId w:val="1"/>
+        </w:numPr>
+        <w:spacing w:after="40"/>
+      </w:pPr>
+      <w:r>
+        <w:rPr>
+          <w:color w:val="1D2D3E"/>
+          <w:sz w:val="22"/>
+          <w:szCs w:val="22"/>
+        </w:rPr>
+        <w:t xml:space="preserve">  Inventory screen — full-screen stock/ledger view pushed from quick actions</w:t>
+      </w:r>
+    </w:p>
+    <w:p>
+      <w:pPr>
+        <w:pStyle w:val="ListParagraph"/>
+        <w:numPr>
+          <w:ilvl w:val="1"/>
+          <w:numId w:val="1"/>
+        </w:numPr>
+        <w:spacing w:after="40"/>
+      </w:pPr>
+      <w:r>
+        <w:rPr>
+          <w:color w:val="1D2D3E"/>
+          <w:sz w:val="22"/>
+          <w:szCs w:val="22"/>
+        </w:rPr>
+        <w:t xml:space="preserve">  Materials screen — materials list pushed from quick actions</w:t>
+      </w:r>
+    </w:p>
+    <w:p>
+      <w:pPr>
+        <w:pStyle w:val="ListParagraph"/>
+        <w:numPr>
+          <w:ilvl w:val="1"/>
+          <w:numId w:val="1"/>
+        </w:numPr>
+        <w:spacing w:after="40"/>
+      </w:pPr>
+      <w:r>
+        <w:rPr>
+          <w:color w:val="1D2D3E"/>
+          <w:sz w:val="22"/>
+          <w:szCs w:val="22"/>
+        </w:rPr>
+        <w:t xml:space="preserve">  PurchaseOrders screen — PO list pushed from quick actions</w:t>
+      </w:r>
+    </w:p>
+    <w:p>
+      <w:pPr>
+        <w:pStyle w:val="ListParagraph"/>
+        <w:numPr>
+          <w:ilvl w:val="1"/>
+          <w:numId w:val="1"/>
+        </w:numPr>
+        <w:spacing w:after="40"/>
+      </w:pPr>
+      <w:r>
+        <w:rPr>
+          <w:color w:val="1D2D3E"/>
+          <w:sz w:val="22"/>
+          <w:szCs w:val="22"/>
+        </w:rPr>
+        <w:t xml:space="preserve">  PODetail screen — PO detail pushed from PO list</w:t>
+      </w:r>
+    </w:p>
+    <w:p>
+      <w:pPr>
+        <w:pStyle w:val="ListParagraph"/>
+        <w:numPr>
+          <w:ilvl w:val="0"/>
+          <w:numId w:val="1"/>
+        </w:numPr>
+        <w:spacing w:after="40"/>
+      </w:pPr>
+      <w:r>
+        <w:rPr>
+          <w:color w:val="1D2D3E"/>
+          <w:sz w:val="22"/>
+          <w:szCs w:val="22"/>
+        </w:rPr>
+        <w:t xml:space="preserve">AuthNavigator (native stack) — Login screen when unauthenticated</w:t>
       </w:r>
     </w:p>
     <w:p>
@@ -468,7 +594,47 @@
           <w:bCs/>
           <w:color w:val="1D2D3E"/>
         </w:rPr>
-        <w:t xml:space="preserve">2.3 Backend API Endpoints</w:t>
+        <w:t xml:space="preserve">2.3 API Layer</w:t>
+      </w:r>
+    </w:p>
+    <w:p>
+      <w:pPr>
+        <w:spacing w:after="80"/>
+      </w:pPr>
+      <w:r>
+        <w:rPr>
+          <w:color w:val="1D2D3E"/>
+          <w:sz w:val="22"/>
+          <w:szCs w:val="22"/>
+        </w:rPr>
+        <w:t xml:space="preserve">The web app exposes dedicated REST endpoints under /api/mobile/ for the mobile app. Each endpoint accepts query parameters for filtering and returns JSON. Authentication is required on all endpoints.</w:t>
+      </w:r>
+    </w:p>
+    <w:p>
+      <w:pPr>
+        <w:spacing w:after="80"/>
+      </w:pPr>
+      <w:r>
+        <w:rPr>
+          <w:color w:val="1D2D3E"/>
+          <w:sz w:val="22"/>
+          <w:szCs w:val="22"/>
+        </w:rPr>
+        <w:t xml:space="preserve"/>
+      </w:r>
+    </w:p>
+    <w:p>
+      <w:pPr>
+        <w:pStyle w:val="Heading2"/>
+        <w:spacing w:after="120" w:before="300"/>
+      </w:pPr>
+      <w:r>
+        <w:rPr>
+          <w:b/>
+          <w:bCs/>
+          <w:color w:val="1D2D3E"/>
+        </w:rPr>
+        <w:t xml:space="preserve">2.4 Backend API Endpoints</w:t>
       </w:r>
     </w:p>
     <w:tbl>
@@ -1569,7 +1735,7 @@
           <w:bCs/>
           <w:color w:val="1D2D3E"/>
         </w:rPr>
-        <w:t xml:space="preserve">3. Implemented Features (Session 1)</w:t>
+        <w:t xml:space="preserve">3. Implemented Features</w:t>
       </w:r>
     </w:p>
     <w:p>
@@ -1583,7 +1749,21 @@
           <w:bCs/>
           <w:color w:val="1D2D3E"/>
         </w:rPr>
-        <w:t xml:space="preserve">3.1 Project Scaffolding</w:t>
+        <w:t xml:space="preserve">3.1 Session 1 — Project Scaffolding &amp; Core Screens</w:t>
+      </w:r>
+    </w:p>
+    <w:p>
+      <w:pPr>
+        <w:pStyle w:val="Heading3"/>
+        <w:spacing w:after="120" w:before="300"/>
+      </w:pPr>
+      <w:r>
+        <w:rPr>
+          <w:b/>
+          <w:bCs/>
+          <w:color w:val="1D2D3E"/>
+        </w:rPr>
+        <w:t xml:space="preserve">3.1.1 Project Scaffolding</w:t>
       </w:r>
     </w:p>
     <w:p>
@@ -1642,20 +1822,614 @@
     </w:p>
     <w:p>
       <w:pPr>
-        <w:pStyle w:val="ListParagraph"/>
-        <w:numPr>
-          <w:ilvl w:val="0"/>
-          <w:numId w:val="1"/>
-        </w:numPr>
-        <w:spacing w:after="40"/>
-      </w:pPr>
-      <w:r>
-        <w:rPr>
-          <w:color w:val="1D2D3E"/>
-          <w:sz w:val="22"/>
-          <w:szCs w:val="22"/>
-        </w:rPr>
-        <w:t xml:space="preserve">.gitignore configured for mobile artifacts</w:t>
+        <w:spacing w:after="80"/>
+      </w:pPr>
+      <w:r>
+        <w:rPr>
+          <w:color w:val="1D2D3E"/>
+          <w:sz w:val="22"/>
+          <w:szCs w:val="22"/>
+        </w:rPr>
+        <w:t xml:space="preserve"/>
+      </w:r>
+    </w:p>
+    <w:p>
+      <w:pPr>
+        <w:pStyle w:val="Heading3"/>
+        <w:spacing w:after="120" w:before="300"/>
+      </w:pPr>
+      <w:r>
+        <w:rPr>
+          <w:b/>
+          <w:bCs/>
+          <w:color w:val="1D2D3E"/>
+        </w:rPr>
+        <w:t xml:space="preserve">3.1.2 Design System (src/theme/index.ts)</w:t>
+      </w:r>
+    </w:p>
+    <w:p>
+      <w:pPr>
+        <w:pStyle w:val="ListParagraph"/>
+        <w:numPr>
+          <w:ilvl w:val="0"/>
+          <w:numId w:val="1"/>
+        </w:numPr>
+        <w:spacing w:after="40"/>
+      </w:pPr>
+      <w:r>
+        <w:rPr>
+          <w:color w:val="1D2D3E"/>
+          <w:sz w:val="22"/>
+          <w:szCs w:val="22"/>
+        </w:rPr>
+        <w:t xml:space="preserve">Full color palette matching web app (primary blue #0A6ED1, greens, reds, oranges)</w:t>
+      </w:r>
+    </w:p>
+    <w:p>
+      <w:pPr>
+        <w:pStyle w:val="ListParagraph"/>
+        <w:numPr>
+          <w:ilvl w:val="0"/>
+          <w:numId w:val="1"/>
+        </w:numPr>
+        <w:spacing w:after="40"/>
+      </w:pPr>
+      <w:r>
+        <w:rPr>
+          <w:color w:val="1D2D3E"/>
+          <w:sz w:val="22"/>
+          <w:szCs w:val="22"/>
+        </w:rPr>
+        <w:t xml:space="preserve">Voucher type badge colors (JV, GRN, DN, PAY, REC, INV, SO, PO)</w:t>
+      </w:r>
+    </w:p>
+    <w:p>
+      <w:pPr>
+        <w:pStyle w:val="ListParagraph"/>
+        <w:numPr>
+          <w:ilvl w:val="0"/>
+          <w:numId w:val="1"/>
+        </w:numPr>
+        <w:spacing w:after="40"/>
+      </w:pPr>
+      <w:r>
+        <w:rPr>
+          <w:color w:val="1D2D3E"/>
+          <w:sz w:val="22"/>
+          <w:szCs w:val="22"/>
+        </w:rPr>
+        <w:t xml:space="preserve">Spacing scale, border radius tokens, shadow presets, typography scale</w:t>
+      </w:r>
+    </w:p>
+    <w:p>
+      <w:pPr>
+        <w:spacing w:after="80"/>
+      </w:pPr>
+      <w:r>
+        <w:rPr>
+          <w:color w:val="1D2D3E"/>
+          <w:sz w:val="22"/>
+          <w:szCs w:val="22"/>
+        </w:rPr>
+        <w:t xml:space="preserve"/>
+      </w:r>
+    </w:p>
+    <w:p>
+      <w:pPr>
+        <w:pStyle w:val="Heading3"/>
+        <w:spacing w:after="120" w:before="300"/>
+      </w:pPr>
+      <w:r>
+        <w:rPr>
+          <w:b/>
+          <w:bCs/>
+          <w:color w:val="1D2D3E"/>
+        </w:rPr>
+        <w:t xml:space="preserve">3.1.3 API Client (src/api/client.ts)</w:t>
+      </w:r>
+    </w:p>
+    <w:p>
+      <w:pPr>
+        <w:pStyle w:val="ListParagraph"/>
+        <w:numPr>
+          <w:ilvl w:val="0"/>
+          <w:numId w:val="1"/>
+        </w:numPr>
+        <w:spacing w:after="40"/>
+      </w:pPr>
+      <w:r>
+        <w:rPr>
+          <w:color w:val="1D2D3E"/>
+          <w:sz w:val="22"/>
+          <w:szCs w:val="22"/>
+        </w:rPr>
+        <w:t xml:space="preserve">Fetch wrapper with automatic JWT token attachment</w:t>
+      </w:r>
+    </w:p>
+    <w:p>
+      <w:pPr>
+        <w:pStyle w:val="ListParagraph"/>
+        <w:numPr>
+          <w:ilvl w:val="0"/>
+          <w:numId w:val="1"/>
+        </w:numPr>
+        <w:spacing w:after="40"/>
+      </w:pPr>
+      <w:r>
+        <w:rPr>
+          <w:color w:val="1D2D3E"/>
+          <w:sz w:val="22"/>
+          <w:szCs w:val="22"/>
+        </w:rPr>
+        <w:t xml:space="preserve">Token stored/retrieved via expo-secure-store (encrypted device storage)</w:t>
+      </w:r>
+    </w:p>
+    <w:p>
+      <w:pPr>
+        <w:pStyle w:val="ListParagraph"/>
+        <w:numPr>
+          <w:ilvl w:val="0"/>
+          <w:numId w:val="1"/>
+        </w:numPr>
+        <w:spacing w:after="40"/>
+      </w:pPr>
+      <w:r>
+        <w:rPr>
+          <w:color w:val="1D2D3E"/>
+          <w:sz w:val="22"/>
+          <w:szCs w:val="22"/>
+        </w:rPr>
+        <w:t xml:space="preserve">Sends Cookie: auth_token=&lt;token&gt; header on all requests</w:t>
+      </w:r>
+    </w:p>
+    <w:p>
+      <w:pPr>
+        <w:pStyle w:val="ListParagraph"/>
+        <w:numPr>
+          <w:ilvl w:val="0"/>
+          <w:numId w:val="1"/>
+        </w:numPr>
+        <w:spacing w:after="40"/>
+      </w:pPr>
+      <w:r>
+        <w:rPr>
+          <w:color w:val="1D2D3E"/>
+          <w:sz w:val="22"/>
+          <w:szCs w:val="22"/>
+        </w:rPr>
+        <w:t xml:space="preserve">Configurable base URL via EXPO_PUBLIC_API_URL env var</w:t>
+      </w:r>
+    </w:p>
+    <w:p>
+      <w:pPr>
+        <w:spacing w:after="80"/>
+      </w:pPr>
+      <w:r>
+        <w:rPr>
+          <w:color w:val="1D2D3E"/>
+          <w:sz w:val="22"/>
+          <w:szCs w:val="22"/>
+        </w:rPr>
+        <w:t xml:space="preserve"/>
+      </w:r>
+    </w:p>
+    <w:p>
+      <w:pPr>
+        <w:pStyle w:val="Heading3"/>
+        <w:spacing w:after="120" w:before="300"/>
+      </w:pPr>
+      <w:r>
+        <w:rPr>
+          <w:b/>
+          <w:bCs/>
+          <w:color w:val="1D2D3E"/>
+        </w:rPr>
+        <w:t xml:space="preserve">3.1.4 Auth Context (src/context/AuthContext.tsx)</w:t>
+      </w:r>
+    </w:p>
+    <w:p>
+      <w:pPr>
+        <w:pStyle w:val="ListParagraph"/>
+        <w:numPr>
+          <w:ilvl w:val="0"/>
+          <w:numId w:val="1"/>
+        </w:numPr>
+        <w:spacing w:after="40"/>
+      </w:pPr>
+      <w:r>
+        <w:rPr>
+          <w:color w:val="1D2D3E"/>
+          <w:sz w:val="22"/>
+          <w:szCs w:val="22"/>
+        </w:rPr>
+        <w:t xml:space="preserve">React context with loginAs / logout actions</w:t>
+      </w:r>
+    </w:p>
+    <w:p>
+      <w:pPr>
+        <w:pStyle w:val="ListParagraph"/>
+        <w:numPr>
+          <w:ilvl w:val="0"/>
+          <w:numId w:val="1"/>
+        </w:numPr>
+        <w:spacing w:after="40"/>
+      </w:pPr>
+      <w:r>
+        <w:rPr>
+          <w:color w:val="1D2D3E"/>
+          <w:sz w:val="22"/>
+          <w:szCs w:val="22"/>
+        </w:rPr>
+        <w:t xml:space="preserve">Restores session from stored JWT on app start (decodes payload)</w:t>
+      </w:r>
+    </w:p>
+    <w:p>
+      <w:pPr>
+        <w:pStyle w:val="ListParagraph"/>
+        <w:numPr>
+          <w:ilvl w:val="0"/>
+          <w:numId w:val="1"/>
+        </w:numPr>
+        <w:spacing w:after="40"/>
+      </w:pPr>
+      <w:r>
+        <w:rPr>
+          <w:color w:val="1D2D3E"/>
+          <w:sz w:val="22"/>
+          <w:szCs w:val="22"/>
+        </w:rPr>
+        <w:t xml:space="preserve">Three states: loading, unauthenticated, authenticated</w:t>
+      </w:r>
+    </w:p>
+    <w:p>
+      <w:pPr>
+        <w:pStyle w:val="ListParagraph"/>
+        <w:numPr>
+          <w:ilvl w:val="0"/>
+          <w:numId w:val="1"/>
+        </w:numPr>
+        <w:spacing w:after="40"/>
+      </w:pPr>
+      <w:r>
+        <w:rPr>
+          <w:color w:val="1D2D3E"/>
+          <w:sz w:val="22"/>
+          <w:szCs w:val="22"/>
+        </w:rPr>
+        <w:t xml:space="preserve">useAuth() hook for consuming components</w:t>
+      </w:r>
+    </w:p>
+    <w:p>
+      <w:pPr>
+        <w:spacing w:after="80"/>
+      </w:pPr>
+      <w:r>
+        <w:rPr>
+          <w:color w:val="1D2D3E"/>
+          <w:sz w:val="22"/>
+          <w:szCs w:val="22"/>
+        </w:rPr>
+        <w:t xml:space="preserve"/>
+      </w:r>
+    </w:p>
+    <w:p>
+      <w:pPr>
+        <w:pStyle w:val="Heading3"/>
+        <w:spacing w:after="120" w:before="300"/>
+      </w:pPr>
+      <w:r>
+        <w:rPr>
+          <w:b/>
+          <w:bCs/>
+          <w:color w:val="1D2D3E"/>
+        </w:rPr>
+        <w:t xml:space="preserve">3.1.5 Login Screen (src/screens/auth/LoginScreen.tsx)</w:t>
+      </w:r>
+    </w:p>
+    <w:p>
+      <w:pPr>
+        <w:pStyle w:val="ListParagraph"/>
+        <w:numPr>
+          <w:ilvl w:val="0"/>
+          <w:numId w:val="1"/>
+        </w:numPr>
+        <w:spacing w:after="40"/>
+      </w:pPr>
+      <w:r>
+        <w:rPr>
+          <w:color w:val="1D2D3E"/>
+          <w:sz w:val="22"/>
+          <w:szCs w:val="22"/>
+        </w:rPr>
+        <w:t xml:space="preserve">Fetches employee list from /api/employees</w:t>
+      </w:r>
+    </w:p>
+    <w:p>
+      <w:pPr>
+        <w:pStyle w:val="ListParagraph"/>
+        <w:numPr>
+          <w:ilvl w:val="0"/>
+          <w:numId w:val="1"/>
+        </w:numPr>
+        <w:spacing w:after="40"/>
+      </w:pPr>
+      <w:r>
+        <w:rPr>
+          <w:color w:val="1D2D3E"/>
+          <w:sz w:val="22"/>
+          <w:szCs w:val="22"/>
+        </w:rPr>
+        <w:t xml:space="preserve">Card list with avatar initials, name, email, role badge</w:t>
+      </w:r>
+    </w:p>
+    <w:p>
+      <w:pPr>
+        <w:pStyle w:val="ListParagraph"/>
+        <w:numPr>
+          <w:ilvl w:val="0"/>
+          <w:numId w:val="1"/>
+        </w:numPr>
+        <w:spacing w:after="40"/>
+      </w:pPr>
+      <w:r>
+        <w:rPr>
+          <w:color w:val="1D2D3E"/>
+          <w:sz w:val="22"/>
+          <w:szCs w:val="22"/>
+        </w:rPr>
+        <w:t xml:space="preserve">Tap to login — calls /api/auth/switch, stores JWT token</w:t>
+      </w:r>
+    </w:p>
+    <w:p>
+      <w:pPr>
+        <w:pStyle w:val="ListParagraph"/>
+        <w:numPr>
+          <w:ilvl w:val="0"/>
+          <w:numId w:val="1"/>
+        </w:numPr>
+        <w:spacing w:after="40"/>
+      </w:pPr>
+      <w:r>
+        <w:rPr>
+          <w:color w:val="1D2D3E"/>
+          <w:sz w:val="22"/>
+          <w:szCs w:val="22"/>
+        </w:rPr>
+        <w:t xml:space="preserve">Loading and error states with retry button</w:t>
+      </w:r>
+    </w:p>
+    <w:p>
+      <w:pPr>
+        <w:spacing w:after="80"/>
+      </w:pPr>
+      <w:r>
+        <w:rPr>
+          <w:color w:val="1D2D3E"/>
+          <w:sz w:val="22"/>
+          <w:szCs w:val="22"/>
+        </w:rPr>
+        <w:t xml:space="preserve"/>
+      </w:r>
+    </w:p>
+    <w:p>
+      <w:pPr>
+        <w:pStyle w:val="Heading3"/>
+        <w:spacing w:after="120" w:before="300"/>
+      </w:pPr>
+      <w:r>
+        <w:rPr>
+          <w:b/>
+          <w:bCs/>
+          <w:color w:val="1D2D3E"/>
+        </w:rPr>
+        <w:t xml:space="preserve">3.1.6 Dashboard Screen (src/screens/dashboard/DashboardScreen.tsx)</w:t>
+      </w:r>
+    </w:p>
+    <w:p>
+      <w:pPr>
+        <w:pStyle w:val="ListParagraph"/>
+        <w:numPr>
+          <w:ilvl w:val="0"/>
+          <w:numId w:val="1"/>
+        </w:numPr>
+        <w:spacing w:after="40"/>
+      </w:pPr>
+      <w:r>
+        <w:rPr>
+          <w:color w:val="1D2D3E"/>
+          <w:sz w:val="22"/>
+          <w:szCs w:val="22"/>
+        </w:rPr>
+        <w:t xml:space="preserve">Top bar with time-based greeting, user name/role, sign out button</w:t>
+      </w:r>
+    </w:p>
+    <w:p>
+      <w:pPr>
+        <w:pStyle w:val="ListParagraph"/>
+        <w:numPr>
+          <w:ilvl w:val="0"/>
+          <w:numId w:val="1"/>
+        </w:numPr>
+        <w:spacing w:after="40"/>
+      </w:pPr>
+      <w:r>
+        <w:rPr>
+          <w:color w:val="1D2D3E"/>
+          <w:sz w:val="22"/>
+          <w:szCs w:val="22"/>
+        </w:rPr>
+        <w:t xml:space="preserve">Pull-to-refresh support</w:t>
+      </w:r>
+    </w:p>
+    <w:p>
+      <w:pPr>
+        <w:pStyle w:val="ListParagraph"/>
+        <w:numPr>
+          <w:ilvl w:val="0"/>
+          <w:numId w:val="1"/>
+        </w:numPr>
+        <w:spacing w:after="40"/>
+      </w:pPr>
+      <w:r>
+        <w:rPr>
+          <w:color w:val="1D2D3E"/>
+          <w:sz w:val="22"/>
+          <w:szCs w:val="22"/>
+        </w:rPr>
+        <w:t xml:space="preserve">3×2 KPI grid: Revenue, Expenses, Net Income, Cash &amp; Bank, Receivables, Payables</w:t>
+      </w:r>
+    </w:p>
+    <w:p>
+      <w:pPr>
+        <w:pStyle w:val="ListParagraph"/>
+        <w:numPr>
+          <w:ilvl w:val="0"/>
+          <w:numId w:val="1"/>
+        </w:numPr>
+        <w:spacing w:after="40"/>
+      </w:pPr>
+      <w:r>
+        <w:rPr>
+          <w:color w:val="1D2D3E"/>
+          <w:sz w:val="22"/>
+          <w:szCs w:val="22"/>
+        </w:rPr>
+        <w:t xml:space="preserve">Working Capital panel (Cash + AR − AP = Net)</w:t>
+      </w:r>
+    </w:p>
+    <w:p>
+      <w:pPr>
+        <w:pStyle w:val="ListParagraph"/>
+        <w:numPr>
+          <w:ilvl w:val="0"/>
+          <w:numId w:val="1"/>
+        </w:numPr>
+        <w:spacing w:after="40"/>
+      </w:pPr>
+      <w:r>
+        <w:rPr>
+          <w:color w:val="1D2D3E"/>
+          <w:sz w:val="22"/>
+          <w:szCs w:val="22"/>
+        </w:rPr>
+        <w:t xml:space="preserve">Quick Actions grid: wired to Inventory, Materials, Purchase Orders (others disabled until built)</w:t>
+      </w:r>
+    </w:p>
+    <w:p>
+      <w:pPr>
+        <w:pStyle w:val="ListParagraph"/>
+        <w:numPr>
+          <w:ilvl w:val="0"/>
+          <w:numId w:val="1"/>
+        </w:numPr>
+        <w:spacing w:after="40"/>
+      </w:pPr>
+      <w:r>
+        <w:rPr>
+          <w:color w:val="1D2D3E"/>
+          <w:sz w:val="22"/>
+          <w:szCs w:val="22"/>
+        </w:rPr>
+        <w:t xml:space="preserve">Recent Activity list (last 20 vouchers with type badge, number, date, amount, status)</w:t>
+      </w:r>
+    </w:p>
+    <w:p>
+      <w:pPr>
+        <w:spacing w:after="80"/>
+      </w:pPr>
+      <w:r>
+        <w:rPr>
+          <w:color w:val="1D2D3E"/>
+          <w:sz w:val="22"/>
+          <w:szCs w:val="22"/>
+        </w:rPr>
+        <w:t xml:space="preserve"/>
+      </w:r>
+    </w:p>
+    <w:p>
+      <w:pPr>
+        <w:pStyle w:val="Heading3"/>
+        <w:spacing w:after="120" w:before="300"/>
+      </w:pPr>
+      <w:r>
+        <w:rPr>
+          <w:b/>
+          <w:bCs/>
+          <w:color w:val="1D2D3E"/>
+        </w:rPr>
+        <w:t xml:space="preserve">3.1.7 Shared Components (src/components/)</w:t>
+      </w:r>
+    </w:p>
+    <w:p>
+      <w:pPr>
+        <w:pStyle w:val="ListParagraph"/>
+        <w:numPr>
+          <w:ilvl w:val="0"/>
+          <w:numId w:val="1"/>
+        </w:numPr>
+        <w:spacing w:after="40"/>
+      </w:pPr>
+      <w:r>
+        <w:rPr>
+          <w:color w:val="1D2D3E"/>
+          <w:sz w:val="22"/>
+          <w:szCs w:val="22"/>
+        </w:rPr>
+        <w:t xml:space="preserve">LoadingView — centered spinner with optional message</w:t>
+      </w:r>
+    </w:p>
+    <w:p>
+      <w:pPr>
+        <w:pStyle w:val="ListParagraph"/>
+        <w:numPr>
+          <w:ilvl w:val="0"/>
+          <w:numId w:val="1"/>
+        </w:numPr>
+        <w:spacing w:after="40"/>
+      </w:pPr>
+      <w:r>
+        <w:rPr>
+          <w:color w:val="1D2D3E"/>
+          <w:sz w:val="22"/>
+          <w:szCs w:val="22"/>
+        </w:rPr>
+        <w:t xml:space="preserve">ErrorView — error message with retry button</w:t>
+      </w:r>
+    </w:p>
+    <w:p>
+      <w:pPr>
+        <w:pStyle w:val="ListParagraph"/>
+        <w:numPr>
+          <w:ilvl w:val="0"/>
+          <w:numId w:val="1"/>
+        </w:numPr>
+        <w:spacing w:after="40"/>
+      </w:pPr>
+      <w:r>
+        <w:rPr>
+          <w:color w:val="1D2D3E"/>
+          <w:sz w:val="22"/>
+          <w:szCs w:val="22"/>
+        </w:rPr>
+        <w:t xml:space="preserve">KPICard — metric card (label / value / subtext, optional color)</w:t>
+      </w:r>
+    </w:p>
+    <w:p>
+      <w:pPr>
+        <w:pStyle w:val="ListParagraph"/>
+        <w:numPr>
+          <w:ilvl w:val="0"/>
+          <w:numId w:val="1"/>
+        </w:numPr>
+        <w:spacing w:after="40"/>
+      </w:pPr>
+      <w:r>
+        <w:rPr>
+          <w:color w:val="1D2D3E"/>
+          <w:sz w:val="22"/>
+          <w:szCs w:val="22"/>
+        </w:rPr>
+        <w:t xml:space="preserve">SectionHeader — section title with optional right-side meta text</w:t>
       </w:r>
     </w:p>
     <w:p>
@@ -1682,79 +2456,12 @@
           <w:bCs/>
           <w:color w:val="1D2D3E"/>
         </w:rPr>
-        <w:t xml:space="preserve">3.2 Design System (src/theme/index.ts)</w:t>
-      </w:r>
-    </w:p>
-    <w:p>
-      <w:pPr>
-        <w:pStyle w:val="ListParagraph"/>
-        <w:numPr>
-          <w:ilvl w:val="0"/>
-          <w:numId w:val="1"/>
-        </w:numPr>
-        <w:spacing w:after="40"/>
-      </w:pPr>
-      <w:r>
-        <w:rPr>
-          <w:color w:val="1D2D3E"/>
-          <w:sz w:val="22"/>
-          <w:szCs w:val="22"/>
-        </w:rPr>
-        <w:t xml:space="preserve">Full color palette matching web app (primary blue #0A6ED1, greens, reds, oranges)</w:t>
-      </w:r>
-    </w:p>
-    <w:p>
-      <w:pPr>
-        <w:pStyle w:val="ListParagraph"/>
-        <w:numPr>
-          <w:ilvl w:val="0"/>
-          <w:numId w:val="1"/>
-        </w:numPr>
-        <w:spacing w:after="40"/>
-      </w:pPr>
-      <w:r>
-        <w:rPr>
-          <w:color w:val="1D2D3E"/>
-          <w:sz w:val="22"/>
-          <w:szCs w:val="22"/>
-        </w:rPr>
-        <w:t xml:space="preserve">Voucher type badge colors (JV, GRN, DN, PAY, REC, INV, SO, PO)</w:t>
-      </w:r>
-    </w:p>
-    <w:p>
-      <w:pPr>
-        <w:pStyle w:val="ListParagraph"/>
-        <w:numPr>
-          <w:ilvl w:val="0"/>
-          <w:numId w:val="1"/>
-        </w:numPr>
-        <w:spacing w:after="40"/>
-      </w:pPr>
-      <w:r>
-        <w:rPr>
-          <w:color w:val="1D2D3E"/>
-          <w:sz w:val="22"/>
-          <w:szCs w:val="22"/>
-        </w:rPr>
-        <w:t xml:space="preserve">Spacing scale, border radius tokens, shadow presets, typography scale</w:t>
-      </w:r>
-    </w:p>
-    <w:p>
-      <w:pPr>
-        <w:spacing w:after="80"/>
-      </w:pPr>
-      <w:r>
-        <w:rPr>
-          <w:color w:val="1D2D3E"/>
-          <w:sz w:val="22"/>
-          <w:szCs w:val="22"/>
-        </w:rPr>
-        <w:t xml:space="preserve"/>
-      </w:r>
-    </w:p>
-    <w:p>
-      <w:pPr>
-        <w:pStyle w:val="Heading2"/>
+        <w:t xml:space="preserve">3.2 Session 2 — Phase 1 Core Data Screens</w:t>
+      </w:r>
+    </w:p>
+    <w:p>
+      <w:pPr>
+        <w:pStyle w:val="Heading3"/>
         <w:spacing w:after="120" w:before="300"/>
       </w:pPr>
       <w:r>
@@ -1763,43 +2470,205 @@
           <w:bCs/>
           <w:color w:val="1D2D3E"/>
         </w:rPr>
-        <w:t xml:space="preserve">3.3 Utilities (src/utils/currency.ts)</w:t>
-      </w:r>
-    </w:p>
-    <w:p>
-      <w:pPr>
-        <w:pStyle w:val="ListParagraph"/>
-        <w:numPr>
-          <w:ilvl w:val="0"/>
-          <w:numId w:val="1"/>
-        </w:numPr>
-        <w:spacing w:after="40"/>
-      </w:pPr>
-      <w:r>
-        <w:rPr>
-          <w:color w:val="1D2D3E"/>
-          <w:sz w:val="22"/>
-          <w:szCs w:val="22"/>
-        </w:rPr>
-        <w:t xml:space="preserve">formatCurrency(amount) — PKR formatting with M/B abbreviations</w:t>
-      </w:r>
-    </w:p>
-    <w:p>
-      <w:pPr>
-        <w:pStyle w:val="ListParagraph"/>
-        <w:numPr>
-          <w:ilvl w:val="0"/>
-          <w:numId w:val="1"/>
-        </w:numPr>
-        <w:spacing w:after="40"/>
-      </w:pPr>
-      <w:r>
-        <w:rPr>
-          <w:color w:val="1D2D3E"/>
-          <w:sz w:val="22"/>
-          <w:szCs w:val="22"/>
-        </w:rPr>
-        <w:t xml:space="preserve">formatDate / formatShortDate helpers</w:t>
+        <w:t xml:space="preserve">3.2.1 Inventory Screen (src/screens/inventory/InventoryScreen.tsx)</w:t>
+      </w:r>
+    </w:p>
+    <w:p>
+      <w:pPr>
+        <w:pStyle w:val="ListParagraph"/>
+        <w:numPr>
+          <w:ilvl w:val="0"/>
+          <w:numId w:val="1"/>
+        </w:numPr>
+        <w:spacing w:after="40"/>
+      </w:pPr>
+      <w:r>
+        <w:rPr>
+          <w:color w:val="1D2D3E"/>
+          <w:sz w:val="22"/>
+          <w:szCs w:val="22"/>
+        </w:rPr>
+        <w:t xml:space="preserve">In-screen tab bar: Stock Balances | Stock Ledger</w:t>
+      </w:r>
+    </w:p>
+    <w:p>
+      <w:pPr>
+        <w:pStyle w:val="ListParagraph"/>
+        <w:numPr>
+          <w:ilvl w:val="0"/>
+          <w:numId w:val="1"/>
+        </w:numPr>
+        <w:spacing w:after="40"/>
+      </w:pPr>
+      <w:r>
+        <w:rPr>
+          <w:color w:val="1D2D3E"/>
+          <w:sz w:val="22"/>
+          <w:szCs w:val="22"/>
+        </w:rPr>
+        <w:t xml:space="preserve">Stock Balances tab:</w:t>
+      </w:r>
+    </w:p>
+    <w:p>
+      <w:pPr>
+        <w:pStyle w:val="ListParagraph"/>
+        <w:numPr>
+          <w:ilvl w:val="1"/>
+          <w:numId w:val="1"/>
+        </w:numPr>
+        <w:spacing w:after="40"/>
+      </w:pPr>
+      <w:r>
+        <w:rPr>
+          <w:color w:val="1D2D3E"/>
+          <w:sz w:val="22"/>
+          <w:szCs w:val="22"/>
+        </w:rPr>
+        <w:t xml:space="preserve">  Summary strip showing total item count and total stock value</w:t>
+      </w:r>
+    </w:p>
+    <w:p>
+      <w:pPr>
+        <w:pStyle w:val="ListParagraph"/>
+        <w:numPr>
+          <w:ilvl w:val="1"/>
+          <w:numId w:val="1"/>
+        </w:numPr>
+        <w:spacing w:after="40"/>
+      </w:pPr>
+      <w:r>
+        <w:rPr>
+          <w:color w:val="1D2D3E"/>
+          <w:sz w:val="22"/>
+          <w:szCs w:val="22"/>
+        </w:rPr>
+        <w:t xml:space="preserve">  Search bar (filters by item name, code, warehouse, category)</w:t>
+      </w:r>
+    </w:p>
+    <w:p>
+      <w:pPr>
+        <w:pStyle w:val="ListParagraph"/>
+        <w:numPr>
+          <w:ilvl w:val="1"/>
+          <w:numId w:val="1"/>
+        </w:numPr>
+        <w:spacing w:after="40"/>
+      </w:pPr>
+      <w:r>
+        <w:rPr>
+          <w:color w:val="1D2D3E"/>
+          <w:sz w:val="22"/>
+          <w:szCs w:val="22"/>
+        </w:rPr>
+        <w:t xml:space="preserve">  Card list: item name, code, warehouse, category badge, quantity (color-coded), UOM, value</w:t>
+      </w:r>
+    </w:p>
+    <w:p>
+      <w:pPr>
+        <w:pStyle w:val="ListParagraph"/>
+        <w:numPr>
+          <w:ilvl w:val="1"/>
+          <w:numId w:val="1"/>
+        </w:numPr>
+        <w:spacing w:after="40"/>
+      </w:pPr>
+      <w:r>
+        <w:rPr>
+          <w:color w:val="1D2D3E"/>
+          <w:sz w:val="22"/>
+          <w:szCs w:val="22"/>
+        </w:rPr>
+        <w:t xml:space="preserve">  Pull-to-refresh</w:t>
+      </w:r>
+    </w:p>
+    <w:p>
+      <w:pPr>
+        <w:pStyle w:val="ListParagraph"/>
+        <w:numPr>
+          <w:ilvl w:val="0"/>
+          <w:numId w:val="1"/>
+        </w:numPr>
+        <w:spacing w:after="40"/>
+      </w:pPr>
+      <w:r>
+        <w:rPr>
+          <w:color w:val="1D2D3E"/>
+          <w:sz w:val="22"/>
+          <w:szCs w:val="22"/>
+        </w:rPr>
+        <w:t xml:space="preserve">Stock Ledger tab:</w:t>
+      </w:r>
+    </w:p>
+    <w:p>
+      <w:pPr>
+        <w:pStyle w:val="ListParagraph"/>
+        <w:numPr>
+          <w:ilvl w:val="1"/>
+          <w:numId w:val="1"/>
+        </w:numPr>
+        <w:spacing w:after="40"/>
+      </w:pPr>
+      <w:r>
+        <w:rPr>
+          <w:color w:val="1D2D3E"/>
+          <w:sz w:val="22"/>
+          <w:szCs w:val="22"/>
+        </w:rPr>
+        <w:t xml:space="preserve">  Lazy-loads on first tab switch to avoid redundant API calls</w:t>
+      </w:r>
+    </w:p>
+    <w:p>
+      <w:pPr>
+        <w:pStyle w:val="ListParagraph"/>
+        <w:numPr>
+          <w:ilvl w:val="1"/>
+          <w:numId w:val="1"/>
+        </w:numPr>
+        <w:spacing w:after="40"/>
+      </w:pPr>
+      <w:r>
+        <w:rPr>
+          <w:color w:val="1D2D3E"/>
+          <w:sz w:val="22"/>
+          <w:szCs w:val="22"/>
+        </w:rPr>
+        <w:t xml:space="preserve">  Transaction cards: voucher type badge, voucher number, date, item, warehouse</w:t>
+      </w:r>
+    </w:p>
+    <w:p>
+      <w:pPr>
+        <w:pStyle w:val="ListParagraph"/>
+        <w:numPr>
+          <w:ilvl w:val="1"/>
+          <w:numId w:val="1"/>
+        </w:numPr>
+        <w:spacing w:after="40"/>
+      </w:pPr>
+      <w:r>
+        <w:rPr>
+          <w:color w:val="1D2D3E"/>
+          <w:sz w:val="22"/>
+          <w:szCs w:val="22"/>
+        </w:rPr>
+        <w:t xml:space="preserve">  Qty IN (green) / Qty OUT (red) / Balance columns per transaction</w:t>
+      </w:r>
+    </w:p>
+    <w:p>
+      <w:pPr>
+        <w:pStyle w:val="ListParagraph"/>
+        <w:numPr>
+          <w:ilvl w:val="0"/>
+          <w:numId w:val="1"/>
+        </w:numPr>
+        <w:spacing w:after="40"/>
+      </w:pPr>
+      <w:r>
+        <w:rPr>
+          <w:color w:val="1D2D3E"/>
+          <w:sz w:val="22"/>
+          <w:szCs w:val="22"/>
+        </w:rPr>
+        <w:t xml:space="preserve">Back button shown when navigated from Quick Actions; hidden when accessed via bottom tab</w:t>
       </w:r>
     </w:p>
     <w:p>
@@ -1817,7 +2686,7 @@
     </w:p>
     <w:p>
       <w:pPr>
-        <w:pStyle w:val="Heading2"/>
+        <w:pStyle w:val="Heading3"/>
         <w:spacing w:after="120" w:before="300"/>
       </w:pPr>
       <w:r>
@@ -1826,79 +2695,115 @@
           <w:bCs/>
           <w:color w:val="1D2D3E"/>
         </w:rPr>
-        <w:t xml:space="preserve">3.4 API Client (src/api/client.ts)</w:t>
-      </w:r>
-    </w:p>
-    <w:p>
-      <w:pPr>
-        <w:pStyle w:val="ListParagraph"/>
-        <w:numPr>
-          <w:ilvl w:val="0"/>
-          <w:numId w:val="1"/>
-        </w:numPr>
-        <w:spacing w:after="40"/>
-      </w:pPr>
-      <w:r>
-        <w:rPr>
-          <w:color w:val="1D2D3E"/>
-          <w:sz w:val="22"/>
-          <w:szCs w:val="22"/>
-        </w:rPr>
-        <w:t xml:space="preserve">Fetch wrapper with automatic JWT token attachment</w:t>
-      </w:r>
-    </w:p>
-    <w:p>
-      <w:pPr>
-        <w:pStyle w:val="ListParagraph"/>
-        <w:numPr>
-          <w:ilvl w:val="0"/>
-          <w:numId w:val="1"/>
-        </w:numPr>
-        <w:spacing w:after="40"/>
-      </w:pPr>
-      <w:r>
-        <w:rPr>
-          <w:color w:val="1D2D3E"/>
-          <w:sz w:val="22"/>
-          <w:szCs w:val="22"/>
-        </w:rPr>
-        <w:t xml:space="preserve">Token stored/retrieved via expo-secure-store</w:t>
-      </w:r>
-    </w:p>
-    <w:p>
-      <w:pPr>
-        <w:pStyle w:val="ListParagraph"/>
-        <w:numPr>
-          <w:ilvl w:val="0"/>
-          <w:numId w:val="1"/>
-        </w:numPr>
-        <w:spacing w:after="40"/>
-      </w:pPr>
-      <w:r>
-        <w:rPr>
-          <w:color w:val="1D2D3E"/>
-          <w:sz w:val="22"/>
-          <w:szCs w:val="22"/>
-        </w:rPr>
-        <w:t xml:space="preserve">Sends Cookie: auth_token=&lt;token&gt; header on all requests</w:t>
-      </w:r>
-    </w:p>
-    <w:p>
-      <w:pPr>
-        <w:pStyle w:val="ListParagraph"/>
-        <w:numPr>
-          <w:ilvl w:val="0"/>
-          <w:numId w:val="1"/>
-        </w:numPr>
-        <w:spacing w:after="40"/>
-      </w:pPr>
-      <w:r>
-        <w:rPr>
-          <w:color w:val="1D2D3E"/>
-          <w:sz w:val="22"/>
-          <w:szCs w:val="22"/>
-        </w:rPr>
-        <w:t xml:space="preserve">Configurable base URL via EXPO_PUBLIC_API_URL env var</w:t>
+        <w:t xml:space="preserve">3.2.2 Materials Screen (src/screens/materials/MaterialsScreen.tsx)</w:t>
+      </w:r>
+    </w:p>
+    <w:p>
+      <w:pPr>
+        <w:pStyle w:val="ListParagraph"/>
+        <w:numPr>
+          <w:ilvl w:val="0"/>
+          <w:numId w:val="1"/>
+        </w:numPr>
+        <w:spacing w:after="40"/>
+      </w:pPr>
+      <w:r>
+        <w:rPr>
+          <w:color w:val="1D2D3E"/>
+          <w:sz w:val="22"/>
+          <w:szCs w:val="22"/>
+        </w:rPr>
+        <w:t xml:space="preserve">Search bar filtering by name, code, type, and description</w:t>
+      </w:r>
+    </w:p>
+    <w:p>
+      <w:pPr>
+        <w:pStyle w:val="ListParagraph"/>
+        <w:numPr>
+          <w:ilvl w:val="0"/>
+          <w:numId w:val="1"/>
+        </w:numPr>
+        <w:spacing w:after="40"/>
+      </w:pPr>
+      <w:r>
+        <w:rPr>
+          <w:color w:val="1D2D3E"/>
+          <w:sz w:val="22"/>
+          <w:szCs w:val="22"/>
+        </w:rPr>
+        <w:t xml:space="preserve">Status filter chips: All | Active | Inactive</w:t>
+      </w:r>
+    </w:p>
+    <w:p>
+      <w:pPr>
+        <w:pStyle w:val="ListParagraph"/>
+        <w:numPr>
+          <w:ilvl w:val="0"/>
+          <w:numId w:val="1"/>
+        </w:numPr>
+        <w:spacing w:after="40"/>
+      </w:pPr>
+      <w:r>
+        <w:rPr>
+          <w:color w:val="1D2D3E"/>
+          <w:sz w:val="22"/>
+          <w:szCs w:val="22"/>
+        </w:rPr>
+        <w:t xml:space="preserve">Horizontal scroll type filter pills (dynamically loaded from /api/mobile/materials?view=types)</w:t>
+      </w:r>
+    </w:p>
+    <w:p>
+      <w:pPr>
+        <w:pStyle w:val="ListParagraph"/>
+        <w:numPr>
+          <w:ilvl w:val="0"/>
+          <w:numId w:val="1"/>
+        </w:numPr>
+        <w:spacing w:after="40"/>
+      </w:pPr>
+      <w:r>
+        <w:rPr>
+          <w:color w:val="1D2D3E"/>
+          <w:sz w:val="22"/>
+          <w:szCs w:val="22"/>
+        </w:rPr>
+        <w:t xml:space="preserve">Material cards: icon, name, code, unit, type badge, active/inactive status dot</w:t>
+      </w:r>
+    </w:p>
+    <w:p>
+      <w:pPr>
+        <w:pStyle w:val="ListParagraph"/>
+        <w:numPr>
+          <w:ilvl w:val="0"/>
+          <w:numId w:val="1"/>
+        </w:numPr>
+        <w:spacing w:after="40"/>
+      </w:pPr>
+      <w:r>
+        <w:rPr>
+          <w:color w:val="1D2D3E"/>
+          <w:sz w:val="22"/>
+          <w:szCs w:val="22"/>
+        </w:rPr>
+        <w:t xml:space="preserve">Live count of filtered results</w:t>
+      </w:r>
+    </w:p>
+    <w:p>
+      <w:pPr>
+        <w:pStyle w:val="ListParagraph"/>
+        <w:numPr>
+          <w:ilvl w:val="0"/>
+          <w:numId w:val="1"/>
+        </w:numPr>
+        <w:spacing w:after="40"/>
+      </w:pPr>
+      <w:r>
+        <w:rPr>
+          <w:color w:val="1D2D3E"/>
+          <w:sz w:val="22"/>
+          <w:szCs w:val="22"/>
+        </w:rPr>
+        <w:t xml:space="preserve">Pull-to-refresh</w:t>
       </w:r>
     </w:p>
     <w:p>
@@ -1916,7 +2821,7 @@
     </w:p>
     <w:p>
       <w:pPr>
-        <w:pStyle w:val="Heading2"/>
+        <w:pStyle w:val="Heading3"/>
         <w:spacing w:after="120" w:before="300"/>
       </w:pPr>
       <w:r>
@@ -1925,79 +2830,115 @@
           <w:bCs/>
           <w:color w:val="1D2D3E"/>
         </w:rPr>
-        <w:t xml:space="preserve">3.5 Auth Context (src/context/AuthContext.tsx)</w:t>
-      </w:r>
-    </w:p>
-    <w:p>
-      <w:pPr>
-        <w:pStyle w:val="ListParagraph"/>
-        <w:numPr>
-          <w:ilvl w:val="0"/>
-          <w:numId w:val="1"/>
-        </w:numPr>
-        <w:spacing w:after="40"/>
-      </w:pPr>
-      <w:r>
-        <w:rPr>
-          <w:color w:val="1D2D3E"/>
-          <w:sz w:val="22"/>
-          <w:szCs w:val="22"/>
-        </w:rPr>
-        <w:t xml:space="preserve">React context with loginAs / logout actions</w:t>
-      </w:r>
-    </w:p>
-    <w:p>
-      <w:pPr>
-        <w:pStyle w:val="ListParagraph"/>
-        <w:numPr>
-          <w:ilvl w:val="0"/>
-          <w:numId w:val="1"/>
-        </w:numPr>
-        <w:spacing w:after="40"/>
-      </w:pPr>
-      <w:r>
-        <w:rPr>
-          <w:color w:val="1D2D3E"/>
-          <w:sz w:val="22"/>
-          <w:szCs w:val="22"/>
-        </w:rPr>
-        <w:t xml:space="preserve">Restores session from stored JWT on app start (decodes payload)</w:t>
-      </w:r>
-    </w:p>
-    <w:p>
-      <w:pPr>
-        <w:pStyle w:val="ListParagraph"/>
-        <w:numPr>
-          <w:ilvl w:val="0"/>
-          <w:numId w:val="1"/>
-        </w:numPr>
-        <w:spacing w:after="40"/>
-      </w:pPr>
-      <w:r>
-        <w:rPr>
-          <w:color w:val="1D2D3E"/>
-          <w:sz w:val="22"/>
-          <w:szCs w:val="22"/>
-        </w:rPr>
-        <w:t xml:space="preserve">Three states: loading, unauthenticated, authenticated</w:t>
-      </w:r>
-    </w:p>
-    <w:p>
-      <w:pPr>
-        <w:pStyle w:val="ListParagraph"/>
-        <w:numPr>
-          <w:ilvl w:val="0"/>
-          <w:numId w:val="1"/>
-        </w:numPr>
-        <w:spacing w:after="40"/>
-      </w:pPr>
-      <w:r>
-        <w:rPr>
-          <w:color w:val="1D2D3E"/>
-          <w:sz w:val="22"/>
-          <w:szCs w:val="22"/>
-        </w:rPr>
-        <w:t xml:space="preserve">useAuth() hook for consuming components</w:t>
+        <w:t xml:space="preserve">3.2.3 Purchase Orders Screen (src/screens/purchaseOrders/PurchaseOrdersScreen.tsx)</w:t>
+      </w:r>
+    </w:p>
+    <w:p>
+      <w:pPr>
+        <w:pStyle w:val="ListParagraph"/>
+        <w:numPr>
+          <w:ilvl w:val="0"/>
+          <w:numId w:val="1"/>
+        </w:numPr>
+        <w:spacing w:after="40"/>
+      </w:pPr>
+      <w:r>
+        <w:rPr>
+          <w:color w:val="1D2D3E"/>
+          <w:sz w:val="22"/>
+          <w:szCs w:val="22"/>
+        </w:rPr>
+        <w:t xml:space="preserve">Horizontal scrollable status tabs: All | Open | Approved | Closed | Draft</w:t>
+      </w:r>
+    </w:p>
+    <w:p>
+      <w:pPr>
+        <w:pStyle w:val="ListParagraph"/>
+        <w:numPr>
+          <w:ilvl w:val="0"/>
+          <w:numId w:val="1"/>
+        </w:numPr>
+        <w:spacing w:after="40"/>
+      </w:pPr>
+      <w:r>
+        <w:rPr>
+          <w:color w:val="1D2D3E"/>
+          <w:sz w:val="22"/>
+          <w:szCs w:val="22"/>
+        </w:rPr>
+        <w:t xml:space="preserve">Live count badges on each status tab</w:t>
+      </w:r>
+    </w:p>
+    <w:p>
+      <w:pPr>
+        <w:pStyle w:val="ListParagraph"/>
+        <w:numPr>
+          <w:ilvl w:val="0"/>
+          <w:numId w:val="1"/>
+        </w:numPr>
+        <w:spacing w:after="40"/>
+      </w:pPr>
+      <w:r>
+        <w:rPr>
+          <w:color w:val="1D2D3E"/>
+          <w:sz w:val="22"/>
+          <w:szCs w:val="22"/>
+        </w:rPr>
+        <w:t xml:space="preserve">PO cards: PO badge, number, vendor name, date, status badge (color-coded), total amount</w:t>
+      </w:r>
+    </w:p>
+    <w:p>
+      <w:pPr>
+        <w:pStyle w:val="ListParagraph"/>
+        <w:numPr>
+          <w:ilvl w:val="0"/>
+          <w:numId w:val="1"/>
+        </w:numPr>
+        <w:spacing w:after="40"/>
+      </w:pPr>
+      <w:r>
+        <w:rPr>
+          <w:color w:val="1D2D3E"/>
+          <w:sz w:val="22"/>
+          <w:szCs w:val="22"/>
+        </w:rPr>
+        <w:t xml:space="preserve">Receiving progress bar (ordered qty vs received qty) when data available</w:t>
+      </w:r>
+    </w:p>
+    <w:p>
+      <w:pPr>
+        <w:pStyle w:val="ListParagraph"/>
+        <w:numPr>
+          <w:ilvl w:val="0"/>
+          <w:numId w:val="1"/>
+        </w:numPr>
+        <w:spacing w:after="40"/>
+      </w:pPr>
+      <w:r>
+        <w:rPr>
+          <w:color w:val="1D2D3E"/>
+          <w:sz w:val="22"/>
+          <w:szCs w:val="22"/>
+        </w:rPr>
+        <w:t xml:space="preserve">Tap card to navigate to PO Detail screen</w:t>
+      </w:r>
+    </w:p>
+    <w:p>
+      <w:pPr>
+        <w:pStyle w:val="ListParagraph"/>
+        <w:numPr>
+          <w:ilvl w:val="0"/>
+          <w:numId w:val="1"/>
+        </w:numPr>
+        <w:spacing w:after="40"/>
+      </w:pPr>
+      <w:r>
+        <w:rPr>
+          <w:color w:val="1D2D3E"/>
+          <w:sz w:val="22"/>
+          <w:szCs w:val="22"/>
+        </w:rPr>
+        <w:t xml:space="preserve">Pull-to-refresh</w:t>
       </w:r>
     </w:p>
     <w:p>
@@ -2015,7 +2956,7 @@
     </w:p>
     <w:p>
       <w:pPr>
-        <w:pStyle w:val="Heading2"/>
+        <w:pStyle w:val="Heading3"/>
         <w:spacing w:after="120" w:before="300"/>
       </w:pPr>
       <w:r>
@@ -2024,79 +2965,169 @@
           <w:bCs/>
           <w:color w:val="1D2D3E"/>
         </w:rPr>
-        <w:t xml:space="preserve">3.6 Login Screen (src/screens/auth/LoginScreen.tsx)</w:t>
-      </w:r>
-    </w:p>
-    <w:p>
-      <w:pPr>
-        <w:pStyle w:val="ListParagraph"/>
-        <w:numPr>
-          <w:ilvl w:val="0"/>
-          <w:numId w:val="1"/>
-        </w:numPr>
-        <w:spacing w:after="40"/>
-      </w:pPr>
-      <w:r>
-        <w:rPr>
-          <w:color w:val="1D2D3E"/>
-          <w:sz w:val="22"/>
-          <w:szCs w:val="22"/>
-        </w:rPr>
-        <w:t xml:space="preserve">Fetches employee list from /api/employees</w:t>
-      </w:r>
-    </w:p>
-    <w:p>
-      <w:pPr>
-        <w:pStyle w:val="ListParagraph"/>
-        <w:numPr>
-          <w:ilvl w:val="0"/>
-          <w:numId w:val="1"/>
-        </w:numPr>
-        <w:spacing w:after="40"/>
-      </w:pPr>
-      <w:r>
-        <w:rPr>
-          <w:color w:val="1D2D3E"/>
-          <w:sz w:val="22"/>
-          <w:szCs w:val="22"/>
-        </w:rPr>
-        <w:t xml:space="preserve">Card list with avatar initials, name, email, role badge</w:t>
-      </w:r>
-    </w:p>
-    <w:p>
-      <w:pPr>
-        <w:pStyle w:val="ListParagraph"/>
-        <w:numPr>
-          <w:ilvl w:val="0"/>
-          <w:numId w:val="1"/>
-        </w:numPr>
-        <w:spacing w:after="40"/>
-      </w:pPr>
-      <w:r>
-        <w:rPr>
-          <w:color w:val="1D2D3E"/>
-          <w:sz w:val="22"/>
-          <w:szCs w:val="22"/>
-        </w:rPr>
-        <w:t xml:space="preserve">Tap to login — calls /api/auth/switch, stores JWT token</w:t>
-      </w:r>
-    </w:p>
-    <w:p>
-      <w:pPr>
-        <w:pStyle w:val="ListParagraph"/>
-        <w:numPr>
-          <w:ilvl w:val="0"/>
-          <w:numId w:val="1"/>
-        </w:numPr>
-        <w:spacing w:after="40"/>
-      </w:pPr>
-      <w:r>
-        <w:rPr>
-          <w:color w:val="1D2D3E"/>
-          <w:sz w:val="22"/>
-          <w:szCs w:val="22"/>
-        </w:rPr>
-        <w:t xml:space="preserve">Loading and error states with retry button</w:t>
+        <w:t xml:space="preserve">3.2.4 PO Detail Screen (src/screens/purchaseOrders/PODetailScreen.tsx)</w:t>
+      </w:r>
+    </w:p>
+    <w:p>
+      <w:pPr>
+        <w:pStyle w:val="ListParagraph"/>
+        <w:numPr>
+          <w:ilvl w:val="0"/>
+          <w:numId w:val="1"/>
+        </w:numPr>
+        <w:spacing w:after="40"/>
+      </w:pPr>
+      <w:r>
+        <w:rPr>
+          <w:color w:val="1D2D3E"/>
+          <w:sz w:val="22"/>
+          <w:szCs w:val="22"/>
+        </w:rPr>
+        <w:t xml:space="preserve">PO header card: number, status badge, vendor, date, company, total amount</w:t>
+      </w:r>
+    </w:p>
+    <w:p>
+      <w:pPr>
+        <w:pStyle w:val="ListParagraph"/>
+        <w:numPr>
+          <w:ilvl w:val="0"/>
+          <w:numId w:val="1"/>
+        </w:numPr>
+        <w:spacing w:after="40"/>
+      </w:pPr>
+      <w:r>
+        <w:rPr>
+          <w:color w:val="1D2D3E"/>
+          <w:sz w:val="22"/>
+          <w:szCs w:val="22"/>
+        </w:rPr>
+        <w:t xml:space="preserve">Receiving Progress card:</w:t>
+      </w:r>
+    </w:p>
+    <w:p>
+      <w:pPr>
+        <w:pStyle w:val="ListParagraph"/>
+        <w:numPr>
+          <w:ilvl w:val="1"/>
+          <w:numId w:val="1"/>
+        </w:numPr>
+        <w:spacing w:after="40"/>
+      </w:pPr>
+      <w:r>
+        <w:rPr>
+          <w:color w:val="1D2D3E"/>
+          <w:sz w:val="22"/>
+          <w:szCs w:val="22"/>
+        </w:rPr>
+        <w:t xml:space="preserve">  Stats row: Ordered / Received / Balance quantity boxes</w:t>
+      </w:r>
+    </w:p>
+    <w:p>
+      <w:pPr>
+        <w:pStyle w:val="ListParagraph"/>
+        <w:numPr>
+          <w:ilvl w:val="1"/>
+          <w:numId w:val="1"/>
+        </w:numPr>
+        <w:spacing w:after="40"/>
+      </w:pPr>
+      <w:r>
+        <w:rPr>
+          <w:color w:val="1D2D3E"/>
+          <w:sz w:val="22"/>
+          <w:szCs w:val="22"/>
+        </w:rPr>
+        <w:t xml:space="preserve">  Large progress bar (color-coded: green=100%, blue=&gt;50%, orange=&lt;50%)</w:t>
+      </w:r>
+    </w:p>
+    <w:p>
+      <w:pPr>
+        <w:pStyle w:val="ListParagraph"/>
+        <w:numPr>
+          <w:ilvl w:val="1"/>
+          <w:numId w:val="1"/>
+        </w:numPr>
+        <w:spacing w:after="40"/>
+      </w:pPr>
+      <w:r>
+        <w:rPr>
+          <w:color w:val="1D2D3E"/>
+          <w:sz w:val="22"/>
+          <w:szCs w:val="22"/>
+        </w:rPr>
+        <w:t xml:space="preserve">  Percentage label</w:t>
+      </w:r>
+    </w:p>
+    <w:p>
+      <w:pPr>
+        <w:pStyle w:val="ListParagraph"/>
+        <w:numPr>
+          <w:ilvl w:val="0"/>
+          <w:numId w:val="1"/>
+        </w:numPr>
+        <w:spacing w:after="40"/>
+      </w:pPr>
+      <w:r>
+        <w:rPr>
+          <w:color w:val="1D2D3E"/>
+          <w:sz w:val="22"/>
+          <w:szCs w:val="22"/>
+        </w:rPr>
+        <w:t xml:space="preserve">Line Items card (when available):</w:t>
+      </w:r>
+    </w:p>
+    <w:p>
+      <w:pPr>
+        <w:pStyle w:val="ListParagraph"/>
+        <w:numPr>
+          <w:ilvl w:val="1"/>
+          <w:numId w:val="1"/>
+        </w:numPr>
+        <w:spacing w:after="40"/>
+      </w:pPr>
+      <w:r>
+        <w:rPr>
+          <w:color w:val="1D2D3E"/>
+          <w:sz w:val="22"/>
+          <w:szCs w:val="22"/>
+        </w:rPr>
+        <w:t xml:space="preserve">  Per-item: name, code, ordered/received/balance quantities, mini progress bar</w:t>
+      </w:r>
+    </w:p>
+    <w:p>
+      <w:pPr>
+        <w:pStyle w:val="ListParagraph"/>
+        <w:numPr>
+          <w:ilvl w:val="1"/>
+          <w:numId w:val="1"/>
+        </w:numPr>
+        <w:spacing w:after="40"/>
+      </w:pPr>
+      <w:r>
+        <w:rPr>
+          <w:color w:val="1D2D3E"/>
+          <w:sz w:val="22"/>
+          <w:szCs w:val="22"/>
+        </w:rPr>
+        <w:t xml:space="preserve">  Unit price and line total when available</w:t>
+      </w:r>
+    </w:p>
+    <w:p>
+      <w:pPr>
+        <w:pStyle w:val="ListParagraph"/>
+        <w:numPr>
+          <w:ilvl w:val="0"/>
+          <w:numId w:val="1"/>
+        </w:numPr>
+        <w:spacing w:after="40"/>
+      </w:pPr>
+      <w:r>
+        <w:rPr>
+          <w:color w:val="1D2D3E"/>
+          <w:sz w:val="22"/>
+          <w:szCs w:val="22"/>
+        </w:rPr>
+        <w:t xml:space="preserve">Notes section (when available)</w:t>
       </w:r>
     </w:p>
     <w:p>
@@ -2114,7 +3145,7 @@
     </w:p>
     <w:p>
       <w:pPr>
-        <w:pStyle w:val="Heading2"/>
+        <w:pStyle w:val="Heading3"/>
         <w:spacing w:after="120" w:before="300"/>
       </w:pPr>
       <w:r>
@@ -2123,115 +3154,61 @@
           <w:bCs/>
           <w:color w:val="1D2D3E"/>
         </w:rPr>
-        <w:t xml:space="preserve">3.7 Dashboard Screen (src/screens/dashboard/DashboardScreen.tsx)</w:t>
-      </w:r>
-    </w:p>
-    <w:p>
-      <w:pPr>
-        <w:pStyle w:val="ListParagraph"/>
-        <w:numPr>
-          <w:ilvl w:val="0"/>
-          <w:numId w:val="1"/>
-        </w:numPr>
-        <w:spacing w:after="40"/>
-      </w:pPr>
-      <w:r>
-        <w:rPr>
-          <w:color w:val="1D2D3E"/>
-          <w:sz w:val="22"/>
-          <w:szCs w:val="22"/>
-        </w:rPr>
-        <w:t xml:space="preserve">Top bar with time-based greeting, user name/role, sign out button</w:t>
-      </w:r>
-    </w:p>
-    <w:p>
-      <w:pPr>
-        <w:pStyle w:val="ListParagraph"/>
-        <w:numPr>
-          <w:ilvl w:val="0"/>
-          <w:numId w:val="1"/>
-        </w:numPr>
-        <w:spacing w:after="40"/>
-      </w:pPr>
-      <w:r>
-        <w:rPr>
-          <w:color w:val="1D2D3E"/>
-          <w:sz w:val="22"/>
-          <w:szCs w:val="22"/>
-        </w:rPr>
-        <w:t xml:space="preserve">Pull-to-refresh support</w:t>
-      </w:r>
-    </w:p>
-    <w:p>
-      <w:pPr>
-        <w:pStyle w:val="ListParagraph"/>
-        <w:numPr>
-          <w:ilvl w:val="0"/>
-          <w:numId w:val="1"/>
-        </w:numPr>
-        <w:spacing w:after="40"/>
-      </w:pPr>
-      <w:r>
-        <w:rPr>
-          <w:color w:val="1D2D3E"/>
-          <w:sz w:val="22"/>
-          <w:szCs w:val="22"/>
-        </w:rPr>
-        <w:t xml:space="preserve">3×2 KPI grid: Revenue, Expenses, Net Income, Cash &amp; Bank, Receivables, Payables</w:t>
-      </w:r>
-    </w:p>
-    <w:p>
-      <w:pPr>
-        <w:pStyle w:val="ListParagraph"/>
-        <w:numPr>
-          <w:ilvl w:val="0"/>
-          <w:numId w:val="1"/>
-        </w:numPr>
-        <w:spacing w:after="40"/>
-      </w:pPr>
-      <w:r>
-        <w:rPr>
-          <w:color w:val="1D2D3E"/>
-          <w:sz w:val="22"/>
-          <w:szCs w:val="22"/>
-        </w:rPr>
-        <w:t xml:space="preserve">Working Capital panel (Cash + AR − AP = Net)</w:t>
-      </w:r>
-    </w:p>
-    <w:p>
-      <w:pPr>
-        <w:pStyle w:val="ListParagraph"/>
-        <w:numPr>
-          <w:ilvl w:val="0"/>
-          <w:numId w:val="1"/>
-        </w:numPr>
-        <w:spacing w:after="40"/>
-      </w:pPr>
-      <w:r>
-        <w:rPr>
-          <w:color w:val="1D2D3E"/>
-          <w:sz w:val="22"/>
-          <w:szCs w:val="22"/>
-        </w:rPr>
-        <w:t xml:space="preserve">Quick Actions grid: Journal Entry, Purchase Order, Sales Order, GRN, Trial Balance, Inventory</w:t>
-      </w:r>
-    </w:p>
-    <w:p>
-      <w:pPr>
-        <w:pStyle w:val="ListParagraph"/>
-        <w:numPr>
-          <w:ilvl w:val="0"/>
-          <w:numId w:val="1"/>
-        </w:numPr>
-        <w:spacing w:after="40"/>
-      </w:pPr>
-      <w:r>
-        <w:rPr>
-          <w:color w:val="1D2D3E"/>
-          <w:sz w:val="22"/>
-          <w:szCs w:val="22"/>
-        </w:rPr>
-        <w:t xml:space="preserve">Recent Activity list (last 20 vouchers with type badge, number, date, amount, status)</w:t>
+        <w:t xml:space="preserve">3.2.5 API Service Modules (Session 2)</w:t>
+      </w:r>
+    </w:p>
+    <w:p>
+      <w:pPr>
+        <w:pStyle w:val="ListParagraph"/>
+        <w:numPr>
+          <w:ilvl w:val="0"/>
+          <w:numId w:val="1"/>
+        </w:numPr>
+        <w:spacing w:after="40"/>
+      </w:pPr>
+      <w:r>
+        <w:rPr>
+          <w:color w:val="1D2D3E"/>
+          <w:sz w:val="22"/>
+          <w:szCs w:val="22"/>
+        </w:rPr>
+        <w:t xml:space="preserve">src/api/inventory.ts — fetchStockBalances(), fetchStockLedger(), fetchInventoryItems()</w:t>
+      </w:r>
+    </w:p>
+    <w:p>
+      <w:pPr>
+        <w:pStyle w:val="ListParagraph"/>
+        <w:numPr>
+          <w:ilvl w:val="0"/>
+          <w:numId w:val="1"/>
+        </w:numPr>
+        <w:spacing w:after="40"/>
+      </w:pPr>
+      <w:r>
+        <w:rPr>
+          <w:color w:val="1D2D3E"/>
+          <w:sz w:val="22"/>
+          <w:szCs w:val="22"/>
+        </w:rPr>
+        <w:t xml:space="preserve">src/api/materials.ts — fetchMaterials(), fetchMaterialTypes()</w:t>
+      </w:r>
+    </w:p>
+    <w:p>
+      <w:pPr>
+        <w:pStyle w:val="ListParagraph"/>
+        <w:numPr>
+          <w:ilvl w:val="0"/>
+          <w:numId w:val="1"/>
+        </w:numPr>
+        <w:spacing w:after="40"/>
+      </w:pPr>
+      <w:r>
+        <w:rPr>
+          <w:color w:val="1D2D3E"/>
+          <w:sz w:val="22"/>
+          <w:szCs w:val="22"/>
+        </w:rPr>
+        <w:t xml:space="preserve">src/api/purchaseOrders.ts — fetchPurchaseOrders(), fetchPODetail()</w:t>
       </w:r>
     </w:p>
     <w:p>
@@ -2249,7 +3226,7 @@
     </w:p>
     <w:p>
       <w:pPr>
-        <w:pStyle w:val="Heading2"/>
+        <w:pStyle w:val="Heading3"/>
         <w:spacing w:after="120" w:before="300"/>
       </w:pPr>
       <w:r>
@@ -2258,160 +3235,79 @@
           <w:bCs/>
           <w:color w:val="1D2D3E"/>
         </w:rPr>
-        <w:t xml:space="preserve">3.8 Navigation (src/navigation/)</w:t>
-      </w:r>
-    </w:p>
-    <w:p>
-      <w:pPr>
-        <w:pStyle w:val="ListParagraph"/>
-        <w:numPr>
-          <w:ilvl w:val="0"/>
-          <w:numId w:val="1"/>
-        </w:numPr>
-        <w:spacing w:after="40"/>
-      </w:pPr>
-      <w:r>
-        <w:rPr>
-          <w:color w:val="1D2D3E"/>
-          <w:sz w:val="22"/>
-          <w:szCs w:val="22"/>
-        </w:rPr>
-        <w:t xml:space="preserve">AuthNavigator — native stack with Login screen</w:t>
-      </w:r>
-    </w:p>
-    <w:p>
-      <w:pPr>
-        <w:pStyle w:val="ListParagraph"/>
-        <w:numPr>
-          <w:ilvl w:val="0"/>
-          <w:numId w:val="1"/>
-        </w:numPr>
-        <w:spacing w:after="40"/>
-      </w:pPr>
-      <w:r>
-        <w:rPr>
-          <w:color w:val="1D2D3E"/>
-          <w:sz w:val="22"/>
-          <w:szCs w:val="22"/>
-        </w:rPr>
-        <w:t xml:space="preserve">AppNavigator — bottom tabs: Dashboard, Inventory, Finance, More</w:t>
-      </w:r>
-    </w:p>
-    <w:p>
-      <w:pPr>
-        <w:pStyle w:val="ListParagraph"/>
-        <w:numPr>
-          <w:ilvl w:val="0"/>
-          <w:numId w:val="1"/>
-        </w:numPr>
-        <w:spacing w:after="40"/>
-      </w:pPr>
-      <w:r>
-        <w:rPr>
-          <w:color w:val="1D2D3E"/>
-          <w:sz w:val="22"/>
-          <w:szCs w:val="22"/>
-        </w:rPr>
-        <w:t xml:space="preserve">RootNavigator — switches between Auth/App based on AuthContext state</w:t>
-      </w:r>
-    </w:p>
-    <w:p>
-      <w:pPr>
-        <w:spacing w:after="80"/>
-      </w:pPr>
-      <w:r>
-        <w:rPr>
-          <w:color w:val="1D2D3E"/>
-          <w:sz w:val="22"/>
-          <w:szCs w:val="22"/>
-        </w:rPr>
-        <w:t xml:space="preserve"/>
-      </w:r>
-    </w:p>
-    <w:p>
-      <w:pPr>
-        <w:pStyle w:val="Heading2"/>
-        <w:spacing w:after="120" w:before="300"/>
-      </w:pPr>
-      <w:r>
-        <w:rPr>
-          <w:b/>
-          <w:bCs/>
-          <w:color w:val="1D2D3E"/>
-        </w:rPr>
-        <w:t xml:space="preserve">3.9 Shared Components (src/components/)</w:t>
-      </w:r>
-    </w:p>
-    <w:p>
-      <w:pPr>
-        <w:pStyle w:val="ListParagraph"/>
-        <w:numPr>
-          <w:ilvl w:val="0"/>
-          <w:numId w:val="1"/>
-        </w:numPr>
-        <w:spacing w:after="40"/>
-      </w:pPr>
-      <w:r>
-        <w:rPr>
-          <w:color w:val="1D2D3E"/>
-          <w:sz w:val="22"/>
-          <w:szCs w:val="22"/>
-        </w:rPr>
-        <w:t xml:space="preserve">LoadingView — centered spinner with optional message</w:t>
-      </w:r>
-    </w:p>
-    <w:p>
-      <w:pPr>
-        <w:pStyle w:val="ListParagraph"/>
-        <w:numPr>
-          <w:ilvl w:val="0"/>
-          <w:numId w:val="1"/>
-        </w:numPr>
-        <w:spacing w:after="40"/>
-      </w:pPr>
-      <w:r>
-        <w:rPr>
-          <w:color w:val="1D2D3E"/>
-          <w:sz w:val="22"/>
-          <w:szCs w:val="22"/>
-        </w:rPr>
-        <w:t xml:space="preserve">ErrorView — error message with retry button</w:t>
-      </w:r>
-    </w:p>
-    <w:p>
-      <w:pPr>
-        <w:pStyle w:val="ListParagraph"/>
-        <w:numPr>
-          <w:ilvl w:val="0"/>
-          <w:numId w:val="1"/>
-        </w:numPr>
-        <w:spacing w:after="40"/>
-      </w:pPr>
-      <w:r>
-        <w:rPr>
-          <w:color w:val="1D2D3E"/>
-          <w:sz w:val="22"/>
-          <w:szCs w:val="22"/>
-        </w:rPr>
-        <w:t xml:space="preserve">KPICard — metric card (label / value / subtext, optional color)</w:t>
-      </w:r>
-    </w:p>
-    <w:p>
-      <w:pPr>
-        <w:pStyle w:val="ListParagraph"/>
-        <w:numPr>
-          <w:ilvl w:val="0"/>
-          <w:numId w:val="1"/>
-        </w:numPr>
-        <w:spacing w:after="40"/>
-      </w:pPr>
-      <w:r>
-        <w:rPr>
-          <w:color w:val="1D2D3E"/>
-          <w:sz w:val="22"/>
-          <w:szCs w:val="22"/>
-        </w:rPr>
-        <w:t xml:space="preserve">SectionHeader — section title with optional right-side meta text</w:t>
+        <w:t xml:space="preserve">3.2.6 Navigation (Session 2)</w:t>
+      </w:r>
+    </w:p>
+    <w:p>
+      <w:pPr>
+        <w:pStyle w:val="ListParagraph"/>
+        <w:numPr>
+          <w:ilvl w:val="0"/>
+          <w:numId w:val="1"/>
+        </w:numPr>
+        <w:spacing w:after="40"/>
+      </w:pPr>
+      <w:r>
+        <w:rPr>
+          <w:color w:val="1D2D3E"/>
+          <w:sz w:val="22"/>
+          <w:szCs w:val="22"/>
+        </w:rPr>
+        <w:t xml:space="preserve">AppStack (src/navigation/AppStack.tsx) — new native stack wrapping all authenticated screens</w:t>
+      </w:r>
+    </w:p>
+    <w:p>
+      <w:pPr>
+        <w:pStyle w:val="ListParagraph"/>
+        <w:numPr>
+          <w:ilvl w:val="0"/>
+          <w:numId w:val="1"/>
+        </w:numPr>
+        <w:spacing w:after="40"/>
+      </w:pPr>
+      <w:r>
+        <w:rPr>
+          <w:color w:val="1D2D3E"/>
+          <w:sz w:val="22"/>
+          <w:szCs w:val="22"/>
+        </w:rPr>
+        <w:t xml:space="preserve">Inventory tab in bottom nav now shows real InventoryScreen</w:t>
+      </w:r>
+    </w:p>
+    <w:p>
+      <w:pPr>
+        <w:pStyle w:val="ListParagraph"/>
+        <w:numPr>
+          <w:ilvl w:val="0"/>
+          <w:numId w:val="1"/>
+        </w:numPr>
+        <w:spacing w:after="40"/>
+      </w:pPr>
+      <w:r>
+        <w:rPr>
+          <w:color w:val="1D2D3E"/>
+          <w:sz w:val="22"/>
+          <w:szCs w:val="22"/>
+        </w:rPr>
+        <w:t xml:space="preserve">Dashboard Quick Actions: Inventory, Materials, Purchase Order are wired and navigate correctly</w:t>
+      </w:r>
+    </w:p>
+    <w:p>
+      <w:pPr>
+        <w:pStyle w:val="ListParagraph"/>
+        <w:numPr>
+          <w:ilvl w:val="0"/>
+          <w:numId w:val="1"/>
+        </w:numPr>
+        <w:spacing w:after="40"/>
+      </w:pPr>
+      <w:r>
+        <w:rPr>
+          <w:color w:val="1D2D3E"/>
+          <w:sz w:val="22"/>
+          <w:szCs w:val="22"/>
+        </w:rPr>
+        <w:t xml:space="preserve">Disabled Quick Actions (Journal Entry, Sales Order, GRN, Trial Balance) shown but grayed out</w:t>
       </w:r>
     </w:p>
     <w:p>
@@ -2741,24 +3637,24 @@
                 <w:sz w:val="20"/>
                 <w:szCs w:val="20"/>
               </w:rPr>
-              <w:t xml:space="preserve">Inventory</w:t>
-            </w:r>
-          </w:p>
-        </w:tc>
-        <w:tc>
-          <w:p>
-            <w:pPr>
-              <w:spacing w:after="40" w:before="40"/>
-            </w:pPr>
-            <w:r>
-              <w:rPr>
-                <w:b w:val="false"/>
-                <w:bCs w:val="false"/>
-                <w:color w:val="1D2D3E"/>
-                <w:sz w:val="20"/>
-                <w:szCs w:val="20"/>
-              </w:rPr>
-              <w:t xml:space="preserve">Planned</w:t>
+              <w:t xml:space="preserve">Inventory (Stock + Ledger)</w:t>
+            </w:r>
+          </w:p>
+        </w:tc>
+        <w:tc>
+          <w:p>
+            <w:pPr>
+              <w:spacing w:after="40" w:before="40"/>
+            </w:pPr>
+            <w:r>
+              <w:rPr>
+                <w:b w:val="false"/>
+                <w:bCs w:val="false"/>
+                <w:color w:val="1D2D3E"/>
+                <w:sz w:val="20"/>
+                <w:szCs w:val="20"/>
+              </w:rPr>
+              <w:t xml:space="preserve">Done</w:t>
             </w:r>
           </w:p>
         </w:tc>
@@ -2837,7 +3733,7 @@
                 <w:sz w:val="20"/>
                 <w:szCs w:val="20"/>
               </w:rPr>
-              <w:t xml:space="preserve">Planned</w:t>
+              <w:t xml:space="preserve">Done</w:t>
             </w:r>
           </w:p>
         </w:tc>
@@ -2893,24 +3789,24 @@
                 <w:sz w:val="20"/>
                 <w:szCs w:val="20"/>
               </w:rPr>
-              <w:t xml:space="preserve">Purchase Orders</w:t>
-            </w:r>
-          </w:p>
-        </w:tc>
-        <w:tc>
-          <w:p>
-            <w:pPr>
-              <w:spacing w:after="40" w:before="40"/>
-            </w:pPr>
-            <w:r>
-              <w:rPr>
-                <w:b w:val="false"/>
-                <w:bCs w:val="false"/>
-                <w:color w:val="1D2D3E"/>
-                <w:sz w:val="20"/>
-                <w:szCs w:val="20"/>
-              </w:rPr>
-              <w:t xml:space="preserve">Planned</w:t>
+              <w:t xml:space="preserve">Purchase Orders + Detail</w:t>
+            </w:r>
+          </w:p>
+        </w:tc>
+        <w:tc>
+          <w:p>
+            <w:pPr>
+              <w:spacing w:after="40" w:before="40"/>
+            </w:pPr>
+            <w:r>
+              <w:rPr>
+                <w:b w:val="false"/>
+                <w:bCs w:val="false"/>
+                <w:color w:val="1D2D3E"/>
+                <w:sz w:val="20"/>
+                <w:szCs w:val="20"/>
+              </w:rPr>
+              <w:t xml:space="preserve">Done</w:t>
             </w:r>
           </w:p>
         </w:tc>
@@ -2989,7 +3885,7 @@
                 <w:sz w:val="20"/>
                 <w:szCs w:val="20"/>
               </w:rPr>
-              <w:t xml:space="preserve">Planned</w:t>
+              <w:t xml:space="preserve">Next</w:t>
             </w:r>
           </w:p>
         </w:tc>
@@ -3062,7 +3958,7 @@
                 <w:sz w:val="20"/>
                 <w:szCs w:val="20"/>
               </w:rPr>
-              <w:t xml:space="preserve">Planned</w:t>
+              <w:t xml:space="preserve">Next</w:t>
             </w:r>
           </w:p>
         </w:tc>
@@ -3670,7 +4566,7 @@
                 <w:sz w:val="20"/>
                 <w:szCs w:val="20"/>
               </w:rPr>
-              <w:t xml:space="preserve">Planned</w:t>
+              <w:t xml:space="preserve">In Progress</w:t>
             </w:r>
           </w:p>
         </w:tc>
@@ -3871,151 +4767,25 @@
           <w:sz w:val="22"/>
           <w:szCs w:val="22"/>
         </w:rPr>
-        <w:t xml:space="preserve">mobile/</w:t>
-      </w:r>
-    </w:p>
-    <w:p>
-      <w:pPr>
-        <w:pStyle w:val="ListParagraph"/>
-        <w:numPr>
-          <w:ilvl w:val="0"/>
-          <w:numId w:val="1"/>
-        </w:numPr>
-        <w:spacing w:after="40"/>
-      </w:pPr>
-      <w:r>
-        <w:rPr>
-          <w:color w:val="1D2D3E"/>
-          <w:sz w:val="22"/>
-          <w:szCs w:val="22"/>
-        </w:rPr>
-        <w:t xml:space="preserve">App.tsx — Entry point: SafeAreaProvider → AuthProvider → RootNavigator</w:t>
-      </w:r>
-    </w:p>
-    <w:p>
-      <w:pPr>
-        <w:pStyle w:val="ListParagraph"/>
-        <w:numPr>
-          <w:ilvl w:val="0"/>
-          <w:numId w:val="1"/>
-        </w:numPr>
-        <w:spacing w:after="40"/>
-      </w:pPr>
-      <w:r>
-        <w:rPr>
-          <w:color w:val="1D2D3E"/>
-          <w:sz w:val="22"/>
-          <w:szCs w:val="22"/>
-        </w:rPr>
-        <w:t xml:space="preserve">app.json — Expo configuration</w:t>
-      </w:r>
-    </w:p>
-    <w:p>
-      <w:pPr>
-        <w:pStyle w:val="ListParagraph"/>
-        <w:numPr>
-          <w:ilvl w:val="0"/>
-          <w:numId w:val="1"/>
-        </w:numPr>
-        <w:spacing w:after="40"/>
-      </w:pPr>
-      <w:r>
-        <w:rPr>
-          <w:color w:val="1D2D3E"/>
-          <w:sz w:val="22"/>
-          <w:szCs w:val="22"/>
-        </w:rPr>
-        <w:t xml:space="preserve">package.json — Dependencies</w:t>
-      </w:r>
-    </w:p>
-    <w:p>
-      <w:pPr>
-        <w:pStyle w:val="ListParagraph"/>
-        <w:numPr>
-          <w:ilvl w:val="0"/>
-          <w:numId w:val="1"/>
-        </w:numPr>
-        <w:spacing w:after="40"/>
-      </w:pPr>
-      <w:r>
-        <w:rPr>
-          <w:color w:val="1D2D3E"/>
-          <w:sz w:val="22"/>
-          <w:szCs w:val="22"/>
-        </w:rPr>
-        <w:t xml:space="preserve">tsconfig.json — TypeScript config with @/ alias</w:t>
-      </w:r>
-    </w:p>
-    <w:p>
-      <w:pPr>
-        <w:pStyle w:val="ListParagraph"/>
-        <w:numPr>
-          <w:ilvl w:val="0"/>
-          <w:numId w:val="1"/>
-        </w:numPr>
-        <w:spacing w:after="40"/>
-      </w:pPr>
-      <w:r>
-        <w:rPr>
-          <w:color w:val="1D2D3E"/>
-          <w:sz w:val="22"/>
-          <w:szCs w:val="22"/>
-        </w:rPr>
-        <w:t xml:space="preserve">babel.config.js — Babel with module-resolver plugin</w:t>
-      </w:r>
-    </w:p>
-    <w:p>
-      <w:pPr>
-        <w:pStyle w:val="ListParagraph"/>
-        <w:numPr>
-          <w:ilvl w:val="0"/>
-          <w:numId w:val="1"/>
-        </w:numPr>
-        <w:spacing w:after="40"/>
-      </w:pPr>
-      <w:r>
-        <w:rPr>
-          <w:color w:val="1D2D3E"/>
-          <w:sz w:val="22"/>
-          <w:szCs w:val="22"/>
-        </w:rPr>
-        <w:t xml:space="preserve">PROGRESS.md — Build progress tracker (updated each session)</w:t>
-      </w:r>
-    </w:p>
-    <w:p>
-      <w:pPr>
-        <w:pStyle w:val="ListParagraph"/>
-        <w:numPr>
-          <w:ilvl w:val="0"/>
-          <w:numId w:val="1"/>
-        </w:numPr>
-        <w:spacing w:after="40"/>
-      </w:pPr>
-      <w:r>
-        <w:rPr>
-          <w:color w:val="1D2D3E"/>
-          <w:sz w:val="22"/>
-          <w:szCs w:val="22"/>
-        </w:rPr>
-        <w:t xml:space="preserve">FEATURES.docx — This document</w:t>
-      </w:r>
-    </w:p>
-    <w:p>
-      <w:pPr>
-        <w:pStyle w:val="ListParagraph"/>
-        <w:numPr>
-          <w:ilvl w:val="0"/>
-          <w:numId w:val="1"/>
-        </w:numPr>
-        <w:spacing w:after="40"/>
-      </w:pPr>
-      <w:r>
-        <w:rPr>
-          <w:color w:val="1D2D3E"/>
-          <w:sz w:val="22"/>
-          <w:szCs w:val="22"/>
-        </w:rPr>
-        <w:t xml:space="preserve">src/api/ — API client and service modules</w:t>
+        <w:t xml:space="preserve">src/</w:t>
+      </w:r>
+    </w:p>
+    <w:p>
+      <w:pPr>
+        <w:pStyle w:val="ListParagraph"/>
+        <w:numPr>
+          <w:ilvl w:val="0"/>
+          <w:numId w:val="1"/>
+        </w:numPr>
+        <w:spacing w:after="40"/>
+      </w:pPr>
+      <w:r>
+        <w:rPr>
+          <w:color w:val="1D2D3E"/>
+          <w:sz w:val="22"/>
+          <w:szCs w:val="22"/>
+        </w:rPr>
+        <w:t xml:space="preserve">api/</w:t>
       </w:r>
     </w:p>
     <w:p>
@@ -4033,7 +4803,7 @@
           <w:sz w:val="22"/>
           <w:szCs w:val="22"/>
         </w:rPr>
-        <w:t xml:space="preserve">client.ts — Fetch wrapper with auth</w:t>
+        <w:t xml:space="preserve">client.ts — Fetch wrapper with JWT auth</w:t>
       </w:r>
     </w:p>
     <w:p>
@@ -4076,108 +4846,378 @@
       <w:pPr>
         <w:pStyle w:val="ListParagraph"/>
         <w:numPr>
-          <w:ilvl w:val="0"/>
-          <w:numId w:val="1"/>
-        </w:numPr>
-        <w:spacing w:after="40"/>
-      </w:pPr>
-      <w:r>
-        <w:rPr>
-          <w:color w:val="1D2D3E"/>
-          <w:sz w:val="22"/>
-          <w:szCs w:val="22"/>
-        </w:rPr>
-        <w:t xml:space="preserve">src/components/ — Shared UI components</w:t>
-      </w:r>
-    </w:p>
-    <w:p>
-      <w:pPr>
-        <w:pStyle w:val="ListParagraph"/>
-        <w:numPr>
-          <w:ilvl w:val="0"/>
-          <w:numId w:val="1"/>
-        </w:numPr>
-        <w:spacing w:after="40"/>
-      </w:pPr>
-      <w:r>
-        <w:rPr>
-          <w:color w:val="1D2D3E"/>
-          <w:sz w:val="22"/>
-          <w:szCs w:val="22"/>
-        </w:rPr>
-        <w:t xml:space="preserve">src/context/ — React contexts (AuthContext)</w:t>
-      </w:r>
-    </w:p>
-    <w:p>
-      <w:pPr>
-        <w:pStyle w:val="ListParagraph"/>
-        <w:numPr>
-          <w:ilvl w:val="0"/>
-          <w:numId w:val="1"/>
-        </w:numPr>
-        <w:spacing w:after="40"/>
-      </w:pPr>
-      <w:r>
-        <w:rPr>
-          <w:color w:val="1D2D3E"/>
-          <w:sz w:val="22"/>
-          <w:szCs w:val="22"/>
-        </w:rPr>
-        <w:t xml:space="preserve">src/navigation/ — Navigation stack definitions</w:t>
-      </w:r>
-    </w:p>
-    <w:p>
-      <w:pPr>
-        <w:pStyle w:val="ListParagraph"/>
-        <w:numPr>
-          <w:ilvl w:val="0"/>
-          <w:numId w:val="1"/>
-        </w:numPr>
-        <w:spacing w:after="40"/>
-      </w:pPr>
-      <w:r>
-        <w:rPr>
-          <w:color w:val="1D2D3E"/>
-          <w:sz w:val="22"/>
-          <w:szCs w:val="22"/>
-        </w:rPr>
-        <w:t xml:space="preserve">src/screens/ — Screen components by feature</w:t>
-      </w:r>
-    </w:p>
-    <w:p>
-      <w:pPr>
-        <w:pStyle w:val="ListParagraph"/>
-        <w:numPr>
-          <w:ilvl w:val="0"/>
-          <w:numId w:val="1"/>
-        </w:numPr>
-        <w:spacing w:after="40"/>
-      </w:pPr>
-      <w:r>
-        <w:rPr>
-          <w:color w:val="1D2D3E"/>
-          <w:sz w:val="22"/>
-          <w:szCs w:val="22"/>
-        </w:rPr>
-        <w:t xml:space="preserve">src/theme/ — Design tokens (colors, spacing, shadows)</w:t>
-      </w:r>
-    </w:p>
-    <w:p>
-      <w:pPr>
-        <w:pStyle w:val="ListParagraph"/>
-        <w:numPr>
-          <w:ilvl w:val="0"/>
-          <w:numId w:val="1"/>
-        </w:numPr>
-        <w:spacing w:after="40"/>
-      </w:pPr>
-      <w:r>
-        <w:rPr>
-          <w:color w:val="1D2D3E"/>
-          <w:sz w:val="22"/>
-          <w:szCs w:val="22"/>
-        </w:rPr>
-        <w:t xml:space="preserve">src/utils/ — Utility functions (currency, dates)</w:t>
+          <w:ilvl w:val="1"/>
+          <w:numId w:val="1"/>
+        </w:numPr>
+        <w:spacing w:after="40"/>
+      </w:pPr>
+      <w:r>
+        <w:rPr>
+          <w:color w:val="1D2D3E"/>
+          <w:sz w:val="22"/>
+          <w:szCs w:val="22"/>
+        </w:rPr>
+        <w:t xml:space="preserve">inventory.ts — Stock balances, ledger, items</w:t>
+      </w:r>
+    </w:p>
+    <w:p>
+      <w:pPr>
+        <w:pStyle w:val="ListParagraph"/>
+        <w:numPr>
+          <w:ilvl w:val="1"/>
+          <w:numId w:val="1"/>
+        </w:numPr>
+        <w:spacing w:after="40"/>
+      </w:pPr>
+      <w:r>
+        <w:rPr>
+          <w:color w:val="1D2D3E"/>
+          <w:sz w:val="22"/>
+          <w:szCs w:val="22"/>
+        </w:rPr>
+        <w:t xml:space="preserve">materials.ts — Materials list and types</w:t>
+      </w:r>
+    </w:p>
+    <w:p>
+      <w:pPr>
+        <w:pStyle w:val="ListParagraph"/>
+        <w:numPr>
+          <w:ilvl w:val="1"/>
+          <w:numId w:val="1"/>
+        </w:numPr>
+        <w:spacing w:after="40"/>
+      </w:pPr>
+      <w:r>
+        <w:rPr>
+          <w:color w:val="1D2D3E"/>
+          <w:sz w:val="22"/>
+          <w:szCs w:val="22"/>
+        </w:rPr>
+        <w:t xml:space="preserve">purchaseOrders.ts — PO list and detail</w:t>
+      </w:r>
+    </w:p>
+    <w:p>
+      <w:pPr>
+        <w:pStyle w:val="ListParagraph"/>
+        <w:numPr>
+          <w:ilvl w:val="0"/>
+          <w:numId w:val="1"/>
+        </w:numPr>
+        <w:spacing w:after="40"/>
+      </w:pPr>
+      <w:r>
+        <w:rPr>
+          <w:color w:val="1D2D3E"/>
+          <w:sz w:val="22"/>
+          <w:szCs w:val="22"/>
+        </w:rPr>
+        <w:t xml:space="preserve">components/</w:t>
+      </w:r>
+    </w:p>
+    <w:p>
+      <w:pPr>
+        <w:pStyle w:val="ListParagraph"/>
+        <w:numPr>
+          <w:ilvl w:val="1"/>
+          <w:numId w:val="1"/>
+        </w:numPr>
+        <w:spacing w:after="40"/>
+      </w:pPr>
+      <w:r>
+        <w:rPr>
+          <w:color w:val="1D2D3E"/>
+          <w:sz w:val="22"/>
+          <w:szCs w:val="22"/>
+        </w:rPr>
+        <w:t xml:space="preserve">LoadingView.tsx, ErrorView.tsx, KPICard.tsx, SectionHeader.tsx</w:t>
+      </w:r>
+    </w:p>
+    <w:p>
+      <w:pPr>
+        <w:pStyle w:val="ListParagraph"/>
+        <w:numPr>
+          <w:ilvl w:val="0"/>
+          <w:numId w:val="1"/>
+        </w:numPr>
+        <w:spacing w:after="40"/>
+      </w:pPr>
+      <w:r>
+        <w:rPr>
+          <w:color w:val="1D2D3E"/>
+          <w:sz w:val="22"/>
+          <w:szCs w:val="22"/>
+        </w:rPr>
+        <w:t xml:space="preserve">context/</w:t>
+      </w:r>
+    </w:p>
+    <w:p>
+      <w:pPr>
+        <w:pStyle w:val="ListParagraph"/>
+        <w:numPr>
+          <w:ilvl w:val="1"/>
+          <w:numId w:val="1"/>
+        </w:numPr>
+        <w:spacing w:after="40"/>
+      </w:pPr>
+      <w:r>
+        <w:rPr>
+          <w:color w:val="1D2D3E"/>
+          <w:sz w:val="22"/>
+          <w:szCs w:val="22"/>
+        </w:rPr>
+        <w:t xml:space="preserve">AuthContext.tsx — JWT auth state management</w:t>
+      </w:r>
+    </w:p>
+    <w:p>
+      <w:pPr>
+        <w:pStyle w:val="ListParagraph"/>
+        <w:numPr>
+          <w:ilvl w:val="0"/>
+          <w:numId w:val="1"/>
+        </w:numPr>
+        <w:spacing w:after="40"/>
+      </w:pPr>
+      <w:r>
+        <w:rPr>
+          <w:color w:val="1D2D3E"/>
+          <w:sz w:val="22"/>
+          <w:szCs w:val="22"/>
+        </w:rPr>
+        <w:t xml:space="preserve">navigation/</w:t>
+      </w:r>
+    </w:p>
+    <w:p>
+      <w:pPr>
+        <w:pStyle w:val="ListParagraph"/>
+        <w:numPr>
+          <w:ilvl w:val="1"/>
+          <w:numId w:val="1"/>
+        </w:numPr>
+        <w:spacing w:after="40"/>
+      </w:pPr>
+      <w:r>
+        <w:rPr>
+          <w:color w:val="1D2D3E"/>
+          <w:sz w:val="22"/>
+          <w:szCs w:val="22"/>
+        </w:rPr>
+        <w:t xml:space="preserve">RootNavigator.tsx — Auth/App switcher</w:t>
+      </w:r>
+    </w:p>
+    <w:p>
+      <w:pPr>
+        <w:pStyle w:val="ListParagraph"/>
+        <w:numPr>
+          <w:ilvl w:val="1"/>
+          <w:numId w:val="1"/>
+        </w:numPr>
+        <w:spacing w:after="40"/>
+      </w:pPr>
+      <w:r>
+        <w:rPr>
+          <w:color w:val="1D2D3E"/>
+          <w:sz w:val="22"/>
+          <w:szCs w:val="22"/>
+        </w:rPr>
+        <w:t xml:space="preserve">AppStack.tsx — Authenticated app stack navigator</w:t>
+      </w:r>
+    </w:p>
+    <w:p>
+      <w:pPr>
+        <w:pStyle w:val="ListParagraph"/>
+        <w:numPr>
+          <w:ilvl w:val="1"/>
+          <w:numId w:val="1"/>
+        </w:numPr>
+        <w:spacing w:after="40"/>
+      </w:pPr>
+      <w:r>
+        <w:rPr>
+          <w:color w:val="1D2D3E"/>
+          <w:sz w:val="22"/>
+          <w:szCs w:val="22"/>
+        </w:rPr>
+        <w:t xml:space="preserve">AppNavigator.tsx — Bottom tab navigator</w:t>
+      </w:r>
+    </w:p>
+    <w:p>
+      <w:pPr>
+        <w:pStyle w:val="ListParagraph"/>
+        <w:numPr>
+          <w:ilvl w:val="1"/>
+          <w:numId w:val="1"/>
+        </w:numPr>
+        <w:spacing w:after="40"/>
+      </w:pPr>
+      <w:r>
+        <w:rPr>
+          <w:color w:val="1D2D3E"/>
+          <w:sz w:val="22"/>
+          <w:szCs w:val="22"/>
+        </w:rPr>
+        <w:t xml:space="preserve">AuthNavigator.tsx — Login stack</w:t>
+      </w:r>
+    </w:p>
+    <w:p>
+      <w:pPr>
+        <w:pStyle w:val="ListParagraph"/>
+        <w:numPr>
+          <w:ilvl w:val="0"/>
+          <w:numId w:val="1"/>
+        </w:numPr>
+        <w:spacing w:after="40"/>
+      </w:pPr>
+      <w:r>
+        <w:rPr>
+          <w:color w:val="1D2D3E"/>
+          <w:sz w:val="22"/>
+          <w:szCs w:val="22"/>
+        </w:rPr>
+        <w:t xml:space="preserve">screens/</w:t>
+      </w:r>
+    </w:p>
+    <w:p>
+      <w:pPr>
+        <w:pStyle w:val="ListParagraph"/>
+        <w:numPr>
+          <w:ilvl w:val="1"/>
+          <w:numId w:val="1"/>
+        </w:numPr>
+        <w:spacing w:after="40"/>
+      </w:pPr>
+      <w:r>
+        <w:rPr>
+          <w:color w:val="1D2D3E"/>
+          <w:sz w:val="22"/>
+          <w:szCs w:val="22"/>
+        </w:rPr>
+        <w:t xml:space="preserve">auth/LoginScreen.tsx</w:t>
+      </w:r>
+    </w:p>
+    <w:p>
+      <w:pPr>
+        <w:pStyle w:val="ListParagraph"/>
+        <w:numPr>
+          <w:ilvl w:val="1"/>
+          <w:numId w:val="1"/>
+        </w:numPr>
+        <w:spacing w:after="40"/>
+      </w:pPr>
+      <w:r>
+        <w:rPr>
+          <w:color w:val="1D2D3E"/>
+          <w:sz w:val="22"/>
+          <w:szCs w:val="22"/>
+        </w:rPr>
+        <w:t xml:space="preserve">dashboard/DashboardScreen.tsx</w:t>
+      </w:r>
+    </w:p>
+    <w:p>
+      <w:pPr>
+        <w:pStyle w:val="ListParagraph"/>
+        <w:numPr>
+          <w:ilvl w:val="1"/>
+          <w:numId w:val="1"/>
+        </w:numPr>
+        <w:spacing w:after="40"/>
+      </w:pPr>
+      <w:r>
+        <w:rPr>
+          <w:color w:val="1D2D3E"/>
+          <w:sz w:val="22"/>
+          <w:szCs w:val="22"/>
+        </w:rPr>
+        <w:t xml:space="preserve">inventory/InventoryScreen.tsx</w:t>
+      </w:r>
+    </w:p>
+    <w:p>
+      <w:pPr>
+        <w:pStyle w:val="ListParagraph"/>
+        <w:numPr>
+          <w:ilvl w:val="1"/>
+          <w:numId w:val="1"/>
+        </w:numPr>
+        <w:spacing w:after="40"/>
+      </w:pPr>
+      <w:r>
+        <w:rPr>
+          <w:color w:val="1D2D3E"/>
+          <w:sz w:val="22"/>
+          <w:szCs w:val="22"/>
+        </w:rPr>
+        <w:t xml:space="preserve">materials/MaterialsScreen.tsx</w:t>
+      </w:r>
+    </w:p>
+    <w:p>
+      <w:pPr>
+        <w:pStyle w:val="ListParagraph"/>
+        <w:numPr>
+          <w:ilvl w:val="1"/>
+          <w:numId w:val="1"/>
+        </w:numPr>
+        <w:spacing w:after="40"/>
+      </w:pPr>
+      <w:r>
+        <w:rPr>
+          <w:color w:val="1D2D3E"/>
+          <w:sz w:val="22"/>
+          <w:szCs w:val="22"/>
+        </w:rPr>
+        <w:t xml:space="preserve">purchaseOrders/PurchaseOrdersScreen.tsx</w:t>
+      </w:r>
+    </w:p>
+    <w:p>
+      <w:pPr>
+        <w:pStyle w:val="ListParagraph"/>
+        <w:numPr>
+          <w:ilvl w:val="1"/>
+          <w:numId w:val="1"/>
+        </w:numPr>
+        <w:spacing w:after="40"/>
+      </w:pPr>
+      <w:r>
+        <w:rPr>
+          <w:color w:val="1D2D3E"/>
+          <w:sz w:val="22"/>
+          <w:szCs w:val="22"/>
+        </w:rPr>
+        <w:t xml:space="preserve">purchaseOrders/PODetailScreen.tsx</w:t>
+      </w:r>
+    </w:p>
+    <w:p>
+      <w:pPr>
+        <w:pStyle w:val="ListParagraph"/>
+        <w:numPr>
+          <w:ilvl w:val="0"/>
+          <w:numId w:val="1"/>
+        </w:numPr>
+        <w:spacing w:after="40"/>
+      </w:pPr>
+      <w:r>
+        <w:rPr>
+          <w:color w:val="1D2D3E"/>
+          <w:sz w:val="22"/>
+          <w:szCs w:val="22"/>
+        </w:rPr>
+        <w:t xml:space="preserve">theme/index.ts — Design tokens</w:t>
+      </w:r>
+    </w:p>
+    <w:p>
+      <w:pPr>
+        <w:pStyle w:val="ListParagraph"/>
+        <w:numPr>
+          <w:ilvl w:val="0"/>
+          <w:numId w:val="1"/>
+        </w:numPr>
+        <w:spacing w:after="40"/>
+      </w:pPr>
+      <w:r>
+        <w:rPr>
+          <w:color w:val="1D2D3E"/>
+          <w:sz w:val="22"/>
+          <w:szCs w:val="22"/>
+        </w:rPr>
+        <w:t xml:space="preserve">utils/currency.ts — Formatting utilities</w:t>
       </w:r>
     </w:p>
     <w:p>
@@ -4457,6 +5497,177 @@
           <w:color w:val="1D2D3E"/>
         </w:rPr>
         <w:t xml:space="preserve">7. Changelog</w:t>
+      </w:r>
+    </w:p>
+    <w:p>
+      <w:pPr>
+        <w:pStyle w:val="Heading2"/>
+        <w:spacing w:after="120" w:before="300"/>
+      </w:pPr>
+      <w:r>
+        <w:rPr>
+          <w:b/>
+          <w:bCs/>
+          <w:color w:val="1D2D3E"/>
+        </w:rPr>
+        <w:t xml:space="preserve">Session 2 — 2026-05-16</w:t>
+      </w:r>
+    </w:p>
+    <w:p>
+      <w:pPr>
+        <w:pStyle w:val="ListParagraph"/>
+        <w:numPr>
+          <w:ilvl w:val="0"/>
+          <w:numId w:val="1"/>
+        </w:numPr>
+        <w:spacing w:after="40"/>
+      </w:pPr>
+      <w:r>
+        <w:rPr>
+          <w:color w:val="1D2D3E"/>
+          <w:sz w:val="22"/>
+          <w:szCs w:val="22"/>
+        </w:rPr>
+        <w:t xml:space="preserve">Added API service modules: inventory, materials, purchase orders</w:t>
+      </w:r>
+    </w:p>
+    <w:p>
+      <w:pPr>
+        <w:pStyle w:val="ListParagraph"/>
+        <w:numPr>
+          <w:ilvl w:val="0"/>
+          <w:numId w:val="1"/>
+        </w:numPr>
+        <w:spacing w:after="40"/>
+      </w:pPr>
+      <w:r>
+        <w:rPr>
+          <w:color w:val="1D2D3E"/>
+          <w:sz w:val="22"/>
+          <w:szCs w:val="22"/>
+        </w:rPr>
+        <w:t xml:space="preserve">Built InventoryScreen with Stock Balances and Stock Ledger tabs</w:t>
+      </w:r>
+    </w:p>
+    <w:p>
+      <w:pPr>
+        <w:pStyle w:val="ListParagraph"/>
+        <w:numPr>
+          <w:ilvl w:val="0"/>
+          <w:numId w:val="1"/>
+        </w:numPr>
+        <w:spacing w:after="40"/>
+      </w:pPr>
+      <w:r>
+        <w:rPr>
+          <w:color w:val="1D2D3E"/>
+          <w:sz w:val="22"/>
+          <w:szCs w:val="22"/>
+        </w:rPr>
+        <w:t xml:space="preserve">Built MaterialsScreen with search, status filter, and type filter pills</w:t>
+      </w:r>
+    </w:p>
+    <w:p>
+      <w:pPr>
+        <w:pStyle w:val="ListParagraph"/>
+        <w:numPr>
+          <w:ilvl w:val="0"/>
+          <w:numId w:val="1"/>
+        </w:numPr>
+        <w:spacing w:after="40"/>
+      </w:pPr>
+      <w:r>
+        <w:rPr>
+          <w:color w:val="1D2D3E"/>
+          <w:sz w:val="22"/>
+          <w:szCs w:val="22"/>
+        </w:rPr>
+        <w:t xml:space="preserve">Built PurchaseOrdersScreen with status tabs, live counts, and progress bars</w:t>
+      </w:r>
+    </w:p>
+    <w:p>
+      <w:pPr>
+        <w:pStyle w:val="ListParagraph"/>
+        <w:numPr>
+          <w:ilvl w:val="0"/>
+          <w:numId w:val="1"/>
+        </w:numPr>
+        <w:spacing w:after="40"/>
+      </w:pPr>
+      <w:r>
+        <w:rPr>
+          <w:color w:val="1D2D3E"/>
+          <w:sz w:val="22"/>
+          <w:szCs w:val="22"/>
+        </w:rPr>
+        <w:t xml:space="preserve">Built PODetailScreen with header info, receiving progress, and line items</w:t>
+      </w:r>
+    </w:p>
+    <w:p>
+      <w:pPr>
+        <w:pStyle w:val="ListParagraph"/>
+        <w:numPr>
+          <w:ilvl w:val="0"/>
+          <w:numId w:val="1"/>
+        </w:numPr>
+        <w:spacing w:after="40"/>
+      </w:pPr>
+      <w:r>
+        <w:rPr>
+          <w:color w:val="1D2D3E"/>
+          <w:sz w:val="22"/>
+          <w:szCs w:val="22"/>
+        </w:rPr>
+        <w:t xml:space="preserve">Created AppStack navigator — wraps bottom tabs + all new feature screens</w:t>
+      </w:r>
+    </w:p>
+    <w:p>
+      <w:pPr>
+        <w:pStyle w:val="ListParagraph"/>
+        <w:numPr>
+          <w:ilvl w:val="0"/>
+          <w:numId w:val="1"/>
+        </w:numPr>
+        <w:spacing w:after="40"/>
+      </w:pPr>
+      <w:r>
+        <w:rPr>
+          <w:color w:val="1D2D3E"/>
+          <w:sz w:val="22"/>
+          <w:szCs w:val="22"/>
+        </w:rPr>
+        <w:t xml:space="preserve">Wired Dashboard Quick Actions: Inventory, Materials, Purchase Order navigate correctly</w:t>
+      </w:r>
+    </w:p>
+    <w:p>
+      <w:pPr>
+        <w:pStyle w:val="ListParagraph"/>
+        <w:numPr>
+          <w:ilvl w:val="0"/>
+          <w:numId w:val="1"/>
+        </w:numPr>
+        <w:spacing w:after="40"/>
+      </w:pPr>
+      <w:r>
+        <w:rPr>
+          <w:color w:val="1D2D3E"/>
+          <w:sz w:val="22"/>
+          <w:szCs w:val="22"/>
+        </w:rPr>
+        <w:t xml:space="preserve">Fixed: InventoryScreen hides back button when accessed as bottom tab</w:t>
+      </w:r>
+    </w:p>
+    <w:p>
+      <w:pPr>
+        <w:spacing w:after="80"/>
+      </w:pPr>
+      <w:r>
+        <w:rPr>
+          <w:color w:val="1D2D3E"/>
+          <w:sz w:val="22"/>
+          <w:szCs w:val="22"/>
+        </w:rPr>
+        <w:t xml:space="preserve"/>
       </w:r>
     </w:p>
     <w:p>

</xml_diff>

<commit_message>
Session 3 docs: update PROGRESS.md and FEATURES.docx
- PROGRESS.md: document all Session 3 changes (company filter
  extension, API retry, navigation fixes, type fixes)
- generate-docs.js: add Session 3 changelog entry and update Section
  3.22-3.24 to reflect the current implementation
- Regenerate FEATURES.docx
</commit_message>
<xml_diff>
--- a/FEATURES.docx
+++ b/FEATURES.docx
@@ -45,7 +45,7 @@
           <w:sz w:val="20"/>
           <w:szCs w:val="20"/>
         </w:rPr>
-        <w:t xml:space="preserve">Generated: 2026-05-15</w:t>
+        <w:t xml:space="preserve">Generated: 2026-05-18</w:t>
       </w:r>
     </w:p>
     <w:p>
@@ -428,7 +428,7 @@
           <w:bCs/>
           <w:color w:val="1D2D3E"/>
         </w:rPr>
-        <w:t xml:space="preserve">2.2 API Layer</w:t>
+        <w:t xml:space="preserve">2.2 Navigation Architecture (Updated Session 2)</w:t>
       </w:r>
     </w:p>
     <w:p>
@@ -441,7 +441,133 @@
           <w:sz w:val="22"/>
           <w:szCs w:val="22"/>
         </w:rPr>
-        <w:t xml:space="preserve">The web app exposes dedicated REST endpoints under /api/mobile/ for the mobile app. Each endpoint accepts query parameters for filtering and returns JSON. Authentication is required on all endpoints.</w:t>
+        <w:t xml:space="preserve">The app uses a two-level navigation structure:</w:t>
+      </w:r>
+    </w:p>
+    <w:p>
+      <w:pPr>
+        <w:pStyle w:val="ListParagraph"/>
+        <w:numPr>
+          <w:ilvl w:val="0"/>
+          <w:numId w:val="1"/>
+        </w:numPr>
+        <w:spacing w:after="40"/>
+      </w:pPr>
+      <w:r>
+        <w:rPr>
+          <w:color w:val="1D2D3E"/>
+          <w:sz w:val="22"/>
+          <w:szCs w:val="22"/>
+        </w:rPr>
+        <w:t xml:space="preserve">AppStack (native stack) — root navigator when authenticated</w:t>
+      </w:r>
+    </w:p>
+    <w:p>
+      <w:pPr>
+        <w:pStyle w:val="ListParagraph"/>
+        <w:numPr>
+          <w:ilvl w:val="1"/>
+          <w:numId w:val="1"/>
+        </w:numPr>
+        <w:spacing w:after="40"/>
+      </w:pPr>
+      <w:r>
+        <w:rPr>
+          <w:color w:val="1D2D3E"/>
+          <w:sz w:val="22"/>
+          <w:szCs w:val="22"/>
+        </w:rPr>
+        <w:t xml:space="preserve">  Tabs screen — bottom tab navigator (Dashboard, Inventory, Finance, More)</w:t>
+      </w:r>
+    </w:p>
+    <w:p>
+      <w:pPr>
+        <w:pStyle w:val="ListParagraph"/>
+        <w:numPr>
+          <w:ilvl w:val="1"/>
+          <w:numId w:val="1"/>
+        </w:numPr>
+        <w:spacing w:after="40"/>
+      </w:pPr>
+      <w:r>
+        <w:rPr>
+          <w:color w:val="1D2D3E"/>
+          <w:sz w:val="22"/>
+          <w:szCs w:val="22"/>
+        </w:rPr>
+        <w:t xml:space="preserve">  Inventory screen — full-screen stock/ledger view pushed from quick actions</w:t>
+      </w:r>
+    </w:p>
+    <w:p>
+      <w:pPr>
+        <w:pStyle w:val="ListParagraph"/>
+        <w:numPr>
+          <w:ilvl w:val="1"/>
+          <w:numId w:val="1"/>
+        </w:numPr>
+        <w:spacing w:after="40"/>
+      </w:pPr>
+      <w:r>
+        <w:rPr>
+          <w:color w:val="1D2D3E"/>
+          <w:sz w:val="22"/>
+          <w:szCs w:val="22"/>
+        </w:rPr>
+        <w:t xml:space="preserve">  Materials screen — materials list pushed from quick actions</w:t>
+      </w:r>
+    </w:p>
+    <w:p>
+      <w:pPr>
+        <w:pStyle w:val="ListParagraph"/>
+        <w:numPr>
+          <w:ilvl w:val="1"/>
+          <w:numId w:val="1"/>
+        </w:numPr>
+        <w:spacing w:after="40"/>
+      </w:pPr>
+      <w:r>
+        <w:rPr>
+          <w:color w:val="1D2D3E"/>
+          <w:sz w:val="22"/>
+          <w:szCs w:val="22"/>
+        </w:rPr>
+        <w:t xml:space="preserve">  PurchaseOrders screen — PO list pushed from quick actions</w:t>
+      </w:r>
+    </w:p>
+    <w:p>
+      <w:pPr>
+        <w:pStyle w:val="ListParagraph"/>
+        <w:numPr>
+          <w:ilvl w:val="1"/>
+          <w:numId w:val="1"/>
+        </w:numPr>
+        <w:spacing w:after="40"/>
+      </w:pPr>
+      <w:r>
+        <w:rPr>
+          <w:color w:val="1D2D3E"/>
+          <w:sz w:val="22"/>
+          <w:szCs w:val="22"/>
+        </w:rPr>
+        <w:t xml:space="preserve">  PODetail screen — PO detail pushed from PO list</w:t>
+      </w:r>
+    </w:p>
+    <w:p>
+      <w:pPr>
+        <w:pStyle w:val="ListParagraph"/>
+        <w:numPr>
+          <w:ilvl w:val="0"/>
+          <w:numId w:val="1"/>
+        </w:numPr>
+        <w:spacing w:after="40"/>
+      </w:pPr>
+      <w:r>
+        <w:rPr>
+          <w:color w:val="1D2D3E"/>
+          <w:sz w:val="22"/>
+          <w:szCs w:val="22"/>
+        </w:rPr>
+        <w:t xml:space="preserve">AuthNavigator (native stack) — Login screen when unauthenticated</w:t>
       </w:r>
     </w:p>
     <w:p>
@@ -468,7 +594,47 @@
           <w:bCs/>
           <w:color w:val="1D2D3E"/>
         </w:rPr>
-        <w:t xml:space="preserve">2.3 Backend API Endpoints</w:t>
+        <w:t xml:space="preserve">2.3 API Layer</w:t>
+      </w:r>
+    </w:p>
+    <w:p>
+      <w:pPr>
+        <w:spacing w:after="80"/>
+      </w:pPr>
+      <w:r>
+        <w:rPr>
+          <w:color w:val="1D2D3E"/>
+          <w:sz w:val="22"/>
+          <w:szCs w:val="22"/>
+        </w:rPr>
+        <w:t xml:space="preserve">The web app exposes dedicated REST endpoints under /api/mobile/ for the mobile app. Each endpoint accepts query parameters for filtering and returns JSON. Authentication is required on all endpoints.</w:t>
+      </w:r>
+    </w:p>
+    <w:p>
+      <w:pPr>
+        <w:spacing w:after="80"/>
+      </w:pPr>
+      <w:r>
+        <w:rPr>
+          <w:color w:val="1D2D3E"/>
+          <w:sz w:val="22"/>
+          <w:szCs w:val="22"/>
+        </w:rPr>
+        <w:t xml:space="preserve"/>
+      </w:r>
+    </w:p>
+    <w:p>
+      <w:pPr>
+        <w:pStyle w:val="Heading2"/>
+        <w:spacing w:after="120" w:before="300"/>
+      </w:pPr>
+      <w:r>
+        <w:rPr>
+          <w:b/>
+          <w:bCs/>
+          <w:color w:val="1D2D3E"/>
+        </w:rPr>
+        <w:t xml:space="preserve">2.4 Backend API Endpoints</w:t>
       </w:r>
     </w:p>
     <w:tbl>
@@ -1574,6 +1740,699 @@
     </w:p>
     <w:p>
       <w:pPr>
+        <w:pStyle w:val="Heading3"/>
+        <w:spacing w:after="120" w:before="300"/>
+      </w:pPr>
+      <w:r>
+        <w:rPr>
+          <w:b/>
+          <w:bCs/>
+          <w:color w:val="1D2D3E"/>
+        </w:rPr>
+        <w:t xml:space="preserve">3.1.1 Project Scaffolding</w:t>
+      </w:r>
+    </w:p>
+    <w:p>
+      <w:pPr>
+        <w:pStyle w:val="ListParagraph"/>
+        <w:numPr>
+          <w:ilvl w:val="0"/>
+          <w:numId w:val="1"/>
+        </w:numPr>
+        <w:spacing w:after="40"/>
+      </w:pPr>
+      <w:r>
+        <w:rPr>
+          <w:color w:val="1D2D3E"/>
+          <w:sz w:val="22"/>
+          <w:szCs w:val="22"/>
+        </w:rPr>
+        <w:t xml:space="preserve">Expo 51 / React Native 0.74 project initialized</w:t>
+      </w:r>
+    </w:p>
+    <w:p>
+      <w:pPr>
+        <w:pStyle w:val="ListParagraph"/>
+        <w:numPr>
+          <w:ilvl w:val="0"/>
+          <w:numId w:val="1"/>
+        </w:numPr>
+        <w:spacing w:after="40"/>
+      </w:pPr>
+      <w:r>
+        <w:rPr>
+          <w:color w:val="1D2D3E"/>
+          <w:sz w:val="22"/>
+          <w:szCs w:val="22"/>
+        </w:rPr>
+        <w:t xml:space="preserve">TypeScript with @/ path aliases via babel-plugin-module-resolver</w:t>
+      </w:r>
+    </w:p>
+    <w:p>
+      <w:pPr>
+        <w:pStyle w:val="ListParagraph"/>
+        <w:numPr>
+          <w:ilvl w:val="0"/>
+          <w:numId w:val="1"/>
+        </w:numPr>
+        <w:spacing w:after="40"/>
+      </w:pPr>
+      <w:r>
+        <w:rPr>
+          <w:color w:val="1D2D3E"/>
+          <w:sz w:val="22"/>
+          <w:szCs w:val="22"/>
+        </w:rPr>
+        <w:t xml:space="preserve">React Navigation with native stack and bottom tab navigators</w:t>
+      </w:r>
+    </w:p>
+    <w:p>
+      <w:pPr>
+        <w:spacing w:after="80"/>
+      </w:pPr>
+      <w:r>
+        <w:rPr>
+          <w:color w:val="1D2D3E"/>
+          <w:sz w:val="22"/>
+          <w:szCs w:val="22"/>
+        </w:rPr>
+        <w:t xml:space="preserve"/>
+      </w:r>
+    </w:p>
+    <w:p>
+      <w:pPr>
+        <w:pStyle w:val="Heading3"/>
+        <w:spacing w:after="120" w:before="300"/>
+      </w:pPr>
+      <w:r>
+        <w:rPr>
+          <w:b/>
+          <w:bCs/>
+          <w:color w:val="1D2D3E"/>
+        </w:rPr>
+        <w:t xml:space="preserve">3.1.2 Design System (src/theme/index.ts)</w:t>
+      </w:r>
+    </w:p>
+    <w:p>
+      <w:pPr>
+        <w:pStyle w:val="ListParagraph"/>
+        <w:numPr>
+          <w:ilvl w:val="0"/>
+          <w:numId w:val="1"/>
+        </w:numPr>
+        <w:spacing w:after="40"/>
+      </w:pPr>
+      <w:r>
+        <w:rPr>
+          <w:color w:val="1D2D3E"/>
+          <w:sz w:val="22"/>
+          <w:szCs w:val="22"/>
+        </w:rPr>
+        <w:t xml:space="preserve">Full color palette matching web app (primary blue #0A6ED1, greens, reds, oranges)</w:t>
+      </w:r>
+    </w:p>
+    <w:p>
+      <w:pPr>
+        <w:pStyle w:val="ListParagraph"/>
+        <w:numPr>
+          <w:ilvl w:val="0"/>
+          <w:numId w:val="1"/>
+        </w:numPr>
+        <w:spacing w:after="40"/>
+      </w:pPr>
+      <w:r>
+        <w:rPr>
+          <w:color w:val="1D2D3E"/>
+          <w:sz w:val="22"/>
+          <w:szCs w:val="22"/>
+        </w:rPr>
+        <w:t xml:space="preserve">Voucher type badge colors (JV, GRN, DN, PAY, REC, INV, SO, PO)</w:t>
+      </w:r>
+    </w:p>
+    <w:p>
+      <w:pPr>
+        <w:pStyle w:val="ListParagraph"/>
+        <w:numPr>
+          <w:ilvl w:val="0"/>
+          <w:numId w:val="1"/>
+        </w:numPr>
+        <w:spacing w:after="40"/>
+      </w:pPr>
+      <w:r>
+        <w:rPr>
+          <w:color w:val="1D2D3E"/>
+          <w:sz w:val="22"/>
+          <w:szCs w:val="22"/>
+        </w:rPr>
+        <w:t xml:space="preserve">Spacing scale, border radius tokens, shadow presets, typography scale</w:t>
+      </w:r>
+    </w:p>
+    <w:p>
+      <w:pPr>
+        <w:spacing w:after="80"/>
+      </w:pPr>
+      <w:r>
+        <w:rPr>
+          <w:color w:val="1D2D3E"/>
+          <w:sz w:val="22"/>
+          <w:szCs w:val="22"/>
+        </w:rPr>
+        <w:t xml:space="preserve"/>
+      </w:r>
+    </w:p>
+    <w:p>
+      <w:pPr>
+        <w:pStyle w:val="Heading3"/>
+        <w:spacing w:after="120" w:before="300"/>
+      </w:pPr>
+      <w:r>
+        <w:rPr>
+          <w:b/>
+          <w:bCs/>
+          <w:color w:val="1D2D3E"/>
+        </w:rPr>
+        <w:t xml:space="preserve">3.1.3 API Client (src/api/client.ts)</w:t>
+      </w:r>
+    </w:p>
+    <w:p>
+      <w:pPr>
+        <w:pStyle w:val="ListParagraph"/>
+        <w:numPr>
+          <w:ilvl w:val="0"/>
+          <w:numId w:val="1"/>
+        </w:numPr>
+        <w:spacing w:after="40"/>
+      </w:pPr>
+      <w:r>
+        <w:rPr>
+          <w:color w:val="1D2D3E"/>
+          <w:sz w:val="22"/>
+          <w:szCs w:val="22"/>
+        </w:rPr>
+        <w:t xml:space="preserve">Fetch wrapper with automatic JWT token attachment</w:t>
+      </w:r>
+    </w:p>
+    <w:p>
+      <w:pPr>
+        <w:pStyle w:val="ListParagraph"/>
+        <w:numPr>
+          <w:ilvl w:val="0"/>
+          <w:numId w:val="1"/>
+        </w:numPr>
+        <w:spacing w:after="40"/>
+      </w:pPr>
+      <w:r>
+        <w:rPr>
+          <w:color w:val="1D2D3E"/>
+          <w:sz w:val="22"/>
+          <w:szCs w:val="22"/>
+        </w:rPr>
+        <w:t xml:space="preserve">Token stored/retrieved via expo-secure-store (encrypted device storage)</w:t>
+      </w:r>
+    </w:p>
+    <w:p>
+      <w:pPr>
+        <w:pStyle w:val="ListParagraph"/>
+        <w:numPr>
+          <w:ilvl w:val="0"/>
+          <w:numId w:val="1"/>
+        </w:numPr>
+        <w:spacing w:after="40"/>
+      </w:pPr>
+      <w:r>
+        <w:rPr>
+          <w:color w:val="1D2D3E"/>
+          <w:sz w:val="22"/>
+          <w:szCs w:val="22"/>
+        </w:rPr>
+        <w:t xml:space="preserve">Sends Cookie: auth_token=&lt;token&gt; header on all requests</w:t>
+      </w:r>
+    </w:p>
+    <w:p>
+      <w:pPr>
+        <w:pStyle w:val="ListParagraph"/>
+        <w:numPr>
+          <w:ilvl w:val="0"/>
+          <w:numId w:val="1"/>
+        </w:numPr>
+        <w:spacing w:after="40"/>
+      </w:pPr>
+      <w:r>
+        <w:rPr>
+          <w:color w:val="1D2D3E"/>
+          <w:sz w:val="22"/>
+          <w:szCs w:val="22"/>
+        </w:rPr>
+        <w:t xml:space="preserve">Configurable base URL via EXPO_PUBLIC_API_URL env var</w:t>
+      </w:r>
+    </w:p>
+    <w:p>
+      <w:pPr>
+        <w:spacing w:after="80"/>
+      </w:pPr>
+      <w:r>
+        <w:rPr>
+          <w:color w:val="1D2D3E"/>
+          <w:sz w:val="22"/>
+          <w:szCs w:val="22"/>
+        </w:rPr>
+        <w:t xml:space="preserve"/>
+      </w:r>
+    </w:p>
+    <w:p>
+      <w:pPr>
+        <w:pStyle w:val="Heading3"/>
+        <w:spacing w:after="120" w:before="300"/>
+      </w:pPr>
+      <w:r>
+        <w:rPr>
+          <w:b/>
+          <w:bCs/>
+          <w:color w:val="1D2D3E"/>
+        </w:rPr>
+        <w:t xml:space="preserve">3.1.4 Auth Context (src/context/AuthContext.tsx)</w:t>
+      </w:r>
+    </w:p>
+    <w:p>
+      <w:pPr>
+        <w:pStyle w:val="ListParagraph"/>
+        <w:numPr>
+          <w:ilvl w:val="0"/>
+          <w:numId w:val="1"/>
+        </w:numPr>
+        <w:spacing w:after="40"/>
+      </w:pPr>
+      <w:r>
+        <w:rPr>
+          <w:color w:val="1D2D3E"/>
+          <w:sz w:val="22"/>
+          <w:szCs w:val="22"/>
+        </w:rPr>
+        <w:t xml:space="preserve">React context with loginAs / logout actions</w:t>
+      </w:r>
+    </w:p>
+    <w:p>
+      <w:pPr>
+        <w:pStyle w:val="ListParagraph"/>
+        <w:numPr>
+          <w:ilvl w:val="0"/>
+          <w:numId w:val="1"/>
+        </w:numPr>
+        <w:spacing w:after="40"/>
+      </w:pPr>
+      <w:r>
+        <w:rPr>
+          <w:color w:val="1D2D3E"/>
+          <w:sz w:val="22"/>
+          <w:szCs w:val="22"/>
+        </w:rPr>
+        <w:t xml:space="preserve">Restores session from stored JWT on app start (decodes payload)</w:t>
+      </w:r>
+    </w:p>
+    <w:p>
+      <w:pPr>
+        <w:pStyle w:val="ListParagraph"/>
+        <w:numPr>
+          <w:ilvl w:val="0"/>
+          <w:numId w:val="1"/>
+        </w:numPr>
+        <w:spacing w:after="40"/>
+      </w:pPr>
+      <w:r>
+        <w:rPr>
+          <w:color w:val="1D2D3E"/>
+          <w:sz w:val="22"/>
+          <w:szCs w:val="22"/>
+        </w:rPr>
+        <w:t xml:space="preserve">Three states: loading, unauthenticated, authenticated</w:t>
+      </w:r>
+    </w:p>
+    <w:p>
+      <w:pPr>
+        <w:pStyle w:val="ListParagraph"/>
+        <w:numPr>
+          <w:ilvl w:val="0"/>
+          <w:numId w:val="1"/>
+        </w:numPr>
+        <w:spacing w:after="40"/>
+      </w:pPr>
+      <w:r>
+        <w:rPr>
+          <w:color w:val="1D2D3E"/>
+          <w:sz w:val="22"/>
+          <w:szCs w:val="22"/>
+        </w:rPr>
+        <w:t xml:space="preserve">useAuth() hook for consuming components</w:t>
+      </w:r>
+    </w:p>
+    <w:p>
+      <w:pPr>
+        <w:spacing w:after="80"/>
+      </w:pPr>
+      <w:r>
+        <w:rPr>
+          <w:color w:val="1D2D3E"/>
+          <w:sz w:val="22"/>
+          <w:szCs w:val="22"/>
+        </w:rPr>
+        <w:t xml:space="preserve"/>
+      </w:r>
+    </w:p>
+    <w:p>
+      <w:pPr>
+        <w:pStyle w:val="Heading3"/>
+        <w:spacing w:after="120" w:before="300"/>
+      </w:pPr>
+      <w:r>
+        <w:rPr>
+          <w:b/>
+          <w:bCs/>
+          <w:color w:val="1D2D3E"/>
+        </w:rPr>
+        <w:t xml:space="preserve">3.1.5 Login Screen (src/screens/auth/LoginScreen.tsx)</w:t>
+      </w:r>
+    </w:p>
+    <w:p>
+      <w:pPr>
+        <w:pStyle w:val="ListParagraph"/>
+        <w:numPr>
+          <w:ilvl w:val="0"/>
+          <w:numId w:val="1"/>
+        </w:numPr>
+        <w:spacing w:after="40"/>
+      </w:pPr>
+      <w:r>
+        <w:rPr>
+          <w:color w:val="1D2D3E"/>
+          <w:sz w:val="22"/>
+          <w:szCs w:val="22"/>
+        </w:rPr>
+        <w:t xml:space="preserve">Fetches employee list from /api/employees</w:t>
+      </w:r>
+    </w:p>
+    <w:p>
+      <w:pPr>
+        <w:pStyle w:val="ListParagraph"/>
+        <w:numPr>
+          <w:ilvl w:val="0"/>
+          <w:numId w:val="1"/>
+        </w:numPr>
+        <w:spacing w:after="40"/>
+      </w:pPr>
+      <w:r>
+        <w:rPr>
+          <w:color w:val="1D2D3E"/>
+          <w:sz w:val="22"/>
+          <w:szCs w:val="22"/>
+        </w:rPr>
+        <w:t xml:space="preserve">Card list with avatar initials, name, email, role badge</w:t>
+      </w:r>
+    </w:p>
+    <w:p>
+      <w:pPr>
+        <w:pStyle w:val="ListParagraph"/>
+        <w:numPr>
+          <w:ilvl w:val="0"/>
+          <w:numId w:val="1"/>
+        </w:numPr>
+        <w:spacing w:after="40"/>
+      </w:pPr>
+      <w:r>
+        <w:rPr>
+          <w:color w:val="1D2D3E"/>
+          <w:sz w:val="22"/>
+          <w:szCs w:val="22"/>
+        </w:rPr>
+        <w:t xml:space="preserve">Tap to login — calls /api/auth/switch, stores JWT token</w:t>
+      </w:r>
+    </w:p>
+    <w:p>
+      <w:pPr>
+        <w:pStyle w:val="ListParagraph"/>
+        <w:numPr>
+          <w:ilvl w:val="0"/>
+          <w:numId w:val="1"/>
+        </w:numPr>
+        <w:spacing w:after="40"/>
+      </w:pPr>
+      <w:r>
+        <w:rPr>
+          <w:color w:val="1D2D3E"/>
+          <w:sz w:val="22"/>
+          <w:szCs w:val="22"/>
+        </w:rPr>
+        <w:t xml:space="preserve">Loading and error states with retry button</w:t>
+      </w:r>
+    </w:p>
+    <w:p>
+      <w:pPr>
+        <w:spacing w:after="80"/>
+      </w:pPr>
+      <w:r>
+        <w:rPr>
+          <w:color w:val="1D2D3E"/>
+          <w:sz w:val="22"/>
+          <w:szCs w:val="22"/>
+        </w:rPr>
+        <w:t xml:space="preserve"/>
+      </w:r>
+    </w:p>
+    <w:p>
+      <w:pPr>
+        <w:pStyle w:val="Heading3"/>
+        <w:spacing w:after="120" w:before="300"/>
+      </w:pPr>
+      <w:r>
+        <w:rPr>
+          <w:b/>
+          <w:bCs/>
+          <w:color w:val="1D2D3E"/>
+        </w:rPr>
+        <w:t xml:space="preserve">3.1.6 Dashboard Screen (src/screens/dashboard/DashboardScreen.tsx)</w:t>
+      </w:r>
+    </w:p>
+    <w:p>
+      <w:pPr>
+        <w:pStyle w:val="ListParagraph"/>
+        <w:numPr>
+          <w:ilvl w:val="0"/>
+          <w:numId w:val="1"/>
+        </w:numPr>
+        <w:spacing w:after="40"/>
+      </w:pPr>
+      <w:r>
+        <w:rPr>
+          <w:color w:val="1D2D3E"/>
+          <w:sz w:val="22"/>
+          <w:szCs w:val="22"/>
+        </w:rPr>
+        <w:t xml:space="preserve">Top bar with time-based greeting, user name/role, sign out button</w:t>
+      </w:r>
+    </w:p>
+    <w:p>
+      <w:pPr>
+        <w:pStyle w:val="ListParagraph"/>
+        <w:numPr>
+          <w:ilvl w:val="0"/>
+          <w:numId w:val="1"/>
+        </w:numPr>
+        <w:spacing w:after="40"/>
+      </w:pPr>
+      <w:r>
+        <w:rPr>
+          <w:color w:val="1D2D3E"/>
+          <w:sz w:val="22"/>
+          <w:szCs w:val="22"/>
+        </w:rPr>
+        <w:t xml:space="preserve">Pull-to-refresh support</w:t>
+      </w:r>
+    </w:p>
+    <w:p>
+      <w:pPr>
+        <w:pStyle w:val="ListParagraph"/>
+        <w:numPr>
+          <w:ilvl w:val="0"/>
+          <w:numId w:val="1"/>
+        </w:numPr>
+        <w:spacing w:after="40"/>
+      </w:pPr>
+      <w:r>
+        <w:rPr>
+          <w:color w:val="1D2D3E"/>
+          <w:sz w:val="22"/>
+          <w:szCs w:val="22"/>
+        </w:rPr>
+        <w:t xml:space="preserve">3×2 KPI grid: Revenue, Expenses, Net Income, Cash &amp; Bank, Receivables, Payables</w:t>
+      </w:r>
+    </w:p>
+    <w:p>
+      <w:pPr>
+        <w:pStyle w:val="ListParagraph"/>
+        <w:numPr>
+          <w:ilvl w:val="0"/>
+          <w:numId w:val="1"/>
+        </w:numPr>
+        <w:spacing w:after="40"/>
+      </w:pPr>
+      <w:r>
+        <w:rPr>
+          <w:color w:val="1D2D3E"/>
+          <w:sz w:val="22"/>
+          <w:szCs w:val="22"/>
+        </w:rPr>
+        <w:t xml:space="preserve">Working Capital panel (Cash + AR − AP = Net)</w:t>
+      </w:r>
+    </w:p>
+    <w:p>
+      <w:pPr>
+        <w:pStyle w:val="ListParagraph"/>
+        <w:numPr>
+          <w:ilvl w:val="0"/>
+          <w:numId w:val="1"/>
+        </w:numPr>
+        <w:spacing w:after="40"/>
+      </w:pPr>
+      <w:r>
+        <w:rPr>
+          <w:color w:val="1D2D3E"/>
+          <w:sz w:val="22"/>
+          <w:szCs w:val="22"/>
+        </w:rPr>
+        <w:t xml:space="preserve">Quick Actions grid: wired to Inventory, Materials, Purchase Orders (others disabled until built)</w:t>
+      </w:r>
+    </w:p>
+    <w:p>
+      <w:pPr>
+        <w:pStyle w:val="ListParagraph"/>
+        <w:numPr>
+          <w:ilvl w:val="0"/>
+          <w:numId w:val="1"/>
+        </w:numPr>
+        <w:spacing w:after="40"/>
+      </w:pPr>
+      <w:r>
+        <w:rPr>
+          <w:color w:val="1D2D3E"/>
+          <w:sz w:val="22"/>
+          <w:szCs w:val="22"/>
+        </w:rPr>
+        <w:t xml:space="preserve">Recent Activity list (last 20 vouchers with type badge, number, date, amount, status)</w:t>
+      </w:r>
+    </w:p>
+    <w:p>
+      <w:pPr>
+        <w:spacing w:after="80"/>
+      </w:pPr>
+      <w:r>
+        <w:rPr>
+          <w:color w:val="1D2D3E"/>
+          <w:sz w:val="22"/>
+          <w:szCs w:val="22"/>
+        </w:rPr>
+        <w:t xml:space="preserve"/>
+      </w:r>
+    </w:p>
+    <w:p>
+      <w:pPr>
+        <w:pStyle w:val="Heading3"/>
+        <w:spacing w:after="120" w:before="300"/>
+      </w:pPr>
+      <w:r>
+        <w:rPr>
+          <w:b/>
+          <w:bCs/>
+          <w:color w:val="1D2D3E"/>
+        </w:rPr>
+        <w:t xml:space="preserve">3.1.7 Shared Components (src/components/)</w:t>
+      </w:r>
+    </w:p>
+    <w:p>
+      <w:pPr>
+        <w:pStyle w:val="ListParagraph"/>
+        <w:numPr>
+          <w:ilvl w:val="0"/>
+          <w:numId w:val="1"/>
+        </w:numPr>
+        <w:spacing w:after="40"/>
+      </w:pPr>
+      <w:r>
+        <w:rPr>
+          <w:color w:val="1D2D3E"/>
+          <w:sz w:val="22"/>
+          <w:szCs w:val="22"/>
+        </w:rPr>
+        <w:t xml:space="preserve">LoadingView — centered spinner with optional message</w:t>
+      </w:r>
+    </w:p>
+    <w:p>
+      <w:pPr>
+        <w:pStyle w:val="ListParagraph"/>
+        <w:numPr>
+          <w:ilvl w:val="0"/>
+          <w:numId w:val="1"/>
+        </w:numPr>
+        <w:spacing w:after="40"/>
+      </w:pPr>
+      <w:r>
+        <w:rPr>
+          <w:color w:val="1D2D3E"/>
+          <w:sz w:val="22"/>
+          <w:szCs w:val="22"/>
+        </w:rPr>
+        <w:t xml:space="preserve">ErrorView — error message with retry button</w:t>
+      </w:r>
+    </w:p>
+    <w:p>
+      <w:pPr>
+        <w:pStyle w:val="ListParagraph"/>
+        <w:numPr>
+          <w:ilvl w:val="0"/>
+          <w:numId w:val="1"/>
+        </w:numPr>
+        <w:spacing w:after="40"/>
+      </w:pPr>
+      <w:r>
+        <w:rPr>
+          <w:color w:val="1D2D3E"/>
+          <w:sz w:val="22"/>
+          <w:szCs w:val="22"/>
+        </w:rPr>
+        <w:t xml:space="preserve">KPICard — metric card (label / value / subtext, optional color)</w:t>
+      </w:r>
+    </w:p>
+    <w:p>
+      <w:pPr>
+        <w:pStyle w:val="ListParagraph"/>
+        <w:numPr>
+          <w:ilvl w:val="0"/>
+          <w:numId w:val="1"/>
+        </w:numPr>
+        <w:spacing w:after="40"/>
+      </w:pPr>
+      <w:r>
+        <w:rPr>
+          <w:color w:val="1D2D3E"/>
+          <w:sz w:val="22"/>
+          <w:szCs w:val="22"/>
+        </w:rPr>
+        <w:t xml:space="preserve">SectionHeader — section title with optional right-side meta text</w:t>
+      </w:r>
+    </w:p>
+    <w:p>
+      <w:pPr>
+        <w:spacing w:after="80"/>
+      </w:pPr>
+      <w:r>
+        <w:rPr>
+          <w:color w:val="1D2D3E"/>
+          <w:sz w:val="22"/>
+          <w:szCs w:val="22"/>
+        </w:rPr>
+        <w:t xml:space="preserve"/>
+      </w:r>
+    </w:p>
+    <w:p>
+      <w:pPr>
         <w:pStyle w:val="Heading2"/>
         <w:spacing w:after="120" w:before="300"/>
       </w:pPr>
@@ -1583,79 +2442,97 @@
           <w:bCs/>
           <w:color w:val="1D2D3E"/>
         </w:rPr>
-        <w:t xml:space="preserve">3.1 Project Scaffolding</w:t>
-      </w:r>
-    </w:p>
-    <w:p>
-      <w:pPr>
-        <w:pStyle w:val="ListParagraph"/>
-        <w:numPr>
-          <w:ilvl w:val="0"/>
-          <w:numId w:val="1"/>
-        </w:numPr>
-        <w:spacing w:after="40"/>
-      </w:pPr>
-      <w:r>
-        <w:rPr>
-          <w:color w:val="1D2D3E"/>
-          <w:sz w:val="22"/>
-          <w:szCs w:val="22"/>
-        </w:rPr>
-        <w:t xml:space="preserve">Expo 51 / React Native 0.74 project initialized</w:t>
-      </w:r>
-    </w:p>
-    <w:p>
-      <w:pPr>
-        <w:pStyle w:val="ListParagraph"/>
-        <w:numPr>
-          <w:ilvl w:val="0"/>
-          <w:numId w:val="1"/>
-        </w:numPr>
-        <w:spacing w:after="40"/>
-      </w:pPr>
-      <w:r>
-        <w:rPr>
-          <w:color w:val="1D2D3E"/>
-          <w:sz w:val="22"/>
-          <w:szCs w:val="22"/>
-        </w:rPr>
-        <w:t xml:space="preserve">TypeScript with @/ path aliases via babel-plugin-module-resolver</w:t>
-      </w:r>
-    </w:p>
-    <w:p>
-      <w:pPr>
-        <w:pStyle w:val="ListParagraph"/>
-        <w:numPr>
-          <w:ilvl w:val="0"/>
-          <w:numId w:val="1"/>
-        </w:numPr>
-        <w:spacing w:after="40"/>
-      </w:pPr>
-      <w:r>
-        <w:rPr>
-          <w:color w:val="1D2D3E"/>
-          <w:sz w:val="22"/>
-          <w:szCs w:val="22"/>
-        </w:rPr>
-        <w:t xml:space="preserve">React Navigation with native stack and bottom tab navigators</w:t>
-      </w:r>
-    </w:p>
-    <w:p>
-      <w:pPr>
-        <w:pStyle w:val="ListParagraph"/>
-        <w:numPr>
-          <w:ilvl w:val="0"/>
-          <w:numId w:val="1"/>
-        </w:numPr>
-        <w:spacing w:after="40"/>
-      </w:pPr>
-      <w:r>
-        <w:rPr>
-          <w:color w:val="1D2D3E"/>
-          <w:sz w:val="22"/>
-          <w:szCs w:val="22"/>
-        </w:rPr>
-        <w:t xml:space="preserve">.gitignore configured for mobile artifacts</w:t>
+        <w:t xml:space="preserve">3.10 Inventory Screen (src/screens/inventory/InventoryScreen.tsx)</w:t>
+      </w:r>
+    </w:p>
+    <w:p>
+      <w:pPr>
+        <w:pStyle w:val="ListParagraph"/>
+        <w:numPr>
+          <w:ilvl w:val="0"/>
+          <w:numId w:val="1"/>
+        </w:numPr>
+        <w:spacing w:after="40"/>
+      </w:pPr>
+      <w:r>
+        <w:rPr>
+          <w:color w:val="1D2D3E"/>
+          <w:sz w:val="22"/>
+          <w:szCs w:val="22"/>
+        </w:rPr>
+        <w:t xml:space="preserve">Internal tab view: Stock Balances and Stock Ledger</w:t>
+      </w:r>
+    </w:p>
+    <w:p>
+      <w:pPr>
+        <w:pStyle w:val="ListParagraph"/>
+        <w:numPr>
+          <w:ilvl w:val="0"/>
+          <w:numId w:val="1"/>
+        </w:numPr>
+        <w:spacing w:after="40"/>
+      </w:pPr>
+      <w:r>
+        <w:rPr>
+          <w:color w:val="1D2D3E"/>
+          <w:sz w:val="22"/>
+          <w:szCs w:val="22"/>
+        </w:rPr>
+        <w:t xml:space="preserve">Stock Balances: item/warehouse/qty cards with color-coded quantity levels</w:t>
+      </w:r>
+    </w:p>
+    <w:p>
+      <w:pPr>
+        <w:pStyle w:val="ListParagraph"/>
+        <w:numPr>
+          <w:ilvl w:val="0"/>
+          <w:numId w:val="1"/>
+        </w:numPr>
+        <w:spacing w:after="40"/>
+      </w:pPr>
+      <w:r>
+        <w:rPr>
+          <w:color w:val="1D2D3E"/>
+          <w:sz w:val="22"/>
+          <w:szCs w:val="22"/>
+        </w:rPr>
+        <w:t xml:space="preserve">Stock Ledger: movement log with IN/OUT/balance amounts and voucher type badges</w:t>
+      </w:r>
+    </w:p>
+    <w:p>
+      <w:pPr>
+        <w:pStyle w:val="ListParagraph"/>
+        <w:numPr>
+          <w:ilvl w:val="0"/>
+          <w:numId w:val="1"/>
+        </w:numPr>
+        <w:spacing w:after="40"/>
+      </w:pPr>
+      <w:r>
+        <w:rPr>
+          <w:color w:val="1D2D3E"/>
+          <w:sz w:val="22"/>
+          <w:szCs w:val="22"/>
+        </w:rPr>
+        <w:t xml:space="preserve">Search filter across both tabs (item name, warehouse)</w:t>
+      </w:r>
+    </w:p>
+    <w:p>
+      <w:pPr>
+        <w:pStyle w:val="ListParagraph"/>
+        <w:numPr>
+          <w:ilvl w:val="0"/>
+          <w:numId w:val="1"/>
+        </w:numPr>
+        <w:spacing w:after="40"/>
+      </w:pPr>
+      <w:r>
+        <w:rPr>
+          <w:color w:val="1D2D3E"/>
+          <w:sz w:val="22"/>
+          <w:szCs w:val="22"/>
+        </w:rPr>
+        <w:t xml:space="preserve">Pull-to-refresh, loading and empty states</w:t>
       </w:r>
     </w:p>
     <w:p>
@@ -1682,61 +2559,61 @@
           <w:bCs/>
           <w:color w:val="1D2D3E"/>
         </w:rPr>
-        <w:t xml:space="preserve">3.2 Design System (src/theme/index.ts)</w:t>
-      </w:r>
-    </w:p>
-    <w:p>
-      <w:pPr>
-        <w:pStyle w:val="ListParagraph"/>
-        <w:numPr>
-          <w:ilvl w:val="0"/>
-          <w:numId w:val="1"/>
-        </w:numPr>
-        <w:spacing w:after="40"/>
-      </w:pPr>
-      <w:r>
-        <w:rPr>
-          <w:color w:val="1D2D3E"/>
-          <w:sz w:val="22"/>
-          <w:szCs w:val="22"/>
-        </w:rPr>
-        <w:t xml:space="preserve">Full color palette matching web app (primary blue #0A6ED1, greens, reds, oranges)</w:t>
-      </w:r>
-    </w:p>
-    <w:p>
-      <w:pPr>
-        <w:pStyle w:val="ListParagraph"/>
-        <w:numPr>
-          <w:ilvl w:val="0"/>
-          <w:numId w:val="1"/>
-        </w:numPr>
-        <w:spacing w:after="40"/>
-      </w:pPr>
-      <w:r>
-        <w:rPr>
-          <w:color w:val="1D2D3E"/>
-          <w:sz w:val="22"/>
-          <w:szCs w:val="22"/>
-        </w:rPr>
-        <w:t xml:space="preserve">Voucher type badge colors (JV, GRN, DN, PAY, REC, INV, SO, PO)</w:t>
-      </w:r>
-    </w:p>
-    <w:p>
-      <w:pPr>
-        <w:pStyle w:val="ListParagraph"/>
-        <w:numPr>
-          <w:ilvl w:val="0"/>
-          <w:numId w:val="1"/>
-        </w:numPr>
-        <w:spacing w:after="40"/>
-      </w:pPr>
-      <w:r>
-        <w:rPr>
-          <w:color w:val="1D2D3E"/>
-          <w:sz w:val="22"/>
-          <w:szCs w:val="22"/>
-        </w:rPr>
-        <w:t xml:space="preserve">Spacing scale, border radius tokens, shadow presets, typography scale</w:t>
+        <w:t xml:space="preserve">3.11 Materials Screen (src/screens/materials/MaterialsScreen.tsx)</w:t>
+      </w:r>
+    </w:p>
+    <w:p>
+      <w:pPr>
+        <w:pStyle w:val="ListParagraph"/>
+        <w:numPr>
+          <w:ilvl w:val="0"/>
+          <w:numId w:val="1"/>
+        </w:numPr>
+        <w:spacing w:after="40"/>
+      </w:pPr>
+      <w:r>
+        <w:rPr>
+          <w:color w:val="1D2D3E"/>
+          <w:sz w:val="22"/>
+          <w:szCs w:val="22"/>
+        </w:rPr>
+        <w:t xml:space="preserve">Searchable list by name, code, type, category</w:t>
+      </w:r>
+    </w:p>
+    <w:p>
+      <w:pPr>
+        <w:pStyle w:val="ListParagraph"/>
+        <w:numPr>
+          <w:ilvl w:val="0"/>
+          <w:numId w:val="1"/>
+        </w:numPr>
+        <w:spacing w:after="40"/>
+      </w:pPr>
+      <w:r>
+        <w:rPr>
+          <w:color w:val="1D2D3E"/>
+          <w:sz w:val="22"/>
+          <w:szCs w:val="22"/>
+        </w:rPr>
+        <w:t xml:space="preserve">Horizontal type filter chips fetched from /api/mobile/materials?view=types</w:t>
+      </w:r>
+    </w:p>
+    <w:p>
+      <w:pPr>
+        <w:pStyle w:val="ListParagraph"/>
+        <w:numPr>
+          <w:ilvl w:val="0"/>
+          <w:numId w:val="1"/>
+        </w:numPr>
+        <w:spacing w:after="40"/>
+      </w:pPr>
+      <w:r>
+        <w:rPr>
+          <w:color w:val="1D2D3E"/>
+          <w:sz w:val="22"/>
+          <w:szCs w:val="22"/>
+        </w:rPr>
+        <w:t xml:space="preserve">Material cards: name, code, type badge, status badge (Active/Inactive), unit chip</w:t>
       </w:r>
     </w:p>
     <w:p>
@@ -1763,43 +2640,61 @@
           <w:bCs/>
           <w:color w:val="1D2D3E"/>
         </w:rPr>
-        <w:t xml:space="preserve">3.3 Utilities (src/utils/currency.ts)</w:t>
-      </w:r>
-    </w:p>
-    <w:p>
-      <w:pPr>
-        <w:pStyle w:val="ListParagraph"/>
-        <w:numPr>
-          <w:ilvl w:val="0"/>
-          <w:numId w:val="1"/>
-        </w:numPr>
-        <w:spacing w:after="40"/>
-      </w:pPr>
-      <w:r>
-        <w:rPr>
-          <w:color w:val="1D2D3E"/>
-          <w:sz w:val="22"/>
-          <w:szCs w:val="22"/>
-        </w:rPr>
-        <w:t xml:space="preserve">formatCurrency(amount) — PKR formatting with M/B abbreviations</w:t>
-      </w:r>
-    </w:p>
-    <w:p>
-      <w:pPr>
-        <w:pStyle w:val="ListParagraph"/>
-        <w:numPr>
-          <w:ilvl w:val="0"/>
-          <w:numId w:val="1"/>
-        </w:numPr>
-        <w:spacing w:after="40"/>
-      </w:pPr>
-      <w:r>
-        <w:rPr>
-          <w:color w:val="1D2D3E"/>
-          <w:sz w:val="22"/>
-          <w:szCs w:val="22"/>
-        </w:rPr>
-        <w:t xml:space="preserve">formatDate / formatShortDate helpers</w:t>
+        <w:t xml:space="preserve">3.12 Purchase Orders Screen (src/screens/purchaseOrders/)</w:t>
+      </w:r>
+    </w:p>
+    <w:p>
+      <w:pPr>
+        <w:pStyle w:val="ListParagraph"/>
+        <w:numPr>
+          <w:ilvl w:val="0"/>
+          <w:numId w:val="1"/>
+        </w:numPr>
+        <w:spacing w:after="40"/>
+      </w:pPr>
+      <w:r>
+        <w:rPr>
+          <w:color w:val="1D2D3E"/>
+          <w:sz w:val="22"/>
+          <w:szCs w:val="22"/>
+        </w:rPr>
+        <w:t xml:space="preserve">Three status tabs: All / Open / In Progress</w:t>
+      </w:r>
+    </w:p>
+    <w:p>
+      <w:pPr>
+        <w:pStyle w:val="ListParagraph"/>
+        <w:numPr>
+          <w:ilvl w:val="0"/>
+          <w:numId w:val="1"/>
+        </w:numPr>
+        <w:spacing w:after="40"/>
+      </w:pPr>
+      <w:r>
+        <w:rPr>
+          <w:color w:val="1D2D3E"/>
+          <w:sz w:val="22"/>
+          <w:szCs w:val="22"/>
+        </w:rPr>
+        <w:t xml:space="preserve">PO cards with: PO number, vendor, date, status badge, total amount, progress bar</w:t>
+      </w:r>
+    </w:p>
+    <w:p>
+      <w:pPr>
+        <w:pStyle w:val="ListParagraph"/>
+        <w:numPr>
+          <w:ilvl w:val="0"/>
+          <w:numId w:val="1"/>
+        </w:numPr>
+        <w:spacing w:after="40"/>
+      </w:pPr>
+      <w:r>
+        <w:rPr>
+          <w:color w:val="1D2D3E"/>
+          <w:sz w:val="22"/>
+          <w:szCs w:val="22"/>
+        </w:rPr>
+        <w:t xml:space="preserve">Detail screen: PO header, receipt progress bar, line items with qty ordered/received/pending</w:t>
       </w:r>
     </w:p>
     <w:p>
@@ -1826,79 +2721,61 @@
           <w:bCs/>
           <w:color w:val="1D2D3E"/>
         </w:rPr>
-        <w:t xml:space="preserve">3.4 API Client (src/api/client.ts)</w:t>
-      </w:r>
-    </w:p>
-    <w:p>
-      <w:pPr>
-        <w:pStyle w:val="ListParagraph"/>
-        <w:numPr>
-          <w:ilvl w:val="0"/>
-          <w:numId w:val="1"/>
-        </w:numPr>
-        <w:spacing w:after="40"/>
-      </w:pPr>
-      <w:r>
-        <w:rPr>
-          <w:color w:val="1D2D3E"/>
-          <w:sz w:val="22"/>
-          <w:szCs w:val="22"/>
-        </w:rPr>
-        <w:t xml:space="preserve">Fetch wrapper with automatic JWT token attachment</w:t>
-      </w:r>
-    </w:p>
-    <w:p>
-      <w:pPr>
-        <w:pStyle w:val="ListParagraph"/>
-        <w:numPr>
-          <w:ilvl w:val="0"/>
-          <w:numId w:val="1"/>
-        </w:numPr>
-        <w:spacing w:after="40"/>
-      </w:pPr>
-      <w:r>
-        <w:rPr>
-          <w:color w:val="1D2D3E"/>
-          <w:sz w:val="22"/>
-          <w:szCs w:val="22"/>
-        </w:rPr>
-        <w:t xml:space="preserve">Token stored/retrieved via expo-secure-store</w:t>
-      </w:r>
-    </w:p>
-    <w:p>
-      <w:pPr>
-        <w:pStyle w:val="ListParagraph"/>
-        <w:numPr>
-          <w:ilvl w:val="0"/>
-          <w:numId w:val="1"/>
-        </w:numPr>
-        <w:spacing w:after="40"/>
-      </w:pPr>
-      <w:r>
-        <w:rPr>
-          <w:color w:val="1D2D3E"/>
-          <w:sz w:val="22"/>
-          <w:szCs w:val="22"/>
-        </w:rPr>
-        <w:t xml:space="preserve">Sends Cookie: auth_token=&lt;token&gt; header on all requests</w:t>
-      </w:r>
-    </w:p>
-    <w:p>
-      <w:pPr>
-        <w:pStyle w:val="ListParagraph"/>
-        <w:numPr>
-          <w:ilvl w:val="0"/>
-          <w:numId w:val="1"/>
-        </w:numPr>
-        <w:spacing w:after="40"/>
-      </w:pPr>
-      <w:r>
-        <w:rPr>
-          <w:color w:val="1D2D3E"/>
-          <w:sz w:val="22"/>
-          <w:szCs w:val="22"/>
-        </w:rPr>
-        <w:t xml:space="preserve">Configurable base URL via EXPO_PUBLIC_API_URL env var</w:t>
+        <w:t xml:space="preserve">3.13 Sales Orders Screen (src/screens/salesOrders/)</w:t>
+      </w:r>
+    </w:p>
+    <w:p>
+      <w:pPr>
+        <w:pStyle w:val="ListParagraph"/>
+        <w:numPr>
+          <w:ilvl w:val="0"/>
+          <w:numId w:val="1"/>
+        </w:numPr>
+        <w:spacing w:after="40"/>
+      </w:pPr>
+      <w:r>
+        <w:rPr>
+          <w:color w:val="1D2D3E"/>
+          <w:sz w:val="22"/>
+          <w:szCs w:val="22"/>
+        </w:rPr>
+        <w:t xml:space="preserve">Four status tabs: All / Open / Approved / Closed</w:t>
+      </w:r>
+    </w:p>
+    <w:p>
+      <w:pPr>
+        <w:pStyle w:val="ListParagraph"/>
+        <w:numPr>
+          <w:ilvl w:val="0"/>
+          <w:numId w:val="1"/>
+        </w:numPr>
+        <w:spacing w:after="40"/>
+      </w:pPr>
+      <w:r>
+        <w:rPr>
+          <w:color w:val="1D2D3E"/>
+          <w:sz w:val="22"/>
+          <w:szCs w:val="22"/>
+        </w:rPr>
+        <w:t xml:space="preserve">SO cards with: SO number, customer, date, status badge, total amount</w:t>
+      </w:r>
+    </w:p>
+    <w:p>
+      <w:pPr>
+        <w:pStyle w:val="ListParagraph"/>
+        <w:numPr>
+          <w:ilvl w:val="0"/>
+          <w:numId w:val="1"/>
+        </w:numPr>
+        <w:spacing w:after="40"/>
+      </w:pPr>
+      <w:r>
+        <w:rPr>
+          <w:color w:val="1D2D3E"/>
+          <w:sz w:val="22"/>
+          <w:szCs w:val="22"/>
+        </w:rPr>
+        <w:t xml:space="preserve">Detail screen: SO header, line items list, total row</w:t>
       </w:r>
     </w:p>
     <w:p>
@@ -1925,79 +2802,61 @@
           <w:bCs/>
           <w:color w:val="1D2D3E"/>
         </w:rPr>
-        <w:t xml:space="preserve">3.5 Auth Context (src/context/AuthContext.tsx)</w:t>
-      </w:r>
-    </w:p>
-    <w:p>
-      <w:pPr>
-        <w:pStyle w:val="ListParagraph"/>
-        <w:numPr>
-          <w:ilvl w:val="0"/>
-          <w:numId w:val="1"/>
-        </w:numPr>
-        <w:spacing w:after="40"/>
-      </w:pPr>
-      <w:r>
-        <w:rPr>
-          <w:color w:val="1D2D3E"/>
-          <w:sz w:val="22"/>
-          <w:szCs w:val="22"/>
-        </w:rPr>
-        <w:t xml:space="preserve">React context with loginAs / logout actions</w:t>
-      </w:r>
-    </w:p>
-    <w:p>
-      <w:pPr>
-        <w:pStyle w:val="ListParagraph"/>
-        <w:numPr>
-          <w:ilvl w:val="0"/>
-          <w:numId w:val="1"/>
-        </w:numPr>
-        <w:spacing w:after="40"/>
-      </w:pPr>
-      <w:r>
-        <w:rPr>
-          <w:color w:val="1D2D3E"/>
-          <w:sz w:val="22"/>
-          <w:szCs w:val="22"/>
-        </w:rPr>
-        <w:t xml:space="preserve">Restores session from stored JWT on app start (decodes payload)</w:t>
-      </w:r>
-    </w:p>
-    <w:p>
-      <w:pPr>
-        <w:pStyle w:val="ListParagraph"/>
-        <w:numPr>
-          <w:ilvl w:val="0"/>
-          <w:numId w:val="1"/>
-        </w:numPr>
-        <w:spacing w:after="40"/>
-      </w:pPr>
-      <w:r>
-        <w:rPr>
-          <w:color w:val="1D2D3E"/>
-          <w:sz w:val="22"/>
-          <w:szCs w:val="22"/>
-        </w:rPr>
-        <w:t xml:space="preserve">Three states: loading, unauthenticated, authenticated</w:t>
-      </w:r>
-    </w:p>
-    <w:p>
-      <w:pPr>
-        <w:pStyle w:val="ListParagraph"/>
-        <w:numPr>
-          <w:ilvl w:val="0"/>
-          <w:numId w:val="1"/>
-        </w:numPr>
-        <w:spacing w:after="40"/>
-      </w:pPr>
-      <w:r>
-        <w:rPr>
-          <w:color w:val="1D2D3E"/>
-          <w:sz w:val="22"/>
-          <w:szCs w:val="22"/>
-        </w:rPr>
-        <w:t xml:space="preserve">useAuth() hook for consuming components</w:t>
+        <w:t xml:space="preserve">3.14 GRN Screen (src/screens/grn/GRNScreen.tsx)</w:t>
+      </w:r>
+    </w:p>
+    <w:p>
+      <w:pPr>
+        <w:pStyle w:val="ListParagraph"/>
+        <w:numPr>
+          <w:ilvl w:val="0"/>
+          <w:numId w:val="1"/>
+        </w:numPr>
+        <w:spacing w:after="40"/>
+      </w:pPr>
+      <w:r>
+        <w:rPr>
+          <w:color w:val="1D2D3E"/>
+          <w:sz w:val="22"/>
+          <w:szCs w:val="22"/>
+        </w:rPr>
+        <w:t xml:space="preserve">Goods receipt progress view per purchase order</w:t>
+      </w:r>
+    </w:p>
+    <w:p>
+      <w:pPr>
+        <w:pStyle w:val="ListParagraph"/>
+        <w:numPr>
+          <w:ilvl w:val="0"/>
+          <w:numId w:val="1"/>
+        </w:numPr>
+        <w:spacing w:after="40"/>
+      </w:pPr>
+      <w:r>
+        <w:rPr>
+          <w:color w:val="1D2D3E"/>
+          <w:sz w:val="22"/>
+          <w:szCs w:val="22"/>
+        </w:rPr>
+        <w:t xml:space="preserve">Overall summary card: PO count, overall % received, progress bar</w:t>
+      </w:r>
+    </w:p>
+    <w:p>
+      <w:pPr>
+        <w:pStyle w:val="ListParagraph"/>
+        <w:numPr>
+          <w:ilvl w:val="0"/>
+          <w:numId w:val="1"/>
+        </w:numPr>
+        <w:spacing w:after="40"/>
+      </w:pPr>
+      <w:r>
+        <w:rPr>
+          <w:color w:val="1D2D3E"/>
+          <w:sz w:val="22"/>
+          <w:szCs w:val="22"/>
+        </w:rPr>
+        <w:t xml:space="preserve">Per-PO cards: receipt progress, optional line item preview</w:t>
       </w:r>
     </w:p>
     <w:p>
@@ -2024,79 +2883,79 @@
           <w:bCs/>
           <w:color w:val="1D2D3E"/>
         </w:rPr>
-        <w:t xml:space="preserve">3.6 Login Screen (src/screens/auth/LoginScreen.tsx)</w:t>
-      </w:r>
-    </w:p>
-    <w:p>
-      <w:pPr>
-        <w:pStyle w:val="ListParagraph"/>
-        <w:numPr>
-          <w:ilvl w:val="0"/>
-          <w:numId w:val="1"/>
-        </w:numPr>
-        <w:spacing w:after="40"/>
-      </w:pPr>
-      <w:r>
-        <w:rPr>
-          <w:color w:val="1D2D3E"/>
-          <w:sz w:val="22"/>
-          <w:szCs w:val="22"/>
-        </w:rPr>
-        <w:t xml:space="preserve">Fetches employee list from /api/employees</w:t>
-      </w:r>
-    </w:p>
-    <w:p>
-      <w:pPr>
-        <w:pStyle w:val="ListParagraph"/>
-        <w:numPr>
-          <w:ilvl w:val="0"/>
-          <w:numId w:val="1"/>
-        </w:numPr>
-        <w:spacing w:after="40"/>
-      </w:pPr>
-      <w:r>
-        <w:rPr>
-          <w:color w:val="1D2D3E"/>
-          <w:sz w:val="22"/>
-          <w:szCs w:val="22"/>
-        </w:rPr>
-        <w:t xml:space="preserve">Card list with avatar initials, name, email, role badge</w:t>
-      </w:r>
-    </w:p>
-    <w:p>
-      <w:pPr>
-        <w:pStyle w:val="ListParagraph"/>
-        <w:numPr>
-          <w:ilvl w:val="0"/>
-          <w:numId w:val="1"/>
-        </w:numPr>
-        <w:spacing w:after="40"/>
-      </w:pPr>
-      <w:r>
-        <w:rPr>
-          <w:color w:val="1D2D3E"/>
-          <w:sz w:val="22"/>
-          <w:szCs w:val="22"/>
-        </w:rPr>
-        <w:t xml:space="preserve">Tap to login — calls /api/auth/switch, stores JWT token</w:t>
-      </w:r>
-    </w:p>
-    <w:p>
-      <w:pPr>
-        <w:pStyle w:val="ListParagraph"/>
-        <w:numPr>
-          <w:ilvl w:val="0"/>
-          <w:numId w:val="1"/>
-        </w:numPr>
-        <w:spacing w:after="40"/>
-      </w:pPr>
-      <w:r>
-        <w:rPr>
-          <w:color w:val="1D2D3E"/>
-          <w:sz w:val="22"/>
-          <w:szCs w:val="22"/>
-        </w:rPr>
-        <w:t xml:space="preserve">Loading and error states with retry button</w:t>
+        <w:t xml:space="preserve">3.15 Accounts Payable Screen (src/screens/finance/AccountsPayableScreen.tsx)</w:t>
+      </w:r>
+    </w:p>
+    <w:p>
+      <w:pPr>
+        <w:pStyle w:val="ListParagraph"/>
+        <w:numPr>
+          <w:ilvl w:val="0"/>
+          <w:numId w:val="1"/>
+        </w:numPr>
+        <w:spacing w:after="40"/>
+      </w:pPr>
+      <w:r>
+        <w:rPr>
+          <w:color w:val="1D2D3E"/>
+          <w:sz w:val="22"/>
+          <w:szCs w:val="22"/>
+        </w:rPr>
+        <w:t xml:space="preserve">Three tabs: Summary / Bills / Vendors</w:t>
+      </w:r>
+    </w:p>
+    <w:p>
+      <w:pPr>
+        <w:pStyle w:val="ListParagraph"/>
+        <w:numPr>
+          <w:ilvl w:val="0"/>
+          <w:numId w:val="1"/>
+        </w:numPr>
+        <w:spacing w:after="40"/>
+      </w:pPr>
+      <w:r>
+        <w:rPr>
+          <w:color w:val="1D2D3E"/>
+          <w:sz w:val="22"/>
+          <w:szCs w:val="22"/>
+        </w:rPr>
+        <w:t xml:space="preserve">Summary: KPI cards (outstanding, overdue, vendor count, bill count) + aging analysis bars</w:t>
+      </w:r>
+    </w:p>
+    <w:p>
+      <w:pPr>
+        <w:pStyle w:val="ListParagraph"/>
+        <w:numPr>
+          <w:ilvl w:val="0"/>
+          <w:numId w:val="1"/>
+        </w:numPr>
+        <w:spacing w:after="40"/>
+      </w:pPr>
+      <w:r>
+        <w:rPr>
+          <w:color w:val="1D2D3E"/>
+          <w:sz w:val="22"/>
+          <w:szCs w:val="22"/>
+        </w:rPr>
+        <w:t xml:space="preserve">Bills: bill cards with status, amounts, due date</w:t>
+      </w:r>
+    </w:p>
+    <w:p>
+      <w:pPr>
+        <w:pStyle w:val="ListParagraph"/>
+        <w:numPr>
+          <w:ilvl w:val="0"/>
+          <w:numId w:val="1"/>
+        </w:numPr>
+        <w:spacing w:after="40"/>
+      </w:pPr>
+      <w:r>
+        <w:rPr>
+          <w:color w:val="1D2D3E"/>
+          <w:sz w:val="22"/>
+          <w:szCs w:val="22"/>
+        </w:rPr>
+        <w:t xml:space="preserve">Vendors: vendor cards with outstanding/overdue balances</w:t>
       </w:r>
     </w:p>
     <w:p>
@@ -2123,115 +2982,79 @@
           <w:bCs/>
           <w:color w:val="1D2D3E"/>
         </w:rPr>
-        <w:t xml:space="preserve">3.7 Dashboard Screen (src/screens/dashboard/DashboardScreen.tsx)</w:t>
-      </w:r>
-    </w:p>
-    <w:p>
-      <w:pPr>
-        <w:pStyle w:val="ListParagraph"/>
-        <w:numPr>
-          <w:ilvl w:val="0"/>
-          <w:numId w:val="1"/>
-        </w:numPr>
-        <w:spacing w:after="40"/>
-      </w:pPr>
-      <w:r>
-        <w:rPr>
-          <w:color w:val="1D2D3E"/>
-          <w:sz w:val="22"/>
-          <w:szCs w:val="22"/>
-        </w:rPr>
-        <w:t xml:space="preserve">Top bar with time-based greeting, user name/role, sign out button</w:t>
-      </w:r>
-    </w:p>
-    <w:p>
-      <w:pPr>
-        <w:pStyle w:val="ListParagraph"/>
-        <w:numPr>
-          <w:ilvl w:val="0"/>
-          <w:numId w:val="1"/>
-        </w:numPr>
-        <w:spacing w:after="40"/>
-      </w:pPr>
-      <w:r>
-        <w:rPr>
-          <w:color w:val="1D2D3E"/>
-          <w:sz w:val="22"/>
-          <w:szCs w:val="22"/>
-        </w:rPr>
-        <w:t xml:space="preserve">Pull-to-refresh support</w:t>
-      </w:r>
-    </w:p>
-    <w:p>
-      <w:pPr>
-        <w:pStyle w:val="ListParagraph"/>
-        <w:numPr>
-          <w:ilvl w:val="0"/>
-          <w:numId w:val="1"/>
-        </w:numPr>
-        <w:spacing w:after="40"/>
-      </w:pPr>
-      <w:r>
-        <w:rPr>
-          <w:color w:val="1D2D3E"/>
-          <w:sz w:val="22"/>
-          <w:szCs w:val="22"/>
-        </w:rPr>
-        <w:t xml:space="preserve">3×2 KPI grid: Revenue, Expenses, Net Income, Cash &amp; Bank, Receivables, Payables</w:t>
-      </w:r>
-    </w:p>
-    <w:p>
-      <w:pPr>
-        <w:pStyle w:val="ListParagraph"/>
-        <w:numPr>
-          <w:ilvl w:val="0"/>
-          <w:numId w:val="1"/>
-        </w:numPr>
-        <w:spacing w:after="40"/>
-      </w:pPr>
-      <w:r>
-        <w:rPr>
-          <w:color w:val="1D2D3E"/>
-          <w:sz w:val="22"/>
-          <w:szCs w:val="22"/>
-        </w:rPr>
-        <w:t xml:space="preserve">Working Capital panel (Cash + AR − AP = Net)</w:t>
-      </w:r>
-    </w:p>
-    <w:p>
-      <w:pPr>
-        <w:pStyle w:val="ListParagraph"/>
-        <w:numPr>
-          <w:ilvl w:val="0"/>
-          <w:numId w:val="1"/>
-        </w:numPr>
-        <w:spacing w:after="40"/>
-      </w:pPr>
-      <w:r>
-        <w:rPr>
-          <w:color w:val="1D2D3E"/>
-          <w:sz w:val="22"/>
-          <w:szCs w:val="22"/>
-        </w:rPr>
-        <w:t xml:space="preserve">Quick Actions grid: Journal Entry, Purchase Order, Sales Order, GRN, Trial Balance, Inventory</w:t>
-      </w:r>
-    </w:p>
-    <w:p>
-      <w:pPr>
-        <w:pStyle w:val="ListParagraph"/>
-        <w:numPr>
-          <w:ilvl w:val="0"/>
-          <w:numId w:val="1"/>
-        </w:numPr>
-        <w:spacing w:after="40"/>
-      </w:pPr>
-      <w:r>
-        <w:rPr>
-          <w:color w:val="1D2D3E"/>
-          <w:sz w:val="22"/>
-          <w:szCs w:val="22"/>
-        </w:rPr>
-        <w:t xml:space="preserve">Recent Activity list (last 20 vouchers with type badge, number, date, amount, status)</w:t>
+        <w:t xml:space="preserve">3.16 Accounts Receivable Screen (src/screens/finance/AccountsReceivableScreen.tsx)</w:t>
+      </w:r>
+    </w:p>
+    <w:p>
+      <w:pPr>
+        <w:pStyle w:val="ListParagraph"/>
+        <w:numPr>
+          <w:ilvl w:val="0"/>
+          <w:numId w:val="1"/>
+        </w:numPr>
+        <w:spacing w:after="40"/>
+      </w:pPr>
+      <w:r>
+        <w:rPr>
+          <w:color w:val="1D2D3E"/>
+          <w:sz w:val="22"/>
+          <w:szCs w:val="22"/>
+        </w:rPr>
+        <w:t xml:space="preserve">Three tabs: Summary / Invoices / Customers</w:t>
+      </w:r>
+    </w:p>
+    <w:p>
+      <w:pPr>
+        <w:pStyle w:val="ListParagraph"/>
+        <w:numPr>
+          <w:ilvl w:val="0"/>
+          <w:numId w:val="1"/>
+        </w:numPr>
+        <w:spacing w:after="40"/>
+      </w:pPr>
+      <w:r>
+        <w:rPr>
+          <w:color w:val="1D2D3E"/>
+          <w:sz w:val="22"/>
+          <w:szCs w:val="22"/>
+        </w:rPr>
+        <w:t xml:space="preserve">Summary: KPI cards + aging analysis bars (same pattern as AP)</w:t>
+      </w:r>
+    </w:p>
+    <w:p>
+      <w:pPr>
+        <w:pStyle w:val="ListParagraph"/>
+        <w:numPr>
+          <w:ilvl w:val="0"/>
+          <w:numId w:val="1"/>
+        </w:numPr>
+        <w:spacing w:after="40"/>
+      </w:pPr>
+      <w:r>
+        <w:rPr>
+          <w:color w:val="1D2D3E"/>
+          <w:sz w:val="22"/>
+          <w:szCs w:val="22"/>
+        </w:rPr>
+        <w:t xml:space="preserve">Invoices: invoice cards with outstanding amounts</w:t>
+      </w:r>
+    </w:p>
+    <w:p>
+      <w:pPr>
+        <w:pStyle w:val="ListParagraph"/>
+        <w:numPr>
+          <w:ilvl w:val="0"/>
+          <w:numId w:val="1"/>
+        </w:numPr>
+        <w:spacing w:after="40"/>
+      </w:pPr>
+      <w:r>
+        <w:rPr>
+          <w:color w:val="1D2D3E"/>
+          <w:sz w:val="22"/>
+          <w:szCs w:val="22"/>
+        </w:rPr>
+        <w:t xml:space="preserve">Customers: customer cards with outstanding/overdue balances</w:t>
       </w:r>
     </w:p>
     <w:p>
@@ -2258,61 +3081,79 @@
           <w:bCs/>
           <w:color w:val="1D2D3E"/>
         </w:rPr>
-        <w:t xml:space="preserve">3.8 Navigation (src/navigation/)</w:t>
-      </w:r>
-    </w:p>
-    <w:p>
-      <w:pPr>
-        <w:pStyle w:val="ListParagraph"/>
-        <w:numPr>
-          <w:ilvl w:val="0"/>
-          <w:numId w:val="1"/>
-        </w:numPr>
-        <w:spacing w:after="40"/>
-      </w:pPr>
-      <w:r>
-        <w:rPr>
-          <w:color w:val="1D2D3E"/>
-          <w:sz w:val="22"/>
-          <w:szCs w:val="22"/>
-        </w:rPr>
-        <w:t xml:space="preserve">AuthNavigator — native stack with Login screen</w:t>
-      </w:r>
-    </w:p>
-    <w:p>
-      <w:pPr>
-        <w:pStyle w:val="ListParagraph"/>
-        <w:numPr>
-          <w:ilvl w:val="0"/>
-          <w:numId w:val="1"/>
-        </w:numPr>
-        <w:spacing w:after="40"/>
-      </w:pPr>
-      <w:r>
-        <w:rPr>
-          <w:color w:val="1D2D3E"/>
-          <w:sz w:val="22"/>
-          <w:szCs w:val="22"/>
-        </w:rPr>
-        <w:t xml:space="preserve">AppNavigator — bottom tabs: Dashboard, Inventory, Finance, More</w:t>
-      </w:r>
-    </w:p>
-    <w:p>
-      <w:pPr>
-        <w:pStyle w:val="ListParagraph"/>
-        <w:numPr>
-          <w:ilvl w:val="0"/>
-          <w:numId w:val="1"/>
-        </w:numPr>
-        <w:spacing w:after="40"/>
-      </w:pPr>
-      <w:r>
-        <w:rPr>
-          <w:color w:val="1D2D3E"/>
-          <w:sz w:val="22"/>
-          <w:szCs w:val="22"/>
-        </w:rPr>
-        <w:t xml:space="preserve">RootNavigator — switches between Auth/App based on AuthContext state</w:t>
+        <w:t xml:space="preserve">3.17 Journal Entries Screen (src/screens/journalEntries/JournalEntriesScreen.tsx)</w:t>
+      </w:r>
+    </w:p>
+    <w:p>
+      <w:pPr>
+        <w:pStyle w:val="ListParagraph"/>
+        <w:numPr>
+          <w:ilvl w:val="0"/>
+          <w:numId w:val="1"/>
+        </w:numPr>
+        <w:spacing w:after="40"/>
+      </w:pPr>
+      <w:r>
+        <w:rPr>
+          <w:color w:val="1D2D3E"/>
+          <w:sz w:val="22"/>
+          <w:szCs w:val="22"/>
+        </w:rPr>
+        <w:t xml:space="preserve">Searchable list: voucher number, narration</w:t>
+      </w:r>
+    </w:p>
+    <w:p>
+      <w:pPr>
+        <w:pStyle w:val="ListParagraph"/>
+        <w:numPr>
+          <w:ilvl w:val="0"/>
+          <w:numId w:val="1"/>
+        </w:numPr>
+        <w:spacing w:after="40"/>
+      </w:pPr>
+      <w:r>
+        <w:rPr>
+          <w:color w:val="1D2D3E"/>
+          <w:sz w:val="22"/>
+          <w:szCs w:val="22"/>
+        </w:rPr>
+        <w:t xml:space="preserve">Voucher type filter chips (JV, GRN, PAY, REC, INV, SO, PO, DN)</w:t>
+      </w:r>
+    </w:p>
+    <w:p>
+      <w:pPr>
+        <w:pStyle w:val="ListParagraph"/>
+        <w:numPr>
+          <w:ilvl w:val="0"/>
+          <w:numId w:val="1"/>
+        </w:numPr>
+        <w:spacing w:after="40"/>
+      </w:pPr>
+      <w:r>
+        <w:rPr>
+          <w:color w:val="1D2D3E"/>
+          <w:sz w:val="22"/>
+          <w:szCs w:val="22"/>
+        </w:rPr>
+        <w:t xml:space="preserve">Cards with colored type badge, status badge (POSTED/DRAFT/VOID), debit/credit totals</w:t>
+      </w:r>
+    </w:p>
+    <w:p>
+      <w:pPr>
+        <w:pStyle w:val="ListParagraph"/>
+        <w:numPr>
+          <w:ilvl w:val="0"/>
+          <w:numId w:val="1"/>
+        </w:numPr>
+        <w:spacing w:after="40"/>
+      </w:pPr>
+      <w:r>
+        <w:rPr>
+          <w:color w:val="1D2D3E"/>
+          <w:sz w:val="22"/>
+          <w:szCs w:val="22"/>
+        </w:rPr>
+        <w:t xml:space="preserve">Expandable cards reveal journal lines (account, debit, credit)</w:t>
       </w:r>
     </w:p>
     <w:p>
@@ -2339,79 +3180,97 @@
           <w:bCs/>
           <w:color w:val="1D2D3E"/>
         </w:rPr>
-        <w:t xml:space="preserve">3.9 Shared Components (src/components/)</w:t>
-      </w:r>
-    </w:p>
-    <w:p>
-      <w:pPr>
-        <w:pStyle w:val="ListParagraph"/>
-        <w:numPr>
-          <w:ilvl w:val="0"/>
-          <w:numId w:val="1"/>
-        </w:numPr>
-        <w:spacing w:after="40"/>
-      </w:pPr>
-      <w:r>
-        <w:rPr>
-          <w:color w:val="1D2D3E"/>
-          <w:sz w:val="22"/>
-          <w:szCs w:val="22"/>
-        </w:rPr>
-        <w:t xml:space="preserve">LoadingView — centered spinner with optional message</w:t>
-      </w:r>
-    </w:p>
-    <w:p>
-      <w:pPr>
-        <w:pStyle w:val="ListParagraph"/>
-        <w:numPr>
-          <w:ilvl w:val="0"/>
-          <w:numId w:val="1"/>
-        </w:numPr>
-        <w:spacing w:after="40"/>
-      </w:pPr>
-      <w:r>
-        <w:rPr>
-          <w:color w:val="1D2D3E"/>
-          <w:sz w:val="22"/>
-          <w:szCs w:val="22"/>
-        </w:rPr>
-        <w:t xml:space="preserve">ErrorView — error message with retry button</w:t>
-      </w:r>
-    </w:p>
-    <w:p>
-      <w:pPr>
-        <w:pStyle w:val="ListParagraph"/>
-        <w:numPr>
-          <w:ilvl w:val="0"/>
-          <w:numId w:val="1"/>
-        </w:numPr>
-        <w:spacing w:after="40"/>
-      </w:pPr>
-      <w:r>
-        <w:rPr>
-          <w:color w:val="1D2D3E"/>
-          <w:sz w:val="22"/>
-          <w:szCs w:val="22"/>
-        </w:rPr>
-        <w:t xml:space="preserve">KPICard — metric card (label / value / subtext, optional color)</w:t>
-      </w:r>
-    </w:p>
-    <w:p>
-      <w:pPr>
-        <w:pStyle w:val="ListParagraph"/>
-        <w:numPr>
-          <w:ilvl w:val="0"/>
-          <w:numId w:val="1"/>
-        </w:numPr>
-        <w:spacing w:after="40"/>
-      </w:pPr>
-      <w:r>
-        <w:rPr>
-          <w:color w:val="1D2D3E"/>
-          <w:sz w:val="22"/>
-          <w:szCs w:val="22"/>
-        </w:rPr>
-        <w:t xml:space="preserve">SectionHeader — section title with optional right-side meta text</w:t>
+        <w:t xml:space="preserve">3.18 Trial Balance Screen (src/screens/trialBalance/TrialBalanceScreen.tsx)</w:t>
+      </w:r>
+    </w:p>
+    <w:p>
+      <w:pPr>
+        <w:pStyle w:val="ListParagraph"/>
+        <w:numPr>
+          <w:ilvl w:val="0"/>
+          <w:numId w:val="1"/>
+        </w:numPr>
+        <w:spacing w:after="40"/>
+      </w:pPr>
+      <w:r>
+        <w:rPr>
+          <w:color w:val="1D2D3E"/>
+          <w:sz w:val="22"/>
+          <w:szCs w:val="22"/>
+        </w:rPr>
+        <w:t xml:space="preserve">Company selector dropdown (populated from /api/options/companies)</w:t>
+      </w:r>
+    </w:p>
+    <w:p>
+      <w:pPr>
+        <w:pStyle w:val="ListParagraph"/>
+        <w:numPr>
+          <w:ilvl w:val="0"/>
+          <w:numId w:val="1"/>
+        </w:numPr>
+        <w:spacing w:after="40"/>
+      </w:pPr>
+      <w:r>
+        <w:rPr>
+          <w:color w:val="1D2D3E"/>
+          <w:sz w:val="22"/>
+          <w:szCs w:val="22"/>
+        </w:rPr>
+        <w:t xml:space="preserve">As-of date text input (YYYY-MM-DD format, Run Report button)</w:t>
+      </w:r>
+    </w:p>
+    <w:p>
+      <w:pPr>
+        <w:pStyle w:val="ListParagraph"/>
+        <w:numPr>
+          <w:ilvl w:val="0"/>
+          <w:numId w:val="1"/>
+        </w:numPr>
+        <w:spacing w:after="40"/>
+      </w:pPr>
+      <w:r>
+        <w:rPr>
+          <w:color w:val="1D2D3E"/>
+          <w:sz w:val="22"/>
+          <w:szCs w:val="22"/>
+        </w:rPr>
+        <w:t xml:space="preserve">Account search filter</w:t>
+      </w:r>
+    </w:p>
+    <w:p>
+      <w:pPr>
+        <w:pStyle w:val="ListParagraph"/>
+        <w:numPr>
+          <w:ilvl w:val="0"/>
+          <w:numId w:val="1"/>
+        </w:numPr>
+        <w:spacing w:after="40"/>
+      </w:pPr>
+      <w:r>
+        <w:rPr>
+          <w:color w:val="1D2D3E"/>
+          <w:sz w:val="22"/>
+          <w:szCs w:val="22"/>
+        </w:rPr>
+        <w:t xml:space="preserve">Summary card: total debit / total credit with balance diff warning</w:t>
+      </w:r>
+    </w:p>
+    <w:p>
+      <w:pPr>
+        <w:pStyle w:val="ListParagraph"/>
+        <w:numPr>
+          <w:ilvl w:val="0"/>
+          <w:numId w:val="1"/>
+        </w:numPr>
+        <w:spacing w:after="40"/>
+      </w:pPr>
+      <w:r>
+        <w:rPr>
+          <w:color w:val="1D2D3E"/>
+          <w:sz w:val="22"/>
+          <w:szCs w:val="22"/>
+        </w:rPr>
+        <w:t xml:space="preserve">Hierarchical account table with group headers, level-based indentation</w:t>
       </w:r>
     </w:p>
     <w:p>
@@ -2438,97 +3297,79 @@
           <w:bCs/>
           <w:color w:val="1D2D3E"/>
         </w:rPr>
-        <w:t xml:space="preserve">3.10 Inventory Screen (src/screens/inventory/InventoryScreen.tsx)</w:t>
-      </w:r>
-    </w:p>
-    <w:p>
-      <w:pPr>
-        <w:pStyle w:val="ListParagraph"/>
-        <w:numPr>
-          <w:ilvl w:val="0"/>
-          <w:numId w:val="1"/>
-        </w:numPr>
-        <w:spacing w:after="40"/>
-      </w:pPr>
-      <w:r>
-        <w:rPr>
-          <w:color w:val="1D2D3E"/>
-          <w:sz w:val="22"/>
-          <w:szCs w:val="22"/>
-        </w:rPr>
-        <w:t xml:space="preserve">Internal tab view: Stock Balances and Stock Ledger</w:t>
-      </w:r>
-    </w:p>
-    <w:p>
-      <w:pPr>
-        <w:pStyle w:val="ListParagraph"/>
-        <w:numPr>
-          <w:ilvl w:val="0"/>
-          <w:numId w:val="1"/>
-        </w:numPr>
-        <w:spacing w:after="40"/>
-      </w:pPr>
-      <w:r>
-        <w:rPr>
-          <w:color w:val="1D2D3E"/>
-          <w:sz w:val="22"/>
-          <w:szCs w:val="22"/>
-        </w:rPr>
-        <w:t xml:space="preserve">Stock Balances: item/warehouse/qty cards with color-coded quantity levels</w:t>
-      </w:r>
-    </w:p>
-    <w:p>
-      <w:pPr>
-        <w:pStyle w:val="ListParagraph"/>
-        <w:numPr>
-          <w:ilvl w:val="0"/>
-          <w:numId w:val="1"/>
-        </w:numPr>
-        <w:spacing w:after="40"/>
-      </w:pPr>
-      <w:r>
-        <w:rPr>
-          <w:color w:val="1D2D3E"/>
-          <w:sz w:val="22"/>
-          <w:szCs w:val="22"/>
-        </w:rPr>
-        <w:t xml:space="preserve">Stock Ledger: movement log with IN/OUT/balance amounts and voucher type badges</w:t>
-      </w:r>
-    </w:p>
-    <w:p>
-      <w:pPr>
-        <w:pStyle w:val="ListParagraph"/>
-        <w:numPr>
-          <w:ilvl w:val="0"/>
-          <w:numId w:val="1"/>
-        </w:numPr>
-        <w:spacing w:after="40"/>
-      </w:pPr>
-      <w:r>
-        <w:rPr>
-          <w:color w:val="1D2D3E"/>
-          <w:sz w:val="22"/>
-          <w:szCs w:val="22"/>
-        </w:rPr>
-        <w:t xml:space="preserve">Search filter across both tabs (item name, warehouse)</w:t>
-      </w:r>
-    </w:p>
-    <w:p>
-      <w:pPr>
-        <w:pStyle w:val="ListParagraph"/>
-        <w:numPr>
-          <w:ilvl w:val="0"/>
-          <w:numId w:val="1"/>
-        </w:numPr>
-        <w:spacing w:after="40"/>
-      </w:pPr>
-      <w:r>
-        <w:rPr>
-          <w:color w:val="1D2D3E"/>
-          <w:sz w:val="22"/>
-          <w:szCs w:val="22"/>
-        </w:rPr>
-        <w:t xml:space="preserve">Pull-to-refresh, loading and empty states</w:t>
+        <w:t xml:space="preserve">3.19 Business Partners Screen (src/screens/partners/PartnersScreen.tsx)</w:t>
+      </w:r>
+    </w:p>
+    <w:p>
+      <w:pPr>
+        <w:pStyle w:val="ListParagraph"/>
+        <w:numPr>
+          <w:ilvl w:val="0"/>
+          <w:numId w:val="1"/>
+        </w:numPr>
+        <w:spacing w:after="40"/>
+      </w:pPr>
+      <w:r>
+        <w:rPr>
+          <w:color w:val="1D2D3E"/>
+          <w:sz w:val="22"/>
+          <w:szCs w:val="22"/>
+        </w:rPr>
+        <w:t xml:space="preserve">Searchable list (name, code, email)</w:t>
+      </w:r>
+    </w:p>
+    <w:p>
+      <w:pPr>
+        <w:pStyle w:val="ListParagraph"/>
+        <w:numPr>
+          <w:ilvl w:val="0"/>
+          <w:numId w:val="1"/>
+        </w:numPr>
+        <w:spacing w:after="40"/>
+      </w:pPr>
+      <w:r>
+        <w:rPr>
+          <w:color w:val="1D2D3E"/>
+          <w:sz w:val="22"/>
+          <w:szCs w:val="22"/>
+        </w:rPr>
+        <w:t xml:space="preserve">Role filter tabs: All / Customers / Vendors</w:t>
+      </w:r>
+    </w:p>
+    <w:p>
+      <w:pPr>
+        <w:pStyle w:val="ListParagraph"/>
+        <w:numPr>
+          <w:ilvl w:val="0"/>
+          <w:numId w:val="1"/>
+        </w:numPr>
+        <w:spacing w:after="40"/>
+      </w:pPr>
+      <w:r>
+        <w:rPr>
+          <w:color w:val="1D2D3E"/>
+          <w:sz w:val="22"/>
+          <w:szCs w:val="22"/>
+        </w:rPr>
+        <w:t xml:space="preserve">Partner cards: avatar initials, name, code, role badges (Customer=green, Vendor=blue)</w:t>
+      </w:r>
+    </w:p>
+    <w:p>
+      <w:pPr>
+        <w:pStyle w:val="ListParagraph"/>
+        <w:numPr>
+          <w:ilvl w:val="0"/>
+          <w:numId w:val="1"/>
+        </w:numPr>
+        <w:spacing w:after="40"/>
+      </w:pPr>
+      <w:r>
+        <w:rPr>
+          <w:color w:val="1D2D3E"/>
+          <w:sz w:val="22"/>
+          <w:szCs w:val="22"/>
+        </w:rPr>
+        <w:t xml:space="preserve">Contact info: email, phone, company</w:t>
       </w:r>
     </w:p>
     <w:p>
@@ -2555,61 +3396,43 @@
           <w:bCs/>
           <w:color w:val="1D2D3E"/>
         </w:rPr>
-        <w:t xml:space="preserve">3.11 Materials Screen (src/screens/materials/MaterialsScreen.tsx)</w:t>
-      </w:r>
-    </w:p>
-    <w:p>
-      <w:pPr>
-        <w:pStyle w:val="ListParagraph"/>
-        <w:numPr>
-          <w:ilvl w:val="0"/>
-          <w:numId w:val="1"/>
-        </w:numPr>
-        <w:spacing w:after="40"/>
-      </w:pPr>
-      <w:r>
-        <w:rPr>
-          <w:color w:val="1D2D3E"/>
-          <w:sz w:val="22"/>
-          <w:szCs w:val="22"/>
-        </w:rPr>
-        <w:t xml:space="preserve">Searchable list by name, code, type, category</w:t>
-      </w:r>
-    </w:p>
-    <w:p>
-      <w:pPr>
-        <w:pStyle w:val="ListParagraph"/>
-        <w:numPr>
-          <w:ilvl w:val="0"/>
-          <w:numId w:val="1"/>
-        </w:numPr>
-        <w:spacing w:after="40"/>
-      </w:pPr>
-      <w:r>
-        <w:rPr>
-          <w:color w:val="1D2D3E"/>
-          <w:sz w:val="22"/>
-          <w:szCs w:val="22"/>
-        </w:rPr>
-        <w:t xml:space="preserve">Horizontal type filter chips fetched from /api/mobile/materials?view=types</w:t>
-      </w:r>
-    </w:p>
-    <w:p>
-      <w:pPr>
-        <w:pStyle w:val="ListParagraph"/>
-        <w:numPr>
-          <w:ilvl w:val="0"/>
-          <w:numId w:val="1"/>
-        </w:numPr>
-        <w:spacing w:after="40"/>
-      </w:pPr>
-      <w:r>
-        <w:rPr>
-          <w:color w:val="1D2D3E"/>
-          <w:sz w:val="22"/>
-          <w:szCs w:val="22"/>
-        </w:rPr>
-        <w:t xml:space="preserve">Material cards: name, code, type badge, status badge (Active/Inactive), unit chip</w:t>
+        <w:t xml:space="preserve">3.20 Companies Screen (src/screens/companies/CompaniesScreen.tsx)</w:t>
+      </w:r>
+    </w:p>
+    <w:p>
+      <w:pPr>
+        <w:pStyle w:val="ListParagraph"/>
+        <w:numPr>
+          <w:ilvl w:val="0"/>
+          <w:numId w:val="1"/>
+        </w:numPr>
+        <w:spacing w:after="40"/>
+      </w:pPr>
+      <w:r>
+        <w:rPr>
+          <w:color w:val="1D2D3E"/>
+          <w:sz w:val="22"/>
+          <w:szCs w:val="22"/>
+        </w:rPr>
+        <w:t xml:space="preserve">Company list with logo circle (initial letter), name, code, active/inactive status badge</w:t>
+      </w:r>
+    </w:p>
+    <w:p>
+      <w:pPr>
+        <w:pStyle w:val="ListParagraph"/>
+        <w:numPr>
+          <w:ilvl w:val="0"/>
+          <w:numId w:val="1"/>
+        </w:numPr>
+        <w:spacing w:after="40"/>
+      </w:pPr>
+      <w:r>
+        <w:rPr>
+          <w:color w:val="1D2D3E"/>
+          <w:sz w:val="22"/>
+          <w:szCs w:val="22"/>
+        </w:rPr>
+        <w:t xml:space="preserve">Detail grid: currency, fiscal year, phone, email, address</w:t>
       </w:r>
     </w:p>
     <w:p>
@@ -2636,61 +3459,97 @@
           <w:bCs/>
           <w:color w:val="1D2D3E"/>
         </w:rPr>
-        <w:t xml:space="preserve">3.12 Purchase Orders Screen (src/screens/purchaseOrders/)</w:t>
-      </w:r>
-    </w:p>
-    <w:p>
-      <w:pPr>
-        <w:pStyle w:val="ListParagraph"/>
-        <w:numPr>
-          <w:ilvl w:val="0"/>
-          <w:numId w:val="1"/>
-        </w:numPr>
-        <w:spacing w:after="40"/>
-      </w:pPr>
-      <w:r>
-        <w:rPr>
-          <w:color w:val="1D2D3E"/>
-          <w:sz w:val="22"/>
-          <w:szCs w:val="22"/>
-        </w:rPr>
-        <w:t xml:space="preserve">Three status tabs: All / Open / In Progress</w:t>
-      </w:r>
-    </w:p>
-    <w:p>
-      <w:pPr>
-        <w:pStyle w:val="ListParagraph"/>
-        <w:numPr>
-          <w:ilvl w:val="0"/>
-          <w:numId w:val="1"/>
-        </w:numPr>
-        <w:spacing w:after="40"/>
-      </w:pPr>
-      <w:r>
-        <w:rPr>
-          <w:color w:val="1D2D3E"/>
-          <w:sz w:val="22"/>
-          <w:szCs w:val="22"/>
-        </w:rPr>
-        <w:t xml:space="preserve">PO cards with: PO number, vendor, date, status badge, total amount, progress bar</w:t>
-      </w:r>
-    </w:p>
-    <w:p>
-      <w:pPr>
-        <w:pStyle w:val="ListParagraph"/>
-        <w:numPr>
-          <w:ilvl w:val="0"/>
-          <w:numId w:val="1"/>
-        </w:numPr>
-        <w:spacing w:after="40"/>
-      </w:pPr>
-      <w:r>
-        <w:rPr>
-          <w:color w:val="1D2D3E"/>
-          <w:sz w:val="22"/>
-          <w:szCs w:val="22"/>
-        </w:rPr>
-        <w:t xml:space="preserve">Detail screen: PO header, receipt progress bar, line items with qty ordered/received/pending</w:t>
+        <w:t xml:space="preserve">3.21 Financial Reports Screen (src/screens/financialReports/)</w:t>
+      </w:r>
+    </w:p>
+    <w:p>
+      <w:pPr>
+        <w:pStyle w:val="ListParagraph"/>
+        <w:numPr>
+          <w:ilvl w:val="0"/>
+          <w:numId w:val="1"/>
+        </w:numPr>
+        <w:spacing w:after="40"/>
+      </w:pPr>
+      <w:r>
+        <w:rPr>
+          <w:color w:val="1D2D3E"/>
+          <w:sz w:val="22"/>
+          <w:szCs w:val="22"/>
+        </w:rPr>
+        <w:t xml:space="preserve">Two tabs: Profit &amp; Loss / Balance Sheet</w:t>
+      </w:r>
+    </w:p>
+    <w:p>
+      <w:pPr>
+        <w:pStyle w:val="ListParagraph"/>
+        <w:numPr>
+          <w:ilvl w:val="0"/>
+          <w:numId w:val="1"/>
+        </w:numPr>
+        <w:spacing w:after="40"/>
+      </w:pPr>
+      <w:r>
+        <w:rPr>
+          <w:color w:val="1D2D3E"/>
+          <w:sz w:val="22"/>
+          <w:szCs w:val="22"/>
+        </w:rPr>
+        <w:t xml:space="preserve">P&amp;L: revenue vs expense sections, net income summary card</w:t>
+      </w:r>
+    </w:p>
+    <w:p>
+      <w:pPr>
+        <w:pStyle w:val="ListParagraph"/>
+        <w:numPr>
+          <w:ilvl w:val="0"/>
+          <w:numId w:val="1"/>
+        </w:numPr>
+        <w:spacing w:after="40"/>
+      </w:pPr>
+      <w:r>
+        <w:rPr>
+          <w:color w:val="1D2D3E"/>
+          <w:sz w:val="22"/>
+          <w:szCs w:val="22"/>
+        </w:rPr>
+        <w:t xml:space="preserve">Balance Sheet: assets, liabilities, equity sections with balance check warning</w:t>
+      </w:r>
+    </w:p>
+    <w:p>
+      <w:pPr>
+        <w:pStyle w:val="ListParagraph"/>
+        <w:numPr>
+          <w:ilvl w:val="0"/>
+          <w:numId w:val="1"/>
+        </w:numPr>
+        <w:spacing w:after="40"/>
+      </w:pPr>
+      <w:r>
+        <w:rPr>
+          <w:color w:val="1D2D3E"/>
+          <w:sz w:val="22"/>
+          <w:szCs w:val="22"/>
+        </w:rPr>
+        <w:t xml:space="preserve">Company selector + as-of date picker (same pattern as Trial Balance)</w:t>
+      </w:r>
+    </w:p>
+    <w:p>
+      <w:pPr>
+        <w:pStyle w:val="ListParagraph"/>
+        <w:numPr>
+          <w:ilvl w:val="0"/>
+          <w:numId w:val="1"/>
+        </w:numPr>
+        <w:spacing w:after="40"/>
+      </w:pPr>
+      <w:r>
+        <w:rPr>
+          <w:color w:val="1D2D3E"/>
+          <w:sz w:val="22"/>
+          <w:szCs w:val="22"/>
+        </w:rPr>
+        <w:t xml:space="preserve">Accounts classified by account_type keyword matching</w:t>
       </w:r>
     </w:p>
     <w:p>
@@ -2717,61 +3576,115 @@
           <w:bCs/>
           <w:color w:val="1D2D3E"/>
         </w:rPr>
-        <w:t xml:space="preserve">3.13 Sales Orders Screen (src/screens/salesOrders/)</w:t>
-      </w:r>
-    </w:p>
-    <w:p>
-      <w:pPr>
-        <w:pStyle w:val="ListParagraph"/>
-        <w:numPr>
-          <w:ilvl w:val="0"/>
-          <w:numId w:val="1"/>
-        </w:numPr>
-        <w:spacing w:after="40"/>
-      </w:pPr>
-      <w:r>
-        <w:rPr>
-          <w:color w:val="1D2D3E"/>
-          <w:sz w:val="22"/>
-          <w:szCs w:val="22"/>
-        </w:rPr>
-        <w:t xml:space="preserve">Four status tabs: All / Open / Approved / Closed</w:t>
-      </w:r>
-    </w:p>
-    <w:p>
-      <w:pPr>
-        <w:pStyle w:val="ListParagraph"/>
-        <w:numPr>
-          <w:ilvl w:val="0"/>
-          <w:numId w:val="1"/>
-        </w:numPr>
-        <w:spacing w:after="40"/>
-      </w:pPr>
-      <w:r>
-        <w:rPr>
-          <w:color w:val="1D2D3E"/>
-          <w:sz w:val="22"/>
-          <w:szCs w:val="22"/>
-        </w:rPr>
-        <w:t xml:space="preserve">SO cards with: SO number, customer, date, status badge, total amount</w:t>
-      </w:r>
-    </w:p>
-    <w:p>
-      <w:pPr>
-        <w:pStyle w:val="ListParagraph"/>
-        <w:numPr>
-          <w:ilvl w:val="0"/>
-          <w:numId w:val="1"/>
-        </w:numPr>
-        <w:spacing w:after="40"/>
-      </w:pPr>
-      <w:r>
-        <w:rPr>
-          <w:color w:val="1D2D3E"/>
-          <w:sz w:val="22"/>
-          <w:szCs w:val="22"/>
-        </w:rPr>
-        <w:t xml:space="preserve">Detail screen: SO header, line items list, total row</w:t>
+        <w:t xml:space="preserve">3.22 Global Company Filter (Updated Session 3)</w:t>
+      </w:r>
+    </w:p>
+    <w:p>
+      <w:pPr>
+        <w:pStyle w:val="ListParagraph"/>
+        <w:numPr>
+          <w:ilvl w:val="0"/>
+          <w:numId w:val="1"/>
+        </w:numPr>
+        <w:spacing w:after="40"/>
+      </w:pPr>
+      <w:r>
+        <w:rPr>
+          <w:color w:val="1D2D3E"/>
+          <w:sz w:val="22"/>
+          <w:szCs w:val="22"/>
+        </w:rPr>
+        <w:t xml:space="preserve">CompanyContext (src/context/CompanyContext.tsx) — global state: companies list, selectedCompany, companyId</w:t>
+      </w:r>
+    </w:p>
+    <w:p>
+      <w:pPr>
+        <w:pStyle w:val="ListParagraph"/>
+        <w:numPr>
+          <w:ilvl w:val="0"/>
+          <w:numId w:val="1"/>
+        </w:numPr>
+        <w:spacing w:after="40"/>
+      </w:pPr>
+      <w:r>
+        <w:rPr>
+          <w:color w:val="1D2D3E"/>
+          <w:sz w:val="22"/>
+          <w:szCs w:val="22"/>
+        </w:rPr>
+        <w:t xml:space="preserve">CompanyPicker (src/components/CompanyPicker.tsx) — horizontal scrollable company chips</w:t>
+      </w:r>
+    </w:p>
+    <w:p>
+      <w:pPr>
+        <w:pStyle w:val="ListParagraph"/>
+        <w:numPr>
+          <w:ilvl w:val="0"/>
+          <w:numId w:val="1"/>
+        </w:numPr>
+        <w:spacing w:after="40"/>
+      </w:pPr>
+      <w:r>
+        <w:rPr>
+          <w:color w:val="1D2D3E"/>
+          <w:sz w:val="22"/>
+          <w:szCs w:val="22"/>
+        </w:rPr>
+        <w:t xml:space="preserve">CompanyProvider wrapped around app in App.tsx</w:t>
+      </w:r>
+    </w:p>
+    <w:p>
+      <w:pPr>
+        <w:pStyle w:val="ListParagraph"/>
+        <w:numPr>
+          <w:ilvl w:val="0"/>
+          <w:numId w:val="1"/>
+        </w:numPr>
+        <w:spacing w:after="40"/>
+      </w:pPr>
+      <w:r>
+        <w:rPr>
+          <w:color w:val="1D2D3E"/>
+          <w:sz w:val="22"/>
+          <w:szCs w:val="22"/>
+        </w:rPr>
+        <w:t xml:space="preserve">Now applied to all data screens: Dashboard, Inventory, Materials, Journal Entries, Partners, Sales Orders, AP, AR</w:t>
+      </w:r>
+    </w:p>
+    <w:p>
+      <w:pPr>
+        <w:pStyle w:val="ListParagraph"/>
+        <w:numPr>
+          <w:ilvl w:val="0"/>
+          <w:numId w:val="1"/>
+        </w:numPr>
+        <w:spacing w:after="40"/>
+      </w:pPr>
+      <w:r>
+        <w:rPr>
+          <w:color w:val="1D2D3E"/>
+          <w:sz w:val="22"/>
+          <w:szCs w:val="22"/>
+        </w:rPr>
+        <w:t xml:space="preserve">TrialBalance and FinancialReports use companies list from context (no duplicate API calls)</w:t>
+      </w:r>
+    </w:p>
+    <w:p>
+      <w:pPr>
+        <w:pStyle w:val="ListParagraph"/>
+        <w:numPr>
+          <w:ilvl w:val="0"/>
+          <w:numId w:val="1"/>
+        </w:numPr>
+        <w:spacing w:after="40"/>
+      </w:pPr>
+      <w:r>
+        <w:rPr>
+          <w:color w:val="1D2D3E"/>
+          <w:sz w:val="22"/>
+          <w:szCs w:val="22"/>
+        </w:rPr>
+        <w:t xml:space="preserve">CompanyContext re-loads after login (was incorrectly loading before auth on app start)</w:t>
       </w:r>
     </w:p>
     <w:p>
@@ -2798,61 +3711,115 @@
           <w:bCs/>
           <w:color w:val="1D2D3E"/>
         </w:rPr>
-        <w:t xml:space="preserve">3.14 GRN Screen (src/screens/grn/GRNScreen.tsx)</w:t>
-      </w:r>
-    </w:p>
-    <w:p>
-      <w:pPr>
-        <w:pStyle w:val="ListParagraph"/>
-        <w:numPr>
-          <w:ilvl w:val="0"/>
-          <w:numId w:val="1"/>
-        </w:numPr>
-        <w:spacing w:after="40"/>
-      </w:pPr>
-      <w:r>
-        <w:rPr>
-          <w:color w:val="1D2D3E"/>
-          <w:sz w:val="22"/>
-          <w:szCs w:val="22"/>
-        </w:rPr>
-        <w:t xml:space="preserve">Goods receipt progress view per purchase order</w:t>
-      </w:r>
-    </w:p>
-    <w:p>
-      <w:pPr>
-        <w:pStyle w:val="ListParagraph"/>
-        <w:numPr>
-          <w:ilvl w:val="0"/>
-          <w:numId w:val="1"/>
-        </w:numPr>
-        <w:spacing w:after="40"/>
-      </w:pPr>
-      <w:r>
-        <w:rPr>
-          <w:color w:val="1D2D3E"/>
-          <w:sz w:val="22"/>
-          <w:szCs w:val="22"/>
-        </w:rPr>
-        <w:t xml:space="preserve">Overall summary card: PO count, overall % received, progress bar</w:t>
-      </w:r>
-    </w:p>
-    <w:p>
-      <w:pPr>
-        <w:pStyle w:val="ListParagraph"/>
-        <w:numPr>
-          <w:ilvl w:val="0"/>
-          <w:numId w:val="1"/>
-        </w:numPr>
-        <w:spacing w:after="40"/>
-      </w:pPr>
-      <w:r>
-        <w:rPr>
-          <w:color w:val="1D2D3E"/>
-          <w:sz w:val="22"/>
-          <w:szCs w:val="22"/>
-        </w:rPr>
-        <w:t xml:space="preserve">Per-PO cards: receipt progress, optional line item preview</w:t>
+        <w:t xml:space="preserve">3.23 Navigation Architecture (Updated Session 3)</w:t>
+      </w:r>
+    </w:p>
+    <w:p>
+      <w:pPr>
+        <w:pStyle w:val="ListParagraph"/>
+        <w:numPr>
+          <w:ilvl w:val="0"/>
+          <w:numId w:val="1"/>
+        </w:numPr>
+        <w:spacing w:after="40"/>
+      </w:pPr>
+      <w:r>
+        <w:rPr>
+          <w:color w:val="1D2D3E"/>
+          <w:sz w:val="22"/>
+          <w:szCs w:val="22"/>
+        </w:rPr>
+        <w:t xml:space="preserve">AppStack (native stack) — thin root wrapper, contains only the Tabs screen</w:t>
+      </w:r>
+    </w:p>
+    <w:p>
+      <w:pPr>
+        <w:pStyle w:val="ListParagraph"/>
+        <w:numPr>
+          <w:ilvl w:val="0"/>
+          <w:numId w:val="1"/>
+        </w:numPr>
+        <w:spacing w:after="40"/>
+      </w:pPr>
+      <w:r>
+        <w:rPr>
+          <w:color w:val="1D2D3E"/>
+          <w:sz w:val="22"/>
+          <w:szCs w:val="22"/>
+        </w:rPr>
+        <w:t xml:space="preserve">AppNavigator (bottom tabs): Dashboard, Inventory, Finance, More</w:t>
+      </w:r>
+    </w:p>
+    <w:p>
+      <w:pPr>
+        <w:pStyle w:val="ListParagraph"/>
+        <w:numPr>
+          <w:ilvl w:val="0"/>
+          <w:numId w:val="1"/>
+        </w:numPr>
+        <w:spacing w:after="40"/>
+      </w:pPr>
+      <w:r>
+        <w:rPr>
+          <w:color w:val="1D2D3E"/>
+          <w:sz w:val="22"/>
+          <w:szCs w:val="22"/>
+        </w:rPr>
+        <w:t xml:space="preserve">FinanceNavigator (stack): FinanceMenu → AccountsPayable, AccountsReceivable, JournalEntries, TrialBalance, FinancialReports</w:t>
+      </w:r>
+    </w:p>
+    <w:p>
+      <w:pPr>
+        <w:pStyle w:val="ListParagraph"/>
+        <w:numPr>
+          <w:ilvl w:val="0"/>
+          <w:numId w:val="1"/>
+        </w:numPr>
+        <w:spacing w:after="40"/>
+      </w:pPr>
+      <w:r>
+        <w:rPr>
+          <w:color w:val="1D2D3E"/>
+          <w:sz w:val="22"/>
+          <w:szCs w:val="22"/>
+        </w:rPr>
+        <w:t xml:space="preserve">MoreNavigator (stack): MoreMenu → Materials, PurchaseOrders, PurchaseOrderDetail, SalesOrders, SalesOrderDetail, GRN, Partners, Companies</w:t>
+      </w:r>
+    </w:p>
+    <w:p>
+      <w:pPr>
+        <w:pStyle w:val="ListParagraph"/>
+        <w:numPr>
+          <w:ilvl w:val="0"/>
+          <w:numId w:val="1"/>
+        </w:numPr>
+        <w:spacing w:after="40"/>
+      </w:pPr>
+      <w:r>
+        <w:rPr>
+          <w:color w:val="1D2D3E"/>
+          <w:sz w:val="22"/>
+          <w:szCs w:val="22"/>
+        </w:rPr>
+        <w:t xml:space="preserve">MoreMenu Finance section navigates to Finance tab's real screens via getParent()</w:t>
+      </w:r>
+    </w:p>
+    <w:p>
+      <w:pPr>
+        <w:pStyle w:val="ListParagraph"/>
+        <w:numPr>
+          <w:ilvl w:val="0"/>
+          <w:numId w:val="1"/>
+        </w:numPr>
+        <w:spacing w:after="40"/>
+      </w:pPr>
+      <w:r>
+        <w:rPr>
+          <w:color w:val="1D2D3E"/>
+          <w:sz w:val="22"/>
+          <w:szCs w:val="22"/>
+        </w:rPr>
+        <w:t xml:space="preserve">Dashboard Quick Actions wired to real screens via tab navigation</w:t>
       </w:r>
     </w:p>
     <w:p>
@@ -2879,871 +3846,61 @@
           <w:bCs/>
           <w:color w:val="1D2D3E"/>
         </w:rPr>
-        <w:t xml:space="preserve">3.15 Accounts Payable Screen (src/screens/finance/AccountsPayableScreen.tsx)</w:t>
-      </w:r>
-    </w:p>
-    <w:p>
-      <w:pPr>
-        <w:pStyle w:val="ListParagraph"/>
-        <w:numPr>
-          <w:ilvl w:val="0"/>
-          <w:numId w:val="1"/>
-        </w:numPr>
-        <w:spacing w:after="40"/>
-      </w:pPr>
-      <w:r>
-        <w:rPr>
-          <w:color w:val="1D2D3E"/>
-          <w:sz w:val="22"/>
-          <w:szCs w:val="22"/>
-        </w:rPr>
-        <w:t xml:space="preserve">Three tabs: Summary / Bills / Vendors</w:t>
-      </w:r>
-    </w:p>
-    <w:p>
-      <w:pPr>
-        <w:pStyle w:val="ListParagraph"/>
-        <w:numPr>
-          <w:ilvl w:val="0"/>
-          <w:numId w:val="1"/>
-        </w:numPr>
-        <w:spacing w:after="40"/>
-      </w:pPr>
-      <w:r>
-        <w:rPr>
-          <w:color w:val="1D2D3E"/>
-          <w:sz w:val="22"/>
-          <w:szCs w:val="22"/>
-        </w:rPr>
-        <w:t xml:space="preserve">Summary: KPI cards (outstanding, overdue, vendor count, bill count) + aging analysis bars</w:t>
-      </w:r>
-    </w:p>
-    <w:p>
-      <w:pPr>
-        <w:pStyle w:val="ListParagraph"/>
-        <w:numPr>
-          <w:ilvl w:val="0"/>
-          <w:numId w:val="1"/>
-        </w:numPr>
-        <w:spacing w:after="40"/>
-      </w:pPr>
-      <w:r>
-        <w:rPr>
-          <w:color w:val="1D2D3E"/>
-          <w:sz w:val="22"/>
-          <w:szCs w:val="22"/>
-        </w:rPr>
-        <w:t xml:space="preserve">Bills: bill cards with status, amounts, due date</w:t>
-      </w:r>
-    </w:p>
-    <w:p>
-      <w:pPr>
-        <w:pStyle w:val="ListParagraph"/>
-        <w:numPr>
-          <w:ilvl w:val="0"/>
-          <w:numId w:val="1"/>
-        </w:numPr>
-        <w:spacing w:after="40"/>
-      </w:pPr>
-      <w:r>
-        <w:rPr>
-          <w:color w:val="1D2D3E"/>
-          <w:sz w:val="22"/>
-          <w:szCs w:val="22"/>
-        </w:rPr>
-        <w:t xml:space="preserve">Vendors: vendor cards with outstanding/overdue balances</w:t>
-      </w:r>
-    </w:p>
-    <w:p>
-      <w:pPr>
-        <w:spacing w:after="80"/>
-      </w:pPr>
-      <w:r>
-        <w:rPr>
-          <w:color w:val="1D2D3E"/>
-          <w:sz w:val="22"/>
-          <w:szCs w:val="22"/>
-        </w:rPr>
-        <w:t xml:space="preserve"/>
-      </w:r>
-    </w:p>
-    <w:p>
-      <w:pPr>
-        <w:pStyle w:val="Heading2"/>
-        <w:spacing w:after="120" w:before="300"/>
-      </w:pPr>
-      <w:r>
-        <w:rPr>
-          <w:b/>
-          <w:bCs/>
-          <w:color w:val="1D2D3E"/>
-        </w:rPr>
-        <w:t xml:space="preserve">3.16 Accounts Receivable Screen (src/screens/finance/AccountsReceivableScreen.tsx)</w:t>
-      </w:r>
-    </w:p>
-    <w:p>
-      <w:pPr>
-        <w:pStyle w:val="ListParagraph"/>
-        <w:numPr>
-          <w:ilvl w:val="0"/>
-          <w:numId w:val="1"/>
-        </w:numPr>
-        <w:spacing w:after="40"/>
-      </w:pPr>
-      <w:r>
-        <w:rPr>
-          <w:color w:val="1D2D3E"/>
-          <w:sz w:val="22"/>
-          <w:szCs w:val="22"/>
-        </w:rPr>
-        <w:t xml:space="preserve">Three tabs: Summary / Invoices / Customers</w:t>
-      </w:r>
-    </w:p>
-    <w:p>
-      <w:pPr>
-        <w:pStyle w:val="ListParagraph"/>
-        <w:numPr>
-          <w:ilvl w:val="0"/>
-          <w:numId w:val="1"/>
-        </w:numPr>
-        <w:spacing w:after="40"/>
-      </w:pPr>
-      <w:r>
-        <w:rPr>
-          <w:color w:val="1D2D3E"/>
-          <w:sz w:val="22"/>
-          <w:szCs w:val="22"/>
-        </w:rPr>
-        <w:t xml:space="preserve">Summary: KPI cards + aging analysis bars (same pattern as AP)</w:t>
-      </w:r>
-    </w:p>
-    <w:p>
-      <w:pPr>
-        <w:pStyle w:val="ListParagraph"/>
-        <w:numPr>
-          <w:ilvl w:val="0"/>
-          <w:numId w:val="1"/>
-        </w:numPr>
-        <w:spacing w:after="40"/>
-      </w:pPr>
-      <w:r>
-        <w:rPr>
-          <w:color w:val="1D2D3E"/>
-          <w:sz w:val="22"/>
-          <w:szCs w:val="22"/>
-        </w:rPr>
-        <w:t xml:space="preserve">Invoices: invoice cards with outstanding amounts</w:t>
-      </w:r>
-    </w:p>
-    <w:p>
-      <w:pPr>
-        <w:pStyle w:val="ListParagraph"/>
-        <w:numPr>
-          <w:ilvl w:val="0"/>
-          <w:numId w:val="1"/>
-        </w:numPr>
-        <w:spacing w:after="40"/>
-      </w:pPr>
-      <w:r>
-        <w:rPr>
-          <w:color w:val="1D2D3E"/>
-          <w:sz w:val="22"/>
-          <w:szCs w:val="22"/>
-        </w:rPr>
-        <w:t xml:space="preserve">Customers: customer cards with outstanding/overdue balances</w:t>
-      </w:r>
-    </w:p>
-    <w:p>
-      <w:pPr>
-        <w:spacing w:after="80"/>
-      </w:pPr>
-      <w:r>
-        <w:rPr>
-          <w:color w:val="1D2D3E"/>
-          <w:sz w:val="22"/>
-          <w:szCs w:val="22"/>
-        </w:rPr>
-        <w:t xml:space="preserve"/>
-      </w:r>
-    </w:p>
-    <w:p>
-      <w:pPr>
-        <w:pStyle w:val="Heading2"/>
-        <w:spacing w:after="120" w:before="300"/>
-      </w:pPr>
-      <w:r>
-        <w:rPr>
-          <w:b/>
-          <w:bCs/>
-          <w:color w:val="1D2D3E"/>
-        </w:rPr>
-        <w:t xml:space="preserve">3.17 Journal Entries Screen (src/screens/journalEntries/JournalEntriesScreen.tsx)</w:t>
-      </w:r>
-    </w:p>
-    <w:p>
-      <w:pPr>
-        <w:pStyle w:val="ListParagraph"/>
-        <w:numPr>
-          <w:ilvl w:val="0"/>
-          <w:numId w:val="1"/>
-        </w:numPr>
-        <w:spacing w:after="40"/>
-      </w:pPr>
-      <w:r>
-        <w:rPr>
-          <w:color w:val="1D2D3E"/>
-          <w:sz w:val="22"/>
-          <w:szCs w:val="22"/>
-        </w:rPr>
-        <w:t xml:space="preserve">Searchable list: voucher number, narration</w:t>
-      </w:r>
-    </w:p>
-    <w:p>
-      <w:pPr>
-        <w:pStyle w:val="ListParagraph"/>
-        <w:numPr>
-          <w:ilvl w:val="0"/>
-          <w:numId w:val="1"/>
-        </w:numPr>
-        <w:spacing w:after="40"/>
-      </w:pPr>
-      <w:r>
-        <w:rPr>
-          <w:color w:val="1D2D3E"/>
-          <w:sz w:val="22"/>
-          <w:szCs w:val="22"/>
-        </w:rPr>
-        <w:t xml:space="preserve">Voucher type filter chips (JV, GRN, PAY, REC, INV, SO, PO, DN)</w:t>
-      </w:r>
-    </w:p>
-    <w:p>
-      <w:pPr>
-        <w:pStyle w:val="ListParagraph"/>
-        <w:numPr>
-          <w:ilvl w:val="0"/>
-          <w:numId w:val="1"/>
-        </w:numPr>
-        <w:spacing w:after="40"/>
-      </w:pPr>
-      <w:r>
-        <w:rPr>
-          <w:color w:val="1D2D3E"/>
-          <w:sz w:val="22"/>
-          <w:szCs w:val="22"/>
-        </w:rPr>
-        <w:t xml:space="preserve">Cards with colored type badge, status badge (POSTED/DRAFT/VOID), debit/credit totals</w:t>
-      </w:r>
-    </w:p>
-    <w:p>
-      <w:pPr>
-        <w:pStyle w:val="ListParagraph"/>
-        <w:numPr>
-          <w:ilvl w:val="0"/>
-          <w:numId w:val="1"/>
-        </w:numPr>
-        <w:spacing w:after="40"/>
-      </w:pPr>
-      <w:r>
-        <w:rPr>
-          <w:color w:val="1D2D3E"/>
-          <w:sz w:val="22"/>
-          <w:szCs w:val="22"/>
-        </w:rPr>
-        <w:t xml:space="preserve">Expandable cards reveal journal lines (account, debit, credit)</w:t>
-      </w:r>
-    </w:p>
-    <w:p>
-      <w:pPr>
-        <w:spacing w:after="80"/>
-      </w:pPr>
-      <w:r>
-        <w:rPr>
-          <w:color w:val="1D2D3E"/>
-          <w:sz w:val="22"/>
-          <w:szCs w:val="22"/>
-        </w:rPr>
-        <w:t xml:space="preserve"/>
-      </w:r>
-    </w:p>
-    <w:p>
-      <w:pPr>
-        <w:pStyle w:val="Heading2"/>
-        <w:spacing w:after="120" w:before="300"/>
-      </w:pPr>
-      <w:r>
-        <w:rPr>
-          <w:b/>
-          <w:bCs/>
-          <w:color w:val="1D2D3E"/>
-        </w:rPr>
-        <w:t xml:space="preserve">3.18 Trial Balance Screen (src/screens/trialBalance/TrialBalanceScreen.tsx)</w:t>
-      </w:r>
-    </w:p>
-    <w:p>
-      <w:pPr>
-        <w:pStyle w:val="ListParagraph"/>
-        <w:numPr>
-          <w:ilvl w:val="0"/>
-          <w:numId w:val="1"/>
-        </w:numPr>
-        <w:spacing w:after="40"/>
-      </w:pPr>
-      <w:r>
-        <w:rPr>
-          <w:color w:val="1D2D3E"/>
-          <w:sz w:val="22"/>
-          <w:szCs w:val="22"/>
-        </w:rPr>
-        <w:t xml:space="preserve">Company selector dropdown (populated from /api/options/companies)</w:t>
-      </w:r>
-    </w:p>
-    <w:p>
-      <w:pPr>
-        <w:pStyle w:val="ListParagraph"/>
-        <w:numPr>
-          <w:ilvl w:val="0"/>
-          <w:numId w:val="1"/>
-        </w:numPr>
-        <w:spacing w:after="40"/>
-      </w:pPr>
-      <w:r>
-        <w:rPr>
-          <w:color w:val="1D2D3E"/>
-          <w:sz w:val="22"/>
-          <w:szCs w:val="22"/>
-        </w:rPr>
-        <w:t xml:space="preserve">As-of date text input (YYYY-MM-DD format, Run Report button)</w:t>
-      </w:r>
-    </w:p>
-    <w:p>
-      <w:pPr>
-        <w:pStyle w:val="ListParagraph"/>
-        <w:numPr>
-          <w:ilvl w:val="0"/>
-          <w:numId w:val="1"/>
-        </w:numPr>
-        <w:spacing w:after="40"/>
-      </w:pPr>
-      <w:r>
-        <w:rPr>
-          <w:color w:val="1D2D3E"/>
-          <w:sz w:val="22"/>
-          <w:szCs w:val="22"/>
-        </w:rPr>
-        <w:t xml:space="preserve">Account search filter</w:t>
-      </w:r>
-    </w:p>
-    <w:p>
-      <w:pPr>
-        <w:pStyle w:val="ListParagraph"/>
-        <w:numPr>
-          <w:ilvl w:val="0"/>
-          <w:numId w:val="1"/>
-        </w:numPr>
-        <w:spacing w:after="40"/>
-      </w:pPr>
-      <w:r>
-        <w:rPr>
-          <w:color w:val="1D2D3E"/>
-          <w:sz w:val="22"/>
-          <w:szCs w:val="22"/>
-        </w:rPr>
-        <w:t xml:space="preserve">Summary card: total debit / total credit with balance diff warning</w:t>
-      </w:r>
-    </w:p>
-    <w:p>
-      <w:pPr>
-        <w:pStyle w:val="ListParagraph"/>
-        <w:numPr>
-          <w:ilvl w:val="0"/>
-          <w:numId w:val="1"/>
-        </w:numPr>
-        <w:spacing w:after="40"/>
-      </w:pPr>
-      <w:r>
-        <w:rPr>
-          <w:color w:val="1D2D3E"/>
-          <w:sz w:val="22"/>
-          <w:szCs w:val="22"/>
-        </w:rPr>
-        <w:t xml:space="preserve">Hierarchical account table with group headers, level-based indentation</w:t>
-      </w:r>
-    </w:p>
-    <w:p>
-      <w:pPr>
-        <w:spacing w:after="80"/>
-      </w:pPr>
-      <w:r>
-        <w:rPr>
-          <w:color w:val="1D2D3E"/>
-          <w:sz w:val="22"/>
-          <w:szCs w:val="22"/>
-        </w:rPr>
-        <w:t xml:space="preserve"/>
-      </w:r>
-    </w:p>
-    <w:p>
-      <w:pPr>
-        <w:pStyle w:val="Heading2"/>
-        <w:spacing w:after="120" w:before="300"/>
-      </w:pPr>
-      <w:r>
-        <w:rPr>
-          <w:b/>
-          <w:bCs/>
-          <w:color w:val="1D2D3E"/>
-        </w:rPr>
-        <w:t xml:space="preserve">3.19 Business Partners Screen (src/screens/partners/PartnersScreen.tsx)</w:t>
-      </w:r>
-    </w:p>
-    <w:p>
-      <w:pPr>
-        <w:pStyle w:val="ListParagraph"/>
-        <w:numPr>
-          <w:ilvl w:val="0"/>
-          <w:numId w:val="1"/>
-        </w:numPr>
-        <w:spacing w:after="40"/>
-      </w:pPr>
-      <w:r>
-        <w:rPr>
-          <w:color w:val="1D2D3E"/>
-          <w:sz w:val="22"/>
-          <w:szCs w:val="22"/>
-        </w:rPr>
-        <w:t xml:space="preserve">Searchable list (name, code, email)</w:t>
-      </w:r>
-    </w:p>
-    <w:p>
-      <w:pPr>
-        <w:pStyle w:val="ListParagraph"/>
-        <w:numPr>
-          <w:ilvl w:val="0"/>
-          <w:numId w:val="1"/>
-        </w:numPr>
-        <w:spacing w:after="40"/>
-      </w:pPr>
-      <w:r>
-        <w:rPr>
-          <w:color w:val="1D2D3E"/>
-          <w:sz w:val="22"/>
-          <w:szCs w:val="22"/>
-        </w:rPr>
-        <w:t xml:space="preserve">Role filter tabs: All / Customers / Vendors</w:t>
-      </w:r>
-    </w:p>
-    <w:p>
-      <w:pPr>
-        <w:pStyle w:val="ListParagraph"/>
-        <w:numPr>
-          <w:ilvl w:val="0"/>
-          <w:numId w:val="1"/>
-        </w:numPr>
-        <w:spacing w:after="40"/>
-      </w:pPr>
-      <w:r>
-        <w:rPr>
-          <w:color w:val="1D2D3E"/>
-          <w:sz w:val="22"/>
-          <w:szCs w:val="22"/>
-        </w:rPr>
-        <w:t xml:space="preserve">Partner cards: avatar initials, name, code, role badges (Customer=green, Vendor=blue)</w:t>
-      </w:r>
-    </w:p>
-    <w:p>
-      <w:pPr>
-        <w:pStyle w:val="ListParagraph"/>
-        <w:numPr>
-          <w:ilvl w:val="0"/>
-          <w:numId w:val="1"/>
-        </w:numPr>
-        <w:spacing w:after="40"/>
-      </w:pPr>
-      <w:r>
-        <w:rPr>
-          <w:color w:val="1D2D3E"/>
-          <w:sz w:val="22"/>
-          <w:szCs w:val="22"/>
-        </w:rPr>
-        <w:t xml:space="preserve">Contact info: email, phone, company</w:t>
-      </w:r>
-    </w:p>
-    <w:p>
-      <w:pPr>
-        <w:spacing w:after="80"/>
-      </w:pPr>
-      <w:r>
-        <w:rPr>
-          <w:color w:val="1D2D3E"/>
-          <w:sz w:val="22"/>
-          <w:szCs w:val="22"/>
-        </w:rPr>
-        <w:t xml:space="preserve"/>
-      </w:r>
-    </w:p>
-    <w:p>
-      <w:pPr>
-        <w:pStyle w:val="Heading2"/>
-        <w:spacing w:after="120" w:before="300"/>
-      </w:pPr>
-      <w:r>
-        <w:rPr>
-          <w:b/>
-          <w:bCs/>
-          <w:color w:val="1D2D3E"/>
-        </w:rPr>
-        <w:t xml:space="preserve">3.20 Companies Screen (src/screens/companies/CompaniesScreen.tsx)</w:t>
-      </w:r>
-    </w:p>
-    <w:p>
-      <w:pPr>
-        <w:pStyle w:val="ListParagraph"/>
-        <w:numPr>
-          <w:ilvl w:val="0"/>
-          <w:numId w:val="1"/>
-        </w:numPr>
-        <w:spacing w:after="40"/>
-      </w:pPr>
-      <w:r>
-        <w:rPr>
-          <w:color w:val="1D2D3E"/>
-          <w:sz w:val="22"/>
-          <w:szCs w:val="22"/>
-        </w:rPr>
-        <w:t xml:space="preserve">Company list with logo circle (initial letter), name, code, active/inactive status badge</w:t>
-      </w:r>
-    </w:p>
-    <w:p>
-      <w:pPr>
-        <w:pStyle w:val="ListParagraph"/>
-        <w:numPr>
-          <w:ilvl w:val="0"/>
-          <w:numId w:val="1"/>
-        </w:numPr>
-        <w:spacing w:after="40"/>
-      </w:pPr>
-      <w:r>
-        <w:rPr>
-          <w:color w:val="1D2D3E"/>
-          <w:sz w:val="22"/>
-          <w:szCs w:val="22"/>
-        </w:rPr>
-        <w:t xml:space="preserve">Detail grid: currency, fiscal year, phone, email, address</w:t>
-      </w:r>
-    </w:p>
-    <w:p>
-      <w:pPr>
-        <w:spacing w:after="80"/>
-      </w:pPr>
-      <w:r>
-        <w:rPr>
-          <w:color w:val="1D2D3E"/>
-          <w:sz w:val="22"/>
-          <w:szCs w:val="22"/>
-        </w:rPr>
-        <w:t xml:space="preserve"/>
-      </w:r>
-    </w:p>
-    <w:p>
-      <w:pPr>
-        <w:pStyle w:val="Heading2"/>
-        <w:spacing w:after="120" w:before="300"/>
-      </w:pPr>
-      <w:r>
-        <w:rPr>
-          <w:b/>
-          <w:bCs/>
-          <w:color w:val="1D2D3E"/>
-        </w:rPr>
-        <w:t xml:space="preserve">3.21 Financial Reports Screen (src/screens/financialReports/)</w:t>
-      </w:r>
-    </w:p>
-    <w:p>
-      <w:pPr>
-        <w:pStyle w:val="ListParagraph"/>
-        <w:numPr>
-          <w:ilvl w:val="0"/>
-          <w:numId w:val="1"/>
-        </w:numPr>
-        <w:spacing w:after="40"/>
-      </w:pPr>
-      <w:r>
-        <w:rPr>
-          <w:color w:val="1D2D3E"/>
-          <w:sz w:val="22"/>
-          <w:szCs w:val="22"/>
-        </w:rPr>
-        <w:t xml:space="preserve">Two tabs: Profit &amp; Loss / Balance Sheet</w:t>
-      </w:r>
-    </w:p>
-    <w:p>
-      <w:pPr>
-        <w:pStyle w:val="ListParagraph"/>
-        <w:numPr>
-          <w:ilvl w:val="0"/>
-          <w:numId w:val="1"/>
-        </w:numPr>
-        <w:spacing w:after="40"/>
-      </w:pPr>
-      <w:r>
-        <w:rPr>
-          <w:color w:val="1D2D3E"/>
-          <w:sz w:val="22"/>
-          <w:szCs w:val="22"/>
-        </w:rPr>
-        <w:t xml:space="preserve">P&amp;L: revenue vs expense sections, net income summary card</w:t>
-      </w:r>
-    </w:p>
-    <w:p>
-      <w:pPr>
-        <w:pStyle w:val="ListParagraph"/>
-        <w:numPr>
-          <w:ilvl w:val="0"/>
-          <w:numId w:val="1"/>
-        </w:numPr>
-        <w:spacing w:after="40"/>
-      </w:pPr>
-      <w:r>
-        <w:rPr>
-          <w:color w:val="1D2D3E"/>
-          <w:sz w:val="22"/>
-          <w:szCs w:val="22"/>
-        </w:rPr>
-        <w:t xml:space="preserve">Balance Sheet: assets, liabilities, equity sections with balance check warning</w:t>
-      </w:r>
-    </w:p>
-    <w:p>
-      <w:pPr>
-        <w:pStyle w:val="ListParagraph"/>
-        <w:numPr>
-          <w:ilvl w:val="0"/>
-          <w:numId w:val="1"/>
-        </w:numPr>
-        <w:spacing w:after="40"/>
-      </w:pPr>
-      <w:r>
-        <w:rPr>
-          <w:color w:val="1D2D3E"/>
-          <w:sz w:val="22"/>
-          <w:szCs w:val="22"/>
-        </w:rPr>
-        <w:t xml:space="preserve">Company selector + as-of date picker (same pattern as Trial Balance)</w:t>
-      </w:r>
-    </w:p>
-    <w:p>
-      <w:pPr>
-        <w:pStyle w:val="ListParagraph"/>
-        <w:numPr>
-          <w:ilvl w:val="0"/>
-          <w:numId w:val="1"/>
-        </w:numPr>
-        <w:spacing w:after="40"/>
-      </w:pPr>
-      <w:r>
-        <w:rPr>
-          <w:color w:val="1D2D3E"/>
-          <w:sz w:val="22"/>
-          <w:szCs w:val="22"/>
-        </w:rPr>
-        <w:t xml:space="preserve">Accounts classified by account_type keyword matching</w:t>
-      </w:r>
-    </w:p>
-    <w:p>
-      <w:pPr>
-        <w:spacing w:after="80"/>
-      </w:pPr>
-      <w:r>
-        <w:rPr>
-          <w:color w:val="1D2D3E"/>
-          <w:sz w:val="22"/>
-          <w:szCs w:val="22"/>
-        </w:rPr>
-        <w:t xml:space="preserve"/>
-      </w:r>
-    </w:p>
-    <w:p>
-      <w:pPr>
-        <w:pStyle w:val="Heading2"/>
-        <w:spacing w:after="120" w:before="300"/>
-      </w:pPr>
-      <w:r>
-        <w:rPr>
-          <w:b/>
-          <w:bCs/>
-          <w:color w:val="1D2D3E"/>
-        </w:rPr>
-        <w:t xml:space="preserve">3.22 Global Company Filter</w:t>
-      </w:r>
-    </w:p>
-    <w:p>
-      <w:pPr>
-        <w:pStyle w:val="ListParagraph"/>
-        <w:numPr>
-          <w:ilvl w:val="0"/>
-          <w:numId w:val="1"/>
-        </w:numPr>
-        <w:spacing w:after="40"/>
-      </w:pPr>
-      <w:r>
-        <w:rPr>
-          <w:color w:val="1D2D3E"/>
-          <w:sz w:val="22"/>
-          <w:szCs w:val="22"/>
-        </w:rPr>
-        <w:t xml:space="preserve">CompanyContext (src/context/CompanyContext.tsx) — global state: companies list, selectedCompany, companyId</w:t>
-      </w:r>
-    </w:p>
-    <w:p>
-      <w:pPr>
-        <w:pStyle w:val="ListParagraph"/>
-        <w:numPr>
-          <w:ilvl w:val="0"/>
-          <w:numId w:val="1"/>
-        </w:numPr>
-        <w:spacing w:after="40"/>
-      </w:pPr>
-      <w:r>
-        <w:rPr>
-          <w:color w:val="1D2D3E"/>
-          <w:sz w:val="22"/>
-          <w:szCs w:val="22"/>
-        </w:rPr>
-        <w:t xml:space="preserve">CompanyPicker (src/components/CompanyPicker.tsx) — horizontal scrollable company chips</w:t>
-      </w:r>
-    </w:p>
-    <w:p>
-      <w:pPr>
-        <w:pStyle w:val="ListParagraph"/>
-        <w:numPr>
-          <w:ilvl w:val="0"/>
-          <w:numId w:val="1"/>
-        </w:numPr>
-        <w:spacing w:after="40"/>
-      </w:pPr>
-      <w:r>
-        <w:rPr>
-          <w:color w:val="1D2D3E"/>
-          <w:sz w:val="22"/>
-          <w:szCs w:val="22"/>
-        </w:rPr>
-        <w:t xml:space="preserve">CompanyProvider wrapped around app in App.tsx</w:t>
-      </w:r>
-    </w:p>
-    <w:p>
-      <w:pPr>
-        <w:pStyle w:val="ListParagraph"/>
-        <w:numPr>
-          <w:ilvl w:val="0"/>
-          <w:numId w:val="1"/>
-        </w:numPr>
-        <w:spacing w:after="40"/>
-      </w:pPr>
-      <w:r>
-        <w:rPr>
-          <w:color w:val="1D2D3E"/>
-          <w:sz w:val="22"/>
-          <w:szCs w:val="22"/>
-        </w:rPr>
-        <w:t xml:space="preserve">Inventory, Accounts Payable, Accounts Receivable screens use companyId from context</w:t>
-      </w:r>
-    </w:p>
-    <w:p>
-      <w:pPr>
-        <w:spacing w:after="80"/>
-      </w:pPr>
-      <w:r>
-        <w:rPr>
-          <w:color w:val="1D2D3E"/>
-          <w:sz w:val="22"/>
-          <w:szCs w:val="22"/>
-        </w:rPr>
-        <w:t xml:space="preserve"/>
-      </w:r>
-    </w:p>
-    <w:p>
-      <w:pPr>
-        <w:pStyle w:val="Heading2"/>
-        <w:spacing w:after="120" w:before="300"/>
-      </w:pPr>
-      <w:r>
-        <w:rPr>
-          <w:b/>
-          <w:bCs/>
-          <w:color w:val="1D2D3E"/>
-        </w:rPr>
-        <w:t xml:space="preserve">3.23 Navigation Architecture</w:t>
-      </w:r>
-    </w:p>
-    <w:p>
-      <w:pPr>
-        <w:pStyle w:val="ListParagraph"/>
-        <w:numPr>
-          <w:ilvl w:val="0"/>
-          <w:numId w:val="1"/>
-        </w:numPr>
-        <w:spacing w:after="40"/>
-      </w:pPr>
-      <w:r>
-        <w:rPr>
-          <w:color w:val="1D2D3E"/>
-          <w:sz w:val="22"/>
-          <w:szCs w:val="22"/>
-        </w:rPr>
-        <w:t xml:space="preserve">AppNavigator (bottom tabs): Dashboard, Inventory, Finance, More</w:t>
-      </w:r>
-    </w:p>
-    <w:p>
-      <w:pPr>
-        <w:pStyle w:val="ListParagraph"/>
-        <w:numPr>
-          <w:ilvl w:val="0"/>
-          <w:numId w:val="1"/>
-        </w:numPr>
-        <w:spacing w:after="40"/>
-      </w:pPr>
-      <w:r>
-        <w:rPr>
-          <w:color w:val="1D2D3E"/>
-          <w:sz w:val="22"/>
-          <w:szCs w:val="22"/>
-        </w:rPr>
-        <w:t xml:space="preserve">FinanceNavigator (stack): FinanceMenu → AccountsPayable, AccountsReceivable, JournalEntries, TrialBalance</w:t>
-      </w:r>
-    </w:p>
-    <w:p>
-      <w:pPr>
-        <w:pStyle w:val="ListParagraph"/>
-        <w:numPr>
-          <w:ilvl w:val="0"/>
-          <w:numId w:val="1"/>
-        </w:numPr>
-        <w:spacing w:after="40"/>
-      </w:pPr>
-      <w:r>
-        <w:rPr>
-          <w:color w:val="1D2D3E"/>
-          <w:sz w:val="22"/>
-          <w:szCs w:val="22"/>
-        </w:rPr>
-        <w:t xml:space="preserve">MoreNavigator (stack): MoreMenu → Materials, PurchaseOrders, PurchaseOrderDetail, SalesOrders, SalesOrderDetail, GRN, Partners, Companies</w:t>
-      </w:r>
-    </w:p>
-    <w:p>
-      <w:pPr>
-        <w:pStyle w:val="ListParagraph"/>
-        <w:numPr>
-          <w:ilvl w:val="0"/>
-          <w:numId w:val="1"/>
-        </w:numPr>
-        <w:spacing w:after="40"/>
-      </w:pPr>
-      <w:r>
-        <w:rPr>
-          <w:color w:val="1D2D3E"/>
-          <w:sz w:val="22"/>
-          <w:szCs w:val="22"/>
-        </w:rPr>
-        <w:t xml:space="preserve">Dashboard Quick Actions wired to real screens via tab navigation</w:t>
+        <w:t xml:space="preserve">3.24 API Client Retry Logic (Session 3)</w:t>
+      </w:r>
+    </w:p>
+    <w:p>
+      <w:pPr>
+        <w:pStyle w:val="ListParagraph"/>
+        <w:numPr>
+          <w:ilvl w:val="0"/>
+          <w:numId w:val="1"/>
+        </w:numPr>
+        <w:spacing w:after="40"/>
+      </w:pPr>
+      <w:r>
+        <w:rPr>
+          <w:color w:val="1D2D3E"/>
+          <w:sz w:val="22"/>
+          <w:szCs w:val="22"/>
+        </w:rPr>
+        <w:t xml:space="preserve">apiRequest() now retries 2 times on network errors and 5xx/429 HTTP status codes</w:t>
+      </w:r>
+    </w:p>
+    <w:p>
+      <w:pPr>
+        <w:pStyle w:val="ListParagraph"/>
+        <w:numPr>
+          <w:ilvl w:val="0"/>
+          <w:numId w:val="1"/>
+        </w:numPr>
+        <w:spacing w:after="40"/>
+      </w:pPr>
+      <w:r>
+        <w:rPr>
+          <w:color w:val="1D2D3E"/>
+          <w:sz w:val="22"/>
+          <w:szCs w:val="22"/>
+        </w:rPr>
+        <w:t xml:space="preserve">Exponential backoff delays: 500ms, 1000ms, 2000ms between attempts</w:t>
+      </w:r>
+    </w:p>
+    <w:p>
+      <w:pPr>
+        <w:pStyle w:val="ListParagraph"/>
+        <w:numPr>
+          <w:ilvl w:val="0"/>
+          <w:numId w:val="1"/>
+        </w:numPr>
+        <w:spacing w:after="40"/>
+      </w:pPr>
+      <w:r>
+        <w:rPr>
+          <w:color w:val="1D2D3E"/>
+          <w:sz w:val="22"/>
+          <w:szCs w:val="22"/>
+        </w:rPr>
+        <w:t xml:space="preserve">Helps recover from transient connectivity issues on mobile networks</w:t>
       </w:r>
     </w:p>
     <w:p>
@@ -5216,151 +5373,25 @@
           <w:sz w:val="22"/>
           <w:szCs w:val="22"/>
         </w:rPr>
-        <w:t xml:space="preserve">mobile/</w:t>
-      </w:r>
-    </w:p>
-    <w:p>
-      <w:pPr>
-        <w:pStyle w:val="ListParagraph"/>
-        <w:numPr>
-          <w:ilvl w:val="0"/>
-          <w:numId w:val="1"/>
-        </w:numPr>
-        <w:spacing w:after="40"/>
-      </w:pPr>
-      <w:r>
-        <w:rPr>
-          <w:color w:val="1D2D3E"/>
-          <w:sz w:val="22"/>
-          <w:szCs w:val="22"/>
-        </w:rPr>
-        <w:t xml:space="preserve">App.tsx — Entry point: SafeAreaProvider → AuthProvider → RootNavigator</w:t>
-      </w:r>
-    </w:p>
-    <w:p>
-      <w:pPr>
-        <w:pStyle w:val="ListParagraph"/>
-        <w:numPr>
-          <w:ilvl w:val="0"/>
-          <w:numId w:val="1"/>
-        </w:numPr>
-        <w:spacing w:after="40"/>
-      </w:pPr>
-      <w:r>
-        <w:rPr>
-          <w:color w:val="1D2D3E"/>
-          <w:sz w:val="22"/>
-          <w:szCs w:val="22"/>
-        </w:rPr>
-        <w:t xml:space="preserve">app.json — Expo configuration</w:t>
-      </w:r>
-    </w:p>
-    <w:p>
-      <w:pPr>
-        <w:pStyle w:val="ListParagraph"/>
-        <w:numPr>
-          <w:ilvl w:val="0"/>
-          <w:numId w:val="1"/>
-        </w:numPr>
-        <w:spacing w:after="40"/>
-      </w:pPr>
-      <w:r>
-        <w:rPr>
-          <w:color w:val="1D2D3E"/>
-          <w:sz w:val="22"/>
-          <w:szCs w:val="22"/>
-        </w:rPr>
-        <w:t xml:space="preserve">package.json — Dependencies</w:t>
-      </w:r>
-    </w:p>
-    <w:p>
-      <w:pPr>
-        <w:pStyle w:val="ListParagraph"/>
-        <w:numPr>
-          <w:ilvl w:val="0"/>
-          <w:numId w:val="1"/>
-        </w:numPr>
-        <w:spacing w:after="40"/>
-      </w:pPr>
-      <w:r>
-        <w:rPr>
-          <w:color w:val="1D2D3E"/>
-          <w:sz w:val="22"/>
-          <w:szCs w:val="22"/>
-        </w:rPr>
-        <w:t xml:space="preserve">tsconfig.json — TypeScript config with @/ alias</w:t>
-      </w:r>
-    </w:p>
-    <w:p>
-      <w:pPr>
-        <w:pStyle w:val="ListParagraph"/>
-        <w:numPr>
-          <w:ilvl w:val="0"/>
-          <w:numId w:val="1"/>
-        </w:numPr>
-        <w:spacing w:after="40"/>
-      </w:pPr>
-      <w:r>
-        <w:rPr>
-          <w:color w:val="1D2D3E"/>
-          <w:sz w:val="22"/>
-          <w:szCs w:val="22"/>
-        </w:rPr>
-        <w:t xml:space="preserve">babel.config.js — Babel with module-resolver plugin</w:t>
-      </w:r>
-    </w:p>
-    <w:p>
-      <w:pPr>
-        <w:pStyle w:val="ListParagraph"/>
-        <w:numPr>
-          <w:ilvl w:val="0"/>
-          <w:numId w:val="1"/>
-        </w:numPr>
-        <w:spacing w:after="40"/>
-      </w:pPr>
-      <w:r>
-        <w:rPr>
-          <w:color w:val="1D2D3E"/>
-          <w:sz w:val="22"/>
-          <w:szCs w:val="22"/>
-        </w:rPr>
-        <w:t xml:space="preserve">PROGRESS.md — Build progress tracker (updated each session)</w:t>
-      </w:r>
-    </w:p>
-    <w:p>
-      <w:pPr>
-        <w:pStyle w:val="ListParagraph"/>
-        <w:numPr>
-          <w:ilvl w:val="0"/>
-          <w:numId w:val="1"/>
-        </w:numPr>
-        <w:spacing w:after="40"/>
-      </w:pPr>
-      <w:r>
-        <w:rPr>
-          <w:color w:val="1D2D3E"/>
-          <w:sz w:val="22"/>
-          <w:szCs w:val="22"/>
-        </w:rPr>
-        <w:t xml:space="preserve">FEATURES.docx — This document</w:t>
-      </w:r>
-    </w:p>
-    <w:p>
-      <w:pPr>
-        <w:pStyle w:val="ListParagraph"/>
-        <w:numPr>
-          <w:ilvl w:val="0"/>
-          <w:numId w:val="1"/>
-        </w:numPr>
-        <w:spacing w:after="40"/>
-      </w:pPr>
-      <w:r>
-        <w:rPr>
-          <w:color w:val="1D2D3E"/>
-          <w:sz w:val="22"/>
-          <w:szCs w:val="22"/>
-        </w:rPr>
-        <w:t xml:space="preserve">src/api/ — API client and service modules</w:t>
+        <w:t xml:space="preserve">src/</w:t>
+      </w:r>
+    </w:p>
+    <w:p>
+      <w:pPr>
+        <w:pStyle w:val="ListParagraph"/>
+        <w:numPr>
+          <w:ilvl w:val="0"/>
+          <w:numId w:val="1"/>
+        </w:numPr>
+        <w:spacing w:after="40"/>
+      </w:pPr>
+      <w:r>
+        <w:rPr>
+          <w:color w:val="1D2D3E"/>
+          <w:sz w:val="22"/>
+          <w:szCs w:val="22"/>
+        </w:rPr>
+        <w:t xml:space="preserve">api/</w:t>
       </w:r>
     </w:p>
     <w:p>
@@ -5378,7 +5409,7 @@
           <w:sz w:val="22"/>
           <w:szCs w:val="22"/>
         </w:rPr>
-        <w:t xml:space="preserve">client.ts — Fetch wrapper with auth</w:t>
+        <w:t xml:space="preserve">client.ts — Fetch wrapper with JWT auth</w:t>
       </w:r>
     </w:p>
     <w:p>
@@ -6067,115 +6098,151 @@
           <w:bCs/>
           <w:color w:val="1D2D3E"/>
         </w:rPr>
-        <w:t xml:space="preserve">Session 1 — 2026-05-12</w:t>
-      </w:r>
-    </w:p>
-    <w:p>
-      <w:pPr>
-        <w:pStyle w:val="ListParagraph"/>
-        <w:numPr>
-          <w:ilvl w:val="0"/>
-          <w:numId w:val="1"/>
-        </w:numPr>
-        <w:spacing w:after="40"/>
-      </w:pPr>
-      <w:r>
-        <w:rPr>
-          <w:color w:val="1D2D3E"/>
-          <w:sz w:val="22"/>
-          <w:szCs w:val="22"/>
-        </w:rPr>
-        <w:t xml:space="preserve">Project scaffolded with Expo 51, TypeScript, React Navigation</w:t>
-      </w:r>
-    </w:p>
-    <w:p>
-      <w:pPr>
-        <w:pStyle w:val="ListParagraph"/>
-        <w:numPr>
-          <w:ilvl w:val="0"/>
-          <w:numId w:val="1"/>
-        </w:numPr>
-        <w:spacing w:after="40"/>
-      </w:pPr>
-      <w:r>
-        <w:rPr>
-          <w:color w:val="1D2D3E"/>
-          <w:sz w:val="22"/>
-          <w:szCs w:val="22"/>
-        </w:rPr>
-        <w:t xml:space="preserve">Design system created matching web app colors</w:t>
-      </w:r>
-    </w:p>
-    <w:p>
-      <w:pPr>
-        <w:pStyle w:val="ListParagraph"/>
-        <w:numPr>
-          <w:ilvl w:val="0"/>
-          <w:numId w:val="1"/>
-        </w:numPr>
-        <w:spacing w:after="40"/>
-      </w:pPr>
-      <w:r>
-        <w:rPr>
-          <w:color w:val="1D2D3E"/>
-          <w:sz w:val="22"/>
-          <w:szCs w:val="22"/>
-        </w:rPr>
-        <w:t xml:space="preserve">API client with JWT auth via Secure Store</w:t>
-      </w:r>
-    </w:p>
-    <w:p>
-      <w:pPr>
-        <w:pStyle w:val="ListParagraph"/>
-        <w:numPr>
-          <w:ilvl w:val="0"/>
-          <w:numId w:val="1"/>
-        </w:numPr>
-        <w:spacing w:after="40"/>
-      </w:pPr>
-      <w:r>
-        <w:rPr>
-          <w:color w:val="1D2D3E"/>
-          <w:sz w:val="22"/>
-          <w:szCs w:val="22"/>
-        </w:rPr>
-        <w:t xml:space="preserve">Login screen with employee selector</w:t>
-      </w:r>
-    </w:p>
-    <w:p>
-      <w:pPr>
-        <w:pStyle w:val="ListParagraph"/>
-        <w:numPr>
-          <w:ilvl w:val="0"/>
-          <w:numId w:val="1"/>
-        </w:numPr>
-        <w:spacing w:after="40"/>
-      </w:pPr>
-      <w:r>
-        <w:rPr>
-          <w:color w:val="1D2D3E"/>
-          <w:sz w:val="22"/>
-          <w:szCs w:val="22"/>
-        </w:rPr>
-        <w:t xml:space="preserve">Dashboard with KPIs, working capital, quick actions, recent activity</w:t>
-      </w:r>
-    </w:p>
-    <w:p>
-      <w:pPr>
-        <w:pStyle w:val="ListParagraph"/>
-        <w:numPr>
-          <w:ilvl w:val="0"/>
-          <w:numId w:val="1"/>
-        </w:numPr>
-        <w:spacing w:after="40"/>
-      </w:pPr>
-      <w:r>
-        <w:rPr>
-          <w:color w:val="1D2D3E"/>
-          <w:sz w:val="22"/>
-          <w:szCs w:val="22"/>
-        </w:rPr>
-        <w:t xml:space="preserve">Bottom tab navigation (Dashboard, Inventory, Finance, More)</w:t>
+        <w:t xml:space="preserve">Session 2 — 2026-05-16</w:t>
+      </w:r>
+    </w:p>
+    <w:p>
+      <w:pPr>
+        <w:pStyle w:val="ListParagraph"/>
+        <w:numPr>
+          <w:ilvl w:val="0"/>
+          <w:numId w:val="1"/>
+        </w:numPr>
+        <w:spacing w:after="40"/>
+      </w:pPr>
+      <w:r>
+        <w:rPr>
+          <w:color w:val="1D2D3E"/>
+          <w:sz w:val="22"/>
+          <w:szCs w:val="22"/>
+        </w:rPr>
+        <w:t xml:space="preserve">Added API service modules: inventory, materials, purchase orders</w:t>
+      </w:r>
+    </w:p>
+    <w:p>
+      <w:pPr>
+        <w:pStyle w:val="ListParagraph"/>
+        <w:numPr>
+          <w:ilvl w:val="0"/>
+          <w:numId w:val="1"/>
+        </w:numPr>
+        <w:spacing w:after="40"/>
+      </w:pPr>
+      <w:r>
+        <w:rPr>
+          <w:color w:val="1D2D3E"/>
+          <w:sz w:val="22"/>
+          <w:szCs w:val="22"/>
+        </w:rPr>
+        <w:t xml:space="preserve">Built InventoryScreen with Stock Balances and Stock Ledger tabs</w:t>
+      </w:r>
+    </w:p>
+    <w:p>
+      <w:pPr>
+        <w:pStyle w:val="ListParagraph"/>
+        <w:numPr>
+          <w:ilvl w:val="0"/>
+          <w:numId w:val="1"/>
+        </w:numPr>
+        <w:spacing w:after="40"/>
+      </w:pPr>
+      <w:r>
+        <w:rPr>
+          <w:color w:val="1D2D3E"/>
+          <w:sz w:val="22"/>
+          <w:szCs w:val="22"/>
+        </w:rPr>
+        <w:t xml:space="preserve">Built MaterialsScreen with search, status filter, and type filter pills</w:t>
+      </w:r>
+    </w:p>
+    <w:p>
+      <w:pPr>
+        <w:pStyle w:val="ListParagraph"/>
+        <w:numPr>
+          <w:ilvl w:val="0"/>
+          <w:numId w:val="1"/>
+        </w:numPr>
+        <w:spacing w:after="40"/>
+      </w:pPr>
+      <w:r>
+        <w:rPr>
+          <w:color w:val="1D2D3E"/>
+          <w:sz w:val="22"/>
+          <w:szCs w:val="22"/>
+        </w:rPr>
+        <w:t xml:space="preserve">Built PurchaseOrdersScreen with status tabs, live counts, and progress bars</w:t>
+      </w:r>
+    </w:p>
+    <w:p>
+      <w:pPr>
+        <w:pStyle w:val="ListParagraph"/>
+        <w:numPr>
+          <w:ilvl w:val="0"/>
+          <w:numId w:val="1"/>
+        </w:numPr>
+        <w:spacing w:after="40"/>
+      </w:pPr>
+      <w:r>
+        <w:rPr>
+          <w:color w:val="1D2D3E"/>
+          <w:sz w:val="22"/>
+          <w:szCs w:val="22"/>
+        </w:rPr>
+        <w:t xml:space="preserve">Built PODetailScreen with header info, receiving progress, and line items</w:t>
+      </w:r>
+    </w:p>
+    <w:p>
+      <w:pPr>
+        <w:pStyle w:val="ListParagraph"/>
+        <w:numPr>
+          <w:ilvl w:val="0"/>
+          <w:numId w:val="1"/>
+        </w:numPr>
+        <w:spacing w:after="40"/>
+      </w:pPr>
+      <w:r>
+        <w:rPr>
+          <w:color w:val="1D2D3E"/>
+          <w:sz w:val="22"/>
+          <w:szCs w:val="22"/>
+        </w:rPr>
+        <w:t xml:space="preserve">Created AppStack navigator — wraps bottom tabs + all new feature screens</w:t>
+      </w:r>
+    </w:p>
+    <w:p>
+      <w:pPr>
+        <w:pStyle w:val="ListParagraph"/>
+        <w:numPr>
+          <w:ilvl w:val="0"/>
+          <w:numId w:val="1"/>
+        </w:numPr>
+        <w:spacing w:after="40"/>
+      </w:pPr>
+      <w:r>
+        <w:rPr>
+          <w:color w:val="1D2D3E"/>
+          <w:sz w:val="22"/>
+          <w:szCs w:val="22"/>
+        </w:rPr>
+        <w:t xml:space="preserve">Wired Dashboard Quick Actions: Inventory, Materials, Purchase Order navigate correctly</w:t>
+      </w:r>
+    </w:p>
+    <w:p>
+      <w:pPr>
+        <w:pStyle w:val="ListParagraph"/>
+        <w:numPr>
+          <w:ilvl w:val="0"/>
+          <w:numId w:val="1"/>
+        </w:numPr>
+        <w:spacing w:after="40"/>
+      </w:pPr>
+      <w:r>
+        <w:rPr>
+          <w:color w:val="1D2D3E"/>
+          <w:sz w:val="22"/>
+          <w:szCs w:val="22"/>
+        </w:rPr>
+        <w:t xml:space="preserve">Fixed: InventoryScreen hides back button when accessed as bottom tab</w:t>
       </w:r>
     </w:p>
     <w:p>
@@ -6202,6 +6269,141 @@
           <w:bCs/>
           <w:color w:val="1D2D3E"/>
         </w:rPr>
+        <w:t xml:space="preserve">Session 1 — 2026-05-12</w:t>
+      </w:r>
+    </w:p>
+    <w:p>
+      <w:pPr>
+        <w:pStyle w:val="ListParagraph"/>
+        <w:numPr>
+          <w:ilvl w:val="0"/>
+          <w:numId w:val="1"/>
+        </w:numPr>
+        <w:spacing w:after="40"/>
+      </w:pPr>
+      <w:r>
+        <w:rPr>
+          <w:color w:val="1D2D3E"/>
+          <w:sz w:val="22"/>
+          <w:szCs w:val="22"/>
+        </w:rPr>
+        <w:t xml:space="preserve">Project scaffolded with Expo 51, TypeScript, React Navigation</w:t>
+      </w:r>
+    </w:p>
+    <w:p>
+      <w:pPr>
+        <w:pStyle w:val="ListParagraph"/>
+        <w:numPr>
+          <w:ilvl w:val="0"/>
+          <w:numId w:val="1"/>
+        </w:numPr>
+        <w:spacing w:after="40"/>
+      </w:pPr>
+      <w:r>
+        <w:rPr>
+          <w:color w:val="1D2D3E"/>
+          <w:sz w:val="22"/>
+          <w:szCs w:val="22"/>
+        </w:rPr>
+        <w:t xml:space="preserve">Design system created matching web app colors</w:t>
+      </w:r>
+    </w:p>
+    <w:p>
+      <w:pPr>
+        <w:pStyle w:val="ListParagraph"/>
+        <w:numPr>
+          <w:ilvl w:val="0"/>
+          <w:numId w:val="1"/>
+        </w:numPr>
+        <w:spacing w:after="40"/>
+      </w:pPr>
+      <w:r>
+        <w:rPr>
+          <w:color w:val="1D2D3E"/>
+          <w:sz w:val="22"/>
+          <w:szCs w:val="22"/>
+        </w:rPr>
+        <w:t xml:space="preserve">API client with JWT auth via Secure Store</w:t>
+      </w:r>
+    </w:p>
+    <w:p>
+      <w:pPr>
+        <w:pStyle w:val="ListParagraph"/>
+        <w:numPr>
+          <w:ilvl w:val="0"/>
+          <w:numId w:val="1"/>
+        </w:numPr>
+        <w:spacing w:after="40"/>
+      </w:pPr>
+      <w:r>
+        <w:rPr>
+          <w:color w:val="1D2D3E"/>
+          <w:sz w:val="22"/>
+          <w:szCs w:val="22"/>
+        </w:rPr>
+        <w:t xml:space="preserve">Login screen with employee selector</w:t>
+      </w:r>
+    </w:p>
+    <w:p>
+      <w:pPr>
+        <w:pStyle w:val="ListParagraph"/>
+        <w:numPr>
+          <w:ilvl w:val="0"/>
+          <w:numId w:val="1"/>
+        </w:numPr>
+        <w:spacing w:after="40"/>
+      </w:pPr>
+      <w:r>
+        <w:rPr>
+          <w:color w:val="1D2D3E"/>
+          <w:sz w:val="22"/>
+          <w:szCs w:val="22"/>
+        </w:rPr>
+        <w:t xml:space="preserve">Dashboard with KPIs, working capital, quick actions, recent activity</w:t>
+      </w:r>
+    </w:p>
+    <w:p>
+      <w:pPr>
+        <w:pStyle w:val="ListParagraph"/>
+        <w:numPr>
+          <w:ilvl w:val="0"/>
+          <w:numId w:val="1"/>
+        </w:numPr>
+        <w:spacing w:after="40"/>
+      </w:pPr>
+      <w:r>
+        <w:rPr>
+          <w:color w:val="1D2D3E"/>
+          <w:sz w:val="22"/>
+          <w:szCs w:val="22"/>
+        </w:rPr>
+        <w:t xml:space="preserve">Bottom tab navigation (Dashboard, Inventory, Finance, More)</w:t>
+      </w:r>
+    </w:p>
+    <w:p>
+      <w:pPr>
+        <w:spacing w:after="80"/>
+      </w:pPr>
+      <w:r>
+        <w:rPr>
+          <w:color w:val="1D2D3E"/>
+          <w:sz w:val="22"/>
+          <w:szCs w:val="22"/>
+        </w:rPr>
+        <w:t xml:space="preserve"/>
+      </w:r>
+    </w:p>
+    <w:p>
+      <w:pPr>
+        <w:pStyle w:val="Heading2"/>
+        <w:spacing w:after="120" w:before="300"/>
+      </w:pPr>
+      <w:r>
+        <w:rPr>
+          <w:b/>
+          <w:bCs/>
+          <w:color w:val="1D2D3E"/>
+        </w:rPr>
         <w:t xml:space="preserve">Session 2 — 2026-05-15</w:t>
       </w:r>
     </w:p>
@@ -6491,6 +6693,177 @@
           <w:szCs w:val="22"/>
         </w:rPr>
         <w:t xml:space="preserve">Phase 6: Inventory, AP, AR screens use global company filter</w:t>
+      </w:r>
+    </w:p>
+    <w:p>
+      <w:pPr>
+        <w:spacing w:after="80"/>
+      </w:pPr>
+      <w:r>
+        <w:rPr>
+          <w:color w:val="1D2D3E"/>
+          <w:sz w:val="22"/>
+          <w:szCs w:val="22"/>
+        </w:rPr>
+        <w:t xml:space="preserve"/>
+      </w:r>
+    </w:p>
+    <w:p>
+      <w:pPr>
+        <w:pStyle w:val="Heading2"/>
+        <w:spacing w:after="120" w:before="300"/>
+      </w:pPr>
+      <w:r>
+        <w:rPr>
+          <w:b/>
+          <w:bCs/>
+          <w:color w:val="1D2D3E"/>
+        </w:rPr>
+        <w:t xml:space="preserve">Session 3 — 2026-05-18</w:t>
+      </w:r>
+    </w:p>
+    <w:p>
+      <w:pPr>
+        <w:pStyle w:val="ListParagraph"/>
+        <w:numPr>
+          <w:ilvl w:val="0"/>
+          <w:numId w:val="1"/>
+        </w:numPr>
+        <w:spacing w:after="40"/>
+      </w:pPr>
+      <w:r>
+        <w:rPr>
+          <w:color w:val="1D2D3E"/>
+          <w:sz w:val="22"/>
+          <w:szCs w:val="22"/>
+        </w:rPr>
+        <w:t xml:space="preserve">Global company filter extended to all screens: Dashboard, Materials, Journal Entries, Partners, Sales Orders</w:t>
+      </w:r>
+    </w:p>
+    <w:p>
+      <w:pPr>
+        <w:pStyle w:val="ListParagraph"/>
+        <w:numPr>
+          <w:ilvl w:val="0"/>
+          <w:numId w:val="1"/>
+        </w:numPr>
+        <w:spacing w:after="40"/>
+      </w:pPr>
+      <w:r>
+        <w:rPr>
+          <w:color w:val="1D2D3E"/>
+          <w:sz w:val="22"/>
+          <w:szCs w:val="22"/>
+        </w:rPr>
+        <w:t xml:space="preserve">TrialBalance and FinancialReports now read companies from CompanyContext (no redundant API calls)</w:t>
+      </w:r>
+    </w:p>
+    <w:p>
+      <w:pPr>
+        <w:pStyle w:val="ListParagraph"/>
+        <w:numPr>
+          <w:ilvl w:val="0"/>
+          <w:numId w:val="1"/>
+        </w:numPr>
+        <w:spacing w:after="40"/>
+      </w:pPr>
+      <w:r>
+        <w:rPr>
+          <w:color w:val="1D2D3E"/>
+          <w:sz w:val="22"/>
+          <w:szCs w:val="22"/>
+        </w:rPr>
+        <w:t xml:space="preserve">CompanyContext fixed to reload after login instead of failing silently on app start</w:t>
+      </w:r>
+    </w:p>
+    <w:p>
+      <w:pPr>
+        <w:pStyle w:val="ListParagraph"/>
+        <w:numPr>
+          <w:ilvl w:val="0"/>
+          <w:numId w:val="1"/>
+        </w:numPr>
+        <w:spacing w:after="40"/>
+      </w:pPr>
+      <w:r>
+        <w:rPr>
+          <w:color w:val="1D2D3E"/>
+          <w:sz w:val="22"/>
+          <w:szCs w:val="22"/>
+        </w:rPr>
+        <w:t xml:space="preserve">API client: added exponential-backoff retry (2 attempts, 500/1000ms) for network errors and 5xx/429</w:t>
+      </w:r>
+    </w:p>
+    <w:p>
+      <w:pPr>
+        <w:pStyle w:val="ListParagraph"/>
+        <w:numPr>
+          <w:ilvl w:val="0"/>
+          <w:numId w:val="1"/>
+        </w:numPr>
+        <w:spacing w:after="40"/>
+      </w:pPr>
+      <w:r>
+        <w:rPr>
+          <w:color w:val="1D2D3E"/>
+          <w:sz w:val="22"/>
+          <w:szCs w:val="22"/>
+        </w:rPr>
+        <w:t xml:space="preserve">MoreMenu Finance section: removed disabled items, now navigates directly into Finance tab screens</w:t>
+      </w:r>
+    </w:p>
+    <w:p>
+      <w:pPr>
+        <w:pStyle w:val="ListParagraph"/>
+        <w:numPr>
+          <w:ilvl w:val="0"/>
+          <w:numId w:val="1"/>
+        </w:numPr>
+        <w:spacing w:after="40"/>
+      </w:pPr>
+      <w:r>
+        <w:rPr>
+          <w:color w:val="1D2D3E"/>
+          <w:sz w:val="22"/>
+          <w:szCs w:val="22"/>
+        </w:rPr>
+        <w:t xml:space="preserve">AppStack: removed dead duplicate routes (Inventory, Materials, POs) — all nav through tab stacks</w:t>
+      </w:r>
+    </w:p>
+    <w:p>
+      <w:pPr>
+        <w:pStyle w:val="ListParagraph"/>
+        <w:numPr>
+          <w:ilvl w:val="0"/>
+          <w:numId w:val="1"/>
+        </w:numPr>
+        <w:spacing w:after="40"/>
+      </w:pPr>
+      <w:r>
+        <w:rPr>
+          <w:color w:val="1D2D3E"/>
+          <w:sz w:val="22"/>
+          <w:szCs w:val="22"/>
+        </w:rPr>
+        <w:t xml:space="preserve">Fixed Inventory tab icon (was using wrong key InventoryTab instead of Inventory)</w:t>
+      </w:r>
+    </w:p>
+    <w:p>
+      <w:pPr>
+        <w:pStyle w:val="ListParagraph"/>
+        <w:numPr>
+          <w:ilvl w:val="0"/>
+          <w:numId w:val="1"/>
+        </w:numPr>
+        <w:spacing w:after="40"/>
+      </w:pPr>
+      <w:r>
+        <w:rPr>
+          <w:color w:val="1D2D3E"/>
+          <w:sz w:val="22"/>
+          <w:szCs w:val="22"/>
+        </w:rPr>
+        <w:t xml:space="preserve">PurchaseOrder type: added received/receipt_pct fields for progress view endpoint</w:t>
       </w:r>
     </w:p>
     <w:p>

</xml_diff>

<commit_message>
Session 4: update PROGRESS.md, FEATURES.docx, and generate-docs.js with Session 4 changelog
</commit_message>
<xml_diff>
--- a/FEATURES.docx
+++ b/FEATURES.docx
@@ -45,7 +45,7 @@
           <w:sz w:val="20"/>
           <w:szCs w:val="20"/>
         </w:rPr>
-        <w:t xml:space="preserve">Generated: 2026-05-18</w:t>
+        <w:t xml:space="preserve">Generated: 2026-05-19</w:t>
       </w:r>
     </w:p>
     <w:p>
@@ -2861,6 +2861,24 @@
     </w:p>
     <w:p>
       <w:pPr>
+        <w:pStyle w:val="ListParagraph"/>
+        <w:numPr>
+          <w:ilvl w:val="0"/>
+          <w:numId w:val="1"/>
+        </w:numPr>
+        <w:spacing w:after="40"/>
+      </w:pPr>
+      <w:r>
+        <w:rPr>
+          <w:color w:val="1D2D3E"/>
+          <w:sz w:val="22"/>
+          <w:szCs w:val="22"/>
+        </w:rPr>
+        <w:t xml:space="preserve">Tappable cards navigate to PO Detail screen (Session 4)</w:t>
+      </w:r>
+    </w:p>
+    <w:p>
+      <w:pPr>
         <w:spacing w:after="80"/>
       </w:pPr>
       <w:r>
@@ -2937,25 +2955,25 @@
           <w:sz w:val="22"/>
           <w:szCs w:val="22"/>
         </w:rPr>
-        <w:t xml:space="preserve">Bills: bill cards with status, amounts, due date</w:t>
-      </w:r>
-    </w:p>
-    <w:p>
-      <w:pPr>
-        <w:pStyle w:val="ListParagraph"/>
-        <w:numPr>
-          <w:ilvl w:val="0"/>
-          <w:numId w:val="1"/>
-        </w:numPr>
-        <w:spacing w:after="40"/>
-      </w:pPr>
-      <w:r>
-        <w:rPr>
-          <w:color w:val="1D2D3E"/>
-          <w:sz w:val="22"/>
-          <w:szCs w:val="22"/>
-        </w:rPr>
-        <w:t xml:space="preserve">Vendors: vendor cards with outstanding/overdue balances</w:t>
+        <w:t xml:space="preserve">Bills: bill cards with status, amounts, due date + search by number/vendor/status (Session 4)</w:t>
+      </w:r>
+    </w:p>
+    <w:p>
+      <w:pPr>
+        <w:pStyle w:val="ListParagraph"/>
+        <w:numPr>
+          <w:ilvl w:val="0"/>
+          <w:numId w:val="1"/>
+        </w:numPr>
+        <w:spacing w:after="40"/>
+      </w:pPr>
+      <w:r>
+        <w:rPr>
+          <w:color w:val="1D2D3E"/>
+          <w:sz w:val="22"/>
+          <w:szCs w:val="22"/>
+        </w:rPr>
+        <w:t xml:space="preserve">Vendors: vendor cards with outstanding/overdue balances + search by name (Session 4)</w:t>
       </w:r>
     </w:p>
     <w:p>
@@ -3036,25 +3054,25 @@
           <w:sz w:val="22"/>
           <w:szCs w:val="22"/>
         </w:rPr>
-        <w:t xml:space="preserve">Invoices: invoice cards with outstanding amounts</w:t>
-      </w:r>
-    </w:p>
-    <w:p>
-      <w:pPr>
-        <w:pStyle w:val="ListParagraph"/>
-        <w:numPr>
-          <w:ilvl w:val="0"/>
-          <w:numId w:val="1"/>
-        </w:numPr>
-        <w:spacing w:after="40"/>
-      </w:pPr>
-      <w:r>
-        <w:rPr>
-          <w:color w:val="1D2D3E"/>
-          <w:sz w:val="22"/>
-          <w:szCs w:val="22"/>
-        </w:rPr>
-        <w:t xml:space="preserve">Customers: customer cards with outstanding/overdue balances</w:t>
+        <w:t xml:space="preserve">Invoices: invoice cards with outstanding amounts + search by number/customer/status (Session 4)</w:t>
+      </w:r>
+    </w:p>
+    <w:p>
+      <w:pPr>
+        <w:pStyle w:val="ListParagraph"/>
+        <w:numPr>
+          <w:ilvl w:val="0"/>
+          <w:numId w:val="1"/>
+        </w:numPr>
+        <w:spacing w:after="40"/>
+      </w:pPr>
+      <w:r>
+        <w:rPr>
+          <w:color w:val="1D2D3E"/>
+          <w:sz w:val="22"/>
+          <w:szCs w:val="22"/>
+        </w:rPr>
+        <w:t xml:space="preserve">Customers: customer cards with outstanding/overdue balances + search by name (Session 4)</w:t>
       </w:r>
     </w:p>
     <w:p>
@@ -3154,6 +3172,42 @@
           <w:szCs w:val="22"/>
         </w:rPr>
         <w:t xml:space="preserve">Expandable cards reveal journal lines (account, debit, credit)</w:t>
+      </w:r>
+    </w:p>
+    <w:p>
+      <w:pPr>
+        <w:pStyle w:val="ListParagraph"/>
+        <w:numPr>
+          <w:ilvl w:val="0"/>
+          <w:numId w:val="1"/>
+        </w:numPr>
+        <w:spacing w:after="40"/>
+      </w:pPr>
+      <w:r>
+        <w:rPr>
+          <w:color w:val="1D2D3E"/>
+          <w:sz w:val="22"/>
+          <w:szCs w:val="22"/>
+        </w:rPr>
+        <w:t xml:space="preserve">Date range filter with From/To inputs (YYYY-MM-DD) — server-side filtering (Session 4)</w:t>
+      </w:r>
+    </w:p>
+    <w:p>
+      <w:pPr>
+        <w:pStyle w:val="ListParagraph"/>
+        <w:numPr>
+          <w:ilvl w:val="0"/>
+          <w:numId w:val="1"/>
+        </w:numPr>
+        <w:spacing w:after="40"/>
+      </w:pPr>
+      <w:r>
+        <w:rPr>
+          <w:color w:val="1D2D3E"/>
+          <w:sz w:val="22"/>
+          <w:szCs w:val="22"/>
+        </w:rPr>
+        <w:t xml:space="preserve">Quick date presets: Today, This Week, This Month, Last Month (Session 4)</w:t>
       </w:r>
     </w:p>
     <w:p>
@@ -5346,6 +5400,310 @@
           </w:p>
         </w:tc>
       </w:tr>
+      <w:tr>
+        <w:tc>
+          <w:tcPr>
+            <w:shd w:color="F0F4F8" w:val="solid"/>
+          </w:tcPr>
+          <w:p>
+            <w:pPr>
+              <w:spacing w:after="40" w:before="40"/>
+            </w:pPr>
+            <w:r>
+              <w:rPr>
+                <w:b w:val="false"/>
+                <w:bCs w:val="false"/>
+                <w:color w:val="1D2D3E"/>
+                <w:sz w:val="20"/>
+                <w:szCs w:val="20"/>
+              </w:rPr>
+              <w:t xml:space="preserve">Session 4</w:t>
+            </w:r>
+          </w:p>
+        </w:tc>
+        <w:tc>
+          <w:tcPr>
+            <w:shd w:color="F0F4F8" w:val="solid"/>
+          </w:tcPr>
+          <w:p>
+            <w:pPr>
+              <w:spacing w:after="40" w:before="40"/>
+            </w:pPr>
+            <w:r>
+              <w:rPr>
+                <w:b w:val="false"/>
+                <w:bCs w:val="false"/>
+                <w:color w:val="1D2D3E"/>
+                <w:sz w:val="20"/>
+                <w:szCs w:val="20"/>
+              </w:rPr>
+              <w:t xml:space="preserve">Back Buttons (all screens)</w:t>
+            </w:r>
+          </w:p>
+        </w:tc>
+        <w:tc>
+          <w:tcPr>
+            <w:shd w:color="F0F4F8" w:val="solid"/>
+          </w:tcPr>
+          <w:p>
+            <w:pPr>
+              <w:spacing w:after="40" w:before="40"/>
+            </w:pPr>
+            <w:r>
+              <w:rPr>
+                <w:b w:val="false"/>
+                <w:bCs w:val="false"/>
+                <w:color w:val="1D2D3E"/>
+                <w:sz w:val="20"/>
+                <w:szCs w:val="20"/>
+              </w:rPr>
+              <w:t xml:space="preserve">Done</w:t>
+            </w:r>
+          </w:p>
+        </w:tc>
+        <w:tc>
+          <w:tcPr>
+            <w:shd w:color="F0F4F8" w:val="solid"/>
+          </w:tcPr>
+          <w:p>
+            <w:pPr>
+              <w:spacing w:after="40" w:before="40"/>
+            </w:pPr>
+            <w:r>
+              <w:rPr>
+                <w:b w:val="false"/>
+                <w:bCs w:val="false"/>
+                <w:color w:val="1D2D3E"/>
+                <w:sz w:val="20"/>
+                <w:szCs w:val="20"/>
+              </w:rPr>
+              <w:t xml:space="preserve">—</w:t>
+            </w:r>
+          </w:p>
+        </w:tc>
+      </w:tr>
+      <w:tr>
+        <w:tc>
+          <w:p>
+            <w:pPr>
+              <w:spacing w:after="40" w:before="40"/>
+            </w:pPr>
+            <w:r>
+              <w:rPr>
+                <w:b w:val="false"/>
+                <w:bCs w:val="false"/>
+                <w:color w:val="1D2D3E"/>
+                <w:sz w:val="20"/>
+                <w:szCs w:val="20"/>
+              </w:rPr>
+              <w:t xml:space="preserve">Session 4</w:t>
+            </w:r>
+          </w:p>
+        </w:tc>
+        <w:tc>
+          <w:p>
+            <w:pPr>
+              <w:spacing w:after="40" w:before="40"/>
+            </w:pPr>
+            <w:r>
+              <w:rPr>
+                <w:b w:val="false"/>
+                <w:bCs w:val="false"/>
+                <w:color w:val="1D2D3E"/>
+                <w:sz w:val="20"/>
+                <w:szCs w:val="20"/>
+              </w:rPr>
+              <w:t xml:space="preserve">Search (PO, SO, AP Bills, AP Vendors, AR Invoices, AR Customers)</w:t>
+            </w:r>
+          </w:p>
+        </w:tc>
+        <w:tc>
+          <w:p>
+            <w:pPr>
+              <w:spacing w:after="40" w:before="40"/>
+            </w:pPr>
+            <w:r>
+              <w:rPr>
+                <w:b w:val="false"/>
+                <w:bCs w:val="false"/>
+                <w:color w:val="1D2D3E"/>
+                <w:sz w:val="20"/>
+                <w:szCs w:val="20"/>
+              </w:rPr>
+              <w:t xml:space="preserve">Done</w:t>
+            </w:r>
+          </w:p>
+        </w:tc>
+        <w:tc>
+          <w:p>
+            <w:pPr>
+              <w:spacing w:after="40" w:before="40"/>
+            </w:pPr>
+            <w:r>
+              <w:rPr>
+                <w:b w:val="false"/>
+                <w:bCs w:val="false"/>
+                <w:color w:val="1D2D3E"/>
+                <w:sz w:val="20"/>
+                <w:szCs w:val="20"/>
+              </w:rPr>
+              <w:t xml:space="preserve">—</w:t>
+            </w:r>
+          </w:p>
+        </w:tc>
+      </w:tr>
+      <w:tr>
+        <w:tc>
+          <w:tcPr>
+            <w:shd w:color="F0F4F8" w:val="solid"/>
+          </w:tcPr>
+          <w:p>
+            <w:pPr>
+              <w:spacing w:after="40" w:before="40"/>
+            </w:pPr>
+            <w:r>
+              <w:rPr>
+                <w:b w:val="false"/>
+                <w:bCs w:val="false"/>
+                <w:color w:val="1D2D3E"/>
+                <w:sz w:val="20"/>
+                <w:szCs w:val="20"/>
+              </w:rPr>
+              <w:t xml:space="preserve">Session 4</w:t>
+            </w:r>
+          </w:p>
+        </w:tc>
+        <w:tc>
+          <w:tcPr>
+            <w:shd w:color="F0F4F8" w:val="solid"/>
+          </w:tcPr>
+          <w:p>
+            <w:pPr>
+              <w:spacing w:after="40" w:before="40"/>
+            </w:pPr>
+            <w:r>
+              <w:rPr>
+                <w:b w:val="false"/>
+                <w:bCs w:val="false"/>
+                <w:color w:val="1D2D3E"/>
+                <w:sz w:val="20"/>
+                <w:szCs w:val="20"/>
+              </w:rPr>
+              <w:t xml:space="preserve">Date Range Filter + Presets (Journal Entries)</w:t>
+            </w:r>
+          </w:p>
+        </w:tc>
+        <w:tc>
+          <w:tcPr>
+            <w:shd w:color="F0F4F8" w:val="solid"/>
+          </w:tcPr>
+          <w:p>
+            <w:pPr>
+              <w:spacing w:after="40" w:before="40"/>
+            </w:pPr>
+            <w:r>
+              <w:rPr>
+                <w:b w:val="false"/>
+                <w:bCs w:val="false"/>
+                <w:color w:val="1D2D3E"/>
+                <w:sz w:val="20"/>
+                <w:szCs w:val="20"/>
+              </w:rPr>
+              <w:t xml:space="preserve">Done</w:t>
+            </w:r>
+          </w:p>
+        </w:tc>
+        <w:tc>
+          <w:tcPr>
+            <w:shd w:color="F0F4F8" w:val="solid"/>
+          </w:tcPr>
+          <w:p>
+            <w:pPr>
+              <w:spacing w:after="40" w:before="40"/>
+            </w:pPr>
+            <w:r>
+              <w:rPr>
+                <w:b w:val="false"/>
+                <w:bCs w:val="false"/>
+                <w:color w:val="1D2D3E"/>
+                <w:sz w:val="20"/>
+                <w:szCs w:val="20"/>
+              </w:rPr>
+              <w:t xml:space="preserve">/api/mobile/journal-entries?from=&amp;to=</w:t>
+            </w:r>
+          </w:p>
+        </w:tc>
+      </w:tr>
+      <w:tr>
+        <w:tc>
+          <w:p>
+            <w:pPr>
+              <w:spacing w:after="40" w:before="40"/>
+            </w:pPr>
+            <w:r>
+              <w:rPr>
+                <w:b w:val="false"/>
+                <w:bCs w:val="false"/>
+                <w:color w:val="1D2D3E"/>
+                <w:sz w:val="20"/>
+                <w:szCs w:val="20"/>
+              </w:rPr>
+              <w:t xml:space="preserve">Session 4</w:t>
+            </w:r>
+          </w:p>
+        </w:tc>
+        <w:tc>
+          <w:p>
+            <w:pPr>
+              <w:spacing w:after="40" w:before="40"/>
+            </w:pPr>
+            <w:r>
+              <w:rPr>
+                <w:b w:val="false"/>
+                <w:bCs w:val="false"/>
+                <w:color w:val="1D2D3E"/>
+                <w:sz w:val="20"/>
+                <w:szCs w:val="20"/>
+              </w:rPr>
+              <w:t xml:space="preserve">GRN → PO Detail navigation</w:t>
+            </w:r>
+          </w:p>
+        </w:tc>
+        <w:tc>
+          <w:p>
+            <w:pPr>
+              <w:spacing w:after="40" w:before="40"/>
+            </w:pPr>
+            <w:r>
+              <w:rPr>
+                <w:b w:val="false"/>
+                <w:bCs w:val="false"/>
+                <w:color w:val="1D2D3E"/>
+                <w:sz w:val="20"/>
+                <w:szCs w:val="20"/>
+              </w:rPr>
+              <w:t xml:space="preserve">Done</w:t>
+            </w:r>
+          </w:p>
+        </w:tc>
+        <w:tc>
+          <w:p>
+            <w:pPr>
+              <w:spacing w:after="40" w:before="40"/>
+            </w:pPr>
+            <w:r>
+              <w:rPr>
+                <w:b w:val="false"/>
+                <w:bCs w:val="false"/>
+                <w:color w:val="1D2D3E"/>
+                <w:sz w:val="20"/>
+                <w:szCs w:val="20"/>
+              </w:rPr>
+              <w:t xml:space="preserve">—</w:t>
+            </w:r>
+          </w:p>
+        </w:tc>
+      </w:tr>
     </w:tbl>
     <w:p>
       <w:pPr>
@@ -6864,6 +7222,195 @@
           <w:szCs w:val="22"/>
         </w:rPr>
         <w:t xml:space="preserve">PurchaseOrder type: added received/receipt_pct fields for progress view endpoint</w:t>
+      </w:r>
+    </w:p>
+    <w:p>
+      <w:pPr>
+        <w:spacing w:after="80"/>
+      </w:pPr>
+      <w:r>
+        <w:rPr>
+          <w:color w:val="1D2D3E"/>
+          <w:sz w:val="22"/>
+          <w:szCs w:val="22"/>
+        </w:rPr>
+        <w:t xml:space="preserve"/>
+      </w:r>
+    </w:p>
+    <w:p>
+      <w:pPr>
+        <w:pStyle w:val="Heading2"/>
+        <w:spacing w:after="120" w:before="300"/>
+      </w:pPr>
+      <w:r>
+        <w:rPr>
+          <w:b/>
+          <w:bCs/>
+          <w:color w:val="1D2D3E"/>
+        </w:rPr>
+        <w:t xml:space="preserve">Session 4 — 2026-05-19</w:t>
+      </w:r>
+    </w:p>
+    <w:p>
+      <w:pPr>
+        <w:pStyle w:val="ListParagraph"/>
+        <w:numPr>
+          <w:ilvl w:val="0"/>
+          <w:numId w:val="1"/>
+        </w:numPr>
+        <w:spacing w:after="40"/>
+      </w:pPr>
+      <w:r>
+        <w:rPr>
+          <w:color w:val="1D2D3E"/>
+          <w:sz w:val="22"/>
+          <w:szCs w:val="22"/>
+        </w:rPr>
+        <w:t xml:space="preserve">Journal Entries: added date range filter (from/to inputs) with server-side filtering via API params</w:t>
+      </w:r>
+    </w:p>
+    <w:p>
+      <w:pPr>
+        <w:pStyle w:val="ListParagraph"/>
+        <w:numPr>
+          <w:ilvl w:val="0"/>
+          <w:numId w:val="1"/>
+        </w:numPr>
+        <w:spacing w:after="40"/>
+      </w:pPr>
+      <w:r>
+        <w:rPr>
+          <w:color w:val="1D2D3E"/>
+          <w:sz w:val="22"/>
+          <w:szCs w:val="22"/>
+        </w:rPr>
+        <w:t xml:space="preserve">Journal Entries: added quick date presets — Today, This Week, This Month, Last Month</w:t>
+      </w:r>
+    </w:p>
+    <w:p>
+      <w:pPr>
+        <w:pStyle w:val="ListParagraph"/>
+        <w:numPr>
+          <w:ilvl w:val="0"/>
+          <w:numId w:val="1"/>
+        </w:numPr>
+        <w:spacing w:after="40"/>
+      </w:pPr>
+      <w:r>
+        <w:rPr>
+          <w:color w:val="1D2D3E"/>
+          <w:sz w:val="22"/>
+          <w:szCs w:val="22"/>
+        </w:rPr>
+        <w:t xml:space="preserve">Accounts Payable: added search bars in Bills tab (by number/vendor/status) and Vendors tab (by name)</w:t>
+      </w:r>
+    </w:p>
+    <w:p>
+      <w:pPr>
+        <w:pStyle w:val="ListParagraph"/>
+        <w:numPr>
+          <w:ilvl w:val="0"/>
+          <w:numId w:val="1"/>
+        </w:numPr>
+        <w:spacing w:after="40"/>
+      </w:pPr>
+      <w:r>
+        <w:rPr>
+          <w:color w:val="1D2D3E"/>
+          <w:sz w:val="22"/>
+          <w:szCs w:val="22"/>
+        </w:rPr>
+        <w:t xml:space="preserve">Accounts Receivable: added search bars in Invoices tab (by number/customer/status) and Customers tab (by name)</w:t>
+      </w:r>
+    </w:p>
+    <w:p>
+      <w:pPr>
+        <w:pStyle w:val="ListParagraph"/>
+        <w:numPr>
+          <w:ilvl w:val="0"/>
+          <w:numId w:val="1"/>
+        </w:numPr>
+        <w:spacing w:after="40"/>
+      </w:pPr>
+      <w:r>
+        <w:rPr>
+          <w:color w:val="1D2D3E"/>
+          <w:sz w:val="22"/>
+          <w:szCs w:val="22"/>
+        </w:rPr>
+        <w:t xml:space="preserve">Purchase Orders: added search bar (by PO number, vendor, status)</w:t>
+      </w:r>
+    </w:p>
+    <w:p>
+      <w:pPr>
+        <w:pStyle w:val="ListParagraph"/>
+        <w:numPr>
+          <w:ilvl w:val="0"/>
+          <w:numId w:val="1"/>
+        </w:numPr>
+        <w:spacing w:after="40"/>
+      </w:pPr>
+      <w:r>
+        <w:rPr>
+          <w:color w:val="1D2D3E"/>
+          <w:sz w:val="22"/>
+          <w:szCs w:val="22"/>
+        </w:rPr>
+        <w:t xml:space="preserve">Sales Orders: added search bar (by SO number, customer, status)</w:t>
+      </w:r>
+    </w:p>
+    <w:p>
+      <w:pPr>
+        <w:pStyle w:val="ListParagraph"/>
+        <w:numPr>
+          <w:ilvl w:val="0"/>
+          <w:numId w:val="1"/>
+        </w:numPr>
+        <w:spacing w:after="40"/>
+      </w:pPr>
+      <w:r>
+        <w:rPr>
+          <w:color w:val="1D2D3E"/>
+          <w:sz w:val="22"/>
+          <w:szCs w:val="22"/>
+        </w:rPr>
+        <w:t xml:space="preserve">GRN screen: made PO cards tappable — tap navigates to PurchaseOrderDetail screen</w:t>
+      </w:r>
+    </w:p>
+    <w:p>
+      <w:pPr>
+        <w:pStyle w:val="ListParagraph"/>
+        <w:numPr>
+          <w:ilvl w:val="0"/>
+          <w:numId w:val="1"/>
+        </w:numPr>
+        <w:spacing w:after="40"/>
+      </w:pPr>
+      <w:r>
+        <w:rPr>
+          <w:color w:val="1D2D3E"/>
+          <w:sz w:val="22"/>
+          <w:szCs w:val="22"/>
+        </w:rPr>
+        <w:t xml:space="preserve">Back buttons: added BackButton component to all non-root stack screens (11 screens total)</w:t>
+      </w:r>
+    </w:p>
+    <w:p>
+      <w:pPr>
+        <w:pStyle w:val="ListParagraph"/>
+        <w:numPr>
+          <w:ilvl w:val="0"/>
+          <w:numId w:val="1"/>
+        </w:numPr>
+        <w:spacing w:after="40"/>
+      </w:pPr>
+      <w:r>
+        <w:rPr>
+          <w:color w:val="1D2D3E"/>
+          <w:sz w:val="22"/>
+          <w:szCs w:val="22"/>
+        </w:rPr>
+        <w:t xml:space="preserve">Back button header style: fixed AP, AR, Financial Reports headers to use flexDirection row</w:t>
       </w:r>
     </w:p>
     <w:p>

</xml_diff>

<commit_message>
Session 5: update PROGRESS.md, FEATURES.docx, and generate-docs.js with Session 5 changelog
- PROGRESS.md: added Session 5 section (warehouses tab, ledger date filter, low-stock filter, exports)
- generate-docs.js: updated sections 3.10, 3.17, 3.18, 3.21, roadmap table, Session 5 changelog
- FEATURES.docx: regenerated with all Session 5 additions

https://claude.ai/code/session_016gTjT9G6dQaTivWxfpwXFp
</commit_message>
<xml_diff>
--- a/FEATURES.docx
+++ b/FEATURES.docx
@@ -2460,7 +2460,7 @@
           <w:sz w:val="22"/>
           <w:szCs w:val="22"/>
         </w:rPr>
-        <w:t xml:space="preserve">Internal tab view: Stock Balances and Stock Ledger</w:t>
+        <w:t xml:space="preserve">Three-tab view: Stock Balances, Stock Ledger, Warehouses (Session 5)</w:t>
       </w:r>
     </w:p>
     <w:p>
@@ -2496,6 +2496,24 @@
           <w:sz w:val="22"/>
           <w:szCs w:val="22"/>
         </w:rPr>
+        <w:t xml:space="preserve">Stock Balances: All / Low Stock / Out of Stock filter chips with live counts (Session 5)</w:t>
+      </w:r>
+    </w:p>
+    <w:p>
+      <w:pPr>
+        <w:pStyle w:val="ListParagraph"/>
+        <w:numPr>
+          <w:ilvl w:val="0"/>
+          <w:numId w:val="1"/>
+        </w:numPr>
+        <w:spacing w:after="40"/>
+      </w:pPr>
+      <w:r>
+        <w:rPr>
+          <w:color w:val="1D2D3E"/>
+          <w:sz w:val="22"/>
+          <w:szCs w:val="22"/>
+        </w:rPr>
         <w:t xml:space="preserve">Stock Ledger: movement log with IN/OUT/balance amounts and voucher type badges</w:t>
       </w:r>
     </w:p>
@@ -2514,7 +2532,43 @@
           <w:sz w:val="22"/>
           <w:szCs w:val="22"/>
         </w:rPr>
-        <w:t xml:space="preserve">Search filter across both tabs (item name, warehouse)</w:t>
+        <w:t xml:space="preserve">Stock Ledger: date range filter with From/To inputs and quick presets (Session 5)</w:t>
+      </w:r>
+    </w:p>
+    <w:p>
+      <w:pPr>
+        <w:pStyle w:val="ListParagraph"/>
+        <w:numPr>
+          <w:ilvl w:val="0"/>
+          <w:numId w:val="1"/>
+        </w:numPr>
+        <w:spacing w:after="40"/>
+      </w:pPr>
+      <w:r>
+        <w:rPr>
+          <w:color w:val="1D2D3E"/>
+          <w:sz w:val="22"/>
+          <w:szCs w:val="22"/>
+        </w:rPr>
+        <w:t xml:space="preserve">Warehouses: card list showing warehouse name, code, type, address, active status (Session 5)</w:t>
+      </w:r>
+    </w:p>
+    <w:p>
+      <w:pPr>
+        <w:pStyle w:val="ListParagraph"/>
+        <w:numPr>
+          <w:ilvl w:val="0"/>
+          <w:numId w:val="1"/>
+        </w:numPr>
+        <w:spacing w:after="40"/>
+      </w:pPr>
+      <w:r>
+        <w:rPr>
+          <w:color w:val="1D2D3E"/>
+          <w:sz w:val="22"/>
+          <w:szCs w:val="22"/>
+        </w:rPr>
+        <w:t xml:space="preserve">Search filter across all three tabs</w:t>
       </w:r>
     </w:p>
     <w:p>
@@ -3212,6 +3266,24 @@
     </w:p>
     <w:p>
       <w:pPr>
+        <w:pStyle w:val="ListParagraph"/>
+        <w:numPr>
+          <w:ilvl w:val="0"/>
+          <w:numId w:val="1"/>
+        </w:numPr>
+        <w:spacing w:after="40"/>
+      </w:pPr>
+      <w:r>
+        <w:rPr>
+          <w:color w:val="1D2D3E"/>
+          <w:sz w:val="22"/>
+          <w:szCs w:val="22"/>
+        </w:rPr>
+        <w:t xml:space="preserve">Export button: shares filtered entries as formatted text via Share API (Session 5)</w:t>
+      </w:r>
+    </w:p>
+    <w:p>
+      <w:pPr>
         <w:spacing w:after="80"/>
       </w:pPr>
       <w:r>
@@ -3329,6 +3401,24 @@
     </w:p>
     <w:p>
       <w:pPr>
+        <w:pStyle w:val="ListParagraph"/>
+        <w:numPr>
+          <w:ilvl w:val="0"/>
+          <w:numId w:val="1"/>
+        </w:numPr>
+        <w:spacing w:after="40"/>
+      </w:pPr>
+      <w:r>
+        <w:rPr>
+          <w:color w:val="1D2D3E"/>
+          <w:sz w:val="22"/>
+          <w:szCs w:val="22"/>
+        </w:rPr>
+        <w:t xml:space="preserve">Export button: shares trial balance as formatted columnar text report (Session 5)</w:t>
+      </w:r>
+    </w:p>
+    <w:p>
+      <w:pPr>
         <w:spacing w:after="80"/>
       </w:pPr>
       <w:r>
@@ -3604,6 +3694,24 @@
           <w:szCs w:val="22"/>
         </w:rPr>
         <w:t xml:space="preserve">Accounts classified by account_type keyword matching</w:t>
+      </w:r>
+    </w:p>
+    <w:p>
+      <w:pPr>
+        <w:pStyle w:val="ListParagraph"/>
+        <w:numPr>
+          <w:ilvl w:val="0"/>
+          <w:numId w:val="1"/>
+        </w:numPr>
+        <w:spacing w:after="40"/>
+      </w:pPr>
+      <w:r>
+        <w:rPr>
+          <w:color w:val="1D2D3E"/>
+          <w:sz w:val="22"/>
+          <w:szCs w:val="22"/>
+        </w:rPr>
+        <w:t xml:space="preserve">Export button: shares P&amp;L or Balance Sheet as formatted text report (Session 5)</w:t>
       </w:r>
     </w:p>
     <w:p>
@@ -5704,6 +5812,462 @@
           </w:p>
         </w:tc>
       </w:tr>
+      <w:tr>
+        <w:tc>
+          <w:tcPr>
+            <w:shd w:color="F0F4F8" w:val="solid"/>
+          </w:tcPr>
+          <w:p>
+            <w:pPr>
+              <w:spacing w:after="40" w:before="40"/>
+            </w:pPr>
+            <w:r>
+              <w:rPr>
+                <w:b w:val="false"/>
+                <w:bCs w:val="false"/>
+                <w:color w:val="1D2D3E"/>
+                <w:sz w:val="20"/>
+                <w:szCs w:val="20"/>
+              </w:rPr>
+              <w:t xml:space="preserve">Session 5</w:t>
+            </w:r>
+          </w:p>
+        </w:tc>
+        <w:tc>
+          <w:tcPr>
+            <w:shd w:color="F0F4F8" w:val="solid"/>
+          </w:tcPr>
+          <w:p>
+            <w:pPr>
+              <w:spacing w:after="40" w:before="40"/>
+            </w:pPr>
+            <w:r>
+              <w:rPr>
+                <w:b w:val="false"/>
+                <w:bCs w:val="false"/>
+                <w:color w:val="1D2D3E"/>
+                <w:sz w:val="20"/>
+                <w:szCs w:val="20"/>
+              </w:rPr>
+              <w:t xml:space="preserve">Inventory Warehouses Tab</w:t>
+            </w:r>
+          </w:p>
+        </w:tc>
+        <w:tc>
+          <w:tcPr>
+            <w:shd w:color="F0F4F8" w:val="solid"/>
+          </w:tcPr>
+          <w:p>
+            <w:pPr>
+              <w:spacing w:after="40" w:before="40"/>
+            </w:pPr>
+            <w:r>
+              <w:rPr>
+                <w:b w:val="false"/>
+                <w:bCs w:val="false"/>
+                <w:color w:val="1D2D3E"/>
+                <w:sz w:val="20"/>
+                <w:szCs w:val="20"/>
+              </w:rPr>
+              <w:t xml:space="preserve">Done</w:t>
+            </w:r>
+          </w:p>
+        </w:tc>
+        <w:tc>
+          <w:tcPr>
+            <w:shd w:color="F0F4F8" w:val="solid"/>
+          </w:tcPr>
+          <w:p>
+            <w:pPr>
+              <w:spacing w:after="40" w:before="40"/>
+            </w:pPr>
+            <w:r>
+              <w:rPr>
+                <w:b w:val="false"/>
+                <w:bCs w:val="false"/>
+                <w:color w:val="1D2D3E"/>
+                <w:sz w:val="20"/>
+                <w:szCs w:val="20"/>
+              </w:rPr>
+              <w:t xml:space="preserve">/api/mobile/inventory?view=warehouses</w:t>
+            </w:r>
+          </w:p>
+        </w:tc>
+      </w:tr>
+      <w:tr>
+        <w:tc>
+          <w:p>
+            <w:pPr>
+              <w:spacing w:after="40" w:before="40"/>
+            </w:pPr>
+            <w:r>
+              <w:rPr>
+                <w:b w:val="false"/>
+                <w:bCs w:val="false"/>
+                <w:color w:val="1D2D3E"/>
+                <w:sz w:val="20"/>
+                <w:szCs w:val="20"/>
+              </w:rPr>
+              <w:t xml:space="preserve">Session 5</w:t>
+            </w:r>
+          </w:p>
+        </w:tc>
+        <w:tc>
+          <w:p>
+            <w:pPr>
+              <w:spacing w:after="40" w:before="40"/>
+            </w:pPr>
+            <w:r>
+              <w:rPr>
+                <w:b w:val="false"/>
+                <w:bCs w:val="false"/>
+                <w:color w:val="1D2D3E"/>
+                <w:sz w:val="20"/>
+                <w:szCs w:val="20"/>
+              </w:rPr>
+              <w:t xml:space="preserve">Inventory Ledger Date Filter + Presets</w:t>
+            </w:r>
+          </w:p>
+        </w:tc>
+        <w:tc>
+          <w:p>
+            <w:pPr>
+              <w:spacing w:after="40" w:before="40"/>
+            </w:pPr>
+            <w:r>
+              <w:rPr>
+                <w:b w:val="false"/>
+                <w:bCs w:val="false"/>
+                <w:color w:val="1D2D3E"/>
+                <w:sz w:val="20"/>
+                <w:szCs w:val="20"/>
+              </w:rPr>
+              <w:t xml:space="preserve">Done</w:t>
+            </w:r>
+          </w:p>
+        </w:tc>
+        <w:tc>
+          <w:p>
+            <w:pPr>
+              <w:spacing w:after="40" w:before="40"/>
+            </w:pPr>
+            <w:r>
+              <w:rPr>
+                <w:b w:val="false"/>
+                <w:bCs w:val="false"/>
+                <w:color w:val="1D2D3E"/>
+                <w:sz w:val="20"/>
+                <w:szCs w:val="20"/>
+              </w:rPr>
+              <w:t xml:space="preserve">/api/mobile/inventory?view=ledger&amp;from=&amp;to=</w:t>
+            </w:r>
+          </w:p>
+        </w:tc>
+      </w:tr>
+      <w:tr>
+        <w:tc>
+          <w:tcPr>
+            <w:shd w:color="F0F4F8" w:val="solid"/>
+          </w:tcPr>
+          <w:p>
+            <w:pPr>
+              <w:spacing w:after="40" w:before="40"/>
+            </w:pPr>
+            <w:r>
+              <w:rPr>
+                <w:b w:val="false"/>
+                <w:bCs w:val="false"/>
+                <w:color w:val="1D2D3E"/>
+                <w:sz w:val="20"/>
+                <w:szCs w:val="20"/>
+              </w:rPr>
+              <w:t xml:space="preserve">Session 5</w:t>
+            </w:r>
+          </w:p>
+        </w:tc>
+        <w:tc>
+          <w:tcPr>
+            <w:shd w:color="F0F4F8" w:val="solid"/>
+          </w:tcPr>
+          <w:p>
+            <w:pPr>
+              <w:spacing w:after="40" w:before="40"/>
+            </w:pPr>
+            <w:r>
+              <w:rPr>
+                <w:b w:val="false"/>
+                <w:bCs w:val="false"/>
+                <w:color w:val="1D2D3E"/>
+                <w:sz w:val="20"/>
+                <w:szCs w:val="20"/>
+              </w:rPr>
+              <w:t xml:space="preserve">Low-Stock Filter on Stock Balances</w:t>
+            </w:r>
+          </w:p>
+        </w:tc>
+        <w:tc>
+          <w:tcPr>
+            <w:shd w:color="F0F4F8" w:val="solid"/>
+          </w:tcPr>
+          <w:p>
+            <w:pPr>
+              <w:spacing w:after="40" w:before="40"/>
+            </w:pPr>
+            <w:r>
+              <w:rPr>
+                <w:b w:val="false"/>
+                <w:bCs w:val="false"/>
+                <w:color w:val="1D2D3E"/>
+                <w:sz w:val="20"/>
+                <w:szCs w:val="20"/>
+              </w:rPr>
+              <w:t xml:space="preserve">Done</w:t>
+            </w:r>
+          </w:p>
+        </w:tc>
+        <w:tc>
+          <w:tcPr>
+            <w:shd w:color="F0F4F8" w:val="solid"/>
+          </w:tcPr>
+          <w:p>
+            <w:pPr>
+              <w:spacing w:after="40" w:before="40"/>
+            </w:pPr>
+            <w:r>
+              <w:rPr>
+                <w:b w:val="false"/>
+                <w:bCs w:val="false"/>
+                <w:color w:val="1D2D3E"/>
+                <w:sz w:val="20"/>
+                <w:szCs w:val="20"/>
+              </w:rPr>
+              <w:t xml:space="preserve">—</w:t>
+            </w:r>
+          </w:p>
+        </w:tc>
+      </w:tr>
+      <w:tr>
+        <w:tc>
+          <w:p>
+            <w:pPr>
+              <w:spacing w:after="40" w:before="40"/>
+            </w:pPr>
+            <w:r>
+              <w:rPr>
+                <w:b w:val="false"/>
+                <w:bCs w:val="false"/>
+                <w:color w:val="1D2D3E"/>
+                <w:sz w:val="20"/>
+                <w:szCs w:val="20"/>
+              </w:rPr>
+              <w:t xml:space="preserve">Session 5</w:t>
+            </w:r>
+          </w:p>
+        </w:tc>
+        <w:tc>
+          <w:p>
+            <w:pPr>
+              <w:spacing w:after="40" w:before="40"/>
+            </w:pPr>
+            <w:r>
+              <w:rPr>
+                <w:b w:val="false"/>
+                <w:bCs w:val="false"/>
+                <w:color w:val="1D2D3E"/>
+                <w:sz w:val="20"/>
+                <w:szCs w:val="20"/>
+              </w:rPr>
+              <w:t xml:space="preserve">Trial Balance Export (Share API)</w:t>
+            </w:r>
+          </w:p>
+        </w:tc>
+        <w:tc>
+          <w:p>
+            <w:pPr>
+              <w:spacing w:after="40" w:before="40"/>
+            </w:pPr>
+            <w:r>
+              <w:rPr>
+                <w:b w:val="false"/>
+                <w:bCs w:val="false"/>
+                <w:color w:val="1D2D3E"/>
+                <w:sz w:val="20"/>
+                <w:szCs w:val="20"/>
+              </w:rPr>
+              <w:t xml:space="preserve">Done</w:t>
+            </w:r>
+          </w:p>
+        </w:tc>
+        <w:tc>
+          <w:p>
+            <w:pPr>
+              <w:spacing w:after="40" w:before="40"/>
+            </w:pPr>
+            <w:r>
+              <w:rPr>
+                <w:b w:val="false"/>
+                <w:bCs w:val="false"/>
+                <w:color w:val="1D2D3E"/>
+                <w:sz w:val="20"/>
+                <w:szCs w:val="20"/>
+              </w:rPr>
+              <w:t xml:space="preserve">—</w:t>
+            </w:r>
+          </w:p>
+        </w:tc>
+      </w:tr>
+      <w:tr>
+        <w:tc>
+          <w:tcPr>
+            <w:shd w:color="F0F4F8" w:val="solid"/>
+          </w:tcPr>
+          <w:p>
+            <w:pPr>
+              <w:spacing w:after="40" w:before="40"/>
+            </w:pPr>
+            <w:r>
+              <w:rPr>
+                <w:b w:val="false"/>
+                <w:bCs w:val="false"/>
+                <w:color w:val="1D2D3E"/>
+                <w:sz w:val="20"/>
+                <w:szCs w:val="20"/>
+              </w:rPr>
+              <w:t xml:space="preserve">Session 5</w:t>
+            </w:r>
+          </w:p>
+        </w:tc>
+        <w:tc>
+          <w:tcPr>
+            <w:shd w:color="F0F4F8" w:val="solid"/>
+          </w:tcPr>
+          <w:p>
+            <w:pPr>
+              <w:spacing w:after="40" w:before="40"/>
+            </w:pPr>
+            <w:r>
+              <w:rPr>
+                <w:b w:val="false"/>
+                <w:bCs w:val="false"/>
+                <w:color w:val="1D2D3E"/>
+                <w:sz w:val="20"/>
+                <w:szCs w:val="20"/>
+              </w:rPr>
+              <w:t xml:space="preserve">Financial Reports Export (Share API)</w:t>
+            </w:r>
+          </w:p>
+        </w:tc>
+        <w:tc>
+          <w:tcPr>
+            <w:shd w:color="F0F4F8" w:val="solid"/>
+          </w:tcPr>
+          <w:p>
+            <w:pPr>
+              <w:spacing w:after="40" w:before="40"/>
+            </w:pPr>
+            <w:r>
+              <w:rPr>
+                <w:b w:val="false"/>
+                <w:bCs w:val="false"/>
+                <w:color w:val="1D2D3E"/>
+                <w:sz w:val="20"/>
+                <w:szCs w:val="20"/>
+              </w:rPr>
+              <w:t xml:space="preserve">Done</w:t>
+            </w:r>
+          </w:p>
+        </w:tc>
+        <w:tc>
+          <w:tcPr>
+            <w:shd w:color="F0F4F8" w:val="solid"/>
+          </w:tcPr>
+          <w:p>
+            <w:pPr>
+              <w:spacing w:after="40" w:before="40"/>
+            </w:pPr>
+            <w:r>
+              <w:rPr>
+                <w:b w:val="false"/>
+                <w:bCs w:val="false"/>
+                <w:color w:val="1D2D3E"/>
+                <w:sz w:val="20"/>
+                <w:szCs w:val="20"/>
+              </w:rPr>
+              <w:t xml:space="preserve">—</w:t>
+            </w:r>
+          </w:p>
+        </w:tc>
+      </w:tr>
+      <w:tr>
+        <w:tc>
+          <w:p>
+            <w:pPr>
+              <w:spacing w:after="40" w:before="40"/>
+            </w:pPr>
+            <w:r>
+              <w:rPr>
+                <w:b w:val="false"/>
+                <w:bCs w:val="false"/>
+                <w:color w:val="1D2D3E"/>
+                <w:sz w:val="20"/>
+                <w:szCs w:val="20"/>
+              </w:rPr>
+              <w:t xml:space="preserve">Session 5</w:t>
+            </w:r>
+          </w:p>
+        </w:tc>
+        <w:tc>
+          <w:p>
+            <w:pPr>
+              <w:spacing w:after="40" w:before="40"/>
+            </w:pPr>
+            <w:r>
+              <w:rPr>
+                <w:b w:val="false"/>
+                <w:bCs w:val="false"/>
+                <w:color w:val="1D2D3E"/>
+                <w:sz w:val="20"/>
+                <w:szCs w:val="20"/>
+              </w:rPr>
+              <w:t xml:space="preserve">Journal Entries Export (Share API)</w:t>
+            </w:r>
+          </w:p>
+        </w:tc>
+        <w:tc>
+          <w:p>
+            <w:pPr>
+              <w:spacing w:after="40" w:before="40"/>
+            </w:pPr>
+            <w:r>
+              <w:rPr>
+                <w:b w:val="false"/>
+                <w:bCs w:val="false"/>
+                <w:color w:val="1D2D3E"/>
+                <w:sz w:val="20"/>
+                <w:szCs w:val="20"/>
+              </w:rPr>
+              <w:t xml:space="preserve">Done</w:t>
+            </w:r>
+          </w:p>
+        </w:tc>
+        <w:tc>
+          <w:p>
+            <w:pPr>
+              <w:spacing w:after="40" w:before="40"/>
+            </w:pPr>
+            <w:r>
+              <w:rPr>
+                <w:b w:val="false"/>
+                <w:bCs w:val="false"/>
+                <w:color w:val="1D2D3E"/>
+                <w:sz w:val="20"/>
+                <w:szCs w:val="20"/>
+              </w:rPr>
+              <w:t xml:space="preserve">—</w:t>
+            </w:r>
+          </w:p>
+        </w:tc>
+      </w:tr>
     </w:tbl>
     <w:p>
       <w:pPr>
@@ -5821,7 +6385,7 @@
           <w:sz w:val="22"/>
           <w:szCs w:val="22"/>
         </w:rPr>
-        <w:t xml:space="preserve">inventory.ts — Stock balances and ledger</w:t>
+        <w:t xml:space="preserve">inventory.ts — Stock balances, ledger, and warehouses (Warehouse interface + fetchWarehouses)</w:t>
       </w:r>
     </w:p>
     <w:p>
@@ -7411,6 +7975,213 @@
           <w:szCs w:val="22"/>
         </w:rPr>
         <w:t xml:space="preserve">Back button header style: fixed AP, AR, Financial Reports headers to use flexDirection row</w:t>
+      </w:r>
+    </w:p>
+    <w:p>
+      <w:pPr>
+        <w:spacing w:after="80"/>
+      </w:pPr>
+      <w:r>
+        <w:rPr>
+          <w:color w:val="1D2D3E"/>
+          <w:sz w:val="22"/>
+          <w:szCs w:val="22"/>
+        </w:rPr>
+        <w:t xml:space="preserve"/>
+      </w:r>
+    </w:p>
+    <w:p>
+      <w:pPr>
+        <w:pStyle w:val="Heading2"/>
+        <w:spacing w:after="120" w:before="300"/>
+      </w:pPr>
+      <w:r>
+        <w:rPr>
+          <w:b/>
+          <w:bCs/>
+          <w:color w:val="1D2D3E"/>
+        </w:rPr>
+        <w:t xml:space="preserve">Session 5 — 2026-05-19</w:t>
+      </w:r>
+    </w:p>
+    <w:p>
+      <w:pPr>
+        <w:pStyle w:val="ListParagraph"/>
+        <w:numPr>
+          <w:ilvl w:val="0"/>
+          <w:numId w:val="1"/>
+        </w:numPr>
+        <w:spacing w:after="40"/>
+      </w:pPr>
+      <w:r>
+        <w:rPr>
+          <w:color w:val="1D2D3E"/>
+          <w:sz w:val="22"/>
+          <w:szCs w:val="22"/>
+        </w:rPr>
+        <w:t xml:space="preserve">Inventory: added 3rd Warehouses tab — card list showing name, code, type, address, active/inactive status</w:t>
+      </w:r>
+    </w:p>
+    <w:p>
+      <w:pPr>
+        <w:pStyle w:val="ListParagraph"/>
+        <w:numPr>
+          <w:ilvl w:val="0"/>
+          <w:numId w:val="1"/>
+        </w:numPr>
+        <w:spacing w:after="40"/>
+      </w:pPr>
+      <w:r>
+        <w:rPr>
+          <w:color w:val="1D2D3E"/>
+          <w:sz w:val="22"/>
+          <w:szCs w:val="22"/>
+        </w:rPr>
+        <w:t xml:space="preserve">Inventory: added fetchWarehouses() API function using ?view=warehouses endpoint</w:t>
+      </w:r>
+    </w:p>
+    <w:p>
+      <w:pPr>
+        <w:pStyle w:val="ListParagraph"/>
+        <w:numPr>
+          <w:ilvl w:val="0"/>
+          <w:numId w:val="1"/>
+        </w:numPr>
+        <w:spacing w:after="40"/>
+      </w:pPr>
+      <w:r>
+        <w:rPr>
+          <w:color w:val="1D2D3E"/>
+          <w:sz w:val="22"/>
+          <w:szCs w:val="22"/>
+        </w:rPr>
+        <w:t xml:space="preserve">Inventory: added date range filter panel on Stock Ledger tab with From/To inputs</w:t>
+      </w:r>
+    </w:p>
+    <w:p>
+      <w:pPr>
+        <w:pStyle w:val="ListParagraph"/>
+        <w:numPr>
+          <w:ilvl w:val="0"/>
+          <w:numId w:val="1"/>
+        </w:numPr>
+        <w:spacing w:after="40"/>
+      </w:pPr>
+      <w:r>
+        <w:rPr>
+          <w:color w:val="1D2D3E"/>
+          <w:sz w:val="22"/>
+          <w:szCs w:val="22"/>
+        </w:rPr>
+        <w:t xml:space="preserve">Inventory: date filter presets on Ledger: Today, This Week, This Month, Last Month</w:t>
+      </w:r>
+    </w:p>
+    <w:p>
+      <w:pPr>
+        <w:pStyle w:val="ListParagraph"/>
+        <w:numPr>
+          <w:ilvl w:val="0"/>
+          <w:numId w:val="1"/>
+        </w:numPr>
+        <w:spacing w:after="40"/>
+      </w:pPr>
+      <w:r>
+        <w:rPr>
+          <w:color w:val="1D2D3E"/>
+          <w:sz w:val="22"/>
+          <w:szCs w:val="22"/>
+        </w:rPr>
+        <w:t xml:space="preserve">Inventory: added Low Stock / Out of Stock filter chips on Stock Balances tab with live counts</w:t>
+      </w:r>
+    </w:p>
+    <w:p>
+      <w:pPr>
+        <w:pStyle w:val="ListParagraph"/>
+        <w:numPr>
+          <w:ilvl w:val="0"/>
+          <w:numId w:val="1"/>
+        </w:numPr>
+        <w:spacing w:after="40"/>
+      </w:pPr>
+      <w:r>
+        <w:rPr>
+          <w:color w:val="1D2D3E"/>
+          <w:sz w:val="22"/>
+          <w:szCs w:val="22"/>
+        </w:rPr>
+        <w:t xml:space="preserve">Inventory: low stock threshold = qty &lt; 100; out of stock = qty &lt;= 0; counts shown in chip labels</w:t>
+      </w:r>
+    </w:p>
+    <w:p>
+      <w:pPr>
+        <w:pStyle w:val="ListParagraph"/>
+        <w:numPr>
+          <w:ilvl w:val="0"/>
+          <w:numId w:val="1"/>
+        </w:numPr>
+        <w:spacing w:after="40"/>
+      </w:pPr>
+      <w:r>
+        <w:rPr>
+          <w:color w:val="1D2D3E"/>
+          <w:sz w:val="22"/>
+          <w:szCs w:val="22"/>
+        </w:rPr>
+        <w:t xml:space="preserve">Trial Balance: added Export button — shares formatted columnar text (Account | Debit | Credit) via Share API</w:t>
+      </w:r>
+    </w:p>
+    <w:p>
+      <w:pPr>
+        <w:pStyle w:val="ListParagraph"/>
+        <w:numPr>
+          <w:ilvl w:val="0"/>
+          <w:numId w:val="1"/>
+        </w:numPr>
+        <w:spacing w:after="40"/>
+      </w:pPr>
+      <w:r>
+        <w:rPr>
+          <w:color w:val="1D2D3E"/>
+          <w:sz w:val="22"/>
+          <w:szCs w:val="22"/>
+        </w:rPr>
+        <w:t xml:space="preserve">Trial Balance: export includes company name, as-of date, totals row, balanced/out-of-balance status</w:t>
+      </w:r>
+    </w:p>
+    <w:p>
+      <w:pPr>
+        <w:pStyle w:val="ListParagraph"/>
+        <w:numPr>
+          <w:ilvl w:val="0"/>
+          <w:numId w:val="1"/>
+        </w:numPr>
+        <w:spacing w:after="40"/>
+      </w:pPr>
+      <w:r>
+        <w:rPr>
+          <w:color w:val="1D2D3E"/>
+          <w:sz w:val="22"/>
+          <w:szCs w:val="22"/>
+        </w:rPr>
+        <w:t xml:space="preserve">Financial Reports: added Export button — shares P&amp;L or Balance Sheet as tab-delimited text</w:t>
+      </w:r>
+    </w:p>
+    <w:p>
+      <w:pPr>
+        <w:pStyle w:val="ListParagraph"/>
+        <w:numPr>
+          <w:ilvl w:val="0"/>
+          <w:numId w:val="1"/>
+        </w:numPr>
+        <w:spacing w:after="40"/>
+      </w:pPr>
+      <w:r>
+        <w:rPr>
+          <w:color w:val="1D2D3E"/>
+          <w:sz w:val="22"/>
+          <w:szCs w:val="22"/>
+        </w:rPr>
+        <w:t xml:space="preserve">Journal Entries: added Export button — shares filtered JE list with voucher lines as formatted text</w:t>
       </w:r>
     </w:p>
     <w:p>

</xml_diff>

<commit_message>
Session 6: update PROGRESS.md, FEATURES.docx, and generate-docs.js with Session 6 changelog
</commit_message>
<xml_diff>
--- a/FEATURES.docx
+++ b/FEATURES.docx
@@ -2496,6 +2496,24 @@
           <w:sz w:val="22"/>
           <w:szCs w:val="22"/>
         </w:rPr>
+        <w:t xml:space="preserve">Stock Balances: tappable cards — tap navigates to ItemLedgerScreen for that item (Session 6)</w:t>
+      </w:r>
+    </w:p>
+    <w:p>
+      <w:pPr>
+        <w:pStyle w:val="ListParagraph"/>
+        <w:numPr>
+          <w:ilvl w:val="0"/>
+          <w:numId w:val="1"/>
+        </w:numPr>
+        <w:spacing w:after="40"/>
+      </w:pPr>
+      <w:r>
+        <w:rPr>
+          <w:color w:val="1D2D3E"/>
+          <w:sz w:val="22"/>
+          <w:szCs w:val="22"/>
+        </w:rPr>
         <w:t xml:space="preserve">Stock Balances: All / Low Stock / Out of Stock filter chips with live counts (Session 5)</w:t>
       </w:r>
     </w:p>
@@ -2587,6 +2605,42 @@
           <w:szCs w:val="22"/>
         </w:rPr>
         <w:t xml:space="preserve">Pull-to-refresh, loading and empty states</w:t>
+      </w:r>
+    </w:p>
+    <w:p>
+      <w:pPr>
+        <w:pStyle w:val="ListParagraph"/>
+        <w:numPr>
+          <w:ilvl w:val="0"/>
+          <w:numId w:val="1"/>
+        </w:numPr>
+        <w:spacing w:after="40"/>
+      </w:pPr>
+      <w:r>
+        <w:rPr>
+          <w:color w:val="1D2D3E"/>
+          <w:sz w:val="22"/>
+          <w:szCs w:val="22"/>
+        </w:rPr>
+        <w:t xml:space="preserve">Offline caching: stock balances cached in AsyncStorage, served instantly on next open (Session 6)</w:t>
+      </w:r>
+    </w:p>
+    <w:p>
+      <w:pPr>
+        <w:pStyle w:val="ListParagraph"/>
+        <w:numPr>
+          <w:ilvl w:val="0"/>
+          <w:numId w:val="1"/>
+        </w:numPr>
+        <w:spacing w:after="40"/>
+      </w:pPr>
+      <w:r>
+        <w:rPr>
+          <w:color w:val="1D2D3E"/>
+          <w:sz w:val="22"/>
+          <w:szCs w:val="22"/>
+        </w:rPr>
+        <w:t xml:space="preserve">OfflineBanner shown when cached (stale) data is displayed (Session 6)</w:t>
       </w:r>
     </w:p>
     <w:p>
@@ -2613,61 +2667,115 @@
           <w:bCs/>
           <w:color w:val="1D2D3E"/>
         </w:rPr>
-        <w:t xml:space="preserve">3.11 Materials Screen (src/screens/materials/MaterialsScreen.tsx)</w:t>
-      </w:r>
-    </w:p>
-    <w:p>
-      <w:pPr>
-        <w:pStyle w:val="ListParagraph"/>
-        <w:numPr>
-          <w:ilvl w:val="0"/>
-          <w:numId w:val="1"/>
-        </w:numPr>
-        <w:spacing w:after="40"/>
-      </w:pPr>
-      <w:r>
-        <w:rPr>
-          <w:color w:val="1D2D3E"/>
-          <w:sz w:val="22"/>
-          <w:szCs w:val="22"/>
-        </w:rPr>
-        <w:t xml:space="preserve">Searchable list by name, code, type, category</w:t>
-      </w:r>
-    </w:p>
-    <w:p>
-      <w:pPr>
-        <w:pStyle w:val="ListParagraph"/>
-        <w:numPr>
-          <w:ilvl w:val="0"/>
-          <w:numId w:val="1"/>
-        </w:numPr>
-        <w:spacing w:after="40"/>
-      </w:pPr>
-      <w:r>
-        <w:rPr>
-          <w:color w:val="1D2D3E"/>
-          <w:sz w:val="22"/>
-          <w:szCs w:val="22"/>
-        </w:rPr>
-        <w:t xml:space="preserve">Horizontal type filter chips fetched from /api/mobile/materials?view=types</w:t>
-      </w:r>
-    </w:p>
-    <w:p>
-      <w:pPr>
-        <w:pStyle w:val="ListParagraph"/>
-        <w:numPr>
-          <w:ilvl w:val="0"/>
-          <w:numId w:val="1"/>
-        </w:numPr>
-        <w:spacing w:after="40"/>
-      </w:pPr>
-      <w:r>
-        <w:rPr>
-          <w:color w:val="1D2D3E"/>
-          <w:sz w:val="22"/>
-          <w:szCs w:val="22"/>
-        </w:rPr>
-        <w:t xml:space="preserve">Material cards: name, code, type badge, status badge (Active/Inactive), unit chip</w:t>
+        <w:t xml:space="preserve">3.10a Inventory Item Ledger Screen (src/screens/inventory/ItemLedgerScreen.tsx)</w:t>
+      </w:r>
+    </w:p>
+    <w:p>
+      <w:pPr>
+        <w:pStyle w:val="ListParagraph"/>
+        <w:numPr>
+          <w:ilvl w:val="0"/>
+          <w:numId w:val="1"/>
+        </w:numPr>
+        <w:spacing w:after="40"/>
+      </w:pPr>
+      <w:r>
+        <w:rPr>
+          <w:color w:val="1D2D3E"/>
+          <w:sz w:val="22"/>
+          <w:szCs w:val="22"/>
+        </w:rPr>
+        <w:t xml:space="preserve">New screen introduced in Session 6 — accessible by tapping a stock balance card</w:t>
+      </w:r>
+    </w:p>
+    <w:p>
+      <w:pPr>
+        <w:pStyle w:val="ListParagraph"/>
+        <w:numPr>
+          <w:ilvl w:val="0"/>
+          <w:numId w:val="1"/>
+        </w:numPr>
+        <w:spacing w:after="40"/>
+      </w:pPr>
+      <w:r>
+        <w:rPr>
+          <w:color w:val="1D2D3E"/>
+          <w:sz w:val="22"/>
+          <w:szCs w:val="22"/>
+        </w:rPr>
+        <w:t xml:space="preserve">Shows full movement history (IN/OUT/balance) for a single inventory item</w:t>
+      </w:r>
+    </w:p>
+    <w:p>
+      <w:pPr>
+        <w:pStyle w:val="ListParagraph"/>
+        <w:numPr>
+          <w:ilvl w:val="0"/>
+          <w:numId w:val="1"/>
+        </w:numPr>
+        <w:spacing w:after="40"/>
+      </w:pPr>
+      <w:r>
+        <w:rPr>
+          <w:color w:val="1D2D3E"/>
+          <w:sz w:val="22"/>
+          <w:szCs w:val="22"/>
+        </w:rPr>
+        <w:t xml:space="preserve">Summary bar: total qty in, total qty out, current balance with color coding</w:t>
+      </w:r>
+    </w:p>
+    <w:p>
+      <w:pPr>
+        <w:pStyle w:val="ListParagraph"/>
+        <w:numPr>
+          <w:ilvl w:val="0"/>
+          <w:numId w:val="1"/>
+        </w:numPr>
+        <w:spacing w:after="40"/>
+      </w:pPr>
+      <w:r>
+        <w:rPr>
+          <w:color w:val="1D2D3E"/>
+          <w:sz w:val="22"/>
+          <w:szCs w:val="22"/>
+        </w:rPr>
+        <w:t xml:space="preserve">Date range filter panel with quick presets (Today, This Week, This Month, Last Month)</w:t>
+      </w:r>
+    </w:p>
+    <w:p>
+      <w:pPr>
+        <w:pStyle w:val="ListParagraph"/>
+        <w:numPr>
+          <w:ilvl w:val="0"/>
+          <w:numId w:val="1"/>
+        </w:numPr>
+        <w:spacing w:after="40"/>
+      </w:pPr>
+      <w:r>
+        <w:rPr>
+          <w:color w:val="1D2D3E"/>
+          <w:sz w:val="22"/>
+          <w:szCs w:val="22"/>
+        </w:rPr>
+        <w:t xml:space="preserve">Voucher type badges (GRN, SRN, ADJ, TRN, INV) with color coding</w:t>
+      </w:r>
+    </w:p>
+    <w:p>
+      <w:pPr>
+        <w:pStyle w:val="ListParagraph"/>
+        <w:numPr>
+          <w:ilvl w:val="0"/>
+          <w:numId w:val="1"/>
+        </w:numPr>
+        <w:spacing w:after="40"/>
+      </w:pPr>
+      <w:r>
+        <w:rPr>
+          <w:color w:val="1D2D3E"/>
+          <w:sz w:val="22"/>
+          <w:szCs w:val="22"/>
+        </w:rPr>
+        <w:t xml:space="preserve">Pull-to-refresh and empty state with clear-filter CTA</w:t>
       </w:r>
     </w:p>
     <w:p>
@@ -2694,61 +2802,61 @@
           <w:bCs/>
           <w:color w:val="1D2D3E"/>
         </w:rPr>
-        <w:t xml:space="preserve">3.12 Purchase Orders Screen (src/screens/purchaseOrders/)</w:t>
-      </w:r>
-    </w:p>
-    <w:p>
-      <w:pPr>
-        <w:pStyle w:val="ListParagraph"/>
-        <w:numPr>
-          <w:ilvl w:val="0"/>
-          <w:numId w:val="1"/>
-        </w:numPr>
-        <w:spacing w:after="40"/>
-      </w:pPr>
-      <w:r>
-        <w:rPr>
-          <w:color w:val="1D2D3E"/>
-          <w:sz w:val="22"/>
-          <w:szCs w:val="22"/>
-        </w:rPr>
-        <w:t xml:space="preserve">Three status tabs: All / Open / In Progress</w:t>
-      </w:r>
-    </w:p>
-    <w:p>
-      <w:pPr>
-        <w:pStyle w:val="ListParagraph"/>
-        <w:numPr>
-          <w:ilvl w:val="0"/>
-          <w:numId w:val="1"/>
-        </w:numPr>
-        <w:spacing w:after="40"/>
-      </w:pPr>
-      <w:r>
-        <w:rPr>
-          <w:color w:val="1D2D3E"/>
-          <w:sz w:val="22"/>
-          <w:szCs w:val="22"/>
-        </w:rPr>
-        <w:t xml:space="preserve">PO cards with: PO number, vendor, date, status badge, total amount, progress bar</w:t>
-      </w:r>
-    </w:p>
-    <w:p>
-      <w:pPr>
-        <w:pStyle w:val="ListParagraph"/>
-        <w:numPr>
-          <w:ilvl w:val="0"/>
-          <w:numId w:val="1"/>
-        </w:numPr>
-        <w:spacing w:after="40"/>
-      </w:pPr>
-      <w:r>
-        <w:rPr>
-          <w:color w:val="1D2D3E"/>
-          <w:sz w:val="22"/>
-          <w:szCs w:val="22"/>
-        </w:rPr>
-        <w:t xml:space="preserve">Detail screen: PO header, receipt progress bar, line items with qty ordered/received/pending</w:t>
+        <w:t xml:space="preserve">3.11 Materials Screen (src/screens/materials/MaterialsScreen.tsx)</w:t>
+      </w:r>
+    </w:p>
+    <w:p>
+      <w:pPr>
+        <w:pStyle w:val="ListParagraph"/>
+        <w:numPr>
+          <w:ilvl w:val="0"/>
+          <w:numId w:val="1"/>
+        </w:numPr>
+        <w:spacing w:after="40"/>
+      </w:pPr>
+      <w:r>
+        <w:rPr>
+          <w:color w:val="1D2D3E"/>
+          <w:sz w:val="22"/>
+          <w:szCs w:val="22"/>
+        </w:rPr>
+        <w:t xml:space="preserve">Searchable list by name, code, type, category</w:t>
+      </w:r>
+    </w:p>
+    <w:p>
+      <w:pPr>
+        <w:pStyle w:val="ListParagraph"/>
+        <w:numPr>
+          <w:ilvl w:val="0"/>
+          <w:numId w:val="1"/>
+        </w:numPr>
+        <w:spacing w:after="40"/>
+      </w:pPr>
+      <w:r>
+        <w:rPr>
+          <w:color w:val="1D2D3E"/>
+          <w:sz w:val="22"/>
+          <w:szCs w:val="22"/>
+        </w:rPr>
+        <w:t xml:space="preserve">Horizontal type filter chips fetched from /api/mobile/materials?view=types</w:t>
+      </w:r>
+    </w:p>
+    <w:p>
+      <w:pPr>
+        <w:pStyle w:val="ListParagraph"/>
+        <w:numPr>
+          <w:ilvl w:val="0"/>
+          <w:numId w:val="1"/>
+        </w:numPr>
+        <w:spacing w:after="40"/>
+      </w:pPr>
+      <w:r>
+        <w:rPr>
+          <w:color w:val="1D2D3E"/>
+          <w:sz w:val="22"/>
+          <w:szCs w:val="22"/>
+        </w:rPr>
+        <w:t xml:space="preserve">Material cards: name, code, type badge, status badge (Active/Inactive), unit chip</w:t>
       </w:r>
     </w:p>
     <w:p>
@@ -2775,61 +2883,61 @@
           <w:bCs/>
           <w:color w:val="1D2D3E"/>
         </w:rPr>
-        <w:t xml:space="preserve">3.13 Sales Orders Screen (src/screens/salesOrders/)</w:t>
-      </w:r>
-    </w:p>
-    <w:p>
-      <w:pPr>
-        <w:pStyle w:val="ListParagraph"/>
-        <w:numPr>
-          <w:ilvl w:val="0"/>
-          <w:numId w:val="1"/>
-        </w:numPr>
-        <w:spacing w:after="40"/>
-      </w:pPr>
-      <w:r>
-        <w:rPr>
-          <w:color w:val="1D2D3E"/>
-          <w:sz w:val="22"/>
-          <w:szCs w:val="22"/>
-        </w:rPr>
-        <w:t xml:space="preserve">Four status tabs: All / Open / Approved / Closed</w:t>
-      </w:r>
-    </w:p>
-    <w:p>
-      <w:pPr>
-        <w:pStyle w:val="ListParagraph"/>
-        <w:numPr>
-          <w:ilvl w:val="0"/>
-          <w:numId w:val="1"/>
-        </w:numPr>
-        <w:spacing w:after="40"/>
-      </w:pPr>
-      <w:r>
-        <w:rPr>
-          <w:color w:val="1D2D3E"/>
-          <w:sz w:val="22"/>
-          <w:szCs w:val="22"/>
-        </w:rPr>
-        <w:t xml:space="preserve">SO cards with: SO number, customer, date, status badge, total amount</w:t>
-      </w:r>
-    </w:p>
-    <w:p>
-      <w:pPr>
-        <w:pStyle w:val="ListParagraph"/>
-        <w:numPr>
-          <w:ilvl w:val="0"/>
-          <w:numId w:val="1"/>
-        </w:numPr>
-        <w:spacing w:after="40"/>
-      </w:pPr>
-      <w:r>
-        <w:rPr>
-          <w:color w:val="1D2D3E"/>
-          <w:sz w:val="22"/>
-          <w:szCs w:val="22"/>
-        </w:rPr>
-        <w:t xml:space="preserve">Detail screen: SO header, line items list, total row</w:t>
+        <w:t xml:space="preserve">3.12 Purchase Orders Screen (src/screens/purchaseOrders/)</w:t>
+      </w:r>
+    </w:p>
+    <w:p>
+      <w:pPr>
+        <w:pStyle w:val="ListParagraph"/>
+        <w:numPr>
+          <w:ilvl w:val="0"/>
+          <w:numId w:val="1"/>
+        </w:numPr>
+        <w:spacing w:after="40"/>
+      </w:pPr>
+      <w:r>
+        <w:rPr>
+          <w:color w:val="1D2D3E"/>
+          <w:sz w:val="22"/>
+          <w:szCs w:val="22"/>
+        </w:rPr>
+        <w:t xml:space="preserve">Three status tabs: All / Open / In Progress</w:t>
+      </w:r>
+    </w:p>
+    <w:p>
+      <w:pPr>
+        <w:pStyle w:val="ListParagraph"/>
+        <w:numPr>
+          <w:ilvl w:val="0"/>
+          <w:numId w:val="1"/>
+        </w:numPr>
+        <w:spacing w:after="40"/>
+      </w:pPr>
+      <w:r>
+        <w:rPr>
+          <w:color w:val="1D2D3E"/>
+          <w:sz w:val="22"/>
+          <w:szCs w:val="22"/>
+        </w:rPr>
+        <w:t xml:space="preserve">PO cards with: PO number, vendor, date, status badge, total amount, progress bar</w:t>
+      </w:r>
+    </w:p>
+    <w:p>
+      <w:pPr>
+        <w:pStyle w:val="ListParagraph"/>
+        <w:numPr>
+          <w:ilvl w:val="0"/>
+          <w:numId w:val="1"/>
+        </w:numPr>
+        <w:spacing w:after="40"/>
+      </w:pPr>
+      <w:r>
+        <w:rPr>
+          <w:color w:val="1D2D3E"/>
+          <w:sz w:val="22"/>
+          <w:szCs w:val="22"/>
+        </w:rPr>
+        <w:t xml:space="preserve">Detail screen: PO header, receipt progress bar, line items with qty ordered/received/pending</w:t>
       </w:r>
     </w:p>
     <w:p>
@@ -2856,79 +2964,61 @@
           <w:bCs/>
           <w:color w:val="1D2D3E"/>
         </w:rPr>
-        <w:t xml:space="preserve">3.14 GRN Screen (src/screens/grn/GRNScreen.tsx)</w:t>
-      </w:r>
-    </w:p>
-    <w:p>
-      <w:pPr>
-        <w:pStyle w:val="ListParagraph"/>
-        <w:numPr>
-          <w:ilvl w:val="0"/>
-          <w:numId w:val="1"/>
-        </w:numPr>
-        <w:spacing w:after="40"/>
-      </w:pPr>
-      <w:r>
-        <w:rPr>
-          <w:color w:val="1D2D3E"/>
-          <w:sz w:val="22"/>
-          <w:szCs w:val="22"/>
-        </w:rPr>
-        <w:t xml:space="preserve">Goods receipt progress view per purchase order</w:t>
-      </w:r>
-    </w:p>
-    <w:p>
-      <w:pPr>
-        <w:pStyle w:val="ListParagraph"/>
-        <w:numPr>
-          <w:ilvl w:val="0"/>
-          <w:numId w:val="1"/>
-        </w:numPr>
-        <w:spacing w:after="40"/>
-      </w:pPr>
-      <w:r>
-        <w:rPr>
-          <w:color w:val="1D2D3E"/>
-          <w:sz w:val="22"/>
-          <w:szCs w:val="22"/>
-        </w:rPr>
-        <w:t xml:space="preserve">Overall summary card: PO count, overall % received, progress bar</w:t>
-      </w:r>
-    </w:p>
-    <w:p>
-      <w:pPr>
-        <w:pStyle w:val="ListParagraph"/>
-        <w:numPr>
-          <w:ilvl w:val="0"/>
-          <w:numId w:val="1"/>
-        </w:numPr>
-        <w:spacing w:after="40"/>
-      </w:pPr>
-      <w:r>
-        <w:rPr>
-          <w:color w:val="1D2D3E"/>
-          <w:sz w:val="22"/>
-          <w:szCs w:val="22"/>
-        </w:rPr>
-        <w:t xml:space="preserve">Per-PO cards: receipt progress, optional line item preview</w:t>
-      </w:r>
-    </w:p>
-    <w:p>
-      <w:pPr>
-        <w:pStyle w:val="ListParagraph"/>
-        <w:numPr>
-          <w:ilvl w:val="0"/>
-          <w:numId w:val="1"/>
-        </w:numPr>
-        <w:spacing w:after="40"/>
-      </w:pPr>
-      <w:r>
-        <w:rPr>
-          <w:color w:val="1D2D3E"/>
-          <w:sz w:val="22"/>
-          <w:szCs w:val="22"/>
-        </w:rPr>
-        <w:t xml:space="preserve">Tappable cards navigate to PO Detail screen (Session 4)</w:t>
+        <w:t xml:space="preserve">3.13 Sales Orders Screen (src/screens/salesOrders/)</w:t>
+      </w:r>
+    </w:p>
+    <w:p>
+      <w:pPr>
+        <w:pStyle w:val="ListParagraph"/>
+        <w:numPr>
+          <w:ilvl w:val="0"/>
+          <w:numId w:val="1"/>
+        </w:numPr>
+        <w:spacing w:after="40"/>
+      </w:pPr>
+      <w:r>
+        <w:rPr>
+          <w:color w:val="1D2D3E"/>
+          <w:sz w:val="22"/>
+          <w:szCs w:val="22"/>
+        </w:rPr>
+        <w:t xml:space="preserve">Four status tabs: All / Open / Approved / Closed</w:t>
+      </w:r>
+    </w:p>
+    <w:p>
+      <w:pPr>
+        <w:pStyle w:val="ListParagraph"/>
+        <w:numPr>
+          <w:ilvl w:val="0"/>
+          <w:numId w:val="1"/>
+        </w:numPr>
+        <w:spacing w:after="40"/>
+      </w:pPr>
+      <w:r>
+        <w:rPr>
+          <w:color w:val="1D2D3E"/>
+          <w:sz w:val="22"/>
+          <w:szCs w:val="22"/>
+        </w:rPr>
+        <w:t xml:space="preserve">SO cards with: SO number, customer, date, status badge, total amount</w:t>
+      </w:r>
+    </w:p>
+    <w:p>
+      <w:pPr>
+        <w:pStyle w:val="ListParagraph"/>
+        <w:numPr>
+          <w:ilvl w:val="0"/>
+          <w:numId w:val="1"/>
+        </w:numPr>
+        <w:spacing w:after="40"/>
+      </w:pPr>
+      <w:r>
+        <w:rPr>
+          <w:color w:val="1D2D3E"/>
+          <w:sz w:val="22"/>
+          <w:szCs w:val="22"/>
+        </w:rPr>
+        <w:t xml:space="preserve">Detail screen: SO header, line items list, total row</w:t>
       </w:r>
     </w:p>
     <w:p>
@@ -2955,79 +3045,79 @@
           <w:bCs/>
           <w:color w:val="1D2D3E"/>
         </w:rPr>
-        <w:t xml:space="preserve">3.15 Accounts Payable Screen (src/screens/finance/AccountsPayableScreen.tsx)</w:t>
-      </w:r>
-    </w:p>
-    <w:p>
-      <w:pPr>
-        <w:pStyle w:val="ListParagraph"/>
-        <w:numPr>
-          <w:ilvl w:val="0"/>
-          <w:numId w:val="1"/>
-        </w:numPr>
-        <w:spacing w:after="40"/>
-      </w:pPr>
-      <w:r>
-        <w:rPr>
-          <w:color w:val="1D2D3E"/>
-          <w:sz w:val="22"/>
-          <w:szCs w:val="22"/>
-        </w:rPr>
-        <w:t xml:space="preserve">Three tabs: Summary / Bills / Vendors</w:t>
-      </w:r>
-    </w:p>
-    <w:p>
-      <w:pPr>
-        <w:pStyle w:val="ListParagraph"/>
-        <w:numPr>
-          <w:ilvl w:val="0"/>
-          <w:numId w:val="1"/>
-        </w:numPr>
-        <w:spacing w:after="40"/>
-      </w:pPr>
-      <w:r>
-        <w:rPr>
-          <w:color w:val="1D2D3E"/>
-          <w:sz w:val="22"/>
-          <w:szCs w:val="22"/>
-        </w:rPr>
-        <w:t xml:space="preserve">Summary: KPI cards (outstanding, overdue, vendor count, bill count) + aging analysis bars</w:t>
-      </w:r>
-    </w:p>
-    <w:p>
-      <w:pPr>
-        <w:pStyle w:val="ListParagraph"/>
-        <w:numPr>
-          <w:ilvl w:val="0"/>
-          <w:numId w:val="1"/>
-        </w:numPr>
-        <w:spacing w:after="40"/>
-      </w:pPr>
-      <w:r>
-        <w:rPr>
-          <w:color w:val="1D2D3E"/>
-          <w:sz w:val="22"/>
-          <w:szCs w:val="22"/>
-        </w:rPr>
-        <w:t xml:space="preserve">Bills: bill cards with status, amounts, due date + search by number/vendor/status (Session 4)</w:t>
-      </w:r>
-    </w:p>
-    <w:p>
-      <w:pPr>
-        <w:pStyle w:val="ListParagraph"/>
-        <w:numPr>
-          <w:ilvl w:val="0"/>
-          <w:numId w:val="1"/>
-        </w:numPr>
-        <w:spacing w:after="40"/>
-      </w:pPr>
-      <w:r>
-        <w:rPr>
-          <w:color w:val="1D2D3E"/>
-          <w:sz w:val="22"/>
-          <w:szCs w:val="22"/>
-        </w:rPr>
-        <w:t xml:space="preserve">Vendors: vendor cards with outstanding/overdue balances + search by name (Session 4)</w:t>
+        <w:t xml:space="preserve">3.14 GRN Screen (src/screens/grn/GRNScreen.tsx)</w:t>
+      </w:r>
+    </w:p>
+    <w:p>
+      <w:pPr>
+        <w:pStyle w:val="ListParagraph"/>
+        <w:numPr>
+          <w:ilvl w:val="0"/>
+          <w:numId w:val="1"/>
+        </w:numPr>
+        <w:spacing w:after="40"/>
+      </w:pPr>
+      <w:r>
+        <w:rPr>
+          <w:color w:val="1D2D3E"/>
+          <w:sz w:val="22"/>
+          <w:szCs w:val="22"/>
+        </w:rPr>
+        <w:t xml:space="preserve">Goods receipt progress view per purchase order</w:t>
+      </w:r>
+    </w:p>
+    <w:p>
+      <w:pPr>
+        <w:pStyle w:val="ListParagraph"/>
+        <w:numPr>
+          <w:ilvl w:val="0"/>
+          <w:numId w:val="1"/>
+        </w:numPr>
+        <w:spacing w:after="40"/>
+      </w:pPr>
+      <w:r>
+        <w:rPr>
+          <w:color w:val="1D2D3E"/>
+          <w:sz w:val="22"/>
+          <w:szCs w:val="22"/>
+        </w:rPr>
+        <w:t xml:space="preserve">Overall summary card: PO count, overall % received, progress bar</w:t>
+      </w:r>
+    </w:p>
+    <w:p>
+      <w:pPr>
+        <w:pStyle w:val="ListParagraph"/>
+        <w:numPr>
+          <w:ilvl w:val="0"/>
+          <w:numId w:val="1"/>
+        </w:numPr>
+        <w:spacing w:after="40"/>
+      </w:pPr>
+      <w:r>
+        <w:rPr>
+          <w:color w:val="1D2D3E"/>
+          <w:sz w:val="22"/>
+          <w:szCs w:val="22"/>
+        </w:rPr>
+        <w:t xml:space="preserve">Per-PO cards: receipt progress, optional line item preview</w:t>
+      </w:r>
+    </w:p>
+    <w:p>
+      <w:pPr>
+        <w:pStyle w:val="ListParagraph"/>
+        <w:numPr>
+          <w:ilvl w:val="0"/>
+          <w:numId w:val="1"/>
+        </w:numPr>
+        <w:spacing w:after="40"/>
+      </w:pPr>
+      <w:r>
+        <w:rPr>
+          <w:color w:val="1D2D3E"/>
+          <w:sz w:val="22"/>
+          <w:szCs w:val="22"/>
+        </w:rPr>
+        <w:t xml:space="preserve">Tappable cards navigate to PO Detail screen (Session 4)</w:t>
       </w:r>
     </w:p>
     <w:p>
@@ -3054,79 +3144,97 @@
           <w:bCs/>
           <w:color w:val="1D2D3E"/>
         </w:rPr>
-        <w:t xml:space="preserve">3.16 Accounts Receivable Screen (src/screens/finance/AccountsReceivableScreen.tsx)</w:t>
-      </w:r>
-    </w:p>
-    <w:p>
-      <w:pPr>
-        <w:pStyle w:val="ListParagraph"/>
-        <w:numPr>
-          <w:ilvl w:val="0"/>
-          <w:numId w:val="1"/>
-        </w:numPr>
-        <w:spacing w:after="40"/>
-      </w:pPr>
-      <w:r>
-        <w:rPr>
-          <w:color w:val="1D2D3E"/>
-          <w:sz w:val="22"/>
-          <w:szCs w:val="22"/>
-        </w:rPr>
-        <w:t xml:space="preserve">Three tabs: Summary / Invoices / Customers</w:t>
-      </w:r>
-    </w:p>
-    <w:p>
-      <w:pPr>
-        <w:pStyle w:val="ListParagraph"/>
-        <w:numPr>
-          <w:ilvl w:val="0"/>
-          <w:numId w:val="1"/>
-        </w:numPr>
-        <w:spacing w:after="40"/>
-      </w:pPr>
-      <w:r>
-        <w:rPr>
-          <w:color w:val="1D2D3E"/>
-          <w:sz w:val="22"/>
-          <w:szCs w:val="22"/>
-        </w:rPr>
-        <w:t xml:space="preserve">Summary: KPI cards + aging analysis bars (same pattern as AP)</w:t>
-      </w:r>
-    </w:p>
-    <w:p>
-      <w:pPr>
-        <w:pStyle w:val="ListParagraph"/>
-        <w:numPr>
-          <w:ilvl w:val="0"/>
-          <w:numId w:val="1"/>
-        </w:numPr>
-        <w:spacing w:after="40"/>
-      </w:pPr>
-      <w:r>
-        <w:rPr>
-          <w:color w:val="1D2D3E"/>
-          <w:sz w:val="22"/>
-          <w:szCs w:val="22"/>
-        </w:rPr>
-        <w:t xml:space="preserve">Invoices: invoice cards with outstanding amounts + search by number/customer/status (Session 4)</w:t>
-      </w:r>
-    </w:p>
-    <w:p>
-      <w:pPr>
-        <w:pStyle w:val="ListParagraph"/>
-        <w:numPr>
-          <w:ilvl w:val="0"/>
-          <w:numId w:val="1"/>
-        </w:numPr>
-        <w:spacing w:after="40"/>
-      </w:pPr>
-      <w:r>
-        <w:rPr>
-          <w:color w:val="1D2D3E"/>
-          <w:sz w:val="22"/>
-          <w:szCs w:val="22"/>
-        </w:rPr>
-        <w:t xml:space="preserve">Customers: customer cards with outstanding/overdue balances + search by name (Session 4)</w:t>
+        <w:t xml:space="preserve">3.15 Accounts Payable Screen (src/screens/finance/AccountsPayableScreen.tsx)</w:t>
+      </w:r>
+    </w:p>
+    <w:p>
+      <w:pPr>
+        <w:pStyle w:val="ListParagraph"/>
+        <w:numPr>
+          <w:ilvl w:val="0"/>
+          <w:numId w:val="1"/>
+        </w:numPr>
+        <w:spacing w:after="40"/>
+      </w:pPr>
+      <w:r>
+        <w:rPr>
+          <w:color w:val="1D2D3E"/>
+          <w:sz w:val="22"/>
+          <w:szCs w:val="22"/>
+        </w:rPr>
+        <w:t xml:space="preserve">Three tabs: Summary / Bills / Vendors</w:t>
+      </w:r>
+    </w:p>
+    <w:p>
+      <w:pPr>
+        <w:pStyle w:val="ListParagraph"/>
+        <w:numPr>
+          <w:ilvl w:val="0"/>
+          <w:numId w:val="1"/>
+        </w:numPr>
+        <w:spacing w:after="40"/>
+      </w:pPr>
+      <w:r>
+        <w:rPr>
+          <w:color w:val="1D2D3E"/>
+          <w:sz w:val="22"/>
+          <w:szCs w:val="22"/>
+        </w:rPr>
+        <w:t xml:space="preserve">Summary: KPI cards (outstanding, overdue, vendor count, bill count) + aging analysis bars</w:t>
+      </w:r>
+    </w:p>
+    <w:p>
+      <w:pPr>
+        <w:pStyle w:val="ListParagraph"/>
+        <w:numPr>
+          <w:ilvl w:val="0"/>
+          <w:numId w:val="1"/>
+        </w:numPr>
+        <w:spacing w:after="40"/>
+      </w:pPr>
+      <w:r>
+        <w:rPr>
+          <w:color w:val="1D2D3E"/>
+          <w:sz w:val="22"/>
+          <w:szCs w:val="22"/>
+        </w:rPr>
+        <w:t xml:space="preserve">Bills: bill cards with status, amounts, due date + search by number/vendor/status (Session 4)</w:t>
+      </w:r>
+    </w:p>
+    <w:p>
+      <w:pPr>
+        <w:pStyle w:val="ListParagraph"/>
+        <w:numPr>
+          <w:ilvl w:val="0"/>
+          <w:numId w:val="1"/>
+        </w:numPr>
+        <w:spacing w:after="40"/>
+      </w:pPr>
+      <w:r>
+        <w:rPr>
+          <w:color w:val="1D2D3E"/>
+          <w:sz w:val="22"/>
+          <w:szCs w:val="22"/>
+        </w:rPr>
+        <w:t xml:space="preserve">Bills: overdue bills sorted to top, tab badge shows overdue count, red left border + banner (Session 6)</w:t>
+      </w:r>
+    </w:p>
+    <w:p>
+      <w:pPr>
+        <w:pStyle w:val="ListParagraph"/>
+        <w:numPr>
+          <w:ilvl w:val="0"/>
+          <w:numId w:val="1"/>
+        </w:numPr>
+        <w:spacing w:after="40"/>
+      </w:pPr>
+      <w:r>
+        <w:rPr>
+          <w:color w:val="1D2D3E"/>
+          <w:sz w:val="22"/>
+          <w:szCs w:val="22"/>
+        </w:rPr>
+        <w:t xml:space="preserve">Vendors: vendor cards with outstanding/overdue balances + search by name (Session 4)</w:t>
       </w:r>
     </w:p>
     <w:p>
@@ -3153,133 +3261,97 @@
           <w:bCs/>
           <w:color w:val="1D2D3E"/>
         </w:rPr>
-        <w:t xml:space="preserve">3.17 Journal Entries Screen (src/screens/journalEntries/JournalEntriesScreen.tsx)</w:t>
-      </w:r>
-    </w:p>
-    <w:p>
-      <w:pPr>
-        <w:pStyle w:val="ListParagraph"/>
-        <w:numPr>
-          <w:ilvl w:val="0"/>
-          <w:numId w:val="1"/>
-        </w:numPr>
-        <w:spacing w:after="40"/>
-      </w:pPr>
-      <w:r>
-        <w:rPr>
-          <w:color w:val="1D2D3E"/>
-          <w:sz w:val="22"/>
-          <w:szCs w:val="22"/>
-        </w:rPr>
-        <w:t xml:space="preserve">Searchable list: voucher number, narration</w:t>
-      </w:r>
-    </w:p>
-    <w:p>
-      <w:pPr>
-        <w:pStyle w:val="ListParagraph"/>
-        <w:numPr>
-          <w:ilvl w:val="0"/>
-          <w:numId w:val="1"/>
-        </w:numPr>
-        <w:spacing w:after="40"/>
-      </w:pPr>
-      <w:r>
-        <w:rPr>
-          <w:color w:val="1D2D3E"/>
-          <w:sz w:val="22"/>
-          <w:szCs w:val="22"/>
-        </w:rPr>
-        <w:t xml:space="preserve">Voucher type filter chips (JV, GRN, PAY, REC, INV, SO, PO, DN)</w:t>
-      </w:r>
-    </w:p>
-    <w:p>
-      <w:pPr>
-        <w:pStyle w:val="ListParagraph"/>
-        <w:numPr>
-          <w:ilvl w:val="0"/>
-          <w:numId w:val="1"/>
-        </w:numPr>
-        <w:spacing w:after="40"/>
-      </w:pPr>
-      <w:r>
-        <w:rPr>
-          <w:color w:val="1D2D3E"/>
-          <w:sz w:val="22"/>
-          <w:szCs w:val="22"/>
-        </w:rPr>
-        <w:t xml:space="preserve">Cards with colored type badge, status badge (POSTED/DRAFT/VOID), debit/credit totals</w:t>
-      </w:r>
-    </w:p>
-    <w:p>
-      <w:pPr>
-        <w:pStyle w:val="ListParagraph"/>
-        <w:numPr>
-          <w:ilvl w:val="0"/>
-          <w:numId w:val="1"/>
-        </w:numPr>
-        <w:spacing w:after="40"/>
-      </w:pPr>
-      <w:r>
-        <w:rPr>
-          <w:color w:val="1D2D3E"/>
-          <w:sz w:val="22"/>
-          <w:szCs w:val="22"/>
-        </w:rPr>
-        <w:t xml:space="preserve">Expandable cards reveal journal lines (account, debit, credit)</w:t>
-      </w:r>
-    </w:p>
-    <w:p>
-      <w:pPr>
-        <w:pStyle w:val="ListParagraph"/>
-        <w:numPr>
-          <w:ilvl w:val="0"/>
-          <w:numId w:val="1"/>
-        </w:numPr>
-        <w:spacing w:after="40"/>
-      </w:pPr>
-      <w:r>
-        <w:rPr>
-          <w:color w:val="1D2D3E"/>
-          <w:sz w:val="22"/>
-          <w:szCs w:val="22"/>
-        </w:rPr>
-        <w:t xml:space="preserve">Date range filter with From/To inputs (YYYY-MM-DD) — server-side filtering (Session 4)</w:t>
-      </w:r>
-    </w:p>
-    <w:p>
-      <w:pPr>
-        <w:pStyle w:val="ListParagraph"/>
-        <w:numPr>
-          <w:ilvl w:val="0"/>
-          <w:numId w:val="1"/>
-        </w:numPr>
-        <w:spacing w:after="40"/>
-      </w:pPr>
-      <w:r>
-        <w:rPr>
-          <w:color w:val="1D2D3E"/>
-          <w:sz w:val="22"/>
-          <w:szCs w:val="22"/>
-        </w:rPr>
-        <w:t xml:space="preserve">Quick date presets: Today, This Week, This Month, Last Month (Session 4)</w:t>
-      </w:r>
-    </w:p>
-    <w:p>
-      <w:pPr>
-        <w:pStyle w:val="ListParagraph"/>
-        <w:numPr>
-          <w:ilvl w:val="0"/>
-          <w:numId w:val="1"/>
-        </w:numPr>
-        <w:spacing w:after="40"/>
-      </w:pPr>
-      <w:r>
-        <w:rPr>
-          <w:color w:val="1D2D3E"/>
-          <w:sz w:val="22"/>
-          <w:szCs w:val="22"/>
-        </w:rPr>
-        <w:t xml:space="preserve">Export button: shares filtered entries as formatted text via Share API (Session 5)</w:t>
+        <w:t xml:space="preserve">3.16 Accounts Receivable Screen (src/screens/finance/AccountsReceivableScreen.tsx)</w:t>
+      </w:r>
+    </w:p>
+    <w:p>
+      <w:pPr>
+        <w:pStyle w:val="ListParagraph"/>
+        <w:numPr>
+          <w:ilvl w:val="0"/>
+          <w:numId w:val="1"/>
+        </w:numPr>
+        <w:spacing w:after="40"/>
+      </w:pPr>
+      <w:r>
+        <w:rPr>
+          <w:color w:val="1D2D3E"/>
+          <w:sz w:val="22"/>
+          <w:szCs w:val="22"/>
+        </w:rPr>
+        <w:t xml:space="preserve">Three tabs: Summary / Invoices / Customers</w:t>
+      </w:r>
+    </w:p>
+    <w:p>
+      <w:pPr>
+        <w:pStyle w:val="ListParagraph"/>
+        <w:numPr>
+          <w:ilvl w:val="0"/>
+          <w:numId w:val="1"/>
+        </w:numPr>
+        <w:spacing w:after="40"/>
+      </w:pPr>
+      <w:r>
+        <w:rPr>
+          <w:color w:val="1D2D3E"/>
+          <w:sz w:val="22"/>
+          <w:szCs w:val="22"/>
+        </w:rPr>
+        <w:t xml:space="preserve">Summary: KPI cards + aging analysis bars (same pattern as AP)</w:t>
+      </w:r>
+    </w:p>
+    <w:p>
+      <w:pPr>
+        <w:pStyle w:val="ListParagraph"/>
+        <w:numPr>
+          <w:ilvl w:val="0"/>
+          <w:numId w:val="1"/>
+        </w:numPr>
+        <w:spacing w:after="40"/>
+      </w:pPr>
+      <w:r>
+        <w:rPr>
+          <w:color w:val="1D2D3E"/>
+          <w:sz w:val="22"/>
+          <w:szCs w:val="22"/>
+        </w:rPr>
+        <w:t xml:space="preserve">Invoices: invoice cards with outstanding amounts + search by number/customer/status (Session 4)</w:t>
+      </w:r>
+    </w:p>
+    <w:p>
+      <w:pPr>
+        <w:pStyle w:val="ListParagraph"/>
+        <w:numPr>
+          <w:ilvl w:val="0"/>
+          <w:numId w:val="1"/>
+        </w:numPr>
+        <w:spacing w:after="40"/>
+      </w:pPr>
+      <w:r>
+        <w:rPr>
+          <w:color w:val="1D2D3E"/>
+          <w:sz w:val="22"/>
+          <w:szCs w:val="22"/>
+        </w:rPr>
+        <w:t xml:space="preserve">Invoices: overdue invoices sorted to top, tab badge shows overdue count, red left border + banner (Session 6)</w:t>
+      </w:r>
+    </w:p>
+    <w:p>
+      <w:pPr>
+        <w:pStyle w:val="ListParagraph"/>
+        <w:numPr>
+          <w:ilvl w:val="0"/>
+          <w:numId w:val="1"/>
+        </w:numPr>
+        <w:spacing w:after="40"/>
+      </w:pPr>
+      <w:r>
+        <w:rPr>
+          <w:color w:val="1D2D3E"/>
+          <w:sz w:val="22"/>
+          <w:szCs w:val="22"/>
+        </w:rPr>
+        <w:t xml:space="preserve">Customers: customer cards with outstanding/overdue balances + search by name (Session 4)</w:t>
       </w:r>
     </w:p>
     <w:p>
@@ -3306,115 +3378,133 @@
           <w:bCs/>
           <w:color w:val="1D2D3E"/>
         </w:rPr>
-        <w:t xml:space="preserve">3.18 Trial Balance Screen (src/screens/trialBalance/TrialBalanceScreen.tsx)</w:t>
-      </w:r>
-    </w:p>
-    <w:p>
-      <w:pPr>
-        <w:pStyle w:val="ListParagraph"/>
-        <w:numPr>
-          <w:ilvl w:val="0"/>
-          <w:numId w:val="1"/>
-        </w:numPr>
-        <w:spacing w:after="40"/>
-      </w:pPr>
-      <w:r>
-        <w:rPr>
-          <w:color w:val="1D2D3E"/>
-          <w:sz w:val="22"/>
-          <w:szCs w:val="22"/>
-        </w:rPr>
-        <w:t xml:space="preserve">Company selector dropdown (populated from /api/options/companies)</w:t>
-      </w:r>
-    </w:p>
-    <w:p>
-      <w:pPr>
-        <w:pStyle w:val="ListParagraph"/>
-        <w:numPr>
-          <w:ilvl w:val="0"/>
-          <w:numId w:val="1"/>
-        </w:numPr>
-        <w:spacing w:after="40"/>
-      </w:pPr>
-      <w:r>
-        <w:rPr>
-          <w:color w:val="1D2D3E"/>
-          <w:sz w:val="22"/>
-          <w:szCs w:val="22"/>
-        </w:rPr>
-        <w:t xml:space="preserve">As-of date text input (YYYY-MM-DD format, Run Report button)</w:t>
-      </w:r>
-    </w:p>
-    <w:p>
-      <w:pPr>
-        <w:pStyle w:val="ListParagraph"/>
-        <w:numPr>
-          <w:ilvl w:val="0"/>
-          <w:numId w:val="1"/>
-        </w:numPr>
-        <w:spacing w:after="40"/>
-      </w:pPr>
-      <w:r>
-        <w:rPr>
-          <w:color w:val="1D2D3E"/>
-          <w:sz w:val="22"/>
-          <w:szCs w:val="22"/>
-        </w:rPr>
-        <w:t xml:space="preserve">Account search filter</w:t>
-      </w:r>
-    </w:p>
-    <w:p>
-      <w:pPr>
-        <w:pStyle w:val="ListParagraph"/>
-        <w:numPr>
-          <w:ilvl w:val="0"/>
-          <w:numId w:val="1"/>
-        </w:numPr>
-        <w:spacing w:after="40"/>
-      </w:pPr>
-      <w:r>
-        <w:rPr>
-          <w:color w:val="1D2D3E"/>
-          <w:sz w:val="22"/>
-          <w:szCs w:val="22"/>
-        </w:rPr>
-        <w:t xml:space="preserve">Summary card: total debit / total credit with balance diff warning</w:t>
-      </w:r>
-    </w:p>
-    <w:p>
-      <w:pPr>
-        <w:pStyle w:val="ListParagraph"/>
-        <w:numPr>
-          <w:ilvl w:val="0"/>
-          <w:numId w:val="1"/>
-        </w:numPr>
-        <w:spacing w:after="40"/>
-      </w:pPr>
-      <w:r>
-        <w:rPr>
-          <w:color w:val="1D2D3E"/>
-          <w:sz w:val="22"/>
-          <w:szCs w:val="22"/>
-        </w:rPr>
-        <w:t xml:space="preserve">Hierarchical account table with group headers, level-based indentation</w:t>
-      </w:r>
-    </w:p>
-    <w:p>
-      <w:pPr>
-        <w:pStyle w:val="ListParagraph"/>
-        <w:numPr>
-          <w:ilvl w:val="0"/>
-          <w:numId w:val="1"/>
-        </w:numPr>
-        <w:spacing w:after="40"/>
-      </w:pPr>
-      <w:r>
-        <w:rPr>
-          <w:color w:val="1D2D3E"/>
-          <w:sz w:val="22"/>
-          <w:szCs w:val="22"/>
-        </w:rPr>
-        <w:t xml:space="preserve">Export button: shares trial balance as formatted columnar text report (Session 5)</w:t>
+        <w:t xml:space="preserve">3.17 Journal Entries Screen (src/screens/journalEntries/JournalEntriesScreen.tsx)</w:t>
+      </w:r>
+    </w:p>
+    <w:p>
+      <w:pPr>
+        <w:pStyle w:val="ListParagraph"/>
+        <w:numPr>
+          <w:ilvl w:val="0"/>
+          <w:numId w:val="1"/>
+        </w:numPr>
+        <w:spacing w:after="40"/>
+      </w:pPr>
+      <w:r>
+        <w:rPr>
+          <w:color w:val="1D2D3E"/>
+          <w:sz w:val="22"/>
+          <w:szCs w:val="22"/>
+        </w:rPr>
+        <w:t xml:space="preserve">Searchable list: voucher number, narration</w:t>
+      </w:r>
+    </w:p>
+    <w:p>
+      <w:pPr>
+        <w:pStyle w:val="ListParagraph"/>
+        <w:numPr>
+          <w:ilvl w:val="0"/>
+          <w:numId w:val="1"/>
+        </w:numPr>
+        <w:spacing w:after="40"/>
+      </w:pPr>
+      <w:r>
+        <w:rPr>
+          <w:color w:val="1D2D3E"/>
+          <w:sz w:val="22"/>
+          <w:szCs w:val="22"/>
+        </w:rPr>
+        <w:t xml:space="preserve">Voucher type filter chips (JV, GRN, PAY, REC, INV, SO, PO, DN)</w:t>
+      </w:r>
+    </w:p>
+    <w:p>
+      <w:pPr>
+        <w:pStyle w:val="ListParagraph"/>
+        <w:numPr>
+          <w:ilvl w:val="0"/>
+          <w:numId w:val="1"/>
+        </w:numPr>
+        <w:spacing w:after="40"/>
+      </w:pPr>
+      <w:r>
+        <w:rPr>
+          <w:color w:val="1D2D3E"/>
+          <w:sz w:val="22"/>
+          <w:szCs w:val="22"/>
+        </w:rPr>
+        <w:t xml:space="preserve">Cards with colored type badge, status badge (POSTED/DRAFT/VOID), debit/credit totals</w:t>
+      </w:r>
+    </w:p>
+    <w:p>
+      <w:pPr>
+        <w:pStyle w:val="ListParagraph"/>
+        <w:numPr>
+          <w:ilvl w:val="0"/>
+          <w:numId w:val="1"/>
+        </w:numPr>
+        <w:spacing w:after="40"/>
+      </w:pPr>
+      <w:r>
+        <w:rPr>
+          <w:color w:val="1D2D3E"/>
+          <w:sz w:val="22"/>
+          <w:szCs w:val="22"/>
+        </w:rPr>
+        <w:t xml:space="preserve">Expandable cards reveal journal lines (account, debit, credit)</w:t>
+      </w:r>
+    </w:p>
+    <w:p>
+      <w:pPr>
+        <w:pStyle w:val="ListParagraph"/>
+        <w:numPr>
+          <w:ilvl w:val="0"/>
+          <w:numId w:val="1"/>
+        </w:numPr>
+        <w:spacing w:after="40"/>
+      </w:pPr>
+      <w:r>
+        <w:rPr>
+          <w:color w:val="1D2D3E"/>
+          <w:sz w:val="22"/>
+          <w:szCs w:val="22"/>
+        </w:rPr>
+        <w:t xml:space="preserve">Date range filter with From/To inputs (YYYY-MM-DD) — server-side filtering (Session 4)</w:t>
+      </w:r>
+    </w:p>
+    <w:p>
+      <w:pPr>
+        <w:pStyle w:val="ListParagraph"/>
+        <w:numPr>
+          <w:ilvl w:val="0"/>
+          <w:numId w:val="1"/>
+        </w:numPr>
+        <w:spacing w:after="40"/>
+      </w:pPr>
+      <w:r>
+        <w:rPr>
+          <w:color w:val="1D2D3E"/>
+          <w:sz w:val="22"/>
+          <w:szCs w:val="22"/>
+        </w:rPr>
+        <w:t xml:space="preserve">Quick date presets: Today, This Week, This Month, Last Month (Session 4)</w:t>
+      </w:r>
+    </w:p>
+    <w:p>
+      <w:pPr>
+        <w:pStyle w:val="ListParagraph"/>
+        <w:numPr>
+          <w:ilvl w:val="0"/>
+          <w:numId w:val="1"/>
+        </w:numPr>
+        <w:spacing w:after="40"/>
+      </w:pPr>
+      <w:r>
+        <w:rPr>
+          <w:color w:val="1D2D3E"/>
+          <w:sz w:val="22"/>
+          <w:szCs w:val="22"/>
+        </w:rPr>
+        <w:t xml:space="preserve">Export button: shares filtered entries as formatted text via Share API (Session 5)</w:t>
       </w:r>
     </w:p>
     <w:p>
@@ -3441,79 +3531,115 @@
           <w:bCs/>
           <w:color w:val="1D2D3E"/>
         </w:rPr>
-        <w:t xml:space="preserve">3.19 Business Partners Screen (src/screens/partners/PartnersScreen.tsx)</w:t>
-      </w:r>
-    </w:p>
-    <w:p>
-      <w:pPr>
-        <w:pStyle w:val="ListParagraph"/>
-        <w:numPr>
-          <w:ilvl w:val="0"/>
-          <w:numId w:val="1"/>
-        </w:numPr>
-        <w:spacing w:after="40"/>
-      </w:pPr>
-      <w:r>
-        <w:rPr>
-          <w:color w:val="1D2D3E"/>
-          <w:sz w:val="22"/>
-          <w:szCs w:val="22"/>
-        </w:rPr>
-        <w:t xml:space="preserve">Searchable list (name, code, email)</w:t>
-      </w:r>
-    </w:p>
-    <w:p>
-      <w:pPr>
-        <w:pStyle w:val="ListParagraph"/>
-        <w:numPr>
-          <w:ilvl w:val="0"/>
-          <w:numId w:val="1"/>
-        </w:numPr>
-        <w:spacing w:after="40"/>
-      </w:pPr>
-      <w:r>
-        <w:rPr>
-          <w:color w:val="1D2D3E"/>
-          <w:sz w:val="22"/>
-          <w:szCs w:val="22"/>
-        </w:rPr>
-        <w:t xml:space="preserve">Role filter tabs: All / Customers / Vendors</w:t>
-      </w:r>
-    </w:p>
-    <w:p>
-      <w:pPr>
-        <w:pStyle w:val="ListParagraph"/>
-        <w:numPr>
-          <w:ilvl w:val="0"/>
-          <w:numId w:val="1"/>
-        </w:numPr>
-        <w:spacing w:after="40"/>
-      </w:pPr>
-      <w:r>
-        <w:rPr>
-          <w:color w:val="1D2D3E"/>
-          <w:sz w:val="22"/>
-          <w:szCs w:val="22"/>
-        </w:rPr>
-        <w:t xml:space="preserve">Partner cards: avatar initials, name, code, role badges (Customer=green, Vendor=blue)</w:t>
-      </w:r>
-    </w:p>
-    <w:p>
-      <w:pPr>
-        <w:pStyle w:val="ListParagraph"/>
-        <w:numPr>
-          <w:ilvl w:val="0"/>
-          <w:numId w:val="1"/>
-        </w:numPr>
-        <w:spacing w:after="40"/>
-      </w:pPr>
-      <w:r>
-        <w:rPr>
-          <w:color w:val="1D2D3E"/>
-          <w:sz w:val="22"/>
-          <w:szCs w:val="22"/>
-        </w:rPr>
-        <w:t xml:space="preserve">Contact info: email, phone, company</w:t>
+        <w:t xml:space="preserve">3.18 Trial Balance Screen (src/screens/trialBalance/TrialBalanceScreen.tsx)</w:t>
+      </w:r>
+    </w:p>
+    <w:p>
+      <w:pPr>
+        <w:pStyle w:val="ListParagraph"/>
+        <w:numPr>
+          <w:ilvl w:val="0"/>
+          <w:numId w:val="1"/>
+        </w:numPr>
+        <w:spacing w:after="40"/>
+      </w:pPr>
+      <w:r>
+        <w:rPr>
+          <w:color w:val="1D2D3E"/>
+          <w:sz w:val="22"/>
+          <w:szCs w:val="22"/>
+        </w:rPr>
+        <w:t xml:space="preserve">Company selector dropdown (populated from /api/options/companies)</w:t>
+      </w:r>
+    </w:p>
+    <w:p>
+      <w:pPr>
+        <w:pStyle w:val="ListParagraph"/>
+        <w:numPr>
+          <w:ilvl w:val="0"/>
+          <w:numId w:val="1"/>
+        </w:numPr>
+        <w:spacing w:after="40"/>
+      </w:pPr>
+      <w:r>
+        <w:rPr>
+          <w:color w:val="1D2D3E"/>
+          <w:sz w:val="22"/>
+          <w:szCs w:val="22"/>
+        </w:rPr>
+        <w:t xml:space="preserve">As-of date text input (YYYY-MM-DD format, Run Report button)</w:t>
+      </w:r>
+    </w:p>
+    <w:p>
+      <w:pPr>
+        <w:pStyle w:val="ListParagraph"/>
+        <w:numPr>
+          <w:ilvl w:val="0"/>
+          <w:numId w:val="1"/>
+        </w:numPr>
+        <w:spacing w:after="40"/>
+      </w:pPr>
+      <w:r>
+        <w:rPr>
+          <w:color w:val="1D2D3E"/>
+          <w:sz w:val="22"/>
+          <w:szCs w:val="22"/>
+        </w:rPr>
+        <w:t xml:space="preserve">Account search filter</w:t>
+      </w:r>
+    </w:p>
+    <w:p>
+      <w:pPr>
+        <w:pStyle w:val="ListParagraph"/>
+        <w:numPr>
+          <w:ilvl w:val="0"/>
+          <w:numId w:val="1"/>
+        </w:numPr>
+        <w:spacing w:after="40"/>
+      </w:pPr>
+      <w:r>
+        <w:rPr>
+          <w:color w:val="1D2D3E"/>
+          <w:sz w:val="22"/>
+          <w:szCs w:val="22"/>
+        </w:rPr>
+        <w:t xml:space="preserve">Summary card: total debit / total credit with balance diff warning</w:t>
+      </w:r>
+    </w:p>
+    <w:p>
+      <w:pPr>
+        <w:pStyle w:val="ListParagraph"/>
+        <w:numPr>
+          <w:ilvl w:val="0"/>
+          <w:numId w:val="1"/>
+        </w:numPr>
+        <w:spacing w:after="40"/>
+      </w:pPr>
+      <w:r>
+        <w:rPr>
+          <w:color w:val="1D2D3E"/>
+          <w:sz w:val="22"/>
+          <w:szCs w:val="22"/>
+        </w:rPr>
+        <w:t xml:space="preserve">Hierarchical account table with group headers, level-based indentation</w:t>
+      </w:r>
+    </w:p>
+    <w:p>
+      <w:pPr>
+        <w:pStyle w:val="ListParagraph"/>
+        <w:numPr>
+          <w:ilvl w:val="0"/>
+          <w:numId w:val="1"/>
+        </w:numPr>
+        <w:spacing w:after="40"/>
+      </w:pPr>
+      <w:r>
+        <w:rPr>
+          <w:color w:val="1D2D3E"/>
+          <w:sz w:val="22"/>
+          <w:szCs w:val="22"/>
+        </w:rPr>
+        <w:t xml:space="preserve">Export button: shares trial balance as formatted columnar text report (Session 5)</w:t>
       </w:r>
     </w:p>
     <w:p>
@@ -3540,43 +3666,79 @@
           <w:bCs/>
           <w:color w:val="1D2D3E"/>
         </w:rPr>
-        <w:t xml:space="preserve">3.20 Companies Screen (src/screens/companies/CompaniesScreen.tsx)</w:t>
-      </w:r>
-    </w:p>
-    <w:p>
-      <w:pPr>
-        <w:pStyle w:val="ListParagraph"/>
-        <w:numPr>
-          <w:ilvl w:val="0"/>
-          <w:numId w:val="1"/>
-        </w:numPr>
-        <w:spacing w:after="40"/>
-      </w:pPr>
-      <w:r>
-        <w:rPr>
-          <w:color w:val="1D2D3E"/>
-          <w:sz w:val="22"/>
-          <w:szCs w:val="22"/>
-        </w:rPr>
-        <w:t xml:space="preserve">Company list with logo circle (initial letter), name, code, active/inactive status badge</w:t>
-      </w:r>
-    </w:p>
-    <w:p>
-      <w:pPr>
-        <w:pStyle w:val="ListParagraph"/>
-        <w:numPr>
-          <w:ilvl w:val="0"/>
-          <w:numId w:val="1"/>
-        </w:numPr>
-        <w:spacing w:after="40"/>
-      </w:pPr>
-      <w:r>
-        <w:rPr>
-          <w:color w:val="1D2D3E"/>
-          <w:sz w:val="22"/>
-          <w:szCs w:val="22"/>
-        </w:rPr>
-        <w:t xml:space="preserve">Detail grid: currency, fiscal year, phone, email, address</w:t>
+        <w:t xml:space="preserve">3.19 Business Partners Screen (src/screens/partners/PartnersScreen.tsx)</w:t>
+      </w:r>
+    </w:p>
+    <w:p>
+      <w:pPr>
+        <w:pStyle w:val="ListParagraph"/>
+        <w:numPr>
+          <w:ilvl w:val="0"/>
+          <w:numId w:val="1"/>
+        </w:numPr>
+        <w:spacing w:after="40"/>
+      </w:pPr>
+      <w:r>
+        <w:rPr>
+          <w:color w:val="1D2D3E"/>
+          <w:sz w:val="22"/>
+          <w:szCs w:val="22"/>
+        </w:rPr>
+        <w:t xml:space="preserve">Searchable list (name, code, email)</w:t>
+      </w:r>
+    </w:p>
+    <w:p>
+      <w:pPr>
+        <w:pStyle w:val="ListParagraph"/>
+        <w:numPr>
+          <w:ilvl w:val="0"/>
+          <w:numId w:val="1"/>
+        </w:numPr>
+        <w:spacing w:after="40"/>
+      </w:pPr>
+      <w:r>
+        <w:rPr>
+          <w:color w:val="1D2D3E"/>
+          <w:sz w:val="22"/>
+          <w:szCs w:val="22"/>
+        </w:rPr>
+        <w:t xml:space="preserve">Role filter tabs: All / Customers / Vendors</w:t>
+      </w:r>
+    </w:p>
+    <w:p>
+      <w:pPr>
+        <w:pStyle w:val="ListParagraph"/>
+        <w:numPr>
+          <w:ilvl w:val="0"/>
+          <w:numId w:val="1"/>
+        </w:numPr>
+        <w:spacing w:after="40"/>
+      </w:pPr>
+      <w:r>
+        <w:rPr>
+          <w:color w:val="1D2D3E"/>
+          <w:sz w:val="22"/>
+          <w:szCs w:val="22"/>
+        </w:rPr>
+        <w:t xml:space="preserve">Partner cards: avatar initials, name, code, role badges (Customer=green, Vendor=blue)</w:t>
+      </w:r>
+    </w:p>
+    <w:p>
+      <w:pPr>
+        <w:pStyle w:val="ListParagraph"/>
+        <w:numPr>
+          <w:ilvl w:val="0"/>
+          <w:numId w:val="1"/>
+        </w:numPr>
+        <w:spacing w:after="40"/>
+      </w:pPr>
+      <w:r>
+        <w:rPr>
+          <w:color w:val="1D2D3E"/>
+          <w:sz w:val="22"/>
+          <w:szCs w:val="22"/>
+        </w:rPr>
+        <w:t xml:space="preserve">Contact info: email, phone, company</w:t>
       </w:r>
     </w:p>
     <w:p>
@@ -3603,115 +3765,43 @@
           <w:bCs/>
           <w:color w:val="1D2D3E"/>
         </w:rPr>
-        <w:t xml:space="preserve">3.21 Financial Reports Screen (src/screens/financialReports/)</w:t>
-      </w:r>
-    </w:p>
-    <w:p>
-      <w:pPr>
-        <w:pStyle w:val="ListParagraph"/>
-        <w:numPr>
-          <w:ilvl w:val="0"/>
-          <w:numId w:val="1"/>
-        </w:numPr>
-        <w:spacing w:after="40"/>
-      </w:pPr>
-      <w:r>
-        <w:rPr>
-          <w:color w:val="1D2D3E"/>
-          <w:sz w:val="22"/>
-          <w:szCs w:val="22"/>
-        </w:rPr>
-        <w:t xml:space="preserve">Two tabs: Profit &amp; Loss / Balance Sheet</w:t>
-      </w:r>
-    </w:p>
-    <w:p>
-      <w:pPr>
-        <w:pStyle w:val="ListParagraph"/>
-        <w:numPr>
-          <w:ilvl w:val="0"/>
-          <w:numId w:val="1"/>
-        </w:numPr>
-        <w:spacing w:after="40"/>
-      </w:pPr>
-      <w:r>
-        <w:rPr>
-          <w:color w:val="1D2D3E"/>
-          <w:sz w:val="22"/>
-          <w:szCs w:val="22"/>
-        </w:rPr>
-        <w:t xml:space="preserve">P&amp;L: revenue vs expense sections, net income summary card</w:t>
-      </w:r>
-    </w:p>
-    <w:p>
-      <w:pPr>
-        <w:pStyle w:val="ListParagraph"/>
-        <w:numPr>
-          <w:ilvl w:val="0"/>
-          <w:numId w:val="1"/>
-        </w:numPr>
-        <w:spacing w:after="40"/>
-      </w:pPr>
-      <w:r>
-        <w:rPr>
-          <w:color w:val="1D2D3E"/>
-          <w:sz w:val="22"/>
-          <w:szCs w:val="22"/>
-        </w:rPr>
-        <w:t xml:space="preserve">Balance Sheet: assets, liabilities, equity sections with balance check warning</w:t>
-      </w:r>
-    </w:p>
-    <w:p>
-      <w:pPr>
-        <w:pStyle w:val="ListParagraph"/>
-        <w:numPr>
-          <w:ilvl w:val="0"/>
-          <w:numId w:val="1"/>
-        </w:numPr>
-        <w:spacing w:after="40"/>
-      </w:pPr>
-      <w:r>
-        <w:rPr>
-          <w:color w:val="1D2D3E"/>
-          <w:sz w:val="22"/>
-          <w:szCs w:val="22"/>
-        </w:rPr>
-        <w:t xml:space="preserve">Company selector + as-of date picker (same pattern as Trial Balance)</w:t>
-      </w:r>
-    </w:p>
-    <w:p>
-      <w:pPr>
-        <w:pStyle w:val="ListParagraph"/>
-        <w:numPr>
-          <w:ilvl w:val="0"/>
-          <w:numId w:val="1"/>
-        </w:numPr>
-        <w:spacing w:after="40"/>
-      </w:pPr>
-      <w:r>
-        <w:rPr>
-          <w:color w:val="1D2D3E"/>
-          <w:sz w:val="22"/>
-          <w:szCs w:val="22"/>
-        </w:rPr>
-        <w:t xml:space="preserve">Accounts classified by account_type keyword matching</w:t>
-      </w:r>
-    </w:p>
-    <w:p>
-      <w:pPr>
-        <w:pStyle w:val="ListParagraph"/>
-        <w:numPr>
-          <w:ilvl w:val="0"/>
-          <w:numId w:val="1"/>
-        </w:numPr>
-        <w:spacing w:after="40"/>
-      </w:pPr>
-      <w:r>
-        <w:rPr>
-          <w:color w:val="1D2D3E"/>
-          <w:sz w:val="22"/>
-          <w:szCs w:val="22"/>
-        </w:rPr>
-        <w:t xml:space="preserve">Export button: shares P&amp;L or Balance Sheet as formatted text report (Session 5)</w:t>
+        <w:t xml:space="preserve">3.20 Companies Screen (src/screens/companies/CompaniesScreen.tsx)</w:t>
+      </w:r>
+    </w:p>
+    <w:p>
+      <w:pPr>
+        <w:pStyle w:val="ListParagraph"/>
+        <w:numPr>
+          <w:ilvl w:val="0"/>
+          <w:numId w:val="1"/>
+        </w:numPr>
+        <w:spacing w:after="40"/>
+      </w:pPr>
+      <w:r>
+        <w:rPr>
+          <w:color w:val="1D2D3E"/>
+          <w:sz w:val="22"/>
+          <w:szCs w:val="22"/>
+        </w:rPr>
+        <w:t xml:space="preserve">Company list with logo circle (initial letter), name, code, active/inactive status badge</w:t>
+      </w:r>
+    </w:p>
+    <w:p>
+      <w:pPr>
+        <w:pStyle w:val="ListParagraph"/>
+        <w:numPr>
+          <w:ilvl w:val="0"/>
+          <w:numId w:val="1"/>
+        </w:numPr>
+        <w:spacing w:after="40"/>
+      </w:pPr>
+      <w:r>
+        <w:rPr>
+          <w:color w:val="1D2D3E"/>
+          <w:sz w:val="22"/>
+          <w:szCs w:val="22"/>
+        </w:rPr>
+        <w:t xml:space="preserve">Detail grid: currency, fiscal year, phone, email, address</w:t>
       </w:r>
     </w:p>
     <w:p>
@@ -3738,115 +3828,115 @@
           <w:bCs/>
           <w:color w:val="1D2D3E"/>
         </w:rPr>
-        <w:t xml:space="preserve">3.22 Global Company Filter (Updated Session 3)</w:t>
-      </w:r>
-    </w:p>
-    <w:p>
-      <w:pPr>
-        <w:pStyle w:val="ListParagraph"/>
-        <w:numPr>
-          <w:ilvl w:val="0"/>
-          <w:numId w:val="1"/>
-        </w:numPr>
-        <w:spacing w:after="40"/>
-      </w:pPr>
-      <w:r>
-        <w:rPr>
-          <w:color w:val="1D2D3E"/>
-          <w:sz w:val="22"/>
-          <w:szCs w:val="22"/>
-        </w:rPr>
-        <w:t xml:space="preserve">CompanyContext (src/context/CompanyContext.tsx) — global state: companies list, selectedCompany, companyId</w:t>
-      </w:r>
-    </w:p>
-    <w:p>
-      <w:pPr>
-        <w:pStyle w:val="ListParagraph"/>
-        <w:numPr>
-          <w:ilvl w:val="0"/>
-          <w:numId w:val="1"/>
-        </w:numPr>
-        <w:spacing w:after="40"/>
-      </w:pPr>
-      <w:r>
-        <w:rPr>
-          <w:color w:val="1D2D3E"/>
-          <w:sz w:val="22"/>
-          <w:szCs w:val="22"/>
-        </w:rPr>
-        <w:t xml:space="preserve">CompanyPicker (src/components/CompanyPicker.tsx) — horizontal scrollable company chips</w:t>
-      </w:r>
-    </w:p>
-    <w:p>
-      <w:pPr>
-        <w:pStyle w:val="ListParagraph"/>
-        <w:numPr>
-          <w:ilvl w:val="0"/>
-          <w:numId w:val="1"/>
-        </w:numPr>
-        <w:spacing w:after="40"/>
-      </w:pPr>
-      <w:r>
-        <w:rPr>
-          <w:color w:val="1D2D3E"/>
-          <w:sz w:val="22"/>
-          <w:szCs w:val="22"/>
-        </w:rPr>
-        <w:t xml:space="preserve">CompanyProvider wrapped around app in App.tsx</w:t>
-      </w:r>
-    </w:p>
-    <w:p>
-      <w:pPr>
-        <w:pStyle w:val="ListParagraph"/>
-        <w:numPr>
-          <w:ilvl w:val="0"/>
-          <w:numId w:val="1"/>
-        </w:numPr>
-        <w:spacing w:after="40"/>
-      </w:pPr>
-      <w:r>
-        <w:rPr>
-          <w:color w:val="1D2D3E"/>
-          <w:sz w:val="22"/>
-          <w:szCs w:val="22"/>
-        </w:rPr>
-        <w:t xml:space="preserve">Now applied to all data screens: Dashboard, Inventory, Materials, Journal Entries, Partners, Sales Orders, AP, AR</w:t>
-      </w:r>
-    </w:p>
-    <w:p>
-      <w:pPr>
-        <w:pStyle w:val="ListParagraph"/>
-        <w:numPr>
-          <w:ilvl w:val="0"/>
-          <w:numId w:val="1"/>
-        </w:numPr>
-        <w:spacing w:after="40"/>
-      </w:pPr>
-      <w:r>
-        <w:rPr>
-          <w:color w:val="1D2D3E"/>
-          <w:sz w:val="22"/>
-          <w:szCs w:val="22"/>
-        </w:rPr>
-        <w:t xml:space="preserve">TrialBalance and FinancialReports use companies list from context (no duplicate API calls)</w:t>
-      </w:r>
-    </w:p>
-    <w:p>
-      <w:pPr>
-        <w:pStyle w:val="ListParagraph"/>
-        <w:numPr>
-          <w:ilvl w:val="0"/>
-          <w:numId w:val="1"/>
-        </w:numPr>
-        <w:spacing w:after="40"/>
-      </w:pPr>
-      <w:r>
-        <w:rPr>
-          <w:color w:val="1D2D3E"/>
-          <w:sz w:val="22"/>
-          <w:szCs w:val="22"/>
-        </w:rPr>
-        <w:t xml:space="preserve">CompanyContext re-loads after login (was incorrectly loading before auth on app start)</w:t>
+        <w:t xml:space="preserve">3.21 Financial Reports Screen (src/screens/financialReports/)</w:t>
+      </w:r>
+    </w:p>
+    <w:p>
+      <w:pPr>
+        <w:pStyle w:val="ListParagraph"/>
+        <w:numPr>
+          <w:ilvl w:val="0"/>
+          <w:numId w:val="1"/>
+        </w:numPr>
+        <w:spacing w:after="40"/>
+      </w:pPr>
+      <w:r>
+        <w:rPr>
+          <w:color w:val="1D2D3E"/>
+          <w:sz w:val="22"/>
+          <w:szCs w:val="22"/>
+        </w:rPr>
+        <w:t xml:space="preserve">Two tabs: Profit &amp; Loss / Balance Sheet</w:t>
+      </w:r>
+    </w:p>
+    <w:p>
+      <w:pPr>
+        <w:pStyle w:val="ListParagraph"/>
+        <w:numPr>
+          <w:ilvl w:val="0"/>
+          <w:numId w:val="1"/>
+        </w:numPr>
+        <w:spacing w:after="40"/>
+      </w:pPr>
+      <w:r>
+        <w:rPr>
+          <w:color w:val="1D2D3E"/>
+          <w:sz w:val="22"/>
+          <w:szCs w:val="22"/>
+        </w:rPr>
+        <w:t xml:space="preserve">P&amp;L: revenue vs expense sections, net income summary card</w:t>
+      </w:r>
+    </w:p>
+    <w:p>
+      <w:pPr>
+        <w:pStyle w:val="ListParagraph"/>
+        <w:numPr>
+          <w:ilvl w:val="0"/>
+          <w:numId w:val="1"/>
+        </w:numPr>
+        <w:spacing w:after="40"/>
+      </w:pPr>
+      <w:r>
+        <w:rPr>
+          <w:color w:val="1D2D3E"/>
+          <w:sz w:val="22"/>
+          <w:szCs w:val="22"/>
+        </w:rPr>
+        <w:t xml:space="preserve">Balance Sheet: assets, liabilities, equity sections with balance check warning</w:t>
+      </w:r>
+    </w:p>
+    <w:p>
+      <w:pPr>
+        <w:pStyle w:val="ListParagraph"/>
+        <w:numPr>
+          <w:ilvl w:val="0"/>
+          <w:numId w:val="1"/>
+        </w:numPr>
+        <w:spacing w:after="40"/>
+      </w:pPr>
+      <w:r>
+        <w:rPr>
+          <w:color w:val="1D2D3E"/>
+          <w:sz w:val="22"/>
+          <w:szCs w:val="22"/>
+        </w:rPr>
+        <w:t xml:space="preserve">Company selector + as-of date picker (same pattern as Trial Balance)</w:t>
+      </w:r>
+    </w:p>
+    <w:p>
+      <w:pPr>
+        <w:pStyle w:val="ListParagraph"/>
+        <w:numPr>
+          <w:ilvl w:val="0"/>
+          <w:numId w:val="1"/>
+        </w:numPr>
+        <w:spacing w:after="40"/>
+      </w:pPr>
+      <w:r>
+        <w:rPr>
+          <w:color w:val="1D2D3E"/>
+          <w:sz w:val="22"/>
+          <w:szCs w:val="22"/>
+        </w:rPr>
+        <w:t xml:space="preserve">Accounts classified by account_type keyword matching</w:t>
+      </w:r>
+    </w:p>
+    <w:p>
+      <w:pPr>
+        <w:pStyle w:val="ListParagraph"/>
+        <w:numPr>
+          <w:ilvl w:val="0"/>
+          <w:numId w:val="1"/>
+        </w:numPr>
+        <w:spacing w:after="40"/>
+      </w:pPr>
+      <w:r>
+        <w:rPr>
+          <w:color w:val="1D2D3E"/>
+          <w:sz w:val="22"/>
+          <w:szCs w:val="22"/>
+        </w:rPr>
+        <w:t xml:space="preserve">Export button: shares P&amp;L or Balance Sheet as formatted text report (Session 5)</w:t>
       </w:r>
     </w:p>
     <w:p>
@@ -3873,7 +3963,142 @@
           <w:bCs/>
           <w:color w:val="1D2D3E"/>
         </w:rPr>
-        <w:t xml:space="preserve">3.23 Navigation Architecture (Updated Session 3)</w:t>
+        <w:t xml:space="preserve">3.22 Global Company Filter (Updated Session 3)</w:t>
+      </w:r>
+    </w:p>
+    <w:p>
+      <w:pPr>
+        <w:pStyle w:val="ListParagraph"/>
+        <w:numPr>
+          <w:ilvl w:val="0"/>
+          <w:numId w:val="1"/>
+        </w:numPr>
+        <w:spacing w:after="40"/>
+      </w:pPr>
+      <w:r>
+        <w:rPr>
+          <w:color w:val="1D2D3E"/>
+          <w:sz w:val="22"/>
+          <w:szCs w:val="22"/>
+        </w:rPr>
+        <w:t xml:space="preserve">CompanyContext (src/context/CompanyContext.tsx) — global state: companies list, selectedCompany, companyId</w:t>
+      </w:r>
+    </w:p>
+    <w:p>
+      <w:pPr>
+        <w:pStyle w:val="ListParagraph"/>
+        <w:numPr>
+          <w:ilvl w:val="0"/>
+          <w:numId w:val="1"/>
+        </w:numPr>
+        <w:spacing w:after="40"/>
+      </w:pPr>
+      <w:r>
+        <w:rPr>
+          <w:color w:val="1D2D3E"/>
+          <w:sz w:val="22"/>
+          <w:szCs w:val="22"/>
+        </w:rPr>
+        <w:t xml:space="preserve">CompanyPicker (src/components/CompanyPicker.tsx) — horizontal scrollable company chips</w:t>
+      </w:r>
+    </w:p>
+    <w:p>
+      <w:pPr>
+        <w:pStyle w:val="ListParagraph"/>
+        <w:numPr>
+          <w:ilvl w:val="0"/>
+          <w:numId w:val="1"/>
+        </w:numPr>
+        <w:spacing w:after="40"/>
+      </w:pPr>
+      <w:r>
+        <w:rPr>
+          <w:color w:val="1D2D3E"/>
+          <w:sz w:val="22"/>
+          <w:szCs w:val="22"/>
+        </w:rPr>
+        <w:t xml:space="preserve">CompanyProvider wrapped around app in App.tsx</w:t>
+      </w:r>
+    </w:p>
+    <w:p>
+      <w:pPr>
+        <w:pStyle w:val="ListParagraph"/>
+        <w:numPr>
+          <w:ilvl w:val="0"/>
+          <w:numId w:val="1"/>
+        </w:numPr>
+        <w:spacing w:after="40"/>
+      </w:pPr>
+      <w:r>
+        <w:rPr>
+          <w:color w:val="1D2D3E"/>
+          <w:sz w:val="22"/>
+          <w:szCs w:val="22"/>
+        </w:rPr>
+        <w:t xml:space="preserve">Now applied to all data screens: Dashboard, Inventory, Materials, Journal Entries, Partners, Sales Orders, AP, AR</w:t>
+      </w:r>
+    </w:p>
+    <w:p>
+      <w:pPr>
+        <w:pStyle w:val="ListParagraph"/>
+        <w:numPr>
+          <w:ilvl w:val="0"/>
+          <w:numId w:val="1"/>
+        </w:numPr>
+        <w:spacing w:after="40"/>
+      </w:pPr>
+      <w:r>
+        <w:rPr>
+          <w:color w:val="1D2D3E"/>
+          <w:sz w:val="22"/>
+          <w:szCs w:val="22"/>
+        </w:rPr>
+        <w:t xml:space="preserve">TrialBalance and FinancialReports use companies list from context (no duplicate API calls)</w:t>
+      </w:r>
+    </w:p>
+    <w:p>
+      <w:pPr>
+        <w:pStyle w:val="ListParagraph"/>
+        <w:numPr>
+          <w:ilvl w:val="0"/>
+          <w:numId w:val="1"/>
+        </w:numPr>
+        <w:spacing w:after="40"/>
+      </w:pPr>
+      <w:r>
+        <w:rPr>
+          <w:color w:val="1D2D3E"/>
+          <w:sz w:val="22"/>
+          <w:szCs w:val="22"/>
+        </w:rPr>
+        <w:t xml:space="preserve">CompanyContext re-loads after login (was incorrectly loading before auth on app start)</w:t>
+      </w:r>
+    </w:p>
+    <w:p>
+      <w:pPr>
+        <w:spacing w:after="80"/>
+      </w:pPr>
+      <w:r>
+        <w:rPr>
+          <w:color w:val="1D2D3E"/>
+          <w:sz w:val="22"/>
+          <w:szCs w:val="22"/>
+        </w:rPr>
+        <w:t xml:space="preserve"/>
+      </w:r>
+    </w:p>
+    <w:p>
+      <w:pPr>
+        <w:pStyle w:val="Heading2"/>
+        <w:spacing w:after="120" w:before="300"/>
+      </w:pPr>
+      <w:r>
+        <w:rPr>
+          <w:b/>
+          <w:bCs/>
+          <w:color w:val="1D2D3E"/>
+        </w:rPr>
+        <w:t xml:space="preserve">3.23 Navigation Architecture (Updated Session 6)</w:t>
       </w:r>
     </w:p>
     <w:p>
@@ -3927,6 +4152,24 @@
           <w:sz w:val="22"/>
           <w:szCs w:val="22"/>
         </w:rPr>
+        <w:t xml:space="preserve">InventoryNavigator (stack, Session 6): InventoryMain → ItemLedger (item detail screen)</w:t>
+      </w:r>
+    </w:p>
+    <w:p>
+      <w:pPr>
+        <w:pStyle w:val="ListParagraph"/>
+        <w:numPr>
+          <w:ilvl w:val="0"/>
+          <w:numId w:val="1"/>
+        </w:numPr>
+        <w:spacing w:after="40"/>
+      </w:pPr>
+      <w:r>
+        <w:rPr>
+          <w:color w:val="1D2D3E"/>
+          <w:sz w:val="22"/>
+          <w:szCs w:val="22"/>
+        </w:rPr>
         <w:t xml:space="preserve">FinanceNavigator (stack): FinanceMenu → AccountsPayable, AccountsReceivable, JournalEntries, TrialBalance, FinancialReports</w:t>
       </w:r>
     </w:p>
@@ -3982,6 +4225,159 @@
           <w:szCs w:val="22"/>
         </w:rPr>
         <w:t xml:space="preserve">Dashboard Quick Actions wired to real screens via tab navigation</w:t>
+      </w:r>
+    </w:p>
+    <w:p>
+      <w:pPr>
+        <w:spacing w:after="80"/>
+      </w:pPr>
+      <w:r>
+        <w:rPr>
+          <w:color w:val="1D2D3E"/>
+          <w:sz w:val="22"/>
+          <w:szCs w:val="22"/>
+        </w:rPr>
+        <w:t xml:space="preserve"/>
+      </w:r>
+    </w:p>
+    <w:p>
+      <w:pPr>
+        <w:pStyle w:val="Heading2"/>
+        <w:spacing w:after="120" w:before="300"/>
+      </w:pPr>
+      <w:r>
+        <w:rPr>
+          <w:b/>
+          <w:bCs/>
+          <w:color w:val="1D2D3E"/>
+        </w:rPr>
+        <w:t xml:space="preserve">3.25 Offline Caching (Session 6)</w:t>
+      </w:r>
+    </w:p>
+    <w:p>
+      <w:pPr>
+        <w:pStyle w:val="ListParagraph"/>
+        <w:numPr>
+          <w:ilvl w:val="0"/>
+          <w:numId w:val="1"/>
+        </w:numPr>
+        <w:spacing w:after="40"/>
+      </w:pPr>
+      <w:r>
+        <w:rPr>
+          <w:color w:val="1D2D3E"/>
+          <w:sz w:val="22"/>
+          <w:szCs w:val="22"/>
+        </w:rPr>
+        <w:t xml:space="preserve">Installed @react-native-async-storage/async-storage for persistent offline storage</w:t>
+      </w:r>
+    </w:p>
+    <w:p>
+      <w:pPr>
+        <w:pStyle w:val="ListParagraph"/>
+        <w:numPr>
+          <w:ilvl w:val="0"/>
+          <w:numId w:val="1"/>
+        </w:numPr>
+        <w:spacing w:after="40"/>
+      </w:pPr>
+      <w:r>
+        <w:rPr>
+          <w:color w:val="1D2D3E"/>
+          <w:sz w:val="22"/>
+          <w:szCs w:val="22"/>
+        </w:rPr>
+        <w:t xml:space="preserve">src/utils/cache.ts: getCached(key) → {data, stale} | null; setCached(key, data); clearCache(prefix)</w:t>
+      </w:r>
+    </w:p>
+    <w:p>
+      <w:pPr>
+        <w:pStyle w:val="ListParagraph"/>
+        <w:numPr>
+          <w:ilvl w:val="0"/>
+          <w:numId w:val="1"/>
+        </w:numPr>
+        <w:spacing w:after="40"/>
+      </w:pPr>
+      <w:r>
+        <w:rPr>
+          <w:color w:val="1D2D3E"/>
+          <w:sz w:val="22"/>
+          <w:szCs w:val="22"/>
+        </w:rPr>
+        <w:t xml:space="preserve">24-hour TTL per cache entry; versioned entries to invalidate stale schema on updates</w:t>
+      </w:r>
+    </w:p>
+    <w:p>
+      <w:pPr>
+        <w:pStyle w:val="ListParagraph"/>
+        <w:numPr>
+          <w:ilvl w:val="0"/>
+          <w:numId w:val="1"/>
+        </w:numPr>
+        <w:spacing w:after="40"/>
+      </w:pPr>
+      <w:r>
+        <w:rPr>
+          <w:color w:val="1D2D3E"/>
+          <w:sz w:val="22"/>
+          <w:szCs w:val="22"/>
+        </w:rPr>
+        <w:t xml:space="preserve">DashboardScreen: loads cached KPIs/vouchers instantly on mount, then fetches fresh in background</w:t>
+      </w:r>
+    </w:p>
+    <w:p>
+      <w:pPr>
+        <w:pStyle w:val="ListParagraph"/>
+        <w:numPr>
+          <w:ilvl w:val="0"/>
+          <w:numId w:val="1"/>
+        </w:numPr>
+        <w:spacing w:after="40"/>
+      </w:pPr>
+      <w:r>
+        <w:rPr>
+          <w:color w:val="1D2D3E"/>
+          <w:sz w:val="22"/>
+          <w:szCs w:val="22"/>
+        </w:rPr>
+        <w:t xml:space="preserve">InventoryScreen: caches stock balances per company; shows cached data immediately then refreshes</w:t>
+      </w:r>
+    </w:p>
+    <w:p>
+      <w:pPr>
+        <w:pStyle w:val="ListParagraph"/>
+        <w:numPr>
+          <w:ilvl w:val="0"/>
+          <w:numId w:val="1"/>
+        </w:numPr>
+        <w:spacing w:after="40"/>
+      </w:pPr>
+      <w:r>
+        <w:rPr>
+          <w:color w:val="1D2D3E"/>
+          <w:sz w:val="22"/>
+          <w:szCs w:val="22"/>
+        </w:rPr>
+        <w:t xml:space="preserve">OfflineBanner (src/components/OfflineBanner.tsx): amber banner when stale data is displayed</w:t>
+      </w:r>
+    </w:p>
+    <w:p>
+      <w:pPr>
+        <w:pStyle w:val="ListParagraph"/>
+        <w:numPr>
+          <w:ilvl w:val="0"/>
+          <w:numId w:val="1"/>
+        </w:numPr>
+        <w:spacing w:after="40"/>
+      </w:pPr>
+      <w:r>
+        <w:rPr>
+          <w:color w:val="1D2D3E"/>
+          <w:sz w:val="22"/>
+          <w:szCs w:val="22"/>
+        </w:rPr>
+        <w:t xml:space="preserve">Architecture: try cache → show if found → fetch fresh → update UI + cache; on failure: show cached + banner</w:t>
       </w:r>
     </w:p>
     <w:p>
@@ -6268,6 +6664,240 @@
           </w:p>
         </w:tc>
       </w:tr>
+      <w:tr>
+        <w:tc>
+          <w:tcPr>
+            <w:shd w:color="F0F4F8" w:val="solid"/>
+          </w:tcPr>
+          <w:p>
+            <w:pPr>
+              <w:spacing w:after="40" w:before="40"/>
+            </w:pPr>
+            <w:r>
+              <w:rPr>
+                <w:b w:val="false"/>
+                <w:bCs w:val="false"/>
+                <w:color w:val="1D2D3E"/>
+                <w:sz w:val="20"/>
+                <w:szCs w:val="20"/>
+              </w:rPr>
+              <w:t xml:space="preserve">Session 6</w:t>
+            </w:r>
+          </w:p>
+        </w:tc>
+        <w:tc>
+          <w:tcPr>
+            <w:shd w:color="F0F4F8" w:val="solid"/>
+          </w:tcPr>
+          <w:p>
+            <w:pPr>
+              <w:spacing w:after="40" w:before="40"/>
+            </w:pPr>
+            <w:r>
+              <w:rPr>
+                <w:b w:val="false"/>
+                <w:bCs w:val="false"/>
+                <w:color w:val="1D2D3E"/>
+                <w:sz w:val="20"/>
+                <w:szCs w:val="20"/>
+              </w:rPr>
+              <w:t xml:space="preserve">Inventory Item Detail Screen</w:t>
+            </w:r>
+          </w:p>
+        </w:tc>
+        <w:tc>
+          <w:tcPr>
+            <w:shd w:color="F0F4F8" w:val="solid"/>
+          </w:tcPr>
+          <w:p>
+            <w:pPr>
+              <w:spacing w:after="40" w:before="40"/>
+            </w:pPr>
+            <w:r>
+              <w:rPr>
+                <w:b w:val="false"/>
+                <w:bCs w:val="false"/>
+                <w:color w:val="1D2D3E"/>
+                <w:sz w:val="20"/>
+                <w:szCs w:val="20"/>
+              </w:rPr>
+              <w:t xml:space="preserve">Done</w:t>
+            </w:r>
+          </w:p>
+        </w:tc>
+        <w:tc>
+          <w:tcPr>
+            <w:shd w:color="F0F4F8" w:val="solid"/>
+          </w:tcPr>
+          <w:p>
+            <w:pPr>
+              <w:spacing w:after="40" w:before="40"/>
+            </w:pPr>
+            <w:r>
+              <w:rPr>
+                <w:b w:val="false"/>
+                <w:bCs w:val="false"/>
+                <w:color w:val="1D2D3E"/>
+                <w:sz w:val="20"/>
+                <w:szCs w:val="20"/>
+              </w:rPr>
+              <w:t xml:space="preserve">/api/mobile/inventory?view=ledger&amp;item_id=</w:t>
+            </w:r>
+          </w:p>
+        </w:tc>
+      </w:tr>
+      <w:tr>
+        <w:tc>
+          <w:p>
+            <w:pPr>
+              <w:spacing w:after="40" w:before="40"/>
+            </w:pPr>
+            <w:r>
+              <w:rPr>
+                <w:b w:val="false"/>
+                <w:bCs w:val="false"/>
+                <w:color w:val="1D2D3E"/>
+                <w:sz w:val="20"/>
+                <w:szCs w:val="20"/>
+              </w:rPr>
+              <w:t xml:space="preserve">Session 6</w:t>
+            </w:r>
+          </w:p>
+        </w:tc>
+        <w:tc>
+          <w:p>
+            <w:pPr>
+              <w:spacing w:after="40" w:before="40"/>
+            </w:pPr>
+            <w:r>
+              <w:rPr>
+                <w:b w:val="false"/>
+                <w:bCs w:val="false"/>
+                <w:color w:val="1D2D3E"/>
+                <w:sz w:val="20"/>
+                <w:szCs w:val="20"/>
+              </w:rPr>
+              <w:t xml:space="preserve">AP/AR Overdue Due-Date Alerts</w:t>
+            </w:r>
+          </w:p>
+        </w:tc>
+        <w:tc>
+          <w:p>
+            <w:pPr>
+              <w:spacing w:after="40" w:before="40"/>
+            </w:pPr>
+            <w:r>
+              <w:rPr>
+                <w:b w:val="false"/>
+                <w:bCs w:val="false"/>
+                <w:color w:val="1D2D3E"/>
+                <w:sz w:val="20"/>
+                <w:szCs w:val="20"/>
+              </w:rPr>
+              <w:t xml:space="preserve">Done</w:t>
+            </w:r>
+          </w:p>
+        </w:tc>
+        <w:tc>
+          <w:p>
+            <w:pPr>
+              <w:spacing w:after="40" w:before="40"/>
+            </w:pPr>
+            <w:r>
+              <w:rPr>
+                <w:b w:val="false"/>
+                <w:bCs w:val="false"/>
+                <w:color w:val="1D2D3E"/>
+                <w:sz w:val="20"/>
+                <w:szCs w:val="20"/>
+              </w:rPr>
+              <w:t xml:space="preserve">—</w:t>
+            </w:r>
+          </w:p>
+        </w:tc>
+      </w:tr>
+      <w:tr>
+        <w:tc>
+          <w:tcPr>
+            <w:shd w:color="F0F4F8" w:val="solid"/>
+          </w:tcPr>
+          <w:p>
+            <w:pPr>
+              <w:spacing w:after="40" w:before="40"/>
+            </w:pPr>
+            <w:r>
+              <w:rPr>
+                <w:b w:val="false"/>
+                <w:bCs w:val="false"/>
+                <w:color w:val="1D2D3E"/>
+                <w:sz w:val="20"/>
+                <w:szCs w:val="20"/>
+              </w:rPr>
+              <w:t xml:space="preserve">Session 6</w:t>
+            </w:r>
+          </w:p>
+        </w:tc>
+        <w:tc>
+          <w:tcPr>
+            <w:shd w:color="F0F4F8" w:val="solid"/>
+          </w:tcPr>
+          <w:p>
+            <w:pPr>
+              <w:spacing w:after="40" w:before="40"/>
+            </w:pPr>
+            <w:r>
+              <w:rPr>
+                <w:b w:val="false"/>
+                <w:bCs w:val="false"/>
+                <w:color w:val="1D2D3E"/>
+                <w:sz w:val="20"/>
+                <w:szCs w:val="20"/>
+              </w:rPr>
+              <w:t xml:space="preserve">Offline Caching (AsyncStorage)</w:t>
+            </w:r>
+          </w:p>
+        </w:tc>
+        <w:tc>
+          <w:tcPr>
+            <w:shd w:color="F0F4F8" w:val="solid"/>
+          </w:tcPr>
+          <w:p>
+            <w:pPr>
+              <w:spacing w:after="40" w:before="40"/>
+            </w:pPr>
+            <w:r>
+              <w:rPr>
+                <w:b w:val="false"/>
+                <w:bCs w:val="false"/>
+                <w:color w:val="1D2D3E"/>
+                <w:sz w:val="20"/>
+                <w:szCs w:val="20"/>
+              </w:rPr>
+              <w:t xml:space="preserve">Done</w:t>
+            </w:r>
+          </w:p>
+        </w:tc>
+        <w:tc>
+          <w:tcPr>
+            <w:shd w:color="F0F4F8" w:val="solid"/>
+          </w:tcPr>
+          <w:p>
+            <w:pPr>
+              <w:spacing w:after="40" w:before="40"/>
+            </w:pPr>
+            <w:r>
+              <w:rPr>
+                <w:b w:val="false"/>
+                <w:bCs w:val="false"/>
+                <w:color w:val="1D2D3E"/>
+                <w:sz w:val="20"/>
+                <w:szCs w:val="20"/>
+              </w:rPr>
+              <w:t xml:space="preserve">—</w:t>
+            </w:r>
+          </w:p>
+        </w:tc>
+      </w:tr>
     </w:tbl>
     <w:p>
       <w:pPr>
@@ -6565,25 +7195,25 @@
           <w:sz w:val="22"/>
           <w:szCs w:val="22"/>
         </w:rPr>
-        <w:t xml:space="preserve">src/components/ — Shared UI components (LoadingView, ErrorView, KPICard, SectionHeader)</w:t>
-      </w:r>
-    </w:p>
-    <w:p>
-      <w:pPr>
-        <w:pStyle w:val="ListParagraph"/>
-        <w:numPr>
-          <w:ilvl w:val="0"/>
-          <w:numId w:val="1"/>
-        </w:numPr>
-        <w:spacing w:after="40"/>
-      </w:pPr>
-      <w:r>
-        <w:rPr>
-          <w:color w:val="1D2D3E"/>
-          <w:sz w:val="22"/>
-          <w:szCs w:val="22"/>
-        </w:rPr>
-        <w:t xml:space="preserve">src/context/ — React contexts (AuthContext)</w:t>
+        <w:t xml:space="preserve">src/components/ — Shared UI components (LoadingView, ErrorView, KPICard, SectionHeader, OfflineBanner)</w:t>
+      </w:r>
+    </w:p>
+    <w:p>
+      <w:pPr>
+        <w:pStyle w:val="ListParagraph"/>
+        <w:numPr>
+          <w:ilvl w:val="0"/>
+          <w:numId w:val="1"/>
+        </w:numPr>
+        <w:spacing w:after="40"/>
+      </w:pPr>
+      <w:r>
+        <w:rPr>
+          <w:color w:val="1D2D3E"/>
+          <w:sz w:val="22"/>
+          <w:szCs w:val="22"/>
+        </w:rPr>
+        <w:t xml:space="preserve">src/context/ — React contexts (AuthContext, CompanyContext)</w:t>
       </w:r>
     </w:p>
     <w:p>
@@ -6637,6 +7267,24 @@
           <w:sz w:val="22"/>
           <w:szCs w:val="22"/>
         </w:rPr>
+        <w:t xml:space="preserve">InventoryNavigator.tsx — Stack for Inventory tab: InventoryMain + ItemLedger (Session 6)</w:t>
+      </w:r>
+    </w:p>
+    <w:p>
+      <w:pPr>
+        <w:pStyle w:val="ListParagraph"/>
+        <w:numPr>
+          <w:ilvl w:val="1"/>
+          <w:numId w:val="1"/>
+        </w:numPr>
+        <w:spacing w:after="40"/>
+      </w:pPr>
+      <w:r>
+        <w:rPr>
+          <w:color w:val="1D2D3E"/>
+          <w:sz w:val="22"/>
+          <w:szCs w:val="22"/>
+        </w:rPr>
         <w:t xml:space="preserve">FinanceNavigator.tsx — Stack for Finance tab screens</w:t>
       </w:r>
     </w:p>
@@ -6727,7 +7375,7 @@
           <w:sz w:val="22"/>
           <w:szCs w:val="22"/>
         </w:rPr>
-        <w:t xml:space="preserve">src/utils/ — Utility functions (currency, dates)</w:t>
+        <w:t xml:space="preserve">src/utils/ — Utility functions: currency.ts (formatting), cache.ts (AsyncStorage offline cache, Session 6)</w:t>
       </w:r>
     </w:p>
     <w:p>
@@ -8182,6 +8830,249 @@
           <w:szCs w:val="22"/>
         </w:rPr>
         <w:t xml:space="preserve">Journal Entries: added Export button — shares filtered JE list with voucher lines as formatted text</w:t>
+      </w:r>
+    </w:p>
+    <w:p>
+      <w:pPr>
+        <w:spacing w:after="80"/>
+      </w:pPr>
+      <w:r>
+        <w:rPr>
+          <w:color w:val="1D2D3E"/>
+          <w:sz w:val="22"/>
+          <w:szCs w:val="22"/>
+        </w:rPr>
+        <w:t xml:space="preserve"/>
+      </w:r>
+    </w:p>
+    <w:p>
+      <w:pPr>
+        <w:pStyle w:val="Heading2"/>
+        <w:spacing w:after="120" w:before="300"/>
+      </w:pPr>
+      <w:r>
+        <w:rPr>
+          <w:b/>
+          <w:bCs/>
+          <w:color w:val="1D2D3E"/>
+        </w:rPr>
+        <w:t xml:space="preserve">Session 6 — 2026-05-19</w:t>
+      </w:r>
+    </w:p>
+    <w:p>
+      <w:pPr>
+        <w:pStyle w:val="ListParagraph"/>
+        <w:numPr>
+          <w:ilvl w:val="0"/>
+          <w:numId w:val="1"/>
+        </w:numPr>
+        <w:spacing w:after="40"/>
+      </w:pPr>
+      <w:r>
+        <w:rPr>
+          <w:color w:val="1D2D3E"/>
+          <w:sz w:val="22"/>
+          <w:szCs w:val="22"/>
+        </w:rPr>
+        <w:t xml:space="preserve">Inventory: stock balance cards are now tappable — tap navigates to ItemLedgerScreen for that item</w:t>
+      </w:r>
+    </w:p>
+    <w:p>
+      <w:pPr>
+        <w:pStyle w:val="ListParagraph"/>
+        <w:numPr>
+          <w:ilvl w:val="0"/>
+          <w:numId w:val="1"/>
+        </w:numPr>
+        <w:spacing w:after="40"/>
+      </w:pPr>
+      <w:r>
+        <w:rPr>
+          <w:color w:val="1D2D3E"/>
+          <w:sz w:val="22"/>
+          <w:szCs w:val="22"/>
+        </w:rPr>
+        <w:t xml:space="preserve">Inventory: created ItemLedgerScreen with summary bar (total in/out/balance), date filter + presets, pull-to-refresh</w:t>
+      </w:r>
+    </w:p>
+    <w:p>
+      <w:pPr>
+        <w:pStyle w:val="ListParagraph"/>
+        <w:numPr>
+          <w:ilvl w:val="0"/>
+          <w:numId w:val="1"/>
+        </w:numPr>
+        <w:spacing w:after="40"/>
+      </w:pPr>
+      <w:r>
+        <w:rPr>
+          <w:color w:val="1D2D3E"/>
+          <w:sz w:val="22"/>
+          <w:szCs w:val="22"/>
+        </w:rPr>
+        <w:t xml:space="preserve">Inventory: created InventoryNavigator (stack) wrapping InventoryMain + ItemLedger screens</w:t>
+      </w:r>
+    </w:p>
+    <w:p>
+      <w:pPr>
+        <w:pStyle w:val="ListParagraph"/>
+        <w:numPr>
+          <w:ilvl w:val="0"/>
+          <w:numId w:val="1"/>
+        </w:numPr>
+        <w:spacing w:after="40"/>
+      </w:pPr>
+      <w:r>
+        <w:rPr>
+          <w:color w:val="1D2D3E"/>
+          <w:sz w:val="22"/>
+          <w:szCs w:val="22"/>
+        </w:rPr>
+        <w:t xml:space="preserve">Accounts Payable: overdue bills sorted to top, tab badge shows overdue count, red left border + warning banner</w:t>
+      </w:r>
+    </w:p>
+    <w:p>
+      <w:pPr>
+        <w:pStyle w:val="ListParagraph"/>
+        <w:numPr>
+          <w:ilvl w:val="0"/>
+          <w:numId w:val="1"/>
+        </w:numPr>
+        <w:spacing w:after="40"/>
+      </w:pPr>
+      <w:r>
+        <w:rPr>
+          <w:color w:val="1D2D3E"/>
+          <w:sz w:val="22"/>
+          <w:szCs w:val="22"/>
+        </w:rPr>
+        <w:t xml:space="preserve">Accounts Receivable: overdue invoices sorted to top, tab badge shows overdue count, red left border + warning banner</w:t>
+      </w:r>
+    </w:p>
+    <w:p>
+      <w:pPr>
+        <w:pStyle w:val="ListParagraph"/>
+        <w:numPr>
+          <w:ilvl w:val="0"/>
+          <w:numId w:val="1"/>
+        </w:numPr>
+        <w:spacing w:after="40"/>
+      </w:pPr>
+      <w:r>
+        <w:rPr>
+          <w:color w:val="1D2D3E"/>
+          <w:sz w:val="22"/>
+          <w:szCs w:val="22"/>
+        </w:rPr>
+        <w:t xml:space="preserve">AP/AR: daysOverdue() helper computes calendar days past due_date (0 for paid or current)</w:t>
+      </w:r>
+    </w:p>
+    <w:p>
+      <w:pPr>
+        <w:pStyle w:val="ListParagraph"/>
+        <w:numPr>
+          <w:ilvl w:val="0"/>
+          <w:numId w:val="1"/>
+        </w:numPr>
+        <w:spacing w:after="40"/>
+      </w:pPr>
+      <w:r>
+        <w:rPr>
+          <w:color w:val="1D2D3E"/>
+          <w:sz w:val="22"/>
+          <w:szCs w:val="22"/>
+        </w:rPr>
+        <w:t xml:space="preserve">AP/AR: SectionHeader meta shows 'N records · M overdue' when overdue items exist</w:t>
+      </w:r>
+    </w:p>
+    <w:p>
+      <w:pPr>
+        <w:pStyle w:val="ListParagraph"/>
+        <w:numPr>
+          <w:ilvl w:val="0"/>
+          <w:numId w:val="1"/>
+        </w:numPr>
+        <w:spacing w:after="40"/>
+      </w:pPr>
+      <w:r>
+        <w:rPr>
+          <w:color w:val="1D2D3E"/>
+          <w:sz w:val="22"/>
+          <w:szCs w:val="22"/>
+        </w:rPr>
+        <w:t xml:space="preserve">Offline caching: installed @react-native-async-storage/async-storage</w:t>
+      </w:r>
+    </w:p>
+    <w:p>
+      <w:pPr>
+        <w:pStyle w:val="ListParagraph"/>
+        <w:numPr>
+          <w:ilvl w:val="0"/>
+          <w:numId w:val="1"/>
+        </w:numPr>
+        <w:spacing w:after="40"/>
+      </w:pPr>
+      <w:r>
+        <w:rPr>
+          <w:color w:val="1D2D3E"/>
+          <w:sz w:val="22"/>
+          <w:szCs w:val="22"/>
+        </w:rPr>
+        <w:t xml:space="preserve">Offline caching: created src/utils/cache.ts with getCached/setCached (24h TTL, versioned)</w:t>
+      </w:r>
+    </w:p>
+    <w:p>
+      <w:pPr>
+        <w:pStyle w:val="ListParagraph"/>
+        <w:numPr>
+          <w:ilvl w:val="0"/>
+          <w:numId w:val="1"/>
+        </w:numPr>
+        <w:spacing w:after="40"/>
+      </w:pPr>
+      <w:r>
+        <w:rPr>
+          <w:color w:val="1D2D3E"/>
+          <w:sz w:val="22"/>
+          <w:szCs w:val="22"/>
+        </w:rPr>
+        <w:t xml:space="preserve">Offline caching: created src/components/OfflineBanner.tsx — amber banner for stale data</w:t>
+      </w:r>
+    </w:p>
+    <w:p>
+      <w:pPr>
+        <w:pStyle w:val="ListParagraph"/>
+        <w:numPr>
+          <w:ilvl w:val="0"/>
+          <w:numId w:val="1"/>
+        </w:numPr>
+        <w:spacing w:after="40"/>
+      </w:pPr>
+      <w:r>
+        <w:rPr>
+          <w:color w:val="1D2D3E"/>
+          <w:sz w:val="22"/>
+          <w:szCs w:val="22"/>
+        </w:rPr>
+        <w:t xml:space="preserve">Offline caching: DashboardScreen shows cached KPIs instantly, fetches fresh in background</w:t>
+      </w:r>
+    </w:p>
+    <w:p>
+      <w:pPr>
+        <w:pStyle w:val="ListParagraph"/>
+        <w:numPr>
+          <w:ilvl w:val="0"/>
+          <w:numId w:val="1"/>
+        </w:numPr>
+        <w:spacing w:after="40"/>
+      </w:pPr>
+      <w:r>
+        <w:rPr>
+          <w:color w:val="1D2D3E"/>
+          <w:sz w:val="22"/>
+          <w:szCs w:val="22"/>
+        </w:rPr>
+        <w:t xml:space="preserve">Offline caching: InventoryScreen caches stock balances per company, populates UI from cache immediately</w:t>
       </w:r>
     </w:p>
     <w:p>

</xml_diff>

<commit_message>
Session 7: Update PROGRESS.md, generate-docs.js, and FEATURES.docx with Session 7 changelog
</commit_message>
<xml_diff>
--- a/FEATURES.docx
+++ b/FEATURES.docx
@@ -45,7 +45,7 @@
           <w:sz w:val="20"/>
           <w:szCs w:val="20"/>
         </w:rPr>
-        <w:t xml:space="preserve">Generated: 2026-05-19</w:t>
+        <w:t xml:space="preserve">Generated: 2026-05-20</w:t>
       </w:r>
     </w:p>
     <w:p>
@@ -2861,6 +2861,24 @@
     </w:p>
     <w:p>
       <w:pPr>
+        <w:pStyle w:val="ListParagraph"/>
+        <w:numPr>
+          <w:ilvl w:val="0"/>
+          <w:numId w:val="1"/>
+        </w:numPr>
+        <w:spacing w:after="40"/>
+      </w:pPr>
+      <w:r>
+        <w:rPr>
+          <w:color w:val="1D2D3E"/>
+          <w:sz w:val="22"/>
+          <w:szCs w:val="22"/>
+        </w:rPr>
+        <w:t xml:space="preserve">Offline caching: materials + types cached per company+type combo with 24h TTL (Session 7)</w:t>
+      </w:r>
+    </w:p>
+    <w:p>
+      <w:pPr>
         <w:spacing w:after="80"/>
       </w:pPr>
       <w:r>
@@ -3239,6 +3257,42 @@
     </w:p>
     <w:p>
       <w:pPr>
+        <w:pStyle w:val="ListParagraph"/>
+        <w:numPr>
+          <w:ilvl w:val="0"/>
+          <w:numId w:val="1"/>
+        </w:numPr>
+        <w:spacing w:after="40"/>
+      </w:pPr>
+      <w:r>
+        <w:rPr>
+          <w:color w:val="1D2D3E"/>
+          <w:sz w:val="22"/>
+          <w:szCs w:val="22"/>
+        </w:rPr>
+        <w:t xml:space="preserve">Vendors: cards and top-vendor mini-list rows are tappable — navigate to VendorDetailScreen (Session 7)</w:t>
+      </w:r>
+    </w:p>
+    <w:p>
+      <w:pPr>
+        <w:pStyle w:val="ListParagraph"/>
+        <w:numPr>
+          <w:ilvl w:val="0"/>
+          <w:numId w:val="1"/>
+        </w:numPr>
+        <w:spacing w:after="40"/>
+      </w:pPr>
+      <w:r>
+        <w:rPr>
+          <w:color w:val="1D2D3E"/>
+          <w:sz w:val="22"/>
+          <w:szCs w:val="22"/>
+        </w:rPr>
+        <w:t xml:space="preserve">Offline caching: summary/bills/vendors cached per company with 24h TTL; OfflineBanner on stale data (Session 7)</w:t>
+      </w:r>
+    </w:p>
+    <w:p>
+      <w:pPr>
         <w:spacing w:after="80"/>
       </w:pPr>
       <w:r>
@@ -3261,97 +3315,133 @@
           <w:bCs/>
           <w:color w:val="1D2D3E"/>
         </w:rPr>
-        <w:t xml:space="preserve">3.16 Accounts Receivable Screen (src/screens/finance/AccountsReceivableScreen.tsx)</w:t>
-      </w:r>
-    </w:p>
-    <w:p>
-      <w:pPr>
-        <w:pStyle w:val="ListParagraph"/>
-        <w:numPr>
-          <w:ilvl w:val="0"/>
-          <w:numId w:val="1"/>
-        </w:numPr>
-        <w:spacing w:after="40"/>
-      </w:pPr>
-      <w:r>
-        <w:rPr>
-          <w:color w:val="1D2D3E"/>
-          <w:sz w:val="22"/>
-          <w:szCs w:val="22"/>
-        </w:rPr>
-        <w:t xml:space="preserve">Three tabs: Summary / Invoices / Customers</w:t>
-      </w:r>
-    </w:p>
-    <w:p>
-      <w:pPr>
-        <w:pStyle w:val="ListParagraph"/>
-        <w:numPr>
-          <w:ilvl w:val="0"/>
-          <w:numId w:val="1"/>
-        </w:numPr>
-        <w:spacing w:after="40"/>
-      </w:pPr>
-      <w:r>
-        <w:rPr>
-          <w:color w:val="1D2D3E"/>
-          <w:sz w:val="22"/>
-          <w:szCs w:val="22"/>
-        </w:rPr>
-        <w:t xml:space="preserve">Summary: KPI cards + aging analysis bars (same pattern as AP)</w:t>
-      </w:r>
-    </w:p>
-    <w:p>
-      <w:pPr>
-        <w:pStyle w:val="ListParagraph"/>
-        <w:numPr>
-          <w:ilvl w:val="0"/>
-          <w:numId w:val="1"/>
-        </w:numPr>
-        <w:spacing w:after="40"/>
-      </w:pPr>
-      <w:r>
-        <w:rPr>
-          <w:color w:val="1D2D3E"/>
-          <w:sz w:val="22"/>
-          <w:szCs w:val="22"/>
-        </w:rPr>
-        <w:t xml:space="preserve">Invoices: invoice cards with outstanding amounts + search by number/customer/status (Session 4)</w:t>
-      </w:r>
-    </w:p>
-    <w:p>
-      <w:pPr>
-        <w:pStyle w:val="ListParagraph"/>
-        <w:numPr>
-          <w:ilvl w:val="0"/>
-          <w:numId w:val="1"/>
-        </w:numPr>
-        <w:spacing w:after="40"/>
-      </w:pPr>
-      <w:r>
-        <w:rPr>
-          <w:color w:val="1D2D3E"/>
-          <w:sz w:val="22"/>
-          <w:szCs w:val="22"/>
-        </w:rPr>
-        <w:t xml:space="preserve">Invoices: overdue invoices sorted to top, tab badge shows overdue count, red left border + banner (Session 6)</w:t>
-      </w:r>
-    </w:p>
-    <w:p>
-      <w:pPr>
-        <w:pStyle w:val="ListParagraph"/>
-        <w:numPr>
-          <w:ilvl w:val="0"/>
-          <w:numId w:val="1"/>
-        </w:numPr>
-        <w:spacing w:after="40"/>
-      </w:pPr>
-      <w:r>
-        <w:rPr>
-          <w:color w:val="1D2D3E"/>
-          <w:sz w:val="22"/>
-          <w:szCs w:val="22"/>
-        </w:rPr>
-        <w:t xml:space="preserve">Customers: customer cards with outstanding/overdue balances + search by name (Session 4)</w:t>
+        <w:t xml:space="preserve">3.15a Vendor Detail Screen (src/screens/finance/VendorDetailScreen.tsx)</w:t>
+      </w:r>
+    </w:p>
+    <w:p>
+      <w:pPr>
+        <w:pStyle w:val="ListParagraph"/>
+        <w:numPr>
+          <w:ilvl w:val="0"/>
+          <w:numId w:val="1"/>
+        </w:numPr>
+        <w:spacing w:after="40"/>
+      </w:pPr>
+      <w:r>
+        <w:rPr>
+          <w:color w:val="1D2D3E"/>
+          <w:sz w:val="22"/>
+          <w:szCs w:val="22"/>
+        </w:rPr>
+        <w:t xml:space="preserve">New screen introduced in Session 7 — accessible by tapping any vendor in AP screen</w:t>
+      </w:r>
+    </w:p>
+    <w:p>
+      <w:pPr>
+        <w:pStyle w:val="ListParagraph"/>
+        <w:numPr>
+          <w:ilvl w:val="0"/>
+          <w:numId w:val="1"/>
+        </w:numPr>
+        <w:spacing w:after="40"/>
+      </w:pPr>
+      <w:r>
+        <w:rPr>
+          <w:color w:val="1D2D3E"/>
+          <w:sz w:val="22"/>
+          <w:szCs w:val="22"/>
+        </w:rPr>
+        <w:t xml:space="preserve">Header: vendor name + 'Vendor · Accounts Payable' subtitle</w:t>
+      </w:r>
+    </w:p>
+    <w:p>
+      <w:pPr>
+        <w:pStyle w:val="ListParagraph"/>
+        <w:numPr>
+          <w:ilvl w:val="0"/>
+          <w:numId w:val="1"/>
+        </w:numPr>
+        <w:spacing w:after="40"/>
+      </w:pPr>
+      <w:r>
+        <w:rPr>
+          <w:color w:val="1D2D3E"/>
+          <w:sz w:val="22"/>
+          <w:szCs w:val="22"/>
+        </w:rPr>
+        <w:t xml:space="preserve">Summary tiles: Outstanding, Overdue (highlighted), Total Billed, Bill count</w:t>
+      </w:r>
+    </w:p>
+    <w:p>
+      <w:pPr>
+        <w:pStyle w:val="ListParagraph"/>
+        <w:numPr>
+          <w:ilvl w:val="0"/>
+          <w:numId w:val="1"/>
+        </w:numPr>
+        <w:spacing w:after="40"/>
+      </w:pPr>
+      <w:r>
+        <w:rPr>
+          <w:color w:val="1D2D3E"/>
+          <w:sz w:val="22"/>
+          <w:szCs w:val="22"/>
+        </w:rPr>
+        <w:t xml:space="preserve">Bill list: all bills for that vendor, sorted overdue-first</w:t>
+      </w:r>
+    </w:p>
+    <w:p>
+      <w:pPr>
+        <w:pStyle w:val="ListParagraph"/>
+        <w:numPr>
+          <w:ilvl w:val="0"/>
+          <w:numId w:val="1"/>
+        </w:numPr>
+        <w:spacing w:after="40"/>
+      </w:pPr>
+      <w:r>
+        <w:rPr>
+          <w:color w:val="1D2D3E"/>
+          <w:sz w:val="22"/>
+          <w:szCs w:val="22"/>
+        </w:rPr>
+        <w:t xml:space="preserve">Overdue alert banner on each overdue bill with days-overdue count</w:t>
+      </w:r>
+    </w:p>
+    <w:p>
+      <w:pPr>
+        <w:pStyle w:val="ListParagraph"/>
+        <w:numPr>
+          <w:ilvl w:val="0"/>
+          <w:numId w:val="1"/>
+        </w:numPr>
+        <w:spacing w:after="40"/>
+      </w:pPr>
+      <w:r>
+        <w:rPr>
+          <w:color w:val="1D2D3E"/>
+          <w:sz w:val="22"/>
+          <w:szCs w:val="22"/>
+        </w:rPr>
+        <w:t xml:space="preserve">Search bar to filter bills by number or status</w:t>
+      </w:r>
+    </w:p>
+    <w:p>
+      <w:pPr>
+        <w:pStyle w:val="ListParagraph"/>
+        <w:numPr>
+          <w:ilvl w:val="0"/>
+          <w:numId w:val="1"/>
+        </w:numPr>
+        <w:spacing w:after="40"/>
+      </w:pPr>
+      <w:r>
+        <w:rPr>
+          <w:color w:val="1D2D3E"/>
+          <w:sz w:val="22"/>
+          <w:szCs w:val="22"/>
+        </w:rPr>
+        <w:t xml:space="preserve">Pull-to-refresh, loading and empty states</w:t>
       </w:r>
     </w:p>
     <w:p>
@@ -3378,133 +3468,133 @@
           <w:bCs/>
           <w:color w:val="1D2D3E"/>
         </w:rPr>
-        <w:t xml:space="preserve">3.17 Journal Entries Screen (src/screens/journalEntries/JournalEntriesScreen.tsx)</w:t>
-      </w:r>
-    </w:p>
-    <w:p>
-      <w:pPr>
-        <w:pStyle w:val="ListParagraph"/>
-        <w:numPr>
-          <w:ilvl w:val="0"/>
-          <w:numId w:val="1"/>
-        </w:numPr>
-        <w:spacing w:after="40"/>
-      </w:pPr>
-      <w:r>
-        <w:rPr>
-          <w:color w:val="1D2D3E"/>
-          <w:sz w:val="22"/>
-          <w:szCs w:val="22"/>
-        </w:rPr>
-        <w:t xml:space="preserve">Searchable list: voucher number, narration</w:t>
-      </w:r>
-    </w:p>
-    <w:p>
-      <w:pPr>
-        <w:pStyle w:val="ListParagraph"/>
-        <w:numPr>
-          <w:ilvl w:val="0"/>
-          <w:numId w:val="1"/>
-        </w:numPr>
-        <w:spacing w:after="40"/>
-      </w:pPr>
-      <w:r>
-        <w:rPr>
-          <w:color w:val="1D2D3E"/>
-          <w:sz w:val="22"/>
-          <w:szCs w:val="22"/>
-        </w:rPr>
-        <w:t xml:space="preserve">Voucher type filter chips (JV, GRN, PAY, REC, INV, SO, PO, DN)</w:t>
-      </w:r>
-    </w:p>
-    <w:p>
-      <w:pPr>
-        <w:pStyle w:val="ListParagraph"/>
-        <w:numPr>
-          <w:ilvl w:val="0"/>
-          <w:numId w:val="1"/>
-        </w:numPr>
-        <w:spacing w:after="40"/>
-      </w:pPr>
-      <w:r>
-        <w:rPr>
-          <w:color w:val="1D2D3E"/>
-          <w:sz w:val="22"/>
-          <w:szCs w:val="22"/>
-        </w:rPr>
-        <w:t xml:space="preserve">Cards with colored type badge, status badge (POSTED/DRAFT/VOID), debit/credit totals</w:t>
-      </w:r>
-    </w:p>
-    <w:p>
-      <w:pPr>
-        <w:pStyle w:val="ListParagraph"/>
-        <w:numPr>
-          <w:ilvl w:val="0"/>
-          <w:numId w:val="1"/>
-        </w:numPr>
-        <w:spacing w:after="40"/>
-      </w:pPr>
-      <w:r>
-        <w:rPr>
-          <w:color w:val="1D2D3E"/>
-          <w:sz w:val="22"/>
-          <w:szCs w:val="22"/>
-        </w:rPr>
-        <w:t xml:space="preserve">Expandable cards reveal journal lines (account, debit, credit)</w:t>
-      </w:r>
-    </w:p>
-    <w:p>
-      <w:pPr>
-        <w:pStyle w:val="ListParagraph"/>
-        <w:numPr>
-          <w:ilvl w:val="0"/>
-          <w:numId w:val="1"/>
-        </w:numPr>
-        <w:spacing w:after="40"/>
-      </w:pPr>
-      <w:r>
-        <w:rPr>
-          <w:color w:val="1D2D3E"/>
-          <w:sz w:val="22"/>
-          <w:szCs w:val="22"/>
-        </w:rPr>
-        <w:t xml:space="preserve">Date range filter with From/To inputs (YYYY-MM-DD) — server-side filtering (Session 4)</w:t>
-      </w:r>
-    </w:p>
-    <w:p>
-      <w:pPr>
-        <w:pStyle w:val="ListParagraph"/>
-        <w:numPr>
-          <w:ilvl w:val="0"/>
-          <w:numId w:val="1"/>
-        </w:numPr>
-        <w:spacing w:after="40"/>
-      </w:pPr>
-      <w:r>
-        <w:rPr>
-          <w:color w:val="1D2D3E"/>
-          <w:sz w:val="22"/>
-          <w:szCs w:val="22"/>
-        </w:rPr>
-        <w:t xml:space="preserve">Quick date presets: Today, This Week, This Month, Last Month (Session 4)</w:t>
-      </w:r>
-    </w:p>
-    <w:p>
-      <w:pPr>
-        <w:pStyle w:val="ListParagraph"/>
-        <w:numPr>
-          <w:ilvl w:val="0"/>
-          <w:numId w:val="1"/>
-        </w:numPr>
-        <w:spacing w:after="40"/>
-      </w:pPr>
-      <w:r>
-        <w:rPr>
-          <w:color w:val="1D2D3E"/>
-          <w:sz w:val="22"/>
-          <w:szCs w:val="22"/>
-        </w:rPr>
-        <w:t xml:space="preserve">Export button: shares filtered entries as formatted text via Share API (Session 5)</w:t>
+        <w:t xml:space="preserve">3.16 Accounts Receivable Screen (src/screens/finance/AccountsReceivableScreen.tsx)</w:t>
+      </w:r>
+    </w:p>
+    <w:p>
+      <w:pPr>
+        <w:pStyle w:val="ListParagraph"/>
+        <w:numPr>
+          <w:ilvl w:val="0"/>
+          <w:numId w:val="1"/>
+        </w:numPr>
+        <w:spacing w:after="40"/>
+      </w:pPr>
+      <w:r>
+        <w:rPr>
+          <w:color w:val="1D2D3E"/>
+          <w:sz w:val="22"/>
+          <w:szCs w:val="22"/>
+        </w:rPr>
+        <w:t xml:space="preserve">Three tabs: Summary / Invoices / Customers</w:t>
+      </w:r>
+    </w:p>
+    <w:p>
+      <w:pPr>
+        <w:pStyle w:val="ListParagraph"/>
+        <w:numPr>
+          <w:ilvl w:val="0"/>
+          <w:numId w:val="1"/>
+        </w:numPr>
+        <w:spacing w:after="40"/>
+      </w:pPr>
+      <w:r>
+        <w:rPr>
+          <w:color w:val="1D2D3E"/>
+          <w:sz w:val="22"/>
+          <w:szCs w:val="22"/>
+        </w:rPr>
+        <w:t xml:space="preserve">Summary: KPI cards + aging analysis bars (same pattern as AP)</w:t>
+      </w:r>
+    </w:p>
+    <w:p>
+      <w:pPr>
+        <w:pStyle w:val="ListParagraph"/>
+        <w:numPr>
+          <w:ilvl w:val="0"/>
+          <w:numId w:val="1"/>
+        </w:numPr>
+        <w:spacing w:after="40"/>
+      </w:pPr>
+      <w:r>
+        <w:rPr>
+          <w:color w:val="1D2D3E"/>
+          <w:sz w:val="22"/>
+          <w:szCs w:val="22"/>
+        </w:rPr>
+        <w:t xml:space="preserve">Invoices: invoice cards with outstanding amounts + search by number/customer/status (Session 4)</w:t>
+      </w:r>
+    </w:p>
+    <w:p>
+      <w:pPr>
+        <w:pStyle w:val="ListParagraph"/>
+        <w:numPr>
+          <w:ilvl w:val="0"/>
+          <w:numId w:val="1"/>
+        </w:numPr>
+        <w:spacing w:after="40"/>
+      </w:pPr>
+      <w:r>
+        <w:rPr>
+          <w:color w:val="1D2D3E"/>
+          <w:sz w:val="22"/>
+          <w:szCs w:val="22"/>
+        </w:rPr>
+        <w:t xml:space="preserve">Invoices: overdue invoices sorted to top, tab badge shows overdue count, red left border + banner (Session 6)</w:t>
+      </w:r>
+    </w:p>
+    <w:p>
+      <w:pPr>
+        <w:pStyle w:val="ListParagraph"/>
+        <w:numPr>
+          <w:ilvl w:val="0"/>
+          <w:numId w:val="1"/>
+        </w:numPr>
+        <w:spacing w:after="40"/>
+      </w:pPr>
+      <w:r>
+        <w:rPr>
+          <w:color w:val="1D2D3E"/>
+          <w:sz w:val="22"/>
+          <w:szCs w:val="22"/>
+        </w:rPr>
+        <w:t xml:space="preserve">Customers: customer cards with outstanding/overdue balances + search by name (Session 4)</w:t>
+      </w:r>
+    </w:p>
+    <w:p>
+      <w:pPr>
+        <w:pStyle w:val="ListParagraph"/>
+        <w:numPr>
+          <w:ilvl w:val="0"/>
+          <w:numId w:val="1"/>
+        </w:numPr>
+        <w:spacing w:after="40"/>
+      </w:pPr>
+      <w:r>
+        <w:rPr>
+          <w:color w:val="1D2D3E"/>
+          <w:sz w:val="22"/>
+          <w:szCs w:val="22"/>
+        </w:rPr>
+        <w:t xml:space="preserve">Customers: cards and top-customer mini-list rows are tappable — navigate to CustomerDetailScreen (Session 7)</w:t>
+      </w:r>
+    </w:p>
+    <w:p>
+      <w:pPr>
+        <w:pStyle w:val="ListParagraph"/>
+        <w:numPr>
+          <w:ilvl w:val="0"/>
+          <w:numId w:val="1"/>
+        </w:numPr>
+        <w:spacing w:after="40"/>
+      </w:pPr>
+      <w:r>
+        <w:rPr>
+          <w:color w:val="1D2D3E"/>
+          <w:sz w:val="22"/>
+          <w:szCs w:val="22"/>
+        </w:rPr>
+        <w:t xml:space="preserve">Offline caching: summary/invoices/customers cached per company with 24h TTL; OfflineBanner on stale data (Session 7)</w:t>
       </w:r>
     </w:p>
     <w:p>
@@ -3531,115 +3621,133 @@
           <w:bCs/>
           <w:color w:val="1D2D3E"/>
         </w:rPr>
-        <w:t xml:space="preserve">3.18 Trial Balance Screen (src/screens/trialBalance/TrialBalanceScreen.tsx)</w:t>
-      </w:r>
-    </w:p>
-    <w:p>
-      <w:pPr>
-        <w:pStyle w:val="ListParagraph"/>
-        <w:numPr>
-          <w:ilvl w:val="0"/>
-          <w:numId w:val="1"/>
-        </w:numPr>
-        <w:spacing w:after="40"/>
-      </w:pPr>
-      <w:r>
-        <w:rPr>
-          <w:color w:val="1D2D3E"/>
-          <w:sz w:val="22"/>
-          <w:szCs w:val="22"/>
-        </w:rPr>
-        <w:t xml:space="preserve">Company selector dropdown (populated from /api/options/companies)</w:t>
-      </w:r>
-    </w:p>
-    <w:p>
-      <w:pPr>
-        <w:pStyle w:val="ListParagraph"/>
-        <w:numPr>
-          <w:ilvl w:val="0"/>
-          <w:numId w:val="1"/>
-        </w:numPr>
-        <w:spacing w:after="40"/>
-      </w:pPr>
-      <w:r>
-        <w:rPr>
-          <w:color w:val="1D2D3E"/>
-          <w:sz w:val="22"/>
-          <w:szCs w:val="22"/>
-        </w:rPr>
-        <w:t xml:space="preserve">As-of date text input (YYYY-MM-DD format, Run Report button)</w:t>
-      </w:r>
-    </w:p>
-    <w:p>
-      <w:pPr>
-        <w:pStyle w:val="ListParagraph"/>
-        <w:numPr>
-          <w:ilvl w:val="0"/>
-          <w:numId w:val="1"/>
-        </w:numPr>
-        <w:spacing w:after="40"/>
-      </w:pPr>
-      <w:r>
-        <w:rPr>
-          <w:color w:val="1D2D3E"/>
-          <w:sz w:val="22"/>
-          <w:szCs w:val="22"/>
-        </w:rPr>
-        <w:t xml:space="preserve">Account search filter</w:t>
-      </w:r>
-    </w:p>
-    <w:p>
-      <w:pPr>
-        <w:pStyle w:val="ListParagraph"/>
-        <w:numPr>
-          <w:ilvl w:val="0"/>
-          <w:numId w:val="1"/>
-        </w:numPr>
-        <w:spacing w:after="40"/>
-      </w:pPr>
-      <w:r>
-        <w:rPr>
-          <w:color w:val="1D2D3E"/>
-          <w:sz w:val="22"/>
-          <w:szCs w:val="22"/>
-        </w:rPr>
-        <w:t xml:space="preserve">Summary card: total debit / total credit with balance diff warning</w:t>
-      </w:r>
-    </w:p>
-    <w:p>
-      <w:pPr>
-        <w:pStyle w:val="ListParagraph"/>
-        <w:numPr>
-          <w:ilvl w:val="0"/>
-          <w:numId w:val="1"/>
-        </w:numPr>
-        <w:spacing w:after="40"/>
-      </w:pPr>
-      <w:r>
-        <w:rPr>
-          <w:color w:val="1D2D3E"/>
-          <w:sz w:val="22"/>
-          <w:szCs w:val="22"/>
-        </w:rPr>
-        <w:t xml:space="preserve">Hierarchical account table with group headers, level-based indentation</w:t>
-      </w:r>
-    </w:p>
-    <w:p>
-      <w:pPr>
-        <w:pStyle w:val="ListParagraph"/>
-        <w:numPr>
-          <w:ilvl w:val="0"/>
-          <w:numId w:val="1"/>
-        </w:numPr>
-        <w:spacing w:after="40"/>
-      </w:pPr>
-      <w:r>
-        <w:rPr>
-          <w:color w:val="1D2D3E"/>
-          <w:sz w:val="22"/>
-          <w:szCs w:val="22"/>
-        </w:rPr>
-        <w:t xml:space="preserve">Export button: shares trial balance as formatted columnar text report (Session 5)</w:t>
+        <w:t xml:space="preserve">3.16a Customer Detail Screen (src/screens/finance/CustomerDetailScreen.tsx)</w:t>
+      </w:r>
+    </w:p>
+    <w:p>
+      <w:pPr>
+        <w:pStyle w:val="ListParagraph"/>
+        <w:numPr>
+          <w:ilvl w:val="0"/>
+          <w:numId w:val="1"/>
+        </w:numPr>
+        <w:spacing w:after="40"/>
+      </w:pPr>
+      <w:r>
+        <w:rPr>
+          <w:color w:val="1D2D3E"/>
+          <w:sz w:val="22"/>
+          <w:szCs w:val="22"/>
+        </w:rPr>
+        <w:t xml:space="preserve">New screen introduced in Session 7 — accessible by tapping any customer in AR screen</w:t>
+      </w:r>
+    </w:p>
+    <w:p>
+      <w:pPr>
+        <w:pStyle w:val="ListParagraph"/>
+        <w:numPr>
+          <w:ilvl w:val="0"/>
+          <w:numId w:val="1"/>
+        </w:numPr>
+        <w:spacing w:after="40"/>
+      </w:pPr>
+      <w:r>
+        <w:rPr>
+          <w:color w:val="1D2D3E"/>
+          <w:sz w:val="22"/>
+          <w:szCs w:val="22"/>
+        </w:rPr>
+        <w:t xml:space="preserve">Header: customer name + 'Customer · Accounts Receivable' subtitle</w:t>
+      </w:r>
+    </w:p>
+    <w:p>
+      <w:pPr>
+        <w:pStyle w:val="ListParagraph"/>
+        <w:numPr>
+          <w:ilvl w:val="0"/>
+          <w:numId w:val="1"/>
+        </w:numPr>
+        <w:spacing w:after="40"/>
+      </w:pPr>
+      <w:r>
+        <w:rPr>
+          <w:color w:val="1D2D3E"/>
+          <w:sz w:val="22"/>
+          <w:szCs w:val="22"/>
+        </w:rPr>
+        <w:t xml:space="preserve">Summary tiles: Outstanding, Overdue (highlighted when &gt; 0), Total Billed, Invoice count</w:t>
+      </w:r>
+    </w:p>
+    <w:p>
+      <w:pPr>
+        <w:pStyle w:val="ListParagraph"/>
+        <w:numPr>
+          <w:ilvl w:val="0"/>
+          <w:numId w:val="1"/>
+        </w:numPr>
+        <w:spacing w:after="40"/>
+      </w:pPr>
+      <w:r>
+        <w:rPr>
+          <w:color w:val="1D2D3E"/>
+          <w:sz w:val="22"/>
+          <w:szCs w:val="22"/>
+        </w:rPr>
+        <w:t xml:space="preserve">Invoice list: all invoices for that customer, sorted overdue-first</w:t>
+      </w:r>
+    </w:p>
+    <w:p>
+      <w:pPr>
+        <w:pStyle w:val="ListParagraph"/>
+        <w:numPr>
+          <w:ilvl w:val="0"/>
+          <w:numId w:val="1"/>
+        </w:numPr>
+        <w:spacing w:after="40"/>
+      </w:pPr>
+      <w:r>
+        <w:rPr>
+          <w:color w:val="1D2D3E"/>
+          <w:sz w:val="22"/>
+          <w:szCs w:val="22"/>
+        </w:rPr>
+        <w:t xml:space="preserve">Overdue alert banner on each overdue invoice with days-overdue count</w:t>
+      </w:r>
+    </w:p>
+    <w:p>
+      <w:pPr>
+        <w:pStyle w:val="ListParagraph"/>
+        <w:numPr>
+          <w:ilvl w:val="0"/>
+          <w:numId w:val="1"/>
+        </w:numPr>
+        <w:spacing w:after="40"/>
+      </w:pPr>
+      <w:r>
+        <w:rPr>
+          <w:color w:val="1D2D3E"/>
+          <w:sz w:val="22"/>
+          <w:szCs w:val="22"/>
+        </w:rPr>
+        <w:t xml:space="preserve">Search bar to filter invoices by number or status</w:t>
+      </w:r>
+    </w:p>
+    <w:p>
+      <w:pPr>
+        <w:pStyle w:val="ListParagraph"/>
+        <w:numPr>
+          <w:ilvl w:val="0"/>
+          <w:numId w:val="1"/>
+        </w:numPr>
+        <w:spacing w:after="40"/>
+      </w:pPr>
+      <w:r>
+        <w:rPr>
+          <w:color w:val="1D2D3E"/>
+          <w:sz w:val="22"/>
+          <w:szCs w:val="22"/>
+        </w:rPr>
+        <w:t xml:space="preserve">Pull-to-refresh, loading and empty states</w:t>
       </w:r>
     </w:p>
     <w:p>
@@ -3666,79 +3774,133 @@
           <w:bCs/>
           <w:color w:val="1D2D3E"/>
         </w:rPr>
-        <w:t xml:space="preserve">3.19 Business Partners Screen (src/screens/partners/PartnersScreen.tsx)</w:t>
-      </w:r>
-    </w:p>
-    <w:p>
-      <w:pPr>
-        <w:pStyle w:val="ListParagraph"/>
-        <w:numPr>
-          <w:ilvl w:val="0"/>
-          <w:numId w:val="1"/>
-        </w:numPr>
-        <w:spacing w:after="40"/>
-      </w:pPr>
-      <w:r>
-        <w:rPr>
-          <w:color w:val="1D2D3E"/>
-          <w:sz w:val="22"/>
-          <w:szCs w:val="22"/>
-        </w:rPr>
-        <w:t xml:space="preserve">Searchable list (name, code, email)</w:t>
-      </w:r>
-    </w:p>
-    <w:p>
-      <w:pPr>
-        <w:pStyle w:val="ListParagraph"/>
-        <w:numPr>
-          <w:ilvl w:val="0"/>
-          <w:numId w:val="1"/>
-        </w:numPr>
-        <w:spacing w:after="40"/>
-      </w:pPr>
-      <w:r>
-        <w:rPr>
-          <w:color w:val="1D2D3E"/>
-          <w:sz w:val="22"/>
-          <w:szCs w:val="22"/>
-        </w:rPr>
-        <w:t xml:space="preserve">Role filter tabs: All / Customers / Vendors</w:t>
-      </w:r>
-    </w:p>
-    <w:p>
-      <w:pPr>
-        <w:pStyle w:val="ListParagraph"/>
-        <w:numPr>
-          <w:ilvl w:val="0"/>
-          <w:numId w:val="1"/>
-        </w:numPr>
-        <w:spacing w:after="40"/>
-      </w:pPr>
-      <w:r>
-        <w:rPr>
-          <w:color w:val="1D2D3E"/>
-          <w:sz w:val="22"/>
-          <w:szCs w:val="22"/>
-        </w:rPr>
-        <w:t xml:space="preserve">Partner cards: avatar initials, name, code, role badges (Customer=green, Vendor=blue)</w:t>
-      </w:r>
-    </w:p>
-    <w:p>
-      <w:pPr>
-        <w:pStyle w:val="ListParagraph"/>
-        <w:numPr>
-          <w:ilvl w:val="0"/>
-          <w:numId w:val="1"/>
-        </w:numPr>
-        <w:spacing w:after="40"/>
-      </w:pPr>
-      <w:r>
-        <w:rPr>
-          <w:color w:val="1D2D3E"/>
-          <w:sz w:val="22"/>
-          <w:szCs w:val="22"/>
-        </w:rPr>
-        <w:t xml:space="preserve">Contact info: email, phone, company</w:t>
+        <w:t xml:space="preserve">3.17 Journal Entries Screen (src/screens/journalEntries/JournalEntriesScreen.tsx)</w:t>
+      </w:r>
+    </w:p>
+    <w:p>
+      <w:pPr>
+        <w:pStyle w:val="ListParagraph"/>
+        <w:numPr>
+          <w:ilvl w:val="0"/>
+          <w:numId w:val="1"/>
+        </w:numPr>
+        <w:spacing w:after="40"/>
+      </w:pPr>
+      <w:r>
+        <w:rPr>
+          <w:color w:val="1D2D3E"/>
+          <w:sz w:val="22"/>
+          <w:szCs w:val="22"/>
+        </w:rPr>
+        <w:t xml:space="preserve">Searchable list: voucher number, narration</w:t>
+      </w:r>
+    </w:p>
+    <w:p>
+      <w:pPr>
+        <w:pStyle w:val="ListParagraph"/>
+        <w:numPr>
+          <w:ilvl w:val="0"/>
+          <w:numId w:val="1"/>
+        </w:numPr>
+        <w:spacing w:after="40"/>
+      </w:pPr>
+      <w:r>
+        <w:rPr>
+          <w:color w:val="1D2D3E"/>
+          <w:sz w:val="22"/>
+          <w:szCs w:val="22"/>
+        </w:rPr>
+        <w:t xml:space="preserve">Voucher type filter chips (JV, GRN, PAY, REC, INV, SO, PO, DN)</w:t>
+      </w:r>
+    </w:p>
+    <w:p>
+      <w:pPr>
+        <w:pStyle w:val="ListParagraph"/>
+        <w:numPr>
+          <w:ilvl w:val="0"/>
+          <w:numId w:val="1"/>
+        </w:numPr>
+        <w:spacing w:after="40"/>
+      </w:pPr>
+      <w:r>
+        <w:rPr>
+          <w:color w:val="1D2D3E"/>
+          <w:sz w:val="22"/>
+          <w:szCs w:val="22"/>
+        </w:rPr>
+        <w:t xml:space="preserve">Cards with colored type badge, status badge (POSTED/DRAFT/VOID), debit/credit totals</w:t>
+      </w:r>
+    </w:p>
+    <w:p>
+      <w:pPr>
+        <w:pStyle w:val="ListParagraph"/>
+        <w:numPr>
+          <w:ilvl w:val="0"/>
+          <w:numId w:val="1"/>
+        </w:numPr>
+        <w:spacing w:after="40"/>
+      </w:pPr>
+      <w:r>
+        <w:rPr>
+          <w:color w:val="1D2D3E"/>
+          <w:sz w:val="22"/>
+          <w:szCs w:val="22"/>
+        </w:rPr>
+        <w:t xml:space="preserve">Expandable cards reveal journal lines (account, debit, credit)</w:t>
+      </w:r>
+    </w:p>
+    <w:p>
+      <w:pPr>
+        <w:pStyle w:val="ListParagraph"/>
+        <w:numPr>
+          <w:ilvl w:val="0"/>
+          <w:numId w:val="1"/>
+        </w:numPr>
+        <w:spacing w:after="40"/>
+      </w:pPr>
+      <w:r>
+        <w:rPr>
+          <w:color w:val="1D2D3E"/>
+          <w:sz w:val="22"/>
+          <w:szCs w:val="22"/>
+        </w:rPr>
+        <w:t xml:space="preserve">Date range filter with From/To inputs (YYYY-MM-DD) — server-side filtering (Session 4)</w:t>
+      </w:r>
+    </w:p>
+    <w:p>
+      <w:pPr>
+        <w:pStyle w:val="ListParagraph"/>
+        <w:numPr>
+          <w:ilvl w:val="0"/>
+          <w:numId w:val="1"/>
+        </w:numPr>
+        <w:spacing w:after="40"/>
+      </w:pPr>
+      <w:r>
+        <w:rPr>
+          <w:color w:val="1D2D3E"/>
+          <w:sz w:val="22"/>
+          <w:szCs w:val="22"/>
+        </w:rPr>
+        <w:t xml:space="preserve">Quick date presets: Today, This Week, This Month, Last Month (Session 4)</w:t>
+      </w:r>
+    </w:p>
+    <w:p>
+      <w:pPr>
+        <w:pStyle w:val="ListParagraph"/>
+        <w:numPr>
+          <w:ilvl w:val="0"/>
+          <w:numId w:val="1"/>
+        </w:numPr>
+        <w:spacing w:after="40"/>
+      </w:pPr>
+      <w:r>
+        <w:rPr>
+          <w:color w:val="1D2D3E"/>
+          <w:sz w:val="22"/>
+          <w:szCs w:val="22"/>
+        </w:rPr>
+        <w:t xml:space="preserve">Export button: shares filtered entries as formatted text via Share API (Session 5)</w:t>
       </w:r>
     </w:p>
     <w:p>
@@ -3765,43 +3927,115 @@
           <w:bCs/>
           <w:color w:val="1D2D3E"/>
         </w:rPr>
-        <w:t xml:space="preserve">3.20 Companies Screen (src/screens/companies/CompaniesScreen.tsx)</w:t>
-      </w:r>
-    </w:p>
-    <w:p>
-      <w:pPr>
-        <w:pStyle w:val="ListParagraph"/>
-        <w:numPr>
-          <w:ilvl w:val="0"/>
-          <w:numId w:val="1"/>
-        </w:numPr>
-        <w:spacing w:after="40"/>
-      </w:pPr>
-      <w:r>
-        <w:rPr>
-          <w:color w:val="1D2D3E"/>
-          <w:sz w:val="22"/>
-          <w:szCs w:val="22"/>
-        </w:rPr>
-        <w:t xml:space="preserve">Company list with logo circle (initial letter), name, code, active/inactive status badge</w:t>
-      </w:r>
-    </w:p>
-    <w:p>
-      <w:pPr>
-        <w:pStyle w:val="ListParagraph"/>
-        <w:numPr>
-          <w:ilvl w:val="0"/>
-          <w:numId w:val="1"/>
-        </w:numPr>
-        <w:spacing w:after="40"/>
-      </w:pPr>
-      <w:r>
-        <w:rPr>
-          <w:color w:val="1D2D3E"/>
-          <w:sz w:val="22"/>
-          <w:szCs w:val="22"/>
-        </w:rPr>
-        <w:t xml:space="preserve">Detail grid: currency, fiscal year, phone, email, address</w:t>
+        <w:t xml:space="preserve">3.18 Trial Balance Screen (src/screens/trialBalance/TrialBalanceScreen.tsx)</w:t>
+      </w:r>
+    </w:p>
+    <w:p>
+      <w:pPr>
+        <w:pStyle w:val="ListParagraph"/>
+        <w:numPr>
+          <w:ilvl w:val="0"/>
+          <w:numId w:val="1"/>
+        </w:numPr>
+        <w:spacing w:after="40"/>
+      </w:pPr>
+      <w:r>
+        <w:rPr>
+          <w:color w:val="1D2D3E"/>
+          <w:sz w:val="22"/>
+          <w:szCs w:val="22"/>
+        </w:rPr>
+        <w:t xml:space="preserve">Company selector dropdown (populated from /api/options/companies)</w:t>
+      </w:r>
+    </w:p>
+    <w:p>
+      <w:pPr>
+        <w:pStyle w:val="ListParagraph"/>
+        <w:numPr>
+          <w:ilvl w:val="0"/>
+          <w:numId w:val="1"/>
+        </w:numPr>
+        <w:spacing w:after="40"/>
+      </w:pPr>
+      <w:r>
+        <w:rPr>
+          <w:color w:val="1D2D3E"/>
+          <w:sz w:val="22"/>
+          <w:szCs w:val="22"/>
+        </w:rPr>
+        <w:t xml:space="preserve">As-of date text input (YYYY-MM-DD format, Run Report button)</w:t>
+      </w:r>
+    </w:p>
+    <w:p>
+      <w:pPr>
+        <w:pStyle w:val="ListParagraph"/>
+        <w:numPr>
+          <w:ilvl w:val="0"/>
+          <w:numId w:val="1"/>
+        </w:numPr>
+        <w:spacing w:after="40"/>
+      </w:pPr>
+      <w:r>
+        <w:rPr>
+          <w:color w:val="1D2D3E"/>
+          <w:sz w:val="22"/>
+          <w:szCs w:val="22"/>
+        </w:rPr>
+        <w:t xml:space="preserve">Account search filter</w:t>
+      </w:r>
+    </w:p>
+    <w:p>
+      <w:pPr>
+        <w:pStyle w:val="ListParagraph"/>
+        <w:numPr>
+          <w:ilvl w:val="0"/>
+          <w:numId w:val="1"/>
+        </w:numPr>
+        <w:spacing w:after="40"/>
+      </w:pPr>
+      <w:r>
+        <w:rPr>
+          <w:color w:val="1D2D3E"/>
+          <w:sz w:val="22"/>
+          <w:szCs w:val="22"/>
+        </w:rPr>
+        <w:t xml:space="preserve">Summary card: total debit / total credit with balance diff warning</w:t>
+      </w:r>
+    </w:p>
+    <w:p>
+      <w:pPr>
+        <w:pStyle w:val="ListParagraph"/>
+        <w:numPr>
+          <w:ilvl w:val="0"/>
+          <w:numId w:val="1"/>
+        </w:numPr>
+        <w:spacing w:after="40"/>
+      </w:pPr>
+      <w:r>
+        <w:rPr>
+          <w:color w:val="1D2D3E"/>
+          <w:sz w:val="22"/>
+          <w:szCs w:val="22"/>
+        </w:rPr>
+        <w:t xml:space="preserve">Hierarchical account table with group headers, level-based indentation</w:t>
+      </w:r>
+    </w:p>
+    <w:p>
+      <w:pPr>
+        <w:pStyle w:val="ListParagraph"/>
+        <w:numPr>
+          <w:ilvl w:val="0"/>
+          <w:numId w:val="1"/>
+        </w:numPr>
+        <w:spacing w:after="40"/>
+      </w:pPr>
+      <w:r>
+        <w:rPr>
+          <w:color w:val="1D2D3E"/>
+          <w:sz w:val="22"/>
+          <w:szCs w:val="22"/>
+        </w:rPr>
+        <w:t xml:space="preserve">Export button: shares trial balance as formatted columnar text report (Session 5)</w:t>
       </w:r>
     </w:p>
     <w:p>
@@ -3828,115 +4062,79 @@
           <w:bCs/>
           <w:color w:val="1D2D3E"/>
         </w:rPr>
-        <w:t xml:space="preserve">3.21 Financial Reports Screen (src/screens/financialReports/)</w:t>
-      </w:r>
-    </w:p>
-    <w:p>
-      <w:pPr>
-        <w:pStyle w:val="ListParagraph"/>
-        <w:numPr>
-          <w:ilvl w:val="0"/>
-          <w:numId w:val="1"/>
-        </w:numPr>
-        <w:spacing w:after="40"/>
-      </w:pPr>
-      <w:r>
-        <w:rPr>
-          <w:color w:val="1D2D3E"/>
-          <w:sz w:val="22"/>
-          <w:szCs w:val="22"/>
-        </w:rPr>
-        <w:t xml:space="preserve">Two tabs: Profit &amp; Loss / Balance Sheet</w:t>
-      </w:r>
-    </w:p>
-    <w:p>
-      <w:pPr>
-        <w:pStyle w:val="ListParagraph"/>
-        <w:numPr>
-          <w:ilvl w:val="0"/>
-          <w:numId w:val="1"/>
-        </w:numPr>
-        <w:spacing w:after="40"/>
-      </w:pPr>
-      <w:r>
-        <w:rPr>
-          <w:color w:val="1D2D3E"/>
-          <w:sz w:val="22"/>
-          <w:szCs w:val="22"/>
-        </w:rPr>
-        <w:t xml:space="preserve">P&amp;L: revenue vs expense sections, net income summary card</w:t>
-      </w:r>
-    </w:p>
-    <w:p>
-      <w:pPr>
-        <w:pStyle w:val="ListParagraph"/>
-        <w:numPr>
-          <w:ilvl w:val="0"/>
-          <w:numId w:val="1"/>
-        </w:numPr>
-        <w:spacing w:after="40"/>
-      </w:pPr>
-      <w:r>
-        <w:rPr>
-          <w:color w:val="1D2D3E"/>
-          <w:sz w:val="22"/>
-          <w:szCs w:val="22"/>
-        </w:rPr>
-        <w:t xml:space="preserve">Balance Sheet: assets, liabilities, equity sections with balance check warning</w:t>
-      </w:r>
-    </w:p>
-    <w:p>
-      <w:pPr>
-        <w:pStyle w:val="ListParagraph"/>
-        <w:numPr>
-          <w:ilvl w:val="0"/>
-          <w:numId w:val="1"/>
-        </w:numPr>
-        <w:spacing w:after="40"/>
-      </w:pPr>
-      <w:r>
-        <w:rPr>
-          <w:color w:val="1D2D3E"/>
-          <w:sz w:val="22"/>
-          <w:szCs w:val="22"/>
-        </w:rPr>
-        <w:t xml:space="preserve">Company selector + as-of date picker (same pattern as Trial Balance)</w:t>
-      </w:r>
-    </w:p>
-    <w:p>
-      <w:pPr>
-        <w:pStyle w:val="ListParagraph"/>
-        <w:numPr>
-          <w:ilvl w:val="0"/>
-          <w:numId w:val="1"/>
-        </w:numPr>
-        <w:spacing w:after="40"/>
-      </w:pPr>
-      <w:r>
-        <w:rPr>
-          <w:color w:val="1D2D3E"/>
-          <w:sz w:val="22"/>
-          <w:szCs w:val="22"/>
-        </w:rPr>
-        <w:t xml:space="preserve">Accounts classified by account_type keyword matching</w:t>
-      </w:r>
-    </w:p>
-    <w:p>
-      <w:pPr>
-        <w:pStyle w:val="ListParagraph"/>
-        <w:numPr>
-          <w:ilvl w:val="0"/>
-          <w:numId w:val="1"/>
-        </w:numPr>
-        <w:spacing w:after="40"/>
-      </w:pPr>
-      <w:r>
-        <w:rPr>
-          <w:color w:val="1D2D3E"/>
-          <w:sz w:val="22"/>
-          <w:szCs w:val="22"/>
-        </w:rPr>
-        <w:t xml:space="preserve">Export button: shares P&amp;L or Balance Sheet as formatted text report (Session 5)</w:t>
+        <w:t xml:space="preserve">3.19 Business Partners Screen (src/screens/partners/PartnersScreen.tsx)</w:t>
+      </w:r>
+    </w:p>
+    <w:p>
+      <w:pPr>
+        <w:pStyle w:val="ListParagraph"/>
+        <w:numPr>
+          <w:ilvl w:val="0"/>
+          <w:numId w:val="1"/>
+        </w:numPr>
+        <w:spacing w:after="40"/>
+      </w:pPr>
+      <w:r>
+        <w:rPr>
+          <w:color w:val="1D2D3E"/>
+          <w:sz w:val="22"/>
+          <w:szCs w:val="22"/>
+        </w:rPr>
+        <w:t xml:space="preserve">Searchable list (name, code, email)</w:t>
+      </w:r>
+    </w:p>
+    <w:p>
+      <w:pPr>
+        <w:pStyle w:val="ListParagraph"/>
+        <w:numPr>
+          <w:ilvl w:val="0"/>
+          <w:numId w:val="1"/>
+        </w:numPr>
+        <w:spacing w:after="40"/>
+      </w:pPr>
+      <w:r>
+        <w:rPr>
+          <w:color w:val="1D2D3E"/>
+          <w:sz w:val="22"/>
+          <w:szCs w:val="22"/>
+        </w:rPr>
+        <w:t xml:space="preserve">Role filter tabs: All / Customers / Vendors</w:t>
+      </w:r>
+    </w:p>
+    <w:p>
+      <w:pPr>
+        <w:pStyle w:val="ListParagraph"/>
+        <w:numPr>
+          <w:ilvl w:val="0"/>
+          <w:numId w:val="1"/>
+        </w:numPr>
+        <w:spacing w:after="40"/>
+      </w:pPr>
+      <w:r>
+        <w:rPr>
+          <w:color w:val="1D2D3E"/>
+          <w:sz w:val="22"/>
+          <w:szCs w:val="22"/>
+        </w:rPr>
+        <w:t xml:space="preserve">Partner cards: avatar initials, name, code, role badges (Customer=green, Vendor=blue)</w:t>
+      </w:r>
+    </w:p>
+    <w:p>
+      <w:pPr>
+        <w:pStyle w:val="ListParagraph"/>
+        <w:numPr>
+          <w:ilvl w:val="0"/>
+          <w:numId w:val="1"/>
+        </w:numPr>
+        <w:spacing w:after="40"/>
+      </w:pPr>
+      <w:r>
+        <w:rPr>
+          <w:color w:val="1D2D3E"/>
+          <w:sz w:val="22"/>
+          <w:szCs w:val="22"/>
+        </w:rPr>
+        <w:t xml:space="preserve">Contact info: email, phone, company</w:t>
       </w:r>
     </w:p>
     <w:p>
@@ -3963,115 +4161,43 @@
           <w:bCs/>
           <w:color w:val="1D2D3E"/>
         </w:rPr>
-        <w:t xml:space="preserve">3.22 Global Company Filter (Updated Session 3)</w:t>
-      </w:r>
-    </w:p>
-    <w:p>
-      <w:pPr>
-        <w:pStyle w:val="ListParagraph"/>
-        <w:numPr>
-          <w:ilvl w:val="0"/>
-          <w:numId w:val="1"/>
-        </w:numPr>
-        <w:spacing w:after="40"/>
-      </w:pPr>
-      <w:r>
-        <w:rPr>
-          <w:color w:val="1D2D3E"/>
-          <w:sz w:val="22"/>
-          <w:szCs w:val="22"/>
-        </w:rPr>
-        <w:t xml:space="preserve">CompanyContext (src/context/CompanyContext.tsx) — global state: companies list, selectedCompany, companyId</w:t>
-      </w:r>
-    </w:p>
-    <w:p>
-      <w:pPr>
-        <w:pStyle w:val="ListParagraph"/>
-        <w:numPr>
-          <w:ilvl w:val="0"/>
-          <w:numId w:val="1"/>
-        </w:numPr>
-        <w:spacing w:after="40"/>
-      </w:pPr>
-      <w:r>
-        <w:rPr>
-          <w:color w:val="1D2D3E"/>
-          <w:sz w:val="22"/>
-          <w:szCs w:val="22"/>
-        </w:rPr>
-        <w:t xml:space="preserve">CompanyPicker (src/components/CompanyPicker.tsx) — horizontal scrollable company chips</w:t>
-      </w:r>
-    </w:p>
-    <w:p>
-      <w:pPr>
-        <w:pStyle w:val="ListParagraph"/>
-        <w:numPr>
-          <w:ilvl w:val="0"/>
-          <w:numId w:val="1"/>
-        </w:numPr>
-        <w:spacing w:after="40"/>
-      </w:pPr>
-      <w:r>
-        <w:rPr>
-          <w:color w:val="1D2D3E"/>
-          <w:sz w:val="22"/>
-          <w:szCs w:val="22"/>
-        </w:rPr>
-        <w:t xml:space="preserve">CompanyProvider wrapped around app in App.tsx</w:t>
-      </w:r>
-    </w:p>
-    <w:p>
-      <w:pPr>
-        <w:pStyle w:val="ListParagraph"/>
-        <w:numPr>
-          <w:ilvl w:val="0"/>
-          <w:numId w:val="1"/>
-        </w:numPr>
-        <w:spacing w:after="40"/>
-      </w:pPr>
-      <w:r>
-        <w:rPr>
-          <w:color w:val="1D2D3E"/>
-          <w:sz w:val="22"/>
-          <w:szCs w:val="22"/>
-        </w:rPr>
-        <w:t xml:space="preserve">Now applied to all data screens: Dashboard, Inventory, Materials, Journal Entries, Partners, Sales Orders, AP, AR</w:t>
-      </w:r>
-    </w:p>
-    <w:p>
-      <w:pPr>
-        <w:pStyle w:val="ListParagraph"/>
-        <w:numPr>
-          <w:ilvl w:val="0"/>
-          <w:numId w:val="1"/>
-        </w:numPr>
-        <w:spacing w:after="40"/>
-      </w:pPr>
-      <w:r>
-        <w:rPr>
-          <w:color w:val="1D2D3E"/>
-          <w:sz w:val="22"/>
-          <w:szCs w:val="22"/>
-        </w:rPr>
-        <w:t xml:space="preserve">TrialBalance and FinancialReports use companies list from context (no duplicate API calls)</w:t>
-      </w:r>
-    </w:p>
-    <w:p>
-      <w:pPr>
-        <w:pStyle w:val="ListParagraph"/>
-        <w:numPr>
-          <w:ilvl w:val="0"/>
-          <w:numId w:val="1"/>
-        </w:numPr>
-        <w:spacing w:after="40"/>
-      </w:pPr>
-      <w:r>
-        <w:rPr>
-          <w:color w:val="1D2D3E"/>
-          <w:sz w:val="22"/>
-          <w:szCs w:val="22"/>
-        </w:rPr>
-        <w:t xml:space="preserve">CompanyContext re-loads after login (was incorrectly loading before auth on app start)</w:t>
+        <w:t xml:space="preserve">3.20 Companies Screen (src/screens/companies/CompaniesScreen.tsx)</w:t>
+      </w:r>
+    </w:p>
+    <w:p>
+      <w:pPr>
+        <w:pStyle w:val="ListParagraph"/>
+        <w:numPr>
+          <w:ilvl w:val="0"/>
+          <w:numId w:val="1"/>
+        </w:numPr>
+        <w:spacing w:after="40"/>
+      </w:pPr>
+      <w:r>
+        <w:rPr>
+          <w:color w:val="1D2D3E"/>
+          <w:sz w:val="22"/>
+          <w:szCs w:val="22"/>
+        </w:rPr>
+        <w:t xml:space="preserve">Company list with logo circle (initial letter), name, code, active/inactive status badge</w:t>
+      </w:r>
+    </w:p>
+    <w:p>
+      <w:pPr>
+        <w:pStyle w:val="ListParagraph"/>
+        <w:numPr>
+          <w:ilvl w:val="0"/>
+          <w:numId w:val="1"/>
+        </w:numPr>
+        <w:spacing w:after="40"/>
+      </w:pPr>
+      <w:r>
+        <w:rPr>
+          <w:color w:val="1D2D3E"/>
+          <w:sz w:val="22"/>
+          <w:szCs w:val="22"/>
+        </w:rPr>
+        <w:t xml:space="preserve">Detail grid: currency, fiscal year, phone, email, address</w:t>
       </w:r>
     </w:p>
     <w:p>
@@ -4098,7 +4224,277 @@
           <w:bCs/>
           <w:color w:val="1D2D3E"/>
         </w:rPr>
-        <w:t xml:space="preserve">3.23 Navigation Architecture (Updated Session 6)</w:t>
+        <w:t xml:space="preserve">3.21 Financial Reports Screen (src/screens/financialReports/)</w:t>
+      </w:r>
+    </w:p>
+    <w:p>
+      <w:pPr>
+        <w:pStyle w:val="ListParagraph"/>
+        <w:numPr>
+          <w:ilvl w:val="0"/>
+          <w:numId w:val="1"/>
+        </w:numPr>
+        <w:spacing w:after="40"/>
+      </w:pPr>
+      <w:r>
+        <w:rPr>
+          <w:color w:val="1D2D3E"/>
+          <w:sz w:val="22"/>
+          <w:szCs w:val="22"/>
+        </w:rPr>
+        <w:t xml:space="preserve">Two tabs: Profit &amp; Loss / Balance Sheet</w:t>
+      </w:r>
+    </w:p>
+    <w:p>
+      <w:pPr>
+        <w:pStyle w:val="ListParagraph"/>
+        <w:numPr>
+          <w:ilvl w:val="0"/>
+          <w:numId w:val="1"/>
+        </w:numPr>
+        <w:spacing w:after="40"/>
+      </w:pPr>
+      <w:r>
+        <w:rPr>
+          <w:color w:val="1D2D3E"/>
+          <w:sz w:val="22"/>
+          <w:szCs w:val="22"/>
+        </w:rPr>
+        <w:t xml:space="preserve">P&amp;L: revenue vs expense sections, net income summary card</w:t>
+      </w:r>
+    </w:p>
+    <w:p>
+      <w:pPr>
+        <w:pStyle w:val="ListParagraph"/>
+        <w:numPr>
+          <w:ilvl w:val="0"/>
+          <w:numId w:val="1"/>
+        </w:numPr>
+        <w:spacing w:after="40"/>
+      </w:pPr>
+      <w:r>
+        <w:rPr>
+          <w:color w:val="1D2D3E"/>
+          <w:sz w:val="22"/>
+          <w:szCs w:val="22"/>
+        </w:rPr>
+        <w:t xml:space="preserve">Balance Sheet: assets, liabilities, equity sections with balance check warning</w:t>
+      </w:r>
+    </w:p>
+    <w:p>
+      <w:pPr>
+        <w:pStyle w:val="ListParagraph"/>
+        <w:numPr>
+          <w:ilvl w:val="0"/>
+          <w:numId w:val="1"/>
+        </w:numPr>
+        <w:spacing w:after="40"/>
+      </w:pPr>
+      <w:r>
+        <w:rPr>
+          <w:color w:val="1D2D3E"/>
+          <w:sz w:val="22"/>
+          <w:szCs w:val="22"/>
+        </w:rPr>
+        <w:t xml:space="preserve">Company selector + as-of date picker (same pattern as Trial Balance)</w:t>
+      </w:r>
+    </w:p>
+    <w:p>
+      <w:pPr>
+        <w:pStyle w:val="ListParagraph"/>
+        <w:numPr>
+          <w:ilvl w:val="0"/>
+          <w:numId w:val="1"/>
+        </w:numPr>
+        <w:spacing w:after="40"/>
+      </w:pPr>
+      <w:r>
+        <w:rPr>
+          <w:color w:val="1D2D3E"/>
+          <w:sz w:val="22"/>
+          <w:szCs w:val="22"/>
+        </w:rPr>
+        <w:t xml:space="preserve">Accounts classified by account_type keyword matching</w:t>
+      </w:r>
+    </w:p>
+    <w:p>
+      <w:pPr>
+        <w:pStyle w:val="ListParagraph"/>
+        <w:numPr>
+          <w:ilvl w:val="0"/>
+          <w:numId w:val="1"/>
+        </w:numPr>
+        <w:spacing w:after="40"/>
+      </w:pPr>
+      <w:r>
+        <w:rPr>
+          <w:color w:val="1D2D3E"/>
+          <w:sz w:val="22"/>
+          <w:szCs w:val="22"/>
+        </w:rPr>
+        <w:t xml:space="preserve">Export button: shares P&amp;L or Balance Sheet as formatted text report (Session 5)</w:t>
+      </w:r>
+    </w:p>
+    <w:p>
+      <w:pPr>
+        <w:spacing w:after="80"/>
+      </w:pPr>
+      <w:r>
+        <w:rPr>
+          <w:color w:val="1D2D3E"/>
+          <w:sz w:val="22"/>
+          <w:szCs w:val="22"/>
+        </w:rPr>
+        <w:t xml:space="preserve"/>
+      </w:r>
+    </w:p>
+    <w:p>
+      <w:pPr>
+        <w:pStyle w:val="Heading2"/>
+        <w:spacing w:after="120" w:before="300"/>
+      </w:pPr>
+      <w:r>
+        <w:rPr>
+          <w:b/>
+          <w:bCs/>
+          <w:color w:val="1D2D3E"/>
+        </w:rPr>
+        <w:t xml:space="preserve">3.22 Global Company Filter (Updated Session 3)</w:t>
+      </w:r>
+    </w:p>
+    <w:p>
+      <w:pPr>
+        <w:pStyle w:val="ListParagraph"/>
+        <w:numPr>
+          <w:ilvl w:val="0"/>
+          <w:numId w:val="1"/>
+        </w:numPr>
+        <w:spacing w:after="40"/>
+      </w:pPr>
+      <w:r>
+        <w:rPr>
+          <w:color w:val="1D2D3E"/>
+          <w:sz w:val="22"/>
+          <w:szCs w:val="22"/>
+        </w:rPr>
+        <w:t xml:space="preserve">CompanyContext (src/context/CompanyContext.tsx) — global state: companies list, selectedCompany, companyId</w:t>
+      </w:r>
+    </w:p>
+    <w:p>
+      <w:pPr>
+        <w:pStyle w:val="ListParagraph"/>
+        <w:numPr>
+          <w:ilvl w:val="0"/>
+          <w:numId w:val="1"/>
+        </w:numPr>
+        <w:spacing w:after="40"/>
+      </w:pPr>
+      <w:r>
+        <w:rPr>
+          <w:color w:val="1D2D3E"/>
+          <w:sz w:val="22"/>
+          <w:szCs w:val="22"/>
+        </w:rPr>
+        <w:t xml:space="preserve">CompanyPicker (src/components/CompanyPicker.tsx) — horizontal scrollable company chips</w:t>
+      </w:r>
+    </w:p>
+    <w:p>
+      <w:pPr>
+        <w:pStyle w:val="ListParagraph"/>
+        <w:numPr>
+          <w:ilvl w:val="0"/>
+          <w:numId w:val="1"/>
+        </w:numPr>
+        <w:spacing w:after="40"/>
+      </w:pPr>
+      <w:r>
+        <w:rPr>
+          <w:color w:val="1D2D3E"/>
+          <w:sz w:val="22"/>
+          <w:szCs w:val="22"/>
+        </w:rPr>
+        <w:t xml:space="preserve">CompanyProvider wrapped around app in App.tsx</w:t>
+      </w:r>
+    </w:p>
+    <w:p>
+      <w:pPr>
+        <w:pStyle w:val="ListParagraph"/>
+        <w:numPr>
+          <w:ilvl w:val="0"/>
+          <w:numId w:val="1"/>
+        </w:numPr>
+        <w:spacing w:after="40"/>
+      </w:pPr>
+      <w:r>
+        <w:rPr>
+          <w:color w:val="1D2D3E"/>
+          <w:sz w:val="22"/>
+          <w:szCs w:val="22"/>
+        </w:rPr>
+        <w:t xml:space="preserve">Now applied to all data screens: Dashboard, Inventory, Materials, Journal Entries, Partners, Sales Orders, AP, AR</w:t>
+      </w:r>
+    </w:p>
+    <w:p>
+      <w:pPr>
+        <w:pStyle w:val="ListParagraph"/>
+        <w:numPr>
+          <w:ilvl w:val="0"/>
+          <w:numId w:val="1"/>
+        </w:numPr>
+        <w:spacing w:after="40"/>
+      </w:pPr>
+      <w:r>
+        <w:rPr>
+          <w:color w:val="1D2D3E"/>
+          <w:sz w:val="22"/>
+          <w:szCs w:val="22"/>
+        </w:rPr>
+        <w:t xml:space="preserve">TrialBalance and FinancialReports use companies list from context (no duplicate API calls)</w:t>
+      </w:r>
+    </w:p>
+    <w:p>
+      <w:pPr>
+        <w:pStyle w:val="ListParagraph"/>
+        <w:numPr>
+          <w:ilvl w:val="0"/>
+          <w:numId w:val="1"/>
+        </w:numPr>
+        <w:spacing w:after="40"/>
+      </w:pPr>
+      <w:r>
+        <w:rPr>
+          <w:color w:val="1D2D3E"/>
+          <w:sz w:val="22"/>
+          <w:szCs w:val="22"/>
+        </w:rPr>
+        <w:t xml:space="preserve">CompanyContext re-loads after login (was incorrectly loading before auth on app start)</w:t>
+      </w:r>
+    </w:p>
+    <w:p>
+      <w:pPr>
+        <w:spacing w:after="80"/>
+      </w:pPr>
+      <w:r>
+        <w:rPr>
+          <w:color w:val="1D2D3E"/>
+          <w:sz w:val="22"/>
+          <w:szCs w:val="22"/>
+        </w:rPr>
+        <w:t xml:space="preserve"/>
+      </w:r>
+    </w:p>
+    <w:p>
+      <w:pPr>
+        <w:pStyle w:val="Heading2"/>
+        <w:spacing w:after="120" w:before="300"/>
+      </w:pPr>
+      <w:r>
+        <w:rPr>
+          <w:b/>
+          <w:bCs/>
+          <w:color w:val="1D2D3E"/>
+        </w:rPr>
+        <w:t xml:space="preserve">3.23 Navigation Architecture (Updated Session 7)</w:t>
       </w:r>
     </w:p>
     <w:p>
@@ -4170,7 +4566,7 @@
           <w:sz w:val="22"/>
           <w:szCs w:val="22"/>
         </w:rPr>
-        <w:t xml:space="preserve">FinanceNavigator (stack): FinanceMenu → AccountsPayable, AccountsReceivable, JournalEntries, TrialBalance, FinancialReports</w:t>
+        <w:t xml:space="preserve">FinanceNavigator (stack): FinanceMenu → AccountsPayable, AccountsReceivable, VendorDetail, CustomerDetail, JournalEntries, TrialBalance, FinancialReports</w:t>
       </w:r>
     </w:p>
     <w:p>
@@ -6898,6 +7294,228 @@
           </w:p>
         </w:tc>
       </w:tr>
+      <w:tr>
+        <w:tc>
+          <w:p>
+            <w:pPr>
+              <w:spacing w:after="40" w:before="40"/>
+            </w:pPr>
+            <w:r>
+              <w:rPr>
+                <w:b w:val="false"/>
+                <w:bCs w:val="false"/>
+                <w:color w:val="1D2D3E"/>
+                <w:sz w:val="20"/>
+                <w:szCs w:val="20"/>
+              </w:rPr>
+              <w:t xml:space="preserve">Session 7</w:t>
+            </w:r>
+          </w:p>
+        </w:tc>
+        <w:tc>
+          <w:p>
+            <w:pPr>
+              <w:spacing w:after="40" w:before="40"/>
+            </w:pPr>
+            <w:r>
+              <w:rPr>
+                <w:b w:val="false"/>
+                <w:bCs w:val="false"/>
+                <w:color w:val="1D2D3E"/>
+                <w:sz w:val="20"/>
+                <w:szCs w:val="20"/>
+              </w:rPr>
+              <w:t xml:space="preserve">Vendor Detail Screen (AP)</w:t>
+            </w:r>
+          </w:p>
+        </w:tc>
+        <w:tc>
+          <w:p>
+            <w:pPr>
+              <w:spacing w:after="40" w:before="40"/>
+            </w:pPr>
+            <w:r>
+              <w:rPr>
+                <w:b w:val="false"/>
+                <w:bCs w:val="false"/>
+                <w:color w:val="1D2D3E"/>
+                <w:sz w:val="20"/>
+                <w:szCs w:val="20"/>
+              </w:rPr>
+              <w:t xml:space="preserve">Done</w:t>
+            </w:r>
+          </w:p>
+        </w:tc>
+        <w:tc>
+          <w:p>
+            <w:pPr>
+              <w:spacing w:after="40" w:before="40"/>
+            </w:pPr>
+            <w:r>
+              <w:rPr>
+                <w:b w:val="false"/>
+                <w:bCs w:val="false"/>
+                <w:color w:val="1D2D3E"/>
+                <w:sz w:val="20"/>
+                <w:szCs w:val="20"/>
+              </w:rPr>
+              <w:t xml:space="preserve">/api/mobile/accounts-payable?view=bills (filtered client-side)</w:t>
+            </w:r>
+          </w:p>
+        </w:tc>
+      </w:tr>
+      <w:tr>
+        <w:tc>
+          <w:tcPr>
+            <w:shd w:color="F0F4F8" w:val="solid"/>
+          </w:tcPr>
+          <w:p>
+            <w:pPr>
+              <w:spacing w:after="40" w:before="40"/>
+            </w:pPr>
+            <w:r>
+              <w:rPr>
+                <w:b w:val="false"/>
+                <w:bCs w:val="false"/>
+                <w:color w:val="1D2D3E"/>
+                <w:sz w:val="20"/>
+                <w:szCs w:val="20"/>
+              </w:rPr>
+              <w:t xml:space="preserve">Session 7</w:t>
+            </w:r>
+          </w:p>
+        </w:tc>
+        <w:tc>
+          <w:tcPr>
+            <w:shd w:color="F0F4F8" w:val="solid"/>
+          </w:tcPr>
+          <w:p>
+            <w:pPr>
+              <w:spacing w:after="40" w:before="40"/>
+            </w:pPr>
+            <w:r>
+              <w:rPr>
+                <w:b w:val="false"/>
+                <w:bCs w:val="false"/>
+                <w:color w:val="1D2D3E"/>
+                <w:sz w:val="20"/>
+                <w:szCs w:val="20"/>
+              </w:rPr>
+              <w:t xml:space="preserve">Customer Detail Screen (AR)</w:t>
+            </w:r>
+          </w:p>
+        </w:tc>
+        <w:tc>
+          <w:tcPr>
+            <w:shd w:color="F0F4F8" w:val="solid"/>
+          </w:tcPr>
+          <w:p>
+            <w:pPr>
+              <w:spacing w:after="40" w:before="40"/>
+            </w:pPr>
+            <w:r>
+              <w:rPr>
+                <w:b w:val="false"/>
+                <w:bCs w:val="false"/>
+                <w:color w:val="1D2D3E"/>
+                <w:sz w:val="20"/>
+                <w:szCs w:val="20"/>
+              </w:rPr>
+              <w:t xml:space="preserve">Done</w:t>
+            </w:r>
+          </w:p>
+        </w:tc>
+        <w:tc>
+          <w:tcPr>
+            <w:shd w:color="F0F4F8" w:val="solid"/>
+          </w:tcPr>
+          <w:p>
+            <w:pPr>
+              <w:spacing w:after="40" w:before="40"/>
+            </w:pPr>
+            <w:r>
+              <w:rPr>
+                <w:b w:val="false"/>
+                <w:bCs w:val="false"/>
+                <w:color w:val="1D2D3E"/>
+                <w:sz w:val="20"/>
+                <w:szCs w:val="20"/>
+              </w:rPr>
+              <w:t xml:space="preserve">/api/mobile/accounts-receivable?view=invoices (filtered client-side)</w:t>
+            </w:r>
+          </w:p>
+        </w:tc>
+      </w:tr>
+      <w:tr>
+        <w:tc>
+          <w:p>
+            <w:pPr>
+              <w:spacing w:after="40" w:before="40"/>
+            </w:pPr>
+            <w:r>
+              <w:rPr>
+                <w:b w:val="false"/>
+                <w:bCs w:val="false"/>
+                <w:color w:val="1D2D3E"/>
+                <w:sz w:val="20"/>
+                <w:szCs w:val="20"/>
+              </w:rPr>
+              <w:t xml:space="preserve">Session 7</w:t>
+            </w:r>
+          </w:p>
+        </w:tc>
+        <w:tc>
+          <w:p>
+            <w:pPr>
+              <w:spacing w:after="40" w:before="40"/>
+            </w:pPr>
+            <w:r>
+              <w:rPr>
+                <w:b w:val="false"/>
+                <w:bCs w:val="false"/>
+                <w:color w:val="1D2D3E"/>
+                <w:sz w:val="20"/>
+                <w:szCs w:val="20"/>
+              </w:rPr>
+              <w:t xml:space="preserve">Offline Caching extended (AP, AR, Materials)</w:t>
+            </w:r>
+          </w:p>
+        </w:tc>
+        <w:tc>
+          <w:p>
+            <w:pPr>
+              <w:spacing w:after="40" w:before="40"/>
+            </w:pPr>
+            <w:r>
+              <w:rPr>
+                <w:b w:val="false"/>
+                <w:bCs w:val="false"/>
+                <w:color w:val="1D2D3E"/>
+                <w:sz w:val="20"/>
+                <w:szCs w:val="20"/>
+              </w:rPr>
+              <w:t xml:space="preserve">Done</w:t>
+            </w:r>
+          </w:p>
+        </w:tc>
+        <w:tc>
+          <w:p>
+            <w:pPr>
+              <w:spacing w:after="40" w:before="40"/>
+            </w:pPr>
+            <w:r>
+              <w:rPr>
+                <w:b w:val="false"/>
+                <w:bCs w:val="false"/>
+                <w:color w:val="1D2D3E"/>
+                <w:sz w:val="20"/>
+                <w:szCs w:val="20"/>
+              </w:rPr>
+              <w:t xml:space="preserve">—</w:t>
+            </w:r>
+          </w:p>
+        </w:tc>
+      </w:tr>
     </w:tbl>
     <w:p>
       <w:pPr>
@@ -9073,6 +9691,285 @@
           <w:szCs w:val="22"/>
         </w:rPr>
         <w:t xml:space="preserve">Offline caching: InventoryScreen caches stock balances per company, populates UI from cache immediately</w:t>
+      </w:r>
+    </w:p>
+    <w:p>
+      <w:pPr>
+        <w:spacing w:after="80"/>
+      </w:pPr>
+      <w:r>
+        <w:rPr>
+          <w:color w:val="1D2D3E"/>
+          <w:sz w:val="22"/>
+          <w:szCs w:val="22"/>
+        </w:rPr>
+        <w:t xml:space="preserve"/>
+      </w:r>
+    </w:p>
+    <w:p>
+      <w:pPr>
+        <w:pStyle w:val="Heading2"/>
+        <w:spacing w:after="120" w:before="300"/>
+      </w:pPr>
+      <w:r>
+        <w:rPr>
+          <w:b/>
+          <w:bCs/>
+          <w:color w:val="1D2D3E"/>
+        </w:rPr>
+        <w:t xml:space="preserve">Session 7 — 2026-05-20</w:t>
+      </w:r>
+    </w:p>
+    <w:p>
+      <w:pPr>
+        <w:pStyle w:val="ListParagraph"/>
+        <w:numPr>
+          <w:ilvl w:val="0"/>
+          <w:numId w:val="1"/>
+        </w:numPr>
+        <w:spacing w:after="40"/>
+      </w:pPr>
+      <w:r>
+        <w:rPr>
+          <w:color w:val="1D2D3E"/>
+          <w:sz w:val="22"/>
+          <w:szCs w:val="22"/>
+        </w:rPr>
+        <w:t xml:space="preserve">Created VendorDetailScreen (src/screens/finance/VendorDetailScreen.tsx)</w:t>
+      </w:r>
+    </w:p>
+    <w:p>
+      <w:pPr>
+        <w:pStyle w:val="ListParagraph"/>
+        <w:numPr>
+          <w:ilvl w:val="1"/>
+          <w:numId w:val="1"/>
+        </w:numPr>
+        <w:spacing w:after="40"/>
+      </w:pPr>
+      <w:r>
+        <w:rPr>
+          <w:color w:val="1D2D3E"/>
+          <w:sz w:val="22"/>
+          <w:szCs w:val="22"/>
+        </w:rPr>
+        <w:t xml:space="preserve">  — Tap any vendor card or top-vendor row in AP screen to view their full bill history</w:t>
+      </w:r>
+    </w:p>
+    <w:p>
+      <w:pPr>
+        <w:pStyle w:val="ListParagraph"/>
+        <w:numPr>
+          <w:ilvl w:val="1"/>
+          <w:numId w:val="1"/>
+        </w:numPr>
+        <w:spacing w:after="40"/>
+      </w:pPr>
+      <w:r>
+        <w:rPr>
+          <w:color w:val="1D2D3E"/>
+          <w:sz w:val="22"/>
+          <w:szCs w:val="22"/>
+        </w:rPr>
+        <w:t xml:space="preserve">  — Summary tiles: Outstanding, Overdue (highlighted), Total Billed, Bill count</w:t>
+      </w:r>
+    </w:p>
+    <w:p>
+      <w:pPr>
+        <w:pStyle w:val="ListParagraph"/>
+        <w:numPr>
+          <w:ilvl w:val="1"/>
+          <w:numId w:val="1"/>
+        </w:numPr>
+        <w:spacing w:after="40"/>
+      </w:pPr>
+      <w:r>
+        <w:rPr>
+          <w:color w:val="1D2D3E"/>
+          <w:sz w:val="22"/>
+          <w:szCs w:val="22"/>
+        </w:rPr>
+        <w:t xml:space="preserve">  — Bills sorted overdue-first, each with overdue-days alert banner</w:t>
+      </w:r>
+    </w:p>
+    <w:p>
+      <w:pPr>
+        <w:pStyle w:val="ListParagraph"/>
+        <w:numPr>
+          <w:ilvl w:val="1"/>
+          <w:numId w:val="1"/>
+        </w:numPr>
+        <w:spacing w:after="40"/>
+      </w:pPr>
+      <w:r>
+        <w:rPr>
+          <w:color w:val="1D2D3E"/>
+          <w:sz w:val="22"/>
+          <w:szCs w:val="22"/>
+        </w:rPr>
+        <w:t xml:space="preserve">  — Search by bill number or status, pull-to-refresh</w:t>
+      </w:r>
+    </w:p>
+    <w:p>
+      <w:pPr>
+        <w:pStyle w:val="ListParagraph"/>
+        <w:numPr>
+          <w:ilvl w:val="0"/>
+          <w:numId w:val="1"/>
+        </w:numPr>
+        <w:spacing w:after="40"/>
+      </w:pPr>
+      <w:r>
+        <w:rPr>
+          <w:color w:val="1D2D3E"/>
+          <w:sz w:val="22"/>
+          <w:szCs w:val="22"/>
+        </w:rPr>
+        <w:t xml:space="preserve">Created CustomerDetailScreen (src/screens/finance/CustomerDetailScreen.tsx)</w:t>
+      </w:r>
+    </w:p>
+    <w:p>
+      <w:pPr>
+        <w:pStyle w:val="ListParagraph"/>
+        <w:numPr>
+          <w:ilvl w:val="1"/>
+          <w:numId w:val="1"/>
+        </w:numPr>
+        <w:spacing w:after="40"/>
+      </w:pPr>
+      <w:r>
+        <w:rPr>
+          <w:color w:val="1D2D3E"/>
+          <w:sz w:val="22"/>
+          <w:szCs w:val="22"/>
+        </w:rPr>
+        <w:t xml:space="preserve">  — Same pattern as VendorDetail but for AR customers → invoice history</w:t>
+      </w:r>
+    </w:p>
+    <w:p>
+      <w:pPr>
+        <w:pStyle w:val="ListParagraph"/>
+        <w:numPr>
+          <w:ilvl w:val="1"/>
+          <w:numId w:val="1"/>
+        </w:numPr>
+        <w:spacing w:after="40"/>
+      </w:pPr>
+      <w:r>
+        <w:rPr>
+          <w:color w:val="1D2D3E"/>
+          <w:sz w:val="22"/>
+          <w:szCs w:val="22"/>
+        </w:rPr>
+        <w:t xml:space="preserve">  — Tap any customer card or top-customer row in AR screen</w:t>
+      </w:r>
+    </w:p>
+    <w:p>
+      <w:pPr>
+        <w:pStyle w:val="ListParagraph"/>
+        <w:numPr>
+          <w:ilvl w:val="0"/>
+          <w:numId w:val="1"/>
+        </w:numPr>
+        <w:spacing w:after="40"/>
+      </w:pPr>
+      <w:r>
+        <w:rPr>
+          <w:color w:val="1D2D3E"/>
+          <w:sz w:val="22"/>
+          <w:szCs w:val="22"/>
+        </w:rPr>
+        <w:t xml:space="preserve">AccountsPayableScreen: VendorCard and summary mini-list now tappable (chevron-right affordance)</w:t>
+      </w:r>
+    </w:p>
+    <w:p>
+      <w:pPr>
+        <w:pStyle w:val="ListParagraph"/>
+        <w:numPr>
+          <w:ilvl w:val="0"/>
+          <w:numId w:val="1"/>
+        </w:numPr>
+        <w:spacing w:after="40"/>
+      </w:pPr>
+      <w:r>
+        <w:rPr>
+          <w:color w:val="1D2D3E"/>
+          <w:sz w:val="22"/>
+          <w:szCs w:val="22"/>
+        </w:rPr>
+        <w:t xml:space="preserve">AccountsReceivableScreen: CustomerCard and summary mini-list now tappable (chevron-right affordance)</w:t>
+      </w:r>
+    </w:p>
+    <w:p>
+      <w:pPr>
+        <w:pStyle w:val="ListParagraph"/>
+        <w:numPr>
+          <w:ilvl w:val="0"/>
+          <w:numId w:val="1"/>
+        </w:numPr>
+        <w:spacing w:after="40"/>
+      </w:pPr>
+      <w:r>
+        <w:rPr>
+          <w:color w:val="1D2D3E"/>
+          <w:sz w:val="22"/>
+          <w:szCs w:val="22"/>
+        </w:rPr>
+        <w:t xml:space="preserve">FinanceNavigator: added VendorDetail + CustomerDetail routes with typed params</w:t>
+      </w:r>
+    </w:p>
+    <w:p>
+      <w:pPr>
+        <w:pStyle w:val="ListParagraph"/>
+        <w:numPr>
+          <w:ilvl w:val="0"/>
+          <w:numId w:val="1"/>
+        </w:numPr>
+        <w:spacing w:after="40"/>
+      </w:pPr>
+      <w:r>
+        <w:rPr>
+          <w:color w:val="1D2D3E"/>
+          <w:sz w:val="22"/>
+          <w:szCs w:val="22"/>
+        </w:rPr>
+        <w:t xml:space="preserve">Offline caching extended to AccountsPayableScreen (summary/bills/vendors per company)</w:t>
+      </w:r>
+    </w:p>
+    <w:p>
+      <w:pPr>
+        <w:pStyle w:val="ListParagraph"/>
+        <w:numPr>
+          <w:ilvl w:val="0"/>
+          <w:numId w:val="1"/>
+        </w:numPr>
+        <w:spacing w:after="40"/>
+      </w:pPr>
+      <w:r>
+        <w:rPr>
+          <w:color w:val="1D2D3E"/>
+          <w:sz w:val="22"/>
+          <w:szCs w:val="22"/>
+        </w:rPr>
+        <w:t xml:space="preserve">Offline caching extended to AccountsReceivableScreen (summary/invoices/customers per company)</w:t>
+      </w:r>
+    </w:p>
+    <w:p>
+      <w:pPr>
+        <w:pStyle w:val="ListParagraph"/>
+        <w:numPr>
+          <w:ilvl w:val="0"/>
+          <w:numId w:val="1"/>
+        </w:numPr>
+        <w:spacing w:after="40"/>
+      </w:pPr>
+      <w:r>
+        <w:rPr>
+          <w:color w:val="1D2D3E"/>
+          <w:sz w:val="22"/>
+          <w:szCs w:val="22"/>
+        </w:rPr>
+        <w:t xml:space="preserve">Offline caching extended to MaterialsScreen (materials + types per company+type combo)</w:t>
       </w:r>
     </w:p>
     <w:p>

</xml_diff>

<commit_message>
Session 8: PROGRESS.md, generate-docs.js, FEATURES.docx updated with Session 8 changelog
</commit_message>
<xml_diff>
--- a/FEATURES.docx
+++ b/FEATURES.docx
@@ -4116,25 +4116,43 @@
           <w:sz w:val="22"/>
           <w:szCs w:val="22"/>
         </w:rPr>
-        <w:t xml:space="preserve">Partner cards: avatar initials, name, code, role badges (Customer=green, Vendor=blue)</w:t>
-      </w:r>
-    </w:p>
-    <w:p>
-      <w:pPr>
-        <w:pStyle w:val="ListParagraph"/>
-        <w:numPr>
-          <w:ilvl w:val="0"/>
-          <w:numId w:val="1"/>
-        </w:numPr>
-        <w:spacing w:after="40"/>
-      </w:pPr>
-      <w:r>
-        <w:rPr>
-          <w:color w:val="1D2D3E"/>
-          <w:sz w:val="22"/>
-          <w:szCs w:val="22"/>
-        </w:rPr>
-        <w:t xml:space="preserve">Contact info: email, phone, company</w:t>
+        <w:t xml:space="preserve">Partner cards: avatar initials, name, code, role badges, contact info — tappable (Session 8)</w:t>
+      </w:r>
+    </w:p>
+    <w:p>
+      <w:pPr>
+        <w:pStyle w:val="ListParagraph"/>
+        <w:numPr>
+          <w:ilvl w:val="0"/>
+          <w:numId w:val="1"/>
+        </w:numPr>
+        <w:spacing w:after="40"/>
+      </w:pPr>
+      <w:r>
+        <w:rPr>
+          <w:color w:val="1D2D3E"/>
+          <w:sz w:val="22"/>
+          <w:szCs w:val="22"/>
+        </w:rPr>
+        <w:t xml:space="preserve">Tap partner card → PartnerDetailScreen with chevron-right affordance (Session 8)</w:t>
+      </w:r>
+    </w:p>
+    <w:p>
+      <w:pPr>
+        <w:pStyle w:val="ListParagraph"/>
+        <w:numPr>
+          <w:ilvl w:val="0"/>
+          <w:numId w:val="1"/>
+        </w:numPr>
+        <w:spacing w:after="40"/>
+      </w:pPr>
+      <w:r>
+        <w:rPr>
+          <w:color w:val="1D2D3E"/>
+          <w:sz w:val="22"/>
+          <w:szCs w:val="22"/>
+        </w:rPr>
+        <w:t xml:space="preserve">Offline caching: partners list cached per company with 24h TTL; OfflineBanner on stale data (Session 8)</w:t>
       </w:r>
     </w:p>
     <w:p>
@@ -4161,43 +4179,133 @@
           <w:bCs/>
           <w:color w:val="1D2D3E"/>
         </w:rPr>
-        <w:t xml:space="preserve">3.20 Companies Screen (src/screens/companies/CompaniesScreen.tsx)</w:t>
-      </w:r>
-    </w:p>
-    <w:p>
-      <w:pPr>
-        <w:pStyle w:val="ListParagraph"/>
-        <w:numPr>
-          <w:ilvl w:val="0"/>
-          <w:numId w:val="1"/>
-        </w:numPr>
-        <w:spacing w:after="40"/>
-      </w:pPr>
-      <w:r>
-        <w:rPr>
-          <w:color w:val="1D2D3E"/>
-          <w:sz w:val="22"/>
-          <w:szCs w:val="22"/>
-        </w:rPr>
-        <w:t xml:space="preserve">Company list with logo circle (initial letter), name, code, active/inactive status badge</w:t>
-      </w:r>
-    </w:p>
-    <w:p>
-      <w:pPr>
-        <w:pStyle w:val="ListParagraph"/>
-        <w:numPr>
-          <w:ilvl w:val="0"/>
-          <w:numId w:val="1"/>
-        </w:numPr>
-        <w:spacing w:after="40"/>
-      </w:pPr>
-      <w:r>
-        <w:rPr>
-          <w:color w:val="1D2D3E"/>
-          <w:sz w:val="22"/>
-          <w:szCs w:val="22"/>
-        </w:rPr>
-        <w:t xml:space="preserve">Detail grid: currency, fiscal year, phone, email, address</w:t>
+        <w:t xml:space="preserve">3.19a Partner Detail Screen (src/screens/partners/PartnerDetailScreen.tsx)</w:t>
+      </w:r>
+    </w:p>
+    <w:p>
+      <w:pPr>
+        <w:pStyle w:val="ListParagraph"/>
+        <w:numPr>
+          <w:ilvl w:val="0"/>
+          <w:numId w:val="1"/>
+        </w:numPr>
+        <w:spacing w:after="40"/>
+      </w:pPr>
+      <w:r>
+        <w:rPr>
+          <w:color w:val="1D2D3E"/>
+          <w:sz w:val="22"/>
+          <w:szCs w:val="22"/>
+        </w:rPr>
+        <w:t xml:space="preserve">New screen introduced in Session 8 — accessible by tapping any partner in Partners screen</w:t>
+      </w:r>
+    </w:p>
+    <w:p>
+      <w:pPr>
+        <w:pStyle w:val="ListParagraph"/>
+        <w:numPr>
+          <w:ilvl w:val="0"/>
+          <w:numId w:val="1"/>
+        </w:numPr>
+        <w:spacing w:after="40"/>
+      </w:pPr>
+      <w:r>
+        <w:rPr>
+          <w:color w:val="1D2D3E"/>
+          <w:sz w:val="22"/>
+          <w:szCs w:val="22"/>
+        </w:rPr>
+        <w:t xml:space="preserve">Receives: partnerId, partnerName, isVendor, isCustomer navigation params</w:t>
+      </w:r>
+    </w:p>
+    <w:p>
+      <w:pPr>
+        <w:pStyle w:val="ListParagraph"/>
+        <w:numPr>
+          <w:ilvl w:val="0"/>
+          <w:numId w:val="1"/>
+        </w:numPr>
+        <w:spacing w:after="40"/>
+      </w:pPr>
+      <w:r>
+        <w:rPr>
+          <w:color w:val="1D2D3E"/>
+          <w:sz w:val="22"/>
+          <w:szCs w:val="22"/>
+        </w:rPr>
+        <w:t xml:space="preserve">Fetches all POs and SOs, then filters client-side by vendor_id / customer_id or matching name</w:t>
+      </w:r>
+    </w:p>
+    <w:p>
+      <w:pPr>
+        <w:pStyle w:val="ListParagraph"/>
+        <w:numPr>
+          <w:ilvl w:val="0"/>
+          <w:numId w:val="1"/>
+        </w:numPr>
+        <w:spacing w:after="40"/>
+      </w:pPr>
+      <w:r>
+        <w:rPr>
+          <w:color w:val="1D2D3E"/>
+          <w:sz w:val="22"/>
+          <w:szCs w:val="22"/>
+        </w:rPr>
+        <w:t xml:space="preserve">Summary tiles: Total PO value + order count (for vendors) / Total SO value + order count (for customers)</w:t>
+      </w:r>
+    </w:p>
+    <w:p>
+      <w:pPr>
+        <w:pStyle w:val="ListParagraph"/>
+        <w:numPr>
+          <w:ilvl w:val="0"/>
+          <w:numId w:val="1"/>
+        </w:numPr>
+        <w:spacing w:after="40"/>
+      </w:pPr>
+      <w:r>
+        <w:rPr>
+          <w:color w:val="1D2D3E"/>
+          <w:sz w:val="22"/>
+          <w:szCs w:val="22"/>
+        </w:rPr>
+        <w:t xml:space="preserve">Dual-role tab bar (Purchase Orders | Sales Orders) shown when partner has both roles</w:t>
+      </w:r>
+    </w:p>
+    <w:p>
+      <w:pPr>
+        <w:pStyle w:val="ListParagraph"/>
+        <w:numPr>
+          <w:ilvl w:val="0"/>
+          <w:numId w:val="1"/>
+        </w:numPr>
+        <w:spacing w:after="40"/>
+      </w:pPr>
+      <w:r>
+        <w:rPr>
+          <w:color w:val="1D2D3E"/>
+          <w:sz w:val="22"/>
+          <w:szCs w:val="22"/>
+        </w:rPr>
+        <w:t xml:space="preserve">PO cards tap → PurchaseOrderDetail; SO cards tap → SalesOrderDetail</w:t>
+      </w:r>
+    </w:p>
+    <w:p>
+      <w:pPr>
+        <w:pStyle w:val="ListParagraph"/>
+        <w:numPr>
+          <w:ilvl w:val="0"/>
+          <w:numId w:val="1"/>
+        </w:numPr>
+        <w:spacing w:after="40"/>
+      </w:pPr>
+      <w:r>
+        <w:rPr>
+          <w:color w:val="1D2D3E"/>
+          <w:sz w:val="22"/>
+          <w:szCs w:val="22"/>
+        </w:rPr>
+        <w:t xml:space="preserve">Pull-to-refresh, loading state, empty states per section</w:t>
       </w:r>
     </w:p>
     <w:p>
@@ -4224,115 +4332,133 @@
           <w:bCs/>
           <w:color w:val="1D2D3E"/>
         </w:rPr>
-        <w:t xml:space="preserve">3.21 Financial Reports Screen (src/screens/financialReports/)</w:t>
-      </w:r>
-    </w:p>
-    <w:p>
-      <w:pPr>
-        <w:pStyle w:val="ListParagraph"/>
-        <w:numPr>
-          <w:ilvl w:val="0"/>
-          <w:numId w:val="1"/>
-        </w:numPr>
-        <w:spacing w:after="40"/>
-      </w:pPr>
-      <w:r>
-        <w:rPr>
-          <w:color w:val="1D2D3E"/>
-          <w:sz w:val="22"/>
-          <w:szCs w:val="22"/>
-        </w:rPr>
-        <w:t xml:space="preserve">Two tabs: Profit &amp; Loss / Balance Sheet</w:t>
-      </w:r>
-    </w:p>
-    <w:p>
-      <w:pPr>
-        <w:pStyle w:val="ListParagraph"/>
-        <w:numPr>
-          <w:ilvl w:val="0"/>
-          <w:numId w:val="1"/>
-        </w:numPr>
-        <w:spacing w:after="40"/>
-      </w:pPr>
-      <w:r>
-        <w:rPr>
-          <w:color w:val="1D2D3E"/>
-          <w:sz w:val="22"/>
-          <w:szCs w:val="22"/>
-        </w:rPr>
-        <w:t xml:space="preserve">P&amp;L: revenue vs expense sections, net income summary card</w:t>
-      </w:r>
-    </w:p>
-    <w:p>
-      <w:pPr>
-        <w:pStyle w:val="ListParagraph"/>
-        <w:numPr>
-          <w:ilvl w:val="0"/>
-          <w:numId w:val="1"/>
-        </w:numPr>
-        <w:spacing w:after="40"/>
-      </w:pPr>
-      <w:r>
-        <w:rPr>
-          <w:color w:val="1D2D3E"/>
-          <w:sz w:val="22"/>
-          <w:szCs w:val="22"/>
-        </w:rPr>
-        <w:t xml:space="preserve">Balance Sheet: assets, liabilities, equity sections with balance check warning</w:t>
-      </w:r>
-    </w:p>
-    <w:p>
-      <w:pPr>
-        <w:pStyle w:val="ListParagraph"/>
-        <w:numPr>
-          <w:ilvl w:val="0"/>
-          <w:numId w:val="1"/>
-        </w:numPr>
-        <w:spacing w:after="40"/>
-      </w:pPr>
-      <w:r>
-        <w:rPr>
-          <w:color w:val="1D2D3E"/>
-          <w:sz w:val="22"/>
-          <w:szCs w:val="22"/>
-        </w:rPr>
-        <w:t xml:space="preserve">Company selector + as-of date picker (same pattern as Trial Balance)</w:t>
-      </w:r>
-    </w:p>
-    <w:p>
-      <w:pPr>
-        <w:pStyle w:val="ListParagraph"/>
-        <w:numPr>
-          <w:ilvl w:val="0"/>
-          <w:numId w:val="1"/>
-        </w:numPr>
-        <w:spacing w:after="40"/>
-      </w:pPr>
-      <w:r>
-        <w:rPr>
-          <w:color w:val="1D2D3E"/>
-          <w:sz w:val="22"/>
-          <w:szCs w:val="22"/>
-        </w:rPr>
-        <w:t xml:space="preserve">Accounts classified by account_type keyword matching</w:t>
-      </w:r>
-    </w:p>
-    <w:p>
-      <w:pPr>
-        <w:pStyle w:val="ListParagraph"/>
-        <w:numPr>
-          <w:ilvl w:val="0"/>
-          <w:numId w:val="1"/>
-        </w:numPr>
-        <w:spacing w:after="40"/>
-      </w:pPr>
-      <w:r>
-        <w:rPr>
-          <w:color w:val="1D2D3E"/>
-          <w:sz w:val="22"/>
-          <w:szCs w:val="22"/>
-        </w:rPr>
-        <w:t xml:space="preserve">Export button: shares P&amp;L or Balance Sheet as formatted text report (Session 5)</w:t>
+        <w:t xml:space="preserve">3.19b Settings Screen (src/screens/settings/SettingsScreen.tsx)</w:t>
+      </w:r>
+    </w:p>
+    <w:p>
+      <w:pPr>
+        <w:pStyle w:val="ListParagraph"/>
+        <w:numPr>
+          <w:ilvl w:val="0"/>
+          <w:numId w:val="1"/>
+        </w:numPr>
+        <w:spacing w:after="40"/>
+      </w:pPr>
+      <w:r>
+        <w:rPr>
+          <w:color w:val="1D2D3E"/>
+          <w:sz w:val="22"/>
+          <w:szCs w:val="22"/>
+        </w:rPr>
+        <w:t xml:space="preserve">New screen introduced in Session 8 — accessible from MoreMenu → Admin → Settings</w:t>
+      </w:r>
+    </w:p>
+    <w:p>
+      <w:pPr>
+        <w:pStyle w:val="ListParagraph"/>
+        <w:numPr>
+          <w:ilvl w:val="0"/>
+          <w:numId w:val="1"/>
+        </w:numPr>
+        <w:spacing w:after="40"/>
+      </w:pPr>
+      <w:r>
+        <w:rPr>
+          <w:color w:val="1D2D3E"/>
+          <w:sz w:val="22"/>
+          <w:szCs w:val="22"/>
+        </w:rPr>
+        <w:t xml:space="preserve">Low-stock threshold: text input to configure qty threshold for low-stock flag on Inventory screen</w:t>
+      </w:r>
+    </w:p>
+    <w:p>
+      <w:pPr>
+        <w:pStyle w:val="ListParagraph"/>
+        <w:numPr>
+          <w:ilvl w:val="0"/>
+          <w:numId w:val="1"/>
+        </w:numPr>
+        <w:spacing w:after="40"/>
+      </w:pPr>
+      <w:r>
+        <w:rPr>
+          <w:color w:val="1D2D3E"/>
+          <w:sz w:val="22"/>
+          <w:szCs w:val="22"/>
+        </w:rPr>
+        <w:t xml:space="preserve">Threshold stored in AsyncStorage via src/utils/settings.ts (getLowStockThreshold/setLowStockThreshold)</w:t>
+      </w:r>
+    </w:p>
+    <w:p>
+      <w:pPr>
+        <w:pStyle w:val="ListParagraph"/>
+        <w:numPr>
+          <w:ilvl w:val="0"/>
+          <w:numId w:val="1"/>
+        </w:numPr>
+        <w:spacing w:after="40"/>
+      </w:pPr>
+      <w:r>
+        <w:rPr>
+          <w:color w:val="1D2D3E"/>
+          <w:sz w:val="22"/>
+          <w:szCs w:val="22"/>
+        </w:rPr>
+        <w:t xml:space="preserve">Default threshold: 100 units; validation requires positive integer</w:t>
+      </w:r>
+    </w:p>
+    <w:p>
+      <w:pPr>
+        <w:pStyle w:val="ListParagraph"/>
+        <w:numPr>
+          <w:ilvl w:val="0"/>
+          <w:numId w:val="1"/>
+        </w:numPr>
+        <w:spacing w:after="40"/>
+      </w:pPr>
+      <w:r>
+        <w:rPr>
+          <w:color w:val="1D2D3E"/>
+          <w:sz w:val="22"/>
+          <w:szCs w:val="22"/>
+        </w:rPr>
+        <w:t xml:space="preserve">Save button shows check icon feedback for 2s after successful save</w:t>
+      </w:r>
+    </w:p>
+    <w:p>
+      <w:pPr>
+        <w:pStyle w:val="ListParagraph"/>
+        <w:numPr>
+          <w:ilvl w:val="0"/>
+          <w:numId w:val="1"/>
+        </w:numPr>
+        <w:spacing w:after="40"/>
+      </w:pPr>
+      <w:r>
+        <w:rPr>
+          <w:color w:val="1D2D3E"/>
+          <w:sz w:val="22"/>
+          <w:szCs w:val="22"/>
+        </w:rPr>
+        <w:t xml:space="preserve">Clear cached data: destructive action with Alert confirmation — removes all cache:* AsyncStorage keys</w:t>
+      </w:r>
+    </w:p>
+    <w:p>
+      <w:pPr>
+        <w:pStyle w:val="ListParagraph"/>
+        <w:numPr>
+          <w:ilvl w:val="0"/>
+          <w:numId w:val="1"/>
+        </w:numPr>
+        <w:spacing w:after="40"/>
+      </w:pPr>
+      <w:r>
+        <w:rPr>
+          <w:color w:val="1D2D3E"/>
+          <w:sz w:val="22"/>
+          <w:szCs w:val="22"/>
+        </w:rPr>
+        <w:t xml:space="preserve">About section: app name and version</w:t>
       </w:r>
     </w:p>
     <w:p>
@@ -4359,115 +4485,43 @@
           <w:bCs/>
           <w:color w:val="1D2D3E"/>
         </w:rPr>
-        <w:t xml:space="preserve">3.22 Global Company Filter (Updated Session 3)</w:t>
-      </w:r>
-    </w:p>
-    <w:p>
-      <w:pPr>
-        <w:pStyle w:val="ListParagraph"/>
-        <w:numPr>
-          <w:ilvl w:val="0"/>
-          <w:numId w:val="1"/>
-        </w:numPr>
-        <w:spacing w:after="40"/>
-      </w:pPr>
-      <w:r>
-        <w:rPr>
-          <w:color w:val="1D2D3E"/>
-          <w:sz w:val="22"/>
-          <w:szCs w:val="22"/>
-        </w:rPr>
-        <w:t xml:space="preserve">CompanyContext (src/context/CompanyContext.tsx) — global state: companies list, selectedCompany, companyId</w:t>
-      </w:r>
-    </w:p>
-    <w:p>
-      <w:pPr>
-        <w:pStyle w:val="ListParagraph"/>
-        <w:numPr>
-          <w:ilvl w:val="0"/>
-          <w:numId w:val="1"/>
-        </w:numPr>
-        <w:spacing w:after="40"/>
-      </w:pPr>
-      <w:r>
-        <w:rPr>
-          <w:color w:val="1D2D3E"/>
-          <w:sz w:val="22"/>
-          <w:szCs w:val="22"/>
-        </w:rPr>
-        <w:t xml:space="preserve">CompanyPicker (src/components/CompanyPicker.tsx) — horizontal scrollable company chips</w:t>
-      </w:r>
-    </w:p>
-    <w:p>
-      <w:pPr>
-        <w:pStyle w:val="ListParagraph"/>
-        <w:numPr>
-          <w:ilvl w:val="0"/>
-          <w:numId w:val="1"/>
-        </w:numPr>
-        <w:spacing w:after="40"/>
-      </w:pPr>
-      <w:r>
-        <w:rPr>
-          <w:color w:val="1D2D3E"/>
-          <w:sz w:val="22"/>
-          <w:szCs w:val="22"/>
-        </w:rPr>
-        <w:t xml:space="preserve">CompanyProvider wrapped around app in App.tsx</w:t>
-      </w:r>
-    </w:p>
-    <w:p>
-      <w:pPr>
-        <w:pStyle w:val="ListParagraph"/>
-        <w:numPr>
-          <w:ilvl w:val="0"/>
-          <w:numId w:val="1"/>
-        </w:numPr>
-        <w:spacing w:after="40"/>
-      </w:pPr>
-      <w:r>
-        <w:rPr>
-          <w:color w:val="1D2D3E"/>
-          <w:sz w:val="22"/>
-          <w:szCs w:val="22"/>
-        </w:rPr>
-        <w:t xml:space="preserve">Now applied to all data screens: Dashboard, Inventory, Materials, Journal Entries, Partners, Sales Orders, AP, AR</w:t>
-      </w:r>
-    </w:p>
-    <w:p>
-      <w:pPr>
-        <w:pStyle w:val="ListParagraph"/>
-        <w:numPr>
-          <w:ilvl w:val="0"/>
-          <w:numId w:val="1"/>
-        </w:numPr>
-        <w:spacing w:after="40"/>
-      </w:pPr>
-      <w:r>
-        <w:rPr>
-          <w:color w:val="1D2D3E"/>
-          <w:sz w:val="22"/>
-          <w:szCs w:val="22"/>
-        </w:rPr>
-        <w:t xml:space="preserve">TrialBalance and FinancialReports use companies list from context (no duplicate API calls)</w:t>
-      </w:r>
-    </w:p>
-    <w:p>
-      <w:pPr>
-        <w:pStyle w:val="ListParagraph"/>
-        <w:numPr>
-          <w:ilvl w:val="0"/>
-          <w:numId w:val="1"/>
-        </w:numPr>
-        <w:spacing w:after="40"/>
-      </w:pPr>
-      <w:r>
-        <w:rPr>
-          <w:color w:val="1D2D3E"/>
-          <w:sz w:val="22"/>
-          <w:szCs w:val="22"/>
-        </w:rPr>
-        <w:t xml:space="preserve">CompanyContext re-loads after login (was incorrectly loading before auth on app start)</w:t>
+        <w:t xml:space="preserve">3.20 Companies Screen (src/screens/companies/CompaniesScreen.tsx)</w:t>
+      </w:r>
+    </w:p>
+    <w:p>
+      <w:pPr>
+        <w:pStyle w:val="ListParagraph"/>
+        <w:numPr>
+          <w:ilvl w:val="0"/>
+          <w:numId w:val="1"/>
+        </w:numPr>
+        <w:spacing w:after="40"/>
+      </w:pPr>
+      <w:r>
+        <w:rPr>
+          <w:color w:val="1D2D3E"/>
+          <w:sz w:val="22"/>
+          <w:szCs w:val="22"/>
+        </w:rPr>
+        <w:t xml:space="preserve">Company list with logo circle (initial letter), name, code, active/inactive status badge</w:t>
+      </w:r>
+    </w:p>
+    <w:p>
+      <w:pPr>
+        <w:pStyle w:val="ListParagraph"/>
+        <w:numPr>
+          <w:ilvl w:val="0"/>
+          <w:numId w:val="1"/>
+        </w:numPr>
+        <w:spacing w:after="40"/>
+      </w:pPr>
+      <w:r>
+        <w:rPr>
+          <w:color w:val="1D2D3E"/>
+          <w:sz w:val="22"/>
+          <w:szCs w:val="22"/>
+        </w:rPr>
+        <w:t xml:space="preserve">Detail grid: currency, fiscal year, phone, email, address</w:t>
       </w:r>
     </w:p>
     <w:p>
@@ -4494,133 +4548,115 @@
           <w:bCs/>
           <w:color w:val="1D2D3E"/>
         </w:rPr>
-        <w:t xml:space="preserve">3.23 Navigation Architecture (Updated Session 7)</w:t>
-      </w:r>
-    </w:p>
-    <w:p>
-      <w:pPr>
-        <w:pStyle w:val="ListParagraph"/>
-        <w:numPr>
-          <w:ilvl w:val="0"/>
-          <w:numId w:val="1"/>
-        </w:numPr>
-        <w:spacing w:after="40"/>
-      </w:pPr>
-      <w:r>
-        <w:rPr>
-          <w:color w:val="1D2D3E"/>
-          <w:sz w:val="22"/>
-          <w:szCs w:val="22"/>
-        </w:rPr>
-        <w:t xml:space="preserve">AppStack (native stack) — thin root wrapper, contains only the Tabs screen</w:t>
-      </w:r>
-    </w:p>
-    <w:p>
-      <w:pPr>
-        <w:pStyle w:val="ListParagraph"/>
-        <w:numPr>
-          <w:ilvl w:val="0"/>
-          <w:numId w:val="1"/>
-        </w:numPr>
-        <w:spacing w:after="40"/>
-      </w:pPr>
-      <w:r>
-        <w:rPr>
-          <w:color w:val="1D2D3E"/>
-          <w:sz w:val="22"/>
-          <w:szCs w:val="22"/>
-        </w:rPr>
-        <w:t xml:space="preserve">AppNavigator (bottom tabs): Dashboard, Inventory, Finance, More</w:t>
-      </w:r>
-    </w:p>
-    <w:p>
-      <w:pPr>
-        <w:pStyle w:val="ListParagraph"/>
-        <w:numPr>
-          <w:ilvl w:val="0"/>
-          <w:numId w:val="1"/>
-        </w:numPr>
-        <w:spacing w:after="40"/>
-      </w:pPr>
-      <w:r>
-        <w:rPr>
-          <w:color w:val="1D2D3E"/>
-          <w:sz w:val="22"/>
-          <w:szCs w:val="22"/>
-        </w:rPr>
-        <w:t xml:space="preserve">InventoryNavigator (stack, Session 6): InventoryMain → ItemLedger (item detail screen)</w:t>
-      </w:r>
-    </w:p>
-    <w:p>
-      <w:pPr>
-        <w:pStyle w:val="ListParagraph"/>
-        <w:numPr>
-          <w:ilvl w:val="0"/>
-          <w:numId w:val="1"/>
-        </w:numPr>
-        <w:spacing w:after="40"/>
-      </w:pPr>
-      <w:r>
-        <w:rPr>
-          <w:color w:val="1D2D3E"/>
-          <w:sz w:val="22"/>
-          <w:szCs w:val="22"/>
-        </w:rPr>
-        <w:t xml:space="preserve">FinanceNavigator (stack): FinanceMenu → AccountsPayable, AccountsReceivable, VendorDetail, CustomerDetail, JournalEntries, TrialBalance, FinancialReports</w:t>
-      </w:r>
-    </w:p>
-    <w:p>
-      <w:pPr>
-        <w:pStyle w:val="ListParagraph"/>
-        <w:numPr>
-          <w:ilvl w:val="0"/>
-          <w:numId w:val="1"/>
-        </w:numPr>
-        <w:spacing w:after="40"/>
-      </w:pPr>
-      <w:r>
-        <w:rPr>
-          <w:color w:val="1D2D3E"/>
-          <w:sz w:val="22"/>
-          <w:szCs w:val="22"/>
-        </w:rPr>
-        <w:t xml:space="preserve">MoreNavigator (stack): MoreMenu → Materials, PurchaseOrders, PurchaseOrderDetail, SalesOrders, SalesOrderDetail, GRN, Partners, Companies</w:t>
-      </w:r>
-    </w:p>
-    <w:p>
-      <w:pPr>
-        <w:pStyle w:val="ListParagraph"/>
-        <w:numPr>
-          <w:ilvl w:val="0"/>
-          <w:numId w:val="1"/>
-        </w:numPr>
-        <w:spacing w:after="40"/>
-      </w:pPr>
-      <w:r>
-        <w:rPr>
-          <w:color w:val="1D2D3E"/>
-          <w:sz w:val="22"/>
-          <w:szCs w:val="22"/>
-        </w:rPr>
-        <w:t xml:space="preserve">MoreMenu Finance section navigates to Finance tab's real screens via getParent()</w:t>
-      </w:r>
-    </w:p>
-    <w:p>
-      <w:pPr>
-        <w:pStyle w:val="ListParagraph"/>
-        <w:numPr>
-          <w:ilvl w:val="0"/>
-          <w:numId w:val="1"/>
-        </w:numPr>
-        <w:spacing w:after="40"/>
-      </w:pPr>
-      <w:r>
-        <w:rPr>
-          <w:color w:val="1D2D3E"/>
-          <w:sz w:val="22"/>
-          <w:szCs w:val="22"/>
-        </w:rPr>
-        <w:t xml:space="preserve">Dashboard Quick Actions wired to real screens via tab navigation</w:t>
+        <w:t xml:space="preserve">3.21 Financial Reports Screen (src/screens/financialReports/)</w:t>
+      </w:r>
+    </w:p>
+    <w:p>
+      <w:pPr>
+        <w:pStyle w:val="ListParagraph"/>
+        <w:numPr>
+          <w:ilvl w:val="0"/>
+          <w:numId w:val="1"/>
+        </w:numPr>
+        <w:spacing w:after="40"/>
+      </w:pPr>
+      <w:r>
+        <w:rPr>
+          <w:color w:val="1D2D3E"/>
+          <w:sz w:val="22"/>
+          <w:szCs w:val="22"/>
+        </w:rPr>
+        <w:t xml:space="preserve">Two tabs: Profit &amp; Loss / Balance Sheet</w:t>
+      </w:r>
+    </w:p>
+    <w:p>
+      <w:pPr>
+        <w:pStyle w:val="ListParagraph"/>
+        <w:numPr>
+          <w:ilvl w:val="0"/>
+          <w:numId w:val="1"/>
+        </w:numPr>
+        <w:spacing w:after="40"/>
+      </w:pPr>
+      <w:r>
+        <w:rPr>
+          <w:color w:val="1D2D3E"/>
+          <w:sz w:val="22"/>
+          <w:szCs w:val="22"/>
+        </w:rPr>
+        <w:t xml:space="preserve">P&amp;L: revenue vs expense sections, net income summary card</w:t>
+      </w:r>
+    </w:p>
+    <w:p>
+      <w:pPr>
+        <w:pStyle w:val="ListParagraph"/>
+        <w:numPr>
+          <w:ilvl w:val="0"/>
+          <w:numId w:val="1"/>
+        </w:numPr>
+        <w:spacing w:after="40"/>
+      </w:pPr>
+      <w:r>
+        <w:rPr>
+          <w:color w:val="1D2D3E"/>
+          <w:sz w:val="22"/>
+          <w:szCs w:val="22"/>
+        </w:rPr>
+        <w:t xml:space="preserve">Balance Sheet: assets, liabilities, equity sections with balance check warning</w:t>
+      </w:r>
+    </w:p>
+    <w:p>
+      <w:pPr>
+        <w:pStyle w:val="ListParagraph"/>
+        <w:numPr>
+          <w:ilvl w:val="0"/>
+          <w:numId w:val="1"/>
+        </w:numPr>
+        <w:spacing w:after="40"/>
+      </w:pPr>
+      <w:r>
+        <w:rPr>
+          <w:color w:val="1D2D3E"/>
+          <w:sz w:val="22"/>
+          <w:szCs w:val="22"/>
+        </w:rPr>
+        <w:t xml:space="preserve">Company selector + as-of date picker (same pattern as Trial Balance)</w:t>
+      </w:r>
+    </w:p>
+    <w:p>
+      <w:pPr>
+        <w:pStyle w:val="ListParagraph"/>
+        <w:numPr>
+          <w:ilvl w:val="0"/>
+          <w:numId w:val="1"/>
+        </w:numPr>
+        <w:spacing w:after="40"/>
+      </w:pPr>
+      <w:r>
+        <w:rPr>
+          <w:color w:val="1D2D3E"/>
+          <w:sz w:val="22"/>
+          <w:szCs w:val="22"/>
+        </w:rPr>
+        <w:t xml:space="preserve">Accounts classified by account_type keyword matching</w:t>
+      </w:r>
+    </w:p>
+    <w:p>
+      <w:pPr>
+        <w:pStyle w:val="ListParagraph"/>
+        <w:numPr>
+          <w:ilvl w:val="0"/>
+          <w:numId w:val="1"/>
+        </w:numPr>
+        <w:spacing w:after="40"/>
+      </w:pPr>
+      <w:r>
+        <w:rPr>
+          <w:color w:val="1D2D3E"/>
+          <w:sz w:val="22"/>
+          <w:szCs w:val="22"/>
+        </w:rPr>
+        <w:t xml:space="preserve">Export button: shares P&amp;L or Balance Sheet as formatted text report (Session 5)</w:t>
       </w:r>
     </w:p>
     <w:p>
@@ -4647,7 +4683,295 @@
           <w:bCs/>
           <w:color w:val="1D2D3E"/>
         </w:rPr>
-        <w:t xml:space="preserve">3.25 Offline Caching (Session 6)</w:t>
+        <w:t xml:space="preserve">3.22 Global Company Filter (Updated Session 3)</w:t>
+      </w:r>
+    </w:p>
+    <w:p>
+      <w:pPr>
+        <w:pStyle w:val="ListParagraph"/>
+        <w:numPr>
+          <w:ilvl w:val="0"/>
+          <w:numId w:val="1"/>
+        </w:numPr>
+        <w:spacing w:after="40"/>
+      </w:pPr>
+      <w:r>
+        <w:rPr>
+          <w:color w:val="1D2D3E"/>
+          <w:sz w:val="22"/>
+          <w:szCs w:val="22"/>
+        </w:rPr>
+        <w:t xml:space="preserve">CompanyContext (src/context/CompanyContext.tsx) — global state: companies list, selectedCompany, companyId</w:t>
+      </w:r>
+    </w:p>
+    <w:p>
+      <w:pPr>
+        <w:pStyle w:val="ListParagraph"/>
+        <w:numPr>
+          <w:ilvl w:val="0"/>
+          <w:numId w:val="1"/>
+        </w:numPr>
+        <w:spacing w:after="40"/>
+      </w:pPr>
+      <w:r>
+        <w:rPr>
+          <w:color w:val="1D2D3E"/>
+          <w:sz w:val="22"/>
+          <w:szCs w:val="22"/>
+        </w:rPr>
+        <w:t xml:space="preserve">CompanyPicker (src/components/CompanyPicker.tsx) — horizontal scrollable company chips</w:t>
+      </w:r>
+    </w:p>
+    <w:p>
+      <w:pPr>
+        <w:pStyle w:val="ListParagraph"/>
+        <w:numPr>
+          <w:ilvl w:val="0"/>
+          <w:numId w:val="1"/>
+        </w:numPr>
+        <w:spacing w:after="40"/>
+      </w:pPr>
+      <w:r>
+        <w:rPr>
+          <w:color w:val="1D2D3E"/>
+          <w:sz w:val="22"/>
+          <w:szCs w:val="22"/>
+        </w:rPr>
+        <w:t xml:space="preserve">CompanyProvider wrapped around app in App.tsx</w:t>
+      </w:r>
+    </w:p>
+    <w:p>
+      <w:pPr>
+        <w:pStyle w:val="ListParagraph"/>
+        <w:numPr>
+          <w:ilvl w:val="0"/>
+          <w:numId w:val="1"/>
+        </w:numPr>
+        <w:spacing w:after="40"/>
+      </w:pPr>
+      <w:r>
+        <w:rPr>
+          <w:color w:val="1D2D3E"/>
+          <w:sz w:val="22"/>
+          <w:szCs w:val="22"/>
+        </w:rPr>
+        <w:t xml:space="preserve">Now applied to all data screens: Dashboard, Inventory, Materials, Journal Entries, Partners, Sales Orders, AP, AR</w:t>
+      </w:r>
+    </w:p>
+    <w:p>
+      <w:pPr>
+        <w:pStyle w:val="ListParagraph"/>
+        <w:numPr>
+          <w:ilvl w:val="0"/>
+          <w:numId w:val="1"/>
+        </w:numPr>
+        <w:spacing w:after="40"/>
+      </w:pPr>
+      <w:r>
+        <w:rPr>
+          <w:color w:val="1D2D3E"/>
+          <w:sz w:val="22"/>
+          <w:szCs w:val="22"/>
+        </w:rPr>
+        <w:t xml:space="preserve">TrialBalance and FinancialReports use companies list from context (no duplicate API calls)</w:t>
+      </w:r>
+    </w:p>
+    <w:p>
+      <w:pPr>
+        <w:pStyle w:val="ListParagraph"/>
+        <w:numPr>
+          <w:ilvl w:val="0"/>
+          <w:numId w:val="1"/>
+        </w:numPr>
+        <w:spacing w:after="40"/>
+      </w:pPr>
+      <w:r>
+        <w:rPr>
+          <w:color w:val="1D2D3E"/>
+          <w:sz w:val="22"/>
+          <w:szCs w:val="22"/>
+        </w:rPr>
+        <w:t xml:space="preserve">CompanyContext re-loads after login (was incorrectly loading before auth on app start)</w:t>
+      </w:r>
+    </w:p>
+    <w:p>
+      <w:pPr>
+        <w:spacing w:after="80"/>
+      </w:pPr>
+      <w:r>
+        <w:rPr>
+          <w:color w:val="1D2D3E"/>
+          <w:sz w:val="22"/>
+          <w:szCs w:val="22"/>
+        </w:rPr>
+        <w:t xml:space="preserve"/>
+      </w:r>
+    </w:p>
+    <w:p>
+      <w:pPr>
+        <w:pStyle w:val="Heading2"/>
+        <w:spacing w:after="120" w:before="300"/>
+      </w:pPr>
+      <w:r>
+        <w:rPr>
+          <w:b/>
+          <w:bCs/>
+          <w:color w:val="1D2D3E"/>
+        </w:rPr>
+        <w:t xml:space="preserve">3.23 Navigation Architecture (Updated Session 8)</w:t>
+      </w:r>
+    </w:p>
+    <w:p>
+      <w:pPr>
+        <w:pStyle w:val="ListParagraph"/>
+        <w:numPr>
+          <w:ilvl w:val="0"/>
+          <w:numId w:val="1"/>
+        </w:numPr>
+        <w:spacing w:after="40"/>
+      </w:pPr>
+      <w:r>
+        <w:rPr>
+          <w:color w:val="1D2D3E"/>
+          <w:sz w:val="22"/>
+          <w:szCs w:val="22"/>
+        </w:rPr>
+        <w:t xml:space="preserve">AppStack (native stack) — thin root wrapper, contains only the Tabs screen</w:t>
+      </w:r>
+    </w:p>
+    <w:p>
+      <w:pPr>
+        <w:pStyle w:val="ListParagraph"/>
+        <w:numPr>
+          <w:ilvl w:val="0"/>
+          <w:numId w:val="1"/>
+        </w:numPr>
+        <w:spacing w:after="40"/>
+      </w:pPr>
+      <w:r>
+        <w:rPr>
+          <w:color w:val="1D2D3E"/>
+          <w:sz w:val="22"/>
+          <w:szCs w:val="22"/>
+        </w:rPr>
+        <w:t xml:space="preserve">AppNavigator (bottom tabs): Dashboard, Inventory, Finance, More</w:t>
+      </w:r>
+    </w:p>
+    <w:p>
+      <w:pPr>
+        <w:pStyle w:val="ListParagraph"/>
+        <w:numPr>
+          <w:ilvl w:val="0"/>
+          <w:numId w:val="1"/>
+        </w:numPr>
+        <w:spacing w:after="40"/>
+      </w:pPr>
+      <w:r>
+        <w:rPr>
+          <w:color w:val="1D2D3E"/>
+          <w:sz w:val="22"/>
+          <w:szCs w:val="22"/>
+        </w:rPr>
+        <w:t xml:space="preserve">InventoryNavigator (stack, Session 6): InventoryMain → ItemLedger (item detail screen)</w:t>
+      </w:r>
+    </w:p>
+    <w:p>
+      <w:pPr>
+        <w:pStyle w:val="ListParagraph"/>
+        <w:numPr>
+          <w:ilvl w:val="0"/>
+          <w:numId w:val="1"/>
+        </w:numPr>
+        <w:spacing w:after="40"/>
+      </w:pPr>
+      <w:r>
+        <w:rPr>
+          <w:color w:val="1D2D3E"/>
+          <w:sz w:val="22"/>
+          <w:szCs w:val="22"/>
+        </w:rPr>
+        <w:t xml:space="preserve">FinanceNavigator (stack): FinanceMenu → AccountsPayable, AccountsReceivable, VendorDetail, CustomerDetail, JournalEntries, TrialBalance, FinancialReports</w:t>
+      </w:r>
+    </w:p>
+    <w:p>
+      <w:pPr>
+        <w:pStyle w:val="ListParagraph"/>
+        <w:numPr>
+          <w:ilvl w:val="0"/>
+          <w:numId w:val="1"/>
+        </w:numPr>
+        <w:spacing w:after="40"/>
+      </w:pPr>
+      <w:r>
+        <w:rPr>
+          <w:color w:val="1D2D3E"/>
+          <w:sz w:val="22"/>
+          <w:szCs w:val="22"/>
+        </w:rPr>
+        <w:t xml:space="preserve">MoreNavigator (stack, Session 8): MoreMenu → Materials, PurchaseOrders, PurchaseOrderDetail, SalesOrders, SalesOrderDetail, GRN, Partners, PartnerDetail, Companies, Settings</w:t>
+      </w:r>
+    </w:p>
+    <w:p>
+      <w:pPr>
+        <w:pStyle w:val="ListParagraph"/>
+        <w:numPr>
+          <w:ilvl w:val="0"/>
+          <w:numId w:val="1"/>
+        </w:numPr>
+        <w:spacing w:after="40"/>
+      </w:pPr>
+      <w:r>
+        <w:rPr>
+          <w:color w:val="1D2D3E"/>
+          <w:sz w:val="22"/>
+          <w:szCs w:val="22"/>
+        </w:rPr>
+        <w:t xml:space="preserve">MoreMenu Finance section navigates to Finance tab's real screens via getParent()</w:t>
+      </w:r>
+    </w:p>
+    <w:p>
+      <w:pPr>
+        <w:pStyle w:val="ListParagraph"/>
+        <w:numPr>
+          <w:ilvl w:val="0"/>
+          <w:numId w:val="1"/>
+        </w:numPr>
+        <w:spacing w:after="40"/>
+      </w:pPr>
+      <w:r>
+        <w:rPr>
+          <w:color w:val="1D2D3E"/>
+          <w:sz w:val="22"/>
+          <w:szCs w:val="22"/>
+        </w:rPr>
+        <w:t xml:space="preserve">Dashboard Quick Actions wired to real screens via tab navigation</w:t>
+      </w:r>
+    </w:p>
+    <w:p>
+      <w:pPr>
+        <w:spacing w:after="80"/>
+      </w:pPr>
+      <w:r>
+        <w:rPr>
+          <w:color w:val="1D2D3E"/>
+          <w:sz w:val="22"/>
+          <w:szCs w:val="22"/>
+        </w:rPr>
+        <w:t xml:space="preserve"/>
+      </w:r>
+    </w:p>
+    <w:p>
+      <w:pPr>
+        <w:pStyle w:val="Heading2"/>
+        <w:spacing w:after="120" w:before="300"/>
+      </w:pPr>
+      <w:r>
+        <w:rPr>
+          <w:b/>
+          <w:bCs/>
+          <w:color w:val="1D2D3E"/>
+        </w:rPr>
+        <w:t xml:space="preserve">3.25 Offline Caching (Sessions 6–8)</w:t>
       </w:r>
     </w:p>
     <w:p>
@@ -4755,7 +5079,115 @@
           <w:sz w:val="22"/>
           <w:szCs w:val="22"/>
         </w:rPr>
-        <w:t xml:space="preserve">OfflineBanner (src/components/OfflineBanner.tsx): amber banner when stale data is displayed</w:t>
+        <w:t xml:space="preserve">AccountsPayableScreen: caches summary/bills/vendors bundle per company (Session 7)</w:t>
+      </w:r>
+    </w:p>
+    <w:p>
+      <w:pPr>
+        <w:pStyle w:val="ListParagraph"/>
+        <w:numPr>
+          <w:ilvl w:val="0"/>
+          <w:numId w:val="1"/>
+        </w:numPr>
+        <w:spacing w:after="40"/>
+      </w:pPr>
+      <w:r>
+        <w:rPr>
+          <w:color w:val="1D2D3E"/>
+          <w:sz w:val="22"/>
+          <w:szCs w:val="22"/>
+        </w:rPr>
+        <w:t xml:space="preserve">AccountsReceivableScreen: caches summary/invoices/customers bundle per company (Session 7)</w:t>
+      </w:r>
+    </w:p>
+    <w:p>
+      <w:pPr>
+        <w:pStyle w:val="ListParagraph"/>
+        <w:numPr>
+          <w:ilvl w:val="0"/>
+          <w:numId w:val="1"/>
+        </w:numPr>
+        <w:spacing w:after="40"/>
+      </w:pPr>
+      <w:r>
+        <w:rPr>
+          <w:color w:val="1D2D3E"/>
+          <w:sz w:val="22"/>
+          <w:szCs w:val="22"/>
+        </w:rPr>
+        <w:t xml:space="preserve">MaterialsScreen: caches materials+types per company+type combo (Session 7)</w:t>
+      </w:r>
+    </w:p>
+    <w:p>
+      <w:pPr>
+        <w:pStyle w:val="ListParagraph"/>
+        <w:numPr>
+          <w:ilvl w:val="0"/>
+          <w:numId w:val="1"/>
+        </w:numPr>
+        <w:spacing w:after="40"/>
+      </w:pPr>
+      <w:r>
+        <w:rPr>
+          <w:color w:val="1D2D3E"/>
+          <w:sz w:val="22"/>
+          <w:szCs w:val="22"/>
+        </w:rPr>
+        <w:t xml:space="preserve">PurchaseOrdersScreen: caches PO list per tab (all/open/progress) with 24h TTL (Session 8)</w:t>
+      </w:r>
+    </w:p>
+    <w:p>
+      <w:pPr>
+        <w:pStyle w:val="ListParagraph"/>
+        <w:numPr>
+          <w:ilvl w:val="0"/>
+          <w:numId w:val="1"/>
+        </w:numPr>
+        <w:spacing w:after="40"/>
+      </w:pPr>
+      <w:r>
+        <w:rPr>
+          <w:color w:val="1D2D3E"/>
+          <w:sz w:val="22"/>
+          <w:szCs w:val="22"/>
+        </w:rPr>
+        <w:t xml:space="preserve">SalesOrdersScreen: caches SO list per tab+company combination with 24h TTL (Session 8)</w:t>
+      </w:r>
+    </w:p>
+    <w:p>
+      <w:pPr>
+        <w:pStyle w:val="ListParagraph"/>
+        <w:numPr>
+          <w:ilvl w:val="0"/>
+          <w:numId w:val="1"/>
+        </w:numPr>
+        <w:spacing w:after="40"/>
+      </w:pPr>
+      <w:r>
+        <w:rPr>
+          <w:color w:val="1D2D3E"/>
+          <w:sz w:val="22"/>
+          <w:szCs w:val="22"/>
+        </w:rPr>
+        <w:t xml:space="preserve">PartnersScreen: caches partners list per company with 24h TTL (Session 8)</w:t>
+      </w:r>
+    </w:p>
+    <w:p>
+      <w:pPr>
+        <w:pStyle w:val="ListParagraph"/>
+        <w:numPr>
+          <w:ilvl w:val="0"/>
+          <w:numId w:val="1"/>
+        </w:numPr>
+        <w:spacing w:after="40"/>
+      </w:pPr>
+      <w:r>
+        <w:rPr>
+          <w:color w:val="1D2D3E"/>
+          <w:sz w:val="22"/>
+          <w:szCs w:val="22"/>
+        </w:rPr>
+        <w:t xml:space="preserve">OfflineBanner (src/components/OfflineBanner.tsx): shown when stale data is displayed on error</w:t>
       </w:r>
     </w:p>
     <w:p>
@@ -4774,6 +5206,87 @@
           <w:szCs w:val="22"/>
         </w:rPr>
         <w:t xml:space="preserve">Architecture: try cache → show if found → fetch fresh → update UI + cache; on failure: show cached + banner</w:t>
+      </w:r>
+    </w:p>
+    <w:p>
+      <w:pPr>
+        <w:spacing w:after="80"/>
+      </w:pPr>
+      <w:r>
+        <w:rPr>
+          <w:color w:val="1D2D3E"/>
+          <w:sz w:val="22"/>
+          <w:szCs w:val="22"/>
+        </w:rPr>
+        <w:t xml:space="preserve"/>
+      </w:r>
+    </w:p>
+    <w:p>
+      <w:pPr>
+        <w:pStyle w:val="Heading2"/>
+        <w:spacing w:after="120" w:before="300"/>
+      </w:pPr>
+      <w:r>
+        <w:rPr>
+          <w:b/>
+          <w:bCs/>
+          <w:color w:val="1D2D3E"/>
+        </w:rPr>
+        <w:t xml:space="preserve">3.26 User Preferences / Settings (Session 8)</w:t>
+      </w:r>
+    </w:p>
+    <w:p>
+      <w:pPr>
+        <w:pStyle w:val="ListParagraph"/>
+        <w:numPr>
+          <w:ilvl w:val="0"/>
+          <w:numId w:val="1"/>
+        </w:numPr>
+        <w:spacing w:after="40"/>
+      </w:pPr>
+      <w:r>
+        <w:rPr>
+          <w:color w:val="1D2D3E"/>
+          <w:sz w:val="22"/>
+          <w:szCs w:val="22"/>
+        </w:rPr>
+        <w:t xml:space="preserve">src/utils/settings.ts: getLowStockThreshold() / setLowStockThreshold(n) — AsyncStorage backed</w:t>
+      </w:r>
+    </w:p>
+    <w:p>
+      <w:pPr>
+        <w:pStyle w:val="ListParagraph"/>
+        <w:numPr>
+          <w:ilvl w:val="0"/>
+          <w:numId w:val="1"/>
+        </w:numPr>
+        <w:spacing w:after="40"/>
+      </w:pPr>
+      <w:r>
+        <w:rPr>
+          <w:color w:val="1D2D3E"/>
+          <w:sz w:val="22"/>
+          <w:szCs w:val="22"/>
+        </w:rPr>
+        <w:t xml:space="preserve">InventoryScreen: loads low-stock threshold from settings on mount (was hardcoded = 100)</w:t>
+      </w:r>
+    </w:p>
+    <w:p>
+      <w:pPr>
+        <w:pStyle w:val="ListParagraph"/>
+        <w:numPr>
+          <w:ilvl w:val="0"/>
+          <w:numId w:val="1"/>
+        </w:numPr>
+        <w:spacing w:after="40"/>
+      </w:pPr>
+      <w:r>
+        <w:rPr>
+          <w:color w:val="1D2D3E"/>
+          <w:sz w:val="22"/>
+          <w:szCs w:val="22"/>
+        </w:rPr>
+        <w:t xml:space="preserve">SettingsScreen: UI to view/edit threshold, clear all cached data, view app version</w:t>
       </w:r>
     </w:p>
     <w:p>
@@ -7516,6 +8029,310 @@
           </w:p>
         </w:tc>
       </w:tr>
+      <w:tr>
+        <w:tc>
+          <w:tcPr>
+            <w:shd w:color="F0F4F8" w:val="solid"/>
+          </w:tcPr>
+          <w:p>
+            <w:pPr>
+              <w:spacing w:after="40" w:before="40"/>
+            </w:pPr>
+            <w:r>
+              <w:rPr>
+                <w:b w:val="false"/>
+                <w:bCs w:val="false"/>
+                <w:color w:val="1D2D3E"/>
+                <w:sz w:val="20"/>
+                <w:szCs w:val="20"/>
+              </w:rPr>
+              <w:t xml:space="preserve">Session 8</w:t>
+            </w:r>
+          </w:p>
+        </w:tc>
+        <w:tc>
+          <w:tcPr>
+            <w:shd w:color="F0F4F8" w:val="solid"/>
+          </w:tcPr>
+          <w:p>
+            <w:pPr>
+              <w:spacing w:after="40" w:before="40"/>
+            </w:pPr>
+            <w:r>
+              <w:rPr>
+                <w:b w:val="false"/>
+                <w:bCs w:val="false"/>
+                <w:color w:val="1D2D3E"/>
+                <w:sz w:val="20"/>
+                <w:szCs w:val="20"/>
+              </w:rPr>
+              <w:t xml:space="preserve">Partner Detail Screen</w:t>
+            </w:r>
+          </w:p>
+        </w:tc>
+        <w:tc>
+          <w:tcPr>
+            <w:shd w:color="F0F4F8" w:val="solid"/>
+          </w:tcPr>
+          <w:p>
+            <w:pPr>
+              <w:spacing w:after="40" w:before="40"/>
+            </w:pPr>
+            <w:r>
+              <w:rPr>
+                <w:b w:val="false"/>
+                <w:bCs w:val="false"/>
+                <w:color w:val="1D2D3E"/>
+                <w:sz w:val="20"/>
+                <w:szCs w:val="20"/>
+              </w:rPr>
+              <w:t xml:space="preserve">Done</w:t>
+            </w:r>
+          </w:p>
+        </w:tc>
+        <w:tc>
+          <w:tcPr>
+            <w:shd w:color="F0F4F8" w:val="solid"/>
+          </w:tcPr>
+          <w:p>
+            <w:pPr>
+              <w:spacing w:after="40" w:before="40"/>
+            </w:pPr>
+            <w:r>
+              <w:rPr>
+                <w:b w:val="false"/>
+                <w:bCs w:val="false"/>
+                <w:color w:val="1D2D3E"/>
+                <w:sz w:val="20"/>
+                <w:szCs w:val="20"/>
+              </w:rPr>
+              <w:t xml:space="preserve">/api/mobile/purchase-orders + /api/mobile/sales-orders (filtered client-side)</w:t>
+            </w:r>
+          </w:p>
+        </w:tc>
+      </w:tr>
+      <w:tr>
+        <w:tc>
+          <w:p>
+            <w:pPr>
+              <w:spacing w:after="40" w:before="40"/>
+            </w:pPr>
+            <w:r>
+              <w:rPr>
+                <w:b w:val="false"/>
+                <w:bCs w:val="false"/>
+                <w:color w:val="1D2D3E"/>
+                <w:sz w:val="20"/>
+                <w:szCs w:val="20"/>
+              </w:rPr>
+              <w:t xml:space="preserve">Session 8</w:t>
+            </w:r>
+          </w:p>
+        </w:tc>
+        <w:tc>
+          <w:p>
+            <w:pPr>
+              <w:spacing w:after="40" w:before="40"/>
+            </w:pPr>
+            <w:r>
+              <w:rPr>
+                <w:b w:val="false"/>
+                <w:bCs w:val="false"/>
+                <w:color w:val="1D2D3E"/>
+                <w:sz w:val="20"/>
+                <w:szCs w:val="20"/>
+              </w:rPr>
+              <w:t xml:space="preserve">Settings Screen (low-stock threshold, cache management)</w:t>
+            </w:r>
+          </w:p>
+        </w:tc>
+        <w:tc>
+          <w:p>
+            <w:pPr>
+              <w:spacing w:after="40" w:before="40"/>
+            </w:pPr>
+            <w:r>
+              <w:rPr>
+                <w:b w:val="false"/>
+                <w:bCs w:val="false"/>
+                <w:color w:val="1D2D3E"/>
+                <w:sz w:val="20"/>
+                <w:szCs w:val="20"/>
+              </w:rPr>
+              <w:t xml:space="preserve">Done</w:t>
+            </w:r>
+          </w:p>
+        </w:tc>
+        <w:tc>
+          <w:p>
+            <w:pPr>
+              <w:spacing w:after="40" w:before="40"/>
+            </w:pPr>
+            <w:r>
+              <w:rPr>
+                <w:b w:val="false"/>
+                <w:bCs w:val="false"/>
+                <w:color w:val="1D2D3E"/>
+                <w:sz w:val="20"/>
+                <w:szCs w:val="20"/>
+              </w:rPr>
+              <w:t xml:space="preserve">AsyncStorage</w:t>
+            </w:r>
+          </w:p>
+        </w:tc>
+      </w:tr>
+      <w:tr>
+        <w:tc>
+          <w:tcPr>
+            <w:shd w:color="F0F4F8" w:val="solid"/>
+          </w:tcPr>
+          <w:p>
+            <w:pPr>
+              <w:spacing w:after="40" w:before="40"/>
+            </w:pPr>
+            <w:r>
+              <w:rPr>
+                <w:b w:val="false"/>
+                <w:bCs w:val="false"/>
+                <w:color w:val="1D2D3E"/>
+                <w:sz w:val="20"/>
+                <w:szCs w:val="20"/>
+              </w:rPr>
+              <w:t xml:space="preserve">Session 8</w:t>
+            </w:r>
+          </w:p>
+        </w:tc>
+        <w:tc>
+          <w:tcPr>
+            <w:shd w:color="F0F4F8" w:val="solid"/>
+          </w:tcPr>
+          <w:p>
+            <w:pPr>
+              <w:spacing w:after="40" w:before="40"/>
+            </w:pPr>
+            <w:r>
+              <w:rPr>
+                <w:b w:val="false"/>
+                <w:bCs w:val="false"/>
+                <w:color w:val="1D2D3E"/>
+                <w:sz w:val="20"/>
+                <w:szCs w:val="20"/>
+              </w:rPr>
+              <w:t xml:space="preserve">Offline Caching extended (PO list, SO list, Partners)</w:t>
+            </w:r>
+          </w:p>
+        </w:tc>
+        <w:tc>
+          <w:tcPr>
+            <w:shd w:color="F0F4F8" w:val="solid"/>
+          </w:tcPr>
+          <w:p>
+            <w:pPr>
+              <w:spacing w:after="40" w:before="40"/>
+            </w:pPr>
+            <w:r>
+              <w:rPr>
+                <w:b w:val="false"/>
+                <w:bCs w:val="false"/>
+                <w:color w:val="1D2D3E"/>
+                <w:sz w:val="20"/>
+                <w:szCs w:val="20"/>
+              </w:rPr>
+              <w:t xml:space="preserve">Done</w:t>
+            </w:r>
+          </w:p>
+        </w:tc>
+        <w:tc>
+          <w:tcPr>
+            <w:shd w:color="F0F4F8" w:val="solid"/>
+          </w:tcPr>
+          <w:p>
+            <w:pPr>
+              <w:spacing w:after="40" w:before="40"/>
+            </w:pPr>
+            <w:r>
+              <w:rPr>
+                <w:b w:val="false"/>
+                <w:bCs w:val="false"/>
+                <w:color w:val="1D2D3E"/>
+                <w:sz w:val="20"/>
+                <w:szCs w:val="20"/>
+              </w:rPr>
+              <w:t xml:space="preserve">—</w:t>
+            </w:r>
+          </w:p>
+        </w:tc>
+      </w:tr>
+      <w:tr>
+        <w:tc>
+          <w:p>
+            <w:pPr>
+              <w:spacing w:after="40" w:before="40"/>
+            </w:pPr>
+            <w:r>
+              <w:rPr>
+                <w:b w:val="false"/>
+                <w:bCs w:val="false"/>
+                <w:color w:val="1D2D3E"/>
+                <w:sz w:val="20"/>
+                <w:szCs w:val="20"/>
+              </w:rPr>
+              <w:t xml:space="preserve">Session 8</w:t>
+            </w:r>
+          </w:p>
+        </w:tc>
+        <w:tc>
+          <w:p>
+            <w:pPr>
+              <w:spacing w:after="40" w:before="40"/>
+            </w:pPr>
+            <w:r>
+              <w:rPr>
+                <w:b w:val="false"/>
+                <w:bCs w:val="false"/>
+                <w:color w:val="1D2D3E"/>
+                <w:sz w:val="20"/>
+                <w:szCs w:val="20"/>
+              </w:rPr>
+              <w:t xml:space="preserve">Low-stock threshold wired to Settings (InventoryScreen)</w:t>
+            </w:r>
+          </w:p>
+        </w:tc>
+        <w:tc>
+          <w:p>
+            <w:pPr>
+              <w:spacing w:after="40" w:before="40"/>
+            </w:pPr>
+            <w:r>
+              <w:rPr>
+                <w:b w:val="false"/>
+                <w:bCs w:val="false"/>
+                <w:color w:val="1D2D3E"/>
+                <w:sz w:val="20"/>
+                <w:szCs w:val="20"/>
+              </w:rPr>
+              <w:t xml:space="preserve">Done</w:t>
+            </w:r>
+          </w:p>
+        </w:tc>
+        <w:tc>
+          <w:p>
+            <w:pPr>
+              <w:spacing w:after="40" w:before="40"/>
+            </w:pPr>
+            <w:r>
+              <w:rPr>
+                <w:b w:val="false"/>
+                <w:bCs w:val="false"/>
+                <w:color w:val="1D2D3E"/>
+                <w:sz w:val="20"/>
+                <w:szCs w:val="20"/>
+              </w:rPr>
+              <w:t xml:space="preserve">src/utils/settings.ts</w:t>
+            </w:r>
+          </w:p>
+        </w:tc>
+      </w:tr>
     </w:tbl>
     <w:p>
       <w:pPr>
@@ -7993,7 +8810,61 @@
           <w:sz w:val="22"/>
           <w:szCs w:val="22"/>
         </w:rPr>
-        <w:t xml:space="preserve">src/utils/ — Utility functions: currency.ts (formatting), cache.ts (AsyncStorage offline cache, Session 6)</w:t>
+        <w:t xml:space="preserve">src/utils/ — Utility functions:</w:t>
+      </w:r>
+    </w:p>
+    <w:p>
+      <w:pPr>
+        <w:pStyle w:val="ListParagraph"/>
+        <w:numPr>
+          <w:ilvl w:val="1"/>
+          <w:numId w:val="1"/>
+        </w:numPr>
+        <w:spacing w:after="40"/>
+      </w:pPr>
+      <w:r>
+        <w:rPr>
+          <w:color w:val="1D2D3E"/>
+          <w:sz w:val="22"/>
+          <w:szCs w:val="22"/>
+        </w:rPr>
+        <w:t xml:space="preserve">currency.ts — formatCurrency, formatShortDate helpers</w:t>
+      </w:r>
+    </w:p>
+    <w:p>
+      <w:pPr>
+        <w:pStyle w:val="ListParagraph"/>
+        <w:numPr>
+          <w:ilvl w:val="1"/>
+          <w:numId w:val="1"/>
+        </w:numPr>
+        <w:spacing w:after="40"/>
+      </w:pPr>
+      <w:r>
+        <w:rPr>
+          <w:color w:val="1D2D3E"/>
+          <w:sz w:val="22"/>
+          <w:szCs w:val="22"/>
+        </w:rPr>
+        <w:t xml:space="preserve">cache.ts — getCached/setCached/clearCache; AsyncStorage offline cache with 24h TTL and versioning (Session 6)</w:t>
+      </w:r>
+    </w:p>
+    <w:p>
+      <w:pPr>
+        <w:pStyle w:val="ListParagraph"/>
+        <w:numPr>
+          <w:ilvl w:val="1"/>
+          <w:numId w:val="1"/>
+        </w:numPr>
+        <w:spacing w:after="40"/>
+      </w:pPr>
+      <w:r>
+        <w:rPr>
+          <w:color w:val="1D2D3E"/>
+          <w:sz w:val="22"/>
+          <w:szCs w:val="22"/>
+        </w:rPr>
+        <w:t xml:space="preserve">settings.ts — getLowStockThreshold/setLowStockThreshold; user preference persistence (Session 8)</w:t>
       </w:r>
     </w:p>
     <w:p>
@@ -9691,6 +10562,321 @@
           <w:szCs w:val="22"/>
         </w:rPr>
         <w:t xml:space="preserve">Offline caching: InventoryScreen caches stock balances per company, populates UI from cache immediately</w:t>
+      </w:r>
+    </w:p>
+    <w:p>
+      <w:pPr>
+        <w:spacing w:after="80"/>
+      </w:pPr>
+      <w:r>
+        <w:rPr>
+          <w:color w:val="1D2D3E"/>
+          <w:sz w:val="22"/>
+          <w:szCs w:val="22"/>
+        </w:rPr>
+        <w:t xml:space="preserve"/>
+      </w:r>
+    </w:p>
+    <w:p>
+      <w:pPr>
+        <w:pStyle w:val="Heading2"/>
+        <w:spacing w:after="120" w:before="300"/>
+      </w:pPr>
+      <w:r>
+        <w:rPr>
+          <w:b/>
+          <w:bCs/>
+          <w:color w:val="1D2D3E"/>
+        </w:rPr>
+        <w:t xml:space="preserve">Session 8 — 2026-05-20</w:t>
+      </w:r>
+    </w:p>
+    <w:p>
+      <w:pPr>
+        <w:pStyle w:val="ListParagraph"/>
+        <w:numPr>
+          <w:ilvl w:val="0"/>
+          <w:numId w:val="1"/>
+        </w:numPr>
+        <w:spacing w:after="40"/>
+      </w:pPr>
+      <w:r>
+        <w:rPr>
+          <w:color w:val="1D2D3E"/>
+          <w:sz w:val="22"/>
+          <w:szCs w:val="22"/>
+        </w:rPr>
+        <w:t xml:space="preserve">Created PartnerDetailScreen (src/screens/partners/PartnerDetailScreen.tsx)</w:t>
+      </w:r>
+    </w:p>
+    <w:p>
+      <w:pPr>
+        <w:pStyle w:val="ListParagraph"/>
+        <w:numPr>
+          <w:ilvl w:val="1"/>
+          <w:numId w:val="1"/>
+        </w:numPr>
+        <w:spacing w:after="40"/>
+      </w:pPr>
+      <w:r>
+        <w:rPr>
+          <w:color w:val="1D2D3E"/>
+          <w:sz w:val="22"/>
+          <w:szCs w:val="22"/>
+        </w:rPr>
+        <w:t xml:space="preserve">  — Tap any partner card in PartnersScreen to view their PO and/or SO history</w:t>
+      </w:r>
+    </w:p>
+    <w:p>
+      <w:pPr>
+        <w:pStyle w:val="ListParagraph"/>
+        <w:numPr>
+          <w:ilvl w:val="1"/>
+          <w:numId w:val="1"/>
+        </w:numPr>
+        <w:spacing w:after="40"/>
+      </w:pPr>
+      <w:r>
+        <w:rPr>
+          <w:color w:val="1D2D3E"/>
+          <w:sz w:val="22"/>
+          <w:szCs w:val="22"/>
+        </w:rPr>
+        <w:t xml:space="preserve">  — Summary tiles: Total PO value + count (vendors) / Total SO value + count (customers)</w:t>
+      </w:r>
+    </w:p>
+    <w:p>
+      <w:pPr>
+        <w:pStyle w:val="ListParagraph"/>
+        <w:numPr>
+          <w:ilvl w:val="1"/>
+          <w:numId w:val="1"/>
+        </w:numPr>
+        <w:spacing w:after="40"/>
+      </w:pPr>
+      <w:r>
+        <w:rPr>
+          <w:color w:val="1D2D3E"/>
+          <w:sz w:val="22"/>
+          <w:szCs w:val="22"/>
+        </w:rPr>
+        <w:t xml:space="preserve">  — Dual-role tab bar (POs | SOs) shown when partner is both vendor and customer</w:t>
+      </w:r>
+    </w:p>
+    <w:p>
+      <w:pPr>
+        <w:pStyle w:val="ListParagraph"/>
+        <w:numPr>
+          <w:ilvl w:val="1"/>
+          <w:numId w:val="1"/>
+        </w:numPr>
+        <w:spacing w:after="40"/>
+      </w:pPr>
+      <w:r>
+        <w:rPr>
+          <w:color w:val="1D2D3E"/>
+          <w:sz w:val="22"/>
+          <w:szCs w:val="22"/>
+        </w:rPr>
+        <w:t xml:space="preserve">  — PO cards navigate to PurchaseOrderDetail; SO cards navigate to SalesOrderDetail</w:t>
+      </w:r>
+    </w:p>
+    <w:p>
+      <w:pPr>
+        <w:pStyle w:val="ListParagraph"/>
+        <w:numPr>
+          <w:ilvl w:val="0"/>
+          <w:numId w:val="1"/>
+        </w:numPr>
+        <w:spacing w:after="40"/>
+      </w:pPr>
+      <w:r>
+        <w:rPr>
+          <w:color w:val="1D2D3E"/>
+          <w:sz w:val="22"/>
+          <w:szCs w:val="22"/>
+        </w:rPr>
+        <w:t xml:space="preserve">Created SettingsScreen (src/screens/settings/SettingsScreen.tsx)</w:t>
+      </w:r>
+    </w:p>
+    <w:p>
+      <w:pPr>
+        <w:pStyle w:val="ListParagraph"/>
+        <w:numPr>
+          <w:ilvl w:val="1"/>
+          <w:numId w:val="1"/>
+        </w:numPr>
+        <w:spacing w:after="40"/>
+      </w:pPr>
+      <w:r>
+        <w:rPr>
+          <w:color w:val="1D2D3E"/>
+          <w:sz w:val="22"/>
+          <w:szCs w:val="22"/>
+        </w:rPr>
+        <w:t xml:space="preserve">  — Low-stock threshold input with save/confirmation feedback</w:t>
+      </w:r>
+    </w:p>
+    <w:p>
+      <w:pPr>
+        <w:pStyle w:val="ListParagraph"/>
+        <w:numPr>
+          <w:ilvl w:val="1"/>
+          <w:numId w:val="1"/>
+        </w:numPr>
+        <w:spacing w:after="40"/>
+      </w:pPr>
+      <w:r>
+        <w:rPr>
+          <w:color w:val="1D2D3E"/>
+          <w:sz w:val="22"/>
+          <w:szCs w:val="22"/>
+        </w:rPr>
+        <w:t xml:space="preserve">  — Clear cached data action with destructive confirmation alert</w:t>
+      </w:r>
+    </w:p>
+    <w:p>
+      <w:pPr>
+        <w:pStyle w:val="ListParagraph"/>
+        <w:numPr>
+          <w:ilvl w:val="1"/>
+          <w:numId w:val="1"/>
+        </w:numPr>
+        <w:spacing w:after="40"/>
+      </w:pPr>
+      <w:r>
+        <w:rPr>
+          <w:color w:val="1D2D3E"/>
+          <w:sz w:val="22"/>
+          <w:szCs w:val="22"/>
+        </w:rPr>
+        <w:t xml:space="preserve">  — About section with app name and version</w:t>
+      </w:r>
+    </w:p>
+    <w:p>
+      <w:pPr>
+        <w:pStyle w:val="ListParagraph"/>
+        <w:numPr>
+          <w:ilvl w:val="0"/>
+          <w:numId w:val="1"/>
+        </w:numPr>
+        <w:spacing w:after="40"/>
+      </w:pPr>
+      <w:r>
+        <w:rPr>
+          <w:color w:val="1D2D3E"/>
+          <w:sz w:val="22"/>
+          <w:szCs w:val="22"/>
+        </w:rPr>
+        <w:t xml:space="preserve">Created src/utils/settings.ts — getLowStockThreshold / setLowStockThreshold via AsyncStorage</w:t>
+      </w:r>
+    </w:p>
+    <w:p>
+      <w:pPr>
+        <w:pStyle w:val="ListParagraph"/>
+        <w:numPr>
+          <w:ilvl w:val="0"/>
+          <w:numId w:val="1"/>
+        </w:numPr>
+        <w:spacing w:after="40"/>
+      </w:pPr>
+      <w:r>
+        <w:rPr>
+          <w:color w:val="1D2D3E"/>
+          <w:sz w:val="22"/>
+          <w:szCs w:val="22"/>
+        </w:rPr>
+        <w:t xml:space="preserve">InventoryScreen: replaced hardcoded LOW_STOCK_THRESHOLD=100 with getLowStockThreshold() from settings</w:t>
+      </w:r>
+    </w:p>
+    <w:p>
+      <w:pPr>
+        <w:pStyle w:val="ListParagraph"/>
+        <w:numPr>
+          <w:ilvl w:val="0"/>
+          <w:numId w:val="1"/>
+        </w:numPr>
+        <w:spacing w:after="40"/>
+      </w:pPr>
+      <w:r>
+        <w:rPr>
+          <w:color w:val="1D2D3E"/>
+          <w:sz w:val="22"/>
+          <w:szCs w:val="22"/>
+        </w:rPr>
+        <w:t xml:space="preserve">PartnersScreen: made partner cards tappable (→ PartnerDetail); added offline caching per company</w:t>
+      </w:r>
+    </w:p>
+    <w:p>
+      <w:pPr>
+        <w:pStyle w:val="ListParagraph"/>
+        <w:numPr>
+          <w:ilvl w:val="0"/>
+          <w:numId w:val="1"/>
+        </w:numPr>
+        <w:spacing w:after="40"/>
+      </w:pPr>
+      <w:r>
+        <w:rPr>
+          <w:color w:val="1D2D3E"/>
+          <w:sz w:val="22"/>
+          <w:szCs w:val="22"/>
+        </w:rPr>
+        <w:t xml:space="preserve">PurchaseOrdersScreen: added offline caching per tab (all/open/progress) with OfflineBanner</w:t>
+      </w:r>
+    </w:p>
+    <w:p>
+      <w:pPr>
+        <w:pStyle w:val="ListParagraph"/>
+        <w:numPr>
+          <w:ilvl w:val="0"/>
+          <w:numId w:val="1"/>
+        </w:numPr>
+        <w:spacing w:after="40"/>
+      </w:pPr>
+      <w:r>
+        <w:rPr>
+          <w:color w:val="1D2D3E"/>
+          <w:sz w:val="22"/>
+          <w:szCs w:val="22"/>
+        </w:rPr>
+        <w:t xml:space="preserve">SalesOrdersScreen: added offline caching per tab+company combo with OfflineBanner</w:t>
+      </w:r>
+    </w:p>
+    <w:p>
+      <w:pPr>
+        <w:pStyle w:val="ListParagraph"/>
+        <w:numPr>
+          <w:ilvl w:val="0"/>
+          <w:numId w:val="1"/>
+        </w:numPr>
+        <w:spacing w:after="40"/>
+      </w:pPr>
+      <w:r>
+        <w:rPr>
+          <w:color w:val="1D2D3E"/>
+          <w:sz w:val="22"/>
+          <w:szCs w:val="22"/>
+        </w:rPr>
+        <w:t xml:space="preserve">MoreNavigator: added PartnerDetail + Settings routes</w:t>
+      </w:r>
+    </w:p>
+    <w:p>
+      <w:pPr>
+        <w:pStyle w:val="ListParagraph"/>
+        <w:numPr>
+          <w:ilvl w:val="0"/>
+          <w:numId w:val="1"/>
+        </w:numPr>
+        <w:spacing w:after="40"/>
+      </w:pPr>
+      <w:r>
+        <w:rPr>
+          <w:color w:val="1D2D3E"/>
+          <w:sz w:val="22"/>
+          <w:szCs w:val="22"/>
+        </w:rPr>
+        <w:t xml:space="preserve">MoreMenuScreen: added Settings link under Admin section</w:t>
       </w:r>
     </w:p>
     <w:p>

</xml_diff>

<commit_message>
Session 10: PROGRESS.md + generate-docs.js + FEATURES.docx updated
- PROGRESS.md: added Session 9 + Session 10 entries; updated What's Next section;
  updated Screen Inventory table with new screens and features
- generate-docs.js: Section 3 additions (3.27 Alerts, 3.28 Dashboard KPI Nav);
  Section 3.23/3.25 updated for Sessions 9-10; Section 4 roadmap rows; changelog entries
- FEATURES.docx: regenerated
</commit_message>
<xml_diff>
--- a/FEATURES.docx
+++ b/FEATURES.docx
@@ -45,7 +45,7 @@
           <w:sz w:val="20"/>
           <w:szCs w:val="20"/>
         </w:rPr>
-        <w:t xml:space="preserve">Generated: 2026-05-20</w:t>
+        <w:t xml:space="preserve">Generated: 2026-05-21</w:t>
       </w:r>
     </w:p>
     <w:p>
@@ -4818,7 +4818,7 @@
           <w:bCs/>
           <w:color w:val="1D2D3E"/>
         </w:rPr>
-        <w:t xml:space="preserve">3.23 Navigation Architecture (Updated Session 8)</w:t>
+        <w:t xml:space="preserve">3.23 Navigation Architecture (Updated Session 10)</w:t>
       </w:r>
     </w:p>
     <w:p>
@@ -4861,6 +4861,24 @@
       <w:pPr>
         <w:pStyle w:val="ListParagraph"/>
         <w:numPr>
+          <w:ilvl w:val="1"/>
+          <w:numId w:val="1"/>
+        </w:numPr>
+        <w:spacing w:after="40"/>
+      </w:pPr>
+      <w:r>
+        <w:rPr>
+          <w:color w:val="1D2D3E"/>
+          <w:sz w:val="22"/>
+          <w:szCs w:val="22"/>
+        </w:rPr>
+        <w:t xml:space="preserve">  Finance tab: badge showing totalOverdue count (from OverdueContext)</w:t>
+      </w:r>
+    </w:p>
+    <w:p>
+      <w:pPr>
+        <w:pStyle w:val="ListParagraph"/>
+        <w:numPr>
           <w:ilvl w:val="0"/>
           <w:numId w:val="1"/>
         </w:numPr>
@@ -4908,7 +4926,7 @@
           <w:sz w:val="22"/>
           <w:szCs w:val="22"/>
         </w:rPr>
-        <w:t xml:space="preserve">MoreNavigator (stack, Session 8): MoreMenu → Materials, PurchaseOrders, PurchaseOrderDetail, SalesOrders, SalesOrderDetail, GRN, Partners, PartnerDetail, Companies, Settings</w:t>
+        <w:t xml:space="preserve">MoreNavigator (stack, Session 10): MoreMenu → Materials, PurchaseOrders, PurchaseOrderDetail, SalesOrders, SalesOrderDetail, GRN, Partners, PartnerDetail, Companies, Settings, Alerts</w:t>
       </w:r>
     </w:p>
     <w:p>
@@ -4971,7 +4989,7 @@
           <w:bCs/>
           <w:color w:val="1D2D3E"/>
         </w:rPr>
-        <w:t xml:space="preserve">3.25 Offline Caching (Sessions 6–8)</w:t>
+        <w:t xml:space="preserve">3.25 Offline Caching (Sessions 6–9)</w:t>
       </w:r>
     </w:p>
     <w:p>
@@ -5170,6 +5188,78 @@
           <w:szCs w:val="22"/>
         </w:rPr>
         <w:t xml:space="preserve">PartnersScreen: caches partners list per company with 24h TTL (Session 8)</w:t>
+      </w:r>
+    </w:p>
+    <w:p>
+      <w:pPr>
+        <w:pStyle w:val="ListParagraph"/>
+        <w:numPr>
+          <w:ilvl w:val="0"/>
+          <w:numId w:val="1"/>
+        </w:numPr>
+        <w:spacing w:after="40"/>
+      </w:pPr>
+      <w:r>
+        <w:rPr>
+          <w:color w:val="1D2D3E"/>
+          <w:sz w:val="22"/>
+          <w:szCs w:val="22"/>
+        </w:rPr>
+        <w:t xml:space="preserve">GRNScreen: caches GRN progress data per company with 24h TTL (Session 9)</w:t>
+      </w:r>
+    </w:p>
+    <w:p>
+      <w:pPr>
+        <w:pStyle w:val="ListParagraph"/>
+        <w:numPr>
+          <w:ilvl w:val="0"/>
+          <w:numId w:val="1"/>
+        </w:numPr>
+        <w:spacing w:after="40"/>
+      </w:pPr>
+      <w:r>
+        <w:rPr>
+          <w:color w:val="1D2D3E"/>
+          <w:sz w:val="22"/>
+          <w:szCs w:val="22"/>
+        </w:rPr>
+        <w:t xml:space="preserve">CompaniesScreen: caches companies list (Session 9)</w:t>
+      </w:r>
+    </w:p>
+    <w:p>
+      <w:pPr>
+        <w:pStyle w:val="ListParagraph"/>
+        <w:numPr>
+          <w:ilvl w:val="0"/>
+          <w:numId w:val="1"/>
+        </w:numPr>
+        <w:spacing w:after="40"/>
+      </w:pPr>
+      <w:r>
+        <w:rPr>
+          <w:color w:val="1D2D3E"/>
+          <w:sz w:val="22"/>
+          <w:szCs w:val="22"/>
+        </w:rPr>
+        <w:t xml:space="preserve">PODetailScreen + PurchaseOrderDetailScreen: each cache individual PO detail by ID (Session 9)</w:t>
+      </w:r>
+    </w:p>
+    <w:p>
+      <w:pPr>
+        <w:pStyle w:val="ListParagraph"/>
+        <w:numPr>
+          <w:ilvl w:val="0"/>
+          <w:numId w:val="1"/>
+        </w:numPr>
+        <w:spacing w:after="40"/>
+      </w:pPr>
+      <w:r>
+        <w:rPr>
+          <w:color w:val="1D2D3E"/>
+          <w:sz w:val="22"/>
+          <w:szCs w:val="22"/>
+        </w:rPr>
+        <w:t xml:space="preserve">SalesOrderDetailScreen: caches individual SO detail by ID (Session 9)</w:t>
       </w:r>
     </w:p>
     <w:p>
@@ -5287,6 +5377,420 @@
           <w:szCs w:val="22"/>
         </w:rPr>
         <w:t xml:space="preserve">SettingsScreen: UI to view/edit threshold, clear all cached data, view app version</w:t>
+      </w:r>
+    </w:p>
+    <w:p>
+      <w:pPr>
+        <w:spacing w:after="80"/>
+      </w:pPr>
+      <w:r>
+        <w:rPr>
+          <w:color w:val="1D2D3E"/>
+          <w:sz w:val="22"/>
+          <w:szCs w:val="22"/>
+        </w:rPr>
+        <w:t xml:space="preserve"/>
+      </w:r>
+    </w:p>
+    <w:p>
+      <w:pPr>
+        <w:pStyle w:val="Heading2"/>
+        <w:spacing w:after="120" w:before="300"/>
+      </w:pPr>
+      <w:r>
+        <w:rPr>
+          <w:b/>
+          <w:bCs/>
+          <w:color w:val="1D2D3E"/>
+        </w:rPr>
+        <w:t xml:space="preserve">3.27 Alerts &amp; Notifications System (Session 10)</w:t>
+      </w:r>
+    </w:p>
+    <w:p>
+      <w:pPr>
+        <w:pStyle w:val="ListParagraph"/>
+        <w:numPr>
+          <w:ilvl w:val="0"/>
+          <w:numId w:val="1"/>
+        </w:numPr>
+        <w:spacing w:after="40"/>
+      </w:pPr>
+      <w:r>
+        <w:rPr>
+          <w:color w:val="1D2D3E"/>
+          <w:sz w:val="22"/>
+          <w:szCs w:val="22"/>
+        </w:rPr>
+        <w:t xml:space="preserve">OverdueContext (src/context/OverdueContext.tsx): apOverdue, arOverdue, lowStock, totalAlerts</w:t>
+      </w:r>
+    </w:p>
+    <w:p>
+      <w:pPr>
+        <w:pStyle w:val="ListParagraph"/>
+        <w:numPr>
+          <w:ilvl w:val="1"/>
+          <w:numId w:val="1"/>
+        </w:numPr>
+        <w:spacing w:after="40"/>
+      </w:pPr>
+      <w:r>
+        <w:rPr>
+          <w:color w:val="1D2D3E"/>
+          <w:sz w:val="22"/>
+          <w:szCs w:val="22"/>
+        </w:rPr>
+        <w:t xml:space="preserve">  AP/AR screens call setAPOverdue/setAROverdue; InventoryScreen calls setLowStock</w:t>
+      </w:r>
+    </w:p>
+    <w:p>
+      <w:pPr>
+        <w:pStyle w:val="ListParagraph"/>
+        <w:numPr>
+          <w:ilvl w:val="0"/>
+          <w:numId w:val="1"/>
+        </w:numPr>
+        <w:spacing w:after="40"/>
+      </w:pPr>
+      <w:r>
+        <w:rPr>
+          <w:color w:val="1D2D3E"/>
+          <w:sz w:val="22"/>
+          <w:szCs w:val="22"/>
+        </w:rPr>
+        <w:t xml:space="preserve">AlertsScreen (src/screens/alerts/AlertsScreen.tsx):</w:t>
+      </w:r>
+    </w:p>
+    <w:p>
+      <w:pPr>
+        <w:pStyle w:val="ListParagraph"/>
+        <w:numPr>
+          <w:ilvl w:val="1"/>
+          <w:numId w:val="1"/>
+        </w:numPr>
+        <w:spacing w:after="40"/>
+      </w:pPr>
+      <w:r>
+        <w:rPr>
+          <w:color w:val="1D2D3E"/>
+          <w:sz w:val="22"/>
+          <w:szCs w:val="22"/>
+        </w:rPr>
+        <w:t xml:space="preserve">  Aggregates all active alerts: overdue AP bills, overdue AR invoices, low-stock items</w:t>
+      </w:r>
+    </w:p>
+    <w:p>
+      <w:pPr>
+        <w:pStyle w:val="ListParagraph"/>
+        <w:numPr>
+          <w:ilvl w:val="1"/>
+          <w:numId w:val="1"/>
+        </w:numPr>
+        <w:spacing w:after="40"/>
+      </w:pPr>
+      <w:r>
+        <w:rPr>
+          <w:color w:val="1D2D3E"/>
+          <w:sz w:val="22"/>
+          <w:szCs w:val="22"/>
+        </w:rPr>
+        <w:t xml:space="preserve">  Loads from cache first for instant display, falls back to fresh API</w:t>
+      </w:r>
+    </w:p>
+    <w:p>
+      <w:pPr>
+        <w:pStyle w:val="ListParagraph"/>
+        <w:numPr>
+          <w:ilvl w:val="1"/>
+          <w:numId w:val="1"/>
+        </w:numPr>
+        <w:spacing w:after="40"/>
+      </w:pPr>
+      <w:r>
+        <w:rPr>
+          <w:color w:val="1D2D3E"/>
+          <w:sz w:val="22"/>
+          <w:szCs w:val="22"/>
+        </w:rPr>
+        <w:t xml:space="preserve">  Overdue bills/invoices sorted most-overdue-first with 'Xd overdue' badge</w:t>
+      </w:r>
+    </w:p>
+    <w:p>
+      <w:pPr>
+        <w:pStyle w:val="ListParagraph"/>
+        <w:numPr>
+          <w:ilvl w:val="1"/>
+          <w:numId w:val="1"/>
+        </w:numPr>
+        <w:spacing w:after="40"/>
+      </w:pPr>
+      <w:r>
+        <w:rPr>
+          <w:color w:val="1D2D3E"/>
+          <w:sz w:val="22"/>
+          <w:szCs w:val="22"/>
+        </w:rPr>
+        <w:t xml:space="preserve">  Low-stock items sorted by qty ascending (most critical first)</w:t>
+      </w:r>
+    </w:p>
+    <w:p>
+      <w:pPr>
+        <w:pStyle w:val="ListParagraph"/>
+        <w:numPr>
+          <w:ilvl w:val="1"/>
+          <w:numId w:val="1"/>
+        </w:numPr>
+        <w:spacing w:after="40"/>
+      </w:pPr>
+      <w:r>
+        <w:rPr>
+          <w:color w:val="1D2D3E"/>
+          <w:sz w:val="22"/>
+          <w:szCs w:val="22"/>
+        </w:rPr>
+        <w:t xml:space="preserve">  Tapping rows navigates cross-tab: bills/invoices → Finance; stock → Inventory</w:t>
+      </w:r>
+    </w:p>
+    <w:p>
+      <w:pPr>
+        <w:pStyle w:val="ListParagraph"/>
+        <w:numPr>
+          <w:ilvl w:val="1"/>
+          <w:numId w:val="1"/>
+        </w:numPr>
+        <w:spacing w:after="40"/>
+      </w:pPr>
+      <w:r>
+        <w:rPr>
+          <w:color w:val="1D2D3E"/>
+          <w:sz w:val="22"/>
+          <w:szCs w:val="22"/>
+        </w:rPr>
+        <w:t xml:space="preserve">  All-clear empty state when no alerts; pull-to-refresh</w:t>
+      </w:r>
+    </w:p>
+    <w:p>
+      <w:pPr>
+        <w:pStyle w:val="ListParagraph"/>
+        <w:numPr>
+          <w:ilvl w:val="0"/>
+          <w:numId w:val="1"/>
+        </w:numPr>
+        <w:spacing w:after="40"/>
+      </w:pPr>
+      <w:r>
+        <w:rPr>
+          <w:color w:val="1D2D3E"/>
+          <w:sz w:val="22"/>
+          <w:szCs w:val="22"/>
+        </w:rPr>
+        <w:t xml:space="preserve">Dashboard bell icon: top-bar button with badge showing totalAlerts (hidden when zero)</w:t>
+      </w:r>
+    </w:p>
+    <w:p>
+      <w:pPr>
+        <w:pStyle w:val="ListParagraph"/>
+        <w:numPr>
+          <w:ilvl w:val="0"/>
+          <w:numId w:val="1"/>
+        </w:numPr>
+        <w:spacing w:after="40"/>
+      </w:pPr>
+      <w:r>
+        <w:rPr>
+          <w:color w:val="1D2D3E"/>
+          <w:sz w:val="22"/>
+          <w:szCs w:val="22"/>
+        </w:rPr>
+        <w:t xml:space="preserve">Dashboard Alerts tile: quick-action tile with badge overlay</w:t>
+      </w:r>
+    </w:p>
+    <w:p>
+      <w:pPr>
+        <w:pStyle w:val="ListParagraph"/>
+        <w:numPr>
+          <w:ilvl w:val="0"/>
+          <w:numId w:val="1"/>
+        </w:numPr>
+        <w:spacing w:after="40"/>
+      </w:pPr>
+      <w:r>
+        <w:rPr>
+          <w:color w:val="1D2D3E"/>
+          <w:sz w:val="22"/>
+          <w:szCs w:val="22"/>
+        </w:rPr>
+        <w:t xml:space="preserve">Dashboard Finance Status panel: cards showing overdue bill/invoice counts; only visible when &gt; 0</w:t>
+      </w:r>
+    </w:p>
+    <w:p>
+      <w:pPr>
+        <w:pStyle w:val="ListParagraph"/>
+        <w:numPr>
+          <w:ilvl w:val="0"/>
+          <w:numId w:val="1"/>
+        </w:numPr>
+        <w:spacing w:after="40"/>
+      </w:pPr>
+      <w:r>
+        <w:rPr>
+          <w:color w:val="1D2D3E"/>
+          <w:sz w:val="22"/>
+          <w:szCs w:val="22"/>
+        </w:rPr>
+        <w:t xml:space="preserve">FinanceMenuScreen: badge pills on AP + AR rows showing overdue counts from context</w:t>
+      </w:r>
+    </w:p>
+    <w:p>
+      <w:pPr>
+        <w:pStyle w:val="ListParagraph"/>
+        <w:numPr>
+          <w:ilvl w:val="0"/>
+          <w:numId w:val="1"/>
+        </w:numPr>
+        <w:spacing w:after="40"/>
+      </w:pPr>
+      <w:r>
+        <w:rPr>
+          <w:color w:val="1D2D3E"/>
+          <w:sz w:val="22"/>
+          <w:szCs w:val="22"/>
+        </w:rPr>
+        <w:t xml:space="preserve">MoreMenuScreen: Alerts banner at top with count breakdown and active border when alerts exist</w:t>
+      </w:r>
+    </w:p>
+    <w:p>
+      <w:pPr>
+        <w:pStyle w:val="ListParagraph"/>
+        <w:numPr>
+          <w:ilvl w:val="0"/>
+          <w:numId w:val="1"/>
+        </w:numPr>
+        <w:spacing w:after="40"/>
+      </w:pPr>
+      <w:r>
+        <w:rPr>
+          <w:color w:val="1D2D3E"/>
+          <w:sz w:val="22"/>
+          <w:szCs w:val="22"/>
+        </w:rPr>
+        <w:t xml:space="preserve">KPICard: shows Feather chevron-right in label row when onPress is provided</w:t>
+      </w:r>
+    </w:p>
+    <w:p>
+      <w:pPr>
+        <w:spacing w:after="80"/>
+      </w:pPr>
+      <w:r>
+        <w:rPr>
+          <w:color w:val="1D2D3E"/>
+          <w:sz w:val="22"/>
+          <w:szCs w:val="22"/>
+        </w:rPr>
+        <w:t xml:space="preserve"/>
+      </w:r>
+    </w:p>
+    <w:p>
+      <w:pPr>
+        <w:pStyle w:val="Heading2"/>
+        <w:spacing w:after="120" w:before="300"/>
+      </w:pPr>
+      <w:r>
+        <w:rPr>
+          <w:b/>
+          <w:bCs/>
+          <w:color w:val="1D2D3E"/>
+        </w:rPr>
+        <w:t xml:space="preserve">3.28 Dashboard KPI Navigation (Session 10)</w:t>
+      </w:r>
+    </w:p>
+    <w:p>
+      <w:pPr>
+        <w:pStyle w:val="ListParagraph"/>
+        <w:numPr>
+          <w:ilvl w:val="0"/>
+          <w:numId w:val="1"/>
+        </w:numPr>
+        <w:spacing w:after="40"/>
+      </w:pPr>
+      <w:r>
+        <w:rPr>
+          <w:color w:val="1D2D3E"/>
+          <w:sz w:val="22"/>
+          <w:szCs w:val="22"/>
+        </w:rPr>
+        <w:t xml:space="preserve">Revenue KPI card → navigates to Financial Reports (P&amp;L tab)</w:t>
+      </w:r>
+    </w:p>
+    <w:p>
+      <w:pPr>
+        <w:pStyle w:val="ListParagraph"/>
+        <w:numPr>
+          <w:ilvl w:val="0"/>
+          <w:numId w:val="1"/>
+        </w:numPr>
+        <w:spacing w:after="40"/>
+      </w:pPr>
+      <w:r>
+        <w:rPr>
+          <w:color w:val="1D2D3E"/>
+          <w:sz w:val="22"/>
+          <w:szCs w:val="22"/>
+        </w:rPr>
+        <w:t xml:space="preserve">Expenses KPI card → navigates to Journal Entries</w:t>
+      </w:r>
+    </w:p>
+    <w:p>
+      <w:pPr>
+        <w:pStyle w:val="ListParagraph"/>
+        <w:numPr>
+          <w:ilvl w:val="0"/>
+          <w:numId w:val="1"/>
+        </w:numPr>
+        <w:spacing w:after="40"/>
+      </w:pPr>
+      <w:r>
+        <w:rPr>
+          <w:color w:val="1D2D3E"/>
+          <w:sz w:val="22"/>
+          <w:szCs w:val="22"/>
+        </w:rPr>
+        <w:t xml:space="preserve">Net Income KPI card → navigates to Financial Reports</w:t>
+      </w:r>
+    </w:p>
+    <w:p>
+      <w:pPr>
+        <w:pStyle w:val="ListParagraph"/>
+        <w:numPr>
+          <w:ilvl w:val="0"/>
+          <w:numId w:val="1"/>
+        </w:numPr>
+        <w:spacing w:after="40"/>
+      </w:pPr>
+      <w:r>
+        <w:rPr>
+          <w:color w:val="1D2D3E"/>
+          <w:sz w:val="22"/>
+          <w:szCs w:val="22"/>
+        </w:rPr>
+        <w:t xml:space="preserve">Receivables KPI card → navigates to Accounts Receivable</w:t>
+      </w:r>
+    </w:p>
+    <w:p>
+      <w:pPr>
+        <w:pStyle w:val="ListParagraph"/>
+        <w:numPr>
+          <w:ilvl w:val="0"/>
+          <w:numId w:val="1"/>
+        </w:numPr>
+        <w:spacing w:after="40"/>
+      </w:pPr>
+      <w:r>
+        <w:rPr>
+          <w:color w:val="1D2D3E"/>
+          <w:sz w:val="22"/>
+          <w:szCs w:val="22"/>
+        </w:rPr>
+        <w:t xml:space="preserve">Payables KPI card → navigates to Accounts Payable</w:t>
       </w:r>
     </w:p>
     <w:p>
@@ -8333,6 +8837,696 @@
           </w:p>
         </w:tc>
       </w:tr>
+      <w:tr>
+        <w:tc>
+          <w:tcPr>
+            <w:shd w:color="F0F4F8" w:val="solid"/>
+          </w:tcPr>
+          <w:p>
+            <w:pPr>
+              <w:spacing w:after="40" w:before="40"/>
+            </w:pPr>
+            <w:r>
+              <w:rPr>
+                <w:b w:val="false"/>
+                <w:bCs w:val="false"/>
+                <w:color w:val="1D2D3E"/>
+                <w:sz w:val="20"/>
+                <w:szCs w:val="20"/>
+              </w:rPr>
+              <w:t xml:space="preserve">Session 9</w:t>
+            </w:r>
+          </w:p>
+        </w:tc>
+        <w:tc>
+          <w:tcPr>
+            <w:shd w:color="F0F4F8" w:val="solid"/>
+          </w:tcPr>
+          <w:p>
+            <w:pPr>
+              <w:spacing w:after="40" w:before="40"/>
+            </w:pPr>
+            <w:r>
+              <w:rPr>
+                <w:b w:val="false"/>
+                <w:bCs w:val="false"/>
+                <w:color w:val="1D2D3E"/>
+                <w:sz w:val="20"/>
+                <w:szCs w:val="20"/>
+              </w:rPr>
+              <w:t xml:space="preserve">Offline Caching for GRN / Companies / PO Detail / SO Detail</w:t>
+            </w:r>
+          </w:p>
+        </w:tc>
+        <w:tc>
+          <w:tcPr>
+            <w:shd w:color="F0F4F8" w:val="solid"/>
+          </w:tcPr>
+          <w:p>
+            <w:pPr>
+              <w:spacing w:after="40" w:before="40"/>
+            </w:pPr>
+            <w:r>
+              <w:rPr>
+                <w:b w:val="false"/>
+                <w:bCs w:val="false"/>
+                <w:color w:val="1D2D3E"/>
+                <w:sz w:val="20"/>
+                <w:szCs w:val="20"/>
+              </w:rPr>
+              <w:t xml:space="preserve">Done</w:t>
+            </w:r>
+          </w:p>
+        </w:tc>
+        <w:tc>
+          <w:tcPr>
+            <w:shd w:color="F0F4F8" w:val="solid"/>
+          </w:tcPr>
+          <w:p>
+            <w:pPr>
+              <w:spacing w:after="40" w:before="40"/>
+            </w:pPr>
+            <w:r>
+              <w:rPr>
+                <w:b w:val="false"/>
+                <w:bCs w:val="false"/>
+                <w:color w:val="1D2D3E"/>
+                <w:sz w:val="20"/>
+                <w:szCs w:val="20"/>
+              </w:rPr>
+              <w:t xml:space="preserve">—</w:t>
+            </w:r>
+          </w:p>
+        </w:tc>
+      </w:tr>
+      <w:tr>
+        <w:tc>
+          <w:p>
+            <w:pPr>
+              <w:spacing w:after="40" w:before="40"/>
+            </w:pPr>
+            <w:r>
+              <w:rPr>
+                <w:b w:val="false"/>
+                <w:bCs w:val="false"/>
+                <w:color w:val="1D2D3E"/>
+                <w:sz w:val="20"/>
+                <w:szCs w:val="20"/>
+              </w:rPr>
+              <w:t xml:space="preserve">Session 9</w:t>
+            </w:r>
+          </w:p>
+        </w:tc>
+        <w:tc>
+          <w:p>
+            <w:pPr>
+              <w:spacing w:after="40" w:before="40"/>
+            </w:pPr>
+            <w:r>
+              <w:rPr>
+                <w:b w:val="false"/>
+                <w:bCs w:val="false"/>
+                <w:color w:val="1D2D3E"/>
+                <w:sz w:val="20"/>
+                <w:szCs w:val="20"/>
+              </w:rPr>
+              <w:t xml:space="preserve">Finance tab overdue badge (OverdueContext, AP+AR screens)</w:t>
+            </w:r>
+          </w:p>
+        </w:tc>
+        <w:tc>
+          <w:p>
+            <w:pPr>
+              <w:spacing w:after="40" w:before="40"/>
+            </w:pPr>
+            <w:r>
+              <w:rPr>
+                <w:b w:val="false"/>
+                <w:bCs w:val="false"/>
+                <w:color w:val="1D2D3E"/>
+                <w:sz w:val="20"/>
+                <w:szCs w:val="20"/>
+              </w:rPr>
+              <w:t xml:space="preserve">Done</w:t>
+            </w:r>
+          </w:p>
+        </w:tc>
+        <w:tc>
+          <w:p>
+            <w:pPr>
+              <w:spacing w:after="40" w:before="40"/>
+            </w:pPr>
+            <w:r>
+              <w:rPr>
+                <w:b w:val="false"/>
+                <w:bCs w:val="false"/>
+                <w:color w:val="1D2D3E"/>
+                <w:sz w:val="20"/>
+                <w:szCs w:val="20"/>
+              </w:rPr>
+              <w:t xml:space="preserve">—</w:t>
+            </w:r>
+          </w:p>
+        </w:tc>
+      </w:tr>
+      <w:tr>
+        <w:tc>
+          <w:tcPr>
+            <w:shd w:color="F0F4F8" w:val="solid"/>
+          </w:tcPr>
+          <w:p>
+            <w:pPr>
+              <w:spacing w:after="40" w:before="40"/>
+            </w:pPr>
+            <w:r>
+              <w:rPr>
+                <w:b w:val="false"/>
+                <w:bCs w:val="false"/>
+                <w:color w:val="1D2D3E"/>
+                <w:sz w:val="20"/>
+                <w:szCs w:val="20"/>
+              </w:rPr>
+              <w:t xml:space="preserve">Session 9</w:t>
+            </w:r>
+          </w:p>
+        </w:tc>
+        <w:tc>
+          <w:tcPr>
+            <w:shd w:color="F0F4F8" w:val="solid"/>
+          </w:tcPr>
+          <w:p>
+            <w:pPr>
+              <w:spacing w:after="40" w:before="40"/>
+            </w:pPr>
+            <w:r>
+              <w:rPr>
+                <w:b w:val="false"/>
+                <w:bCs w:val="false"/>
+                <w:color w:val="1D2D3E"/>
+                <w:sz w:val="20"/>
+                <w:szCs w:val="20"/>
+              </w:rPr>
+              <w:t xml:space="preserve">Companies search/filter (name, code, active-only toggle)</w:t>
+            </w:r>
+          </w:p>
+        </w:tc>
+        <w:tc>
+          <w:tcPr>
+            <w:shd w:color="F0F4F8" w:val="solid"/>
+          </w:tcPr>
+          <w:p>
+            <w:pPr>
+              <w:spacing w:after="40" w:before="40"/>
+            </w:pPr>
+            <w:r>
+              <w:rPr>
+                <w:b w:val="false"/>
+                <w:bCs w:val="false"/>
+                <w:color w:val="1D2D3E"/>
+                <w:sz w:val="20"/>
+                <w:szCs w:val="20"/>
+              </w:rPr>
+              <w:t xml:space="preserve">Done</w:t>
+            </w:r>
+          </w:p>
+        </w:tc>
+        <w:tc>
+          <w:tcPr>
+            <w:shd w:color="F0F4F8" w:val="solid"/>
+          </w:tcPr>
+          <w:p>
+            <w:pPr>
+              <w:spacing w:after="40" w:before="40"/>
+            </w:pPr>
+            <w:r>
+              <w:rPr>
+                <w:b w:val="false"/>
+                <w:bCs w:val="false"/>
+                <w:color w:val="1D2D3E"/>
+                <w:sz w:val="20"/>
+                <w:szCs w:val="20"/>
+              </w:rPr>
+              <w:t xml:space="preserve">—</w:t>
+            </w:r>
+          </w:p>
+        </w:tc>
+      </w:tr>
+      <w:tr>
+        <w:tc>
+          <w:p>
+            <w:pPr>
+              <w:spacing w:after="40" w:before="40"/>
+            </w:pPr>
+            <w:r>
+              <w:rPr>
+                <w:b w:val="false"/>
+                <w:bCs w:val="false"/>
+                <w:color w:val="1D2D3E"/>
+                <w:sz w:val="20"/>
+                <w:szCs w:val="20"/>
+              </w:rPr>
+              <w:t xml:space="preserve">Session 10</w:t>
+            </w:r>
+          </w:p>
+        </w:tc>
+        <w:tc>
+          <w:p>
+            <w:pPr>
+              <w:spacing w:after="40" w:before="40"/>
+            </w:pPr>
+            <w:r>
+              <w:rPr>
+                <w:b w:val="false"/>
+                <w:bCs w:val="false"/>
+                <w:color w:val="1D2D3E"/>
+                <w:sz w:val="20"/>
+                <w:szCs w:val="20"/>
+              </w:rPr>
+              <w:t xml:space="preserve">Alerts / Notifications Center Screen</w:t>
+            </w:r>
+          </w:p>
+        </w:tc>
+        <w:tc>
+          <w:p>
+            <w:pPr>
+              <w:spacing w:after="40" w:before="40"/>
+            </w:pPr>
+            <w:r>
+              <w:rPr>
+                <w:b w:val="false"/>
+                <w:bCs w:val="false"/>
+                <w:color w:val="1D2D3E"/>
+                <w:sz w:val="20"/>
+                <w:szCs w:val="20"/>
+              </w:rPr>
+              <w:t xml:space="preserve">Done</w:t>
+            </w:r>
+          </w:p>
+        </w:tc>
+        <w:tc>
+          <w:p>
+            <w:pPr>
+              <w:spacing w:after="40" w:before="40"/>
+            </w:pPr>
+            <w:r>
+              <w:rPr>
+                <w:b w:val="false"/>
+                <w:bCs w:val="false"/>
+                <w:color w:val="1D2D3E"/>
+                <w:sz w:val="20"/>
+                <w:szCs w:val="20"/>
+              </w:rPr>
+              <w:t xml:space="preserve">/api/mobile/accounts-payable + accounts-receivable + inventory</w:t>
+            </w:r>
+          </w:p>
+        </w:tc>
+      </w:tr>
+      <w:tr>
+        <w:tc>
+          <w:tcPr>
+            <w:shd w:color="F0F4F8" w:val="solid"/>
+          </w:tcPr>
+          <w:p>
+            <w:pPr>
+              <w:spacing w:after="40" w:before="40"/>
+            </w:pPr>
+            <w:r>
+              <w:rPr>
+                <w:b w:val="false"/>
+                <w:bCs w:val="false"/>
+                <w:color w:val="1D2D3E"/>
+                <w:sz w:val="20"/>
+                <w:szCs w:val="20"/>
+              </w:rPr>
+              <w:t xml:space="preserve">Session 10</w:t>
+            </w:r>
+          </w:p>
+        </w:tc>
+        <w:tc>
+          <w:tcPr>
+            <w:shd w:color="F0F4F8" w:val="solid"/>
+          </w:tcPr>
+          <w:p>
+            <w:pPr>
+              <w:spacing w:after="40" w:before="40"/>
+            </w:pPr>
+            <w:r>
+              <w:rPr>
+                <w:b w:val="false"/>
+                <w:bCs w:val="false"/>
+                <w:color w:val="1D2D3E"/>
+                <w:sz w:val="20"/>
+                <w:szCs w:val="20"/>
+              </w:rPr>
+              <w:t xml:space="preserve">OverdueContext extended with lowStock + totalAlerts</w:t>
+            </w:r>
+          </w:p>
+        </w:tc>
+        <w:tc>
+          <w:tcPr>
+            <w:shd w:color="F0F4F8" w:val="solid"/>
+          </w:tcPr>
+          <w:p>
+            <w:pPr>
+              <w:spacing w:after="40" w:before="40"/>
+            </w:pPr>
+            <w:r>
+              <w:rPr>
+                <w:b w:val="false"/>
+                <w:bCs w:val="false"/>
+                <w:color w:val="1D2D3E"/>
+                <w:sz w:val="20"/>
+                <w:szCs w:val="20"/>
+              </w:rPr>
+              <w:t xml:space="preserve">Done</w:t>
+            </w:r>
+          </w:p>
+        </w:tc>
+        <w:tc>
+          <w:tcPr>
+            <w:shd w:color="F0F4F8" w:val="solid"/>
+          </w:tcPr>
+          <w:p>
+            <w:pPr>
+              <w:spacing w:after="40" w:before="40"/>
+            </w:pPr>
+            <w:r>
+              <w:rPr>
+                <w:b w:val="false"/>
+                <w:bCs w:val="false"/>
+                <w:color w:val="1D2D3E"/>
+                <w:sz w:val="20"/>
+                <w:szCs w:val="20"/>
+              </w:rPr>
+              <w:t xml:space="preserve">—</w:t>
+            </w:r>
+          </w:p>
+        </w:tc>
+      </w:tr>
+      <w:tr>
+        <w:tc>
+          <w:p>
+            <w:pPr>
+              <w:spacing w:after="40" w:before="40"/>
+            </w:pPr>
+            <w:r>
+              <w:rPr>
+                <w:b w:val="false"/>
+                <w:bCs w:val="false"/>
+                <w:color w:val="1D2D3E"/>
+                <w:sz w:val="20"/>
+                <w:szCs w:val="20"/>
+              </w:rPr>
+              <w:t xml:space="preserve">Session 10</w:t>
+            </w:r>
+          </w:p>
+        </w:tc>
+        <w:tc>
+          <w:p>
+            <w:pPr>
+              <w:spacing w:after="40" w:before="40"/>
+            </w:pPr>
+            <w:r>
+              <w:rPr>
+                <w:b w:val="false"/>
+                <w:bCs w:val="false"/>
+                <w:color w:val="1D2D3E"/>
+                <w:sz w:val="20"/>
+                <w:szCs w:val="20"/>
+              </w:rPr>
+              <w:t xml:space="preserve">Dashboard: bell badge, Finance Status panel, all KPI cards tappable</w:t>
+            </w:r>
+          </w:p>
+        </w:tc>
+        <w:tc>
+          <w:p>
+            <w:pPr>
+              <w:spacing w:after="40" w:before="40"/>
+            </w:pPr>
+            <w:r>
+              <w:rPr>
+                <w:b w:val="false"/>
+                <w:bCs w:val="false"/>
+                <w:color w:val="1D2D3E"/>
+                <w:sz w:val="20"/>
+                <w:szCs w:val="20"/>
+              </w:rPr>
+              <w:t xml:space="preserve">Done</w:t>
+            </w:r>
+          </w:p>
+        </w:tc>
+        <w:tc>
+          <w:p>
+            <w:pPr>
+              <w:spacing w:after="40" w:before="40"/>
+            </w:pPr>
+            <w:r>
+              <w:rPr>
+                <w:b w:val="false"/>
+                <w:bCs w:val="false"/>
+                <w:color w:val="1D2D3E"/>
+                <w:sz w:val="20"/>
+                <w:szCs w:val="20"/>
+              </w:rPr>
+              <w:t xml:space="preserve">—</w:t>
+            </w:r>
+          </w:p>
+        </w:tc>
+      </w:tr>
+      <w:tr>
+        <w:tc>
+          <w:tcPr>
+            <w:shd w:color="F0F4F8" w:val="solid"/>
+          </w:tcPr>
+          <w:p>
+            <w:pPr>
+              <w:spacing w:after="40" w:before="40"/>
+            </w:pPr>
+            <w:r>
+              <w:rPr>
+                <w:b w:val="false"/>
+                <w:bCs w:val="false"/>
+                <w:color w:val="1D2D3E"/>
+                <w:sz w:val="20"/>
+                <w:szCs w:val="20"/>
+              </w:rPr>
+              <w:t xml:space="preserve">Session 10</w:t>
+            </w:r>
+          </w:p>
+        </w:tc>
+        <w:tc>
+          <w:tcPr>
+            <w:shd w:color="F0F4F8" w:val="solid"/>
+          </w:tcPr>
+          <w:p>
+            <w:pPr>
+              <w:spacing w:after="40" w:before="40"/>
+            </w:pPr>
+            <w:r>
+              <w:rPr>
+                <w:b w:val="false"/>
+                <w:bCs w:val="false"/>
+                <w:color w:val="1D2D3E"/>
+                <w:sz w:val="20"/>
+                <w:szCs w:val="20"/>
+              </w:rPr>
+              <w:t xml:space="preserve">FinanceMenu: overdue badge pills on AP + AR rows</w:t>
+            </w:r>
+          </w:p>
+        </w:tc>
+        <w:tc>
+          <w:tcPr>
+            <w:shd w:color="F0F4F8" w:val="solid"/>
+          </w:tcPr>
+          <w:p>
+            <w:pPr>
+              <w:spacing w:after="40" w:before="40"/>
+            </w:pPr>
+            <w:r>
+              <w:rPr>
+                <w:b w:val="false"/>
+                <w:bCs w:val="false"/>
+                <w:color w:val="1D2D3E"/>
+                <w:sz w:val="20"/>
+                <w:szCs w:val="20"/>
+              </w:rPr>
+              <w:t xml:space="preserve">Done</w:t>
+            </w:r>
+          </w:p>
+        </w:tc>
+        <w:tc>
+          <w:tcPr>
+            <w:shd w:color="F0F4F8" w:val="solid"/>
+          </w:tcPr>
+          <w:p>
+            <w:pPr>
+              <w:spacing w:after="40" w:before="40"/>
+            </w:pPr>
+            <w:r>
+              <w:rPr>
+                <w:b w:val="false"/>
+                <w:bCs w:val="false"/>
+                <w:color w:val="1D2D3E"/>
+                <w:sz w:val="20"/>
+                <w:szCs w:val="20"/>
+              </w:rPr>
+              <w:t xml:space="preserve">—</w:t>
+            </w:r>
+          </w:p>
+        </w:tc>
+      </w:tr>
+      <w:tr>
+        <w:tc>
+          <w:p>
+            <w:pPr>
+              <w:spacing w:after="40" w:before="40"/>
+            </w:pPr>
+            <w:r>
+              <w:rPr>
+                <w:b w:val="false"/>
+                <w:bCs w:val="false"/>
+                <w:color w:val="1D2D3E"/>
+                <w:sz w:val="20"/>
+                <w:szCs w:val="20"/>
+              </w:rPr>
+              <w:t xml:space="preserve">Session 10</w:t>
+            </w:r>
+          </w:p>
+        </w:tc>
+        <w:tc>
+          <w:p>
+            <w:pPr>
+              <w:spacing w:after="40" w:before="40"/>
+            </w:pPr>
+            <w:r>
+              <w:rPr>
+                <w:b w:val="false"/>
+                <w:bCs w:val="false"/>
+                <w:color w:val="1D2D3E"/>
+                <w:sz w:val="20"/>
+                <w:szCs w:val="20"/>
+              </w:rPr>
+              <w:t xml:space="preserve">MoreMenu: Alerts banner with count breakdown</w:t>
+            </w:r>
+          </w:p>
+        </w:tc>
+        <w:tc>
+          <w:p>
+            <w:pPr>
+              <w:spacing w:after="40" w:before="40"/>
+            </w:pPr>
+            <w:r>
+              <w:rPr>
+                <w:b w:val="false"/>
+                <w:bCs w:val="false"/>
+                <w:color w:val="1D2D3E"/>
+                <w:sz w:val="20"/>
+                <w:szCs w:val="20"/>
+              </w:rPr>
+              <w:t xml:space="preserve">Done</w:t>
+            </w:r>
+          </w:p>
+        </w:tc>
+        <w:tc>
+          <w:p>
+            <w:pPr>
+              <w:spacing w:after="40" w:before="40"/>
+            </w:pPr>
+            <w:r>
+              <w:rPr>
+                <w:b w:val="false"/>
+                <w:bCs w:val="false"/>
+                <w:color w:val="1D2D3E"/>
+                <w:sz w:val="20"/>
+                <w:szCs w:val="20"/>
+              </w:rPr>
+              <w:t xml:space="preserve">—</w:t>
+            </w:r>
+          </w:p>
+        </w:tc>
+      </w:tr>
+      <w:tr>
+        <w:tc>
+          <w:tcPr>
+            <w:shd w:color="F0F4F8" w:val="solid"/>
+          </w:tcPr>
+          <w:p>
+            <w:pPr>
+              <w:spacing w:after="40" w:before="40"/>
+            </w:pPr>
+            <w:r>
+              <w:rPr>
+                <w:b w:val="false"/>
+                <w:bCs w:val="false"/>
+                <w:color w:val="1D2D3E"/>
+                <w:sz w:val="20"/>
+                <w:szCs w:val="20"/>
+              </w:rPr>
+              <w:t xml:space="preserve">Session 10</w:t>
+            </w:r>
+          </w:p>
+        </w:tc>
+        <w:tc>
+          <w:tcPr>
+            <w:shd w:color="F0F4F8" w:val="solid"/>
+          </w:tcPr>
+          <w:p>
+            <w:pPr>
+              <w:spacing w:after="40" w:before="40"/>
+            </w:pPr>
+            <w:r>
+              <w:rPr>
+                <w:b w:val="false"/>
+                <w:bCs w:val="false"/>
+                <w:color w:val="1D2D3E"/>
+                <w:sz w:val="20"/>
+                <w:szCs w:val="20"/>
+              </w:rPr>
+              <w:t xml:space="preserve">KPICard: chevron indicator when onPress provided</w:t>
+            </w:r>
+          </w:p>
+        </w:tc>
+        <w:tc>
+          <w:tcPr>
+            <w:shd w:color="F0F4F8" w:val="solid"/>
+          </w:tcPr>
+          <w:p>
+            <w:pPr>
+              <w:spacing w:after="40" w:before="40"/>
+            </w:pPr>
+            <w:r>
+              <w:rPr>
+                <w:b w:val="false"/>
+                <w:bCs w:val="false"/>
+                <w:color w:val="1D2D3E"/>
+                <w:sz w:val="20"/>
+                <w:szCs w:val="20"/>
+              </w:rPr>
+              <w:t xml:space="preserve">Done</w:t>
+            </w:r>
+          </w:p>
+        </w:tc>
+        <w:tc>
+          <w:tcPr>
+            <w:shd w:color="F0F4F8" w:val="solid"/>
+          </w:tcPr>
+          <w:p>
+            <w:pPr>
+              <w:spacing w:after="40" w:before="40"/>
+            </w:pPr>
+            <w:r>
+              <w:rPr>
+                <w:b w:val="false"/>
+                <w:bCs w:val="false"/>
+                <w:color w:val="1D2D3E"/>
+                <w:sz w:val="20"/>
+                <w:szCs w:val="20"/>
+              </w:rPr>
+              <w:t xml:space="preserve">—</w:t>
+            </w:r>
+          </w:p>
+        </w:tc>
+      </w:tr>
     </w:tbl>
     <w:p>
       <w:pPr>
@@ -11156,6 +12350,438 @@
           <w:szCs w:val="22"/>
         </w:rPr>
         <w:t xml:space="preserve">Offline caching extended to MaterialsScreen (materials + types per company+type combo)</w:t>
+      </w:r>
+    </w:p>
+    <w:p>
+      <w:pPr>
+        <w:spacing w:after="80"/>
+      </w:pPr>
+      <w:r>
+        <w:rPr>
+          <w:color w:val="1D2D3E"/>
+          <w:sz w:val="22"/>
+          <w:szCs w:val="22"/>
+        </w:rPr>
+        <w:t xml:space="preserve"/>
+      </w:r>
+    </w:p>
+    <w:p>
+      <w:pPr>
+        <w:pStyle w:val="Heading2"/>
+        <w:spacing w:after="120" w:before="300"/>
+      </w:pPr>
+      <w:r>
+        <w:rPr>
+          <w:b/>
+          <w:bCs/>
+          <w:color w:val="1D2D3E"/>
+        </w:rPr>
+        <w:t xml:space="preserve">Session 9 — 2026-05-21</w:t>
+      </w:r>
+    </w:p>
+    <w:p>
+      <w:pPr>
+        <w:pStyle w:val="ListParagraph"/>
+        <w:numPr>
+          <w:ilvl w:val="0"/>
+          <w:numId w:val="1"/>
+        </w:numPr>
+        <w:spacing w:after="40"/>
+      </w:pPr>
+      <w:r>
+        <w:rPr>
+          <w:color w:val="1D2D3E"/>
+          <w:sz w:val="22"/>
+          <w:szCs w:val="22"/>
+        </w:rPr>
+        <w:t xml:space="preserve">Offline caching extended to GRNScreen (per company, 24h TTL)</w:t>
+      </w:r>
+    </w:p>
+    <w:p>
+      <w:pPr>
+        <w:pStyle w:val="ListParagraph"/>
+        <w:numPr>
+          <w:ilvl w:val="0"/>
+          <w:numId w:val="1"/>
+        </w:numPr>
+        <w:spacing w:after="40"/>
+      </w:pPr>
+      <w:r>
+        <w:rPr>
+          <w:color w:val="1D2D3E"/>
+          <w:sz w:val="22"/>
+          <w:szCs w:val="22"/>
+        </w:rPr>
+        <w:t xml:space="preserve">Offline caching extended to CompaniesScreen</w:t>
+      </w:r>
+    </w:p>
+    <w:p>
+      <w:pPr>
+        <w:pStyle w:val="ListParagraph"/>
+        <w:numPr>
+          <w:ilvl w:val="0"/>
+          <w:numId w:val="1"/>
+        </w:numPr>
+        <w:spacing w:after="40"/>
+      </w:pPr>
+      <w:r>
+        <w:rPr>
+          <w:color w:val="1D2D3E"/>
+          <w:sz w:val="22"/>
+          <w:szCs w:val="22"/>
+        </w:rPr>
+        <w:t xml:space="preserve">Offline caching extended to PODetailScreen and PurchaseOrderDetailScreen (per PO ID)</w:t>
+      </w:r>
+    </w:p>
+    <w:p>
+      <w:pPr>
+        <w:pStyle w:val="ListParagraph"/>
+        <w:numPr>
+          <w:ilvl w:val="0"/>
+          <w:numId w:val="1"/>
+        </w:numPr>
+        <w:spacing w:after="40"/>
+      </w:pPr>
+      <w:r>
+        <w:rPr>
+          <w:color w:val="1D2D3E"/>
+          <w:sz w:val="22"/>
+          <w:szCs w:val="22"/>
+        </w:rPr>
+        <w:t xml:space="preserve">Offline caching extended to SalesOrderDetailScreen (per SO ID)</w:t>
+      </w:r>
+    </w:p>
+    <w:p>
+      <w:pPr>
+        <w:pStyle w:val="ListParagraph"/>
+        <w:numPr>
+          <w:ilvl w:val="0"/>
+          <w:numId w:val="1"/>
+        </w:numPr>
+        <w:spacing w:after="40"/>
+      </w:pPr>
+      <w:r>
+        <w:rPr>
+          <w:color w:val="1D2D3E"/>
+          <w:sz w:val="22"/>
+          <w:szCs w:val="22"/>
+        </w:rPr>
+        <w:t xml:space="preserve">Created OverdueContext (src/context/OverdueContext.tsx) with apOverdue / arOverdue / totalOverdue</w:t>
+      </w:r>
+    </w:p>
+    <w:p>
+      <w:pPr>
+        <w:pStyle w:val="ListParagraph"/>
+        <w:numPr>
+          <w:ilvl w:val="0"/>
+          <w:numId w:val="1"/>
+        </w:numPr>
+        <w:spacing w:after="40"/>
+      </w:pPr>
+      <w:r>
+        <w:rPr>
+          <w:color w:val="1D2D3E"/>
+          <w:sz w:val="22"/>
+          <w:szCs w:val="22"/>
+        </w:rPr>
+        <w:t xml:space="preserve">AccountsPayableScreen: calls setAPOverdue(count) after loading bills</w:t>
+      </w:r>
+    </w:p>
+    <w:p>
+      <w:pPr>
+        <w:pStyle w:val="ListParagraph"/>
+        <w:numPr>
+          <w:ilvl w:val="0"/>
+          <w:numId w:val="1"/>
+        </w:numPr>
+        <w:spacing w:after="40"/>
+      </w:pPr>
+      <w:r>
+        <w:rPr>
+          <w:color w:val="1D2D3E"/>
+          <w:sz w:val="22"/>
+          <w:szCs w:val="22"/>
+        </w:rPr>
+        <w:t xml:space="preserve">AccountsReceivableScreen: calls setAROverdue(count) after loading invoices</w:t>
+      </w:r>
+    </w:p>
+    <w:p>
+      <w:pPr>
+        <w:pStyle w:val="ListParagraph"/>
+        <w:numPr>
+          <w:ilvl w:val="0"/>
+          <w:numId w:val="1"/>
+        </w:numPr>
+        <w:spacing w:after="40"/>
+      </w:pPr>
+      <w:r>
+        <w:rPr>
+          <w:color w:val="1D2D3E"/>
+          <w:sz w:val="22"/>
+          <w:szCs w:val="22"/>
+        </w:rPr>
+        <w:t xml:space="preserve">AppNavigator: Finance tab badge displays totalOverdue count from OverdueContext</w:t>
+      </w:r>
+    </w:p>
+    <w:p>
+      <w:pPr>
+        <w:pStyle w:val="ListParagraph"/>
+        <w:numPr>
+          <w:ilvl w:val="0"/>
+          <w:numId w:val="1"/>
+        </w:numPr>
+        <w:spacing w:after="40"/>
+      </w:pPr>
+      <w:r>
+        <w:rPr>
+          <w:color w:val="1D2D3E"/>
+          <w:sz w:val="22"/>
+          <w:szCs w:val="22"/>
+        </w:rPr>
+        <w:t xml:space="preserve">CompaniesScreen: added real-time search by name/code and active-only toggle chip</w:t>
+      </w:r>
+    </w:p>
+    <w:p>
+      <w:pPr>
+        <w:spacing w:after="80"/>
+      </w:pPr>
+      <w:r>
+        <w:rPr>
+          <w:color w:val="1D2D3E"/>
+          <w:sz w:val="22"/>
+          <w:szCs w:val="22"/>
+        </w:rPr>
+        <w:t xml:space="preserve"/>
+      </w:r>
+    </w:p>
+    <w:p>
+      <w:pPr>
+        <w:pStyle w:val="Heading2"/>
+        <w:spacing w:after="120" w:before="300"/>
+      </w:pPr>
+      <w:r>
+        <w:rPr>
+          <w:b/>
+          <w:bCs/>
+          <w:color w:val="1D2D3E"/>
+        </w:rPr>
+        <w:t xml:space="preserve">Session 10 — 2026-05-21</w:t>
+      </w:r>
+    </w:p>
+    <w:p>
+      <w:pPr>
+        <w:pStyle w:val="ListParagraph"/>
+        <w:numPr>
+          <w:ilvl w:val="0"/>
+          <w:numId w:val="1"/>
+        </w:numPr>
+        <w:spacing w:after="40"/>
+      </w:pPr>
+      <w:r>
+        <w:rPr>
+          <w:color w:val="1D2D3E"/>
+          <w:sz w:val="22"/>
+          <w:szCs w:val="22"/>
+        </w:rPr>
+        <w:t xml:space="preserve">Created AlertsScreen (src/screens/alerts/AlertsScreen.tsx)</w:t>
+      </w:r>
+    </w:p>
+    <w:p>
+      <w:pPr>
+        <w:pStyle w:val="ListParagraph"/>
+        <w:numPr>
+          <w:ilvl w:val="1"/>
+          <w:numId w:val="1"/>
+        </w:numPr>
+        <w:spacing w:after="40"/>
+      </w:pPr>
+      <w:r>
+        <w:rPr>
+          <w:color w:val="1D2D3E"/>
+          <w:sz w:val="22"/>
+          <w:szCs w:val="22"/>
+        </w:rPr>
+        <w:t xml:space="preserve">  — Aggregates overdue AP bills, overdue AR invoices, low-stock items</w:t>
+      </w:r>
+    </w:p>
+    <w:p>
+      <w:pPr>
+        <w:pStyle w:val="ListParagraph"/>
+        <w:numPr>
+          <w:ilvl w:val="1"/>
+          <w:numId w:val="1"/>
+        </w:numPr>
+        <w:spacing w:after="40"/>
+      </w:pPr>
+      <w:r>
+        <w:rPr>
+          <w:color w:val="1D2D3E"/>
+          <w:sz w:val="22"/>
+          <w:szCs w:val="22"/>
+        </w:rPr>
+        <w:t xml:space="preserve">  — Cache-first data loading; cross-tab navigation on row tap</w:t>
+      </w:r>
+    </w:p>
+    <w:p>
+      <w:pPr>
+        <w:pStyle w:val="ListParagraph"/>
+        <w:numPr>
+          <w:ilvl w:val="1"/>
+          <w:numId w:val="1"/>
+        </w:numPr>
+        <w:spacing w:after="40"/>
+      </w:pPr>
+      <w:r>
+        <w:rPr>
+          <w:color w:val="1D2D3E"/>
+          <w:sz w:val="22"/>
+          <w:szCs w:val="22"/>
+        </w:rPr>
+        <w:t xml:space="preserve">  — All-clear empty state; pull-to-refresh; updates OverdueContext on load</w:t>
+      </w:r>
+    </w:p>
+    <w:p>
+      <w:pPr>
+        <w:pStyle w:val="ListParagraph"/>
+        <w:numPr>
+          <w:ilvl w:val="0"/>
+          <w:numId w:val="1"/>
+        </w:numPr>
+        <w:spacing w:after="40"/>
+      </w:pPr>
+      <w:r>
+        <w:rPr>
+          <w:color w:val="1D2D3E"/>
+          <w:sz w:val="22"/>
+          <w:szCs w:val="22"/>
+        </w:rPr>
+        <w:t xml:space="preserve">Extended OverdueContext: added lowStock, setLowStock, totalAlerts fields</w:t>
+      </w:r>
+    </w:p>
+    <w:p>
+      <w:pPr>
+        <w:pStyle w:val="ListParagraph"/>
+        <w:numPr>
+          <w:ilvl w:val="0"/>
+          <w:numId w:val="1"/>
+        </w:numPr>
+        <w:spacing w:after="40"/>
+      </w:pPr>
+      <w:r>
+        <w:rPr>
+          <w:color w:val="1D2D3E"/>
+          <w:sz w:val="22"/>
+          <w:szCs w:val="22"/>
+        </w:rPr>
+        <w:t xml:space="preserve">InventoryScreen: publishes low-stock count to OverdueContext via useEffect</w:t>
+      </w:r>
+    </w:p>
+    <w:p>
+      <w:pPr>
+        <w:pStyle w:val="ListParagraph"/>
+        <w:numPr>
+          <w:ilvl w:val="0"/>
+          <w:numId w:val="1"/>
+        </w:numPr>
+        <w:spacing w:after="40"/>
+      </w:pPr>
+      <w:r>
+        <w:rPr>
+          <w:color w:val="1D2D3E"/>
+          <w:sz w:val="22"/>
+          <w:szCs w:val="22"/>
+        </w:rPr>
+        <w:t xml:space="preserve">MoreNavigator: added Alerts route</w:t>
+      </w:r>
+    </w:p>
+    <w:p>
+      <w:pPr>
+        <w:pStyle w:val="ListParagraph"/>
+        <w:numPr>
+          <w:ilvl w:val="0"/>
+          <w:numId w:val="1"/>
+        </w:numPr>
+        <w:spacing w:after="40"/>
+      </w:pPr>
+      <w:r>
+        <w:rPr>
+          <w:color w:val="1D2D3E"/>
+          <w:sz w:val="22"/>
+          <w:szCs w:val="22"/>
+        </w:rPr>
+        <w:t xml:space="preserve">MoreMenuScreen: Alerts banner at top with count breakdown; active border when alerts exist</w:t>
+      </w:r>
+    </w:p>
+    <w:p>
+      <w:pPr>
+        <w:pStyle w:val="ListParagraph"/>
+        <w:numPr>
+          <w:ilvl w:val="0"/>
+          <w:numId w:val="1"/>
+        </w:numPr>
+        <w:spacing w:after="40"/>
+      </w:pPr>
+      <w:r>
+        <w:rPr>
+          <w:color w:val="1D2D3E"/>
+          <w:sz w:val="22"/>
+          <w:szCs w:val="22"/>
+        </w:rPr>
+        <w:t xml:space="preserve">Dashboard: bell icon with totalAlerts badge, Alerts quick-action tile with badge, Finance Status panel</w:t>
+      </w:r>
+    </w:p>
+    <w:p>
+      <w:pPr>
+        <w:pStyle w:val="ListParagraph"/>
+        <w:numPr>
+          <w:ilvl w:val="0"/>
+          <w:numId w:val="1"/>
+        </w:numPr>
+        <w:spacing w:after="40"/>
+      </w:pPr>
+      <w:r>
+        <w:rPr>
+          <w:color w:val="1D2D3E"/>
+          <w:sz w:val="22"/>
+          <w:szCs w:val="22"/>
+        </w:rPr>
+        <w:t xml:space="preserve">Dashboard KPI cards: Revenue, Expenses, Net Income, Receivables, Payables are all now tappable</w:t>
+      </w:r>
+    </w:p>
+    <w:p>
+      <w:pPr>
+        <w:pStyle w:val="ListParagraph"/>
+        <w:numPr>
+          <w:ilvl w:val="0"/>
+          <w:numId w:val="1"/>
+        </w:numPr>
+        <w:spacing w:after="40"/>
+      </w:pPr>
+      <w:r>
+        <w:rPr>
+          <w:color w:val="1D2D3E"/>
+          <w:sz w:val="22"/>
+          <w:szCs w:val="22"/>
+        </w:rPr>
+        <w:t xml:space="preserve">FinanceMenuScreen: AP and AR rows show overdue count pill badges from OverdueContext</w:t>
+      </w:r>
+    </w:p>
+    <w:p>
+      <w:pPr>
+        <w:pStyle w:val="ListParagraph"/>
+        <w:numPr>
+          <w:ilvl w:val="0"/>
+          <w:numId w:val="1"/>
+        </w:numPr>
+        <w:spacing w:after="40"/>
+      </w:pPr>
+      <w:r>
+        <w:rPr>
+          <w:color w:val="1D2D3E"/>
+          <w:sz w:val="22"/>
+          <w:szCs w:val="22"/>
+        </w:rPr>
+        <w:t xml:space="preserve">KPICard component: chevron-right indicator in label row when onPress prop is provided</w:t>
       </w:r>
     </w:p>
     <w:p>

</xml_diff>

<commit_message>
Session 11: Update PROGRESS.md, generate-docs.js, and FEATURES.docx
- PROGRESS.md: Session 11 entries — GlobalSearch + AgingChart
- PROGRESS.md: Updated What's Next section for Session 12
- PROGRESS.md: Screen inventory table additions
- generate-docs.js: Sections 3.29/3.30 for new features
- generate-docs.js: Session 11 changelog entry
- generate-docs.js: Updated MoreNavigator note with Search route
- FEATURES.docx: regenerated
</commit_message>
<xml_diff>
--- a/FEATURES.docx
+++ b/FEATURES.docx
@@ -45,7 +45,7 @@
           <w:sz w:val="20"/>
           <w:szCs w:val="20"/>
         </w:rPr>
-        <w:t xml:space="preserve">Generated: 2026-05-21</w:t>
+        <w:t xml:space="preserve">Generated: 2026-05-22</w:t>
       </w:r>
     </w:p>
     <w:p>
@@ -4926,7 +4926,7 @@
           <w:sz w:val="22"/>
           <w:szCs w:val="22"/>
         </w:rPr>
-        <w:t xml:space="preserve">MoreNavigator (stack, Session 10): MoreMenu → Materials, PurchaseOrders, PurchaseOrderDetail, SalesOrders, SalesOrderDetail, GRN, Partners, PartnerDetail, Companies, Settings, Alerts</w:t>
+        <w:t xml:space="preserve">MoreNavigator (stack, updated Session 11): MoreMenu → Search, Materials, PurchaseOrders, PurchaseOrderDetail, SalesOrders, SalesOrderDetail, GRN, Partners, PartnerDetail, Companies, Settings, Alerts</w:t>
       </w:r>
     </w:p>
     <w:p>
@@ -5377,6 +5377,438 @@
           <w:szCs w:val="22"/>
         </w:rPr>
         <w:t xml:space="preserve">SettingsScreen: UI to view/edit threshold, clear all cached data, view app version</w:t>
+      </w:r>
+    </w:p>
+    <w:p>
+      <w:pPr>
+        <w:spacing w:after="80"/>
+      </w:pPr>
+      <w:r>
+        <w:rPr>
+          <w:color w:val="1D2D3E"/>
+          <w:sz w:val="22"/>
+          <w:szCs w:val="22"/>
+        </w:rPr>
+        <w:t xml:space="preserve"/>
+      </w:r>
+    </w:p>
+    <w:p>
+      <w:pPr>
+        <w:pStyle w:val="Heading2"/>
+        <w:spacing w:after="120" w:before="300"/>
+      </w:pPr>
+      <w:r>
+        <w:rPr>
+          <w:b/>
+          <w:bCs/>
+          <w:color w:val="1D2D3E"/>
+        </w:rPr>
+        <w:t xml:space="preserve">3.29 Global Search Screen (Session 11)</w:t>
+      </w:r>
+    </w:p>
+    <w:p>
+      <w:pPr>
+        <w:pStyle w:val="ListParagraph"/>
+        <w:numPr>
+          <w:ilvl w:val="0"/>
+          <w:numId w:val="1"/>
+        </w:numPr>
+        <w:spacing w:after="40"/>
+      </w:pPr>
+      <w:r>
+        <w:rPr>
+          <w:color w:val="1D2D3E"/>
+          <w:sz w:val="22"/>
+          <w:szCs w:val="22"/>
+        </w:rPr>
+        <w:t xml:space="preserve">SearchScreen (src/screens/search/SearchScreen.tsx):</w:t>
+      </w:r>
+    </w:p>
+    <w:p>
+      <w:pPr>
+        <w:pStyle w:val="ListParagraph"/>
+        <w:numPr>
+          <w:ilvl w:val="1"/>
+          <w:numId w:val="1"/>
+        </w:numPr>
+        <w:spacing w:after="40"/>
+      </w:pPr>
+      <w:r>
+        <w:rPr>
+          <w:color w:val="1D2D3E"/>
+          <w:sz w:val="22"/>
+          <w:szCs w:val="22"/>
+        </w:rPr>
+        <w:t xml:space="preserve">  Unified search across 5 data types: Purchase Orders, Sales Orders, Stock Balances, Materials, Business Partners</w:t>
+      </w:r>
+    </w:p>
+    <w:p>
+      <w:pPr>
+        <w:pStyle w:val="ListParagraph"/>
+        <w:numPr>
+          <w:ilvl w:val="1"/>
+          <w:numId w:val="1"/>
+        </w:numPr>
+        <w:spacing w:after="40"/>
+      </w:pPr>
+      <w:r>
+        <w:rPr>
+          <w:color w:val="1D2D3E"/>
+          <w:sz w:val="22"/>
+          <w:szCs w:val="22"/>
+        </w:rPr>
+        <w:t xml:space="preserve">  Loads all data sources on mount (cache-first, background refresh for stale data)</w:t>
+      </w:r>
+    </w:p>
+    <w:p>
+      <w:pPr>
+        <w:pStyle w:val="ListParagraph"/>
+        <w:numPr>
+          <w:ilvl w:val="1"/>
+          <w:numId w:val="1"/>
+        </w:numPr>
+        <w:spacing w:after="40"/>
+      </w:pPr>
+      <w:r>
+        <w:rPr>
+          <w:color w:val="1D2D3E"/>
+          <w:sz w:val="22"/>
+          <w:szCs w:val="22"/>
+        </w:rPr>
+        <w:t xml:space="preserve">  Instant client-side filtering — no API call on each keystroke</w:t>
+      </w:r>
+    </w:p>
+    <w:p>
+      <w:pPr>
+        <w:pStyle w:val="ListParagraph"/>
+        <w:numPr>
+          <w:ilvl w:val="1"/>
+          <w:numId w:val="1"/>
+        </w:numPr>
+        <w:spacing w:after="40"/>
+      </w:pPr>
+      <w:r>
+        <w:rPr>
+          <w:color w:val="1D2D3E"/>
+          <w:sz w:val="22"/>
+          <w:szCs w:val="22"/>
+        </w:rPr>
+        <w:t xml:space="preserve">  Results grouped by type with section headers, icon, result count</w:t>
+      </w:r>
+    </w:p>
+    <w:p>
+      <w:pPr>
+        <w:pStyle w:val="ListParagraph"/>
+        <w:numPr>
+          <w:ilvl w:val="1"/>
+          <w:numId w:val="1"/>
+        </w:numPr>
+        <w:spacing w:after="40"/>
+      </w:pPr>
+      <w:r>
+        <w:rPr>
+          <w:color w:val="1D2D3E"/>
+          <w:sz w:val="22"/>
+          <w:szCs w:val="22"/>
+        </w:rPr>
+        <w:t xml:space="preserve">  Each result shows title, subtitle, optional amount/qty meta, and status badge</w:t>
+      </w:r>
+    </w:p>
+    <w:p>
+      <w:pPr>
+        <w:pStyle w:val="ListParagraph"/>
+        <w:numPr>
+          <w:ilvl w:val="1"/>
+          <w:numId w:val="1"/>
+        </w:numPr>
+        <w:spacing w:after="40"/>
+      </w:pPr>
+      <w:r>
+        <w:rPr>
+          <w:color w:val="1D2D3E"/>
+          <w:sz w:val="22"/>
+          <w:szCs w:val="22"/>
+        </w:rPr>
+        <w:t xml:space="preserve">  Tapping PO → PurchaseOrderDetail; SO → SalesOrderDetail; Partner → PartnerDetail</w:t>
+      </w:r>
+    </w:p>
+    <w:p>
+      <w:pPr>
+        <w:pStyle w:val="ListParagraph"/>
+        <w:numPr>
+          <w:ilvl w:val="1"/>
+          <w:numId w:val="1"/>
+        </w:numPr>
+        <w:spacing w:after="40"/>
+      </w:pPr>
+      <w:r>
+        <w:rPr>
+          <w:color w:val="1D2D3E"/>
+          <w:sz w:val="22"/>
+          <w:szCs w:val="22"/>
+        </w:rPr>
+        <w:t xml:space="preserve">  Stock results use cross-tab navigation to Inventory &gt; ItemLedger</w:t>
+      </w:r>
+    </w:p>
+    <w:p>
+      <w:pPr>
+        <w:pStyle w:val="ListParagraph"/>
+        <w:numPr>
+          <w:ilvl w:val="1"/>
+          <w:numId w:val="1"/>
+        </w:numPr>
+        <w:spacing w:after="40"/>
+      </w:pPr>
+      <w:r>
+        <w:rPr>
+          <w:color w:val="1D2D3E"/>
+          <w:sz w:val="22"/>
+          <w:szCs w:val="22"/>
+        </w:rPr>
+        <w:t xml:space="preserve">  Material results navigate to MaterialsScreen (no per-item detail screen)</w:t>
+      </w:r>
+    </w:p>
+    <w:p>
+      <w:pPr>
+        <w:pStyle w:val="ListParagraph"/>
+        <w:numPr>
+          <w:ilvl w:val="1"/>
+          <w:numId w:val="1"/>
+        </w:numPr>
+        <w:spacing w:after="40"/>
+      </w:pPr>
+      <w:r>
+        <w:rPr>
+          <w:color w:val="1D2D3E"/>
+          <w:sz w:val="22"/>
+          <w:szCs w:val="22"/>
+        </w:rPr>
+        <w:t xml:space="preserve">  Loading / empty query / zero-results states with Feather icons</w:t>
+      </w:r>
+    </w:p>
+    <w:p>
+      <w:pPr>
+        <w:pStyle w:val="ListParagraph"/>
+        <w:numPr>
+          <w:ilvl w:val="1"/>
+          <w:numId w:val="1"/>
+        </w:numPr>
+        <w:spacing w:after="40"/>
+      </w:pPr>
+      <w:r>
+        <w:rPr>
+          <w:color w:val="1D2D3E"/>
+          <w:sz w:val="22"/>
+          <w:szCs w:val="22"/>
+        </w:rPr>
+        <w:t xml:space="preserve">  Auto-focuses TextInput on mount; clear (×) button; keyboard-aware FlatList</w:t>
+      </w:r>
+    </w:p>
+    <w:p>
+      <w:pPr>
+        <w:pStyle w:val="ListParagraph"/>
+        <w:numPr>
+          <w:ilvl w:val="0"/>
+          <w:numId w:val="1"/>
+        </w:numPr>
+        <w:spacing w:after="40"/>
+      </w:pPr>
+      <w:r>
+        <w:rPr>
+          <w:color w:val="1D2D3E"/>
+          <w:sz w:val="22"/>
+          <w:szCs w:val="22"/>
+        </w:rPr>
+        <w:t xml:space="preserve">MoreNavigator: added Search route to MoreStackParamList and navigator</w:t>
+      </w:r>
+    </w:p>
+    <w:p>
+      <w:pPr>
+        <w:pStyle w:val="ListParagraph"/>
+        <w:numPr>
+          <w:ilvl w:val="0"/>
+          <w:numId w:val="1"/>
+        </w:numPr>
+        <w:spacing w:after="40"/>
+      </w:pPr>
+      <w:r>
+        <w:rPr>
+          <w:color w:val="1D2D3E"/>
+          <w:sz w:val="22"/>
+          <w:szCs w:val="22"/>
+        </w:rPr>
+        <w:t xml:space="preserve">MoreMenuScreen: tappable search shortcut bar above scroll content navigates to SearchScreen</w:t>
+      </w:r>
+    </w:p>
+    <w:p>
+      <w:pPr>
+        <w:pStyle w:val="ListParagraph"/>
+        <w:numPr>
+          <w:ilvl w:val="0"/>
+          <w:numId w:val="1"/>
+        </w:numPr>
+        <w:spacing w:after="40"/>
+      </w:pPr>
+      <w:r>
+        <w:rPr>
+          <w:color w:val="1D2D3E"/>
+          <w:sz w:val="22"/>
+          <w:szCs w:val="22"/>
+        </w:rPr>
+        <w:t xml:space="preserve">DashboardScreen: search icon button in top bar navigates to Search via More stack cross-tab</w:t>
+      </w:r>
+    </w:p>
+    <w:p>
+      <w:pPr>
+        <w:spacing w:after="80"/>
+      </w:pPr>
+      <w:r>
+        <w:rPr>
+          <w:color w:val="1D2D3E"/>
+          <w:sz w:val="22"/>
+          <w:szCs w:val="22"/>
+        </w:rPr>
+        <w:t xml:space="preserve"/>
+      </w:r>
+    </w:p>
+    <w:p>
+      <w:pPr>
+        <w:pStyle w:val="Heading2"/>
+        <w:spacing w:after="120" w:before="300"/>
+      </w:pPr>
+      <w:r>
+        <w:rPr>
+          <w:b/>
+          <w:bCs/>
+          <w:color w:val="1D2D3E"/>
+        </w:rPr>
+        <w:t xml:space="preserve">3.30 AgingChart Component (Session 11)</w:t>
+      </w:r>
+    </w:p>
+    <w:p>
+      <w:pPr>
+        <w:pStyle w:val="ListParagraph"/>
+        <w:numPr>
+          <w:ilvl w:val="0"/>
+          <w:numId w:val="1"/>
+        </w:numPr>
+        <w:spacing w:after="40"/>
+      </w:pPr>
+      <w:r>
+        <w:rPr>
+          <w:color w:val="1D2D3E"/>
+          <w:sz w:val="22"/>
+          <w:szCs w:val="22"/>
+        </w:rPr>
+        <w:t xml:space="preserve">AgingChart (src/components/AgingChart.tsx): reusable stacked horizontal aging bar with legend</w:t>
+      </w:r>
+    </w:p>
+    <w:p>
+      <w:pPr>
+        <w:pStyle w:val="ListParagraph"/>
+        <w:numPr>
+          <w:ilvl w:val="1"/>
+          <w:numId w:val="1"/>
+        </w:numPr>
+        <w:spacing w:after="40"/>
+      </w:pPr>
+      <w:r>
+        <w:rPr>
+          <w:color w:val="1D2D3E"/>
+          <w:sz w:val="22"/>
+          <w:szCs w:val="22"/>
+        </w:rPr>
+        <w:t xml:space="preserve">  Full-width proportional bar — each segment width = bucket amount / total amount</w:t>
+      </w:r>
+    </w:p>
+    <w:p>
+      <w:pPr>
+        <w:pStyle w:val="ListParagraph"/>
+        <w:numPr>
+          <w:ilvl w:val="1"/>
+          <w:numId w:val="1"/>
+        </w:numPr>
+        <w:spacing w:after="40"/>
+      </w:pPr>
+      <w:r>
+        <w:rPr>
+          <w:color w:val="1D2D3E"/>
+          <w:sz w:val="22"/>
+          <w:szCs w:val="22"/>
+        </w:rPr>
+        <w:t xml:space="preserve">  5 grayscale fills (light → dark) represent Current → Over-90-days severity</w:t>
+      </w:r>
+    </w:p>
+    <w:p>
+      <w:pPr>
+        <w:pStyle w:val="ListParagraph"/>
+        <w:numPr>
+          <w:ilvl w:val="1"/>
+          <w:numId w:val="1"/>
+        </w:numPr>
+        <w:spacing w:after="40"/>
+      </w:pPr>
+      <w:r>
+        <w:rPr>
+          <w:color w:val="1D2D3E"/>
+          <w:sz w:val="22"/>
+          <w:szCs w:val="22"/>
+        </w:rPr>
+        <w:t xml:space="preserve">  Legend grid below bar: colored dot + short label + formatted amount + % of total</w:t>
+      </w:r>
+    </w:p>
+    <w:p>
+      <w:pPr>
+        <w:pStyle w:val="ListParagraph"/>
+        <w:numPr>
+          <w:ilvl w:val="1"/>
+          <w:numId w:val="1"/>
+        </w:numPr>
+        <w:spacing w:after="40"/>
+      </w:pPr>
+      <w:r>
+        <w:rPr>
+          <w:color w:val="1D2D3E"/>
+          <w:sz w:val="22"/>
+          <w:szCs w:val="22"/>
+        </w:rPr>
+        <w:t xml:space="preserve">  Handles zero-total case gracefully (shows empty gray bar)</w:t>
+      </w:r>
+    </w:p>
+    <w:p>
+      <w:pPr>
+        <w:pStyle w:val="ListParagraph"/>
+        <w:numPr>
+          <w:ilvl w:val="0"/>
+          <w:numId w:val="1"/>
+        </w:numPr>
+        <w:spacing w:after="40"/>
+      </w:pPr>
+      <w:r>
+        <w:rPr>
+          <w:color w:val="1D2D3E"/>
+          <w:sz w:val="22"/>
+          <w:szCs w:val="22"/>
+        </w:rPr>
+        <w:t xml:space="preserve">AccountsPayableScreen: replaced 5 separate AgingBar rows with AgingChart component</w:t>
+      </w:r>
+    </w:p>
+    <w:p>
+      <w:pPr>
+        <w:pStyle w:val="ListParagraph"/>
+        <w:numPr>
+          <w:ilvl w:val="0"/>
+          <w:numId w:val="1"/>
+        </w:numPr>
+        <w:spacing w:after="40"/>
+      </w:pPr>
+      <w:r>
+        <w:rPr>
+          <w:color w:val="1D2D3E"/>
+          <w:sz w:val="22"/>
+          <w:szCs w:val="22"/>
+        </w:rPr>
+        <w:t xml:space="preserve">AccountsReceivableScreen: same replacement — removed AgingBar function and styles</w:t>
       </w:r>
     </w:p>
     <w:p>
@@ -9527,6 +9959,228 @@
           </w:p>
         </w:tc>
       </w:tr>
+      <w:tr>
+        <w:tc>
+          <w:p>
+            <w:pPr>
+              <w:spacing w:after="40" w:before="40"/>
+            </w:pPr>
+            <w:r>
+              <w:rPr>
+                <w:b w:val="false"/>
+                <w:bCs w:val="false"/>
+                <w:color w:val="1D2D3E"/>
+                <w:sz w:val="20"/>
+                <w:szCs w:val="20"/>
+              </w:rPr>
+              <w:t xml:space="preserve">Session 11</w:t>
+            </w:r>
+          </w:p>
+        </w:tc>
+        <w:tc>
+          <w:p>
+            <w:pPr>
+              <w:spacing w:after="40" w:before="40"/>
+            </w:pPr>
+            <w:r>
+              <w:rPr>
+                <w:b w:val="false"/>
+                <w:bCs w:val="false"/>
+                <w:color w:val="1D2D3E"/>
+                <w:sz w:val="20"/>
+                <w:szCs w:val="20"/>
+              </w:rPr>
+              <w:t xml:space="preserve">Global Search Screen (POs, SOs, Stock, Materials, Partners)</w:t>
+            </w:r>
+          </w:p>
+        </w:tc>
+        <w:tc>
+          <w:p>
+            <w:pPr>
+              <w:spacing w:after="40" w:before="40"/>
+            </w:pPr>
+            <w:r>
+              <w:rPr>
+                <w:b w:val="false"/>
+                <w:bCs w:val="false"/>
+                <w:color w:val="1D2D3E"/>
+                <w:sz w:val="20"/>
+                <w:szCs w:val="20"/>
+              </w:rPr>
+              <w:t xml:space="preserve">Done</w:t>
+            </w:r>
+          </w:p>
+        </w:tc>
+        <w:tc>
+          <w:p>
+            <w:pPr>
+              <w:spacing w:after="40" w:before="40"/>
+            </w:pPr>
+            <w:r>
+              <w:rPr>
+                <w:b w:val="false"/>
+                <w:bCs w:val="false"/>
+                <w:color w:val="1D2D3E"/>
+                <w:sz w:val="20"/>
+                <w:szCs w:val="20"/>
+              </w:rPr>
+              <w:t xml:space="preserve">/api/mobile/* (cached)</w:t>
+            </w:r>
+          </w:p>
+        </w:tc>
+      </w:tr>
+      <w:tr>
+        <w:tc>
+          <w:tcPr>
+            <w:shd w:color="F0F4F8" w:val="solid"/>
+          </w:tcPr>
+          <w:p>
+            <w:pPr>
+              <w:spacing w:after="40" w:before="40"/>
+            </w:pPr>
+            <w:r>
+              <w:rPr>
+                <w:b w:val="false"/>
+                <w:bCs w:val="false"/>
+                <w:color w:val="1D2D3E"/>
+                <w:sz w:val="20"/>
+                <w:szCs w:val="20"/>
+              </w:rPr>
+              <w:t xml:space="preserve">Session 11</w:t>
+            </w:r>
+          </w:p>
+        </w:tc>
+        <w:tc>
+          <w:tcPr>
+            <w:shd w:color="F0F4F8" w:val="solid"/>
+          </w:tcPr>
+          <w:p>
+            <w:pPr>
+              <w:spacing w:after="40" w:before="40"/>
+            </w:pPr>
+            <w:r>
+              <w:rPr>
+                <w:b w:val="false"/>
+                <w:bCs w:val="false"/>
+                <w:color w:val="1D2D3E"/>
+                <w:sz w:val="20"/>
+                <w:szCs w:val="20"/>
+              </w:rPr>
+              <w:t xml:space="preserve">AgingChart component — stacked bar replaces per-row bars in AP/AR</w:t>
+            </w:r>
+          </w:p>
+        </w:tc>
+        <w:tc>
+          <w:tcPr>
+            <w:shd w:color="F0F4F8" w:val="solid"/>
+          </w:tcPr>
+          <w:p>
+            <w:pPr>
+              <w:spacing w:after="40" w:before="40"/>
+            </w:pPr>
+            <w:r>
+              <w:rPr>
+                <w:b w:val="false"/>
+                <w:bCs w:val="false"/>
+                <w:color w:val="1D2D3E"/>
+                <w:sz w:val="20"/>
+                <w:szCs w:val="20"/>
+              </w:rPr>
+              <w:t xml:space="preserve">Done</w:t>
+            </w:r>
+          </w:p>
+        </w:tc>
+        <w:tc>
+          <w:tcPr>
+            <w:shd w:color="F0F4F8" w:val="solid"/>
+          </w:tcPr>
+          <w:p>
+            <w:pPr>
+              <w:spacing w:after="40" w:before="40"/>
+            </w:pPr>
+            <w:r>
+              <w:rPr>
+                <w:b w:val="false"/>
+                <w:bCs w:val="false"/>
+                <w:color w:val="1D2D3E"/>
+                <w:sz w:val="20"/>
+                <w:szCs w:val="20"/>
+              </w:rPr>
+              <w:t xml:space="preserve">—</w:t>
+            </w:r>
+          </w:p>
+        </w:tc>
+      </w:tr>
+      <w:tr>
+        <w:tc>
+          <w:p>
+            <w:pPr>
+              <w:spacing w:after="40" w:before="40"/>
+            </w:pPr>
+            <w:r>
+              <w:rPr>
+                <w:b w:val="false"/>
+                <w:bCs w:val="false"/>
+                <w:color w:val="1D2D3E"/>
+                <w:sz w:val="20"/>
+                <w:szCs w:val="20"/>
+              </w:rPr>
+              <w:t xml:space="preserve">Session 11</w:t>
+            </w:r>
+          </w:p>
+        </w:tc>
+        <w:tc>
+          <w:p>
+            <w:pPr>
+              <w:spacing w:after="40" w:before="40"/>
+            </w:pPr>
+            <w:r>
+              <w:rPr>
+                <w:b w:val="false"/>
+                <w:bCs w:val="false"/>
+                <w:color w:val="1D2D3E"/>
+                <w:sz w:val="20"/>
+                <w:szCs w:val="20"/>
+              </w:rPr>
+              <w:t xml:space="preserve">Dashboard search icon button + MoreMenu search shortcut</w:t>
+            </w:r>
+          </w:p>
+        </w:tc>
+        <w:tc>
+          <w:p>
+            <w:pPr>
+              <w:spacing w:after="40" w:before="40"/>
+            </w:pPr>
+            <w:r>
+              <w:rPr>
+                <w:b w:val="false"/>
+                <w:bCs w:val="false"/>
+                <w:color w:val="1D2D3E"/>
+                <w:sz w:val="20"/>
+                <w:szCs w:val="20"/>
+              </w:rPr>
+              <w:t xml:space="preserve">Done</w:t>
+            </w:r>
+          </w:p>
+        </w:tc>
+        <w:tc>
+          <w:p>
+            <w:pPr>
+              <w:spacing w:after="40" w:before="40"/>
+            </w:pPr>
+            <w:r>
+              <w:rPr>
+                <w:b w:val="false"/>
+                <w:bCs w:val="false"/>
+                <w:color w:val="1D2D3E"/>
+                <w:sz w:val="20"/>
+                <w:szCs w:val="20"/>
+              </w:rPr>
+              <w:t xml:space="preserve">—</w:t>
+            </w:r>
+          </w:p>
+        </w:tc>
+      </w:tr>
     </w:tbl>
     <w:p>
       <w:pPr>
@@ -12782,6 +13436,267 @@
           <w:szCs w:val="22"/>
         </w:rPr>
         <w:t xml:space="preserve">KPICard component: chevron-right indicator in label row when onPress prop is provided</w:t>
+      </w:r>
+    </w:p>
+    <w:p>
+      <w:pPr>
+        <w:spacing w:after="80"/>
+      </w:pPr>
+      <w:r>
+        <w:rPr>
+          <w:color w:val="1D2D3E"/>
+          <w:sz w:val="22"/>
+          <w:szCs w:val="22"/>
+        </w:rPr>
+        <w:t xml:space="preserve"/>
+      </w:r>
+    </w:p>
+    <w:p>
+      <w:pPr>
+        <w:pStyle w:val="Heading2"/>
+        <w:spacing w:after="120" w:before="300"/>
+      </w:pPr>
+      <w:r>
+        <w:rPr>
+          <w:b/>
+          <w:bCs/>
+          <w:color w:val="1D2D3E"/>
+        </w:rPr>
+        <w:t xml:space="preserve">Session 11 — 2026-05-22</w:t>
+      </w:r>
+    </w:p>
+    <w:p>
+      <w:pPr>
+        <w:pStyle w:val="ListParagraph"/>
+        <w:numPr>
+          <w:ilvl w:val="0"/>
+          <w:numId w:val="1"/>
+        </w:numPr>
+        <w:spacing w:after="40"/>
+      </w:pPr>
+      <w:r>
+        <w:rPr>
+          <w:color w:val="1D2D3E"/>
+          <w:sz w:val="22"/>
+          <w:szCs w:val="22"/>
+        </w:rPr>
+        <w:t xml:space="preserve">Created GlobalSearch screen (src/screens/search/SearchScreen.tsx)</w:t>
+      </w:r>
+    </w:p>
+    <w:p>
+      <w:pPr>
+        <w:pStyle w:val="ListParagraph"/>
+        <w:numPr>
+          <w:ilvl w:val="1"/>
+          <w:numId w:val="1"/>
+        </w:numPr>
+        <w:spacing w:after="40"/>
+      </w:pPr>
+      <w:r>
+        <w:rPr>
+          <w:color w:val="1D2D3E"/>
+          <w:sz w:val="22"/>
+          <w:szCs w:val="22"/>
+        </w:rPr>
+        <w:t xml:space="preserve">  — Cache-first data loading of POs, SOs, Materials, Partners, Stock Balances</w:t>
+      </w:r>
+    </w:p>
+    <w:p>
+      <w:pPr>
+        <w:pStyle w:val="ListParagraph"/>
+        <w:numPr>
+          <w:ilvl w:val="1"/>
+          <w:numId w:val="1"/>
+        </w:numPr>
+        <w:spacing w:after="40"/>
+      </w:pPr>
+      <w:r>
+        <w:rPr>
+          <w:color w:val="1D2D3E"/>
+          <w:sz w:val="22"/>
+          <w:szCs w:val="22"/>
+        </w:rPr>
+        <w:t xml:space="preserve">  — Instant client-side filtering with minimum 2-char threshold</w:t>
+      </w:r>
+    </w:p>
+    <w:p>
+      <w:pPr>
+        <w:pStyle w:val="ListParagraph"/>
+        <w:numPr>
+          <w:ilvl w:val="1"/>
+          <w:numId w:val="1"/>
+        </w:numPr>
+        <w:spacing w:after="40"/>
+      </w:pPr>
+      <w:r>
+        <w:rPr>
+          <w:color w:val="1D2D3E"/>
+          <w:sz w:val="22"/>
+          <w:szCs w:val="22"/>
+        </w:rPr>
+        <w:t xml:space="preserve">  — Results grouped by type; tapping navigates to respective detail screens</w:t>
+      </w:r>
+    </w:p>
+    <w:p>
+      <w:pPr>
+        <w:pStyle w:val="ListParagraph"/>
+        <w:numPr>
+          <w:ilvl w:val="1"/>
+          <w:numId w:val="1"/>
+        </w:numPr>
+        <w:spacing w:after="40"/>
+      </w:pPr>
+      <w:r>
+        <w:rPr>
+          <w:color w:val="1D2D3E"/>
+          <w:sz w:val="22"/>
+          <w:szCs w:val="22"/>
+        </w:rPr>
+        <w:t xml:space="preserve">  — Cross-tab navigation for stock results → Inventory &gt; ItemLedger</w:t>
+      </w:r>
+    </w:p>
+    <w:p>
+      <w:pPr>
+        <w:pStyle w:val="ListParagraph"/>
+        <w:numPr>
+          <w:ilvl w:val="0"/>
+          <w:numId w:val="1"/>
+        </w:numPr>
+        <w:spacing w:after="40"/>
+      </w:pPr>
+      <w:r>
+        <w:rPr>
+          <w:color w:val="1D2D3E"/>
+          <w:sz w:val="22"/>
+          <w:szCs w:val="22"/>
+        </w:rPr>
+        <w:t xml:space="preserve">Added Search route to MoreNavigator</w:t>
+      </w:r>
+    </w:p>
+    <w:p>
+      <w:pPr>
+        <w:pStyle w:val="ListParagraph"/>
+        <w:numPr>
+          <w:ilvl w:val="0"/>
+          <w:numId w:val="1"/>
+        </w:numPr>
+        <w:spacing w:after="40"/>
+      </w:pPr>
+      <w:r>
+        <w:rPr>
+          <w:color w:val="1D2D3E"/>
+          <w:sz w:val="22"/>
+          <w:szCs w:val="22"/>
+        </w:rPr>
+        <w:t xml:space="preserve">MoreMenuScreen: search shortcut bar taps into SearchScreen</w:t>
+      </w:r>
+    </w:p>
+    <w:p>
+      <w:pPr>
+        <w:pStyle w:val="ListParagraph"/>
+        <w:numPr>
+          <w:ilvl w:val="0"/>
+          <w:numId w:val="1"/>
+        </w:numPr>
+        <w:spacing w:after="40"/>
+      </w:pPr>
+      <w:r>
+        <w:rPr>
+          <w:color w:val="1D2D3E"/>
+          <w:sz w:val="22"/>
+          <w:szCs w:val="22"/>
+        </w:rPr>
+        <w:t xml:space="preserve">DashboardScreen: search icon (Feather 'search') added to top bar header</w:t>
+      </w:r>
+    </w:p>
+    <w:p>
+      <w:pPr>
+        <w:pStyle w:val="ListParagraph"/>
+        <w:numPr>
+          <w:ilvl w:val="0"/>
+          <w:numId w:val="1"/>
+        </w:numPr>
+        <w:spacing w:after="40"/>
+      </w:pPr>
+      <w:r>
+        <w:rPr>
+          <w:color w:val="1D2D3E"/>
+          <w:sz w:val="22"/>
+          <w:szCs w:val="22"/>
+        </w:rPr>
+        <w:t xml:space="preserve">Created AgingChart component (src/components/AgingChart.tsx)</w:t>
+      </w:r>
+    </w:p>
+    <w:p>
+      <w:pPr>
+        <w:pStyle w:val="ListParagraph"/>
+        <w:numPr>
+          <w:ilvl w:val="1"/>
+          <w:numId w:val="1"/>
+        </w:numPr>
+        <w:spacing w:after="40"/>
+      </w:pPr>
+      <w:r>
+        <w:rPr>
+          <w:color w:val="1D2D3E"/>
+          <w:sz w:val="22"/>
+          <w:szCs w:val="22"/>
+        </w:rPr>
+        <w:t xml:space="preserve">  — Stacked horizontal bar: proportional segment widths per aging bucket</w:t>
+      </w:r>
+    </w:p>
+    <w:p>
+      <w:pPr>
+        <w:pStyle w:val="ListParagraph"/>
+        <w:numPr>
+          <w:ilvl w:val="1"/>
+          <w:numId w:val="1"/>
+        </w:numPr>
+        <w:spacing w:after="40"/>
+      </w:pPr>
+      <w:r>
+        <w:rPr>
+          <w:color w:val="1D2D3E"/>
+          <w:sz w:val="22"/>
+          <w:szCs w:val="22"/>
+        </w:rPr>
+        <w:t xml:space="preserve">  — Legend grid with colored dot, short label, amount, and percentage</w:t>
+      </w:r>
+    </w:p>
+    <w:p>
+      <w:pPr>
+        <w:pStyle w:val="ListParagraph"/>
+        <w:numPr>
+          <w:ilvl w:val="0"/>
+          <w:numId w:val="1"/>
+        </w:numPr>
+        <w:spacing w:after="40"/>
+      </w:pPr>
+      <w:r>
+        <w:rPr>
+          <w:color w:val="1D2D3E"/>
+          <w:sz w:val="22"/>
+          <w:szCs w:val="22"/>
+        </w:rPr>
+        <w:t xml:space="preserve">AccountsPayableScreen: replaced 5 AgingBar rows with AgingChart; removed AgingBar fn + styles</w:t>
+      </w:r>
+    </w:p>
+    <w:p>
+      <w:pPr>
+        <w:pStyle w:val="ListParagraph"/>
+        <w:numPr>
+          <w:ilvl w:val="0"/>
+          <w:numId w:val="1"/>
+        </w:numPr>
+        <w:spacing w:after="40"/>
+      </w:pPr>
+      <w:r>
+        <w:rPr>
+          <w:color w:val="1D2D3E"/>
+          <w:sz w:val="22"/>
+          <w:szCs w:val="22"/>
+        </w:rPr>
+        <w:t xml:space="preserve">AccountsReceivableScreen: same AgingChart migration</w:t>
       </w:r>
     </w:p>
     <w:p>

</xml_diff>

<commit_message>
Session 12: Update generate-docs.js and regenerate FEATURES.docx
- Added Session 12 changelog entry (skeleton system + keyboard UX)
- Added skeleton components to shared components section (Section 3.1.7)
- Added 2 new rows to roadmap table for Session 12 deliverables
- Regenerated FEATURES.docx
</commit_message>
<xml_diff>
--- a/FEATURES.docx
+++ b/FEATURES.docx
@@ -45,7 +45,7 @@
           <w:sz w:val="20"/>
           <w:szCs w:val="20"/>
         </w:rPr>
-        <w:t xml:space="preserve">Generated: 2026-05-22</w:t>
+        <w:t xml:space="preserve">Generated: 2026-05-23</w:t>
       </w:r>
     </w:p>
     <w:p>
@@ -2420,6 +2420,312 @@
     </w:p>
     <w:p>
       <w:pPr>
+        <w:pStyle w:val="ListParagraph"/>
+        <w:numPr>
+          <w:ilvl w:val="0"/>
+          <w:numId w:val="1"/>
+        </w:numPr>
+        <w:spacing w:after="40"/>
+      </w:pPr>
+      <w:r>
+        <w:rPr>
+          <w:color w:val="1D2D3E"/>
+          <w:sz w:val="22"/>
+          <w:szCs w:val="22"/>
+        </w:rPr>
+        <w:t xml:space="preserve">SkeletonBox — animated shimmer rectangle (pulse animation, any width/height/radius)</w:t>
+      </w:r>
+    </w:p>
+    <w:p>
+      <w:pPr>
+        <w:pStyle w:val="ListParagraph"/>
+        <w:numPr>
+          <w:ilvl w:val="0"/>
+          <w:numId w:val="1"/>
+        </w:numPr>
+        <w:spacing w:after="40"/>
+      </w:pPr>
+      <w:r>
+        <w:rPr>
+          <w:color w:val="1D2D3E"/>
+          <w:sz w:val="22"/>
+          <w:szCs w:val="22"/>
+        </w:rPr>
+        <w:t xml:space="preserve">SkeletonListItem — card-shaped skeleton with left column + optional right badge (Session 12)</w:t>
+      </w:r>
+    </w:p>
+    <w:p>
+      <w:pPr>
+        <w:pStyle w:val="ListParagraph"/>
+        <w:numPr>
+          <w:ilvl w:val="0"/>
+          <w:numId w:val="1"/>
+        </w:numPr>
+        <w:spacing w:after="40"/>
+      </w:pPr>
+      <w:r>
+        <w:rPr>
+          <w:color w:val="1D2D3E"/>
+          <w:sz w:val="22"/>
+          <w:szCs w:val="22"/>
+        </w:rPr>
+        <w:t xml:space="preserve">SkeletonKPICard — KPI card proportions skeleton (Session 12)</w:t>
+      </w:r>
+    </w:p>
+    <w:p>
+      <w:pPr>
+        <w:pStyle w:val="ListParagraph"/>
+        <w:numPr>
+          <w:ilvl w:val="0"/>
+          <w:numId w:val="1"/>
+        </w:numPr>
+        <w:spacing w:after="40"/>
+      </w:pPr>
+      <w:r>
+        <w:rPr>
+          <w:color w:val="1D2D3E"/>
+          <w:sz w:val="22"/>
+          <w:szCs w:val="22"/>
+        </w:rPr>
+        <w:t xml:space="preserve">DashboardSkeleton — full-page dashboard skeleton including top bar (Session 12)</w:t>
+      </w:r>
+    </w:p>
+    <w:p>
+      <w:pPr>
+        <w:pStyle w:val="ListParagraph"/>
+        <w:numPr>
+          <w:ilvl w:val="0"/>
+          <w:numId w:val="1"/>
+        </w:numPr>
+        <w:spacing w:after="40"/>
+      </w:pPr>
+      <w:r>
+        <w:rPr>
+          <w:color w:val="1D2D3E"/>
+          <w:sz w:val="22"/>
+          <w:szCs w:val="22"/>
+        </w:rPr>
+        <w:t xml:space="preserve">ListScreenSkeleton — inline skeleton: optional search + tabs + N list items (Session 12)</w:t>
+      </w:r>
+    </w:p>
+    <w:p>
+      <w:pPr>
+        <w:pStyle w:val="ListParagraph"/>
+        <w:numPr>
+          <w:ilvl w:val="0"/>
+          <w:numId w:val="1"/>
+        </w:numPr>
+        <w:spacing w:after="40"/>
+      </w:pPr>
+      <w:r>
+        <w:rPr>
+          <w:color w:val="1D2D3E"/>
+          <w:sz w:val="22"/>
+          <w:szCs w:val="22"/>
+        </w:rPr>
+        <w:t xml:space="preserve">FinanceSummarySkeleton — inline skeleton: summary tiles + aging bar + tabs + list (Session 12)</w:t>
+      </w:r>
+    </w:p>
+    <w:p>
+      <w:pPr>
+        <w:pStyle w:val="ListParagraph"/>
+        <w:numPr>
+          <w:ilvl w:val="0"/>
+          <w:numId w:val="1"/>
+        </w:numPr>
+        <w:spacing w:after="40"/>
+      </w:pPr>
+      <w:r>
+        <w:rPr>
+          <w:color w:val="1D2D3E"/>
+          <w:sz w:val="22"/>
+          <w:szCs w:val="22"/>
+        </w:rPr>
+        <w:t xml:space="preserve">DetailSkeleton — inline skeleton: summary tiles + section label + N rows (Session 12)</w:t>
+      </w:r>
+    </w:p>
+    <w:p>
+      <w:pPr>
+        <w:pStyle w:val="ListParagraph"/>
+        <w:numPr>
+          <w:ilvl w:val="0"/>
+          <w:numId w:val="1"/>
+        </w:numPr>
+        <w:spacing w:after="40"/>
+      </w:pPr>
+      <w:r>
+        <w:rPr>
+          <w:color w:val="1D2D3E"/>
+          <w:sz w:val="22"/>
+          <w:szCs w:val="22"/>
+        </w:rPr>
+        <w:t xml:space="preserve">AgingChart — stacked horizontal aging analysis bar with legend (Session 11)</w:t>
+      </w:r>
+    </w:p>
+    <w:p>
+      <w:pPr>
+        <w:pStyle w:val="ListParagraph"/>
+        <w:numPr>
+          <w:ilvl w:val="0"/>
+          <w:numId w:val="1"/>
+        </w:numPr>
+        <w:spacing w:after="40"/>
+      </w:pPr>
+      <w:r>
+        <w:rPr>
+          <w:color w:val="1D2D3E"/>
+          <w:sz w:val="22"/>
+          <w:szCs w:val="22"/>
+        </w:rPr>
+        <w:t xml:space="preserve">OfflineBanner — amber banner shown when displaying stale cached data (Session 6)</w:t>
+      </w:r>
+    </w:p>
+    <w:p>
+      <w:pPr>
+        <w:pStyle w:val="ListParagraph"/>
+        <w:numPr>
+          <w:ilvl w:val="0"/>
+          <w:numId w:val="1"/>
+        </w:numPr>
+        <w:spacing w:after="40"/>
+      </w:pPr>
+      <w:r>
+        <w:rPr>
+          <w:color w:val="1D2D3E"/>
+          <w:sz w:val="22"/>
+          <w:szCs w:val="22"/>
+        </w:rPr>
+        <w:t xml:space="preserve">BackButton — navigation back button for stack screens (Session 4)</w:t>
+      </w:r>
+    </w:p>
+    <w:p>
+      <w:pPr>
+        <w:pStyle w:val="ListParagraph"/>
+        <w:numPr>
+          <w:ilvl w:val="0"/>
+          <w:numId w:val="1"/>
+        </w:numPr>
+        <w:spacing w:after="40"/>
+      </w:pPr>
+      <w:r>
+        <w:rPr>
+          <w:color w:val="1D2D3E"/>
+          <w:sz w:val="22"/>
+          <w:szCs w:val="22"/>
+        </w:rPr>
+        <w:t xml:space="preserve">CompanySelector — bottom-sheet company picker using global CompanyContext (Session 3)</w:t>
+      </w:r>
+    </w:p>
+    <w:p>
+      <w:pPr>
+        <w:pStyle w:val="ListParagraph"/>
+        <w:numPr>
+          <w:ilvl w:val="0"/>
+          <w:numId w:val="1"/>
+        </w:numPr>
+        <w:spacing w:after="40"/>
+      </w:pPr>
+      <w:r>
+        <w:rPr>
+          <w:color w:val="1D2D3E"/>
+          <w:sz w:val="22"/>
+          <w:szCs w:val="22"/>
+        </w:rPr>
+        <w:t xml:space="preserve">DateRangeBar — date range/single date input bar with presets and clear button (Session 8 UI polish)</w:t>
+      </w:r>
+    </w:p>
+    <w:p>
+      <w:pPr>
+        <w:pStyle w:val="ListParagraph"/>
+        <w:numPr>
+          <w:ilvl w:val="0"/>
+          <w:numId w:val="1"/>
+        </w:numPr>
+        <w:spacing w:after="40"/>
+      </w:pPr>
+      <w:r>
+        <w:rPr>
+          <w:color w:val="1D2D3E"/>
+          <w:sz w:val="22"/>
+          <w:szCs w:val="22"/>
+        </w:rPr>
+        <w:t xml:space="preserve">SearchBar — reusable search input with icon and clear button</w:t>
+      </w:r>
+    </w:p>
+    <w:p>
+      <w:pPr>
+        <w:pStyle w:val="ListParagraph"/>
+        <w:numPr>
+          <w:ilvl w:val="0"/>
+          <w:numId w:val="1"/>
+        </w:numPr>
+        <w:spacing w:after="40"/>
+      </w:pPr>
+      <w:r>
+        <w:rPr>
+          <w:color w:val="1D2D3E"/>
+          <w:sz w:val="22"/>
+          <w:szCs w:val="22"/>
+        </w:rPr>
+        <w:t xml:space="preserve">FilterChip — toggleable pill-shaped filter chip</w:t>
+      </w:r>
+    </w:p>
+    <w:p>
+      <w:pPr>
+        <w:pStyle w:val="ListParagraph"/>
+        <w:numPr>
+          <w:ilvl w:val="0"/>
+          <w:numId w:val="1"/>
+        </w:numPr>
+        <w:spacing w:after="40"/>
+      </w:pPr>
+      <w:r>
+        <w:rPr>
+          <w:color w:val="1D2D3E"/>
+          <w:sz w:val="22"/>
+          <w:szCs w:val="22"/>
+        </w:rPr>
+        <w:t xml:space="preserve">StatusBadge — colored status pill (configurable text, bg, fg)</w:t>
+      </w:r>
+    </w:p>
+    <w:p>
+      <w:pPr>
+        <w:pStyle w:val="ListParagraph"/>
+        <w:numPr>
+          <w:ilvl w:val="0"/>
+          <w:numId w:val="1"/>
+        </w:numPr>
+        <w:spacing w:after="40"/>
+      </w:pPr>
+      <w:r>
+        <w:rPr>
+          <w:color w:val="1D2D3E"/>
+          <w:sz w:val="22"/>
+          <w:szCs w:val="22"/>
+        </w:rPr>
+        <w:t xml:space="preserve">TabBar — horizontal tab row component</w:t>
+      </w:r>
+    </w:p>
+    <w:p>
+      <w:pPr>
+        <w:pStyle w:val="ListParagraph"/>
+        <w:numPr>
+          <w:ilvl w:val="0"/>
+          <w:numId w:val="1"/>
+        </w:numPr>
+        <w:spacing w:after="40"/>
+      </w:pPr>
+      <w:r>
+        <w:rPr>
+          <w:color w:val="1D2D3E"/>
+          <w:sz w:val="22"/>
+          <w:szCs w:val="22"/>
+        </w:rPr>
+        <w:t xml:space="preserve">SegmentedControl — multi-option segmented control</w:t>
+      </w:r>
+    </w:p>
+    <w:p>
+      <w:pPr>
         <w:spacing w:after="80"/>
       </w:pPr>
       <w:r>
@@ -10181,6 +10487,158 @@
           </w:p>
         </w:tc>
       </w:tr>
+      <w:tr>
+        <w:tc>
+          <w:tcPr>
+            <w:shd w:color="F0F4F8" w:val="solid"/>
+          </w:tcPr>
+          <w:p>
+            <w:pPr>
+              <w:spacing w:after="40" w:before="40"/>
+            </w:pPr>
+            <w:r>
+              <w:rPr>
+                <w:b w:val="false"/>
+                <w:bCs w:val="false"/>
+                <w:color w:val="1D2D3E"/>
+                <w:sz w:val="20"/>
+                <w:szCs w:val="20"/>
+              </w:rPr>
+              <w:t xml:space="preserve">Session 12</w:t>
+            </w:r>
+          </w:p>
+        </w:tc>
+        <w:tc>
+          <w:tcPr>
+            <w:shd w:color="F0F4F8" w:val="solid"/>
+          </w:tcPr>
+          <w:p>
+            <w:pPr>
+              <w:spacing w:after="40" w:before="40"/>
+            </w:pPr>
+            <w:r>
+              <w:rPr>
+                <w:b w:val="false"/>
+                <w:bCs w:val="false"/>
+                <w:color w:val="1D2D3E"/>
+                <w:sz w:val="20"/>
+                <w:szCs w:val="20"/>
+              </w:rPr>
+              <w:t xml:space="preserve">Skeleton loading system (7 components, 20+ screens migrated)</w:t>
+            </w:r>
+          </w:p>
+        </w:tc>
+        <w:tc>
+          <w:tcPr>
+            <w:shd w:color="F0F4F8" w:val="solid"/>
+          </w:tcPr>
+          <w:p>
+            <w:pPr>
+              <w:spacing w:after="40" w:before="40"/>
+            </w:pPr>
+            <w:r>
+              <w:rPr>
+                <w:b w:val="false"/>
+                <w:bCs w:val="false"/>
+                <w:color w:val="1D2D3E"/>
+                <w:sz w:val="20"/>
+                <w:szCs w:val="20"/>
+              </w:rPr>
+              <w:t xml:space="preserve">Done</w:t>
+            </w:r>
+          </w:p>
+        </w:tc>
+        <w:tc>
+          <w:tcPr>
+            <w:shd w:color="F0F4F8" w:val="solid"/>
+          </w:tcPr>
+          <w:p>
+            <w:pPr>
+              <w:spacing w:after="40" w:before="40"/>
+            </w:pPr>
+            <w:r>
+              <w:rPr>
+                <w:b w:val="false"/>
+                <w:bCs w:val="false"/>
+                <w:color w:val="1D2D3E"/>
+                <w:sz w:val="20"/>
+                <w:szCs w:val="20"/>
+              </w:rPr>
+              <w:t xml:space="preserve">—</w:t>
+            </w:r>
+          </w:p>
+        </w:tc>
+      </w:tr>
+      <w:tr>
+        <w:tc>
+          <w:p>
+            <w:pPr>
+              <w:spacing w:after="40" w:before="40"/>
+            </w:pPr>
+            <w:r>
+              <w:rPr>
+                <w:b w:val="false"/>
+                <w:bCs w:val="false"/>
+                <w:color w:val="1D2D3E"/>
+                <w:sz w:val="20"/>
+                <w:szCs w:val="20"/>
+              </w:rPr>
+              <w:t xml:space="preserve">Session 12</w:t>
+            </w:r>
+          </w:p>
+        </w:tc>
+        <w:tc>
+          <w:p>
+            <w:pPr>
+              <w:spacing w:after="40" w:before="40"/>
+            </w:pPr>
+            <w:r>
+              <w:rPr>
+                <w:b w:val="false"/>
+                <w:bCs w:val="false"/>
+                <w:color w:val="1D2D3E"/>
+                <w:sz w:val="20"/>
+                <w:szCs w:val="20"/>
+              </w:rPr>
+              <w:t xml:space="preserve">Keyboard UX (keyboardShouldPersistTaps + keyboardDismissMode)</w:t>
+            </w:r>
+          </w:p>
+        </w:tc>
+        <w:tc>
+          <w:p>
+            <w:pPr>
+              <w:spacing w:after="40" w:before="40"/>
+            </w:pPr>
+            <w:r>
+              <w:rPr>
+                <w:b w:val="false"/>
+                <w:bCs w:val="false"/>
+                <w:color w:val="1D2D3E"/>
+                <w:sz w:val="20"/>
+                <w:szCs w:val="20"/>
+              </w:rPr>
+              <w:t xml:space="preserve">Done</w:t>
+            </w:r>
+          </w:p>
+        </w:tc>
+        <w:tc>
+          <w:p>
+            <w:pPr>
+              <w:spacing w:after="40" w:before="40"/>
+            </w:pPr>
+            <w:r>
+              <w:rPr>
+                <w:b w:val="false"/>
+                <w:bCs w:val="false"/>
+                <w:color w:val="1D2D3E"/>
+                <w:sz w:val="20"/>
+                <w:szCs w:val="20"/>
+              </w:rPr>
+              <w:t xml:space="preserve">—</w:t>
+            </w:r>
+          </w:p>
+        </w:tc>
+      </w:tr>
     </w:tbl>
     <w:p>
       <w:pPr>
@@ -13697,6 +14155,447 @@
           <w:szCs w:val="22"/>
         </w:rPr>
         <w:t xml:space="preserve">AccountsReceivableScreen: same AgingChart migration</w:t>
+      </w:r>
+    </w:p>
+    <w:p>
+      <w:pPr>
+        <w:spacing w:after="80"/>
+      </w:pPr>
+      <w:r>
+        <w:rPr>
+          <w:color w:val="1D2D3E"/>
+          <w:sz w:val="22"/>
+          <w:szCs w:val="22"/>
+        </w:rPr>
+        <w:t xml:space="preserve"/>
+      </w:r>
+    </w:p>
+    <w:p>
+      <w:pPr>
+        <w:pStyle w:val="Heading2"/>
+        <w:spacing w:after="120" w:before="300"/>
+      </w:pPr>
+      <w:r>
+        <w:rPr>
+          <w:b/>
+          <w:bCs/>
+          <w:color w:val="1D2D3E"/>
+        </w:rPr>
+        <w:t xml:space="preserve">Session 12 — 2026-05-23</w:t>
+      </w:r>
+    </w:p>
+    <w:p>
+      <w:pPr>
+        <w:pStyle w:val="ListParagraph"/>
+        <w:numPr>
+          <w:ilvl w:val="0"/>
+          <w:numId w:val="1"/>
+        </w:numPr>
+        <w:spacing w:after="40"/>
+      </w:pPr>
+      <w:r>
+        <w:rPr>
+          <w:color w:val="1D2D3E"/>
+          <w:sz w:val="22"/>
+          <w:szCs w:val="22"/>
+        </w:rPr>
+        <w:t xml:space="preserve">Animated Skeleton Loading System — replaced all full-screen spinners with shimmer skeletons</w:t>
+      </w:r>
+    </w:p>
+    <w:p>
+      <w:pPr>
+        <w:pStyle w:val="ListParagraph"/>
+        <w:numPr>
+          <w:ilvl w:val="1"/>
+          <w:numId w:val="1"/>
+        </w:numPr>
+        <w:spacing w:after="40"/>
+      </w:pPr>
+      <w:r>
+        <w:rPr>
+          <w:color w:val="1D2D3E"/>
+          <w:sz w:val="22"/>
+          <w:szCs w:val="22"/>
+        </w:rPr>
+        <w:t xml:space="preserve">  SkeletonBox: animated pulse (opacity 0.4→1.0→0.4 loop, 700ms per leg, useNativeDriver)</w:t>
+      </w:r>
+    </w:p>
+    <w:p>
+      <w:pPr>
+        <w:pStyle w:val="ListParagraph"/>
+        <w:numPr>
+          <w:ilvl w:val="1"/>
+          <w:numId w:val="1"/>
+        </w:numPr>
+        <w:spacing w:after="40"/>
+      </w:pPr>
+      <w:r>
+        <w:rPr>
+          <w:color w:val="1D2D3E"/>
+          <w:sz w:val="22"/>
+          <w:szCs w:val="22"/>
+        </w:rPr>
+        <w:t xml:space="preserve">  SkeletonListItem: card skeleton — left column (title+subtitle+meta), optional right badge column</w:t>
+      </w:r>
+    </w:p>
+    <w:p>
+      <w:pPr>
+        <w:pStyle w:val="ListParagraph"/>
+        <w:numPr>
+          <w:ilvl w:val="1"/>
+          <w:numId w:val="1"/>
+        </w:numPr>
+        <w:spacing w:after="40"/>
+      </w:pPr>
+      <w:r>
+        <w:rPr>
+          <w:color w:val="1D2D3E"/>
+          <w:sz w:val="22"/>
+          <w:szCs w:val="22"/>
+        </w:rPr>
+        <w:t xml:space="preserve">  SkeletonKPICard: matches KPI card proportions (label + number + sub-label rows)</w:t>
+      </w:r>
+    </w:p>
+    <w:p>
+      <w:pPr>
+        <w:pStyle w:val="ListParagraph"/>
+        <w:numPr>
+          <w:ilvl w:val="1"/>
+          <w:numId w:val="1"/>
+        </w:numPr>
+        <w:spacing w:after="40"/>
+      </w:pPr>
+      <w:r>
+        <w:rPr>
+          <w:color w:val="1D2D3E"/>
+          <w:sz w:val="22"/>
+          <w:szCs w:val="22"/>
+        </w:rPr>
+        <w:t xml:space="preserve">  DashboardSkeleton: standalone full-page — top bar + 2×2 KPI grid + 6 quick tiles + 4 voucher rows</w:t>
+      </w:r>
+    </w:p>
+    <w:p>
+      <w:pPr>
+        <w:pStyle w:val="ListParagraph"/>
+        <w:numPr>
+          <w:ilvl w:val="1"/>
+          <w:numId w:val="1"/>
+        </w:numPr>
+        <w:spacing w:after="40"/>
+      </w:pPr>
+      <w:r>
+        <w:rPr>
+          <w:color w:val="1D2D3E"/>
+          <w:sz w:val="22"/>
+          <w:szCs w:val="22"/>
+        </w:rPr>
+        <w:t xml:space="preserve">  ListScreenSkeleton: inline — optional search bar + optional tab bar + N list items</w:t>
+      </w:r>
+    </w:p>
+    <w:p>
+      <w:pPr>
+        <w:pStyle w:val="ListParagraph"/>
+        <w:numPr>
+          <w:ilvl w:val="1"/>
+          <w:numId w:val="1"/>
+        </w:numPr>
+        <w:spacing w:after="40"/>
+      </w:pPr>
+      <w:r>
+        <w:rPr>
+          <w:color w:val="1D2D3E"/>
+          <w:sz w:val="22"/>
+          <w:szCs w:val="22"/>
+        </w:rPr>
+        <w:t xml:space="preserve">  FinanceSummarySkeleton: inline — 2×2 summary tiles + aging bar + tab bar + N rows</w:t>
+      </w:r>
+    </w:p>
+    <w:p>
+      <w:pPr>
+        <w:pStyle w:val="ListParagraph"/>
+        <w:numPr>
+          <w:ilvl w:val="1"/>
+          <w:numId w:val="1"/>
+        </w:numPr>
+        <w:spacing w:after="40"/>
+      </w:pPr>
+      <w:r>
+        <w:rPr>
+          <w:color w:val="1D2D3E"/>
+          <w:sz w:val="22"/>
+          <w:szCs w:val="22"/>
+        </w:rPr>
+        <w:t xml:space="preserve">  DetailSkeleton: inline — configurable summary tiles (2-col rows) + section label + N rows</w:t>
+      </w:r>
+    </w:p>
+    <w:p>
+      <w:pPr>
+        <w:pStyle w:val="ListParagraph"/>
+        <w:numPr>
+          <w:ilvl w:val="0"/>
+          <w:numId w:val="1"/>
+        </w:numPr>
+        <w:spacing w:after="40"/>
+      </w:pPr>
+      <w:r>
+        <w:rPr>
+          <w:color w:val="1D2D3E"/>
+          <w:sz w:val="22"/>
+          <w:szCs w:val="22"/>
+        </w:rPr>
+        <w:t xml:space="preserve">Migrated 20+ screens from ActivityIndicator spinner to skeleton loading:</w:t>
+      </w:r>
+    </w:p>
+    <w:p>
+      <w:pPr>
+        <w:pStyle w:val="ListParagraph"/>
+        <w:numPr>
+          <w:ilvl w:val="1"/>
+          <w:numId w:val="1"/>
+        </w:numPr>
+        <w:spacing w:after="40"/>
+      </w:pPr>
+      <w:r>
+        <w:rPr>
+          <w:color w:val="1D2D3E"/>
+          <w:sz w:val="22"/>
+          <w:szCs w:val="22"/>
+        </w:rPr>
+        <w:t xml:space="preserve">  DashboardScreen: full-page DashboardSkeleton (entire screen chrome, header included)</w:t>
+      </w:r>
+    </w:p>
+    <w:p>
+      <w:pPr>
+        <w:pStyle w:val="ListParagraph"/>
+        <w:numPr>
+          <w:ilvl w:val="1"/>
+          <w:numId w:val="1"/>
+        </w:numPr>
+        <w:spacing w:after="40"/>
+      </w:pPr>
+      <w:r>
+        <w:rPr>
+          <w:color w:val="1D2D3E"/>
+          <w:sz w:val="22"/>
+          <w:szCs w:val="22"/>
+        </w:rPr>
+        <w:t xml:space="preserve">  PurchaseOrdersScreen: header stays visible; skeleton body replaces search+tabs+list</w:t>
+      </w:r>
+    </w:p>
+    <w:p>
+      <w:pPr>
+        <w:pStyle w:val="ListParagraph"/>
+        <w:numPr>
+          <w:ilvl w:val="1"/>
+          <w:numId w:val="1"/>
+        </w:numPr>
+        <w:spacing w:after="40"/>
+      </w:pPr>
+      <w:r>
+        <w:rPr>
+          <w:color w:val="1D2D3E"/>
+          <w:sz w:val="22"/>
+          <w:szCs w:val="22"/>
+        </w:rPr>
+        <w:t xml:space="preserve">  SalesOrdersScreen, MaterialsScreen, PartnersScreen, CompaniesScreen: same inline pattern</w:t>
+      </w:r>
+    </w:p>
+    <w:p>
+      <w:pPr>
+        <w:pStyle w:val="ListParagraph"/>
+        <w:numPr>
+          <w:ilvl w:val="1"/>
+          <w:numId w:val="1"/>
+        </w:numPr>
+        <w:spacing w:after="40"/>
+      </w:pPr>
+      <w:r>
+        <w:rPr>
+          <w:color w:val="1D2D3E"/>
+          <w:sz w:val="22"/>
+          <w:szCs w:val="22"/>
+        </w:rPr>
+        <w:t xml:space="preserve">  InventoryScreen: header + tab bar stay; skeleton replaces content body</w:t>
+      </w:r>
+    </w:p>
+    <w:p>
+      <w:pPr>
+        <w:pStyle w:val="ListParagraph"/>
+        <w:numPr>
+          <w:ilvl w:val="1"/>
+          <w:numId w:val="1"/>
+        </w:numPr>
+        <w:spacing w:after="40"/>
+      </w:pPr>
+      <w:r>
+        <w:rPr>
+          <w:color w:val="1D2D3E"/>
+          <w:sz w:val="22"/>
+          <w:szCs w:val="22"/>
+        </w:rPr>
+        <w:t xml:space="preserve">  AccountsPayableScreen + AccountsReceivableScreen: FinanceSummarySkeleton in body</w:t>
+      </w:r>
+    </w:p>
+    <w:p>
+      <w:pPr>
+        <w:pStyle w:val="ListParagraph"/>
+        <w:numPr>
+          <w:ilvl w:val="1"/>
+          <w:numId w:val="1"/>
+        </w:numPr>
+        <w:spacing w:after="40"/>
+      </w:pPr>
+      <w:r>
+        <w:rPr>
+          <w:color w:val="1D2D3E"/>
+          <w:sz w:val="22"/>
+          <w:szCs w:val="22"/>
+        </w:rPr>
+        <w:t xml:space="preserve">  JournalEntriesScreen: header stays; skeleton replaces date filter+search+list</w:t>
+      </w:r>
+    </w:p>
+    <w:p>
+      <w:pPr>
+        <w:pStyle w:val="ListParagraph"/>
+        <w:numPr>
+          <w:ilvl w:val="1"/>
+          <w:numId w:val="1"/>
+        </w:numPr>
+        <w:spacing w:after="40"/>
+      </w:pPr>
+      <w:r>
+        <w:rPr>
+          <w:color w:val="1D2D3E"/>
+          <w:sz w:val="22"/>
+          <w:szCs w:val="22"/>
+        </w:rPr>
+        <w:t xml:space="preserve">  AlertsScreen: chained ternary (loading→skeleton, empty→all-clear, else→list)</w:t>
+      </w:r>
+    </w:p>
+    <w:p>
+      <w:pPr>
+        <w:pStyle w:val="ListParagraph"/>
+        <w:numPr>
+          <w:ilvl w:val="1"/>
+          <w:numId w:val="1"/>
+        </w:numPr>
+        <w:spacing w:after="40"/>
+      </w:pPr>
+      <w:r>
+        <w:rPr>
+          <w:color w:val="1D2D3E"/>
+          <w:sz w:val="22"/>
+          <w:szCs w:val="22"/>
+        </w:rPr>
+        <w:t xml:space="preserve">  GRNScreen: header stays; skeleton replaces ScrollView</w:t>
+      </w:r>
+    </w:p>
+    <w:p>
+      <w:pPr>
+        <w:pStyle w:val="ListParagraph"/>
+        <w:numPr>
+          <w:ilvl w:val="1"/>
+          <w:numId w:val="1"/>
+        </w:numPr>
+        <w:spacing w:after="40"/>
+      </w:pPr>
+      <w:r>
+        <w:rPr>
+          <w:color w:val="1D2D3E"/>
+          <w:sz w:val="22"/>
+          <w:szCs w:val="22"/>
+        </w:rPr>
+        <w:t xml:space="preserve">  TrialBalanceScreen + FinancialReportsScreen: header+tabs stay; skeleton for data body</w:t>
+      </w:r>
+    </w:p>
+    <w:p>
+      <w:pPr>
+        <w:pStyle w:val="ListParagraph"/>
+        <w:numPr>
+          <w:ilvl w:val="1"/>
+          <w:numId w:val="1"/>
+        </w:numPr>
+        <w:spacing w:after="40"/>
+      </w:pPr>
+      <w:r>
+        <w:rPr>
+          <w:color w:val="1D2D3E"/>
+          <w:sz w:val="22"/>
+          <w:szCs w:val="22"/>
+        </w:rPr>
+        <w:t xml:space="preserve">  Detail screens (PO, SO, Vendor, Customer, Item Ledger, Partner): SafeAreaView + DetailSkeleton</w:t>
+      </w:r>
+    </w:p>
+    <w:p>
+      <w:pPr>
+        <w:pStyle w:val="ListParagraph"/>
+        <w:numPr>
+          <w:ilvl w:val="0"/>
+          <w:numId w:val="1"/>
+        </w:numPr>
+        <w:spacing w:after="40"/>
+      </w:pPr>
+      <w:r>
+        <w:rPr>
+          <w:color w:val="1D2D3E"/>
+          <w:sz w:val="22"/>
+          <w:szCs w:val="22"/>
+        </w:rPr>
+        <w:t xml:space="preserve">Keyboard UX improvements on all list/search screens:</w:t>
+      </w:r>
+    </w:p>
+    <w:p>
+      <w:pPr>
+        <w:pStyle w:val="ListParagraph"/>
+        <w:numPr>
+          <w:ilvl w:val="1"/>
+          <w:numId w:val="1"/>
+        </w:numPr>
+        <w:spacing w:after="40"/>
+      </w:pPr>
+      <w:r>
+        <w:rPr>
+          <w:color w:val="1D2D3E"/>
+          <w:sz w:val="22"/>
+          <w:szCs w:val="22"/>
+        </w:rPr>
+        <w:t xml:space="preserve">  keyboardShouldPersistTaps='handled': users can tap results while keyboard is open</w:t>
+      </w:r>
+    </w:p>
+    <w:p>
+      <w:pPr>
+        <w:pStyle w:val="ListParagraph"/>
+        <w:numPr>
+          <w:ilvl w:val="1"/>
+          <w:numId w:val="1"/>
+        </w:numPr>
+        <w:spacing w:after="40"/>
+      </w:pPr>
+      <w:r>
+        <w:rPr>
+          <w:color w:val="1D2D3E"/>
+          <w:sz w:val="22"/>
+          <w:szCs w:val="22"/>
+        </w:rPr>
+        <w:t xml:space="preserve">  keyboardDismissMode='on-drag': keyboard dismisses when user scrolls the list</w:t>
+      </w:r>
+    </w:p>
+    <w:p>
+      <w:pPr>
+        <w:pStyle w:val="ListParagraph"/>
+        <w:numPr>
+          <w:ilvl w:val="1"/>
+          <w:numId w:val="1"/>
+        </w:numPr>
+        <w:spacing w:after="40"/>
+      </w:pPr>
+      <w:r>
+        <w:rPr>
+          <w:color w:val="1D2D3E"/>
+          <w:sz w:val="22"/>
+          <w:szCs w:val="22"/>
+        </w:rPr>
+        <w:t xml:space="preserve">  Applied to: Dashboard, PO, SO, Materials, Partners, Companies, JournalEntries, Inventory, TrialBalance, Alerts, GRN</w:t>
       </w:r>
     </w:p>
     <w:p>

</xml_diff>

<commit_message>
docs: update generate-docs.js and regenerate FEATURES.docx for Session 13
- Added VoucherActivityChart to shared components section
- Added MaterialDetailScreen (section 3.11a) with full feature description
- Updated MaterialsScreen entry to note tappable cards
- Added 4 Session 13 entries to roadmap table
- Added Session 13 changelog entry
</commit_message>
<xml_diff>
--- a/FEATURES.docx
+++ b/FEATURES.docx
@@ -2559,6 +2559,24 @@
           <w:sz w:val="22"/>
           <w:szCs w:val="22"/>
         </w:rPr>
+        <w:t xml:space="preserve">VoucherActivityChart — horizontal bar chart showing top-6 voucher types by count + amount (Session 13)</w:t>
+      </w:r>
+    </w:p>
+    <w:p>
+      <w:pPr>
+        <w:pStyle w:val="ListParagraph"/>
+        <w:numPr>
+          <w:ilvl w:val="0"/>
+          <w:numId w:val="1"/>
+        </w:numPr>
+        <w:spacing w:after="40"/>
+      </w:pPr>
+      <w:r>
+        <w:rPr>
+          <w:color w:val="1D2D3E"/>
+          <w:sz w:val="22"/>
+          <w:szCs w:val="22"/>
+        </w:rPr>
         <w:t xml:space="preserve">AgingChart — stacked horizontal aging analysis bar with legend (Session 11)</w:t>
       </w:r>
     </w:p>
@@ -3180,7 +3198,232 @@
           <w:sz w:val="22"/>
           <w:szCs w:val="22"/>
         </w:rPr>
+        <w:t xml:space="preserve">Material cards are tappable — navigate to MaterialDetailScreen with full params (Session 13)</w:t>
+      </w:r>
+    </w:p>
+    <w:p>
+      <w:pPr>
+        <w:pStyle w:val="ListParagraph"/>
+        <w:numPr>
+          <w:ilvl w:val="0"/>
+          <w:numId w:val="1"/>
+        </w:numPr>
+        <w:spacing w:after="40"/>
+      </w:pPr>
+      <w:r>
+        <w:rPr>
+          <w:color w:val="1D2D3E"/>
+          <w:sz w:val="22"/>
+          <w:szCs w:val="22"/>
+        </w:rPr>
         <w:t xml:space="preserve">Offline caching: materials + types cached per company+type combo with 24h TTL (Session 7)</w:t>
+      </w:r>
+    </w:p>
+    <w:p>
+      <w:pPr>
+        <w:spacing w:after="80"/>
+      </w:pPr>
+      <w:r>
+        <w:rPr>
+          <w:color w:val="1D2D3E"/>
+          <w:sz w:val="22"/>
+          <w:szCs w:val="22"/>
+        </w:rPr>
+        <w:t xml:space="preserve"/>
+      </w:r>
+    </w:p>
+    <w:p>
+      <w:pPr>
+        <w:pStyle w:val="Heading2"/>
+        <w:spacing w:after="120" w:before="300"/>
+      </w:pPr>
+      <w:r>
+        <w:rPr>
+          <w:b/>
+          <w:bCs/>
+          <w:color w:val="1D2D3E"/>
+        </w:rPr>
+        <w:t xml:space="preserve">3.11a Material Detail Screen (src/screens/materials/MaterialDetailScreen.tsx)</w:t>
+      </w:r>
+    </w:p>
+    <w:p>
+      <w:pPr>
+        <w:pStyle w:val="ListParagraph"/>
+        <w:numPr>
+          <w:ilvl w:val="0"/>
+          <w:numId w:val="1"/>
+        </w:numPr>
+        <w:spacing w:after="40"/>
+      </w:pPr>
+      <w:r>
+        <w:rPr>
+          <w:color w:val="1D2D3E"/>
+          <w:sz w:val="22"/>
+          <w:szCs w:val="22"/>
+        </w:rPr>
+        <w:t xml:space="preserve">New screen added in Session 13 — accessible by tapping any material card</w:t>
+      </w:r>
+    </w:p>
+    <w:p>
+      <w:pPr>
+        <w:pStyle w:val="ListParagraph"/>
+        <w:numPr>
+          <w:ilvl w:val="0"/>
+          <w:numId w:val="1"/>
+        </w:numPr>
+        <w:spacing w:after="40"/>
+      </w:pPr>
+      <w:r>
+        <w:rPr>
+          <w:color w:val="1D2D3E"/>
+          <w:sz w:val="22"/>
+          <w:szCs w:val="22"/>
+        </w:rPr>
+        <w:t xml:space="preserve">Header: material name + optional code badge + meta chips (type, category, unit, status)</w:t>
+      </w:r>
+    </w:p>
+    <w:p>
+      <w:pPr>
+        <w:pStyle w:val="ListParagraph"/>
+        <w:numPr>
+          <w:ilvl w:val="0"/>
+          <w:numId w:val="1"/>
+        </w:numPr>
+        <w:spacing w:after="40"/>
+      </w:pPr>
+      <w:r>
+        <w:rPr>
+          <w:color w:val="1D2D3E"/>
+          <w:sz w:val="22"/>
+          <w:szCs w:val="22"/>
+        </w:rPr>
+        <w:t xml:space="preserve">Optional description bar shown below meta chips when description is available</w:t>
+      </w:r>
+    </w:p>
+    <w:p>
+      <w:pPr>
+        <w:pStyle w:val="ListParagraph"/>
+        <w:numPr>
+          <w:ilvl w:val="0"/>
+          <w:numId w:val="1"/>
+        </w:numPr>
+        <w:spacing w:after="40"/>
+      </w:pPr>
+      <w:r>
+        <w:rPr>
+          <w:color w:val="1D2D3E"/>
+          <w:sz w:val="22"/>
+          <w:szCs w:val="22"/>
+        </w:rPr>
+        <w:t xml:space="preserve">Summary tiles (2×2): Total Stock, Warehouse Count, Total In, Total Out</w:t>
+      </w:r>
+    </w:p>
+    <w:p>
+      <w:pPr>
+        <w:pStyle w:val="ListParagraph"/>
+        <w:numPr>
+          <w:ilvl w:val="0"/>
+          <w:numId w:val="1"/>
+        </w:numPr>
+        <w:spacing w:after="40"/>
+      </w:pPr>
+      <w:r>
+        <w:rPr>
+          <w:color w:val="1D2D3E"/>
+          <w:sz w:val="22"/>
+          <w:szCs w:val="22"/>
+        </w:rPr>
+        <w:t xml:space="preserve">Stock by Warehouse: per-warehouse cards with qty, unit, low-stock/out-of-stock indicators</w:t>
+      </w:r>
+    </w:p>
+    <w:p>
+      <w:pPr>
+        <w:pStyle w:val="ListParagraph"/>
+        <w:numPr>
+          <w:ilvl w:val="0"/>
+          <w:numId w:val="1"/>
+        </w:numPr>
+        <w:spacing w:after="40"/>
+      </w:pPr>
+      <w:r>
+        <w:rPr>
+          <w:color w:val="1D2D3E"/>
+          <w:sz w:val="22"/>
+          <w:szCs w:val="22"/>
+        </w:rPr>
+        <w:t xml:space="preserve">Transactions: up to 50 latest ledger entries per item — voucher badge, date, warehouse, qty delta, running balance</w:t>
+      </w:r>
+    </w:p>
+    <w:p>
+      <w:pPr>
+        <w:pStyle w:val="ListParagraph"/>
+        <w:numPr>
+          <w:ilvl w:val="0"/>
+          <w:numId w:val="1"/>
+        </w:numPr>
+        <w:spacing w:after="40"/>
+      </w:pPr>
+      <w:r>
+        <w:rPr>
+          <w:color w:val="1D2D3E"/>
+          <w:sz w:val="22"/>
+          <w:szCs w:val="22"/>
+        </w:rPr>
+        <w:t xml:space="preserve">DateRangeBar date filter on transactions: Today/This Week/This Month/Last Month/Custom presets</w:t>
+      </w:r>
+    </w:p>
+    <w:p>
+      <w:pPr>
+        <w:pStyle w:val="ListParagraph"/>
+        <w:numPr>
+          <w:ilvl w:val="0"/>
+          <w:numId w:val="1"/>
+        </w:numPr>
+        <w:spacing w:after="40"/>
+      </w:pPr>
+      <w:r>
+        <w:rPr>
+          <w:color w:val="1D2D3E"/>
+          <w:sz w:val="22"/>
+          <w:szCs w:val="22"/>
+        </w:rPr>
+        <w:t xml:space="preserve">API: fetchStockBalances (filtered by item_id) + fetchStockLedger with item_id + date params</w:t>
+      </w:r>
+    </w:p>
+    <w:p>
+      <w:pPr>
+        <w:pStyle w:val="ListParagraph"/>
+        <w:numPr>
+          <w:ilvl w:val="0"/>
+          <w:numId w:val="1"/>
+        </w:numPr>
+        <w:spacing w:after="40"/>
+      </w:pPr>
+      <w:r>
+        <w:rPr>
+          <w:color w:val="1D2D3E"/>
+          <w:sz w:val="22"/>
+          <w:szCs w:val="22"/>
+        </w:rPr>
+        <w:t xml:space="preserve">Navigation: MaterialsScreen cards → MaterialDetail; Search results → MaterialDetail; Alerts low-stock → MaterialDetail</w:t>
+      </w:r>
+    </w:p>
+    <w:p>
+      <w:pPr>
+        <w:pStyle w:val="ListParagraph"/>
+        <w:numPr>
+          <w:ilvl w:val="0"/>
+          <w:numId w:val="1"/>
+        </w:numPr>
+        <w:spacing w:after="40"/>
+      </w:pPr>
+      <w:r>
+        <w:rPr>
+          <w:color w:val="1D2D3E"/>
+          <w:sz w:val="22"/>
+          <w:szCs w:val="22"/>
+        </w:rPr>
+        <w:t xml:space="preserve">24h offline cache (bypassed when date filter is active); DetailSkeleton loading; ErrorView; pull-to-refresh</w:t>
       </w:r>
     </w:p>
     <w:p>
@@ -10639,6 +10882,310 @@
           </w:p>
         </w:tc>
       </w:tr>
+      <w:tr>
+        <w:tc>
+          <w:tcPr>
+            <w:shd w:color="F0F4F8" w:val="solid"/>
+          </w:tcPr>
+          <w:p>
+            <w:pPr>
+              <w:spacing w:after="40" w:before="40"/>
+            </w:pPr>
+            <w:r>
+              <w:rPr>
+                <w:b w:val="false"/>
+                <w:bCs w:val="false"/>
+                <w:color w:val="1D2D3E"/>
+                <w:sz w:val="20"/>
+                <w:szCs w:val="20"/>
+              </w:rPr>
+              <w:t xml:space="preserve">Session 13</w:t>
+            </w:r>
+          </w:p>
+        </w:tc>
+        <w:tc>
+          <w:tcPr>
+            <w:shd w:color="F0F4F8" w:val="solid"/>
+          </w:tcPr>
+          <w:p>
+            <w:pPr>
+              <w:spacing w:after="40" w:before="40"/>
+            </w:pPr>
+            <w:r>
+              <w:rPr>
+                <w:b w:val="false"/>
+                <w:bCs w:val="false"/>
+                <w:color w:val="1D2D3E"/>
+                <w:sz w:val="20"/>
+                <w:szCs w:val="20"/>
+              </w:rPr>
+              <w:t xml:space="preserve">Material Detail Screen — stock by warehouse + transactions + date filter</w:t>
+            </w:r>
+          </w:p>
+        </w:tc>
+        <w:tc>
+          <w:tcPr>
+            <w:shd w:color="F0F4F8" w:val="solid"/>
+          </w:tcPr>
+          <w:p>
+            <w:pPr>
+              <w:spacing w:after="40" w:before="40"/>
+            </w:pPr>
+            <w:r>
+              <w:rPr>
+                <w:b w:val="false"/>
+                <w:bCs w:val="false"/>
+                <w:color w:val="1D2D3E"/>
+                <w:sz w:val="20"/>
+                <w:szCs w:val="20"/>
+              </w:rPr>
+              <w:t xml:space="preserve">Done</w:t>
+            </w:r>
+          </w:p>
+        </w:tc>
+        <w:tc>
+          <w:tcPr>
+            <w:shd w:color="F0F4F8" w:val="solid"/>
+          </w:tcPr>
+          <w:p>
+            <w:pPr>
+              <w:spacing w:after="40" w:before="40"/>
+            </w:pPr>
+            <w:r>
+              <w:rPr>
+                <w:b w:val="false"/>
+                <w:bCs w:val="false"/>
+                <w:color w:val="1D2D3E"/>
+                <w:sz w:val="20"/>
+                <w:szCs w:val="20"/>
+              </w:rPr>
+              <w:t xml:space="preserve">/api/mobile/inventory</w:t>
+            </w:r>
+          </w:p>
+        </w:tc>
+      </w:tr>
+      <w:tr>
+        <w:tc>
+          <w:p>
+            <w:pPr>
+              <w:spacing w:after="40" w:before="40"/>
+            </w:pPr>
+            <w:r>
+              <w:rPr>
+                <w:b w:val="false"/>
+                <w:bCs w:val="false"/>
+                <w:color w:val="1D2D3E"/>
+                <w:sz w:val="20"/>
+                <w:szCs w:val="20"/>
+              </w:rPr>
+              <w:t xml:space="preserve">Session 13</w:t>
+            </w:r>
+          </w:p>
+        </w:tc>
+        <w:tc>
+          <w:p>
+            <w:pPr>
+              <w:spacing w:after="40" w:before="40"/>
+            </w:pPr>
+            <w:r>
+              <w:rPr>
+                <w:b w:val="false"/>
+                <w:bCs w:val="false"/>
+                <w:color w:val="1D2D3E"/>
+                <w:sz w:val="20"/>
+                <w:szCs w:val="20"/>
+              </w:rPr>
+              <w:t xml:space="preserve">Dashboard Voucher Activity Chart — horizontal bar chart by type</w:t>
+            </w:r>
+          </w:p>
+        </w:tc>
+        <w:tc>
+          <w:p>
+            <w:pPr>
+              <w:spacing w:after="40" w:before="40"/>
+            </w:pPr>
+            <w:r>
+              <w:rPr>
+                <w:b w:val="false"/>
+                <w:bCs w:val="false"/>
+                <w:color w:val="1D2D3E"/>
+                <w:sz w:val="20"/>
+                <w:szCs w:val="20"/>
+              </w:rPr>
+              <w:t xml:space="preserve">Done</w:t>
+            </w:r>
+          </w:p>
+        </w:tc>
+        <w:tc>
+          <w:p>
+            <w:pPr>
+              <w:spacing w:after="40" w:before="40"/>
+            </w:pPr>
+            <w:r>
+              <w:rPr>
+                <w:b w:val="false"/>
+                <w:bCs w:val="false"/>
+                <w:color w:val="1D2D3E"/>
+                <w:sz w:val="20"/>
+                <w:szCs w:val="20"/>
+              </w:rPr>
+              <w:t xml:space="preserve">—</w:t>
+            </w:r>
+          </w:p>
+        </w:tc>
+      </w:tr>
+      <w:tr>
+        <w:tc>
+          <w:tcPr>
+            <w:shd w:color="F0F4F8" w:val="solid"/>
+          </w:tcPr>
+          <w:p>
+            <w:pPr>
+              <w:spacing w:after="40" w:before="40"/>
+            </w:pPr>
+            <w:r>
+              <w:rPr>
+                <w:b w:val="false"/>
+                <w:bCs w:val="false"/>
+                <w:color w:val="1D2D3E"/>
+                <w:sz w:val="20"/>
+                <w:szCs w:val="20"/>
+              </w:rPr>
+              <w:t xml:space="preserve">Session 13</w:t>
+            </w:r>
+          </w:p>
+        </w:tc>
+        <w:tc>
+          <w:tcPr>
+            <w:shd w:color="F0F4F8" w:val="solid"/>
+          </w:tcPr>
+          <w:p>
+            <w:pPr>
+              <w:spacing w:after="40" w:before="40"/>
+            </w:pPr>
+            <w:r>
+              <w:rPr>
+                <w:b w:val="false"/>
+                <w:bCs w:val="false"/>
+                <w:color w:val="1D2D3E"/>
+                <w:sz w:val="20"/>
+                <w:szCs w:val="20"/>
+              </w:rPr>
+              <w:t xml:space="preserve">Search → MaterialDetail navigation (was navigating to list)</w:t>
+            </w:r>
+          </w:p>
+        </w:tc>
+        <w:tc>
+          <w:tcPr>
+            <w:shd w:color="F0F4F8" w:val="solid"/>
+          </w:tcPr>
+          <w:p>
+            <w:pPr>
+              <w:spacing w:after="40" w:before="40"/>
+            </w:pPr>
+            <w:r>
+              <w:rPr>
+                <w:b w:val="false"/>
+                <w:bCs w:val="false"/>
+                <w:color w:val="1D2D3E"/>
+                <w:sz w:val="20"/>
+                <w:szCs w:val="20"/>
+              </w:rPr>
+              <w:t xml:space="preserve">Done</w:t>
+            </w:r>
+          </w:p>
+        </w:tc>
+        <w:tc>
+          <w:tcPr>
+            <w:shd w:color="F0F4F8" w:val="solid"/>
+          </w:tcPr>
+          <w:p>
+            <w:pPr>
+              <w:spacing w:after="40" w:before="40"/>
+            </w:pPr>
+            <w:r>
+              <w:rPr>
+                <w:b w:val="false"/>
+                <w:bCs w:val="false"/>
+                <w:color w:val="1D2D3E"/>
+                <w:sz w:val="20"/>
+                <w:szCs w:val="20"/>
+              </w:rPr>
+              <w:t xml:space="preserve">—</w:t>
+            </w:r>
+          </w:p>
+        </w:tc>
+      </w:tr>
+      <w:tr>
+        <w:tc>
+          <w:p>
+            <w:pPr>
+              <w:spacing w:after="40" w:before="40"/>
+            </w:pPr>
+            <w:r>
+              <w:rPr>
+                <w:b w:val="false"/>
+                <w:bCs w:val="false"/>
+                <w:color w:val="1D2D3E"/>
+                <w:sz w:val="20"/>
+                <w:szCs w:val="20"/>
+              </w:rPr>
+              <w:t xml:space="preserve">Session 13</w:t>
+            </w:r>
+          </w:p>
+        </w:tc>
+        <w:tc>
+          <w:p>
+            <w:pPr>
+              <w:spacing w:after="40" w:before="40"/>
+            </w:pPr>
+            <w:r>
+              <w:rPr>
+                <w:b w:val="false"/>
+                <w:bCs w:val="false"/>
+                <w:color w:val="1D2D3E"/>
+                <w:sz w:val="20"/>
+                <w:szCs w:val="20"/>
+              </w:rPr>
+              <w:t xml:space="preserve">Alerts low-stock items → MaterialDetail navigation</w:t>
+            </w:r>
+          </w:p>
+        </w:tc>
+        <w:tc>
+          <w:p>
+            <w:pPr>
+              <w:spacing w:after="40" w:before="40"/>
+            </w:pPr>
+            <w:r>
+              <w:rPr>
+                <w:b w:val="false"/>
+                <w:bCs w:val="false"/>
+                <w:color w:val="1D2D3E"/>
+                <w:sz w:val="20"/>
+                <w:szCs w:val="20"/>
+              </w:rPr>
+              <w:t xml:space="preserve">Done</w:t>
+            </w:r>
+          </w:p>
+        </w:tc>
+        <w:tc>
+          <w:p>
+            <w:pPr>
+              <w:spacing w:after="40" w:before="40"/>
+            </w:pPr>
+            <w:r>
+              <w:rPr>
+                <w:b w:val="false"/>
+                <w:bCs w:val="false"/>
+                <w:color w:val="1D2D3E"/>
+                <w:sz w:val="20"/>
+                <w:szCs w:val="20"/>
+              </w:rPr>
+              <w:t xml:space="preserve">—</w:t>
+            </w:r>
+          </w:p>
+        </w:tc>
+      </w:tr>
     </w:tbl>
     <w:p>
       <w:pPr>
@@ -14155,6 +14702,303 @@
           <w:szCs w:val="22"/>
         </w:rPr>
         <w:t xml:space="preserve">AccountsReceivableScreen: same AgingChart migration</w:t>
+      </w:r>
+    </w:p>
+    <w:p>
+      <w:pPr>
+        <w:spacing w:after="80"/>
+      </w:pPr>
+      <w:r>
+        <w:rPr>
+          <w:color w:val="1D2D3E"/>
+          <w:sz w:val="22"/>
+          <w:szCs w:val="22"/>
+        </w:rPr>
+        <w:t xml:space="preserve"/>
+      </w:r>
+    </w:p>
+    <w:p>
+      <w:pPr>
+        <w:pStyle w:val="Heading2"/>
+        <w:spacing w:after="120" w:before="300"/>
+      </w:pPr>
+      <w:r>
+        <w:rPr>
+          <w:b/>
+          <w:bCs/>
+          <w:color w:val="1D2D3E"/>
+        </w:rPr>
+        <w:t xml:space="preserve">Session 13 — 2026-05-23</w:t>
+      </w:r>
+    </w:p>
+    <w:p>
+      <w:pPr>
+        <w:pStyle w:val="ListParagraph"/>
+        <w:numPr>
+          <w:ilvl w:val="0"/>
+          <w:numId w:val="1"/>
+        </w:numPr>
+        <w:spacing w:after="40"/>
+      </w:pPr>
+      <w:r>
+        <w:rPr>
+          <w:color w:val="1D2D3E"/>
+          <w:sz w:val="22"/>
+          <w:szCs w:val="22"/>
+        </w:rPr>
+        <w:t xml:space="preserve">Material Detail Screen: full drill-down from material list, search, and alerts</w:t>
+      </w:r>
+    </w:p>
+    <w:p>
+      <w:pPr>
+        <w:pStyle w:val="ListParagraph"/>
+        <w:numPr>
+          <w:ilvl w:val="1"/>
+          <w:numId w:val="1"/>
+        </w:numPr>
+        <w:spacing w:after="40"/>
+      </w:pPr>
+      <w:r>
+        <w:rPr>
+          <w:color w:val="1D2D3E"/>
+          <w:sz w:val="22"/>
+          <w:szCs w:val="22"/>
+        </w:rPr>
+        <w:t xml:space="preserve">  Header: name + code badge + meta chips (type/category/unit/status) + optional description bar</w:t>
+      </w:r>
+    </w:p>
+    <w:p>
+      <w:pPr>
+        <w:pStyle w:val="ListParagraph"/>
+        <w:numPr>
+          <w:ilvl w:val="1"/>
+          <w:numId w:val="1"/>
+        </w:numPr>
+        <w:spacing w:after="40"/>
+      </w:pPr>
+      <w:r>
+        <w:rPr>
+          <w:color w:val="1D2D3E"/>
+          <w:sz w:val="22"/>
+          <w:szCs w:val="22"/>
+        </w:rPr>
+        <w:t xml:space="preserve">  Summary tiles 2×2: Total Stock / Warehouse Count / Total In / Total Out</w:t>
+      </w:r>
+    </w:p>
+    <w:p>
+      <w:pPr>
+        <w:pStyle w:val="ListParagraph"/>
+        <w:numPr>
+          <w:ilvl w:val="1"/>
+          <w:numId w:val="1"/>
+        </w:numPr>
+        <w:spacing w:after="40"/>
+      </w:pPr>
+      <w:r>
+        <w:rPr>
+          <w:color w:val="1D2D3E"/>
+          <w:sz w:val="22"/>
+          <w:szCs w:val="22"/>
+        </w:rPr>
+        <w:t xml:space="preserve">  Stock by Warehouse: per-warehouse cards with qty, low-stock / out-of-stock indicators</w:t>
+      </w:r>
+    </w:p>
+    <w:p>
+      <w:pPr>
+        <w:pStyle w:val="ListParagraph"/>
+        <w:numPr>
+          <w:ilvl w:val="1"/>
+          <w:numId w:val="1"/>
+        </w:numPr>
+        <w:spacing w:after="40"/>
+      </w:pPr>
+      <w:r>
+        <w:rPr>
+          <w:color w:val="1D2D3E"/>
+          <w:sz w:val="22"/>
+          <w:szCs w:val="22"/>
+        </w:rPr>
+        <w:t xml:space="preserve">  Transactions section: up to 50 ledger entries with voucher badges, qty deltas, running balance</w:t>
+      </w:r>
+    </w:p>
+    <w:p>
+      <w:pPr>
+        <w:pStyle w:val="ListParagraph"/>
+        <w:numPr>
+          <w:ilvl w:val="1"/>
+          <w:numId w:val="1"/>
+        </w:numPr>
+        <w:spacing w:after="40"/>
+      </w:pPr>
+      <w:r>
+        <w:rPr>
+          <w:color w:val="1D2D3E"/>
+          <w:sz w:val="22"/>
+          <w:szCs w:val="22"/>
+        </w:rPr>
+        <w:t xml:space="preserve">  DateRangeBar on transactions: Today/This Week/This Month/Last Month/Custom — re-fetches with date params</w:t>
+      </w:r>
+    </w:p>
+    <w:p>
+      <w:pPr>
+        <w:pStyle w:val="ListParagraph"/>
+        <w:numPr>
+          <w:ilvl w:val="1"/>
+          <w:numId w:val="1"/>
+        </w:numPr>
+        <w:spacing w:after="40"/>
+      </w:pPr>
+      <w:r>
+        <w:rPr>
+          <w:color w:val="1D2D3E"/>
+          <w:sz w:val="22"/>
+          <w:szCs w:val="22"/>
+        </w:rPr>
+        <w:t xml:space="preserve">  24h offline cache; DetailSkeleton; ErrorView; pull-to-refresh</w:t>
+      </w:r>
+    </w:p>
+    <w:p>
+      <w:pPr>
+        <w:pStyle w:val="ListParagraph"/>
+        <w:numPr>
+          <w:ilvl w:val="0"/>
+          <w:numId w:val="1"/>
+        </w:numPr>
+        <w:spacing w:after="40"/>
+      </w:pPr>
+      <w:r>
+        <w:rPr>
+          <w:color w:val="1D2D3E"/>
+          <w:sz w:val="22"/>
+          <w:szCs w:val="22"/>
+        </w:rPr>
+        <w:t xml:space="preserve">Dashboard Voucher Activity Chart (VoucherActivityChart component):</w:t>
+      </w:r>
+    </w:p>
+    <w:p>
+      <w:pPr>
+        <w:pStyle w:val="ListParagraph"/>
+        <w:numPr>
+          <w:ilvl w:val="1"/>
+          <w:numId w:val="1"/>
+        </w:numPr>
+        <w:spacing w:after="40"/>
+      </w:pPr>
+      <w:r>
+        <w:rPr>
+          <w:color w:val="1D2D3E"/>
+          <w:sz w:val="22"/>
+          <w:szCs w:val="22"/>
+        </w:rPr>
+        <w:t xml:space="preserve">  Horizontal proportional bars: top-6 voucher types sorted by count</w:t>
+      </w:r>
+    </w:p>
+    <w:p>
+      <w:pPr>
+        <w:pStyle w:val="ListParagraph"/>
+        <w:numPr>
+          <w:ilvl w:val="1"/>
+          <w:numId w:val="1"/>
+        </w:numPr>
+        <w:spacing w:after="40"/>
+      </w:pPr>
+      <w:r>
+        <w:rPr>
+          <w:color w:val="1D2D3E"/>
+          <w:sz w:val="22"/>
+          <w:szCs w:val="22"/>
+        </w:rPr>
+        <w:t xml:space="preserve">  Each row: type label + bar track + count badge + formatted amount</w:t>
+      </w:r>
+    </w:p>
+    <w:p>
+      <w:pPr>
+        <w:pStyle w:val="ListParagraph"/>
+        <w:numPr>
+          <w:ilvl w:val="1"/>
+          <w:numId w:val="1"/>
+        </w:numPr>
+        <w:spacing w:after="40"/>
+      </w:pPr>
+      <w:r>
+        <w:rPr>
+          <w:color w:val="1D2D3E"/>
+          <w:sz w:val="22"/>
+          <w:szCs w:val="22"/>
+        </w:rPr>
+        <w:t xml:space="preserve">  fetchDashboardData now returns voucherTypeStats[] from monthly JE aggregation</w:t>
+      </w:r>
+    </w:p>
+    <w:p>
+      <w:pPr>
+        <w:pStyle w:val="ListParagraph"/>
+        <w:numPr>
+          <w:ilvl w:val="1"/>
+          <w:numId w:val="1"/>
+        </w:numPr>
+        <w:spacing w:after="40"/>
+      </w:pPr>
+      <w:r>
+        <w:rPr>
+          <w:color w:val="1D2D3E"/>
+          <w:sz w:val="22"/>
+          <w:szCs w:val="22"/>
+        </w:rPr>
+        <w:t xml:space="preserve">  'Activity by Type' section added to Dashboard between Quick Actions and Recent Activity</w:t>
+      </w:r>
+    </w:p>
+    <w:p>
+      <w:pPr>
+        <w:pStyle w:val="ListParagraph"/>
+        <w:numPr>
+          <w:ilvl w:val="0"/>
+          <w:numId w:val="1"/>
+        </w:numPr>
+        <w:spacing w:after="40"/>
+      </w:pPr>
+      <w:r>
+        <w:rPr>
+          <w:color w:val="1D2D3E"/>
+          <w:sz w:val="22"/>
+          <w:szCs w:val="22"/>
+        </w:rPr>
+        <w:t xml:space="preserve">Search → MaterialDetail: tapping a material in Global Search now opens MaterialDetail directly</w:t>
+      </w:r>
+    </w:p>
+    <w:p>
+      <w:pPr>
+        <w:pStyle w:val="ListParagraph"/>
+        <w:numPr>
+          <w:ilvl w:val="1"/>
+          <w:numId w:val="1"/>
+        </w:numPr>
+        <w:spacing w:after="40"/>
+      </w:pPr>
+      <w:r>
+        <w:rPr>
+          <w:color w:val="1D2D3E"/>
+          <w:sz w:val="22"/>
+          <w:szCs w:val="22"/>
+        </w:rPr>
+        <w:t xml:space="preserve">  materialMeta added to SearchResult; materialToResult populates it; navigate path fixed</w:t>
+      </w:r>
+    </w:p>
+    <w:p>
+      <w:pPr>
+        <w:pStyle w:val="ListParagraph"/>
+        <w:numPr>
+          <w:ilvl w:val="0"/>
+          <w:numId w:val="1"/>
+        </w:numPr>
+        <w:spacing w:after="40"/>
+      </w:pPr>
+      <w:r>
+        <w:rPr>
+          <w:color w:val="1D2D3E"/>
+          <w:sz w:val="22"/>
+          <w:szCs w:val="22"/>
+        </w:rPr>
+        <w:t xml:space="preserve">Alerts → MaterialDetail: low-stock items now navigate to MaterialDetail when item_id is available</w:t>
       </w:r>
     </w:p>
     <w:p>

</xml_diff>

<commit_message>
docs: update PROGRESS.md and FEATURES.docx for Session 14
- PROGRESS.md: Session 14 section with all 5 features documented
- PROGRESS.md: Screen Inventory updated (JE entry updated, 5 new rows added)
- PROGRESS.md: What's Next updated to Session 15+
- generate-docs.js: Section 3.26 expanded; new Sections 3.31–3.33 (auto-refresh, company persistence, session timeout)
- generate-docs.js: Roadmap table rows for all 5 Session 14 items added
- generate-docs.js: Session 14 changelog entry added
- generate-docs.js: Directory structure updated (hooks/ directory, updated settings.ts notes)
- FEATURES.docx: regenerated

https://claude.ai/code/session_01Bt9mhoGUQjPrAsHutGyUAP
</commit_message>
<xml_diff>
--- a/FEATURES.docx
+++ b/FEATURES.docx
@@ -45,7 +45,7 @@
           <w:sz w:val="20"/>
           <w:szCs w:val="20"/>
         </w:rPr>
-        <w:t xml:space="preserve">Generated: 2026-05-23</w:t>
+        <w:t xml:space="preserve">Generated: 2026-05-24</w:t>
       </w:r>
     </w:p>
     <w:p>
@@ -5871,25 +5871,61 @@
           <w:bCs/>
           <w:color w:val="1D2D3E"/>
         </w:rPr>
-        <w:t xml:space="preserve">3.26 User Preferences / Settings (Session 8)</w:t>
-      </w:r>
-    </w:p>
-    <w:p>
-      <w:pPr>
-        <w:pStyle w:val="ListParagraph"/>
-        <w:numPr>
-          <w:ilvl w:val="0"/>
-          <w:numId w:val="1"/>
-        </w:numPr>
-        <w:spacing w:after="40"/>
-      </w:pPr>
-      <w:r>
-        <w:rPr>
-          <w:color w:val="1D2D3E"/>
-          <w:sz w:val="22"/>
-          <w:szCs w:val="22"/>
-        </w:rPr>
-        <w:t xml:space="preserve">src/utils/settings.ts: getLowStockThreshold() / setLowStockThreshold(n) — AsyncStorage backed</w:t>
+        <w:t xml:space="preserve">3.26 User Preferences / Settings (Sessions 8, 14)</w:t>
+      </w:r>
+    </w:p>
+    <w:p>
+      <w:pPr>
+        <w:pStyle w:val="ListParagraph"/>
+        <w:numPr>
+          <w:ilvl w:val="0"/>
+          <w:numId w:val="1"/>
+        </w:numPr>
+        <w:spacing w:after="40"/>
+      </w:pPr>
+      <w:r>
+        <w:rPr>
+          <w:color w:val="1D2D3E"/>
+          <w:sz w:val="22"/>
+          <w:szCs w:val="22"/>
+        </w:rPr>
+        <w:t xml:space="preserve">src/utils/settings.ts: getLowStockThreshold() / setLowStockThreshold(n) — AsyncStorage backed (Session 8)</w:t>
+      </w:r>
+    </w:p>
+    <w:p>
+      <w:pPr>
+        <w:pStyle w:val="ListParagraph"/>
+        <w:numPr>
+          <w:ilvl w:val="0"/>
+          <w:numId w:val="1"/>
+        </w:numPr>
+        <w:spacing w:after="40"/>
+      </w:pPr>
+      <w:r>
+        <w:rPr>
+          <w:color w:val="1D2D3E"/>
+          <w:sz w:val="22"/>
+          <w:szCs w:val="22"/>
+        </w:rPr>
+        <w:t xml:space="preserve">src/utils/settings.ts: getAutoRefreshInterval() / setAutoRefreshInterval(n) — dashboard auto-refresh in minutes; 0=off (Session 14)</w:t>
+      </w:r>
+    </w:p>
+    <w:p>
+      <w:pPr>
+        <w:pStyle w:val="ListParagraph"/>
+        <w:numPr>
+          <w:ilvl w:val="0"/>
+          <w:numId w:val="1"/>
+        </w:numPr>
+        <w:spacing w:after="40"/>
+      </w:pPr>
+      <w:r>
+        <w:rPr>
+          <w:color w:val="1D2D3E"/>
+          <w:sz w:val="22"/>
+          <w:szCs w:val="22"/>
+        </w:rPr>
+        <w:t xml:space="preserve">src/utils/settings.ts: getSessionTimeout() / setSessionTimeout(n) — inactivity lock in minutes; 0=off (Session 14)</w:t>
       </w:r>
     </w:p>
     <w:p>
@@ -5925,7 +5961,412 @@
           <w:sz w:val="22"/>
           <w:szCs w:val="22"/>
         </w:rPr>
-        <w:t xml:space="preserve">SettingsScreen: UI to view/edit threshold, clear all cached data, view app version</w:t>
+        <w:t xml:space="preserve">SettingsScreen: UI to view/edit low-stock threshold, clear all cached data, view app version (Session 8)</w:t>
+      </w:r>
+    </w:p>
+    <w:p>
+      <w:pPr>
+        <w:pStyle w:val="ListParagraph"/>
+        <w:numPr>
+          <w:ilvl w:val="0"/>
+          <w:numId w:val="1"/>
+        </w:numPr>
+        <w:spacing w:after="40"/>
+      </w:pPr>
+      <w:r>
+        <w:rPr>
+          <w:color w:val="1D2D3E"/>
+          <w:sz w:val="22"/>
+          <w:szCs w:val="22"/>
+        </w:rPr>
+        <w:t xml:space="preserve">SettingsScreen (Session 14): DASHBOARD section — auto-refresh interval chip picker (Off/1m/5m/10m/30m)</w:t>
+      </w:r>
+    </w:p>
+    <w:p>
+      <w:pPr>
+        <w:pStyle w:val="ListParagraph"/>
+        <w:numPr>
+          <w:ilvl w:val="0"/>
+          <w:numId w:val="1"/>
+        </w:numPr>
+        <w:spacing w:after="40"/>
+      </w:pPr>
+      <w:r>
+        <w:rPr>
+          <w:color w:val="1D2D3E"/>
+          <w:sz w:val="22"/>
+          <w:szCs w:val="22"/>
+        </w:rPr>
+        <w:t xml:space="preserve">SettingsScreen (Session 14): SECURITY section — session timeout chip picker (Off/5m/15m/30m/1hr)</w:t>
+      </w:r>
+    </w:p>
+    <w:p>
+      <w:pPr>
+        <w:spacing w:after="80"/>
+      </w:pPr>
+      <w:r>
+        <w:rPr>
+          <w:color w:val="1D2D3E"/>
+          <w:sz w:val="22"/>
+          <w:szCs w:val="22"/>
+        </w:rPr>
+        <w:t xml:space="preserve"/>
+      </w:r>
+    </w:p>
+    <w:p>
+      <w:pPr>
+        <w:pStyle w:val="Heading2"/>
+        <w:spacing w:after="120" w:before="300"/>
+      </w:pPr>
+      <w:r>
+        <w:rPr>
+          <w:b/>
+          <w:bCs/>
+          <w:color w:val="1D2D3E"/>
+        </w:rPr>
+        <w:t xml:space="preserve">3.31 Dashboard Auto-Refresh + Last Updated (Session 14)</w:t>
+      </w:r>
+    </w:p>
+    <w:p>
+      <w:pPr>
+        <w:pStyle w:val="ListParagraph"/>
+        <w:numPr>
+          <w:ilvl w:val="0"/>
+          <w:numId w:val="1"/>
+        </w:numPr>
+        <w:spacing w:after="40"/>
+      </w:pPr>
+      <w:r>
+        <w:rPr>
+          <w:color w:val="1D2D3E"/>
+          <w:sz w:val="22"/>
+          <w:szCs w:val="22"/>
+        </w:rPr>
+        <w:t xml:space="preserve">Dashboard load() has isSilent flag — auto-refresh runs in background without showing RefreshControl</w:t>
+      </w:r>
+    </w:p>
+    <w:p>
+      <w:pPr>
+        <w:pStyle w:val="ListParagraph"/>
+        <w:numPr>
+          <w:ilvl w:val="0"/>
+          <w:numId w:val="1"/>
+        </w:numPr>
+        <w:spacing w:after="40"/>
+      </w:pPr>
+      <w:r>
+        <w:rPr>
+          <w:color w:val="1D2D3E"/>
+          <w:sz w:val="22"/>
+          <w:szCs w:val="22"/>
+        </w:rPr>
+        <w:t xml:space="preserve">useFocusEffect re-reads refresh interval on every Dashboard focus to pick up changes from Settings</w:t>
+      </w:r>
+    </w:p>
+    <w:p>
+      <w:pPr>
+        <w:pStyle w:val="ListParagraph"/>
+        <w:numPr>
+          <w:ilvl w:val="0"/>
+          <w:numId w:val="1"/>
+        </w:numPr>
+        <w:spacing w:after="40"/>
+      </w:pPr>
+      <w:r>
+        <w:rPr>
+          <w:color w:val="1D2D3E"/>
+          <w:sz w:val="22"/>
+          <w:szCs w:val="22"/>
+        </w:rPr>
+        <w:t xml:space="preserve">setInterval fires load(true, true) at configured interval; cleared on unmount or interval change</w:t>
+      </w:r>
+    </w:p>
+    <w:p>
+      <w:pPr>
+        <w:pStyle w:val="ListParagraph"/>
+        <w:numPr>
+          <w:ilvl w:val="0"/>
+          <w:numId w:val="1"/>
+        </w:numPr>
+        <w:spacing w:after="40"/>
+      </w:pPr>
+      <w:r>
+        <w:rPr>
+          <w:color w:val="1D2D3E"/>
+          <w:sz w:val="22"/>
+          <w:szCs w:val="22"/>
+        </w:rPr>
+        <w:t xml:space="preserve">lastUpdated: Date state tracks successful fetches — shown in top bar as 'Updated X min ago'</w:t>
+      </w:r>
+    </w:p>
+    <w:p>
+      <w:pPr>
+        <w:pStyle w:val="ListParagraph"/>
+        <w:numPr>
+          <w:ilvl w:val="0"/>
+          <w:numId w:val="1"/>
+        </w:numPr>
+        <w:spacing w:after="40"/>
+      </w:pPr>
+      <w:r>
+        <w:rPr>
+          <w:color w:val="1D2D3E"/>
+          <w:sz w:val="22"/>
+          <w:szCs w:val="22"/>
+        </w:rPr>
+        <w:t xml:space="preserve">60-second tick timer keeps the relative-time label fresh without extra API calls</w:t>
+      </w:r>
+    </w:p>
+    <w:p>
+      <w:pPr>
+        <w:pStyle w:val="ListParagraph"/>
+        <w:numPr>
+          <w:ilvl w:val="0"/>
+          <w:numId w:val="1"/>
+        </w:numPr>
+        <w:spacing w:after="40"/>
+      </w:pPr>
+      <w:r>
+        <w:rPr>
+          <w:color w:val="1D2D3E"/>
+          <w:sz w:val="22"/>
+          <w:szCs w:val="22"/>
+        </w:rPr>
+        <w:t xml:space="preserve">'Auto ↻Xm' indicator displayed in subGreeting line when auto-refresh is active</w:t>
+      </w:r>
+    </w:p>
+    <w:p>
+      <w:pPr>
+        <w:spacing w:after="80"/>
+      </w:pPr>
+      <w:r>
+        <w:rPr>
+          <w:color w:val="1D2D3E"/>
+          <w:sz w:val="22"/>
+          <w:szCs w:val="22"/>
+        </w:rPr>
+        <w:t xml:space="preserve"/>
+      </w:r>
+    </w:p>
+    <w:p>
+      <w:pPr>
+        <w:pStyle w:val="Heading2"/>
+        <w:spacing w:after="120" w:before="300"/>
+      </w:pPr>
+      <w:r>
+        <w:rPr>
+          <w:b/>
+          <w:bCs/>
+          <w:color w:val="1D2D3E"/>
+        </w:rPr>
+        <w:t xml:space="preserve">3.32 Company Selection Persistence (Session 14)</w:t>
+      </w:r>
+    </w:p>
+    <w:p>
+      <w:pPr>
+        <w:pStyle w:val="ListParagraph"/>
+        <w:numPr>
+          <w:ilvl w:val="0"/>
+          <w:numId w:val="1"/>
+        </w:numPr>
+        <w:spacing w:after="40"/>
+      </w:pPr>
+      <w:r>
+        <w:rPr>
+          <w:color w:val="1D2D3E"/>
+          <w:sz w:val="22"/>
+          <w:szCs w:val="22"/>
+        </w:rPr>
+        <w:t xml:space="preserve">CompanyContext.setSelectedCompany wraps setSelectedCompanyState: saves company ID to AsyncStorage on every change</w:t>
+      </w:r>
+    </w:p>
+    <w:p>
+      <w:pPr>
+        <w:pStyle w:val="ListParagraph"/>
+        <w:numPr>
+          <w:ilvl w:val="0"/>
+          <w:numId w:val="1"/>
+        </w:numPr>
+        <w:spacing w:after="40"/>
+      </w:pPr>
+      <w:r>
+        <w:rPr>
+          <w:color w:val="1D2D3E"/>
+          <w:sz w:val="22"/>
+          <w:szCs w:val="22"/>
+        </w:rPr>
+        <w:t xml:space="preserve">AsyncStorage key: setting:selectedCompanyId</w:t>
+      </w:r>
+    </w:p>
+    <w:p>
+      <w:pPr>
+        <w:pStyle w:val="ListParagraph"/>
+        <w:numPr>
+          <w:ilvl w:val="0"/>
+          <w:numId w:val="1"/>
+        </w:numPr>
+        <w:spacing w:after="40"/>
+      </w:pPr>
+      <w:r>
+        <w:rPr>
+          <w:color w:val="1D2D3E"/>
+          <w:sz w:val="22"/>
+          <w:szCs w:val="22"/>
+        </w:rPr>
+        <w:t xml:space="preserve">On app restart, load() reads saved ID alongside companies list and restores previous selection</w:t>
+      </w:r>
+    </w:p>
+    <w:p>
+      <w:pPr>
+        <w:pStyle w:val="ListParagraph"/>
+        <w:numPr>
+          <w:ilvl w:val="0"/>
+          <w:numId w:val="1"/>
+        </w:numPr>
+        <w:spacing w:after="40"/>
+      </w:pPr>
+      <w:r>
+        <w:rPr>
+          <w:color w:val="1D2D3E"/>
+          <w:sz w:val="22"/>
+          <w:szCs w:val="22"/>
+        </w:rPr>
+        <w:t xml:space="preserve">Falls back to first company in list when saved ID is absent or no longer available</w:t>
+      </w:r>
+    </w:p>
+    <w:p>
+      <w:pPr>
+        <w:spacing w:after="80"/>
+      </w:pPr>
+      <w:r>
+        <w:rPr>
+          <w:color w:val="1D2D3E"/>
+          <w:sz w:val="22"/>
+          <w:szCs w:val="22"/>
+        </w:rPr>
+        <w:t xml:space="preserve"/>
+      </w:r>
+    </w:p>
+    <w:p>
+      <w:pPr>
+        <w:pStyle w:val="Heading2"/>
+        <w:spacing w:after="120" w:before="300"/>
+      </w:pPr>
+      <w:r>
+        <w:rPr>
+          <w:b/>
+          <w:bCs/>
+          <w:color w:val="1D2D3E"/>
+        </w:rPr>
+        <w:t xml:space="preserve">3.33 Session Timeout / Security Lock (Session 14)</w:t>
+      </w:r>
+    </w:p>
+    <w:p>
+      <w:pPr>
+        <w:pStyle w:val="ListParagraph"/>
+        <w:numPr>
+          <w:ilvl w:val="0"/>
+          <w:numId w:val="1"/>
+        </w:numPr>
+        <w:spacing w:after="40"/>
+      </w:pPr>
+      <w:r>
+        <w:rPr>
+          <w:color w:val="1D2D3E"/>
+          <w:sz w:val="22"/>
+          <w:szCs w:val="22"/>
+        </w:rPr>
+        <w:t xml:space="preserve">src/hooks/useSessionTimeout.ts: hook using React Native AppState API (no extra packages)</w:t>
+      </w:r>
+    </w:p>
+    <w:p>
+      <w:pPr>
+        <w:pStyle w:val="ListParagraph"/>
+        <w:numPr>
+          <w:ilvl w:val="0"/>
+          <w:numId w:val="1"/>
+        </w:numPr>
+        <w:spacing w:after="40"/>
+      </w:pPr>
+      <w:r>
+        <w:rPr>
+          <w:color w:val="1D2D3E"/>
+          <w:sz w:val="22"/>
+          <w:szCs w:val="22"/>
+        </w:rPr>
+        <w:t xml:space="preserve">Records backgroundedAt timestamp when app moves to background/inactive state</w:t>
+      </w:r>
+    </w:p>
+    <w:p>
+      <w:pPr>
+        <w:pStyle w:val="ListParagraph"/>
+        <w:numPr>
+          <w:ilvl w:val="0"/>
+          <w:numId w:val="1"/>
+        </w:numPr>
+        <w:spacing w:after="40"/>
+      </w:pPr>
+      <w:r>
+        <w:rPr>
+          <w:color w:val="1D2D3E"/>
+          <w:sz w:val="22"/>
+          <w:szCs w:val="22"/>
+        </w:rPr>
+        <w:t xml:space="preserve">Re-reads the session timeout setting on each background event (picks up changes from Settings)</w:t>
+      </w:r>
+    </w:p>
+    <w:p>
+      <w:pPr>
+        <w:pStyle w:val="ListParagraph"/>
+        <w:numPr>
+          <w:ilvl w:val="0"/>
+          <w:numId w:val="1"/>
+        </w:numPr>
+        <w:spacing w:after="40"/>
+      </w:pPr>
+      <w:r>
+        <w:rPr>
+          <w:color w:val="1D2D3E"/>
+          <w:sz w:val="22"/>
+          <w:szCs w:val="22"/>
+        </w:rPr>
+        <w:t xml:space="preserve">On foreground: computes elapsed minutes; calls onTimeout() when elapsed &gt;= configured timeout</w:t>
+      </w:r>
+    </w:p>
+    <w:p>
+      <w:pPr>
+        <w:pStyle w:val="ListParagraph"/>
+        <w:numPr>
+          <w:ilvl w:val="0"/>
+          <w:numId w:val="1"/>
+        </w:numPr>
+        <w:spacing w:after="40"/>
+      </w:pPr>
+      <w:r>
+        <w:rPr>
+          <w:color w:val="1D2D3E"/>
+          <w:sz w:val="22"/>
+          <w:szCs w:val="22"/>
+        </w:rPr>
+        <w:t xml:space="preserve">AppNavigator wires useSessionTimeout(logout) — runs for all authenticated screens globally</w:t>
+      </w:r>
+    </w:p>
+    <w:p>
+      <w:pPr>
+        <w:pStyle w:val="ListParagraph"/>
+        <w:numPr>
+          <w:ilvl w:val="0"/>
+          <w:numId w:val="1"/>
+        </w:numPr>
+        <w:spacing w:after="40"/>
+      </w:pPr>
+      <w:r>
+        <w:rPr>
+          <w:color w:val="1D2D3E"/>
+          <w:sz w:val="22"/>
+          <w:szCs w:val="22"/>
+        </w:rPr>
+        <w:t xml:space="preserve">SettingsScreen: SECURITY section with chip picker for 0/5/15/30/60 minute options</w:t>
       </w:r>
     </w:p>
     <w:p>
@@ -11186,6 +11627,392 @@
           </w:p>
         </w:tc>
       </w:tr>
+      <w:tr>
+        <w:tc>
+          <w:tcPr>
+            <w:shd w:color="F0F4F8" w:val="solid"/>
+          </w:tcPr>
+          <w:p>
+            <w:pPr>
+              <w:spacing w:after="40" w:before="40"/>
+            </w:pPr>
+            <w:r>
+              <w:rPr>
+                <w:b w:val="false"/>
+                <w:bCs w:val="false"/>
+                <w:color w:val="1D2D3E"/>
+                <w:sz w:val="20"/>
+                <w:szCs w:val="20"/>
+              </w:rPr>
+              <w:t xml:space="preserve">Session 14</w:t>
+            </w:r>
+          </w:p>
+        </w:tc>
+        <w:tc>
+          <w:tcPr>
+            <w:shd w:color="F0F4F8" w:val="solid"/>
+          </w:tcPr>
+          <w:p>
+            <w:pPr>
+              <w:spacing w:after="40" w:before="40"/>
+            </w:pPr>
+            <w:r>
+              <w:rPr>
+                <w:b w:val="false"/>
+                <w:bCs w:val="false"/>
+                <w:color w:val="1D2D3E"/>
+                <w:sz w:val="20"/>
+                <w:szCs w:val="20"/>
+              </w:rPr>
+              <w:t xml:space="preserve">Dashboard auto-refresh interval (configurable: Off/1/5/10/30 min)</w:t>
+            </w:r>
+          </w:p>
+        </w:tc>
+        <w:tc>
+          <w:tcPr>
+            <w:shd w:color="F0F4F8" w:val="solid"/>
+          </w:tcPr>
+          <w:p>
+            <w:pPr>
+              <w:spacing w:after="40" w:before="40"/>
+            </w:pPr>
+            <w:r>
+              <w:rPr>
+                <w:b w:val="false"/>
+                <w:bCs w:val="false"/>
+                <w:color w:val="1D2D3E"/>
+                <w:sz w:val="20"/>
+                <w:szCs w:val="20"/>
+              </w:rPr>
+              <w:t xml:space="preserve">Done</w:t>
+            </w:r>
+          </w:p>
+        </w:tc>
+        <w:tc>
+          <w:tcPr>
+            <w:shd w:color="F0F4F8" w:val="solid"/>
+          </w:tcPr>
+          <w:p>
+            <w:pPr>
+              <w:spacing w:after="40" w:before="40"/>
+            </w:pPr>
+            <w:r>
+              <w:rPr>
+                <w:b w:val="false"/>
+                <w:bCs w:val="false"/>
+                <w:color w:val="1D2D3E"/>
+                <w:sz w:val="20"/>
+                <w:szCs w:val="20"/>
+              </w:rPr>
+              <w:t xml:space="preserve">—</w:t>
+            </w:r>
+          </w:p>
+        </w:tc>
+      </w:tr>
+      <w:tr>
+        <w:tc>
+          <w:p>
+            <w:pPr>
+              <w:spacing w:after="40" w:before="40"/>
+            </w:pPr>
+            <w:r>
+              <w:rPr>
+                <w:b w:val="false"/>
+                <w:bCs w:val="false"/>
+                <w:color w:val="1D2D3E"/>
+                <w:sz w:val="20"/>
+                <w:szCs w:val="20"/>
+              </w:rPr>
+              <w:t xml:space="preserve">Session 14</w:t>
+            </w:r>
+          </w:p>
+        </w:tc>
+        <w:tc>
+          <w:p>
+            <w:pPr>
+              <w:spacing w:after="40" w:before="40"/>
+            </w:pPr>
+            <w:r>
+              <w:rPr>
+                <w:b w:val="false"/>
+                <w:bCs w:val="false"/>
+                <w:color w:val="1D2D3E"/>
+                <w:sz w:val="20"/>
+                <w:szCs w:val="20"/>
+              </w:rPr>
+              <w:t xml:space="preserve">Dashboard 'last updated' relative timestamp in top bar</w:t>
+            </w:r>
+          </w:p>
+        </w:tc>
+        <w:tc>
+          <w:p>
+            <w:pPr>
+              <w:spacing w:after="40" w:before="40"/>
+            </w:pPr>
+            <w:r>
+              <w:rPr>
+                <w:b w:val="false"/>
+                <w:bCs w:val="false"/>
+                <w:color w:val="1D2D3E"/>
+                <w:sz w:val="20"/>
+                <w:szCs w:val="20"/>
+              </w:rPr>
+              <w:t xml:space="preserve">Done</w:t>
+            </w:r>
+          </w:p>
+        </w:tc>
+        <w:tc>
+          <w:p>
+            <w:pPr>
+              <w:spacing w:after="40" w:before="40"/>
+            </w:pPr>
+            <w:r>
+              <w:rPr>
+                <w:b w:val="false"/>
+                <w:bCs w:val="false"/>
+                <w:color w:val="1D2D3E"/>
+                <w:sz w:val="20"/>
+                <w:szCs w:val="20"/>
+              </w:rPr>
+              <w:t xml:space="preserve">—</w:t>
+            </w:r>
+          </w:p>
+        </w:tc>
+      </w:tr>
+      <w:tr>
+        <w:tc>
+          <w:tcPr>
+            <w:shd w:color="F0F4F8" w:val="solid"/>
+          </w:tcPr>
+          <w:p>
+            <w:pPr>
+              <w:spacing w:after="40" w:before="40"/>
+            </w:pPr>
+            <w:r>
+              <w:rPr>
+                <w:b w:val="false"/>
+                <w:bCs w:val="false"/>
+                <w:color w:val="1D2D3E"/>
+                <w:sz w:val="20"/>
+                <w:szCs w:val="20"/>
+              </w:rPr>
+              <w:t xml:space="preserve">Session 14</w:t>
+            </w:r>
+          </w:p>
+        </w:tc>
+        <w:tc>
+          <w:tcPr>
+            <w:shd w:color="F0F4F8" w:val="solid"/>
+          </w:tcPr>
+          <w:p>
+            <w:pPr>
+              <w:spacing w:after="40" w:before="40"/>
+            </w:pPr>
+            <w:r>
+              <w:rPr>
+                <w:b w:val="false"/>
+                <w:bCs w:val="false"/>
+                <w:color w:val="1D2D3E"/>
+                <w:sz w:val="20"/>
+                <w:szCs w:val="20"/>
+              </w:rPr>
+              <w:t xml:space="preserve">Company selection persists across app restarts (AsyncStorage)</w:t>
+            </w:r>
+          </w:p>
+        </w:tc>
+        <w:tc>
+          <w:tcPr>
+            <w:shd w:color="F0F4F8" w:val="solid"/>
+          </w:tcPr>
+          <w:p>
+            <w:pPr>
+              <w:spacing w:after="40" w:before="40"/>
+            </w:pPr>
+            <w:r>
+              <w:rPr>
+                <w:b w:val="false"/>
+                <w:bCs w:val="false"/>
+                <w:color w:val="1D2D3E"/>
+                <w:sz w:val="20"/>
+                <w:szCs w:val="20"/>
+              </w:rPr>
+              <w:t xml:space="preserve">Done</w:t>
+            </w:r>
+          </w:p>
+        </w:tc>
+        <w:tc>
+          <w:tcPr>
+            <w:shd w:color="F0F4F8" w:val="solid"/>
+          </w:tcPr>
+          <w:p>
+            <w:pPr>
+              <w:spacing w:after="40" w:before="40"/>
+            </w:pPr>
+            <w:r>
+              <w:rPr>
+                <w:b w:val="false"/>
+                <w:bCs w:val="false"/>
+                <w:color w:val="1D2D3E"/>
+                <w:sz w:val="20"/>
+                <w:szCs w:val="20"/>
+              </w:rPr>
+              <w:t xml:space="preserve">—</w:t>
+            </w:r>
+          </w:p>
+        </w:tc>
+      </w:tr>
+      <w:tr>
+        <w:tc>
+          <w:p>
+            <w:pPr>
+              <w:spacing w:after="40" w:before="40"/>
+            </w:pPr>
+            <w:r>
+              <w:rPr>
+                <w:b w:val="false"/>
+                <w:bCs w:val="false"/>
+                <w:color w:val="1D2D3E"/>
+                <w:sz w:val="20"/>
+                <w:szCs w:val="20"/>
+              </w:rPr>
+              <w:t xml:space="preserve">Session 14</w:t>
+            </w:r>
+          </w:p>
+        </w:tc>
+        <w:tc>
+          <w:p>
+            <w:pPr>
+              <w:spacing w:after="40" w:before="40"/>
+            </w:pPr>
+            <w:r>
+              <w:rPr>
+                <w:b w:val="false"/>
+                <w:bCs w:val="false"/>
+                <w:color w:val="1D2D3E"/>
+                <w:sz w:val="20"/>
+                <w:szCs w:val="20"/>
+              </w:rPr>
+              <w:t xml:space="preserve">Session timeout / security lock (auto-logout after background inactivity)</w:t>
+            </w:r>
+          </w:p>
+        </w:tc>
+        <w:tc>
+          <w:p>
+            <w:pPr>
+              <w:spacing w:after="40" w:before="40"/>
+            </w:pPr>
+            <w:r>
+              <w:rPr>
+                <w:b w:val="false"/>
+                <w:bCs w:val="false"/>
+                <w:color w:val="1D2D3E"/>
+                <w:sz w:val="20"/>
+                <w:szCs w:val="20"/>
+              </w:rPr>
+              <w:t xml:space="preserve">Done</w:t>
+            </w:r>
+          </w:p>
+        </w:tc>
+        <w:tc>
+          <w:p>
+            <w:pPr>
+              <w:spacing w:after="40" w:before="40"/>
+            </w:pPr>
+            <w:r>
+              <w:rPr>
+                <w:b w:val="false"/>
+                <w:bCs w:val="false"/>
+                <w:color w:val="1D2D3E"/>
+                <w:sz w:val="20"/>
+                <w:szCs w:val="20"/>
+              </w:rPr>
+              <w:t xml:space="preserve">AppState API</w:t>
+            </w:r>
+          </w:p>
+        </w:tc>
+      </w:tr>
+      <w:tr>
+        <w:tc>
+          <w:tcPr>
+            <w:shd w:color="F0F4F8" w:val="solid"/>
+          </w:tcPr>
+          <w:p>
+            <w:pPr>
+              <w:spacing w:after="40" w:before="40"/>
+            </w:pPr>
+            <w:r>
+              <w:rPr>
+                <w:b w:val="false"/>
+                <w:bCs w:val="false"/>
+                <w:color w:val="1D2D3E"/>
+                <w:sz w:val="20"/>
+                <w:szCs w:val="20"/>
+              </w:rPr>
+              <w:t xml:space="preserve">Session 14</w:t>
+            </w:r>
+          </w:p>
+        </w:tc>
+        <w:tc>
+          <w:tcPr>
+            <w:shd w:color="F0F4F8" w:val="solid"/>
+          </w:tcPr>
+          <w:p>
+            <w:pPr>
+              <w:spacing w:after="40" w:before="40"/>
+            </w:pPr>
+            <w:r>
+              <w:rPr>
+                <w:b w:val="false"/>
+                <w:bCs w:val="false"/>
+                <w:color w:val="1D2D3E"/>
+                <w:sz w:val="20"/>
+                <w:szCs w:val="20"/>
+              </w:rPr>
+              <w:t xml:space="preserve">Journal Entries offline caching (per company+type, bypassed when date filter active)</w:t>
+            </w:r>
+          </w:p>
+        </w:tc>
+        <w:tc>
+          <w:tcPr>
+            <w:shd w:color="F0F4F8" w:val="solid"/>
+          </w:tcPr>
+          <w:p>
+            <w:pPr>
+              <w:spacing w:after="40" w:before="40"/>
+            </w:pPr>
+            <w:r>
+              <w:rPr>
+                <w:b w:val="false"/>
+                <w:bCs w:val="false"/>
+                <w:color w:val="1D2D3E"/>
+                <w:sz w:val="20"/>
+                <w:szCs w:val="20"/>
+              </w:rPr>
+              <w:t xml:space="preserve">Done</w:t>
+            </w:r>
+          </w:p>
+        </w:tc>
+        <w:tc>
+          <w:tcPr>
+            <w:shd w:color="F0F4F8" w:val="solid"/>
+          </w:tcPr>
+          <w:p>
+            <w:pPr>
+              <w:spacing w:after="40" w:before="40"/>
+            </w:pPr>
+            <w:r>
+              <w:rPr>
+                <w:b w:val="false"/>
+                <w:bCs w:val="false"/>
+                <w:color w:val="1D2D3E"/>
+                <w:sz w:val="20"/>
+                <w:szCs w:val="20"/>
+              </w:rPr>
+              <w:t xml:space="preserve">AsyncStorage</w:t>
+            </w:r>
+          </w:p>
+        </w:tc>
+      </w:tr>
     </w:tbl>
     <w:p>
       <w:pPr>
@@ -11717,7 +12544,43 @@
           <w:sz w:val="22"/>
           <w:szCs w:val="22"/>
         </w:rPr>
-        <w:t xml:space="preserve">settings.ts — getLowStockThreshold/setLowStockThreshold; user preference persistence (Session 8)</w:t>
+        <w:t xml:space="preserve">settings.ts — getLowStockThreshold/setLowStockThreshold/getAutoRefreshInterval/setAutoRefreshInterval/getSessionTimeout/setSessionTimeout (Sessions 8, 14)</w:t>
+      </w:r>
+    </w:p>
+    <w:p>
+      <w:pPr>
+        <w:pStyle w:val="ListParagraph"/>
+        <w:numPr>
+          <w:ilvl w:val="0"/>
+          <w:numId w:val="1"/>
+        </w:numPr>
+        <w:spacing w:after="40"/>
+      </w:pPr>
+      <w:r>
+        <w:rPr>
+          <w:color w:val="1D2D3E"/>
+          <w:sz w:val="22"/>
+          <w:szCs w:val="22"/>
+        </w:rPr>
+        <w:t xml:space="preserve">src/hooks/ — Custom React hooks:</w:t>
+      </w:r>
+    </w:p>
+    <w:p>
+      <w:pPr>
+        <w:pStyle w:val="ListParagraph"/>
+        <w:numPr>
+          <w:ilvl w:val="1"/>
+          <w:numId w:val="1"/>
+        </w:numPr>
+        <w:spacing w:after="40"/>
+      </w:pPr>
+      <w:r>
+        <w:rPr>
+          <w:color w:val="1D2D3E"/>
+          <w:sz w:val="22"/>
+          <w:szCs w:val="22"/>
+        </w:rPr>
+        <w:t xml:space="preserve">useSessionTimeout.ts — AppState-based session lock hook; triggers onTimeout when background exceeds configured limit (Session 14)</w:t>
       </w:r>
     </w:p>
     <w:p>
@@ -14702,6 +15565,357 @@
           <w:szCs w:val="22"/>
         </w:rPr>
         <w:t xml:space="preserve">AccountsReceivableScreen: same AgingChart migration</w:t>
+      </w:r>
+    </w:p>
+    <w:p>
+      <w:pPr>
+        <w:spacing w:after="80"/>
+      </w:pPr>
+      <w:r>
+        <w:rPr>
+          <w:color w:val="1D2D3E"/>
+          <w:sz w:val="22"/>
+          <w:szCs w:val="22"/>
+        </w:rPr>
+        <w:t xml:space="preserve"/>
+      </w:r>
+    </w:p>
+    <w:p>
+      <w:pPr>
+        <w:pStyle w:val="Heading2"/>
+        <w:spacing w:after="120" w:before="300"/>
+      </w:pPr>
+      <w:r>
+        <w:rPr>
+          <w:b/>
+          <w:bCs/>
+          <w:color w:val="1D2D3E"/>
+        </w:rPr>
+        <w:t xml:space="preserve">Session 14 — 2026-05-24</w:t>
+      </w:r>
+    </w:p>
+    <w:p>
+      <w:pPr>
+        <w:pStyle w:val="ListParagraph"/>
+        <w:numPr>
+          <w:ilvl w:val="0"/>
+          <w:numId w:val="1"/>
+        </w:numPr>
+        <w:spacing w:after="40"/>
+      </w:pPr>
+      <w:r>
+        <w:rPr>
+          <w:color w:val="1D2D3E"/>
+          <w:sz w:val="22"/>
+          <w:szCs w:val="22"/>
+        </w:rPr>
+        <w:t xml:space="preserve">Dashboard auto-refresh interval setting (Off/1/5/10/30 min); persists in AsyncStorage</w:t>
+      </w:r>
+    </w:p>
+    <w:p>
+      <w:pPr>
+        <w:pStyle w:val="ListParagraph"/>
+        <w:numPr>
+          <w:ilvl w:val="1"/>
+          <w:numId w:val="1"/>
+        </w:numPr>
+        <w:spacing w:after="40"/>
+      </w:pPr>
+      <w:r>
+        <w:rPr>
+          <w:color w:val="1D2D3E"/>
+          <w:sz w:val="22"/>
+          <w:szCs w:val="22"/>
+        </w:rPr>
+        <w:t xml:space="preserve">  useFocusEffect re-reads interval on every Dashboard focus, picks up Settings changes immediately</w:t>
+      </w:r>
+    </w:p>
+    <w:p>
+      <w:pPr>
+        <w:pStyle w:val="ListParagraph"/>
+        <w:numPr>
+          <w:ilvl w:val="1"/>
+          <w:numId w:val="1"/>
+        </w:numPr>
+        <w:spacing w:after="40"/>
+      </w:pPr>
+      <w:r>
+        <w:rPr>
+          <w:color w:val="1D2D3E"/>
+          <w:sz w:val="22"/>
+          <w:szCs w:val="22"/>
+        </w:rPr>
+        <w:t xml:space="preserve">  Silent load(isSilent=true) — auto-refresh runs in background without showing RefreshControl</w:t>
+      </w:r>
+    </w:p>
+    <w:p>
+      <w:pPr>
+        <w:pStyle w:val="ListParagraph"/>
+        <w:numPr>
+          <w:ilvl w:val="1"/>
+          <w:numId w:val="1"/>
+        </w:numPr>
+        <w:spacing w:after="40"/>
+      </w:pPr>
+      <w:r>
+        <w:rPr>
+          <w:color w:val="1D2D3E"/>
+          <w:sz w:val="22"/>
+          <w:szCs w:val="22"/>
+        </w:rPr>
+        <w:t xml:space="preserve">  setInterval wires to load(); cleared on unmount or interval change</w:t>
+      </w:r>
+    </w:p>
+    <w:p>
+      <w:pPr>
+        <w:pStyle w:val="ListParagraph"/>
+        <w:numPr>
+          <w:ilvl w:val="0"/>
+          <w:numId w:val="1"/>
+        </w:numPr>
+        <w:spacing w:after="40"/>
+      </w:pPr>
+      <w:r>
+        <w:rPr>
+          <w:color w:val="1D2D3E"/>
+          <w:sz w:val="22"/>
+          <w:szCs w:val="22"/>
+        </w:rPr>
+        <w:t xml:space="preserve">Dashboard 'last updated' relative timestamp shown in top-bar subGreeting</w:t>
+      </w:r>
+    </w:p>
+    <w:p>
+      <w:pPr>
+        <w:pStyle w:val="ListParagraph"/>
+        <w:numPr>
+          <w:ilvl w:val="1"/>
+          <w:numId w:val="1"/>
+        </w:numPr>
+        <w:spacing w:after="40"/>
+      </w:pPr>
+      <w:r>
+        <w:rPr>
+          <w:color w:val="1D2D3E"/>
+          <w:sz w:val="22"/>
+          <w:szCs w:val="22"/>
+        </w:rPr>
+        <w:t xml:space="preserve">  Tracks successful fetch timestamp; 60s tick timer keeps label fresh without API calls</w:t>
+      </w:r>
+    </w:p>
+    <w:p>
+      <w:pPr>
+        <w:pStyle w:val="ListParagraph"/>
+        <w:numPr>
+          <w:ilvl w:val="1"/>
+          <w:numId w:val="1"/>
+        </w:numPr>
+        <w:spacing w:after="40"/>
+      </w:pPr>
+      <w:r>
+        <w:rPr>
+          <w:color w:val="1D2D3E"/>
+          <w:sz w:val="22"/>
+          <w:szCs w:val="22"/>
+        </w:rPr>
+        <w:t xml:space="preserve">  'Auto ↻Xm' indicator shown when auto-refresh is active</w:t>
+      </w:r>
+    </w:p>
+    <w:p>
+      <w:pPr>
+        <w:pStyle w:val="ListParagraph"/>
+        <w:numPr>
+          <w:ilvl w:val="0"/>
+          <w:numId w:val="1"/>
+        </w:numPr>
+        <w:spacing w:after="40"/>
+      </w:pPr>
+      <w:r>
+        <w:rPr>
+          <w:color w:val="1D2D3E"/>
+          <w:sz w:val="22"/>
+          <w:szCs w:val="22"/>
+        </w:rPr>
+        <w:t xml:space="preserve">Company selection persisted to AsyncStorage (setting:selectedCompanyId)</w:t>
+      </w:r>
+    </w:p>
+    <w:p>
+      <w:pPr>
+        <w:pStyle w:val="ListParagraph"/>
+        <w:numPr>
+          <w:ilvl w:val="1"/>
+          <w:numId w:val="1"/>
+        </w:numPr>
+        <w:spacing w:after="40"/>
+      </w:pPr>
+      <w:r>
+        <w:rPr>
+          <w:color w:val="1D2D3E"/>
+          <w:sz w:val="22"/>
+          <w:szCs w:val="22"/>
+        </w:rPr>
+        <w:t xml:space="preserve">  CompanyContext.setSelectedCompany wraps setSelectedCompanyState + AsyncStorage.setItem</w:t>
+      </w:r>
+    </w:p>
+    <w:p>
+      <w:pPr>
+        <w:pStyle w:val="ListParagraph"/>
+        <w:numPr>
+          <w:ilvl w:val="1"/>
+          <w:numId w:val="1"/>
+        </w:numPr>
+        <w:spacing w:after="40"/>
+      </w:pPr>
+      <w:r>
+        <w:rPr>
+          <w:color w:val="1D2D3E"/>
+          <w:sz w:val="22"/>
+          <w:szCs w:val="22"/>
+        </w:rPr>
+        <w:t xml:space="preserve">  On restart: load() reads saved ID alongside companies; restores previous selection or falls back to first</w:t>
+      </w:r>
+    </w:p>
+    <w:p>
+      <w:pPr>
+        <w:pStyle w:val="ListParagraph"/>
+        <w:numPr>
+          <w:ilvl w:val="0"/>
+          <w:numId w:val="1"/>
+        </w:numPr>
+        <w:spacing w:after="40"/>
+      </w:pPr>
+      <w:r>
+        <w:rPr>
+          <w:color w:val="1D2D3E"/>
+          <w:sz w:val="22"/>
+          <w:szCs w:val="22"/>
+        </w:rPr>
+        <w:t xml:space="preserve">Session timeout / security lock feature</w:t>
+      </w:r>
+    </w:p>
+    <w:p>
+      <w:pPr>
+        <w:pStyle w:val="ListParagraph"/>
+        <w:numPr>
+          <w:ilvl w:val="1"/>
+          <w:numId w:val="1"/>
+        </w:numPr>
+        <w:spacing w:after="40"/>
+      </w:pPr>
+      <w:r>
+        <w:rPr>
+          <w:color w:val="1D2D3E"/>
+          <w:sz w:val="22"/>
+          <w:szCs w:val="22"/>
+        </w:rPr>
+        <w:t xml:space="preserve">  src/hooks/useSessionTimeout.ts: AppState-based hook; no extra native packages required</w:t>
+      </w:r>
+    </w:p>
+    <w:p>
+      <w:pPr>
+        <w:pStyle w:val="ListParagraph"/>
+        <w:numPr>
+          <w:ilvl w:val="1"/>
+          <w:numId w:val="1"/>
+        </w:numPr>
+        <w:spacing w:after="40"/>
+      </w:pPr>
+      <w:r>
+        <w:rPr>
+          <w:color w:val="1D2D3E"/>
+          <w:sz w:val="22"/>
+          <w:szCs w:val="22"/>
+        </w:rPr>
+        <w:t xml:space="preserve">  Records backgroundedAt on background; re-reads setting on each background event</w:t>
+      </w:r>
+    </w:p>
+    <w:p>
+      <w:pPr>
+        <w:pStyle w:val="ListParagraph"/>
+        <w:numPr>
+          <w:ilvl w:val="1"/>
+          <w:numId w:val="1"/>
+        </w:numPr>
+        <w:spacing w:after="40"/>
+      </w:pPr>
+      <w:r>
+        <w:rPr>
+          <w:color w:val="1D2D3E"/>
+          <w:sz w:val="22"/>
+          <w:szCs w:val="22"/>
+        </w:rPr>
+        <w:t xml:space="preserve">  On foreground: if elapsed &gt;= timeout, calls onTimeout() (wired to logout() in AppNavigator)</w:t>
+      </w:r>
+    </w:p>
+    <w:p>
+      <w:pPr>
+        <w:pStyle w:val="ListParagraph"/>
+        <w:numPr>
+          <w:ilvl w:val="1"/>
+          <w:numId w:val="1"/>
+        </w:numPr>
+        <w:spacing w:after="40"/>
+      </w:pPr>
+      <w:r>
+        <w:rPr>
+          <w:color w:val="1D2D3E"/>
+          <w:sz w:val="22"/>
+          <w:szCs w:val="22"/>
+        </w:rPr>
+        <w:t xml:space="preserve">  SettingsScreen: new SECURITY section — chip picker for Off/5m/15m/30m/1hr</w:t>
+      </w:r>
+    </w:p>
+    <w:p>
+      <w:pPr>
+        <w:pStyle w:val="ListParagraph"/>
+        <w:numPr>
+          <w:ilvl w:val="0"/>
+          <w:numId w:val="1"/>
+        </w:numPr>
+        <w:spacing w:after="40"/>
+      </w:pPr>
+      <w:r>
+        <w:rPr>
+          <w:color w:val="1D2D3E"/>
+          <w:sz w:val="22"/>
+          <w:szCs w:val="22"/>
+        </w:rPr>
+        <w:t xml:space="preserve">Journal Entries offline caching (24h TTL, per company+type combo; bypassed when date filter active)</w:t>
+      </w:r>
+    </w:p>
+    <w:p>
+      <w:pPr>
+        <w:pStyle w:val="ListParagraph"/>
+        <w:numPr>
+          <w:ilvl w:val="1"/>
+          <w:numId w:val="1"/>
+        </w:numPr>
+        <w:spacing w:after="40"/>
+      </w:pPr>
+      <w:r>
+        <w:rPr>
+          <w:color w:val="1D2D3E"/>
+          <w:sz w:val="22"/>
+          <w:szCs w:val="22"/>
+        </w:rPr>
+        <w:t xml:space="preserve">  Serves cache instantly on mount; refreshes in background; OfflineBanner on stale+error</w:t>
+      </w:r>
+    </w:p>
+    <w:p>
+      <w:pPr>
+        <w:pStyle w:val="ListParagraph"/>
+        <w:numPr>
+          <w:ilvl w:val="0"/>
+          <w:numId w:val="1"/>
+        </w:numPr>
+        <w:spacing w:after="40"/>
+      </w:pPr>
+      <w:r>
+        <w:rPr>
+          <w:color w:val="1D2D3E"/>
+          <w:sz w:val="22"/>
+          <w:szCs w:val="22"/>
+        </w:rPr>
+        <w:t xml:space="preserve">Removed unused AsyncStorage import from SettingsScreen</w:t>
       </w:r>
     </w:p>
     <w:p>

</xml_diff>

<commit_message>
docs: update PROGRESS.md, FEATURES.docx, generate-docs.js for Session 15
Session 15 completed:
- Trial Balance + Financial Reports offline caching
- Biometric lock (expo-local-authentication)
- Local push notifications for overdue reminders (expo-notifications)

https://claude.ai/code/session_01Fco3obPbwcc17vRxqtPrx8
</commit_message>
<xml_diff>
--- a/FEATURES.docx
+++ b/FEATURES.docx
@@ -2595,6 +2595,24 @@
           <w:sz w:val="22"/>
           <w:szCs w:val="22"/>
         </w:rPr>
+        <w:t xml:space="preserve">BiometricLockOverlay — full-screen lock overlay with LocalAuthentication.authenticateAsync(); 'Try Again' state on failure (Session 15)</w:t>
+      </w:r>
+    </w:p>
+    <w:p>
+      <w:pPr>
+        <w:pStyle w:val="ListParagraph"/>
+        <w:numPr>
+          <w:ilvl w:val="0"/>
+          <w:numId w:val="1"/>
+        </w:numPr>
+        <w:spacing w:after="40"/>
+      </w:pPr>
+      <w:r>
+        <w:rPr>
+          <w:color w:val="1D2D3E"/>
+          <w:sz w:val="22"/>
+          <w:szCs w:val="22"/>
+        </w:rPr>
         <w:t xml:space="preserve">OfflineBanner — amber banner shown when displaying stale cached data (Session 6)</w:t>
       </w:r>
     </w:p>
@@ -4589,6 +4607,42 @@
     </w:p>
     <w:p>
       <w:pPr>
+        <w:pStyle w:val="ListParagraph"/>
+        <w:numPr>
+          <w:ilvl w:val="0"/>
+          <w:numId w:val="1"/>
+        </w:numPr>
+        <w:spacing w:after="40"/>
+      </w:pPr>
+      <w:r>
+        <w:rPr>
+          <w:color w:val="1D2D3E"/>
+          <w:sz w:val="22"/>
+          <w:szCs w:val="22"/>
+        </w:rPr>
+        <w:t xml:space="preserve">Offline caching: serves cached data instantly on mount, refreshes in background; OfflineBanner on stale+error (Session 15)</w:t>
+      </w:r>
+    </w:p>
+    <w:p>
+      <w:pPr>
+        <w:pStyle w:val="ListParagraph"/>
+        <w:numPr>
+          <w:ilvl w:val="0"/>
+          <w:numId w:val="1"/>
+        </w:numPr>
+        <w:spacing w:after="40"/>
+      </w:pPr>
+      <w:r>
+        <w:rPr>
+          <w:color w:val="1D2D3E"/>
+          <w:sz w:val="22"/>
+          <w:szCs w:val="22"/>
+        </w:rPr>
+        <w:t xml:space="preserve">Cache key: trial-balance:&lt;companyId&gt;:&lt;asOf&gt; — shared with Financial Reports (same endpoint) (Session 15)</w:t>
+      </w:r>
+    </w:p>
+    <w:p>
+      <w:pPr>
         <w:spacing w:after="80"/>
       </w:pPr>
       <w:r>
@@ -5210,6 +5264,24 @@
     </w:p>
     <w:p>
       <w:pPr>
+        <w:pStyle w:val="ListParagraph"/>
+        <w:numPr>
+          <w:ilvl w:val="0"/>
+          <w:numId w:val="1"/>
+        </w:numPr>
+        <w:spacing w:after="40"/>
+      </w:pPr>
+      <w:r>
+        <w:rPr>
+          <w:color w:val="1D2D3E"/>
+          <w:sz w:val="22"/>
+          <w:szCs w:val="22"/>
+        </w:rPr>
+        <w:t xml:space="preserve">Offline caching: shares the same trial-balance:&lt;companyId&gt;:&lt;asOf&gt; cache key as Trial Balance; serves data instantly on mount (Session 15)</w:t>
+      </w:r>
+    </w:p>
+    <w:p>
+      <w:pPr>
         <w:spacing w:after="80"/>
       </w:pPr>
       <w:r>
@@ -5871,7 +5943,7 @@
           <w:bCs/>
           <w:color w:val="1D2D3E"/>
         </w:rPr>
-        <w:t xml:space="preserve">3.26 User Preferences / Settings (Sessions 8, 14)</w:t>
+        <w:t xml:space="preserve">3.26 User Preferences / Settings (Sessions 8, 14–15)</w:t>
       </w:r>
     </w:p>
     <w:p>
@@ -5943,6 +6015,24 @@
           <w:sz w:val="22"/>
           <w:szCs w:val="22"/>
         </w:rPr>
+        <w:t xml:space="preserve">src/utils/settings.ts: getBiometricEnabled() / setBiometricEnabled(bool) — biometric lock toggle (Session 15)</w:t>
+      </w:r>
+    </w:p>
+    <w:p>
+      <w:pPr>
+        <w:pStyle w:val="ListParagraph"/>
+        <w:numPr>
+          <w:ilvl w:val="0"/>
+          <w:numId w:val="1"/>
+        </w:numPr>
+        <w:spacing w:after="40"/>
+      </w:pPr>
+      <w:r>
+        <w:rPr>
+          <w:color w:val="1D2D3E"/>
+          <w:sz w:val="22"/>
+          <w:szCs w:val="22"/>
+        </w:rPr>
         <w:t xml:space="preserve">InventoryScreen: loads low-stock threshold from settings on mount (was hardcoded = 100)</w:t>
       </w:r>
     </w:p>
@@ -5998,6 +6088,528 @@
           <w:szCs w:val="22"/>
         </w:rPr>
         <w:t xml:space="preserve">SettingsScreen (Session 14): SECURITY section — session timeout chip picker (Off/5m/15m/30m/1hr)</w:t>
+      </w:r>
+    </w:p>
+    <w:p>
+      <w:pPr>
+        <w:pStyle w:val="ListParagraph"/>
+        <w:numPr>
+          <w:ilvl w:val="0"/>
+          <w:numId w:val="1"/>
+        </w:numPr>
+        <w:spacing w:after="40"/>
+      </w:pPr>
+      <w:r>
+        <w:rPr>
+          <w:color w:val="1D2D3E"/>
+          <w:sz w:val="22"/>
+          <w:szCs w:val="22"/>
+        </w:rPr>
+        <w:t xml:space="preserve">SettingsScreen (Session 15): Biometric lock Switch (only shown when device has enrolled biometrics)</w:t>
+      </w:r>
+    </w:p>
+    <w:p>
+      <w:pPr>
+        <w:pStyle w:val="ListParagraph"/>
+        <w:numPr>
+          <w:ilvl w:val="0"/>
+          <w:numId w:val="1"/>
+        </w:numPr>
+        <w:spacing w:after="40"/>
+      </w:pPr>
+      <w:r>
+        <w:rPr>
+          <w:color w:val="1D2D3E"/>
+          <w:sz w:val="22"/>
+          <w:szCs w:val="22"/>
+        </w:rPr>
+        <w:t xml:space="preserve">SettingsScreen (Session 15): Overdue reminders Switch — enables daily 9 AM notification for active alerts</w:t>
+      </w:r>
+    </w:p>
+    <w:p>
+      <w:pPr>
+        <w:spacing w:after="80"/>
+      </w:pPr>
+      <w:r>
+        <w:rPr>
+          <w:color w:val="1D2D3E"/>
+          <w:sz w:val="22"/>
+          <w:szCs w:val="22"/>
+        </w:rPr>
+        <w:t xml:space="preserve"/>
+      </w:r>
+    </w:p>
+    <w:p>
+      <w:pPr>
+        <w:pStyle w:val="Heading2"/>
+        <w:spacing w:after="120" w:before="300"/>
+      </w:pPr>
+      <w:r>
+        <w:rPr>
+          <w:b/>
+          <w:bCs/>
+          <w:color w:val="1D2D3E"/>
+        </w:rPr>
+        <w:t xml:space="preserve">3.34 Biometric Lock (Session 15)</w:t>
+      </w:r>
+    </w:p>
+    <w:p>
+      <w:pPr>
+        <w:pStyle w:val="ListParagraph"/>
+        <w:numPr>
+          <w:ilvl w:val="0"/>
+          <w:numId w:val="1"/>
+        </w:numPr>
+        <w:spacing w:after="40"/>
+      </w:pPr>
+      <w:r>
+        <w:rPr>
+          <w:color w:val="1D2D3E"/>
+          <w:sz w:val="22"/>
+          <w:szCs w:val="22"/>
+        </w:rPr>
+        <w:t xml:space="preserve">Install: expo-local-authentication</w:t>
+      </w:r>
+    </w:p>
+    <w:p>
+      <w:pPr>
+        <w:pStyle w:val="ListParagraph"/>
+        <w:numPr>
+          <w:ilvl w:val="0"/>
+          <w:numId w:val="1"/>
+        </w:numPr>
+        <w:spacing w:after="40"/>
+      </w:pPr>
+      <w:r>
+        <w:rPr>
+          <w:color w:val="1D2D3E"/>
+          <w:sz w:val="22"/>
+          <w:szCs w:val="22"/>
+        </w:rPr>
+        <w:t xml:space="preserve">BiometricLockOverlay (src/components/BiometricLockOverlay.tsx): full-screen overlay shown when app is locked</w:t>
+      </w:r>
+    </w:p>
+    <w:p>
+      <w:pPr>
+        <w:pStyle w:val="ListParagraph"/>
+        <w:numPr>
+          <w:ilvl w:val="1"/>
+          <w:numId w:val="1"/>
+        </w:numPr>
+        <w:spacing w:after="40"/>
+      </w:pPr>
+      <w:r>
+        <w:rPr>
+          <w:color w:val="1D2D3E"/>
+          <w:sz w:val="22"/>
+          <w:szCs w:val="22"/>
+        </w:rPr>
+        <w:t xml:space="preserve">  Immediately triggers LocalAuthentication.authenticateAsync() on mount</w:t>
+      </w:r>
+    </w:p>
+    <w:p>
+      <w:pPr>
+        <w:pStyle w:val="ListParagraph"/>
+        <w:numPr>
+          <w:ilvl w:val="1"/>
+          <w:numId w:val="1"/>
+        </w:numPr>
+        <w:spacing w:after="40"/>
+      </w:pPr>
+      <w:r>
+        <w:rPr>
+          <w:color w:val="1D2D3E"/>
+          <w:sz w:val="22"/>
+          <w:szCs w:val="22"/>
+        </w:rPr>
+        <w:t xml:space="preserve">  Shows lock icon + 'Unlock' button; 'Try Again' state when authentication fails or is cancelled</w:t>
+      </w:r>
+    </w:p>
+    <w:p>
+      <w:pPr>
+        <w:pStyle w:val="ListParagraph"/>
+        <w:numPr>
+          <w:ilvl w:val="1"/>
+          <w:numId w:val="1"/>
+        </w:numPr>
+        <w:spacing w:after="40"/>
+      </w:pPr>
+      <w:r>
+        <w:rPr>
+          <w:color w:val="1D2D3E"/>
+          <w:sz w:val="22"/>
+          <w:szCs w:val="22"/>
+        </w:rPr>
+        <w:t xml:space="preserve">  Calls onUnlock() callback when auth succeeds — parent dismisses the overlay</w:t>
+      </w:r>
+    </w:p>
+    <w:p>
+      <w:pPr>
+        <w:pStyle w:val="ListParagraph"/>
+        <w:numPr>
+          <w:ilvl w:val="0"/>
+          <w:numId w:val="1"/>
+        </w:numPr>
+        <w:spacing w:after="40"/>
+      </w:pPr>
+      <w:r>
+        <w:rPr>
+          <w:color w:val="1D2D3E"/>
+          <w:sz w:val="22"/>
+          <w:szCs w:val="22"/>
+        </w:rPr>
+        <w:t xml:space="preserve">AppNavigator: AppState listener detects background → foreground transition</w:t>
+      </w:r>
+    </w:p>
+    <w:p>
+      <w:pPr>
+        <w:pStyle w:val="ListParagraph"/>
+        <w:numPr>
+          <w:ilvl w:val="1"/>
+          <w:numId w:val="1"/>
+        </w:numPr>
+        <w:spacing w:after="40"/>
+      </w:pPr>
+      <w:r>
+        <w:rPr>
+          <w:color w:val="1D2D3E"/>
+          <w:sz w:val="22"/>
+          <w:szCs w:val="22"/>
+        </w:rPr>
+        <w:t xml:space="preserve">  Reads getBiometricEnabled() on each foreground event</w:t>
+      </w:r>
+    </w:p>
+    <w:p>
+      <w:pPr>
+        <w:pStyle w:val="ListParagraph"/>
+        <w:numPr>
+          <w:ilvl w:val="1"/>
+          <w:numId w:val="1"/>
+        </w:numPr>
+        <w:spacing w:after="40"/>
+      </w:pPr>
+      <w:r>
+        <w:rPr>
+          <w:color w:val="1D2D3E"/>
+          <w:sz w:val="22"/>
+          <w:szCs w:val="22"/>
+        </w:rPr>
+        <w:t xml:space="preserve">  Sets biometricLocked=true when enabled; BiometricLockOverlay renders as absolute-fill overlay</w:t>
+      </w:r>
+    </w:p>
+    <w:p>
+      <w:pPr>
+        <w:pStyle w:val="ListParagraph"/>
+        <w:numPr>
+          <w:ilvl w:val="1"/>
+          <w:numId w:val="1"/>
+        </w:numPr>
+        <w:spacing w:after="40"/>
+      </w:pPr>
+      <w:r>
+        <w:rPr>
+          <w:color w:val="1D2D3E"/>
+          <w:sz w:val="22"/>
+          <w:szCs w:val="22"/>
+        </w:rPr>
+        <w:t xml:space="preserve">  Overlay sits above the tab navigator; does not interrupt navigation state</w:t>
+      </w:r>
+    </w:p>
+    <w:p>
+      <w:pPr>
+        <w:pStyle w:val="ListParagraph"/>
+        <w:numPr>
+          <w:ilvl w:val="0"/>
+          <w:numId w:val="1"/>
+        </w:numPr>
+        <w:spacing w:after="40"/>
+      </w:pPr>
+      <w:r>
+        <w:rPr>
+          <w:color w:val="1D2D3E"/>
+          <w:sz w:val="22"/>
+          <w:szCs w:val="22"/>
+        </w:rPr>
+        <w:t xml:space="preserve">SettingsScreen: Switch toggle in SECURITY section; requires one successful auth to enable (prevents accidental lockout)</w:t>
+      </w:r>
+    </w:p>
+    <w:p>
+      <w:pPr>
+        <w:spacing w:after="80"/>
+      </w:pPr>
+      <w:r>
+        <w:rPr>
+          <w:color w:val="1D2D3E"/>
+          <w:sz w:val="22"/>
+          <w:szCs w:val="22"/>
+        </w:rPr>
+        <w:t xml:space="preserve"/>
+      </w:r>
+    </w:p>
+    <w:p>
+      <w:pPr>
+        <w:pStyle w:val="Heading2"/>
+        <w:spacing w:after="120" w:before="300"/>
+      </w:pPr>
+      <w:r>
+        <w:rPr>
+          <w:b/>
+          <w:bCs/>
+          <w:color w:val="1D2D3E"/>
+        </w:rPr>
+        <w:t xml:space="preserve">3.35 Local Push Notifications (Session 15)</w:t>
+      </w:r>
+    </w:p>
+    <w:p>
+      <w:pPr>
+        <w:pStyle w:val="ListParagraph"/>
+        <w:numPr>
+          <w:ilvl w:val="0"/>
+          <w:numId w:val="1"/>
+        </w:numPr>
+        <w:spacing w:after="40"/>
+      </w:pPr>
+      <w:r>
+        <w:rPr>
+          <w:color w:val="1D2D3E"/>
+          <w:sz w:val="22"/>
+          <w:szCs w:val="22"/>
+        </w:rPr>
+        <w:t xml:space="preserve">Install: expo-notifications v56</w:t>
+      </w:r>
+    </w:p>
+    <w:p>
+      <w:pPr>
+        <w:pStyle w:val="ListParagraph"/>
+        <w:numPr>
+          <w:ilvl w:val="0"/>
+          <w:numId w:val="1"/>
+        </w:numPr>
+        <w:spacing w:after="40"/>
+      </w:pPr>
+      <w:r>
+        <w:rPr>
+          <w:color w:val="1D2D3E"/>
+          <w:sz w:val="22"/>
+          <w:szCs w:val="22"/>
+        </w:rPr>
+        <w:t xml:space="preserve">src/utils/notifications.ts: notification helper module</w:t>
+      </w:r>
+    </w:p>
+    <w:p>
+      <w:pPr>
+        <w:pStyle w:val="ListParagraph"/>
+        <w:numPr>
+          <w:ilvl w:val="1"/>
+          <w:numId w:val="1"/>
+        </w:numPr>
+        <w:spacing w:after="40"/>
+      </w:pPr>
+      <w:r>
+        <w:rPr>
+          <w:color w:val="1D2D3E"/>
+          <w:sz w:val="22"/>
+          <w:szCs w:val="22"/>
+        </w:rPr>
+        <w:t xml:space="preserve">  setNotificationHandler: banner + list display; no sound; no badge (Session 15)</w:t>
+      </w:r>
+    </w:p>
+    <w:p>
+      <w:pPr>
+        <w:pStyle w:val="ListParagraph"/>
+        <w:numPr>
+          <w:ilvl w:val="1"/>
+          <w:numId w:val="1"/>
+        </w:numPr>
+        <w:spacing w:after="40"/>
+      </w:pPr>
+      <w:r>
+        <w:rPr>
+          <w:color w:val="1D2D3E"/>
+          <w:sz w:val="22"/>
+          <w:szCs w:val="22"/>
+        </w:rPr>
+        <w:t xml:space="preserve">  requestNotificationPermissions(): checks existing grant, requests if needed, returns boolean (Session 15)</w:t>
+      </w:r>
+    </w:p>
+    <w:p>
+      <w:pPr>
+        <w:pStyle w:val="ListParagraph"/>
+        <w:numPr>
+          <w:ilvl w:val="1"/>
+          <w:numId w:val="1"/>
+        </w:numPr>
+        <w:spacing w:after="40"/>
+      </w:pPr>
+      <w:r>
+        <w:rPr>
+          <w:color w:val="1D2D3E"/>
+          <w:sz w:val="22"/>
+          <w:szCs w:val="22"/>
+        </w:rPr>
+        <w:t xml:space="preserve">  scheduleOverdueReminder({ apOverdue, arOverdue, lowStock }): schedules daily notification at 9 AM (Session 15)</w:t>
+      </w:r>
+    </w:p>
+    <w:p>
+      <w:pPr>
+        <w:pStyle w:val="ListParagraph"/>
+        <w:numPr>
+          <w:ilvl w:val="2"/>
+          <w:numId w:val="1"/>
+        </w:numPr>
+        <w:spacing w:after="40"/>
+      </w:pPr>
+      <w:r>
+        <w:rPr>
+          <w:color w:val="1D2D3E"/>
+          <w:sz w:val="22"/>
+          <w:szCs w:val="22"/>
+        </w:rPr>
+        <w:t xml:space="preserve">    — Composes body from overdue bill/invoice/low-stock counts (e.g. '3 overdue bills · 2 low-stock items')</w:t>
+      </w:r>
+    </w:p>
+    <w:p>
+      <w:pPr>
+        <w:pStyle w:val="ListParagraph"/>
+        <w:numPr>
+          <w:ilvl w:val="2"/>
+          <w:numId w:val="1"/>
+        </w:numPr>
+        <w:spacing w:after="40"/>
+      </w:pPr>
+      <w:r>
+        <w:rPr>
+          <w:color w:val="1D2D3E"/>
+          <w:sz w:val="22"/>
+          <w:szCs w:val="22"/>
+        </w:rPr>
+        <w:t xml:space="preserve">    — Cancels then reschedules whenever counts change; cancels if total alerts = 0</w:t>
+      </w:r>
+    </w:p>
+    <w:p>
+      <w:pPr>
+        <w:pStyle w:val="ListParagraph"/>
+        <w:numPr>
+          <w:ilvl w:val="2"/>
+          <w:numId w:val="1"/>
+        </w:numPr>
+        <w:spacing w:after="40"/>
+      </w:pPr>
+      <w:r>
+        <w:rPr>
+          <w:color w:val="1D2D3E"/>
+          <w:sz w:val="22"/>
+          <w:szCs w:val="22"/>
+        </w:rPr>
+        <w:t xml:space="preserve">    — Fails silently when run in Expo Go or without valid notification credentials</w:t>
+      </w:r>
+    </w:p>
+    <w:p>
+      <w:pPr>
+        <w:pStyle w:val="ListParagraph"/>
+        <w:numPr>
+          <w:ilvl w:val="1"/>
+          <w:numId w:val="1"/>
+        </w:numPr>
+        <w:spacing w:after="40"/>
+      </w:pPr>
+      <w:r>
+        <w:rPr>
+          <w:color w:val="1D2D3E"/>
+          <w:sz w:val="22"/>
+          <w:szCs w:val="22"/>
+        </w:rPr>
+        <w:t xml:space="preserve">  cancelOverdueReminder(): cancels the scheduled overdue reminder (Session 15)</w:t>
+      </w:r>
+    </w:p>
+    <w:p>
+      <w:pPr>
+        <w:pStyle w:val="ListParagraph"/>
+        <w:numPr>
+          <w:ilvl w:val="1"/>
+          <w:numId w:val="1"/>
+        </w:numPr>
+        <w:spacing w:after="40"/>
+      </w:pPr>
+      <w:r>
+        <w:rPr>
+          <w:color w:val="1D2D3E"/>
+          <w:sz w:val="22"/>
+          <w:szCs w:val="22"/>
+        </w:rPr>
+        <w:t xml:space="preserve">  getNotificationsEnabled() / setNotificationsEnabled(): AsyncStorage-backed toggle (Session 15)</w:t>
+      </w:r>
+    </w:p>
+    <w:p>
+      <w:pPr>
+        <w:pStyle w:val="ListParagraph"/>
+        <w:numPr>
+          <w:ilvl w:val="0"/>
+          <w:numId w:val="1"/>
+        </w:numPr>
+        <w:spacing w:after="40"/>
+      </w:pPr>
+      <w:r>
+        <w:rPr>
+          <w:color w:val="1D2D3E"/>
+          <w:sz w:val="22"/>
+          <w:szCs w:val="22"/>
+        </w:rPr>
+        <w:t xml:space="preserve">AppNavigator: useEffect on [apOverdue, arOverdue, lowStock] — reschedules reminder when alert counts change</w:t>
+      </w:r>
+    </w:p>
+    <w:p>
+      <w:pPr>
+        <w:pStyle w:val="ListParagraph"/>
+        <w:numPr>
+          <w:ilvl w:val="0"/>
+          <w:numId w:val="1"/>
+        </w:numPr>
+        <w:spacing w:after="40"/>
+      </w:pPr>
+      <w:r>
+        <w:rPr>
+          <w:color w:val="1D2D3E"/>
+          <w:sz w:val="22"/>
+          <w:szCs w:val="22"/>
+        </w:rPr>
+        <w:t xml:space="preserve">SettingsScreen: 'Overdue reminders' Switch in SECURITY section</w:t>
+      </w:r>
+    </w:p>
+    <w:p>
+      <w:pPr>
+        <w:pStyle w:val="ListParagraph"/>
+        <w:numPr>
+          <w:ilvl w:val="1"/>
+          <w:numId w:val="1"/>
+        </w:numPr>
+        <w:spacing w:after="40"/>
+      </w:pPr>
+      <w:r>
+        <w:rPr>
+          <w:color w:val="1D2D3E"/>
+          <w:sz w:val="22"/>
+          <w:szCs w:val="22"/>
+        </w:rPr>
+        <w:t xml:space="preserve">  On enable: calls requestNotificationPermissions(); shows Alert if OS permission denied</w:t>
+      </w:r>
+    </w:p>
+    <w:p>
+      <w:pPr>
+        <w:pStyle w:val="ListParagraph"/>
+        <w:numPr>
+          <w:ilvl w:val="1"/>
+          <w:numId w:val="1"/>
+        </w:numPr>
+        <w:spacing w:after="40"/>
+      </w:pPr>
+      <w:r>
+        <w:rPr>
+          <w:color w:val="1D2D3E"/>
+          <w:sz w:val="22"/>
+          <w:szCs w:val="22"/>
+        </w:rPr>
+        <w:t xml:space="preserve">  On disable: calls cancelOverdueReminder() to clear pending scheduled notification</w:t>
       </w:r>
     </w:p>
     <w:p>
@@ -12013,6 +12625,228 @@
           </w:p>
         </w:tc>
       </w:tr>
+      <w:tr>
+        <w:tc>
+          <w:p>
+            <w:pPr>
+              <w:spacing w:after="40" w:before="40"/>
+            </w:pPr>
+            <w:r>
+              <w:rPr>
+                <w:b w:val="false"/>
+                <w:bCs w:val="false"/>
+                <w:color w:val="1D2D3E"/>
+                <w:sz w:val="20"/>
+                <w:szCs w:val="20"/>
+              </w:rPr>
+              <w:t xml:space="preserve">Session 15</w:t>
+            </w:r>
+          </w:p>
+        </w:tc>
+        <w:tc>
+          <w:p>
+            <w:pPr>
+              <w:spacing w:after="40" w:before="40"/>
+            </w:pPr>
+            <w:r>
+              <w:rPr>
+                <w:b w:val="false"/>
+                <w:bCs w:val="false"/>
+                <w:color w:val="1D2D3E"/>
+                <w:sz w:val="20"/>
+                <w:szCs w:val="20"/>
+              </w:rPr>
+              <w:t xml:space="preserve">Trial Balance + Financial Reports offline caching (shared cache key, 24h TTL)</w:t>
+            </w:r>
+          </w:p>
+        </w:tc>
+        <w:tc>
+          <w:p>
+            <w:pPr>
+              <w:spacing w:after="40" w:before="40"/>
+            </w:pPr>
+            <w:r>
+              <w:rPr>
+                <w:b w:val="false"/>
+                <w:bCs w:val="false"/>
+                <w:color w:val="1D2D3E"/>
+                <w:sz w:val="20"/>
+                <w:szCs w:val="20"/>
+              </w:rPr>
+              <w:t xml:space="preserve">Done</w:t>
+            </w:r>
+          </w:p>
+        </w:tc>
+        <w:tc>
+          <w:p>
+            <w:pPr>
+              <w:spacing w:after="40" w:before="40"/>
+            </w:pPr>
+            <w:r>
+              <w:rPr>
+                <w:b w:val="false"/>
+                <w:bCs w:val="false"/>
+                <w:color w:val="1D2D3E"/>
+                <w:sz w:val="20"/>
+                <w:szCs w:val="20"/>
+              </w:rPr>
+              <w:t xml:space="preserve">AsyncStorage</w:t>
+            </w:r>
+          </w:p>
+        </w:tc>
+      </w:tr>
+      <w:tr>
+        <w:tc>
+          <w:tcPr>
+            <w:shd w:color="F0F4F8" w:val="solid"/>
+          </w:tcPr>
+          <w:p>
+            <w:pPr>
+              <w:spacing w:after="40" w:before="40"/>
+            </w:pPr>
+            <w:r>
+              <w:rPr>
+                <w:b w:val="false"/>
+                <w:bCs w:val="false"/>
+                <w:color w:val="1D2D3E"/>
+                <w:sz w:val="20"/>
+                <w:szCs w:val="20"/>
+              </w:rPr>
+              <w:t xml:space="preserve">Session 15</w:t>
+            </w:r>
+          </w:p>
+        </w:tc>
+        <w:tc>
+          <w:tcPr>
+            <w:shd w:color="F0F4F8" w:val="solid"/>
+          </w:tcPr>
+          <w:p>
+            <w:pPr>
+              <w:spacing w:after="40" w:before="40"/>
+            </w:pPr>
+            <w:r>
+              <w:rPr>
+                <w:b w:val="false"/>
+                <w:bCs w:val="false"/>
+                <w:color w:val="1D2D3E"/>
+                <w:sz w:val="20"/>
+                <w:szCs w:val="20"/>
+              </w:rPr>
+              <w:t xml:space="preserve">Biometric lock (fingerprint / Face ID on app foreground)</w:t>
+            </w:r>
+          </w:p>
+        </w:tc>
+        <w:tc>
+          <w:tcPr>
+            <w:shd w:color="F0F4F8" w:val="solid"/>
+          </w:tcPr>
+          <w:p>
+            <w:pPr>
+              <w:spacing w:after="40" w:before="40"/>
+            </w:pPr>
+            <w:r>
+              <w:rPr>
+                <w:b w:val="false"/>
+                <w:bCs w:val="false"/>
+                <w:color w:val="1D2D3E"/>
+                <w:sz w:val="20"/>
+                <w:szCs w:val="20"/>
+              </w:rPr>
+              <w:t xml:space="preserve">Done</w:t>
+            </w:r>
+          </w:p>
+        </w:tc>
+        <w:tc>
+          <w:tcPr>
+            <w:shd w:color="F0F4F8" w:val="solid"/>
+          </w:tcPr>
+          <w:p>
+            <w:pPr>
+              <w:spacing w:after="40" w:before="40"/>
+            </w:pPr>
+            <w:r>
+              <w:rPr>
+                <w:b w:val="false"/>
+                <w:bCs w:val="false"/>
+                <w:color w:val="1D2D3E"/>
+                <w:sz w:val="20"/>
+                <w:szCs w:val="20"/>
+              </w:rPr>
+              <w:t xml:space="preserve">expo-local-authentication</w:t>
+            </w:r>
+          </w:p>
+        </w:tc>
+      </w:tr>
+      <w:tr>
+        <w:tc>
+          <w:p>
+            <w:pPr>
+              <w:spacing w:after="40" w:before="40"/>
+            </w:pPr>
+            <w:r>
+              <w:rPr>
+                <w:b w:val="false"/>
+                <w:bCs w:val="false"/>
+                <w:color w:val="1D2D3E"/>
+                <w:sz w:val="20"/>
+                <w:szCs w:val="20"/>
+              </w:rPr>
+              <w:t xml:space="preserve">Session 15</w:t>
+            </w:r>
+          </w:p>
+        </w:tc>
+        <w:tc>
+          <w:p>
+            <w:pPr>
+              <w:spacing w:after="40" w:before="40"/>
+            </w:pPr>
+            <w:r>
+              <w:rPr>
+                <w:b w:val="false"/>
+                <w:bCs w:val="false"/>
+                <w:color w:val="1D2D3E"/>
+                <w:sz w:val="20"/>
+                <w:szCs w:val="20"/>
+              </w:rPr>
+              <w:t xml:space="preserve">Local push notifications — daily overdue reminders at 9 AM</w:t>
+            </w:r>
+          </w:p>
+        </w:tc>
+        <w:tc>
+          <w:p>
+            <w:pPr>
+              <w:spacing w:after="40" w:before="40"/>
+            </w:pPr>
+            <w:r>
+              <w:rPr>
+                <w:b w:val="false"/>
+                <w:bCs w:val="false"/>
+                <w:color w:val="1D2D3E"/>
+                <w:sz w:val="20"/>
+                <w:szCs w:val="20"/>
+              </w:rPr>
+              <w:t xml:space="preserve">Done</w:t>
+            </w:r>
+          </w:p>
+        </w:tc>
+        <w:tc>
+          <w:p>
+            <w:pPr>
+              <w:spacing w:after="40" w:before="40"/>
+            </w:pPr>
+            <w:r>
+              <w:rPr>
+                <w:b w:val="false"/>
+                <w:bCs w:val="false"/>
+                <w:color w:val="1D2D3E"/>
+                <w:sz w:val="20"/>
+                <w:szCs w:val="20"/>
+              </w:rPr>
+              <w:t xml:space="preserve">expo-notifications</w:t>
+            </w:r>
+          </w:p>
+        </w:tc>
+      </w:tr>
     </w:tbl>
     <w:p>
       <w:pPr>
@@ -12544,7 +13378,25 @@
           <w:sz w:val="22"/>
           <w:szCs w:val="22"/>
         </w:rPr>
-        <w:t xml:space="preserve">settings.ts — getLowStockThreshold/setLowStockThreshold/getAutoRefreshInterval/setAutoRefreshInterval/getSessionTimeout/setSessionTimeout (Sessions 8, 14)</w:t>
+        <w:t xml:space="preserve">settings.ts — getLowStockThreshold/setLowStockThreshold/getAutoRefreshInterval/setAutoRefreshInterval/getSessionTimeout/setSessionTimeout/getBiometricEnabled/setBiometricEnabled (Sessions 8, 14–15)</w:t>
+      </w:r>
+    </w:p>
+    <w:p>
+      <w:pPr>
+        <w:pStyle w:val="ListParagraph"/>
+        <w:numPr>
+          <w:ilvl w:val="1"/>
+          <w:numId w:val="1"/>
+        </w:numPr>
+        <w:spacing w:after="40"/>
+      </w:pPr>
+      <w:r>
+        <w:rPr>
+          <w:color w:val="1D2D3E"/>
+          <w:sz w:val="22"/>
+          <w:szCs w:val="22"/>
+        </w:rPr>
+        <w:t xml:space="preserve">notifications.ts — requestNotificationPermissions, scheduleOverdueReminder, cancelOverdueReminder, getNotificationsEnabled/setNotificationsEnabled (Session 15)</w:t>
       </w:r>
     </w:p>
     <w:p>
@@ -15565,6 +16417,321 @@
           <w:szCs w:val="22"/>
         </w:rPr>
         <w:t xml:space="preserve">AccountsReceivableScreen: same AgingChart migration</w:t>
+      </w:r>
+    </w:p>
+    <w:p>
+      <w:pPr>
+        <w:spacing w:after="80"/>
+      </w:pPr>
+      <w:r>
+        <w:rPr>
+          <w:color w:val="1D2D3E"/>
+          <w:sz w:val="22"/>
+          <w:szCs w:val="22"/>
+        </w:rPr>
+        <w:t xml:space="preserve"/>
+      </w:r>
+    </w:p>
+    <w:p>
+      <w:pPr>
+        <w:pStyle w:val="Heading2"/>
+        <w:spacing w:after="120" w:before="300"/>
+      </w:pPr>
+      <w:r>
+        <w:rPr>
+          <w:b/>
+          <w:bCs/>
+          <w:color w:val="1D2D3E"/>
+        </w:rPr>
+        <w:t xml:space="preserve">Session 15 — 2026-05-24</w:t>
+      </w:r>
+    </w:p>
+    <w:p>
+      <w:pPr>
+        <w:pStyle w:val="ListParagraph"/>
+        <w:numPr>
+          <w:ilvl w:val="0"/>
+          <w:numId w:val="1"/>
+        </w:numPr>
+        <w:spacing w:after="40"/>
+      </w:pPr>
+      <w:r>
+        <w:rPr>
+          <w:color w:val="1D2D3E"/>
+          <w:sz w:val="22"/>
+          <w:szCs w:val="22"/>
+        </w:rPr>
+        <w:t xml:space="preserve">Trial Balance + Financial Reports offline caching</w:t>
+      </w:r>
+    </w:p>
+    <w:p>
+      <w:pPr>
+        <w:pStyle w:val="ListParagraph"/>
+        <w:numPr>
+          <w:ilvl w:val="1"/>
+          <w:numId w:val="1"/>
+        </w:numPr>
+        <w:spacing w:after="40"/>
+      </w:pPr>
+      <w:r>
+        <w:rPr>
+          <w:color w:val="1D2D3E"/>
+          <w:sz w:val="22"/>
+          <w:szCs w:val="22"/>
+        </w:rPr>
+        <w:t xml:space="preserve">  Both screens now use getCached/setCached pattern — serve data instantly on mount, refresh in background</w:t>
+      </w:r>
+    </w:p>
+    <w:p>
+      <w:pPr>
+        <w:pStyle w:val="ListParagraph"/>
+        <w:numPr>
+          <w:ilvl w:val="1"/>
+          <w:numId w:val="1"/>
+        </w:numPr>
+        <w:spacing w:after="40"/>
+      </w:pPr>
+      <w:r>
+        <w:rPr>
+          <w:color w:val="1D2D3E"/>
+          <w:sz w:val="22"/>
+          <w:szCs w:val="22"/>
+        </w:rPr>
+        <w:t xml:space="preserve">  Cache key: trial-balance:&lt;companyId&gt;:&lt;asOf&gt; — shared between both screens (same API endpoint)</w:t>
+      </w:r>
+    </w:p>
+    <w:p>
+      <w:pPr>
+        <w:pStyle w:val="ListParagraph"/>
+        <w:numPr>
+          <w:ilvl w:val="1"/>
+          <w:numId w:val="1"/>
+        </w:numPr>
+        <w:spacing w:after="40"/>
+      </w:pPr>
+      <w:r>
+        <w:rPr>
+          <w:color w:val="1D2D3E"/>
+          <w:sz w:val="22"/>
+          <w:szCs w:val="22"/>
+        </w:rPr>
+        <w:t xml:space="preserve">  OfflineBanner shown when stale cached data is served after a failed refresh</w:t>
+      </w:r>
+    </w:p>
+    <w:p>
+      <w:pPr>
+        <w:pStyle w:val="ListParagraph"/>
+        <w:numPr>
+          <w:ilvl w:val="1"/>
+          <w:numId w:val="1"/>
+        </w:numPr>
+        <w:spacing w:after="40"/>
+      </w:pPr>
+      <w:r>
+        <w:rPr>
+          <w:color w:val="1D2D3E"/>
+          <w:sz w:val="22"/>
+          <w:szCs w:val="22"/>
+        </w:rPr>
+        <w:t xml:space="preserve">  Error guard: ErrorView only shown when no cached data is available</w:t>
+      </w:r>
+    </w:p>
+    <w:p>
+      <w:pPr>
+        <w:pStyle w:val="ListParagraph"/>
+        <w:numPr>
+          <w:ilvl w:val="0"/>
+          <w:numId w:val="1"/>
+        </w:numPr>
+        <w:spacing w:after="40"/>
+      </w:pPr>
+      <w:r>
+        <w:rPr>
+          <w:color w:val="1D2D3E"/>
+          <w:sz w:val="22"/>
+          <w:szCs w:val="22"/>
+        </w:rPr>
+        <w:t xml:space="preserve">Biometric lock feature (expo-local-authentication)</w:t>
+      </w:r>
+    </w:p>
+    <w:p>
+      <w:pPr>
+        <w:pStyle w:val="ListParagraph"/>
+        <w:numPr>
+          <w:ilvl w:val="1"/>
+          <w:numId w:val="1"/>
+        </w:numPr>
+        <w:spacing w:after="40"/>
+      </w:pPr>
+      <w:r>
+        <w:rPr>
+          <w:color w:val="1D2D3E"/>
+          <w:sz w:val="22"/>
+          <w:szCs w:val="22"/>
+        </w:rPr>
+        <w:t xml:space="preserve">  BiometricLockOverlay component: full-screen overlay, auto-triggers authenticateAsync() on mount</w:t>
+      </w:r>
+    </w:p>
+    <w:p>
+      <w:pPr>
+        <w:pStyle w:val="ListParagraph"/>
+        <w:numPr>
+          <w:ilvl w:val="1"/>
+          <w:numId w:val="1"/>
+        </w:numPr>
+        <w:spacing w:after="40"/>
+      </w:pPr>
+      <w:r>
+        <w:rPr>
+          <w:color w:val="1D2D3E"/>
+          <w:sz w:val="22"/>
+          <w:szCs w:val="22"/>
+        </w:rPr>
+        <w:t xml:space="preserve">  AppNavigator: AppState listener triggers biometric lock on every background→foreground transition when enabled</w:t>
+      </w:r>
+    </w:p>
+    <w:p>
+      <w:pPr>
+        <w:pStyle w:val="ListParagraph"/>
+        <w:numPr>
+          <w:ilvl w:val="1"/>
+          <w:numId w:val="1"/>
+        </w:numPr>
+        <w:spacing w:after="40"/>
+      </w:pPr>
+      <w:r>
+        <w:rPr>
+          <w:color w:val="1D2D3E"/>
+          <w:sz w:val="22"/>
+          <w:szCs w:val="22"/>
+        </w:rPr>
+        <w:t xml:space="preserve">  SettingsScreen: Biometric lock Switch in SECURITY section (hidden when biometric hardware unavailable)</w:t>
+      </w:r>
+    </w:p>
+    <w:p>
+      <w:pPr>
+        <w:pStyle w:val="ListParagraph"/>
+        <w:numPr>
+          <w:ilvl w:val="1"/>
+          <w:numId w:val="1"/>
+        </w:numPr>
+        <w:spacing w:after="40"/>
+      </w:pPr>
+      <w:r>
+        <w:rPr>
+          <w:color w:val="1D2D3E"/>
+          <w:sz w:val="22"/>
+          <w:szCs w:val="22"/>
+        </w:rPr>
+        <w:t xml:space="preserve">  Enable flow: requires one successful auth first to prevent accidental lockout</w:t>
+      </w:r>
+    </w:p>
+    <w:p>
+      <w:pPr>
+        <w:pStyle w:val="ListParagraph"/>
+        <w:numPr>
+          <w:ilvl w:val="1"/>
+          <w:numId w:val="1"/>
+        </w:numPr>
+        <w:spacing w:after="40"/>
+      </w:pPr>
+      <w:r>
+        <w:rPr>
+          <w:color w:val="1D2D3E"/>
+          <w:sz w:val="22"/>
+          <w:szCs w:val="22"/>
+        </w:rPr>
+        <w:t xml:space="preserve">  settings.ts: added getBiometricEnabled / setBiometricEnabled</w:t>
+      </w:r>
+    </w:p>
+    <w:p>
+      <w:pPr>
+        <w:pStyle w:val="ListParagraph"/>
+        <w:numPr>
+          <w:ilvl w:val="0"/>
+          <w:numId w:val="1"/>
+        </w:numPr>
+        <w:spacing w:after="40"/>
+      </w:pPr>
+      <w:r>
+        <w:rPr>
+          <w:color w:val="1D2D3E"/>
+          <w:sz w:val="22"/>
+          <w:szCs w:val="22"/>
+        </w:rPr>
+        <w:t xml:space="preserve">Local push notifications for overdue items (expo-notifications)</w:t>
+      </w:r>
+    </w:p>
+    <w:p>
+      <w:pPr>
+        <w:pStyle w:val="ListParagraph"/>
+        <w:numPr>
+          <w:ilvl w:val="1"/>
+          <w:numId w:val="1"/>
+        </w:numPr>
+        <w:spacing w:after="40"/>
+      </w:pPr>
+      <w:r>
+        <w:rPr>
+          <w:color w:val="1D2D3E"/>
+          <w:sz w:val="22"/>
+          <w:szCs w:val="22"/>
+        </w:rPr>
+        <w:t xml:space="preserve">  notifications.ts: scheduleOverdueReminder schedules a daily notification at 9 AM when alerts exist</w:t>
+      </w:r>
+    </w:p>
+    <w:p>
+      <w:pPr>
+        <w:pStyle w:val="ListParagraph"/>
+        <w:numPr>
+          <w:ilvl w:val="1"/>
+          <w:numId w:val="1"/>
+        </w:numPr>
+        <w:spacing w:after="40"/>
+      </w:pPr>
+      <w:r>
+        <w:rPr>
+          <w:color w:val="1D2D3E"/>
+          <w:sz w:val="22"/>
+          <w:szCs w:val="22"/>
+        </w:rPr>
+        <w:t xml:space="preserve">  Notification body includes: 'N overdue bills · N overdue invoices · N low-stock items'</w:t>
+      </w:r>
+    </w:p>
+    <w:p>
+      <w:pPr>
+        <w:pStyle w:val="ListParagraph"/>
+        <w:numPr>
+          <w:ilvl w:val="1"/>
+          <w:numId w:val="1"/>
+        </w:numPr>
+        <w:spacing w:after="40"/>
+      </w:pPr>
+      <w:r>
+        <w:rPr>
+          <w:color w:val="1D2D3E"/>
+          <w:sz w:val="22"/>
+          <w:szCs w:val="22"/>
+        </w:rPr>
+        <w:t xml:space="preserve">  AppNavigator: reschedules notification via useEffect on [apOverdue, arOverdue, lowStock]</w:t>
+      </w:r>
+    </w:p>
+    <w:p>
+      <w:pPr>
+        <w:pStyle w:val="ListParagraph"/>
+        <w:numPr>
+          <w:ilvl w:val="1"/>
+          <w:numId w:val="1"/>
+        </w:numPr>
+        <w:spacing w:after="40"/>
+      </w:pPr>
+      <w:r>
+        <w:rPr>
+          <w:color w:val="1D2D3E"/>
+          <w:sz w:val="22"/>
+          <w:szCs w:val="22"/>
+        </w:rPr>
+        <w:t xml:space="preserve">  SettingsScreen: 'Overdue reminders' Switch in SECURITY section; OS permission requested on enable</w:t>
       </w:r>
     </w:p>
     <w:p>

</xml_diff>

<commit_message>
docs: update PROGRESS.md, FEATURES.docx, generate-docs.js for Session 16
Session 16 completed:
- Notification time picker + per-type toggles (AP/AR/stock)
- Deep link navigation (poultryerp:// URL scheme)
- PDF export for Trial Balance, P&L, Balance Sheet, Journal Entries
</commit_message>
<xml_diff>
--- a/FEATURES.docx
+++ b/FEATURES.docx
@@ -5943,7 +5943,7 @@
           <w:bCs/>
           <w:color w:val="1D2D3E"/>
         </w:rPr>
-        <w:t xml:space="preserve">3.26 User Preferences / Settings (Sessions 8, 14–15)</w:t>
+        <w:t xml:space="preserve">3.26 User Preferences / Settings (Sessions 8, 14–16)</w:t>
       </w:r>
     </w:p>
     <w:p>
@@ -6033,6 +6033,78 @@
           <w:sz w:val="22"/>
           <w:szCs w:val="22"/>
         </w:rPr>
+        <w:t xml:space="preserve">src/utils/settings.ts: getNotificationHour() / setNotificationHour(hour) — notification fire hour 0–23; default 9 (Session 16)</w:t>
+      </w:r>
+    </w:p>
+    <w:p>
+      <w:pPr>
+        <w:pStyle w:val="ListParagraph"/>
+        <w:numPr>
+          <w:ilvl w:val="0"/>
+          <w:numId w:val="1"/>
+        </w:numPr>
+        <w:spacing w:after="40"/>
+      </w:pPr>
+      <w:r>
+        <w:rPr>
+          <w:color w:val="1D2D3E"/>
+          <w:sz w:val="22"/>
+          <w:szCs w:val="22"/>
+        </w:rPr>
+        <w:t xml:space="preserve">src/utils/settings.ts: getNotifyApOverdue() / setNotifyApOverdue(bool) — AP overdue alert type toggle; default true (Session 16)</w:t>
+      </w:r>
+    </w:p>
+    <w:p>
+      <w:pPr>
+        <w:pStyle w:val="ListParagraph"/>
+        <w:numPr>
+          <w:ilvl w:val="0"/>
+          <w:numId w:val="1"/>
+        </w:numPr>
+        <w:spacing w:after="40"/>
+      </w:pPr>
+      <w:r>
+        <w:rPr>
+          <w:color w:val="1D2D3E"/>
+          <w:sz w:val="22"/>
+          <w:szCs w:val="22"/>
+        </w:rPr>
+        <w:t xml:space="preserve">src/utils/settings.ts: getNotifyArOverdue() / setNotifyArOverdue(bool) — AR overdue alert type toggle; default true (Session 16)</w:t>
+      </w:r>
+    </w:p>
+    <w:p>
+      <w:pPr>
+        <w:pStyle w:val="ListParagraph"/>
+        <w:numPr>
+          <w:ilvl w:val="0"/>
+          <w:numId w:val="1"/>
+        </w:numPr>
+        <w:spacing w:after="40"/>
+      </w:pPr>
+      <w:r>
+        <w:rPr>
+          <w:color w:val="1D2D3E"/>
+          <w:sz w:val="22"/>
+          <w:szCs w:val="22"/>
+        </w:rPr>
+        <w:t xml:space="preserve">src/utils/settings.ts: getNotifyLowStock() / setNotifyLowStock(bool) — low-stock alert type toggle; default true (Session 16)</w:t>
+      </w:r>
+    </w:p>
+    <w:p>
+      <w:pPr>
+        <w:pStyle w:val="ListParagraph"/>
+        <w:numPr>
+          <w:ilvl w:val="0"/>
+          <w:numId w:val="1"/>
+        </w:numPr>
+        <w:spacing w:after="40"/>
+      </w:pPr>
+      <w:r>
+        <w:rPr>
+          <w:color w:val="1D2D3E"/>
+          <w:sz w:val="22"/>
+          <w:szCs w:val="22"/>
+        </w:rPr>
         <w:t xml:space="preserve">InventoryScreen: loads low-stock threshold from settings on mount (was hardcoded = 100)</w:t>
       </w:r>
     </w:p>
@@ -6123,7 +6195,7 @@
           <w:sz w:val="22"/>
           <w:szCs w:val="22"/>
         </w:rPr>
-        <w:t xml:space="preserve">SettingsScreen (Session 15): Overdue reminders Switch — enables daily 9 AM notification for active alerts</w:t>
+        <w:t xml:space="preserve">SettingsScreen (Session 16): NOTIFICATIONS section — master toggle + time picker + 3 per-type Switches</w:t>
       </w:r>
     </w:p>
     <w:p>
@@ -6357,7 +6429,7 @@
           <w:bCs/>
           <w:color w:val="1D2D3E"/>
         </w:rPr>
-        <w:t xml:space="preserve">3.35 Local Push Notifications (Session 15)</w:t>
+        <w:t xml:space="preserve">3.35 Local Push Notifications (Sessions 15–16)</w:t>
       </w:r>
     </w:p>
     <w:p>
@@ -6411,7 +6483,7 @@
           <w:sz w:val="22"/>
           <w:szCs w:val="22"/>
         </w:rPr>
-        <w:t xml:space="preserve">  setNotificationHandler: banner + list display; no sound; no badge (Session 15)</w:t>
+        <w:t xml:space="preserve">  setNotificationHandler: banner + list display; no sound; no badge</w:t>
       </w:r>
     </w:p>
     <w:p>
@@ -6429,7 +6501,7 @@
           <w:sz w:val="22"/>
           <w:szCs w:val="22"/>
         </w:rPr>
-        <w:t xml:space="preserve">  requestNotificationPermissions(): checks existing grant, requests if needed, returns boolean (Session 15)</w:t>
+        <w:t xml:space="preserve">  requestNotificationPermissions(): checks existing grant, requests if needed, returns boolean</w:t>
       </w:r>
     </w:p>
     <w:p>
@@ -6447,7 +6519,7 @@
           <w:sz w:val="22"/>
           <w:szCs w:val="22"/>
         </w:rPr>
-        <w:t xml:space="preserve">  scheduleOverdueReminder({ apOverdue, arOverdue, lowStock }): schedules daily notification at 9 AM (Session 15)</w:t>
+        <w:t xml:space="preserve">  scheduleOverdueReminder({ apOverdue, arOverdue, lowStock }): schedules daily notification at configured hour</w:t>
       </w:r>
     </w:p>
     <w:p>
@@ -6465,7 +6537,7 @@
           <w:sz w:val="22"/>
           <w:szCs w:val="22"/>
         </w:rPr>
-        <w:t xml:space="preserve">    — Composes body from overdue bill/invoice/low-stock counts (e.g. '3 overdue bills · 2 low-stock items')</w:t>
+        <w:t xml:space="preserve">    — Reads per-type settings (notifyApOverdue, notifyArOverdue, notifyLowStock) and notificationHour before composing</w:t>
       </w:r>
     </w:p>
     <w:p>
@@ -6483,7 +6555,7 @@
           <w:sz w:val="22"/>
           <w:szCs w:val="22"/>
         </w:rPr>
-        <w:t xml:space="preserve">    — Cancels then reschedules whenever counts change; cancels if total alerts = 0</w:t>
+        <w:t xml:space="preserve">    — Skips disabled alert types from the notification body; cancels if effective total = 0</w:t>
       </w:r>
     </w:p>
     <w:p>
@@ -6501,6 +6573,24 @@
           <w:sz w:val="22"/>
           <w:szCs w:val="22"/>
         </w:rPr>
+        <w:t xml:space="preserve">    — Schedules for next occurrence of the configured hour (advances to next day if already past)</w:t>
+      </w:r>
+    </w:p>
+    <w:p>
+      <w:pPr>
+        <w:pStyle w:val="ListParagraph"/>
+        <w:numPr>
+          <w:ilvl w:val="2"/>
+          <w:numId w:val="1"/>
+        </w:numPr>
+        <w:spacing w:after="40"/>
+      </w:pPr>
+      <w:r>
+        <w:rPr>
+          <w:color w:val="1D2D3E"/>
+          <w:sz w:val="22"/>
+          <w:szCs w:val="22"/>
+        </w:rPr>
         <w:t xml:space="preserve">    — Fails silently when run in Expo Go or without valid notification credentials</w:t>
       </w:r>
     </w:p>
@@ -6519,7 +6609,7 @@
           <w:sz w:val="22"/>
           <w:szCs w:val="22"/>
         </w:rPr>
-        <w:t xml:space="preserve">  cancelOverdueReminder(): cancels the scheduled overdue reminder (Session 15)</w:t>
+        <w:t xml:space="preserve">  cancelOverdueReminder(): cancels the scheduled overdue reminder</w:t>
       </w:r>
     </w:p>
     <w:p>
@@ -6537,7 +6627,7 @@
           <w:sz w:val="22"/>
           <w:szCs w:val="22"/>
         </w:rPr>
-        <w:t xml:space="preserve">  getNotificationsEnabled() / setNotificationsEnabled(): AsyncStorage-backed toggle (Session 15)</w:t>
+        <w:t xml:space="preserve">  getNotificationsEnabled() / setNotificationsEnabled(): AsyncStorage-backed master toggle</w:t>
       </w:r>
     </w:p>
     <w:p>
@@ -6573,7 +6663,25 @@
           <w:sz w:val="22"/>
           <w:szCs w:val="22"/>
         </w:rPr>
-        <w:t xml:space="preserve">SettingsScreen: 'Overdue reminders' Switch in SECURITY section</w:t>
+        <w:t xml:space="preserve">AppNavigator: Notifications.addNotificationResponseReceivedListener — tapping notification navigates to Alerts screen (Session 16)</w:t>
+      </w:r>
+    </w:p>
+    <w:p>
+      <w:pPr>
+        <w:pStyle w:val="ListParagraph"/>
+        <w:numPr>
+          <w:ilvl w:val="0"/>
+          <w:numId w:val="1"/>
+        </w:numPr>
+        <w:spacing w:after="40"/>
+      </w:pPr>
+      <w:r>
+        <w:rPr>
+          <w:color w:val="1D2D3E"/>
+          <w:sz w:val="22"/>
+          <w:szCs w:val="22"/>
+        </w:rPr>
+        <w:t xml:space="preserve">SettingsScreen NOTIFICATIONS section (Session 16):</w:t>
       </w:r>
     </w:p>
     <w:p>
@@ -6591,7 +6699,7 @@
           <w:sz w:val="22"/>
           <w:szCs w:val="22"/>
         </w:rPr>
-        <w:t xml:space="preserve">  On enable: calls requestNotificationPermissions(); shows Alert if OS permission denied</w:t>
+        <w:t xml:space="preserve">  Master toggle: 'Overdue reminders' Switch — enables daily notification when alerts exist</w:t>
       </w:r>
     </w:p>
     <w:p>
@@ -6609,7 +6717,727 @@
           <w:sz w:val="22"/>
           <w:szCs w:val="22"/>
         </w:rPr>
-        <w:t xml:space="preserve">  On disable: calls cancelOverdueReminder() to clear pending scheduled notification</w:t>
+        <w:t xml:space="preserve">  Notification time: 8 chip options (6 AM → 6 PM) — fires reminder at selected hour (Session 16)</w:t>
+      </w:r>
+    </w:p>
+    <w:p>
+      <w:pPr>
+        <w:pStyle w:val="ListParagraph"/>
+        <w:numPr>
+          <w:ilvl w:val="1"/>
+          <w:numId w:val="1"/>
+        </w:numPr>
+        <w:spacing w:after="40"/>
+      </w:pPr>
+      <w:r>
+        <w:rPr>
+          <w:color w:val="1D2D3E"/>
+          <w:sz w:val="22"/>
+          <w:szCs w:val="22"/>
+        </w:rPr>
+        <w:t xml:space="preserve">  'Notify about' section with 3 per-type Switches: Overdue bills (AP) / Overdue invoices (AR) / Low-stock items (Session 16)</w:t>
+      </w:r>
+    </w:p>
+    <w:p>
+      <w:pPr>
+        <w:pStyle w:val="ListParagraph"/>
+        <w:numPr>
+          <w:ilvl w:val="1"/>
+          <w:numId w:val="1"/>
+        </w:numPr>
+        <w:spacing w:after="40"/>
+      </w:pPr>
+      <w:r>
+        <w:rPr>
+          <w:color w:val="1D2D3E"/>
+          <w:sz w:val="22"/>
+          <w:szCs w:val="22"/>
+        </w:rPr>
+        <w:t xml:space="preserve">  Per-type controls only visible when master toggle is on (Session 16)</w:t>
+      </w:r>
+    </w:p>
+    <w:p>
+      <w:pPr>
+        <w:spacing w:after="80"/>
+      </w:pPr>
+      <w:r>
+        <w:rPr>
+          <w:color w:val="1D2D3E"/>
+          <w:sz w:val="22"/>
+          <w:szCs w:val="22"/>
+        </w:rPr>
+        <w:t xml:space="preserve"/>
+      </w:r>
+    </w:p>
+    <w:p>
+      <w:pPr>
+        <w:pStyle w:val="Heading2"/>
+        <w:spacing w:after="120" w:before="300"/>
+      </w:pPr>
+      <w:r>
+        <w:rPr>
+          <w:b/>
+          <w:bCs/>
+          <w:color w:val="1D2D3E"/>
+        </w:rPr>
+        <w:t xml:space="preserve">3.36 Deep Link Navigation (Session 16)</w:t>
+      </w:r>
+    </w:p>
+    <w:p>
+      <w:pPr>
+        <w:pStyle w:val="ListParagraph"/>
+        <w:numPr>
+          <w:ilvl w:val="0"/>
+          <w:numId w:val="1"/>
+        </w:numPr>
+        <w:spacing w:after="40"/>
+      </w:pPr>
+      <w:r>
+        <w:rPr>
+          <w:color w:val="1D2D3E"/>
+          <w:sz w:val="22"/>
+          <w:szCs w:val="22"/>
+        </w:rPr>
+        <w:t xml:space="preserve">app.json: added scheme: 'poultryerp' — enables poultryerp:// custom URL scheme on iOS and Android</w:t>
+      </w:r>
+    </w:p>
+    <w:p>
+      <w:pPr>
+        <w:pStyle w:val="ListParagraph"/>
+        <w:numPr>
+          <w:ilvl w:val="0"/>
+          <w:numId w:val="1"/>
+        </w:numPr>
+        <w:spacing w:after="40"/>
+      </w:pPr>
+      <w:r>
+        <w:rPr>
+          <w:color w:val="1D2D3E"/>
+          <w:sz w:val="22"/>
+          <w:szCs w:val="22"/>
+        </w:rPr>
+        <w:t xml:space="preserve">Install: expo-linking</w:t>
+      </w:r>
+    </w:p>
+    <w:p>
+      <w:pPr>
+        <w:pStyle w:val="ListParagraph"/>
+        <w:numPr>
+          <w:ilvl w:val="0"/>
+          <w:numId w:val="1"/>
+        </w:numPr>
+        <w:spacing w:after="40"/>
+      </w:pPr>
+      <w:r>
+        <w:rPr>
+          <w:color w:val="1D2D3E"/>
+          <w:sz w:val="22"/>
+          <w:szCs w:val="22"/>
+        </w:rPr>
+        <w:t xml:space="preserve">src/navigation/linking.ts: LinkingOptions config mapping poultryerp:// URLs to screen names</w:t>
+      </w:r>
+    </w:p>
+    <w:p>
+      <w:pPr>
+        <w:pStyle w:val="ListParagraph"/>
+        <w:numPr>
+          <w:ilvl w:val="0"/>
+          <w:numId w:val="1"/>
+        </w:numPr>
+        <w:spacing w:after="40"/>
+      </w:pPr>
+      <w:r>
+        <w:rPr>
+          <w:color w:val="1D2D3E"/>
+          <w:sz w:val="22"/>
+          <w:szCs w:val="22"/>
+        </w:rPr>
+        <w:t xml:space="preserve">  poultryerp://dashboard → Dashboard tab</w:t>
+      </w:r>
+    </w:p>
+    <w:p>
+      <w:pPr>
+        <w:pStyle w:val="ListParagraph"/>
+        <w:numPr>
+          <w:ilvl w:val="1"/>
+          <w:numId w:val="1"/>
+        </w:numPr>
+        <w:spacing w:after="40"/>
+      </w:pPr>
+      <w:r>
+        <w:rPr>
+          <w:color w:val="1D2D3E"/>
+          <w:sz w:val="22"/>
+          <w:szCs w:val="22"/>
+        </w:rPr>
+        <w:t xml:space="preserve">  poultryerp://inventory → InventoryMain (Inventory tab)</w:t>
+      </w:r>
+    </w:p>
+    <w:p>
+      <w:pPr>
+        <w:pStyle w:val="ListParagraph"/>
+        <w:numPr>
+          <w:ilvl w:val="1"/>
+          <w:numId w:val="1"/>
+        </w:numPr>
+        <w:spacing w:after="40"/>
+      </w:pPr>
+      <w:r>
+        <w:rPr>
+          <w:color w:val="1D2D3E"/>
+          <w:sz w:val="22"/>
+          <w:szCs w:val="22"/>
+        </w:rPr>
+        <w:t xml:space="preserve">  poultryerp://finance → Finance tab menu</w:t>
+      </w:r>
+    </w:p>
+    <w:p>
+      <w:pPr>
+        <w:pStyle w:val="ListParagraph"/>
+        <w:numPr>
+          <w:ilvl w:val="1"/>
+          <w:numId w:val="1"/>
+        </w:numPr>
+        <w:spacing w:after="40"/>
+      </w:pPr>
+      <w:r>
+        <w:rPr>
+          <w:color w:val="1D2D3E"/>
+          <w:sz w:val="22"/>
+          <w:szCs w:val="22"/>
+        </w:rPr>
+        <w:t xml:space="preserve">  poultryerp://finance/ap → AccountsPayable</w:t>
+      </w:r>
+    </w:p>
+    <w:p>
+      <w:pPr>
+        <w:pStyle w:val="ListParagraph"/>
+        <w:numPr>
+          <w:ilvl w:val="1"/>
+          <w:numId w:val="1"/>
+        </w:numPr>
+        <w:spacing w:after="40"/>
+      </w:pPr>
+      <w:r>
+        <w:rPr>
+          <w:color w:val="1D2D3E"/>
+          <w:sz w:val="22"/>
+          <w:szCs w:val="22"/>
+        </w:rPr>
+        <w:t xml:space="preserve">  poultryerp://finance/ar → AccountsReceivable</w:t>
+      </w:r>
+    </w:p>
+    <w:p>
+      <w:pPr>
+        <w:pStyle w:val="ListParagraph"/>
+        <w:numPr>
+          <w:ilvl w:val="1"/>
+          <w:numId w:val="1"/>
+        </w:numPr>
+        <w:spacing w:after="40"/>
+      </w:pPr>
+      <w:r>
+        <w:rPr>
+          <w:color w:val="1D2D3E"/>
+          <w:sz w:val="22"/>
+          <w:szCs w:val="22"/>
+        </w:rPr>
+        <w:t xml:space="preserve">  poultryerp://finance/journal → JournalEntries</w:t>
+      </w:r>
+    </w:p>
+    <w:p>
+      <w:pPr>
+        <w:pStyle w:val="ListParagraph"/>
+        <w:numPr>
+          <w:ilvl w:val="1"/>
+          <w:numId w:val="1"/>
+        </w:numPr>
+        <w:spacing w:after="40"/>
+      </w:pPr>
+      <w:r>
+        <w:rPr>
+          <w:color w:val="1D2D3E"/>
+          <w:sz w:val="22"/>
+          <w:szCs w:val="22"/>
+        </w:rPr>
+        <w:t xml:space="preserve">  poultryerp://finance/trial-balance → TrialBalance</w:t>
+      </w:r>
+    </w:p>
+    <w:p>
+      <w:pPr>
+        <w:pStyle w:val="ListParagraph"/>
+        <w:numPr>
+          <w:ilvl w:val="1"/>
+          <w:numId w:val="1"/>
+        </w:numPr>
+        <w:spacing w:after="40"/>
+      </w:pPr>
+      <w:r>
+        <w:rPr>
+          <w:color w:val="1D2D3E"/>
+          <w:sz w:val="22"/>
+          <w:szCs w:val="22"/>
+        </w:rPr>
+        <w:t xml:space="preserve">  poultryerp://finance/reports → FinancialReports</w:t>
+      </w:r>
+    </w:p>
+    <w:p>
+      <w:pPr>
+        <w:pStyle w:val="ListParagraph"/>
+        <w:numPr>
+          <w:ilvl w:val="1"/>
+          <w:numId w:val="1"/>
+        </w:numPr>
+        <w:spacing w:after="40"/>
+      </w:pPr>
+      <w:r>
+        <w:rPr>
+          <w:color w:val="1D2D3E"/>
+          <w:sz w:val="22"/>
+          <w:szCs w:val="22"/>
+        </w:rPr>
+        <w:t xml:space="preserve">  poultryerp://materials → Materials screen</w:t>
+      </w:r>
+    </w:p>
+    <w:p>
+      <w:pPr>
+        <w:pStyle w:val="ListParagraph"/>
+        <w:numPr>
+          <w:ilvl w:val="1"/>
+          <w:numId w:val="1"/>
+        </w:numPr>
+        <w:spacing w:after="40"/>
+      </w:pPr>
+      <w:r>
+        <w:rPr>
+          <w:color w:val="1D2D3E"/>
+          <w:sz w:val="22"/>
+          <w:szCs w:val="22"/>
+        </w:rPr>
+        <w:t xml:space="preserve">  poultryerp://purchase-orders → PurchaseOrders screen</w:t>
+      </w:r>
+    </w:p>
+    <w:p>
+      <w:pPr>
+        <w:pStyle w:val="ListParagraph"/>
+        <w:numPr>
+          <w:ilvl w:val="1"/>
+          <w:numId w:val="1"/>
+        </w:numPr>
+        <w:spacing w:after="40"/>
+      </w:pPr>
+      <w:r>
+        <w:rPr>
+          <w:color w:val="1D2D3E"/>
+          <w:sz w:val="22"/>
+          <w:szCs w:val="22"/>
+        </w:rPr>
+        <w:t xml:space="preserve">  poultryerp://sales-orders → SalesOrders screen</w:t>
+      </w:r>
+    </w:p>
+    <w:p>
+      <w:pPr>
+        <w:pStyle w:val="ListParagraph"/>
+        <w:numPr>
+          <w:ilvl w:val="1"/>
+          <w:numId w:val="1"/>
+        </w:numPr>
+        <w:spacing w:after="40"/>
+      </w:pPr>
+      <w:r>
+        <w:rPr>
+          <w:color w:val="1D2D3E"/>
+          <w:sz w:val="22"/>
+          <w:szCs w:val="22"/>
+        </w:rPr>
+        <w:t xml:space="preserve">  poultryerp://grn → GRN screen</w:t>
+      </w:r>
+    </w:p>
+    <w:p>
+      <w:pPr>
+        <w:pStyle w:val="ListParagraph"/>
+        <w:numPr>
+          <w:ilvl w:val="1"/>
+          <w:numId w:val="1"/>
+        </w:numPr>
+        <w:spacing w:after="40"/>
+      </w:pPr>
+      <w:r>
+        <w:rPr>
+          <w:color w:val="1D2D3E"/>
+          <w:sz w:val="22"/>
+          <w:szCs w:val="22"/>
+        </w:rPr>
+        <w:t xml:space="preserve">  poultryerp://partners → Partners screen</w:t>
+      </w:r>
+    </w:p>
+    <w:p>
+      <w:pPr>
+        <w:pStyle w:val="ListParagraph"/>
+        <w:numPr>
+          <w:ilvl w:val="1"/>
+          <w:numId w:val="1"/>
+        </w:numPr>
+        <w:spacing w:after="40"/>
+      </w:pPr>
+      <w:r>
+        <w:rPr>
+          <w:color w:val="1D2D3E"/>
+          <w:sz w:val="22"/>
+          <w:szCs w:val="22"/>
+        </w:rPr>
+        <w:t xml:space="preserve">  poultryerp://companies → Companies screen</w:t>
+      </w:r>
+    </w:p>
+    <w:p>
+      <w:pPr>
+        <w:pStyle w:val="ListParagraph"/>
+        <w:numPr>
+          <w:ilvl w:val="1"/>
+          <w:numId w:val="1"/>
+        </w:numPr>
+        <w:spacing w:after="40"/>
+      </w:pPr>
+      <w:r>
+        <w:rPr>
+          <w:color w:val="1D2D3E"/>
+          <w:sz w:val="22"/>
+          <w:szCs w:val="22"/>
+        </w:rPr>
+        <w:t xml:space="preserve">  poultryerp://alerts → Alerts screen</w:t>
+      </w:r>
+    </w:p>
+    <w:p>
+      <w:pPr>
+        <w:pStyle w:val="ListParagraph"/>
+        <w:numPr>
+          <w:ilvl w:val="1"/>
+          <w:numId w:val="1"/>
+        </w:numPr>
+        <w:spacing w:after="40"/>
+      </w:pPr>
+      <w:r>
+        <w:rPr>
+          <w:color w:val="1D2D3E"/>
+          <w:sz w:val="22"/>
+          <w:szCs w:val="22"/>
+        </w:rPr>
+        <w:t xml:space="preserve">  poultryerp://settings → Settings screen</w:t>
+      </w:r>
+    </w:p>
+    <w:p>
+      <w:pPr>
+        <w:pStyle w:val="ListParagraph"/>
+        <w:numPr>
+          <w:ilvl w:val="1"/>
+          <w:numId w:val="1"/>
+        </w:numPr>
+        <w:spacing w:after="40"/>
+      </w:pPr>
+      <w:r>
+        <w:rPr>
+          <w:color w:val="1D2D3E"/>
+          <w:sz w:val="22"/>
+          <w:szCs w:val="22"/>
+        </w:rPr>
+        <w:t xml:space="preserve">  poultryerp://search → Search screen</w:t>
+      </w:r>
+    </w:p>
+    <w:p>
+      <w:pPr>
+        <w:pStyle w:val="ListParagraph"/>
+        <w:numPr>
+          <w:ilvl w:val="0"/>
+          <w:numId w:val="1"/>
+        </w:numPr>
+        <w:spacing w:after="40"/>
+      </w:pPr>
+      <w:r>
+        <w:rPr>
+          <w:color w:val="1D2D3E"/>
+          <w:sz w:val="22"/>
+          <w:szCs w:val="22"/>
+        </w:rPr>
+        <w:t xml:space="preserve">RootNavigator: linking config injected into NavigationContainer when user is authenticated</w:t>
+      </w:r>
+    </w:p>
+    <w:p>
+      <w:pPr>
+        <w:spacing w:after="80"/>
+      </w:pPr>
+      <w:r>
+        <w:rPr>
+          <w:color w:val="1D2D3E"/>
+          <w:sz w:val="22"/>
+          <w:szCs w:val="22"/>
+        </w:rPr>
+        <w:t xml:space="preserve"/>
+      </w:r>
+    </w:p>
+    <w:p>
+      <w:pPr>
+        <w:pStyle w:val="Heading2"/>
+        <w:spacing w:after="120" w:before="300"/>
+      </w:pPr>
+      <w:r>
+        <w:rPr>
+          <w:b/>
+          <w:bCs/>
+          <w:color w:val="1D2D3E"/>
+        </w:rPr>
+        <w:t xml:space="preserve">3.37 PDF Export (Session 16)</w:t>
+      </w:r>
+    </w:p>
+    <w:p>
+      <w:pPr>
+        <w:pStyle w:val="ListParagraph"/>
+        <w:numPr>
+          <w:ilvl w:val="0"/>
+          <w:numId w:val="1"/>
+        </w:numPr>
+        <w:spacing w:after="40"/>
+      </w:pPr>
+      <w:r>
+        <w:rPr>
+          <w:color w:val="1D2D3E"/>
+          <w:sz w:val="22"/>
+          <w:szCs w:val="22"/>
+        </w:rPr>
+        <w:t xml:space="preserve">Install: expo-print + expo-sharing</w:t>
+      </w:r>
+    </w:p>
+    <w:p>
+      <w:pPr>
+        <w:pStyle w:val="ListParagraph"/>
+        <w:numPr>
+          <w:ilvl w:val="0"/>
+          <w:numId w:val="1"/>
+        </w:numPr>
+        <w:spacing w:after="40"/>
+      </w:pPr>
+      <w:r>
+        <w:rPr>
+          <w:color w:val="1D2D3E"/>
+          <w:sz w:val="22"/>
+          <w:szCs w:val="22"/>
+        </w:rPr>
+        <w:t xml:space="preserve">src/utils/pdfExport.ts: shared PDF generation and sharing utility</w:t>
+      </w:r>
+    </w:p>
+    <w:p>
+      <w:pPr>
+        <w:pStyle w:val="ListParagraph"/>
+        <w:numPr>
+          <w:ilvl w:val="0"/>
+          <w:numId w:val="1"/>
+        </w:numPr>
+        <w:spacing w:after="40"/>
+      </w:pPr>
+      <w:r>
+        <w:rPr>
+          <w:color w:val="1D2D3E"/>
+          <w:sz w:val="22"/>
+          <w:szCs w:val="22"/>
+        </w:rPr>
+        <w:t xml:space="preserve">  BASE_CSS: monochrome print stylesheet (clean, no colors — matches app design)</w:t>
+      </w:r>
+    </w:p>
+    <w:p>
+      <w:pPr>
+        <w:pStyle w:val="ListParagraph"/>
+        <w:numPr>
+          <w:ilvl w:val="0"/>
+          <w:numId w:val="1"/>
+        </w:numPr>
+        <w:spacing w:after="40"/>
+      </w:pPr>
+      <w:r>
+        <w:rPr>
+          <w:color w:val="1D2D3E"/>
+          <w:sz w:val="22"/>
+          <w:szCs w:val="22"/>
+        </w:rPr>
+        <w:t xml:space="preserve">  wrapHtml(title, body): wraps HTML body in full page template with CSS and generated-by footer</w:t>
+      </w:r>
+    </w:p>
+    <w:p>
+      <w:pPr>
+        <w:pStyle w:val="ListParagraph"/>
+        <w:numPr>
+          <w:ilvl w:val="0"/>
+          <w:numId w:val="1"/>
+        </w:numPr>
+        <w:spacing w:after="40"/>
+      </w:pPr>
+      <w:r>
+        <w:rPr>
+          <w:color w:val="1D2D3E"/>
+          <w:sz w:val="22"/>
+          <w:szCs w:val="22"/>
+        </w:rPr>
+        <w:t xml:space="preserve">  printAndShare(html, filename): expo-print renders PDF to temp file; expo-sharing opens OS share sheet</w:t>
+      </w:r>
+    </w:p>
+    <w:p>
+      <w:pPr>
+        <w:pStyle w:val="ListParagraph"/>
+        <w:numPr>
+          <w:ilvl w:val="1"/>
+          <w:numId w:val="1"/>
+        </w:numPr>
+        <w:spacing w:after="40"/>
+      </w:pPr>
+      <w:r>
+        <w:rPr>
+          <w:color w:val="1D2D3E"/>
+          <w:sz w:val="22"/>
+          <w:szCs w:val="22"/>
+        </w:rPr>
+        <w:t xml:space="preserve">    — Falls back to expo-print.printAsync (system print dialog) when sharing is unavailable</w:t>
+      </w:r>
+    </w:p>
+    <w:p>
+      <w:pPr>
+        <w:pStyle w:val="ListParagraph"/>
+        <w:numPr>
+          <w:ilvl w:val="1"/>
+          <w:numId w:val="1"/>
+        </w:numPr>
+        <w:spacing w:after="40"/>
+      </w:pPr>
+      <w:r>
+        <w:rPr>
+          <w:color w:val="1D2D3E"/>
+          <w:sz w:val="22"/>
+          <w:szCs w:val="22"/>
+        </w:rPr>
+        <w:t xml:space="preserve">    — Catches all errors and shows Alert to user</w:t>
+      </w:r>
+    </w:p>
+    <w:p>
+      <w:pPr>
+        <w:pStyle w:val="ListParagraph"/>
+        <w:numPr>
+          <w:ilvl w:val="0"/>
+          <w:numId w:val="1"/>
+        </w:numPr>
+        <w:spacing w:after="40"/>
+      </w:pPr>
+      <w:r>
+        <w:rPr>
+          <w:color w:val="1D2D3E"/>
+          <w:sz w:val="22"/>
+          <w:szCs w:val="22"/>
+        </w:rPr>
+        <w:t xml:space="preserve">  exportTrialBalancePDF: styled account table with debit/credit columns, group rows, totals, balanced status</w:t>
+      </w:r>
+    </w:p>
+    <w:p>
+      <w:pPr>
+        <w:pStyle w:val="ListParagraph"/>
+        <w:numPr>
+          <w:ilvl w:val="0"/>
+          <w:numId w:val="1"/>
+        </w:numPr>
+        <w:spacing w:after="40"/>
+      </w:pPr>
+      <w:r>
+        <w:rPr>
+          <w:color w:val="1D2D3E"/>
+          <w:sz w:val="22"/>
+          <w:szCs w:val="22"/>
+        </w:rPr>
+        <w:t xml:space="preserve">  exportPLPDF: summary grid + revenue and expense account tables + Net Income row</w:t>
+      </w:r>
+    </w:p>
+    <w:p>
+      <w:pPr>
+        <w:pStyle w:val="ListParagraph"/>
+        <w:numPr>
+          <w:ilvl w:val="0"/>
+          <w:numId w:val="1"/>
+        </w:numPr>
+        <w:spacing w:after="40"/>
+      </w:pPr>
+      <w:r>
+        <w:rPr>
+          <w:color w:val="1D2D3E"/>
+          <w:sz w:val="22"/>
+          <w:szCs w:val="22"/>
+        </w:rPr>
+        <w:t xml:space="preserve">  exportBSPDF: assets / liabilities / equity tables + L+E total row + imbalance warning</w:t>
+      </w:r>
+    </w:p>
+    <w:p>
+      <w:pPr>
+        <w:pStyle w:val="ListParagraph"/>
+        <w:numPr>
+          <w:ilvl w:val="0"/>
+          <w:numId w:val="1"/>
+        </w:numPr>
+        <w:spacing w:after="40"/>
+      </w:pPr>
+      <w:r>
+        <w:rPr>
+          <w:color w:val="1D2D3E"/>
+          <w:sz w:val="22"/>
+          <w:szCs w:val="22"/>
+        </w:rPr>
+        <w:t xml:space="preserve">  exportJournalEntriesPDF: summary grid (voucher count + total amount) + full entry table with narration and line items</w:t>
+      </w:r>
+    </w:p>
+    <w:p>
+      <w:pPr>
+        <w:pStyle w:val="ListParagraph"/>
+        <w:numPr>
+          <w:ilvl w:val="0"/>
+          <w:numId w:val="1"/>
+        </w:numPr>
+        <w:spacing w:after="40"/>
+      </w:pPr>
+      <w:r>
+        <w:rPr>
+          <w:color w:val="1D2D3E"/>
+          <w:sz w:val="22"/>
+          <w:szCs w:val="22"/>
+        </w:rPr>
+        <w:t xml:space="preserve">TrialBalanceScreen: PDF button (file-text icon) added to header alongside existing Share text button</w:t>
+      </w:r>
+    </w:p>
+    <w:p>
+      <w:pPr>
+        <w:pStyle w:val="ListParagraph"/>
+        <w:numPr>
+          <w:ilvl w:val="0"/>
+          <w:numId w:val="1"/>
+        </w:numPr>
+        <w:spacing w:after="40"/>
+      </w:pPr>
+      <w:r>
+        <w:rPr>
+          <w:color w:val="1D2D3E"/>
+          <w:sz w:val="22"/>
+          <w:szCs w:val="22"/>
+        </w:rPr>
+        <w:t xml:space="preserve">FinancialReportsScreen: PDF button added; dispatches to exportPLPDF or exportBSPDF based on active tab</w:t>
+      </w:r>
+    </w:p>
+    <w:p>
+      <w:pPr>
+        <w:pStyle w:val="ListParagraph"/>
+        <w:numPr>
+          <w:ilvl w:val="0"/>
+          <w:numId w:val="1"/>
+        </w:numPr>
+        <w:spacing w:after="40"/>
+      </w:pPr>
+      <w:r>
+        <w:rPr>
+          <w:color w:val="1D2D3E"/>
+          <w:sz w:val="22"/>
+          <w:szCs w:val="22"/>
+        </w:rPr>
+        <w:t xml:space="preserve">JournalEntriesScreen: PDF button added alongside existing Share text button</w:t>
       </w:r>
     </w:p>
     <w:p>
@@ -12847,6 +13675,544 @@
           </w:p>
         </w:tc>
       </w:tr>
+      <w:tr>
+        <w:tc>
+          <w:tcPr>
+            <w:shd w:color="F0F4F8" w:val="solid"/>
+          </w:tcPr>
+          <w:p>
+            <w:pPr>
+              <w:spacing w:after="40" w:before="40"/>
+            </w:pPr>
+            <w:r>
+              <w:rPr>
+                <w:b w:val="false"/>
+                <w:bCs w:val="false"/>
+                <w:color w:val="1D2D3E"/>
+                <w:sz w:val="20"/>
+                <w:szCs w:val="20"/>
+              </w:rPr>
+              <w:t xml:space="preserve">Session 16</w:t>
+            </w:r>
+          </w:p>
+        </w:tc>
+        <w:tc>
+          <w:tcPr>
+            <w:shd w:color="F0F4F8" w:val="solid"/>
+          </w:tcPr>
+          <w:p>
+            <w:pPr>
+              <w:spacing w:after="40" w:before="40"/>
+            </w:pPr>
+            <w:r>
+              <w:rPr>
+                <w:b w:val="false"/>
+                <w:bCs w:val="false"/>
+                <w:color w:val="1D2D3E"/>
+                <w:sz w:val="20"/>
+                <w:szCs w:val="20"/>
+              </w:rPr>
+              <w:t xml:space="preserve">Configurable notification time — chip picker (6AM–6PM)</w:t>
+            </w:r>
+          </w:p>
+        </w:tc>
+        <w:tc>
+          <w:tcPr>
+            <w:shd w:color="F0F4F8" w:val="solid"/>
+          </w:tcPr>
+          <w:p>
+            <w:pPr>
+              <w:spacing w:after="40" w:before="40"/>
+            </w:pPr>
+            <w:r>
+              <w:rPr>
+                <w:b w:val="false"/>
+                <w:bCs w:val="false"/>
+                <w:color w:val="1D2D3E"/>
+                <w:sz w:val="20"/>
+                <w:szCs w:val="20"/>
+              </w:rPr>
+              <w:t xml:space="preserve">Done</w:t>
+            </w:r>
+          </w:p>
+        </w:tc>
+        <w:tc>
+          <w:tcPr>
+            <w:shd w:color="F0F4F8" w:val="solid"/>
+          </w:tcPr>
+          <w:p>
+            <w:pPr>
+              <w:spacing w:after="40" w:before="40"/>
+            </w:pPr>
+            <w:r>
+              <w:rPr>
+                <w:b w:val="false"/>
+                <w:bCs w:val="false"/>
+                <w:color w:val="1D2D3E"/>
+                <w:sz w:val="20"/>
+                <w:szCs w:val="20"/>
+              </w:rPr>
+              <w:t xml:space="preserve">src/utils/settings.ts</w:t>
+            </w:r>
+          </w:p>
+        </w:tc>
+      </w:tr>
+      <w:tr>
+        <w:tc>
+          <w:p>
+            <w:pPr>
+              <w:spacing w:after="40" w:before="40"/>
+            </w:pPr>
+            <w:r>
+              <w:rPr>
+                <w:b w:val="false"/>
+                <w:bCs w:val="false"/>
+                <w:color w:val="1D2D3E"/>
+                <w:sz w:val="20"/>
+                <w:szCs w:val="20"/>
+              </w:rPr>
+              <w:t xml:space="preserve">Session 16</w:t>
+            </w:r>
+          </w:p>
+        </w:tc>
+        <w:tc>
+          <w:p>
+            <w:pPr>
+              <w:spacing w:after="40" w:before="40"/>
+            </w:pPr>
+            <w:r>
+              <w:rPr>
+                <w:b w:val="false"/>
+                <w:bCs w:val="false"/>
+                <w:color w:val="1D2D3E"/>
+                <w:sz w:val="20"/>
+                <w:szCs w:val="20"/>
+              </w:rPr>
+              <w:t xml:space="preserve">Per-type notification toggles — AP overdue / AR overdue / Low-stock</w:t>
+            </w:r>
+          </w:p>
+        </w:tc>
+        <w:tc>
+          <w:p>
+            <w:pPr>
+              <w:spacing w:after="40" w:before="40"/>
+            </w:pPr>
+            <w:r>
+              <w:rPr>
+                <w:b w:val="false"/>
+                <w:bCs w:val="false"/>
+                <w:color w:val="1D2D3E"/>
+                <w:sz w:val="20"/>
+                <w:szCs w:val="20"/>
+              </w:rPr>
+              <w:t xml:space="preserve">Done</w:t>
+            </w:r>
+          </w:p>
+        </w:tc>
+        <w:tc>
+          <w:p>
+            <w:pPr>
+              <w:spacing w:after="40" w:before="40"/>
+            </w:pPr>
+            <w:r>
+              <w:rPr>
+                <w:b w:val="false"/>
+                <w:bCs w:val="false"/>
+                <w:color w:val="1D2D3E"/>
+                <w:sz w:val="20"/>
+                <w:szCs w:val="20"/>
+              </w:rPr>
+              <w:t xml:space="preserve">src/utils/settings.ts</w:t>
+            </w:r>
+          </w:p>
+        </w:tc>
+      </w:tr>
+      <w:tr>
+        <w:tc>
+          <w:tcPr>
+            <w:shd w:color="F0F4F8" w:val="solid"/>
+          </w:tcPr>
+          <w:p>
+            <w:pPr>
+              <w:spacing w:after="40" w:before="40"/>
+            </w:pPr>
+            <w:r>
+              <w:rPr>
+                <w:b w:val="false"/>
+                <w:bCs w:val="false"/>
+                <w:color w:val="1D2D3E"/>
+                <w:sz w:val="20"/>
+                <w:szCs w:val="20"/>
+              </w:rPr>
+              <w:t xml:space="preserve">Session 16</w:t>
+            </w:r>
+          </w:p>
+        </w:tc>
+        <w:tc>
+          <w:tcPr>
+            <w:shd w:color="F0F4F8" w:val="solid"/>
+          </w:tcPr>
+          <w:p>
+            <w:pPr>
+              <w:spacing w:after="40" w:before="40"/>
+            </w:pPr>
+            <w:r>
+              <w:rPr>
+                <w:b w:val="false"/>
+                <w:bCs w:val="false"/>
+                <w:color w:val="1D2D3E"/>
+                <w:sz w:val="20"/>
+                <w:szCs w:val="20"/>
+              </w:rPr>
+              <w:t xml:space="preserve">Notification tap → Alerts screen navigation</w:t>
+            </w:r>
+          </w:p>
+        </w:tc>
+        <w:tc>
+          <w:tcPr>
+            <w:shd w:color="F0F4F8" w:val="solid"/>
+          </w:tcPr>
+          <w:p>
+            <w:pPr>
+              <w:spacing w:after="40" w:before="40"/>
+            </w:pPr>
+            <w:r>
+              <w:rPr>
+                <w:b w:val="false"/>
+                <w:bCs w:val="false"/>
+                <w:color w:val="1D2D3E"/>
+                <w:sz w:val="20"/>
+                <w:szCs w:val="20"/>
+              </w:rPr>
+              <w:t xml:space="preserve">Done</w:t>
+            </w:r>
+          </w:p>
+        </w:tc>
+        <w:tc>
+          <w:tcPr>
+            <w:shd w:color="F0F4F8" w:val="solid"/>
+          </w:tcPr>
+          <w:p>
+            <w:pPr>
+              <w:spacing w:after="40" w:before="40"/>
+            </w:pPr>
+            <w:r>
+              <w:rPr>
+                <w:b w:val="false"/>
+                <w:bCs w:val="false"/>
+                <w:color w:val="1D2D3E"/>
+                <w:sz w:val="20"/>
+                <w:szCs w:val="20"/>
+              </w:rPr>
+              <w:t xml:space="preserve">expo-notifications listener</w:t>
+            </w:r>
+          </w:p>
+        </w:tc>
+      </w:tr>
+      <w:tr>
+        <w:tc>
+          <w:p>
+            <w:pPr>
+              <w:spacing w:after="40" w:before="40"/>
+            </w:pPr>
+            <w:r>
+              <w:rPr>
+                <w:b w:val="false"/>
+                <w:bCs w:val="false"/>
+                <w:color w:val="1D2D3E"/>
+                <w:sz w:val="20"/>
+                <w:szCs w:val="20"/>
+              </w:rPr>
+              <w:t xml:space="preserve">Session 16</w:t>
+            </w:r>
+          </w:p>
+        </w:tc>
+        <w:tc>
+          <w:p>
+            <w:pPr>
+              <w:spacing w:after="40" w:before="40"/>
+            </w:pPr>
+            <w:r>
+              <w:rPr>
+                <w:b w:val="false"/>
+                <w:bCs w:val="false"/>
+                <w:color w:val="1D2D3E"/>
+                <w:sz w:val="20"/>
+                <w:szCs w:val="20"/>
+              </w:rPr>
+              <w:t xml:space="preserve">Deep link navigation — poultryerp:// URL scheme</w:t>
+            </w:r>
+          </w:p>
+        </w:tc>
+        <w:tc>
+          <w:p>
+            <w:pPr>
+              <w:spacing w:after="40" w:before="40"/>
+            </w:pPr>
+            <w:r>
+              <w:rPr>
+                <w:b w:val="false"/>
+                <w:bCs w:val="false"/>
+                <w:color w:val="1D2D3E"/>
+                <w:sz w:val="20"/>
+                <w:szCs w:val="20"/>
+              </w:rPr>
+              <w:t xml:space="preserve">Done</w:t>
+            </w:r>
+          </w:p>
+        </w:tc>
+        <w:tc>
+          <w:p>
+            <w:pPr>
+              <w:spacing w:after="40" w:before="40"/>
+            </w:pPr>
+            <w:r>
+              <w:rPr>
+                <w:b w:val="false"/>
+                <w:bCs w:val="false"/>
+                <w:color w:val="1D2D3E"/>
+                <w:sz w:val="20"/>
+                <w:szCs w:val="20"/>
+              </w:rPr>
+              <w:t xml:space="preserve">expo-linking + linking.ts</w:t>
+            </w:r>
+          </w:p>
+        </w:tc>
+      </w:tr>
+      <w:tr>
+        <w:tc>
+          <w:tcPr>
+            <w:shd w:color="F0F4F8" w:val="solid"/>
+          </w:tcPr>
+          <w:p>
+            <w:pPr>
+              <w:spacing w:after="40" w:before="40"/>
+            </w:pPr>
+            <w:r>
+              <w:rPr>
+                <w:b w:val="false"/>
+                <w:bCs w:val="false"/>
+                <w:color w:val="1D2D3E"/>
+                <w:sz w:val="20"/>
+                <w:szCs w:val="20"/>
+              </w:rPr>
+              <w:t xml:space="preserve">Session 16</w:t>
+            </w:r>
+          </w:p>
+        </w:tc>
+        <w:tc>
+          <w:tcPr>
+            <w:shd w:color="F0F4F8" w:val="solid"/>
+          </w:tcPr>
+          <w:p>
+            <w:pPr>
+              <w:spacing w:after="40" w:before="40"/>
+            </w:pPr>
+            <w:r>
+              <w:rPr>
+                <w:b w:val="false"/>
+                <w:bCs w:val="false"/>
+                <w:color w:val="1D2D3E"/>
+                <w:sz w:val="20"/>
+                <w:szCs w:val="20"/>
+              </w:rPr>
+              <w:t xml:space="preserve">PDF export — Trial Balance (styled HTML → PDF via expo-print)</w:t>
+            </w:r>
+          </w:p>
+        </w:tc>
+        <w:tc>
+          <w:tcPr>
+            <w:shd w:color="F0F4F8" w:val="solid"/>
+          </w:tcPr>
+          <w:p>
+            <w:pPr>
+              <w:spacing w:after="40" w:before="40"/>
+            </w:pPr>
+            <w:r>
+              <w:rPr>
+                <w:b w:val="false"/>
+                <w:bCs w:val="false"/>
+                <w:color w:val="1D2D3E"/>
+                <w:sz w:val="20"/>
+                <w:szCs w:val="20"/>
+              </w:rPr>
+              <w:t xml:space="preserve">Done</w:t>
+            </w:r>
+          </w:p>
+        </w:tc>
+        <w:tc>
+          <w:tcPr>
+            <w:shd w:color="F0F4F8" w:val="solid"/>
+          </w:tcPr>
+          <w:p>
+            <w:pPr>
+              <w:spacing w:after="40" w:before="40"/>
+            </w:pPr>
+            <w:r>
+              <w:rPr>
+                <w:b w:val="false"/>
+                <w:bCs w:val="false"/>
+                <w:color w:val="1D2D3E"/>
+                <w:sz w:val="20"/>
+                <w:szCs w:val="20"/>
+              </w:rPr>
+              <w:t xml:space="preserve">expo-print + expo-sharing</w:t>
+            </w:r>
+          </w:p>
+        </w:tc>
+      </w:tr>
+      <w:tr>
+        <w:tc>
+          <w:p>
+            <w:pPr>
+              <w:spacing w:after="40" w:before="40"/>
+            </w:pPr>
+            <w:r>
+              <w:rPr>
+                <w:b w:val="false"/>
+                <w:bCs w:val="false"/>
+                <w:color w:val="1D2D3E"/>
+                <w:sz w:val="20"/>
+                <w:szCs w:val="20"/>
+              </w:rPr>
+              <w:t xml:space="preserve">Session 16</w:t>
+            </w:r>
+          </w:p>
+        </w:tc>
+        <w:tc>
+          <w:p>
+            <w:pPr>
+              <w:spacing w:after="40" w:before="40"/>
+            </w:pPr>
+            <w:r>
+              <w:rPr>
+                <w:b w:val="false"/>
+                <w:bCs w:val="false"/>
+                <w:color w:val="1D2D3E"/>
+                <w:sz w:val="20"/>
+                <w:szCs w:val="20"/>
+              </w:rPr>
+              <w:t xml:space="preserve">PDF export — P&amp;L and Balance Sheet reports</w:t>
+            </w:r>
+          </w:p>
+        </w:tc>
+        <w:tc>
+          <w:p>
+            <w:pPr>
+              <w:spacing w:after="40" w:before="40"/>
+            </w:pPr>
+            <w:r>
+              <w:rPr>
+                <w:b w:val="false"/>
+                <w:bCs w:val="false"/>
+                <w:color w:val="1D2D3E"/>
+                <w:sz w:val="20"/>
+                <w:szCs w:val="20"/>
+              </w:rPr>
+              <w:t xml:space="preserve">Done</w:t>
+            </w:r>
+          </w:p>
+        </w:tc>
+        <w:tc>
+          <w:p>
+            <w:pPr>
+              <w:spacing w:after="40" w:before="40"/>
+            </w:pPr>
+            <w:r>
+              <w:rPr>
+                <w:b w:val="false"/>
+                <w:bCs w:val="false"/>
+                <w:color w:val="1D2D3E"/>
+                <w:sz w:val="20"/>
+                <w:szCs w:val="20"/>
+              </w:rPr>
+              <w:t xml:space="preserve">expo-print + expo-sharing</w:t>
+            </w:r>
+          </w:p>
+        </w:tc>
+      </w:tr>
+      <w:tr>
+        <w:tc>
+          <w:tcPr>
+            <w:shd w:color="F0F4F8" w:val="solid"/>
+          </w:tcPr>
+          <w:p>
+            <w:pPr>
+              <w:spacing w:after="40" w:before="40"/>
+            </w:pPr>
+            <w:r>
+              <w:rPr>
+                <w:b w:val="false"/>
+                <w:bCs w:val="false"/>
+                <w:color w:val="1D2D3E"/>
+                <w:sz w:val="20"/>
+                <w:szCs w:val="20"/>
+              </w:rPr>
+              <w:t xml:space="preserve">Session 16</w:t>
+            </w:r>
+          </w:p>
+        </w:tc>
+        <w:tc>
+          <w:tcPr>
+            <w:shd w:color="F0F4F8" w:val="solid"/>
+          </w:tcPr>
+          <w:p>
+            <w:pPr>
+              <w:spacing w:after="40" w:before="40"/>
+            </w:pPr>
+            <w:r>
+              <w:rPr>
+                <w:b w:val="false"/>
+                <w:bCs w:val="false"/>
+                <w:color w:val="1D2D3E"/>
+                <w:sz w:val="20"/>
+                <w:szCs w:val="20"/>
+              </w:rPr>
+              <w:t xml:space="preserve">PDF export — Journal Entries with line items</w:t>
+            </w:r>
+          </w:p>
+        </w:tc>
+        <w:tc>
+          <w:tcPr>
+            <w:shd w:color="F0F4F8" w:val="solid"/>
+          </w:tcPr>
+          <w:p>
+            <w:pPr>
+              <w:spacing w:after="40" w:before="40"/>
+            </w:pPr>
+            <w:r>
+              <w:rPr>
+                <w:b w:val="false"/>
+                <w:bCs w:val="false"/>
+                <w:color w:val="1D2D3E"/>
+                <w:sz w:val="20"/>
+                <w:szCs w:val="20"/>
+              </w:rPr>
+              <w:t xml:space="preserve">Done</w:t>
+            </w:r>
+          </w:p>
+        </w:tc>
+        <w:tc>
+          <w:tcPr>
+            <w:shd w:color="F0F4F8" w:val="solid"/>
+          </w:tcPr>
+          <w:p>
+            <w:pPr>
+              <w:spacing w:after="40" w:before="40"/>
+            </w:pPr>
+            <w:r>
+              <w:rPr>
+                <w:b w:val="false"/>
+                <w:bCs w:val="false"/>
+                <w:color w:val="1D2D3E"/>
+                <w:sz w:val="20"/>
+                <w:szCs w:val="20"/>
+              </w:rPr>
+              <w:t xml:space="preserve">expo-print + expo-sharing</w:t>
+            </w:r>
+          </w:p>
+        </w:tc>
+      </w:tr>
     </w:tbl>
     <w:p>
       <w:pPr>
@@ -13396,7 +14762,25 @@
           <w:sz w:val="22"/>
           <w:szCs w:val="22"/>
         </w:rPr>
-        <w:t xml:space="preserve">notifications.ts — requestNotificationPermissions, scheduleOverdueReminder, cancelOverdueReminder, getNotificationsEnabled/setNotificationsEnabled (Session 15)</w:t>
+        <w:t xml:space="preserve">notifications.ts — requestNotificationPermissions, scheduleOverdueReminder (per-type + configurable hour), cancelOverdueReminder, getNotificationsEnabled/setNotificationsEnabled (Sessions 15–16)</w:t>
+      </w:r>
+    </w:p>
+    <w:p>
+      <w:pPr>
+        <w:pStyle w:val="ListParagraph"/>
+        <w:numPr>
+          <w:ilvl w:val="1"/>
+          <w:numId w:val="1"/>
+        </w:numPr>
+        <w:spacing w:after="40"/>
+      </w:pPr>
+      <w:r>
+        <w:rPr>
+          <w:color w:val="1D2D3E"/>
+          <w:sz w:val="22"/>
+          <w:szCs w:val="22"/>
+        </w:rPr>
+        <w:t xml:space="preserve">pdfExport.ts — exportTrialBalancePDF, exportPLPDF, exportBSPDF, exportJournalEntriesPDF via expo-print + expo-sharing (Session 16)</w:t>
       </w:r>
     </w:p>
     <w:p>
@@ -13433,6 +14817,24 @@
           <w:szCs w:val="22"/>
         </w:rPr>
         <w:t xml:space="preserve">useSessionTimeout.ts — AppState-based session lock hook; triggers onTimeout when background exceeds configured limit (Session 14)</w:t>
+      </w:r>
+    </w:p>
+    <w:p>
+      <w:pPr>
+        <w:pStyle w:val="ListParagraph"/>
+        <w:numPr>
+          <w:ilvl w:val="0"/>
+          <w:numId w:val="1"/>
+        </w:numPr>
+        <w:spacing w:after="40"/>
+      </w:pPr>
+      <w:r>
+        <w:rPr>
+          <w:color w:val="1D2D3E"/>
+          <w:sz w:val="22"/>
+          <w:szCs w:val="22"/>
+        </w:rPr>
+        <w:t xml:space="preserve">src/navigation/linking.ts — React Navigation LinkingOptions mapping poultryerp:// URLs to screen names (Session 16)</w:t>
       </w:r>
     </w:p>
     <w:p>
@@ -16417,6 +17819,357 @@
           <w:szCs w:val="22"/>
         </w:rPr>
         <w:t xml:space="preserve">AccountsReceivableScreen: same AgingChart migration</w:t>
+      </w:r>
+    </w:p>
+    <w:p>
+      <w:pPr>
+        <w:spacing w:after="80"/>
+      </w:pPr>
+      <w:r>
+        <w:rPr>
+          <w:color w:val="1D2D3E"/>
+          <w:sz w:val="22"/>
+          <w:szCs w:val="22"/>
+        </w:rPr>
+        <w:t xml:space="preserve"/>
+      </w:r>
+    </w:p>
+    <w:p>
+      <w:pPr>
+        <w:pStyle w:val="Heading2"/>
+        <w:spacing w:after="120" w:before="300"/>
+      </w:pPr>
+      <w:r>
+        <w:rPr>
+          <w:b/>
+          <w:bCs/>
+          <w:color w:val="1D2D3E"/>
+        </w:rPr>
+        <w:t xml:space="preserve">Session 16 — 2026-05-24</w:t>
+      </w:r>
+    </w:p>
+    <w:p>
+      <w:pPr>
+        <w:pStyle w:val="ListParagraph"/>
+        <w:numPr>
+          <w:ilvl w:val="0"/>
+          <w:numId w:val="1"/>
+        </w:numPr>
+        <w:spacing w:after="40"/>
+      </w:pPr>
+      <w:r>
+        <w:rPr>
+          <w:color w:val="1D2D3E"/>
+          <w:sz w:val="22"/>
+          <w:szCs w:val="22"/>
+        </w:rPr>
+        <w:t xml:space="preserve">Notification improvements — configurable time and per-type toggles</w:t>
+      </w:r>
+    </w:p>
+    <w:p>
+      <w:pPr>
+        <w:pStyle w:val="ListParagraph"/>
+        <w:numPr>
+          <w:ilvl w:val="1"/>
+          <w:numId w:val="1"/>
+        </w:numPr>
+        <w:spacing w:after="40"/>
+      </w:pPr>
+      <w:r>
+        <w:rPr>
+          <w:color w:val="1D2D3E"/>
+          <w:sz w:val="22"/>
+          <w:szCs w:val="22"/>
+        </w:rPr>
+        <w:t xml:space="preserve">  settings.ts: 4 new settings keys — notificationHour, notifyApOverdue, notifyArOverdue, notifyLowStock</w:t>
+      </w:r>
+    </w:p>
+    <w:p>
+      <w:pPr>
+        <w:pStyle w:val="ListParagraph"/>
+        <w:numPr>
+          <w:ilvl w:val="1"/>
+          <w:numId w:val="1"/>
+        </w:numPr>
+        <w:spacing w:after="40"/>
+      </w:pPr>
+      <w:r>
+        <w:rPr>
+          <w:color w:val="1D2D3E"/>
+          <w:sz w:val="22"/>
+          <w:szCs w:val="22"/>
+        </w:rPr>
+        <w:t xml:space="preserve">  notifications.ts: scheduleOverdueReminder now reads per-type settings — filters disabled types from notification body; uses configured hour instead of hardcoded 9 AM</w:t>
+      </w:r>
+    </w:p>
+    <w:p>
+      <w:pPr>
+        <w:pStyle w:val="ListParagraph"/>
+        <w:numPr>
+          <w:ilvl w:val="1"/>
+          <w:numId w:val="1"/>
+        </w:numPr>
+        <w:spacing w:after="40"/>
+      </w:pPr>
+      <w:r>
+        <w:rPr>
+          <w:color w:val="1D2D3E"/>
+          <w:sz w:val="22"/>
+          <w:szCs w:val="22"/>
+        </w:rPr>
+        <w:t xml:space="preserve">  SettingsScreen: new NOTIFICATIONS section with master toggle, 8-option time picker, and 3 per-type Switches (AP/AR/Stock)</w:t>
+      </w:r>
+    </w:p>
+    <w:p>
+      <w:pPr>
+        <w:pStyle w:val="ListParagraph"/>
+        <w:numPr>
+          <w:ilvl w:val="1"/>
+          <w:numId w:val="1"/>
+        </w:numPr>
+        <w:spacing w:after="40"/>
+      </w:pPr>
+      <w:r>
+        <w:rPr>
+          <w:color w:val="1D2D3E"/>
+          <w:sz w:val="22"/>
+          <w:szCs w:val="22"/>
+        </w:rPr>
+        <w:t xml:space="preserve">  Per-type controls are only visible when the master Overdue reminders toggle is on</w:t>
+      </w:r>
+    </w:p>
+    <w:p>
+      <w:pPr>
+        <w:pStyle w:val="ListParagraph"/>
+        <w:numPr>
+          <w:ilvl w:val="1"/>
+          <w:numId w:val="1"/>
+        </w:numPr>
+        <w:spacing w:after="40"/>
+      </w:pPr>
+      <w:r>
+        <w:rPr>
+          <w:color w:val="1D2D3E"/>
+          <w:sz w:val="22"/>
+          <w:szCs w:val="22"/>
+        </w:rPr>
+        <w:t xml:space="preserve">  AppNavigator: addNotificationResponseReceivedListener — tapping the daily reminder navigates to Alerts screen</w:t>
+      </w:r>
+    </w:p>
+    <w:p>
+      <w:pPr>
+        <w:pStyle w:val="ListParagraph"/>
+        <w:numPr>
+          <w:ilvl w:val="0"/>
+          <w:numId w:val="1"/>
+        </w:numPr>
+        <w:spacing w:after="40"/>
+      </w:pPr>
+      <w:r>
+        <w:rPr>
+          <w:color w:val="1D2D3E"/>
+          <w:sz w:val="22"/>
+          <w:szCs w:val="22"/>
+        </w:rPr>
+        <w:t xml:space="preserve">Deep link navigation (poultryerp:// URL scheme)</w:t>
+      </w:r>
+    </w:p>
+    <w:p>
+      <w:pPr>
+        <w:pStyle w:val="ListParagraph"/>
+        <w:numPr>
+          <w:ilvl w:val="1"/>
+          <w:numId w:val="1"/>
+        </w:numPr>
+        <w:spacing w:after="40"/>
+      </w:pPr>
+      <w:r>
+        <w:rPr>
+          <w:color w:val="1D2D3E"/>
+          <w:sz w:val="22"/>
+          <w:szCs w:val="22"/>
+        </w:rPr>
+        <w:t xml:space="preserve">  app.json: added scheme 'poultryerp'</w:t>
+      </w:r>
+    </w:p>
+    <w:p>
+      <w:pPr>
+        <w:pStyle w:val="ListParagraph"/>
+        <w:numPr>
+          <w:ilvl w:val="1"/>
+          <w:numId w:val="1"/>
+        </w:numPr>
+        <w:spacing w:after="40"/>
+      </w:pPr>
+      <w:r>
+        <w:rPr>
+          <w:color w:val="1D2D3E"/>
+          <w:sz w:val="22"/>
+          <w:szCs w:val="22"/>
+        </w:rPr>
+        <w:t xml:space="preserve">  expo-linking installed</w:t>
+      </w:r>
+    </w:p>
+    <w:p>
+      <w:pPr>
+        <w:pStyle w:val="ListParagraph"/>
+        <w:numPr>
+          <w:ilvl w:val="1"/>
+          <w:numId w:val="1"/>
+        </w:numPr>
+        <w:spacing w:after="40"/>
+      </w:pPr>
+      <w:r>
+        <w:rPr>
+          <w:color w:val="1D2D3E"/>
+          <w:sz w:val="22"/>
+          <w:szCs w:val="22"/>
+        </w:rPr>
+        <w:t xml:space="preserve">  src/navigation/linking.ts: LinkingOptions mapping 17 URL paths to screen names across all tab navigators</w:t>
+      </w:r>
+    </w:p>
+    <w:p>
+      <w:pPr>
+        <w:pStyle w:val="ListParagraph"/>
+        <w:numPr>
+          <w:ilvl w:val="1"/>
+          <w:numId w:val="1"/>
+        </w:numPr>
+        <w:spacing w:after="40"/>
+      </w:pPr>
+      <w:r>
+        <w:rPr>
+          <w:color w:val="1D2D3E"/>
+          <w:sz w:val="22"/>
+          <w:szCs w:val="22"/>
+        </w:rPr>
+        <w:t xml:space="preserve">  RootNavigator: NavigationContainer now receives linking config when user is authenticated</w:t>
+      </w:r>
+    </w:p>
+    <w:p>
+      <w:pPr>
+        <w:pStyle w:val="ListParagraph"/>
+        <w:numPr>
+          <w:ilvl w:val="0"/>
+          <w:numId w:val="1"/>
+        </w:numPr>
+        <w:spacing w:after="40"/>
+      </w:pPr>
+      <w:r>
+        <w:rPr>
+          <w:color w:val="1D2D3E"/>
+          <w:sz w:val="22"/>
+          <w:szCs w:val="22"/>
+        </w:rPr>
+        <w:t xml:space="preserve">PDF export for financial reports</w:t>
+      </w:r>
+    </w:p>
+    <w:p>
+      <w:pPr>
+        <w:pStyle w:val="ListParagraph"/>
+        <w:numPr>
+          <w:ilvl w:val="1"/>
+          <w:numId w:val="1"/>
+        </w:numPr>
+        <w:spacing w:after="40"/>
+      </w:pPr>
+      <w:r>
+        <w:rPr>
+          <w:color w:val="1D2D3E"/>
+          <w:sz w:val="22"/>
+          <w:szCs w:val="22"/>
+        </w:rPr>
+        <w:t xml:space="preserve">  expo-print + expo-sharing installed</w:t>
+      </w:r>
+    </w:p>
+    <w:p>
+      <w:pPr>
+        <w:pStyle w:val="ListParagraph"/>
+        <w:numPr>
+          <w:ilvl w:val="1"/>
+          <w:numId w:val="1"/>
+        </w:numPr>
+        <w:spacing w:after="40"/>
+      </w:pPr>
+      <w:r>
+        <w:rPr>
+          <w:color w:val="1D2D3E"/>
+          <w:sz w:val="22"/>
+          <w:szCs w:val="22"/>
+        </w:rPr>
+        <w:t xml:space="preserve">  src/utils/pdfExport.ts: 4 export functions — exportTrialBalancePDF, exportPLPDF, exportBSPDF, exportJournalEntriesPDF</w:t>
+      </w:r>
+    </w:p>
+    <w:p>
+      <w:pPr>
+        <w:pStyle w:val="ListParagraph"/>
+        <w:numPr>
+          <w:ilvl w:val="1"/>
+          <w:numId w:val="1"/>
+        </w:numPr>
+        <w:spacing w:after="40"/>
+      </w:pPr>
+      <w:r>
+        <w:rPr>
+          <w:color w:val="1D2D3E"/>
+          <w:sz w:val="22"/>
+          <w:szCs w:val="22"/>
+        </w:rPr>
+        <w:t xml:space="preserve">  All use shared BASE_CSS (monochrome print stylesheet) + printAndShare helper (PDF → OS share sheet)</w:t>
+      </w:r>
+    </w:p>
+    <w:p>
+      <w:pPr>
+        <w:pStyle w:val="ListParagraph"/>
+        <w:numPr>
+          <w:ilvl w:val="1"/>
+          <w:numId w:val="1"/>
+        </w:numPr>
+        <w:spacing w:after="40"/>
+      </w:pPr>
+      <w:r>
+        <w:rPr>
+          <w:color w:val="1D2D3E"/>
+          <w:sz w:val="22"/>
+          <w:szCs w:val="22"/>
+        </w:rPr>
+        <w:t xml:space="preserve">  TrialBalanceScreen: PDF button (file-text) added alongside existing Share text button</w:t>
+      </w:r>
+    </w:p>
+    <w:p>
+      <w:pPr>
+        <w:pStyle w:val="ListParagraph"/>
+        <w:numPr>
+          <w:ilvl w:val="1"/>
+          <w:numId w:val="1"/>
+        </w:numPr>
+        <w:spacing w:after="40"/>
+      </w:pPr>
+      <w:r>
+        <w:rPr>
+          <w:color w:val="1D2D3E"/>
+          <w:sz w:val="22"/>
+          <w:szCs w:val="22"/>
+        </w:rPr>
+        <w:t xml:space="preserve">  FinancialReportsScreen: PDF button dispatches to P&amp;L or BS based on active tab</w:t>
+      </w:r>
+    </w:p>
+    <w:p>
+      <w:pPr>
+        <w:pStyle w:val="ListParagraph"/>
+        <w:numPr>
+          <w:ilvl w:val="1"/>
+          <w:numId w:val="1"/>
+        </w:numPr>
+        <w:spacing w:after="40"/>
+      </w:pPr>
+      <w:r>
+        <w:rPr>
+          <w:color w:val="1D2D3E"/>
+          <w:sz w:val="22"/>
+          <w:szCs w:val="22"/>
+        </w:rPr>
+        <w:t xml:space="preserve">  JournalEntriesScreen: PDF button added — export includes summary grid + full entry table with line items</w:t>
       </w:r>
     </w:p>
     <w:p>

</xml_diff>

<commit_message>
docs: update PROGRESS.md, FEATURES.docx, generate-docs.js for Session 17
Session 17 additions documented:
- In-app notification inbox (notificationLog.ts + InboxScreen)
- More tab inbox badge + MoreMenuScreen side-by-side Alerts/Inbox banners
- Dashboard inbox quick action tile + unread notification banner
- Batch PDF export (exportCombinedReportPDF — TB + P&L + BS in one file)
- Stock balances PDF export (exportStockBalancePDF)
- Bundle button on TrialBalance + FinancialReports screens
- Updated What's Next to Session 18+
</commit_message>
<xml_diff>
--- a/FEATURES.docx
+++ b/FEATURES.docx
@@ -45,7 +45,7 @@
           <w:sz w:val="20"/>
           <w:szCs w:val="20"/>
         </w:rPr>
-        <w:t xml:space="preserve">Generated: 2026-05-24</w:t>
+        <w:t xml:space="preserve">Generated: 2026-05-25</w:t>
       </w:r>
     </w:p>
     <w:p>
@@ -14213,6 +14213,532 @@
           </w:p>
         </w:tc>
       </w:tr>
+      <w:tr>
+        <w:tc>
+          <w:p>
+            <w:pPr>
+              <w:spacing w:after="40" w:before="40"/>
+            </w:pPr>
+            <w:r>
+              <w:rPr>
+                <w:b w:val="false"/>
+                <w:bCs w:val="false"/>
+                <w:color w:val="1D2D3E"/>
+                <w:sz w:val="20"/>
+                <w:szCs w:val="20"/>
+              </w:rPr>
+              <w:t xml:space="preserve">Session 17</w:t>
+            </w:r>
+          </w:p>
+        </w:tc>
+        <w:tc>
+          <w:p>
+            <w:pPr>
+              <w:spacing w:after="40" w:before="40"/>
+            </w:pPr>
+            <w:r>
+              <w:rPr>
+                <w:b w:val="false"/>
+                <w:bCs w:val="false"/>
+                <w:color w:val="1D2D3E"/>
+                <w:sz w:val="20"/>
+                <w:szCs w:val="20"/>
+              </w:rPr>
+              <w:t xml:space="preserve">In-app notification inbox (history log, unread badge, clear all)</w:t>
+            </w:r>
+          </w:p>
+        </w:tc>
+        <w:tc>
+          <w:p>
+            <w:pPr>
+              <w:spacing w:after="40" w:before="40"/>
+            </w:pPr>
+            <w:r>
+              <w:rPr>
+                <w:b w:val="false"/>
+                <w:bCs w:val="false"/>
+                <w:color w:val="1D2D3E"/>
+                <w:sz w:val="20"/>
+                <w:szCs w:val="20"/>
+              </w:rPr>
+              <w:t xml:space="preserve">Done</w:t>
+            </w:r>
+          </w:p>
+        </w:tc>
+        <w:tc>
+          <w:p>
+            <w:pPr>
+              <w:spacing w:after="40" w:before="40"/>
+            </w:pPr>
+            <w:r>
+              <w:rPr>
+                <w:b w:val="false"/>
+                <w:bCs w:val="false"/>
+                <w:color w:val="1D2D3E"/>
+                <w:sz w:val="20"/>
+                <w:szCs w:val="20"/>
+              </w:rPr>
+              <w:t xml:space="preserve">src/utils/notificationLog.ts</w:t>
+            </w:r>
+          </w:p>
+        </w:tc>
+      </w:tr>
+      <w:tr>
+        <w:tc>
+          <w:tcPr>
+            <w:shd w:color="F0F4F8" w:val="solid"/>
+          </w:tcPr>
+          <w:p>
+            <w:pPr>
+              <w:spacing w:after="40" w:before="40"/>
+            </w:pPr>
+            <w:r>
+              <w:rPr>
+                <w:b w:val="false"/>
+                <w:bCs w:val="false"/>
+                <w:color w:val="1D2D3E"/>
+                <w:sz w:val="20"/>
+                <w:szCs w:val="20"/>
+              </w:rPr>
+              <w:t xml:space="preserve">Session 17</w:t>
+            </w:r>
+          </w:p>
+        </w:tc>
+        <w:tc>
+          <w:tcPr>
+            <w:shd w:color="F0F4F8" w:val="solid"/>
+          </w:tcPr>
+          <w:p>
+            <w:pPr>
+              <w:spacing w:after="40" w:before="40"/>
+            </w:pPr>
+            <w:r>
+              <w:rPr>
+                <w:b w:val="false"/>
+                <w:bCs w:val="false"/>
+                <w:color w:val="1D2D3E"/>
+                <w:sz w:val="20"/>
+                <w:szCs w:val="20"/>
+              </w:rPr>
+              <w:t xml:space="preserve">Inbox screen with unread entry highlighting and breakdown chips</w:t>
+            </w:r>
+          </w:p>
+        </w:tc>
+        <w:tc>
+          <w:tcPr>
+            <w:shd w:color="F0F4F8" w:val="solid"/>
+          </w:tcPr>
+          <w:p>
+            <w:pPr>
+              <w:spacing w:after="40" w:before="40"/>
+            </w:pPr>
+            <w:r>
+              <w:rPr>
+                <w:b w:val="false"/>
+                <w:bCs w:val="false"/>
+                <w:color w:val="1D2D3E"/>
+                <w:sz w:val="20"/>
+                <w:szCs w:val="20"/>
+              </w:rPr>
+              <w:t xml:space="preserve">Done</w:t>
+            </w:r>
+          </w:p>
+        </w:tc>
+        <w:tc>
+          <w:tcPr>
+            <w:shd w:color="F0F4F8" w:val="solid"/>
+          </w:tcPr>
+          <w:p>
+            <w:pPr>
+              <w:spacing w:after="40" w:before="40"/>
+            </w:pPr>
+            <w:r>
+              <w:rPr>
+                <w:b w:val="false"/>
+                <w:bCs w:val="false"/>
+                <w:color w:val="1D2D3E"/>
+                <w:sz w:val="20"/>
+                <w:szCs w:val="20"/>
+              </w:rPr>
+              <w:t xml:space="preserve">src/screens/inbox/InboxScreen.tsx</w:t>
+            </w:r>
+          </w:p>
+        </w:tc>
+      </w:tr>
+      <w:tr>
+        <w:tc>
+          <w:p>
+            <w:pPr>
+              <w:spacing w:after="40" w:before="40"/>
+            </w:pPr>
+            <w:r>
+              <w:rPr>
+                <w:b w:val="false"/>
+                <w:bCs w:val="false"/>
+                <w:color w:val="1D2D3E"/>
+                <w:sz w:val="20"/>
+                <w:szCs w:val="20"/>
+              </w:rPr>
+              <w:t xml:space="preserve">Session 17</w:t>
+            </w:r>
+          </w:p>
+        </w:tc>
+        <w:tc>
+          <w:p>
+            <w:pPr>
+              <w:spacing w:after="40" w:before="40"/>
+            </w:pPr>
+            <w:r>
+              <w:rPr>
+                <w:b w:val="false"/>
+                <w:bCs w:val="false"/>
+                <w:color w:val="1D2D3E"/>
+                <w:sz w:val="20"/>
+                <w:szCs w:val="20"/>
+              </w:rPr>
+              <w:t xml:space="preserve">More tab badge showing unread inbox count</w:t>
+            </w:r>
+          </w:p>
+        </w:tc>
+        <w:tc>
+          <w:p>
+            <w:pPr>
+              <w:spacing w:after="40" w:before="40"/>
+            </w:pPr>
+            <w:r>
+              <w:rPr>
+                <w:b w:val="false"/>
+                <w:bCs w:val="false"/>
+                <w:color w:val="1D2D3E"/>
+                <w:sz w:val="20"/>
+                <w:szCs w:val="20"/>
+              </w:rPr>
+              <w:t xml:space="preserve">Done</w:t>
+            </w:r>
+          </w:p>
+        </w:tc>
+        <w:tc>
+          <w:p>
+            <w:pPr>
+              <w:spacing w:after="40" w:before="40"/>
+            </w:pPr>
+            <w:r>
+              <w:rPr>
+                <w:b w:val="false"/>
+                <w:bCs w:val="false"/>
+                <w:color w:val="1D2D3E"/>
+                <w:sz w:val="20"/>
+                <w:szCs w:val="20"/>
+              </w:rPr>
+              <w:t xml:space="preserve">AppNavigator.tsx</w:t>
+            </w:r>
+          </w:p>
+        </w:tc>
+      </w:tr>
+      <w:tr>
+        <w:tc>
+          <w:tcPr>
+            <w:shd w:color="F0F4F8" w:val="solid"/>
+          </w:tcPr>
+          <w:p>
+            <w:pPr>
+              <w:spacing w:after="40" w:before="40"/>
+            </w:pPr>
+            <w:r>
+              <w:rPr>
+                <w:b w:val="false"/>
+                <w:bCs w:val="false"/>
+                <w:color w:val="1D2D3E"/>
+                <w:sz w:val="20"/>
+                <w:szCs w:val="20"/>
+              </w:rPr>
+              <w:t xml:space="preserve">Session 17</w:t>
+            </w:r>
+          </w:p>
+        </w:tc>
+        <w:tc>
+          <w:tcPr>
+            <w:shd w:color="F0F4F8" w:val="solid"/>
+          </w:tcPr>
+          <w:p>
+            <w:pPr>
+              <w:spacing w:after="40" w:before="40"/>
+            </w:pPr>
+            <w:r>
+              <w:rPr>
+                <w:b w:val="false"/>
+                <w:bCs w:val="false"/>
+                <w:color w:val="1D2D3E"/>
+                <w:sz w:val="20"/>
+                <w:szCs w:val="20"/>
+              </w:rPr>
+              <w:t xml:space="preserve">Dashboard Inbox quick action tile + unread notification banner</w:t>
+            </w:r>
+          </w:p>
+        </w:tc>
+        <w:tc>
+          <w:tcPr>
+            <w:shd w:color="F0F4F8" w:val="solid"/>
+          </w:tcPr>
+          <w:p>
+            <w:pPr>
+              <w:spacing w:after="40" w:before="40"/>
+            </w:pPr>
+            <w:r>
+              <w:rPr>
+                <w:b w:val="false"/>
+                <w:bCs w:val="false"/>
+                <w:color w:val="1D2D3E"/>
+                <w:sz w:val="20"/>
+                <w:szCs w:val="20"/>
+              </w:rPr>
+              <w:t xml:space="preserve">Done</w:t>
+            </w:r>
+          </w:p>
+        </w:tc>
+        <w:tc>
+          <w:tcPr>
+            <w:shd w:color="F0F4F8" w:val="solid"/>
+          </w:tcPr>
+          <w:p>
+            <w:pPr>
+              <w:spacing w:after="40" w:before="40"/>
+            </w:pPr>
+            <w:r>
+              <w:rPr>
+                <w:b w:val="false"/>
+                <w:bCs w:val="false"/>
+                <w:color w:val="1D2D3E"/>
+                <w:sz w:val="20"/>
+                <w:szCs w:val="20"/>
+              </w:rPr>
+              <w:t xml:space="preserve">DashboardScreen.tsx</w:t>
+            </w:r>
+          </w:p>
+        </w:tc>
+      </w:tr>
+      <w:tr>
+        <w:tc>
+          <w:p>
+            <w:pPr>
+              <w:spacing w:after="40" w:before="40"/>
+            </w:pPr>
+            <w:r>
+              <w:rPr>
+                <w:b w:val="false"/>
+                <w:bCs w:val="false"/>
+                <w:color w:val="1D2D3E"/>
+                <w:sz w:val="20"/>
+                <w:szCs w:val="20"/>
+              </w:rPr>
+              <w:t xml:space="preserve">Session 17</w:t>
+            </w:r>
+          </w:p>
+        </w:tc>
+        <w:tc>
+          <w:p>
+            <w:pPr>
+              <w:spacing w:after="40" w:before="40"/>
+            </w:pPr>
+            <w:r>
+              <w:rPr>
+                <w:b w:val="false"/>
+                <w:bCs w:val="false"/>
+                <w:color w:val="1D2D3E"/>
+                <w:sz w:val="20"/>
+                <w:szCs w:val="20"/>
+              </w:rPr>
+              <w:t xml:space="preserve">Batch PDF export — combined Trial Balance + P&amp;L + Balance Sheet</w:t>
+            </w:r>
+          </w:p>
+        </w:tc>
+        <w:tc>
+          <w:p>
+            <w:pPr>
+              <w:spacing w:after="40" w:before="40"/>
+            </w:pPr>
+            <w:r>
+              <w:rPr>
+                <w:b w:val="false"/>
+                <w:bCs w:val="false"/>
+                <w:color w:val="1D2D3E"/>
+                <w:sz w:val="20"/>
+                <w:szCs w:val="20"/>
+              </w:rPr>
+              <w:t xml:space="preserve">Done</w:t>
+            </w:r>
+          </w:p>
+        </w:tc>
+        <w:tc>
+          <w:p>
+            <w:pPr>
+              <w:spacing w:after="40" w:before="40"/>
+            </w:pPr>
+            <w:r>
+              <w:rPr>
+                <w:b w:val="false"/>
+                <w:bCs w:val="false"/>
+                <w:color w:val="1D2D3E"/>
+                <w:sz w:val="20"/>
+                <w:szCs w:val="20"/>
+              </w:rPr>
+              <w:t xml:space="preserve">pdfExport.ts exportCombinedReportPDF</w:t>
+            </w:r>
+          </w:p>
+        </w:tc>
+      </w:tr>
+      <w:tr>
+        <w:tc>
+          <w:tcPr>
+            <w:shd w:color="F0F4F8" w:val="solid"/>
+          </w:tcPr>
+          <w:p>
+            <w:pPr>
+              <w:spacing w:after="40" w:before="40"/>
+            </w:pPr>
+            <w:r>
+              <w:rPr>
+                <w:b w:val="false"/>
+                <w:bCs w:val="false"/>
+                <w:color w:val="1D2D3E"/>
+                <w:sz w:val="20"/>
+                <w:szCs w:val="20"/>
+              </w:rPr>
+              <w:t xml:space="preserve">Session 17</w:t>
+            </w:r>
+          </w:p>
+        </w:tc>
+        <w:tc>
+          <w:tcPr>
+            <w:shd w:color="F0F4F8" w:val="solid"/>
+          </w:tcPr>
+          <w:p>
+            <w:pPr>
+              <w:spacing w:after="40" w:before="40"/>
+            </w:pPr>
+            <w:r>
+              <w:rPr>
+                <w:b w:val="false"/>
+                <w:bCs w:val="false"/>
+                <w:color w:val="1D2D3E"/>
+                <w:sz w:val="20"/>
+                <w:szCs w:val="20"/>
+              </w:rPr>
+              <w:t xml:space="preserve">Bundle button in Trial Balance + Financial Reports screens</w:t>
+            </w:r>
+          </w:p>
+        </w:tc>
+        <w:tc>
+          <w:tcPr>
+            <w:shd w:color="F0F4F8" w:val="solid"/>
+          </w:tcPr>
+          <w:p>
+            <w:pPr>
+              <w:spacing w:after="40" w:before="40"/>
+            </w:pPr>
+            <w:r>
+              <w:rPr>
+                <w:b w:val="false"/>
+                <w:bCs w:val="false"/>
+                <w:color w:val="1D2D3E"/>
+                <w:sz w:val="20"/>
+                <w:szCs w:val="20"/>
+              </w:rPr>
+              <w:t xml:space="preserve">Done</w:t>
+            </w:r>
+          </w:p>
+        </w:tc>
+        <w:tc>
+          <w:tcPr>
+            <w:shd w:color="F0F4F8" w:val="solid"/>
+          </w:tcPr>
+          <w:p>
+            <w:pPr>
+              <w:spacing w:after="40" w:before="40"/>
+            </w:pPr>
+            <w:r>
+              <w:rPr>
+                <w:b w:val="false"/>
+                <w:bCs w:val="false"/>
+                <w:color w:val="1D2D3E"/>
+                <w:sz w:val="20"/>
+                <w:szCs w:val="20"/>
+              </w:rPr>
+              <w:t xml:space="preserve">expo-print + expo-sharing</w:t>
+            </w:r>
+          </w:p>
+        </w:tc>
+      </w:tr>
+      <w:tr>
+        <w:tc>
+          <w:p>
+            <w:pPr>
+              <w:spacing w:after="40" w:before="40"/>
+            </w:pPr>
+            <w:r>
+              <w:rPr>
+                <w:b w:val="false"/>
+                <w:bCs w:val="false"/>
+                <w:color w:val="1D2D3E"/>
+                <w:sz w:val="20"/>
+                <w:szCs w:val="20"/>
+              </w:rPr>
+              <w:t xml:space="preserve">Session 17</w:t>
+            </w:r>
+          </w:p>
+        </w:tc>
+        <w:tc>
+          <w:p>
+            <w:pPr>
+              <w:spacing w:after="40" w:before="40"/>
+            </w:pPr>
+            <w:r>
+              <w:rPr>
+                <w:b w:val="false"/>
+                <w:bCs w:val="false"/>
+                <w:color w:val="1D2D3E"/>
+                <w:sz w:val="20"/>
+                <w:szCs w:val="20"/>
+              </w:rPr>
+              <w:t xml:space="preserve">Stock balances PDF export in Inventory screen</w:t>
+            </w:r>
+          </w:p>
+        </w:tc>
+        <w:tc>
+          <w:p>
+            <w:pPr>
+              <w:spacing w:after="40" w:before="40"/>
+            </w:pPr>
+            <w:r>
+              <w:rPr>
+                <w:b w:val="false"/>
+                <w:bCs w:val="false"/>
+                <w:color w:val="1D2D3E"/>
+                <w:sz w:val="20"/>
+                <w:szCs w:val="20"/>
+              </w:rPr>
+              <w:t xml:space="preserve">Done</w:t>
+            </w:r>
+          </w:p>
+        </w:tc>
+        <w:tc>
+          <w:p>
+            <w:pPr>
+              <w:spacing w:after="40" w:before="40"/>
+            </w:pPr>
+            <w:r>
+              <w:rPr>
+                <w:b w:val="false"/>
+                <w:bCs w:val="false"/>
+                <w:color w:val="1D2D3E"/>
+                <w:sz w:val="20"/>
+                <w:szCs w:val="20"/>
+              </w:rPr>
+              <w:t xml:space="preserve">exportStockBalancePDF</w:t>
+            </w:r>
+          </w:p>
+        </w:tc>
+      </w:tr>
     </w:tbl>
     <w:p>
       <w:pPr>
@@ -14780,7 +15306,25 @@
           <w:sz w:val="22"/>
           <w:szCs w:val="22"/>
         </w:rPr>
-        <w:t xml:space="preserve">pdfExport.ts — exportTrialBalancePDF, exportPLPDF, exportBSPDF, exportJournalEntriesPDF via expo-print + expo-sharing (Session 16)</w:t>
+        <w:t xml:space="preserve">notificationLog.ts — logNotificationEvent, getInboxEntries, getUnreadCount, markAllRead, clearInbox; AsyncStorage inbox log with max 50 entries (Session 17)</w:t>
+      </w:r>
+    </w:p>
+    <w:p>
+      <w:pPr>
+        <w:pStyle w:val="ListParagraph"/>
+        <w:numPr>
+          <w:ilvl w:val="1"/>
+          <w:numId w:val="1"/>
+        </w:numPr>
+        <w:spacing w:after="40"/>
+      </w:pPr>
+      <w:r>
+        <w:rPr>
+          <w:color w:val="1D2D3E"/>
+          <w:sz w:val="22"/>
+          <w:szCs w:val="22"/>
+        </w:rPr>
+        <w:t xml:space="preserve">pdfExport.ts — exportTrialBalancePDF, exportPLPDF, exportBSPDF, exportJournalEntriesPDF, exportCombinedReportPDF, exportStockBalancePDF via expo-print + expo-sharing (Sessions 16–17)</w:t>
       </w:r>
     </w:p>
     <w:p>
@@ -14834,7 +15378,25 @@
           <w:sz w:val="22"/>
           <w:szCs w:val="22"/>
         </w:rPr>
-        <w:t xml:space="preserve">src/navigation/linking.ts — React Navigation LinkingOptions mapping poultryerp:// URLs to screen names (Session 16)</w:t>
+        <w:t xml:space="preserve">src/screens/inbox/ — Inbox screen (notification history, unread badge, clear all) (Session 17)</w:t>
+      </w:r>
+    </w:p>
+    <w:p>
+      <w:pPr>
+        <w:pStyle w:val="ListParagraph"/>
+        <w:numPr>
+          <w:ilvl w:val="0"/>
+          <w:numId w:val="1"/>
+        </w:numPr>
+        <w:spacing w:after="40"/>
+      </w:pPr>
+      <w:r>
+        <w:rPr>
+          <w:color w:val="1D2D3E"/>
+          <w:sz w:val="22"/>
+          <w:szCs w:val="22"/>
+        </w:rPr>
+        <w:t xml:space="preserve">src/navigation/linking.ts — React Navigation LinkingOptions mapping poultryerp:// URLs to screen names (Sessions 16–17)</w:t>
       </w:r>
     </w:p>
     <w:p>
@@ -17819,6 +18381,393 @@
           <w:szCs w:val="22"/>
         </w:rPr>
         <w:t xml:space="preserve">AccountsReceivableScreen: same AgingChart migration</w:t>
+      </w:r>
+    </w:p>
+    <w:p>
+      <w:pPr>
+        <w:spacing w:after="80"/>
+      </w:pPr>
+      <w:r>
+        <w:rPr>
+          <w:color w:val="1D2D3E"/>
+          <w:sz w:val="22"/>
+          <w:szCs w:val="22"/>
+        </w:rPr>
+        <w:t xml:space="preserve"/>
+      </w:r>
+    </w:p>
+    <w:p>
+      <w:pPr>
+        <w:pStyle w:val="Heading2"/>
+        <w:spacing w:after="120" w:before="300"/>
+      </w:pPr>
+      <w:r>
+        <w:rPr>
+          <w:b/>
+          <w:bCs/>
+          <w:color w:val="1D2D3E"/>
+        </w:rPr>
+        <w:t xml:space="preserve">Session 17 — 2026-05-25</w:t>
+      </w:r>
+    </w:p>
+    <w:p>
+      <w:pPr>
+        <w:pStyle w:val="ListParagraph"/>
+        <w:numPr>
+          <w:ilvl w:val="0"/>
+          <w:numId w:val="1"/>
+        </w:numPr>
+        <w:spacing w:after="40"/>
+      </w:pPr>
+      <w:r>
+        <w:rPr>
+          <w:color w:val="1D2D3E"/>
+          <w:sz w:val="22"/>
+          <w:szCs w:val="22"/>
+        </w:rPr>
+        <w:t xml:space="preserve">In-app notification inbox (src/utils/notificationLog.ts + src/screens/inbox/InboxScreen.tsx)</w:t>
+      </w:r>
+    </w:p>
+    <w:p>
+      <w:pPr>
+        <w:pStyle w:val="ListParagraph"/>
+        <w:numPr>
+          <w:ilvl w:val="1"/>
+          <w:numId w:val="1"/>
+        </w:numPr>
+        <w:spacing w:after="40"/>
+      </w:pPr>
+      <w:r>
+        <w:rPr>
+          <w:color w:val="1D2D3E"/>
+          <w:sz w:val="22"/>
+          <w:szCs w:val="22"/>
+        </w:rPr>
+        <w:t xml:space="preserve">  notificationLog.ts: logNotificationEvent, getInboxEntries, getUnreadCount, markAllRead, clearInbox (AsyncStorage, max 50 entries)</w:t>
+      </w:r>
+    </w:p>
+    <w:p>
+      <w:pPr>
+        <w:pStyle w:val="ListParagraph"/>
+        <w:numPr>
+          <w:ilvl w:val="1"/>
+          <w:numId w:val="1"/>
+        </w:numPr>
+        <w:spacing w:after="40"/>
+      </w:pPr>
+      <w:r>
+        <w:rPr>
+          <w:color w:val="1D2D3E"/>
+          <w:sz w:val="22"/>
+          <w:szCs w:val="22"/>
+        </w:rPr>
+        <w:t xml:space="preserve">  notifications.ts: scheduleOverdueReminder now calls logNotificationEvent on every successful schedule</w:t>
+      </w:r>
+    </w:p>
+    <w:p>
+      <w:pPr>
+        <w:pStyle w:val="ListParagraph"/>
+        <w:numPr>
+          <w:ilvl w:val="1"/>
+          <w:numId w:val="1"/>
+        </w:numPr>
+        <w:spacing w:after="40"/>
+      </w:pPr>
+      <w:r>
+        <w:rPr>
+          <w:color w:val="1D2D3E"/>
+          <w:sz w:val="22"/>
+          <w:szCs w:val="22"/>
+        </w:rPr>
+        <w:t xml:space="preserve">  InboxScreen: FlatList of notification history; bold border + dot for unread; breakdown chips (AP/AR/Stock); clear all with confirmation; marks all read on open</w:t>
+      </w:r>
+    </w:p>
+    <w:p>
+      <w:pPr>
+        <w:pStyle w:val="ListParagraph"/>
+        <w:numPr>
+          <w:ilvl w:val="1"/>
+          <w:numId w:val="1"/>
+        </w:numPr>
+        <w:spacing w:after="40"/>
+      </w:pPr>
+      <w:r>
+        <w:rPr>
+          <w:color w:val="1D2D3E"/>
+          <w:sz w:val="22"/>
+          <w:szCs w:val="22"/>
+        </w:rPr>
+        <w:t xml:space="preserve">  MoreNavigator: Inbox route added; linking.ts: poultryerp://inbox deep link</w:t>
+      </w:r>
+    </w:p>
+    <w:p>
+      <w:pPr>
+        <w:pStyle w:val="ListParagraph"/>
+        <w:numPr>
+          <w:ilvl w:val="1"/>
+          <w:numId w:val="1"/>
+        </w:numPr>
+        <w:spacing w:after="40"/>
+      </w:pPr>
+      <w:r>
+        <w:rPr>
+          <w:color w:val="1D2D3E"/>
+          <w:sz w:val="22"/>
+          <w:szCs w:val="22"/>
+        </w:rPr>
+        <w:t xml:space="preserve">  MoreMenuScreen: split alerts banner into side-by-side Alerts + Inbox banners; Inbox shows unread count</w:t>
+      </w:r>
+    </w:p>
+    <w:p>
+      <w:pPr>
+        <w:pStyle w:val="ListParagraph"/>
+        <w:numPr>
+          <w:ilvl w:val="1"/>
+          <w:numId w:val="1"/>
+        </w:numPr>
+        <w:spacing w:after="40"/>
+      </w:pPr>
+      <w:r>
+        <w:rPr>
+          <w:color w:val="1D2D3E"/>
+          <w:sz w:val="22"/>
+          <w:szCs w:val="22"/>
+        </w:rPr>
+        <w:t xml:space="preserve">  AppNavigator: More tab badge shows inboxUnread; refreshed on mount + foreground transitions</w:t>
+      </w:r>
+    </w:p>
+    <w:p>
+      <w:pPr>
+        <w:pStyle w:val="ListParagraph"/>
+        <w:numPr>
+          <w:ilvl w:val="0"/>
+          <w:numId w:val="1"/>
+        </w:numPr>
+        <w:spacing w:after="40"/>
+      </w:pPr>
+      <w:r>
+        <w:rPr>
+          <w:color w:val="1D2D3E"/>
+          <w:sz w:val="22"/>
+          <w:szCs w:val="22"/>
+        </w:rPr>
+        <w:t xml:space="preserve">Dashboard inbox integration</w:t>
+      </w:r>
+    </w:p>
+    <w:p>
+      <w:pPr>
+        <w:pStyle w:val="ListParagraph"/>
+        <w:numPr>
+          <w:ilvl w:val="1"/>
+          <w:numId w:val="1"/>
+        </w:numPr>
+        <w:spacing w:after="40"/>
+      </w:pPr>
+      <w:r>
+        <w:rPr>
+          <w:color w:val="1D2D3E"/>
+          <w:sz w:val="22"/>
+          <w:szCs w:val="22"/>
+        </w:rPr>
+        <w:t xml:space="preserve">  Inbox added as 8th Quick Action tile (Feather inbox icon) with unread badge</w:t>
+      </w:r>
+    </w:p>
+    <w:p>
+      <w:pPr>
+        <w:pStyle w:val="ListParagraph"/>
+        <w:numPr>
+          <w:ilvl w:val="1"/>
+          <w:numId w:val="1"/>
+        </w:numPr>
+        <w:spacing w:after="40"/>
+      </w:pPr>
+      <w:r>
+        <w:rPr>
+          <w:color w:val="1D2D3E"/>
+          <w:sz w:val="22"/>
+          <w:szCs w:val="22"/>
+        </w:rPr>
+        <w:t xml:space="preserve">  Inbox unread banner shown between Finance Status and Quick Actions when unread &gt; 0</w:t>
+      </w:r>
+    </w:p>
+    <w:p>
+      <w:pPr>
+        <w:pStyle w:val="ListParagraph"/>
+        <w:numPr>
+          <w:ilvl w:val="1"/>
+          <w:numId w:val="1"/>
+        </w:numPr>
+        <w:spacing w:after="40"/>
+      </w:pPr>
+      <w:r>
+        <w:rPr>
+          <w:color w:val="1D2D3E"/>
+          <w:sz w:val="22"/>
+          <w:szCs w:val="22"/>
+        </w:rPr>
+        <w:t xml:space="preserve">  inboxUnread state loaded via getUnreadCount() on every Dashboard focus event</w:t>
+      </w:r>
+    </w:p>
+    <w:p>
+      <w:pPr>
+        <w:pStyle w:val="ListParagraph"/>
+        <w:numPr>
+          <w:ilvl w:val="0"/>
+          <w:numId w:val="1"/>
+        </w:numPr>
+        <w:spacing w:after="40"/>
+      </w:pPr>
+      <w:r>
+        <w:rPr>
+          <w:color w:val="1D2D3E"/>
+          <w:sz w:val="22"/>
+          <w:szCs w:val="22"/>
+        </w:rPr>
+        <w:t xml:space="preserve">Batch PDF export — exportCombinedReportPDF()</w:t>
+      </w:r>
+    </w:p>
+    <w:p>
+      <w:pPr>
+        <w:pStyle w:val="ListParagraph"/>
+        <w:numPr>
+          <w:ilvl w:val="1"/>
+          <w:numId w:val="1"/>
+        </w:numPr>
+        <w:spacing w:after="40"/>
+      </w:pPr>
+      <w:r>
+        <w:rPr>
+          <w:color w:val="1D2D3E"/>
+          <w:sz w:val="22"/>
+          <w:szCs w:val="22"/>
+        </w:rPr>
+        <w:t xml:space="preserve">  Combined HTML document: cover page with TOC + Trial Balance + P&amp;L + Balance Sheet sections</w:t>
+      </w:r>
+    </w:p>
+    <w:p>
+      <w:pPr>
+        <w:pStyle w:val="ListParagraph"/>
+        <w:numPr>
+          <w:ilvl w:val="1"/>
+          <w:numId w:val="1"/>
+        </w:numPr>
+        <w:spacing w:after="40"/>
+      </w:pPr>
+      <w:r>
+        <w:rPr>
+          <w:color w:val="1D2D3E"/>
+          <w:sz w:val="22"/>
+          <w:szCs w:val="22"/>
+        </w:rPr>
+        <w:t xml:space="preserve">  Page-break dividers between sections with section numbers; COMBINED_EXTRA_CSS for print layout</w:t>
+      </w:r>
+    </w:p>
+    <w:p>
+      <w:pPr>
+        <w:pStyle w:val="ListParagraph"/>
+        <w:numPr>
+          <w:ilvl w:val="1"/>
+          <w:numId w:val="1"/>
+        </w:numPr>
+        <w:spacing w:after="40"/>
+      </w:pPr>
+      <w:r>
+        <w:rPr>
+          <w:color w:val="1D2D3E"/>
+          <w:sz w:val="22"/>
+          <w:szCs w:val="22"/>
+        </w:rPr>
+        <w:t xml:space="preserve">  classifyRow() helper embedded in pdfExport.ts to classify accounts into report categories</w:t>
+      </w:r>
+    </w:p>
+    <w:p>
+      <w:pPr>
+        <w:pStyle w:val="ListParagraph"/>
+        <w:numPr>
+          <w:ilvl w:val="1"/>
+          <w:numId w:val="1"/>
+        </w:numPr>
+        <w:spacing w:after="40"/>
+      </w:pPr>
+      <w:r>
+        <w:rPr>
+          <w:color w:val="1D2D3E"/>
+          <w:sz w:val="22"/>
+          <w:szCs w:val="22"/>
+        </w:rPr>
+        <w:t xml:space="preserve">  Bundle button (Feather layers) added to TrialBalanceScreen header; uses all rows (unfiltered)</w:t>
+      </w:r>
+    </w:p>
+    <w:p>
+      <w:pPr>
+        <w:pStyle w:val="ListParagraph"/>
+        <w:numPr>
+          <w:ilvl w:val="1"/>
+          <w:numId w:val="1"/>
+        </w:numPr>
+        <w:spacing w:after="40"/>
+      </w:pPr>
+      <w:r>
+        <w:rPr>
+          <w:color w:val="1D2D3E"/>
+          <w:sz w:val="22"/>
+          <w:szCs w:val="22"/>
+        </w:rPr>
+        <w:t xml:space="preserve">  Bundle button added to FinancialReportsScreen header alongside existing PDF + Share buttons</w:t>
+      </w:r>
+    </w:p>
+    <w:p>
+      <w:pPr>
+        <w:pStyle w:val="ListParagraph"/>
+        <w:numPr>
+          <w:ilvl w:val="0"/>
+          <w:numId w:val="1"/>
+        </w:numPr>
+        <w:spacing w:after="40"/>
+      </w:pPr>
+      <w:r>
+        <w:rPr>
+          <w:color w:val="1D2D3E"/>
+          <w:sz w:val="22"/>
+          <w:szCs w:val="22"/>
+        </w:rPr>
+        <w:t xml:space="preserve">Stock balances PDF export in Inventory screen</w:t>
+      </w:r>
+    </w:p>
+    <w:p>
+      <w:pPr>
+        <w:pStyle w:val="ListParagraph"/>
+        <w:numPr>
+          <w:ilvl w:val="1"/>
+          <w:numId w:val="1"/>
+        </w:numPr>
+        <w:spacing w:after="40"/>
+      </w:pPr>
+      <w:r>
+        <w:rPr>
+          <w:color w:val="1D2D3E"/>
+          <w:sz w:val="22"/>
+          <w:szCs w:val="22"/>
+        </w:rPr>
+        <w:t xml:space="preserve">  exportStockBalancePDF(): item/warehouse/qty/unit table with summary grid (items + total qty)</w:t>
+      </w:r>
+    </w:p>
+    <w:p>
+      <w:pPr>
+        <w:pStyle w:val="ListParagraph"/>
+        <w:numPr>
+          <w:ilvl w:val="1"/>
+          <w:numId w:val="1"/>
+        </w:numPr>
+        <w:spacing w:after="40"/>
+      </w:pPr>
+      <w:r>
+        <w:rPr>
+          <w:color w:val="1D2D3E"/>
+          <w:sz w:val="22"/>
+          <w:szCs w:val="22"/>
+        </w:rPr>
+        <w:t xml:space="preserve">  PDF button shown in Inventory header on Stock tab when data is loaded; respects current filter</w:t>
       </w:r>
     </w:p>
     <w:p>

</xml_diff>

<commit_message>
docs: update PROGRESS.md, FEATURES.docx, generate-docs.js for Session 18
Session 18 deliverables documented:
- Bookmarks system (bookmarks.ts, BookmarkButton, BookmarksScreen)
- Inbox swipe-to-delete (PanResponder + Animated per-entry)
- Multi-company KPI comparison screen

https://claude.ai/code/session_019j4zP8H2WYBiZnpH5nhiYi
</commit_message>
<xml_diff>
--- a/FEATURES.docx
+++ b/FEATURES.docx
@@ -14739,6 +14739,392 @@
           </w:p>
         </w:tc>
       </w:tr>
+      <w:tr>
+        <w:tc>
+          <w:tcPr>
+            <w:shd w:color="F0F4F8" w:val="solid"/>
+          </w:tcPr>
+          <w:p>
+            <w:pPr>
+              <w:spacing w:after="40" w:before="40"/>
+            </w:pPr>
+            <w:r>
+              <w:rPr>
+                <w:b w:val="false"/>
+                <w:bCs w:val="false"/>
+                <w:color w:val="1D2D3E"/>
+                <w:sz w:val="20"/>
+                <w:szCs w:val="20"/>
+              </w:rPr>
+              <w:t xml:space="preserve">Session 18</w:t>
+            </w:r>
+          </w:p>
+        </w:tc>
+        <w:tc>
+          <w:tcPr>
+            <w:shd w:color="F0F4F8" w:val="solid"/>
+          </w:tcPr>
+          <w:p>
+            <w:pPr>
+              <w:spacing w:after="40" w:before="40"/>
+            </w:pPr>
+            <w:r>
+              <w:rPr>
+                <w:b w:val="false"/>
+                <w:bCs w:val="false"/>
+                <w:color w:val="1D2D3E"/>
+                <w:sz w:val="20"/>
+                <w:szCs w:val="20"/>
+              </w:rPr>
+              <w:t xml:space="preserve">Bookmarks system — save POs, SOs, partners, materials for quick access</w:t>
+            </w:r>
+          </w:p>
+        </w:tc>
+        <w:tc>
+          <w:tcPr>
+            <w:shd w:color="F0F4F8" w:val="solid"/>
+          </w:tcPr>
+          <w:p>
+            <w:pPr>
+              <w:spacing w:after="40" w:before="40"/>
+            </w:pPr>
+            <w:r>
+              <w:rPr>
+                <w:b w:val="false"/>
+                <w:bCs w:val="false"/>
+                <w:color w:val="1D2D3E"/>
+                <w:sz w:val="20"/>
+                <w:szCs w:val="20"/>
+              </w:rPr>
+              <w:t xml:space="preserve">Done</w:t>
+            </w:r>
+          </w:p>
+        </w:tc>
+        <w:tc>
+          <w:tcPr>
+            <w:shd w:color="F0F4F8" w:val="solid"/>
+          </w:tcPr>
+          <w:p>
+            <w:pPr>
+              <w:spacing w:after="40" w:before="40"/>
+            </w:pPr>
+            <w:r>
+              <w:rPr>
+                <w:b w:val="false"/>
+                <w:bCs w:val="false"/>
+                <w:color w:val="1D2D3E"/>
+                <w:sz w:val="20"/>
+                <w:szCs w:val="20"/>
+              </w:rPr>
+              <w:t xml:space="preserve">src/utils/bookmarks.ts</w:t>
+            </w:r>
+          </w:p>
+        </w:tc>
+      </w:tr>
+      <w:tr>
+        <w:tc>
+          <w:p>
+            <w:pPr>
+              <w:spacing w:after="40" w:before="40"/>
+            </w:pPr>
+            <w:r>
+              <w:rPr>
+                <w:b w:val="false"/>
+                <w:bCs w:val="false"/>
+                <w:color w:val="1D2D3E"/>
+                <w:sz w:val="20"/>
+                <w:szCs w:val="20"/>
+              </w:rPr>
+              <w:t xml:space="preserve">Session 18</w:t>
+            </w:r>
+          </w:p>
+        </w:tc>
+        <w:tc>
+          <w:p>
+            <w:pPr>
+              <w:spacing w:after="40" w:before="40"/>
+            </w:pPr>
+            <w:r>
+              <w:rPr>
+                <w:b w:val="false"/>
+                <w:bCs w:val="false"/>
+                <w:color w:val="1D2D3E"/>
+                <w:sz w:val="20"/>
+                <w:szCs w:val="20"/>
+              </w:rPr>
+              <w:t xml:space="preserve">BookmarkButton component — toggle on detail screen headers</w:t>
+            </w:r>
+          </w:p>
+        </w:tc>
+        <w:tc>
+          <w:p>
+            <w:pPr>
+              <w:spacing w:after="40" w:before="40"/>
+            </w:pPr>
+            <w:r>
+              <w:rPr>
+                <w:b w:val="false"/>
+                <w:bCs w:val="false"/>
+                <w:color w:val="1D2D3E"/>
+                <w:sz w:val="20"/>
+                <w:szCs w:val="20"/>
+              </w:rPr>
+              <w:t xml:space="preserve">Done</w:t>
+            </w:r>
+          </w:p>
+        </w:tc>
+        <w:tc>
+          <w:p>
+            <w:pPr>
+              <w:spacing w:after="40" w:before="40"/>
+            </w:pPr>
+            <w:r>
+              <w:rPr>
+                <w:b w:val="false"/>
+                <w:bCs w:val="false"/>
+                <w:color w:val="1D2D3E"/>
+                <w:sz w:val="20"/>
+                <w:szCs w:val="20"/>
+              </w:rPr>
+              <w:t xml:space="preserve">src/components/BookmarkButton.tsx</w:t>
+            </w:r>
+          </w:p>
+        </w:tc>
+      </w:tr>
+      <w:tr>
+        <w:tc>
+          <w:tcPr>
+            <w:shd w:color="F0F4F8" w:val="solid"/>
+          </w:tcPr>
+          <w:p>
+            <w:pPr>
+              <w:spacing w:after="40" w:before="40"/>
+            </w:pPr>
+            <w:r>
+              <w:rPr>
+                <w:b w:val="false"/>
+                <w:bCs w:val="false"/>
+                <w:color w:val="1D2D3E"/>
+                <w:sz w:val="20"/>
+                <w:szCs w:val="20"/>
+              </w:rPr>
+              <w:t xml:space="preserve">Session 18</w:t>
+            </w:r>
+          </w:p>
+        </w:tc>
+        <w:tc>
+          <w:tcPr>
+            <w:shd w:color="F0F4F8" w:val="solid"/>
+          </w:tcPr>
+          <w:p>
+            <w:pPr>
+              <w:spacing w:after="40" w:before="40"/>
+            </w:pPr>
+            <w:r>
+              <w:rPr>
+                <w:b w:val="false"/>
+                <w:bCs w:val="false"/>
+                <w:color w:val="1D2D3E"/>
+                <w:sz w:val="20"/>
+                <w:szCs w:val="20"/>
+              </w:rPr>
+              <w:t xml:space="preserve">BookmarksScreen — grouped list with one-tap navigation to saved items</w:t>
+            </w:r>
+          </w:p>
+        </w:tc>
+        <w:tc>
+          <w:tcPr>
+            <w:shd w:color="F0F4F8" w:val="solid"/>
+          </w:tcPr>
+          <w:p>
+            <w:pPr>
+              <w:spacing w:after="40" w:before="40"/>
+            </w:pPr>
+            <w:r>
+              <w:rPr>
+                <w:b w:val="false"/>
+                <w:bCs w:val="false"/>
+                <w:color w:val="1D2D3E"/>
+                <w:sz w:val="20"/>
+                <w:szCs w:val="20"/>
+              </w:rPr>
+              <w:t xml:space="preserve">Done</w:t>
+            </w:r>
+          </w:p>
+        </w:tc>
+        <w:tc>
+          <w:tcPr>
+            <w:shd w:color="F0F4F8" w:val="solid"/>
+          </w:tcPr>
+          <w:p>
+            <w:pPr>
+              <w:spacing w:after="40" w:before="40"/>
+            </w:pPr>
+            <w:r>
+              <w:rPr>
+                <w:b w:val="false"/>
+                <w:bCs w:val="false"/>
+                <w:color w:val="1D2D3E"/>
+                <w:sz w:val="20"/>
+                <w:szCs w:val="20"/>
+              </w:rPr>
+              <w:t xml:space="preserve">src/screens/bookmarks/BookmarksScreen.tsx</w:t>
+            </w:r>
+          </w:p>
+        </w:tc>
+      </w:tr>
+      <w:tr>
+        <w:tc>
+          <w:p>
+            <w:pPr>
+              <w:spacing w:after="40" w:before="40"/>
+            </w:pPr>
+            <w:r>
+              <w:rPr>
+                <w:b w:val="false"/>
+                <w:bCs w:val="false"/>
+                <w:color w:val="1D2D3E"/>
+                <w:sz w:val="20"/>
+                <w:szCs w:val="20"/>
+              </w:rPr>
+              <w:t xml:space="preserve">Session 18</w:t>
+            </w:r>
+          </w:p>
+        </w:tc>
+        <w:tc>
+          <w:p>
+            <w:pPr>
+              <w:spacing w:after="40" w:before="40"/>
+            </w:pPr>
+            <w:r>
+              <w:rPr>
+                <w:b w:val="false"/>
+                <w:bCs w:val="false"/>
+                <w:color w:val="1D2D3E"/>
+                <w:sz w:val="20"/>
+                <w:szCs w:val="20"/>
+              </w:rPr>
+              <w:t xml:space="preserve">Inbox swipe-to-delete — per-entry deletion via PanResponder gesture</w:t>
+            </w:r>
+          </w:p>
+        </w:tc>
+        <w:tc>
+          <w:p>
+            <w:pPr>
+              <w:spacing w:after="40" w:before="40"/>
+            </w:pPr>
+            <w:r>
+              <w:rPr>
+                <w:b w:val="false"/>
+                <w:bCs w:val="false"/>
+                <w:color w:val="1D2D3E"/>
+                <w:sz w:val="20"/>
+                <w:szCs w:val="20"/>
+              </w:rPr>
+              <w:t xml:space="preserve">Done</w:t>
+            </w:r>
+          </w:p>
+        </w:tc>
+        <w:tc>
+          <w:p>
+            <w:pPr>
+              <w:spacing w:after="40" w:before="40"/>
+            </w:pPr>
+            <w:r>
+              <w:rPr>
+                <w:b w:val="false"/>
+                <w:bCs w:val="false"/>
+                <w:color w:val="1D2D3E"/>
+                <w:sz w:val="20"/>
+                <w:szCs w:val="20"/>
+              </w:rPr>
+              <w:t xml:space="preserve">src/screens/inbox/InboxScreen.tsx</w:t>
+            </w:r>
+          </w:p>
+        </w:tc>
+      </w:tr>
+      <w:tr>
+        <w:tc>
+          <w:tcPr>
+            <w:shd w:color="F0F4F8" w:val="solid"/>
+          </w:tcPr>
+          <w:p>
+            <w:pPr>
+              <w:spacing w:after="40" w:before="40"/>
+            </w:pPr>
+            <w:r>
+              <w:rPr>
+                <w:b w:val="false"/>
+                <w:bCs w:val="false"/>
+                <w:color w:val="1D2D3E"/>
+                <w:sz w:val="20"/>
+                <w:szCs w:val="20"/>
+              </w:rPr>
+              <w:t xml:space="preserve">Session 18</w:t>
+            </w:r>
+          </w:p>
+        </w:tc>
+        <w:tc>
+          <w:tcPr>
+            <w:shd w:color="F0F4F8" w:val="solid"/>
+          </w:tcPr>
+          <w:p>
+            <w:pPr>
+              <w:spacing w:after="40" w:before="40"/>
+            </w:pPr>
+            <w:r>
+              <w:rPr>
+                <w:b w:val="false"/>
+                <w:bCs w:val="false"/>
+                <w:color w:val="1D2D3E"/>
+                <w:sz w:val="20"/>
+                <w:szCs w:val="20"/>
+              </w:rPr>
+              <w:t xml:space="preserve">Multi-company KPI comparison — ranked metrics across all companies</w:t>
+            </w:r>
+          </w:p>
+        </w:tc>
+        <w:tc>
+          <w:tcPr>
+            <w:shd w:color="F0F4F8" w:val="solid"/>
+          </w:tcPr>
+          <w:p>
+            <w:pPr>
+              <w:spacing w:after="40" w:before="40"/>
+            </w:pPr>
+            <w:r>
+              <w:rPr>
+                <w:b w:val="false"/>
+                <w:bCs w:val="false"/>
+                <w:color w:val="1D2D3E"/>
+                <w:sz w:val="20"/>
+                <w:szCs w:val="20"/>
+              </w:rPr>
+              <w:t xml:space="preserve">Done</w:t>
+            </w:r>
+          </w:p>
+        </w:tc>
+        <w:tc>
+          <w:tcPr>
+            <w:shd w:color="F0F4F8" w:val="solid"/>
+          </w:tcPr>
+          <w:p>
+            <w:pPr>
+              <w:spacing w:after="40" w:before="40"/>
+            </w:pPr>
+            <w:r>
+              <w:rPr>
+                <w:b w:val="false"/>
+                <w:bCs w:val="false"/>
+                <w:color w:val="1D2D3E"/>
+                <w:sz w:val="20"/>
+                <w:szCs w:val="20"/>
+              </w:rPr>
+              <w:t xml:space="preserve">src/screens/comparison/ComparisonScreen.tsx</w:t>
+            </w:r>
+          </w:p>
+        </w:tc>
+      </w:tr>
     </w:tbl>
     <w:p>
       <w:pPr>
@@ -15306,7 +15692,7 @@
           <w:sz w:val="22"/>
           <w:szCs w:val="22"/>
         </w:rPr>
-        <w:t xml:space="preserve">notificationLog.ts — logNotificationEvent, getInboxEntries, getUnreadCount, markAllRead, clearInbox; AsyncStorage inbox log with max 50 entries (Session 17)</w:t>
+        <w:t xml:space="preserve">notificationLog.ts — logNotificationEvent, getInboxEntries, getUnreadCount, markAllRead, deleteInboxEntry, clearInbox; AsyncStorage inbox log with max 50 entries (Sessions 17–18)</w:t>
       </w:r>
     </w:p>
     <w:p>
@@ -15331,6 +15717,24 @@
       <w:pPr>
         <w:pStyle w:val="ListParagraph"/>
         <w:numPr>
+          <w:ilvl w:val="1"/>
+          <w:numId w:val="1"/>
+        </w:numPr>
+        <w:spacing w:after="40"/>
+      </w:pPr>
+      <w:r>
+        <w:rPr>
+          <w:color w:val="1D2D3E"/>
+          <w:sz w:val="22"/>
+          <w:szCs w:val="22"/>
+        </w:rPr>
+        <w:t xml:space="preserve">bookmarks.ts — addBookmark, removeBookmark, isBookmarked, getBookmarks, clearBookmarks; AsyncStorage-backed per-type bookmark registry (max 100 entries) (Session 18)</w:t>
+      </w:r>
+    </w:p>
+    <w:p>
+      <w:pPr>
+        <w:pStyle w:val="ListParagraph"/>
+        <w:numPr>
           <w:ilvl w:val="0"/>
           <w:numId w:val="1"/>
         </w:numPr>
@@ -15378,25 +15782,79 @@
           <w:sz w:val="22"/>
           <w:szCs w:val="22"/>
         </w:rPr>
-        <w:t xml:space="preserve">src/screens/inbox/ — Inbox screen (notification history, unread badge, clear all) (Session 17)</w:t>
-      </w:r>
-    </w:p>
-    <w:p>
-      <w:pPr>
-        <w:pStyle w:val="ListParagraph"/>
-        <w:numPr>
-          <w:ilvl w:val="0"/>
-          <w:numId w:val="1"/>
-        </w:numPr>
-        <w:spacing w:after="40"/>
-      </w:pPr>
-      <w:r>
-        <w:rPr>
-          <w:color w:val="1D2D3E"/>
-          <w:sz w:val="22"/>
-          <w:szCs w:val="22"/>
-        </w:rPr>
-        <w:t xml:space="preserve">src/navigation/linking.ts — React Navigation LinkingOptions mapping poultryerp:// URLs to screen names (Sessions 16–17)</w:t>
+        <w:t xml:space="preserve">src/screens/inbox/ — Inbox screen (notification history, swipe-to-delete, clear all) (Sessions 17–18)</w:t>
+      </w:r>
+    </w:p>
+    <w:p>
+      <w:pPr>
+        <w:pStyle w:val="ListParagraph"/>
+        <w:numPr>
+          <w:ilvl w:val="0"/>
+          <w:numId w:val="1"/>
+        </w:numPr>
+        <w:spacing w:after="40"/>
+      </w:pPr>
+      <w:r>
+        <w:rPr>
+          <w:color w:val="1D2D3E"/>
+          <w:sz w:val="22"/>
+          <w:szCs w:val="22"/>
+        </w:rPr>
+        <w:t xml:space="preserve">src/screens/bookmarks/ — BookmarksScreen (saved items grouped by type, tap to navigate, per-item delete) (Session 18)</w:t>
+      </w:r>
+    </w:p>
+    <w:p>
+      <w:pPr>
+        <w:pStyle w:val="ListParagraph"/>
+        <w:numPr>
+          <w:ilvl w:val="0"/>
+          <w:numId w:val="1"/>
+        </w:numPr>
+        <w:spacing w:after="40"/>
+      </w:pPr>
+      <w:r>
+        <w:rPr>
+          <w:color w:val="1D2D3E"/>
+          <w:sz w:val="22"/>
+          <w:szCs w:val="22"/>
+        </w:rPr>
+        <w:t xml:space="preserve">src/screens/comparison/ — ComparisonScreen (multi-company KPI ranking with proportional bars, pull-to-refresh) (Session 18)</w:t>
+      </w:r>
+    </w:p>
+    <w:p>
+      <w:pPr>
+        <w:pStyle w:val="ListParagraph"/>
+        <w:numPr>
+          <w:ilvl w:val="0"/>
+          <w:numId w:val="1"/>
+        </w:numPr>
+        <w:spacing w:after="40"/>
+      </w:pPr>
+      <w:r>
+        <w:rPr>
+          <w:color w:val="1D2D3E"/>
+          <w:sz w:val="22"/>
+          <w:szCs w:val="22"/>
+        </w:rPr>
+        <w:t xml:space="preserve">src/components/BookmarkButton.tsx — Toggle bookmark icon button for detail screen headers (Session 18)</w:t>
+      </w:r>
+    </w:p>
+    <w:p>
+      <w:pPr>
+        <w:pStyle w:val="ListParagraph"/>
+        <w:numPr>
+          <w:ilvl w:val="0"/>
+          <w:numId w:val="1"/>
+        </w:numPr>
+        <w:spacing w:after="40"/>
+      </w:pPr>
+      <w:r>
+        <w:rPr>
+          <w:color w:val="1D2D3E"/>
+          <w:sz w:val="22"/>
+          <w:szCs w:val="22"/>
+        </w:rPr>
+        <w:t xml:space="preserve">src/navigation/linking.ts — React Navigation LinkingOptions mapping poultryerp:// URLs to screen names (Sessions 16–18)</w:t>
       </w:r>
     </w:p>
     <w:p>
@@ -18381,6 +18839,411 @@
           <w:szCs w:val="22"/>
         </w:rPr>
         <w:t xml:space="preserve">AccountsReceivableScreen: same AgingChart migration</w:t>
+      </w:r>
+    </w:p>
+    <w:p>
+      <w:pPr>
+        <w:spacing w:after="80"/>
+      </w:pPr>
+      <w:r>
+        <w:rPr>
+          <w:color w:val="1D2D3E"/>
+          <w:sz w:val="22"/>
+          <w:szCs w:val="22"/>
+        </w:rPr>
+        <w:t xml:space="preserve"/>
+      </w:r>
+    </w:p>
+    <w:p>
+      <w:pPr>
+        <w:pStyle w:val="Heading2"/>
+        <w:spacing w:after="120" w:before="300"/>
+      </w:pPr>
+      <w:r>
+        <w:rPr>
+          <w:b/>
+          <w:bCs/>
+          <w:color w:val="1D2D3E"/>
+        </w:rPr>
+        <w:t xml:space="preserve">Session 18 — 2026-05-25</w:t>
+      </w:r>
+    </w:p>
+    <w:p>
+      <w:pPr>
+        <w:pStyle w:val="ListParagraph"/>
+        <w:numPr>
+          <w:ilvl w:val="0"/>
+          <w:numId w:val="1"/>
+        </w:numPr>
+        <w:spacing w:after="40"/>
+      </w:pPr>
+      <w:r>
+        <w:rPr>
+          <w:color w:val="1D2D3E"/>
+          <w:sz w:val="22"/>
+          <w:szCs w:val="22"/>
+        </w:rPr>
+        <w:t xml:space="preserve">Bookmarks system (src/utils/bookmarks.ts + src/screens/bookmarks/BookmarksScreen.tsx)</w:t>
+      </w:r>
+    </w:p>
+    <w:p>
+      <w:pPr>
+        <w:pStyle w:val="ListParagraph"/>
+        <w:numPr>
+          <w:ilvl w:val="1"/>
+          <w:numId w:val="1"/>
+        </w:numPr>
+        <w:spacing w:after="40"/>
+      </w:pPr>
+      <w:r>
+        <w:rPr>
+          <w:color w:val="1D2D3E"/>
+          <w:sz w:val="22"/>
+          <w:szCs w:val="22"/>
+        </w:rPr>
+        <w:t xml:space="preserve">  bookmarks.ts: addBookmark, removeBookmark, isBookmarked, getBookmarks, clearBookmarks — AsyncStorage-backed, max 100, sorted by recency</w:t>
+      </w:r>
+    </w:p>
+    <w:p>
+      <w:pPr>
+        <w:pStyle w:val="ListParagraph"/>
+        <w:numPr>
+          <w:ilvl w:val="1"/>
+          <w:numId w:val="1"/>
+        </w:numPr>
+        <w:spacing w:after="40"/>
+      </w:pPr>
+      <w:r>
+        <w:rPr>
+          <w:color w:val="1D2D3E"/>
+          <w:sz w:val="22"/>
+          <w:szCs w:val="22"/>
+        </w:rPr>
+        <w:t xml:space="preserve">  Bookmark types: po | so | partner | material — each stores entityId, title, subtitle, meta, navParams for navigation</w:t>
+      </w:r>
+    </w:p>
+    <w:p>
+      <w:pPr>
+        <w:pStyle w:val="ListParagraph"/>
+        <w:numPr>
+          <w:ilvl w:val="1"/>
+          <w:numId w:val="1"/>
+        </w:numPr>
+        <w:spacing w:after="40"/>
+      </w:pPr>
+      <w:r>
+        <w:rPr>
+          <w:color w:val="1D2D3E"/>
+          <w:sz w:val="22"/>
+          <w:szCs w:val="22"/>
+        </w:rPr>
+        <w:t xml:space="preserve">  BookmarkButton component: toggle star/bookmark icon; reads initial state on mount; persists on press; accepts optional color prop for dark headers</w:t>
+      </w:r>
+    </w:p>
+    <w:p>
+      <w:pPr>
+        <w:pStyle w:val="ListParagraph"/>
+        <w:numPr>
+          <w:ilvl w:val="1"/>
+          <w:numId w:val="1"/>
+        </w:numPr>
+        <w:spacing w:after="40"/>
+      </w:pPr>
+      <w:r>
+        <w:rPr>
+          <w:color w:val="1D2D3E"/>
+          <w:sz w:val="22"/>
+          <w:szCs w:val="22"/>
+        </w:rPr>
+        <w:t xml:space="preserve">  BookmarksScreen: FlatList grouped by type (POs, SOs, Partners, Materials); tap navigates to detail screen; X removes individual entry; Clear all with confirmation; empty state</w:t>
+      </w:r>
+    </w:p>
+    <w:p>
+      <w:pPr>
+        <w:pStyle w:val="ListParagraph"/>
+        <w:numPr>
+          <w:ilvl w:val="1"/>
+          <w:numId w:val="1"/>
+        </w:numPr>
+        <w:spacing w:after="40"/>
+      </w:pPr>
+      <w:r>
+        <w:rPr>
+          <w:color w:val="1D2D3E"/>
+          <w:sz w:val="22"/>
+          <w:szCs w:val="22"/>
+        </w:rPr>
+        <w:t xml:space="preserve">  MoreNavigator: Bookmarks route added; MoreMenuScreen ADMIN section: Bookmarks item; linking.ts: poultryerp://bookmarks</w:t>
+      </w:r>
+    </w:p>
+    <w:p>
+      <w:pPr>
+        <w:pStyle w:val="ListParagraph"/>
+        <w:numPr>
+          <w:ilvl w:val="1"/>
+          <w:numId w:val="1"/>
+        </w:numPr>
+        <w:spacing w:after="40"/>
+      </w:pPr>
+      <w:r>
+        <w:rPr>
+          <w:color w:val="1D2D3E"/>
+          <w:sz w:val="22"/>
+          <w:szCs w:val="22"/>
+        </w:rPr>
+        <w:t xml:space="preserve">  BookmarkButton wired into PurchaseOrderDetailScreen, SalesOrderDetailScreen, PartnerDetailScreen, MaterialDetailScreen headers</w:t>
+      </w:r>
+    </w:p>
+    <w:p>
+      <w:pPr>
+        <w:pStyle w:val="ListParagraph"/>
+        <w:numPr>
+          <w:ilvl w:val="1"/>
+          <w:numId w:val="1"/>
+        </w:numPr>
+        <w:spacing w:after="40"/>
+      </w:pPr>
+      <w:r>
+        <w:rPr>
+          <w:color w:val="1D2D3E"/>
+          <w:sz w:val="22"/>
+          <w:szCs w:val="22"/>
+        </w:rPr>
+        <w:t xml:space="preserve">  DashboardScreen: Bookmarks added as 9th quick action tile</w:t>
+      </w:r>
+    </w:p>
+    <w:p>
+      <w:pPr>
+        <w:pStyle w:val="ListParagraph"/>
+        <w:numPr>
+          <w:ilvl w:val="0"/>
+          <w:numId w:val="1"/>
+        </w:numPr>
+        <w:spacing w:after="40"/>
+      </w:pPr>
+      <w:r>
+        <w:rPr>
+          <w:color w:val="1D2D3E"/>
+          <w:sz w:val="22"/>
+          <w:szCs w:val="22"/>
+        </w:rPr>
+        <w:t xml:space="preserve">Inbox swipe-to-delete (src/screens/inbox/InboxScreen.tsx)</w:t>
+      </w:r>
+    </w:p>
+    <w:p>
+      <w:pPr>
+        <w:pStyle w:val="ListParagraph"/>
+        <w:numPr>
+          <w:ilvl w:val="1"/>
+          <w:numId w:val="1"/>
+        </w:numPr>
+        <w:spacing w:after="40"/>
+      </w:pPr>
+      <w:r>
+        <w:rPr>
+          <w:color w:val="1D2D3E"/>
+          <w:sz w:val="22"/>
+          <w:szCs w:val="22"/>
+        </w:rPr>
+        <w:t xml:space="preserve">  notificationLog.ts: new deleteInboxEntry(id) function</w:t>
+      </w:r>
+    </w:p>
+    <w:p>
+      <w:pPr>
+        <w:pStyle w:val="ListParagraph"/>
+        <w:numPr>
+          <w:ilvl w:val="1"/>
+          <w:numId w:val="1"/>
+        </w:numPr>
+        <w:spacing w:after="40"/>
+      </w:pPr>
+      <w:r>
+        <w:rPr>
+          <w:color w:val="1D2D3E"/>
+          <w:sz w:val="22"/>
+          <w:szCs w:val="22"/>
+        </w:rPr>
+        <w:t xml:space="preserve">  SwipeableEntryRow component using PanResponder + Animated.Value</w:t>
+      </w:r>
+    </w:p>
+    <w:p>
+      <w:pPr>
+        <w:pStyle w:val="ListParagraph"/>
+        <w:numPr>
+          <w:ilvl w:val="1"/>
+          <w:numId w:val="1"/>
+        </w:numPr>
+        <w:spacing w:after="40"/>
+      </w:pPr>
+      <w:r>
+        <w:rPr>
+          <w:color w:val="1D2D3E"/>
+          <w:sz w:val="22"/>
+          <w:szCs w:val="22"/>
+        </w:rPr>
+        <w:t xml:space="preserve">  Swipe left &gt; 80px threshold snaps open a 72px dark delete action button</w:t>
+      </w:r>
+    </w:p>
+    <w:p>
+      <w:pPr>
+        <w:pStyle w:val="ListParagraph"/>
+        <w:numPr>
+          <w:ilvl w:val="1"/>
+          <w:numId w:val="1"/>
+        </w:numPr>
+        <w:spacing w:after="40"/>
+      </w:pPr>
+      <w:r>
+        <w:rPr>
+          <w:color w:val="1D2D3E"/>
+          <w:sz w:val="22"/>
+          <w:szCs w:val="22"/>
+        </w:rPr>
+        <w:t xml:space="preserve">  Tap delete button: animates card off-screen then removes entry from state + AsyncStorage</w:t>
+      </w:r>
+    </w:p>
+    <w:p>
+      <w:pPr>
+        <w:pStyle w:val="ListParagraph"/>
+        <w:numPr>
+          <w:ilvl w:val="1"/>
+          <w:numId w:val="1"/>
+        </w:numPr>
+        <w:spacing w:after="40"/>
+      </w:pPr>
+      <w:r>
+        <w:rPr>
+          <w:color w:val="1D2D3E"/>
+          <w:sz w:val="22"/>
+          <w:szCs w:val="22"/>
+        </w:rPr>
+        <w:t xml:space="preserve">  Snap-back spring animation when swipe &lt; threshold; header subtitle shows 'Swipe left to delete' when entries present</w:t>
+      </w:r>
+    </w:p>
+    <w:p>
+      <w:pPr>
+        <w:pStyle w:val="ListParagraph"/>
+        <w:numPr>
+          <w:ilvl w:val="0"/>
+          <w:numId w:val="1"/>
+        </w:numPr>
+        <w:spacing w:after="40"/>
+      </w:pPr>
+      <w:r>
+        <w:rPr>
+          <w:color w:val="1D2D3E"/>
+          <w:sz w:val="22"/>
+          <w:szCs w:val="22"/>
+        </w:rPr>
+        <w:t xml:space="preserve">Multi-company KPI comparison (src/screens/comparison/ComparisonScreen.tsx)</w:t>
+      </w:r>
+    </w:p>
+    <w:p>
+      <w:pPr>
+        <w:pStyle w:val="ListParagraph"/>
+        <w:numPr>
+          <w:ilvl w:val="1"/>
+          <w:numId w:val="1"/>
+        </w:numPr>
+        <w:spacing w:after="40"/>
+      </w:pPr>
+      <w:r>
+        <w:rPr>
+          <w:color w:val="1D2D3E"/>
+          <w:sz w:val="22"/>
+          <w:szCs w:val="22"/>
+        </w:rPr>
+        <w:t xml:space="preserve">  Fetches KPIs for all companies in parallel via existing fetchDashboardData(companyId)</w:t>
+      </w:r>
+    </w:p>
+    <w:p>
+      <w:pPr>
+        <w:pStyle w:val="ListParagraph"/>
+        <w:numPr>
+          <w:ilvl w:val="1"/>
+          <w:numId w:val="1"/>
+        </w:numPr>
+        <w:spacing w:after="40"/>
+      </w:pPr>
+      <w:r>
+        <w:rPr>
+          <w:color w:val="1D2D3E"/>
+          <w:sz w:val="22"/>
+          <w:szCs w:val="22"/>
+        </w:rPr>
+        <w:t xml:space="preserve">  Company status chips row: dot (loaded) / spinner (loading) / alert-circle (failed) per company</w:t>
+      </w:r>
+    </w:p>
+    <w:p>
+      <w:pPr>
+        <w:pStyle w:val="ListParagraph"/>
+        <w:numPr>
+          <w:ilvl w:val="1"/>
+          <w:numId w:val="1"/>
+        </w:numPr>
+        <w:spacing w:after="40"/>
+      </w:pPr>
+      <w:r>
+        <w:rPr>
+          <w:color w:val="1D2D3E"/>
+          <w:sz w:val="22"/>
+          <w:szCs w:val="22"/>
+        </w:rPr>
+        <w:t xml:space="preserve">  Summary tiles: total companies / loaded / loading / failed counts</w:t>
+      </w:r>
+    </w:p>
+    <w:p>
+      <w:pPr>
+        <w:pStyle w:val="ListParagraph"/>
+        <w:numPr>
+          <w:ilvl w:val="1"/>
+          <w:numId w:val="1"/>
+        </w:numPr>
+        <w:spacing w:after="40"/>
+      </w:pPr>
+      <w:r>
+        <w:rPr>
+          <w:color w:val="1D2D3E"/>
+          <w:sz w:val="22"/>
+          <w:szCs w:val="22"/>
+        </w:rPr>
+        <w:t xml:space="preserve">  9 ranked metric sections: Net Income, Revenue, Expenses, Cash Balance, AR, AP, Vouchers MTD, Working Capital</w:t>
+      </w:r>
+    </w:p>
+    <w:p>
+      <w:pPr>
+        <w:pStyle w:val="ListParagraph"/>
+        <w:numPr>
+          <w:ilvl w:val="1"/>
+          <w:numId w:val="1"/>
+        </w:numPr>
+        <w:spacing w:after="40"/>
+      </w:pPr>
+      <w:r>
+        <w:rPr>
+          <w:color w:val="1D2D3E"/>
+          <w:sz w:val="22"/>
+          <w:szCs w:val="22"/>
+        </w:rPr>
+        <w:t xml:space="preserve">  Each section: companies ranked by value; proportional horizontal bars (top = full-weight bar + bold value); negative values use muted bar</w:t>
+      </w:r>
+    </w:p>
+    <w:p>
+      <w:pPr>
+        <w:pStyle w:val="ListParagraph"/>
+        <w:numPr>
+          <w:ilvl w:val="1"/>
+          <w:numId w:val="1"/>
+        </w:numPr>
+        <w:spacing w:after="40"/>
+      </w:pPr>
+      <w:r>
+        <w:rPr>
+          <w:color w:val="1D2D3E"/>
+          <w:sz w:val="22"/>
+          <w:szCs w:val="22"/>
+        </w:rPr>
+        <w:t xml:space="preserve">  Pull-to-refresh reloads all companies in parallel; MoreNavigator + MoreMenuScreen ADMIN + poultryerp://comparison deep link</w:t>
       </w:r>
     </w:p>
     <w:p>

</xml_diff>

<commit_message>
docs: update PROGRESS.md, FEATURES.docx, generate-docs.js for Session 19
Session 19 additions:
- Bookmark count badge on Dashboard Bookmarks quick action tile
- PDF export for Bookmarks list, PO Detail, SO Detail, Partner Detail,
  Material Detail, Vendor Detail (AP bills), Customer Detail (AR invoices)
- 8 new exportXxxPDF functions added to pdfExport.ts
- PDF button (Feather file-text) wired into 7 detail screens
- PROGRESS.md: Session 19 entry + updated Screen Inventory table
- generate-docs.js: Section 4 table rows + Section 7 changelog entry for Session 19
</commit_message>
<xml_diff>
--- a/FEATURES.docx
+++ b/FEATURES.docx
@@ -15125,6 +15125,614 @@
           </w:p>
         </w:tc>
       </w:tr>
+      <w:tr>
+        <w:tc>
+          <w:p>
+            <w:pPr>
+              <w:spacing w:after="40" w:before="40"/>
+            </w:pPr>
+            <w:r>
+              <w:rPr>
+                <w:b w:val="false"/>
+                <w:bCs w:val="false"/>
+                <w:color w:val="1D2D3E"/>
+                <w:sz w:val="20"/>
+                <w:szCs w:val="20"/>
+              </w:rPr>
+              <w:t xml:space="preserve">Session 19</w:t>
+            </w:r>
+          </w:p>
+        </w:tc>
+        <w:tc>
+          <w:p>
+            <w:pPr>
+              <w:spacing w:after="40" w:before="40"/>
+            </w:pPr>
+            <w:r>
+              <w:rPr>
+                <w:b w:val="false"/>
+                <w:bCs w:val="false"/>
+                <w:color w:val="1D2D3E"/>
+                <w:sz w:val="20"/>
+                <w:szCs w:val="20"/>
+              </w:rPr>
+              <w:t xml:space="preserve">Bookmark count badge on Dashboard Bookmarks quick action tile</w:t>
+            </w:r>
+          </w:p>
+        </w:tc>
+        <w:tc>
+          <w:p>
+            <w:pPr>
+              <w:spacing w:after="40" w:before="40"/>
+            </w:pPr>
+            <w:r>
+              <w:rPr>
+                <w:b w:val="false"/>
+                <w:bCs w:val="false"/>
+                <w:color w:val="1D2D3E"/>
+                <w:sz w:val="20"/>
+                <w:szCs w:val="20"/>
+              </w:rPr>
+              <w:t xml:space="preserve">Done</w:t>
+            </w:r>
+          </w:p>
+        </w:tc>
+        <w:tc>
+          <w:p>
+            <w:pPr>
+              <w:spacing w:after="40" w:before="40"/>
+            </w:pPr>
+            <w:r>
+              <w:rPr>
+                <w:b w:val="false"/>
+                <w:bCs w:val="false"/>
+                <w:color w:val="1D2D3E"/>
+                <w:sz w:val="20"/>
+                <w:szCs w:val="20"/>
+              </w:rPr>
+              <w:t xml:space="preserve">DashboardScreen.tsx</w:t>
+            </w:r>
+          </w:p>
+        </w:tc>
+      </w:tr>
+      <w:tr>
+        <w:tc>
+          <w:tcPr>
+            <w:shd w:color="F0F4F8" w:val="solid"/>
+          </w:tcPr>
+          <w:p>
+            <w:pPr>
+              <w:spacing w:after="40" w:before="40"/>
+            </w:pPr>
+            <w:r>
+              <w:rPr>
+                <w:b w:val="false"/>
+                <w:bCs w:val="false"/>
+                <w:color w:val="1D2D3E"/>
+                <w:sz w:val="20"/>
+                <w:szCs w:val="20"/>
+              </w:rPr>
+              <w:t xml:space="preserve">Session 19</w:t>
+            </w:r>
+          </w:p>
+        </w:tc>
+        <w:tc>
+          <w:tcPr>
+            <w:shd w:color="F0F4F8" w:val="solid"/>
+          </w:tcPr>
+          <w:p>
+            <w:pPr>
+              <w:spacing w:after="40" w:before="40"/>
+            </w:pPr>
+            <w:r>
+              <w:rPr>
+                <w:b w:val="false"/>
+                <w:bCs w:val="false"/>
+                <w:color w:val="1D2D3E"/>
+                <w:sz w:val="20"/>
+                <w:szCs w:val="20"/>
+              </w:rPr>
+              <w:t xml:space="preserve">PDF export — Bookmarks list (grouped by type with title/amount/date)</w:t>
+            </w:r>
+          </w:p>
+        </w:tc>
+        <w:tc>
+          <w:tcPr>
+            <w:shd w:color="F0F4F8" w:val="solid"/>
+          </w:tcPr>
+          <w:p>
+            <w:pPr>
+              <w:spacing w:after="40" w:before="40"/>
+            </w:pPr>
+            <w:r>
+              <w:rPr>
+                <w:b w:val="false"/>
+                <w:bCs w:val="false"/>
+                <w:color w:val="1D2D3E"/>
+                <w:sz w:val="20"/>
+                <w:szCs w:val="20"/>
+              </w:rPr>
+              <w:t xml:space="preserve">Done</w:t>
+            </w:r>
+          </w:p>
+        </w:tc>
+        <w:tc>
+          <w:tcPr>
+            <w:shd w:color="F0F4F8" w:val="solid"/>
+          </w:tcPr>
+          <w:p>
+            <w:pPr>
+              <w:spacing w:after="40" w:before="40"/>
+            </w:pPr>
+            <w:r>
+              <w:rPr>
+                <w:b w:val="false"/>
+                <w:bCs w:val="false"/>
+                <w:color w:val="1D2D3E"/>
+                <w:sz w:val="20"/>
+                <w:szCs w:val="20"/>
+              </w:rPr>
+              <w:t xml:space="preserve">pdfExport.ts exportBookmarksPDF</w:t>
+            </w:r>
+          </w:p>
+        </w:tc>
+      </w:tr>
+      <w:tr>
+        <w:tc>
+          <w:p>
+            <w:pPr>
+              <w:spacing w:after="40" w:before="40"/>
+            </w:pPr>
+            <w:r>
+              <w:rPr>
+                <w:b w:val="false"/>
+                <w:bCs w:val="false"/>
+                <w:color w:val="1D2D3E"/>
+                <w:sz w:val="20"/>
+                <w:szCs w:val="20"/>
+              </w:rPr>
+              <w:t xml:space="preserve">Session 19</w:t>
+            </w:r>
+          </w:p>
+        </w:tc>
+        <w:tc>
+          <w:p>
+            <w:pPr>
+              <w:spacing w:after="40" w:before="40"/>
+            </w:pPr>
+            <w:r>
+              <w:rPr>
+                <w:b w:val="false"/>
+                <w:bCs w:val="false"/>
+                <w:color w:val="1D2D3E"/>
+                <w:sz w:val="20"/>
+                <w:szCs w:val="20"/>
+              </w:rPr>
+              <w:t xml:space="preserve">PDF export — Purchase Order detail (summary + receipt progress + line items)</w:t>
+            </w:r>
+          </w:p>
+        </w:tc>
+        <w:tc>
+          <w:p>
+            <w:pPr>
+              <w:spacing w:after="40" w:before="40"/>
+            </w:pPr>
+            <w:r>
+              <w:rPr>
+                <w:b w:val="false"/>
+                <w:bCs w:val="false"/>
+                <w:color w:val="1D2D3E"/>
+                <w:sz w:val="20"/>
+                <w:szCs w:val="20"/>
+              </w:rPr>
+              <w:t xml:space="preserve">Done</w:t>
+            </w:r>
+          </w:p>
+        </w:tc>
+        <w:tc>
+          <w:p>
+            <w:pPr>
+              <w:spacing w:after="40" w:before="40"/>
+            </w:pPr>
+            <w:r>
+              <w:rPr>
+                <w:b w:val="false"/>
+                <w:bCs w:val="false"/>
+                <w:color w:val="1D2D3E"/>
+                <w:sz w:val="20"/>
+                <w:szCs w:val="20"/>
+              </w:rPr>
+              <w:t xml:space="preserve">pdfExport.ts exportPODetailPDF</w:t>
+            </w:r>
+          </w:p>
+        </w:tc>
+      </w:tr>
+      <w:tr>
+        <w:tc>
+          <w:tcPr>
+            <w:shd w:color="F0F4F8" w:val="solid"/>
+          </w:tcPr>
+          <w:p>
+            <w:pPr>
+              <w:spacing w:after="40" w:before="40"/>
+            </w:pPr>
+            <w:r>
+              <w:rPr>
+                <w:b w:val="false"/>
+                <w:bCs w:val="false"/>
+                <w:color w:val="1D2D3E"/>
+                <w:sz w:val="20"/>
+                <w:szCs w:val="20"/>
+              </w:rPr>
+              <w:t xml:space="preserve">Session 19</w:t>
+            </w:r>
+          </w:p>
+        </w:tc>
+        <w:tc>
+          <w:tcPr>
+            <w:shd w:color="F0F4F8" w:val="solid"/>
+          </w:tcPr>
+          <w:p>
+            <w:pPr>
+              <w:spacing w:after="40" w:before="40"/>
+            </w:pPr>
+            <w:r>
+              <w:rPr>
+                <w:b w:val="false"/>
+                <w:bCs w:val="false"/>
+                <w:color w:val="1D2D3E"/>
+                <w:sz w:val="20"/>
+                <w:szCs w:val="20"/>
+              </w:rPr>
+              <w:t xml:space="preserve">PDF export — Sales Order detail (summary + line items table)</w:t>
+            </w:r>
+          </w:p>
+        </w:tc>
+        <w:tc>
+          <w:tcPr>
+            <w:shd w:color="F0F4F8" w:val="solid"/>
+          </w:tcPr>
+          <w:p>
+            <w:pPr>
+              <w:spacing w:after="40" w:before="40"/>
+            </w:pPr>
+            <w:r>
+              <w:rPr>
+                <w:b w:val="false"/>
+                <w:bCs w:val="false"/>
+                <w:color w:val="1D2D3E"/>
+                <w:sz w:val="20"/>
+                <w:szCs w:val="20"/>
+              </w:rPr>
+              <w:t xml:space="preserve">Done</w:t>
+            </w:r>
+          </w:p>
+        </w:tc>
+        <w:tc>
+          <w:tcPr>
+            <w:shd w:color="F0F4F8" w:val="solid"/>
+          </w:tcPr>
+          <w:p>
+            <w:pPr>
+              <w:spacing w:after="40" w:before="40"/>
+            </w:pPr>
+            <w:r>
+              <w:rPr>
+                <w:b w:val="false"/>
+                <w:bCs w:val="false"/>
+                <w:color w:val="1D2D3E"/>
+                <w:sz w:val="20"/>
+                <w:szCs w:val="20"/>
+              </w:rPr>
+              <w:t xml:space="preserve">pdfExport.ts exportSODetailPDF</w:t>
+            </w:r>
+          </w:p>
+        </w:tc>
+      </w:tr>
+      <w:tr>
+        <w:tc>
+          <w:p>
+            <w:pPr>
+              <w:spacing w:after="40" w:before="40"/>
+            </w:pPr>
+            <w:r>
+              <w:rPr>
+                <w:b w:val="false"/>
+                <w:bCs w:val="false"/>
+                <w:color w:val="1D2D3E"/>
+                <w:sz w:val="20"/>
+                <w:szCs w:val="20"/>
+              </w:rPr>
+              <w:t xml:space="preserve">Session 19</w:t>
+            </w:r>
+          </w:p>
+        </w:tc>
+        <w:tc>
+          <w:p>
+            <w:pPr>
+              <w:spacing w:after="40" w:before="40"/>
+            </w:pPr>
+            <w:r>
+              <w:rPr>
+                <w:b w:val="false"/>
+                <w:bCs w:val="false"/>
+                <w:color w:val="1D2D3E"/>
+                <w:sz w:val="20"/>
+                <w:szCs w:val="20"/>
+              </w:rPr>
+              <w:t xml:space="preserve">PDF export — Partner Detail (PO + SO history tables)</w:t>
+            </w:r>
+          </w:p>
+        </w:tc>
+        <w:tc>
+          <w:p>
+            <w:pPr>
+              <w:spacing w:after="40" w:before="40"/>
+            </w:pPr>
+            <w:r>
+              <w:rPr>
+                <w:b w:val="false"/>
+                <w:bCs w:val="false"/>
+                <w:color w:val="1D2D3E"/>
+                <w:sz w:val="20"/>
+                <w:szCs w:val="20"/>
+              </w:rPr>
+              <w:t xml:space="preserve">Done</w:t>
+            </w:r>
+          </w:p>
+        </w:tc>
+        <w:tc>
+          <w:p>
+            <w:pPr>
+              <w:spacing w:after="40" w:before="40"/>
+            </w:pPr>
+            <w:r>
+              <w:rPr>
+                <w:b w:val="false"/>
+                <w:bCs w:val="false"/>
+                <w:color w:val="1D2D3E"/>
+                <w:sz w:val="20"/>
+                <w:szCs w:val="20"/>
+              </w:rPr>
+              <w:t xml:space="preserve">pdfExport.ts exportPartnerDetailPDF</w:t>
+            </w:r>
+          </w:p>
+        </w:tc>
+      </w:tr>
+      <w:tr>
+        <w:tc>
+          <w:tcPr>
+            <w:shd w:color="F0F4F8" w:val="solid"/>
+          </w:tcPr>
+          <w:p>
+            <w:pPr>
+              <w:spacing w:after="40" w:before="40"/>
+            </w:pPr>
+            <w:r>
+              <w:rPr>
+                <w:b w:val="false"/>
+                <w:bCs w:val="false"/>
+                <w:color w:val="1D2D3E"/>
+                <w:sz w:val="20"/>
+                <w:szCs w:val="20"/>
+              </w:rPr>
+              <w:t xml:space="preserve">Session 19</w:t>
+            </w:r>
+          </w:p>
+        </w:tc>
+        <w:tc>
+          <w:tcPr>
+            <w:shd w:color="F0F4F8" w:val="solid"/>
+          </w:tcPr>
+          <w:p>
+            <w:pPr>
+              <w:spacing w:after="40" w:before="40"/>
+            </w:pPr>
+            <w:r>
+              <w:rPr>
+                <w:b w:val="false"/>
+                <w:bCs w:val="false"/>
+                <w:color w:val="1D2D3E"/>
+                <w:sz w:val="20"/>
+                <w:szCs w:val="20"/>
+              </w:rPr>
+              <w:t xml:space="preserve">PDF export — Material Detail (stock by warehouse + ledger table)</w:t>
+            </w:r>
+          </w:p>
+        </w:tc>
+        <w:tc>
+          <w:tcPr>
+            <w:shd w:color="F0F4F8" w:val="solid"/>
+          </w:tcPr>
+          <w:p>
+            <w:pPr>
+              <w:spacing w:after="40" w:before="40"/>
+            </w:pPr>
+            <w:r>
+              <w:rPr>
+                <w:b w:val="false"/>
+                <w:bCs w:val="false"/>
+                <w:color w:val="1D2D3E"/>
+                <w:sz w:val="20"/>
+                <w:szCs w:val="20"/>
+              </w:rPr>
+              <w:t xml:space="preserve">Done</w:t>
+            </w:r>
+          </w:p>
+        </w:tc>
+        <w:tc>
+          <w:tcPr>
+            <w:shd w:color="F0F4F8" w:val="solid"/>
+          </w:tcPr>
+          <w:p>
+            <w:pPr>
+              <w:spacing w:after="40" w:before="40"/>
+            </w:pPr>
+            <w:r>
+              <w:rPr>
+                <w:b w:val="false"/>
+                <w:bCs w:val="false"/>
+                <w:color w:val="1D2D3E"/>
+                <w:sz w:val="20"/>
+                <w:szCs w:val="20"/>
+              </w:rPr>
+              <w:t xml:space="preserve">pdfExport.ts exportMaterialDetailPDF</w:t>
+            </w:r>
+          </w:p>
+        </w:tc>
+      </w:tr>
+      <w:tr>
+        <w:tc>
+          <w:p>
+            <w:pPr>
+              <w:spacing w:after="40" w:before="40"/>
+            </w:pPr>
+            <w:r>
+              <w:rPr>
+                <w:b w:val="false"/>
+                <w:bCs w:val="false"/>
+                <w:color w:val="1D2D3E"/>
+                <w:sz w:val="20"/>
+                <w:szCs w:val="20"/>
+              </w:rPr>
+              <w:t xml:space="preserve">Session 19</w:t>
+            </w:r>
+          </w:p>
+        </w:tc>
+        <w:tc>
+          <w:p>
+            <w:pPr>
+              <w:spacing w:after="40" w:before="40"/>
+            </w:pPr>
+            <w:r>
+              <w:rPr>
+                <w:b w:val="false"/>
+                <w:bCs w:val="false"/>
+                <w:color w:val="1D2D3E"/>
+                <w:sz w:val="20"/>
+                <w:szCs w:val="20"/>
+              </w:rPr>
+              <w:t xml:space="preserve">PDF export — Vendor Detail (AP bills with overdue summary)</w:t>
+            </w:r>
+          </w:p>
+        </w:tc>
+        <w:tc>
+          <w:p>
+            <w:pPr>
+              <w:spacing w:after="40" w:before="40"/>
+            </w:pPr>
+            <w:r>
+              <w:rPr>
+                <w:b w:val="false"/>
+                <w:bCs w:val="false"/>
+                <w:color w:val="1D2D3E"/>
+                <w:sz w:val="20"/>
+                <w:szCs w:val="20"/>
+              </w:rPr>
+              <w:t xml:space="preserve">Done</w:t>
+            </w:r>
+          </w:p>
+        </w:tc>
+        <w:tc>
+          <w:p>
+            <w:pPr>
+              <w:spacing w:after="40" w:before="40"/>
+            </w:pPr>
+            <w:r>
+              <w:rPr>
+                <w:b w:val="false"/>
+                <w:bCs w:val="false"/>
+                <w:color w:val="1D2D3E"/>
+                <w:sz w:val="20"/>
+                <w:szCs w:val="20"/>
+              </w:rPr>
+              <w:t xml:space="preserve">pdfExport.ts exportVendorDetailPDF</w:t>
+            </w:r>
+          </w:p>
+        </w:tc>
+      </w:tr>
+      <w:tr>
+        <w:tc>
+          <w:tcPr>
+            <w:shd w:color="F0F4F8" w:val="solid"/>
+          </w:tcPr>
+          <w:p>
+            <w:pPr>
+              <w:spacing w:after="40" w:before="40"/>
+            </w:pPr>
+            <w:r>
+              <w:rPr>
+                <w:b w:val="false"/>
+                <w:bCs w:val="false"/>
+                <w:color w:val="1D2D3E"/>
+                <w:sz w:val="20"/>
+                <w:szCs w:val="20"/>
+              </w:rPr>
+              <w:t xml:space="preserve">Session 19</w:t>
+            </w:r>
+          </w:p>
+        </w:tc>
+        <w:tc>
+          <w:tcPr>
+            <w:shd w:color="F0F4F8" w:val="solid"/>
+          </w:tcPr>
+          <w:p>
+            <w:pPr>
+              <w:spacing w:after="40" w:before="40"/>
+            </w:pPr>
+            <w:r>
+              <w:rPr>
+                <w:b w:val="false"/>
+                <w:bCs w:val="false"/>
+                <w:color w:val="1D2D3E"/>
+                <w:sz w:val="20"/>
+                <w:szCs w:val="20"/>
+              </w:rPr>
+              <w:t xml:space="preserve">PDF export — Customer Detail (AR invoices with overdue summary)</w:t>
+            </w:r>
+          </w:p>
+        </w:tc>
+        <w:tc>
+          <w:tcPr>
+            <w:shd w:color="F0F4F8" w:val="solid"/>
+          </w:tcPr>
+          <w:p>
+            <w:pPr>
+              <w:spacing w:after="40" w:before="40"/>
+            </w:pPr>
+            <w:r>
+              <w:rPr>
+                <w:b w:val="false"/>
+                <w:bCs w:val="false"/>
+                <w:color w:val="1D2D3E"/>
+                <w:sz w:val="20"/>
+                <w:szCs w:val="20"/>
+              </w:rPr>
+              <w:t xml:space="preserve">Done</w:t>
+            </w:r>
+          </w:p>
+        </w:tc>
+        <w:tc>
+          <w:tcPr>
+            <w:shd w:color="F0F4F8" w:val="solid"/>
+          </w:tcPr>
+          <w:p>
+            <w:pPr>
+              <w:spacing w:after="40" w:before="40"/>
+            </w:pPr>
+            <w:r>
+              <w:rPr>
+                <w:b w:val="false"/>
+                <w:bCs w:val="false"/>
+                <w:color w:val="1D2D3E"/>
+                <w:sz w:val="20"/>
+                <w:szCs w:val="20"/>
+              </w:rPr>
+              <w:t xml:space="preserve">pdfExport.ts exportCustomerDetailPDF</w:t>
+            </w:r>
+          </w:p>
+        </w:tc>
+      </w:tr>
     </w:tbl>
     <w:p>
       <w:pPr>
@@ -18839,6 +19447,501 @@
           <w:szCs w:val="22"/>
         </w:rPr>
         <w:t xml:space="preserve">AccountsReceivableScreen: same AgingChart migration</w:t>
+      </w:r>
+    </w:p>
+    <w:p>
+      <w:pPr>
+        <w:spacing w:after="80"/>
+      </w:pPr>
+      <w:r>
+        <w:rPr>
+          <w:color w:val="1D2D3E"/>
+          <w:sz w:val="22"/>
+          <w:szCs w:val="22"/>
+        </w:rPr>
+        <w:t xml:space="preserve"/>
+      </w:r>
+    </w:p>
+    <w:p>
+      <w:pPr>
+        <w:pStyle w:val="Heading2"/>
+        <w:spacing w:after="120" w:before="300"/>
+      </w:pPr>
+      <w:r>
+        <w:rPr>
+          <w:b/>
+          <w:bCs/>
+          <w:color w:val="1D2D3E"/>
+        </w:rPr>
+        <w:t xml:space="preserve">Session 19 — 2026-05-25</w:t>
+      </w:r>
+    </w:p>
+    <w:p>
+      <w:pPr>
+        <w:pStyle w:val="ListParagraph"/>
+        <w:numPr>
+          <w:ilvl w:val="0"/>
+          <w:numId w:val="1"/>
+        </w:numPr>
+        <w:spacing w:after="40"/>
+      </w:pPr>
+      <w:r>
+        <w:rPr>
+          <w:color w:val="1D2D3E"/>
+          <w:sz w:val="22"/>
+          <w:szCs w:val="22"/>
+        </w:rPr>
+        <w:t xml:space="preserve">Bookmark count badge on Dashboard Bookmarks quick action tile</w:t>
+      </w:r>
+    </w:p>
+    <w:p>
+      <w:pPr>
+        <w:pStyle w:val="ListParagraph"/>
+        <w:numPr>
+          <w:ilvl w:val="1"/>
+          <w:numId w:val="1"/>
+        </w:numPr>
+        <w:spacing w:after="40"/>
+      </w:pPr>
+      <w:r>
+        <w:rPr>
+          <w:color w:val="1D2D3E"/>
+          <w:sz w:val="22"/>
+          <w:szCs w:val="22"/>
+        </w:rPr>
+        <w:t xml:space="preserve">  DashboardScreen: bookmarkCount state loaded from getBookmarks().length on every useFocusEffect</w:t>
+      </w:r>
+    </w:p>
+    <w:p>
+      <w:pPr>
+        <w:pStyle w:val="ListParagraph"/>
+        <w:numPr>
+          <w:ilvl w:val="1"/>
+          <w:numId w:val="1"/>
+        </w:numPr>
+        <w:spacing w:after="40"/>
+      </w:pPr>
+      <w:r>
+        <w:rPr>
+          <w:color w:val="1D2D3E"/>
+          <w:sz w:val="22"/>
+          <w:szCs w:val="22"/>
+        </w:rPr>
+        <w:t xml:space="preserve">  Badge wired into quick tile renderer alongside existing Alerts and Inbox badges</w:t>
+      </w:r>
+    </w:p>
+    <w:p>
+      <w:pPr>
+        <w:pStyle w:val="ListParagraph"/>
+        <w:numPr>
+          <w:ilvl w:val="1"/>
+          <w:numId w:val="1"/>
+        </w:numPr>
+        <w:spacing w:after="40"/>
+      </w:pPr>
+      <w:r>
+        <w:rPr>
+          <w:color w:val="1D2D3E"/>
+          <w:sz w:val="22"/>
+          <w:szCs w:val="22"/>
+        </w:rPr>
+        <w:t xml:space="preserve">  Badge shows count of saved bookmarks; disappears when count is 0</w:t>
+      </w:r>
+    </w:p>
+    <w:p>
+      <w:pPr>
+        <w:pStyle w:val="ListParagraph"/>
+        <w:numPr>
+          <w:ilvl w:val="0"/>
+          <w:numId w:val="1"/>
+        </w:numPr>
+        <w:spacing w:after="40"/>
+      </w:pPr>
+      <w:r>
+        <w:rPr>
+          <w:color w:val="1D2D3E"/>
+          <w:sz w:val="22"/>
+          <w:szCs w:val="22"/>
+        </w:rPr>
+        <w:t xml:space="preserve">PDF export — BookmarksScreen</w:t>
+      </w:r>
+    </w:p>
+    <w:p>
+      <w:pPr>
+        <w:pStyle w:val="ListParagraph"/>
+        <w:numPr>
+          <w:ilvl w:val="1"/>
+          <w:numId w:val="1"/>
+        </w:numPr>
+        <w:spacing w:after="40"/>
+      </w:pPr>
+      <w:r>
+        <w:rPr>
+          <w:color w:val="1D2D3E"/>
+          <w:sz w:val="22"/>
+          <w:szCs w:val="22"/>
+        </w:rPr>
+        <w:t xml:space="preserve">  exportBookmarksPDF(): summary grid by type, then per-type tables (title / details / amount / saved date)</w:t>
+      </w:r>
+    </w:p>
+    <w:p>
+      <w:pPr>
+        <w:pStyle w:val="ListParagraph"/>
+        <w:numPr>
+          <w:ilvl w:val="1"/>
+          <w:numId w:val="1"/>
+        </w:numPr>
+        <w:spacing w:after="40"/>
+      </w:pPr>
+      <w:r>
+        <w:rPr>
+          <w:color w:val="1D2D3E"/>
+          <w:sz w:val="22"/>
+          <w:szCs w:val="22"/>
+        </w:rPr>
+        <w:t xml:space="preserve">  Feather file-text button added to BookmarksScreen header alongside Clear all; only visible when list non-empty</w:t>
+      </w:r>
+    </w:p>
+    <w:p>
+      <w:pPr>
+        <w:pStyle w:val="ListParagraph"/>
+        <w:numPr>
+          <w:ilvl w:val="0"/>
+          <w:numId w:val="1"/>
+        </w:numPr>
+        <w:spacing w:after="40"/>
+      </w:pPr>
+      <w:r>
+        <w:rPr>
+          <w:color w:val="1D2D3E"/>
+          <w:sz w:val="22"/>
+          <w:szCs w:val="22"/>
+        </w:rPr>
+        <w:t xml:space="preserve">PDF export — PurchaseOrderDetailScreen</w:t>
+      </w:r>
+    </w:p>
+    <w:p>
+      <w:pPr>
+        <w:pStyle w:val="ListParagraph"/>
+        <w:numPr>
+          <w:ilvl w:val="1"/>
+          <w:numId w:val="1"/>
+        </w:numPr>
+        <w:spacing w:after="40"/>
+      </w:pPr>
+      <w:r>
+        <w:rPr>
+          <w:color w:val="1D2D3E"/>
+          <w:sz w:val="22"/>
+          <w:szCs w:val="22"/>
+        </w:rPr>
+        <w:t xml:space="preserve">  exportPODetailPDF(po): PO summary tiles (status/amount/dates) + receipt progress bar + full line items table</w:t>
+      </w:r>
+    </w:p>
+    <w:p>
+      <w:pPr>
+        <w:pStyle w:val="ListParagraph"/>
+        <w:numPr>
+          <w:ilvl w:val="1"/>
+          <w:numId w:val="1"/>
+        </w:numPr>
+        <w:spacing w:after="40"/>
+      </w:pPr>
+      <w:r>
+        <w:rPr>
+          <w:color w:val="1D2D3E"/>
+          <w:sz w:val="22"/>
+          <w:szCs w:val="22"/>
+        </w:rPr>
+        <w:t xml:space="preserve">  Columns: item / ordered / received / pending / unit / rate / amount; totals row; filename from po_number</w:t>
+      </w:r>
+    </w:p>
+    <w:p>
+      <w:pPr>
+        <w:pStyle w:val="ListParagraph"/>
+        <w:numPr>
+          <w:ilvl w:val="1"/>
+          <w:numId w:val="1"/>
+        </w:numPr>
+        <w:spacing w:after="40"/>
+      </w:pPr>
+      <w:r>
+        <w:rPr>
+          <w:color w:val="1D2D3E"/>
+          <w:sz w:val="22"/>
+          <w:szCs w:val="22"/>
+        </w:rPr>
+        <w:t xml:space="preserve">  Feather file-text button in PO detail header between BackButton and BookmarkButton</w:t>
+      </w:r>
+    </w:p>
+    <w:p>
+      <w:pPr>
+        <w:pStyle w:val="ListParagraph"/>
+        <w:numPr>
+          <w:ilvl w:val="0"/>
+          <w:numId w:val="1"/>
+        </w:numPr>
+        <w:spacing w:after="40"/>
+      </w:pPr>
+      <w:r>
+        <w:rPr>
+          <w:color w:val="1D2D3E"/>
+          <w:sz w:val="22"/>
+          <w:szCs w:val="22"/>
+        </w:rPr>
+        <w:t xml:space="preserve">PDF export — SalesOrderDetailScreen</w:t>
+      </w:r>
+    </w:p>
+    <w:p>
+      <w:pPr>
+        <w:pStyle w:val="ListParagraph"/>
+        <w:numPr>
+          <w:ilvl w:val="1"/>
+          <w:numId w:val="1"/>
+        </w:numPr>
+        <w:spacing w:after="40"/>
+      </w:pPr>
+      <w:r>
+        <w:rPr>
+          <w:color w:val="1D2D3E"/>
+          <w:sz w:val="22"/>
+          <w:szCs w:val="22"/>
+        </w:rPr>
+        <w:t xml:space="preserve">  exportSODetailPDF(so): SO summary tiles + line items table (qty/unit/rate/amount); totals row; filename from so_number</w:t>
+      </w:r>
+    </w:p>
+    <w:p>
+      <w:pPr>
+        <w:pStyle w:val="ListParagraph"/>
+        <w:numPr>
+          <w:ilvl w:val="1"/>
+          <w:numId w:val="1"/>
+        </w:numPr>
+        <w:spacing w:after="40"/>
+      </w:pPr>
+      <w:r>
+        <w:rPr>
+          <w:color w:val="1D2D3E"/>
+          <w:sz w:val="22"/>
+          <w:szCs w:val="22"/>
+        </w:rPr>
+        <w:t xml:space="preserve">  Feather file-text button in SO detail header between BackButton and BookmarkButton</w:t>
+      </w:r>
+    </w:p>
+    <w:p>
+      <w:pPr>
+        <w:pStyle w:val="ListParagraph"/>
+        <w:numPr>
+          <w:ilvl w:val="0"/>
+          <w:numId w:val="1"/>
+        </w:numPr>
+        <w:spacing w:after="40"/>
+      </w:pPr>
+      <w:r>
+        <w:rPr>
+          <w:color w:val="1D2D3E"/>
+          <w:sz w:val="22"/>
+          <w:szCs w:val="22"/>
+        </w:rPr>
+        <w:t xml:space="preserve">PDF export — PartnerDetailScreen</w:t>
+      </w:r>
+    </w:p>
+    <w:p>
+      <w:pPr>
+        <w:pStyle w:val="ListParagraph"/>
+        <w:numPr>
+          <w:ilvl w:val="1"/>
+          <w:numId w:val="1"/>
+        </w:numPr>
+        <w:spacing w:after="40"/>
+      </w:pPr>
+      <w:r>
+        <w:rPr>
+          <w:color w:val="1D2D3E"/>
+          <w:sz w:val="22"/>
+          <w:szCs w:val="22"/>
+        </w:rPr>
+        <w:t xml:space="preserve">  exportPartnerDetailPDF(): PO + SO summary tiles, separate PO/SO tables with date/status/amount, totals rows</w:t>
+      </w:r>
+    </w:p>
+    <w:p>
+      <w:pPr>
+        <w:pStyle w:val="ListParagraph"/>
+        <w:numPr>
+          <w:ilvl w:val="1"/>
+          <w:numId w:val="1"/>
+        </w:numPr>
+        <w:spacing w:after="40"/>
+      </w:pPr>
+      <w:r>
+        <w:rPr>
+          <w:color w:val="1D2D3E"/>
+          <w:sz w:val="22"/>
+          <w:szCs w:val="22"/>
+        </w:rPr>
+        <w:t xml:space="preserve">  Feather file-text button in PartnerDetail header; filename from partnerName</w:t>
+      </w:r>
+    </w:p>
+    <w:p>
+      <w:pPr>
+        <w:pStyle w:val="ListParagraph"/>
+        <w:numPr>
+          <w:ilvl w:val="0"/>
+          <w:numId w:val="1"/>
+        </w:numPr>
+        <w:spacing w:after="40"/>
+      </w:pPr>
+      <w:r>
+        <w:rPr>
+          <w:color w:val="1D2D3E"/>
+          <w:sz w:val="22"/>
+          <w:szCs w:val="22"/>
+        </w:rPr>
+        <w:t xml:space="preserve">PDF export — MaterialDetailScreen</w:t>
+      </w:r>
+    </w:p>
+    <w:p>
+      <w:pPr>
+        <w:pStyle w:val="ListParagraph"/>
+        <w:numPr>
+          <w:ilvl w:val="1"/>
+          <w:numId w:val="1"/>
+        </w:numPr>
+        <w:spacing w:after="40"/>
+      </w:pPr>
+      <w:r>
+        <w:rPr>
+          <w:color w:val="1D2D3E"/>
+          <w:sz w:val="22"/>
+          <w:szCs w:val="22"/>
+        </w:rPr>
+        <w:t xml:space="preserve">  exportMaterialDetailPDF(): 4-tile summary, stock-by-warehouse table, ledger table (date/type/voucher/wh/in/out/balance)</w:t>
+      </w:r>
+    </w:p>
+    <w:p>
+      <w:pPr>
+        <w:pStyle w:val="ListParagraph"/>
+        <w:numPr>
+          <w:ilvl w:val="1"/>
+          <w:numId w:val="1"/>
+        </w:numPr>
+        <w:spacing w:after="40"/>
+      </w:pPr>
+      <w:r>
+        <w:rPr>
+          <w:color w:val="1D2D3E"/>
+          <w:sz w:val="22"/>
+          <w:szCs w:val="22"/>
+        </w:rPr>
+        <w:t xml:space="preserve">  Feather file-text button in MaterialDetail header; receives live stock+ledger state at press time</w:t>
+      </w:r>
+    </w:p>
+    <w:p>
+      <w:pPr>
+        <w:pStyle w:val="ListParagraph"/>
+        <w:numPr>
+          <w:ilvl w:val="0"/>
+          <w:numId w:val="1"/>
+        </w:numPr>
+        <w:spacing w:after="40"/>
+      </w:pPr>
+      <w:r>
+        <w:rPr>
+          <w:color w:val="1D2D3E"/>
+          <w:sz w:val="22"/>
+          <w:szCs w:val="22"/>
+        </w:rPr>
+        <w:t xml:space="preserve">PDF export — VendorDetailScreen</w:t>
+      </w:r>
+    </w:p>
+    <w:p>
+      <w:pPr>
+        <w:pStyle w:val="ListParagraph"/>
+        <w:numPr>
+          <w:ilvl w:val="1"/>
+          <w:numId w:val="1"/>
+        </w:numPr>
+        <w:spacing w:after="40"/>
+      </w:pPr>
+      <w:r>
+        <w:rPr>
+          <w:color w:val="1D2D3E"/>
+          <w:sz w:val="22"/>
+          <w:szCs w:val="22"/>
+        </w:rPr>
+        <w:t xml:space="preserve">  exportVendorDetailPDF(): 4-tile summary (outstanding/overdue/total/count), bills table with amount/paid/outstanding</w:t>
+      </w:r>
+    </w:p>
+    <w:p>
+      <w:pPr>
+        <w:pStyle w:val="ListParagraph"/>
+        <w:numPr>
+          <w:ilvl w:val="1"/>
+          <w:numId w:val="1"/>
+        </w:numPr>
+        <w:spacing w:after="40"/>
+      </w:pPr>
+      <w:r>
+        <w:rPr>
+          <w:color w:val="1D2D3E"/>
+          <w:sz w:val="22"/>
+          <w:szCs w:val="22"/>
+        </w:rPr>
+        <w:t xml:space="preserve">  Button only visible when bills.length &gt; 0; filename from vendorName</w:t>
+      </w:r>
+    </w:p>
+    <w:p>
+      <w:pPr>
+        <w:pStyle w:val="ListParagraph"/>
+        <w:numPr>
+          <w:ilvl w:val="0"/>
+          <w:numId w:val="1"/>
+        </w:numPr>
+        <w:spacing w:after="40"/>
+      </w:pPr>
+      <w:r>
+        <w:rPr>
+          <w:color w:val="1D2D3E"/>
+          <w:sz w:val="22"/>
+          <w:szCs w:val="22"/>
+        </w:rPr>
+        <w:t xml:space="preserve">PDF export — CustomerDetailScreen</w:t>
+      </w:r>
+    </w:p>
+    <w:p>
+      <w:pPr>
+        <w:pStyle w:val="ListParagraph"/>
+        <w:numPr>
+          <w:ilvl w:val="1"/>
+          <w:numId w:val="1"/>
+        </w:numPr>
+        <w:spacing w:after="40"/>
+      </w:pPr>
+      <w:r>
+        <w:rPr>
+          <w:color w:val="1D2D3E"/>
+          <w:sz w:val="22"/>
+          <w:szCs w:val="22"/>
+        </w:rPr>
+        <w:t xml:space="preserve">  exportCustomerDetailPDF(): same pattern as Vendor but for AR invoices</w:t>
+      </w:r>
+    </w:p>
+    <w:p>
+      <w:pPr>
+        <w:pStyle w:val="ListParagraph"/>
+        <w:numPr>
+          <w:ilvl w:val="1"/>
+          <w:numId w:val="1"/>
+        </w:numPr>
+        <w:spacing w:after="40"/>
+      </w:pPr>
+      <w:r>
+        <w:rPr>
+          <w:color w:val="1D2D3E"/>
+          <w:sz w:val="22"/>
+          <w:szCs w:val="22"/>
+        </w:rPr>
+        <w:t xml:space="preserve">  Button only visible when invoices.length &gt; 0; filename from customerName</w:t>
       </w:r>
     </w:p>
     <w:p>

</xml_diff>

<commit_message>
docs: update PROGRESS.md, FEATURES.docx, generate-docs.js for Session 20
- PROGRESS.md: Session 20 section with Item Ledger PDF, GRN PDF, Cash Flow
  screen, and Dashboard quick actions expansion
- generate-docs.js: Session 20 changelog entry; updated roadmap table rows;
  updated pdfExport.ts bullet with all 14 export functions; added CashFlow
  screen to directory structure
- FEATURES.docx: regenerated from updated generate-docs.js

https://claude.ai/code/session_01KrZo2iavrNyrKBK1gRBxrA
</commit_message>
<xml_diff>
--- a/FEATURES.docx
+++ b/FEATURES.docx
@@ -45,7 +45,7 @@
           <w:sz w:val="20"/>
           <w:szCs w:val="20"/>
         </w:rPr>
-        <w:t xml:space="preserve">Generated: 2026-05-25</w:t>
+        <w:t xml:space="preserve">Generated: 2026-05-26</w:t>
       </w:r>
     </w:p>
     <w:p>
@@ -15733,6 +15733,310 @@
           </w:p>
         </w:tc>
       </w:tr>
+      <w:tr>
+        <w:tc>
+          <w:p>
+            <w:pPr>
+              <w:spacing w:after="40" w:before="40"/>
+            </w:pPr>
+            <w:r>
+              <w:rPr>
+                <w:b w:val="false"/>
+                <w:bCs w:val="false"/>
+                <w:color w:val="1D2D3E"/>
+                <w:sz w:val="20"/>
+                <w:szCs w:val="20"/>
+              </w:rPr>
+              <w:t xml:space="preserve">Session 20</w:t>
+            </w:r>
+          </w:p>
+        </w:tc>
+        <w:tc>
+          <w:p>
+            <w:pPr>
+              <w:spacing w:after="40" w:before="40"/>
+            </w:pPr>
+            <w:r>
+              <w:rPr>
+                <w:b w:val="false"/>
+                <w:bCs w:val="false"/>
+                <w:color w:val="1D2D3E"/>
+                <w:sz w:val="20"/>
+                <w:szCs w:val="20"/>
+              </w:rPr>
+              <w:t xml:space="preserve">PDF export — Item Ledger (movement log with summary tiles + date range)</w:t>
+            </w:r>
+          </w:p>
+        </w:tc>
+        <w:tc>
+          <w:p>
+            <w:pPr>
+              <w:spacing w:after="40" w:before="40"/>
+            </w:pPr>
+            <w:r>
+              <w:rPr>
+                <w:b w:val="false"/>
+                <w:bCs w:val="false"/>
+                <w:color w:val="1D2D3E"/>
+                <w:sz w:val="20"/>
+                <w:szCs w:val="20"/>
+              </w:rPr>
+              <w:t xml:space="preserve">Done</w:t>
+            </w:r>
+          </w:p>
+        </w:tc>
+        <w:tc>
+          <w:p>
+            <w:pPr>
+              <w:spacing w:after="40" w:before="40"/>
+            </w:pPr>
+            <w:r>
+              <w:rPr>
+                <w:b w:val="false"/>
+                <w:bCs w:val="false"/>
+                <w:color w:val="1D2D3E"/>
+                <w:sz w:val="20"/>
+                <w:szCs w:val="20"/>
+              </w:rPr>
+              <w:t xml:space="preserve">pdfExport.ts exportItemLedgerPDF</w:t>
+            </w:r>
+          </w:p>
+        </w:tc>
+      </w:tr>
+      <w:tr>
+        <w:tc>
+          <w:tcPr>
+            <w:shd w:color="F0F4F8" w:val="solid"/>
+          </w:tcPr>
+          <w:p>
+            <w:pPr>
+              <w:spacing w:after="40" w:before="40"/>
+            </w:pPr>
+            <w:r>
+              <w:rPr>
+                <w:b w:val="false"/>
+                <w:bCs w:val="false"/>
+                <w:color w:val="1D2D3E"/>
+                <w:sz w:val="20"/>
+                <w:szCs w:val="20"/>
+              </w:rPr>
+              <w:t xml:space="preserve">Session 20</w:t>
+            </w:r>
+          </w:p>
+        </w:tc>
+        <w:tc>
+          <w:tcPr>
+            <w:shd w:color="F0F4F8" w:val="solid"/>
+          </w:tcPr>
+          <w:p>
+            <w:pPr>
+              <w:spacing w:after="40" w:before="40"/>
+            </w:pPr>
+            <w:r>
+              <w:rPr>
+                <w:b w:val="false"/>
+                <w:bCs w:val="false"/>
+                <w:color w:val="1D2D3E"/>
+                <w:sz w:val="20"/>
+                <w:szCs w:val="20"/>
+              </w:rPr>
+              <w:t xml:space="preserve">PDF export — GRN Goods Receipt (progress summary + per-PO table with inline bars)</w:t>
+            </w:r>
+          </w:p>
+        </w:tc>
+        <w:tc>
+          <w:tcPr>
+            <w:shd w:color="F0F4F8" w:val="solid"/>
+          </w:tcPr>
+          <w:p>
+            <w:pPr>
+              <w:spacing w:after="40" w:before="40"/>
+            </w:pPr>
+            <w:r>
+              <w:rPr>
+                <w:b w:val="false"/>
+                <w:bCs w:val="false"/>
+                <w:color w:val="1D2D3E"/>
+                <w:sz w:val="20"/>
+                <w:szCs w:val="20"/>
+              </w:rPr>
+              <w:t xml:space="preserve">Done</w:t>
+            </w:r>
+          </w:p>
+        </w:tc>
+        <w:tc>
+          <w:tcPr>
+            <w:shd w:color="F0F4F8" w:val="solid"/>
+          </w:tcPr>
+          <w:p>
+            <w:pPr>
+              <w:spacing w:after="40" w:before="40"/>
+            </w:pPr>
+            <w:r>
+              <w:rPr>
+                <w:b w:val="false"/>
+                <w:bCs w:val="false"/>
+                <w:color w:val="1D2D3E"/>
+                <w:sz w:val="20"/>
+                <w:szCs w:val="20"/>
+              </w:rPr>
+              <w:t xml:space="preserve">pdfExport.ts exportGRNPDF</w:t>
+            </w:r>
+          </w:p>
+        </w:tc>
+      </w:tr>
+      <w:tr>
+        <w:tc>
+          <w:p>
+            <w:pPr>
+              <w:spacing w:after="40" w:before="40"/>
+            </w:pPr>
+            <w:r>
+              <w:rPr>
+                <w:b w:val="false"/>
+                <w:bCs w:val="false"/>
+                <w:color w:val="1D2D3E"/>
+                <w:sz w:val="20"/>
+                <w:szCs w:val="20"/>
+              </w:rPr>
+              <w:t xml:space="preserve">Session 20</w:t>
+            </w:r>
+          </w:p>
+        </w:tc>
+        <w:tc>
+          <w:p>
+            <w:pPr>
+              <w:spacing w:after="40" w:before="40"/>
+            </w:pPr>
+            <w:r>
+              <w:rPr>
+                <w:b w:val="false"/>
+                <w:bCs w:val="false"/>
+                <w:color w:val="1D2D3E"/>
+                <w:sz w:val="20"/>
+                <w:szCs w:val="20"/>
+              </w:rPr>
+              <w:t xml:space="preserve">Cash Flow screen — upcoming AP/AR payments grouped by due date period</w:t>
+            </w:r>
+          </w:p>
+        </w:tc>
+        <w:tc>
+          <w:p>
+            <w:pPr>
+              <w:spacing w:after="40" w:before="40"/>
+            </w:pPr>
+            <w:r>
+              <w:rPr>
+                <w:b w:val="false"/>
+                <w:bCs w:val="false"/>
+                <w:color w:val="1D2D3E"/>
+                <w:sz w:val="20"/>
+                <w:szCs w:val="20"/>
+              </w:rPr>
+              <w:t xml:space="preserve">Done</w:t>
+            </w:r>
+          </w:p>
+        </w:tc>
+        <w:tc>
+          <w:p>
+            <w:pPr>
+              <w:spacing w:after="40" w:before="40"/>
+            </w:pPr>
+            <w:r>
+              <w:rPr>
+                <w:b w:val="false"/>
+                <w:bCs w:val="false"/>
+                <w:color w:val="1D2D3E"/>
+                <w:sz w:val="20"/>
+                <w:szCs w:val="20"/>
+              </w:rPr>
+              <w:t xml:space="preserve">src/screens/finance/CashFlowScreen.tsx</w:t>
+            </w:r>
+          </w:p>
+        </w:tc>
+      </w:tr>
+      <w:tr>
+        <w:tc>
+          <w:tcPr>
+            <w:shd w:color="F0F4F8" w:val="solid"/>
+          </w:tcPr>
+          <w:p>
+            <w:pPr>
+              <w:spacing w:after="40" w:before="40"/>
+            </w:pPr>
+            <w:r>
+              <w:rPr>
+                <w:b w:val="false"/>
+                <w:bCs w:val="false"/>
+                <w:color w:val="1D2D3E"/>
+                <w:sz w:val="20"/>
+                <w:szCs w:val="20"/>
+              </w:rPr>
+              <w:t xml:space="preserve">Session 20</w:t>
+            </w:r>
+          </w:p>
+        </w:tc>
+        <w:tc>
+          <w:tcPr>
+            <w:shd w:color="F0F4F8" w:val="solid"/>
+          </w:tcPr>
+          <w:p>
+            <w:pPr>
+              <w:spacing w:after="40" w:before="40"/>
+            </w:pPr>
+            <w:r>
+              <w:rPr>
+                <w:b w:val="false"/>
+                <w:bCs w:val="false"/>
+                <w:color w:val="1D2D3E"/>
+                <w:sz w:val="20"/>
+                <w:szCs w:val="20"/>
+              </w:rPr>
+              <w:t xml:space="preserve">Dashboard Quick Actions expanded: Cash Flow, Partners, Reports tiles added (12 total)</w:t>
+            </w:r>
+          </w:p>
+        </w:tc>
+        <w:tc>
+          <w:tcPr>
+            <w:shd w:color="F0F4F8" w:val="solid"/>
+          </w:tcPr>
+          <w:p>
+            <w:pPr>
+              <w:spacing w:after="40" w:before="40"/>
+            </w:pPr>
+            <w:r>
+              <w:rPr>
+                <w:b w:val="false"/>
+                <w:bCs w:val="false"/>
+                <w:color w:val="1D2D3E"/>
+                <w:sz w:val="20"/>
+                <w:szCs w:val="20"/>
+              </w:rPr>
+              <w:t xml:space="preserve">Done</w:t>
+            </w:r>
+          </w:p>
+        </w:tc>
+        <w:tc>
+          <w:tcPr>
+            <w:shd w:color="F0F4F8" w:val="solid"/>
+          </w:tcPr>
+          <w:p>
+            <w:pPr>
+              <w:spacing w:after="40" w:before="40"/>
+            </w:pPr>
+            <w:r>
+              <w:rPr>
+                <w:b w:val="false"/>
+                <w:bCs w:val="false"/>
+                <w:color w:val="1D2D3E"/>
+                <w:sz w:val="20"/>
+                <w:szCs w:val="20"/>
+              </w:rPr>
+              <w:t xml:space="preserve">DashboardScreen.tsx</w:t>
+            </w:r>
+          </w:p>
+        </w:tc>
+      </w:tr>
     </w:tbl>
     <w:p>
       <w:pPr>
@@ -16318,7 +16622,7 @@
           <w:sz w:val="22"/>
           <w:szCs w:val="22"/>
         </w:rPr>
-        <w:t xml:space="preserve">pdfExport.ts — exportTrialBalancePDF, exportPLPDF, exportBSPDF, exportJournalEntriesPDF, exportCombinedReportPDF, exportStockBalancePDF via expo-print + expo-sharing (Sessions 16–17)</w:t>
+        <w:t xml:space="preserve">pdfExport.ts — exportTrialBalancePDF, exportPLPDF, exportBSPDF, exportJournalEntriesPDF, exportCombinedReportPDF, exportStockBalancePDF, exportMaterialDetailPDF, exportPODetailPDF, exportSODetailPDF, exportPartnerDetailPDF, exportVendorDetailPDF, exportCustomerDetailPDF, exportBookmarksPDF, exportItemLedgerPDF, exportGRNPDF via expo-print + expo-sharing (Sessions 16–20)</w:t>
       </w:r>
     </w:p>
     <w:p>
@@ -16462,7 +16766,25 @@
           <w:sz w:val="22"/>
           <w:szCs w:val="22"/>
         </w:rPr>
-        <w:t xml:space="preserve">src/navigation/linking.ts — React Navigation LinkingOptions mapping poultryerp:// URLs to screen names (Sessions 16–18)</w:t>
+        <w:t xml:space="preserve">src/navigation/linking.ts — React Navigation LinkingOptions mapping poultryerp:// URLs to screen names (Sessions 16–20)</w:t>
+      </w:r>
+    </w:p>
+    <w:p>
+      <w:pPr>
+        <w:pStyle w:val="ListParagraph"/>
+        <w:numPr>
+          <w:ilvl w:val="0"/>
+          <w:numId w:val="1"/>
+        </w:numPr>
+        <w:spacing w:after="40"/>
+      </w:pPr>
+      <w:r>
+        <w:rPr>
+          <w:color w:val="1D2D3E"/>
+          <w:sz w:val="22"/>
+          <w:szCs w:val="22"/>
+        </w:rPr>
+        <w:t xml:space="preserve">src/screens/finance/CashFlowScreen.tsx — Cash Flow screen: upcoming AP bills + AR invoices grouped by due date period (Session 20)</w:t>
       </w:r>
     </w:p>
     <w:p>
@@ -19447,6 +19769,393 @@
           <w:szCs w:val="22"/>
         </w:rPr>
         <w:t xml:space="preserve">AccountsReceivableScreen: same AgingChart migration</w:t>
+      </w:r>
+    </w:p>
+    <w:p>
+      <w:pPr>
+        <w:spacing w:after="80"/>
+      </w:pPr>
+      <w:r>
+        <w:rPr>
+          <w:color w:val="1D2D3E"/>
+          <w:sz w:val="22"/>
+          <w:szCs w:val="22"/>
+        </w:rPr>
+        <w:t xml:space="preserve"/>
+      </w:r>
+    </w:p>
+    <w:p>
+      <w:pPr>
+        <w:pStyle w:val="Heading2"/>
+        <w:spacing w:after="120" w:before="300"/>
+      </w:pPr>
+      <w:r>
+        <w:rPr>
+          <w:b/>
+          <w:bCs/>
+          <w:color w:val="1D2D3E"/>
+        </w:rPr>
+        <w:t xml:space="preserve">Session 20 — 2026-05-26</w:t>
+      </w:r>
+    </w:p>
+    <w:p>
+      <w:pPr>
+        <w:pStyle w:val="ListParagraph"/>
+        <w:numPr>
+          <w:ilvl w:val="0"/>
+          <w:numId w:val="1"/>
+        </w:numPr>
+        <w:spacing w:after="40"/>
+      </w:pPr>
+      <w:r>
+        <w:rPr>
+          <w:color w:val="1D2D3E"/>
+          <w:sz w:val="22"/>
+          <w:szCs w:val="22"/>
+        </w:rPr>
+        <w:t xml:space="preserve">PDF export — Item Ledger (src/screens/inventory/ItemLedgerScreen.tsx, pdfExport.ts)</w:t>
+      </w:r>
+    </w:p>
+    <w:p>
+      <w:pPr>
+        <w:pStyle w:val="ListParagraph"/>
+        <w:numPr>
+          <w:ilvl w:val="1"/>
+          <w:numId w:val="1"/>
+        </w:numPr>
+        <w:spacing w:after="40"/>
+      </w:pPr>
+      <w:r>
+        <w:rPr>
+          <w:color w:val="1D2D3E"/>
+          <w:sz w:val="22"/>
+          <w:szCs w:val="22"/>
+        </w:rPr>
+        <w:t xml:space="preserve">  exportItemLedgerPDF(): item name + code in header, date range when filter active, 4-tile summary (total in/out/balance/count)</w:t>
+      </w:r>
+    </w:p>
+    <w:p>
+      <w:pPr>
+        <w:pStyle w:val="ListParagraph"/>
+        <w:numPr>
+          <w:ilvl w:val="1"/>
+          <w:numId w:val="1"/>
+        </w:numPr>
+        <w:spacing w:after="40"/>
+      </w:pPr>
+      <w:r>
+        <w:rPr>
+          <w:color w:val="1D2D3E"/>
+          <w:sz w:val="22"/>
+          <w:szCs w:val="22"/>
+        </w:rPr>
+        <w:t xml:space="preserve">  Full movement log table: Type | Voucher # | Date | Warehouse | In | Out | Balance | Unit</w:t>
+      </w:r>
+    </w:p>
+    <w:p>
+      <w:pPr>
+        <w:pStyle w:val="ListParagraph"/>
+        <w:numPr>
+          <w:ilvl w:val="1"/>
+          <w:numId w:val="1"/>
+        </w:numPr>
+        <w:spacing w:after="40"/>
+      </w:pPr>
+      <w:r>
+        <w:rPr>
+          <w:color w:val="1D2D3E"/>
+          <w:sz w:val="22"/>
+          <w:szCs w:val="22"/>
+        </w:rPr>
+        <w:t xml:space="preserve">  ItemLedgerScreen: Feather file-text PDF button in header; visible only when entries are loaded</w:t>
+      </w:r>
+    </w:p>
+    <w:p>
+      <w:pPr>
+        <w:pStyle w:val="ListParagraph"/>
+        <w:numPr>
+          <w:ilvl w:val="0"/>
+          <w:numId w:val="1"/>
+        </w:numPr>
+        <w:spacing w:after="40"/>
+      </w:pPr>
+      <w:r>
+        <w:rPr>
+          <w:color w:val="1D2D3E"/>
+          <w:sz w:val="22"/>
+          <w:szCs w:val="22"/>
+        </w:rPr>
+        <w:t xml:space="preserve">PDF export — GRN Goods Receipt (src/screens/grn/GRNScreen.tsx, pdfExport.ts)</w:t>
+      </w:r>
+    </w:p>
+    <w:p>
+      <w:pPr>
+        <w:pStyle w:val="ListParagraph"/>
+        <w:numPr>
+          <w:ilvl w:val="1"/>
+          <w:numId w:val="1"/>
+        </w:numPr>
+        <w:spacing w:after="40"/>
+      </w:pPr>
+      <w:r>
+        <w:rPr>
+          <w:color w:val="1D2D3E"/>
+          <w:sz w:val="22"/>
+          <w:szCs w:val="22"/>
+        </w:rPr>
+        <w:t xml:space="preserve">  exportGRNPDF(): 4-tile summary (PO count/complete count/overall pct/value received)</w:t>
+      </w:r>
+    </w:p>
+    <w:p>
+      <w:pPr>
+        <w:pStyle w:val="ListParagraph"/>
+        <w:numPr>
+          <w:ilvl w:val="1"/>
+          <w:numId w:val="1"/>
+        </w:numPr>
+        <w:spacing w:after="40"/>
+      </w:pPr>
+      <w:r>
+        <w:rPr>
+          <w:color w:val="1D2D3E"/>
+          <w:sz w:val="22"/>
+          <w:szCs w:val="22"/>
+        </w:rPr>
+        <w:t xml:space="preserve">  Per-PO table with inline CSS progress bar + expandable line item sub-rows (item name + received/ordered/pct)</w:t>
+      </w:r>
+    </w:p>
+    <w:p>
+      <w:pPr>
+        <w:pStyle w:val="ListParagraph"/>
+        <w:numPr>
+          <w:ilvl w:val="1"/>
+          <w:numId w:val="1"/>
+        </w:numPr>
+        <w:spacing w:after="40"/>
+      </w:pPr>
+      <w:r>
+        <w:rPr>
+          <w:color w:val="1D2D3E"/>
+          <w:sz w:val="22"/>
+          <w:szCs w:val="22"/>
+        </w:rPr>
+        <w:t xml:space="preserve">  GRNScreen: CompanyContext added; Feather file-text PDF button in header; visible when orders loaded</w:t>
+      </w:r>
+    </w:p>
+    <w:p>
+      <w:pPr>
+        <w:pStyle w:val="ListParagraph"/>
+        <w:numPr>
+          <w:ilvl w:val="1"/>
+          <w:numId w:val="1"/>
+        </w:numPr>
+        <w:spacing w:after="40"/>
+      </w:pPr>
+      <w:r>
+        <w:rPr>
+          <w:color w:val="1D2D3E"/>
+          <w:sz w:val="22"/>
+          <w:szCs w:val="22"/>
+        </w:rPr>
+        <w:t xml:space="preserve">  GRNScreen: header alignItems baseline → center to accommodate the icon button</w:t>
+      </w:r>
+    </w:p>
+    <w:p>
+      <w:pPr>
+        <w:pStyle w:val="ListParagraph"/>
+        <w:numPr>
+          <w:ilvl w:val="0"/>
+          <w:numId w:val="1"/>
+        </w:numPr>
+        <w:spacing w:after="40"/>
+      </w:pPr>
+      <w:r>
+        <w:rPr>
+          <w:color w:val="1D2D3E"/>
+          <w:sz w:val="22"/>
+          <w:szCs w:val="22"/>
+        </w:rPr>
+        <w:t xml:space="preserve">Cash Flow screen (src/screens/finance/CashFlowScreen.tsx)</w:t>
+      </w:r>
+    </w:p>
+    <w:p>
+      <w:pPr>
+        <w:pStyle w:val="ListParagraph"/>
+        <w:numPr>
+          <w:ilvl w:val="1"/>
+          <w:numId w:val="1"/>
+        </w:numPr>
+        <w:spacing w:after="40"/>
+      </w:pPr>
+      <w:r>
+        <w:rPr>
+          <w:color w:val="1D2D3E"/>
+          <w:sz w:val="22"/>
+          <w:szCs w:val="22"/>
+        </w:rPr>
+        <w:t xml:space="preserve">  Fetches outstanding AP bills + AR invoices in parallel; filters to only items with outstanding &gt; 0</w:t>
+      </w:r>
+    </w:p>
+    <w:p>
+      <w:pPr>
+        <w:pStyle w:val="ListParagraph"/>
+        <w:numPr>
+          <w:ilvl w:val="1"/>
+          <w:numId w:val="1"/>
+        </w:numPr>
+        <w:spacing w:after="40"/>
+      </w:pPr>
+      <w:r>
+        <w:rPr>
+          <w:color w:val="1D2D3E"/>
+          <w:sz w:val="22"/>
+          <w:szCs w:val="22"/>
+        </w:rPr>
+        <w:t xml:space="preserve">  Periods: Overdue | This Week | Next Week | 2-3 Weeks | 3-4 Weeks | 30+ Days | No Due Date</w:t>
+      </w:r>
+    </w:p>
+    <w:p>
+      <w:pPr>
+        <w:pStyle w:val="ListParagraph"/>
+        <w:numPr>
+          <w:ilvl w:val="1"/>
+          <w:numId w:val="1"/>
+        </w:numPr>
+        <w:spacing w:after="40"/>
+      </w:pPr>
+      <w:r>
+        <w:rPr>
+          <w:color w:val="1D2D3E"/>
+          <w:sz w:val="22"/>
+          <w:szCs w:val="22"/>
+        </w:rPr>
+        <w:t xml:space="preserve">  Summary tiles: Total Payable / Total Receivable; Net Cash Position card (darker border when negative)</w:t>
+      </w:r>
+    </w:p>
+    <w:p>
+      <w:pPr>
+        <w:pStyle w:val="ListParagraph"/>
+        <w:numPr>
+          <w:ilvl w:val="1"/>
+          <w:numId w:val="1"/>
+        </w:numPr>
+        <w:spacing w:after="40"/>
+      </w:pPr>
+      <w:r>
+        <w:rPr>
+          <w:color w:val="1D2D3E"/>
+          <w:sz w:val="22"/>
+          <w:szCs w:val="22"/>
+        </w:rPr>
+        <w:t xml:space="preserve">  Per-period: TO PAY group (bills) and TO COLLECT group (invoices), each with party / ref / amount / due date rows</w:t>
+      </w:r>
+    </w:p>
+    <w:p>
+      <w:pPr>
+        <w:pStyle w:val="ListParagraph"/>
+        <w:numPr>
+          <w:ilvl w:val="1"/>
+          <w:numId w:val="1"/>
+        </w:numPr>
+        <w:spacing w:after="40"/>
+      </w:pPr>
+      <w:r>
+        <w:rPr>
+          <w:color w:val="1D2D3E"/>
+          <w:sz w:val="22"/>
+          <w:szCs w:val="22"/>
+        </w:rPr>
+        <w:t xml:space="preserve">  Period Net row per section; overdue groups get bold border treatment</w:t>
+      </w:r>
+    </w:p>
+    <w:p>
+      <w:pPr>
+        <w:pStyle w:val="ListParagraph"/>
+        <w:numPr>
+          <w:ilvl w:val="1"/>
+          <w:numId w:val="1"/>
+        </w:numPr>
+        <w:spacing w:after="40"/>
+      </w:pPr>
+      <w:r>
+        <w:rPr>
+          <w:color w:val="1D2D3E"/>
+          <w:sz w:val="22"/>
+          <w:szCs w:val="22"/>
+        </w:rPr>
+        <w:t xml:space="preserve">  24h offline cache per company; CompanySelector; OfflineBanner; ErrorView; ListScreenSkeleton; pull-to-refresh</w:t>
+      </w:r>
+    </w:p>
+    <w:p>
+      <w:pPr>
+        <w:pStyle w:val="ListParagraph"/>
+        <w:numPr>
+          <w:ilvl w:val="1"/>
+          <w:numId w:val="1"/>
+        </w:numPr>
+        <w:spacing w:after="40"/>
+      </w:pPr>
+      <w:r>
+        <w:rPr>
+          <w:color w:val="1D2D3E"/>
+          <w:sz w:val="22"/>
+          <w:szCs w:val="22"/>
+        </w:rPr>
+        <w:t xml:space="preserve">  Wired into FinanceNavigator (CashFlow route + headerShown: false), FinanceMenuScreen (trending-up icon)</w:t>
+      </w:r>
+    </w:p>
+    <w:p>
+      <w:pPr>
+        <w:pStyle w:val="ListParagraph"/>
+        <w:numPr>
+          <w:ilvl w:val="1"/>
+          <w:numId w:val="1"/>
+        </w:numPr>
+        <w:spacing w:after="40"/>
+      </w:pPr>
+      <w:r>
+        <w:rPr>
+          <w:color w:val="1D2D3E"/>
+          <w:sz w:val="22"/>
+          <w:szCs w:val="22"/>
+        </w:rPr>
+        <w:t xml:space="preserve">  poultryerp://finance/cash-flow deep link added to linking.ts</w:t>
+      </w:r>
+    </w:p>
+    <w:p>
+      <w:pPr>
+        <w:pStyle w:val="ListParagraph"/>
+        <w:numPr>
+          <w:ilvl w:val="0"/>
+          <w:numId w:val="1"/>
+        </w:numPr>
+        <w:spacing w:after="40"/>
+      </w:pPr>
+      <w:r>
+        <w:rPr>
+          <w:color w:val="1D2D3E"/>
+          <w:sz w:val="22"/>
+          <w:szCs w:val="22"/>
+        </w:rPr>
+        <w:t xml:space="preserve">Dashboard Quick Actions expanded from 9 to 12 tiles (4 complete rows of 3)</w:t>
+      </w:r>
+    </w:p>
+    <w:p>
+      <w:pPr>
+        <w:pStyle w:val="ListParagraph"/>
+        <w:numPr>
+          <w:ilvl w:val="1"/>
+          <w:numId w:val="1"/>
+        </w:numPr>
+        <w:spacing w:after="40"/>
+      </w:pPr>
+      <w:r>
+        <w:rPr>
+          <w:color w:val="1D2D3E"/>
+          <w:sz w:val="22"/>
+          <w:szCs w:val="22"/>
+        </w:rPr>
+        <w:t xml:space="preserve">  New tiles: Cash Flow → Finance &gt; CashFlow, Partners → More &gt; Partners, Reports → Finance &gt; FinancialReports</w:t>
       </w:r>
     </w:p>
     <w:p>

</xml_diff>

<commit_message>
docs: update PROGRESS.md, FEATURES.docx, generate-docs.js for Session 21
https://claude.ai/code/session_016GNVP693Cc9mduAmAoiPH6
</commit_message>
<xml_diff>
--- a/FEATURES.docx
+++ b/FEATURES.docx
@@ -16037,6 +16037,310 @@
           </w:p>
         </w:tc>
       </w:tr>
+      <w:tr>
+        <w:tc>
+          <w:p>
+            <w:pPr>
+              <w:spacing w:after="40" w:before="40"/>
+            </w:pPr>
+            <w:r>
+              <w:rPr>
+                <w:b w:val="false"/>
+                <w:bCs w:val="false"/>
+                <w:color w:val="1D2D3E"/>
+                <w:sz w:val="20"/>
+                <w:szCs w:val="20"/>
+              </w:rPr>
+              <w:t xml:space="preserve">Session 21</w:t>
+            </w:r>
+          </w:p>
+        </w:tc>
+        <w:tc>
+          <w:p>
+            <w:pPr>
+              <w:spacing w:after="40" w:before="40"/>
+            </w:pPr>
+            <w:r>
+              <w:rPr>
+                <w:b w:val="false"/>
+                <w:bCs w:val="false"/>
+                <w:color w:val="1D2D3E"/>
+                <w:sz w:val="20"/>
+                <w:szCs w:val="20"/>
+              </w:rPr>
+              <w:t xml:space="preserve">Journal Entry Detail Screen — full-page view with lines, share &amp; PDF export</w:t>
+            </w:r>
+          </w:p>
+        </w:tc>
+        <w:tc>
+          <w:p>
+            <w:pPr>
+              <w:spacing w:after="40" w:before="40"/>
+            </w:pPr>
+            <w:r>
+              <w:rPr>
+                <w:b w:val="false"/>
+                <w:bCs w:val="false"/>
+                <w:color w:val="1D2D3E"/>
+                <w:sz w:val="20"/>
+                <w:szCs w:val="20"/>
+              </w:rPr>
+              <w:t xml:space="preserve">Done</w:t>
+            </w:r>
+          </w:p>
+        </w:tc>
+        <w:tc>
+          <w:p>
+            <w:pPr>
+              <w:spacing w:after="40" w:before="40"/>
+            </w:pPr>
+            <w:r>
+              <w:rPr>
+                <w:b w:val="false"/>
+                <w:bCs w:val="false"/>
+                <w:color w:val="1D2D3E"/>
+                <w:sz w:val="20"/>
+                <w:szCs w:val="20"/>
+              </w:rPr>
+              <w:t xml:space="preserve">src/screens/journalEntries/JournalEntryDetailScreen.tsx</w:t>
+            </w:r>
+          </w:p>
+        </w:tc>
+      </w:tr>
+      <w:tr>
+        <w:tc>
+          <w:tcPr>
+            <w:shd w:color="F0F4F8" w:val="solid"/>
+          </w:tcPr>
+          <w:p>
+            <w:pPr>
+              <w:spacing w:after="40" w:before="40"/>
+            </w:pPr>
+            <w:r>
+              <w:rPr>
+                <w:b w:val="false"/>
+                <w:bCs w:val="false"/>
+                <w:color w:val="1D2D3E"/>
+                <w:sz w:val="20"/>
+                <w:szCs w:val="20"/>
+              </w:rPr>
+              <w:t xml:space="preserve">Session 21</w:t>
+            </w:r>
+          </w:p>
+        </w:tc>
+        <w:tc>
+          <w:tcPr>
+            <w:shd w:color="F0F4F8" w:val="solid"/>
+          </w:tcPr>
+          <w:p>
+            <w:pPr>
+              <w:spacing w:after="40" w:before="40"/>
+            </w:pPr>
+            <w:r>
+              <w:rPr>
+                <w:b w:val="false"/>
+                <w:bCs w:val="false"/>
+                <w:color w:val="1D2D3E"/>
+                <w:sz w:val="20"/>
+                <w:szCs w:val="20"/>
+              </w:rPr>
+              <w:t xml:space="preserve">Trial Balance → JE drill-down: tap any account row to navigate to filtered JEs</w:t>
+            </w:r>
+          </w:p>
+        </w:tc>
+        <w:tc>
+          <w:tcPr>
+            <w:shd w:color="F0F4F8" w:val="solid"/>
+          </w:tcPr>
+          <w:p>
+            <w:pPr>
+              <w:spacing w:after="40" w:before="40"/>
+            </w:pPr>
+            <w:r>
+              <w:rPr>
+                <w:b w:val="false"/>
+                <w:bCs w:val="false"/>
+                <w:color w:val="1D2D3E"/>
+                <w:sz w:val="20"/>
+                <w:szCs w:val="20"/>
+              </w:rPr>
+              <w:t xml:space="preserve">Done</w:t>
+            </w:r>
+          </w:p>
+        </w:tc>
+        <w:tc>
+          <w:tcPr>
+            <w:shd w:color="F0F4F8" w:val="solid"/>
+          </w:tcPr>
+          <w:p>
+            <w:pPr>
+              <w:spacing w:after="40" w:before="40"/>
+            </w:pPr>
+            <w:r>
+              <w:rPr>
+                <w:b w:val="false"/>
+                <w:bCs w:val="false"/>
+                <w:color w:val="1D2D3E"/>
+                <w:sz w:val="20"/>
+                <w:szCs w:val="20"/>
+              </w:rPr>
+              <w:t xml:space="preserve">TrialBalanceScreen.tsx + JournalEntriesScreen.tsx</w:t>
+            </w:r>
+          </w:p>
+        </w:tc>
+      </w:tr>
+      <w:tr>
+        <w:tc>
+          <w:p>
+            <w:pPr>
+              <w:spacing w:after="40" w:before="40"/>
+            </w:pPr>
+            <w:r>
+              <w:rPr>
+                <w:b w:val="false"/>
+                <w:bCs w:val="false"/>
+                <w:color w:val="1D2D3E"/>
+                <w:sz w:val="20"/>
+                <w:szCs w:val="20"/>
+              </w:rPr>
+              <w:t xml:space="preserve">Session 21</w:t>
+            </w:r>
+          </w:p>
+        </w:tc>
+        <w:tc>
+          <w:p>
+            <w:pPr>
+              <w:spacing w:after="40" w:before="40"/>
+            </w:pPr>
+            <w:r>
+              <w:rPr>
+                <w:b w:val="false"/>
+                <w:bCs w:val="false"/>
+                <w:color w:val="1D2D3E"/>
+                <w:sz w:val="20"/>
+                <w:szCs w:val="20"/>
+              </w:rPr>
+              <w:t xml:space="preserve">PDF export — AP Summary (aging analysis + vendor table + bills list)</w:t>
+            </w:r>
+          </w:p>
+        </w:tc>
+        <w:tc>
+          <w:p>
+            <w:pPr>
+              <w:spacing w:after="40" w:before="40"/>
+            </w:pPr>
+            <w:r>
+              <w:rPr>
+                <w:b w:val="false"/>
+                <w:bCs w:val="false"/>
+                <w:color w:val="1D2D3E"/>
+                <w:sz w:val="20"/>
+                <w:szCs w:val="20"/>
+              </w:rPr>
+              <w:t xml:space="preserve">Done</w:t>
+            </w:r>
+          </w:p>
+        </w:tc>
+        <w:tc>
+          <w:p>
+            <w:pPr>
+              <w:spacing w:after="40" w:before="40"/>
+            </w:pPr>
+            <w:r>
+              <w:rPr>
+                <w:b w:val="false"/>
+                <w:bCs w:val="false"/>
+                <w:color w:val="1D2D3E"/>
+                <w:sz w:val="20"/>
+                <w:szCs w:val="20"/>
+              </w:rPr>
+              <w:t xml:space="preserve">pdfExport.ts exportAPSummaryPDF</w:t>
+            </w:r>
+          </w:p>
+        </w:tc>
+      </w:tr>
+      <w:tr>
+        <w:tc>
+          <w:tcPr>
+            <w:shd w:color="F0F4F8" w:val="solid"/>
+          </w:tcPr>
+          <w:p>
+            <w:pPr>
+              <w:spacing w:after="40" w:before="40"/>
+            </w:pPr>
+            <w:r>
+              <w:rPr>
+                <w:b w:val="false"/>
+                <w:bCs w:val="false"/>
+                <w:color w:val="1D2D3E"/>
+                <w:sz w:val="20"/>
+                <w:szCs w:val="20"/>
+              </w:rPr>
+              <w:t xml:space="preserve">Session 21</w:t>
+            </w:r>
+          </w:p>
+        </w:tc>
+        <w:tc>
+          <w:tcPr>
+            <w:shd w:color="F0F4F8" w:val="solid"/>
+          </w:tcPr>
+          <w:p>
+            <w:pPr>
+              <w:spacing w:after="40" w:before="40"/>
+            </w:pPr>
+            <w:r>
+              <w:rPr>
+                <w:b w:val="false"/>
+                <w:bCs w:val="false"/>
+                <w:color w:val="1D2D3E"/>
+                <w:sz w:val="20"/>
+                <w:szCs w:val="20"/>
+              </w:rPr>
+              <w:t xml:space="preserve">PDF export — AR Summary (aging analysis + customer table + invoices list)</w:t>
+            </w:r>
+          </w:p>
+        </w:tc>
+        <w:tc>
+          <w:tcPr>
+            <w:shd w:color="F0F4F8" w:val="solid"/>
+          </w:tcPr>
+          <w:p>
+            <w:pPr>
+              <w:spacing w:after="40" w:before="40"/>
+            </w:pPr>
+            <w:r>
+              <w:rPr>
+                <w:b w:val="false"/>
+                <w:bCs w:val="false"/>
+                <w:color w:val="1D2D3E"/>
+                <w:sz w:val="20"/>
+                <w:szCs w:val="20"/>
+              </w:rPr>
+              <w:t xml:space="preserve">Done</w:t>
+            </w:r>
+          </w:p>
+        </w:tc>
+        <w:tc>
+          <w:tcPr>
+            <w:shd w:color="F0F4F8" w:val="solid"/>
+          </w:tcPr>
+          <w:p>
+            <w:pPr>
+              <w:spacing w:after="40" w:before="40"/>
+            </w:pPr>
+            <w:r>
+              <w:rPr>
+                <w:b w:val="false"/>
+                <w:bCs w:val="false"/>
+                <w:color w:val="1D2D3E"/>
+                <w:sz w:val="20"/>
+                <w:szCs w:val="20"/>
+              </w:rPr>
+              <w:t xml:space="preserve">pdfExport.ts exportARSummaryPDF</w:t>
+            </w:r>
+          </w:p>
+        </w:tc>
+      </w:tr>
     </w:tbl>
     <w:p>
       <w:pPr>
@@ -16785,6 +17089,24 @@
           <w:szCs w:val="22"/>
         </w:rPr>
         <w:t xml:space="preserve">src/screens/finance/CashFlowScreen.tsx — Cash Flow screen: upcoming AP bills + AR invoices grouped by due date period (Session 20)</w:t>
+      </w:r>
+    </w:p>
+    <w:p>
+      <w:pPr>
+        <w:pStyle w:val="ListParagraph"/>
+        <w:numPr>
+          <w:ilvl w:val="0"/>
+          <w:numId w:val="1"/>
+        </w:numPr>
+        <w:spacing w:after="40"/>
+      </w:pPr>
+      <w:r>
+        <w:rPr>
+          <w:color w:val="1D2D3E"/>
+          <w:sz w:val="22"/>
+          <w:szCs w:val="22"/>
+        </w:rPr>
+        <w:t xml:space="preserve">src/screens/journalEntries/JournalEntryDetailScreen.tsx — Full-page JE detail: voucher info + lines table + share/PDF export (Session 21)</w:t>
       </w:r>
     </w:p>
     <w:p>
@@ -19769,6 +20091,411 @@
           <w:szCs w:val="22"/>
         </w:rPr>
         <w:t xml:space="preserve">AccountsReceivableScreen: same AgingChart migration</w:t>
+      </w:r>
+    </w:p>
+    <w:p>
+      <w:pPr>
+        <w:spacing w:after="80"/>
+      </w:pPr>
+      <w:r>
+        <w:rPr>
+          <w:color w:val="1D2D3E"/>
+          <w:sz w:val="22"/>
+          <w:szCs w:val="22"/>
+        </w:rPr>
+        <w:t xml:space="preserve"/>
+      </w:r>
+    </w:p>
+    <w:p>
+      <w:pPr>
+        <w:pStyle w:val="Heading2"/>
+        <w:spacing w:after="120" w:before="300"/>
+      </w:pPr>
+      <w:r>
+        <w:rPr>
+          <w:b/>
+          <w:bCs/>
+          <w:color w:val="1D2D3E"/>
+        </w:rPr>
+        <w:t xml:space="preserve">Session 21 — 2026-05-26</w:t>
+      </w:r>
+    </w:p>
+    <w:p>
+      <w:pPr>
+        <w:pStyle w:val="ListParagraph"/>
+        <w:numPr>
+          <w:ilvl w:val="0"/>
+          <w:numId w:val="1"/>
+        </w:numPr>
+        <w:spacing w:after="40"/>
+      </w:pPr>
+      <w:r>
+        <w:rPr>
+          <w:color w:val="1D2D3E"/>
+          <w:sz w:val="22"/>
+          <w:szCs w:val="22"/>
+        </w:rPr>
+        <w:t xml:space="preserve">Journal Entry Detail Screen (src/screens/journalEntries/JournalEntryDetailScreen.tsx)</w:t>
+      </w:r>
+    </w:p>
+    <w:p>
+      <w:pPr>
+        <w:pStyle w:val="ListParagraph"/>
+        <w:numPr>
+          <w:ilvl w:val="1"/>
+          <w:numId w:val="1"/>
+        </w:numPr>
+        <w:spacing w:after="40"/>
+      </w:pPr>
+      <w:r>
+        <w:rPr>
+          <w:color w:val="1D2D3E"/>
+          <w:sz w:val="22"/>
+          <w:szCs w:val="22"/>
+        </w:rPr>
+        <w:t xml:space="preserve">  Full-page detail view: voucher type badge + number, date, status badge, narration card</w:t>
+      </w:r>
+    </w:p>
+    <w:p>
+      <w:pPr>
+        <w:pStyle w:val="ListParagraph"/>
+        <w:numPr>
+          <w:ilvl w:val="1"/>
+          <w:numId w:val="1"/>
+        </w:numPr>
+        <w:spacing w:after="40"/>
+      </w:pPr>
+      <w:r>
+        <w:rPr>
+          <w:color w:val="1D2D3E"/>
+          <w:sz w:val="22"/>
+          <w:szCs w:val="22"/>
+        </w:rPr>
+        <w:t xml:space="preserve">  Journal lines table: Account | Debit | Credit columns with totals row and line narrations</w:t>
+      </w:r>
+    </w:p>
+    <w:p>
+      <w:pPr>
+        <w:pStyle w:val="ListParagraph"/>
+        <w:numPr>
+          <w:ilvl w:val="1"/>
+          <w:numId w:val="1"/>
+        </w:numPr>
+        <w:spacing w:after="40"/>
+      </w:pPr>
+      <w:r>
+        <w:rPr>
+          <w:color w:val="1D2D3E"/>
+          <w:sz w:val="22"/>
+          <w:szCs w:val="22"/>
+        </w:rPr>
+        <w:t xml:space="preserve">  Share button (plain text with debit/credit columns); PDF export via exportJournalEntryDetailPDF</w:t>
+      </w:r>
+    </w:p>
+    <w:p>
+      <w:pPr>
+        <w:pStyle w:val="ListParagraph"/>
+        <w:numPr>
+          <w:ilvl w:val="1"/>
+          <w:numId w:val="1"/>
+        </w:numPr>
+        <w:spacing w:after="40"/>
+      </w:pPr>
+      <w:r>
+        <w:rPr>
+          <w:color w:val="1D2D3E"/>
+          <w:sz w:val="22"/>
+          <w:szCs w:val="22"/>
+        </w:rPr>
+        <w:t xml:space="preserve">  Registered in FinanceNavigator as JournalEntryDetail route (receives full JournalEntry as param)</w:t>
+      </w:r>
+    </w:p>
+    <w:p>
+      <w:pPr>
+        <w:pStyle w:val="ListParagraph"/>
+        <w:numPr>
+          <w:ilvl w:val="0"/>
+          <w:numId w:val="1"/>
+        </w:numPr>
+        <w:spacing w:after="40"/>
+      </w:pPr>
+      <w:r>
+        <w:rPr>
+          <w:color w:val="1D2D3E"/>
+          <w:sz w:val="22"/>
+          <w:szCs w:val="22"/>
+        </w:rPr>
+        <w:t xml:space="preserve">JournalEntriesScreen — navigation upgrade</w:t>
+      </w:r>
+    </w:p>
+    <w:p>
+      <w:pPr>
+        <w:pStyle w:val="ListParagraph"/>
+        <w:numPr>
+          <w:ilvl w:val="1"/>
+          <w:numId w:val="1"/>
+        </w:numPr>
+        <w:spacing w:after="40"/>
+      </w:pPr>
+      <w:r>
+        <w:rPr>
+          <w:color w:val="1D2D3E"/>
+          <w:sz w:val="22"/>
+          <w:szCs w:val="22"/>
+        </w:rPr>
+        <w:t xml:space="preserve">  Cards now navigate to JournalEntryDetail on tap (chevron-right + N lines hint replaces expand toggle)</w:t>
+      </w:r>
+    </w:p>
+    <w:p>
+      <w:pPr>
+        <w:pStyle w:val="ListParagraph"/>
+        <w:numPr>
+          <w:ilvl w:val="1"/>
+          <w:numId w:val="1"/>
+        </w:numPr>
+        <w:spacing w:after="40"/>
+      </w:pPr>
+      <w:r>
+        <w:rPr>
+          <w:color w:val="1D2D3E"/>
+          <w:sz w:val="22"/>
+          <w:szCs w:val="22"/>
+        </w:rPr>
+        <w:t xml:space="preserve">  Accepts { account?, accountName? } route params; passes account to API for server-side filtering</w:t>
+      </w:r>
+    </w:p>
+    <w:p>
+      <w:pPr>
+        <w:pStyle w:val="ListParagraph"/>
+        <w:numPr>
+          <w:ilvl w:val="1"/>
+          <w:numId w:val="1"/>
+        </w:numPr>
+        <w:spacing w:after="40"/>
+      </w:pPr>
+      <w:r>
+        <w:rPr>
+          <w:color w:val="1D2D3E"/>
+          <w:sz w:val="22"/>
+          <w:szCs w:val="22"/>
+        </w:rPr>
+        <w:t xml:space="preserve">  Account filter banner shown below header when screen is opened from TrialBalance</w:t>
+      </w:r>
+    </w:p>
+    <w:p>
+      <w:pPr>
+        <w:pStyle w:val="ListParagraph"/>
+        <w:numPr>
+          <w:ilvl w:val="0"/>
+          <w:numId w:val="1"/>
+        </w:numPr>
+        <w:spacing w:after="40"/>
+      </w:pPr>
+      <w:r>
+        <w:rPr>
+          <w:color w:val="1D2D3E"/>
+          <w:sz w:val="22"/>
+          <w:szCs w:val="22"/>
+        </w:rPr>
+        <w:t xml:space="preserve">Trial Balance → JE drill-down (TrialBalanceScreen.tsx)</w:t>
+      </w:r>
+    </w:p>
+    <w:p>
+      <w:pPr>
+        <w:pStyle w:val="ListParagraph"/>
+        <w:numPr>
+          <w:ilvl w:val="1"/>
+          <w:numId w:val="1"/>
+        </w:numPr>
+        <w:spacing w:after="40"/>
+      </w:pPr>
+      <w:r>
+        <w:rPr>
+          <w:color w:val="1D2D3E"/>
+          <w:sz w:val="22"/>
+          <w:szCs w:val="22"/>
+        </w:rPr>
+        <w:t xml:space="preserve">  Non-group account rows now tappable; show chevron-right indicator</w:t>
+      </w:r>
+    </w:p>
+    <w:p>
+      <w:pPr>
+        <w:pStyle w:val="ListParagraph"/>
+        <w:numPr>
+          <w:ilvl w:val="1"/>
+          <w:numId w:val="1"/>
+        </w:numPr>
+        <w:spacing w:after="40"/>
+      </w:pPr>
+      <w:r>
+        <w:rPr>
+          <w:color w:val="1D2D3E"/>
+          <w:sz w:val="22"/>
+          <w:szCs w:val="22"/>
+        </w:rPr>
+        <w:t xml:space="preserve">  Tap navigates to JournalEntries screen with account code/name as filter</w:t>
+      </w:r>
+    </w:p>
+    <w:p>
+      <w:pPr>
+        <w:pStyle w:val="ListParagraph"/>
+        <w:numPr>
+          <w:ilvl w:val="1"/>
+          <w:numId w:val="1"/>
+        </w:numPr>
+        <w:spacing w:after="40"/>
+      </w:pPr>
+      <w:r>
+        <w:rPr>
+          <w:color w:val="1D2D3E"/>
+          <w:sz w:val="22"/>
+          <w:szCs w:val="22"/>
+        </w:rPr>
+        <w:t xml:space="preserve">  Group rows (subtotals) remain non-interactive</w:t>
+      </w:r>
+    </w:p>
+    <w:p>
+      <w:pPr>
+        <w:pStyle w:val="ListParagraph"/>
+        <w:numPr>
+          <w:ilvl w:val="0"/>
+          <w:numId w:val="1"/>
+        </w:numPr>
+        <w:spacing w:after="40"/>
+      </w:pPr>
+      <w:r>
+        <w:rPr>
+          <w:color w:val="1D2D3E"/>
+          <w:sz w:val="22"/>
+          <w:szCs w:val="22"/>
+        </w:rPr>
+        <w:t xml:space="preserve">PDF export — AP Summary (pdfExport.ts exportAPSummaryPDF)</w:t>
+      </w:r>
+    </w:p>
+    <w:p>
+      <w:pPr>
+        <w:pStyle w:val="ListParagraph"/>
+        <w:numPr>
+          <w:ilvl w:val="1"/>
+          <w:numId w:val="1"/>
+        </w:numPr>
+        <w:spacing w:after="40"/>
+      </w:pPr>
+      <w:r>
+        <w:rPr>
+          <w:color w:val="1D2D3E"/>
+          <w:sz w:val="22"/>
+          <w:szCs w:val="22"/>
+        </w:rPr>
+        <w:t xml:space="preserve">  4-tile summary: outstanding / overdue / vendors count / bills count</w:t>
+      </w:r>
+    </w:p>
+    <w:p>
+      <w:pPr>
+        <w:pStyle w:val="ListParagraph"/>
+        <w:numPr>
+          <w:ilvl w:val="1"/>
+          <w:numId w:val="1"/>
+        </w:numPr>
+        <w:spacing w:after="40"/>
+      </w:pPr>
+      <w:r>
+        <w:rPr>
+          <w:color w:val="1D2D3E"/>
+          <w:sz w:val="22"/>
+          <w:szCs w:val="22"/>
+        </w:rPr>
+        <w:t xml:space="preserve">  Aging analysis table with grayscale shading per period</w:t>
+      </w:r>
+    </w:p>
+    <w:p>
+      <w:pPr>
+        <w:pStyle w:val="ListParagraph"/>
+        <w:numPr>
+          <w:ilvl w:val="1"/>
+          <w:numId w:val="1"/>
+        </w:numPr>
+        <w:spacing w:after="40"/>
+      </w:pPr>
+      <w:r>
+        <w:rPr>
+          <w:color w:val="1D2D3E"/>
+          <w:sz w:val="22"/>
+          <w:szCs w:val="22"/>
+        </w:rPr>
+        <w:t xml:space="preserve">  Top vendors table + bills list (up to 50 bills)</w:t>
+      </w:r>
+    </w:p>
+    <w:p>
+      <w:pPr>
+        <w:pStyle w:val="ListParagraph"/>
+        <w:numPr>
+          <w:ilvl w:val="1"/>
+          <w:numId w:val="1"/>
+        </w:numPr>
+        <w:spacing w:after="40"/>
+      </w:pPr>
+      <w:r>
+        <w:rPr>
+          <w:color w:val="1D2D3E"/>
+          <w:sz w:val="22"/>
+          <w:szCs w:val="22"/>
+        </w:rPr>
+        <w:t xml:space="preserve">  PDF button in AccountsPayableScreen header; visible when data loaded</w:t>
+      </w:r>
+    </w:p>
+    <w:p>
+      <w:pPr>
+        <w:pStyle w:val="ListParagraph"/>
+        <w:numPr>
+          <w:ilvl w:val="0"/>
+          <w:numId w:val="1"/>
+        </w:numPr>
+        <w:spacing w:after="40"/>
+      </w:pPr>
+      <w:r>
+        <w:rPr>
+          <w:color w:val="1D2D3E"/>
+          <w:sz w:val="22"/>
+          <w:szCs w:val="22"/>
+        </w:rPr>
+        <w:t xml:space="preserve">PDF export — AR Summary (pdfExport.ts exportARSummaryPDF)</w:t>
+      </w:r>
+    </w:p>
+    <w:p>
+      <w:pPr>
+        <w:pStyle w:val="ListParagraph"/>
+        <w:numPr>
+          <w:ilvl w:val="1"/>
+          <w:numId w:val="1"/>
+        </w:numPr>
+        <w:spacing w:after="40"/>
+      </w:pPr>
+      <w:r>
+        <w:rPr>
+          <w:color w:val="1D2D3E"/>
+          <w:sz w:val="22"/>
+          <w:szCs w:val="22"/>
+        </w:rPr>
+        <w:t xml:space="preserve">  Same structure as AP: 4-tile summary, aging table, customers table, invoices list</w:t>
+      </w:r>
+    </w:p>
+    <w:p>
+      <w:pPr>
+        <w:pStyle w:val="ListParagraph"/>
+        <w:numPr>
+          <w:ilvl w:val="1"/>
+          <w:numId w:val="1"/>
+        </w:numPr>
+        <w:spacing w:after="40"/>
+      </w:pPr>
+      <w:r>
+        <w:rPr>
+          <w:color w:val="1D2D3E"/>
+          <w:sz w:val="22"/>
+          <w:szCs w:val="22"/>
+        </w:rPr>
+        <w:t xml:space="preserve">  PDF button in AccountsReceivableScreen header; visible when data loaded</w:t>
       </w:r>
     </w:p>
     <w:p>

</xml_diff>

<commit_message>
docs: update PROGRESS.md, FEATURES.docx, generate-docs.js for Session 22
- Added Session 22 section in PROGRESS.md covering Cash Flow PDF export and Warehouse PDF export
- Marked Cash Flow PDF and Warehouse PDF items as Done in What's Next section
- generate-docs.js: added Session 22 entries to roadmap table, directory listing, and changelog section
- Regenerated FEATURES.docx
</commit_message>
<xml_diff>
--- a/FEATURES.docx
+++ b/FEATURES.docx
@@ -45,7 +45,7 @@
           <w:sz w:val="20"/>
           <w:szCs w:val="20"/>
         </w:rPr>
-        <w:t xml:space="preserve">Generated: 2026-05-26</w:t>
+        <w:t xml:space="preserve">Generated: 2026-05-27</w:t>
       </w:r>
     </w:p>
     <w:p>
@@ -16341,6 +16341,158 @@
           </w:p>
         </w:tc>
       </w:tr>
+      <w:tr>
+        <w:tc>
+          <w:p>
+            <w:pPr>
+              <w:spacing w:after="40" w:before="40"/>
+            </w:pPr>
+            <w:r>
+              <w:rPr>
+                <w:b w:val="false"/>
+                <w:bCs w:val="false"/>
+                <w:color w:val="1D2D3E"/>
+                <w:sz w:val="20"/>
+                <w:szCs w:val="20"/>
+              </w:rPr>
+              <w:t xml:space="preserve">Session 22</w:t>
+            </w:r>
+          </w:p>
+        </w:tc>
+        <w:tc>
+          <w:p>
+            <w:pPr>
+              <w:spacing w:after="40" w:before="40"/>
+            </w:pPr>
+            <w:r>
+              <w:rPr>
+                <w:b w:val="false"/>
+                <w:bCs w:val="false"/>
+                <w:color w:val="1D2D3E"/>
+                <w:sz w:val="20"/>
+                <w:szCs w:val="20"/>
+              </w:rPr>
+              <w:t xml:space="preserve">PDF export — Cash Flow Report (period breakdown, net position, bills + invoices)</w:t>
+            </w:r>
+          </w:p>
+        </w:tc>
+        <w:tc>
+          <w:p>
+            <w:pPr>
+              <w:spacing w:after="40" w:before="40"/>
+            </w:pPr>
+            <w:r>
+              <w:rPr>
+                <w:b w:val="false"/>
+                <w:bCs w:val="false"/>
+                <w:color w:val="1D2D3E"/>
+                <w:sz w:val="20"/>
+                <w:szCs w:val="20"/>
+              </w:rPr>
+              <w:t xml:space="preserve">Done</w:t>
+            </w:r>
+          </w:p>
+        </w:tc>
+        <w:tc>
+          <w:p>
+            <w:pPr>
+              <w:spacing w:after="40" w:before="40"/>
+            </w:pPr>
+            <w:r>
+              <w:rPr>
+                <w:b w:val="false"/>
+                <w:bCs w:val="false"/>
+                <w:color w:val="1D2D3E"/>
+                <w:sz w:val="20"/>
+                <w:szCs w:val="20"/>
+              </w:rPr>
+              <w:t xml:space="preserve">pdfExport.ts exportCashFlowPDF</w:t>
+            </w:r>
+          </w:p>
+        </w:tc>
+      </w:tr>
+      <w:tr>
+        <w:tc>
+          <w:tcPr>
+            <w:shd w:color="F0F4F8" w:val="solid"/>
+          </w:tcPr>
+          <w:p>
+            <w:pPr>
+              <w:spacing w:after="40" w:before="40"/>
+            </w:pPr>
+            <w:r>
+              <w:rPr>
+                <w:b w:val="false"/>
+                <w:bCs w:val="false"/>
+                <w:color w:val="1D2D3E"/>
+                <w:sz w:val="20"/>
+                <w:szCs w:val="20"/>
+              </w:rPr>
+              <w:t xml:space="preserve">Session 22</w:t>
+            </w:r>
+          </w:p>
+        </w:tc>
+        <w:tc>
+          <w:tcPr>
+            <w:shd w:color="F0F4F8" w:val="solid"/>
+          </w:tcPr>
+          <w:p>
+            <w:pPr>
+              <w:spacing w:after="40" w:before="40"/>
+            </w:pPr>
+            <w:r>
+              <w:rPr>
+                <w:b w:val="false"/>
+                <w:bCs w:val="false"/>
+                <w:color w:val="1D2D3E"/>
+                <w:sz w:val="20"/>
+                <w:szCs w:val="20"/>
+              </w:rPr>
+              <w:t xml:space="preserve">PDF export — Warehouse List (status badge, items/qty columns, summary tiles)</w:t>
+            </w:r>
+          </w:p>
+        </w:tc>
+        <w:tc>
+          <w:tcPr>
+            <w:shd w:color="F0F4F8" w:val="solid"/>
+          </w:tcPr>
+          <w:p>
+            <w:pPr>
+              <w:spacing w:after="40" w:before="40"/>
+            </w:pPr>
+            <w:r>
+              <w:rPr>
+                <w:b w:val="false"/>
+                <w:bCs w:val="false"/>
+                <w:color w:val="1D2D3E"/>
+                <w:sz w:val="20"/>
+                <w:szCs w:val="20"/>
+              </w:rPr>
+              <w:t xml:space="preserve">Done</w:t>
+            </w:r>
+          </w:p>
+        </w:tc>
+        <w:tc>
+          <w:tcPr>
+            <w:shd w:color="F0F4F8" w:val="solid"/>
+          </w:tcPr>
+          <w:p>
+            <w:pPr>
+              <w:spacing w:after="40" w:before="40"/>
+            </w:pPr>
+            <w:r>
+              <w:rPr>
+                <w:b w:val="false"/>
+                <w:bCs w:val="false"/>
+                <w:color w:val="1D2D3E"/>
+                <w:sz w:val="20"/>
+                <w:szCs w:val="20"/>
+              </w:rPr>
+              <w:t xml:space="preserve">pdfExport.ts exportWarehousesPDF</w:t>
+            </w:r>
+          </w:p>
+        </w:tc>
+      </w:tr>
     </w:tbl>
     <w:p>
       <w:pPr>
@@ -17107,6 +17259,42 @@
           <w:szCs w:val="22"/>
         </w:rPr>
         <w:t xml:space="preserve">src/screens/journalEntries/JournalEntryDetailScreen.tsx — Full-page JE detail: voucher info + lines table + share/PDF export (Session 21)</w:t>
+      </w:r>
+    </w:p>
+    <w:p>
+      <w:pPr>
+        <w:pStyle w:val="ListParagraph"/>
+        <w:numPr>
+          <w:ilvl w:val="0"/>
+          <w:numId w:val="1"/>
+        </w:numPr>
+        <w:spacing w:after="40"/>
+      </w:pPr>
+      <w:r>
+        <w:rPr>
+          <w:color w:val="1D2D3E"/>
+          <w:sz w:val="22"/>
+          <w:szCs w:val="22"/>
+        </w:rPr>
+        <w:t xml:space="preserve">pdfExport.ts exportCashFlowPDF — Cash Flow Report PDF: period breakdown with TO PAY / TO COLLECT tables, net position (Session 22)</w:t>
+      </w:r>
+    </w:p>
+    <w:p>
+      <w:pPr>
+        <w:pStyle w:val="ListParagraph"/>
+        <w:numPr>
+          <w:ilvl w:val="0"/>
+          <w:numId w:val="1"/>
+        </w:numPr>
+        <w:spacing w:after="40"/>
+      </w:pPr>
+      <w:r>
+        <w:rPr>
+          <w:color w:val="1D2D3E"/>
+          <w:sz w:val="22"/>
+          <w:szCs w:val="22"/>
+        </w:rPr>
+        <w:t xml:space="preserve">pdfExport.ts exportWarehousesPDF — Warehouse List PDF: summary tiles + full table with status badge, items, qty (Session 22)</w:t>
       </w:r>
     </w:p>
     <w:p>
@@ -20091,6 +20279,249 @@
           <w:szCs w:val="22"/>
         </w:rPr>
         <w:t xml:space="preserve">AccountsReceivableScreen: same AgingChart migration</w:t>
+      </w:r>
+    </w:p>
+    <w:p>
+      <w:pPr>
+        <w:spacing w:after="80"/>
+      </w:pPr>
+      <w:r>
+        <w:rPr>
+          <w:color w:val="1D2D3E"/>
+          <w:sz w:val="22"/>
+          <w:szCs w:val="22"/>
+        </w:rPr>
+        <w:t xml:space="preserve"/>
+      </w:r>
+    </w:p>
+    <w:p>
+      <w:pPr>
+        <w:pStyle w:val="Heading2"/>
+        <w:spacing w:after="120" w:before="300"/>
+      </w:pPr>
+      <w:r>
+        <w:rPr>
+          <w:b/>
+          <w:bCs/>
+          <w:color w:val="1D2D3E"/>
+        </w:rPr>
+        <w:t xml:space="preserve">Session 22 — 2026-05-27</w:t>
+      </w:r>
+    </w:p>
+    <w:p>
+      <w:pPr>
+        <w:pStyle w:val="ListParagraph"/>
+        <w:numPr>
+          <w:ilvl w:val="0"/>
+          <w:numId w:val="1"/>
+        </w:numPr>
+        <w:spacing w:after="40"/>
+      </w:pPr>
+      <w:r>
+        <w:rPr>
+          <w:color w:val="1D2D3E"/>
+          <w:sz w:val="22"/>
+          <w:szCs w:val="22"/>
+        </w:rPr>
+        <w:t xml:space="preserve">PDF export — Cash Flow Report (pdfExport.ts exportCashFlowPDF, CashFlowScreen.tsx)</w:t>
+      </w:r>
+    </w:p>
+    <w:p>
+      <w:pPr>
+        <w:pStyle w:val="ListParagraph"/>
+        <w:numPr>
+          <w:ilvl w:val="1"/>
+          <w:numId w:val="1"/>
+        </w:numPr>
+        <w:spacing w:after="40"/>
+      </w:pPr>
+      <w:r>
+        <w:rPr>
+          <w:color w:val="1D2D3E"/>
+          <w:sz w:val="22"/>
+          <w:szCs w:val="22"/>
+        </w:rPr>
+        <w:t xml:space="preserve">  2-tile summary: Total Payable (outstanding bills count) / Total Receivable (outstanding invoices count)</w:t>
+      </w:r>
+    </w:p>
+    <w:p>
+      <w:pPr>
+        <w:pStyle w:val="ListParagraph"/>
+        <w:numPr>
+          <w:ilvl w:val="1"/>
+          <w:numId w:val="1"/>
+        </w:numPr>
+        <w:spacing w:after="40"/>
+      </w:pPr>
+      <w:r>
+        <w:rPr>
+          <w:color w:val="1D2D3E"/>
+          <w:sz w:val="22"/>
+          <w:szCs w:val="22"/>
+        </w:rPr>
+        <w:t xml:space="preserve">  Net Cash Position banner with green (+) / red (−) color coding and descriptive sub-line</w:t>
+      </w:r>
+    </w:p>
+    <w:p>
+      <w:pPr>
+        <w:pStyle w:val="ListParagraph"/>
+        <w:numPr>
+          <w:ilvl w:val="1"/>
+          <w:numId w:val="1"/>
+        </w:numPr>
+        <w:spacing w:after="40"/>
+      </w:pPr>
+      <w:r>
+        <w:rPr>
+          <w:color w:val="1D2D3E"/>
+          <w:sz w:val="22"/>
+          <w:szCs w:val="22"/>
+        </w:rPr>
+        <w:t xml:space="preserve">  Per-period breakdown: Overdue → This Week → Next Week → 2–3 Weeks → 3–4 Weeks → 30+ Days → No Due Date</w:t>
+      </w:r>
+    </w:p>
+    <w:p>
+      <w:pPr>
+        <w:pStyle w:val="ListParagraph"/>
+        <w:numPr>
+          <w:ilvl w:val="1"/>
+          <w:numId w:val="1"/>
+        </w:numPr>
+        <w:spacing w:after="40"/>
+      </w:pPr>
+      <w:r>
+        <w:rPr>
+          <w:color w:val="1D2D3E"/>
+          <w:sz w:val="22"/>
+          <w:szCs w:val="22"/>
+        </w:rPr>
+        <w:t xml:space="preserve">  Each period section: TO PAY table (Ref / Vendor / Amount / Due) + TO COLLECT table (Ref / Customer / Amount / Due)</w:t>
+      </w:r>
+    </w:p>
+    <w:p>
+      <w:pPr>
+        <w:pStyle w:val="ListParagraph"/>
+        <w:numPr>
+          <w:ilvl w:val="1"/>
+          <w:numId w:val="1"/>
+        </w:numPr>
+        <w:spacing w:after="40"/>
+      </w:pPr>
+      <w:r>
+        <w:rPr>
+          <w:color w:val="1D2D3E"/>
+          <w:sz w:val="22"/>
+          <w:szCs w:val="22"/>
+        </w:rPr>
+        <w:t xml:space="preserve">  Period net row per section with green/red coloring; overdue sections styled with red-tinted background</w:t>
+      </w:r>
+    </w:p>
+    <w:p>
+      <w:pPr>
+        <w:pStyle w:val="ListParagraph"/>
+        <w:numPr>
+          <w:ilvl w:val="1"/>
+          <w:numId w:val="1"/>
+        </w:numPr>
+        <w:spacing w:after="40"/>
+      </w:pPr>
+      <w:r>
+        <w:rPr>
+          <w:color w:val="1D2D3E"/>
+          <w:sz w:val="22"/>
+          <w:szCs w:val="22"/>
+        </w:rPr>
+        <w:t xml:space="preserve">  PDF button in CashFlowScreen header; shows ActivityIndicator while exporting; uses selectedCompany name</w:t>
+      </w:r>
+    </w:p>
+    <w:p>
+      <w:pPr>
+        <w:pStyle w:val="ListParagraph"/>
+        <w:numPr>
+          <w:ilvl w:val="0"/>
+          <w:numId w:val="1"/>
+        </w:numPr>
+        <w:spacing w:after="40"/>
+      </w:pPr>
+      <w:r>
+        <w:rPr>
+          <w:color w:val="1D2D3E"/>
+          <w:sz w:val="22"/>
+          <w:szCs w:val="22"/>
+        </w:rPr>
+        <w:t xml:space="preserve">PDF export — Warehouse List (pdfExport.ts exportWarehousesPDF, InventoryScreen.tsx)</w:t>
+      </w:r>
+    </w:p>
+    <w:p>
+      <w:pPr>
+        <w:pStyle w:val="ListParagraph"/>
+        <w:numPr>
+          <w:ilvl w:val="1"/>
+          <w:numId w:val="1"/>
+        </w:numPr>
+        <w:spacing w:after="40"/>
+      </w:pPr>
+      <w:r>
+        <w:rPr>
+          <w:color w:val="1D2D3E"/>
+          <w:sz w:val="22"/>
+          <w:szCs w:val="22"/>
+        </w:rPr>
+        <w:t xml:space="preserve">  2-tile summary: Total Warehouses count / Active count</w:t>
+      </w:r>
+    </w:p>
+    <w:p>
+      <w:pPr>
+        <w:pStyle w:val="ListParagraph"/>
+        <w:numPr>
+          <w:ilvl w:val="1"/>
+          <w:numId w:val="1"/>
+        </w:numPr>
+        <w:spacing w:after="40"/>
+      </w:pPr>
+      <w:r>
+        <w:rPr>
+          <w:color w:val="1D2D3E"/>
+          <w:sz w:val="22"/>
+          <w:szCs w:val="22"/>
+        </w:rPr>
+        <w:t xml:space="preserve">  Full table: Code | Name | Type | Address | Status (color-coded pill) | Items | Total Qty</w:t>
+      </w:r>
+    </w:p>
+    <w:p>
+      <w:pPr>
+        <w:pStyle w:val="ListParagraph"/>
+        <w:numPr>
+          <w:ilvl w:val="1"/>
+          <w:numId w:val="1"/>
+        </w:numPr>
+        <w:spacing w:after="40"/>
+      </w:pPr>
+      <w:r>
+        <w:rPr>
+          <w:color w:val="1D2D3E"/>
+          <w:sz w:val="22"/>
+          <w:szCs w:val="22"/>
+        </w:rPr>
+        <w:t xml:space="preserve">  PDF button in InventoryScreen header only when Warehouses tab is active and filteredWarehouses non-empty</w:t>
+      </w:r>
+    </w:p>
+    <w:p>
+      <w:pPr>
+        <w:pStyle w:val="ListParagraph"/>
+        <w:numPr>
+          <w:ilvl w:val="1"/>
+          <w:numId w:val="1"/>
+        </w:numPr>
+        <w:spacing w:after="40"/>
+      </w:pPr>
+      <w:r>
+        <w:rPr>
+          <w:color w:val="1D2D3E"/>
+          <w:sz w:val="22"/>
+          <w:szCs w:val="22"/>
+        </w:rPr>
+        <w:t xml:space="preserve">  Reuses existing exportBtn/exportBtnText styles alongside Stock tab PDF button</w:t>
       </w:r>
     </w:p>
     <w:p>

</xml_diff>

<commit_message>
docs: update PROGRESS.md, FEATURES.docx, generate-docs.js for Session 23
Session 23 additions:
- Company KPI Comparison PDF export
- Materials List PDF export
- Partners List PDF export
- Settings: Default company picker
- InboxScreen pull-to-refresh
- Recent search history in SearchScreen
</commit_message>
<xml_diff>
--- a/FEATURES.docx
+++ b/FEATURES.docx
@@ -16493,6 +16493,462 @@
           </w:p>
         </w:tc>
       </w:tr>
+      <w:tr>
+        <w:tc>
+          <w:p>
+            <w:pPr>
+              <w:spacing w:after="40" w:before="40"/>
+            </w:pPr>
+            <w:r>
+              <w:rPr>
+                <w:b w:val="false"/>
+                <w:bCs w:val="false"/>
+                <w:color w:val="1D2D3E"/>
+                <w:sz w:val="20"/>
+                <w:szCs w:val="20"/>
+              </w:rPr>
+              <w:t xml:space="preserve">Session 23</w:t>
+            </w:r>
+          </w:p>
+        </w:tc>
+        <w:tc>
+          <w:p>
+            <w:pPr>
+              <w:spacing w:after="40" w:before="40"/>
+            </w:pPr>
+            <w:r>
+              <w:rPr>
+                <w:b w:val="false"/>
+                <w:bCs w:val="false"/>
+                <w:color w:val="1D2D3E"/>
+                <w:sz w:val="20"/>
+                <w:szCs w:val="20"/>
+              </w:rPr>
+              <w:t xml:space="preserve">PDF export — Company KPI Comparison (8 metric sections, ranked tables with bars)</w:t>
+            </w:r>
+          </w:p>
+        </w:tc>
+        <w:tc>
+          <w:p>
+            <w:pPr>
+              <w:spacing w:after="40" w:before="40"/>
+            </w:pPr>
+            <w:r>
+              <w:rPr>
+                <w:b w:val="false"/>
+                <w:bCs w:val="false"/>
+                <w:color w:val="1D2D3E"/>
+                <w:sz w:val="20"/>
+                <w:szCs w:val="20"/>
+              </w:rPr>
+              <w:t xml:space="preserve">Done</w:t>
+            </w:r>
+          </w:p>
+        </w:tc>
+        <w:tc>
+          <w:p>
+            <w:pPr>
+              <w:spacing w:after="40" w:before="40"/>
+            </w:pPr>
+            <w:r>
+              <w:rPr>
+                <w:b w:val="false"/>
+                <w:bCs w:val="false"/>
+                <w:color w:val="1D2D3E"/>
+                <w:sz w:val="20"/>
+                <w:szCs w:val="20"/>
+              </w:rPr>
+              <w:t xml:space="preserve">pdfExport.ts exportComparisonPDF</w:t>
+            </w:r>
+          </w:p>
+        </w:tc>
+      </w:tr>
+      <w:tr>
+        <w:tc>
+          <w:tcPr>
+            <w:shd w:color="F0F4F8" w:val="solid"/>
+          </w:tcPr>
+          <w:p>
+            <w:pPr>
+              <w:spacing w:after="40" w:before="40"/>
+            </w:pPr>
+            <w:r>
+              <w:rPr>
+                <w:b w:val="false"/>
+                <w:bCs w:val="false"/>
+                <w:color w:val="1D2D3E"/>
+                <w:sz w:val="20"/>
+                <w:szCs w:val="20"/>
+              </w:rPr>
+              <w:t xml:space="preserve">Session 23</w:t>
+            </w:r>
+          </w:p>
+        </w:tc>
+        <w:tc>
+          <w:tcPr>
+            <w:shd w:color="F0F4F8" w:val="solid"/>
+          </w:tcPr>
+          <w:p>
+            <w:pPr>
+              <w:spacing w:after="40" w:before="40"/>
+            </w:pPr>
+            <w:r>
+              <w:rPr>
+                <w:b w:val="false"/>
+                <w:bCs w:val="false"/>
+                <w:color w:val="1D2D3E"/>
+                <w:sz w:val="20"/>
+                <w:szCs w:val="20"/>
+              </w:rPr>
+              <w:t xml:space="preserve">PDF export — Materials List (type breakdown grid + full table, filter label)</w:t>
+            </w:r>
+          </w:p>
+        </w:tc>
+        <w:tc>
+          <w:tcPr>
+            <w:shd w:color="F0F4F8" w:val="solid"/>
+          </w:tcPr>
+          <w:p>
+            <w:pPr>
+              <w:spacing w:after="40" w:before="40"/>
+            </w:pPr>
+            <w:r>
+              <w:rPr>
+                <w:b w:val="false"/>
+                <w:bCs w:val="false"/>
+                <w:color w:val="1D2D3E"/>
+                <w:sz w:val="20"/>
+                <w:szCs w:val="20"/>
+              </w:rPr>
+              <w:t xml:space="preserve">Done</w:t>
+            </w:r>
+          </w:p>
+        </w:tc>
+        <w:tc>
+          <w:tcPr>
+            <w:shd w:color="F0F4F8" w:val="solid"/>
+          </w:tcPr>
+          <w:p>
+            <w:pPr>
+              <w:spacing w:after="40" w:before="40"/>
+            </w:pPr>
+            <w:r>
+              <w:rPr>
+                <w:b w:val="false"/>
+                <w:bCs w:val="false"/>
+                <w:color w:val="1D2D3E"/>
+                <w:sz w:val="20"/>
+                <w:szCs w:val="20"/>
+              </w:rPr>
+              <w:t xml:space="preserve">pdfExport.ts exportMaterialsListPDF</w:t>
+            </w:r>
+          </w:p>
+        </w:tc>
+      </w:tr>
+      <w:tr>
+        <w:tc>
+          <w:p>
+            <w:pPr>
+              <w:spacing w:after="40" w:before="40"/>
+            </w:pPr>
+            <w:r>
+              <w:rPr>
+                <w:b w:val="false"/>
+                <w:bCs w:val="false"/>
+                <w:color w:val="1D2D3E"/>
+                <w:sz w:val="20"/>
+                <w:szCs w:val="20"/>
+              </w:rPr>
+              <w:t xml:space="preserve">Session 23</w:t>
+            </w:r>
+          </w:p>
+        </w:tc>
+        <w:tc>
+          <w:p>
+            <w:pPr>
+              <w:spacing w:after="40" w:before="40"/>
+            </w:pPr>
+            <w:r>
+              <w:rPr>
+                <w:b w:val="false"/>
+                <w:bCs w:val="false"/>
+                <w:color w:val="1D2D3E"/>
+                <w:sz w:val="20"/>
+                <w:szCs w:val="20"/>
+              </w:rPr>
+              <w:t xml:space="preserve">PDF export — Partners List (role summary + full table, filter label)</w:t>
+            </w:r>
+          </w:p>
+        </w:tc>
+        <w:tc>
+          <w:p>
+            <w:pPr>
+              <w:spacing w:after="40" w:before="40"/>
+            </w:pPr>
+            <w:r>
+              <w:rPr>
+                <w:b w:val="false"/>
+                <w:bCs w:val="false"/>
+                <w:color w:val="1D2D3E"/>
+                <w:sz w:val="20"/>
+                <w:szCs w:val="20"/>
+              </w:rPr>
+              <w:t xml:space="preserve">Done</w:t>
+            </w:r>
+          </w:p>
+        </w:tc>
+        <w:tc>
+          <w:p>
+            <w:pPr>
+              <w:spacing w:after="40" w:before="40"/>
+            </w:pPr>
+            <w:r>
+              <w:rPr>
+                <w:b w:val="false"/>
+                <w:bCs w:val="false"/>
+                <w:color w:val="1D2D3E"/>
+                <w:sz w:val="20"/>
+                <w:szCs w:val="20"/>
+              </w:rPr>
+              <w:t xml:space="preserve">pdfExport.ts exportPartnersListPDF</w:t>
+            </w:r>
+          </w:p>
+        </w:tc>
+      </w:tr>
+      <w:tr>
+        <w:tc>
+          <w:tcPr>
+            <w:shd w:color="F0F4F8" w:val="solid"/>
+          </w:tcPr>
+          <w:p>
+            <w:pPr>
+              <w:spacing w:after="40" w:before="40"/>
+            </w:pPr>
+            <w:r>
+              <w:rPr>
+                <w:b w:val="false"/>
+                <w:bCs w:val="false"/>
+                <w:color w:val="1D2D3E"/>
+                <w:sz w:val="20"/>
+                <w:szCs w:val="20"/>
+              </w:rPr>
+              <w:t xml:space="preserve">Session 23</w:t>
+            </w:r>
+          </w:p>
+        </w:tc>
+        <w:tc>
+          <w:tcPr>
+            <w:shd w:color="F0F4F8" w:val="solid"/>
+          </w:tcPr>
+          <w:p>
+            <w:pPr>
+              <w:spacing w:after="40" w:before="40"/>
+            </w:pPr>
+            <w:r>
+              <w:rPr>
+                <w:b w:val="false"/>
+                <w:bCs w:val="false"/>
+                <w:color w:val="1D2D3E"/>
+                <w:sz w:val="20"/>
+                <w:szCs w:val="20"/>
+              </w:rPr>
+              <w:t xml:space="preserve">Settings: Default company picker (explicit company selection in Settings screen)</w:t>
+            </w:r>
+          </w:p>
+        </w:tc>
+        <w:tc>
+          <w:tcPr>
+            <w:shd w:color="F0F4F8" w:val="solid"/>
+          </w:tcPr>
+          <w:p>
+            <w:pPr>
+              <w:spacing w:after="40" w:before="40"/>
+            </w:pPr>
+            <w:r>
+              <w:rPr>
+                <w:b w:val="false"/>
+                <w:bCs w:val="false"/>
+                <w:color w:val="1D2D3E"/>
+                <w:sz w:val="20"/>
+                <w:szCs w:val="20"/>
+              </w:rPr>
+              <w:t xml:space="preserve">Done</w:t>
+            </w:r>
+          </w:p>
+        </w:tc>
+        <w:tc>
+          <w:tcPr>
+            <w:shd w:color="F0F4F8" w:val="solid"/>
+          </w:tcPr>
+          <w:p>
+            <w:pPr>
+              <w:spacing w:after="40" w:before="40"/>
+            </w:pPr>
+            <w:r>
+              <w:rPr>
+                <w:b w:val="false"/>
+                <w:bCs w:val="false"/>
+                <w:color w:val="1D2D3E"/>
+                <w:sz w:val="20"/>
+                <w:szCs w:val="20"/>
+              </w:rPr>
+              <w:t xml:space="preserve">SettingsScreen.tsx + CompanyContext</w:t>
+            </w:r>
+          </w:p>
+        </w:tc>
+      </w:tr>
+      <w:tr>
+        <w:tc>
+          <w:p>
+            <w:pPr>
+              <w:spacing w:after="40" w:before="40"/>
+            </w:pPr>
+            <w:r>
+              <w:rPr>
+                <w:b w:val="false"/>
+                <w:bCs w:val="false"/>
+                <w:color w:val="1D2D3E"/>
+                <w:sz w:val="20"/>
+                <w:szCs w:val="20"/>
+              </w:rPr>
+              <w:t xml:space="preserve">Session 23</w:t>
+            </w:r>
+          </w:p>
+        </w:tc>
+        <w:tc>
+          <w:p>
+            <w:pPr>
+              <w:spacing w:after="40" w:before="40"/>
+            </w:pPr>
+            <w:r>
+              <w:rPr>
+                <w:b w:val="false"/>
+                <w:bCs w:val="false"/>
+                <w:color w:val="1D2D3E"/>
+                <w:sz w:val="20"/>
+                <w:szCs w:val="20"/>
+              </w:rPr>
+              <w:t xml:space="preserve">InboxScreen pull-to-refresh (RefreshControl on FlatList + ScrollView empty state)</w:t>
+            </w:r>
+          </w:p>
+        </w:tc>
+        <w:tc>
+          <w:p>
+            <w:pPr>
+              <w:spacing w:after="40" w:before="40"/>
+            </w:pPr>
+            <w:r>
+              <w:rPr>
+                <w:b w:val="false"/>
+                <w:bCs w:val="false"/>
+                <w:color w:val="1D2D3E"/>
+                <w:sz w:val="20"/>
+                <w:szCs w:val="20"/>
+              </w:rPr>
+              <w:t xml:space="preserve">Done</w:t>
+            </w:r>
+          </w:p>
+        </w:tc>
+        <w:tc>
+          <w:p>
+            <w:pPr>
+              <w:spacing w:after="40" w:before="40"/>
+            </w:pPr>
+            <w:r>
+              <w:rPr>
+                <w:b w:val="false"/>
+                <w:bCs w:val="false"/>
+                <w:color w:val="1D2D3E"/>
+                <w:sz w:val="20"/>
+                <w:szCs w:val="20"/>
+              </w:rPr>
+              <w:t xml:space="preserve">InboxScreen.tsx</w:t>
+            </w:r>
+          </w:p>
+        </w:tc>
+      </w:tr>
+      <w:tr>
+        <w:tc>
+          <w:tcPr>
+            <w:shd w:color="F0F4F8" w:val="solid"/>
+          </w:tcPr>
+          <w:p>
+            <w:pPr>
+              <w:spacing w:after="40" w:before="40"/>
+            </w:pPr>
+            <w:r>
+              <w:rPr>
+                <w:b w:val="false"/>
+                <w:bCs w:val="false"/>
+                <w:color w:val="1D2D3E"/>
+                <w:sz w:val="20"/>
+                <w:szCs w:val="20"/>
+              </w:rPr>
+              <w:t xml:space="preserve">Session 23</w:t>
+            </w:r>
+          </w:p>
+        </w:tc>
+        <w:tc>
+          <w:tcPr>
+            <w:shd w:color="F0F4F8" w:val="solid"/>
+          </w:tcPr>
+          <w:p>
+            <w:pPr>
+              <w:spacing w:after="40" w:before="40"/>
+            </w:pPr>
+            <w:r>
+              <w:rPr>
+                <w:b w:val="false"/>
+                <w:bCs w:val="false"/>
+                <w:color w:val="1D2D3E"/>
+                <w:sz w:val="20"/>
+                <w:szCs w:val="20"/>
+              </w:rPr>
+              <w:t xml:space="preserve">Recent search history (AsyncStorage, max 8, per-item delete, Clear all)</w:t>
+            </w:r>
+          </w:p>
+        </w:tc>
+        <w:tc>
+          <w:tcPr>
+            <w:shd w:color="F0F4F8" w:val="solid"/>
+          </w:tcPr>
+          <w:p>
+            <w:pPr>
+              <w:spacing w:after="40" w:before="40"/>
+            </w:pPr>
+            <w:r>
+              <w:rPr>
+                <w:b w:val="false"/>
+                <w:bCs w:val="false"/>
+                <w:color w:val="1D2D3E"/>
+                <w:sz w:val="20"/>
+                <w:szCs w:val="20"/>
+              </w:rPr>
+              <w:t xml:space="preserve">Done</w:t>
+            </w:r>
+          </w:p>
+        </w:tc>
+        <w:tc>
+          <w:tcPr>
+            <w:shd w:color="F0F4F8" w:val="solid"/>
+          </w:tcPr>
+          <w:p>
+            <w:pPr>
+              <w:spacing w:after="40" w:before="40"/>
+            </w:pPr>
+            <w:r>
+              <w:rPr>
+                <w:b w:val="false"/>
+                <w:bCs w:val="false"/>
+                <w:color w:val="1D2D3E"/>
+                <w:sz w:val="20"/>
+                <w:szCs w:val="20"/>
+              </w:rPr>
+              <w:t xml:space="preserve">SearchScreen.tsx</w:t>
+            </w:r>
+          </w:p>
+        </w:tc>
+      </w:tr>
     </w:tbl>
     <w:p>
       <w:pPr>
@@ -17295,6 +17751,96 @@
           <w:szCs w:val="22"/>
         </w:rPr>
         <w:t xml:space="preserve">pdfExport.ts exportWarehousesPDF — Warehouse List PDF: summary tiles + full table with status badge, items, qty (Session 22)</w:t>
+      </w:r>
+    </w:p>
+    <w:p>
+      <w:pPr>
+        <w:pStyle w:val="ListParagraph"/>
+        <w:numPr>
+          <w:ilvl w:val="0"/>
+          <w:numId w:val="1"/>
+        </w:numPr>
+        <w:spacing w:after="40"/>
+      </w:pPr>
+      <w:r>
+        <w:rPr>
+          <w:color w:val="1D2D3E"/>
+          <w:sz w:val="22"/>
+          <w:szCs w:val="22"/>
+        </w:rPr>
+        <w:t xml:space="preserve">pdfExport.ts exportComparisonPDF — Company KPI Comparison PDF: 8 metric sections (Net Income, Revenue, Expenses, Cash, AR, AP, Vouchers, Working Capital) as ranked tables with proportional bars (Session 23)</w:t>
+      </w:r>
+    </w:p>
+    <w:p>
+      <w:pPr>
+        <w:pStyle w:val="ListParagraph"/>
+        <w:numPr>
+          <w:ilvl w:val="0"/>
+          <w:numId w:val="1"/>
+        </w:numPr>
+        <w:spacing w:after="40"/>
+      </w:pPr>
+      <w:r>
+        <w:rPr>
+          <w:color w:val="1D2D3E"/>
+          <w:sz w:val="22"/>
+          <w:szCs w:val="22"/>
+        </w:rPr>
+        <w:t xml:space="preserve">pdfExport.ts exportMaterialsListPDF — Materials List PDF: type breakdown grid + full table with Code/Name/Type/Category/Unit/Status (Session 23)</w:t>
+      </w:r>
+    </w:p>
+    <w:p>
+      <w:pPr>
+        <w:pStyle w:val="ListParagraph"/>
+        <w:numPr>
+          <w:ilvl w:val="0"/>
+          <w:numId w:val="1"/>
+        </w:numPr>
+        <w:spacing w:after="40"/>
+      </w:pPr>
+      <w:r>
+        <w:rPr>
+          <w:color w:val="1D2D3E"/>
+          <w:sz w:val="22"/>
+          <w:szCs w:val="22"/>
+        </w:rPr>
+        <w:t xml:space="preserve">pdfExport.ts exportPartnersListPDF — Partners List PDF: role summary (Total/Vendors/Customers/Both) + full table with Name/Code/Role/Email/Phone/Address (Session 23)</w:t>
+      </w:r>
+    </w:p>
+    <w:p>
+      <w:pPr>
+        <w:pStyle w:val="ListParagraph"/>
+        <w:numPr>
+          <w:ilvl w:val="0"/>
+          <w:numId w:val="1"/>
+        </w:numPr>
+        <w:spacing w:after="40"/>
+      </w:pPr>
+      <w:r>
+        <w:rPr>
+          <w:color w:val="1D2D3E"/>
+          <w:sz w:val="22"/>
+          <w:szCs w:val="22"/>
+        </w:rPr>
+        <w:t xml:space="preserve">SearchScreen: AsyncStorage-backed recent search history — max 8 entries, deduplication, per-item delete, clear all, tap to re-run (Session 23)</w:t>
+      </w:r>
+    </w:p>
+    <w:p>
+      <w:pPr>
+        <w:pStyle w:val="ListParagraph"/>
+        <w:numPr>
+          <w:ilvl w:val="0"/>
+          <w:numId w:val="1"/>
+        </w:numPr>
+        <w:spacing w:after="40"/>
+      </w:pPr>
+      <w:r>
+        <w:rPr>
+          <w:color w:val="1D2D3E"/>
+          <w:sz w:val="22"/>
+          <w:szCs w:val="22"/>
+        </w:rPr>
+        <w:t xml:space="preserve">SettingsScreen: Default company picker section — shows all companies as tappable rows with check mark on active; calls setSelectedCompany for persistence (Session 23)</w:t>
       </w:r>
     </w:p>
     <w:p>
@@ -20522,6 +21068,465 @@
           <w:szCs w:val="22"/>
         </w:rPr>
         <w:t xml:space="preserve">  Reuses existing exportBtn/exportBtnText styles alongside Stock tab PDF button</w:t>
+      </w:r>
+    </w:p>
+    <w:p>
+      <w:pPr>
+        <w:spacing w:after="80"/>
+      </w:pPr>
+      <w:r>
+        <w:rPr>
+          <w:color w:val="1D2D3E"/>
+          <w:sz w:val="22"/>
+          <w:szCs w:val="22"/>
+        </w:rPr>
+        <w:t xml:space="preserve"/>
+      </w:r>
+    </w:p>
+    <w:p>
+      <w:pPr>
+        <w:pStyle w:val="Heading2"/>
+        <w:spacing w:after="120" w:before="300"/>
+      </w:pPr>
+      <w:r>
+        <w:rPr>
+          <w:b/>
+          <w:bCs/>
+          <w:color w:val="1D2D3E"/>
+        </w:rPr>
+        <w:t xml:space="preserve">Session 23 — 2026-05-27</w:t>
+      </w:r>
+    </w:p>
+    <w:p>
+      <w:pPr>
+        <w:pStyle w:val="ListParagraph"/>
+        <w:numPr>
+          <w:ilvl w:val="0"/>
+          <w:numId w:val="1"/>
+        </w:numPr>
+        <w:spacing w:after="40"/>
+      </w:pPr>
+      <w:r>
+        <w:rPr>
+          <w:color w:val="1D2D3E"/>
+          <w:sz w:val="22"/>
+          <w:szCs w:val="22"/>
+        </w:rPr>
+        <w:t xml:space="preserve">PDF export — Company KPI Comparison (pdfExport.ts exportComparisonPDF, ComparisonScreen.tsx)</w:t>
+      </w:r>
+    </w:p>
+    <w:p>
+      <w:pPr>
+        <w:pStyle w:val="ListParagraph"/>
+        <w:numPr>
+          <w:ilvl w:val="1"/>
+          <w:numId w:val="1"/>
+        </w:numPr>
+        <w:spacing w:after="40"/>
+      </w:pPr>
+      <w:r>
+        <w:rPr>
+          <w:color w:val="1D2D3E"/>
+          <w:sz w:val="22"/>
+          <w:szCs w:val="22"/>
+        </w:rPr>
+        <w:t xml:space="preserve">  8 metric sections: Net Income, Revenue, Expenses, Cash, AR, AP, Vouchers MTD, Working Capital</w:t>
+      </w:r>
+    </w:p>
+    <w:p>
+      <w:pPr>
+        <w:pStyle w:val="ListParagraph"/>
+        <w:numPr>
+          <w:ilvl w:val="1"/>
+          <w:numId w:val="1"/>
+        </w:numPr>
+        <w:spacing w:after="40"/>
+      </w:pPr>
+      <w:r>
+        <w:rPr>
+          <w:color w:val="1D2D3E"/>
+          <w:sz w:val="22"/>
+          <w:szCs w:val="22"/>
+        </w:rPr>
+        <w:t xml:space="preserve">  Each section: ranked table with inline CSS proportional bars (top performer bold/solid, others lighter)</w:t>
+      </w:r>
+    </w:p>
+    <w:p>
+      <w:pPr>
+        <w:pStyle w:val="ListParagraph"/>
+        <w:numPr>
+          <w:ilvl w:val="1"/>
+          <w:numId w:val="1"/>
+        </w:numPr>
+        <w:spacing w:after="40"/>
+      </w:pPr>
+      <w:r>
+        <w:rPr>
+          <w:color w:val="1D2D3E"/>
+          <w:sz w:val="22"/>
+          <w:szCs w:val="22"/>
+        </w:rPr>
+        <w:t xml:space="preserve">  Summary tiles: total companies / loaded count / failed count</w:t>
+      </w:r>
+    </w:p>
+    <w:p>
+      <w:pPr>
+        <w:pStyle w:val="ListParagraph"/>
+        <w:numPr>
+          <w:ilvl w:val="1"/>
+          <w:numId w:val="1"/>
+        </w:numPr>
+        <w:spacing w:after="40"/>
+      </w:pPr>
+      <w:r>
+        <w:rPr>
+          <w:color w:val="1D2D3E"/>
+          <w:sz w:val="22"/>
+          <w:szCs w:val="22"/>
+        </w:rPr>
+        <w:t xml:space="preserve">  PDF button in ComparisonScreen header; visible when ≥1 snapshot loaded; ActivityIndicator while exporting</w:t>
+      </w:r>
+    </w:p>
+    <w:p>
+      <w:pPr>
+        <w:pStyle w:val="ListParagraph"/>
+        <w:numPr>
+          <w:ilvl w:val="0"/>
+          <w:numId w:val="1"/>
+        </w:numPr>
+        <w:spacing w:after="40"/>
+      </w:pPr>
+      <w:r>
+        <w:rPr>
+          <w:color w:val="1D2D3E"/>
+          <w:sz w:val="22"/>
+          <w:szCs w:val="22"/>
+        </w:rPr>
+        <w:t xml:space="preserve">PDF export — Materials List (pdfExport.ts exportMaterialsListPDF, MaterialsScreen.tsx)</w:t>
+      </w:r>
+    </w:p>
+    <w:p>
+      <w:pPr>
+        <w:pStyle w:val="ListParagraph"/>
+        <w:numPr>
+          <w:ilvl w:val="1"/>
+          <w:numId w:val="1"/>
+        </w:numPr>
+        <w:spacing w:after="40"/>
+      </w:pPr>
+      <w:r>
+        <w:rPr>
+          <w:color w:val="1D2D3E"/>
+          <w:sz w:val="22"/>
+          <w:szCs w:val="22"/>
+        </w:rPr>
+        <w:t xml:space="preserve">  3-tile summary: Total Items / Active / Types; By Type breakdown grid (up to 4 types)</w:t>
+      </w:r>
+    </w:p>
+    <w:p>
+      <w:pPr>
+        <w:pStyle w:val="ListParagraph"/>
+        <w:numPr>
+          <w:ilvl w:val="1"/>
+          <w:numId w:val="1"/>
+        </w:numPr>
+        <w:spacing w:after="40"/>
+      </w:pPr>
+      <w:r>
+        <w:rPr>
+          <w:color w:val="1D2D3E"/>
+          <w:sz w:val="22"/>
+          <w:szCs w:val="22"/>
+        </w:rPr>
+        <w:t xml:space="preserve">  Full table: Code | Name | Type | Category | Unit | Status; inactive rows at 0.6 opacity</w:t>
+      </w:r>
+    </w:p>
+    <w:p>
+      <w:pPr>
+        <w:pStyle w:val="ListParagraph"/>
+        <w:numPr>
+          <w:ilvl w:val="1"/>
+          <w:numId w:val="1"/>
+        </w:numPr>
+        <w:spacing w:after="40"/>
+      </w:pPr>
+      <w:r>
+        <w:rPr>
+          <w:color w:val="1D2D3E"/>
+          <w:sz w:val="22"/>
+          <w:szCs w:val="22"/>
+        </w:rPr>
+        <w:t xml:space="preserve">  PDF button in MaterialsScreen header; respects current type + search filters; passes filterLabel</w:t>
+      </w:r>
+    </w:p>
+    <w:p>
+      <w:pPr>
+        <w:pStyle w:val="ListParagraph"/>
+        <w:numPr>
+          <w:ilvl w:val="0"/>
+          <w:numId w:val="1"/>
+        </w:numPr>
+        <w:spacing w:after="40"/>
+      </w:pPr>
+      <w:r>
+        <w:rPr>
+          <w:color w:val="1D2D3E"/>
+          <w:sz w:val="22"/>
+          <w:szCs w:val="22"/>
+        </w:rPr>
+        <w:t xml:space="preserve">PDF export — Partners List (pdfExport.ts exportPartnersListPDF, PartnersScreen.tsx)</w:t>
+      </w:r>
+    </w:p>
+    <w:p>
+      <w:pPr>
+        <w:pStyle w:val="ListParagraph"/>
+        <w:numPr>
+          <w:ilvl w:val="1"/>
+          <w:numId w:val="1"/>
+        </w:numPr>
+        <w:spacing w:after="40"/>
+      </w:pPr>
+      <w:r>
+        <w:rPr>
+          <w:color w:val="1D2D3E"/>
+          <w:sz w:val="22"/>
+          <w:szCs w:val="22"/>
+        </w:rPr>
+        <w:t xml:space="preserve">  Dynamic summary grid: Total / Vendors / Customers / Both (4th tile shown only when both &gt; 0)</w:t>
+      </w:r>
+    </w:p>
+    <w:p>
+      <w:pPr>
+        <w:pStyle w:val="ListParagraph"/>
+        <w:numPr>
+          <w:ilvl w:val="1"/>
+          <w:numId w:val="1"/>
+        </w:numPr>
+        <w:spacing w:after="40"/>
+      </w:pPr>
+      <w:r>
+        <w:rPr>
+          <w:color w:val="1D2D3E"/>
+          <w:sz w:val="22"/>
+          <w:szCs w:val="22"/>
+        </w:rPr>
+        <w:t xml:space="preserve">  Full table: Name | Code | Role | Email | Phone | Address (truncated to 40 chars)</w:t>
+      </w:r>
+    </w:p>
+    <w:p>
+      <w:pPr>
+        <w:pStyle w:val="ListParagraph"/>
+        <w:numPr>
+          <w:ilvl w:val="1"/>
+          <w:numId w:val="1"/>
+        </w:numPr>
+        <w:spacing w:after="40"/>
+      </w:pPr>
+      <w:r>
+        <w:rPr>
+          <w:color w:val="1D2D3E"/>
+          <w:sz w:val="22"/>
+          <w:szCs w:val="22"/>
+        </w:rPr>
+        <w:t xml:space="preserve">  PDF button in PartnersScreen header; respects role filter (Customers/Vendors) + search</w:t>
+      </w:r>
+    </w:p>
+    <w:p>
+      <w:pPr>
+        <w:pStyle w:val="ListParagraph"/>
+        <w:numPr>
+          <w:ilvl w:val="0"/>
+          <w:numId w:val="1"/>
+        </w:numPr>
+        <w:spacing w:after="40"/>
+      </w:pPr>
+      <w:r>
+        <w:rPr>
+          <w:color w:val="1D2D3E"/>
+          <w:sz w:val="22"/>
+          <w:szCs w:val="22"/>
+        </w:rPr>
+        <w:t xml:space="preserve">Settings screen: Default company picker (SettingsScreen.tsx)</w:t>
+      </w:r>
+    </w:p>
+    <w:p>
+      <w:pPr>
+        <w:pStyle w:val="ListParagraph"/>
+        <w:numPr>
+          <w:ilvl w:val="1"/>
+          <w:numId w:val="1"/>
+        </w:numPr>
+        <w:spacing w:after="40"/>
+      </w:pPr>
+      <w:r>
+        <w:rPr>
+          <w:color w:val="1D2D3E"/>
+          <w:sz w:val="22"/>
+          <w:szCs w:val="22"/>
+        </w:rPr>
+        <w:t xml:space="preserve">  New DEFAULT COMPANY section at top of Settings using useCompany() context</w:t>
+      </w:r>
+    </w:p>
+    <w:p>
+      <w:pPr>
+        <w:pStyle w:val="ListParagraph"/>
+        <w:numPr>
+          <w:ilvl w:val="1"/>
+          <w:numId w:val="1"/>
+        </w:numPr>
+        <w:spacing w:after="40"/>
+      </w:pPr>
+      <w:r>
+        <w:rPr>
+          <w:color w:val="1D2D3E"/>
+          <w:sz w:val="22"/>
+          <w:szCs w:val="22"/>
+        </w:rPr>
+        <w:t xml:space="preserve">  Lists all companies as tappable rows; active company shows check icon + bold name</w:t>
+      </w:r>
+    </w:p>
+    <w:p>
+      <w:pPr>
+        <w:pStyle w:val="ListParagraph"/>
+        <w:numPr>
+          <w:ilvl w:val="1"/>
+          <w:numId w:val="1"/>
+        </w:numPr>
+        <w:spacing w:after="40"/>
+      </w:pPr>
+      <w:r>
+        <w:rPr>
+          <w:color w:val="1D2D3E"/>
+          <w:sz w:val="22"/>
+          <w:szCs w:val="22"/>
+        </w:rPr>
+        <w:t xml:space="preserve">  Tapping calls setSelectedCompany() → persists to AsyncStorage, restores on next launch</w:t>
+      </w:r>
+    </w:p>
+    <w:p>
+      <w:pPr>
+        <w:pStyle w:val="ListParagraph"/>
+        <w:numPr>
+          <w:ilvl w:val="0"/>
+          <w:numId w:val="1"/>
+        </w:numPr>
+        <w:spacing w:after="40"/>
+      </w:pPr>
+      <w:r>
+        <w:rPr>
+          <w:color w:val="1D2D3E"/>
+          <w:sz w:val="22"/>
+          <w:szCs w:val="22"/>
+        </w:rPr>
+        <w:t xml:space="preserve">InboxScreen pull-to-refresh (InboxScreen.tsx)</w:t>
+      </w:r>
+    </w:p>
+    <w:p>
+      <w:pPr>
+        <w:pStyle w:val="ListParagraph"/>
+        <w:numPr>
+          <w:ilvl w:val="1"/>
+          <w:numId w:val="1"/>
+        </w:numPr>
+        <w:spacing w:after="40"/>
+      </w:pPr>
+      <w:r>
+        <w:rPr>
+          <w:color w:val="1D2D3E"/>
+          <w:sz w:val="22"/>
+          <w:szCs w:val="22"/>
+        </w:rPr>
+        <w:t xml:space="preserve">  RefreshControl on FlatList; empty state uses ScrollView + RefreshControl; flexGrow: 1 on emptyState</w:t>
+      </w:r>
+    </w:p>
+    <w:p>
+      <w:pPr>
+        <w:pStyle w:val="ListParagraph"/>
+        <w:numPr>
+          <w:ilvl w:val="0"/>
+          <w:numId w:val="1"/>
+        </w:numPr>
+        <w:spacing w:after="40"/>
+      </w:pPr>
+      <w:r>
+        <w:rPr>
+          <w:color w:val="1D2D3E"/>
+          <w:sz w:val="22"/>
+          <w:szCs w:val="22"/>
+        </w:rPr>
+        <w:t xml:space="preserve">Recent search history in SearchScreen (SearchScreen.tsx)</w:t>
+      </w:r>
+    </w:p>
+    <w:p>
+      <w:pPr>
+        <w:pStyle w:val="ListParagraph"/>
+        <w:numPr>
+          <w:ilvl w:val="1"/>
+          <w:numId w:val="1"/>
+        </w:numPr>
+        <w:spacing w:after="40"/>
+      </w:pPr>
+      <w:r>
+        <w:rPr>
+          <w:color w:val="1D2D3E"/>
+          <w:sz w:val="22"/>
+          <w:szCs w:val="22"/>
+        </w:rPr>
+        <w:t xml:space="preserve">  AsyncStorage-backed history (max 8, case-insensitive deduplication)</w:t>
+      </w:r>
+    </w:p>
+    <w:p>
+      <w:pPr>
+        <w:pStyle w:val="ListParagraph"/>
+        <w:numPr>
+          <w:ilvl w:val="1"/>
+          <w:numId w:val="1"/>
+        </w:numPr>
+        <w:spacing w:after="40"/>
+      </w:pPr>
+      <w:r>
+        <w:rPr>
+          <w:color w:val="1D2D3E"/>
+          <w:sz w:val="22"/>
+          <w:szCs w:val="22"/>
+        </w:rPr>
+        <w:t xml:space="preserve">  Shows clock-icon rows when no query typed; per-item × delete + Clear all button</w:t>
+      </w:r>
+    </w:p>
+    <w:p>
+      <w:pPr>
+        <w:pStyle w:val="ListParagraph"/>
+        <w:numPr>
+          <w:ilvl w:val="1"/>
+          <w:numId w:val="1"/>
+        </w:numPr>
+        <w:spacing w:after="40"/>
+      </w:pPr>
+      <w:r>
+        <w:rPr>
+          <w:color w:val="1D2D3E"/>
+          <w:sz w:val="22"/>
+          <w:szCs w:val="22"/>
+        </w:rPr>
+        <w:t xml:space="preserve">  commitSearch() called on keyboard submit + before navigating to any result</w:t>
+      </w:r>
+    </w:p>
+    <w:p>
+      <w:pPr>
+        <w:pStyle w:val="ListParagraph"/>
+        <w:numPr>
+          <w:ilvl w:val="1"/>
+          <w:numId w:val="1"/>
+        </w:numPr>
+        <w:spacing w:after="40"/>
+      </w:pPr>
+      <w:r>
+        <w:rPr>
+          <w:color w:val="1D2D3E"/>
+          <w:sz w:val="22"/>
+          <w:szCs w:val="22"/>
+        </w:rPr>
+        <w:t xml:space="preserve">  Tapping a history row repopulates the query field</w:t>
       </w:r>
     </w:p>
     <w:p>

</xml_diff>

<commit_message>
feat(session-24): dashboard MoM trend, KPICard trend props, docs update
</commit_message>
<xml_diff>
--- a/FEATURES.docx
+++ b/FEATURES.docx
@@ -16949,6 +16949,228 @@
           </w:p>
         </w:tc>
       </w:tr>
+      <w:tr>
+        <w:tc>
+          <w:p>
+            <w:pPr>
+              <w:spacing w:after="40" w:before="40"/>
+            </w:pPr>
+            <w:r>
+              <w:rPr>
+                <w:b w:val="false"/>
+                <w:bCs w:val="false"/>
+                <w:color w:val="1D2D3E"/>
+                <w:sz w:val="20"/>
+                <w:szCs w:val="20"/>
+              </w:rPr>
+              <w:t xml:space="preserve">Session 24</w:t>
+            </w:r>
+          </w:p>
+        </w:tc>
+        <w:tc>
+          <w:p>
+            <w:pPr>
+              <w:spacing w:after="40" w:before="40"/>
+            </w:pPr>
+            <w:r>
+              <w:rPr>
+                <w:b w:val="false"/>
+                <w:bCs w:val="false"/>
+                <w:color w:val="1D2D3E"/>
+                <w:sz w:val="20"/>
+                <w:szCs w:val="20"/>
+              </w:rPr>
+              <w:t xml:space="preserve">Date format setting — natural (Jan 15), DD/MM/YYYY, MM/DD/YYYY; persists + updates all screens instantly</w:t>
+            </w:r>
+          </w:p>
+        </w:tc>
+        <w:tc>
+          <w:p>
+            <w:pPr>
+              <w:spacing w:after="40" w:before="40"/>
+            </w:pPr>
+            <w:r>
+              <w:rPr>
+                <w:b w:val="false"/>
+                <w:bCs w:val="false"/>
+                <w:color w:val="1D2D3E"/>
+                <w:sz w:val="20"/>
+                <w:szCs w:val="20"/>
+              </w:rPr>
+              <w:t xml:space="preserve">Done</w:t>
+            </w:r>
+          </w:p>
+        </w:tc>
+        <w:tc>
+          <w:p>
+            <w:pPr>
+              <w:spacing w:after="40" w:before="40"/>
+            </w:pPr>
+            <w:r>
+              <w:rPr>
+                <w:b w:val="false"/>
+                <w:bCs w:val="false"/>
+                <w:color w:val="1D2D3E"/>
+                <w:sz w:val="20"/>
+                <w:szCs w:val="20"/>
+              </w:rPr>
+              <w:t xml:space="preserve">settings.ts + currency.ts + SettingsScreen.tsx</w:t>
+            </w:r>
+          </w:p>
+        </w:tc>
+      </w:tr>
+      <w:tr>
+        <w:tc>
+          <w:tcPr>
+            <w:shd w:color="F0F4F8" w:val="solid"/>
+          </w:tcPr>
+          <w:p>
+            <w:pPr>
+              <w:spacing w:after="40" w:before="40"/>
+            </w:pPr>
+            <w:r>
+              <w:rPr>
+                <w:b w:val="false"/>
+                <w:bCs w:val="false"/>
+                <w:color w:val="1D2D3E"/>
+                <w:sz w:val="20"/>
+                <w:szCs w:val="20"/>
+              </w:rPr>
+              <w:t xml:space="preserve">Session 24</w:t>
+            </w:r>
+          </w:p>
+        </w:tc>
+        <w:tc>
+          <w:tcPr>
+            <w:shd w:color="F0F4F8" w:val="solid"/>
+          </w:tcPr>
+          <w:p>
+            <w:pPr>
+              <w:spacing w:after="40" w:before="40"/>
+            </w:pPr>
+            <w:r>
+              <w:rPr>
+                <w:b w:val="false"/>
+                <w:bCs w:val="false"/>
+                <w:color w:val="1D2D3E"/>
+                <w:sz w:val="20"/>
+                <w:szCs w:val="20"/>
+              </w:rPr>
+              <w:t xml:space="preserve">PDF export — Companies list (active/inactive counts, full table with name/code/currency/phone/email/status)</w:t>
+            </w:r>
+          </w:p>
+        </w:tc>
+        <w:tc>
+          <w:tcPr>
+            <w:shd w:color="F0F4F8" w:val="solid"/>
+          </w:tcPr>
+          <w:p>
+            <w:pPr>
+              <w:spacing w:after="40" w:before="40"/>
+            </w:pPr>
+            <w:r>
+              <w:rPr>
+                <w:b w:val="false"/>
+                <w:bCs w:val="false"/>
+                <w:color w:val="1D2D3E"/>
+                <w:sz w:val="20"/>
+                <w:szCs w:val="20"/>
+              </w:rPr>
+              <w:t xml:space="preserve">Done</w:t>
+            </w:r>
+          </w:p>
+        </w:tc>
+        <w:tc>
+          <w:tcPr>
+            <w:shd w:color="F0F4F8" w:val="solid"/>
+          </w:tcPr>
+          <w:p>
+            <w:pPr>
+              <w:spacing w:after="40" w:before="40"/>
+            </w:pPr>
+            <w:r>
+              <w:rPr>
+                <w:b w:val="false"/>
+                <w:bCs w:val="false"/>
+                <w:color w:val="1D2D3E"/>
+                <w:sz w:val="20"/>
+                <w:szCs w:val="20"/>
+              </w:rPr>
+              <w:t xml:space="preserve">pdfExport.ts exportCompaniesPDF + CompaniesScreen.tsx</w:t>
+            </w:r>
+          </w:p>
+        </w:tc>
+      </w:tr>
+      <w:tr>
+        <w:tc>
+          <w:p>
+            <w:pPr>
+              <w:spacing w:after="40" w:before="40"/>
+            </w:pPr>
+            <w:r>
+              <w:rPr>
+                <w:b w:val="false"/>
+                <w:bCs w:val="false"/>
+                <w:color w:val="1D2D3E"/>
+                <w:sz w:val="20"/>
+                <w:szCs w:val="20"/>
+              </w:rPr>
+              <w:t xml:space="preserve">Session 24</w:t>
+            </w:r>
+          </w:p>
+        </w:tc>
+        <w:tc>
+          <w:p>
+            <w:pPr>
+              <w:spacing w:after="40" w:before="40"/>
+            </w:pPr>
+            <w:r>
+              <w:rPr>
+                <w:b w:val="false"/>
+                <w:bCs w:val="false"/>
+                <w:color w:val="1D2D3E"/>
+                <w:sz w:val="20"/>
+                <w:szCs w:val="20"/>
+              </w:rPr>
+              <w:t xml:space="preserve">Dashboard month-over-month trend: Revenue and Expenses KPI cards show ±X% vs last month with green/red trend icons</w:t>
+            </w:r>
+          </w:p>
+        </w:tc>
+        <w:tc>
+          <w:p>
+            <w:pPr>
+              <w:spacing w:after="40" w:before="40"/>
+            </w:pPr>
+            <w:r>
+              <w:rPr>
+                <w:b w:val="false"/>
+                <w:bCs w:val="false"/>
+                <w:color w:val="1D2D3E"/>
+                <w:sz w:val="20"/>
+                <w:szCs w:val="20"/>
+              </w:rPr>
+              <w:t xml:space="preserve">Done</w:t>
+            </w:r>
+          </w:p>
+        </w:tc>
+        <w:tc>
+          <w:p>
+            <w:pPr>
+              <w:spacing w:after="40" w:before="40"/>
+            </w:pPr>
+            <w:r>
+              <w:rPr>
+                <w:b w:val="false"/>
+                <w:bCs w:val="false"/>
+                <w:color w:val="1D2D3E"/>
+                <w:sz w:val="20"/>
+                <w:szCs w:val="20"/>
+              </w:rPr>
+              <w:t xml:space="preserve">dashboard.ts + KPICard.tsx + DashboardScreen.tsx</w:t>
+            </w:r>
+          </w:p>
+        </w:tc>
+      </w:tr>
     </w:tbl>
     <w:p>
       <w:pPr>
@@ -17841,6 +18063,96 @@
           <w:szCs w:val="22"/>
         </w:rPr>
         <w:t xml:space="preserve">SettingsScreen: Default company picker section — shows all companies as tappable rows with check mark on active; calls setSelectedCompany for persistence (Session 23)</w:t>
+      </w:r>
+    </w:p>
+    <w:p>
+      <w:pPr>
+        <w:pStyle w:val="ListParagraph"/>
+        <w:numPr>
+          <w:ilvl w:val="0"/>
+          <w:numId w:val="1"/>
+        </w:numPr>
+        <w:spacing w:after="40"/>
+      </w:pPr>
+      <w:r>
+        <w:rPr>
+          <w:color w:val="1D2D3E"/>
+          <w:sz w:val="22"/>
+          <w:szCs w:val="22"/>
+        </w:rPr>
+        <w:t xml:space="preserve">settings.ts: DateFormat type + initDateFormat()/getDateFormatSync()/getDateFormat()/setDateFormat() — synchronous date format for all render paths (Session 24)</w:t>
+      </w:r>
+    </w:p>
+    <w:p>
+      <w:pPr>
+        <w:pStyle w:val="ListParagraph"/>
+        <w:numPr>
+          <w:ilvl w:val="0"/>
+          <w:numId w:val="1"/>
+        </w:numPr>
+        <w:spacing w:after="40"/>
+      </w:pPr>
+      <w:r>
+        <w:rPr>
+          <w:color w:val="1D2D3E"/>
+          <w:sz w:val="22"/>
+          <w:szCs w:val="22"/>
+        </w:rPr>
+        <w:t xml:space="preserve">currency.ts: formatDate() and formatShortDate() now respect DateFormat setting via getDateFormatSync() (Session 24)</w:t>
+      </w:r>
+    </w:p>
+    <w:p>
+      <w:pPr>
+        <w:pStyle w:val="ListParagraph"/>
+        <w:numPr>
+          <w:ilvl w:val="0"/>
+          <w:numId w:val="1"/>
+        </w:numPr>
+        <w:spacing w:after="40"/>
+      </w:pPr>
+      <w:r>
+        <w:rPr>
+          <w:color w:val="1D2D3E"/>
+          <w:sz w:val="22"/>
+          <w:szCs w:val="22"/>
+        </w:rPr>
+        <w:t xml:space="preserve">pdfExport.ts exportCompaniesPDF — Companies List PDF: active/inactive summary + full table with Name/Code/Currency/Phone/Email/Status (Session 24)</w:t>
+      </w:r>
+    </w:p>
+    <w:p>
+      <w:pPr>
+        <w:pStyle w:val="ListParagraph"/>
+        <w:numPr>
+          <w:ilvl w:val="0"/>
+          <w:numId w:val="1"/>
+        </w:numPr>
+        <w:spacing w:after="40"/>
+      </w:pPr>
+      <w:r>
+        <w:rPr>
+          <w:color w:val="1D2D3E"/>
+          <w:sz w:val="22"/>
+          <w:szCs w:val="22"/>
+        </w:rPr>
+        <w:t xml:space="preserve">KPICard.tsx: trendPct and trendInverted props — shows trending-up/down icon + '±X.X% vs last mo' in green/red (Session 24)</w:t>
+      </w:r>
+    </w:p>
+    <w:p>
+      <w:pPr>
+        <w:pStyle w:val="ListParagraph"/>
+        <w:numPr>
+          <w:ilvl w:val="0"/>
+          <w:numId w:val="1"/>
+        </w:numPr>
+        <w:spacing w:after="40"/>
+      </w:pPr>
+      <w:r>
+        <w:rPr>
+          <w:color w:val="1D2D3E"/>
+          <w:sz w:val="22"/>
+          <w:szCs w:val="22"/>
+        </w:rPr>
+        <w:t xml:space="preserve">dashboard.ts: fetchDashboardData now fetches prev month JEs in parallel; KPIs include revenuePrevMonth and expensesPrevMonth (Session 24)</w:t>
       </w:r>
     </w:p>
     <w:p>
@@ -21527,6 +21839,285 @@
           <w:szCs w:val="22"/>
         </w:rPr>
         <w:t xml:space="preserve">  Tapping a history row repopulates the query field</w:t>
+      </w:r>
+    </w:p>
+    <w:p>
+      <w:pPr>
+        <w:spacing w:after="80"/>
+      </w:pPr>
+      <w:r>
+        <w:rPr>
+          <w:color w:val="1D2D3E"/>
+          <w:sz w:val="22"/>
+          <w:szCs w:val="22"/>
+        </w:rPr>
+        <w:t xml:space="preserve"/>
+      </w:r>
+    </w:p>
+    <w:p>
+      <w:pPr>
+        <w:pStyle w:val="Heading2"/>
+        <w:spacing w:after="120" w:before="300"/>
+      </w:pPr>
+      <w:r>
+        <w:rPr>
+          <w:b/>
+          <w:bCs/>
+          <w:color w:val="1D2D3E"/>
+        </w:rPr>
+        <w:t xml:space="preserve">Session 24 — 2026-05-27</w:t>
+      </w:r>
+    </w:p>
+    <w:p>
+      <w:pPr>
+        <w:pStyle w:val="ListParagraph"/>
+        <w:numPr>
+          <w:ilvl w:val="0"/>
+          <w:numId w:val="1"/>
+        </w:numPr>
+        <w:spacing w:after="40"/>
+      </w:pPr>
+      <w:r>
+        <w:rPr>
+          <w:color w:val="1D2D3E"/>
+          <w:sz w:val="22"/>
+          <w:szCs w:val="22"/>
+        </w:rPr>
+        <w:t xml:space="preserve">Date format setting (settings.ts, currency.ts, SettingsScreen.tsx, App.tsx)</w:t>
+      </w:r>
+    </w:p>
+    <w:p>
+      <w:pPr>
+        <w:pStyle w:val="ListParagraph"/>
+        <w:numPr>
+          <w:ilvl w:val="1"/>
+          <w:numId w:val="1"/>
+        </w:numPr>
+        <w:spacing w:after="40"/>
+      </w:pPr>
+      <w:r>
+        <w:rPr>
+          <w:color w:val="1D2D3E"/>
+          <w:sz w:val="22"/>
+          <w:szCs w:val="22"/>
+        </w:rPr>
+        <w:t xml:space="preserve">  DateFormat type: 'natural' (Jan 15, 2025) | 'dmy' (DD/MM/YYYY) | 'mdy' (MM/DD/YYYY)</w:t>
+      </w:r>
+    </w:p>
+    <w:p>
+      <w:pPr>
+        <w:pStyle w:val="ListParagraph"/>
+        <w:numPr>
+          <w:ilvl w:val="1"/>
+          <w:numId w:val="1"/>
+        </w:numPr>
+        <w:spacing w:after="40"/>
+      </w:pPr>
+      <w:r>
+        <w:rPr>
+          <w:color w:val="1D2D3E"/>
+          <w:sz w:val="22"/>
+          <w:szCs w:val="22"/>
+        </w:rPr>
+        <w:t xml:space="preserve">  Module-level _dateFormatCache initialized via initDateFormat() called at app startup in App.tsx</w:t>
+      </w:r>
+    </w:p>
+    <w:p>
+      <w:pPr>
+        <w:pStyle w:val="ListParagraph"/>
+        <w:numPr>
+          <w:ilvl w:val="1"/>
+          <w:numId w:val="1"/>
+        </w:numPr>
+        <w:spacing w:after="40"/>
+      </w:pPr>
+      <w:r>
+        <w:rPr>
+          <w:color w:val="1D2D3E"/>
+          <w:sz w:val="22"/>
+          <w:szCs w:val="22"/>
+        </w:rPr>
+        <w:t xml:space="preserve">  getDateFormatSync() used synchronously in formatDate() and formatShortDate() — zero async overhead at render</w:t>
+      </w:r>
+    </w:p>
+    <w:p>
+      <w:pPr>
+        <w:pStyle w:val="ListParagraph"/>
+        <w:numPr>
+          <w:ilvl w:val="1"/>
+          <w:numId w:val="1"/>
+        </w:numPr>
+        <w:spacing w:after="40"/>
+      </w:pPr>
+      <w:r>
+        <w:rPr>
+          <w:color w:val="1D2D3E"/>
+          <w:sz w:val="22"/>
+          <w:szCs w:val="22"/>
+        </w:rPr>
+        <w:t xml:space="preserve">  Settings screen: new DATE FORMAT section with 3 chip-style buttons; updates cache + AsyncStorage immediately</w:t>
+      </w:r>
+    </w:p>
+    <w:p>
+      <w:pPr>
+        <w:pStyle w:val="ListParagraph"/>
+        <w:numPr>
+          <w:ilvl w:val="0"/>
+          <w:numId w:val="1"/>
+        </w:numPr>
+        <w:spacing w:after="40"/>
+      </w:pPr>
+      <w:r>
+        <w:rPr>
+          <w:color w:val="1D2D3E"/>
+          <w:sz w:val="22"/>
+          <w:szCs w:val="22"/>
+        </w:rPr>
+        <w:t xml:space="preserve">PDF export — Companies List (pdfExport.ts exportCompaniesPDF, CompaniesScreen.tsx)</w:t>
+      </w:r>
+    </w:p>
+    <w:p>
+      <w:pPr>
+        <w:pStyle w:val="ListParagraph"/>
+        <w:numPr>
+          <w:ilvl w:val="1"/>
+          <w:numId w:val="1"/>
+        </w:numPr>
+        <w:spacing w:after="40"/>
+      </w:pPr>
+      <w:r>
+        <w:rPr>
+          <w:color w:val="1D2D3E"/>
+          <w:sz w:val="22"/>
+          <w:szCs w:val="22"/>
+        </w:rPr>
+        <w:t xml:space="preserve">  Summary grid: Total / Active / Inactive counts</w:t>
+      </w:r>
+    </w:p>
+    <w:p>
+      <w:pPr>
+        <w:pStyle w:val="ListParagraph"/>
+        <w:numPr>
+          <w:ilvl w:val="1"/>
+          <w:numId w:val="1"/>
+        </w:numPr>
+        <w:spacing w:after="40"/>
+      </w:pPr>
+      <w:r>
+        <w:rPr>
+          <w:color w:val="1D2D3E"/>
+          <w:sz w:val="22"/>
+          <w:szCs w:val="22"/>
+        </w:rPr>
+        <w:t xml:space="preserve">  Full table: Name | Code | Currency | Phone | Email | Status (color-coded Active/Inactive)</w:t>
+      </w:r>
+    </w:p>
+    <w:p>
+      <w:pPr>
+        <w:pStyle w:val="ListParagraph"/>
+        <w:numPr>
+          <w:ilvl w:val="1"/>
+          <w:numId w:val="1"/>
+        </w:numPr>
+        <w:spacing w:after="40"/>
+      </w:pPr>
+      <w:r>
+        <w:rPr>
+          <w:color w:val="1D2D3E"/>
+          <w:sz w:val="22"/>
+          <w:szCs w:val="22"/>
+        </w:rPr>
+        <w:t xml:space="preserve">  PDF button in CompaniesScreen header with ActivityIndicator; exports currently-filtered list</w:t>
+      </w:r>
+    </w:p>
+    <w:p>
+      <w:pPr>
+        <w:pStyle w:val="ListParagraph"/>
+        <w:numPr>
+          <w:ilvl w:val="0"/>
+          <w:numId w:val="1"/>
+        </w:numPr>
+        <w:spacing w:after="40"/>
+      </w:pPr>
+      <w:r>
+        <w:rPr>
+          <w:color w:val="1D2D3E"/>
+          <w:sz w:val="22"/>
+          <w:szCs w:val="22"/>
+        </w:rPr>
+        <w:t xml:space="preserve">Dashboard month-over-month trend indicators (dashboard.ts, KPICard.tsx, DashboardScreen.tsx)</w:t>
+      </w:r>
+    </w:p>
+    <w:p>
+      <w:pPr>
+        <w:pStyle w:val="ListParagraph"/>
+        <w:numPr>
+          <w:ilvl w:val="1"/>
+          <w:numId w:val="1"/>
+        </w:numPr>
+        <w:spacing w:after="40"/>
+      </w:pPr>
+      <w:r>
+        <w:rPr>
+          <w:color w:val="1D2D3E"/>
+          <w:sz w:val="22"/>
+          <w:szCs w:val="22"/>
+        </w:rPr>
+        <w:t xml:space="preserve">  fetchDashboardData now fetches prev month's journal entries in parallel → revenuePrevMonth + expensesPrevMonth</w:t>
+      </w:r>
+    </w:p>
+    <w:p>
+      <w:pPr>
+        <w:pStyle w:val="ListParagraph"/>
+        <w:numPr>
+          <w:ilvl w:val="1"/>
+          <w:numId w:val="1"/>
+        </w:numPr>
+        <w:spacing w:after="40"/>
+      </w:pPr>
+      <w:r>
+        <w:rPr>
+          <w:color w:val="1D2D3E"/>
+          <w:sz w:val="22"/>
+          <w:szCs w:val="22"/>
+        </w:rPr>
+        <w:t xml:space="preserve">  KPICard: new trendPct (number|null) + trendInverted (bool) props; shows trending-up/down icon + '±X.X% vs last mo'</w:t>
+      </w:r>
+    </w:p>
+    <w:p>
+      <w:pPr>
+        <w:pStyle w:val="ListParagraph"/>
+        <w:numPr>
+          <w:ilvl w:val="1"/>
+          <w:numId w:val="1"/>
+        </w:numPr>
+        <w:spacing w:after="40"/>
+      </w:pPr>
+      <w:r>
+        <w:rPr>
+          <w:color w:val="1D2D3E"/>
+          <w:sz w:val="22"/>
+          <w:szCs w:val="22"/>
+        </w:rPr>
+        <w:t xml:space="preserve">  Revenue card: green when positive; Expenses card: trendInverted=true so positive = red</w:t>
+      </w:r>
+    </w:p>
+    <w:p>
+      <w:pPr>
+        <w:pStyle w:val="ListParagraph"/>
+        <w:numPr>
+          <w:ilvl w:val="1"/>
+          <w:numId w:val="1"/>
+        </w:numPr>
+        <w:spacing w:after="40"/>
+      </w:pPr>
+      <w:r>
+        <w:rPr>
+          <w:color w:val="1D2D3E"/>
+          <w:sz w:val="22"/>
+          <w:szCs w:val="22"/>
+        </w:rPr>
+        <w:t xml:space="preserve">  Trend row hidden when prev-month data unavailable (API error / first month of operation)</w:t>
       </w:r>
     </w:p>
     <w:p>

</xml_diff>

<commit_message>
docs(session-25): update PROGRESS.md, generate-docs.js, and FEATURES.docx for Session 25 changelog
</commit_message>
<xml_diff>
--- a/FEATURES.docx
+++ b/FEATURES.docx
@@ -45,7 +45,7 @@
           <w:sz w:val="20"/>
           <w:szCs w:val="20"/>
         </w:rPr>
-        <w:t xml:space="preserve">Generated: 2026-05-27</w:t>
+        <w:t xml:space="preserve">Generated: 2026-05-28</w:t>
       </w:r>
     </w:p>
     <w:p>
@@ -21839,6 +21839,393 @@
           <w:szCs w:val="22"/>
         </w:rPr>
         <w:t xml:space="preserve">  Tapping a history row repopulates the query field</w:t>
+      </w:r>
+    </w:p>
+    <w:p>
+      <w:pPr>
+        <w:spacing w:after="80"/>
+      </w:pPr>
+      <w:r>
+        <w:rPr>
+          <w:color w:val="1D2D3E"/>
+          <w:sz w:val="22"/>
+          <w:szCs w:val="22"/>
+        </w:rPr>
+        <w:t xml:space="preserve"/>
+      </w:r>
+    </w:p>
+    <w:p>
+      <w:pPr>
+        <w:pStyle w:val="Heading2"/>
+        <w:spacing w:after="120" w:before="300"/>
+      </w:pPr>
+      <w:r>
+        <w:rPr>
+          <w:b/>
+          <w:bCs/>
+          <w:color w:val="1D2D3E"/>
+        </w:rPr>
+        <w:t xml:space="preserve">Session 25 — 2026-05-28</w:t>
+      </w:r>
+    </w:p>
+    <w:p>
+      <w:pPr>
+        <w:pStyle w:val="ListParagraph"/>
+        <w:numPr>
+          <w:ilvl w:val="0"/>
+          <w:numId w:val="1"/>
+        </w:numPr>
+        <w:spacing w:after="40"/>
+      </w:pPr>
+      <w:r>
+        <w:rPr>
+          <w:color w:val="1D2D3E"/>
+          <w:sz w:val="22"/>
+          <w:szCs w:val="22"/>
+        </w:rPr>
+        <w:t xml:space="preserve">Dashboard: Net Income MoM trend indicator (uses existing revenuePrevMonth/expensesPrevMonth)</w:t>
+      </w:r>
+    </w:p>
+    <w:p>
+      <w:pPr>
+        <w:pStyle w:val="ListParagraph"/>
+        <w:numPr>
+          <w:ilvl w:val="0"/>
+          <w:numId w:val="1"/>
+        </w:numPr>
+        <w:spacing w:after="40"/>
+      </w:pPr>
+      <w:r>
+        <w:rPr>
+          <w:color w:val="1D2D3E"/>
+          <w:sz w:val="22"/>
+          <w:szCs w:val="22"/>
+        </w:rPr>
+        <w:t xml:space="preserve">Dashboard: Vouchers MTD trend vs. last month (vouchersPrevMonth added to KPIs type + API)</w:t>
+      </w:r>
+    </w:p>
+    <w:p>
+      <w:pPr>
+        <w:pStyle w:val="ListParagraph"/>
+        <w:numPr>
+          <w:ilvl w:val="0"/>
+          <w:numId w:val="1"/>
+        </w:numPr>
+        <w:spacing w:after="40"/>
+      </w:pPr>
+      <w:r>
+        <w:rPr>
+          <w:color w:val="1D2D3E"/>
+          <w:sz w:val="22"/>
+          <w:szCs w:val="22"/>
+        </w:rPr>
+        <w:t xml:space="preserve">Dashboard: 7-day daily voucher sparkline chart (VoucherSparkline.tsx component)</w:t>
+      </w:r>
+    </w:p>
+    <w:p>
+      <w:pPr>
+        <w:pStyle w:val="ListParagraph"/>
+        <w:numPr>
+          <w:ilvl w:val="1"/>
+          <w:numId w:val="1"/>
+        </w:numPr>
+        <w:spacing w:after="40"/>
+      </w:pPr>
+      <w:r>
+        <w:rPr>
+          <w:color w:val="1D2D3E"/>
+          <w:sz w:val="22"/>
+          <w:szCs w:val="22"/>
+        </w:rPr>
+        <w:t xml:space="preserve">  7 bars, oldest → newest, today highlighted in dark color; shows count label on non-zero bars</w:t>
+      </w:r>
+    </w:p>
+    <w:p>
+      <w:pPr>
+        <w:pStyle w:val="ListParagraph"/>
+        <w:numPr>
+          <w:ilvl w:val="0"/>
+          <w:numId w:val="1"/>
+        </w:numPr>
+        <w:spacing w:after="40"/>
+      </w:pPr>
+      <w:r>
+        <w:rPr>
+          <w:color w:val="1D2D3E"/>
+          <w:sz w:val="22"/>
+          <w:szCs w:val="22"/>
+        </w:rPr>
+        <w:t xml:space="preserve">Dashboard: Supply Chain Snapshot section (fetchSupplyChainSnapshot in dashboard.ts)</w:t>
+      </w:r>
+    </w:p>
+    <w:p>
+      <w:pPr>
+        <w:pStyle w:val="ListParagraph"/>
+        <w:numPr>
+          <w:ilvl w:val="1"/>
+          <w:numId w:val="1"/>
+        </w:numPr>
+        <w:spacing w:after="40"/>
+      </w:pPr>
+      <w:r>
+        <w:rPr>
+          <w:color w:val="1D2D3E"/>
+          <w:sz w:val="22"/>
+          <w:szCs w:val="22"/>
+        </w:rPr>
+        <w:t xml:space="preserve">  Lazy-loaded after main dashboard data; shows Open POs / Open SOs / Active Materials count tiles</w:t>
+      </w:r>
+    </w:p>
+    <w:p>
+      <w:pPr>
+        <w:pStyle w:val="ListParagraph"/>
+        <w:numPr>
+          <w:ilvl w:val="1"/>
+          <w:numId w:val="1"/>
+        </w:numPr>
+        <w:spacing w:after="40"/>
+      </w:pPr>
+      <w:r>
+        <w:rPr>
+          <w:color w:val="1D2D3E"/>
+          <w:sz w:val="22"/>
+          <w:szCs w:val="22"/>
+        </w:rPr>
+        <w:t xml:space="preserve">  Each tile taps through to the corresponding screen</w:t>
+      </w:r>
+    </w:p>
+    <w:p>
+      <w:pPr>
+        <w:pStyle w:val="ListParagraph"/>
+        <w:numPr>
+          <w:ilvl w:val="0"/>
+          <w:numId w:val="1"/>
+        </w:numPr>
+        <w:spacing w:after="40"/>
+      </w:pPr>
+      <w:r>
+        <w:rPr>
+          <w:color w:val="1D2D3E"/>
+          <w:sz w:val="22"/>
+          <w:szCs w:val="22"/>
+        </w:rPr>
+        <w:t xml:space="preserve">Dashboard: Recently Viewed section (utils/recentlyViewed.ts + RecentlyViewedSection.tsx)</w:t>
+      </w:r>
+    </w:p>
+    <w:p>
+      <w:pPr>
+        <w:pStyle w:val="ListParagraph"/>
+        <w:numPr>
+          <w:ilvl w:val="1"/>
+          <w:numId w:val="1"/>
+        </w:numPr>
+        <w:spacing w:after="40"/>
+      </w:pPr>
+      <w:r>
+        <w:rPr>
+          <w:color w:val="1D2D3E"/>
+          <w:sz w:val="22"/>
+          <w:szCs w:val="22"/>
+        </w:rPr>
+        <w:t xml:space="preserve">  AsyncStorage-backed history (max 8 items); deduplicates by type+entityId</w:t>
+      </w:r>
+    </w:p>
+    <w:p>
+      <w:pPr>
+        <w:pStyle w:val="ListParagraph"/>
+        <w:numPr>
+          <w:ilvl w:val="1"/>
+          <w:numId w:val="1"/>
+        </w:numPr>
+        <w:spacing w:after="40"/>
+      </w:pPr>
+      <w:r>
+        <w:rPr>
+          <w:color w:val="1D2D3E"/>
+          <w:sz w:val="22"/>
+          <w:szCs w:val="22"/>
+        </w:rPr>
+        <w:t xml:space="preserve">  Tracks PO detail, SO detail, Partner detail, Material detail views</w:t>
+      </w:r>
+    </w:p>
+    <w:p>
+      <w:pPr>
+        <w:pStyle w:val="ListParagraph"/>
+        <w:numPr>
+          <w:ilvl w:val="1"/>
+          <w:numId w:val="1"/>
+        </w:numPr>
+        <w:spacing w:after="40"/>
+      </w:pPr>
+      <w:r>
+        <w:rPr>
+          <w:color w:val="1D2D3E"/>
+          <w:sz w:val="22"/>
+          <w:szCs w:val="22"/>
+        </w:rPr>
+        <w:t xml:space="preserve">  Dashboard shows last 5 items with icon, title, subtitle; tapping navigates back to that record</w:t>
+      </w:r>
+    </w:p>
+    <w:p>
+      <w:pPr>
+        <w:pStyle w:val="ListParagraph"/>
+        <w:numPr>
+          <w:ilvl w:val="1"/>
+          <w:numId w:val="1"/>
+        </w:numPr>
+        <w:spacing w:after="40"/>
+      </w:pPr>
+      <w:r>
+        <w:rPr>
+          <w:color w:val="1D2D3E"/>
+          <w:sz w:val="22"/>
+          <w:szCs w:val="22"/>
+        </w:rPr>
+        <w:t xml:space="preserve">  Updated on focus so new views appear on next dashboard visit</w:t>
+      </w:r>
+    </w:p>
+    <w:p>
+      <w:pPr>
+        <w:pStyle w:val="ListParagraph"/>
+        <w:numPr>
+          <w:ilvl w:val="0"/>
+          <w:numId w:val="1"/>
+        </w:numPr>
+        <w:spacing w:after="40"/>
+      </w:pPr>
+      <w:r>
+        <w:rPr>
+          <w:color w:val="1D2D3E"/>
+          <w:sz w:val="22"/>
+          <w:szCs w:val="22"/>
+        </w:rPr>
+        <w:t xml:space="preserve">Settings: Date format preview (formatDate('2025-01-15') shown below format chips live)</w:t>
+      </w:r>
+    </w:p>
+    <w:p>
+      <w:pPr>
+        <w:pStyle w:val="ListParagraph"/>
+        <w:numPr>
+          <w:ilvl w:val="0"/>
+          <w:numId w:val="1"/>
+        </w:numPr>
+        <w:spacing w:after="40"/>
+      </w:pPr>
+      <w:r>
+        <w:rPr>
+          <w:color w:val="1D2D3E"/>
+          <w:sz w:val="22"/>
+          <w:szCs w:val="22"/>
+        </w:rPr>
+        <w:t xml:space="preserve">PODetailScreen (GRN flow): pull-to-refresh added (RefreshControl)</w:t>
+      </w:r>
+    </w:p>
+    <w:p>
+      <w:pPr>
+        <w:pStyle w:val="ListParagraph"/>
+        <w:numPr>
+          <w:ilvl w:val="0"/>
+          <w:numId w:val="1"/>
+        </w:numPr>
+        <w:spacing w:after="40"/>
+      </w:pPr>
+      <w:r>
+        <w:rPr>
+          <w:color w:val="1D2D3E"/>
+          <w:sz w:val="22"/>
+          <w:szCs w:val="22"/>
+        </w:rPr>
+        <w:t xml:space="preserve">BookmarksScreen: pull-to-refresh for both FlatList and empty-state ScrollView</w:t>
+      </w:r>
+    </w:p>
+    <w:p>
+      <w:pPr>
+        <w:pStyle w:val="ListParagraph"/>
+        <w:numPr>
+          <w:ilvl w:val="0"/>
+          <w:numId w:val="1"/>
+        </w:numPr>
+        <w:spacing w:after="40"/>
+      </w:pPr>
+      <w:r>
+        <w:rPr>
+          <w:color w:val="1D2D3E"/>
+          <w:sz w:val="22"/>
+          <w:szCs w:val="22"/>
+        </w:rPr>
+        <w:t xml:space="preserve">Inventory: Stock Ledger PDF export (exportStockLedgerPDF in pdfExport.ts)</w:t>
+      </w:r>
+    </w:p>
+    <w:p>
+      <w:pPr>
+        <w:pStyle w:val="ListParagraph"/>
+        <w:numPr>
+          <w:ilvl w:val="1"/>
+          <w:numId w:val="1"/>
+        </w:numPr>
+        <w:spacing w:after="40"/>
+      </w:pPr>
+      <w:r>
+        <w:rPr>
+          <w:color w:val="1D2D3E"/>
+          <w:sz w:val="22"/>
+          <w:szCs w:val="22"/>
+        </w:rPr>
+        <w:t xml:space="preserve">  Summary tiles: entries / total in / total out; full table with date, item, warehouse, voucher, qty in/out, balance</w:t>
+      </w:r>
+    </w:p>
+    <w:p>
+      <w:pPr>
+        <w:pStyle w:val="ListParagraph"/>
+        <w:numPr>
+          <w:ilvl w:val="0"/>
+          <w:numId w:val="1"/>
+        </w:numPr>
+        <w:spacing w:after="40"/>
+      </w:pPr>
+      <w:r>
+        <w:rPr>
+          <w:color w:val="1D2D3E"/>
+          <w:sz w:val="22"/>
+          <w:szCs w:val="22"/>
+        </w:rPr>
+        <w:t xml:space="preserve">Inventory: Stock Balance sort button (cycles name A-Z → qty desc → qty asc)</w:t>
+      </w:r>
+    </w:p>
+    <w:p>
+      <w:pPr>
+        <w:pStyle w:val="ListParagraph"/>
+        <w:numPr>
+          <w:ilvl w:val="1"/>
+          <w:numId w:val="1"/>
+        </w:numPr>
+        <w:spacing w:after="40"/>
+      </w:pPr>
+      <w:r>
+        <w:rPr>
+          <w:color w:val="1D2D3E"/>
+          <w:sz w:val="22"/>
+          <w:szCs w:val="22"/>
+        </w:rPr>
+        <w:t xml:space="preserve">  Sort mode shown inline in filter bar with icon and label</w:t>
+      </w:r>
+    </w:p>
+    <w:p>
+      <w:pPr>
+        <w:pStyle w:val="ListParagraph"/>
+        <w:numPr>
+          <w:ilvl w:val="0"/>
+          <w:numId w:val="1"/>
+        </w:numPr>
+        <w:spacing w:after="40"/>
+      </w:pPr>
+      <w:r>
+        <w:rPr>
+          <w:color w:val="1D2D3E"/>
+          <w:sz w:val="22"/>
+          <w:szCs w:val="22"/>
+        </w:rPr>
+        <w:t xml:space="preserve">Materials: sort button in header (cycles name A-Z → code → type grouping)</w:t>
       </w:r>
     </w:p>
     <w:p>

</xml_diff>

<commit_message>
docs(session-26): update PROGRESS.md, generate-docs.js, and FEATURES.docx for Session 26 changelog
</commit_message>
<xml_diff>
--- a/FEATURES.docx
+++ b/FEATURES.docx
@@ -17171,6 +17171,544 @@
           </w:p>
         </w:tc>
       </w:tr>
+      <w:tr>
+        <w:tc>
+          <w:tcPr>
+            <w:shd w:color="F0F4F8" w:val="solid"/>
+          </w:tcPr>
+          <w:p>
+            <w:pPr>
+              <w:spacing w:after="40" w:before="40"/>
+            </w:pPr>
+            <w:r>
+              <w:rPr>
+                <w:b w:val="false"/>
+                <w:bCs w:val="false"/>
+                <w:color w:val="1D2D3E"/>
+                <w:sz w:val="20"/>
+                <w:szCs w:val="20"/>
+              </w:rPr>
+              <w:t xml:space="preserve">Session 25</w:t>
+            </w:r>
+          </w:p>
+        </w:tc>
+        <w:tc>
+          <w:tcPr>
+            <w:shd w:color="F0F4F8" w:val="solid"/>
+          </w:tcPr>
+          <w:p>
+            <w:pPr>
+              <w:spacing w:after="40" w:before="40"/>
+            </w:pPr>
+            <w:r>
+              <w:rPr>
+                <w:b w:val="false"/>
+                <w:bCs w:val="false"/>
+                <w:color w:val="1D2D3E"/>
+                <w:sz w:val="20"/>
+                <w:szCs w:val="20"/>
+              </w:rPr>
+              <w:t xml:space="preserve">Dashboard net income + vouchers MoM trends; 7-day daily sparkline (VoucherSparkline.tsx)</w:t>
+            </w:r>
+          </w:p>
+        </w:tc>
+        <w:tc>
+          <w:tcPr>
+            <w:shd w:color="F0F4F8" w:val="solid"/>
+          </w:tcPr>
+          <w:p>
+            <w:pPr>
+              <w:spacing w:after="40" w:before="40"/>
+            </w:pPr>
+            <w:r>
+              <w:rPr>
+                <w:b w:val="false"/>
+                <w:bCs w:val="false"/>
+                <w:color w:val="1D2D3E"/>
+                <w:sz w:val="20"/>
+                <w:szCs w:val="20"/>
+              </w:rPr>
+              <w:t xml:space="preserve">Done</w:t>
+            </w:r>
+          </w:p>
+        </w:tc>
+        <w:tc>
+          <w:tcPr>
+            <w:shd w:color="F0F4F8" w:val="solid"/>
+          </w:tcPr>
+          <w:p>
+            <w:pPr>
+              <w:spacing w:after="40" w:before="40"/>
+            </w:pPr>
+            <w:r>
+              <w:rPr>
+                <w:b w:val="false"/>
+                <w:bCs w:val="false"/>
+                <w:color w:val="1D2D3E"/>
+                <w:sz w:val="20"/>
+                <w:szCs w:val="20"/>
+              </w:rPr>
+              <w:t xml:space="preserve">dashboard.ts + VoucherSparkline.tsx + DashboardScreen.tsx</w:t>
+            </w:r>
+          </w:p>
+        </w:tc>
+      </w:tr>
+      <w:tr>
+        <w:tc>
+          <w:p>
+            <w:pPr>
+              <w:spacing w:after="40" w:before="40"/>
+            </w:pPr>
+            <w:r>
+              <w:rPr>
+                <w:b w:val="false"/>
+                <w:bCs w:val="false"/>
+                <w:color w:val="1D2D3E"/>
+                <w:sz w:val="20"/>
+                <w:szCs w:val="20"/>
+              </w:rPr>
+              <w:t xml:space="preserve">Session 25</w:t>
+            </w:r>
+          </w:p>
+        </w:tc>
+        <w:tc>
+          <w:p>
+            <w:pPr>
+              <w:spacing w:after="40" w:before="40"/>
+            </w:pPr>
+            <w:r>
+              <w:rPr>
+                <w:b w:val="false"/>
+                <w:bCs w:val="false"/>
+                <w:color w:val="1D2D3E"/>
+                <w:sz w:val="20"/>
+                <w:szCs w:val="20"/>
+              </w:rPr>
+              <w:t xml:space="preserve">Supply Chain Snapshot on Dashboard (Open POs / Open SOs / Active Materials, lazy-loaded)</w:t>
+            </w:r>
+          </w:p>
+        </w:tc>
+        <w:tc>
+          <w:p>
+            <w:pPr>
+              <w:spacing w:after="40" w:before="40"/>
+            </w:pPr>
+            <w:r>
+              <w:rPr>
+                <w:b w:val="false"/>
+                <w:bCs w:val="false"/>
+                <w:color w:val="1D2D3E"/>
+                <w:sz w:val="20"/>
+                <w:szCs w:val="20"/>
+              </w:rPr>
+              <w:t xml:space="preserve">Done</w:t>
+            </w:r>
+          </w:p>
+        </w:tc>
+        <w:tc>
+          <w:p>
+            <w:pPr>
+              <w:spacing w:after="40" w:before="40"/>
+            </w:pPr>
+            <w:r>
+              <w:rPr>
+                <w:b w:val="false"/>
+                <w:bCs w:val="false"/>
+                <w:color w:val="1D2D3E"/>
+                <w:sz w:val="20"/>
+                <w:szCs w:val="20"/>
+              </w:rPr>
+              <w:t xml:space="preserve">dashboard.ts fetchSupplyChainSnapshot + DashboardScreen.tsx</w:t>
+            </w:r>
+          </w:p>
+        </w:tc>
+      </w:tr>
+      <w:tr>
+        <w:tc>
+          <w:tcPr>
+            <w:shd w:color="F0F4F8" w:val="solid"/>
+          </w:tcPr>
+          <w:p>
+            <w:pPr>
+              <w:spacing w:after="40" w:before="40"/>
+            </w:pPr>
+            <w:r>
+              <w:rPr>
+                <w:b w:val="false"/>
+                <w:bCs w:val="false"/>
+                <w:color w:val="1D2D3E"/>
+                <w:sz w:val="20"/>
+                <w:szCs w:val="20"/>
+              </w:rPr>
+              <w:t xml:space="preserve">Session 25</w:t>
+            </w:r>
+          </w:p>
+        </w:tc>
+        <w:tc>
+          <w:tcPr>
+            <w:shd w:color="F0F4F8" w:val="solid"/>
+          </w:tcPr>
+          <w:p>
+            <w:pPr>
+              <w:spacing w:after="40" w:before="40"/>
+            </w:pPr>
+            <w:r>
+              <w:rPr>
+                <w:b w:val="false"/>
+                <w:bCs w:val="false"/>
+                <w:color w:val="1D2D3E"/>
+                <w:sz w:val="20"/>
+                <w:szCs w:val="20"/>
+              </w:rPr>
+              <w:t xml:space="preserve">Recently Viewed section on Dashboard (AsyncStorage, max 8, deduplication by type+id)</w:t>
+            </w:r>
+          </w:p>
+        </w:tc>
+        <w:tc>
+          <w:tcPr>
+            <w:shd w:color="F0F4F8" w:val="solid"/>
+          </w:tcPr>
+          <w:p>
+            <w:pPr>
+              <w:spacing w:after="40" w:before="40"/>
+            </w:pPr>
+            <w:r>
+              <w:rPr>
+                <w:b w:val="false"/>
+                <w:bCs w:val="false"/>
+                <w:color w:val="1D2D3E"/>
+                <w:sz w:val="20"/>
+                <w:szCs w:val="20"/>
+              </w:rPr>
+              <w:t xml:space="preserve">Done</w:t>
+            </w:r>
+          </w:p>
+        </w:tc>
+        <w:tc>
+          <w:tcPr>
+            <w:shd w:color="F0F4F8" w:val="solid"/>
+          </w:tcPr>
+          <w:p>
+            <w:pPr>
+              <w:spacing w:after="40" w:before="40"/>
+            </w:pPr>
+            <w:r>
+              <w:rPr>
+                <w:b w:val="false"/>
+                <w:bCs w:val="false"/>
+                <w:color w:val="1D2D3E"/>
+                <w:sz w:val="20"/>
+                <w:szCs w:val="20"/>
+              </w:rPr>
+              <w:t xml:space="preserve">utils/recentlyViewed.ts + RecentlyViewedSection.tsx + DashboardScreen.tsx</w:t>
+            </w:r>
+          </w:p>
+        </w:tc>
+      </w:tr>
+      <w:tr>
+        <w:tc>
+          <w:p>
+            <w:pPr>
+              <w:spacing w:after="40" w:before="40"/>
+            </w:pPr>
+            <w:r>
+              <w:rPr>
+                <w:b w:val="false"/>
+                <w:bCs w:val="false"/>
+                <w:color w:val="1D2D3E"/>
+                <w:sz w:val="20"/>
+                <w:szCs w:val="20"/>
+              </w:rPr>
+              <w:t xml:space="preserve">Session 25</w:t>
+            </w:r>
+          </w:p>
+        </w:tc>
+        <w:tc>
+          <w:p>
+            <w:pPr>
+              <w:spacing w:after="40" w:before="40"/>
+            </w:pPr>
+            <w:r>
+              <w:rPr>
+                <w:b w:val="false"/>
+                <w:bCs w:val="false"/>
+                <w:color w:val="1D2D3E"/>
+                <w:sz w:val="20"/>
+                <w:szCs w:val="20"/>
+              </w:rPr>
+              <w:t xml:space="preserve">Stock Ledger PDF export + Stock Balance sort button</w:t>
+            </w:r>
+          </w:p>
+        </w:tc>
+        <w:tc>
+          <w:p>
+            <w:pPr>
+              <w:spacing w:after="40" w:before="40"/>
+            </w:pPr>
+            <w:r>
+              <w:rPr>
+                <w:b w:val="false"/>
+                <w:bCs w:val="false"/>
+                <w:color w:val="1D2D3E"/>
+                <w:sz w:val="20"/>
+                <w:szCs w:val="20"/>
+              </w:rPr>
+              <w:t xml:space="preserve">Done</w:t>
+            </w:r>
+          </w:p>
+        </w:tc>
+        <w:tc>
+          <w:p>
+            <w:pPr>
+              <w:spacing w:after="40" w:before="40"/>
+            </w:pPr>
+            <w:r>
+              <w:rPr>
+                <w:b w:val="false"/>
+                <w:bCs w:val="false"/>
+                <w:color w:val="1D2D3E"/>
+                <w:sz w:val="20"/>
+                <w:szCs w:val="20"/>
+              </w:rPr>
+              <w:t xml:space="preserve">pdfExport.ts exportStockLedgerPDF + InventoryScreen.tsx</w:t>
+            </w:r>
+          </w:p>
+        </w:tc>
+      </w:tr>
+      <w:tr>
+        <w:tc>
+          <w:tcPr>
+            <w:shd w:color="F0F4F8" w:val="solid"/>
+          </w:tcPr>
+          <w:p>
+            <w:pPr>
+              <w:spacing w:after="40" w:before="40"/>
+            </w:pPr>
+            <w:r>
+              <w:rPr>
+                <w:b w:val="false"/>
+                <w:bCs w:val="false"/>
+                <w:color w:val="1D2D3E"/>
+                <w:sz w:val="20"/>
+                <w:szCs w:val="20"/>
+              </w:rPr>
+              <w:t xml:space="preserve">Session 26</w:t>
+            </w:r>
+          </w:p>
+        </w:tc>
+        <w:tc>
+          <w:tcPr>
+            <w:shd w:color="F0F4F8" w:val="solid"/>
+          </w:tcPr>
+          <w:p>
+            <w:pPr>
+              <w:spacing w:after="40" w:before="40"/>
+            </w:pPr>
+            <w:r>
+              <w:rPr>
+                <w:b w:val="false"/>
+                <w:bCs w:val="false"/>
+                <w:color w:val="1D2D3E"/>
+                <w:sz w:val="20"/>
+                <w:szCs w:val="20"/>
+              </w:rPr>
+              <w:t xml:space="preserve">Account Statement screen — JE lines for any account with running balance; TB drill-down</w:t>
+            </w:r>
+          </w:p>
+        </w:tc>
+        <w:tc>
+          <w:tcPr>
+            <w:shd w:color="F0F4F8" w:val="solid"/>
+          </w:tcPr>
+          <w:p>
+            <w:pPr>
+              <w:spacing w:after="40" w:before="40"/>
+            </w:pPr>
+            <w:r>
+              <w:rPr>
+                <w:b w:val="false"/>
+                <w:bCs w:val="false"/>
+                <w:color w:val="1D2D3E"/>
+                <w:sz w:val="20"/>
+                <w:szCs w:val="20"/>
+              </w:rPr>
+              <w:t xml:space="preserve">Done</w:t>
+            </w:r>
+          </w:p>
+        </w:tc>
+        <w:tc>
+          <w:tcPr>
+            <w:shd w:color="F0F4F8" w:val="solid"/>
+          </w:tcPr>
+          <w:p>
+            <w:pPr>
+              <w:spacing w:after="40" w:before="40"/>
+            </w:pPr>
+            <w:r>
+              <w:rPr>
+                <w:b w:val="false"/>
+                <w:bCs w:val="false"/>
+                <w:color w:val="1D2D3E"/>
+                <w:sz w:val="20"/>
+                <w:szCs w:val="20"/>
+              </w:rPr>
+              <w:t xml:space="preserve">src/screens/finance/AccountStatementScreen.tsx</w:t>
+            </w:r>
+          </w:p>
+        </w:tc>
+      </w:tr>
+      <w:tr>
+        <w:tc>
+          <w:p>
+            <w:pPr>
+              <w:spacing w:after="40" w:before="40"/>
+            </w:pPr>
+            <w:r>
+              <w:rPr>
+                <w:b w:val="false"/>
+                <w:bCs w:val="false"/>
+                <w:color w:val="1D2D3E"/>
+                <w:sz w:val="20"/>
+                <w:szCs w:val="20"/>
+              </w:rPr>
+              <w:t xml:space="preserve">Session 26</w:t>
+            </w:r>
+          </w:p>
+        </w:tc>
+        <w:tc>
+          <w:p>
+            <w:pPr>
+              <w:spacing w:after="40" w:before="40"/>
+            </w:pPr>
+            <w:r>
+              <w:rPr>
+                <w:b w:val="false"/>
+                <w:bCs w:val="false"/>
+                <w:color w:val="1D2D3E"/>
+                <w:sz w:val="20"/>
+                <w:szCs w:val="20"/>
+              </w:rPr>
+              <w:t xml:space="preserve">PDF export — Account Statement (summary tiles + transactions table + running balance)</w:t>
+            </w:r>
+          </w:p>
+        </w:tc>
+        <w:tc>
+          <w:p>
+            <w:pPr>
+              <w:spacing w:after="40" w:before="40"/>
+            </w:pPr>
+            <w:r>
+              <w:rPr>
+                <w:b w:val="false"/>
+                <w:bCs w:val="false"/>
+                <w:color w:val="1D2D3E"/>
+                <w:sz w:val="20"/>
+                <w:szCs w:val="20"/>
+              </w:rPr>
+              <w:t xml:space="preserve">Done</w:t>
+            </w:r>
+          </w:p>
+        </w:tc>
+        <w:tc>
+          <w:p>
+            <w:pPr>
+              <w:spacing w:after="40" w:before="40"/>
+            </w:pPr>
+            <w:r>
+              <w:rPr>
+                <w:b w:val="false"/>
+                <w:bCs w:val="false"/>
+                <w:color w:val="1D2D3E"/>
+                <w:sz w:val="20"/>
+                <w:szCs w:val="20"/>
+              </w:rPr>
+              <w:t xml:space="preserve">pdfExport.ts exportAccountStatementPDF</w:t>
+            </w:r>
+          </w:p>
+        </w:tc>
+      </w:tr>
+      <w:tr>
+        <w:tc>
+          <w:tcPr>
+            <w:shd w:color="F0F4F8" w:val="solid"/>
+          </w:tcPr>
+          <w:p>
+            <w:pPr>
+              <w:spacing w:after="40" w:before="40"/>
+            </w:pPr>
+            <w:r>
+              <w:rPr>
+                <w:b w:val="false"/>
+                <w:bCs w:val="false"/>
+                <w:color w:val="1D2D3E"/>
+                <w:sz w:val="20"/>
+                <w:szCs w:val="20"/>
+              </w:rPr>
+              <w:t xml:space="preserve">Session 26</w:t>
+            </w:r>
+          </w:p>
+        </w:tc>
+        <w:tc>
+          <w:tcPr>
+            <w:shd w:color="F0F4F8" w:val="solid"/>
+          </w:tcPr>
+          <w:p>
+            <w:pPr>
+              <w:spacing w:after="40" w:before="40"/>
+            </w:pPr>
+            <w:r>
+              <w:rPr>
+                <w:b w:val="false"/>
+                <w:bCs w:val="false"/>
+                <w:color w:val="1D2D3E"/>
+                <w:sz w:val="20"/>
+                <w:szCs w:val="20"/>
+              </w:rPr>
+              <w:t xml:space="preserve">Dashboard Summary PDF export — KPI grid + working capital + supply chain + voucher activity</w:t>
+            </w:r>
+          </w:p>
+        </w:tc>
+        <w:tc>
+          <w:tcPr>
+            <w:shd w:color="F0F4F8" w:val="solid"/>
+          </w:tcPr>
+          <w:p>
+            <w:pPr>
+              <w:spacing w:after="40" w:before="40"/>
+            </w:pPr>
+            <w:r>
+              <w:rPr>
+                <w:b w:val="false"/>
+                <w:bCs w:val="false"/>
+                <w:color w:val="1D2D3E"/>
+                <w:sz w:val="20"/>
+                <w:szCs w:val="20"/>
+              </w:rPr>
+              <w:t xml:space="preserve">Done</w:t>
+            </w:r>
+          </w:p>
+        </w:tc>
+        <w:tc>
+          <w:tcPr>
+            <w:shd w:color="F0F4F8" w:val="solid"/>
+          </w:tcPr>
+          <w:p>
+            <w:pPr>
+              <w:spacing w:after="40" w:before="40"/>
+            </w:pPr>
+            <w:r>
+              <w:rPr>
+                <w:b w:val="false"/>
+                <w:bCs w:val="false"/>
+                <w:color w:val="1D2D3E"/>
+                <w:sz w:val="20"/>
+                <w:szCs w:val="20"/>
+              </w:rPr>
+              <w:t xml:space="preserve">pdfExport.ts exportDashboardSummaryPDF + DashboardScreen.tsx</w:t>
+            </w:r>
+          </w:p>
+        </w:tc>
+      </w:tr>
     </w:tbl>
     <w:p>
       <w:pPr>
@@ -21839,6 +22377,267 @@
           <w:szCs w:val="22"/>
         </w:rPr>
         <w:t xml:space="preserve">  Tapping a history row repopulates the query field</w:t>
+      </w:r>
+    </w:p>
+    <w:p>
+      <w:pPr>
+        <w:spacing w:after="80"/>
+      </w:pPr>
+      <w:r>
+        <w:rPr>
+          <w:color w:val="1D2D3E"/>
+          <w:sz w:val="22"/>
+          <w:szCs w:val="22"/>
+        </w:rPr>
+        <w:t xml:space="preserve"/>
+      </w:r>
+    </w:p>
+    <w:p>
+      <w:pPr>
+        <w:pStyle w:val="Heading2"/>
+        <w:spacing w:after="120" w:before="300"/>
+      </w:pPr>
+      <w:r>
+        <w:rPr>
+          <w:b/>
+          <w:bCs/>
+          <w:color w:val="1D2D3E"/>
+        </w:rPr>
+        <w:t xml:space="preserve">Session 26 — 2026-05-28</w:t>
+      </w:r>
+    </w:p>
+    <w:p>
+      <w:pPr>
+        <w:pStyle w:val="ListParagraph"/>
+        <w:numPr>
+          <w:ilvl w:val="0"/>
+          <w:numId w:val="1"/>
+        </w:numPr>
+        <w:spacing w:after="40"/>
+      </w:pPr>
+      <w:r>
+        <w:rPr>
+          <w:color w:val="1D2D3E"/>
+          <w:sz w:val="22"/>
+          <w:szCs w:val="22"/>
+        </w:rPr>
+        <w:t xml:space="preserve">Account Statement screen (src/screens/finance/AccountStatementScreen.tsx)</w:t>
+      </w:r>
+    </w:p>
+    <w:p>
+      <w:pPr>
+        <w:pStyle w:val="ListParagraph"/>
+        <w:numPr>
+          <w:ilvl w:val="1"/>
+          <w:numId w:val="1"/>
+        </w:numPr>
+        <w:spacing w:after="40"/>
+      </w:pPr>
+      <w:r>
+        <w:rPr>
+          <w:color w:val="1D2D3E"/>
+          <w:sz w:val="22"/>
+          <w:szCs w:val="22"/>
+        </w:rPr>
+        <w:t xml:space="preserve">  Shows journal entry lines for a single account with running balance column</w:t>
+      </w:r>
+    </w:p>
+    <w:p>
+      <w:pPr>
+        <w:pStyle w:val="ListParagraph"/>
+        <w:numPr>
+          <w:ilvl w:val="1"/>
+          <w:numId w:val="1"/>
+        </w:numPr>
+        <w:spacing w:after="40"/>
+      </w:pPr>
+      <w:r>
+        <w:rPr>
+          <w:color w:val="1D2D3E"/>
+          <w:sz w:val="22"/>
+          <w:szCs w:val="22"/>
+        </w:rPr>
+        <w:t xml:space="preserve">  Accessible from Trial Balance: tap any non-group account row → Account Statement (replaces JE drill-down)</w:t>
+      </w:r>
+    </w:p>
+    <w:p>
+      <w:pPr>
+        <w:pStyle w:val="ListParagraph"/>
+        <w:numPr>
+          <w:ilvl w:val="1"/>
+          <w:numId w:val="1"/>
+        </w:numPr>
+        <w:spacing w:after="40"/>
+      </w:pPr>
+      <w:r>
+        <w:rPr>
+          <w:color w:val="1D2D3E"/>
+          <w:sz w:val="22"/>
+          <w:szCs w:val="22"/>
+        </w:rPr>
+        <w:t xml:space="preserve">  Date range filter (DateRangeBar, defaults to current month); 24h offline cache per account+range</w:t>
+      </w:r>
+    </w:p>
+    <w:p>
+      <w:pPr>
+        <w:pStyle w:val="ListParagraph"/>
+        <w:numPr>
+          <w:ilvl w:val="1"/>
+          <w:numId w:val="1"/>
+        </w:numPr>
+        <w:spacing w:after="40"/>
+      </w:pPr>
+      <w:r>
+        <w:rPr>
+          <w:color w:val="1D2D3E"/>
+          <w:sz w:val="22"/>
+          <w:szCs w:val="22"/>
+        </w:rPr>
+        <w:t xml:space="preserve">  Running balance: debit-normal (1xx/5xx accounts) or credit-normal (2xx/3xx/4xx) inferred from code prefix</w:t>
+      </w:r>
+    </w:p>
+    <w:p>
+      <w:pPr>
+        <w:pStyle w:val="ListParagraph"/>
+        <w:numPr>
+          <w:ilvl w:val="1"/>
+          <w:numId w:val="1"/>
+        </w:numPr>
+        <w:spacing w:after="40"/>
+      </w:pPr>
+      <w:r>
+        <w:rPr>
+          <w:color w:val="1D2D3E"/>
+          <w:sz w:val="22"/>
+          <w:szCs w:val="22"/>
+        </w:rPr>
+        <w:t xml:space="preserve">  Summary tiles: Total Debits | Total Credits | Closing Balance</w:t>
+      </w:r>
+    </w:p>
+    <w:p>
+      <w:pPr>
+        <w:pStyle w:val="ListParagraph"/>
+        <w:numPr>
+          <w:ilvl w:val="1"/>
+          <w:numId w:val="1"/>
+        </w:numPr>
+        <w:spacing w:after="40"/>
+      </w:pPr>
+      <w:r>
+        <w:rPr>
+          <w:color w:val="1D2D3E"/>
+          <w:sz w:val="22"/>
+          <w:szCs w:val="22"/>
+        </w:rPr>
+        <w:t xml:space="preserve">  Table: Date | Voucher badge + no + narration | Debit | Credit | Running Balance + totals row</w:t>
+      </w:r>
+    </w:p>
+    <w:p>
+      <w:pPr>
+        <w:pStyle w:val="ListParagraph"/>
+        <w:numPr>
+          <w:ilvl w:val="1"/>
+          <w:numId w:val="1"/>
+        </w:numPr>
+        <w:spacing w:after="40"/>
+      </w:pPr>
+      <w:r>
+        <w:rPr>
+          <w:color w:val="1D2D3E"/>
+          <w:sz w:val="22"/>
+          <w:szCs w:val="22"/>
+        </w:rPr>
+        <w:t xml:space="preserve">  PDF export: exportAccountStatementPDF — summary tiles + full transactions table</w:t>
+      </w:r>
+    </w:p>
+    <w:p>
+      <w:pPr>
+        <w:pStyle w:val="ListParagraph"/>
+        <w:numPr>
+          <w:ilvl w:val="1"/>
+          <w:numId w:val="1"/>
+        </w:numPr>
+        <w:spacing w:after="40"/>
+      </w:pPr>
+      <w:r>
+        <w:rPr>
+          <w:color w:val="1D2D3E"/>
+          <w:sz w:val="22"/>
+          <w:szCs w:val="22"/>
+        </w:rPr>
+        <w:t xml:space="preserve">  FinanceNavigator: AccountStatement route added; linking.ts finance/account-statement deep link</w:t>
+      </w:r>
+    </w:p>
+    <w:p>
+      <w:pPr>
+        <w:pStyle w:val="ListParagraph"/>
+        <w:numPr>
+          <w:ilvl w:val="0"/>
+          <w:numId w:val="1"/>
+        </w:numPr>
+        <w:spacing w:after="40"/>
+      </w:pPr>
+      <w:r>
+        <w:rPr>
+          <w:color w:val="1D2D3E"/>
+          <w:sz w:val="22"/>
+          <w:szCs w:val="22"/>
+        </w:rPr>
+        <w:t xml:space="preserve">Dashboard Summary PDF export (DashboardScreen.tsx, pdfExport.ts)</w:t>
+      </w:r>
+    </w:p>
+    <w:p>
+      <w:pPr>
+        <w:pStyle w:val="ListParagraph"/>
+        <w:numPr>
+          <w:ilvl w:val="1"/>
+          <w:numId w:val="1"/>
+        </w:numPr>
+        <w:spacing w:after="40"/>
+      </w:pPr>
+      <w:r>
+        <w:rPr>
+          <w:color w:val="1D2D3E"/>
+          <w:sz w:val="22"/>
+          <w:szCs w:val="22"/>
+        </w:rPr>
+        <w:t xml:space="preserve">  exportDashboardSummaryPDF: KPI grid with MoM trends, working capital, supply chain snapshot</w:t>
+      </w:r>
+    </w:p>
+    <w:p>
+      <w:pPr>
+        <w:pStyle w:val="ListParagraph"/>
+        <w:numPr>
+          <w:ilvl w:val="1"/>
+          <w:numId w:val="1"/>
+        </w:numPr>
+        <w:spacing w:after="40"/>
+      </w:pPr>
+      <w:r>
+        <w:rPr>
+          <w:color w:val="1D2D3E"/>
+          <w:sz w:val="22"/>
+          <w:szCs w:val="22"/>
+        </w:rPr>
+        <w:t xml:space="preserve">  Voucher activity by type table (up to 8 types); recent vouchers table (last 5)</w:t>
+      </w:r>
+    </w:p>
+    <w:p>
+      <w:pPr>
+        <w:pStyle w:val="ListParagraph"/>
+        <w:numPr>
+          <w:ilvl w:val="1"/>
+          <w:numId w:val="1"/>
+        </w:numPr>
+        <w:spacing w:after="40"/>
+      </w:pPr>
+      <w:r>
+        <w:rPr>
+          <w:color w:val="1D2D3E"/>
+          <w:sz w:val="22"/>
+          <w:szCs w:val="22"/>
+        </w:rPr>
+        <w:t xml:space="preserve">  Dashboard top bar: file-text icon button (between search and bell); ActivityIndicator while exporting</w:t>
       </w:r>
     </w:p>
     <w:p>

</xml_diff>

<commit_message>
docs(session-27): update PROGRESS.md, generate-docs.js, and FEATURES.docx for Session 27 changelog
Session 27:
- Vendor/Customer Ledger tab (Bills|Ledger) with running balance
- Ledger PDF export for both Vendor and Customer detail screens
- Account Picker Modal in JournalEntriesScreen
- Tappable JE lines → Account Statement drill-down
</commit_message>
<xml_diff>
--- a/FEATURES.docx
+++ b/FEATURES.docx
@@ -17709,6 +17709,310 @@
           </w:p>
         </w:tc>
       </w:tr>
+      <w:tr>
+        <w:tc>
+          <w:p>
+            <w:pPr>
+              <w:spacing w:after="40" w:before="40"/>
+            </w:pPr>
+            <w:r>
+              <w:rPr>
+                <w:b w:val="false"/>
+                <w:bCs w:val="false"/>
+                <w:color w:val="1D2D3E"/>
+                <w:sz w:val="20"/>
+                <w:szCs w:val="20"/>
+              </w:rPr>
+              <w:t xml:space="preserve">Session 27</w:t>
+            </w:r>
+          </w:p>
+        </w:tc>
+        <w:tc>
+          <w:p>
+            <w:pPr>
+              <w:spacing w:after="40" w:before="40"/>
+            </w:pPr>
+            <w:r>
+              <w:rPr>
+                <w:b w:val="false"/>
+                <w:bCs w:val="false"/>
+                <w:color w:val="1D2D3E"/>
+                <w:sz w:val="20"/>
+                <w:szCs w:val="20"/>
+              </w:rPr>
+              <w:t xml:space="preserve">Vendor/Customer Ledger tab — running-balance ledger (BILL/PMT, INV/REC entries) in both detail screens</w:t>
+            </w:r>
+          </w:p>
+        </w:tc>
+        <w:tc>
+          <w:p>
+            <w:pPr>
+              <w:spacing w:after="40" w:before="40"/>
+            </w:pPr>
+            <w:r>
+              <w:rPr>
+                <w:b w:val="false"/>
+                <w:bCs w:val="false"/>
+                <w:color w:val="1D2D3E"/>
+                <w:sz w:val="20"/>
+                <w:szCs w:val="20"/>
+              </w:rPr>
+              <w:t xml:space="preserve">Done</w:t>
+            </w:r>
+          </w:p>
+        </w:tc>
+        <w:tc>
+          <w:p>
+            <w:pPr>
+              <w:spacing w:after="40" w:before="40"/>
+            </w:pPr>
+            <w:r>
+              <w:rPr>
+                <w:b w:val="false"/>
+                <w:bCs w:val="false"/>
+                <w:color w:val="1D2D3E"/>
+                <w:sz w:val="20"/>
+                <w:szCs w:val="20"/>
+              </w:rPr>
+              <w:t xml:space="preserve">VendorDetailScreen.tsx + CustomerDetailScreen.tsx</w:t>
+            </w:r>
+          </w:p>
+        </w:tc>
+      </w:tr>
+      <w:tr>
+        <w:tc>
+          <w:tcPr>
+            <w:shd w:color="F0F4F8" w:val="solid"/>
+          </w:tcPr>
+          <w:p>
+            <w:pPr>
+              <w:spacing w:after="40" w:before="40"/>
+            </w:pPr>
+            <w:r>
+              <w:rPr>
+                <w:b w:val="false"/>
+                <w:bCs w:val="false"/>
+                <w:color w:val="1D2D3E"/>
+                <w:sz w:val="20"/>
+                <w:szCs w:val="20"/>
+              </w:rPr>
+              <w:t xml:space="preserve">Session 27</w:t>
+            </w:r>
+          </w:p>
+        </w:tc>
+        <w:tc>
+          <w:tcPr>
+            <w:shd w:color="F0F4F8" w:val="solid"/>
+          </w:tcPr>
+          <w:p>
+            <w:pPr>
+              <w:spacing w:after="40" w:before="40"/>
+            </w:pPr>
+            <w:r>
+              <w:rPr>
+                <w:b w:val="false"/>
+                <w:bCs w:val="false"/>
+                <w:color w:val="1D2D3E"/>
+                <w:sz w:val="20"/>
+                <w:szCs w:val="20"/>
+              </w:rPr>
+              <w:t xml:space="preserve">Ledger PDF export — context-aware export (Bills vs Ledger) from Vendor/Customer detail header</w:t>
+            </w:r>
+          </w:p>
+        </w:tc>
+        <w:tc>
+          <w:tcPr>
+            <w:shd w:color="F0F4F8" w:val="solid"/>
+          </w:tcPr>
+          <w:p>
+            <w:pPr>
+              <w:spacing w:after="40" w:before="40"/>
+            </w:pPr>
+            <w:r>
+              <w:rPr>
+                <w:b w:val="false"/>
+                <w:bCs w:val="false"/>
+                <w:color w:val="1D2D3E"/>
+                <w:sz w:val="20"/>
+                <w:szCs w:val="20"/>
+              </w:rPr>
+              <w:t xml:space="preserve">Done</w:t>
+            </w:r>
+          </w:p>
+        </w:tc>
+        <w:tc>
+          <w:tcPr>
+            <w:shd w:color="F0F4F8" w:val="solid"/>
+          </w:tcPr>
+          <w:p>
+            <w:pPr>
+              <w:spacing w:after="40" w:before="40"/>
+            </w:pPr>
+            <w:r>
+              <w:rPr>
+                <w:b w:val="false"/>
+                <w:bCs w:val="false"/>
+                <w:color w:val="1D2D3E"/>
+                <w:sz w:val="20"/>
+                <w:szCs w:val="20"/>
+              </w:rPr>
+              <w:t xml:space="preserve">pdfExport.ts exportVendorLedgerPDF + exportCustomerLedgerPDF</w:t>
+            </w:r>
+          </w:p>
+        </w:tc>
+      </w:tr>
+      <w:tr>
+        <w:tc>
+          <w:p>
+            <w:pPr>
+              <w:spacing w:after="40" w:before="40"/>
+            </w:pPr>
+            <w:r>
+              <w:rPr>
+                <w:b w:val="false"/>
+                <w:bCs w:val="false"/>
+                <w:color w:val="1D2D3E"/>
+                <w:sz w:val="20"/>
+                <w:szCs w:val="20"/>
+              </w:rPr>
+              <w:t xml:space="preserve">Session 27</w:t>
+            </w:r>
+          </w:p>
+        </w:tc>
+        <w:tc>
+          <w:p>
+            <w:pPr>
+              <w:spacing w:after="40" w:before="40"/>
+            </w:pPr>
+            <w:r>
+              <w:rPr>
+                <w:b w:val="false"/>
+                <w:bCs w:val="false"/>
+                <w:color w:val="1D2D3E"/>
+                <w:sz w:val="20"/>
+                <w:szCs w:val="20"/>
+              </w:rPr>
+              <w:t xml:space="preserve">Account Picker Modal in JournalEntries — interactive filter replacing static route-param filter</w:t>
+            </w:r>
+          </w:p>
+        </w:tc>
+        <w:tc>
+          <w:p>
+            <w:pPr>
+              <w:spacing w:after="40" w:before="40"/>
+            </w:pPr>
+            <w:r>
+              <w:rPr>
+                <w:b w:val="false"/>
+                <w:bCs w:val="false"/>
+                <w:color w:val="1D2D3E"/>
+                <w:sz w:val="20"/>
+                <w:szCs w:val="20"/>
+              </w:rPr>
+              <w:t xml:space="preserve">Done</w:t>
+            </w:r>
+          </w:p>
+        </w:tc>
+        <w:tc>
+          <w:p>
+            <w:pPr>
+              <w:spacing w:after="40" w:before="40"/>
+            </w:pPr>
+            <w:r>
+              <w:rPr>
+                <w:b w:val="false"/>
+                <w:bCs w:val="false"/>
+                <w:color w:val="1D2D3E"/>
+                <w:sz w:val="20"/>
+                <w:szCs w:val="20"/>
+              </w:rPr>
+              <w:t xml:space="preserve">JournalEntriesScreen.tsx + trialBalance API</w:t>
+            </w:r>
+          </w:p>
+        </w:tc>
+      </w:tr>
+      <w:tr>
+        <w:tc>
+          <w:tcPr>
+            <w:shd w:color="F0F4F8" w:val="solid"/>
+          </w:tcPr>
+          <w:p>
+            <w:pPr>
+              <w:spacing w:after="40" w:before="40"/>
+            </w:pPr>
+            <w:r>
+              <w:rPr>
+                <w:b w:val="false"/>
+                <w:bCs w:val="false"/>
+                <w:color w:val="1D2D3E"/>
+                <w:sz w:val="20"/>
+                <w:szCs w:val="20"/>
+              </w:rPr>
+              <w:t xml:space="preserve">Session 27</w:t>
+            </w:r>
+          </w:p>
+        </w:tc>
+        <w:tc>
+          <w:tcPr>
+            <w:shd w:color="F0F4F8" w:val="solid"/>
+          </w:tcPr>
+          <w:p>
+            <w:pPr>
+              <w:spacing w:after="40" w:before="40"/>
+            </w:pPr>
+            <w:r>
+              <w:rPr>
+                <w:b w:val="false"/>
+                <w:bCs w:val="false"/>
+                <w:color w:val="1D2D3E"/>
+                <w:sz w:val="20"/>
+                <w:szCs w:val="20"/>
+              </w:rPr>
+              <w:t xml:space="preserve">Tappable JE lines in JournalEntryDetail — tap account to drill into Account Statement</w:t>
+            </w:r>
+          </w:p>
+        </w:tc>
+        <w:tc>
+          <w:tcPr>
+            <w:shd w:color="F0F4F8" w:val="solid"/>
+          </w:tcPr>
+          <w:p>
+            <w:pPr>
+              <w:spacing w:after="40" w:before="40"/>
+            </w:pPr>
+            <w:r>
+              <w:rPr>
+                <w:b w:val="false"/>
+                <w:bCs w:val="false"/>
+                <w:color w:val="1D2D3E"/>
+                <w:sz w:val="20"/>
+                <w:szCs w:val="20"/>
+              </w:rPr>
+              <w:t xml:space="preserve">Done</w:t>
+            </w:r>
+          </w:p>
+        </w:tc>
+        <w:tc>
+          <w:tcPr>
+            <w:shd w:color="F0F4F8" w:val="solid"/>
+          </w:tcPr>
+          <w:p>
+            <w:pPr>
+              <w:spacing w:after="40" w:before="40"/>
+            </w:pPr>
+            <w:r>
+              <w:rPr>
+                <w:b w:val="false"/>
+                <w:bCs w:val="false"/>
+                <w:color w:val="1D2D3E"/>
+                <w:sz w:val="20"/>
+                <w:szCs w:val="20"/>
+              </w:rPr>
+              <w:t xml:space="preserve">JournalEntryDetailScreen.tsx</w:t>
+            </w:r>
+          </w:p>
+        </w:tc>
+      </w:tr>
     </w:tbl>
     <w:p>
       <w:pPr>
@@ -22377,6 +22681,375 @@
           <w:szCs w:val="22"/>
         </w:rPr>
         <w:t xml:space="preserve">  Tapping a history row repopulates the query field</w:t>
+      </w:r>
+    </w:p>
+    <w:p>
+      <w:pPr>
+        <w:spacing w:after="80"/>
+      </w:pPr>
+      <w:r>
+        <w:rPr>
+          <w:color w:val="1D2D3E"/>
+          <w:sz w:val="22"/>
+          <w:szCs w:val="22"/>
+        </w:rPr>
+        <w:t xml:space="preserve"/>
+      </w:r>
+    </w:p>
+    <w:p>
+      <w:pPr>
+        <w:pStyle w:val="Heading2"/>
+        <w:spacing w:after="120" w:before="300"/>
+      </w:pPr>
+      <w:r>
+        <w:rPr>
+          <w:b/>
+          <w:bCs/>
+          <w:color w:val="1D2D3E"/>
+        </w:rPr>
+        <w:t xml:space="preserve">Session 27 — 2026-05-28</w:t>
+      </w:r>
+    </w:p>
+    <w:p>
+      <w:pPr>
+        <w:pStyle w:val="ListParagraph"/>
+        <w:numPr>
+          <w:ilvl w:val="0"/>
+          <w:numId w:val="1"/>
+        </w:numPr>
+        <w:spacing w:after="40"/>
+      </w:pPr>
+      <w:r>
+        <w:rPr>
+          <w:color w:val="1D2D3E"/>
+          <w:sz w:val="22"/>
+          <w:szCs w:val="22"/>
+        </w:rPr>
+        <w:t xml:space="preserve">Vendor/Customer Ledger Tab (VendorDetailScreen.tsx, CustomerDetailScreen.tsx)</w:t>
+      </w:r>
+    </w:p>
+    <w:p>
+      <w:pPr>
+        <w:pStyle w:val="ListParagraph"/>
+        <w:numPr>
+          <w:ilvl w:val="1"/>
+          <w:numId w:val="1"/>
+        </w:numPr>
+        <w:spacing w:after="40"/>
+      </w:pPr>
+      <w:r>
+        <w:rPr>
+          <w:color w:val="1D2D3E"/>
+          <w:sz w:val="22"/>
+          <w:szCs w:val="22"/>
+        </w:rPr>
+        <w:t xml:space="preserve">  Both detail screens now have Bills | Ledger tab bar</w:t>
+      </w:r>
+    </w:p>
+    <w:p>
+      <w:pPr>
+        <w:pStyle w:val="ListParagraph"/>
+        <w:numPr>
+          <w:ilvl w:val="1"/>
+          <w:numId w:val="1"/>
+        </w:numPr>
+        <w:spacing w:after="40"/>
+      </w:pPr>
+      <w:r>
+        <w:rPr>
+          <w:color w:val="1D2D3E"/>
+          <w:sz w:val="22"/>
+          <w:szCs w:val="22"/>
+        </w:rPr>
+        <w:t xml:space="preserve">  Ledger tab: running-balance table with BILL/PMT (vendor) or INV/REC (customer) entries</w:t>
+      </w:r>
+    </w:p>
+    <w:p>
+      <w:pPr>
+        <w:pStyle w:val="ListParagraph"/>
+        <w:numPr>
+          <w:ilvl w:val="1"/>
+          <w:numId w:val="1"/>
+        </w:numPr>
+        <w:spacing w:after="40"/>
+      </w:pPr>
+      <w:r>
+        <w:rPr>
+          <w:color w:val="1D2D3E"/>
+          <w:sz w:val="22"/>
+          <w:szCs w:val="22"/>
+        </w:rPr>
+        <w:t xml:space="preserve">  Entries sorted chronologically; running balance computed per entry</w:t>
+      </w:r>
+    </w:p>
+    <w:p>
+      <w:pPr>
+        <w:pStyle w:val="ListParagraph"/>
+        <w:numPr>
+          <w:ilvl w:val="1"/>
+          <w:numId w:val="1"/>
+        </w:numPr>
+        <w:spacing w:after="40"/>
+      </w:pPr>
+      <w:r>
+        <w:rPr>
+          <w:color w:val="1D2D3E"/>
+          <w:sz w:val="22"/>
+          <w:szCs w:val="22"/>
+        </w:rPr>
+        <w:t xml:space="preserve">  Totals row: column sums + closing balance</w:t>
+      </w:r>
+    </w:p>
+    <w:p>
+      <w:pPr>
+        <w:pStyle w:val="ListParagraph"/>
+        <w:numPr>
+          <w:ilvl w:val="1"/>
+          <w:numId w:val="1"/>
+        </w:numPr>
+        <w:spacing w:after="40"/>
+      </w:pPr>
+      <w:r>
+        <w:rPr>
+          <w:color w:val="1D2D3E"/>
+          <w:sz w:val="22"/>
+          <w:szCs w:val="22"/>
+        </w:rPr>
+        <w:t xml:space="preserve">  PDF export button context-aware: Bills PDF on bills tab, Ledger PDF on ledger tab</w:t>
+      </w:r>
+    </w:p>
+    <w:p>
+      <w:pPr>
+        <w:pStyle w:val="ListParagraph"/>
+        <w:numPr>
+          <w:ilvl w:val="0"/>
+          <w:numId w:val="1"/>
+        </w:numPr>
+        <w:spacing w:after="40"/>
+      </w:pPr>
+      <w:r>
+        <w:rPr>
+          <w:color w:val="1D2D3E"/>
+          <w:sz w:val="22"/>
+          <w:szCs w:val="22"/>
+        </w:rPr>
+        <w:t xml:space="preserve">Ledger PDF Export (pdfExport.ts)</w:t>
+      </w:r>
+    </w:p>
+    <w:p>
+      <w:pPr>
+        <w:pStyle w:val="ListParagraph"/>
+        <w:numPr>
+          <w:ilvl w:val="1"/>
+          <w:numId w:val="1"/>
+        </w:numPr>
+        <w:spacing w:after="40"/>
+      </w:pPr>
+      <w:r>
+        <w:rPr>
+          <w:color w:val="1D2D3E"/>
+          <w:sz w:val="22"/>
+          <w:szCs w:val="22"/>
+        </w:rPr>
+        <w:t xml:space="preserve">  exportVendorLedgerPDF(): summary tiles + full running ledger table</w:t>
+      </w:r>
+    </w:p>
+    <w:p>
+      <w:pPr>
+        <w:pStyle w:val="ListParagraph"/>
+        <w:numPr>
+          <w:ilvl w:val="1"/>
+          <w:numId w:val="1"/>
+        </w:numPr>
+        <w:spacing w:after="40"/>
+      </w:pPr>
+      <w:r>
+        <w:rPr>
+          <w:color w:val="1D2D3E"/>
+          <w:sz w:val="22"/>
+          <w:szCs w:val="22"/>
+        </w:rPr>
+        <w:t xml:space="preserve">  exportCustomerLedgerPDF(): summary tiles + full running ledger table</w:t>
+      </w:r>
+    </w:p>
+    <w:p>
+      <w:pPr>
+        <w:pStyle w:val="ListParagraph"/>
+        <w:numPr>
+          <w:ilvl w:val="1"/>
+          <w:numId w:val="1"/>
+        </w:numPr>
+        <w:spacing w:after="40"/>
+      </w:pPr>
+      <w:r>
+        <w:rPr>
+          <w:color w:val="1D2D3E"/>
+          <w:sz w:val="22"/>
+          <w:szCs w:val="22"/>
+        </w:rPr>
+        <w:t xml:space="preserve">  PartnerLedgerEntry interface shared between both functions</w:t>
+      </w:r>
+    </w:p>
+    <w:p>
+      <w:pPr>
+        <w:pStyle w:val="ListParagraph"/>
+        <w:numPr>
+          <w:ilvl w:val="0"/>
+          <w:numId w:val="1"/>
+        </w:numPr>
+        <w:spacing w:after="40"/>
+      </w:pPr>
+      <w:r>
+        <w:rPr>
+          <w:color w:val="1D2D3E"/>
+          <w:sz w:val="22"/>
+          <w:szCs w:val="22"/>
+        </w:rPr>
+        <w:t xml:space="preserve">Account Picker Modal in JournalEntriesScreen (JournalEntriesScreen.tsx)</w:t>
+      </w:r>
+    </w:p>
+    <w:p>
+      <w:pPr>
+        <w:pStyle w:val="ListParagraph"/>
+        <w:numPr>
+          <w:ilvl w:val="1"/>
+          <w:numId w:val="1"/>
+        </w:numPr>
+        <w:spacing w:after="40"/>
+      </w:pPr>
+      <w:r>
+        <w:rPr>
+          <w:color w:val="1D2D3E"/>
+          <w:sz w:val="22"/>
+          <w:szCs w:val="22"/>
+        </w:rPr>
+        <w:t xml:space="preserve">  Interactive filter replaces static route-param-only account filter</w:t>
+      </w:r>
+    </w:p>
+    <w:p>
+      <w:pPr>
+        <w:pStyle w:val="ListParagraph"/>
+        <w:numPr>
+          <w:ilvl w:val="1"/>
+          <w:numId w:val="1"/>
+        </w:numPr>
+        <w:spacing w:after="40"/>
+      </w:pPr>
+      <w:r>
+        <w:rPr>
+          <w:color w:val="1D2D3E"/>
+          <w:sz w:val="22"/>
+          <w:szCs w:val="22"/>
+        </w:rPr>
+        <w:t xml:space="preserve">  AccountPickerModal: fetches non-group accounts from trial balance, real-time search</w:t>
+      </w:r>
+    </w:p>
+    <w:p>
+      <w:pPr>
+        <w:pStyle w:val="ListParagraph"/>
+        <w:numPr>
+          <w:ilvl w:val="1"/>
+          <w:numId w:val="1"/>
+        </w:numPr>
+        <w:spacing w:after="40"/>
+      </w:pPr>
+      <w:r>
+        <w:rPr>
+          <w:color w:val="1D2D3E"/>
+          <w:sz w:val="22"/>
+          <w:szCs w:val="22"/>
+        </w:rPr>
+        <w:t xml:space="preserve">  Active filter shows account name with edit + clear buttons</w:t>
+      </w:r>
+    </w:p>
+    <w:p>
+      <w:pPr>
+        <w:pStyle w:val="ListParagraph"/>
+        <w:numPr>
+          <w:ilvl w:val="1"/>
+          <w:numId w:val="1"/>
+        </w:numPr>
+        <w:spacing w:after="40"/>
+      </w:pPr>
+      <w:r>
+        <w:rPr>
+          <w:color w:val="1D2D3E"/>
+          <w:sz w:val="22"/>
+          <w:szCs w:val="22"/>
+        </w:rPr>
+        <w:t xml:space="preserve">  Backward-compatible: still honours route.params.account on mount</w:t>
+      </w:r>
+    </w:p>
+    <w:p>
+      <w:pPr>
+        <w:pStyle w:val="ListParagraph"/>
+        <w:numPr>
+          <w:ilvl w:val="0"/>
+          <w:numId w:val="1"/>
+        </w:numPr>
+        <w:spacing w:after="40"/>
+      </w:pPr>
+      <w:r>
+        <w:rPr>
+          <w:color w:val="1D2D3E"/>
+          <w:sz w:val="22"/>
+          <w:szCs w:val="22"/>
+        </w:rPr>
+        <w:t xml:space="preserve">Tappable JE Lines in JournalEntryDetailScreen (JournalEntryDetailScreen.tsx)</w:t>
+      </w:r>
+    </w:p>
+    <w:p>
+      <w:pPr>
+        <w:pStyle w:val="ListParagraph"/>
+        <w:numPr>
+          <w:ilvl w:val="1"/>
+          <w:numId w:val="1"/>
+        </w:numPr>
+        <w:spacing w:after="40"/>
+      </w:pPr>
+      <w:r>
+        <w:rPr>
+          <w:color w:val="1D2D3E"/>
+          <w:sz w:val="22"/>
+          <w:szCs w:val="22"/>
+        </w:rPr>
+        <w:t xml:space="preserve">  Each JE line is now a TouchableOpacity; tap navigates to Account Statement</w:t>
+      </w:r>
+    </w:p>
+    <w:p>
+      <w:pPr>
+        <w:pStyle w:val="ListParagraph"/>
+        <w:numPr>
+          <w:ilvl w:val="1"/>
+          <w:numId w:val="1"/>
+        </w:numPr>
+        <w:spacing w:after="40"/>
+      </w:pPr>
+      <w:r>
+        <w:rPr>
+          <w:color w:val="1D2D3E"/>
+          <w:sz w:val="22"/>
+          <w:szCs w:val="22"/>
+        </w:rPr>
+        <w:t xml:space="preserve">  parseAccountField() splits '1001 - Cash' format into code + name</w:t>
+      </w:r>
+    </w:p>
+    <w:p>
+      <w:pPr>
+        <w:pStyle w:val="ListParagraph"/>
+        <w:numPr>
+          <w:ilvl w:val="1"/>
+          <w:numId w:val="1"/>
+        </w:numPr>
+        <w:spacing w:after="40"/>
+      </w:pPr>
+      <w:r>
+        <w:rPr>
+          <w:color w:val="1D2D3E"/>
+          <w:sz w:val="22"/>
+          <w:szCs w:val="22"/>
+        </w:rPr>
+        <w:t xml:space="preserve">  Chevron shown on tappable rows; JE list → detail → Account Statement drill-down chain</w:t>
       </w:r>
     </w:p>
     <w:p>

</xml_diff>

<commit_message>
docs(session-28): update PROGRESS.md, generate-docs.js, and FEATURES.docx
Session 28 changelog:
- Payment timeline tab (VendorDetail + CustomerDetail)
- Date range filter on PO and SO list screens
- Delivery countdown chips on PO/SO cards
- Updated What's Next: partner timeline marked done, new ideas added
- Screen inventory table updated with 9 new entries
</commit_message>
<xml_diff>
--- a/FEATURES.docx
+++ b/FEATURES.docx
@@ -45,7 +45,7 @@
           <w:sz w:val="20"/>
           <w:szCs w:val="20"/>
         </w:rPr>
-        <w:t xml:space="preserve">Generated: 2026-05-28</w:t>
+        <w:t xml:space="preserve">Generated: 2026-05-29</w:t>
       </w:r>
     </w:p>
     <w:p>
@@ -18013,6 +18013,380 @@
           </w:p>
         </w:tc>
       </w:tr>
+      <w:tr>
+        <w:tc>
+          <w:p>
+            <w:pPr>
+              <w:spacing w:after="40" w:before="40"/>
+            </w:pPr>
+            <w:r>
+              <w:rPr>
+                <w:b w:val="false"/>
+                <w:bCs w:val="false"/>
+                <w:color w:val="1D2D3E"/>
+                <w:sz w:val="20"/>
+                <w:szCs w:val="20"/>
+              </w:rPr>
+              <w:t xml:space="preserve">Session 28</w:t>
+            </w:r>
+          </w:p>
+        </w:tc>
+        <w:tc>
+          <w:p>
+            <w:pPr>
+              <w:spacing w:after="40" w:before="40"/>
+            </w:pPr>
+            <w:r>
+              <w:rPr>
+                <w:b w:val="false"/>
+                <w:bCs w:val="false"/>
+                <w:color w:val="1D2D3E"/>
+                <w:sz w:val="20"/>
+                <w:szCs w:val="20"/>
+              </w:rPr>
+              <w:t xml:space="preserve">Payment Timeline tab in VendorDetail — PMT entries as visual dot-line timeline with stats bar</w:t>
+            </w:r>
+          </w:p>
+        </w:tc>
+        <w:tc>
+          <w:p>
+            <w:pPr>
+              <w:spacing w:after="40" w:before="40"/>
+            </w:pPr>
+            <w:r>
+              <w:rPr>
+                <w:b w:val="false"/>
+                <w:bCs w:val="false"/>
+                <w:color w:val="1D2D3E"/>
+                <w:sz w:val="20"/>
+                <w:szCs w:val="20"/>
+              </w:rPr>
+              <w:t xml:space="preserve">Done</w:t>
+            </w:r>
+          </w:p>
+        </w:tc>
+        <w:tc>
+          <w:p>
+            <w:pPr>
+              <w:spacing w:after="40" w:before="40"/>
+            </w:pPr>
+            <w:r>
+              <w:rPr>
+                <w:b w:val="false"/>
+                <w:bCs w:val="false"/>
+                <w:color w:val="1D2D3E"/>
+                <w:sz w:val="20"/>
+                <w:szCs w:val="20"/>
+              </w:rPr>
+              <w:t xml:space="preserve">VendorDetailScreen.tsx</w:t>
+            </w:r>
+          </w:p>
+        </w:tc>
+      </w:tr>
+      <w:tr>
+        <w:tc>
+          <w:tcPr>
+            <w:shd w:color="F0F4F8" w:val="solid"/>
+          </w:tcPr>
+          <w:p>
+            <w:pPr>
+              <w:spacing w:after="40" w:before="40"/>
+            </w:pPr>
+            <w:r>
+              <w:rPr>
+                <w:b w:val="false"/>
+                <w:bCs w:val="false"/>
+                <w:color w:val="1D2D3E"/>
+                <w:sz w:val="20"/>
+                <w:szCs w:val="20"/>
+              </w:rPr>
+              <w:t xml:space="preserve">Session 28</w:t>
+            </w:r>
+          </w:p>
+        </w:tc>
+        <w:tc>
+          <w:tcPr>
+            <w:shd w:color="F0F4F8" w:val="solid"/>
+          </w:tcPr>
+          <w:p>
+            <w:pPr>
+              <w:spacing w:after="40" w:before="40"/>
+            </w:pPr>
+            <w:r>
+              <w:rPr>
+                <w:b w:val="false"/>
+                <w:bCs w:val="false"/>
+                <w:color w:val="1D2D3E"/>
+                <w:sz w:val="20"/>
+                <w:szCs w:val="20"/>
+              </w:rPr>
+              <w:t xml:space="preserve">Receipt Timeline tab in CustomerDetail — REC entries timeline with stats bar</w:t>
+            </w:r>
+          </w:p>
+        </w:tc>
+        <w:tc>
+          <w:tcPr>
+            <w:shd w:color="F0F4F8" w:val="solid"/>
+          </w:tcPr>
+          <w:p>
+            <w:pPr>
+              <w:spacing w:after="40" w:before="40"/>
+            </w:pPr>
+            <w:r>
+              <w:rPr>
+                <w:b w:val="false"/>
+                <w:bCs w:val="false"/>
+                <w:color w:val="1D2D3E"/>
+                <w:sz w:val="20"/>
+                <w:szCs w:val="20"/>
+              </w:rPr>
+              <w:t xml:space="preserve">Done</w:t>
+            </w:r>
+          </w:p>
+        </w:tc>
+        <w:tc>
+          <w:tcPr>
+            <w:shd w:color="F0F4F8" w:val="solid"/>
+          </w:tcPr>
+          <w:p>
+            <w:pPr>
+              <w:spacing w:after="40" w:before="40"/>
+            </w:pPr>
+            <w:r>
+              <w:rPr>
+                <w:b w:val="false"/>
+                <w:bCs w:val="false"/>
+                <w:color w:val="1D2D3E"/>
+                <w:sz w:val="20"/>
+                <w:szCs w:val="20"/>
+              </w:rPr>
+              <w:t xml:space="preserve">CustomerDetailScreen.tsx</w:t>
+            </w:r>
+          </w:p>
+        </w:tc>
+      </w:tr>
+      <w:tr>
+        <w:tc>
+          <w:p>
+            <w:pPr>
+              <w:spacing w:after="40" w:before="40"/>
+            </w:pPr>
+            <w:r>
+              <w:rPr>
+                <w:b w:val="false"/>
+                <w:bCs w:val="false"/>
+                <w:color w:val="1D2D3E"/>
+                <w:sz w:val="20"/>
+                <w:szCs w:val="20"/>
+              </w:rPr>
+              <w:t xml:space="preserve">Session 28</w:t>
+            </w:r>
+          </w:p>
+        </w:tc>
+        <w:tc>
+          <w:p>
+            <w:pPr>
+              <w:spacing w:after="40" w:before="40"/>
+            </w:pPr>
+            <w:r>
+              <w:rPr>
+                <w:b w:val="false"/>
+                <w:bCs w:val="false"/>
+                <w:color w:val="1D2D3E"/>
+                <w:sz w:val="20"/>
+                <w:szCs w:val="20"/>
+              </w:rPr>
+              <w:t xml:space="preserve">Date range filter on PO list — DateRangeBar below status tabs, client-side date filtering</w:t>
+            </w:r>
+          </w:p>
+        </w:tc>
+        <w:tc>
+          <w:p>
+            <w:pPr>
+              <w:spacing w:after="40" w:before="40"/>
+            </w:pPr>
+            <w:r>
+              <w:rPr>
+                <w:b w:val="false"/>
+                <w:bCs w:val="false"/>
+                <w:color w:val="1D2D3E"/>
+                <w:sz w:val="20"/>
+                <w:szCs w:val="20"/>
+              </w:rPr>
+              <w:t xml:space="preserve">Done</w:t>
+            </w:r>
+          </w:p>
+        </w:tc>
+        <w:tc>
+          <w:p>
+            <w:pPr>
+              <w:spacing w:after="40" w:before="40"/>
+            </w:pPr>
+            <w:r>
+              <w:rPr>
+                <w:b w:val="false"/>
+                <w:bCs w:val="false"/>
+                <w:color w:val="1D2D3E"/>
+                <w:sz w:val="20"/>
+                <w:szCs w:val="20"/>
+              </w:rPr>
+              <w:t xml:space="preserve">PurchaseOrdersScreen.tsx</w:t>
+            </w:r>
+          </w:p>
+        </w:tc>
+      </w:tr>
+      <w:tr>
+        <w:tc>
+          <w:tcPr>
+            <w:shd w:color="F0F4F8" w:val="solid"/>
+          </w:tcPr>
+          <w:p>
+            <w:pPr>
+              <w:spacing w:after="40" w:before="40"/>
+            </w:pPr>
+            <w:r>
+              <w:rPr>
+                <w:b w:val="false"/>
+                <w:bCs w:val="false"/>
+                <w:color w:val="1D2D3E"/>
+                <w:sz w:val="20"/>
+                <w:szCs w:val="20"/>
+              </w:rPr>
+              <w:t xml:space="preserve">Session 28</w:t>
+            </w:r>
+          </w:p>
+        </w:tc>
+        <w:tc>
+          <w:tcPr>
+            <w:shd w:color="F0F4F8" w:val="solid"/>
+          </w:tcPr>
+          <w:p>
+            <w:pPr>
+              <w:spacing w:after="40" w:before="40"/>
+            </w:pPr>
+            <w:r>
+              <w:rPr>
+                <w:b w:val="false"/>
+                <w:bCs w:val="false"/>
+                <w:color w:val="1D2D3E"/>
+                <w:sz w:val="20"/>
+                <w:szCs w:val="20"/>
+              </w:rPr>
+              <w:t xml:space="preserve">Date range filter on SO list — same DateRangeBar pattern</w:t>
+            </w:r>
+          </w:p>
+        </w:tc>
+        <w:tc>
+          <w:tcPr>
+            <w:shd w:color="F0F4F8" w:val="solid"/>
+          </w:tcPr>
+          <w:p>
+            <w:pPr>
+              <w:spacing w:after="40" w:before="40"/>
+            </w:pPr>
+            <w:r>
+              <w:rPr>
+                <w:b w:val="false"/>
+                <w:bCs w:val="false"/>
+                <w:color w:val="1D2D3E"/>
+                <w:sz w:val="20"/>
+                <w:szCs w:val="20"/>
+              </w:rPr>
+              <w:t xml:space="preserve">Done</w:t>
+            </w:r>
+          </w:p>
+        </w:tc>
+        <w:tc>
+          <w:tcPr>
+            <w:shd w:color="F0F4F8" w:val="solid"/>
+          </w:tcPr>
+          <w:p>
+            <w:pPr>
+              <w:spacing w:after="40" w:before="40"/>
+            </w:pPr>
+            <w:r>
+              <w:rPr>
+                <w:b w:val="false"/>
+                <w:bCs w:val="false"/>
+                <w:color w:val="1D2D3E"/>
+                <w:sz w:val="20"/>
+                <w:szCs w:val="20"/>
+              </w:rPr>
+              <w:t xml:space="preserve">SalesOrdersScreen.tsx</w:t>
+            </w:r>
+          </w:p>
+        </w:tc>
+      </w:tr>
+      <w:tr>
+        <w:tc>
+          <w:p>
+            <w:pPr>
+              <w:spacing w:after="40" w:before="40"/>
+            </w:pPr>
+            <w:r>
+              <w:rPr>
+                <w:b w:val="false"/>
+                <w:bCs w:val="false"/>
+                <w:color w:val="1D2D3E"/>
+                <w:sz w:val="20"/>
+                <w:szCs w:val="20"/>
+              </w:rPr>
+              <w:t xml:space="preserve">Session 28</w:t>
+            </w:r>
+          </w:p>
+        </w:tc>
+        <w:tc>
+          <w:p>
+            <w:pPr>
+              <w:spacing w:after="40" w:before="40"/>
+            </w:pPr>
+            <w:r>
+              <w:rPr>
+                <w:b w:val="false"/>
+                <w:bCs w:val="false"/>
+                <w:color w:val="1D2D3E"/>
+                <w:sz w:val="20"/>
+                <w:szCs w:val="20"/>
+              </w:rPr>
+              <w:t xml:space="preserve">Delivery countdown chips on PO/SO cards — overdue/today/urgent/soon indicators</w:t>
+            </w:r>
+          </w:p>
+        </w:tc>
+        <w:tc>
+          <w:p>
+            <w:pPr>
+              <w:spacing w:after="40" w:before="40"/>
+            </w:pPr>
+            <w:r>
+              <w:rPr>
+                <w:b w:val="false"/>
+                <w:bCs w:val="false"/>
+                <w:color w:val="1D2D3E"/>
+                <w:sz w:val="20"/>
+                <w:szCs w:val="20"/>
+              </w:rPr>
+              <w:t xml:space="preserve">Done</w:t>
+            </w:r>
+          </w:p>
+        </w:tc>
+        <w:tc>
+          <w:p>
+            <w:pPr>
+              <w:spacing w:after="40" w:before="40"/>
+            </w:pPr>
+            <w:r>
+              <w:rPr>
+                <w:b w:val="false"/>
+                <w:bCs w:val="false"/>
+                <w:color w:val="1D2D3E"/>
+                <w:sz w:val="20"/>
+                <w:szCs w:val="20"/>
+              </w:rPr>
+              <w:t xml:space="preserve">PurchaseOrdersScreen.tsx + SalesOrdersScreen.tsx</w:t>
+            </w:r>
+          </w:p>
+        </w:tc>
+      </w:tr>
     </w:tbl>
     <w:p>
       <w:pPr>
@@ -22681,6 +23055,357 @@
           <w:szCs w:val="22"/>
         </w:rPr>
         <w:t xml:space="preserve">  Tapping a history row repopulates the query field</w:t>
+      </w:r>
+    </w:p>
+    <w:p>
+      <w:pPr>
+        <w:spacing w:after="80"/>
+      </w:pPr>
+      <w:r>
+        <w:rPr>
+          <w:color w:val="1D2D3E"/>
+          <w:sz w:val="22"/>
+          <w:szCs w:val="22"/>
+        </w:rPr>
+        <w:t xml:space="preserve"/>
+      </w:r>
+    </w:p>
+    <w:p>
+      <w:pPr>
+        <w:pStyle w:val="Heading2"/>
+        <w:spacing w:after="120" w:before="300"/>
+      </w:pPr>
+      <w:r>
+        <w:rPr>
+          <w:b/>
+          <w:bCs/>
+          <w:color w:val="1D2D3E"/>
+        </w:rPr>
+        <w:t xml:space="preserve">Session 28 — 2026-05-29</w:t>
+      </w:r>
+    </w:p>
+    <w:p>
+      <w:pPr>
+        <w:pStyle w:val="ListParagraph"/>
+        <w:numPr>
+          <w:ilvl w:val="0"/>
+          <w:numId w:val="1"/>
+        </w:numPr>
+        <w:spacing w:after="40"/>
+      </w:pPr>
+      <w:r>
+        <w:rPr>
+          <w:color w:val="1D2D3E"/>
+          <w:sz w:val="22"/>
+          <w:szCs w:val="22"/>
+        </w:rPr>
+        <w:t xml:space="preserve">Payment Timeline Tab in VendorDetailScreen (VendorDetailScreen.tsx)</w:t>
+      </w:r>
+    </w:p>
+    <w:p>
+      <w:pPr>
+        <w:pStyle w:val="ListParagraph"/>
+        <w:numPr>
+          <w:ilvl w:val="1"/>
+          <w:numId w:val="1"/>
+        </w:numPr>
+        <w:spacing w:after="40"/>
+      </w:pPr>
+      <w:r>
+        <w:rPr>
+          <w:color w:val="1D2D3E"/>
+          <w:sz w:val="22"/>
+          <w:szCs w:val="22"/>
+        </w:rPr>
+        <w:t xml:space="preserve">  Three-tab layout: Bills | Payments | Ledger</w:t>
+      </w:r>
+    </w:p>
+    <w:p>
+      <w:pPr>
+        <w:pStyle w:val="ListParagraph"/>
+        <w:numPr>
+          <w:ilvl w:val="1"/>
+          <w:numId w:val="1"/>
+        </w:numPr>
+        <w:spacing w:after="40"/>
+      </w:pPr>
+      <w:r>
+        <w:rPr>
+          <w:color w:val="1D2D3E"/>
+          <w:sz w:val="22"/>
+          <w:szCs w:val="22"/>
+        </w:rPr>
+        <w:t xml:space="preserve">  Payments tab: extracts PMT entries from ledger; stats bar (count, total paid, avg)</w:t>
+      </w:r>
+    </w:p>
+    <w:p>
+      <w:pPr>
+        <w:pStyle w:val="ListParagraph"/>
+        <w:numPr>
+          <w:ilvl w:val="1"/>
+          <w:numId w:val="1"/>
+        </w:numPr>
+        <w:spacing w:after="40"/>
+      </w:pPr>
+      <w:r>
+        <w:rPr>
+          <w:color w:val="1D2D3E"/>
+          <w:sz w:val="22"/>
+          <w:szCs w:val="22"/>
+        </w:rPr>
+        <w:t xml:space="preserve">  Visual timeline: vertical dot-and-line connector, each card shows date + reference + amount</w:t>
+      </w:r>
+    </w:p>
+    <w:p>
+      <w:pPr>
+        <w:pStyle w:val="ListParagraph"/>
+        <w:numPr>
+          <w:ilvl w:val="1"/>
+          <w:numId w:val="1"/>
+        </w:numPr>
+        <w:spacing w:after="40"/>
+      </w:pPr>
+      <w:r>
+        <w:rPr>
+          <w:color w:val="1D2D3E"/>
+          <w:sz w:val="22"/>
+          <w:szCs w:val="22"/>
+        </w:rPr>
+        <w:t xml:space="preserve">  PDF export button hidden on Payments tab</w:t>
+      </w:r>
+    </w:p>
+    <w:p>
+      <w:pPr>
+        <w:pStyle w:val="ListParagraph"/>
+        <w:numPr>
+          <w:ilvl w:val="0"/>
+          <w:numId w:val="1"/>
+        </w:numPr>
+        <w:spacing w:after="40"/>
+      </w:pPr>
+      <w:r>
+        <w:rPr>
+          <w:color w:val="1D2D3E"/>
+          <w:sz w:val="22"/>
+          <w:szCs w:val="22"/>
+        </w:rPr>
+        <w:t xml:space="preserve">Receipt Timeline Tab in CustomerDetailScreen (CustomerDetailScreen.tsx)</w:t>
+      </w:r>
+    </w:p>
+    <w:p>
+      <w:pPr>
+        <w:pStyle w:val="ListParagraph"/>
+        <w:numPr>
+          <w:ilvl w:val="1"/>
+          <w:numId w:val="1"/>
+        </w:numPr>
+        <w:spacing w:after="40"/>
+      </w:pPr>
+      <w:r>
+        <w:rPr>
+          <w:color w:val="1D2D3E"/>
+          <w:sz w:val="22"/>
+          <w:szCs w:val="22"/>
+        </w:rPr>
+        <w:t xml:space="preserve">  Three-tab layout: Invoices | Payments | Ledger</w:t>
+      </w:r>
+    </w:p>
+    <w:p>
+      <w:pPr>
+        <w:pStyle w:val="ListParagraph"/>
+        <w:numPr>
+          <w:ilvl w:val="1"/>
+          <w:numId w:val="1"/>
+        </w:numPr>
+        <w:spacing w:after="40"/>
+      </w:pPr>
+      <w:r>
+        <w:rPr>
+          <w:color w:val="1D2D3E"/>
+          <w:sz w:val="22"/>
+          <w:szCs w:val="22"/>
+        </w:rPr>
+        <w:t xml:space="preserve">  Payments tab: extracts REC entries; stats bar (count, total received, avg receipt)</w:t>
+      </w:r>
+    </w:p>
+    <w:p>
+      <w:pPr>
+        <w:pStyle w:val="ListParagraph"/>
+        <w:numPr>
+          <w:ilvl w:val="0"/>
+          <w:numId w:val="1"/>
+        </w:numPr>
+        <w:spacing w:after="40"/>
+      </w:pPr>
+      <w:r>
+        <w:rPr>
+          <w:color w:val="1D2D3E"/>
+          <w:sz w:val="22"/>
+          <w:szCs w:val="22"/>
+        </w:rPr>
+        <w:t xml:space="preserve">Date Range Filter on Purchase Orders (PurchaseOrdersScreen.tsx)</w:t>
+      </w:r>
+    </w:p>
+    <w:p>
+      <w:pPr>
+        <w:pStyle w:val="ListParagraph"/>
+        <w:numPr>
+          <w:ilvl w:val="1"/>
+          <w:numId w:val="1"/>
+        </w:numPr>
+        <w:spacing w:after="40"/>
+      </w:pPr>
+      <w:r>
+        <w:rPr>
+          <w:color w:val="1D2D3E"/>
+          <w:sz w:val="22"/>
+          <w:szCs w:val="22"/>
+        </w:rPr>
+        <w:t xml:space="preserve">  DateRangeBar below status tabs; client-side filter by order dt field</w:t>
+      </w:r>
+    </w:p>
+    <w:p>
+      <w:pPr>
+        <w:pStyle w:val="ListParagraph"/>
+        <w:numPr>
+          <w:ilvl w:val="1"/>
+          <w:numId w:val="1"/>
+        </w:numPr>
+        <w:spacing w:after="40"/>
+      </w:pPr>
+      <w:r>
+        <w:rPr>
+          <w:color w:val="1D2D3E"/>
+          <w:sz w:val="22"/>
+          <w:szCs w:val="22"/>
+        </w:rPr>
+        <w:t xml:space="preserve">  Presets: Today, This Week, This Month, Last Month, Custom</w:t>
+      </w:r>
+    </w:p>
+    <w:p>
+      <w:pPr>
+        <w:pStyle w:val="ListParagraph"/>
+        <w:numPr>
+          <w:ilvl w:val="0"/>
+          <w:numId w:val="1"/>
+        </w:numPr>
+        <w:spacing w:after="40"/>
+      </w:pPr>
+      <w:r>
+        <w:rPr>
+          <w:color w:val="1D2D3E"/>
+          <w:sz w:val="22"/>
+          <w:szCs w:val="22"/>
+        </w:rPr>
+        <w:t xml:space="preserve">Date Range Filter on Sales Orders (SalesOrdersScreen.tsx)</w:t>
+      </w:r>
+    </w:p>
+    <w:p>
+      <w:pPr>
+        <w:pStyle w:val="ListParagraph"/>
+        <w:numPr>
+          <w:ilvl w:val="1"/>
+          <w:numId w:val="1"/>
+        </w:numPr>
+        <w:spacing w:after="40"/>
+      </w:pPr>
+      <w:r>
+        <w:rPr>
+          <w:color w:val="1D2D3E"/>
+          <w:sz w:val="22"/>
+          <w:szCs w:val="22"/>
+        </w:rPr>
+        <w:t xml:space="preserve">  Same DateRangeBar pattern as PO screen</w:t>
+      </w:r>
+    </w:p>
+    <w:p>
+      <w:pPr>
+        <w:pStyle w:val="ListParagraph"/>
+        <w:numPr>
+          <w:ilvl w:val="0"/>
+          <w:numId w:val="1"/>
+        </w:numPr>
+        <w:spacing w:after="40"/>
+      </w:pPr>
+      <w:r>
+        <w:rPr>
+          <w:color w:val="1D2D3E"/>
+          <w:sz w:val="22"/>
+          <w:szCs w:val="22"/>
+        </w:rPr>
+        <w:t xml:space="preserve">Delivery Countdown Chips on PO/SO Cards</w:t>
+      </w:r>
+    </w:p>
+    <w:p>
+      <w:pPr>
+        <w:pStyle w:val="ListParagraph"/>
+        <w:numPr>
+          <w:ilvl w:val="1"/>
+          <w:numId w:val="1"/>
+        </w:numPr>
+        <w:spacing w:after="40"/>
+      </w:pPr>
+      <w:r>
+        <w:rPr>
+          <w:color w:val="1D2D3E"/>
+          <w:sz w:val="22"/>
+          <w:szCs w:val="22"/>
+        </w:rPr>
+        <w:t xml:space="preserve">  getDeliveryStatus() computes urgency from delivery_date vs today</w:t>
+      </w:r>
+    </w:p>
+    <w:p>
+      <w:pPr>
+        <w:pStyle w:val="ListParagraph"/>
+        <w:numPr>
+          <w:ilvl w:val="1"/>
+          <w:numId w:val="1"/>
+        </w:numPr>
+        <w:spacing w:after="40"/>
+      </w:pPr>
+      <w:r>
+        <w:rPr>
+          <w:color w:val="1D2D3E"/>
+          <w:sz w:val="22"/>
+          <w:szCs w:val="22"/>
+        </w:rPr>
+        <w:t xml:space="preserve">  Chips: 'X days overdue', 'Due today', 'Due in Xd' (1-7 days only)</w:t>
+      </w:r>
+    </w:p>
+    <w:p>
+      <w:pPr>
+        <w:pStyle w:val="ListParagraph"/>
+        <w:numPr>
+          <w:ilvl w:val="1"/>
+          <w:numId w:val="1"/>
+        </w:numPr>
+        <w:spacing w:after="40"/>
+      </w:pPr>
+      <w:r>
+        <w:rPr>
+          <w:color w:val="1D2D3E"/>
+          <w:sz w:val="22"/>
+          <w:szCs w:val="22"/>
+        </w:rPr>
+        <w:t xml:space="preserve">  Overdue chip has bolder border and alert-circle icon</w:t>
+      </w:r>
+    </w:p>
+    <w:p>
+      <w:pPr>
+        <w:pStyle w:val="ListParagraph"/>
+        <w:numPr>
+          <w:ilvl w:val="1"/>
+          <w:numId w:val="1"/>
+        </w:numPr>
+        <w:spacing w:after="40"/>
+      </w:pPr>
+      <w:r>
+        <w:rPr>
+          <w:color w:val="1D2D3E"/>
+          <w:sz w:val="22"/>
+          <w:szCs w:val="22"/>
+        </w:rPr>
+        <w:t xml:space="preserve">  Closed/cancelled/received orders show no chip</w:t>
       </w:r>
     </w:p>
     <w:p>

</xml_diff>

<commit_message>
docs(session-29): update PROGRESS.md, generate-docs.js, and FEATURES.docx
- PROGRESS.md: full Session 29 section with DeliveryCalendarScreen,
  UpcomingDeliveriesSection, supply chain delivery stats details
- Screen Inventory: 4 new "Done" rows added for session-29 features
- What's Next: delivery calendar view marked done; updated to Session 30+
- generate-docs.js: Session 29 changelog entry + 3.38/3.39 subsections
  + 3 roadmap table rows
- FEATURES.docx regenerated

https://claude.ai/code/session_014Zhp9C8Yg1uESVpGKkopM8
</commit_message>
<xml_diff>
--- a/FEATURES.docx
+++ b/FEATURES.docx
@@ -8751,6 +8751,330 @@
     </w:p>
     <w:p>
       <w:pPr>
+        <w:pStyle w:val="Heading2"/>
+        <w:spacing w:after="120" w:before="300"/>
+      </w:pPr>
+      <w:r>
+        <w:rPr>
+          <w:b/>
+          <w:bCs/>
+          <w:color w:val="1D2D3E"/>
+        </w:rPr>
+        <w:t xml:space="preserve">3.38 Delivery Calendar Screen (Session 29)</w:t>
+      </w:r>
+    </w:p>
+    <w:p>
+      <w:pPr>
+        <w:pStyle w:val="ListParagraph"/>
+        <w:numPr>
+          <w:ilvl w:val="0"/>
+          <w:numId w:val="1"/>
+        </w:numPr>
+        <w:spacing w:after="40"/>
+      </w:pPr>
+      <w:r>
+        <w:rPr>
+          <w:color w:val="1D2D3E"/>
+          <w:sz w:val="22"/>
+          <w:szCs w:val="22"/>
+        </w:rPr>
+        <w:t xml:space="preserve">DeliveryCalendarScreen (src/screens/deliveryCalendar/DeliveryCalendarScreen.tsx)</w:t>
+      </w:r>
+    </w:p>
+    <w:p>
+      <w:pPr>
+        <w:pStyle w:val="ListParagraph"/>
+        <w:numPr>
+          <w:ilvl w:val="1"/>
+          <w:numId w:val="1"/>
+        </w:numPr>
+        <w:spacing w:after="40"/>
+      </w:pPr>
+      <w:r>
+        <w:rPr>
+          <w:color w:val="1D2D3E"/>
+          <w:sz w:val="22"/>
+          <w:szCs w:val="22"/>
+        </w:rPr>
+        <w:t xml:space="preserve">Monthly calendar grid built from pure JS Date math — no external calendar library</w:t>
+      </w:r>
+    </w:p>
+    <w:p>
+      <w:pPr>
+        <w:pStyle w:val="ListParagraph"/>
+        <w:numPr>
+          <w:ilvl w:val="1"/>
+          <w:numId w:val="1"/>
+        </w:numPr>
+        <w:spacing w:after="40"/>
+      </w:pPr>
+      <w:r>
+        <w:rPr>
+          <w:color w:val="1D2D3E"/>
+          <w:sz w:val="22"/>
+          <w:szCs w:val="22"/>
+        </w:rPr>
+        <w:t xml:space="preserve">Dot indicators per day: overdue=red, due-today=amber, 1-3d=blue, 4-14d=green</w:t>
+      </w:r>
+    </w:p>
+    <w:p>
+      <w:pPr>
+        <w:pStyle w:val="ListParagraph"/>
+        <w:numPr>
+          <w:ilvl w:val="1"/>
+          <w:numId w:val="1"/>
+        </w:numPr>
+        <w:spacing w:after="40"/>
+      </w:pPr>
+      <w:r>
+        <w:rPr>
+          <w:color w:val="1D2D3E"/>
+          <w:sz w:val="22"/>
+          <w:szCs w:val="22"/>
+        </w:rPr>
+        <w:t xml:space="preserve">All/POs/SOs type filter toggle at top; month navigation arrows</w:t>
+      </w:r>
+    </w:p>
+    <w:p>
+      <w:pPr>
+        <w:pStyle w:val="ListParagraph"/>
+        <w:numPr>
+          <w:ilvl w:val="1"/>
+          <w:numId w:val="1"/>
+        </w:numPr>
+        <w:spacing w:after="40"/>
+      </w:pPr>
+      <w:r>
+        <w:rPr>
+          <w:color w:val="1D2D3E"/>
+          <w:sz w:val="22"/>
+          <w:szCs w:val="22"/>
+        </w:rPr>
+        <w:t xml:space="preserve">Monthly summary badges: overdue count + pending count</w:t>
+      </w:r>
+    </w:p>
+    <w:p>
+      <w:pPr>
+        <w:pStyle w:val="ListParagraph"/>
+        <w:numPr>
+          <w:ilvl w:val="1"/>
+          <w:numId w:val="1"/>
+        </w:numPr>
+        <w:spacing w:after="40"/>
+      </w:pPr>
+      <w:r>
+        <w:rPr>
+          <w:color w:val="1D2D3E"/>
+          <w:sz w:val="22"/>
+          <w:szCs w:val="22"/>
+        </w:rPr>
+        <w:t xml:space="preserve">Tap day → day-detail panel shows all orders due that day as tappable cards</w:t>
+      </w:r>
+    </w:p>
+    <w:p>
+      <w:pPr>
+        <w:pStyle w:val="ListParagraph"/>
+        <w:numPr>
+          <w:ilvl w:val="1"/>
+          <w:numId w:val="1"/>
+        </w:numPr>
+        <w:spacing w:after="40"/>
+      </w:pPr>
+      <w:r>
+        <w:rPr>
+          <w:color w:val="1D2D3E"/>
+          <w:sz w:val="22"/>
+          <w:szCs w:val="22"/>
+        </w:rPr>
+        <w:t xml:space="preserve">Pull-to-refresh; offline cache keys delivery-cal:po and delivery-cal:so</w:t>
+      </w:r>
+    </w:p>
+    <w:p>
+      <w:pPr>
+        <w:pStyle w:val="ListParagraph"/>
+        <w:numPr>
+          <w:ilvl w:val="1"/>
+          <w:numId w:val="1"/>
+        </w:numPr>
+        <w:spacing w:after="40"/>
+      </w:pPr>
+      <w:r>
+        <w:rPr>
+          <w:color w:val="1D2D3E"/>
+          <w:sz w:val="22"/>
+          <w:szCs w:val="22"/>
+        </w:rPr>
+        <w:t xml:space="preserve">Wired to MoreNavigator + MoreMenu under Operations section</w:t>
+      </w:r>
+    </w:p>
+    <w:p>
+      <w:pPr>
+        <w:spacing w:after="80"/>
+      </w:pPr>
+      <w:r>
+        <w:rPr>
+          <w:color w:val="1D2D3E"/>
+          <w:sz w:val="22"/>
+          <w:szCs w:val="22"/>
+        </w:rPr>
+        <w:t xml:space="preserve"/>
+      </w:r>
+    </w:p>
+    <w:p>
+      <w:pPr>
+        <w:pStyle w:val="Heading2"/>
+        <w:spacing w:after="120" w:before="300"/>
+      </w:pPr>
+      <w:r>
+        <w:rPr>
+          <w:b/>
+          <w:bCs/>
+          <w:color w:val="1D2D3E"/>
+        </w:rPr>
+        <w:t xml:space="preserve">3.39 Upcoming Deliveries Dashboard Section (Session 29)</w:t>
+      </w:r>
+    </w:p>
+    <w:p>
+      <w:pPr>
+        <w:pStyle w:val="ListParagraph"/>
+        <w:numPr>
+          <w:ilvl w:val="0"/>
+          <w:numId w:val="1"/>
+        </w:numPr>
+        <w:spacing w:after="40"/>
+      </w:pPr>
+      <w:r>
+        <w:rPr>
+          <w:color w:val="1D2D3E"/>
+          <w:sz w:val="22"/>
+          <w:szCs w:val="22"/>
+        </w:rPr>
+        <w:t xml:space="preserve">UpcomingDeliveriesSection (src/components/UpcomingDeliveriesSection.tsx)</w:t>
+      </w:r>
+    </w:p>
+    <w:p>
+      <w:pPr>
+        <w:pStyle w:val="ListParagraph"/>
+        <w:numPr>
+          <w:ilvl w:val="1"/>
+          <w:numId w:val="1"/>
+        </w:numPr>
+        <w:spacing w:after="40"/>
+      </w:pPr>
+      <w:r>
+        <w:rPr>
+          <w:color w:val="1D2D3E"/>
+          <w:sz w:val="22"/>
+          <w:szCs w:val="22"/>
+        </w:rPr>
+        <w:t xml:space="preserve">Shows on Dashboard below Supply Chain Snapshot</w:t>
+      </w:r>
+    </w:p>
+    <w:p>
+      <w:pPr>
+        <w:pStyle w:val="ListParagraph"/>
+        <w:numPr>
+          <w:ilvl w:val="1"/>
+          <w:numId w:val="1"/>
+        </w:numPr>
+        <w:spacing w:after="40"/>
+      </w:pPr>
+      <w:r>
+        <w:rPr>
+          <w:color w:val="1D2D3E"/>
+          <w:sz w:val="22"/>
+          <w:szCs w:val="22"/>
+        </w:rPr>
+        <w:t xml:space="preserve">Lists next 5 PO/SO deliveries due within 14 days, overdue first</w:t>
+      </w:r>
+    </w:p>
+    <w:p>
+      <w:pPr>
+        <w:pStyle w:val="ListParagraph"/>
+        <w:numPr>
+          <w:ilvl w:val="1"/>
+          <w:numId w:val="1"/>
+        </w:numPr>
+        <w:spacing w:after="40"/>
+      </w:pPr>
+      <w:r>
+        <w:rPr>
+          <w:color w:val="1D2D3E"/>
+          <w:sz w:val="22"/>
+          <w:szCs w:val="22"/>
+        </w:rPr>
+        <w:t xml:space="preserve">Each row: type dot + order label + party + urgency chip; tap navigates to detail</w:t>
+      </w:r>
+    </w:p>
+    <w:p>
+      <w:pPr>
+        <w:pStyle w:val="ListParagraph"/>
+        <w:numPr>
+          <w:ilvl w:val="1"/>
+          <w:numId w:val="1"/>
+        </w:numPr>
+        <w:spacing w:after="40"/>
+      </w:pPr>
+      <w:r>
+        <w:rPr>
+          <w:color w:val="1D2D3E"/>
+          <w:sz w:val="22"/>
+          <w:szCs w:val="22"/>
+        </w:rPr>
+        <w:t xml:space="preserve">Footer 'View all N deliveries' → DeliveryCalendar</w:t>
+      </w:r>
+    </w:p>
+    <w:p>
+      <w:pPr>
+        <w:pStyle w:val="ListParagraph"/>
+        <w:numPr>
+          <w:ilvl w:val="1"/>
+          <w:numId w:val="1"/>
+        </w:numPr>
+        <w:spacing w:after="40"/>
+      </w:pPr>
+      <w:r>
+        <w:rPr>
+          <w:color w:val="1D2D3E"/>
+          <w:sz w:val="22"/>
+          <w:szCs w:val="22"/>
+        </w:rPr>
+        <w:t xml:space="preserve">Zero extra API calls — reuses openPOList/openSOList from SupplyChainSnapshot</w:t>
+      </w:r>
+    </w:p>
+    <w:p>
+      <w:pPr>
+        <w:pStyle w:val="ListParagraph"/>
+        <w:numPr>
+          <w:ilvl w:val="1"/>
+          <w:numId w:val="1"/>
+        </w:numPr>
+        <w:spacing w:after="40"/>
+      </w:pPr>
+      <w:r>
+        <w:rPr>
+          <w:color w:val="1D2D3E"/>
+          <w:sz w:val="22"/>
+          <w:szCs w:val="22"/>
+        </w:rPr>
+        <w:t xml:space="preserve">SupplyChainSnapshot extended: deliveriesDueThisWeek + deliveriesOverdue + openPOList + openSOList</w:t>
+      </w:r>
+    </w:p>
+    <w:p>
+      <w:pPr>
+        <w:spacing w:after="80"/>
+      </w:pPr>
+      <w:r>
+        <w:rPr>
+          <w:color w:val="1D2D3E"/>
+          <w:sz w:val="22"/>
+          <w:szCs w:val="22"/>
+        </w:rPr>
+        <w:t xml:space="preserve"/>
+      </w:r>
+    </w:p>
+    <w:p>
+      <w:pPr>
         <w:pStyle w:val="Heading1"/>
         <w:spacing w:after="120" w:before="300"/>
       </w:pPr>
@@ -18387,6 +18711,240 @@
           </w:p>
         </w:tc>
       </w:tr>
+      <w:tr>
+        <w:tc>
+          <w:tcPr>
+            <w:shd w:color="F0F4F8" w:val="solid"/>
+          </w:tcPr>
+          <w:p>
+            <w:pPr>
+              <w:spacing w:after="40" w:before="40"/>
+            </w:pPr>
+            <w:r>
+              <w:rPr>
+                <w:b w:val="false"/>
+                <w:bCs w:val="false"/>
+                <w:color w:val="1D2D3E"/>
+                <w:sz w:val="20"/>
+                <w:szCs w:val="20"/>
+              </w:rPr>
+              <w:t xml:space="preserve">Session 29</w:t>
+            </w:r>
+          </w:p>
+        </w:tc>
+        <w:tc>
+          <w:tcPr>
+            <w:shd w:color="F0F4F8" w:val="solid"/>
+          </w:tcPr>
+          <w:p>
+            <w:pPr>
+              <w:spacing w:after="40" w:before="40"/>
+            </w:pPr>
+            <w:r>
+              <w:rPr>
+                <w:b w:val="false"/>
+                <w:bCs w:val="false"/>
+                <w:color w:val="1D2D3E"/>
+                <w:sz w:val="20"/>
+                <w:szCs w:val="20"/>
+              </w:rPr>
+              <w:t xml:space="preserve">Delivery Calendar screen — monthly grid, dot indicators, day-detail panel, offline cache</w:t>
+            </w:r>
+          </w:p>
+        </w:tc>
+        <w:tc>
+          <w:tcPr>
+            <w:shd w:color="F0F4F8" w:val="solid"/>
+          </w:tcPr>
+          <w:p>
+            <w:pPr>
+              <w:spacing w:after="40" w:before="40"/>
+            </w:pPr>
+            <w:r>
+              <w:rPr>
+                <w:b w:val="false"/>
+                <w:bCs w:val="false"/>
+                <w:color w:val="1D2D3E"/>
+                <w:sz w:val="20"/>
+                <w:szCs w:val="20"/>
+              </w:rPr>
+              <w:t xml:space="preserve">Done</w:t>
+            </w:r>
+          </w:p>
+        </w:tc>
+        <w:tc>
+          <w:tcPr>
+            <w:shd w:color="F0F4F8" w:val="solid"/>
+          </w:tcPr>
+          <w:p>
+            <w:pPr>
+              <w:spacing w:after="40" w:before="40"/>
+            </w:pPr>
+            <w:r>
+              <w:rPr>
+                <w:b w:val="false"/>
+                <w:bCs w:val="false"/>
+                <w:color w:val="1D2D3E"/>
+                <w:sz w:val="20"/>
+                <w:szCs w:val="20"/>
+              </w:rPr>
+              <w:t xml:space="preserve">DeliveryCalendarScreen.tsx</w:t>
+            </w:r>
+          </w:p>
+        </w:tc>
+      </w:tr>
+      <w:tr>
+        <w:tc>
+          <w:p>
+            <w:pPr>
+              <w:spacing w:after="40" w:before="40"/>
+            </w:pPr>
+            <w:r>
+              <w:rPr>
+                <w:b w:val="false"/>
+                <w:bCs w:val="false"/>
+                <w:color w:val="1D2D3E"/>
+                <w:sz w:val="20"/>
+                <w:szCs w:val="20"/>
+              </w:rPr>
+              <w:t xml:space="preserve">Session 29</w:t>
+            </w:r>
+          </w:p>
+        </w:tc>
+        <w:tc>
+          <w:p>
+            <w:pPr>
+              <w:spacing w:after="40" w:before="40"/>
+            </w:pPr>
+            <w:r>
+              <w:rPr>
+                <w:b w:val="false"/>
+                <w:bCs w:val="false"/>
+                <w:color w:val="1D2D3E"/>
+                <w:sz w:val="20"/>
+                <w:szCs w:val="20"/>
+              </w:rPr>
+              <w:t xml:space="preserve">UpcomingDeliveriesSection — next 5 deliveries widget on Dashboard</w:t>
+            </w:r>
+          </w:p>
+        </w:tc>
+        <w:tc>
+          <w:p>
+            <w:pPr>
+              <w:spacing w:after="40" w:before="40"/>
+            </w:pPr>
+            <w:r>
+              <w:rPr>
+                <w:b w:val="false"/>
+                <w:bCs w:val="false"/>
+                <w:color w:val="1D2D3E"/>
+                <w:sz w:val="20"/>
+                <w:szCs w:val="20"/>
+              </w:rPr>
+              <w:t xml:space="preserve">Done</w:t>
+            </w:r>
+          </w:p>
+        </w:tc>
+        <w:tc>
+          <w:p>
+            <w:pPr>
+              <w:spacing w:after="40" w:before="40"/>
+            </w:pPr>
+            <w:r>
+              <w:rPr>
+                <w:b w:val="false"/>
+                <w:bCs w:val="false"/>
+                <w:color w:val="1D2D3E"/>
+                <w:sz w:val="20"/>
+                <w:szCs w:val="20"/>
+              </w:rPr>
+              <w:t xml:space="preserve">UpcomingDeliveriesSection.tsx</w:t>
+            </w:r>
+          </w:p>
+        </w:tc>
+      </w:tr>
+      <w:tr>
+        <w:tc>
+          <w:tcPr>
+            <w:shd w:color="F0F4F8" w:val="solid"/>
+          </w:tcPr>
+          <w:p>
+            <w:pPr>
+              <w:spacing w:after="40" w:before="40"/>
+            </w:pPr>
+            <w:r>
+              <w:rPr>
+                <w:b w:val="false"/>
+                <w:bCs w:val="false"/>
+                <w:color w:val="1D2D3E"/>
+                <w:sz w:val="20"/>
+                <w:szCs w:val="20"/>
+              </w:rPr>
+              <w:t xml:space="preserve">Session 29</w:t>
+            </w:r>
+          </w:p>
+        </w:tc>
+        <w:tc>
+          <w:tcPr>
+            <w:shd w:color="F0F4F8" w:val="solid"/>
+          </w:tcPr>
+          <w:p>
+            <w:pPr>
+              <w:spacing w:after="40" w:before="40"/>
+            </w:pPr>
+            <w:r>
+              <w:rPr>
+                <w:b w:val="false"/>
+                <w:bCs w:val="false"/>
+                <w:color w:val="1D2D3E"/>
+                <w:sz w:val="20"/>
+                <w:szCs w:val="20"/>
+              </w:rPr>
+              <w:t xml:space="preserve">Supply Chain snapshot: delivery stats (overdue + due-7d count, taps to calendar)</w:t>
+            </w:r>
+          </w:p>
+        </w:tc>
+        <w:tc>
+          <w:tcPr>
+            <w:shd w:color="F0F4F8" w:val="solid"/>
+          </w:tcPr>
+          <w:p>
+            <w:pPr>
+              <w:spacing w:after="40" w:before="40"/>
+            </w:pPr>
+            <w:r>
+              <w:rPr>
+                <w:b w:val="false"/>
+                <w:bCs w:val="false"/>
+                <w:color w:val="1D2D3E"/>
+                <w:sz w:val="20"/>
+                <w:szCs w:val="20"/>
+              </w:rPr>
+              <w:t xml:space="preserve">Done</w:t>
+            </w:r>
+          </w:p>
+        </w:tc>
+        <w:tc>
+          <w:tcPr>
+            <w:shd w:color="F0F4F8" w:val="solid"/>
+          </w:tcPr>
+          <w:p>
+            <w:pPr>
+              <w:spacing w:after="40" w:before="40"/>
+            </w:pPr>
+            <w:r>
+              <w:rPr>
+                <w:b w:val="false"/>
+                <w:bCs w:val="false"/>
+                <w:color w:val="1D2D3E"/>
+                <w:sz w:val="20"/>
+                <w:szCs w:val="20"/>
+              </w:rPr>
+              <w:t xml:space="preserve">dashboard.ts + DashboardScreen.tsx</w:t>
+            </w:r>
+          </w:p>
+        </w:tc>
+      </w:tr>
     </w:tbl>
     <w:p>
       <w:pPr>
@@ -23055,6 +23613,375 @@
           <w:szCs w:val="22"/>
         </w:rPr>
         <w:t xml:space="preserve">  Tapping a history row repopulates the query field</w:t>
+      </w:r>
+    </w:p>
+    <w:p>
+      <w:pPr>
+        <w:spacing w:after="80"/>
+      </w:pPr>
+      <w:r>
+        <w:rPr>
+          <w:color w:val="1D2D3E"/>
+          <w:sz w:val="22"/>
+          <w:szCs w:val="22"/>
+        </w:rPr>
+        <w:t xml:space="preserve"/>
+      </w:r>
+    </w:p>
+    <w:p>
+      <w:pPr>
+        <w:pStyle w:val="Heading2"/>
+        <w:spacing w:after="120" w:before="300"/>
+      </w:pPr>
+      <w:r>
+        <w:rPr>
+          <w:b/>
+          <w:bCs/>
+          <w:color w:val="1D2D3E"/>
+        </w:rPr>
+        <w:t xml:space="preserve">Session 29 — 2026-05-29</w:t>
+      </w:r>
+    </w:p>
+    <w:p>
+      <w:pPr>
+        <w:pStyle w:val="ListParagraph"/>
+        <w:numPr>
+          <w:ilvl w:val="0"/>
+          <w:numId w:val="1"/>
+        </w:numPr>
+        <w:spacing w:after="40"/>
+      </w:pPr>
+      <w:r>
+        <w:rPr>
+          <w:color w:val="1D2D3E"/>
+          <w:sz w:val="22"/>
+          <w:szCs w:val="22"/>
+        </w:rPr>
+        <w:t xml:space="preserve">Delivery Calendar Screen (src/screens/deliveryCalendar/DeliveryCalendarScreen.tsx)</w:t>
+      </w:r>
+    </w:p>
+    <w:p>
+      <w:pPr>
+        <w:pStyle w:val="ListParagraph"/>
+        <w:numPr>
+          <w:ilvl w:val="1"/>
+          <w:numId w:val="1"/>
+        </w:numPr>
+        <w:spacing w:after="40"/>
+      </w:pPr>
+      <w:r>
+        <w:rPr>
+          <w:color w:val="1D2D3E"/>
+          <w:sz w:val="22"/>
+          <w:szCs w:val="22"/>
+        </w:rPr>
+        <w:t xml:space="preserve">  Monthly calendar grid with colored dot indicators per day</w:t>
+      </w:r>
+    </w:p>
+    <w:p>
+      <w:pPr>
+        <w:pStyle w:val="ListParagraph"/>
+        <w:numPr>
+          <w:ilvl w:val="1"/>
+          <w:numId w:val="1"/>
+        </w:numPr>
+        <w:spacing w:after="40"/>
+      </w:pPr>
+      <w:r>
+        <w:rPr>
+          <w:color w:val="1D2D3E"/>
+          <w:sz w:val="22"/>
+          <w:szCs w:val="22"/>
+        </w:rPr>
+        <w:t xml:space="preserve">  Dot colors: overdue=red, today=amber, 1-3d=blue, 4-14d=green</w:t>
+      </w:r>
+    </w:p>
+    <w:p>
+      <w:pPr>
+        <w:pStyle w:val="ListParagraph"/>
+        <w:numPr>
+          <w:ilvl w:val="1"/>
+          <w:numId w:val="1"/>
+        </w:numPr>
+        <w:spacing w:after="40"/>
+      </w:pPr>
+      <w:r>
+        <w:rPr>
+          <w:color w:val="1D2D3E"/>
+          <w:sz w:val="22"/>
+          <w:szCs w:val="22"/>
+        </w:rPr>
+        <w:t xml:space="preserve">  All/POs/SOs type filter toggle; month navigation with prev/next arrows</w:t>
+      </w:r>
+    </w:p>
+    <w:p>
+      <w:pPr>
+        <w:pStyle w:val="ListParagraph"/>
+        <w:numPr>
+          <w:ilvl w:val="1"/>
+          <w:numId w:val="1"/>
+        </w:numPr>
+        <w:spacing w:after="40"/>
+      </w:pPr>
+      <w:r>
+        <w:rPr>
+          <w:color w:val="1D2D3E"/>
+          <w:sz w:val="22"/>
+          <w:szCs w:val="22"/>
+        </w:rPr>
+        <w:t xml:space="preserve">  Monthly summary badges: overdue count + pending count below month title</w:t>
+      </w:r>
+    </w:p>
+    <w:p>
+      <w:pPr>
+        <w:pStyle w:val="ListParagraph"/>
+        <w:numPr>
+          <w:ilvl w:val="1"/>
+          <w:numId w:val="1"/>
+        </w:numPr>
+        <w:spacing w:after="40"/>
+      </w:pPr>
+      <w:r>
+        <w:rPr>
+          <w:color w:val="1D2D3E"/>
+          <w:sz w:val="22"/>
+          <w:szCs w:val="22"/>
+        </w:rPr>
+        <w:t xml:space="preserve">  Tap day → day detail panel with list of order cards for that date</w:t>
+      </w:r>
+    </w:p>
+    <w:p>
+      <w:pPr>
+        <w:pStyle w:val="ListParagraph"/>
+        <w:numPr>
+          <w:ilvl w:val="1"/>
+          <w:numId w:val="1"/>
+        </w:numPr>
+        <w:spacing w:after="40"/>
+      </w:pPr>
+      <w:r>
+        <w:rPr>
+          <w:color w:val="1D2D3E"/>
+          <w:sz w:val="22"/>
+          <w:szCs w:val="22"/>
+        </w:rPr>
+        <w:t xml:space="preserve">  Order cards: type pill (PO/SO), number, party, urgency chip; tap → detail screen</w:t>
+      </w:r>
+    </w:p>
+    <w:p>
+      <w:pPr>
+        <w:pStyle w:val="ListParagraph"/>
+        <w:numPr>
+          <w:ilvl w:val="1"/>
+          <w:numId w:val="1"/>
+        </w:numPr>
+        <w:spacing w:after="40"/>
+      </w:pPr>
+      <w:r>
+        <w:rPr>
+          <w:color w:val="1D2D3E"/>
+          <w:sz w:val="22"/>
+          <w:szCs w:val="22"/>
+        </w:rPr>
+        <w:t xml:space="preserve">  Pull-to-refresh, offline cache (delivery-cal:po / delivery-cal:so)</w:t>
+      </w:r>
+    </w:p>
+    <w:p>
+      <w:pPr>
+        <w:pStyle w:val="ListParagraph"/>
+        <w:numPr>
+          <w:ilvl w:val="1"/>
+          <w:numId w:val="1"/>
+        </w:numPr>
+        <w:spacing w:after="40"/>
+      </w:pPr>
+      <w:r>
+        <w:rPr>
+          <w:color w:val="1D2D3E"/>
+          <w:sz w:val="22"/>
+          <w:szCs w:val="22"/>
+        </w:rPr>
+        <w:t xml:space="preserve">  Wired to MoreNavigator + MoreMenu Operations section</w:t>
+      </w:r>
+    </w:p>
+    <w:p>
+      <w:pPr>
+        <w:pStyle w:val="ListParagraph"/>
+        <w:numPr>
+          <w:ilvl w:val="0"/>
+          <w:numId w:val="1"/>
+        </w:numPr>
+        <w:spacing w:after="40"/>
+      </w:pPr>
+      <w:r>
+        <w:rPr>
+          <w:color w:val="1D2D3E"/>
+          <w:sz w:val="22"/>
+          <w:szCs w:val="22"/>
+        </w:rPr>
+        <w:t xml:space="preserve">Dashboard: Supply Chain Snapshot delivery stats</w:t>
+      </w:r>
+    </w:p>
+    <w:p>
+      <w:pPr>
+        <w:pStyle w:val="ListParagraph"/>
+        <w:numPr>
+          <w:ilvl w:val="1"/>
+          <w:numId w:val="1"/>
+        </w:numPr>
+        <w:spacing w:after="40"/>
+      </w:pPr>
+      <w:r>
+        <w:rPr>
+          <w:color w:val="1D2D3E"/>
+          <w:sz w:val="22"/>
+          <w:szCs w:val="22"/>
+        </w:rPr>
+        <w:t xml:space="preserve">  SupplyChainSnapshot gains deliveriesDueThisWeek + deliveriesOverdue + openPOList + openSOList</w:t>
+      </w:r>
+    </w:p>
+    <w:p>
+      <w:pPr>
+        <w:pStyle w:val="ListParagraph"/>
+        <w:numPr>
+          <w:ilvl w:val="1"/>
+          <w:numId w:val="1"/>
+        </w:numPr>
+        <w:spacing w:after="40"/>
+      </w:pPr>
+      <w:r>
+        <w:rPr>
+          <w:color w:val="1D2D3E"/>
+          <w:sz w:val="22"/>
+          <w:szCs w:val="22"/>
+        </w:rPr>
+        <w:t xml:space="preserve">  4th Supply Chain card: shows overdue count (red) or due-7d count; taps to DeliveryCalendar</w:t>
+      </w:r>
+    </w:p>
+    <w:p>
+      <w:pPr>
+        <w:pStyle w:val="ListParagraph"/>
+        <w:numPr>
+          <w:ilvl w:val="1"/>
+          <w:numId w:val="1"/>
+        </w:numPr>
+        <w:spacing w:after="40"/>
+      </w:pPr>
+      <w:r>
+        <w:rPr>
+          <w:color w:val="1D2D3E"/>
+          <w:sz w:val="22"/>
+          <w:szCs w:val="22"/>
+        </w:rPr>
+        <w:t xml:space="preserve">  'Deliveries' tile added to Quick Actions grid</w:t>
+      </w:r>
+    </w:p>
+    <w:p>
+      <w:pPr>
+        <w:pStyle w:val="ListParagraph"/>
+        <w:numPr>
+          <w:ilvl w:val="0"/>
+          <w:numId w:val="1"/>
+        </w:numPr>
+        <w:spacing w:after="40"/>
+      </w:pPr>
+      <w:r>
+        <w:rPr>
+          <w:color w:val="1D2D3E"/>
+          <w:sz w:val="22"/>
+          <w:szCs w:val="22"/>
+        </w:rPr>
+        <w:t xml:space="preserve">Upcoming Deliveries Section on Dashboard (src/components/UpcomingDeliveriesSection.tsx)</w:t>
+      </w:r>
+    </w:p>
+    <w:p>
+      <w:pPr>
+        <w:pStyle w:val="ListParagraph"/>
+        <w:numPr>
+          <w:ilvl w:val="1"/>
+          <w:numId w:val="1"/>
+        </w:numPr>
+        <w:spacing w:after="40"/>
+      </w:pPr>
+      <w:r>
+        <w:rPr>
+          <w:color w:val="1D2D3E"/>
+          <w:sz w:val="22"/>
+          <w:szCs w:val="22"/>
+        </w:rPr>
+        <w:t xml:space="preserve">  New component shown below Supply Chain row</w:t>
+      </w:r>
+    </w:p>
+    <w:p>
+      <w:pPr>
+        <w:pStyle w:val="ListParagraph"/>
+        <w:numPr>
+          <w:ilvl w:val="1"/>
+          <w:numId w:val="1"/>
+        </w:numPr>
+        <w:spacing w:after="40"/>
+      </w:pPr>
+      <w:r>
+        <w:rPr>
+          <w:color w:val="1D2D3E"/>
+          <w:sz w:val="22"/>
+          <w:szCs w:val="22"/>
+        </w:rPr>
+        <w:t xml:space="preserve">  Shows next 5 deliveries due within 14 days (overdue first, then by date)</w:t>
+      </w:r>
+    </w:p>
+    <w:p>
+      <w:pPr>
+        <w:pStyle w:val="ListParagraph"/>
+        <w:numPr>
+          <w:ilvl w:val="1"/>
+          <w:numId w:val="1"/>
+        </w:numPr>
+        <w:spacing w:after="40"/>
+      </w:pPr>
+      <w:r>
+        <w:rPr>
+          <w:color w:val="1D2D3E"/>
+          <w:sz w:val="22"/>
+          <w:szCs w:val="22"/>
+        </w:rPr>
+        <w:t xml:space="preserve">  Each row: type dot + order number + party + urgency chip; tap → PO/SO detail</w:t>
+      </w:r>
+    </w:p>
+    <w:p>
+      <w:pPr>
+        <w:pStyle w:val="ListParagraph"/>
+        <w:numPr>
+          <w:ilvl w:val="1"/>
+          <w:numId w:val="1"/>
+        </w:numPr>
+        <w:spacing w:after="40"/>
+      </w:pPr>
+      <w:r>
+        <w:rPr>
+          <w:color w:val="1D2D3E"/>
+          <w:sz w:val="22"/>
+          <w:szCs w:val="22"/>
+        </w:rPr>
+        <w:t xml:space="preserve">  Footer 'View all N deliveries' link → DeliveryCalendar</w:t>
+      </w:r>
+    </w:p>
+    <w:p>
+      <w:pPr>
+        <w:pStyle w:val="ListParagraph"/>
+        <w:numPr>
+          <w:ilvl w:val="1"/>
+          <w:numId w:val="1"/>
+        </w:numPr>
+        <w:spacing w:after="40"/>
+      </w:pPr>
+      <w:r>
+        <w:rPr>
+          <w:color w:val="1D2D3E"/>
+          <w:sz w:val="22"/>
+          <w:szCs w:val="22"/>
+        </w:rPr>
+        <w:t xml:space="preserve">  Zero additional API calls — reuses openPOList/openSOList from supply chain snapshot</w:t>
       </w:r>
     </w:p>
     <w:p>

</xml_diff>

<commit_message>
docs(session-30): update PROGRESS.md, generate-docs.js, and FEATURES.docx with Session 30 changelog
</commit_message>
<xml_diff>
--- a/FEATURES.docx
+++ b/FEATURES.docx
@@ -45,7 +45,7 @@
           <w:sz w:val="20"/>
           <w:szCs w:val="20"/>
         </w:rPr>
-        <w:t xml:space="preserve">Generated: 2026-05-29</w:t>
+        <w:t xml:space="preserve">Generated: 2026-05-30</w:t>
       </w:r>
     </w:p>
     <w:p>
@@ -18945,6 +18945,310 @@
           </w:p>
         </w:tc>
       </w:tr>
+      <w:tr>
+        <w:tc>
+          <w:p>
+            <w:pPr>
+              <w:spacing w:after="40" w:before="40"/>
+            </w:pPr>
+            <w:r>
+              <w:rPr>
+                <w:b w:val="false"/>
+                <w:bCs w:val="false"/>
+                <w:color w:val="1D2D3E"/>
+                <w:sz w:val="20"/>
+                <w:szCs w:val="20"/>
+              </w:rPr>
+              <w:t xml:space="preserve">Session 30</w:t>
+            </w:r>
+          </w:p>
+        </w:tc>
+        <w:tc>
+          <w:p>
+            <w:pPr>
+              <w:spacing w:after="40" w:before="40"/>
+            </w:pPr>
+            <w:r>
+              <w:rPr>
+                <w:b w:val="false"/>
+                <w:bCs w:val="false"/>
+                <w:color w:val="1D2D3E"/>
+                <w:sz w:val="20"/>
+                <w:szCs w:val="20"/>
+              </w:rPr>
+              <w:t xml:space="preserve">Procurement Analytics screen — monthly PO/SO trend, top vendors/customers, status breakdown, PDF</w:t>
+            </w:r>
+          </w:p>
+        </w:tc>
+        <w:tc>
+          <w:p>
+            <w:pPr>
+              <w:spacing w:after="40" w:before="40"/>
+            </w:pPr>
+            <w:r>
+              <w:rPr>
+                <w:b w:val="false"/>
+                <w:bCs w:val="false"/>
+                <w:color w:val="1D2D3E"/>
+                <w:sz w:val="20"/>
+                <w:szCs w:val="20"/>
+              </w:rPr>
+              <w:t xml:space="preserve">Done</w:t>
+            </w:r>
+          </w:p>
+        </w:tc>
+        <w:tc>
+          <w:p>
+            <w:pPr>
+              <w:spacing w:after="40" w:before="40"/>
+            </w:pPr>
+            <w:r>
+              <w:rPr>
+                <w:b w:val="false"/>
+                <w:bCs w:val="false"/>
+                <w:color w:val="1D2D3E"/>
+                <w:sz w:val="20"/>
+                <w:szCs w:val="20"/>
+              </w:rPr>
+              <w:t xml:space="preserve">ProcurementAnalyticsScreen.tsx</w:t>
+            </w:r>
+          </w:p>
+        </w:tc>
+      </w:tr>
+      <w:tr>
+        <w:tc>
+          <w:tcPr>
+            <w:shd w:color="F0F4F8" w:val="solid"/>
+          </w:tcPr>
+          <w:p>
+            <w:pPr>
+              <w:spacing w:after="40" w:before="40"/>
+            </w:pPr>
+            <w:r>
+              <w:rPr>
+                <w:b w:val="false"/>
+                <w:bCs w:val="false"/>
+                <w:color w:val="1D2D3E"/>
+                <w:sz w:val="20"/>
+                <w:szCs w:val="20"/>
+              </w:rPr>
+              <w:t xml:space="preserve">Session 30</w:t>
+            </w:r>
+          </w:p>
+        </w:tc>
+        <w:tc>
+          <w:tcPr>
+            <w:shd w:color="F0F4F8" w:val="solid"/>
+          </w:tcPr>
+          <w:p>
+            <w:pPr>
+              <w:spacing w:after="40" w:before="40"/>
+            </w:pPr>
+            <w:r>
+              <w:rPr>
+                <w:b w:val="false"/>
+                <w:bCs w:val="false"/>
+                <w:color w:val="1D2D3E"/>
+                <w:sz w:val="20"/>
+                <w:szCs w:val="20"/>
+              </w:rPr>
+              <w:t xml:space="preserve">Stock Health screen — stock overview bar, low-stock list, top items by qty, warehouse breakdown, PDF</w:t>
+            </w:r>
+          </w:p>
+        </w:tc>
+        <w:tc>
+          <w:tcPr>
+            <w:shd w:color="F0F4F8" w:val="solid"/>
+          </w:tcPr>
+          <w:p>
+            <w:pPr>
+              <w:spacing w:after="40" w:before="40"/>
+            </w:pPr>
+            <w:r>
+              <w:rPr>
+                <w:b w:val="false"/>
+                <w:bCs w:val="false"/>
+                <w:color w:val="1D2D3E"/>
+                <w:sz w:val="20"/>
+                <w:szCs w:val="20"/>
+              </w:rPr>
+              <w:t xml:space="preserve">Done</w:t>
+            </w:r>
+          </w:p>
+        </w:tc>
+        <w:tc>
+          <w:tcPr>
+            <w:shd w:color="F0F4F8" w:val="solid"/>
+          </w:tcPr>
+          <w:p>
+            <w:pPr>
+              <w:spacing w:after="40" w:before="40"/>
+            </w:pPr>
+            <w:r>
+              <w:rPr>
+                <w:b w:val="false"/>
+                <w:bCs w:val="false"/>
+                <w:color w:val="1D2D3E"/>
+                <w:sz w:val="20"/>
+                <w:szCs w:val="20"/>
+              </w:rPr>
+              <w:t xml:space="preserve">StockHealthScreen.tsx</w:t>
+            </w:r>
+          </w:p>
+        </w:tc>
+      </w:tr>
+      <w:tr>
+        <w:tc>
+          <w:p>
+            <w:pPr>
+              <w:spacing w:after="40" w:before="40"/>
+            </w:pPr>
+            <w:r>
+              <w:rPr>
+                <w:b w:val="false"/>
+                <w:bCs w:val="false"/>
+                <w:color w:val="1D2D3E"/>
+                <w:sz w:val="20"/>
+                <w:szCs w:val="20"/>
+              </w:rPr>
+              <w:t xml:space="preserve">Session 30</w:t>
+            </w:r>
+          </w:p>
+        </w:tc>
+        <w:tc>
+          <w:p>
+            <w:pPr>
+              <w:spacing w:after="40" w:before="40"/>
+            </w:pPr>
+            <w:r>
+              <w:rPr>
+                <w:b w:val="false"/>
+                <w:bCs w:val="false"/>
+                <w:color w:val="1D2D3E"/>
+                <w:sz w:val="20"/>
+                <w:szCs w:val="20"/>
+              </w:rPr>
+              <w:t xml:space="preserve">MoreMenu Analytics section — Procurement Analytics + Stock Health + Company Comparison grouped</w:t>
+            </w:r>
+          </w:p>
+        </w:tc>
+        <w:tc>
+          <w:p>
+            <w:pPr>
+              <w:spacing w:after="40" w:before="40"/>
+            </w:pPr>
+            <w:r>
+              <w:rPr>
+                <w:b w:val="false"/>
+                <w:bCs w:val="false"/>
+                <w:color w:val="1D2D3E"/>
+                <w:sz w:val="20"/>
+                <w:szCs w:val="20"/>
+              </w:rPr>
+              <w:t xml:space="preserve">Done</w:t>
+            </w:r>
+          </w:p>
+        </w:tc>
+        <w:tc>
+          <w:p>
+            <w:pPr>
+              <w:spacing w:after="40" w:before="40"/>
+            </w:pPr>
+            <w:r>
+              <w:rPr>
+                <w:b w:val="false"/>
+                <w:bCs w:val="false"/>
+                <w:color w:val="1D2D3E"/>
+                <w:sz w:val="20"/>
+                <w:szCs w:val="20"/>
+              </w:rPr>
+              <w:t xml:space="preserve">MoreMenuScreen.tsx</w:t>
+            </w:r>
+          </w:p>
+        </w:tc>
+      </w:tr>
+      <w:tr>
+        <w:tc>
+          <w:tcPr>
+            <w:shd w:color="F0F4F8" w:val="solid"/>
+          </w:tcPr>
+          <w:p>
+            <w:pPr>
+              <w:spacing w:after="40" w:before="40"/>
+            </w:pPr>
+            <w:r>
+              <w:rPr>
+                <w:b w:val="false"/>
+                <w:bCs w:val="false"/>
+                <w:color w:val="1D2D3E"/>
+                <w:sz w:val="20"/>
+                <w:szCs w:val="20"/>
+              </w:rPr>
+              <w:t xml:space="preserve">Session 30</w:t>
+            </w:r>
+          </w:p>
+        </w:tc>
+        <w:tc>
+          <w:tcPr>
+            <w:shd w:color="F0F4F8" w:val="solid"/>
+          </w:tcPr>
+          <w:p>
+            <w:pPr>
+              <w:spacing w:after="40" w:before="40"/>
+            </w:pPr>
+            <w:r>
+              <w:rPr>
+                <w:b w:val="false"/>
+                <w:bCs w:val="false"/>
+                <w:color w:val="1D2D3E"/>
+                <w:sz w:val="20"/>
+                <w:szCs w:val="20"/>
+              </w:rPr>
+              <w:t xml:space="preserve">Dashboard Analytics quick-action tile → ProcurementAnalytics</w:t>
+            </w:r>
+          </w:p>
+        </w:tc>
+        <w:tc>
+          <w:tcPr>
+            <w:shd w:color="F0F4F8" w:val="solid"/>
+          </w:tcPr>
+          <w:p>
+            <w:pPr>
+              <w:spacing w:after="40" w:before="40"/>
+            </w:pPr>
+            <w:r>
+              <w:rPr>
+                <w:b w:val="false"/>
+                <w:bCs w:val="false"/>
+                <w:color w:val="1D2D3E"/>
+                <w:sz w:val="20"/>
+                <w:szCs w:val="20"/>
+              </w:rPr>
+              <w:t xml:space="preserve">Done</w:t>
+            </w:r>
+          </w:p>
+        </w:tc>
+        <w:tc>
+          <w:tcPr>
+            <w:shd w:color="F0F4F8" w:val="solid"/>
+          </w:tcPr>
+          <w:p>
+            <w:pPr>
+              <w:spacing w:after="40" w:before="40"/>
+            </w:pPr>
+            <w:r>
+              <w:rPr>
+                <w:b w:val="false"/>
+                <w:bCs w:val="false"/>
+                <w:color w:val="1D2D3E"/>
+                <w:sz w:val="20"/>
+                <w:szCs w:val="20"/>
+              </w:rPr>
+              <w:t xml:space="preserve">DashboardScreen.tsx</w:t>
+            </w:r>
+          </w:p>
+        </w:tc>
+      </w:tr>
     </w:tbl>
     <w:p>
       <w:pPr>
@@ -19927,6 +20231,78 @@
           <w:szCs w:val="22"/>
         </w:rPr>
         <w:t xml:space="preserve">dashboard.ts: fetchDashboardData now fetches prev month JEs in parallel; KPIs include revenuePrevMonth and expensesPrevMonth (Session 24)</w:t>
+      </w:r>
+    </w:p>
+    <w:p>
+      <w:pPr>
+        <w:pStyle w:val="ListParagraph"/>
+        <w:numPr>
+          <w:ilvl w:val="0"/>
+          <w:numId w:val="1"/>
+        </w:numPr>
+        <w:spacing w:after="40"/>
+      </w:pPr>
+      <w:r>
+        <w:rPr>
+          <w:color w:val="1D2D3E"/>
+          <w:sz w:val="22"/>
+          <w:szCs w:val="22"/>
+        </w:rPr>
+        <w:t xml:space="preserve">src/screens/analytics/ProcurementAnalyticsScreen.tsx — Procurement Analytics: monthly PO/SO trend chart, top vendors/customers ranked bar lists, status chip grids, PDF export via exportProcurementAnalyticsPDF() (Session 30)</w:t>
+      </w:r>
+    </w:p>
+    <w:p>
+      <w:pPr>
+        <w:pStyle w:val="ListParagraph"/>
+        <w:numPr>
+          <w:ilvl w:val="0"/>
+          <w:numId w:val="1"/>
+        </w:numPr>
+        <w:spacing w:after="40"/>
+      </w:pPr>
+      <w:r>
+        <w:rPr>
+          <w:color w:val="1D2D3E"/>
+          <w:sz w:val="22"/>
+          <w:szCs w:val="22"/>
+        </w:rPr>
+        <w:t xml:space="preserve">src/screens/analytics/StockHealthScreen.tsx — Stock Health: stacked status overview bar (Healthy/Low/Out), conditional low-stock alert list, top-8 ranked items, warehouse distribution bars, PDF export via exportStockHealthPDF() (Session 30)</w:t>
+      </w:r>
+    </w:p>
+    <w:p>
+      <w:pPr>
+        <w:pStyle w:val="ListParagraph"/>
+        <w:numPr>
+          <w:ilvl w:val="0"/>
+          <w:numId w:val="1"/>
+        </w:numPr>
+        <w:spacing w:after="40"/>
+      </w:pPr>
+      <w:r>
+        <w:rPr>
+          <w:color w:val="1D2D3E"/>
+          <w:sz w:val="22"/>
+          <w:szCs w:val="22"/>
+        </w:rPr>
+        <w:t xml:space="preserve">pdfExport.ts exportProcurementAnalyticsPDF — Procurement Analytics PDF: 6-block KPI summary, monthly trend table, top vendors, top customers, PO/SO status breakdowns (Session 30)</w:t>
+      </w:r>
+    </w:p>
+    <w:p>
+      <w:pPr>
+        <w:pStyle w:val="ListParagraph"/>
+        <w:numPr>
+          <w:ilvl w:val="0"/>
+          <w:numId w:val="1"/>
+        </w:numPr>
+        <w:spacing w:after="40"/>
+      </w:pPr>
+      <w:r>
+        <w:rPr>
+          <w:color w:val="1D2D3E"/>
+          <w:sz w:val="22"/>
+          <w:szCs w:val="22"/>
+        </w:rPr>
+        <w:t xml:space="preserve">pdfExport.ts exportStockHealthPDF — Stock Health PDF: 4-block summary, low-stock items table, top items by qty, warehouse distribution table (Session 30)</w:t>
       </w:r>
     </w:p>
     <w:p>
@@ -23613,6 +23989,465 @@
           <w:szCs w:val="22"/>
         </w:rPr>
         <w:t xml:space="preserve">  Tapping a history row repopulates the query field</w:t>
+      </w:r>
+    </w:p>
+    <w:p>
+      <w:pPr>
+        <w:spacing w:after="80"/>
+      </w:pPr>
+      <w:r>
+        <w:rPr>
+          <w:color w:val="1D2D3E"/>
+          <w:sz w:val="22"/>
+          <w:szCs w:val="22"/>
+        </w:rPr>
+        <w:t xml:space="preserve"/>
+      </w:r>
+    </w:p>
+    <w:p>
+      <w:pPr>
+        <w:pStyle w:val="Heading2"/>
+        <w:spacing w:after="120" w:before="300"/>
+      </w:pPr>
+      <w:r>
+        <w:rPr>
+          <w:b/>
+          <w:bCs/>
+          <w:color w:val="1D2D3E"/>
+        </w:rPr>
+        <w:t xml:space="preserve">Session 30 — 2026-05-30</w:t>
+      </w:r>
+    </w:p>
+    <w:p>
+      <w:pPr>
+        <w:pStyle w:val="ListParagraph"/>
+        <w:numPr>
+          <w:ilvl w:val="0"/>
+          <w:numId w:val="1"/>
+        </w:numPr>
+        <w:spacing w:after="40"/>
+      </w:pPr>
+      <w:r>
+        <w:rPr>
+          <w:color w:val="1D2D3E"/>
+          <w:sz w:val="22"/>
+          <w:szCs w:val="22"/>
+        </w:rPr>
+        <w:t xml:space="preserve">Procurement Analytics Screen (src/screens/analytics/ProcurementAnalyticsScreen.tsx)</w:t>
+      </w:r>
+    </w:p>
+    <w:p>
+      <w:pPr>
+        <w:pStyle w:val="ListParagraph"/>
+        <w:numPr>
+          <w:ilvl w:val="1"/>
+          <w:numId w:val="1"/>
+        </w:numPr>
+        <w:spacing w:after="40"/>
+      </w:pPr>
+      <w:r>
+        <w:rPr>
+          <w:color w:val="1D2D3E"/>
+          <w:sz w:val="22"/>
+          <w:szCs w:val="22"/>
+        </w:rPr>
+        <w:t xml:space="preserve">  KPI row: Total PO Value, Total SO Value, Open POs, Open SOs</w:t>
+      </w:r>
+    </w:p>
+    <w:p>
+      <w:pPr>
+        <w:pStyle w:val="ListParagraph"/>
+        <w:numPr>
+          <w:ilvl w:val="1"/>
+          <w:numId w:val="1"/>
+        </w:numPr>
+        <w:spacing w:after="40"/>
+      </w:pPr>
+      <w:r>
+        <w:rPr>
+          <w:color w:val="1D2D3E"/>
+          <w:sz w:val="22"/>
+          <w:szCs w:val="22"/>
+        </w:rPr>
+        <w:t xml:space="preserve">  Monthly trend chart: grouped vertical bars for last 6 months (PO count vs SO count)</w:t>
+      </w:r>
+    </w:p>
+    <w:p>
+      <w:pPr>
+        <w:pStyle w:val="ListParagraph"/>
+        <w:numPr>
+          <w:ilvl w:val="1"/>
+          <w:numId w:val="1"/>
+        </w:numPr>
+        <w:spacing w:after="40"/>
+      </w:pPr>
+      <w:r>
+        <w:rPr>
+          <w:color w:val="1D2D3E"/>
+          <w:sz w:val="22"/>
+          <w:szCs w:val="22"/>
+        </w:rPr>
+        <w:t xml:space="preserve">  Top 5 Vendors ranked by total PO value with progress bars</w:t>
+      </w:r>
+    </w:p>
+    <w:p>
+      <w:pPr>
+        <w:pStyle w:val="ListParagraph"/>
+        <w:numPr>
+          <w:ilvl w:val="1"/>
+          <w:numId w:val="1"/>
+        </w:numPr>
+        <w:spacing w:after="40"/>
+      </w:pPr>
+      <w:r>
+        <w:rPr>
+          <w:color w:val="1D2D3E"/>
+          <w:sz w:val="22"/>
+          <w:szCs w:val="22"/>
+        </w:rPr>
+        <w:t xml:space="preserve">  Top 5 Customers ranked by total SO value with progress bars</w:t>
+      </w:r>
+    </w:p>
+    <w:p>
+      <w:pPr>
+        <w:pStyle w:val="ListParagraph"/>
+        <w:numPr>
+          <w:ilvl w:val="1"/>
+          <w:numId w:val="1"/>
+        </w:numPr>
+        <w:spacing w:after="40"/>
+      </w:pPr>
+      <w:r>
+        <w:rPr>
+          <w:color w:val="1D2D3E"/>
+          <w:sz w:val="22"/>
+          <w:szCs w:val="22"/>
+        </w:rPr>
+        <w:t xml:space="preserve">  PO + SO status distribution: chip grid with count, % share, mini bar</w:t>
+      </w:r>
+    </w:p>
+    <w:p>
+      <w:pPr>
+        <w:pStyle w:val="ListParagraph"/>
+        <w:numPr>
+          <w:ilvl w:val="1"/>
+          <w:numId w:val="1"/>
+        </w:numPr>
+        <w:spacing w:after="40"/>
+      </w:pPr>
+      <w:r>
+        <w:rPr>
+          <w:color w:val="1D2D3E"/>
+          <w:sz w:val="22"/>
+          <w:szCs w:val="22"/>
+        </w:rPr>
+        <w:t xml:space="preserve">  PDF export via exportProcurementAnalyticsPDF()</w:t>
+      </w:r>
+    </w:p>
+    <w:p>
+      <w:pPr>
+        <w:pStyle w:val="ListParagraph"/>
+        <w:numPr>
+          <w:ilvl w:val="1"/>
+          <w:numId w:val="1"/>
+        </w:numPr>
+        <w:spacing w:after="40"/>
+      </w:pPr>
+      <w:r>
+        <w:rPr>
+          <w:color w:val="1D2D3E"/>
+          <w:sz w:val="22"/>
+          <w:szCs w:val="22"/>
+        </w:rPr>
+        <w:t xml:space="preserve">  Pull-to-refresh + offline cache (procurement-analytics:&lt;companyId&gt;)</w:t>
+      </w:r>
+    </w:p>
+    <w:p>
+      <w:pPr>
+        <w:pStyle w:val="ListParagraph"/>
+        <w:numPr>
+          <w:ilvl w:val="0"/>
+          <w:numId w:val="1"/>
+        </w:numPr>
+        <w:spacing w:after="40"/>
+      </w:pPr>
+      <w:r>
+        <w:rPr>
+          <w:color w:val="1D2D3E"/>
+          <w:sz w:val="22"/>
+          <w:szCs w:val="22"/>
+        </w:rPr>
+        <w:t xml:space="preserve">Stock Health Screen (src/screens/analytics/StockHealthScreen.tsx)</w:t>
+      </w:r>
+    </w:p>
+    <w:p>
+      <w:pPr>
+        <w:pStyle w:val="ListParagraph"/>
+        <w:numPr>
+          <w:ilvl w:val="1"/>
+          <w:numId w:val="1"/>
+        </w:numPr>
+        <w:spacing w:after="40"/>
+      </w:pPr>
+      <w:r>
+        <w:rPr>
+          <w:color w:val="1D2D3E"/>
+          <w:sz w:val="22"/>
+          <w:szCs w:val="22"/>
+        </w:rPr>
+        <w:t xml:space="preserve">  Stock overview: Healthy / Low Stock / Out of Stock counts + stacked bar legend</w:t>
+      </w:r>
+    </w:p>
+    <w:p>
+      <w:pPr>
+        <w:pStyle w:val="ListParagraph"/>
+        <w:numPr>
+          <w:ilvl w:val="1"/>
+          <w:numId w:val="1"/>
+        </w:numPr>
+        <w:spacing w:after="40"/>
+      </w:pPr>
+      <w:r>
+        <w:rPr>
+          <w:color w:val="1D2D3E"/>
+          <w:sz w:val="22"/>
+          <w:szCs w:val="22"/>
+        </w:rPr>
+        <w:t xml:space="preserve">  Configurable threshold sourced from Settings (getLowStockThreshold)</w:t>
+      </w:r>
+    </w:p>
+    <w:p>
+      <w:pPr>
+        <w:pStyle w:val="ListParagraph"/>
+        <w:numPr>
+          <w:ilvl w:val="1"/>
+          <w:numId w:val="1"/>
+        </w:numPr>
+        <w:spacing w:after="40"/>
+      </w:pPr>
+      <w:r>
+        <w:rPr>
+          <w:color w:val="1D2D3E"/>
+          <w:sz w:val="22"/>
+          <w:szCs w:val="22"/>
+        </w:rPr>
+        <w:t xml:space="preserve">  Conditional Low Stock Items section — alert-circle icon, sorted ascending by qty</w:t>
+      </w:r>
+    </w:p>
+    <w:p>
+      <w:pPr>
+        <w:pStyle w:val="ListParagraph"/>
+        <w:numPr>
+          <w:ilvl w:val="1"/>
+          <w:numId w:val="1"/>
+        </w:numPr>
+        <w:spacing w:after="40"/>
+      </w:pPr>
+      <w:r>
+        <w:rPr>
+          <w:color w:val="1D2D3E"/>
+          <w:sz w:val="22"/>
+          <w:szCs w:val="22"/>
+        </w:rPr>
+        <w:t xml:space="preserve">  Top 8 items by quantity with ranked progress bars</w:t>
+      </w:r>
+    </w:p>
+    <w:p>
+      <w:pPr>
+        <w:pStyle w:val="ListParagraph"/>
+        <w:numPr>
+          <w:ilvl w:val="1"/>
+          <w:numId w:val="1"/>
+        </w:numPr>
+        <w:spacing w:after="40"/>
+      </w:pPr>
+      <w:r>
+        <w:rPr>
+          <w:color w:val="1D2D3E"/>
+          <w:sz w:val="22"/>
+          <w:szCs w:val="22"/>
+        </w:rPr>
+        <w:t xml:space="preserve">  Warehouse distribution list: per-warehouse item count + total qty with bars</w:t>
+      </w:r>
+    </w:p>
+    <w:p>
+      <w:pPr>
+        <w:pStyle w:val="ListParagraph"/>
+        <w:numPr>
+          <w:ilvl w:val="1"/>
+          <w:numId w:val="1"/>
+        </w:numPr>
+        <w:spacing w:after="40"/>
+      </w:pPr>
+      <w:r>
+        <w:rPr>
+          <w:color w:val="1D2D3E"/>
+          <w:sz w:val="22"/>
+          <w:szCs w:val="22"/>
+        </w:rPr>
+        <w:t xml:space="preserve">  PDF export via exportStockHealthPDF()</w:t>
+      </w:r>
+    </w:p>
+    <w:p>
+      <w:pPr>
+        <w:pStyle w:val="ListParagraph"/>
+        <w:numPr>
+          <w:ilvl w:val="1"/>
+          <w:numId w:val="1"/>
+        </w:numPr>
+        <w:spacing w:after="40"/>
+      </w:pPr>
+      <w:r>
+        <w:rPr>
+          <w:color w:val="1D2D3E"/>
+          <w:sz w:val="22"/>
+          <w:szCs w:val="22"/>
+        </w:rPr>
+        <w:t xml:space="preserve">  Pull-to-refresh + offline cache (stock-health:&lt;companyId&gt;)</w:t>
+      </w:r>
+    </w:p>
+    <w:p>
+      <w:pPr>
+        <w:pStyle w:val="ListParagraph"/>
+        <w:numPr>
+          <w:ilvl w:val="0"/>
+          <w:numId w:val="1"/>
+        </w:numPr>
+        <w:spacing w:after="40"/>
+      </w:pPr>
+      <w:r>
+        <w:rPr>
+          <w:color w:val="1D2D3E"/>
+          <w:sz w:val="22"/>
+          <w:szCs w:val="22"/>
+        </w:rPr>
+        <w:t xml:space="preserve">MoreMenu Analytics section (MoreMenuScreen.tsx)</w:t>
+      </w:r>
+    </w:p>
+    <w:p>
+      <w:pPr>
+        <w:pStyle w:val="ListParagraph"/>
+        <w:numPr>
+          <w:ilvl w:val="1"/>
+          <w:numId w:val="1"/>
+        </w:numPr>
+        <w:spacing w:after="40"/>
+      </w:pPr>
+      <w:r>
+        <w:rPr>
+          <w:color w:val="1D2D3E"/>
+          <w:sz w:val="22"/>
+          <w:szCs w:val="22"/>
+        </w:rPr>
+        <w:t xml:space="preserve">  New ANALYTICS section added between Operations and Finance</w:t>
+      </w:r>
+    </w:p>
+    <w:p>
+      <w:pPr>
+        <w:pStyle w:val="ListParagraph"/>
+        <w:numPr>
+          <w:ilvl w:val="1"/>
+          <w:numId w:val="1"/>
+        </w:numPr>
+        <w:spacing w:after="40"/>
+      </w:pPr>
+      <w:r>
+        <w:rPr>
+          <w:color w:val="1D2D3E"/>
+          <w:sz w:val="22"/>
+          <w:szCs w:val="22"/>
+        </w:rPr>
+        <w:t xml:space="preserve">  Contains: Procurement Analytics (trending-up), Stock Health (activity), Company Comparison (bar-chart)</w:t>
+      </w:r>
+    </w:p>
+    <w:p>
+      <w:pPr>
+        <w:pStyle w:val="ListParagraph"/>
+        <w:numPr>
+          <w:ilvl w:val="1"/>
+          <w:numId w:val="1"/>
+        </w:numPr>
+        <w:spacing w:after="40"/>
+      </w:pPr>
+      <w:r>
+        <w:rPr>
+          <w:color w:val="1D2D3E"/>
+          <w:sz w:val="22"/>
+          <w:szCs w:val="22"/>
+        </w:rPr>
+        <w:t xml:space="preserve">  Company Comparison moved from Admin to Analytics for better grouping</w:t>
+      </w:r>
+    </w:p>
+    <w:p>
+      <w:pPr>
+        <w:pStyle w:val="ListParagraph"/>
+        <w:numPr>
+          <w:ilvl w:val="1"/>
+          <w:numId w:val="1"/>
+        </w:numPr>
+        <w:spacing w:after="40"/>
+      </w:pPr>
+      <w:r>
+        <w:rPr>
+          <w:color w:val="1D2D3E"/>
+          <w:sz w:val="22"/>
+          <w:szCs w:val="22"/>
+        </w:rPr>
+        <w:t xml:space="preserve">  Admin section now: Partners, Companies, Bookmarks, Settings</w:t>
+      </w:r>
+    </w:p>
+    <w:p>
+      <w:pPr>
+        <w:pStyle w:val="ListParagraph"/>
+        <w:numPr>
+          <w:ilvl w:val="0"/>
+          <w:numId w:val="1"/>
+        </w:numPr>
+        <w:spacing w:after="40"/>
+      </w:pPr>
+      <w:r>
+        <w:rPr>
+          <w:color w:val="1D2D3E"/>
+          <w:sz w:val="22"/>
+          <w:szCs w:val="22"/>
+        </w:rPr>
+        <w:t xml:space="preserve">Dashboard Analytics quick-action tile (DashboardScreen.tsx)</w:t>
+      </w:r>
+    </w:p>
+    <w:p>
+      <w:pPr>
+        <w:pStyle w:val="ListParagraph"/>
+        <w:numPr>
+          <w:ilvl w:val="1"/>
+          <w:numId w:val="1"/>
+        </w:numPr>
+        <w:spacing w:after="40"/>
+      </w:pPr>
+      <w:r>
+        <w:rPr>
+          <w:color w:val="1D2D3E"/>
+          <w:sz w:val="22"/>
+          <w:szCs w:val="22"/>
+        </w:rPr>
+        <w:t xml:space="preserve">  14th quick action tile: 'Analytics' (trending-up icon) → ProcurementAnalytics screen</w:t>
+      </w:r>
+    </w:p>
+    <w:p>
+      <w:pPr>
+        <w:pStyle w:val="ListParagraph"/>
+        <w:numPr>
+          <w:ilvl w:val="0"/>
+          <w:numId w:val="1"/>
+        </w:numPr>
+        <w:spacing w:after="40"/>
+      </w:pPr>
+      <w:r>
+        <w:rPr>
+          <w:color w:val="1D2D3E"/>
+          <w:sz w:val="22"/>
+          <w:szCs w:val="22"/>
+        </w:rPr>
+        <w:t xml:space="preserve">pdfExport.ts additions: ProcurementAnalyticsData interface + exportProcurementAnalyticsPDF() + StockHealthPDFData interface + exportStockHealthPDF()</w:t>
       </w:r>
     </w:p>
     <w:p>

</xml_diff>

<commit_message>
docs(session-32): update PROGRESS.md, generate-docs.js, and FEATURES.docx with Session 32 changelog
</commit_message>
<xml_diff>
--- a/FEATURES.docx
+++ b/FEATURES.docx
@@ -19249,6 +19249,310 @@
           </w:p>
         </w:tc>
       </w:tr>
+      <w:tr>
+        <w:tc>
+          <w:p>
+            <w:pPr>
+              <w:spacing w:after="40" w:before="40"/>
+            </w:pPr>
+            <w:r>
+              <w:rPr>
+                <w:b w:val="false"/>
+                <w:bCs w:val="false"/>
+                <w:color w:val="1D2D3E"/>
+                <w:sz w:val="20"/>
+                <w:szCs w:val="20"/>
+              </w:rPr>
+              <w:t xml:space="preserve">Session 32</w:t>
+            </w:r>
+          </w:p>
+        </w:tc>
+        <w:tc>
+          <w:p>
+            <w:pPr>
+              <w:spacing w:after="40" w:before="40"/>
+            </w:pPr>
+            <w:r>
+              <w:rPr>
+                <w:b w:val="false"/>
+                <w:bCs w:val="false"/>
+                <w:color w:val="1D2D3E"/>
+                <w:sz w:val="20"/>
+                <w:szCs w:val="20"/>
+              </w:rPr>
+              <w:t xml:space="preserve">Financial Analytics screen — AP/AR net position, aging charts, top vendors/customers, PDF export</w:t>
+            </w:r>
+          </w:p>
+        </w:tc>
+        <w:tc>
+          <w:p>
+            <w:pPr>
+              <w:spacing w:after="40" w:before="40"/>
+            </w:pPr>
+            <w:r>
+              <w:rPr>
+                <w:b w:val="false"/>
+                <w:bCs w:val="false"/>
+                <w:color w:val="1D2D3E"/>
+                <w:sz w:val="20"/>
+                <w:szCs w:val="20"/>
+              </w:rPr>
+              <w:t xml:space="preserve">Done</w:t>
+            </w:r>
+          </w:p>
+        </w:tc>
+        <w:tc>
+          <w:p>
+            <w:pPr>
+              <w:spacing w:after="40" w:before="40"/>
+            </w:pPr>
+            <w:r>
+              <w:rPr>
+                <w:b w:val="false"/>
+                <w:bCs w:val="false"/>
+                <w:color w:val="1D2D3E"/>
+                <w:sz w:val="20"/>
+                <w:szCs w:val="20"/>
+              </w:rPr>
+              <w:t xml:space="preserve">FinancialAnalyticsScreen.tsx</w:t>
+            </w:r>
+          </w:p>
+        </w:tc>
+      </w:tr>
+      <w:tr>
+        <w:tc>
+          <w:tcPr>
+            <w:shd w:color="F0F4F8" w:val="solid"/>
+          </w:tcPr>
+          <w:p>
+            <w:pPr>
+              <w:spacing w:after="40" w:before="40"/>
+            </w:pPr>
+            <w:r>
+              <w:rPr>
+                <w:b w:val="false"/>
+                <w:bCs w:val="false"/>
+                <w:color w:val="1D2D3E"/>
+                <w:sz w:val="20"/>
+                <w:szCs w:val="20"/>
+              </w:rPr>
+              <w:t xml:space="preserve">Session 32</w:t>
+            </w:r>
+          </w:p>
+        </w:tc>
+        <w:tc>
+          <w:tcPr>
+            <w:shd w:color="F0F4F8" w:val="solid"/>
+          </w:tcPr>
+          <w:p>
+            <w:pPr>
+              <w:spacing w:after="40" w:before="40"/>
+            </w:pPr>
+            <w:r>
+              <w:rPr>
+                <w:b w:val="false"/>
+                <w:bCs w:val="false"/>
+                <w:color w:val="1D2D3E"/>
+                <w:sz w:val="20"/>
+                <w:szCs w:val="20"/>
+              </w:rPr>
+              <w:t xml:space="preserve">Per-vendor aging breakdown chart in VendorDetailScreen (computed from bills)</w:t>
+            </w:r>
+          </w:p>
+        </w:tc>
+        <w:tc>
+          <w:tcPr>
+            <w:shd w:color="F0F4F8" w:val="solid"/>
+          </w:tcPr>
+          <w:p>
+            <w:pPr>
+              <w:spacing w:after="40" w:before="40"/>
+            </w:pPr>
+            <w:r>
+              <w:rPr>
+                <w:b w:val="false"/>
+                <w:bCs w:val="false"/>
+                <w:color w:val="1D2D3E"/>
+                <w:sz w:val="20"/>
+                <w:szCs w:val="20"/>
+              </w:rPr>
+              <w:t xml:space="preserve">Done</w:t>
+            </w:r>
+          </w:p>
+        </w:tc>
+        <w:tc>
+          <w:tcPr>
+            <w:shd w:color="F0F4F8" w:val="solid"/>
+          </w:tcPr>
+          <w:p>
+            <w:pPr>
+              <w:spacing w:after="40" w:before="40"/>
+            </w:pPr>
+            <w:r>
+              <w:rPr>
+                <w:b w:val="false"/>
+                <w:bCs w:val="false"/>
+                <w:color w:val="1D2D3E"/>
+                <w:sz w:val="20"/>
+                <w:szCs w:val="20"/>
+              </w:rPr>
+              <w:t xml:space="preserve">VendorDetailScreen.tsx</w:t>
+            </w:r>
+          </w:p>
+        </w:tc>
+      </w:tr>
+      <w:tr>
+        <w:tc>
+          <w:p>
+            <w:pPr>
+              <w:spacing w:after="40" w:before="40"/>
+            </w:pPr>
+            <w:r>
+              <w:rPr>
+                <w:b w:val="false"/>
+                <w:bCs w:val="false"/>
+                <w:color w:val="1D2D3E"/>
+                <w:sz w:val="20"/>
+                <w:szCs w:val="20"/>
+              </w:rPr>
+              <w:t xml:space="preserve">Session 32</w:t>
+            </w:r>
+          </w:p>
+        </w:tc>
+        <w:tc>
+          <w:p>
+            <w:pPr>
+              <w:spacing w:after="40" w:before="40"/>
+            </w:pPr>
+            <w:r>
+              <w:rPr>
+                <w:b w:val="false"/>
+                <w:bCs w:val="false"/>
+                <w:color w:val="1D2D3E"/>
+                <w:sz w:val="20"/>
+                <w:szCs w:val="20"/>
+              </w:rPr>
+              <w:t xml:space="preserve">Per-customer aging breakdown chart in CustomerDetailScreen (computed from invoices)</w:t>
+            </w:r>
+          </w:p>
+        </w:tc>
+        <w:tc>
+          <w:p>
+            <w:pPr>
+              <w:spacing w:after="40" w:before="40"/>
+            </w:pPr>
+            <w:r>
+              <w:rPr>
+                <w:b w:val="false"/>
+                <w:bCs w:val="false"/>
+                <w:color w:val="1D2D3E"/>
+                <w:sz w:val="20"/>
+                <w:szCs w:val="20"/>
+              </w:rPr>
+              <w:t xml:space="preserve">Done</w:t>
+            </w:r>
+          </w:p>
+        </w:tc>
+        <w:tc>
+          <w:p>
+            <w:pPr>
+              <w:spacing w:after="40" w:before="40"/>
+            </w:pPr>
+            <w:r>
+              <w:rPr>
+                <w:b w:val="false"/>
+                <w:bCs w:val="false"/>
+                <w:color w:val="1D2D3E"/>
+                <w:sz w:val="20"/>
+                <w:szCs w:val="20"/>
+              </w:rPr>
+              <w:t xml:space="preserve">CustomerDetailScreen.tsx</w:t>
+            </w:r>
+          </w:p>
+        </w:tc>
+      </w:tr>
+      <w:tr>
+        <w:tc>
+          <w:tcPr>
+            <w:shd w:color="F0F4F8" w:val="solid"/>
+          </w:tcPr>
+          <w:p>
+            <w:pPr>
+              <w:spacing w:after="40" w:before="40"/>
+            </w:pPr>
+            <w:r>
+              <w:rPr>
+                <w:b w:val="false"/>
+                <w:bCs w:val="false"/>
+                <w:color w:val="1D2D3E"/>
+                <w:sz w:val="20"/>
+                <w:szCs w:val="20"/>
+              </w:rPr>
+              <w:t xml:space="preserve">Session 32</w:t>
+            </w:r>
+          </w:p>
+        </w:tc>
+        <w:tc>
+          <w:tcPr>
+            <w:shd w:color="F0F4F8" w:val="solid"/>
+          </w:tcPr>
+          <w:p>
+            <w:pPr>
+              <w:spacing w:after="40" w:before="40"/>
+            </w:pPr>
+            <w:r>
+              <w:rPr>
+                <w:b w:val="false"/>
+                <w:bCs w:val="false"/>
+                <w:color w:val="1D2D3E"/>
+                <w:sz w:val="20"/>
+                <w:szCs w:val="20"/>
+              </w:rPr>
+              <w:t xml:space="preserve">Expandable narrations on JE list cards — long narrations get a show-more/less toggle</w:t>
+            </w:r>
+          </w:p>
+        </w:tc>
+        <w:tc>
+          <w:tcPr>
+            <w:shd w:color="F0F4F8" w:val="solid"/>
+          </w:tcPr>
+          <w:p>
+            <w:pPr>
+              <w:spacing w:after="40" w:before="40"/>
+            </w:pPr>
+            <w:r>
+              <w:rPr>
+                <w:b w:val="false"/>
+                <w:bCs w:val="false"/>
+                <w:color w:val="1D2D3E"/>
+                <w:sz w:val="20"/>
+                <w:szCs w:val="20"/>
+              </w:rPr>
+              <w:t xml:space="preserve">Done</w:t>
+            </w:r>
+          </w:p>
+        </w:tc>
+        <w:tc>
+          <w:tcPr>
+            <w:shd w:color="F0F4F8" w:val="solid"/>
+          </w:tcPr>
+          <w:p>
+            <w:pPr>
+              <w:spacing w:after="40" w:before="40"/>
+            </w:pPr>
+            <w:r>
+              <w:rPr>
+                <w:b w:val="false"/>
+                <w:bCs w:val="false"/>
+                <w:color w:val="1D2D3E"/>
+                <w:sz w:val="20"/>
+                <w:szCs w:val="20"/>
+              </w:rPr>
+              <w:t xml:space="preserve">JournalEntriesScreen.tsx</w:t>
+            </w:r>
+          </w:p>
+        </w:tc>
+      </w:tr>
     </w:tbl>
     <w:p>
       <w:pPr>
@@ -20284,6 +20588,24 @@
           <w:sz w:val="22"/>
           <w:szCs w:val="22"/>
         </w:rPr>
+        <w:t xml:space="preserve">src/screens/analytics/FinancialAnalyticsScreen.tsx — Financial Analytics: net position card (AR − AP), AP aging chart, AR aging chart, top-5 vendors by outstanding, top-5 customers by outstanding, PDF export via exportFinancialAnalyticsPDF() (Session 32)</w:t>
+      </w:r>
+    </w:p>
+    <w:p>
+      <w:pPr>
+        <w:pStyle w:val="ListParagraph"/>
+        <w:numPr>
+          <w:ilvl w:val="0"/>
+          <w:numId w:val="1"/>
+        </w:numPr>
+        <w:spacing w:after="40"/>
+      </w:pPr>
+      <w:r>
+        <w:rPr>
+          <w:color w:val="1D2D3E"/>
+          <w:sz w:val="22"/>
+          <w:szCs w:val="22"/>
+        </w:rPr>
         <w:t xml:space="preserve">pdfExport.ts exportProcurementAnalyticsPDF — Procurement Analytics PDF: 6-block KPI summary, monthly trend table, top vendors, top customers, PO/SO status breakdowns (Session 30)</w:t>
       </w:r>
     </w:p>
@@ -20303,6 +20625,24 @@
           <w:szCs w:val="22"/>
         </w:rPr>
         <w:t xml:space="preserve">pdfExport.ts exportStockHealthPDF — Stock Health PDF: 4-block summary, low-stock items table, top items by qty, warehouse distribution table (Session 30)</w:t>
+      </w:r>
+    </w:p>
+    <w:p>
+      <w:pPr>
+        <w:pStyle w:val="ListParagraph"/>
+        <w:numPr>
+          <w:ilvl w:val="0"/>
+          <w:numId w:val="1"/>
+        </w:numPr>
+        <w:spacing w:after="40"/>
+      </w:pPr>
+      <w:r>
+        <w:rPr>
+          <w:color w:val="1D2D3E"/>
+          <w:sz w:val="22"/>
+          <w:szCs w:val="22"/>
+        </w:rPr>
+        <w:t xml:space="preserve">pdfExport.ts exportFinancialAnalyticsPDF — Financial Analytics PDF: net position row, 4-block AP/AR summary, AP aging table with % bars, AR aging table, top vendors table, top customers table (Session 32)</w:t>
       </w:r>
     </w:p>
     <w:p>
@@ -23989,6 +24329,447 @@
           <w:szCs w:val="22"/>
         </w:rPr>
         <w:t xml:space="preserve">  Tapping a history row repopulates the query field</w:t>
+      </w:r>
+    </w:p>
+    <w:p>
+      <w:pPr>
+        <w:spacing w:after="80"/>
+      </w:pPr>
+      <w:r>
+        <w:rPr>
+          <w:color w:val="1D2D3E"/>
+          <w:sz w:val="22"/>
+          <w:szCs w:val="22"/>
+        </w:rPr>
+        <w:t xml:space="preserve"/>
+      </w:r>
+    </w:p>
+    <w:p>
+      <w:pPr>
+        <w:pStyle w:val="Heading2"/>
+        <w:spacing w:after="120" w:before="300"/>
+      </w:pPr>
+      <w:r>
+        <w:rPr>
+          <w:b/>
+          <w:bCs/>
+          <w:color w:val="1D2D3E"/>
+        </w:rPr>
+        <w:t xml:space="preserve">Session 32 — 2026-05-30</w:t>
+      </w:r>
+    </w:p>
+    <w:p>
+      <w:pPr>
+        <w:pStyle w:val="ListParagraph"/>
+        <w:numPr>
+          <w:ilvl w:val="0"/>
+          <w:numId w:val="1"/>
+        </w:numPr>
+        <w:spacing w:after="40"/>
+      </w:pPr>
+      <w:r>
+        <w:rPr>
+          <w:color w:val="1D2D3E"/>
+          <w:sz w:val="22"/>
+          <w:szCs w:val="22"/>
+        </w:rPr>
+        <w:t xml:space="preserve">Financial Analytics Screen (src/screens/analytics/FinancialAnalyticsScreen.tsx)</w:t>
+      </w:r>
+    </w:p>
+    <w:p>
+      <w:pPr>
+        <w:pStyle w:val="ListParagraph"/>
+        <w:numPr>
+          <w:ilvl w:val="1"/>
+          <w:numId w:val="1"/>
+        </w:numPr>
+        <w:spacing w:after="40"/>
+      </w:pPr>
+      <w:r>
+        <w:rPr>
+          <w:color w:val="1D2D3E"/>
+          <w:sz w:val="22"/>
+          <w:szCs w:val="22"/>
+        </w:rPr>
+        <w:t xml:space="preserve">  New screen under More → Analytics section</w:t>
+      </w:r>
+    </w:p>
+    <w:p>
+      <w:pPr>
+        <w:pStyle w:val="ListParagraph"/>
+        <w:numPr>
+          <w:ilvl w:val="1"/>
+          <w:numId w:val="1"/>
+        </w:numPr>
+        <w:spacing w:after="40"/>
+      </w:pPr>
+      <w:r>
+        <w:rPr>
+          <w:color w:val="1D2D3E"/>
+          <w:sz w:val="22"/>
+          <w:szCs w:val="22"/>
+        </w:rPr>
+        <w:t xml:space="preserve">  Net Position card: shows AR Outstanding − AP Outstanding = net receivable/payable</w:t>
+      </w:r>
+    </w:p>
+    <w:p>
+      <w:pPr>
+        <w:pStyle w:val="ListParagraph"/>
+        <w:numPr>
+          <w:ilvl w:val="1"/>
+          <w:numId w:val="1"/>
+        </w:numPr>
+        <w:spacing w:after="40"/>
+      </w:pPr>
+      <w:r>
+        <w:rPr>
+          <w:color w:val="1D2D3E"/>
+          <w:sz w:val="22"/>
+          <w:szCs w:val="22"/>
+        </w:rPr>
+        <w:t xml:space="preserve">  AP Overview: total outstanding, overdue summary tiles</w:t>
+      </w:r>
+    </w:p>
+    <w:p>
+      <w:pPr>
+        <w:pStyle w:val="ListParagraph"/>
+        <w:numPr>
+          <w:ilvl w:val="1"/>
+          <w:numId w:val="1"/>
+        </w:numPr>
+        <w:spacing w:after="40"/>
+      </w:pPr>
+      <w:r>
+        <w:rPr>
+          <w:color w:val="1D2D3E"/>
+          <w:sz w:val="22"/>
+          <w:szCs w:val="22"/>
+        </w:rPr>
+        <w:t xml:space="preserve">  AP Aging chart: stacked bar (Current / 1-30d / 31-60d / 61-90d / 90+d) from APSummary.aging</w:t>
+      </w:r>
+    </w:p>
+    <w:p>
+      <w:pPr>
+        <w:pStyle w:val="ListParagraph"/>
+        <w:numPr>
+          <w:ilvl w:val="1"/>
+          <w:numId w:val="1"/>
+        </w:numPr>
+        <w:spacing w:after="40"/>
+      </w:pPr>
+      <w:r>
+        <w:rPr>
+          <w:color w:val="1D2D3E"/>
+          <w:sz w:val="22"/>
+          <w:szCs w:val="22"/>
+        </w:rPr>
+        <w:t xml:space="preserve">  AR Overview: total outstanding, overdue summary tiles</w:t>
+      </w:r>
+    </w:p>
+    <w:p>
+      <w:pPr>
+        <w:pStyle w:val="ListParagraph"/>
+        <w:numPr>
+          <w:ilvl w:val="1"/>
+          <w:numId w:val="1"/>
+        </w:numPr>
+        <w:spacing w:after="40"/>
+      </w:pPr>
+      <w:r>
+        <w:rPr>
+          <w:color w:val="1D2D3E"/>
+          <w:sz w:val="22"/>
+          <w:szCs w:val="22"/>
+        </w:rPr>
+        <w:t xml:space="preserve">  AR Aging chart: same stacked bar pattern from ARSummary.aging</w:t>
+      </w:r>
+    </w:p>
+    <w:p>
+      <w:pPr>
+        <w:pStyle w:val="ListParagraph"/>
+        <w:numPr>
+          <w:ilvl w:val="1"/>
+          <w:numId w:val="1"/>
+        </w:numPr>
+        <w:spacing w:after="40"/>
+      </w:pPr>
+      <w:r>
+        <w:rPr>
+          <w:color w:val="1D2D3E"/>
+          <w:sz w:val="22"/>
+          <w:szCs w:val="22"/>
+        </w:rPr>
+        <w:t xml:space="preserve">  Top 5 Vendors by outstanding: ranked list with progress bars and bill count</w:t>
+      </w:r>
+    </w:p>
+    <w:p>
+      <w:pPr>
+        <w:pStyle w:val="ListParagraph"/>
+        <w:numPr>
+          <w:ilvl w:val="1"/>
+          <w:numId w:val="1"/>
+        </w:numPr>
+        <w:spacing w:after="40"/>
+      </w:pPr>
+      <w:r>
+        <w:rPr>
+          <w:color w:val="1D2D3E"/>
+          <w:sz w:val="22"/>
+          <w:szCs w:val="22"/>
+        </w:rPr>
+        <w:t xml:space="preserve">  Top 5 Customers by outstanding: ranked list with progress bars and invoice count</w:t>
+      </w:r>
+    </w:p>
+    <w:p>
+      <w:pPr>
+        <w:pStyle w:val="ListParagraph"/>
+        <w:numPr>
+          <w:ilvl w:val="1"/>
+          <w:numId w:val="1"/>
+        </w:numPr>
+        <w:spacing w:after="40"/>
+      </w:pPr>
+      <w:r>
+        <w:rPr>
+          <w:color w:val="1D2D3E"/>
+          <w:sz w:val="22"/>
+          <w:szCs w:val="22"/>
+        </w:rPr>
+        <w:t xml:space="preserve">  PDF export via exportFinancialAnalyticsPDF() — net row, 4-block summary, both aging tables, both partner tables</w:t>
+      </w:r>
+    </w:p>
+    <w:p>
+      <w:pPr>
+        <w:pStyle w:val="ListParagraph"/>
+        <w:numPr>
+          <w:ilvl w:val="1"/>
+          <w:numId w:val="1"/>
+        </w:numPr>
+        <w:spacing w:after="40"/>
+      </w:pPr>
+      <w:r>
+        <w:rPr>
+          <w:color w:val="1D2D3E"/>
+          <w:sz w:val="22"/>
+          <w:szCs w:val="22"/>
+        </w:rPr>
+        <w:t xml:space="preserve">  Pull-to-refresh + 24h offline cache (financial-analytics:&lt;companyId&gt;)</w:t>
+      </w:r>
+    </w:p>
+    <w:p>
+      <w:pPr>
+        <w:pStyle w:val="ListParagraph"/>
+        <w:numPr>
+          <w:ilvl w:val="1"/>
+          <w:numId w:val="1"/>
+        </w:numPr>
+        <w:spacing w:after="40"/>
+      </w:pPr>
+      <w:r>
+        <w:rPr>
+          <w:color w:val="1D2D3E"/>
+          <w:sz w:val="22"/>
+          <w:szCs w:val="22"/>
+        </w:rPr>
+        <w:t xml:space="preserve">  MoreNavigator: FinancialAnalytics route added</w:t>
+      </w:r>
+    </w:p>
+    <w:p>
+      <w:pPr>
+        <w:pStyle w:val="ListParagraph"/>
+        <w:numPr>
+          <w:ilvl w:val="1"/>
+          <w:numId w:val="1"/>
+        </w:numPr>
+        <w:spacing w:after="40"/>
+      </w:pPr>
+      <w:r>
+        <w:rPr>
+          <w:color w:val="1D2D3E"/>
+          <w:sz w:val="22"/>
+          <w:szCs w:val="22"/>
+        </w:rPr>
+        <w:t xml:space="preserve">  MoreMenu Analytics section: Financial Analytics entry added (dollar-sign icon)</w:t>
+      </w:r>
+    </w:p>
+    <w:p>
+      <w:pPr>
+        <w:pStyle w:val="ListParagraph"/>
+        <w:numPr>
+          <w:ilvl w:val="0"/>
+          <w:numId w:val="1"/>
+        </w:numPr>
+        <w:spacing w:after="40"/>
+      </w:pPr>
+      <w:r>
+        <w:rPr>
+          <w:color w:val="1D2D3E"/>
+          <w:sz w:val="22"/>
+          <w:szCs w:val="22"/>
+        </w:rPr>
+        <w:t xml:space="preserve">Per-vendor aging breakdown in VendorDetailScreen (src/screens/finance/VendorDetailScreen.tsx)</w:t>
+      </w:r>
+    </w:p>
+    <w:p>
+      <w:pPr>
+        <w:pStyle w:val="ListParagraph"/>
+        <w:numPr>
+          <w:ilvl w:val="1"/>
+          <w:numId w:val="1"/>
+        </w:numPr>
+        <w:spacing w:after="40"/>
+      </w:pPr>
+      <w:r>
+        <w:rPr>
+          <w:color w:val="1D2D3E"/>
+          <w:sz w:val="22"/>
+          <w:szCs w:val="22"/>
+        </w:rPr>
+        <w:t xml:space="preserve">  AgingChart rendered between summary tiles and tab bar when outstanding &gt; 0</w:t>
+      </w:r>
+    </w:p>
+    <w:p>
+      <w:pPr>
+        <w:pStyle w:val="ListParagraph"/>
+        <w:numPr>
+          <w:ilvl w:val="1"/>
+          <w:numId w:val="1"/>
+        </w:numPr>
+        <w:spacing w:after="40"/>
+      </w:pPr>
+      <w:r>
+        <w:rPr>
+          <w:color w:val="1D2D3E"/>
+          <w:sz w:val="22"/>
+          <w:szCs w:val="22"/>
+        </w:rPr>
+        <w:t xml:space="preserve">  Aging buckets computed from bills: Current (not past due), 1-30d, 31-60d, 61-90d, 90+d</w:t>
+      </w:r>
+    </w:p>
+    <w:p>
+      <w:pPr>
+        <w:pStyle w:val="ListParagraph"/>
+        <w:numPr>
+          <w:ilvl w:val="1"/>
+          <w:numId w:val="1"/>
+        </w:numPr>
+        <w:spacing w:after="40"/>
+      </w:pPr>
+      <w:r>
+        <w:rPr>
+          <w:color w:val="1D2D3E"/>
+          <w:sz w:val="22"/>
+          <w:szCs w:val="22"/>
+        </w:rPr>
+        <w:t xml:space="preserve">  Only visible for vendors with outstanding balances</w:t>
+      </w:r>
+    </w:p>
+    <w:p>
+      <w:pPr>
+        <w:pStyle w:val="ListParagraph"/>
+        <w:numPr>
+          <w:ilvl w:val="0"/>
+          <w:numId w:val="1"/>
+        </w:numPr>
+        <w:spacing w:after="40"/>
+      </w:pPr>
+      <w:r>
+        <w:rPr>
+          <w:color w:val="1D2D3E"/>
+          <w:sz w:val="22"/>
+          <w:szCs w:val="22"/>
+        </w:rPr>
+        <w:t xml:space="preserve">Per-customer aging breakdown in CustomerDetailScreen (src/screens/finance/CustomerDetailScreen.tsx)</w:t>
+      </w:r>
+    </w:p>
+    <w:p>
+      <w:pPr>
+        <w:pStyle w:val="ListParagraph"/>
+        <w:numPr>
+          <w:ilvl w:val="1"/>
+          <w:numId w:val="1"/>
+        </w:numPr>
+        <w:spacing w:after="40"/>
+      </w:pPr>
+      <w:r>
+        <w:rPr>
+          <w:color w:val="1D2D3E"/>
+          <w:sz w:val="22"/>
+          <w:szCs w:val="22"/>
+        </w:rPr>
+        <w:t xml:space="preserve">  Same pattern as vendor: AgingChart computed from invoices, shown when outstanding &gt; 0</w:t>
+      </w:r>
+    </w:p>
+    <w:p>
+      <w:pPr>
+        <w:pStyle w:val="ListParagraph"/>
+        <w:numPr>
+          <w:ilvl w:val="0"/>
+          <w:numId w:val="1"/>
+        </w:numPr>
+        <w:spacing w:after="40"/>
+      </w:pPr>
+      <w:r>
+        <w:rPr>
+          <w:color w:val="1D2D3E"/>
+          <w:sz w:val="22"/>
+          <w:szCs w:val="22"/>
+        </w:rPr>
+        <w:t xml:space="preserve">Expandable narrations on Journal Entry list cards (JournalEntriesScreen.tsx)</w:t>
+      </w:r>
+    </w:p>
+    <w:p>
+      <w:pPr>
+        <w:pStyle w:val="ListParagraph"/>
+        <w:numPr>
+          <w:ilvl w:val="1"/>
+          <w:numId w:val="1"/>
+        </w:numPr>
+        <w:spacing w:after="40"/>
+      </w:pPr>
+      <w:r>
+        <w:rPr>
+          <w:color w:val="1D2D3E"/>
+          <w:sz w:val="22"/>
+          <w:szCs w:val="22"/>
+        </w:rPr>
+        <w:t xml:space="preserve">  Narrations longer than 80 chars show truncated with show-more chevron</w:t>
+      </w:r>
+    </w:p>
+    <w:p>
+      <w:pPr>
+        <w:pStyle w:val="ListParagraph"/>
+        <w:numPr>
+          <w:ilvl w:val="1"/>
+          <w:numId w:val="1"/>
+        </w:numPr>
+        <w:spacing w:after="40"/>
+      </w:pPr>
+      <w:r>
+        <w:rPr>
+          <w:color w:val="1D2D3E"/>
+          <w:sz w:val="22"/>
+          <w:szCs w:val="22"/>
+        </w:rPr>
+        <w:t xml:space="preserve">  Tapping the narration area expands to full text; tapping again collapses</w:t>
+      </w:r>
+    </w:p>
+    <w:p>
+      <w:pPr>
+        <w:pStyle w:val="ListParagraph"/>
+        <w:numPr>
+          <w:ilvl w:val="1"/>
+          <w:numId w:val="1"/>
+        </w:numPr>
+        <w:spacing w:after="40"/>
+      </w:pPr>
+      <w:r>
+        <w:rPr>
+          <w:color w:val="1D2D3E"/>
+          <w:sz w:val="22"/>
+          <w:szCs w:val="22"/>
+        </w:rPr>
+        <w:t xml:space="preserve">  Full card tap still navigates to JE detail (not affected by expansion)</w:t>
       </w:r>
     </w:p>
     <w:p>

</xml_diff>

<commit_message>
docs(session-33): update PROGRESS.md, generate-docs.js, and FEATURES.docx with Session 33 changelog
- PROGRESS.md: Session 33 section — drill-through, due soon alerts, notifications, settings
- generate-docs.js: roadmap table rows + Section 3 entries + Session 33 changelog section
- FEATURES.docx: regenerated with all Session 33 content
</commit_message>
<xml_diff>
--- a/FEATURES.docx
+++ b/FEATURES.docx
@@ -19553,6 +19553,310 @@
           </w:p>
         </w:tc>
       </w:tr>
+      <w:tr>
+        <w:tc>
+          <w:p>
+            <w:pPr>
+              <w:spacing w:after="40" w:before="40"/>
+            </w:pPr>
+            <w:r>
+              <w:rPr>
+                <w:b w:val="false"/>
+                <w:bCs w:val="false"/>
+                <w:color w:val="1D2D3E"/>
+                <w:sz w:val="20"/>
+                <w:szCs w:val="20"/>
+              </w:rPr>
+              <w:t xml:space="preserve">Session 33</w:t>
+            </w:r>
+          </w:p>
+        </w:tc>
+        <w:tc>
+          <w:p>
+            <w:pPr>
+              <w:spacing w:after="40" w:before="40"/>
+            </w:pPr>
+            <w:r>
+              <w:rPr>
+                <w:b w:val="false"/>
+                <w:bCs w:val="false"/>
+                <w:color w:val="1D2D3E"/>
+                <w:sz w:val="20"/>
+                <w:szCs w:val="20"/>
+              </w:rPr>
+              <w:t xml:space="preserve">Financial Analytics → AP/AR/VendorDetail/CustomerDetail drill-through navigation</w:t>
+            </w:r>
+          </w:p>
+        </w:tc>
+        <w:tc>
+          <w:p>
+            <w:pPr>
+              <w:spacing w:after="40" w:before="40"/>
+            </w:pPr>
+            <w:r>
+              <w:rPr>
+                <w:b w:val="false"/>
+                <w:bCs w:val="false"/>
+                <w:color w:val="1D2D3E"/>
+                <w:sz w:val="20"/>
+                <w:szCs w:val="20"/>
+              </w:rPr>
+              <w:t xml:space="preserve">Done</w:t>
+            </w:r>
+          </w:p>
+        </w:tc>
+        <w:tc>
+          <w:p>
+            <w:pPr>
+              <w:spacing w:after="40" w:before="40"/>
+            </w:pPr>
+            <w:r>
+              <w:rPr>
+                <w:b w:val="false"/>
+                <w:bCs w:val="false"/>
+                <w:color w:val="1D2D3E"/>
+                <w:sz w:val="20"/>
+                <w:szCs w:val="20"/>
+              </w:rPr>
+              <w:t xml:space="preserve">FinancialAnalyticsScreen.tsx</w:t>
+            </w:r>
+          </w:p>
+        </w:tc>
+      </w:tr>
+      <w:tr>
+        <w:tc>
+          <w:tcPr>
+            <w:shd w:color="F0F4F8" w:val="solid"/>
+          </w:tcPr>
+          <w:p>
+            <w:pPr>
+              <w:spacing w:after="40" w:before="40"/>
+            </w:pPr>
+            <w:r>
+              <w:rPr>
+                <w:b w:val="false"/>
+                <w:bCs w:val="false"/>
+                <w:color w:val="1D2D3E"/>
+                <w:sz w:val="20"/>
+                <w:szCs w:val="20"/>
+              </w:rPr>
+              <w:t xml:space="preserve">Session 33</w:t>
+            </w:r>
+          </w:p>
+        </w:tc>
+        <w:tc>
+          <w:tcPr>
+            <w:shd w:color="F0F4F8" w:val="solid"/>
+          </w:tcPr>
+          <w:p>
+            <w:pPr>
+              <w:spacing w:after="40" w:before="40"/>
+            </w:pPr>
+            <w:r>
+              <w:rPr>
+                <w:b w:val="false"/>
+                <w:bCs w:val="false"/>
+                <w:color w:val="1D2D3E"/>
+                <w:sz w:val="20"/>
+                <w:szCs w:val="20"/>
+              </w:rPr>
+              <w:t xml:space="preserve">Due Soon alerts — bills/invoices due within N days shown as new alert section</w:t>
+            </w:r>
+          </w:p>
+        </w:tc>
+        <w:tc>
+          <w:tcPr>
+            <w:shd w:color="F0F4F8" w:val="solid"/>
+          </w:tcPr>
+          <w:p>
+            <w:pPr>
+              <w:spacing w:after="40" w:before="40"/>
+            </w:pPr>
+            <w:r>
+              <w:rPr>
+                <w:b w:val="false"/>
+                <w:bCs w:val="false"/>
+                <w:color w:val="1D2D3E"/>
+                <w:sz w:val="20"/>
+                <w:szCs w:val="20"/>
+              </w:rPr>
+              <w:t xml:space="preserve">Done</w:t>
+            </w:r>
+          </w:p>
+        </w:tc>
+        <w:tc>
+          <w:tcPr>
+            <w:shd w:color="F0F4F8" w:val="solid"/>
+          </w:tcPr>
+          <w:p>
+            <w:pPr>
+              <w:spacing w:after="40" w:before="40"/>
+            </w:pPr>
+            <w:r>
+              <w:rPr>
+                <w:b w:val="false"/>
+                <w:bCs w:val="false"/>
+                <w:color w:val="1D2D3E"/>
+                <w:sz w:val="20"/>
+                <w:szCs w:val="20"/>
+              </w:rPr>
+              <w:t xml:space="preserve">AlertsScreen.tsx + OverdueContext.tsx</w:t>
+            </w:r>
+          </w:p>
+        </w:tc>
+      </w:tr>
+      <w:tr>
+        <w:tc>
+          <w:p>
+            <w:pPr>
+              <w:spacing w:after="40" w:before="40"/>
+            </w:pPr>
+            <w:r>
+              <w:rPr>
+                <w:b w:val="false"/>
+                <w:bCs w:val="false"/>
+                <w:color w:val="1D2D3E"/>
+                <w:sz w:val="20"/>
+                <w:szCs w:val="20"/>
+              </w:rPr>
+              <w:t xml:space="preserve">Session 33</w:t>
+            </w:r>
+          </w:p>
+        </w:tc>
+        <w:tc>
+          <w:p>
+            <w:pPr>
+              <w:spacing w:after="40" w:before="40"/>
+            </w:pPr>
+            <w:r>
+              <w:rPr>
+                <w:b w:val="false"/>
+                <w:bCs w:val="false"/>
+                <w:color w:val="1D2D3E"/>
+                <w:sz w:val="20"/>
+                <w:szCs w:val="20"/>
+              </w:rPr>
+              <w:t xml:space="preserve">Due Soon notification — separate daily push notification for upcoming payments</w:t>
+            </w:r>
+          </w:p>
+        </w:tc>
+        <w:tc>
+          <w:p>
+            <w:pPr>
+              <w:spacing w:after="40" w:before="40"/>
+            </w:pPr>
+            <w:r>
+              <w:rPr>
+                <w:b w:val="false"/>
+                <w:bCs w:val="false"/>
+                <w:color w:val="1D2D3E"/>
+                <w:sz w:val="20"/>
+                <w:szCs w:val="20"/>
+              </w:rPr>
+              <w:t xml:space="preserve">Done</w:t>
+            </w:r>
+          </w:p>
+        </w:tc>
+        <w:tc>
+          <w:p>
+            <w:pPr>
+              <w:spacing w:after="40" w:before="40"/>
+            </w:pPr>
+            <w:r>
+              <w:rPr>
+                <w:b w:val="false"/>
+                <w:bCs w:val="false"/>
+                <w:color w:val="1D2D3E"/>
+                <w:sz w:val="20"/>
+                <w:szCs w:val="20"/>
+              </w:rPr>
+              <w:t xml:space="preserve">notifications.ts scheduleDueSoonReminder()</w:t>
+            </w:r>
+          </w:p>
+        </w:tc>
+      </w:tr>
+      <w:tr>
+        <w:tc>
+          <w:tcPr>
+            <w:shd w:color="F0F4F8" w:val="solid"/>
+          </w:tcPr>
+          <w:p>
+            <w:pPr>
+              <w:spacing w:after="40" w:before="40"/>
+            </w:pPr>
+            <w:r>
+              <w:rPr>
+                <w:b w:val="false"/>
+                <w:bCs w:val="false"/>
+                <w:color w:val="1D2D3E"/>
+                <w:sz w:val="20"/>
+                <w:szCs w:val="20"/>
+              </w:rPr>
+              <w:t xml:space="preserve">Session 33</w:t>
+            </w:r>
+          </w:p>
+        </w:tc>
+        <w:tc>
+          <w:tcPr>
+            <w:shd w:color="F0F4F8" w:val="solid"/>
+          </w:tcPr>
+          <w:p>
+            <w:pPr>
+              <w:spacing w:after="40" w:before="40"/>
+            </w:pPr>
+            <w:r>
+              <w:rPr>
+                <w:b w:val="false"/>
+                <w:bCs w:val="false"/>
+                <w:color w:val="1D2D3E"/>
+                <w:sz w:val="20"/>
+                <w:szCs w:val="20"/>
+              </w:rPr>
+              <w:t xml:space="preserve">Settings: Due Soon window picker (1/3/7/14/30 days) + notification toggle</w:t>
+            </w:r>
+          </w:p>
+        </w:tc>
+        <w:tc>
+          <w:tcPr>
+            <w:shd w:color="F0F4F8" w:val="solid"/>
+          </w:tcPr>
+          <w:p>
+            <w:pPr>
+              <w:spacing w:after="40" w:before="40"/>
+            </w:pPr>
+            <w:r>
+              <w:rPr>
+                <w:b w:val="false"/>
+                <w:bCs w:val="false"/>
+                <w:color w:val="1D2D3E"/>
+                <w:sz w:val="20"/>
+                <w:szCs w:val="20"/>
+              </w:rPr>
+              <w:t xml:space="preserve">Done</w:t>
+            </w:r>
+          </w:p>
+        </w:tc>
+        <w:tc>
+          <w:tcPr>
+            <w:shd w:color="F0F4F8" w:val="solid"/>
+          </w:tcPr>
+          <w:p>
+            <w:pPr>
+              <w:spacing w:after="40" w:before="40"/>
+            </w:pPr>
+            <w:r>
+              <w:rPr>
+                <w:b w:val="false"/>
+                <w:bCs w:val="false"/>
+                <w:color w:val="1D2D3E"/>
+                <w:sz w:val="20"/>
+                <w:szCs w:val="20"/>
+              </w:rPr>
+              <w:t xml:space="preserve">settings.ts + SettingsScreen.tsx</w:t>
+            </w:r>
+          </w:p>
+        </w:tc>
+      </w:tr>
     </w:tbl>
     <w:p>
       <w:pPr>
@@ -20589,6 +20893,96 @@
           <w:szCs w:val="22"/>
         </w:rPr>
         <w:t xml:space="preserve">src/screens/analytics/FinancialAnalyticsScreen.tsx — Financial Analytics: net position card (AR − AP), AP aging chart, AR aging chart, top-5 vendors by outstanding, top-5 customers by outstanding, PDF export via exportFinancialAnalyticsPDF() (Session 32)</w:t>
+      </w:r>
+    </w:p>
+    <w:p>
+      <w:pPr>
+        <w:pStyle w:val="ListParagraph"/>
+        <w:numPr>
+          <w:ilvl w:val="0"/>
+          <w:numId w:val="1"/>
+        </w:numPr>
+        <w:spacing w:after="40"/>
+      </w:pPr>
+      <w:r>
+        <w:rPr>
+          <w:color w:val="1D2D3E"/>
+          <w:sz w:val="22"/>
+          <w:szCs w:val="22"/>
+        </w:rPr>
+        <w:t xml:space="preserve">Financial Analytics drill-through (Session 33): AP/AR section headers + summary tiles tap → cross-tab Finance &gt; AP/AR screens; PartnerRankList vendor/customer rows tap → VendorDetail/CustomerDetail with outstanding/overdue params</w:t>
+      </w:r>
+    </w:p>
+    <w:p>
+      <w:pPr>
+        <w:pStyle w:val="ListParagraph"/>
+        <w:numPr>
+          <w:ilvl w:val="0"/>
+          <w:numId w:val="1"/>
+        </w:numPr>
+        <w:spacing w:after="40"/>
+      </w:pPr>
+      <w:r>
+        <w:rPr>
+          <w:color w:val="1D2D3E"/>
+          <w:sz w:val="22"/>
+          <w:szCs w:val="22"/>
+        </w:rPr>
+        <w:t xml:space="preserve">AlertsScreen 'Due Soon' sections (Session 33): bills and invoices due within configurable N days shown below overdue sections; UPCOMING divider; dashed chips with 'Xd left'/'due today'; daysDueIn() helper; all-clear updated to check 5 categories</w:t>
+      </w:r>
+    </w:p>
+    <w:p>
+      <w:pPr>
+        <w:pStyle w:val="ListParagraph"/>
+        <w:numPr>
+          <w:ilvl w:val="0"/>
+          <w:numId w:val="1"/>
+        </w:numPr>
+        <w:spacing w:after="40"/>
+      </w:pPr>
+      <w:r>
+        <w:rPr>
+          <w:color w:val="1D2D3E"/>
+          <w:sz w:val="22"/>
+          <w:szCs w:val="22"/>
+        </w:rPr>
+        <w:t xml:space="preserve">notifications.ts scheduleDueSoonReminder (Session 33): separate daily notification for upcoming payments; fires 30 min after overdue reminder hour; respects getNotifyDueSoon() setting; cancelDueSoonReminder() counterpart</w:t>
+      </w:r>
+    </w:p>
+    <w:p>
+      <w:pPr>
+        <w:pStyle w:val="ListParagraph"/>
+        <w:numPr>
+          <w:ilvl w:val="0"/>
+          <w:numId w:val="1"/>
+        </w:numPr>
+        <w:spacing w:after="40"/>
+      </w:pPr>
+      <w:r>
+        <w:rPr>
+          <w:color w:val="1D2D3E"/>
+          <w:sz w:val="22"/>
+          <w:szCs w:val="22"/>
+        </w:rPr>
+        <w:t xml:space="preserve">settings.ts: getDueSoonDays/setDueSoonDays (1/3/7/14/30d default 7) + getNotifyDueSoon/setNotifyDueSoon — configures 'Due Soon' alert window (Session 33)</w:t>
+      </w:r>
+    </w:p>
+    <w:p>
+      <w:pPr>
+        <w:pStyle w:val="ListParagraph"/>
+        <w:numPr>
+          <w:ilvl w:val="0"/>
+          <w:numId w:val="1"/>
+        </w:numPr>
+        <w:spacing w:after="40"/>
+      </w:pPr>
+      <w:r>
+        <w:rPr>
+          <w:color w:val="1D2D3E"/>
+          <w:sz w:val="22"/>
+          <w:szCs w:val="22"/>
+        </w:rPr>
+        <w:t xml:space="preserve">OverdueContext: apDueSoon + arDueSoon counts added with setters; AlertsScreen publishes counts; AppNavigator schedules due-soon reminder on context changes (Session 33)</w:t>
       </w:r>
     </w:p>
     <w:p>
@@ -24329,6 +24723,555 @@
           <w:szCs w:val="22"/>
         </w:rPr>
         <w:t xml:space="preserve">  Tapping a history row repopulates the query field</w:t>
+      </w:r>
+    </w:p>
+    <w:p>
+      <w:pPr>
+        <w:spacing w:after="80"/>
+      </w:pPr>
+      <w:r>
+        <w:rPr>
+          <w:color w:val="1D2D3E"/>
+          <w:sz w:val="22"/>
+          <w:szCs w:val="22"/>
+        </w:rPr>
+        <w:t xml:space="preserve"/>
+      </w:r>
+    </w:p>
+    <w:p>
+      <w:pPr>
+        <w:pStyle w:val="Heading2"/>
+        <w:spacing w:after="120" w:before="300"/>
+      </w:pPr>
+      <w:r>
+        <w:rPr>
+          <w:b/>
+          <w:bCs/>
+          <w:color w:val="1D2D3E"/>
+        </w:rPr>
+        <w:t xml:space="preserve">Session 33 — 2026-05-30</w:t>
+      </w:r>
+    </w:p>
+    <w:p>
+      <w:pPr>
+        <w:pStyle w:val="ListParagraph"/>
+        <w:numPr>
+          <w:ilvl w:val="0"/>
+          <w:numId w:val="1"/>
+        </w:numPr>
+        <w:spacing w:after="40"/>
+      </w:pPr>
+      <w:r>
+        <w:rPr>
+          <w:color w:val="1D2D3E"/>
+          <w:sz w:val="22"/>
+          <w:szCs w:val="22"/>
+        </w:rPr>
+        <w:t xml:space="preserve">Financial Analytics drill-through navigation (FinancialAnalyticsScreen.tsx)</w:t>
+      </w:r>
+    </w:p>
+    <w:p>
+      <w:pPr>
+        <w:pStyle w:val="ListParagraph"/>
+        <w:numPr>
+          <w:ilvl w:val="1"/>
+          <w:numId w:val="1"/>
+        </w:numPr>
+        <w:spacing w:after="40"/>
+      </w:pPr>
+      <w:r>
+        <w:rPr>
+          <w:color w:val="1D2D3E"/>
+          <w:sz w:val="22"/>
+          <w:szCs w:val="22"/>
+        </w:rPr>
+        <w:t xml:space="preserve">  AP section header + summary tiles → tap navigates cross-tab to Finance &gt; AccountsPayable</w:t>
+      </w:r>
+    </w:p>
+    <w:p>
+      <w:pPr>
+        <w:pStyle w:val="ListParagraph"/>
+        <w:numPr>
+          <w:ilvl w:val="1"/>
+          <w:numId w:val="1"/>
+        </w:numPr>
+        <w:spacing w:after="40"/>
+      </w:pPr>
+      <w:r>
+        <w:rPr>
+          <w:color w:val="1D2D3E"/>
+          <w:sz w:val="22"/>
+          <w:szCs w:val="22"/>
+        </w:rPr>
+        <w:t xml:space="preserve">  AR section header + summary tiles → tap navigates cross-tab to Finance &gt; AccountsReceivable</w:t>
+      </w:r>
+    </w:p>
+    <w:p>
+      <w:pPr>
+        <w:pStyle w:val="ListParagraph"/>
+        <w:numPr>
+          <w:ilvl w:val="1"/>
+          <w:numId w:val="1"/>
+        </w:numPr>
+        <w:spacing w:after="40"/>
+      </w:pPr>
+      <w:r>
+        <w:rPr>
+          <w:color w:val="1D2D3E"/>
+          <w:sz w:val="22"/>
+          <w:szCs w:val="22"/>
+        </w:rPr>
+        <w:t xml:space="preserve">  Top Vendors rank list rows → tap navigates to Finance &gt; VendorDetail with outstanding/overdue params</w:t>
+      </w:r>
+    </w:p>
+    <w:p>
+      <w:pPr>
+        <w:pStyle w:val="ListParagraph"/>
+        <w:numPr>
+          <w:ilvl w:val="1"/>
+          <w:numId w:val="1"/>
+        </w:numPr>
+        <w:spacing w:after="40"/>
+      </w:pPr>
+      <w:r>
+        <w:rPr>
+          <w:color w:val="1D2D3E"/>
+          <w:sz w:val="22"/>
+          <w:szCs w:val="22"/>
+        </w:rPr>
+        <w:t xml:space="preserve">  Top Customers rank list rows → tap navigates to Finance &gt; CustomerDetail</w:t>
+      </w:r>
+    </w:p>
+    <w:p>
+      <w:pPr>
+        <w:pStyle w:val="ListParagraph"/>
+        <w:numPr>
+          <w:ilvl w:val="1"/>
+          <w:numId w:val="1"/>
+        </w:numPr>
+        <w:spacing w:after="40"/>
+      </w:pPr>
+      <w:r>
+        <w:rPr>
+          <w:color w:val="1D2D3E"/>
+          <w:sz w:val="22"/>
+          <w:szCs w:val="22"/>
+        </w:rPr>
+        <w:t xml:space="preserve">  PartnerRankList updated: optional onPress per item + chevron-right indicator</w:t>
+      </w:r>
+    </w:p>
+    <w:p>
+      <w:pPr>
+        <w:pStyle w:val="ListParagraph"/>
+        <w:numPr>
+          <w:ilvl w:val="1"/>
+          <w:numId w:val="1"/>
+        </w:numPr>
+        <w:spacing w:after="40"/>
+      </w:pPr>
+      <w:r>
+        <w:rPr>
+          <w:color w:val="1D2D3E"/>
+          <w:sz w:val="22"/>
+          <w:szCs w:val="22"/>
+        </w:rPr>
+        <w:t xml:space="preserve">  Cross-tab navigation via getParent&lt;TabNav&gt;().navigate('Finance', { screen, params })</w:t>
+      </w:r>
+    </w:p>
+    <w:p>
+      <w:pPr>
+        <w:pStyle w:val="ListParagraph"/>
+        <w:numPr>
+          <w:ilvl w:val="0"/>
+          <w:numId w:val="1"/>
+        </w:numPr>
+        <w:spacing w:after="40"/>
+      </w:pPr>
+      <w:r>
+        <w:rPr>
+          <w:color w:val="1D2D3E"/>
+          <w:sz w:val="22"/>
+          <w:szCs w:val="22"/>
+        </w:rPr>
+        <w:t xml:space="preserve">Due Soon alerts in AlertsScreen (AlertsScreen.tsx)</w:t>
+      </w:r>
+    </w:p>
+    <w:p>
+      <w:pPr>
+        <w:pStyle w:val="ListParagraph"/>
+        <w:numPr>
+          <w:ilvl w:val="1"/>
+          <w:numId w:val="1"/>
+        </w:numPr>
+        <w:spacing w:after="40"/>
+      </w:pPr>
+      <w:r>
+        <w:rPr>
+          <w:color w:val="1D2D3E"/>
+          <w:sz w:val="22"/>
+          <w:szCs w:val="22"/>
+        </w:rPr>
+        <w:t xml:space="preserve">  New 'Bills Due in N Days (AP)' section showing upcoming bills (not yet overdue) within configurable window</w:t>
+      </w:r>
+    </w:p>
+    <w:p>
+      <w:pPr>
+        <w:pStyle w:val="ListParagraph"/>
+        <w:numPr>
+          <w:ilvl w:val="1"/>
+          <w:numId w:val="1"/>
+        </w:numPr>
+        <w:spacing w:after="40"/>
+      </w:pPr>
+      <w:r>
+        <w:rPr>
+          <w:color w:val="1D2D3E"/>
+          <w:sz w:val="22"/>
+          <w:szCs w:val="22"/>
+        </w:rPr>
+        <w:t xml:space="preserve">  New 'Invoices Due in N Days (AR)' section showing upcoming invoices</w:t>
+      </w:r>
+    </w:p>
+    <w:p>
+      <w:pPr>
+        <w:pStyle w:val="ListParagraph"/>
+        <w:numPr>
+          <w:ilvl w:val="1"/>
+          <w:numId w:val="1"/>
+        </w:numPr>
+        <w:spacing w:after="40"/>
+      </w:pPr>
+      <w:r>
+        <w:rPr>
+          <w:color w:val="1D2D3E"/>
+          <w:sz w:val="22"/>
+          <w:szCs w:val="22"/>
+        </w:rPr>
+        <w:t xml:space="preserve">  daysDueIn() helper: returns positive days-until-due for upcoming, −9999 for paid/closed/cancelled</w:t>
+      </w:r>
+    </w:p>
+    <w:p>
+      <w:pPr>
+        <w:pStyle w:val="ListParagraph"/>
+        <w:numPr>
+          <w:ilvl w:val="1"/>
+          <w:numId w:val="1"/>
+        </w:numPr>
+        <w:spacing w:after="40"/>
+      </w:pPr>
+      <w:r>
+        <w:rPr>
+          <w:color w:val="1D2D3E"/>
+          <w:sz w:val="22"/>
+          <w:szCs w:val="22"/>
+        </w:rPr>
+        <w:t xml:space="preserve">  Items sorted soonest-first; dashed chip badge shows 'Xd left' or 'due today'</w:t>
+      </w:r>
+    </w:p>
+    <w:p>
+      <w:pPr>
+        <w:pStyle w:val="ListParagraph"/>
+        <w:numPr>
+          <w:ilvl w:val="1"/>
+          <w:numId w:val="1"/>
+        </w:numPr>
+        <w:spacing w:after="40"/>
+      </w:pPr>
+      <w:r>
+        <w:rPr>
+          <w:color w:val="1D2D3E"/>
+          <w:sz w:val="22"/>
+          <w:szCs w:val="22"/>
+        </w:rPr>
+        <w:t xml:space="preserve">  UPCOMING divider row separates urgent overdue items from informational due-soon section</w:t>
+      </w:r>
+    </w:p>
+    <w:p>
+      <w:pPr>
+        <w:pStyle w:val="ListParagraph"/>
+        <w:numPr>
+          <w:ilvl w:val="1"/>
+          <w:numId w:val="1"/>
+        </w:numPr>
+        <w:spacing w:after="40"/>
+      </w:pPr>
+      <w:r>
+        <w:rPr>
+          <w:color w:val="1D2D3E"/>
+          <w:sz w:val="22"/>
+          <w:szCs w:val="22"/>
+        </w:rPr>
+        <w:t xml:space="preserve">  'All clear' state now only shows when ALL 5 categories are empty (overdue+lowstock+due-soon)</w:t>
+      </w:r>
+    </w:p>
+    <w:p>
+      <w:pPr>
+        <w:pStyle w:val="ListParagraph"/>
+        <w:numPr>
+          <w:ilvl w:val="1"/>
+          <w:numId w:val="1"/>
+        </w:numPr>
+        <w:spacing w:after="40"/>
+      </w:pPr>
+      <w:r>
+        <w:rPr>
+          <w:color w:val="1D2D3E"/>
+          <w:sz w:val="22"/>
+          <w:szCs w:val="22"/>
+        </w:rPr>
+        <w:t xml:space="preserve">  Header shows overdue badge in black or due-soon badge in secondary gray</w:t>
+      </w:r>
+    </w:p>
+    <w:p>
+      <w:pPr>
+        <w:pStyle w:val="ListParagraph"/>
+        <w:numPr>
+          <w:ilvl w:val="0"/>
+          <w:numId w:val="1"/>
+        </w:numPr>
+        <w:spacing w:after="40"/>
+      </w:pPr>
+      <w:r>
+        <w:rPr>
+          <w:color w:val="1D2D3E"/>
+          <w:sz w:val="22"/>
+          <w:szCs w:val="22"/>
+        </w:rPr>
+        <w:t xml:space="preserve">OverdueContext extended (OverdueContext.tsx)</w:t>
+      </w:r>
+    </w:p>
+    <w:p>
+      <w:pPr>
+        <w:pStyle w:val="ListParagraph"/>
+        <w:numPr>
+          <w:ilvl w:val="1"/>
+          <w:numId w:val="1"/>
+        </w:numPr>
+        <w:spacing w:after="40"/>
+      </w:pPr>
+      <w:r>
+        <w:rPr>
+          <w:color w:val="1D2D3E"/>
+          <w:sz w:val="22"/>
+          <w:szCs w:val="22"/>
+        </w:rPr>
+        <w:t xml:space="preserve">  Added apDueSoon + arDueSoon count states with setAPDueSoon + setARDueSoon setters</w:t>
+      </w:r>
+    </w:p>
+    <w:p>
+      <w:pPr>
+        <w:pStyle w:val="ListParagraph"/>
+        <w:numPr>
+          <w:ilvl w:val="1"/>
+          <w:numId w:val="1"/>
+        </w:numPr>
+        <w:spacing w:after="40"/>
+      </w:pPr>
+      <w:r>
+        <w:rPr>
+          <w:color w:val="1D2D3E"/>
+          <w:sz w:val="22"/>
+          <w:szCs w:val="22"/>
+        </w:rPr>
+        <w:t xml:space="preserve">  AlertsScreen publishes due-soon counts to context on every load</w:t>
+      </w:r>
+    </w:p>
+    <w:p>
+      <w:pPr>
+        <w:pStyle w:val="ListParagraph"/>
+        <w:numPr>
+          <w:ilvl w:val="0"/>
+          <w:numId w:val="1"/>
+        </w:numPr>
+        <w:spacing w:after="40"/>
+      </w:pPr>
+      <w:r>
+        <w:rPr>
+          <w:color w:val="1D2D3E"/>
+          <w:sz w:val="22"/>
+          <w:szCs w:val="22"/>
+        </w:rPr>
+        <w:t xml:space="preserve">Due Soon push notification (notifications.ts)</w:t>
+      </w:r>
+    </w:p>
+    <w:p>
+      <w:pPr>
+        <w:pStyle w:val="ListParagraph"/>
+        <w:numPr>
+          <w:ilvl w:val="1"/>
+          <w:numId w:val="1"/>
+        </w:numPr>
+        <w:spacing w:after="40"/>
+      </w:pPr>
+      <w:r>
+        <w:rPr>
+          <w:color w:val="1D2D3E"/>
+          <w:sz w:val="22"/>
+          <w:szCs w:val="22"/>
+        </w:rPr>
+        <w:t xml:space="preserve">  scheduleDueSoonReminder({ apDueSoon, arDueSoon }): separate daily notification 30 min after overdue reminder</w:t>
+      </w:r>
+    </w:p>
+    <w:p>
+      <w:pPr>
+        <w:pStyle w:val="ListParagraph"/>
+        <w:numPr>
+          <w:ilvl w:val="1"/>
+          <w:numId w:val="1"/>
+        </w:numPr>
+        <w:spacing w:after="40"/>
+      </w:pPr>
+      <w:r>
+        <w:rPr>
+          <w:color w:val="1D2D3E"/>
+          <w:sz w:val="22"/>
+          <w:szCs w:val="22"/>
+        </w:rPr>
+        <w:t xml:space="preserve">  Respects getNotifyDueSoon() setting; cancels when total = 0 or setting disabled</w:t>
+      </w:r>
+    </w:p>
+    <w:p>
+      <w:pPr>
+        <w:pStyle w:val="ListParagraph"/>
+        <w:numPr>
+          <w:ilvl w:val="1"/>
+          <w:numId w:val="1"/>
+        </w:numPr>
+        <w:spacing w:after="40"/>
+      </w:pPr>
+      <w:r>
+        <w:rPr>
+          <w:color w:val="1D2D3E"/>
+          <w:sz w:val="22"/>
+          <w:szCs w:val="22"/>
+        </w:rPr>
+        <w:t xml:space="preserve">  Notification content: 'Upcoming payments' title + '3 bills due soon · 2 invoices due soon' body</w:t>
+      </w:r>
+    </w:p>
+    <w:p>
+      <w:pPr>
+        <w:pStyle w:val="ListParagraph"/>
+        <w:numPr>
+          <w:ilvl w:val="1"/>
+          <w:numId w:val="1"/>
+        </w:numPr>
+        <w:spacing w:after="40"/>
+      </w:pPr>
+      <w:r>
+        <w:rPr>
+          <w:color w:val="1D2D3E"/>
+          <w:sz w:val="22"/>
+          <w:szCs w:val="22"/>
+        </w:rPr>
+        <w:t xml:space="preserve">  cancelDueSoonReminder(): cancels the scheduled notification</w:t>
+      </w:r>
+    </w:p>
+    <w:p>
+      <w:pPr>
+        <w:pStyle w:val="ListParagraph"/>
+        <w:numPr>
+          <w:ilvl w:val="1"/>
+          <w:numId w:val="1"/>
+        </w:numPr>
+        <w:spacing w:after="40"/>
+      </w:pPr>
+      <w:r>
+        <w:rPr>
+          <w:color w:val="1D2D3E"/>
+          <w:sz w:val="22"/>
+          <w:szCs w:val="22"/>
+        </w:rPr>
+        <w:t xml:space="preserve">  AppNavigator: schedules due-soon reminder on [apDueSoon, arDueSoon] changes; tap navigates to Alerts screen</w:t>
+      </w:r>
+    </w:p>
+    <w:p>
+      <w:pPr>
+        <w:pStyle w:val="ListParagraph"/>
+        <w:numPr>
+          <w:ilvl w:val="0"/>
+          <w:numId w:val="1"/>
+        </w:numPr>
+        <w:spacing w:after="40"/>
+      </w:pPr>
+      <w:r>
+        <w:rPr>
+          <w:color w:val="1D2D3E"/>
+          <w:sz w:val="22"/>
+          <w:szCs w:val="22"/>
+        </w:rPr>
+        <w:t xml:space="preserve">Settings: Due Soon configuration (SettingsScreen.tsx, settings.ts)</w:t>
+      </w:r>
+    </w:p>
+    <w:p>
+      <w:pPr>
+        <w:pStyle w:val="ListParagraph"/>
+        <w:numPr>
+          <w:ilvl w:val="1"/>
+          <w:numId w:val="1"/>
+        </w:numPr>
+        <w:spacing w:after="40"/>
+      </w:pPr>
+      <w:r>
+        <w:rPr>
+          <w:color w:val="1D2D3E"/>
+          <w:sz w:val="22"/>
+          <w:szCs w:val="22"/>
+        </w:rPr>
+        <w:t xml:space="preserve">  getDueSoonDays() / setDueSoonDays(): configurable window 1/3/7/14/30 days, default 7</w:t>
+      </w:r>
+    </w:p>
+    <w:p>
+      <w:pPr>
+        <w:pStyle w:val="ListParagraph"/>
+        <w:numPr>
+          <w:ilvl w:val="1"/>
+          <w:numId w:val="1"/>
+        </w:numPr>
+        <w:spacing w:after="40"/>
+      </w:pPr>
+      <w:r>
+        <w:rPr>
+          <w:color w:val="1D2D3E"/>
+          <w:sz w:val="22"/>
+          <w:szCs w:val="22"/>
+        </w:rPr>
+        <w:t xml:space="preserve">  getNotifyDueSoon() / setNotifyDueSoon(): toggle for due-soon push notifications, default true</w:t>
+      </w:r>
+    </w:p>
+    <w:p>
+      <w:pPr>
+        <w:pStyle w:val="ListParagraph"/>
+        <w:numPr>
+          <w:ilvl w:val="1"/>
+          <w:numId w:val="1"/>
+        </w:numPr>
+        <w:spacing w:after="40"/>
+      </w:pPr>
+      <w:r>
+        <w:rPr>
+          <w:color w:val="1D2D3E"/>
+          <w:sz w:val="22"/>
+          <w:szCs w:val="22"/>
+        </w:rPr>
+        <w:t xml:space="preserve">  New 'Upcoming payments (due soon)' Switch in NOTIFICATIONS section (after low-stock toggle)</w:t>
+      </w:r>
+    </w:p>
+    <w:p>
+      <w:pPr>
+        <w:pStyle w:val="ListParagraph"/>
+        <w:numPr>
+          <w:ilvl w:val="1"/>
+          <w:numId w:val="1"/>
+        </w:numPr>
+        <w:spacing w:after="40"/>
+      </w:pPr>
+      <w:r>
+        <w:rPr>
+          <w:color w:val="1D2D3E"/>
+          <w:sz w:val="22"/>
+          <w:szCs w:val="22"/>
+        </w:rPr>
+        <w:t xml:space="preserve">  New 'ALERTS — DUE SOON WINDOW' section in SettingsScreen with 5-chip day picker</w:t>
       </w:r>
     </w:p>
     <w:p>

</xml_diff>

<commit_message>
docs(session-34): update PROGRESS.md, generate-docs.js, and FEATURES.docx with Session 34 changelog
</commit_message>
<xml_diff>
--- a/FEATURES.docx
+++ b/FEATURES.docx
@@ -45,7 +45,7 @@
           <w:sz w:val="20"/>
           <w:szCs w:val="20"/>
         </w:rPr>
-        <w:t xml:space="preserve">Generated: 2026-05-30</w:t>
+        <w:t xml:space="preserve">Generated: 2026-05-31</w:t>
       </w:r>
     </w:p>
     <w:p>
@@ -19857,6 +19857,310 @@
           </w:p>
         </w:tc>
       </w:tr>
+      <w:tr>
+        <w:tc>
+          <w:p>
+            <w:pPr>
+              <w:spacing w:after="40" w:before="40"/>
+            </w:pPr>
+            <w:r>
+              <w:rPr>
+                <w:b w:val="false"/>
+                <w:bCs w:val="false"/>
+                <w:color w:val="1D2D3E"/>
+                <w:sz w:val="20"/>
+                <w:szCs w:val="20"/>
+              </w:rPr>
+              <w:t xml:space="preserve">Session 34</w:t>
+            </w:r>
+          </w:p>
+        </w:tc>
+        <w:tc>
+          <w:p>
+            <w:pPr>
+              <w:spacing w:after="40" w:before="40"/>
+            </w:pPr>
+            <w:r>
+              <w:rPr>
+                <w:b w:val="false"/>
+                <w:bCs w:val="false"/>
+                <w:color w:val="1D2D3E"/>
+                <w:sz w:val="20"/>
+                <w:szCs w:val="20"/>
+              </w:rPr>
+              <w:t xml:space="preserve">Dashboard 'Upcoming Payments' section — DueSoonPaymentsSection component</w:t>
+            </w:r>
+          </w:p>
+        </w:tc>
+        <w:tc>
+          <w:p>
+            <w:pPr>
+              <w:spacing w:after="40" w:before="40"/>
+            </w:pPr>
+            <w:r>
+              <w:rPr>
+                <w:b w:val="false"/>
+                <w:bCs w:val="false"/>
+                <w:color w:val="1D2D3E"/>
+                <w:sz w:val="20"/>
+                <w:szCs w:val="20"/>
+              </w:rPr>
+              <w:t xml:space="preserve">Done</w:t>
+            </w:r>
+          </w:p>
+        </w:tc>
+        <w:tc>
+          <w:p>
+            <w:pPr>
+              <w:spacing w:after="40" w:before="40"/>
+            </w:pPr>
+            <w:r>
+              <w:rPr>
+                <w:b w:val="false"/>
+                <w:bCs w:val="false"/>
+                <w:color w:val="1D2D3E"/>
+                <w:sz w:val="20"/>
+                <w:szCs w:val="20"/>
+              </w:rPr>
+              <w:t xml:space="preserve">DueSoonPaymentsSection.tsx + DashboardScreen.tsx</w:t>
+            </w:r>
+          </w:p>
+        </w:tc>
+      </w:tr>
+      <w:tr>
+        <w:tc>
+          <w:tcPr>
+            <w:shd w:color="F0F4F8" w:val="solid"/>
+          </w:tcPr>
+          <w:p>
+            <w:pPr>
+              <w:spacing w:after="40" w:before="40"/>
+            </w:pPr>
+            <w:r>
+              <w:rPr>
+                <w:b w:val="false"/>
+                <w:bCs w:val="false"/>
+                <w:color w:val="1D2D3E"/>
+                <w:sz w:val="20"/>
+                <w:szCs w:val="20"/>
+              </w:rPr>
+              <w:t xml:space="preserve">Session 34</w:t>
+            </w:r>
+          </w:p>
+        </w:tc>
+        <w:tc>
+          <w:tcPr>
+            <w:shd w:color="F0F4F8" w:val="solid"/>
+          </w:tcPr>
+          <w:p>
+            <w:pPr>
+              <w:spacing w:after="40" w:before="40"/>
+            </w:pPr>
+            <w:r>
+              <w:rPr>
+                <w:b w:val="false"/>
+                <w:bCs w:val="false"/>
+                <w:color w:val="1D2D3E"/>
+                <w:sz w:val="20"/>
+                <w:szCs w:val="20"/>
+              </w:rPr>
+              <w:t xml:space="preserve">Global search: AP bills + AR invoices as searchable types → VendorDetail/CustomerDetail navigation</w:t>
+            </w:r>
+          </w:p>
+        </w:tc>
+        <w:tc>
+          <w:tcPr>
+            <w:shd w:color="F0F4F8" w:val="solid"/>
+          </w:tcPr>
+          <w:p>
+            <w:pPr>
+              <w:spacing w:after="40" w:before="40"/>
+            </w:pPr>
+            <w:r>
+              <w:rPr>
+                <w:b w:val="false"/>
+                <w:bCs w:val="false"/>
+                <w:color w:val="1D2D3E"/>
+                <w:sz w:val="20"/>
+                <w:szCs w:val="20"/>
+              </w:rPr>
+              <w:t xml:space="preserve">Done</w:t>
+            </w:r>
+          </w:p>
+        </w:tc>
+        <w:tc>
+          <w:tcPr>
+            <w:shd w:color="F0F4F8" w:val="solid"/>
+          </w:tcPr>
+          <w:p>
+            <w:pPr>
+              <w:spacing w:after="40" w:before="40"/>
+            </w:pPr>
+            <w:r>
+              <w:rPr>
+                <w:b w:val="false"/>
+                <w:bCs w:val="false"/>
+                <w:color w:val="1D2D3E"/>
+                <w:sz w:val="20"/>
+                <w:szCs w:val="20"/>
+              </w:rPr>
+              <w:t xml:space="preserve">SearchScreen.tsx</w:t>
+            </w:r>
+          </w:p>
+        </w:tc>
+      </w:tr>
+      <w:tr>
+        <w:tc>
+          <w:p>
+            <w:pPr>
+              <w:spacing w:after="40" w:before="40"/>
+            </w:pPr>
+            <w:r>
+              <w:rPr>
+                <w:b w:val="false"/>
+                <w:bCs w:val="false"/>
+                <w:color w:val="1D2D3E"/>
+                <w:sz w:val="20"/>
+                <w:szCs w:val="20"/>
+              </w:rPr>
+              <w:t xml:space="preserve">Session 34</w:t>
+            </w:r>
+          </w:p>
+        </w:tc>
+        <w:tc>
+          <w:p>
+            <w:pPr>
+              <w:spacing w:after="40" w:before="40"/>
+            </w:pPr>
+            <w:r>
+              <w:rPr>
+                <w:b w:val="false"/>
+                <w:bCs w:val="false"/>
+                <w:color w:val="1D2D3E"/>
+                <w:sz w:val="20"/>
+                <w:szCs w:val="20"/>
+              </w:rPr>
+              <w:t xml:space="preserve">AP/AR filter chips on Bills/Invoices tab: All | Overdue | Due Soon</w:t>
+            </w:r>
+          </w:p>
+        </w:tc>
+        <w:tc>
+          <w:p>
+            <w:pPr>
+              <w:spacing w:after="40" w:before="40"/>
+            </w:pPr>
+            <w:r>
+              <w:rPr>
+                <w:b w:val="false"/>
+                <w:bCs w:val="false"/>
+                <w:color w:val="1D2D3E"/>
+                <w:sz w:val="20"/>
+                <w:szCs w:val="20"/>
+              </w:rPr>
+              <w:t xml:space="preserve">Done</w:t>
+            </w:r>
+          </w:p>
+        </w:tc>
+        <w:tc>
+          <w:p>
+            <w:pPr>
+              <w:spacing w:after="40" w:before="40"/>
+            </w:pPr>
+            <w:r>
+              <w:rPr>
+                <w:b w:val="false"/>
+                <w:bCs w:val="false"/>
+                <w:color w:val="1D2D3E"/>
+                <w:sz w:val="20"/>
+                <w:szCs w:val="20"/>
+              </w:rPr>
+              <w:t xml:space="preserve">AccountsPayableScreen.tsx + AccountsReceivableScreen.tsx</w:t>
+            </w:r>
+          </w:p>
+        </w:tc>
+      </w:tr>
+      <w:tr>
+        <w:tc>
+          <w:tcPr>
+            <w:shd w:color="F0F4F8" w:val="solid"/>
+          </w:tcPr>
+          <w:p>
+            <w:pPr>
+              <w:spacing w:after="40" w:before="40"/>
+            </w:pPr>
+            <w:r>
+              <w:rPr>
+                <w:b w:val="false"/>
+                <w:bCs w:val="false"/>
+                <w:color w:val="1D2D3E"/>
+                <w:sz w:val="20"/>
+                <w:szCs w:val="20"/>
+              </w:rPr>
+              <w:t xml:space="preserve">Session 34</w:t>
+            </w:r>
+          </w:p>
+        </w:tc>
+        <w:tc>
+          <w:tcPr>
+            <w:shd w:color="F0F4F8" w:val="solid"/>
+          </w:tcPr>
+          <w:p>
+            <w:pPr>
+              <w:spacing w:after="40" w:before="40"/>
+            </w:pPr>
+            <w:r>
+              <w:rPr>
+                <w:b w:val="false"/>
+                <w:bCs w:val="false"/>
+                <w:color w:val="1D2D3E"/>
+                <w:sz w:val="20"/>
+                <w:szCs w:val="20"/>
+              </w:rPr>
+              <w:t xml:space="preserve">FinanceMenu due-soon outline badge on AP/AR rows</w:t>
+            </w:r>
+          </w:p>
+        </w:tc>
+        <w:tc>
+          <w:tcPr>
+            <w:shd w:color="F0F4F8" w:val="solid"/>
+          </w:tcPr>
+          <w:p>
+            <w:pPr>
+              <w:spacing w:after="40" w:before="40"/>
+            </w:pPr>
+            <w:r>
+              <w:rPr>
+                <w:b w:val="false"/>
+                <w:bCs w:val="false"/>
+                <w:color w:val="1D2D3E"/>
+                <w:sz w:val="20"/>
+                <w:szCs w:val="20"/>
+              </w:rPr>
+              <w:t xml:space="preserve">Done</w:t>
+            </w:r>
+          </w:p>
+        </w:tc>
+        <w:tc>
+          <w:tcPr>
+            <w:shd w:color="F0F4F8" w:val="solid"/>
+          </w:tcPr>
+          <w:p>
+            <w:pPr>
+              <w:spacing w:after="40" w:before="40"/>
+            </w:pPr>
+            <w:r>
+              <w:rPr>
+                <w:b w:val="false"/>
+                <w:bCs w:val="false"/>
+                <w:color w:val="1D2D3E"/>
+                <w:sz w:val="20"/>
+                <w:szCs w:val="20"/>
+              </w:rPr>
+              <w:t xml:space="preserve">FinanceMenuScreen.tsx</w:t>
+            </w:r>
+          </w:p>
+        </w:tc>
+      </w:tr>
     </w:tbl>
     <w:p>
       <w:pPr>
@@ -20983,6 +21287,78 @@
           <w:szCs w:val="22"/>
         </w:rPr>
         <w:t xml:space="preserve">OverdueContext: apDueSoon + arDueSoon counts added with setters; AlertsScreen publishes counts; AppNavigator schedules due-soon reminder on context changes (Session 33)</w:t>
+      </w:r>
+    </w:p>
+    <w:p>
+      <w:pPr>
+        <w:pStyle w:val="ListParagraph"/>
+        <w:numPr>
+          <w:ilvl w:val="0"/>
+          <w:numId w:val="1"/>
+        </w:numPr>
+        <w:spacing w:after="40"/>
+      </w:pPr>
+      <w:r>
+        <w:rPr>
+          <w:color w:val="1D2D3E"/>
+          <w:sz w:val="22"/>
+          <w:szCs w:val="22"/>
+        </w:rPr>
+        <w:t xml:space="preserve">src/components/DueSoonPaymentsSection.tsx — Dashboard 'Upcoming Payments' section (Session 34): shows AP bills + AR invoices due within configured window; reads from AP/AR cache (zero extra API calls); sorted by days-until-due; footer → CashFlow screen</w:t>
+      </w:r>
+    </w:p>
+    <w:p>
+      <w:pPr>
+        <w:pStyle w:val="ListParagraph"/>
+        <w:numPr>
+          <w:ilvl w:val="0"/>
+          <w:numId w:val="1"/>
+        </w:numPr>
+        <w:spacing w:after="40"/>
+      </w:pPr>
+      <w:r>
+        <w:rPr>
+          <w:color w:val="1D2D3E"/>
+          <w:sz w:val="22"/>
+          <w:szCs w:val="22"/>
+        </w:rPr>
+        <w:t xml:space="preserve">SearchScreen bill/invoice types (Session 34): 'bill' + 'invoice' ResultTypes added; sources data from AP/AR cache; bill tap → VendorDetail with vendorId/name/outstanding; invoice tap → CustomerDetail; fallback to AP/AR list screen when no ID</w:t>
+      </w:r>
+    </w:p>
+    <w:p>
+      <w:pPr>
+        <w:pStyle w:val="ListParagraph"/>
+        <w:numPr>
+          <w:ilvl w:val="0"/>
+          <w:numId w:val="1"/>
+        </w:numPr>
+        <w:spacing w:after="40"/>
+      </w:pPr>
+      <w:r>
+        <w:rPr>
+          <w:color w:val="1D2D3E"/>
+          <w:sz w:val="22"/>
+          <w:szCs w:val="22"/>
+        </w:rPr>
+        <w:t xml:space="preserve">AP/AR filter chips (Session 34): All | Overdue | Due Soon quick filter row added to AP Bills tab and AR Invoices tab; dueSoonDays read from settings; chip counts shown inline; daysDueIn() helper added to both screens</w:t>
+      </w:r>
+    </w:p>
+    <w:p>
+      <w:pPr>
+        <w:pStyle w:val="ListParagraph"/>
+        <w:numPr>
+          <w:ilvl w:val="0"/>
+          <w:numId w:val="1"/>
+        </w:numPr>
+        <w:spacing w:after="40"/>
+      </w:pPr>
+      <w:r>
+        <w:rPr>
+          <w:color w:val="1D2D3E"/>
+          <w:sz w:val="22"/>
+          <w:szCs w:val="22"/>
+        </w:rPr>
+        <w:t xml:space="preserve">FinanceMenu due-soon badge (Session 34): secondary outline badge on AP/AR rows showing apDueSoon/arDueSoon when overdue count = 0; uses OverdueContext</w:t>
       </w:r>
     </w:p>
     <w:p>
@@ -24723,6 +25099,339 @@
           <w:szCs w:val="22"/>
         </w:rPr>
         <w:t xml:space="preserve">  Tapping a history row repopulates the query field</w:t>
+      </w:r>
+    </w:p>
+    <w:p>
+      <w:pPr>
+        <w:spacing w:after="80"/>
+      </w:pPr>
+      <w:r>
+        <w:rPr>
+          <w:color w:val="1D2D3E"/>
+          <w:sz w:val="22"/>
+          <w:szCs w:val="22"/>
+        </w:rPr>
+        <w:t xml:space="preserve"/>
+      </w:r>
+    </w:p>
+    <w:p>
+      <w:pPr>
+        <w:pStyle w:val="Heading2"/>
+        <w:spacing w:after="120" w:before="300"/>
+      </w:pPr>
+      <w:r>
+        <w:rPr>
+          <w:b/>
+          <w:bCs/>
+          <w:color w:val="1D2D3E"/>
+        </w:rPr>
+        <w:t xml:space="preserve">Session 34 — 2026-05-31</w:t>
+      </w:r>
+    </w:p>
+    <w:p>
+      <w:pPr>
+        <w:pStyle w:val="ListParagraph"/>
+        <w:numPr>
+          <w:ilvl w:val="0"/>
+          <w:numId w:val="1"/>
+        </w:numPr>
+        <w:spacing w:after="40"/>
+      </w:pPr>
+      <w:r>
+        <w:rPr>
+          <w:color w:val="1D2D3E"/>
+          <w:sz w:val="22"/>
+          <w:szCs w:val="22"/>
+        </w:rPr>
+        <w:t xml:space="preserve">Dashboard 'Upcoming Payments' section (DueSoonPaymentsSection.tsx)</w:t>
+      </w:r>
+    </w:p>
+    <w:p>
+      <w:pPr>
+        <w:pStyle w:val="ListParagraph"/>
+        <w:numPr>
+          <w:ilvl w:val="1"/>
+          <w:numId w:val="1"/>
+        </w:numPr>
+        <w:spacing w:after="40"/>
+      </w:pPr>
+      <w:r>
+        <w:rPr>
+          <w:color w:val="1D2D3E"/>
+          <w:sz w:val="22"/>
+          <w:szCs w:val="22"/>
+        </w:rPr>
+        <w:t xml:space="preserve">  New component: shows AP bills + AR invoices due within configured 'due soon' window on Dashboard</w:t>
+      </w:r>
+    </w:p>
+    <w:p>
+      <w:pPr>
+        <w:pStyle w:val="ListParagraph"/>
+        <w:numPr>
+          <w:ilvl w:val="1"/>
+          <w:numId w:val="1"/>
+        </w:numPr>
+        <w:spacing w:after="40"/>
+      </w:pPr>
+      <w:r>
+        <w:rPr>
+          <w:color w:val="1D2D3E"/>
+          <w:sz w:val="22"/>
+          <w:szCs w:val="22"/>
+        </w:rPr>
+        <w:t xml:space="preserve">  Reads from AP/AR cache in useFocusEffect — zero extra API calls when cache warm</w:t>
+      </w:r>
+    </w:p>
+    <w:p>
+      <w:pPr>
+        <w:pStyle w:val="ListParagraph"/>
+        <w:numPr>
+          <w:ilvl w:val="1"/>
+          <w:numId w:val="1"/>
+        </w:numPr>
+        <w:spacing w:after="40"/>
+      </w:pPr>
+      <w:r>
+        <w:rPr>
+          <w:color w:val="1D2D3E"/>
+          <w:sz w:val="22"/>
+          <w:szCs w:val="22"/>
+        </w:rPr>
+        <w:t xml:space="preserve">  Combined list sorted by days-until-due; max 5 rows; card header shows total amount</w:t>
+      </w:r>
+    </w:p>
+    <w:p>
+      <w:pPr>
+        <w:pStyle w:val="ListParagraph"/>
+        <w:numPr>
+          <w:ilvl w:val="1"/>
+          <w:numId w:val="1"/>
+        </w:numPr>
+        <w:spacing w:after="40"/>
+      </w:pPr>
+      <w:r>
+        <w:rPr>
+          <w:color w:val="1D2D3E"/>
+          <w:sz w:val="22"/>
+          <w:szCs w:val="22"/>
+        </w:rPr>
+        <w:t xml:space="preserve">  Footer link: 'View all N upcoming payments' → Finance &gt; CashFlow screen</w:t>
+      </w:r>
+    </w:p>
+    <w:p>
+      <w:pPr>
+        <w:pStyle w:val="ListParagraph"/>
+        <w:numPr>
+          <w:ilvl w:val="1"/>
+          <w:numId w:val="1"/>
+        </w:numPr>
+        <w:spacing w:after="40"/>
+      </w:pPr>
+      <w:r>
+        <w:rPr>
+          <w:color w:val="1D2D3E"/>
+          <w:sz w:val="22"/>
+          <w:szCs w:val="22"/>
+        </w:rPr>
+        <w:t xml:space="preserve">  Section hidden when both arrays empty (no visual noise)</w:t>
+      </w:r>
+    </w:p>
+    <w:p>
+      <w:pPr>
+        <w:pStyle w:val="ListParagraph"/>
+        <w:numPr>
+          <w:ilvl w:val="0"/>
+          <w:numId w:val="1"/>
+        </w:numPr>
+        <w:spacing w:after="40"/>
+      </w:pPr>
+      <w:r>
+        <w:rPr>
+          <w:color w:val="1D2D3E"/>
+          <w:sz w:val="22"/>
+          <w:szCs w:val="22"/>
+        </w:rPr>
+        <w:t xml:space="preserve">Global Search: AP Bills + AR Invoices (SearchScreen.tsx)</w:t>
+      </w:r>
+    </w:p>
+    <w:p>
+      <w:pPr>
+        <w:pStyle w:val="ListParagraph"/>
+        <w:numPr>
+          <w:ilvl w:val="1"/>
+          <w:numId w:val="1"/>
+        </w:numPr>
+        <w:spacing w:after="40"/>
+      </w:pPr>
+      <w:r>
+        <w:rPr>
+          <w:color w:val="1D2D3E"/>
+          <w:sz w:val="22"/>
+          <w:szCs w:val="22"/>
+        </w:rPr>
+        <w:t xml:space="preserve">  'bill' + 'invoice' added as new ResultType values — 7 total searchable types</w:t>
+      </w:r>
+    </w:p>
+    <w:p>
+      <w:pPr>
+        <w:pStyle w:val="ListParagraph"/>
+        <w:numPr>
+          <w:ilvl w:val="1"/>
+          <w:numId w:val="1"/>
+        </w:numPr>
+        <w:spacing w:after="40"/>
+      </w:pPr>
+      <w:r>
+        <w:rPr>
+          <w:color w:val="1D2D3E"/>
+          <w:sz w:val="22"/>
+          <w:szCs w:val="22"/>
+        </w:rPr>
+        <w:t xml:space="preserve">  Bill results: search bill_number, vendor, id; tap → VendorDetail or AP screen</w:t>
+      </w:r>
+    </w:p>
+    <w:p>
+      <w:pPr>
+        <w:pStyle w:val="ListParagraph"/>
+        <w:numPr>
+          <w:ilvl w:val="1"/>
+          <w:numId w:val="1"/>
+        </w:numPr>
+        <w:spacing w:after="40"/>
+      </w:pPr>
+      <w:r>
+        <w:rPr>
+          <w:color w:val="1D2D3E"/>
+          <w:sz w:val="22"/>
+          <w:szCs w:val="22"/>
+        </w:rPr>
+        <w:t xml:space="preserve">  Invoice results: search invoice_number, customer, id; tap → CustomerDetail or AR screen</w:t>
+      </w:r>
+    </w:p>
+    <w:p>
+      <w:pPr>
+        <w:pStyle w:val="ListParagraph"/>
+        <w:numPr>
+          <w:ilvl w:val="1"/>
+          <w:numId w:val="1"/>
+        </w:numPr>
+        <w:spacing w:after="40"/>
+      </w:pPr>
+      <w:r>
+        <w:rPr>
+          <w:color w:val="1D2D3E"/>
+          <w:sz w:val="22"/>
+          <w:szCs w:val="22"/>
+        </w:rPr>
+        <w:t xml:space="preserve">  Data sourced from AP/AR cache; falls back to fresh API fetch when cache absent</w:t>
+      </w:r>
+    </w:p>
+    <w:p>
+      <w:pPr>
+        <w:pStyle w:val="ListParagraph"/>
+        <w:numPr>
+          <w:ilvl w:val="0"/>
+          <w:numId w:val="1"/>
+        </w:numPr>
+        <w:spacing w:after="40"/>
+      </w:pPr>
+      <w:r>
+        <w:rPr>
+          <w:color w:val="1D2D3E"/>
+          <w:sz w:val="22"/>
+          <w:szCs w:val="22"/>
+        </w:rPr>
+        <w:t xml:space="preserve">AP/AR Bills/Invoices filter chips (AccountsPayableScreen.tsx, AccountsReceivableScreen.tsx)</w:t>
+      </w:r>
+    </w:p>
+    <w:p>
+      <w:pPr>
+        <w:pStyle w:val="ListParagraph"/>
+        <w:numPr>
+          <w:ilvl w:val="1"/>
+          <w:numId w:val="1"/>
+        </w:numPr>
+        <w:spacing w:after="40"/>
+      </w:pPr>
+      <w:r>
+        <w:rPr>
+          <w:color w:val="1D2D3E"/>
+          <w:sz w:val="22"/>
+          <w:szCs w:val="22"/>
+        </w:rPr>
+        <w:t xml:space="preserve">  Three chip modes: All | Overdue (N) | Due Soon (N) below search bar</w:t>
+      </w:r>
+    </w:p>
+    <w:p>
+      <w:pPr>
+        <w:pStyle w:val="ListParagraph"/>
+        <w:numPr>
+          <w:ilvl w:val="1"/>
+          <w:numId w:val="1"/>
+        </w:numPr>
+        <w:spacing w:after="40"/>
+      </w:pPr>
+      <w:r>
+        <w:rPr>
+          <w:color w:val="1D2D3E"/>
+          <w:sz w:val="22"/>
+          <w:szCs w:val="22"/>
+        </w:rPr>
+        <w:t xml:space="preserve">  Active chip: dark filled; inactive: outline. Counts shown inline in chip labels</w:t>
+      </w:r>
+    </w:p>
+    <w:p>
+      <w:pPr>
+        <w:pStyle w:val="ListParagraph"/>
+        <w:numPr>
+          <w:ilvl w:val="1"/>
+          <w:numId w:val="1"/>
+        </w:numPr>
+        <w:spacing w:after="40"/>
+      </w:pPr>
+      <w:r>
+        <w:rPr>
+          <w:color w:val="1D2D3E"/>
+          <w:sz w:val="22"/>
+          <w:szCs w:val="22"/>
+        </w:rPr>
+        <w:t xml:space="preserve">  daysDueIn() helper added to both screens; dueSoonDays loaded from settings on mount</w:t>
+      </w:r>
+    </w:p>
+    <w:p>
+      <w:pPr>
+        <w:pStyle w:val="ListParagraph"/>
+        <w:numPr>
+          <w:ilvl w:val="0"/>
+          <w:numId w:val="1"/>
+        </w:numPr>
+        <w:spacing w:after="40"/>
+      </w:pPr>
+      <w:r>
+        <w:rPr>
+          <w:color w:val="1D2D3E"/>
+          <w:sz w:val="22"/>
+          <w:szCs w:val="22"/>
+        </w:rPr>
+        <w:t xml:space="preserve">FinanceMenu due-soon badge (FinanceMenuScreen.tsx)</w:t>
+      </w:r>
+    </w:p>
+    <w:p>
+      <w:pPr>
+        <w:pStyle w:val="ListParagraph"/>
+        <w:numPr>
+          <w:ilvl w:val="1"/>
+          <w:numId w:val="1"/>
+        </w:numPr>
+        <w:spacing w:after="40"/>
+      </w:pPr>
+      <w:r>
+        <w:rPr>
+          <w:color w:val="1D2D3E"/>
+          <w:sz w:val="22"/>
+          <w:szCs w:val="22"/>
+        </w:rPr>
+        <w:t xml:space="preserve">  Outline badge showing apDueSoon/arDueSoon on AP/AR rows when overdue count = 0</w:t>
       </w:r>
     </w:p>
     <w:p>

</xml_diff>

<commit_message>
docs(session-35): update PROGRESS.md, generate-docs.js, and FEATURES.docx with Session 35 changelog
https://claude.ai/code/session_01NtEYR8nvyPgQjPtg8cjsw2
</commit_message>
<xml_diff>
--- a/FEATURES.docx
+++ b/FEATURES.docx
@@ -20161,6 +20161,310 @@
           </w:p>
         </w:tc>
       </w:tr>
+      <w:tr>
+        <w:tc>
+          <w:p>
+            <w:pPr>
+              <w:spacing w:after="40" w:before="40"/>
+            </w:pPr>
+            <w:r>
+              <w:rPr>
+                <w:b w:val="false"/>
+                <w:bCs w:val="false"/>
+                <w:color w:val="1D2D3E"/>
+                <w:sz w:val="20"/>
+                <w:szCs w:val="20"/>
+              </w:rPr>
+              <w:t xml:space="preserve">Session 35</w:t>
+            </w:r>
+          </w:p>
+        </w:tc>
+        <w:tc>
+          <w:p>
+            <w:pPr>
+              <w:spacing w:after="40" w:before="40"/>
+            </w:pPr>
+            <w:r>
+              <w:rPr>
+                <w:b w:val="false"/>
+                <w:bCs w:val="false"/>
+                <w:color w:val="1D2D3E"/>
+                <w:sz w:val="20"/>
+                <w:szCs w:val="20"/>
+              </w:rPr>
+              <w:t xml:space="preserve">Vendor/Customer contact info — tappable phone/email/address in VendorDetail + CustomerDetail</w:t>
+            </w:r>
+          </w:p>
+        </w:tc>
+        <w:tc>
+          <w:p>
+            <w:pPr>
+              <w:spacing w:after="40" w:before="40"/>
+            </w:pPr>
+            <w:r>
+              <w:rPr>
+                <w:b w:val="false"/>
+                <w:bCs w:val="false"/>
+                <w:color w:val="1D2D3E"/>
+                <w:sz w:val="20"/>
+                <w:szCs w:val="20"/>
+              </w:rPr>
+              <w:t xml:space="preserve">Done</w:t>
+            </w:r>
+          </w:p>
+        </w:tc>
+        <w:tc>
+          <w:p>
+            <w:pPr>
+              <w:spacing w:after="40" w:before="40"/>
+            </w:pPr>
+            <w:r>
+              <w:rPr>
+                <w:b w:val="false"/>
+                <w:bCs w:val="false"/>
+                <w:color w:val="1D2D3E"/>
+                <w:sz w:val="20"/>
+                <w:szCs w:val="20"/>
+              </w:rPr>
+              <w:t xml:space="preserve">VendorDetailScreen.tsx + CustomerDetailScreen.tsx</w:t>
+            </w:r>
+          </w:p>
+        </w:tc>
+      </w:tr>
+      <w:tr>
+        <w:tc>
+          <w:tcPr>
+            <w:shd w:color="F0F4F8" w:val="solid"/>
+          </w:tcPr>
+          <w:p>
+            <w:pPr>
+              <w:spacing w:after="40" w:before="40"/>
+            </w:pPr>
+            <w:r>
+              <w:rPr>
+                <w:b w:val="false"/>
+                <w:bCs w:val="false"/>
+                <w:color w:val="1D2D3E"/>
+                <w:sz w:val="20"/>
+                <w:szCs w:val="20"/>
+              </w:rPr>
+              <w:t xml:space="preserve">Session 35</w:t>
+            </w:r>
+          </w:p>
+        </w:tc>
+        <w:tc>
+          <w:tcPr>
+            <w:shd w:color="F0F4F8" w:val="solid"/>
+          </w:tcPr>
+          <w:p>
+            <w:pPr>
+              <w:spacing w:after="40" w:before="40"/>
+            </w:pPr>
+            <w:r>
+              <w:rPr>
+                <w:b w:val="false"/>
+                <w:bCs w:val="false"/>
+                <w:color w:val="1D2D3E"/>
+                <w:sz w:val="20"/>
+                <w:szCs w:val="20"/>
+              </w:rPr>
+              <w:t xml:space="preserve">AP/AR pay-by / collect-by mini summary bar on bills/invoices tabs (Overdue | This Week | Later amounts)</w:t>
+            </w:r>
+          </w:p>
+        </w:tc>
+        <w:tc>
+          <w:tcPr>
+            <w:shd w:color="F0F4F8" w:val="solid"/>
+          </w:tcPr>
+          <w:p>
+            <w:pPr>
+              <w:spacing w:after="40" w:before="40"/>
+            </w:pPr>
+            <w:r>
+              <w:rPr>
+                <w:b w:val="false"/>
+                <w:bCs w:val="false"/>
+                <w:color w:val="1D2D3E"/>
+                <w:sz w:val="20"/>
+                <w:szCs w:val="20"/>
+              </w:rPr>
+              <w:t xml:space="preserve">Done</w:t>
+            </w:r>
+          </w:p>
+        </w:tc>
+        <w:tc>
+          <w:tcPr>
+            <w:shd w:color="F0F4F8" w:val="solid"/>
+          </w:tcPr>
+          <w:p>
+            <w:pPr>
+              <w:spacing w:after="40" w:before="40"/>
+            </w:pPr>
+            <w:r>
+              <w:rPr>
+                <w:b w:val="false"/>
+                <w:bCs w:val="false"/>
+                <w:color w:val="1D2D3E"/>
+                <w:sz w:val="20"/>
+                <w:szCs w:val="20"/>
+              </w:rPr>
+              <w:t xml:space="preserve">AccountsPayableScreen.tsx + AccountsReceivableScreen.tsx</w:t>
+            </w:r>
+          </w:p>
+        </w:tc>
+      </w:tr>
+      <w:tr>
+        <w:tc>
+          <w:p>
+            <w:pPr>
+              <w:spacing w:after="40" w:before="40"/>
+            </w:pPr>
+            <w:r>
+              <w:rPr>
+                <w:b w:val="false"/>
+                <w:bCs w:val="false"/>
+                <w:color w:val="1D2D3E"/>
+                <w:sz w:val="20"/>
+                <w:szCs w:val="20"/>
+              </w:rPr>
+              <w:t xml:space="preserve">Session 35</w:t>
+            </w:r>
+          </w:p>
+        </w:tc>
+        <w:tc>
+          <w:p>
+            <w:pPr>
+              <w:spacing w:after="40" w:before="40"/>
+            </w:pPr>
+            <w:r>
+              <w:rPr>
+                <w:b w:val="false"/>
+                <w:bCs w:val="false"/>
+                <w:color w:val="1D2D3E"/>
+                <w:sz w:val="20"/>
+                <w:szCs w:val="20"/>
+              </w:rPr>
+              <w:t xml:space="preserve">Dashboard Finance Health card — AR vs AP stacked bar, net position, ratio</w:t>
+            </w:r>
+          </w:p>
+        </w:tc>
+        <w:tc>
+          <w:p>
+            <w:pPr>
+              <w:spacing w:after="40" w:before="40"/>
+            </w:pPr>
+            <w:r>
+              <w:rPr>
+                <w:b w:val="false"/>
+                <w:bCs w:val="false"/>
+                <w:color w:val="1D2D3E"/>
+                <w:sz w:val="20"/>
+                <w:szCs w:val="20"/>
+              </w:rPr>
+              <w:t xml:space="preserve">Done</w:t>
+            </w:r>
+          </w:p>
+        </w:tc>
+        <w:tc>
+          <w:p>
+            <w:pPr>
+              <w:spacing w:after="40" w:before="40"/>
+            </w:pPr>
+            <w:r>
+              <w:rPr>
+                <w:b w:val="false"/>
+                <w:bCs w:val="false"/>
+                <w:color w:val="1D2D3E"/>
+                <w:sz w:val="20"/>
+                <w:szCs w:val="20"/>
+              </w:rPr>
+              <w:t xml:space="preserve">DashboardScreen.tsx</w:t>
+            </w:r>
+          </w:p>
+        </w:tc>
+      </w:tr>
+      <w:tr>
+        <w:tc>
+          <w:tcPr>
+            <w:shd w:color="F0F4F8" w:val="solid"/>
+          </w:tcPr>
+          <w:p>
+            <w:pPr>
+              <w:spacing w:after="40" w:before="40"/>
+            </w:pPr>
+            <w:r>
+              <w:rPr>
+                <w:b w:val="false"/>
+                <w:bCs w:val="false"/>
+                <w:color w:val="1D2D3E"/>
+                <w:sz w:val="20"/>
+                <w:szCs w:val="20"/>
+              </w:rPr>
+              <w:t xml:space="preserve">Session 35</w:t>
+            </w:r>
+          </w:p>
+        </w:tc>
+        <w:tc>
+          <w:tcPr>
+            <w:shd w:color="F0F4F8" w:val="solid"/>
+          </w:tcPr>
+          <w:p>
+            <w:pPr>
+              <w:spacing w:after="40" w:before="40"/>
+            </w:pPr>
+            <w:r>
+              <w:rPr>
+                <w:b w:val="false"/>
+                <w:bCs w:val="false"/>
+                <w:color w:val="1D2D3E"/>
+                <w:sz w:val="20"/>
+                <w:szCs w:val="20"/>
+              </w:rPr>
+              <w:t xml:space="preserve">Upcoming Payments PDF export — exportUpcomingPaymentsPDF with bill/invoice tables + net cash impact</w:t>
+            </w:r>
+          </w:p>
+        </w:tc>
+        <w:tc>
+          <w:tcPr>
+            <w:shd w:color="F0F4F8" w:val="solid"/>
+          </w:tcPr>
+          <w:p>
+            <w:pPr>
+              <w:spacing w:after="40" w:before="40"/>
+            </w:pPr>
+            <w:r>
+              <w:rPr>
+                <w:b w:val="false"/>
+                <w:bCs w:val="false"/>
+                <w:color w:val="1D2D3E"/>
+                <w:sz w:val="20"/>
+                <w:szCs w:val="20"/>
+              </w:rPr>
+              <w:t xml:space="preserve">Done</w:t>
+            </w:r>
+          </w:p>
+        </w:tc>
+        <w:tc>
+          <w:tcPr>
+            <w:shd w:color="F0F4F8" w:val="solid"/>
+          </w:tcPr>
+          <w:p>
+            <w:pPr>
+              <w:spacing w:after="40" w:before="40"/>
+            </w:pPr>
+            <w:r>
+              <w:rPr>
+                <w:b w:val="false"/>
+                <w:bCs w:val="false"/>
+                <w:color w:val="1D2D3E"/>
+                <w:sz w:val="20"/>
+                <w:szCs w:val="20"/>
+              </w:rPr>
+              <w:t xml:space="preserve">pdfExport.ts + DashboardScreen.tsx</w:t>
+            </w:r>
+          </w:p>
+        </w:tc>
+      </w:tr>
     </w:tbl>
     <w:p>
       <w:pPr>
@@ -21359,6 +21663,78 @@
           <w:szCs w:val="22"/>
         </w:rPr>
         <w:t xml:space="preserve">FinanceMenu due-soon badge (Session 34): secondary outline badge on AP/AR rows showing apDueSoon/arDueSoon when overdue count = 0; uses OverdueContext</w:t>
+      </w:r>
+    </w:p>
+    <w:p>
+      <w:pPr>
+        <w:pStyle w:val="ListParagraph"/>
+        <w:numPr>
+          <w:ilvl w:val="0"/>
+          <w:numId w:val="1"/>
+        </w:numPr>
+        <w:spacing w:after="40"/>
+      </w:pPr>
+      <w:r>
+        <w:rPr>
+          <w:color w:val="1D2D3E"/>
+          <w:sz w:val="22"/>
+          <w:szCs w:val="22"/>
+        </w:rPr>
+        <w:t xml:space="preserve">Vendor/Customer contact info (Session 35): VendorDetailScreen + CustomerDetailScreen fetch partners list after main data load; match by id or name; show contactCard row with tappable phone (tel:) + email (mailto:) + address between aging chart and tab bar</w:t>
+      </w:r>
+    </w:p>
+    <w:p>
+      <w:pPr>
+        <w:pStyle w:val="ListParagraph"/>
+        <w:numPr>
+          <w:ilvl w:val="0"/>
+          <w:numId w:val="1"/>
+        </w:numPr>
+        <w:spacing w:after="40"/>
+      </w:pPr>
+      <w:r>
+        <w:rPr>
+          <w:color w:val="1D2D3E"/>
+          <w:sz w:val="22"/>
+          <w:szCs w:val="22"/>
+        </w:rPr>
+        <w:t xml:space="preserve">AP/AR pay-by / collect-by summary bar (Session 35): outstanding bills/invoices bucketed into Overdue | This Week | Later amounts shown above Bills/Invoices SectionHeader when filter='all'</w:t>
+      </w:r>
+    </w:p>
+    <w:p>
+      <w:pPr>
+        <w:pStyle w:val="ListParagraph"/>
+        <w:numPr>
+          <w:ilvl w:val="0"/>
+          <w:numId w:val="1"/>
+        </w:numPr>
+        <w:spacing w:after="40"/>
+      </w:pPr>
+      <w:r>
+        <w:rPr>
+          <w:color w:val="1D2D3E"/>
+          <w:sz w:val="22"/>
+          <w:szCs w:val="22"/>
+        </w:rPr>
+        <w:t xml:space="preserve">Dashboard Finance Health card (Session 35): AR vs AP stacked bar + legend with net position and ratio; shown between Working Capital and Supply Chain sections</w:t>
+      </w:r>
+    </w:p>
+    <w:p>
+      <w:pPr>
+        <w:pStyle w:val="ListParagraph"/>
+        <w:numPr>
+          <w:ilvl w:val="0"/>
+          <w:numId w:val="1"/>
+        </w:numPr>
+        <w:spacing w:after="40"/>
+      </w:pPr>
+      <w:r>
+        <w:rPr>
+          <w:color w:val="1D2D3E"/>
+          <w:sz w:val="22"/>
+          <w:szCs w:val="22"/>
+        </w:rPr>
+        <w:t xml:space="preserve">pdfExport.ts exportUpcomingPaymentsPDF (Session 35): 3-tile summary (To Pay / To Collect / Net Cash Impact), bills table sorted soonest-first, invoices table; accessible from Dashboard Upcoming Payments header PDF button</w:t>
       </w:r>
     </w:p>
     <w:p>
@@ -25099,6 +25475,357 @@
           <w:szCs w:val="22"/>
         </w:rPr>
         <w:t xml:space="preserve">  Tapping a history row repopulates the query field</w:t>
+      </w:r>
+    </w:p>
+    <w:p>
+      <w:pPr>
+        <w:spacing w:after="80"/>
+      </w:pPr>
+      <w:r>
+        <w:rPr>
+          <w:color w:val="1D2D3E"/>
+          <w:sz w:val="22"/>
+          <w:szCs w:val="22"/>
+        </w:rPr>
+        <w:t xml:space="preserve"/>
+      </w:r>
+    </w:p>
+    <w:p>
+      <w:pPr>
+        <w:pStyle w:val="Heading2"/>
+        <w:spacing w:after="120" w:before="300"/>
+      </w:pPr>
+      <w:r>
+        <w:rPr>
+          <w:b/>
+          <w:bCs/>
+          <w:color w:val="1D2D3E"/>
+        </w:rPr>
+        <w:t xml:space="preserve">Session 35 — 2026-05-31</w:t>
+      </w:r>
+    </w:p>
+    <w:p>
+      <w:pPr>
+        <w:pStyle w:val="ListParagraph"/>
+        <w:numPr>
+          <w:ilvl w:val="0"/>
+          <w:numId w:val="1"/>
+        </w:numPr>
+        <w:spacing w:after="40"/>
+      </w:pPr>
+      <w:r>
+        <w:rPr>
+          <w:color w:val="1D2D3E"/>
+          <w:sz w:val="22"/>
+          <w:szCs w:val="22"/>
+        </w:rPr>
+        <w:t xml:space="preserve">Vendor/Customer contact info (VendorDetailScreen.tsx, CustomerDetailScreen.tsx)</w:t>
+      </w:r>
+    </w:p>
+    <w:p>
+      <w:pPr>
+        <w:pStyle w:val="ListParagraph"/>
+        <w:numPr>
+          <w:ilvl w:val="1"/>
+          <w:numId w:val="1"/>
+        </w:numPr>
+        <w:spacing w:after="40"/>
+      </w:pPr>
+      <w:r>
+        <w:rPr>
+          <w:color w:val="1D2D3E"/>
+          <w:sz w:val="22"/>
+          <w:szCs w:val="22"/>
+        </w:rPr>
+        <w:t xml:space="preserve">  fetchPartners called after main bills/invoices load (best-effort, non-blocking)</w:t>
+      </w:r>
+    </w:p>
+    <w:p>
+      <w:pPr>
+        <w:pStyle w:val="ListParagraph"/>
+        <w:numPr>
+          <w:ilvl w:val="1"/>
+          <w:numId w:val="1"/>
+        </w:numPr>
+        <w:spacing w:after="40"/>
+      </w:pPr>
+      <w:r>
+        <w:rPr>
+          <w:color w:val="1D2D3E"/>
+          <w:sz w:val="22"/>
+          <w:szCs w:val="22"/>
+        </w:rPr>
+        <w:t xml:space="preserve">  Partner matched by id === vendorId/customerId OR name case-insensitive</w:t>
+      </w:r>
+    </w:p>
+    <w:p>
+      <w:pPr>
+        <w:pStyle w:val="ListParagraph"/>
+        <w:numPr>
+          <w:ilvl w:val="1"/>
+          <w:numId w:val="1"/>
+        </w:numPr>
+        <w:spacing w:after="40"/>
+      </w:pPr>
+      <w:r>
+        <w:rPr>
+          <w:color w:val="1D2D3E"/>
+          <w:sz w:val="22"/>
+          <w:szCs w:val="22"/>
+        </w:rPr>
+        <w:t xml:space="preserve">  Contact card between aging chart and tab bar: phone → tel: link, email → mailto: link, address static</w:t>
+      </w:r>
+    </w:p>
+    <w:p>
+      <w:pPr>
+        <w:pStyle w:val="ListParagraph"/>
+        <w:numPr>
+          <w:ilvl w:val="1"/>
+          <w:numId w:val="1"/>
+        </w:numPr>
+        <w:spacing w:after="40"/>
+      </w:pPr>
+      <w:r>
+        <w:rPr>
+          <w:color w:val="1D2D3E"/>
+          <w:sz w:val="22"/>
+          <w:szCs w:val="22"/>
+        </w:rPr>
+        <w:t xml:space="preserve">  Uses Linking.openURL from React Native — phone opens dialer, email opens mail client</w:t>
+      </w:r>
+    </w:p>
+    <w:p>
+      <w:pPr>
+        <w:pStyle w:val="ListParagraph"/>
+        <w:numPr>
+          <w:ilvl w:val="0"/>
+          <w:numId w:val="1"/>
+        </w:numPr>
+        <w:spacing w:after="40"/>
+      </w:pPr>
+      <w:r>
+        <w:rPr>
+          <w:color w:val="1D2D3E"/>
+          <w:sz w:val="22"/>
+          <w:szCs w:val="22"/>
+        </w:rPr>
+        <w:t xml:space="preserve">AP/AR pay-by / collect-by mini summary bar (AccountsPayableScreen.tsx, AccountsReceivableScreen.tsx)</w:t>
+      </w:r>
+    </w:p>
+    <w:p>
+      <w:pPr>
+        <w:pStyle w:val="ListParagraph"/>
+        <w:numPr>
+          <w:ilvl w:val="1"/>
+          <w:numId w:val="1"/>
+        </w:numPr>
+        <w:spacing w:after="40"/>
+      </w:pPr>
+      <w:r>
+        <w:rPr>
+          <w:color w:val="1D2D3E"/>
+          <w:sz w:val="22"/>
+          <w:szCs w:val="22"/>
+        </w:rPr>
+        <w:t xml:space="preserve">  Bills tab: Overdue | This Week (0-7d) | Later buckets showing outstanding amounts</w:t>
+      </w:r>
+    </w:p>
+    <w:p>
+      <w:pPr>
+        <w:pStyle w:val="ListParagraph"/>
+        <w:numPr>
+          <w:ilvl w:val="1"/>
+          <w:numId w:val="1"/>
+        </w:numPr>
+        <w:spacing w:after="40"/>
+      </w:pPr>
+      <w:r>
+        <w:rPr>
+          <w:color w:val="1D2D3E"/>
+          <w:sz w:val="22"/>
+          <w:szCs w:val="22"/>
+        </w:rPr>
+        <w:t xml:space="preserve">  Invoices tab: same pattern for AR — collect-by stats row above Invoices SectionHeader</w:t>
+      </w:r>
+    </w:p>
+    <w:p>
+      <w:pPr>
+        <w:pStyle w:val="ListParagraph"/>
+        <w:numPr>
+          <w:ilvl w:val="1"/>
+          <w:numId w:val="1"/>
+        </w:numPr>
+        <w:spacing w:after="40"/>
+      </w:pPr>
+      <w:r>
+        <w:rPr>
+          <w:color w:val="1D2D3E"/>
+          <w:sz w:val="22"/>
+          <w:szCs w:val="22"/>
+        </w:rPr>
+        <w:t xml:space="preserve">  Only shown when filter='all' and at least one bucket has value; Overdue tile gets surfaceHover background</w:t>
+      </w:r>
+    </w:p>
+    <w:p>
+      <w:pPr>
+        <w:pStyle w:val="ListParagraph"/>
+        <w:numPr>
+          <w:ilvl w:val="0"/>
+          <w:numId w:val="1"/>
+        </w:numPr>
+        <w:spacing w:after="40"/>
+      </w:pPr>
+      <w:r>
+        <w:rPr>
+          <w:color w:val="1D2D3E"/>
+          <w:sz w:val="22"/>
+          <w:szCs w:val="22"/>
+        </w:rPr>
+        <w:t xml:space="preserve">Dashboard Finance Health card (DashboardScreen.tsx)</w:t>
+      </w:r>
+    </w:p>
+    <w:p>
+      <w:pPr>
+        <w:pStyle w:val="ListParagraph"/>
+        <w:numPr>
+          <w:ilvl w:val="1"/>
+          <w:numId w:val="1"/>
+        </w:numPr>
+        <w:spacing w:after="40"/>
+      </w:pPr>
+      <w:r>
+        <w:rPr>
+          <w:color w:val="1D2D3E"/>
+          <w:sz w:val="22"/>
+          <w:szCs w:val="22"/>
+        </w:rPr>
+        <w:t xml:space="preserve">  Stacked horizontal bar: AR (dark) vs AP (muted) proportional segments</w:t>
+      </w:r>
+    </w:p>
+    <w:p>
+      <w:pPr>
+        <w:pStyle w:val="ListParagraph"/>
+        <w:numPr>
+          <w:ilvl w:val="1"/>
+          <w:numId w:val="1"/>
+        </w:numPr>
+        <w:spacing w:after="40"/>
+      </w:pPr>
+      <w:r>
+        <w:rPr>
+          <w:color w:val="1D2D3E"/>
+          <w:sz w:val="22"/>
+          <w:szCs w:val="22"/>
+        </w:rPr>
+        <w:t xml:space="preserve">  Legend: RECEIVABLES amount | Net +/- amount + AR/AP ratio | PAYABLES amount</w:t>
+      </w:r>
+    </w:p>
+    <w:p>
+      <w:pPr>
+        <w:pStyle w:val="ListParagraph"/>
+        <w:numPr>
+          <w:ilvl w:val="1"/>
+          <w:numId w:val="1"/>
+        </w:numPr>
+        <w:spacing w:after="40"/>
+      </w:pPr>
+      <w:r>
+        <w:rPr>
+          <w:color w:val="1D2D3E"/>
+          <w:sz w:val="22"/>
+          <w:szCs w:val="22"/>
+        </w:rPr>
+        <w:t xml:space="preserve">  Shown between Working Capital and Supply Chain when totalAR or totalAP &gt; 0</w:t>
+      </w:r>
+    </w:p>
+    <w:p>
+      <w:pPr>
+        <w:pStyle w:val="ListParagraph"/>
+        <w:numPr>
+          <w:ilvl w:val="0"/>
+          <w:numId w:val="1"/>
+        </w:numPr>
+        <w:spacing w:after="40"/>
+      </w:pPr>
+      <w:r>
+        <w:rPr>
+          <w:color w:val="1D2D3E"/>
+          <w:sz w:val="22"/>
+          <w:szCs w:val="22"/>
+        </w:rPr>
+        <w:t xml:space="preserve">Upcoming Payments PDF export (pdfExport.ts, DashboardScreen.tsx)</w:t>
+      </w:r>
+    </w:p>
+    <w:p>
+      <w:pPr>
+        <w:pStyle w:val="ListParagraph"/>
+        <w:numPr>
+          <w:ilvl w:val="1"/>
+          <w:numId w:val="1"/>
+        </w:numPr>
+        <w:spacing w:after="40"/>
+      </w:pPr>
+      <w:r>
+        <w:rPr>
+          <w:color w:val="1D2D3E"/>
+          <w:sz w:val="22"/>
+          <w:szCs w:val="22"/>
+        </w:rPr>
+        <w:t xml:space="preserve">  exportUpcomingPaymentsPDF: 3-tile summary (To Pay / To Collect / Net Cash Impact)</w:t>
+      </w:r>
+    </w:p>
+    <w:p>
+      <w:pPr>
+        <w:pStyle w:val="ListParagraph"/>
+        <w:numPr>
+          <w:ilvl w:val="1"/>
+          <w:numId w:val="1"/>
+        </w:numPr>
+        <w:spacing w:after="40"/>
+      </w:pPr>
+      <w:r>
+        <w:rPr>
+          <w:color w:val="1D2D3E"/>
+          <w:sz w:val="22"/>
+          <w:szCs w:val="22"/>
+        </w:rPr>
+        <w:t xml:space="preserve">  Bills table: Bill# / Vendor / Due Date / Days Left / Outstanding, sorted soonest-first</w:t>
+      </w:r>
+    </w:p>
+    <w:p>
+      <w:pPr>
+        <w:pStyle w:val="ListParagraph"/>
+        <w:numPr>
+          <w:ilvl w:val="1"/>
+          <w:numId w:val="1"/>
+        </w:numPr>
+        <w:spacing w:after="40"/>
+      </w:pPr>
+      <w:r>
+        <w:rPr>
+          <w:color w:val="1D2D3E"/>
+          <w:sz w:val="22"/>
+          <w:szCs w:val="22"/>
+        </w:rPr>
+        <w:t xml:space="preserve">  Invoices table: same pattern for AR invoices</w:t>
+      </w:r>
+    </w:p>
+    <w:p>
+      <w:pPr>
+        <w:pStyle w:val="ListParagraph"/>
+        <w:numPr>
+          <w:ilvl w:val="1"/>
+          <w:numId w:val="1"/>
+        </w:numPr>
+        <w:spacing w:after="40"/>
+      </w:pPr>
+      <w:r>
+        <w:rPr>
+          <w:color w:val="1D2D3E"/>
+          <w:sz w:val="22"/>
+          <w:szCs w:val="22"/>
+        </w:rPr>
+        <w:t xml:space="preserve">  PDF button added to Dashboard Upcoming Payments section header inline row</w:t>
       </w:r>
     </w:p>
     <w:p>

</xml_diff>

<commit_message>
docs(session-36): update PROGRESS.md, generate-docs.js, and FEATURES.docx with Session 36 changelog
</commit_message>
<xml_diff>
--- a/FEATURES.docx
+++ b/FEATURES.docx
@@ -45,7 +45,7 @@
           <w:sz w:val="20"/>
           <w:szCs w:val="20"/>
         </w:rPr>
-        <w:t xml:space="preserve">Generated: 2026-05-31</w:t>
+        <w:t xml:space="preserve">Generated: 2026-06-01</w:t>
       </w:r>
     </w:p>
     <w:p>
@@ -20465,6 +20465,310 @@
           </w:p>
         </w:tc>
       </w:tr>
+      <w:tr>
+        <w:tc>
+          <w:p>
+            <w:pPr>
+              <w:spacing w:after="40" w:before="40"/>
+            </w:pPr>
+            <w:r>
+              <w:rPr>
+                <w:b w:val="false"/>
+                <w:bCs w:val="false"/>
+                <w:color w:val="1D2D3E"/>
+                <w:sz w:val="20"/>
+                <w:szCs w:val="20"/>
+              </w:rPr>
+              <w:t xml:space="preserve">Session 36</w:t>
+            </w:r>
+          </w:p>
+        </w:tc>
+        <w:tc>
+          <w:p>
+            <w:pPr>
+              <w:spacing w:after="40" w:before="40"/>
+            </w:pPr>
+            <w:r>
+              <w:rPr>
+                <w:b w:val="false"/>
+                <w:bCs w:val="false"/>
+                <w:color w:val="1D2D3E"/>
+                <w:sz w:val="20"/>
+                <w:szCs w:val="20"/>
+              </w:rPr>
+              <w:t xml:space="preserve">6-Month Outstanding Balance Trend Chart — MonthlyBalanceChart component in VendorDetail + CustomerDetail</w:t>
+            </w:r>
+          </w:p>
+        </w:tc>
+        <w:tc>
+          <w:p>
+            <w:pPr>
+              <w:spacing w:after="40" w:before="40"/>
+            </w:pPr>
+            <w:r>
+              <w:rPr>
+                <w:b w:val="false"/>
+                <w:bCs w:val="false"/>
+                <w:color w:val="1D2D3E"/>
+                <w:sz w:val="20"/>
+                <w:szCs w:val="20"/>
+              </w:rPr>
+              <w:t xml:space="preserve">Done</w:t>
+            </w:r>
+          </w:p>
+        </w:tc>
+        <w:tc>
+          <w:p>
+            <w:pPr>
+              <w:spacing w:after="40" w:before="40"/>
+            </w:pPr>
+            <w:r>
+              <w:rPr>
+                <w:b w:val="false"/>
+                <w:bCs w:val="false"/>
+                <w:color w:val="1D2D3E"/>
+                <w:sz w:val="20"/>
+                <w:szCs w:val="20"/>
+              </w:rPr>
+              <w:t xml:space="preserve">MonthlyBalanceChart.tsx + VendorDetailScreen.tsx + CustomerDetailScreen.tsx</w:t>
+            </w:r>
+          </w:p>
+        </w:tc>
+      </w:tr>
+      <w:tr>
+        <w:tc>
+          <w:tcPr>
+            <w:shd w:color="F0F4F8" w:val="solid"/>
+          </w:tcPr>
+          <w:p>
+            <w:pPr>
+              <w:spacing w:after="40" w:before="40"/>
+            </w:pPr>
+            <w:r>
+              <w:rPr>
+                <w:b w:val="false"/>
+                <w:bCs w:val="false"/>
+                <w:color w:val="1D2D3E"/>
+                <w:sz w:val="20"/>
+                <w:szCs w:val="20"/>
+              </w:rPr>
+              <w:t xml:space="preserve">Session 36</w:t>
+            </w:r>
+          </w:p>
+        </w:tc>
+        <w:tc>
+          <w:tcPr>
+            <w:shd w:color="F0F4F8" w:val="solid"/>
+          </w:tcPr>
+          <w:p>
+            <w:pPr>
+              <w:spacing w:after="40" w:before="40"/>
+            </w:pPr>
+            <w:r>
+              <w:rPr>
+                <w:b w:val="false"/>
+                <w:bCs w:val="false"/>
+                <w:color w:val="1D2D3E"/>
+                <w:sz w:val="20"/>
+                <w:szCs w:val="20"/>
+              </w:rPr>
+              <w:t xml:space="preserve">Partner list tappable call/email — TouchableOpacity wraps phone/email rows in PartnerCard</w:t>
+            </w:r>
+          </w:p>
+        </w:tc>
+        <w:tc>
+          <w:tcPr>
+            <w:shd w:color="F0F4F8" w:val="solid"/>
+          </w:tcPr>
+          <w:p>
+            <w:pPr>
+              <w:spacing w:after="40" w:before="40"/>
+            </w:pPr>
+            <w:r>
+              <w:rPr>
+                <w:b w:val="false"/>
+                <w:bCs w:val="false"/>
+                <w:color w:val="1D2D3E"/>
+                <w:sz w:val="20"/>
+                <w:szCs w:val="20"/>
+              </w:rPr>
+              <w:t xml:space="preserve">Done</w:t>
+            </w:r>
+          </w:p>
+        </w:tc>
+        <w:tc>
+          <w:tcPr>
+            <w:shd w:color="F0F4F8" w:val="solid"/>
+          </w:tcPr>
+          <w:p>
+            <w:pPr>
+              <w:spacing w:after="40" w:before="40"/>
+            </w:pPr>
+            <w:r>
+              <w:rPr>
+                <w:b w:val="false"/>
+                <w:bCs w:val="false"/>
+                <w:color w:val="1D2D3E"/>
+                <w:sz w:val="20"/>
+                <w:szCs w:val="20"/>
+              </w:rPr>
+              <w:t xml:space="preserve">PartnersScreen.tsx</w:t>
+            </w:r>
+          </w:p>
+        </w:tc>
+      </w:tr>
+      <w:tr>
+        <w:tc>
+          <w:p>
+            <w:pPr>
+              <w:spacing w:after="40" w:before="40"/>
+            </w:pPr>
+            <w:r>
+              <w:rPr>
+                <w:b w:val="false"/>
+                <w:bCs w:val="false"/>
+                <w:color w:val="1D2D3E"/>
+                <w:sz w:val="20"/>
+                <w:szCs w:val="20"/>
+              </w:rPr>
+              <w:t xml:space="preserve">Session 36</w:t>
+            </w:r>
+          </w:p>
+        </w:tc>
+        <w:tc>
+          <w:p>
+            <w:pPr>
+              <w:spacing w:after="40" w:before="40"/>
+            </w:pPr>
+            <w:r>
+              <w:rPr>
+                <w:b w:val="false"/>
+                <w:bCs w:val="false"/>
+                <w:color w:val="1D2D3E"/>
+                <w:sz w:val="20"/>
+                <w:szCs w:val="20"/>
+              </w:rPr>
+              <w:t xml:space="preserve">Vendor/Customer recently viewed tracking + Dashboard navigation for vendor/customer history items</w:t>
+            </w:r>
+          </w:p>
+        </w:tc>
+        <w:tc>
+          <w:p>
+            <w:pPr>
+              <w:spacing w:after="40" w:before="40"/>
+            </w:pPr>
+            <w:r>
+              <w:rPr>
+                <w:b w:val="false"/>
+                <w:bCs w:val="false"/>
+                <w:color w:val="1D2D3E"/>
+                <w:sz w:val="20"/>
+                <w:szCs w:val="20"/>
+              </w:rPr>
+              <w:t xml:space="preserve">Done</w:t>
+            </w:r>
+          </w:p>
+        </w:tc>
+        <w:tc>
+          <w:p>
+            <w:pPr>
+              <w:spacing w:after="40" w:before="40"/>
+            </w:pPr>
+            <w:r>
+              <w:rPr>
+                <w:b w:val="false"/>
+                <w:bCs w:val="false"/>
+                <w:color w:val="1D2D3E"/>
+                <w:sz w:val="20"/>
+                <w:szCs w:val="20"/>
+              </w:rPr>
+              <w:t xml:space="preserve">VendorDetailScreen.tsx + CustomerDetailScreen.tsx + DashboardScreen.tsx</w:t>
+            </w:r>
+          </w:p>
+        </w:tc>
+      </w:tr>
+      <w:tr>
+        <w:tc>
+          <w:tcPr>
+            <w:shd w:color="F0F4F8" w:val="solid"/>
+          </w:tcPr>
+          <w:p>
+            <w:pPr>
+              <w:spacing w:after="40" w:before="40"/>
+            </w:pPr>
+            <w:r>
+              <w:rPr>
+                <w:b w:val="false"/>
+                <w:bCs w:val="false"/>
+                <w:color w:val="1D2D3E"/>
+                <w:sz w:val="20"/>
+                <w:szCs w:val="20"/>
+              </w:rPr>
+              <w:t xml:space="preserve">Session 36</w:t>
+            </w:r>
+          </w:p>
+        </w:tc>
+        <w:tc>
+          <w:tcPr>
+            <w:shd w:color="F0F4F8" w:val="solid"/>
+          </w:tcPr>
+          <w:p>
+            <w:pPr>
+              <w:spacing w:after="40" w:before="40"/>
+            </w:pPr>
+            <w:r>
+              <w:rPr>
+                <w:b w:val="false"/>
+                <w:bCs w:val="false"/>
+                <w:color w:val="1D2D3E"/>
+                <w:sz w:val="20"/>
+                <w:szCs w:val="20"/>
+              </w:rPr>
+              <w:t xml:space="preserve">Weekly Payment/Collection Schedule on AP/AR summary tabs — WeeklyScheduleCard with 4-week horizon + overdue</w:t>
+            </w:r>
+          </w:p>
+        </w:tc>
+        <w:tc>
+          <w:tcPr>
+            <w:shd w:color="F0F4F8" w:val="solid"/>
+          </w:tcPr>
+          <w:p>
+            <w:pPr>
+              <w:spacing w:after="40" w:before="40"/>
+            </w:pPr>
+            <w:r>
+              <w:rPr>
+                <w:b w:val="false"/>
+                <w:bCs w:val="false"/>
+                <w:color w:val="1D2D3E"/>
+                <w:sz w:val="20"/>
+                <w:szCs w:val="20"/>
+              </w:rPr>
+              <w:t xml:space="preserve">Done</w:t>
+            </w:r>
+          </w:p>
+        </w:tc>
+        <w:tc>
+          <w:tcPr>
+            <w:shd w:color="F0F4F8" w:val="solid"/>
+          </w:tcPr>
+          <w:p>
+            <w:pPr>
+              <w:spacing w:after="40" w:before="40"/>
+            </w:pPr>
+            <w:r>
+              <w:rPr>
+                <w:b w:val="false"/>
+                <w:bCs w:val="false"/>
+                <w:color w:val="1D2D3E"/>
+                <w:sz w:val="20"/>
+                <w:szCs w:val="20"/>
+              </w:rPr>
+              <w:t xml:space="preserve">WeeklyScheduleCard.tsx + AccountsPayableScreen.tsx + AccountsReceivableScreen.tsx</w:t>
+            </w:r>
+          </w:p>
+        </w:tc>
+      </w:tr>
     </w:tbl>
     <w:p>
       <w:pPr>
@@ -21735,6 +22039,78 @@
           <w:szCs w:val="22"/>
         </w:rPr>
         <w:t xml:space="preserve">pdfExport.ts exportUpcomingPaymentsPDF (Session 35): 3-tile summary (To Pay / To Collect / Net Cash Impact), bills table sorted soonest-first, invoices table; accessible from Dashboard Upcoming Payments header PDF button</w:t>
+      </w:r>
+    </w:p>
+    <w:p>
+      <w:pPr>
+        <w:pStyle w:val="ListParagraph"/>
+        <w:numPr>
+          <w:ilvl w:val="0"/>
+          <w:numId w:val="1"/>
+        </w:numPr>
+        <w:spacing w:after="40"/>
+      </w:pPr>
+      <w:r>
+        <w:rPr>
+          <w:color w:val="1D2D3E"/>
+          <w:sz w:val="22"/>
+          <w:szCs w:val="22"/>
+        </w:rPr>
+        <w:t xml:space="preserve">src/components/MonthlyBalanceChart.tsx (Session 36): 6-month outstanding balance trend bar chart; computeMonthlyBalances() extracts closing balance per month-end from sorted ledger entries; mounted in VendorDetailScreen + CustomerDetailScreen</w:t>
+      </w:r>
+    </w:p>
+    <w:p>
+      <w:pPr>
+        <w:pStyle w:val="ListParagraph"/>
+        <w:numPr>
+          <w:ilvl w:val="0"/>
+          <w:numId w:val="1"/>
+        </w:numPr>
+        <w:spacing w:after="40"/>
+      </w:pPr>
+      <w:r>
+        <w:rPr>
+          <w:color w:val="1D2D3E"/>
+          <w:sz w:val="22"/>
+          <w:szCs w:val="22"/>
+        </w:rPr>
+        <w:t xml:space="preserve">Partner list tappable contacts (Session 36): PartnersScreen PartnerCard email/phone rows are TouchableOpacity → Linking.openURL; contactTextTappable style with underline</w:t>
+      </w:r>
+    </w:p>
+    <w:p>
+      <w:pPr>
+        <w:pStyle w:val="ListParagraph"/>
+        <w:numPr>
+          <w:ilvl w:val="0"/>
+          <w:numId w:val="1"/>
+        </w:numPr>
+        <w:spacing w:after="40"/>
+      </w:pPr>
+      <w:r>
+        <w:rPr>
+          <w:color w:val="1D2D3E"/>
+          <w:sz w:val="22"/>
+          <w:szCs w:val="22"/>
+        </w:rPr>
+        <w:t xml:space="preserve">Vendor/Customer recently viewed (Session 36): VendorDetailScreen + CustomerDetailScreen call addRecentlyViewed() on load; Dashboard switch handles 'vendor'/'customer' types → Finance &gt; VendorDetail/CustomerDetail navigation</w:t>
+      </w:r>
+    </w:p>
+    <w:p>
+      <w:pPr>
+        <w:pStyle w:val="ListParagraph"/>
+        <w:numPr>
+          <w:ilvl w:val="0"/>
+          <w:numId w:val="1"/>
+        </w:numPr>
+        <w:spacing w:after="40"/>
+      </w:pPr>
+      <w:r>
+        <w:rPr>
+          <w:color w:val="1D2D3E"/>
+          <w:sz w:val="22"/>
+          <w:szCs w:val="22"/>
+        </w:rPr>
+        <w:t xml:space="preserve">src/components/WeeklyScheduleCard.tsx (Session 36): reusable weekly bucket schedule card with proportional bars + date range sublabels; mounted on AP Summary ('Payment Schedule') and AR Summary ('Collection Schedule') tabs with 4-week + overdue horizon</w:t>
       </w:r>
     </w:p>
     <w:p>
@@ -25475,6 +25851,357 @@
           <w:szCs w:val="22"/>
         </w:rPr>
         <w:t xml:space="preserve">  Tapping a history row repopulates the query field</w:t>
+      </w:r>
+    </w:p>
+    <w:p>
+      <w:pPr>
+        <w:spacing w:after="80"/>
+      </w:pPr>
+      <w:r>
+        <w:rPr>
+          <w:color w:val="1D2D3E"/>
+          <w:sz w:val="22"/>
+          <w:szCs w:val="22"/>
+        </w:rPr>
+        <w:t xml:space="preserve"/>
+      </w:r>
+    </w:p>
+    <w:p>
+      <w:pPr>
+        <w:pStyle w:val="Heading2"/>
+        <w:spacing w:after="120" w:before="300"/>
+      </w:pPr>
+      <w:r>
+        <w:rPr>
+          <w:b/>
+          <w:bCs/>
+          <w:color w:val="1D2D3E"/>
+        </w:rPr>
+        <w:t xml:space="preserve">Session 36 — 2026-06-01</w:t>
+      </w:r>
+    </w:p>
+    <w:p>
+      <w:pPr>
+        <w:pStyle w:val="ListParagraph"/>
+        <w:numPr>
+          <w:ilvl w:val="0"/>
+          <w:numId w:val="1"/>
+        </w:numPr>
+        <w:spacing w:after="40"/>
+      </w:pPr>
+      <w:r>
+        <w:rPr>
+          <w:color w:val="1D2D3E"/>
+          <w:sz w:val="22"/>
+          <w:szCs w:val="22"/>
+        </w:rPr>
+        <w:t xml:space="preserve">6-Month Outstanding Balance Trend Chart (MonthlyBalanceChart.tsx)</w:t>
+      </w:r>
+    </w:p>
+    <w:p>
+      <w:pPr>
+        <w:pStyle w:val="ListParagraph"/>
+        <w:numPr>
+          <w:ilvl w:val="1"/>
+          <w:numId w:val="1"/>
+        </w:numPr>
+        <w:spacing w:after="40"/>
+      </w:pPr>
+      <w:r>
+        <w:rPr>
+          <w:color w:val="1D2D3E"/>
+          <w:sz w:val="22"/>
+          <w:szCs w:val="22"/>
+        </w:rPr>
+        <w:t xml:space="preserve">  New shared component: takes {date, balance}[] ledger entries; computeMonthlyBalances() finds closing balance per month-end</w:t>
+      </w:r>
+    </w:p>
+    <w:p>
+      <w:pPr>
+        <w:pStyle w:val="ListParagraph"/>
+        <w:numPr>
+          <w:ilvl w:val="1"/>
+          <w:numId w:val="1"/>
+        </w:numPr>
+        <w:spacing w:after="40"/>
+      </w:pPr>
+      <w:r>
+        <w:rPr>
+          <w:color w:val="1D2D3E"/>
+          <w:sz w:val="22"/>
+          <w:szCs w:val="22"/>
+        </w:rPr>
+        <w:t xml:space="preserve">  6 vertical bars, heights proportional to max balance; current month is bold/dark; fmtShort() formats as 45K/1.2M</w:t>
+      </w:r>
+    </w:p>
+    <w:p>
+      <w:pPr>
+        <w:pStyle w:val="ListParagraph"/>
+        <w:numPr>
+          <w:ilvl w:val="1"/>
+          <w:numId w:val="1"/>
+        </w:numPr>
+        <w:spacing w:after="40"/>
+      </w:pPr>
+      <w:r>
+        <w:rPr>
+          <w:color w:val="1D2D3E"/>
+          <w:sz w:val="22"/>
+          <w:szCs w:val="22"/>
+        </w:rPr>
+        <w:t xml:space="preserve">  Added to VendorDetailScreen between aging chart and contact card — '6-MONTH OUTSTANDING TREND' label</w:t>
+      </w:r>
+    </w:p>
+    <w:p>
+      <w:pPr>
+        <w:pStyle w:val="ListParagraph"/>
+        <w:numPr>
+          <w:ilvl w:val="1"/>
+          <w:numId w:val="1"/>
+        </w:numPr>
+        <w:spacing w:after="40"/>
+      </w:pPr>
+      <w:r>
+        <w:rPr>
+          <w:color w:val="1D2D3E"/>
+          <w:sz w:val="22"/>
+          <w:szCs w:val="22"/>
+        </w:rPr>
+        <w:t xml:space="preserve">  Added to CustomerDetailScreen in same position; only rendered when ledgerEntries.length &gt; 0</w:t>
+      </w:r>
+    </w:p>
+    <w:p>
+      <w:pPr>
+        <w:pStyle w:val="ListParagraph"/>
+        <w:numPr>
+          <w:ilvl w:val="0"/>
+          <w:numId w:val="1"/>
+        </w:numPr>
+        <w:spacing w:after="40"/>
+      </w:pPr>
+      <w:r>
+        <w:rPr>
+          <w:color w:val="1D2D3E"/>
+          <w:sz w:val="22"/>
+          <w:szCs w:val="22"/>
+        </w:rPr>
+        <w:t xml:space="preserve">Partner list tappable call/email (PartnersScreen.tsx)</w:t>
+      </w:r>
+    </w:p>
+    <w:p>
+      <w:pPr>
+        <w:pStyle w:val="ListParagraph"/>
+        <w:numPr>
+          <w:ilvl w:val="1"/>
+          <w:numId w:val="1"/>
+        </w:numPr>
+        <w:spacing w:after="40"/>
+      </w:pPr>
+      <w:r>
+        <w:rPr>
+          <w:color w:val="1D2D3E"/>
+          <w:sz w:val="22"/>
+          <w:szCs w:val="22"/>
+        </w:rPr>
+        <w:t xml:space="preserve">  Linking imported from React Native; email row wrapped in TouchableOpacity → Linking.openURL('mailto:...')</w:t>
+      </w:r>
+    </w:p>
+    <w:p>
+      <w:pPr>
+        <w:pStyle w:val="ListParagraph"/>
+        <w:numPr>
+          <w:ilvl w:val="1"/>
+          <w:numId w:val="1"/>
+        </w:numPr>
+        <w:spacing w:after="40"/>
+      </w:pPr>
+      <w:r>
+        <w:rPr>
+          <w:color w:val="1D2D3E"/>
+          <w:sz w:val="22"/>
+          <w:szCs w:val="22"/>
+        </w:rPr>
+        <w:t xml:space="preserve">  Phone row wrapped in TouchableOpacity → Linking.openURL('tel:...'); contactTextTappable style adds underline</w:t>
+      </w:r>
+    </w:p>
+    <w:p>
+      <w:pPr>
+        <w:pStyle w:val="ListParagraph"/>
+        <w:numPr>
+          <w:ilvl w:val="0"/>
+          <w:numId w:val="1"/>
+        </w:numPr>
+        <w:spacing w:after="40"/>
+      </w:pPr>
+      <w:r>
+        <w:rPr>
+          <w:color w:val="1D2D3E"/>
+          <w:sz w:val="22"/>
+          <w:szCs w:val="22"/>
+        </w:rPr>
+        <w:t xml:space="preserve">Vendor/Customer recently viewed tracking (VendorDetailScreen.tsx, CustomerDetailScreen.tsx, DashboardScreen.tsx)</w:t>
+      </w:r>
+    </w:p>
+    <w:p>
+      <w:pPr>
+        <w:pStyle w:val="ListParagraph"/>
+        <w:numPr>
+          <w:ilvl w:val="1"/>
+          <w:numId w:val="1"/>
+        </w:numPr>
+        <w:spacing w:after="40"/>
+      </w:pPr>
+      <w:r>
+        <w:rPr>
+          <w:color w:val="1D2D3E"/>
+          <w:sz w:val="22"/>
+          <w:szCs w:val="22"/>
+        </w:rPr>
+        <w:t xml:space="preserve">  Both screens call addRecentlyViewed() in useEffect([loading]) after data loads; type: 'vendor'/'customer'</w:t>
+      </w:r>
+    </w:p>
+    <w:p>
+      <w:pPr>
+        <w:pStyle w:val="ListParagraph"/>
+        <w:numPr>
+          <w:ilvl w:val="1"/>
+          <w:numId w:val="1"/>
+        </w:numPr>
+        <w:spacing w:after="40"/>
+      </w:pPr>
+      <w:r>
+        <w:rPr>
+          <w:color w:val="1D2D3E"/>
+          <w:sz w:val="22"/>
+          <w:szCs w:val="22"/>
+        </w:rPr>
+        <w:t xml:space="preserve">  Dashboard switch statement gains 'vendor' case → Finance &gt; VendorDetail and 'customer' case → Finance &gt; CustomerDetail</w:t>
+      </w:r>
+    </w:p>
+    <w:p>
+      <w:pPr>
+        <w:pStyle w:val="ListParagraph"/>
+        <w:numPr>
+          <w:ilvl w:val="1"/>
+          <w:numId w:val="1"/>
+        </w:numPr>
+        <w:spacing w:after="40"/>
+      </w:pPr>
+      <w:r>
+        <w:rPr>
+          <w:color w:val="1D2D3E"/>
+          <w:sz w:val="22"/>
+          <w:szCs w:val="22"/>
+        </w:rPr>
+        <w:t xml:space="preserve">  Icons already defined in RecentlyViewedSection (briefcase/user) — no component changes needed</w:t>
+      </w:r>
+    </w:p>
+    <w:p>
+      <w:pPr>
+        <w:pStyle w:val="ListParagraph"/>
+        <w:numPr>
+          <w:ilvl w:val="0"/>
+          <w:numId w:val="1"/>
+        </w:numPr>
+        <w:spacing w:after="40"/>
+      </w:pPr>
+      <w:r>
+        <w:rPr>
+          <w:color w:val="1D2D3E"/>
+          <w:sz w:val="22"/>
+          <w:szCs w:val="22"/>
+        </w:rPr>
+        <w:t xml:space="preserve">Weekly Payment/Collection Schedule (WeeklyScheduleCard.tsx, AccountsPayableScreen.tsx, AccountsReceivableScreen.tsx)</w:t>
+      </w:r>
+    </w:p>
+    <w:p>
+      <w:pPr>
+        <w:pStyle w:val="ListParagraph"/>
+        <w:numPr>
+          <w:ilvl w:val="1"/>
+          <w:numId w:val="1"/>
+        </w:numPr>
+        <w:spacing w:after="40"/>
+      </w:pPr>
+      <w:r>
+        <w:rPr>
+          <w:color w:val="1D2D3E"/>
+          <w:sz w:val="22"/>
+          <w:szCs w:val="22"/>
+        </w:rPr>
+        <w:t xml:space="preserve">  New WeeklyScheduleCard component: list of WeekBucket rows with label + date range sublabel + proportional bar + amount + count</w:t>
+      </w:r>
+    </w:p>
+    <w:p>
+      <w:pPr>
+        <w:pStyle w:val="ListParagraph"/>
+        <w:numPr>
+          <w:ilvl w:val="1"/>
+          <w:numId w:val="1"/>
+        </w:numPr>
+        <w:spacing w:after="40"/>
+      </w:pPr>
+      <w:r>
+        <w:rPr>
+          <w:color w:val="1D2D3E"/>
+          <w:sz w:val="22"/>
+          <w:szCs w:val="22"/>
+        </w:rPr>
+        <w:t xml:space="preserve">  Overdue bucket: bold label + dark bar; regular weeks: textSecondary bar; card hidden when all amounts are zero</w:t>
+      </w:r>
+    </w:p>
+    <w:p>
+      <w:pPr>
+        <w:pStyle w:val="ListParagraph"/>
+        <w:numPr>
+          <w:ilvl w:val="1"/>
+          <w:numId w:val="1"/>
+        </w:numPr>
+        <w:spacing w:after="40"/>
+      </w:pPr>
+      <w:r>
+        <w:rPr>
+          <w:color w:val="1D2D3E"/>
+          <w:sz w:val="22"/>
+          <w:szCs w:val="22"/>
+        </w:rPr>
+        <w:t xml:space="preserve">  AP Summary tab: apWeeklyBuckets (Overdue / This Week / Week 2 / Week 3 / Week 4 / Later) — 'Payment Schedule' section</w:t>
+      </w:r>
+    </w:p>
+    <w:p>
+      <w:pPr>
+        <w:pStyle w:val="ListParagraph"/>
+        <w:numPr>
+          <w:ilvl w:val="1"/>
+          <w:numId w:val="1"/>
+        </w:numPr>
+        <w:spacing w:after="40"/>
+      </w:pPr>
+      <w:r>
+        <w:rPr>
+          <w:color w:val="1D2D3E"/>
+          <w:sz w:val="22"/>
+          <w:szCs w:val="22"/>
+        </w:rPr>
+        <w:t xml:space="preserve">  AR Summary tab: arWeeklyBuckets same structure — 'Collection Schedule' section</w:t>
+      </w:r>
+    </w:p>
+    <w:p>
+      <w:pPr>
+        <w:pStyle w:val="ListParagraph"/>
+        <w:numPr>
+          <w:ilvl w:val="1"/>
+          <w:numId w:val="1"/>
+        </w:numPr>
+        <w:spacing w:after="40"/>
+      </w:pPr>
+      <w:r>
+        <w:rPr>
+          <w:color w:val="1D2D3E"/>
+          <w:sz w:val="22"/>
+          <w:szCs w:val="22"/>
+        </w:rPr>
+        <w:t xml:space="preserve">  getWeekRange() / fmtDateRange() helpers compute human-readable date ranges (e.g. 'Jun 1–7')</w:t>
       </w:r>
     </w:p>
     <w:p>

</xml_diff>

<commit_message>
docs(session-37): update PROGRESS.md, generate-docs.js, and FEATURES.docx with Session 37 changelog
- PROGRESS.md: Session 37 completed features (CSV export, PO delivery notifications, bill/invoice flags)
- generate-docs.js: session 37 roadmap table rows + changelog section + sections 3.40–3.42
- FEATURES.docx: regenerated
</commit_message>
<xml_diff>
--- a/FEATURES.docx
+++ b/FEATURES.docx
@@ -9075,6 +9075,519 @@
     </w:p>
     <w:p>
       <w:pPr>
+        <w:pStyle w:val="Heading2"/>
+        <w:spacing w:after="120" w:before="300"/>
+      </w:pPr>
+      <w:r>
+        <w:rPr>
+          <w:b/>
+          <w:bCs/>
+          <w:color w:val="1D2D3E"/>
+        </w:rPr>
+        <w:t xml:space="preserve">3.40 CSV Share Export (Session 37)</w:t>
+      </w:r>
+    </w:p>
+    <w:p>
+      <w:pPr>
+        <w:pStyle w:val="ListParagraph"/>
+        <w:numPr>
+          <w:ilvl w:val="0"/>
+          <w:numId w:val="1"/>
+        </w:numPr>
+        <w:spacing w:after="40"/>
+      </w:pPr>
+      <w:r>
+        <w:rPr>
+          <w:color w:val="1D2D3E"/>
+          <w:sz w:val="22"/>
+          <w:szCs w:val="22"/>
+        </w:rPr>
+        <w:t xml:space="preserve">src/utils/csvExport.ts: RFC 4180-compliant CSV generation with proper value escaping</w:t>
+      </w:r>
+    </w:p>
+    <w:p>
+      <w:pPr>
+        <w:pStyle w:val="ListParagraph"/>
+        <w:numPr>
+          <w:ilvl w:val="1"/>
+          <w:numId w:val="1"/>
+        </w:numPr>
+        <w:spacing w:after="40"/>
+      </w:pPr>
+      <w:r>
+        <w:rPr>
+          <w:color w:val="1D2D3E"/>
+          <w:sz w:val="22"/>
+          <w:szCs w:val="22"/>
+        </w:rPr>
+        <w:t xml:space="preserve">  exportTrialBalanceCSV(): company/date header + account rows (code/name/level/debit/credit) + totals</w:t>
+      </w:r>
+    </w:p>
+    <w:p>
+      <w:pPr>
+        <w:pStyle w:val="ListParagraph"/>
+        <w:numPr>
+          <w:ilvl w:val="1"/>
+          <w:numId w:val="1"/>
+        </w:numPr>
+        <w:spacing w:after="40"/>
+      </w:pPr>
+      <w:r>
+        <w:rPr>
+          <w:color w:val="1D2D3E"/>
+          <w:sz w:val="22"/>
+          <w:szCs w:val="22"/>
+        </w:rPr>
+        <w:t xml:space="preserve">  exportJournalEntriesCSV(): one flat row per JE line — all voucher + account + amount columns</w:t>
+      </w:r>
+    </w:p>
+    <w:p>
+      <w:pPr>
+        <w:pStyle w:val="ListParagraph"/>
+        <w:numPr>
+          <w:ilvl w:val="1"/>
+          <w:numId w:val="1"/>
+        </w:numPr>
+        <w:spacing w:after="40"/>
+      </w:pPr>
+      <w:r>
+        <w:rPr>
+          <w:color w:val="1D2D3E"/>
+          <w:sz w:val="22"/>
+          <w:szCs w:val="22"/>
+        </w:rPr>
+        <w:t xml:space="preserve">  exportAPBillsCSV() + exportARInvoicesCSV() prepared for future integration</w:t>
+      </w:r>
+    </w:p>
+    <w:p>
+      <w:pPr>
+        <w:pStyle w:val="ListParagraph"/>
+        <w:numPr>
+          <w:ilvl w:val="1"/>
+          <w:numId w:val="1"/>
+        </w:numPr>
+        <w:spacing w:after="40"/>
+      </w:pPr>
+      <w:r>
+        <w:rPr>
+          <w:color w:val="1D2D3E"/>
+          <w:sz w:val="22"/>
+          <w:szCs w:val="22"/>
+        </w:rPr>
+        <w:t xml:space="preserve">  Uses Share.share() — no extra packages; native share sheet on iOS/Android</w:t>
+      </w:r>
+    </w:p>
+    <w:p>
+      <w:pPr>
+        <w:pStyle w:val="ListParagraph"/>
+        <w:numPr>
+          <w:ilvl w:val="0"/>
+          <w:numId w:val="1"/>
+        </w:numPr>
+        <w:spacing w:after="40"/>
+      </w:pPr>
+      <w:r>
+        <w:rPr>
+          <w:color w:val="1D2D3E"/>
+          <w:sz w:val="22"/>
+          <w:szCs w:val="22"/>
+        </w:rPr>
+        <w:t xml:space="preserve">TrialBalanceScreen: 'Share' button replaced with 'CSV' (grid icon) button calling exportTrialBalanceCSV</w:t>
+      </w:r>
+    </w:p>
+    <w:p>
+      <w:pPr>
+        <w:pStyle w:val="ListParagraph"/>
+        <w:numPr>
+          <w:ilvl w:val="0"/>
+          <w:numId w:val="1"/>
+        </w:numPr>
+        <w:spacing w:after="40"/>
+      </w:pPr>
+      <w:r>
+        <w:rPr>
+          <w:color w:val="1D2D3E"/>
+          <w:sz w:val="22"/>
+          <w:szCs w:val="22"/>
+        </w:rPr>
+        <w:t xml:space="preserve">JournalEntriesScreen: 'Share' button replaced with 'CSV' (grid icon) button calling exportJournalEntriesCSV</w:t>
+      </w:r>
+    </w:p>
+    <w:p>
+      <w:pPr>
+        <w:spacing w:after="80"/>
+      </w:pPr>
+      <w:r>
+        <w:rPr>
+          <w:color w:val="1D2D3E"/>
+          <w:sz w:val="22"/>
+          <w:szCs w:val="22"/>
+        </w:rPr>
+        <w:t xml:space="preserve"/>
+      </w:r>
+    </w:p>
+    <w:p>
+      <w:pPr>
+        <w:pStyle w:val="Heading2"/>
+        <w:spacing w:after="120" w:before="300"/>
+      </w:pPr>
+      <w:r>
+        <w:rPr>
+          <w:b/>
+          <w:bCs/>
+          <w:color w:val="1D2D3E"/>
+        </w:rPr>
+        <w:t xml:space="preserve">3.41 PO Delivery Approaching Notifications (Session 37)</w:t>
+      </w:r>
+    </w:p>
+    <w:p>
+      <w:pPr>
+        <w:pStyle w:val="ListParagraph"/>
+        <w:numPr>
+          <w:ilvl w:val="0"/>
+          <w:numId w:val="1"/>
+        </w:numPr>
+        <w:spacing w:after="40"/>
+      </w:pPr>
+      <w:r>
+        <w:rPr>
+          <w:color w:val="1D2D3E"/>
+          <w:sz w:val="22"/>
+          <w:szCs w:val="22"/>
+        </w:rPr>
+        <w:t xml:space="preserve">settings.ts: NOTIFY_PO_DELIVERY (bool, default true) + PO_DELIVERY_DAYS (int, default 3) with full get/set API</w:t>
+      </w:r>
+    </w:p>
+    <w:p>
+      <w:pPr>
+        <w:pStyle w:val="ListParagraph"/>
+        <w:numPr>
+          <w:ilvl w:val="0"/>
+          <w:numId w:val="1"/>
+        </w:numPr>
+        <w:spacing w:after="40"/>
+      </w:pPr>
+      <w:r>
+        <w:rPr>
+          <w:color w:val="1D2D3E"/>
+          <w:sz w:val="22"/>
+          <w:szCs w:val="22"/>
+        </w:rPr>
+        <w:t xml:space="preserve">notifications.ts: schedulePoDeliveryReminder(orders[]) — counts open POs with delivery overdue or within N days</w:t>
+      </w:r>
+    </w:p>
+    <w:p>
+      <w:pPr>
+        <w:pStyle w:val="ListParagraph"/>
+        <w:numPr>
+          <w:ilvl w:val="1"/>
+          <w:numId w:val="1"/>
+        </w:numPr>
+        <w:spacing w:after="40"/>
+      </w:pPr>
+      <w:r>
+        <w:rPr>
+          <w:color w:val="1D2D3E"/>
+          <w:sz w:val="22"/>
+          <w:szCs w:val="22"/>
+        </w:rPr>
+        <w:t xml:space="preserve">  Fires 1 hour after overdue reminder to avoid stacking; IDENTIFIER_PO_DELIVERY = 'poultry-erp-po-delivery'</w:t>
+      </w:r>
+    </w:p>
+    <w:p>
+      <w:pPr>
+        <w:pStyle w:val="ListParagraph"/>
+        <w:numPr>
+          <w:ilvl w:val="1"/>
+          <w:numId w:val="1"/>
+        </w:numPr>
+        <w:spacing w:after="40"/>
+      </w:pPr>
+      <w:r>
+        <w:rPr>
+          <w:color w:val="1D2D3E"/>
+          <w:sz w:val="22"/>
+          <w:szCs w:val="22"/>
+        </w:rPr>
+        <w:t xml:space="preserve">  cancelPoDeliveryReminder() for settings toggle</w:t>
+      </w:r>
+    </w:p>
+    <w:p>
+      <w:pPr>
+        <w:pStyle w:val="ListParagraph"/>
+        <w:numPr>
+          <w:ilvl w:val="0"/>
+          <w:numId w:val="1"/>
+        </w:numPr>
+        <w:spacing w:after="40"/>
+      </w:pPr>
+      <w:r>
+        <w:rPr>
+          <w:color w:val="1D2D3E"/>
+          <w:sz w:val="22"/>
+          <w:szCs w:val="22"/>
+        </w:rPr>
+        <w:t xml:space="preserve">PurchaseOrdersScreen: schedulePoDeliveryReminder(data) called after each fresh API fetch (best-effort, non-blocking)</w:t>
+      </w:r>
+    </w:p>
+    <w:p>
+      <w:pPr>
+        <w:pStyle w:val="ListParagraph"/>
+        <w:numPr>
+          <w:ilvl w:val="0"/>
+          <w:numId w:val="1"/>
+        </w:numPr>
+        <w:spacing w:after="40"/>
+      </w:pPr>
+      <w:r>
+        <w:rPr>
+          <w:color w:val="1D2D3E"/>
+          <w:sz w:val="22"/>
+          <w:szCs w:val="22"/>
+        </w:rPr>
+        <w:t xml:space="preserve">SettingsScreen: 'PO delivery approaching' toggle inside Notifications section + standalone chip-picker for days</w:t>
+      </w:r>
+    </w:p>
+    <w:p>
+      <w:pPr>
+        <w:pStyle w:val="ListParagraph"/>
+        <w:numPr>
+          <w:ilvl w:val="0"/>
+          <w:numId w:val="1"/>
+        </w:numPr>
+        <w:spacing w:after="40"/>
+      </w:pPr>
+      <w:r>
+        <w:rPr>
+          <w:color w:val="1D2D3E"/>
+          <w:sz w:val="22"/>
+          <w:szCs w:val="22"/>
+        </w:rPr>
+        <w:t xml:space="preserve">AppNavigator: tapping the PO delivery notification navigates to PurchaseOrders screen</w:t>
+      </w:r>
+    </w:p>
+    <w:p>
+      <w:pPr>
+        <w:spacing w:after="80"/>
+      </w:pPr>
+      <w:r>
+        <w:rPr>
+          <w:color w:val="1D2D3E"/>
+          <w:sz w:val="22"/>
+          <w:szCs w:val="22"/>
+        </w:rPr>
+        <w:t xml:space="preserve"/>
+      </w:r>
+    </w:p>
+    <w:p>
+      <w:pPr>
+        <w:pStyle w:val="Heading2"/>
+        <w:spacing w:after="120" w:before="300"/>
+      </w:pPr>
+      <w:r>
+        <w:rPr>
+          <w:b/>
+          <w:bCs/>
+          <w:color w:val="1D2D3E"/>
+        </w:rPr>
+        <w:t xml:space="preserve">3.42 Bill/Invoice Flag System (Session 37)</w:t>
+      </w:r>
+    </w:p>
+    <w:p>
+      <w:pPr>
+        <w:pStyle w:val="ListParagraph"/>
+        <w:numPr>
+          <w:ilvl w:val="0"/>
+          <w:numId w:val="1"/>
+        </w:numPr>
+        <w:spacing w:after="40"/>
+      </w:pPr>
+      <w:r>
+        <w:rPr>
+          <w:color w:val="1D2D3E"/>
+          <w:sz w:val="22"/>
+          <w:szCs w:val="22"/>
+        </w:rPr>
+        <w:t xml:space="preserve">src/utils/flaggedItems.ts: AsyncStorage-backed flag toggle by type ('bill' | 'invoice')</w:t>
+      </w:r>
+    </w:p>
+    <w:p>
+      <w:pPr>
+        <w:pStyle w:val="ListParagraph"/>
+        <w:numPr>
+          <w:ilvl w:val="1"/>
+          <w:numId w:val="1"/>
+        </w:numPr>
+        <w:spacing w:after="40"/>
+      </w:pPr>
+      <w:r>
+        <w:rPr>
+          <w:color w:val="1D2D3E"/>
+          <w:sz w:val="22"/>
+          <w:szCs w:val="22"/>
+        </w:rPr>
+        <w:t xml:space="preserve">  toggleFlagged(type, id) returns new boolean state; getFlaggedIds(type) returns Set&lt;number&gt;</w:t>
+      </w:r>
+    </w:p>
+    <w:p>
+      <w:pPr>
+        <w:pStyle w:val="ListParagraph"/>
+        <w:numPr>
+          <w:ilvl w:val="1"/>
+          <w:numId w:val="1"/>
+        </w:numPr>
+        <w:spacing w:after="40"/>
+      </w:pPr>
+      <w:r>
+        <w:rPr>
+          <w:color w:val="1D2D3E"/>
+          <w:sz w:val="22"/>
+          <w:szCs w:val="22"/>
+        </w:rPr>
+        <w:t xml:space="preserve">  isFlagged(type, id) for one-off checks; clearAllFlagged(type) for cleanup</w:t>
+      </w:r>
+    </w:p>
+    <w:p>
+      <w:pPr>
+        <w:pStyle w:val="ListParagraph"/>
+        <w:numPr>
+          <w:ilvl w:val="0"/>
+          <w:numId w:val="1"/>
+        </w:numPr>
+        <w:spacing w:after="40"/>
+      </w:pPr>
+      <w:r>
+        <w:rPr>
+          <w:color w:val="1D2D3E"/>
+          <w:sz w:val="22"/>
+          <w:szCs w:val="22"/>
+        </w:rPr>
+        <w:t xml:space="preserve">AccountsPayableScreen bills tab:</w:t>
+      </w:r>
+    </w:p>
+    <w:p>
+      <w:pPr>
+        <w:pStyle w:val="ListParagraph"/>
+        <w:numPr>
+          <w:ilvl w:val="1"/>
+          <w:numId w:val="1"/>
+        </w:numPr>
+        <w:spacing w:after="40"/>
+      </w:pPr>
+      <w:r>
+        <w:rPr>
+          <w:color w:val="1D2D3E"/>
+          <w:sz w:val="22"/>
+          <w:szCs w:val="22"/>
+        </w:rPr>
+        <w:t xml:space="preserve">  flaggedBillIds: Set&lt;number&gt; state loaded from AsyncStorage on mount</w:t>
+      </w:r>
+    </w:p>
+    <w:p>
+      <w:pPr>
+        <w:pStyle w:val="ListParagraph"/>
+        <w:numPr>
+          <w:ilvl w:val="1"/>
+          <w:numId w:val="1"/>
+        </w:numPr>
+        <w:spacing w:after="40"/>
+      </w:pPr>
+      <w:r>
+        <w:rPr>
+          <w:color w:val="1D2D3E"/>
+          <w:sz w:val="22"/>
+          <w:szCs w:val="22"/>
+        </w:rPr>
+        <w:t xml:space="preserve">  Star chip ⭐ in filter row shows count badge; toggles showFlaggedOnly boolean filter</w:t>
+      </w:r>
+    </w:p>
+    <w:p>
+      <w:pPr>
+        <w:pStyle w:val="ListParagraph"/>
+        <w:numPr>
+          <w:ilvl w:val="1"/>
+          <w:numId w:val="1"/>
+        </w:numPr>
+        <w:spacing w:after="40"/>
+      </w:pPr>
+      <w:r>
+        <w:rPr>
+          <w:color w:val="1D2D3E"/>
+          <w:sz w:val="22"/>
+          <w:szCs w:val="22"/>
+        </w:rPr>
+        <w:t xml:space="preserve">  BillCard: star icon button (Feather 'star') in card header — filled Colors.text when flagged, Colors.borderLight outline when not</w:t>
+      </w:r>
+    </w:p>
+    <w:p>
+      <w:pPr>
+        <w:pStyle w:val="ListParagraph"/>
+        <w:numPr>
+          <w:ilvl w:val="1"/>
+          <w:numId w:val="1"/>
+        </w:numPr>
+        <w:spacing w:after="40"/>
+      </w:pPr>
+      <w:r>
+        <w:rPr>
+          <w:color w:val="1D2D3E"/>
+          <w:sz w:val="22"/>
+          <w:szCs w:val="22"/>
+        </w:rPr>
+        <w:t xml:space="preserve">  onToggleFlag writes to AsyncStorage then reloads full flag set for consistency</w:t>
+      </w:r>
+    </w:p>
+    <w:p>
+      <w:pPr>
+        <w:pStyle w:val="ListParagraph"/>
+        <w:numPr>
+          <w:ilvl w:val="0"/>
+          <w:numId w:val="1"/>
+        </w:numPr>
+        <w:spacing w:after="40"/>
+      </w:pPr>
+      <w:r>
+        <w:rPr>
+          <w:color w:val="1D2D3E"/>
+          <w:sz w:val="22"/>
+          <w:szCs w:val="22"/>
+        </w:rPr>
+        <w:t xml:space="preserve">AccountsReceivableScreen invoices tab: identical InvoiceCard + flaggedInvoiceIds pattern</w:t>
+      </w:r>
+    </w:p>
+    <w:p>
+      <w:pPr>
+        <w:pStyle w:val="ListParagraph"/>
+        <w:numPr>
+          <w:ilvl w:val="0"/>
+          <w:numId w:val="1"/>
+        </w:numPr>
+        <w:spacing w:after="40"/>
+      </w:pPr>
+      <w:r>
+        <w:rPr>
+          <w:color w:val="1D2D3E"/>
+          <w:sz w:val="22"/>
+          <w:szCs w:val="22"/>
+        </w:rPr>
+        <w:t xml:space="preserve">Flags persist across app restarts; star filter composable with overdue / due-soon filters</w:t>
+      </w:r>
+    </w:p>
+    <w:p>
+      <w:pPr>
+        <w:spacing w:after="80"/>
+      </w:pPr>
+      <w:r>
+        <w:rPr>
+          <w:color w:val="1D2D3E"/>
+          <w:sz w:val="22"/>
+          <w:szCs w:val="22"/>
+        </w:rPr>
+        <w:t xml:space="preserve"/>
+      </w:r>
+    </w:p>
+    <w:p>
+      <w:pPr>
         <w:pStyle w:val="Heading1"/>
         <w:spacing w:after="120" w:before="300"/>
       </w:pPr>
@@ -20769,6 +21282,228 @@
           </w:p>
         </w:tc>
       </w:tr>
+      <w:tr>
+        <w:tc>
+          <w:p>
+            <w:pPr>
+              <w:spacing w:after="40" w:before="40"/>
+            </w:pPr>
+            <w:r>
+              <w:rPr>
+                <w:b w:val="false"/>
+                <w:bCs w:val="false"/>
+                <w:color w:val="1D2D3E"/>
+                <w:sz w:val="20"/>
+                <w:szCs w:val="20"/>
+              </w:rPr>
+              <w:t xml:space="preserve">Session 37</w:t>
+            </w:r>
+          </w:p>
+        </w:tc>
+        <w:tc>
+          <w:p>
+            <w:pPr>
+              <w:spacing w:after="40" w:before="40"/>
+            </w:pPr>
+            <w:r>
+              <w:rPr>
+                <w:b w:val="false"/>
+                <w:bCs w:val="false"/>
+                <w:color w:val="1D2D3E"/>
+                <w:sz w:val="20"/>
+                <w:szCs w:val="20"/>
+              </w:rPr>
+              <w:t xml:space="preserve">CSV Share Export for Trial Balance + Journal Entries — exportTrialBalanceCSV / exportJournalEntriesCSV using Share.share()</w:t>
+            </w:r>
+          </w:p>
+        </w:tc>
+        <w:tc>
+          <w:p>
+            <w:pPr>
+              <w:spacing w:after="40" w:before="40"/>
+            </w:pPr>
+            <w:r>
+              <w:rPr>
+                <w:b w:val="false"/>
+                <w:bCs w:val="false"/>
+                <w:color w:val="1D2D3E"/>
+                <w:sz w:val="20"/>
+                <w:szCs w:val="20"/>
+              </w:rPr>
+              <w:t xml:space="preserve">Done</w:t>
+            </w:r>
+          </w:p>
+        </w:tc>
+        <w:tc>
+          <w:p>
+            <w:pPr>
+              <w:spacing w:after="40" w:before="40"/>
+            </w:pPr>
+            <w:r>
+              <w:rPr>
+                <w:b w:val="false"/>
+                <w:bCs w:val="false"/>
+                <w:color w:val="1D2D3E"/>
+                <w:sz w:val="20"/>
+                <w:szCs w:val="20"/>
+              </w:rPr>
+              <w:t xml:space="preserve">csvExport.ts + TrialBalanceScreen.tsx + JournalEntriesScreen.tsx</w:t>
+            </w:r>
+          </w:p>
+        </w:tc>
+      </w:tr>
+      <w:tr>
+        <w:tc>
+          <w:tcPr>
+            <w:shd w:color="F0F4F8" w:val="solid"/>
+          </w:tcPr>
+          <w:p>
+            <w:pPr>
+              <w:spacing w:after="40" w:before="40"/>
+            </w:pPr>
+            <w:r>
+              <w:rPr>
+                <w:b w:val="false"/>
+                <w:bCs w:val="false"/>
+                <w:color w:val="1D2D3E"/>
+                <w:sz w:val="20"/>
+                <w:szCs w:val="20"/>
+              </w:rPr>
+              <w:t xml:space="preserve">Session 37</w:t>
+            </w:r>
+          </w:p>
+        </w:tc>
+        <w:tc>
+          <w:tcPr>
+            <w:shd w:color="F0F4F8" w:val="solid"/>
+          </w:tcPr>
+          <w:p>
+            <w:pPr>
+              <w:spacing w:after="40" w:before="40"/>
+            </w:pPr>
+            <w:r>
+              <w:rPr>
+                <w:b w:val="false"/>
+                <w:bCs w:val="false"/>
+                <w:color w:val="1D2D3E"/>
+                <w:sz w:val="20"/>
+                <w:szCs w:val="20"/>
+              </w:rPr>
+              <w:t xml:space="preserve">PO Delivery Approaching Notifications — schedulePoDeliveryReminder() with configurable lead-time setting</w:t>
+            </w:r>
+          </w:p>
+        </w:tc>
+        <w:tc>
+          <w:tcPr>
+            <w:shd w:color="F0F4F8" w:val="solid"/>
+          </w:tcPr>
+          <w:p>
+            <w:pPr>
+              <w:spacing w:after="40" w:before="40"/>
+            </w:pPr>
+            <w:r>
+              <w:rPr>
+                <w:b w:val="false"/>
+                <w:bCs w:val="false"/>
+                <w:color w:val="1D2D3E"/>
+                <w:sz w:val="20"/>
+                <w:szCs w:val="20"/>
+              </w:rPr>
+              <w:t xml:space="preserve">Done</w:t>
+            </w:r>
+          </w:p>
+        </w:tc>
+        <w:tc>
+          <w:tcPr>
+            <w:shd w:color="F0F4F8" w:val="solid"/>
+          </w:tcPr>
+          <w:p>
+            <w:pPr>
+              <w:spacing w:after="40" w:before="40"/>
+            </w:pPr>
+            <w:r>
+              <w:rPr>
+                <w:b w:val="false"/>
+                <w:bCs w:val="false"/>
+                <w:color w:val="1D2D3E"/>
+                <w:sz w:val="20"/>
+                <w:szCs w:val="20"/>
+              </w:rPr>
+              <w:t xml:space="preserve">settings.ts + notifications.ts + PurchaseOrdersScreen.tsx + SettingsScreen.tsx</w:t>
+            </w:r>
+          </w:p>
+        </w:tc>
+      </w:tr>
+      <w:tr>
+        <w:tc>
+          <w:p>
+            <w:pPr>
+              <w:spacing w:after="40" w:before="40"/>
+            </w:pPr>
+            <w:r>
+              <w:rPr>
+                <w:b w:val="false"/>
+                <w:bCs w:val="false"/>
+                <w:color w:val="1D2D3E"/>
+                <w:sz w:val="20"/>
+                <w:szCs w:val="20"/>
+              </w:rPr>
+              <w:t xml:space="preserve">Session 37</w:t>
+            </w:r>
+          </w:p>
+        </w:tc>
+        <w:tc>
+          <w:p>
+            <w:pPr>
+              <w:spacing w:after="40" w:before="40"/>
+            </w:pPr>
+            <w:r>
+              <w:rPr>
+                <w:b w:val="false"/>
+                <w:bCs w:val="false"/>
+                <w:color w:val="1D2D3E"/>
+                <w:sz w:val="20"/>
+                <w:szCs w:val="20"/>
+              </w:rPr>
+              <w:t xml:space="preserve">Bill/Invoice Flag System — star/flag bills and invoices for follow-up, persisted in AsyncStorage</w:t>
+            </w:r>
+          </w:p>
+        </w:tc>
+        <w:tc>
+          <w:p>
+            <w:pPr>
+              <w:spacing w:after="40" w:before="40"/>
+            </w:pPr>
+            <w:r>
+              <w:rPr>
+                <w:b w:val="false"/>
+                <w:bCs w:val="false"/>
+                <w:color w:val="1D2D3E"/>
+                <w:sz w:val="20"/>
+                <w:szCs w:val="20"/>
+              </w:rPr>
+              <w:t xml:space="preserve">Done</w:t>
+            </w:r>
+          </w:p>
+        </w:tc>
+        <w:tc>
+          <w:p>
+            <w:pPr>
+              <w:spacing w:after="40" w:before="40"/>
+            </w:pPr>
+            <w:r>
+              <w:rPr>
+                <w:b w:val="false"/>
+                <w:bCs w:val="false"/>
+                <w:color w:val="1D2D3E"/>
+                <w:sz w:val="20"/>
+                <w:szCs w:val="20"/>
+              </w:rPr>
+              <w:t xml:space="preserve">flaggedItems.ts + AccountsPayableScreen.tsx + AccountsReceivableScreen.tsx</w:t>
+            </w:r>
+          </w:p>
+        </w:tc>
+      </w:tr>
     </w:tbl>
     <w:p>
       <w:pPr>
@@ -25851,6 +26586,357 @@
           <w:szCs w:val="22"/>
         </w:rPr>
         <w:t xml:space="preserve">  Tapping a history row repopulates the query field</w:t>
+      </w:r>
+    </w:p>
+    <w:p>
+      <w:pPr>
+        <w:spacing w:after="80"/>
+      </w:pPr>
+      <w:r>
+        <w:rPr>
+          <w:color w:val="1D2D3E"/>
+          <w:sz w:val="22"/>
+          <w:szCs w:val="22"/>
+        </w:rPr>
+        <w:t xml:space="preserve"/>
+      </w:r>
+    </w:p>
+    <w:p>
+      <w:pPr>
+        <w:pStyle w:val="Heading2"/>
+        <w:spacing w:after="120" w:before="300"/>
+      </w:pPr>
+      <w:r>
+        <w:rPr>
+          <w:b/>
+          <w:bCs/>
+          <w:color w:val="1D2D3E"/>
+        </w:rPr>
+        <w:t xml:space="preserve">Session 37 — 2026-06-01</w:t>
+      </w:r>
+    </w:p>
+    <w:p>
+      <w:pPr>
+        <w:pStyle w:val="ListParagraph"/>
+        <w:numPr>
+          <w:ilvl w:val="0"/>
+          <w:numId w:val="1"/>
+        </w:numPr>
+        <w:spacing w:after="40"/>
+      </w:pPr>
+      <w:r>
+        <w:rPr>
+          <w:color w:val="1D2D3E"/>
+          <w:sz w:val="22"/>
+          <w:szCs w:val="22"/>
+        </w:rPr>
+        <w:t xml:space="preserve">CSV Share Export (csvExport.ts, TrialBalanceScreen.tsx, JournalEntriesScreen.tsx)</w:t>
+      </w:r>
+    </w:p>
+    <w:p>
+      <w:pPr>
+        <w:pStyle w:val="ListParagraph"/>
+        <w:numPr>
+          <w:ilvl w:val="1"/>
+          <w:numId w:val="1"/>
+        </w:numPr>
+        <w:spacing w:after="40"/>
+      </w:pPr>
+      <w:r>
+        <w:rPr>
+          <w:color w:val="1D2D3E"/>
+          <w:sz w:val="22"/>
+          <w:szCs w:val="22"/>
+        </w:rPr>
+        <w:t xml:space="preserve">  New src/utils/csvExport.ts: RFC 4180-compliant CSV with proper comma/quote/newline escaping</w:t>
+      </w:r>
+    </w:p>
+    <w:p>
+      <w:pPr>
+        <w:pStyle w:val="ListParagraph"/>
+        <w:numPr>
+          <w:ilvl w:val="1"/>
+          <w:numId w:val="1"/>
+        </w:numPr>
+        <w:spacing w:after="40"/>
+      </w:pPr>
+      <w:r>
+        <w:rPr>
+          <w:color w:val="1D2D3E"/>
+          <w:sz w:val="22"/>
+          <w:szCs w:val="22"/>
+        </w:rPr>
+        <w:t xml:space="preserve">  exportTrialBalanceCSV(): company header, account code/name/level/debit/credit rows + totals footer</w:t>
+      </w:r>
+    </w:p>
+    <w:p>
+      <w:pPr>
+        <w:pStyle w:val="ListParagraph"/>
+        <w:numPr>
+          <w:ilvl w:val="1"/>
+          <w:numId w:val="1"/>
+        </w:numPr>
+        <w:spacing w:after="40"/>
+      </w:pPr>
+      <w:r>
+        <w:rPr>
+          <w:color w:val="1D2D3E"/>
+          <w:sz w:val="22"/>
+          <w:szCs w:val="22"/>
+        </w:rPr>
+        <w:t xml:space="preserve">  exportJournalEntriesCSV(): one row per JE line — voucher type/no/date/account/debit/credit/narration/status</w:t>
+      </w:r>
+    </w:p>
+    <w:p>
+      <w:pPr>
+        <w:pStyle w:val="ListParagraph"/>
+        <w:numPr>
+          <w:ilvl w:val="1"/>
+          <w:numId w:val="1"/>
+        </w:numPr>
+        <w:spacing w:after="40"/>
+      </w:pPr>
+      <w:r>
+        <w:rPr>
+          <w:color w:val="1D2D3E"/>
+          <w:sz w:val="22"/>
+          <w:szCs w:val="22"/>
+        </w:rPr>
+        <w:t xml:space="preserve">  exportAPBillsCSV() and exportARInvoicesCSV() prepared for future use</w:t>
+      </w:r>
+    </w:p>
+    <w:p>
+      <w:pPr>
+        <w:pStyle w:val="ListParagraph"/>
+        <w:numPr>
+          <w:ilvl w:val="1"/>
+          <w:numId w:val="1"/>
+        </w:numPr>
+        <w:spacing w:after="40"/>
+      </w:pPr>
+      <w:r>
+        <w:rPr>
+          <w:color w:val="1D2D3E"/>
+          <w:sz w:val="22"/>
+          <w:szCs w:val="22"/>
+        </w:rPr>
+        <w:t xml:space="preserve">  Both screens: 'Share' text button replaced with 'CSV' grid-icon button; unused Share import removed</w:t>
+      </w:r>
+    </w:p>
+    <w:p>
+      <w:pPr>
+        <w:pStyle w:val="ListParagraph"/>
+        <w:numPr>
+          <w:ilvl w:val="0"/>
+          <w:numId w:val="1"/>
+        </w:numPr>
+        <w:spacing w:after="40"/>
+      </w:pPr>
+      <w:r>
+        <w:rPr>
+          <w:color w:val="1D2D3E"/>
+          <w:sz w:val="22"/>
+          <w:szCs w:val="22"/>
+        </w:rPr>
+        <w:t xml:space="preserve">PO Delivery Approaching Notifications (settings.ts, notifications.ts, PurchaseOrdersScreen.tsx, SettingsScreen.tsx)</w:t>
+      </w:r>
+    </w:p>
+    <w:p>
+      <w:pPr>
+        <w:pStyle w:val="ListParagraph"/>
+        <w:numPr>
+          <w:ilvl w:val="1"/>
+          <w:numId w:val="1"/>
+        </w:numPr>
+        <w:spacing w:after="40"/>
+      </w:pPr>
+      <w:r>
+        <w:rPr>
+          <w:color w:val="1D2D3E"/>
+          <w:sz w:val="22"/>
+          <w:szCs w:val="22"/>
+        </w:rPr>
+        <w:t xml:space="preserve">  settings.ts: NOTIFY_PO_DELIVERY (bool, default true) + PO_DELIVERY_DAYS (int, default 3) with getters/setters</w:t>
+      </w:r>
+    </w:p>
+    <w:p>
+      <w:pPr>
+        <w:pStyle w:val="ListParagraph"/>
+        <w:numPr>
+          <w:ilvl w:val="1"/>
+          <w:numId w:val="1"/>
+        </w:numPr>
+        <w:spacing w:after="40"/>
+      </w:pPr>
+      <w:r>
+        <w:rPr>
+          <w:color w:val="1D2D3E"/>
+          <w:sz w:val="22"/>
+          <w:szCs w:val="22"/>
+        </w:rPr>
+        <w:t xml:space="preserve">  notifications.ts: schedulePoDeliveryReminder(orders[]) — counts open POs with delivery in window or overdue</w:t>
+      </w:r>
+    </w:p>
+    <w:p>
+      <w:pPr>
+        <w:pStyle w:val="ListParagraph"/>
+        <w:numPr>
+          <w:ilvl w:val="1"/>
+          <w:numId w:val="1"/>
+        </w:numPr>
+        <w:spacing w:after="40"/>
+      </w:pPr>
+      <w:r>
+        <w:rPr>
+          <w:color w:val="1D2D3E"/>
+          <w:sz w:val="22"/>
+          <w:szCs w:val="22"/>
+        </w:rPr>
+        <w:t xml:space="preserve">  Fires 1 hour after overdue reminder (hour+1); IDENTIFIER_PO_DELIVERY constant; cancelPoDeliveryReminder()</w:t>
+      </w:r>
+    </w:p>
+    <w:p>
+      <w:pPr>
+        <w:pStyle w:val="ListParagraph"/>
+        <w:numPr>
+          <w:ilvl w:val="1"/>
+          <w:numId w:val="1"/>
+        </w:numPr>
+        <w:spacing w:after="40"/>
+      </w:pPr>
+      <w:r>
+        <w:rPr>
+          <w:color w:val="1D2D3E"/>
+          <w:sz w:val="22"/>
+          <w:szCs w:val="22"/>
+        </w:rPr>
+        <w:t xml:space="preserve">  PurchaseOrdersScreen: schedulePoDeliveryReminder(data) called after each fresh API fetch (best-effort)</w:t>
+      </w:r>
+    </w:p>
+    <w:p>
+      <w:pPr>
+        <w:pStyle w:val="ListParagraph"/>
+        <w:numPr>
+          <w:ilvl w:val="1"/>
+          <w:numId w:val="1"/>
+        </w:numPr>
+        <w:spacing w:after="40"/>
+      </w:pPr>
+      <w:r>
+        <w:rPr>
+          <w:color w:val="1D2D3E"/>
+          <w:sz w:val="22"/>
+          <w:szCs w:val="22"/>
+        </w:rPr>
+        <w:t xml:space="preserve">  SettingsScreen: 'PO delivery approaching' toggle + 'ALERTS — PO DELIVERY WINDOW' chip (1/2/3/5/7 days)</w:t>
+      </w:r>
+    </w:p>
+    <w:p>
+      <w:pPr>
+        <w:pStyle w:val="ListParagraph"/>
+        <w:numPr>
+          <w:ilvl w:val="1"/>
+          <w:numId w:val="1"/>
+        </w:numPr>
+        <w:spacing w:after="40"/>
+      </w:pPr>
+      <w:r>
+        <w:rPr>
+          <w:color w:val="1D2D3E"/>
+          <w:sz w:val="22"/>
+          <w:szCs w:val="22"/>
+        </w:rPr>
+        <w:t xml:space="preserve">  AppNavigator: tapping PO delivery notification navigates to PurchaseOrders screen</w:t>
+      </w:r>
+    </w:p>
+    <w:p>
+      <w:pPr>
+        <w:pStyle w:val="ListParagraph"/>
+        <w:numPr>
+          <w:ilvl w:val="0"/>
+          <w:numId w:val="1"/>
+        </w:numPr>
+        <w:spacing w:after="40"/>
+      </w:pPr>
+      <w:r>
+        <w:rPr>
+          <w:color w:val="1D2D3E"/>
+          <w:sz w:val="22"/>
+          <w:szCs w:val="22"/>
+        </w:rPr>
+        <w:t xml:space="preserve">Bill/Invoice Flag System (flaggedItems.ts, AccountsPayableScreen.tsx, AccountsReceivableScreen.tsx)</w:t>
+      </w:r>
+    </w:p>
+    <w:p>
+      <w:pPr>
+        <w:pStyle w:val="ListParagraph"/>
+        <w:numPr>
+          <w:ilvl w:val="1"/>
+          <w:numId w:val="1"/>
+        </w:numPr>
+        <w:spacing w:after="40"/>
+      </w:pPr>
+      <w:r>
+        <w:rPr>
+          <w:color w:val="1D2D3E"/>
+          <w:sz w:val="22"/>
+          <w:szCs w:val="22"/>
+        </w:rPr>
+        <w:t xml:space="preserve">  New src/utils/flaggedItems.ts: AsyncStorage-backed per-type flag toggle with toggleFlagged/getFlaggedIds/isFlagged</w:t>
+      </w:r>
+    </w:p>
+    <w:p>
+      <w:pPr>
+        <w:pStyle w:val="ListParagraph"/>
+        <w:numPr>
+          <w:ilvl w:val="1"/>
+          <w:numId w:val="1"/>
+        </w:numPr>
+        <w:spacing w:after="40"/>
+      </w:pPr>
+      <w:r>
+        <w:rPr>
+          <w:color w:val="1D2D3E"/>
+          <w:sz w:val="22"/>
+          <w:szCs w:val="22"/>
+        </w:rPr>
+        <w:t xml:space="preserve">  AccountsPayableScreen bills tab: ⭐ chip with count toggles showFlaggedOnly filter; BillCard star button</w:t>
+      </w:r>
+    </w:p>
+    <w:p>
+      <w:pPr>
+        <w:pStyle w:val="ListParagraph"/>
+        <w:numPr>
+          <w:ilvl w:val="1"/>
+          <w:numId w:val="1"/>
+        </w:numPr>
+        <w:spacing w:after="40"/>
+      </w:pPr>
+      <w:r>
+        <w:rPr>
+          <w:color w:val="1D2D3E"/>
+          <w:sz w:val="22"/>
+          <w:szCs w:val="22"/>
+        </w:rPr>
+        <w:t xml:space="preserve">  AccountsReceivableScreen invoices tab: identical pattern via InvoiceCard + flaggedInvoiceIds state</w:t>
+      </w:r>
+    </w:p>
+    <w:p>
+      <w:pPr>
+        <w:pStyle w:val="ListParagraph"/>
+        <w:numPr>
+          <w:ilvl w:val="1"/>
+          <w:numId w:val="1"/>
+        </w:numPr>
+        <w:spacing w:after="40"/>
+      </w:pPr>
+      <w:r>
+        <w:rPr>
+          <w:color w:val="1D2D3E"/>
+          <w:sz w:val="22"/>
+          <w:szCs w:val="22"/>
+        </w:rPr>
+        <w:t xml:space="preserve">  Flags persist across restarts; star filter composable with overdue/due-soon filters</w:t>
       </w:r>
     </w:p>
     <w:p>

</xml_diff>

<commit_message>
docs(session-38): update PROGRESS.md, generate-docs.js, and FEATURES.docx with Session 38 changelog
- PROGRESS.md: Session 38 entry with AP/AR CSV export, Dashboard Pending Actions card, Stock Health drill-down
- generate-docs.js: sections 3.43-3.45, roadmap rows for Session 38, Session 38 changelog block
- FEATURES.docx: regenerated
</commit_message>
<xml_diff>
--- a/FEATURES.docx
+++ b/FEATURES.docx
@@ -45,7 +45,7 @@
           <w:sz w:val="20"/>
           <w:szCs w:val="20"/>
         </w:rPr>
-        <w:t xml:space="preserve">Generated: 2026-06-01</w:t>
+        <w:t xml:space="preserve">Generated: 2026-06-02</w:t>
       </w:r>
     </w:p>
     <w:p>
@@ -9588,6 +9588,411 @@
     </w:p>
     <w:p>
       <w:pPr>
+        <w:pStyle w:val="Heading2"/>
+        <w:spacing w:after="120" w:before="300"/>
+      </w:pPr>
+      <w:r>
+        <w:rPr>
+          <w:b/>
+          <w:bCs/>
+          <w:color w:val="1D2D3E"/>
+        </w:rPr>
+        <w:t xml:space="preserve">3.43 AP/AR Bills &amp; Invoices CSV Export (Session 38)</w:t>
+      </w:r>
+    </w:p>
+    <w:p>
+      <w:pPr>
+        <w:pStyle w:val="ListParagraph"/>
+        <w:numPr>
+          <w:ilvl w:val="0"/>
+          <w:numId w:val="1"/>
+        </w:numPr>
+        <w:spacing w:after="40"/>
+      </w:pPr>
+      <w:r>
+        <w:rPr>
+          <w:color w:val="1D2D3E"/>
+          <w:sz w:val="22"/>
+          <w:szCs w:val="22"/>
+        </w:rPr>
+        <w:t xml:space="preserve">SectionHeader component: added optional action?: ReactNode prop — renders to the right of the meta label</w:t>
+      </w:r>
+    </w:p>
+    <w:p>
+      <w:pPr>
+        <w:pStyle w:val="ListParagraph"/>
+        <w:numPr>
+          <w:ilvl w:val="0"/>
+          <w:numId w:val="1"/>
+        </w:numPr>
+        <w:spacing w:after="40"/>
+      </w:pPr>
+      <w:r>
+        <w:rPr>
+          <w:color w:val="1D2D3E"/>
+          <w:sz w:val="22"/>
+          <w:szCs w:val="22"/>
+        </w:rPr>
+        <w:t xml:space="preserve">AccountsPayableScreen bills tab: CSV download button in SectionHeader action slot</w:t>
+      </w:r>
+    </w:p>
+    <w:p>
+      <w:pPr>
+        <w:pStyle w:val="ListParagraph"/>
+        <w:numPr>
+          <w:ilvl w:val="1"/>
+          <w:numId w:val="1"/>
+        </w:numPr>
+        <w:spacing w:after="40"/>
+      </w:pPr>
+      <w:r>
+        <w:rPr>
+          <w:color w:val="1D2D3E"/>
+          <w:sz w:val="22"/>
+          <w:szCs w:val="22"/>
+        </w:rPr>
+        <w:t xml:space="preserve">  Calls exportAPBillsCSV() from csvExport.ts with currently-filtered bills (respects overdue/due-soon/flagged filters)</w:t>
+      </w:r>
+    </w:p>
+    <w:p>
+      <w:pPr>
+        <w:pStyle w:val="ListParagraph"/>
+        <w:numPr>
+          <w:ilvl w:val="0"/>
+          <w:numId w:val="1"/>
+        </w:numPr>
+        <w:spacing w:after="40"/>
+      </w:pPr>
+      <w:r>
+        <w:rPr>
+          <w:color w:val="1D2D3E"/>
+          <w:sz w:val="22"/>
+          <w:szCs w:val="22"/>
+        </w:rPr>
+        <w:t xml:space="preserve">AccountsReceivableScreen invoices tab: identical CSV button → exportARInvoicesCSV()</w:t>
+      </w:r>
+    </w:p>
+    <w:p>
+      <w:pPr>
+        <w:pStyle w:val="ListParagraph"/>
+        <w:numPr>
+          <w:ilvl w:val="0"/>
+          <w:numId w:val="1"/>
+        </w:numPr>
+        <w:spacing w:after="40"/>
+      </w:pPr>
+      <w:r>
+        <w:rPr>
+          <w:color w:val="1D2D3E"/>
+          <w:sz w:val="22"/>
+          <w:szCs w:val="22"/>
+        </w:rPr>
+        <w:t xml:space="preserve">Both functions were built in Session 37; this session wires them into the UI</w:t>
+      </w:r>
+    </w:p>
+    <w:p>
+      <w:pPr>
+        <w:spacing w:after="80"/>
+      </w:pPr>
+      <w:r>
+        <w:rPr>
+          <w:color w:val="1D2D3E"/>
+          <w:sz w:val="22"/>
+          <w:szCs w:val="22"/>
+        </w:rPr>
+        <w:t xml:space="preserve"/>
+      </w:r>
+    </w:p>
+    <w:p>
+      <w:pPr>
+        <w:pStyle w:val="Heading2"/>
+        <w:spacing w:after="120" w:before="300"/>
+      </w:pPr>
+      <w:r>
+        <w:rPr>
+          <w:b/>
+          <w:bCs/>
+          <w:color w:val="1D2D3E"/>
+        </w:rPr>
+        <w:t xml:space="preserve">3.44 Dashboard Pending Actions Card (Session 38)</w:t>
+      </w:r>
+    </w:p>
+    <w:p>
+      <w:pPr>
+        <w:pStyle w:val="ListParagraph"/>
+        <w:numPr>
+          <w:ilvl w:val="0"/>
+          <w:numId w:val="1"/>
+        </w:numPr>
+        <w:spacing w:after="40"/>
+      </w:pPr>
+      <w:r>
+        <w:rPr>
+          <w:color w:val="1D2D3E"/>
+          <w:sz w:val="22"/>
+          <w:szCs w:val="22"/>
+        </w:rPr>
+        <w:t xml:space="preserve">Replaced old plain inbox banner with a structured Pending Actions card on DashboardScreen</w:t>
+      </w:r>
+    </w:p>
+    <w:p>
+      <w:pPr>
+        <w:pStyle w:val="ListParagraph"/>
+        <w:numPr>
+          <w:ilvl w:val="0"/>
+          <w:numId w:val="1"/>
+        </w:numPr>
+        <w:spacing w:after="40"/>
+      </w:pPr>
+      <w:r>
+        <w:rPr>
+          <w:color w:val="1D2D3E"/>
+          <w:sz w:val="22"/>
+          <w:szCs w:val="22"/>
+        </w:rPr>
+        <w:t xml:space="preserve">Loads flaggedBillCount + flaggedInvoiceCount via getFlaggedIds() on screen focus</w:t>
+      </w:r>
+    </w:p>
+    <w:p>
+      <w:pPr>
+        <w:pStyle w:val="ListParagraph"/>
+        <w:numPr>
+          <w:ilvl w:val="0"/>
+          <w:numId w:val="1"/>
+        </w:numPr>
+        <w:spacing w:after="40"/>
+      </w:pPr>
+      <w:r>
+        <w:rPr>
+          <w:color w:val="1D2D3E"/>
+          <w:sz w:val="22"/>
+          <w:szCs w:val="22"/>
+        </w:rPr>
+        <w:t xml:space="preserve">Card shows up to three tappable rows: Flagged Bills (→ AP), Flagged Invoices (→ AR), Unread Notifications (→ Inbox)</w:t>
+      </w:r>
+    </w:p>
+    <w:p>
+      <w:pPr>
+        <w:pStyle w:val="ListParagraph"/>
+        <w:numPr>
+          <w:ilvl w:val="0"/>
+          <w:numId w:val="1"/>
+        </w:numPr>
+        <w:spacing w:after="40"/>
+      </w:pPr>
+      <w:r>
+        <w:rPr>
+          <w:color w:val="1D2D3E"/>
+          <w:sz w:val="22"/>
+          <w:szCs w:val="22"/>
+        </w:rPr>
+        <w:t xml:space="preserve">Each row: colored icon badge, label, sublabel, count badge (rounded pill), chevron</w:t>
+      </w:r>
+    </w:p>
+    <w:p>
+      <w:pPr>
+        <w:pStyle w:val="ListParagraph"/>
+        <w:numPr>
+          <w:ilvl w:val="0"/>
+          <w:numId w:val="1"/>
+        </w:numPr>
+        <w:spacing w:after="40"/>
+      </w:pPr>
+      <w:r>
+        <w:rPr>
+          <w:color w:val="1D2D3E"/>
+          <w:sz w:val="22"/>
+          <w:szCs w:val="22"/>
+        </w:rPr>
+        <w:t xml:space="preserve">Card only renders when total pending count &gt; 0; dividers only between visible rows</w:t>
+      </w:r>
+    </w:p>
+    <w:p>
+      <w:pPr>
+        <w:spacing w:after="80"/>
+      </w:pPr>
+      <w:r>
+        <w:rPr>
+          <w:color w:val="1D2D3E"/>
+          <w:sz w:val="22"/>
+          <w:szCs w:val="22"/>
+        </w:rPr>
+        <w:t xml:space="preserve"/>
+      </w:r>
+    </w:p>
+    <w:p>
+      <w:pPr>
+        <w:pStyle w:val="Heading2"/>
+        <w:spacing w:after="120" w:before="300"/>
+      </w:pPr>
+      <w:r>
+        <w:rPr>
+          <w:b/>
+          <w:bCs/>
+          <w:color w:val="1D2D3E"/>
+        </w:rPr>
+        <w:t xml:space="preserve">3.45 Stock Health Item Drill-Down Modal (Session 38)</w:t>
+      </w:r>
+    </w:p>
+    <w:p>
+      <w:pPr>
+        <w:pStyle w:val="ListParagraph"/>
+        <w:numPr>
+          <w:ilvl w:val="0"/>
+          <w:numId w:val="1"/>
+        </w:numPr>
+        <w:spacing w:after="40"/>
+      </w:pPr>
+      <w:r>
+        <w:rPr>
+          <w:color w:val="1D2D3E"/>
+          <w:sz w:val="22"/>
+          <w:szCs w:val="22"/>
+        </w:rPr>
+        <w:t xml:space="preserve">RankedItemList rows now tappable — onPress prop + chevron icon</w:t>
+      </w:r>
+    </w:p>
+    <w:p>
+      <w:pPr>
+        <w:pStyle w:val="ListParagraph"/>
+        <w:numPr>
+          <w:ilvl w:val="0"/>
+          <w:numId w:val="1"/>
+        </w:numPr>
+        <w:spacing w:after="40"/>
+      </w:pPr>
+      <w:r>
+        <w:rPr>
+          <w:color w:val="1D2D3E"/>
+          <w:sz w:val="22"/>
+          <w:szCs w:val="22"/>
+        </w:rPr>
+        <w:t xml:space="preserve">ItemDetailModal: React Native Modal (slide-up bottom sheet) when any item is tapped</w:t>
+      </w:r>
+    </w:p>
+    <w:p>
+      <w:pPr>
+        <w:pStyle w:val="ListParagraph"/>
+        <w:numPr>
+          <w:ilvl w:val="1"/>
+          <w:numId w:val="1"/>
+        </w:numPr>
+        <w:spacing w:after="40"/>
+      </w:pPr>
+      <w:r>
+        <w:rPr>
+          <w:color w:val="1D2D3E"/>
+          <w:sz w:val="22"/>
+          <w:szCs w:val="22"/>
+        </w:rPr>
+        <w:t xml:space="preserve">  Summary tiles: total stock qty across all warehouses, warehouse count, unit</w:t>
+      </w:r>
+    </w:p>
+    <w:p>
+      <w:pPr>
+        <w:pStyle w:val="ListParagraph"/>
+        <w:numPr>
+          <w:ilvl w:val="1"/>
+          <w:numId w:val="1"/>
+        </w:numPr>
+        <w:spacing w:after="40"/>
+      </w:pPr>
+      <w:r>
+        <w:rPr>
+          <w:color w:val="1D2D3E"/>
+          <w:sz w:val="22"/>
+          <w:szCs w:val="22"/>
+        </w:rPr>
+        <w:t xml:space="preserve">  Stock by Warehouse: client-side aggregation from allStock by item name/id — proportional bar + %</w:t>
+      </w:r>
+    </w:p>
+    <w:p>
+      <w:pPr>
+        <w:pStyle w:val="ListParagraph"/>
+        <w:numPr>
+          <w:ilvl w:val="1"/>
+          <w:numId w:val="1"/>
+        </w:numPr>
+        <w:spacing w:after="40"/>
+      </w:pPr>
+      <w:r>
+        <w:rPr>
+          <w:color w:val="1D2D3E"/>
+          <w:sz w:val="22"/>
+          <w:szCs w:val="22"/>
+        </w:rPr>
+        <w:t xml:space="preserve">  Recent Activity: last 15 ledger entries from /api/mobile/inventory?view=ledger&amp;item_id=...</w:t>
+      </w:r>
+    </w:p>
+    <w:p>
+      <w:pPr>
+        <w:pStyle w:val="ListParagraph"/>
+        <w:numPr>
+          <w:ilvl w:val="1"/>
+          <w:numId w:val="1"/>
+        </w:numPr>
+        <w:spacing w:after="40"/>
+      </w:pPr>
+      <w:r>
+        <w:rPr>
+          <w:color w:val="1D2D3E"/>
+          <w:sz w:val="22"/>
+          <w:szCs w:val="22"/>
+        </w:rPr>
+        <w:t xml:space="preserve">  Ledger rows: in/out dot, voucher type+no, date, signed qty change, running balance</w:t>
+      </w:r>
+    </w:p>
+    <w:p>
+      <w:pPr>
+        <w:pStyle w:val="ListParagraph"/>
+        <w:numPr>
+          <w:ilvl w:val="0"/>
+          <w:numId w:val="1"/>
+        </w:numPr>
+        <w:spacing w:after="40"/>
+      </w:pPr>
+      <w:r>
+        <w:rPr>
+          <w:color w:val="1D2D3E"/>
+          <w:sz w:val="22"/>
+          <w:szCs w:val="22"/>
+        </w:rPr>
+        <w:t xml:space="preserve">allStock saved in state during load — zero extra API calls for warehouse breakdown</w:t>
+      </w:r>
+    </w:p>
+    <w:p>
+      <w:pPr>
+        <w:pStyle w:val="ListParagraph"/>
+        <w:numPr>
+          <w:ilvl w:val="0"/>
+          <w:numId w:val="1"/>
+        </w:numPr>
+        <w:spacing w:after="40"/>
+      </w:pPr>
+      <w:r>
+        <w:rPr>
+          <w:color w:val="1D2D3E"/>
+          <w:sz w:val="22"/>
+          <w:szCs w:val="22"/>
+        </w:rPr>
+        <w:t xml:space="preserve">Both low-stock list and top-by-qty list are tappable drill-downs</w:t>
+      </w:r>
+    </w:p>
+    <w:p>
+      <w:pPr>
+        <w:spacing w:after="80"/>
+      </w:pPr>
+      <w:r>
+        <w:rPr>
+          <w:color w:val="1D2D3E"/>
+          <w:sz w:val="22"/>
+          <w:szCs w:val="22"/>
+        </w:rPr>
+        <w:t xml:space="preserve"/>
+      </w:r>
+    </w:p>
+    <w:p>
+      <w:pPr>
         <w:pStyle w:val="Heading1"/>
         <w:spacing w:after="120" w:before="300"/>
       </w:pPr>
@@ -21504,6 +21909,240 @@
           </w:p>
         </w:tc>
       </w:tr>
+      <w:tr>
+        <w:tc>
+          <w:tcPr>
+            <w:shd w:color="F0F4F8" w:val="solid"/>
+          </w:tcPr>
+          <w:p>
+            <w:pPr>
+              <w:spacing w:after="40" w:before="40"/>
+            </w:pPr>
+            <w:r>
+              <w:rPr>
+                <w:b w:val="false"/>
+                <w:bCs w:val="false"/>
+                <w:color w:val="1D2D3E"/>
+                <w:sz w:val="20"/>
+                <w:szCs w:val="20"/>
+              </w:rPr>
+              <w:t xml:space="preserve">Session 38</w:t>
+            </w:r>
+          </w:p>
+        </w:tc>
+        <w:tc>
+          <w:tcPr>
+            <w:shd w:color="F0F4F8" w:val="solid"/>
+          </w:tcPr>
+          <w:p>
+            <w:pPr>
+              <w:spacing w:after="40" w:before="40"/>
+            </w:pPr>
+            <w:r>
+              <w:rPr>
+                <w:b w:val="false"/>
+                <w:bCs w:val="false"/>
+                <w:color w:val="1D2D3E"/>
+                <w:sz w:val="20"/>
+                <w:szCs w:val="20"/>
+              </w:rPr>
+              <w:t xml:space="preserve">AP/AR CSV Export buttons — bills tab (AP) + invoices tab (AR) via SectionHeader action prop</w:t>
+            </w:r>
+          </w:p>
+        </w:tc>
+        <w:tc>
+          <w:tcPr>
+            <w:shd w:color="F0F4F8" w:val="solid"/>
+          </w:tcPr>
+          <w:p>
+            <w:pPr>
+              <w:spacing w:after="40" w:before="40"/>
+            </w:pPr>
+            <w:r>
+              <w:rPr>
+                <w:b w:val="false"/>
+                <w:bCs w:val="false"/>
+                <w:color w:val="1D2D3E"/>
+                <w:sz w:val="20"/>
+                <w:szCs w:val="20"/>
+              </w:rPr>
+              <w:t xml:space="preserve">Done</w:t>
+            </w:r>
+          </w:p>
+        </w:tc>
+        <w:tc>
+          <w:tcPr>
+            <w:shd w:color="F0F4F8" w:val="solid"/>
+          </w:tcPr>
+          <w:p>
+            <w:pPr>
+              <w:spacing w:after="40" w:before="40"/>
+            </w:pPr>
+            <w:r>
+              <w:rPr>
+                <w:b w:val="false"/>
+                <w:bCs w:val="false"/>
+                <w:color w:val="1D2D3E"/>
+                <w:sz w:val="20"/>
+                <w:szCs w:val="20"/>
+              </w:rPr>
+              <w:t xml:space="preserve">SectionHeader.tsx + AccountsPayableScreen.tsx + AccountsReceivableScreen.tsx</w:t>
+            </w:r>
+          </w:p>
+        </w:tc>
+      </w:tr>
+      <w:tr>
+        <w:tc>
+          <w:p>
+            <w:pPr>
+              <w:spacing w:after="40" w:before="40"/>
+            </w:pPr>
+            <w:r>
+              <w:rPr>
+                <w:b w:val="false"/>
+                <w:bCs w:val="false"/>
+                <w:color w:val="1D2D3E"/>
+                <w:sz w:val="20"/>
+                <w:szCs w:val="20"/>
+              </w:rPr>
+              <w:t xml:space="preserve">Session 38</w:t>
+            </w:r>
+          </w:p>
+        </w:tc>
+        <w:tc>
+          <w:p>
+            <w:pPr>
+              <w:spacing w:after="40" w:before="40"/>
+            </w:pPr>
+            <w:r>
+              <w:rPr>
+                <w:b w:val="false"/>
+                <w:bCs w:val="false"/>
+                <w:color w:val="1D2D3E"/>
+                <w:sz w:val="20"/>
+                <w:szCs w:val="20"/>
+              </w:rPr>
+              <w:t xml:space="preserve">Dashboard Pending Actions card — flagged bills + invoices + unread inbox in one glanceable card</w:t>
+            </w:r>
+          </w:p>
+        </w:tc>
+        <w:tc>
+          <w:p>
+            <w:pPr>
+              <w:spacing w:after="40" w:before="40"/>
+            </w:pPr>
+            <w:r>
+              <w:rPr>
+                <w:b w:val="false"/>
+                <w:bCs w:val="false"/>
+                <w:color w:val="1D2D3E"/>
+                <w:sz w:val="20"/>
+                <w:szCs w:val="20"/>
+              </w:rPr>
+              <w:t xml:space="preserve">Done</w:t>
+            </w:r>
+          </w:p>
+        </w:tc>
+        <w:tc>
+          <w:p>
+            <w:pPr>
+              <w:spacing w:after="40" w:before="40"/>
+            </w:pPr>
+            <w:r>
+              <w:rPr>
+                <w:b w:val="false"/>
+                <w:bCs w:val="false"/>
+                <w:color w:val="1D2D3E"/>
+                <w:sz w:val="20"/>
+                <w:szCs w:val="20"/>
+              </w:rPr>
+              <w:t xml:space="preserve">DashboardScreen.tsx + flaggedItems.ts</w:t>
+            </w:r>
+          </w:p>
+        </w:tc>
+      </w:tr>
+      <w:tr>
+        <w:tc>
+          <w:tcPr>
+            <w:shd w:color="F0F4F8" w:val="solid"/>
+          </w:tcPr>
+          <w:p>
+            <w:pPr>
+              <w:spacing w:after="40" w:before="40"/>
+            </w:pPr>
+            <w:r>
+              <w:rPr>
+                <w:b w:val="false"/>
+                <w:bCs w:val="false"/>
+                <w:color w:val="1D2D3E"/>
+                <w:sz w:val="20"/>
+                <w:szCs w:val="20"/>
+              </w:rPr>
+              <w:t xml:space="preserve">Session 38</w:t>
+            </w:r>
+          </w:p>
+        </w:tc>
+        <w:tc>
+          <w:tcPr>
+            <w:shd w:color="F0F4F8" w:val="solid"/>
+          </w:tcPr>
+          <w:p>
+            <w:pPr>
+              <w:spacing w:after="40" w:before="40"/>
+            </w:pPr>
+            <w:r>
+              <w:rPr>
+                <w:b w:val="false"/>
+                <w:bCs w:val="false"/>
+                <w:color w:val="1D2D3E"/>
+                <w:sz w:val="20"/>
+                <w:szCs w:val="20"/>
+              </w:rPr>
+              <w:t xml:space="preserve">Stock Health item drill-down modal — per-warehouse breakdown + last 15 ledger entries per item</w:t>
+            </w:r>
+          </w:p>
+        </w:tc>
+        <w:tc>
+          <w:tcPr>
+            <w:shd w:color="F0F4F8" w:val="solid"/>
+          </w:tcPr>
+          <w:p>
+            <w:pPr>
+              <w:spacing w:after="40" w:before="40"/>
+            </w:pPr>
+            <w:r>
+              <w:rPr>
+                <w:b w:val="false"/>
+                <w:bCs w:val="false"/>
+                <w:color w:val="1D2D3E"/>
+                <w:sz w:val="20"/>
+                <w:szCs w:val="20"/>
+              </w:rPr>
+              <w:t xml:space="preserve">Done</w:t>
+            </w:r>
+          </w:p>
+        </w:tc>
+        <w:tc>
+          <w:tcPr>
+            <w:shd w:color="F0F4F8" w:val="solid"/>
+          </w:tcPr>
+          <w:p>
+            <w:pPr>
+              <w:spacing w:after="40" w:before="40"/>
+            </w:pPr>
+            <w:r>
+              <w:rPr>
+                <w:b w:val="false"/>
+                <w:bCs w:val="false"/>
+                <w:color w:val="1D2D3E"/>
+                <w:sz w:val="20"/>
+                <w:szCs w:val="20"/>
+              </w:rPr>
+              <w:t xml:space="preserve">StockHealthScreen.tsx</w:t>
+            </w:r>
+          </w:p>
+        </w:tc>
+      </w:tr>
     </w:tbl>
     <w:p>
       <w:pPr>
@@ -26586,6 +27225,339 @@
           <w:szCs w:val="22"/>
         </w:rPr>
         <w:t xml:space="preserve">  Tapping a history row repopulates the query field</w:t>
+      </w:r>
+    </w:p>
+    <w:p>
+      <w:pPr>
+        <w:spacing w:after="80"/>
+      </w:pPr>
+      <w:r>
+        <w:rPr>
+          <w:color w:val="1D2D3E"/>
+          <w:sz w:val="22"/>
+          <w:szCs w:val="22"/>
+        </w:rPr>
+        <w:t xml:space="preserve"/>
+      </w:r>
+    </w:p>
+    <w:p>
+      <w:pPr>
+        <w:pStyle w:val="Heading2"/>
+        <w:spacing w:after="120" w:before="300"/>
+      </w:pPr>
+      <w:r>
+        <w:rPr>
+          <w:b/>
+          <w:bCs/>
+          <w:color w:val="1D2D3E"/>
+        </w:rPr>
+        <w:t xml:space="preserve">Session 38 — 2026-06-02</w:t>
+      </w:r>
+    </w:p>
+    <w:p>
+      <w:pPr>
+        <w:pStyle w:val="ListParagraph"/>
+        <w:numPr>
+          <w:ilvl w:val="0"/>
+          <w:numId w:val="1"/>
+        </w:numPr>
+        <w:spacing w:after="40"/>
+      </w:pPr>
+      <w:r>
+        <w:rPr>
+          <w:color w:val="1D2D3E"/>
+          <w:sz w:val="22"/>
+          <w:szCs w:val="22"/>
+        </w:rPr>
+        <w:t xml:space="preserve">AP/AR Bills &amp; Invoices CSV Export (SectionHeader.tsx, AccountsPayableScreen.tsx, AccountsReceivableScreen.tsx)</w:t>
+      </w:r>
+    </w:p>
+    <w:p>
+      <w:pPr>
+        <w:pStyle w:val="ListParagraph"/>
+        <w:numPr>
+          <w:ilvl w:val="1"/>
+          <w:numId w:val="1"/>
+        </w:numPr>
+        <w:spacing w:after="40"/>
+      </w:pPr>
+      <w:r>
+        <w:rPr>
+          <w:color w:val="1D2D3E"/>
+          <w:sz w:val="22"/>
+          <w:szCs w:val="22"/>
+        </w:rPr>
+        <w:t xml:space="preserve">  SectionHeader: added action?: ReactNode prop — renders right of meta label; uses flexDirection row + gap</w:t>
+      </w:r>
+    </w:p>
+    <w:p>
+      <w:pPr>
+        <w:pStyle w:val="ListParagraph"/>
+        <w:numPr>
+          <w:ilvl w:val="1"/>
+          <w:numId w:val="1"/>
+        </w:numPr>
+        <w:spacing w:after="40"/>
+      </w:pPr>
+      <w:r>
+        <w:rPr>
+          <w:color w:val="1D2D3E"/>
+          <w:sz w:val="22"/>
+          <w:szCs w:val="22"/>
+        </w:rPr>
+        <w:t xml:space="preserve">  AccountsPayableScreen bills tab: CSV button (download icon) in SectionHeader action → exportAPBillsCSV(filteredBills)</w:t>
+      </w:r>
+    </w:p>
+    <w:p>
+      <w:pPr>
+        <w:pStyle w:val="ListParagraph"/>
+        <w:numPr>
+          <w:ilvl w:val="1"/>
+          <w:numId w:val="1"/>
+        </w:numPr>
+        <w:spacing w:after="40"/>
+      </w:pPr>
+      <w:r>
+        <w:rPr>
+          <w:color w:val="1D2D3E"/>
+          <w:sz w:val="22"/>
+          <w:szCs w:val="22"/>
+        </w:rPr>
+        <w:t xml:space="preserve">  AccountsReceivableScreen invoices tab: identical CSV button → exportARInvoicesCSV(filteredInvoices)</w:t>
+      </w:r>
+    </w:p>
+    <w:p>
+      <w:pPr>
+        <w:pStyle w:val="ListParagraph"/>
+        <w:numPr>
+          <w:ilvl w:val="1"/>
+          <w:numId w:val="1"/>
+        </w:numPr>
+        <w:spacing w:after="40"/>
+      </w:pPr>
+      <w:r>
+        <w:rPr>
+          <w:color w:val="1D2D3E"/>
+          <w:sz w:val="22"/>
+          <w:szCs w:val="22"/>
+        </w:rPr>
+        <w:t xml:space="preserve">  Export respects all active filters (overdue, due-soon, flagged); exports what the user sees</w:t>
+      </w:r>
+    </w:p>
+    <w:p>
+      <w:pPr>
+        <w:pStyle w:val="ListParagraph"/>
+        <w:numPr>
+          <w:ilvl w:val="0"/>
+          <w:numId w:val="1"/>
+        </w:numPr>
+        <w:spacing w:after="40"/>
+      </w:pPr>
+      <w:r>
+        <w:rPr>
+          <w:color w:val="1D2D3E"/>
+          <w:sz w:val="22"/>
+          <w:szCs w:val="22"/>
+        </w:rPr>
+        <w:t xml:space="preserve">Dashboard Pending Actions Card (DashboardScreen.tsx)</w:t>
+      </w:r>
+    </w:p>
+    <w:p>
+      <w:pPr>
+        <w:pStyle w:val="ListParagraph"/>
+        <w:numPr>
+          <w:ilvl w:val="1"/>
+          <w:numId w:val="1"/>
+        </w:numPr>
+        <w:spacing w:after="40"/>
+      </w:pPr>
+      <w:r>
+        <w:rPr>
+          <w:color w:val="1D2D3E"/>
+          <w:sz w:val="22"/>
+          <w:szCs w:val="22"/>
+        </w:rPr>
+        <w:t xml:space="preserve">  Replaces old inline inbox banner with structured card aggregating all pending items</w:t>
+      </w:r>
+    </w:p>
+    <w:p>
+      <w:pPr>
+        <w:pStyle w:val="ListParagraph"/>
+        <w:numPr>
+          <w:ilvl w:val="1"/>
+          <w:numId w:val="1"/>
+        </w:numPr>
+        <w:spacing w:after="40"/>
+      </w:pPr>
+      <w:r>
+        <w:rPr>
+          <w:color w:val="1D2D3E"/>
+          <w:sz w:val="22"/>
+          <w:szCs w:val="22"/>
+        </w:rPr>
+        <w:t xml:space="preserve">  Loads flaggedBillCount + flaggedInvoiceCount via getFlaggedIds() on focus alongside existing inboxUnread</w:t>
+      </w:r>
+    </w:p>
+    <w:p>
+      <w:pPr>
+        <w:pStyle w:val="ListParagraph"/>
+        <w:numPr>
+          <w:ilvl w:val="1"/>
+          <w:numId w:val="1"/>
+        </w:numPr>
+        <w:spacing w:after="40"/>
+      </w:pPr>
+      <w:r>
+        <w:rPr>
+          <w:color w:val="1D2D3E"/>
+          <w:sz w:val="22"/>
+          <w:szCs w:val="22"/>
+        </w:rPr>
+        <w:t xml:space="preserve">  Up to 3 rows: Flagged Bills (amber → AP), Flagged Invoices (blue → AR), Unread Notifications (gray → Inbox)</w:t>
+      </w:r>
+    </w:p>
+    <w:p>
+      <w:pPr>
+        <w:pStyle w:val="ListParagraph"/>
+        <w:numPr>
+          <w:ilvl w:val="1"/>
+          <w:numId w:val="1"/>
+        </w:numPr>
+        <w:spacing w:after="40"/>
+      </w:pPr>
+      <w:r>
+        <w:rPr>
+          <w:color w:val="1D2D3E"/>
+          <w:sz w:val="22"/>
+          <w:szCs w:val="22"/>
+        </w:rPr>
+        <w:t xml:space="preserve">  Card hides when all counts are zero; dividers only appear between visible rows</w:t>
+      </w:r>
+    </w:p>
+    <w:p>
+      <w:pPr>
+        <w:pStyle w:val="ListParagraph"/>
+        <w:numPr>
+          <w:ilvl w:val="0"/>
+          <w:numId w:val="1"/>
+        </w:numPr>
+        <w:spacing w:after="40"/>
+      </w:pPr>
+      <w:r>
+        <w:rPr>
+          <w:color w:val="1D2D3E"/>
+          <w:sz w:val="22"/>
+          <w:szCs w:val="22"/>
+        </w:rPr>
+        <w:t xml:space="preserve">Stock Health Item Drill-Down Modal (StockHealthScreen.tsx)</w:t>
+      </w:r>
+    </w:p>
+    <w:p>
+      <w:pPr>
+        <w:pStyle w:val="ListParagraph"/>
+        <w:numPr>
+          <w:ilvl w:val="1"/>
+          <w:numId w:val="1"/>
+        </w:numPr>
+        <w:spacing w:after="40"/>
+      </w:pPr>
+      <w:r>
+        <w:rPr>
+          <w:color w:val="1D2D3E"/>
+          <w:sz w:val="22"/>
+          <w:szCs w:val="22"/>
+        </w:rPr>
+        <w:t xml:space="preserve">  RankedItemList: added onPress prop + chevron; rows wrapped in TouchableOpacity</w:t>
+      </w:r>
+    </w:p>
+    <w:p>
+      <w:pPr>
+        <w:pStyle w:val="ListParagraph"/>
+        <w:numPr>
+          <w:ilvl w:val="1"/>
+          <w:numId w:val="1"/>
+        </w:numPr>
+        <w:spacing w:after="40"/>
+      </w:pPr>
+      <w:r>
+        <w:rPr>
+          <w:color w:val="1D2D3E"/>
+          <w:sz w:val="22"/>
+          <w:szCs w:val="22"/>
+        </w:rPr>
+        <w:t xml:space="preserve">  ItemDetailModal: slide-up bottom sheet with handle, header (name + code), close button</w:t>
+      </w:r>
+    </w:p>
+    <w:p>
+      <w:pPr>
+        <w:pStyle w:val="ListParagraph"/>
+        <w:numPr>
+          <w:ilvl w:val="1"/>
+          <w:numId w:val="1"/>
+        </w:numPr>
+        <w:spacing w:after="40"/>
+      </w:pPr>
+      <w:r>
+        <w:rPr>
+          <w:color w:val="1D2D3E"/>
+          <w:sz w:val="22"/>
+          <w:szCs w:val="22"/>
+        </w:rPr>
+        <w:t xml:space="preserve">  Summary tiles: total stock qty, warehouse count, unit</w:t>
+      </w:r>
+    </w:p>
+    <w:p>
+      <w:pPr>
+        <w:pStyle w:val="ListParagraph"/>
+        <w:numPr>
+          <w:ilvl w:val="1"/>
+          <w:numId w:val="1"/>
+        </w:numPr>
+        <w:spacing w:after="40"/>
+      </w:pPr>
+      <w:r>
+        <w:rPr>
+          <w:color w:val="1D2D3E"/>
+          <w:sz w:val="22"/>
+          <w:szCs w:val="22"/>
+        </w:rPr>
+        <w:t xml:space="preserve">  Stock by Warehouse: client-side aggregation from allStock; proportional bar + percentage per warehouse</w:t>
+      </w:r>
+    </w:p>
+    <w:p>
+      <w:pPr>
+        <w:pStyle w:val="ListParagraph"/>
+        <w:numPr>
+          <w:ilvl w:val="1"/>
+          <w:numId w:val="1"/>
+        </w:numPr>
+        <w:spacing w:after="40"/>
+      </w:pPr>
+      <w:r>
+        <w:rPr>
+          <w:color w:val="1D2D3E"/>
+          <w:sz w:val="22"/>
+          <w:szCs w:val="22"/>
+        </w:rPr>
+        <w:t xml:space="preserve">  Recent Activity: fetchStockLedger({ itemId }) → last 15 entries; in/out dot, voucher, date, qty, balance</w:t>
+      </w:r>
+    </w:p>
+    <w:p>
+      <w:pPr>
+        <w:pStyle w:val="ListParagraph"/>
+        <w:numPr>
+          <w:ilvl w:val="1"/>
+          <w:numId w:val="1"/>
+        </w:numPr>
+        <w:spacing w:after="40"/>
+      </w:pPr>
+      <w:r>
+        <w:rPr>
+          <w:color w:val="1D2D3E"/>
+          <w:sz w:val="22"/>
+          <w:szCs w:val="22"/>
+        </w:rPr>
+        <w:t xml:space="preserve">  allStock stored in state so warehouse tab needs zero extra API calls</w:t>
       </w:r>
     </w:p>
     <w:p>

</xml_diff>

<commit_message>
docs(session-39): update PROGRESS.md, generate-docs.js, and FEATURES.docx with Session 39 changelog
</commit_message>
<xml_diff>
--- a/FEATURES.docx
+++ b/FEATURES.docx
@@ -9993,6 +9993,537 @@
     </w:p>
     <w:p>
       <w:pPr>
+        <w:pStyle w:val="Heading2"/>
+        <w:spacing w:after="120" w:before="300"/>
+      </w:pPr>
+      <w:r>
+        <w:rPr>
+          <w:b/>
+          <w:bCs/>
+          <w:color w:val="1D2D3E"/>
+        </w:rPr>
+        <w:t xml:space="preserve">3.46 Out-of-Stock Items List in Stock Health (Session 39)</w:t>
+      </w:r>
+    </w:p>
+    <w:p>
+      <w:pPr>
+        <w:pStyle w:val="ListParagraph"/>
+        <w:numPr>
+          <w:ilvl w:val="0"/>
+          <w:numId w:val="1"/>
+        </w:numPr>
+        <w:spacing w:after="40"/>
+      </w:pPr>
+      <w:r>
+        <w:rPr>
+          <w:color w:val="1D2D3E"/>
+          <w:sz w:val="22"/>
+          <w:szCs w:val="22"/>
+        </w:rPr>
+        <w:t xml:space="preserve">StockHealthScreen: new 'Out of Stock' section showing all items with qty ≤ 0</w:t>
+      </w:r>
+    </w:p>
+    <w:p>
+      <w:pPr>
+        <w:pStyle w:val="ListParagraph"/>
+        <w:numPr>
+          <w:ilvl w:val="0"/>
+          <w:numId w:val="1"/>
+        </w:numPr>
+        <w:spacing w:after="40"/>
+      </w:pPr>
+      <w:r>
+        <w:rPr>
+          <w:color w:val="1D2D3E"/>
+          <w:sz w:val="22"/>
+          <w:szCs w:val="22"/>
+        </w:rPr>
+        <w:t xml:space="preserve">Displayed above the low-stock list (zero-stock is more critical than low-stock)</w:t>
+      </w:r>
+    </w:p>
+    <w:p>
+      <w:pPr>
+        <w:pStyle w:val="ListParagraph"/>
+        <w:numPr>
+          <w:ilvl w:val="1"/>
+          <w:numId w:val="1"/>
+        </w:numPr>
+        <w:spacing w:after="40"/>
+      </w:pPr>
+      <w:r>
+        <w:rPr>
+          <w:color w:val="1D2D3E"/>
+          <w:sz w:val="22"/>
+          <w:szCs w:val="22"/>
+        </w:rPr>
+        <w:t xml:space="preserve">  x-circle icon badge instead of rank number or alert-circle</w:t>
+      </w:r>
+    </w:p>
+    <w:p>
+      <w:pPr>
+        <w:pStyle w:val="ListParagraph"/>
+        <w:numPr>
+          <w:ilvl w:val="1"/>
+          <w:numId w:val="1"/>
+        </w:numPr>
+        <w:spacing w:after="40"/>
+      </w:pPr>
+      <w:r>
+        <w:rPr>
+          <w:color w:val="1D2D3E"/>
+          <w:sz w:val="22"/>
+          <w:szCs w:val="22"/>
+        </w:rPr>
+        <w:t xml:space="preserve">  Qty shown as '0' in muted grey; no proportional bar (would be empty)</w:t>
+      </w:r>
+    </w:p>
+    <w:p>
+      <w:pPr>
+        <w:pStyle w:val="ListParagraph"/>
+        <w:numPr>
+          <w:ilvl w:val="1"/>
+          <w:numId w:val="1"/>
+        </w:numPr>
+        <w:spacing w:after="40"/>
+      </w:pPr>
+      <w:r>
+        <w:rPr>
+          <w:color w:val="1D2D3E"/>
+          <w:sz w:val="22"/>
+          <w:szCs w:val="22"/>
+        </w:rPr>
+        <w:t xml:space="preserve">  Items sorted alphabetically A–Z for easy scanning</w:t>
+      </w:r>
+    </w:p>
+    <w:p>
+      <w:pPr>
+        <w:pStyle w:val="ListParagraph"/>
+        <w:numPr>
+          <w:ilvl w:val="0"/>
+          <w:numId w:val="1"/>
+        </w:numPr>
+        <w:spacing w:after="40"/>
+      </w:pPr>
+      <w:r>
+        <w:rPr>
+          <w:color w:val="1D2D3E"/>
+          <w:sz w:val="22"/>
+          <w:szCs w:val="22"/>
+        </w:rPr>
+        <w:t xml:space="preserve">RankedItemList: new showOutOfStock prop — hides bar track, forces '0' display, uses x-circle icon</w:t>
+      </w:r>
+    </w:p>
+    <w:p>
+      <w:pPr>
+        <w:pStyle w:val="ListParagraph"/>
+        <w:numPr>
+          <w:ilvl w:val="0"/>
+          <w:numId w:val="1"/>
+        </w:numPr>
+        <w:spacing w:after="40"/>
+      </w:pPr>
+      <w:r>
+        <w:rPr>
+          <w:color w:val="1D2D3E"/>
+          <w:sz w:val="22"/>
+          <w:szCs w:val="22"/>
+        </w:rPr>
+        <w:t xml:space="preserve">computeStockHealth: returns outOfStock: StockBalance[] (all items, no 8-item cap)</w:t>
+      </w:r>
+    </w:p>
+    <w:p>
+      <w:pPr>
+        <w:pStyle w:val="ListParagraph"/>
+        <w:numPr>
+          <w:ilvl w:val="0"/>
+          <w:numId w:val="1"/>
+        </w:numPr>
+        <w:spacing w:after="40"/>
+      </w:pPr>
+      <w:r>
+        <w:rPr>
+          <w:color w:val="1D2D3E"/>
+          <w:sz w:val="22"/>
+          <w:szCs w:val="22"/>
+        </w:rPr>
+        <w:t xml:space="preserve">StockHealthData type: outOfStock field added alongside existing topByQty and lowStock</w:t>
+      </w:r>
+    </w:p>
+    <w:p>
+      <w:pPr>
+        <w:spacing w:after="80"/>
+      </w:pPr>
+      <w:r>
+        <w:rPr>
+          <w:color w:val="1D2D3E"/>
+          <w:sz w:val="22"/>
+          <w:szCs w:val="22"/>
+        </w:rPr>
+        <w:t xml:space="preserve"/>
+      </w:r>
+    </w:p>
+    <w:p>
+      <w:pPr>
+        <w:pStyle w:val="Heading2"/>
+        <w:spacing w:after="120" w:before="300"/>
+      </w:pPr>
+      <w:r>
+        <w:rPr>
+          <w:b/>
+          <w:bCs/>
+          <w:color w:val="1D2D3E"/>
+        </w:rPr>
+        <w:t xml:space="preserve">3.47 Mark as Reviewed for Bills &amp; Invoices (Session 39)</w:t>
+      </w:r>
+    </w:p>
+    <w:p>
+      <w:pPr>
+        <w:pStyle w:val="ListParagraph"/>
+        <w:numPr>
+          <w:ilvl w:val="0"/>
+          <w:numId w:val="1"/>
+        </w:numPr>
+        <w:spacing w:after="40"/>
+      </w:pPr>
+      <w:r>
+        <w:rPr>
+          <w:color w:val="1D2D3E"/>
+          <w:sz w:val="22"/>
+          <w:szCs w:val="22"/>
+        </w:rPr>
+        <w:t xml:space="preserve">New src/utils/reviewedItems.ts: AsyncStorage-backed reviewed state (mirrors flaggedItems.ts pattern)</w:t>
+      </w:r>
+    </w:p>
+    <w:p>
+      <w:pPr>
+        <w:pStyle w:val="ListParagraph"/>
+        <w:numPr>
+          <w:ilvl w:val="1"/>
+          <w:numId w:val="1"/>
+        </w:numPr>
+        <w:spacing w:after="40"/>
+      </w:pPr>
+      <w:r>
+        <w:rPr>
+          <w:color w:val="1D2D3E"/>
+          <w:sz w:val="22"/>
+          <w:szCs w:val="22"/>
+        </w:rPr>
+        <w:t xml:space="preserve">  getReviewedIds(type): returns Set&lt;number&gt; of reviewed IDs; toggleReviewed(type, id): toggles and returns new state</w:t>
+      </w:r>
+    </w:p>
+    <w:p>
+      <w:pPr>
+        <w:pStyle w:val="ListParagraph"/>
+        <w:numPr>
+          <w:ilvl w:val="1"/>
+          <w:numId w:val="1"/>
+        </w:numPr>
+        <w:spacing w:after="40"/>
+      </w:pPr>
+      <w:r>
+        <w:rPr>
+          <w:color w:val="1D2D3E"/>
+          <w:sz w:val="22"/>
+          <w:szCs w:val="22"/>
+        </w:rPr>
+        <w:t xml:space="preserve">  Separate keys for bills ('reviewed_bills') and invoices ('reviewed_invoices'); clearAllReviewed() for cleanup</w:t>
+      </w:r>
+    </w:p>
+    <w:p>
+      <w:pPr>
+        <w:pStyle w:val="ListParagraph"/>
+        <w:numPr>
+          <w:ilvl w:val="0"/>
+          <w:numId w:val="1"/>
+        </w:numPr>
+        <w:spacing w:after="40"/>
+      </w:pPr>
+      <w:r>
+        <w:rPr>
+          <w:color w:val="1D2D3E"/>
+          <w:sz w:val="22"/>
+          <w:szCs w:val="22"/>
+        </w:rPr>
+        <w:t xml:space="preserve">AccountsPayableScreen bills tab:</w:t>
+      </w:r>
+    </w:p>
+    <w:p>
+      <w:pPr>
+        <w:pStyle w:val="ListParagraph"/>
+        <w:numPr>
+          <w:ilvl w:val="1"/>
+          <w:numId w:val="1"/>
+        </w:numPr>
+        <w:spacing w:after="40"/>
+      </w:pPr>
+      <w:r>
+        <w:rPr>
+          <w:color w:val="1D2D3E"/>
+          <w:sz w:val="22"/>
+          <w:szCs w:val="22"/>
+        </w:rPr>
+        <w:t xml:space="preserve">  reviewedBillIds state (Set&lt;number&gt;) loaded from AsyncStorage on mount</w:t>
+      </w:r>
+    </w:p>
+    <w:p>
+      <w:pPr>
+        <w:pStyle w:val="ListParagraph"/>
+        <w:numPr>
+          <w:ilvl w:val="1"/>
+          <w:numId w:val="1"/>
+        </w:numPr>
+        <w:spacing w:after="40"/>
+      </w:pPr>
+      <w:r>
+        <w:rPr>
+          <w:color w:val="1D2D3E"/>
+          <w:sz w:val="22"/>
+          <w:szCs w:val="22"/>
+        </w:rPr>
+        <w:t xml:space="preserve">  check-circle filter chip in filter row — shows count badge (✓ N) when any bills reviewed; toggles showReviewedOnly</w:t>
+      </w:r>
+    </w:p>
+    <w:p>
+      <w:pPr>
+        <w:pStyle w:val="ListParagraph"/>
+        <w:numPr>
+          <w:ilvl w:val="1"/>
+          <w:numId w:val="1"/>
+        </w:numPr>
+        <w:spacing w:after="40"/>
+      </w:pPr>
+      <w:r>
+        <w:rPr>
+          <w:color w:val="1D2D3E"/>
+          <w:sz w:val="22"/>
+          <w:szCs w:val="22"/>
+        </w:rPr>
+        <w:t xml:space="preserve">  BillCard: check-circle icon (filled = reviewed, borderLight = not) + opacity 0.6 on reviewed cards</w:t>
+      </w:r>
+    </w:p>
+    <w:p>
+      <w:pPr>
+        <w:pStyle w:val="ListParagraph"/>
+        <w:numPr>
+          <w:ilvl w:val="1"/>
+          <w:numId w:val="1"/>
+        </w:numPr>
+        <w:spacing w:after="40"/>
+      </w:pPr>
+      <w:r>
+        <w:rPr>
+          <w:color w:val="1D2D3E"/>
+          <w:sz w:val="22"/>
+          <w:szCs w:val="22"/>
+        </w:rPr>
+        <w:t xml:space="preserve">  showReviewedOnly filter composable with flagged / overdue / due-soon filters</w:t>
+      </w:r>
+    </w:p>
+    <w:p>
+      <w:pPr>
+        <w:pStyle w:val="ListParagraph"/>
+        <w:numPr>
+          <w:ilvl w:val="0"/>
+          <w:numId w:val="1"/>
+        </w:numPr>
+        <w:spacing w:after="40"/>
+      </w:pPr>
+      <w:r>
+        <w:rPr>
+          <w:color w:val="1D2D3E"/>
+          <w:sz w:val="22"/>
+          <w:szCs w:val="22"/>
+        </w:rPr>
+        <w:t xml:space="preserve">AccountsReceivableScreen invoices tab: identical pattern via InvoiceCard + reviewedInvoiceIds</w:t>
+      </w:r>
+    </w:p>
+    <w:p>
+      <w:pPr>
+        <w:spacing w:after="80"/>
+      </w:pPr>
+      <w:r>
+        <w:rPr>
+          <w:color w:val="1D2D3E"/>
+          <w:sz w:val="22"/>
+          <w:szCs w:val="22"/>
+        </w:rPr>
+        <w:t xml:space="preserve"/>
+      </w:r>
+    </w:p>
+    <w:p>
+      <w:pPr>
+        <w:pStyle w:val="Heading2"/>
+        <w:spacing w:after="120" w:before="300"/>
+      </w:pPr>
+      <w:r>
+        <w:rPr>
+          <w:b/>
+          <w:bCs/>
+          <w:color w:val="1D2D3E"/>
+        </w:rPr>
+        <w:t xml:space="preserve">3.48 Vendor &amp; Customer Local Notes (Session 39)</w:t>
+      </w:r>
+    </w:p>
+    <w:p>
+      <w:pPr>
+        <w:pStyle w:val="ListParagraph"/>
+        <w:numPr>
+          <w:ilvl w:val="0"/>
+          <w:numId w:val="1"/>
+        </w:numPr>
+        <w:spacing w:after="40"/>
+      </w:pPr>
+      <w:r>
+        <w:rPr>
+          <w:color w:val="1D2D3E"/>
+          <w:sz w:val="22"/>
+          <w:szCs w:val="22"/>
+        </w:rPr>
+        <w:t xml:space="preserve">New src/utils/partnerNotes.ts: AsyncStorage utility keyed by type+id for freeform text notes</w:t>
+      </w:r>
+    </w:p>
+    <w:p>
+      <w:pPr>
+        <w:pStyle w:val="ListParagraph"/>
+        <w:numPr>
+          <w:ilvl w:val="1"/>
+          <w:numId w:val="1"/>
+        </w:numPr>
+        <w:spacing w:after="40"/>
+      </w:pPr>
+      <w:r>
+        <w:rPr>
+          <w:color w:val="1D2D3E"/>
+          <w:sz w:val="22"/>
+          <w:szCs w:val="22"/>
+        </w:rPr>
+        <w:t xml:space="preserve">  getNote(type, id): returns stored string or '' on miss; saveNote(type, id, text): stores or removes (empty → delete)</w:t>
+      </w:r>
+    </w:p>
+    <w:p>
+      <w:pPr>
+        <w:pStyle w:val="ListParagraph"/>
+        <w:numPr>
+          <w:ilvl w:val="0"/>
+          <w:numId w:val="1"/>
+        </w:numPr>
+        <w:spacing w:after="40"/>
+      </w:pPr>
+      <w:r>
+        <w:rPr>
+          <w:color w:val="1D2D3E"/>
+          <w:sz w:val="22"/>
+          <w:szCs w:val="22"/>
+        </w:rPr>
+        <w:t xml:space="preserve">VendorDetailScreen: new 'Notes' tab (4th tab after Bills / Payments / Ledger)</w:t>
+      </w:r>
+    </w:p>
+    <w:p>
+      <w:pPr>
+        <w:pStyle w:val="ListParagraph"/>
+        <w:numPr>
+          <w:ilvl w:val="1"/>
+          <w:numId w:val="1"/>
+        </w:numPr>
+        <w:spacing w:after="40"/>
+      </w:pPr>
+      <w:r>
+        <w:rPr>
+          <w:color w:val="1D2D3E"/>
+          <w:sz w:val="22"/>
+          <w:szCs w:val="22"/>
+        </w:rPr>
+        <w:t xml:space="preserve">  Multi-line TextInput backed by AsyncStorage; Save button with loading state</w:t>
+      </w:r>
+    </w:p>
+    <w:p>
+      <w:pPr>
+        <w:pStyle w:val="ListParagraph"/>
+        <w:numPr>
+          <w:ilvl w:val="1"/>
+          <w:numId w:val="1"/>
+        </w:numPr>
+        <w:spacing w:after="40"/>
+      </w:pPr>
+      <w:r>
+        <w:rPr>
+          <w:color w:val="1D2D3E"/>
+          <w:sz w:val="22"/>
+          <w:szCs w:val="22"/>
+        </w:rPr>
+        <w:t xml:space="preserve">  Tab label shows '·' dot when note is non-empty — visual indicator from tab bar</w:t>
+      </w:r>
+    </w:p>
+    <w:p>
+      <w:pPr>
+        <w:pStyle w:val="ListParagraph"/>
+        <w:numPr>
+          <w:ilvl w:val="1"/>
+          <w:numId w:val="1"/>
+        </w:numPr>
+        <w:spacing w:after="40"/>
+      </w:pPr>
+      <w:r>
+        <w:rPr>
+          <w:color w:val="1D2D3E"/>
+          <w:sz w:val="22"/>
+          <w:szCs w:val="22"/>
+        </w:rPr>
+        <w:t xml:space="preserve">  Hint text (payment terms, contact preferences, follow-up reminders) shown when note is empty</w:t>
+      </w:r>
+    </w:p>
+    <w:p>
+      <w:pPr>
+        <w:pStyle w:val="ListParagraph"/>
+        <w:numPr>
+          <w:ilvl w:val="0"/>
+          <w:numId w:val="1"/>
+        </w:numPr>
+        <w:spacing w:after="40"/>
+      </w:pPr>
+      <w:r>
+        <w:rPr>
+          <w:color w:val="1D2D3E"/>
+          <w:sz w:val="22"/>
+          <w:szCs w:val="22"/>
+        </w:rPr>
+        <w:t xml:space="preserve">CustomerDetailScreen: identical Notes tab with customer-specific copy</w:t>
+      </w:r>
+    </w:p>
+    <w:p>
+      <w:pPr>
+        <w:pStyle w:val="ListParagraph"/>
+        <w:numPr>
+          <w:ilvl w:val="0"/>
+          <w:numId w:val="1"/>
+        </w:numPr>
+        <w:spacing w:after="40"/>
+      </w:pPr>
+      <w:r>
+        <w:rPr>
+          <w:color w:val="1D2D3E"/>
+          <w:sz w:val="22"/>
+          <w:szCs w:val="22"/>
+        </w:rPr>
+        <w:t xml:space="preserve">Notes persist across restarts; stored on device only, no API involvement</w:t>
+      </w:r>
+    </w:p>
+    <w:p>
+      <w:pPr>
+        <w:spacing w:after="80"/>
+      </w:pPr>
+      <w:r>
+        <w:rPr>
+          <w:color w:val="1D2D3E"/>
+          <w:sz w:val="22"/>
+          <w:szCs w:val="22"/>
+        </w:rPr>
+        <w:t xml:space="preserve"/>
+      </w:r>
+    </w:p>
+    <w:p>
+      <w:pPr>
         <w:pStyle w:val="Heading1"/>
         <w:spacing w:after="120" w:before="300"/>
       </w:pPr>
@@ -22143,6 +22674,228 @@
           </w:p>
         </w:tc>
       </w:tr>
+      <w:tr>
+        <w:tc>
+          <w:p>
+            <w:pPr>
+              <w:spacing w:after="40" w:before="40"/>
+            </w:pPr>
+            <w:r>
+              <w:rPr>
+                <w:b w:val="false"/>
+                <w:bCs w:val="false"/>
+                <w:color w:val="1D2D3E"/>
+                <w:sz w:val="20"/>
+                <w:szCs w:val="20"/>
+              </w:rPr>
+              <w:t xml:space="preserve">Session 39</w:t>
+            </w:r>
+          </w:p>
+        </w:tc>
+        <w:tc>
+          <w:p>
+            <w:pPr>
+              <w:spacing w:after="40" w:before="40"/>
+            </w:pPr>
+            <w:r>
+              <w:rPr>
+                <w:b w:val="false"/>
+                <w:bCs w:val="false"/>
+                <w:color w:val="1D2D3E"/>
+                <w:sz w:val="20"/>
+                <w:szCs w:val="20"/>
+              </w:rPr>
+              <w:t xml:space="preserve">Out-of-stock items list in Stock Health — all zero-qty items sorted A–Z, section above low-stock</w:t>
+            </w:r>
+          </w:p>
+        </w:tc>
+        <w:tc>
+          <w:p>
+            <w:pPr>
+              <w:spacing w:after="40" w:before="40"/>
+            </w:pPr>
+            <w:r>
+              <w:rPr>
+                <w:b w:val="false"/>
+                <w:bCs w:val="false"/>
+                <w:color w:val="1D2D3E"/>
+                <w:sz w:val="20"/>
+                <w:szCs w:val="20"/>
+              </w:rPr>
+              <w:t xml:space="preserve">Done</w:t>
+            </w:r>
+          </w:p>
+        </w:tc>
+        <w:tc>
+          <w:p>
+            <w:pPr>
+              <w:spacing w:after="40" w:before="40"/>
+            </w:pPr>
+            <w:r>
+              <w:rPr>
+                <w:b w:val="false"/>
+                <w:bCs w:val="false"/>
+                <w:color w:val="1D2D3E"/>
+                <w:sz w:val="20"/>
+                <w:szCs w:val="20"/>
+              </w:rPr>
+              <w:t xml:space="preserve">StockHealthScreen.tsx</w:t>
+            </w:r>
+          </w:p>
+        </w:tc>
+      </w:tr>
+      <w:tr>
+        <w:tc>
+          <w:tcPr>
+            <w:shd w:color="F0F4F8" w:val="solid"/>
+          </w:tcPr>
+          <w:p>
+            <w:pPr>
+              <w:spacing w:after="40" w:before="40"/>
+            </w:pPr>
+            <w:r>
+              <w:rPr>
+                <w:b w:val="false"/>
+                <w:bCs w:val="false"/>
+                <w:color w:val="1D2D3E"/>
+                <w:sz w:val="20"/>
+                <w:szCs w:val="20"/>
+              </w:rPr>
+              <w:t xml:space="preserve">Session 39</w:t>
+            </w:r>
+          </w:p>
+        </w:tc>
+        <w:tc>
+          <w:tcPr>
+            <w:shd w:color="F0F4F8" w:val="solid"/>
+          </w:tcPr>
+          <w:p>
+            <w:pPr>
+              <w:spacing w:after="40" w:before="40"/>
+            </w:pPr>
+            <w:r>
+              <w:rPr>
+                <w:b w:val="false"/>
+                <w:bCs w:val="false"/>
+                <w:color w:val="1D2D3E"/>
+                <w:sz w:val="20"/>
+                <w:szCs w:val="20"/>
+              </w:rPr>
+              <w:t xml:space="preserve">Mark as Reviewed for bills/invoices — check-circle icon, opacity 0.6, filter chip, AsyncStorage persistence</w:t>
+            </w:r>
+          </w:p>
+        </w:tc>
+        <w:tc>
+          <w:tcPr>
+            <w:shd w:color="F0F4F8" w:val="solid"/>
+          </w:tcPr>
+          <w:p>
+            <w:pPr>
+              <w:spacing w:after="40" w:before="40"/>
+            </w:pPr>
+            <w:r>
+              <w:rPr>
+                <w:b w:val="false"/>
+                <w:bCs w:val="false"/>
+                <w:color w:val="1D2D3E"/>
+                <w:sz w:val="20"/>
+                <w:szCs w:val="20"/>
+              </w:rPr>
+              <w:t xml:space="preserve">Done</w:t>
+            </w:r>
+          </w:p>
+        </w:tc>
+        <w:tc>
+          <w:tcPr>
+            <w:shd w:color="F0F4F8" w:val="solid"/>
+          </w:tcPr>
+          <w:p>
+            <w:pPr>
+              <w:spacing w:after="40" w:before="40"/>
+            </w:pPr>
+            <w:r>
+              <w:rPr>
+                <w:b w:val="false"/>
+                <w:bCs w:val="false"/>
+                <w:color w:val="1D2D3E"/>
+                <w:sz w:val="20"/>
+                <w:szCs w:val="20"/>
+              </w:rPr>
+              <w:t xml:space="preserve">reviewedItems.ts + AccountsPayableScreen.tsx + AccountsReceivableScreen.tsx</w:t>
+            </w:r>
+          </w:p>
+        </w:tc>
+      </w:tr>
+      <w:tr>
+        <w:tc>
+          <w:p>
+            <w:pPr>
+              <w:spacing w:after="40" w:before="40"/>
+            </w:pPr>
+            <w:r>
+              <w:rPr>
+                <w:b w:val="false"/>
+                <w:bCs w:val="false"/>
+                <w:color w:val="1D2D3E"/>
+                <w:sz w:val="20"/>
+                <w:szCs w:val="20"/>
+              </w:rPr>
+              <w:t xml:space="preserve">Session 39</w:t>
+            </w:r>
+          </w:p>
+        </w:tc>
+        <w:tc>
+          <w:p>
+            <w:pPr>
+              <w:spacing w:after="40" w:before="40"/>
+            </w:pPr>
+            <w:r>
+              <w:rPr>
+                <w:b w:val="false"/>
+                <w:bCs w:val="false"/>
+                <w:color w:val="1D2D3E"/>
+                <w:sz w:val="20"/>
+                <w:szCs w:val="20"/>
+              </w:rPr>
+              <w:t xml:space="preserve">Vendor &amp; Customer local notes — freeform text tab backed by AsyncStorage, dot indicator in tab label</w:t>
+            </w:r>
+          </w:p>
+        </w:tc>
+        <w:tc>
+          <w:p>
+            <w:pPr>
+              <w:spacing w:after="40" w:before="40"/>
+            </w:pPr>
+            <w:r>
+              <w:rPr>
+                <w:b w:val="false"/>
+                <w:bCs w:val="false"/>
+                <w:color w:val="1D2D3E"/>
+                <w:sz w:val="20"/>
+                <w:szCs w:val="20"/>
+              </w:rPr>
+              <w:t xml:space="preserve">Done</w:t>
+            </w:r>
+          </w:p>
+        </w:tc>
+        <w:tc>
+          <w:p>
+            <w:pPr>
+              <w:spacing w:after="40" w:before="40"/>
+            </w:pPr>
+            <w:r>
+              <w:rPr>
+                <w:b w:val="false"/>
+                <w:bCs w:val="false"/>
+                <w:color w:val="1D2D3E"/>
+                <w:sz w:val="20"/>
+                <w:szCs w:val="20"/>
+              </w:rPr>
+              <w:t xml:space="preserve">partnerNotes.ts + VendorDetailScreen.tsx + CustomerDetailScreen.tsx</w:t>
+            </w:r>
+          </w:p>
+        </w:tc>
+      </w:tr>
     </w:tbl>
     <w:p>
       <w:pPr>
@@ -27225,6 +27978,321 @@
           <w:szCs w:val="22"/>
         </w:rPr>
         <w:t xml:space="preserve">  Tapping a history row repopulates the query field</w:t>
+      </w:r>
+    </w:p>
+    <w:p>
+      <w:pPr>
+        <w:spacing w:after="80"/>
+      </w:pPr>
+      <w:r>
+        <w:rPr>
+          <w:color w:val="1D2D3E"/>
+          <w:sz w:val="22"/>
+          <w:szCs w:val="22"/>
+        </w:rPr>
+        <w:t xml:space="preserve"/>
+      </w:r>
+    </w:p>
+    <w:p>
+      <w:pPr>
+        <w:pStyle w:val="Heading2"/>
+        <w:spacing w:after="120" w:before="300"/>
+      </w:pPr>
+      <w:r>
+        <w:rPr>
+          <w:b/>
+          <w:bCs/>
+          <w:color w:val="1D2D3E"/>
+        </w:rPr>
+        <w:t xml:space="preserve">Session 39 — 2026-06-02</w:t>
+      </w:r>
+    </w:p>
+    <w:p>
+      <w:pPr>
+        <w:pStyle w:val="ListParagraph"/>
+        <w:numPr>
+          <w:ilvl w:val="0"/>
+          <w:numId w:val="1"/>
+        </w:numPr>
+        <w:spacing w:after="40"/>
+      </w:pPr>
+      <w:r>
+        <w:rPr>
+          <w:color w:val="1D2D3E"/>
+          <w:sz w:val="22"/>
+          <w:szCs w:val="22"/>
+        </w:rPr>
+        <w:t xml:space="preserve">Out-of-Stock Items List in Stock Health (StockHealthScreen.tsx)</w:t>
+      </w:r>
+    </w:p>
+    <w:p>
+      <w:pPr>
+        <w:pStyle w:val="ListParagraph"/>
+        <w:numPr>
+          <w:ilvl w:val="1"/>
+          <w:numId w:val="1"/>
+        </w:numPr>
+        <w:spacing w:after="40"/>
+      </w:pPr>
+      <w:r>
+        <w:rPr>
+          <w:color w:val="1D2D3E"/>
+          <w:sz w:val="22"/>
+          <w:szCs w:val="22"/>
+        </w:rPr>
+        <w:t xml:space="preserve">  computeStockHealth now returns outOfStock: StockBalance[] (all zero-qty items, sorted A–Z, no 8-cap)</w:t>
+      </w:r>
+    </w:p>
+    <w:p>
+      <w:pPr>
+        <w:pStyle w:val="ListParagraph"/>
+        <w:numPr>
+          <w:ilvl w:val="1"/>
+          <w:numId w:val="1"/>
+        </w:numPr>
+        <w:spacing w:after="40"/>
+      </w:pPr>
+      <w:r>
+        <w:rPr>
+          <w:color w:val="1D2D3E"/>
+          <w:sz w:val="22"/>
+          <w:szCs w:val="22"/>
+        </w:rPr>
+        <w:t xml:space="preserve">  StockHealthData type extended with outOfStock field</w:t>
+      </w:r>
+    </w:p>
+    <w:p>
+      <w:pPr>
+        <w:pStyle w:val="ListParagraph"/>
+        <w:numPr>
+          <w:ilvl w:val="1"/>
+          <w:numId w:val="1"/>
+        </w:numPr>
+        <w:spacing w:after="40"/>
+      </w:pPr>
+      <w:r>
+        <w:rPr>
+          <w:color w:val="1D2D3E"/>
+          <w:sz w:val="22"/>
+          <w:szCs w:val="22"/>
+        </w:rPr>
+        <w:t xml:space="preserve">  New 'Out of Stock' section displayed above low-stock list when outOfStockItems &gt; 0</w:t>
+      </w:r>
+    </w:p>
+    <w:p>
+      <w:pPr>
+        <w:pStyle w:val="ListParagraph"/>
+        <w:numPr>
+          <w:ilvl w:val="1"/>
+          <w:numId w:val="1"/>
+        </w:numPr>
+        <w:spacing w:after="40"/>
+      </w:pPr>
+      <w:r>
+        <w:rPr>
+          <w:color w:val="1D2D3E"/>
+          <w:sz w:val="22"/>
+          <w:szCs w:val="22"/>
+        </w:rPr>
+        <w:t xml:space="preserve">  RankedItemList: showOutOfStock prop — x-circle icon, no proportional bar, qty shown as '0' in muted colour</w:t>
+      </w:r>
+    </w:p>
+    <w:p>
+      <w:pPr>
+        <w:pStyle w:val="ListParagraph"/>
+        <w:numPr>
+          <w:ilvl w:val="1"/>
+          <w:numId w:val="1"/>
+        </w:numPr>
+        <w:spacing w:after="40"/>
+      </w:pPr>
+      <w:r>
+        <w:rPr>
+          <w:color w:val="1D2D3E"/>
+          <w:sz w:val="22"/>
+          <w:szCs w:val="22"/>
+        </w:rPr>
+        <w:t xml:space="preserve">  All out-of-stock items are tappable (drill-down modal same as low-stock)</w:t>
+      </w:r>
+    </w:p>
+    <w:p>
+      <w:pPr>
+        <w:pStyle w:val="ListParagraph"/>
+        <w:numPr>
+          <w:ilvl w:val="0"/>
+          <w:numId w:val="1"/>
+        </w:numPr>
+        <w:spacing w:after="40"/>
+      </w:pPr>
+      <w:r>
+        <w:rPr>
+          <w:color w:val="1D2D3E"/>
+          <w:sz w:val="22"/>
+          <w:szCs w:val="22"/>
+        </w:rPr>
+        <w:t xml:space="preserve">Mark as Reviewed for Bills &amp; Invoices (reviewedItems.ts, AccountsPayableScreen.tsx, AccountsReceivableScreen.tsx)</w:t>
+      </w:r>
+    </w:p>
+    <w:p>
+      <w:pPr>
+        <w:pStyle w:val="ListParagraph"/>
+        <w:numPr>
+          <w:ilvl w:val="1"/>
+          <w:numId w:val="1"/>
+        </w:numPr>
+        <w:spacing w:after="40"/>
+      </w:pPr>
+      <w:r>
+        <w:rPr>
+          <w:color w:val="1D2D3E"/>
+          <w:sz w:val="22"/>
+          <w:szCs w:val="22"/>
+        </w:rPr>
+        <w:t xml:space="preserve">  New src/utils/reviewedItems.ts: getReviewedIds / toggleReviewed / clearAllReviewed via AsyncStorage</w:t>
+      </w:r>
+    </w:p>
+    <w:p>
+      <w:pPr>
+        <w:pStyle w:val="ListParagraph"/>
+        <w:numPr>
+          <w:ilvl w:val="1"/>
+          <w:numId w:val="1"/>
+        </w:numPr>
+        <w:spacing w:after="40"/>
+      </w:pPr>
+      <w:r>
+        <w:rPr>
+          <w:color w:val="1D2D3E"/>
+          <w:sz w:val="22"/>
+          <w:szCs w:val="22"/>
+        </w:rPr>
+        <w:t xml:space="preserve">  AccountsPayableScreen: check-circle icon on each BillCard; opacity 0.6 when reviewed; check-circle filter chip</w:t>
+      </w:r>
+    </w:p>
+    <w:p>
+      <w:pPr>
+        <w:pStyle w:val="ListParagraph"/>
+        <w:numPr>
+          <w:ilvl w:val="1"/>
+          <w:numId w:val="1"/>
+        </w:numPr>
+        <w:spacing w:after="40"/>
+      </w:pPr>
+      <w:r>
+        <w:rPr>
+          <w:color w:val="1D2D3E"/>
+          <w:sz w:val="22"/>
+          <w:szCs w:val="22"/>
+        </w:rPr>
+        <w:t xml:space="preserve">  AccountsReceivableScreen: identical pattern for InvoiceCard + reviewedInvoiceIds</w:t>
+      </w:r>
+    </w:p>
+    <w:p>
+      <w:pPr>
+        <w:pStyle w:val="ListParagraph"/>
+        <w:numPr>
+          <w:ilvl w:val="1"/>
+          <w:numId w:val="1"/>
+        </w:numPr>
+        <w:spacing w:after="40"/>
+      </w:pPr>
+      <w:r>
+        <w:rPr>
+          <w:color w:val="1D2D3E"/>
+          <w:sz w:val="22"/>
+          <w:szCs w:val="22"/>
+        </w:rPr>
+        <w:t xml:space="preserve">  showReviewedOnly filter composable with flagged / overdue / due-soon; count badge on chip when non-empty</w:t>
+      </w:r>
+    </w:p>
+    <w:p>
+      <w:pPr>
+        <w:pStyle w:val="ListParagraph"/>
+        <w:numPr>
+          <w:ilvl w:val="0"/>
+          <w:numId w:val="1"/>
+        </w:numPr>
+        <w:spacing w:after="40"/>
+      </w:pPr>
+      <w:r>
+        <w:rPr>
+          <w:color w:val="1D2D3E"/>
+          <w:sz w:val="22"/>
+          <w:szCs w:val="22"/>
+        </w:rPr>
+        <w:t xml:space="preserve">Vendor &amp; Customer Local Notes (partnerNotes.ts, VendorDetailScreen.tsx, CustomerDetailScreen.tsx)</w:t>
+      </w:r>
+    </w:p>
+    <w:p>
+      <w:pPr>
+        <w:pStyle w:val="ListParagraph"/>
+        <w:numPr>
+          <w:ilvl w:val="1"/>
+          <w:numId w:val="1"/>
+        </w:numPr>
+        <w:spacing w:after="40"/>
+      </w:pPr>
+      <w:r>
+        <w:rPr>
+          <w:color w:val="1D2D3E"/>
+          <w:sz w:val="22"/>
+          <w:szCs w:val="22"/>
+        </w:rPr>
+        <w:t xml:space="preserve">  New src/utils/partnerNotes.ts: getNote / saveNote — keyed by type+id, auto-remove on empty save</w:t>
+      </w:r>
+    </w:p>
+    <w:p>
+      <w:pPr>
+        <w:pStyle w:val="ListParagraph"/>
+        <w:numPr>
+          <w:ilvl w:val="1"/>
+          <w:numId w:val="1"/>
+        </w:numPr>
+        <w:spacing w:after="40"/>
+      </w:pPr>
+      <w:r>
+        <w:rPr>
+          <w:color w:val="1D2D3E"/>
+          <w:sz w:val="22"/>
+          <w:szCs w:val="22"/>
+        </w:rPr>
+        <w:t xml:space="preserve">  VendorDetailScreen: 4th tab 'Notes' — multiline TextInput, Save button with loading state, hint when empty</w:t>
+      </w:r>
+    </w:p>
+    <w:p>
+      <w:pPr>
+        <w:pStyle w:val="ListParagraph"/>
+        <w:numPr>
+          <w:ilvl w:val="1"/>
+          <w:numId w:val="1"/>
+        </w:numPr>
+        <w:spacing w:after="40"/>
+      </w:pPr>
+      <w:r>
+        <w:rPr>
+          <w:color w:val="1D2D3E"/>
+          <w:sz w:val="22"/>
+          <w:szCs w:val="22"/>
+        </w:rPr>
+        <w:t xml:space="preserve">  CustomerDetailScreen: identical Notes tab with customer-specific copy text</w:t>
+      </w:r>
+    </w:p>
+    <w:p>
+      <w:pPr>
+        <w:pStyle w:val="ListParagraph"/>
+        <w:numPr>
+          <w:ilvl w:val="1"/>
+          <w:numId w:val="1"/>
+        </w:numPr>
+        <w:spacing w:after="40"/>
+      </w:pPr>
+      <w:r>
+        <w:rPr>
+          <w:color w:val="1D2D3E"/>
+          <w:sz w:val="22"/>
+          <w:szCs w:val="22"/>
+        </w:rPr>
+        <w:t xml:space="preserve">  Tab label shows '·' dot when a note is saved — visible indicator from the tab bar row</w:t>
       </w:r>
     </w:p>
     <w:p>

</xml_diff>

<commit_message>
docs(session-40): update PROGRESS.md, generate-docs.js, and FEATURES.docx with Session 40 changelog
</commit_message>
<xml_diff>
--- a/FEATURES.docx
+++ b/FEATURES.docx
@@ -45,7 +45,7 @@
           <w:sz w:val="20"/>
           <w:szCs w:val="20"/>
         </w:rPr>
-        <w:t xml:space="preserve">Generated: 2026-06-02</w:t>
+        <w:t xml:space="preserve">Generated: 2026-06-03</w:t>
       </w:r>
     </w:p>
     <w:p>
@@ -10362,6 +10362,663 @@
           <w:bCs/>
           <w:color w:val="1D2D3E"/>
         </w:rPr>
+        <w:t xml:space="preserve">3.49 StockHealth Out-of-Stock PDF Export (Session 40)</w:t>
+      </w:r>
+    </w:p>
+    <w:p>
+      <w:pPr>
+        <w:pStyle w:val="ListParagraph"/>
+        <w:numPr>
+          <w:ilvl w:val="0"/>
+          <w:numId w:val="1"/>
+        </w:numPr>
+        <w:spacing w:after="40"/>
+      </w:pPr>
+      <w:r>
+        <w:rPr>
+          <w:color w:val="1D2D3E"/>
+          <w:sz w:val="22"/>
+          <w:szCs w:val="22"/>
+        </w:rPr>
+        <w:t xml:space="preserve">pdfExport.ts: StockHealthPDFData gains optional outOfStock field</w:t>
+      </w:r>
+    </w:p>
+    <w:p>
+      <w:pPr>
+        <w:pStyle w:val="ListParagraph"/>
+        <w:numPr>
+          <w:ilvl w:val="1"/>
+          <w:numId w:val="1"/>
+        </w:numPr>
+        <w:spacing w:after="40"/>
+      </w:pPr>
+      <w:r>
+        <w:rPr>
+          <w:color w:val="1D2D3E"/>
+          <w:sz w:val="22"/>
+          <w:szCs w:val="22"/>
+        </w:rPr>
+        <w:t xml:space="preserve">  exportStockHealthPDF: out-of-stock table rendered above low-stock (red section label, qty shown as 0 in red)</w:t>
+      </w:r>
+    </w:p>
+    <w:p>
+      <w:pPr>
+        <w:pStyle w:val="ListParagraph"/>
+        <w:numPr>
+          <w:ilvl w:val="1"/>
+          <w:numId w:val="1"/>
+        </w:numPr>
+        <w:spacing w:after="40"/>
+      </w:pPr>
+      <w:r>
+        <w:rPr>
+          <w:color w:val="1D2D3E"/>
+          <w:sz w:val="22"/>
+          <w:szCs w:val="22"/>
+        </w:rPr>
+        <w:t xml:space="preserve">  Out-of-stock section only renders when outOfStockRows is non-empty</w:t>
+      </w:r>
+    </w:p>
+    <w:p>
+      <w:pPr>
+        <w:pStyle w:val="ListParagraph"/>
+        <w:numPr>
+          <w:ilvl w:val="0"/>
+          <w:numId w:val="1"/>
+        </w:numPr>
+        <w:spacing w:after="40"/>
+      </w:pPr>
+      <w:r>
+        <w:rPr>
+          <w:color w:val="1D2D3E"/>
+          <w:sz w:val="22"/>
+          <w:szCs w:val="22"/>
+        </w:rPr>
+        <w:t xml:space="preserve">StockHealthScreen.tsx: passes data.outOfStock to exportStockHealthPDF call</w:t>
+      </w:r>
+    </w:p>
+    <w:p>
+      <w:pPr>
+        <w:spacing w:after="80"/>
+      </w:pPr>
+      <w:r>
+        <w:rPr>
+          <w:color w:val="1D2D3E"/>
+          <w:sz w:val="22"/>
+          <w:szCs w:val="22"/>
+        </w:rPr>
+        <w:t xml:space="preserve"/>
+      </w:r>
+    </w:p>
+    <w:p>
+      <w:pPr>
+        <w:pStyle w:val="Heading2"/>
+        <w:spacing w:after="120" w:before="300"/>
+      </w:pPr>
+      <w:r>
+        <w:rPr>
+          <w:b/>
+          <w:bCs/>
+          <w:color w:val="1D2D3E"/>
+        </w:rPr>
+        <w:t xml:space="preserve">3.50 AP/AR Flagged Bills/Invoices PDF Export (Session 40)</w:t>
+      </w:r>
+    </w:p>
+    <w:p>
+      <w:pPr>
+        <w:pStyle w:val="ListParagraph"/>
+        <w:numPr>
+          <w:ilvl w:val="0"/>
+          <w:numId w:val="1"/>
+        </w:numPr>
+        <w:spacing w:after="40"/>
+      </w:pPr>
+      <w:r>
+        <w:rPr>
+          <w:color w:val="1D2D3E"/>
+          <w:sz w:val="22"/>
+          <w:szCs w:val="22"/>
+        </w:rPr>
+        <w:t xml:space="preserve">pdfExport.ts: new exportFlaggedBillsPDF() function</w:t>
+      </w:r>
+    </w:p>
+    <w:p>
+      <w:pPr>
+        <w:pStyle w:val="ListParagraph"/>
+        <w:numPr>
+          <w:ilvl w:val="1"/>
+          <w:numId w:val="1"/>
+        </w:numPr>
+        <w:spacing w:after="40"/>
+      </w:pPr>
+      <w:r>
+        <w:rPr>
+          <w:color w:val="1D2D3E"/>
+          <w:sz w:val="22"/>
+          <w:szCs w:val="22"/>
+        </w:rPr>
+        <w:t xml:space="preserve">  3-tile summary (Flagged Bills / Total Outstanding / Overdue count)</w:t>
+      </w:r>
+    </w:p>
+    <w:p>
+      <w:pPr>
+        <w:pStyle w:val="ListParagraph"/>
+        <w:numPr>
+          <w:ilvl w:val="1"/>
+          <w:numId w:val="1"/>
+        </w:numPr>
+        <w:spacing w:after="40"/>
+      </w:pPr>
+      <w:r>
+        <w:rPr>
+          <w:color w:val="1D2D3E"/>
+          <w:sz w:val="22"/>
+          <w:szCs w:val="22"/>
+        </w:rPr>
+        <w:t xml:space="preserve">  Full bills table (Bill# / Vendor / Date / Due Date / Status / Amount / Outstanding)</w:t>
+      </w:r>
+    </w:p>
+    <w:p>
+      <w:pPr>
+        <w:pStyle w:val="ListParagraph"/>
+        <w:numPr>
+          <w:ilvl w:val="1"/>
+          <w:numId w:val="1"/>
+        </w:numPr>
+        <w:spacing w:after="40"/>
+      </w:pPr>
+      <w:r>
+        <w:rPr>
+          <w:color w:val="1D2D3E"/>
+          <w:sz w:val="22"/>
+          <w:szCs w:val="22"/>
+        </w:rPr>
+        <w:t xml:space="preserve">  Overdue rows in bold; totals footer row</w:t>
+      </w:r>
+    </w:p>
+    <w:p>
+      <w:pPr>
+        <w:pStyle w:val="ListParagraph"/>
+        <w:numPr>
+          <w:ilvl w:val="0"/>
+          <w:numId w:val="1"/>
+        </w:numPr>
+        <w:spacing w:after="40"/>
+      </w:pPr>
+      <w:r>
+        <w:rPr>
+          <w:color w:val="1D2D3E"/>
+          <w:sz w:val="22"/>
+          <w:szCs w:val="22"/>
+        </w:rPr>
+        <w:t xml:space="preserve">pdfExport.ts: new exportFlaggedInvoicesPDF() function — identical structure for AR invoices</w:t>
+      </w:r>
+    </w:p>
+    <w:p>
+      <w:pPr>
+        <w:pStyle w:val="ListParagraph"/>
+        <w:numPr>
+          <w:ilvl w:val="0"/>
+          <w:numId w:val="1"/>
+        </w:numPr>
+        <w:spacing w:after="40"/>
+      </w:pPr>
+      <w:r>
+        <w:rPr>
+          <w:color w:val="1D2D3E"/>
+          <w:sz w:val="22"/>
+          <w:szCs w:val="22"/>
+        </w:rPr>
+        <w:t xml:space="preserve">AccountsPayableScreen bills tab: PDF button appears in action slot when flagged-only filter is active</w:t>
+      </w:r>
+    </w:p>
+    <w:p>
+      <w:pPr>
+        <w:pStyle w:val="ListParagraph"/>
+        <w:numPr>
+          <w:ilvl w:val="0"/>
+          <w:numId w:val="1"/>
+        </w:numPr>
+        <w:spacing w:after="40"/>
+      </w:pPr>
+      <w:r>
+        <w:rPr>
+          <w:color w:val="1D2D3E"/>
+          <w:sz w:val="22"/>
+          <w:szCs w:val="22"/>
+        </w:rPr>
+        <w:t xml:space="preserve">AccountsReceivableScreen invoices tab: identical PDF button for flagged invoices</w:t>
+      </w:r>
+    </w:p>
+    <w:p>
+      <w:pPr>
+        <w:spacing w:after="80"/>
+      </w:pPr>
+      <w:r>
+        <w:rPr>
+          <w:color w:val="1D2D3E"/>
+          <w:sz w:val="22"/>
+          <w:szCs w:val="22"/>
+        </w:rPr>
+        <w:t xml:space="preserve"/>
+      </w:r>
+    </w:p>
+    <w:p>
+      <w:pPr>
+        <w:pStyle w:val="Heading2"/>
+        <w:spacing w:after="120" w:before="300"/>
+      </w:pPr>
+      <w:r>
+        <w:rPr>
+          <w:b/>
+          <w:bCs/>
+          <w:color w:val="1D2D3E"/>
+        </w:rPr>
+        <w:t xml:space="preserve">3.51 AP/AR Batch Unflag-All and Clear-Reviews (Session 40)</w:t>
+      </w:r>
+    </w:p>
+    <w:p>
+      <w:pPr>
+        <w:pStyle w:val="ListParagraph"/>
+        <w:numPr>
+          <w:ilvl w:val="0"/>
+          <w:numId w:val="1"/>
+        </w:numPr>
+        <w:spacing w:after="40"/>
+      </w:pPr>
+      <w:r>
+        <w:rPr>
+          <w:color w:val="1D2D3E"/>
+          <w:sz w:val="22"/>
+          <w:szCs w:val="22"/>
+        </w:rPr>
+        <w:t xml:space="preserve">AccountsPayableScreen bills tab: 'Unflag All' button when flagged-only is active — calls clearAllFlagged('bill'), resets state</w:t>
+      </w:r>
+    </w:p>
+    <w:p>
+      <w:pPr>
+        <w:pStyle w:val="ListParagraph"/>
+        <w:numPr>
+          <w:ilvl w:val="0"/>
+          <w:numId w:val="1"/>
+        </w:numPr>
+        <w:spacing w:after="40"/>
+      </w:pPr>
+      <w:r>
+        <w:rPr>
+          <w:color w:val="1D2D3E"/>
+          <w:sz w:val="22"/>
+          <w:szCs w:val="22"/>
+        </w:rPr>
+        <w:t xml:space="preserve">AccountsPayableScreen bills tab: 'Clear Reviews' button when reviewed-only is active — calls clearAllReviewed('bill')</w:t>
+      </w:r>
+    </w:p>
+    <w:p>
+      <w:pPr>
+        <w:pStyle w:val="ListParagraph"/>
+        <w:numPr>
+          <w:ilvl w:val="0"/>
+          <w:numId w:val="1"/>
+        </w:numPr>
+        <w:spacing w:after="40"/>
+      </w:pPr>
+      <w:r>
+        <w:rPr>
+          <w:color w:val="1D2D3E"/>
+          <w:sz w:val="22"/>
+          <w:szCs w:val="22"/>
+        </w:rPr>
+        <w:t xml:space="preserve">AccountsReceivableScreen invoices tab: identical 'Unflag All' and 'Clear Reviews' batch actions</w:t>
+      </w:r>
+    </w:p>
+    <w:p>
+      <w:pPr>
+        <w:pStyle w:val="ListParagraph"/>
+        <w:numPr>
+          <w:ilvl w:val="0"/>
+          <w:numId w:val="1"/>
+        </w:numPr>
+        <w:spacing w:after="40"/>
+      </w:pPr>
+      <w:r>
+        <w:rPr>
+          <w:color w:val="1D2D3E"/>
+          <w:sz w:val="22"/>
+          <w:szCs w:val="22"/>
+        </w:rPr>
+        <w:t xml:space="preserve">Both screens import clearAllFlagged from flaggedItems.ts and clearAllReviewed from reviewedItems.ts</w:t>
+      </w:r>
+    </w:p>
+    <w:p>
+      <w:pPr>
+        <w:pStyle w:val="ListParagraph"/>
+        <w:numPr>
+          <w:ilvl w:val="0"/>
+          <w:numId w:val="1"/>
+        </w:numPr>
+        <w:spacing w:after="40"/>
+      </w:pPr>
+      <w:r>
+        <w:rPr>
+          <w:color w:val="1D2D3E"/>
+          <w:sz w:val="22"/>
+          <w:szCs w:val="22"/>
+        </w:rPr>
+        <w:t xml:space="preserve">clearBtn style: lighter border to visually distinguish from export buttons</w:t>
+      </w:r>
+    </w:p>
+    <w:p>
+      <w:pPr>
+        <w:spacing w:after="80"/>
+      </w:pPr>
+      <w:r>
+        <w:rPr>
+          <w:color w:val="1D2D3E"/>
+          <w:sz w:val="22"/>
+          <w:szCs w:val="22"/>
+        </w:rPr>
+        <w:t xml:space="preserve"/>
+      </w:r>
+    </w:p>
+    <w:p>
+      <w:pPr>
+        <w:pStyle w:val="Heading2"/>
+        <w:spacing w:after="120" w:before="300"/>
+      </w:pPr>
+      <w:r>
+        <w:rPr>
+          <w:b/>
+          <w:bCs/>
+          <w:color w:val="1D2D3E"/>
+        </w:rPr>
+        <w:t xml:space="preserve">3.52 Mark as Reviewed in VendorDetail/CustomerDetail (Session 40)</w:t>
+      </w:r>
+    </w:p>
+    <w:p>
+      <w:pPr>
+        <w:pStyle w:val="ListParagraph"/>
+        <w:numPr>
+          <w:ilvl w:val="0"/>
+          <w:numId w:val="1"/>
+        </w:numPr>
+        <w:spacing w:after="40"/>
+      </w:pPr>
+      <w:r>
+        <w:rPr>
+          <w:color w:val="1D2D3E"/>
+          <w:sz w:val="22"/>
+          <w:szCs w:val="22"/>
+        </w:rPr>
+        <w:t xml:space="preserve">VendorDetailScreen: reviewedBillIds state (Set&lt;number&gt;) loaded from AsyncStorage on mount via getReviewedIds('bill')</w:t>
+      </w:r>
+    </w:p>
+    <w:p>
+      <w:pPr>
+        <w:pStyle w:val="ListParagraph"/>
+        <w:numPr>
+          <w:ilvl w:val="1"/>
+          <w:numId w:val="1"/>
+        </w:numPr>
+        <w:spacing w:after="40"/>
+      </w:pPr>
+      <w:r>
+        <w:rPr>
+          <w:color w:val="1D2D3E"/>
+          <w:sz w:val="22"/>
+          <w:szCs w:val="22"/>
+        </w:rPr>
+        <w:t xml:space="preserve">  BillCard now accepts reviewed + onToggleReview props; check-circle icon (filled = reviewed)</w:t>
+      </w:r>
+    </w:p>
+    <w:p>
+      <w:pPr>
+        <w:pStyle w:val="ListParagraph"/>
+        <w:numPr>
+          <w:ilvl w:val="1"/>
+          <w:numId w:val="1"/>
+        </w:numPr>
+        <w:spacing w:after="40"/>
+      </w:pPr>
+      <w:r>
+        <w:rPr>
+          <w:color w:val="1D2D3E"/>
+          <w:sz w:val="22"/>
+          <w:szCs w:val="22"/>
+        </w:rPr>
+        <w:t xml:space="preserve">  cardReviewed style: opacity 0.6 when reviewed</w:t>
+      </w:r>
+    </w:p>
+    <w:p>
+      <w:pPr>
+        <w:pStyle w:val="ListParagraph"/>
+        <w:numPr>
+          <w:ilvl w:val="1"/>
+          <w:numId w:val="1"/>
+        </w:numPr>
+        <w:spacing w:after="40"/>
+      </w:pPr>
+      <w:r>
+        <w:rPr>
+          <w:color w:val="1D2D3E"/>
+          <w:sz w:val="22"/>
+          <w:szCs w:val="22"/>
+        </w:rPr>
+        <w:t xml:space="preserve">  Toggle writes to AsyncStorage and refreshes the full set for consistency</w:t>
+      </w:r>
+    </w:p>
+    <w:p>
+      <w:pPr>
+        <w:pStyle w:val="ListParagraph"/>
+        <w:numPr>
+          <w:ilvl w:val="0"/>
+          <w:numId w:val="1"/>
+        </w:numPr>
+        <w:spacing w:after="40"/>
+      </w:pPr>
+      <w:r>
+        <w:rPr>
+          <w:color w:val="1D2D3E"/>
+          <w:sz w:val="22"/>
+          <w:szCs w:val="22"/>
+        </w:rPr>
+        <w:t xml:space="preserve">CustomerDetailScreen: identical reviewed pattern for InvoiceCard with getReviewedIds('invoice')</w:t>
+      </w:r>
+    </w:p>
+    <w:p>
+      <w:pPr>
+        <w:pStyle w:val="ListParagraph"/>
+        <w:numPr>
+          <w:ilvl w:val="0"/>
+          <w:numId w:val="1"/>
+        </w:numPr>
+        <w:spacing w:after="40"/>
+      </w:pPr>
+      <w:r>
+        <w:rPr>
+          <w:color w:val="1D2D3E"/>
+          <w:sz w:val="22"/>
+          <w:szCs w:val="22"/>
+        </w:rPr>
+        <w:t xml:space="preserve">Review state is shared with AP/AR screens (same AsyncStorage key) — reviewing in detail screen reflects in list and vice versa</w:t>
+      </w:r>
+    </w:p>
+    <w:p>
+      <w:pPr>
+        <w:spacing w:after="80"/>
+      </w:pPr>
+      <w:r>
+        <w:rPr>
+          <w:color w:val="1D2D3E"/>
+          <w:sz w:val="22"/>
+          <w:szCs w:val="22"/>
+        </w:rPr>
+        <w:t xml:space="preserve"/>
+      </w:r>
+    </w:p>
+    <w:p>
+      <w:pPr>
+        <w:pStyle w:val="Heading2"/>
+        <w:spacing w:after="120" w:before="300"/>
+      </w:pPr>
+      <w:r>
+        <w:rPr>
+          <w:b/>
+          <w:bCs/>
+          <w:color w:val="1D2D3E"/>
+        </w:rPr>
+        <w:t xml:space="preserve">3.53 Partner Notes Modal in PartnersScreen (Session 40)</w:t>
+      </w:r>
+    </w:p>
+    <w:p>
+      <w:pPr>
+        <w:pStyle w:val="ListParagraph"/>
+        <w:numPr>
+          <w:ilvl w:val="0"/>
+          <w:numId w:val="1"/>
+        </w:numPr>
+        <w:spacing w:after="40"/>
+      </w:pPr>
+      <w:r>
+        <w:rPr>
+          <w:color w:val="1D2D3E"/>
+          <w:sz w:val="22"/>
+          <w:szCs w:val="22"/>
+        </w:rPr>
+        <w:t xml:space="preserve">PartnersScreen: imports getNote/saveNote from partnerNotes.ts</w:t>
+      </w:r>
+    </w:p>
+    <w:p>
+      <w:pPr>
+        <w:pStyle w:val="ListParagraph"/>
+        <w:numPr>
+          <w:ilvl w:val="1"/>
+          <w:numId w:val="1"/>
+        </w:numPr>
+        <w:spacing w:after="40"/>
+      </w:pPr>
+      <w:r>
+        <w:rPr>
+          <w:color w:val="1D2D3E"/>
+          <w:sz w:val="22"/>
+          <w:szCs w:val="22"/>
+        </w:rPr>
+        <w:t xml:space="preserve">  partnerNotesMap state: Record&lt;number, string&gt; loaded in batch after partners load (one AsyncStorage read per partner)</w:t>
+      </w:r>
+    </w:p>
+    <w:p>
+      <w:pPr>
+        <w:pStyle w:val="ListParagraph"/>
+        <w:numPr>
+          <w:ilvl w:val="1"/>
+          <w:numId w:val="1"/>
+        </w:numPr>
+        <w:spacing w:after="40"/>
+      </w:pPr>
+      <w:r>
+        <w:rPr>
+          <w:color w:val="1D2D3E"/>
+          <w:sz w:val="22"/>
+          <w:szCs w:val="22"/>
+        </w:rPr>
+        <w:t xml:space="preserve">  Edit-3 icon on every partner card; icon + dot indicator when note exists</w:t>
+      </w:r>
+    </w:p>
+    <w:p>
+      <w:pPr>
+        <w:pStyle w:val="ListParagraph"/>
+        <w:numPr>
+          <w:ilvl w:val="1"/>
+          <w:numId w:val="1"/>
+        </w:numPr>
+        <w:spacing w:after="40"/>
+      </w:pPr>
+      <w:r>
+        <w:rPr>
+          <w:color w:val="1D2D3E"/>
+          <w:sz w:val="22"/>
+          <w:szCs w:val="22"/>
+        </w:rPr>
+        <w:t xml:space="preserve">  openNoteModal(): determines type (vendor/customer) from partner role, loads existing note, sets modal state</w:t>
+      </w:r>
+    </w:p>
+    <w:p>
+      <w:pPr>
+        <w:pStyle w:val="ListParagraph"/>
+        <w:numPr>
+          <w:ilvl w:val="1"/>
+          <w:numId w:val="1"/>
+        </w:numPr>
+        <w:spacing w:after="40"/>
+      </w:pPr>
+      <w:r>
+        <w:rPr>
+          <w:color w:val="1D2D3E"/>
+          <w:sz w:val="22"/>
+          <w:szCs w:val="22"/>
+        </w:rPr>
+        <w:t xml:space="preserve">  savePartnerNote(): writes via saveNote, updates partnerNotesMap in-place, closes modal</w:t>
+      </w:r>
+    </w:p>
+    <w:p>
+      <w:pPr>
+        <w:pStyle w:val="ListParagraph"/>
+        <w:numPr>
+          <w:ilvl w:val="1"/>
+          <w:numId w:val="1"/>
+        </w:numPr>
+        <w:spacing w:after="40"/>
+      </w:pPr>
+      <w:r>
+        <w:rPr>
+          <w:color w:val="1D2D3E"/>
+          <w:sz w:val="22"/>
+          <w:szCs w:val="22"/>
+        </w:rPr>
+        <w:t xml:space="preserve">  Modal: slide-up sheet with KeyboardAvoidingView, multiline TextInput, Cancel + Save buttons</w:t>
+      </w:r>
+    </w:p>
+    <w:p>
+      <w:pPr>
+        <w:pStyle w:val="ListParagraph"/>
+        <w:numPr>
+          <w:ilvl w:val="0"/>
+          <w:numId w:val="1"/>
+        </w:numPr>
+        <w:spacing w:after="40"/>
+      </w:pPr>
+      <w:r>
+        <w:rPr>
+          <w:color w:val="1D2D3E"/>
+          <w:sz w:val="22"/>
+          <w:szCs w:val="22"/>
+        </w:rPr>
+        <w:t xml:space="preserve">Notes use the same storage key as VendorDetailScreen/CustomerDetailScreen — seamlessly shared</w:t>
+      </w:r>
+    </w:p>
+    <w:p>
+      <w:pPr>
+        <w:spacing w:after="80"/>
+      </w:pPr>
+      <w:r>
+        <w:rPr>
+          <w:color w:val="1D2D3E"/>
+          <w:sz w:val="22"/>
+          <w:szCs w:val="22"/>
+        </w:rPr>
+        <w:t xml:space="preserve"/>
+      </w:r>
+    </w:p>
+    <w:p>
+      <w:pPr>
+        <w:pStyle w:val="Heading2"/>
+        <w:spacing w:after="120" w:before="300"/>
+      </w:pPr>
+      <w:r>
+        <w:rPr>
+          <w:b/>
+          <w:bCs/>
+          <w:color w:val="1D2D3E"/>
+        </w:rPr>
         <w:t xml:space="preserve">3.48 Vendor &amp; Customer Local Notes (Session 39)</w:t>
       </w:r>
     </w:p>
@@ -22896,6 +23553,392 @@
           </w:p>
         </w:tc>
       </w:tr>
+      <w:tr>
+        <w:tc>
+          <w:tcPr>
+            <w:shd w:color="F0F4F8" w:val="solid"/>
+          </w:tcPr>
+          <w:p>
+            <w:pPr>
+              <w:spacing w:after="40" w:before="40"/>
+            </w:pPr>
+            <w:r>
+              <w:rPr>
+                <w:b w:val="false"/>
+                <w:bCs w:val="false"/>
+                <w:color w:val="1D2D3E"/>
+                <w:sz w:val="20"/>
+                <w:szCs w:val="20"/>
+              </w:rPr>
+              <w:t xml:space="preserve">Session 40</w:t>
+            </w:r>
+          </w:p>
+        </w:tc>
+        <w:tc>
+          <w:tcPr>
+            <w:shd w:color="F0F4F8" w:val="solid"/>
+          </w:tcPr>
+          <w:p>
+            <w:pPr>
+              <w:spacing w:after="40" w:before="40"/>
+            </w:pPr>
+            <w:r>
+              <w:rPr>
+                <w:b w:val="false"/>
+                <w:bCs w:val="false"/>
+                <w:color w:val="1D2D3E"/>
+                <w:sz w:val="20"/>
+                <w:szCs w:val="20"/>
+              </w:rPr>
+              <w:t xml:space="preserve">StockHealth out-of-stock PDF export — separate table above low-stock section with red label</w:t>
+            </w:r>
+          </w:p>
+        </w:tc>
+        <w:tc>
+          <w:tcPr>
+            <w:shd w:color="F0F4F8" w:val="solid"/>
+          </w:tcPr>
+          <w:p>
+            <w:pPr>
+              <w:spacing w:after="40" w:before="40"/>
+            </w:pPr>
+            <w:r>
+              <w:rPr>
+                <w:b w:val="false"/>
+                <w:bCs w:val="false"/>
+                <w:color w:val="1D2D3E"/>
+                <w:sz w:val="20"/>
+                <w:szCs w:val="20"/>
+              </w:rPr>
+              <w:t xml:space="preserve">Done</w:t>
+            </w:r>
+          </w:p>
+        </w:tc>
+        <w:tc>
+          <w:tcPr>
+            <w:shd w:color="F0F4F8" w:val="solid"/>
+          </w:tcPr>
+          <w:p>
+            <w:pPr>
+              <w:spacing w:after="40" w:before="40"/>
+            </w:pPr>
+            <w:r>
+              <w:rPr>
+                <w:b w:val="false"/>
+                <w:bCs w:val="false"/>
+                <w:color w:val="1D2D3E"/>
+                <w:sz w:val="20"/>
+                <w:szCs w:val="20"/>
+              </w:rPr>
+              <w:t xml:space="preserve">pdfExport.ts + StockHealthScreen.tsx</w:t>
+            </w:r>
+          </w:p>
+        </w:tc>
+      </w:tr>
+      <w:tr>
+        <w:tc>
+          <w:p>
+            <w:pPr>
+              <w:spacing w:after="40" w:before="40"/>
+            </w:pPr>
+            <w:r>
+              <w:rPr>
+                <w:b w:val="false"/>
+                <w:bCs w:val="false"/>
+                <w:color w:val="1D2D3E"/>
+                <w:sz w:val="20"/>
+                <w:szCs w:val="20"/>
+              </w:rPr>
+              <w:t xml:space="preserve">Session 40</w:t>
+            </w:r>
+          </w:p>
+        </w:tc>
+        <w:tc>
+          <w:p>
+            <w:pPr>
+              <w:spacing w:after="40" w:before="40"/>
+            </w:pPr>
+            <w:r>
+              <w:rPr>
+                <w:b w:val="false"/>
+                <w:bCs w:val="false"/>
+                <w:color w:val="1D2D3E"/>
+                <w:sz w:val="20"/>
+                <w:szCs w:val="20"/>
+              </w:rPr>
+              <w:t xml:space="preserve">AP/AR flagged bills/invoices PDF — 3-tile summary + full table; PDF button when flagged-only filter active</w:t>
+            </w:r>
+          </w:p>
+        </w:tc>
+        <w:tc>
+          <w:p>
+            <w:pPr>
+              <w:spacing w:after="40" w:before="40"/>
+            </w:pPr>
+            <w:r>
+              <w:rPr>
+                <w:b w:val="false"/>
+                <w:bCs w:val="false"/>
+                <w:color w:val="1D2D3E"/>
+                <w:sz w:val="20"/>
+                <w:szCs w:val="20"/>
+              </w:rPr>
+              <w:t xml:space="preserve">Done</w:t>
+            </w:r>
+          </w:p>
+        </w:tc>
+        <w:tc>
+          <w:p>
+            <w:pPr>
+              <w:spacing w:after="40" w:before="40"/>
+            </w:pPr>
+            <w:r>
+              <w:rPr>
+                <w:b w:val="false"/>
+                <w:bCs w:val="false"/>
+                <w:color w:val="1D2D3E"/>
+                <w:sz w:val="20"/>
+                <w:szCs w:val="20"/>
+              </w:rPr>
+              <w:t xml:space="preserve">pdfExport.ts + AccountsPayableScreen.tsx + AccountsReceivableScreen.tsx</w:t>
+            </w:r>
+          </w:p>
+        </w:tc>
+      </w:tr>
+      <w:tr>
+        <w:tc>
+          <w:tcPr>
+            <w:shd w:color="F0F4F8" w:val="solid"/>
+          </w:tcPr>
+          <w:p>
+            <w:pPr>
+              <w:spacing w:after="40" w:before="40"/>
+            </w:pPr>
+            <w:r>
+              <w:rPr>
+                <w:b w:val="false"/>
+                <w:bCs w:val="false"/>
+                <w:color w:val="1D2D3E"/>
+                <w:sz w:val="20"/>
+                <w:szCs w:val="20"/>
+              </w:rPr>
+              <w:t xml:space="preserve">Session 40</w:t>
+            </w:r>
+          </w:p>
+        </w:tc>
+        <w:tc>
+          <w:tcPr>
+            <w:shd w:color="F0F4F8" w:val="solid"/>
+          </w:tcPr>
+          <w:p>
+            <w:pPr>
+              <w:spacing w:after="40" w:before="40"/>
+            </w:pPr>
+            <w:r>
+              <w:rPr>
+                <w:b w:val="false"/>
+                <w:bCs w:val="false"/>
+                <w:color w:val="1D2D3E"/>
+                <w:sz w:val="20"/>
+                <w:szCs w:val="20"/>
+              </w:rPr>
+              <w:t xml:space="preserve">AP/AR batch unflag-all + clear-reviews — appear in action slot alongside CSV/PDF when filter active</w:t>
+            </w:r>
+          </w:p>
+        </w:tc>
+        <w:tc>
+          <w:tcPr>
+            <w:shd w:color="F0F4F8" w:val="solid"/>
+          </w:tcPr>
+          <w:p>
+            <w:pPr>
+              <w:spacing w:after="40" w:before="40"/>
+            </w:pPr>
+            <w:r>
+              <w:rPr>
+                <w:b w:val="false"/>
+                <w:bCs w:val="false"/>
+                <w:color w:val="1D2D3E"/>
+                <w:sz w:val="20"/>
+                <w:szCs w:val="20"/>
+              </w:rPr>
+              <w:t xml:space="preserve">Done</w:t>
+            </w:r>
+          </w:p>
+        </w:tc>
+        <w:tc>
+          <w:tcPr>
+            <w:shd w:color="F0F4F8" w:val="solid"/>
+          </w:tcPr>
+          <w:p>
+            <w:pPr>
+              <w:spacing w:after="40" w:before="40"/>
+            </w:pPr>
+            <w:r>
+              <w:rPr>
+                <w:b w:val="false"/>
+                <w:bCs w:val="false"/>
+                <w:color w:val="1D2D3E"/>
+                <w:sz w:val="20"/>
+                <w:szCs w:val="20"/>
+              </w:rPr>
+              <w:t xml:space="preserve">AccountsPayableScreen.tsx + AccountsReceivableScreen.tsx</w:t>
+            </w:r>
+          </w:p>
+        </w:tc>
+      </w:tr>
+      <w:tr>
+        <w:tc>
+          <w:p>
+            <w:pPr>
+              <w:spacing w:after="40" w:before="40"/>
+            </w:pPr>
+            <w:r>
+              <w:rPr>
+                <w:b w:val="false"/>
+                <w:bCs w:val="false"/>
+                <w:color w:val="1D2D3E"/>
+                <w:sz w:val="20"/>
+                <w:szCs w:val="20"/>
+              </w:rPr>
+              <w:t xml:space="preserve">Session 40</w:t>
+            </w:r>
+          </w:p>
+        </w:tc>
+        <w:tc>
+          <w:p>
+            <w:pPr>
+              <w:spacing w:after="40" w:before="40"/>
+            </w:pPr>
+            <w:r>
+              <w:rPr>
+                <w:b w:val="false"/>
+                <w:bCs w:val="false"/>
+                <w:color w:val="1D2D3E"/>
+                <w:sz w:val="20"/>
+                <w:szCs w:val="20"/>
+              </w:rPr>
+              <w:t xml:space="preserve">Reviewed state in VendorDetail/CustomerDetail bills/invoices — check-circle icon, opacity dim, shared AsyncStorage key</w:t>
+            </w:r>
+          </w:p>
+        </w:tc>
+        <w:tc>
+          <w:p>
+            <w:pPr>
+              <w:spacing w:after="40" w:before="40"/>
+            </w:pPr>
+            <w:r>
+              <w:rPr>
+                <w:b w:val="false"/>
+                <w:bCs w:val="false"/>
+                <w:color w:val="1D2D3E"/>
+                <w:sz w:val="20"/>
+                <w:szCs w:val="20"/>
+              </w:rPr>
+              <w:t xml:space="preserve">Done</w:t>
+            </w:r>
+          </w:p>
+        </w:tc>
+        <w:tc>
+          <w:p>
+            <w:pPr>
+              <w:spacing w:after="40" w:before="40"/>
+            </w:pPr>
+            <w:r>
+              <w:rPr>
+                <w:b w:val="false"/>
+                <w:bCs w:val="false"/>
+                <w:color w:val="1D2D3E"/>
+                <w:sz w:val="20"/>
+                <w:szCs w:val="20"/>
+              </w:rPr>
+              <w:t xml:space="preserve">VendorDetailScreen.tsx + CustomerDetailScreen.tsx</w:t>
+            </w:r>
+          </w:p>
+        </w:tc>
+      </w:tr>
+      <w:tr>
+        <w:tc>
+          <w:tcPr>
+            <w:shd w:color="F0F4F8" w:val="solid"/>
+          </w:tcPr>
+          <w:p>
+            <w:pPr>
+              <w:spacing w:after="40" w:before="40"/>
+            </w:pPr>
+            <w:r>
+              <w:rPr>
+                <w:b w:val="false"/>
+                <w:bCs w:val="false"/>
+                <w:color w:val="1D2D3E"/>
+                <w:sz w:val="20"/>
+                <w:szCs w:val="20"/>
+              </w:rPr>
+              <w:t xml:space="preserve">Session 40</w:t>
+            </w:r>
+          </w:p>
+        </w:tc>
+        <w:tc>
+          <w:tcPr>
+            <w:shd w:color="F0F4F8" w:val="solid"/>
+          </w:tcPr>
+          <w:p>
+            <w:pPr>
+              <w:spacing w:after="40" w:before="40"/>
+            </w:pPr>
+            <w:r>
+              <w:rPr>
+                <w:b w:val="false"/>
+                <w:bCs w:val="false"/>
+                <w:color w:val="1D2D3E"/>
+                <w:sz w:val="20"/>
+                <w:szCs w:val="20"/>
+              </w:rPr>
+              <w:t xml:space="preserve">Partner notes modal in PartnersScreen — edit icon per card, note dot, slide-up modal, shared storage with detail screens</w:t>
+            </w:r>
+          </w:p>
+        </w:tc>
+        <w:tc>
+          <w:tcPr>
+            <w:shd w:color="F0F4F8" w:val="solid"/>
+          </w:tcPr>
+          <w:p>
+            <w:pPr>
+              <w:spacing w:after="40" w:before="40"/>
+            </w:pPr>
+            <w:r>
+              <w:rPr>
+                <w:b w:val="false"/>
+                <w:bCs w:val="false"/>
+                <w:color w:val="1D2D3E"/>
+                <w:sz w:val="20"/>
+                <w:szCs w:val="20"/>
+              </w:rPr>
+              <w:t xml:space="preserve">Done</w:t>
+            </w:r>
+          </w:p>
+        </w:tc>
+        <w:tc>
+          <w:tcPr>
+            <w:shd w:color="F0F4F8" w:val="solid"/>
+          </w:tcPr>
+          <w:p>
+            <w:pPr>
+              <w:spacing w:after="40" w:before="40"/>
+            </w:pPr>
+            <w:r>
+              <w:rPr>
+                <w:b w:val="false"/>
+                <w:bCs w:val="false"/>
+                <w:color w:val="1D2D3E"/>
+                <w:sz w:val="20"/>
+                <w:szCs w:val="20"/>
+              </w:rPr>
+              <w:t xml:space="preserve">PartnersScreen.tsx</w:t>
+            </w:r>
+          </w:p>
+        </w:tc>
+      </w:tr>
     </w:tbl>
     <w:p>
       <w:pPr>
@@ -27978,6 +29021,411 @@
           <w:szCs w:val="22"/>
         </w:rPr>
         <w:t xml:space="preserve">  Tapping a history row repopulates the query field</w:t>
+      </w:r>
+    </w:p>
+    <w:p>
+      <w:pPr>
+        <w:spacing w:after="80"/>
+      </w:pPr>
+      <w:r>
+        <w:rPr>
+          <w:color w:val="1D2D3E"/>
+          <w:sz w:val="22"/>
+          <w:szCs w:val="22"/>
+        </w:rPr>
+        <w:t xml:space="preserve"/>
+      </w:r>
+    </w:p>
+    <w:p>
+      <w:pPr>
+        <w:pStyle w:val="Heading2"/>
+        <w:spacing w:after="120" w:before="300"/>
+      </w:pPr>
+      <w:r>
+        <w:rPr>
+          <w:b/>
+          <w:bCs/>
+          <w:color w:val="1D2D3E"/>
+        </w:rPr>
+        <w:t xml:space="preserve">Session 40 — 2026-06-03</w:t>
+      </w:r>
+    </w:p>
+    <w:p>
+      <w:pPr>
+        <w:pStyle w:val="ListParagraph"/>
+        <w:numPr>
+          <w:ilvl w:val="0"/>
+          <w:numId w:val="1"/>
+        </w:numPr>
+        <w:spacing w:after="40"/>
+      </w:pPr>
+      <w:r>
+        <w:rPr>
+          <w:color w:val="1D2D3E"/>
+          <w:sz w:val="22"/>
+          <w:szCs w:val="22"/>
+        </w:rPr>
+        <w:t xml:space="preserve">StockHealth out-of-stock PDF export (pdfExport.ts, StockHealthScreen.tsx)</w:t>
+      </w:r>
+    </w:p>
+    <w:p>
+      <w:pPr>
+        <w:pStyle w:val="ListParagraph"/>
+        <w:numPr>
+          <w:ilvl w:val="1"/>
+          <w:numId w:val="1"/>
+        </w:numPr>
+        <w:spacing w:after="40"/>
+      </w:pPr>
+      <w:r>
+        <w:rPr>
+          <w:color w:val="1D2D3E"/>
+          <w:sz w:val="22"/>
+          <w:szCs w:val="22"/>
+        </w:rPr>
+        <w:t xml:space="preserve">  StockHealthPDFData gains outOfStock?: array field; exportStockHealthPDF renders separate out-of-stock table above low-stock</w:t>
+      </w:r>
+    </w:p>
+    <w:p>
+      <w:pPr>
+        <w:pStyle w:val="ListParagraph"/>
+        <w:numPr>
+          <w:ilvl w:val="1"/>
+          <w:numId w:val="1"/>
+        </w:numPr>
+        <w:spacing w:after="40"/>
+      </w:pPr>
+      <w:r>
+        <w:rPr>
+          <w:color w:val="1D2D3E"/>
+          <w:sz w:val="22"/>
+          <w:szCs w:val="22"/>
+        </w:rPr>
+        <w:t xml:space="preserve">  Red section label; items shown with qty 0; only rendered when outOfStock rows non-empty</w:t>
+      </w:r>
+    </w:p>
+    <w:p>
+      <w:pPr>
+        <w:pStyle w:val="ListParagraph"/>
+        <w:numPr>
+          <w:ilvl w:val="0"/>
+          <w:numId w:val="1"/>
+        </w:numPr>
+        <w:spacing w:after="40"/>
+      </w:pPr>
+      <w:r>
+        <w:rPr>
+          <w:color w:val="1D2D3E"/>
+          <w:sz w:val="22"/>
+          <w:szCs w:val="22"/>
+        </w:rPr>
+        <w:t xml:space="preserve">AP/AR flagged bills/invoices PDF export (pdfExport.ts, AccountsPayableScreen.tsx, AccountsReceivableScreen.tsx)</w:t>
+      </w:r>
+    </w:p>
+    <w:p>
+      <w:pPr>
+        <w:pStyle w:val="ListParagraph"/>
+        <w:numPr>
+          <w:ilvl w:val="1"/>
+          <w:numId w:val="1"/>
+        </w:numPr>
+        <w:spacing w:after="40"/>
+      </w:pPr>
+      <w:r>
+        <w:rPr>
+          <w:color w:val="1D2D3E"/>
+          <w:sz w:val="22"/>
+          <w:szCs w:val="22"/>
+        </w:rPr>
+        <w:t xml:space="preserve">  exportFlaggedBillsPDF(): 3-tile summary + bills table (bold overdue rows) + totals footer</w:t>
+      </w:r>
+    </w:p>
+    <w:p>
+      <w:pPr>
+        <w:pStyle w:val="ListParagraph"/>
+        <w:numPr>
+          <w:ilvl w:val="1"/>
+          <w:numId w:val="1"/>
+        </w:numPr>
+        <w:spacing w:after="40"/>
+      </w:pPr>
+      <w:r>
+        <w:rPr>
+          <w:color w:val="1D2D3E"/>
+          <w:sz w:val="22"/>
+          <w:szCs w:val="22"/>
+        </w:rPr>
+        <w:t xml:space="preserve">  exportFlaggedInvoicesPDF(): identical structure for AR invoices</w:t>
+      </w:r>
+    </w:p>
+    <w:p>
+      <w:pPr>
+        <w:pStyle w:val="ListParagraph"/>
+        <w:numPr>
+          <w:ilvl w:val="1"/>
+          <w:numId w:val="1"/>
+        </w:numPr>
+        <w:spacing w:after="40"/>
+      </w:pPr>
+      <w:r>
+        <w:rPr>
+          <w:color w:val="1D2D3E"/>
+          <w:sz w:val="22"/>
+          <w:szCs w:val="22"/>
+        </w:rPr>
+        <w:t xml:space="preserve">  PDF button appears in bills/invoices SectionHeader action slot when flagged-only filter is active</w:t>
+      </w:r>
+    </w:p>
+    <w:p>
+      <w:pPr>
+        <w:pStyle w:val="ListParagraph"/>
+        <w:numPr>
+          <w:ilvl w:val="0"/>
+          <w:numId w:val="1"/>
+        </w:numPr>
+        <w:spacing w:after="40"/>
+      </w:pPr>
+      <w:r>
+        <w:rPr>
+          <w:color w:val="1D2D3E"/>
+          <w:sz w:val="22"/>
+          <w:szCs w:val="22"/>
+        </w:rPr>
+        <w:t xml:space="preserve">AP/AR batch unflag-all + clear-reviews (AccountsPayableScreen.tsx, AccountsReceivableScreen.tsx)</w:t>
+      </w:r>
+    </w:p>
+    <w:p>
+      <w:pPr>
+        <w:pStyle w:val="ListParagraph"/>
+        <w:numPr>
+          <w:ilvl w:val="1"/>
+          <w:numId w:val="1"/>
+        </w:numPr>
+        <w:spacing w:after="40"/>
+      </w:pPr>
+      <w:r>
+        <w:rPr>
+          <w:color w:val="1D2D3E"/>
+          <w:sz w:val="22"/>
+          <w:szCs w:val="22"/>
+        </w:rPr>
+        <w:t xml:space="preserve">  'Unflag All' button: shown when flagged-only active; calls clearAllFlagged, resets flaggedIds state + filter</w:t>
+      </w:r>
+    </w:p>
+    <w:p>
+      <w:pPr>
+        <w:pStyle w:val="ListParagraph"/>
+        <w:numPr>
+          <w:ilvl w:val="1"/>
+          <w:numId w:val="1"/>
+        </w:numPr>
+        <w:spacing w:after="40"/>
+      </w:pPr>
+      <w:r>
+        <w:rPr>
+          <w:color w:val="1D2D3E"/>
+          <w:sz w:val="22"/>
+          <w:szCs w:val="22"/>
+        </w:rPr>
+        <w:t xml:space="preserve">  'Clear Reviews' button: shown when reviewed-only active; calls clearAllReviewed, resets reviewedIds state + filter</w:t>
+      </w:r>
+    </w:p>
+    <w:p>
+      <w:pPr>
+        <w:pStyle w:val="ListParagraph"/>
+        <w:numPr>
+          <w:ilvl w:val="1"/>
+          <w:numId w:val="1"/>
+        </w:numPr>
+        <w:spacing w:after="40"/>
+      </w:pPr>
+      <w:r>
+        <w:rPr>
+          <w:color w:val="1D2D3E"/>
+          <w:sz w:val="22"/>
+          <w:szCs w:val="22"/>
+        </w:rPr>
+        <w:t xml:space="preserve">  Both AP and AR screens import clearAllFlagged from flaggedItems.ts + clearAllReviewed from reviewedItems.ts</w:t>
+      </w:r>
+    </w:p>
+    <w:p>
+      <w:pPr>
+        <w:pStyle w:val="ListParagraph"/>
+        <w:numPr>
+          <w:ilvl w:val="0"/>
+          <w:numId w:val="1"/>
+        </w:numPr>
+        <w:spacing w:after="40"/>
+      </w:pPr>
+      <w:r>
+        <w:rPr>
+          <w:color w:val="1D2D3E"/>
+          <w:sz w:val="22"/>
+          <w:szCs w:val="22"/>
+        </w:rPr>
+        <w:t xml:space="preserve">Reviewed state in VendorDetail/CustomerDetail (VendorDetailScreen.tsx, CustomerDetailScreen.tsx)</w:t>
+      </w:r>
+    </w:p>
+    <w:p>
+      <w:pPr>
+        <w:pStyle w:val="ListParagraph"/>
+        <w:numPr>
+          <w:ilvl w:val="1"/>
+          <w:numId w:val="1"/>
+        </w:numPr>
+        <w:spacing w:after="40"/>
+      </w:pPr>
+      <w:r>
+        <w:rPr>
+          <w:color w:val="1D2D3E"/>
+          <w:sz w:val="22"/>
+          <w:szCs w:val="22"/>
+        </w:rPr>
+        <w:t xml:space="preserve">  reviewedBillIds/reviewedInvoiceIds state loaded from AsyncStorage on mount; shared key with AP/AR screens</w:t>
+      </w:r>
+    </w:p>
+    <w:p>
+      <w:pPr>
+        <w:pStyle w:val="ListParagraph"/>
+        <w:numPr>
+          <w:ilvl w:val="1"/>
+          <w:numId w:val="1"/>
+        </w:numPr>
+        <w:spacing w:after="40"/>
+      </w:pPr>
+      <w:r>
+        <w:rPr>
+          <w:color w:val="1D2D3E"/>
+          <w:sz w:val="22"/>
+          <w:szCs w:val="22"/>
+        </w:rPr>
+        <w:t xml:space="preserve">  check-circle icon on each bill/invoice card; filled = reviewed; cardReviewed opacity 0.6</w:t>
+      </w:r>
+    </w:p>
+    <w:p>
+      <w:pPr>
+        <w:pStyle w:val="ListParagraph"/>
+        <w:numPr>
+          <w:ilvl w:val="1"/>
+          <w:numId w:val="1"/>
+        </w:numPr>
+        <w:spacing w:after="40"/>
+      </w:pPr>
+      <w:r>
+        <w:rPr>
+          <w:color w:val="1D2D3E"/>
+          <w:sz w:val="22"/>
+          <w:szCs w:val="22"/>
+        </w:rPr>
+        <w:t xml:space="preserve">  onToggleReview: writes to AsyncStorage, refreshes full set for consistency</w:t>
+      </w:r>
+    </w:p>
+    <w:p>
+      <w:pPr>
+        <w:pStyle w:val="ListParagraph"/>
+        <w:numPr>
+          <w:ilvl w:val="0"/>
+          <w:numId w:val="1"/>
+        </w:numPr>
+        <w:spacing w:after="40"/>
+      </w:pPr>
+      <w:r>
+        <w:rPr>
+          <w:color w:val="1D2D3E"/>
+          <w:sz w:val="22"/>
+          <w:szCs w:val="22"/>
+        </w:rPr>
+        <w:t xml:space="preserve">Partner notes modal in PartnersScreen (PartnersScreen.tsx)</w:t>
+      </w:r>
+    </w:p>
+    <w:p>
+      <w:pPr>
+        <w:pStyle w:val="ListParagraph"/>
+        <w:numPr>
+          <w:ilvl w:val="1"/>
+          <w:numId w:val="1"/>
+        </w:numPr>
+        <w:spacing w:after="40"/>
+      </w:pPr>
+      <w:r>
+        <w:rPr>
+          <w:color w:val="1D2D3E"/>
+          <w:sz w:val="22"/>
+          <w:szCs w:val="22"/>
+        </w:rPr>
+        <w:t xml:space="preserve">  Edit-3 icon on every card; blue dot indicator when note exists</w:t>
+      </w:r>
+    </w:p>
+    <w:p>
+      <w:pPr>
+        <w:pStyle w:val="ListParagraph"/>
+        <w:numPr>
+          <w:ilvl w:val="1"/>
+          <w:numId w:val="1"/>
+        </w:numPr>
+        <w:spacing w:after="40"/>
+      </w:pPr>
+      <w:r>
+        <w:rPr>
+          <w:color w:val="1D2D3E"/>
+          <w:sz w:val="22"/>
+          <w:szCs w:val="22"/>
+        </w:rPr>
+        <w:t xml:space="preserve">  Batch load: all partner notes checked via Promise.all on mount; partnerNotesMap state for dot indicators</w:t>
+      </w:r>
+    </w:p>
+    <w:p>
+      <w:pPr>
+        <w:pStyle w:val="ListParagraph"/>
+        <w:numPr>
+          <w:ilvl w:val="1"/>
+          <w:numId w:val="1"/>
+        </w:numPr>
+        <w:spacing w:after="40"/>
+      </w:pPr>
+      <w:r>
+        <w:rPr>
+          <w:color w:val="1D2D3E"/>
+          <w:sz w:val="22"/>
+          <w:szCs w:val="22"/>
+        </w:rPr>
+        <w:t xml:space="preserve">  Slide-up modal with KeyboardAvoidingView, multiline TextInput, Cancel + Save buttons</w:t>
+      </w:r>
+    </w:p>
+    <w:p>
+      <w:pPr>
+        <w:pStyle w:val="ListParagraph"/>
+        <w:numPr>
+          <w:ilvl w:val="1"/>
+          <w:numId w:val="1"/>
+        </w:numPr>
+        <w:spacing w:after="40"/>
+      </w:pPr>
+      <w:r>
+        <w:rPr>
+          <w:color w:val="1D2D3E"/>
+          <w:sz w:val="22"/>
+          <w:szCs w:val="22"/>
+        </w:rPr>
+        <w:t xml:space="preserve">  Note type determined by partner role (vendor/customer); shares storage key with VendorDetail/CustomerDetail</w:t>
+      </w:r>
+    </w:p>
+    <w:p>
+      <w:pPr>
+        <w:pStyle w:val="ListParagraph"/>
+        <w:numPr>
+          <w:ilvl w:val="1"/>
+          <w:numId w:val="1"/>
+        </w:numPr>
+        <w:spacing w:after="40"/>
+      </w:pPr>
+      <w:r>
+        <w:rPr>
+          <w:color w:val="1D2D3E"/>
+          <w:sz w:val="22"/>
+          <w:szCs w:val="22"/>
+        </w:rPr>
+        <w:t xml:space="preserve">  partnerNotesMap updates in-place after save without full reload</w:t>
       </w:r>
     </w:p>
     <w:p>

</xml_diff>

<commit_message>
docs(session-41): update PROGRESS.md, generate-docs.js, and FEATURES.docx with Session 41 changelog
- PROGRESS.md: Session 41 entry with all 5 features documented
- generate-docs.js: Sections 3.54-3.57 + Session 41 changelog + roadmap rows
- FEATURES.docx: regenerated with updated content

https://claude.ai/code/session_01NUexzXpX1vo11V4AbMnUge
</commit_message>
<xml_diff>
--- a/FEATURES.docx
+++ b/FEATURES.docx
@@ -11181,6 +11181,492 @@
     </w:p>
     <w:p>
       <w:pPr>
+        <w:pStyle w:val="Heading2"/>
+        <w:spacing w:after="120" w:before="300"/>
+      </w:pPr>
+      <w:r>
+        <w:rPr>
+          <w:b/>
+          <w:bCs/>
+          <w:color w:val="1D2D3E"/>
+        </w:rPr>
+        <w:t xml:space="preserve">3.54 Date Range Filter on AP Bills / AR Invoices (Session 41)</w:t>
+      </w:r>
+    </w:p>
+    <w:p>
+      <w:pPr>
+        <w:pStyle w:val="ListParagraph"/>
+        <w:numPr>
+          <w:ilvl w:val="0"/>
+          <w:numId w:val="1"/>
+        </w:numPr>
+        <w:spacing w:after="40"/>
+      </w:pPr>
+      <w:r>
+        <w:rPr>
+          <w:color w:val="1D2D3E"/>
+          <w:sz w:val="22"/>
+          <w:szCs w:val="22"/>
+        </w:rPr>
+        <w:t xml:space="preserve">AccountsPayableScreen + AccountsReceivableScreen: import DateRangeBar, DateRangeValue</w:t>
+      </w:r>
+    </w:p>
+    <w:p>
+      <w:pPr>
+        <w:pStyle w:val="ListParagraph"/>
+        <w:numPr>
+          <w:ilvl w:val="1"/>
+          <w:numId w:val="1"/>
+        </w:numPr>
+        <w:spacing w:after="40"/>
+      </w:pPr>
+      <w:r>
+        <w:rPr>
+          <w:color w:val="1D2D3E"/>
+          <w:sz w:val="22"/>
+          <w:szCs w:val="22"/>
+        </w:rPr>
+        <w:t xml:space="preserve">  billDateRange/invDateRange state + showDateFilter toggle added to each screen</w:t>
+      </w:r>
+    </w:p>
+    <w:p>
+      <w:pPr>
+        <w:pStyle w:val="ListParagraph"/>
+        <w:numPr>
+          <w:ilvl w:val="1"/>
+          <w:numId w:val="1"/>
+        </w:numPr>
+        <w:spacing w:after="40"/>
+      </w:pPr>
+      <w:r>
+        <w:rPr>
+          <w:color w:val="1D2D3E"/>
+          <w:sz w:val="22"/>
+          <w:szCs w:val="22"/>
+        </w:rPr>
+        <w:t xml:space="preserve">  dateFilteredBills/dateFilteredInvoices: pre-filter step using dt field, before search/chip filters</w:t>
+      </w:r>
+    </w:p>
+    <w:p>
+      <w:pPr>
+        <w:pStyle w:val="ListParagraph"/>
+        <w:numPr>
+          <w:ilvl w:val="1"/>
+          <w:numId w:val="1"/>
+        </w:numPr>
+        <w:spacing w:after="40"/>
+      </w:pPr>
+      <w:r>
+        <w:rPr>
+          <w:color w:val="1D2D3E"/>
+          <w:sz w:val="22"/>
+          <w:szCs w:val="22"/>
+        </w:rPr>
+        <w:t xml:space="preserve">  overdueCount/dueSoonCount chip badges use date-filtered set for accurate in-context counts</w:t>
+      </w:r>
+    </w:p>
+    <w:p>
+      <w:pPr>
+        <w:pStyle w:val="ListParagraph"/>
+        <w:numPr>
+          <w:ilvl w:val="1"/>
+          <w:numId w:val="1"/>
+        </w:numPr>
+        <w:spacing w:after="40"/>
+      </w:pPr>
+      <w:r>
+        <w:rPr>
+          <w:color w:val="1D2D3E"/>
+          <w:sz w:val="22"/>
+          <w:szCs w:val="22"/>
+        </w:rPr>
+        <w:t xml:space="preserve">  Calendar icon chip in filter row: expands DateRangeBar below chips; shows MM-DD–MM-DD when active</w:t>
+      </w:r>
+    </w:p>
+    <w:p>
+      <w:pPr>
+        <w:pStyle w:val="ListParagraph"/>
+        <w:numPr>
+          <w:ilvl w:val="1"/>
+          <w:numId w:val="1"/>
+        </w:numPr>
+        <w:spacing w:after="40"/>
+      </w:pPr>
+      <w:r>
+        <w:rPr>
+          <w:color w:val="1D2D3E"/>
+          <w:sz w:val="22"/>
+          <w:szCs w:val="22"/>
+        </w:rPr>
+        <w:t xml:space="preserve">  SectionHeader meta includes date range label when active</w:t>
+      </w:r>
+    </w:p>
+    <w:p>
+      <w:pPr>
+        <w:pStyle w:val="ListParagraph"/>
+        <w:numPr>
+          <w:ilvl w:val="0"/>
+          <w:numId w:val="1"/>
+        </w:numPr>
+        <w:spacing w:after="40"/>
+      </w:pPr>
+      <w:r>
+        <w:rPr>
+          <w:color w:val="1D2D3E"/>
+          <w:sz w:val="22"/>
+          <w:szCs w:val="22"/>
+        </w:rPr>
+        <w:t xml:space="preserve">All exports (CSV, flagged PDF) automatically respect the active date range</w:t>
+      </w:r>
+    </w:p>
+    <w:p>
+      <w:pPr>
+        <w:spacing w:after="80"/>
+      </w:pPr>
+      <w:r>
+        <w:rPr>
+          <w:color w:val="1D2D3E"/>
+          <w:sz w:val="22"/>
+          <w:szCs w:val="22"/>
+        </w:rPr>
+        <w:t xml:space="preserve"/>
+      </w:r>
+    </w:p>
+    <w:p>
+      <w:pPr>
+        <w:pStyle w:val="Heading2"/>
+        <w:spacing w:after="120" w:before="300"/>
+      </w:pPr>
+      <w:r>
+        <w:rPr>
+          <w:b/>
+          <w:bCs/>
+          <w:color w:val="1D2D3E"/>
+        </w:rPr>
+        <w:t xml:space="preserve">3.55 Compact Company Switcher in Dashboard Top Bar (Session 41)</w:t>
+      </w:r>
+    </w:p>
+    <w:p>
+      <w:pPr>
+        <w:pStyle w:val="ListParagraph"/>
+        <w:numPr>
+          <w:ilvl w:val="0"/>
+          <w:numId w:val="1"/>
+        </w:numPr>
+        <w:spacing w:after="40"/>
+      </w:pPr>
+      <w:r>
+        <w:rPr>
+          <w:color w:val="1D2D3E"/>
+          <w:sz w:val="22"/>
+          <w:szCs w:val="22"/>
+        </w:rPr>
+        <w:t xml:space="preserve">CompanySelector gains variant prop: 'row' (default) or 'compact'</w:t>
+      </w:r>
+    </w:p>
+    <w:p>
+      <w:pPr>
+        <w:pStyle w:val="ListParagraph"/>
+        <w:numPr>
+          <w:ilvl w:val="1"/>
+          <w:numId w:val="1"/>
+        </w:numPr>
+        <w:spacing w:after="40"/>
+      </w:pPr>
+      <w:r>
+        <w:rPr>
+          <w:color w:val="1D2D3E"/>
+          <w:sz w:val="22"/>
+          <w:szCs w:val="22"/>
+        </w:rPr>
+        <w:t xml:space="preserve">  'compact' renders as small inline pill: briefcase icon + company name + chevron-down, hairline border</w:t>
+      </w:r>
+    </w:p>
+    <w:p>
+      <w:pPr>
+        <w:pStyle w:val="ListParagraph"/>
+        <w:numPr>
+          <w:ilvl w:val="0"/>
+          <w:numId w:val="1"/>
+        </w:numPr>
+        <w:spacing w:after="40"/>
+      </w:pPr>
+      <w:r>
+        <w:rPr>
+          <w:color w:val="1D2D3E"/>
+          <w:sz w:val="22"/>
+          <w:szCs w:val="22"/>
+        </w:rPr>
+        <w:t xml:space="preserve">DashboardScreen: full-width CompanySelector row below header replaced by compact variant in topBarLeft</w:t>
+      </w:r>
+    </w:p>
+    <w:p>
+      <w:pPr>
+        <w:pStyle w:val="ListParagraph"/>
+        <w:numPr>
+          <w:ilvl w:val="0"/>
+          <w:numId w:val="1"/>
+        </w:numPr>
+        <w:spacing w:after="40"/>
+      </w:pPr>
+      <w:r>
+        <w:rPr>
+          <w:color w:val="1D2D3E"/>
+          <w:sz w:val="22"/>
+          <w:szCs w:val="22"/>
+        </w:rPr>
+        <w:t xml:space="preserve">Same picker modal for both variants; change propagates globally via CompanyContext</w:t>
+      </w:r>
+    </w:p>
+    <w:p>
+      <w:pPr>
+        <w:spacing w:after="80"/>
+      </w:pPr>
+      <w:r>
+        <w:rPr>
+          <w:color w:val="1D2D3E"/>
+          <w:sz w:val="22"/>
+          <w:szCs w:val="22"/>
+        </w:rPr>
+        <w:t xml:space="preserve"/>
+      </w:r>
+    </w:p>
+    <w:p>
+      <w:pPr>
+        <w:pStyle w:val="Heading2"/>
+        <w:spacing w:after="120" w:before="300"/>
+      </w:pPr>
+      <w:r>
+        <w:rPr>
+          <w:b/>
+          <w:bCs/>
+          <w:color w:val="1D2D3E"/>
+        </w:rPr>
+        <w:t xml:space="preserve">3.56 Partner Notes Search and Bulk Export (Session 41)</w:t>
+      </w:r>
+    </w:p>
+    <w:p>
+      <w:pPr>
+        <w:pStyle w:val="ListParagraph"/>
+        <w:numPr>
+          <w:ilvl w:val="0"/>
+          <w:numId w:val="1"/>
+        </w:numPr>
+        <w:spacing w:after="40"/>
+      </w:pPr>
+      <w:r>
+        <w:rPr>
+          <w:color w:val="1D2D3E"/>
+          <w:sz w:val="22"/>
+          <w:szCs w:val="22"/>
+        </w:rPr>
+        <w:t xml:space="preserve">PartnersScreen: showNotesOnly state + 'Notes (N)' filter chip — visible only when notes exist</w:t>
+      </w:r>
+    </w:p>
+    <w:p>
+      <w:pPr>
+        <w:pStyle w:val="ListParagraph"/>
+        <w:numPr>
+          <w:ilvl w:val="1"/>
+          <w:numId w:val="1"/>
+        </w:numPr>
+        <w:spacing w:after="40"/>
+      </w:pPr>
+      <w:r>
+        <w:rPr>
+          <w:color w:val="1D2D3E"/>
+          <w:sz w:val="22"/>
+          <w:szCs w:val="22"/>
+        </w:rPr>
+        <w:t xml:space="preserve">  Search now includes note content in match: typing a keyword finds partners by name/code/email/notes</w:t>
+      </w:r>
+    </w:p>
+    <w:p>
+      <w:pPr>
+        <w:pStyle w:val="ListParagraph"/>
+        <w:numPr>
+          <w:ilvl w:val="1"/>
+          <w:numId w:val="1"/>
+        </w:numPr>
+        <w:spacing w:after="40"/>
+      </w:pPr>
+      <w:r>
+        <w:rPr>
+          <w:color w:val="1D2D3E"/>
+          <w:sz w:val="22"/>
+          <w:szCs w:val="22"/>
+        </w:rPr>
+        <w:t xml:space="preserve">  notesPartnersCount derived from partnerNotesMap for chip badge label</w:t>
+      </w:r>
+    </w:p>
+    <w:p>
+      <w:pPr>
+        <w:pStyle w:val="ListParagraph"/>
+        <w:numPr>
+          <w:ilvl w:val="1"/>
+          <w:numId w:val="1"/>
+        </w:numPr>
+        <w:spacing w:after="40"/>
+      </w:pPr>
+      <w:r>
+        <w:rPr>
+          <w:color w:val="1D2D3E"/>
+          <w:sz w:val="22"/>
+          <w:szCs w:val="22"/>
+        </w:rPr>
+        <w:t xml:space="preserve">  SectionHeader meta appends '· has notes' when notes filter active</w:t>
+      </w:r>
+    </w:p>
+    <w:p>
+      <w:pPr>
+        <w:pStyle w:val="ListParagraph"/>
+        <w:numPr>
+          <w:ilvl w:val="0"/>
+          <w:numId w:val="1"/>
+        </w:numPr>
+        <w:spacing w:after="40"/>
+      </w:pPr>
+      <w:r>
+        <w:rPr>
+          <w:color w:val="1D2D3E"/>
+          <w:sz w:val="22"/>
+          <w:szCs w:val="22"/>
+        </w:rPr>
+        <w:t xml:space="preserve">exportPartnerNotesCSV() added to csvExport.ts: Company / date header, Name/Code/Role/Note columns</w:t>
+      </w:r>
+    </w:p>
+    <w:p>
+      <w:pPr>
+        <w:pStyle w:val="ListParagraph"/>
+        <w:numPr>
+          <w:ilvl w:val="1"/>
+          <w:numId w:val="1"/>
+        </w:numPr>
+        <w:spacing w:after="40"/>
+      </w:pPr>
+      <w:r>
+        <w:rPr>
+          <w:color w:val="1D2D3E"/>
+          <w:sz w:val="22"/>
+          <w:szCs w:val="22"/>
+        </w:rPr>
+        <w:t xml:space="preserve">  'Notes' pill button in PartnersScreen header: visible when notes exist, shows ActivityIndicator</w:t>
+      </w:r>
+    </w:p>
+    <w:p>
+      <w:pPr>
+        <w:spacing w:after="80"/>
+      </w:pPr>
+      <w:r>
+        <w:rPr>
+          <w:color w:val="1D2D3E"/>
+          <w:sz w:val="22"/>
+          <w:szCs w:val="22"/>
+        </w:rPr>
+        <w:t xml:space="preserve"/>
+      </w:r>
+    </w:p>
+    <w:p>
+      <w:pPr>
+        <w:pStyle w:val="Heading2"/>
+        <w:spacing w:after="120" w:before="300"/>
+      </w:pPr>
+      <w:r>
+        <w:rPr>
+          <w:b/>
+          <w:bCs/>
+          <w:color w:val="1D2D3E"/>
+        </w:rPr>
+        <w:t xml:space="preserve">3.57 Stock Ledger IN/OUT/NET Summary Bar (Session 41)</w:t>
+      </w:r>
+    </w:p>
+    <w:p>
+      <w:pPr>
+        <w:pStyle w:val="ListParagraph"/>
+        <w:numPr>
+          <w:ilvl w:val="0"/>
+          <w:numId w:val="1"/>
+        </w:numPr>
+        <w:spacing w:after="40"/>
+      </w:pPr>
+      <w:r>
+        <w:rPr>
+          <w:color w:val="1D2D3E"/>
+          <w:sz w:val="22"/>
+          <w:szCs w:val="22"/>
+        </w:rPr>
+        <w:t xml:space="preserve">InventoryScreen ledger tab: ledgerSummary computed from filteredLedger (totalIn, totalOut, net)</w:t>
+      </w:r>
+    </w:p>
+    <w:p>
+      <w:pPr>
+        <w:pStyle w:val="ListParagraph"/>
+        <w:numPr>
+          <w:ilvl w:val="1"/>
+          <w:numId w:val="1"/>
+        </w:numPr>
+        <w:spacing w:after="40"/>
+      </w:pPr>
+      <w:r>
+        <w:rPr>
+          <w:color w:val="1D2D3E"/>
+          <w:sz w:val="22"/>
+          <w:szCs w:val="22"/>
+        </w:rPr>
+        <w:t xml:space="preserve">  3-tile bar (IN | OUT | NET) with hairline dividers above Movement Log SectionHeader</w:t>
+      </w:r>
+    </w:p>
+    <w:p>
+      <w:pPr>
+        <w:pStyle w:val="ListParagraph"/>
+        <w:numPr>
+          <w:ilvl w:val="1"/>
+          <w:numId w:val="1"/>
+        </w:numPr>
+        <w:spacing w:after="40"/>
+      </w:pPr>
+      <w:r>
+        <w:rPr>
+          <w:color w:val="1D2D3E"/>
+          <w:sz w:val="22"/>
+          <w:szCs w:val="22"/>
+        </w:rPr>
+        <w:t xml:space="preserve">  NET tile renders in muted color when negative; bar respects active search + date range</w:t>
+      </w:r>
+    </w:p>
+    <w:p>
+      <w:pPr>
+        <w:pStyle w:val="ListParagraph"/>
+        <w:numPr>
+          <w:ilvl w:val="0"/>
+          <w:numId w:val="1"/>
+        </w:numPr>
+        <w:spacing w:after="40"/>
+      </w:pPr>
+      <w:r>
+        <w:rPr>
+          <w:color w:val="1D2D3E"/>
+          <w:sz w:val="22"/>
+          <w:szCs w:val="22"/>
+        </w:rPr>
+        <w:t xml:space="preserve">Bar hidden when filteredLedger is empty (no visual noise on empty state)</w:t>
+      </w:r>
+    </w:p>
+    <w:p>
+      <w:pPr>
+        <w:spacing w:after="80"/>
+      </w:pPr>
+      <w:r>
+        <w:rPr>
+          <w:color w:val="1D2D3E"/>
+          <w:sz w:val="22"/>
+          <w:szCs w:val="22"/>
+        </w:rPr>
+        <w:t xml:space="preserve"/>
+      </w:r>
+    </w:p>
+    <w:p>
+      <w:pPr>
         <w:pStyle w:val="Heading1"/>
         <w:spacing w:after="120" w:before="300"/>
       </w:pPr>
@@ -23939,6 +24425,310 @@
           </w:p>
         </w:tc>
       </w:tr>
+      <w:tr>
+        <w:tc>
+          <w:p>
+            <w:pPr>
+              <w:spacing w:after="40" w:before="40"/>
+            </w:pPr>
+            <w:r>
+              <w:rPr>
+                <w:b w:val="false"/>
+                <w:bCs w:val="false"/>
+                <w:color w:val="1D2D3E"/>
+                <w:sz w:val="20"/>
+                <w:szCs w:val="20"/>
+              </w:rPr>
+              <w:t xml:space="preserve">Session 41</w:t>
+            </w:r>
+          </w:p>
+        </w:tc>
+        <w:tc>
+          <w:p>
+            <w:pPr>
+              <w:spacing w:after="40" w:before="40"/>
+            </w:pPr>
+            <w:r>
+              <w:rPr>
+                <w:b w:val="false"/>
+                <w:bCs w:val="false"/>
+                <w:color w:val="1D2D3E"/>
+                <w:sz w:val="20"/>
+                <w:szCs w:val="20"/>
+              </w:rPr>
+              <w:t xml:space="preserve">Date range filter on AP bills/AR invoices — calendar chip, DateRangeBar below chips, dt-based pre-filter, exports respect range</w:t>
+            </w:r>
+          </w:p>
+        </w:tc>
+        <w:tc>
+          <w:p>
+            <w:pPr>
+              <w:spacing w:after="40" w:before="40"/>
+            </w:pPr>
+            <w:r>
+              <w:rPr>
+                <w:b w:val="false"/>
+                <w:bCs w:val="false"/>
+                <w:color w:val="1D2D3E"/>
+                <w:sz w:val="20"/>
+                <w:szCs w:val="20"/>
+              </w:rPr>
+              <w:t xml:space="preserve">Done</w:t>
+            </w:r>
+          </w:p>
+        </w:tc>
+        <w:tc>
+          <w:p>
+            <w:pPr>
+              <w:spacing w:after="40" w:before="40"/>
+            </w:pPr>
+            <w:r>
+              <w:rPr>
+                <w:b w:val="false"/>
+                <w:bCs w:val="false"/>
+                <w:color w:val="1D2D3E"/>
+                <w:sz w:val="20"/>
+                <w:szCs w:val="20"/>
+              </w:rPr>
+              <w:t xml:space="preserve">AccountsPayableScreen.tsx + AccountsReceivableScreen.tsx</w:t>
+            </w:r>
+          </w:p>
+        </w:tc>
+      </w:tr>
+      <w:tr>
+        <w:tc>
+          <w:tcPr>
+            <w:shd w:color="F0F4F8" w:val="solid"/>
+          </w:tcPr>
+          <w:p>
+            <w:pPr>
+              <w:spacing w:after="40" w:before="40"/>
+            </w:pPr>
+            <w:r>
+              <w:rPr>
+                <w:b w:val="false"/>
+                <w:bCs w:val="false"/>
+                <w:color w:val="1D2D3E"/>
+                <w:sz w:val="20"/>
+                <w:szCs w:val="20"/>
+              </w:rPr>
+              <w:t xml:space="preserve">Session 41</w:t>
+            </w:r>
+          </w:p>
+        </w:tc>
+        <w:tc>
+          <w:tcPr>
+            <w:shd w:color="F0F4F8" w:val="solid"/>
+          </w:tcPr>
+          <w:p>
+            <w:pPr>
+              <w:spacing w:after="40" w:before="40"/>
+            </w:pPr>
+            <w:r>
+              <w:rPr>
+                <w:b w:val="false"/>
+                <w:bCs w:val="false"/>
+                <w:color w:val="1D2D3E"/>
+                <w:sz w:val="20"/>
+                <w:szCs w:val="20"/>
+              </w:rPr>
+              <w:t xml:space="preserve">Compact company switcher in Dashboard top bar — CompanySelector variant='compact' pill replaces full-width row</w:t>
+            </w:r>
+          </w:p>
+        </w:tc>
+        <w:tc>
+          <w:tcPr>
+            <w:shd w:color="F0F4F8" w:val="solid"/>
+          </w:tcPr>
+          <w:p>
+            <w:pPr>
+              <w:spacing w:after="40" w:before="40"/>
+            </w:pPr>
+            <w:r>
+              <w:rPr>
+                <w:b w:val="false"/>
+                <w:bCs w:val="false"/>
+                <w:color w:val="1D2D3E"/>
+                <w:sz w:val="20"/>
+                <w:szCs w:val="20"/>
+              </w:rPr>
+              <w:t xml:space="preserve">Done</w:t>
+            </w:r>
+          </w:p>
+        </w:tc>
+        <w:tc>
+          <w:tcPr>
+            <w:shd w:color="F0F4F8" w:val="solid"/>
+          </w:tcPr>
+          <w:p>
+            <w:pPr>
+              <w:spacing w:after="40" w:before="40"/>
+            </w:pPr>
+            <w:r>
+              <w:rPr>
+                <w:b w:val="false"/>
+                <w:bCs w:val="false"/>
+                <w:color w:val="1D2D3E"/>
+                <w:sz w:val="20"/>
+                <w:szCs w:val="20"/>
+              </w:rPr>
+              <w:t xml:space="preserve">CompanySelector.tsx + DashboardScreen.tsx</w:t>
+            </w:r>
+          </w:p>
+        </w:tc>
+      </w:tr>
+      <w:tr>
+        <w:tc>
+          <w:p>
+            <w:pPr>
+              <w:spacing w:after="40" w:before="40"/>
+            </w:pPr>
+            <w:r>
+              <w:rPr>
+                <w:b w:val="false"/>
+                <w:bCs w:val="false"/>
+                <w:color w:val="1D2D3E"/>
+                <w:sz w:val="20"/>
+                <w:szCs w:val="20"/>
+              </w:rPr>
+              <w:t xml:space="preserve">Session 41</w:t>
+            </w:r>
+          </w:p>
+        </w:tc>
+        <w:tc>
+          <w:p>
+            <w:pPr>
+              <w:spacing w:after="40" w:before="40"/>
+            </w:pPr>
+            <w:r>
+              <w:rPr>
+                <w:b w:val="false"/>
+                <w:bCs w:val="false"/>
+                <w:color w:val="1D2D3E"/>
+                <w:sz w:val="20"/>
+                <w:szCs w:val="20"/>
+              </w:rPr>
+              <w:t xml:space="preserve">Partner notes search (note content in search) + 'Notes' filter chip + bulk CSV export</w:t>
+            </w:r>
+          </w:p>
+        </w:tc>
+        <w:tc>
+          <w:p>
+            <w:pPr>
+              <w:spacing w:after="40" w:before="40"/>
+            </w:pPr>
+            <w:r>
+              <w:rPr>
+                <w:b w:val="false"/>
+                <w:bCs w:val="false"/>
+                <w:color w:val="1D2D3E"/>
+                <w:sz w:val="20"/>
+                <w:szCs w:val="20"/>
+              </w:rPr>
+              <w:t xml:space="preserve">Done</w:t>
+            </w:r>
+          </w:p>
+        </w:tc>
+        <w:tc>
+          <w:p>
+            <w:pPr>
+              <w:spacing w:after="40" w:before="40"/>
+            </w:pPr>
+            <w:r>
+              <w:rPr>
+                <w:b w:val="false"/>
+                <w:bCs w:val="false"/>
+                <w:color w:val="1D2D3E"/>
+                <w:sz w:val="20"/>
+                <w:szCs w:val="20"/>
+              </w:rPr>
+              <w:t xml:space="preserve">PartnersScreen.tsx + csvExport.ts</w:t>
+            </w:r>
+          </w:p>
+        </w:tc>
+      </w:tr>
+      <w:tr>
+        <w:tc>
+          <w:tcPr>
+            <w:shd w:color="F0F4F8" w:val="solid"/>
+          </w:tcPr>
+          <w:p>
+            <w:pPr>
+              <w:spacing w:after="40" w:before="40"/>
+            </w:pPr>
+            <w:r>
+              <w:rPr>
+                <w:b w:val="false"/>
+                <w:bCs w:val="false"/>
+                <w:color w:val="1D2D3E"/>
+                <w:sz w:val="20"/>
+                <w:szCs w:val="20"/>
+              </w:rPr>
+              <w:t xml:space="preserve">Session 41</w:t>
+            </w:r>
+          </w:p>
+        </w:tc>
+        <w:tc>
+          <w:tcPr>
+            <w:shd w:color="F0F4F8" w:val="solid"/>
+          </w:tcPr>
+          <w:p>
+            <w:pPr>
+              <w:spacing w:after="40" w:before="40"/>
+            </w:pPr>
+            <w:r>
+              <w:rPr>
+                <w:b w:val="false"/>
+                <w:bCs w:val="false"/>
+                <w:color w:val="1D2D3E"/>
+                <w:sz w:val="20"/>
+                <w:szCs w:val="20"/>
+              </w:rPr>
+              <w:t xml:space="preserve">Stock ledger IN/OUT/NET summary bar — 3-tile bar above Movement Log, respects active filters</w:t>
+            </w:r>
+          </w:p>
+        </w:tc>
+        <w:tc>
+          <w:tcPr>
+            <w:shd w:color="F0F4F8" w:val="solid"/>
+          </w:tcPr>
+          <w:p>
+            <w:pPr>
+              <w:spacing w:after="40" w:before="40"/>
+            </w:pPr>
+            <w:r>
+              <w:rPr>
+                <w:b w:val="false"/>
+                <w:bCs w:val="false"/>
+                <w:color w:val="1D2D3E"/>
+                <w:sz w:val="20"/>
+                <w:szCs w:val="20"/>
+              </w:rPr>
+              <w:t xml:space="preserve">Done</w:t>
+            </w:r>
+          </w:p>
+        </w:tc>
+        <w:tc>
+          <w:tcPr>
+            <w:shd w:color="F0F4F8" w:val="solid"/>
+          </w:tcPr>
+          <w:p>
+            <w:pPr>
+              <w:spacing w:after="40" w:before="40"/>
+            </w:pPr>
+            <w:r>
+              <w:rPr>
+                <w:b w:val="false"/>
+                <w:bCs w:val="false"/>
+                <w:color w:val="1D2D3E"/>
+                <w:sz w:val="20"/>
+                <w:szCs w:val="20"/>
+              </w:rPr>
+              <w:t xml:space="preserve">InventoryScreen.tsx</w:t>
+            </w:r>
+          </w:p>
+        </w:tc>
+      </w:tr>
     </w:tbl>
     <w:p>
       <w:pPr>
@@ -29021,6 +29811,375 @@
           <w:szCs w:val="22"/>
         </w:rPr>
         <w:t xml:space="preserve">  Tapping a history row repopulates the query field</w:t>
+      </w:r>
+    </w:p>
+    <w:p>
+      <w:pPr>
+        <w:spacing w:after="80"/>
+      </w:pPr>
+      <w:r>
+        <w:rPr>
+          <w:color w:val="1D2D3E"/>
+          <w:sz w:val="22"/>
+          <w:szCs w:val="22"/>
+        </w:rPr>
+        <w:t xml:space="preserve"/>
+      </w:r>
+    </w:p>
+    <w:p>
+      <w:pPr>
+        <w:pStyle w:val="Heading2"/>
+        <w:spacing w:after="120" w:before="300"/>
+      </w:pPr>
+      <w:r>
+        <w:rPr>
+          <w:b/>
+          <w:bCs/>
+          <w:color w:val="1D2D3E"/>
+        </w:rPr>
+        <w:t xml:space="preserve">Session 41 — 2026-06-03</w:t>
+      </w:r>
+    </w:p>
+    <w:p>
+      <w:pPr>
+        <w:pStyle w:val="ListParagraph"/>
+        <w:numPr>
+          <w:ilvl w:val="0"/>
+          <w:numId w:val="1"/>
+        </w:numPr>
+        <w:spacing w:after="40"/>
+      </w:pPr>
+      <w:r>
+        <w:rPr>
+          <w:color w:val="1D2D3E"/>
+          <w:sz w:val="22"/>
+          <w:szCs w:val="22"/>
+        </w:rPr>
+        <w:t xml:space="preserve">Date range filter on AP bills / AR invoices tab (AccountsPayableScreen.tsx, AccountsReceivableScreen.tsx)</w:t>
+      </w:r>
+    </w:p>
+    <w:p>
+      <w:pPr>
+        <w:pStyle w:val="ListParagraph"/>
+        <w:numPr>
+          <w:ilvl w:val="1"/>
+          <w:numId w:val="1"/>
+        </w:numPr>
+        <w:spacing w:after="40"/>
+      </w:pPr>
+      <w:r>
+        <w:rPr>
+          <w:color w:val="1D2D3E"/>
+          <w:sz w:val="22"/>
+          <w:szCs w:val="22"/>
+        </w:rPr>
+        <w:t xml:space="preserve">  dateFilteredBills/dateFilteredInvoices pre-filter step using dt field before search + chip filters</w:t>
+      </w:r>
+    </w:p>
+    <w:p>
+      <w:pPr>
+        <w:pStyle w:val="ListParagraph"/>
+        <w:numPr>
+          <w:ilvl w:val="1"/>
+          <w:numId w:val="1"/>
+        </w:numPr>
+        <w:spacing w:after="40"/>
+      </w:pPr>
+      <w:r>
+        <w:rPr>
+          <w:color w:val="1D2D3E"/>
+          <w:sz w:val="22"/>
+          <w:szCs w:val="22"/>
+        </w:rPr>
+        <w:t xml:space="preserve">  Calendar icon chip: tap to show/hide DateRangeBar; displays MM-DD–MM-DD range inline when active</w:t>
+      </w:r>
+    </w:p>
+    <w:p>
+      <w:pPr>
+        <w:pStyle w:val="ListParagraph"/>
+        <w:numPr>
+          <w:ilvl w:val="1"/>
+          <w:numId w:val="1"/>
+        </w:numPr>
+        <w:spacing w:after="40"/>
+      </w:pPr>
+      <w:r>
+        <w:rPr>
+          <w:color w:val="1D2D3E"/>
+          <w:sz w:val="22"/>
+          <w:szCs w:val="22"/>
+        </w:rPr>
+        <w:t xml:space="preserve">  overdueCount/dueSoonCount now use dateFilteredBills/dateFilteredInvoices for accurate in-context counts</w:t>
+      </w:r>
+    </w:p>
+    <w:p>
+      <w:pPr>
+        <w:pStyle w:val="ListParagraph"/>
+        <w:numPr>
+          <w:ilvl w:val="1"/>
+          <w:numId w:val="1"/>
+        </w:numPr>
+        <w:spacing w:after="40"/>
+      </w:pPr>
+      <w:r>
+        <w:rPr>
+          <w:color w:val="1D2D3E"/>
+          <w:sz w:val="22"/>
+          <w:szCs w:val="22"/>
+        </w:rPr>
+        <w:t xml:space="preserve">  SectionHeader meta shows date range; all exports (CSV + flagged PDF) automatically respect the range</w:t>
+      </w:r>
+    </w:p>
+    <w:p>
+      <w:pPr>
+        <w:pStyle w:val="ListParagraph"/>
+        <w:numPr>
+          <w:ilvl w:val="0"/>
+          <w:numId w:val="1"/>
+        </w:numPr>
+        <w:spacing w:after="40"/>
+      </w:pPr>
+      <w:r>
+        <w:rPr>
+          <w:color w:val="1D2D3E"/>
+          <w:sz w:val="22"/>
+          <w:szCs w:val="22"/>
+        </w:rPr>
+        <w:t xml:space="preserve">Compact company switcher in Dashboard top bar (CompanySelector.tsx, DashboardScreen.tsx)</w:t>
+      </w:r>
+    </w:p>
+    <w:p>
+      <w:pPr>
+        <w:pStyle w:val="ListParagraph"/>
+        <w:numPr>
+          <w:ilvl w:val="1"/>
+          <w:numId w:val="1"/>
+        </w:numPr>
+        <w:spacing w:after="40"/>
+      </w:pPr>
+      <w:r>
+        <w:rPr>
+          <w:color w:val="1D2D3E"/>
+          <w:sz w:val="22"/>
+          <w:szCs w:val="22"/>
+        </w:rPr>
+        <w:t xml:space="preserve">  CompanySelector gains variant='compact' prop: small inline pill with briefcase icon + name + chevron</w:t>
+      </w:r>
+    </w:p>
+    <w:p>
+      <w:pPr>
+        <w:pStyle w:val="ListParagraph"/>
+        <w:numPr>
+          <w:ilvl w:val="1"/>
+          <w:numId w:val="1"/>
+        </w:numPr>
+        <w:spacing w:after="40"/>
+      </w:pPr>
+      <w:r>
+        <w:rPr>
+          <w:color w:val="1D2D3E"/>
+          <w:sz w:val="22"/>
+          <w:szCs w:val="22"/>
+        </w:rPr>
+        <w:t xml:space="preserve">  DashboardScreen: full-width row replaced by compact variant inside topBarLeft (below sub-greeting)</w:t>
+      </w:r>
+    </w:p>
+    <w:p>
+      <w:pPr>
+        <w:pStyle w:val="ListParagraph"/>
+        <w:numPr>
+          <w:ilvl w:val="1"/>
+          <w:numId w:val="1"/>
+        </w:numPr>
+        <w:spacing w:after="40"/>
+      </w:pPr>
+      <w:r>
+        <w:rPr>
+          <w:color w:val="1D2D3E"/>
+          <w:sz w:val="22"/>
+          <w:szCs w:val="22"/>
+        </w:rPr>
+        <w:t xml:space="preserve">  Same picker modal; change propagates globally via CompanyContext as before</w:t>
+      </w:r>
+    </w:p>
+    <w:p>
+      <w:pPr>
+        <w:pStyle w:val="ListParagraph"/>
+        <w:numPr>
+          <w:ilvl w:val="0"/>
+          <w:numId w:val="1"/>
+        </w:numPr>
+        <w:spacing w:after="40"/>
+      </w:pPr>
+      <w:r>
+        <w:rPr>
+          <w:color w:val="1D2D3E"/>
+          <w:sz w:val="22"/>
+          <w:szCs w:val="22"/>
+        </w:rPr>
+        <w:t xml:space="preserve">Partner notes search and filter (PartnersScreen.tsx)</w:t>
+      </w:r>
+    </w:p>
+    <w:p>
+      <w:pPr>
+        <w:pStyle w:val="ListParagraph"/>
+        <w:numPr>
+          <w:ilvl w:val="1"/>
+          <w:numId w:val="1"/>
+        </w:numPr>
+        <w:spacing w:after="40"/>
+      </w:pPr>
+      <w:r>
+        <w:rPr>
+          <w:color w:val="1D2D3E"/>
+          <w:sz w:val="22"/>
+          <w:szCs w:val="22"/>
+        </w:rPr>
+        <w:t xml:space="preserve">  showNotesOnly state + 'Notes (N)' filter chip — only visible when notes exist; filters to note-holders</w:t>
+      </w:r>
+    </w:p>
+    <w:p>
+      <w:pPr>
+        <w:pStyle w:val="ListParagraph"/>
+        <w:numPr>
+          <w:ilvl w:val="1"/>
+          <w:numId w:val="1"/>
+        </w:numPr>
+        <w:spacing w:after="40"/>
+      </w:pPr>
+      <w:r>
+        <w:rPr>
+          <w:color w:val="1D2D3E"/>
+          <w:sz w:val="22"/>
+          <w:szCs w:val="22"/>
+        </w:rPr>
+        <w:t xml:space="preserve">  Search now matches note content (in addition to name/code/email)</w:t>
+      </w:r>
+    </w:p>
+    <w:p>
+      <w:pPr>
+        <w:pStyle w:val="ListParagraph"/>
+        <w:numPr>
+          <w:ilvl w:val="1"/>
+          <w:numId w:val="1"/>
+        </w:numPr>
+        <w:spacing w:after="40"/>
+      </w:pPr>
+      <w:r>
+        <w:rPr>
+          <w:color w:val="1D2D3E"/>
+          <w:sz w:val="22"/>
+          <w:szCs w:val="22"/>
+        </w:rPr>
+        <w:t xml:space="preserve">  Search placeholder updated; SectionHeader meta and empty state cover notes filter</w:t>
+      </w:r>
+    </w:p>
+    <w:p>
+      <w:pPr>
+        <w:pStyle w:val="ListParagraph"/>
+        <w:numPr>
+          <w:ilvl w:val="0"/>
+          <w:numId w:val="1"/>
+        </w:numPr>
+        <w:spacing w:after="40"/>
+      </w:pPr>
+      <w:r>
+        <w:rPr>
+          <w:color w:val="1D2D3E"/>
+          <w:sz w:val="22"/>
+          <w:szCs w:val="22"/>
+        </w:rPr>
+        <w:t xml:space="preserve">Partner notes bulk CSV export (csvExport.ts, PartnersScreen.tsx)</w:t>
+      </w:r>
+    </w:p>
+    <w:p>
+      <w:pPr>
+        <w:pStyle w:val="ListParagraph"/>
+        <w:numPr>
+          <w:ilvl w:val="1"/>
+          <w:numId w:val="1"/>
+        </w:numPr>
+        <w:spacing w:after="40"/>
+      </w:pPr>
+      <w:r>
+        <w:rPr>
+          <w:color w:val="1D2D3E"/>
+          <w:sz w:val="22"/>
+          <w:szCs w:val="22"/>
+        </w:rPr>
+        <w:t xml:space="preserve">  exportPartnerNotesCSV(): Company / date header + Name / Code / Role / Note columns</w:t>
+      </w:r>
+    </w:p>
+    <w:p>
+      <w:pPr>
+        <w:pStyle w:val="ListParagraph"/>
+        <w:numPr>
+          <w:ilvl w:val="1"/>
+          <w:numId w:val="1"/>
+        </w:numPr>
+        <w:spacing w:after="40"/>
+      </w:pPr>
+      <w:r>
+        <w:rPr>
+          <w:color w:val="1D2D3E"/>
+          <w:sz w:val="22"/>
+          <w:szCs w:val="22"/>
+        </w:rPr>
+        <w:t xml:space="preserve">  'Notes' pill button in PartnersScreen header; visible when notes exist; ActivityIndicator during export</w:t>
+      </w:r>
+    </w:p>
+    <w:p>
+      <w:pPr>
+        <w:pStyle w:val="ListParagraph"/>
+        <w:numPr>
+          <w:ilvl w:val="0"/>
+          <w:numId w:val="1"/>
+        </w:numPr>
+        <w:spacing w:after="40"/>
+      </w:pPr>
+      <w:r>
+        <w:rPr>
+          <w:color w:val="1D2D3E"/>
+          <w:sz w:val="22"/>
+          <w:szCs w:val="22"/>
+        </w:rPr>
+        <w:t xml:space="preserve">Stock ledger IN/OUT/NET summary bar (InventoryScreen.tsx)</w:t>
+      </w:r>
+    </w:p>
+    <w:p>
+      <w:pPr>
+        <w:pStyle w:val="ListParagraph"/>
+        <w:numPr>
+          <w:ilvl w:val="1"/>
+          <w:numId w:val="1"/>
+        </w:numPr>
+        <w:spacing w:after="40"/>
+      </w:pPr>
+      <w:r>
+        <w:rPr>
+          <w:color w:val="1D2D3E"/>
+          <w:sz w:val="22"/>
+          <w:szCs w:val="22"/>
+        </w:rPr>
+        <w:t xml:space="preserve">  ledgerSummary computed from filteredLedger: totalIn + totalOut + net</w:t>
+      </w:r>
+    </w:p>
+    <w:p>
+      <w:pPr>
+        <w:pStyle w:val="ListParagraph"/>
+        <w:numPr>
+          <w:ilvl w:val="1"/>
+          <w:numId w:val="1"/>
+        </w:numPr>
+        <w:spacing w:after="40"/>
+      </w:pPr>
+      <w:r>
+        <w:rPr>
+          <w:color w:val="1D2D3E"/>
+          <w:sz w:val="22"/>
+          <w:szCs w:val="22"/>
+        </w:rPr>
+        <w:t xml:space="preserve">  3-tile bar above Movement Log SectionHeader; NET muted when negative; respects search + date range</w:t>
       </w:r>
     </w:p>
     <w:p>

</xml_diff>

<commit_message>
docs(session-42): update PROGRESS.md, generate-docs.js, and FEATURES.docx with Session 42 changelog
- PROGRESS.md: Session 42 section added with 4 feature entries + next-session suggestions
- generate-docs.js: sections 3.58–3.61 added for Session 42 features; roadmap table gains 5 new rows; Session 42 changelog entry prepended
- FEATURES.docx: regenerated with all Session 42 changes
</commit_message>
<xml_diff>
--- a/FEATURES.docx
+++ b/FEATURES.docx
@@ -45,7 +45,7 @@
           <w:sz w:val="20"/>
           <w:szCs w:val="20"/>
         </w:rPr>
-        <w:t xml:space="preserve">Generated: 2026-06-03</w:t>
+        <w:t xml:space="preserve">Generated: 2026-06-04</w:t>
       </w:r>
     </w:p>
     <w:p>
@@ -11667,6 +11667,384 @@
     </w:p>
     <w:p>
       <w:pPr>
+        <w:pStyle w:val="Heading2"/>
+        <w:spacing w:after="120" w:before="300"/>
+      </w:pPr>
+      <w:r>
+        <w:rPr>
+          <w:b/>
+          <w:bCs/>
+          <w:color w:val="1D2D3E"/>
+        </w:rPr>
+        <w:t xml:space="preserve">3.58 Procurement Analytics Date Range Filter (Session 42)</w:t>
+      </w:r>
+    </w:p>
+    <w:p>
+      <w:pPr>
+        <w:pStyle w:val="ListParagraph"/>
+        <w:numPr>
+          <w:ilvl w:val="0"/>
+          <w:numId w:val="1"/>
+        </w:numPr>
+        <w:spacing w:after="40"/>
+      </w:pPr>
+      <w:r>
+        <w:rPr>
+          <w:color w:val="1D2D3E"/>
+          <w:sz w:val="22"/>
+          <w:szCs w:val="22"/>
+        </w:rPr>
+        <w:t xml:space="preserve">ProcurementAnalyticsScreen: raw PO/SO data stored in rawData state; analytics derived via useMemo with date filter</w:t>
+      </w:r>
+    </w:p>
+    <w:p>
+      <w:pPr>
+        <w:pStyle w:val="ListParagraph"/>
+        <w:numPr>
+          <w:ilvl w:val="1"/>
+          <w:numId w:val="1"/>
+        </w:numPr>
+        <w:spacing w:after="40"/>
+      </w:pPr>
+      <w:r>
+        <w:rPr>
+          <w:color w:val="1D2D3E"/>
+          <w:sz w:val="22"/>
+          <w:szCs w:val="22"/>
+        </w:rPr>
+        <w:t xml:space="preserve">  Calendar icon button in header: tap to show/hide DateRangeBar; active range shown as MM-DD–MM-DD badge</w:t>
+      </w:r>
+    </w:p>
+    <w:p>
+      <w:pPr>
+        <w:pStyle w:val="ListParagraph"/>
+        <w:numPr>
+          <w:ilvl w:val="1"/>
+          <w:numId w:val="1"/>
+        </w:numPr>
+        <w:spacing w:after="40"/>
+      </w:pPr>
+      <w:r>
+        <w:rPr>
+          <w:color w:val="1D2D3E"/>
+          <w:sz w:val="22"/>
+          <w:szCs w:val="22"/>
+        </w:rPr>
+        <w:t xml:space="preserve">  getMonthsInRange() generates month buckets for any custom range (capped at 12 months)</w:t>
+      </w:r>
+    </w:p>
+    <w:p>
+      <w:pPr>
+        <w:pStyle w:val="ListParagraph"/>
+        <w:numPr>
+          <w:ilvl w:val="1"/>
+          <w:numId w:val="1"/>
+        </w:numPr>
+        <w:spacing w:after="40"/>
+      </w:pPr>
+      <w:r>
+        <w:rPr>
+          <w:color w:val="1D2D3E"/>
+          <w:sz w:val="22"/>
+          <w:szCs w:val="22"/>
+        </w:rPr>
+        <w:t xml:space="preserve">  All KPIs, ranked vendor/customer lists, status grids reflect the active date filter</w:t>
+      </w:r>
+    </w:p>
+    <w:p>
+      <w:pPr>
+        <w:pStyle w:val="ListParagraph"/>
+        <w:numPr>
+          <w:ilvl w:val="1"/>
+          <w:numId w:val="1"/>
+        </w:numPr>
+        <w:spacing w:after="40"/>
+      </w:pPr>
+      <w:r>
+        <w:rPr>
+          <w:color w:val="1D2D3E"/>
+          <w:sz w:val="22"/>
+          <w:szCs w:val="22"/>
+        </w:rPr>
+        <w:t xml:space="preserve">  Monthly Trend subtitle updates to show from–to range when active</w:t>
+      </w:r>
+    </w:p>
+    <w:p>
+      <w:pPr>
+        <w:pStyle w:val="ListParagraph"/>
+        <w:numPr>
+          <w:ilvl w:val="0"/>
+          <w:numId w:val="1"/>
+        </w:numPr>
+        <w:spacing w:after="40"/>
+      </w:pPr>
+      <w:r>
+        <w:rPr>
+          <w:color w:val="1D2D3E"/>
+          <w:sz w:val="22"/>
+          <w:szCs w:val="22"/>
+        </w:rPr>
+        <w:t xml:space="preserve">SectionHeader gains subtitle?: string prop (renders as second line below title)</w:t>
+      </w:r>
+    </w:p>
+    <w:p>
+      <w:pPr>
+        <w:spacing w:after="80"/>
+      </w:pPr>
+      <w:r>
+        <w:rPr>
+          <w:color w:val="1D2D3E"/>
+          <w:sz w:val="22"/>
+          <w:szCs w:val="22"/>
+        </w:rPr>
+        <w:t xml:space="preserve"/>
+      </w:r>
+    </w:p>
+    <w:p>
+      <w:pPr>
+        <w:pStyle w:val="Heading2"/>
+        <w:spacing w:after="120" w:before="300"/>
+      </w:pPr>
+      <w:r>
+        <w:rPr>
+          <w:b/>
+          <w:bCs/>
+          <w:color w:val="1D2D3E"/>
+        </w:rPr>
+        <w:t xml:space="preserve">3.59 Dashboard Top Vendors by Outstanding AP Balance (Session 42)</w:t>
+      </w:r>
+    </w:p>
+    <w:p>
+      <w:pPr>
+        <w:pStyle w:val="ListParagraph"/>
+        <w:numPr>
+          <w:ilvl w:val="0"/>
+          <w:numId w:val="1"/>
+        </w:numPr>
+        <w:spacing w:after="40"/>
+      </w:pPr>
+      <w:r>
+        <w:rPr>
+          <w:color w:val="1D2D3E"/>
+          <w:sz w:val="22"/>
+          <w:szCs w:val="22"/>
+        </w:rPr>
+        <w:t xml:space="preserve">topVendors state computed in useFocusEffect from all unpaid AP bills (already cached — zero extra API calls)</w:t>
+      </w:r>
+    </w:p>
+    <w:p>
+      <w:pPr>
+        <w:pStyle w:val="ListParagraph"/>
+        <w:numPr>
+          <w:ilvl w:val="1"/>
+          <w:numId w:val="1"/>
+        </w:numPr>
+        <w:spacing w:after="40"/>
+      </w:pPr>
+      <w:r>
+        <w:rPr>
+          <w:color w:val="1D2D3E"/>
+          <w:sz w:val="22"/>
+          <w:szCs w:val="22"/>
+        </w:rPr>
+        <w:t xml:space="preserve">  Aggregates outstanding by vendor name, filters zero-balance, top 3 by outstanding</w:t>
+      </w:r>
+    </w:p>
+    <w:p>
+      <w:pPr>
+        <w:pStyle w:val="ListParagraph"/>
+        <w:numPr>
+          <w:ilvl w:val="1"/>
+          <w:numId w:val="1"/>
+        </w:numPr>
+        <w:spacing w:after="40"/>
+      </w:pPr>
+      <w:r>
+        <w:rPr>
+          <w:color w:val="1D2D3E"/>
+          <w:sz w:val="22"/>
+          <w:szCs w:val="22"/>
+        </w:rPr>
+        <w:t xml:space="preserve">  Card with rank badge, vendor name, blue progress bar, outstanding amount + bill count</w:t>
+      </w:r>
+    </w:p>
+    <w:p>
+      <w:pPr>
+        <w:pStyle w:val="ListParagraph"/>
+        <w:numPr>
+          <w:ilvl w:val="1"/>
+          <w:numId w:val="1"/>
+        </w:numPr>
+        <w:spacing w:after="40"/>
+      </w:pPr>
+      <w:r>
+        <w:rPr>
+          <w:color w:val="1D2D3E"/>
+          <w:sz w:val="22"/>
+          <w:szCs w:val="22"/>
+        </w:rPr>
+        <w:t xml:space="preserve">  Placed after Finance Status section, before Upcoming Payments; only renders when topVendors.length &gt; 0</w:t>
+      </w:r>
+    </w:p>
+    <w:p>
+      <w:pPr>
+        <w:spacing w:after="80"/>
+      </w:pPr>
+      <w:r>
+        <w:rPr>
+          <w:color w:val="1D2D3E"/>
+          <w:sz w:val="22"/>
+          <w:szCs w:val="22"/>
+        </w:rPr>
+        <w:t xml:space="preserve"/>
+      </w:r>
+    </w:p>
+    <w:p>
+      <w:pPr>
+        <w:pStyle w:val="Heading2"/>
+        <w:spacing w:after="120" w:before="300"/>
+      </w:pPr>
+      <w:r>
+        <w:rPr>
+          <w:b/>
+          <w:bCs/>
+          <w:color w:val="1D2D3E"/>
+        </w:rPr>
+        <w:t xml:space="preserve">3.60 Out-of-Stock Standalone PDF Reorder Export (Session 42)</w:t>
+      </w:r>
+    </w:p>
+    <w:p>
+      <w:pPr>
+        <w:pStyle w:val="ListParagraph"/>
+        <w:numPr>
+          <w:ilvl w:val="0"/>
+          <w:numId w:val="1"/>
+        </w:numPr>
+        <w:spacing w:after="40"/>
+      </w:pPr>
+      <w:r>
+        <w:rPr>
+          <w:color w:val="1D2D3E"/>
+          <w:sz w:val="22"/>
+          <w:szCs w:val="22"/>
+        </w:rPr>
+        <w:t xml:space="preserve">exportOutOfStockPDF() in pdfExport.ts: 3-tile summary, full table (Item Name / Warehouse / Unit / Status in red), footer count</w:t>
+      </w:r>
+    </w:p>
+    <w:p>
+      <w:pPr>
+        <w:pStyle w:val="ListParagraph"/>
+        <w:numPr>
+          <w:ilvl w:val="0"/>
+          <w:numId w:val="1"/>
+        </w:numPr>
+        <w:spacing w:after="40"/>
+      </w:pPr>
+      <w:r>
+        <w:rPr>
+          <w:color w:val="1D2D3E"/>
+          <w:sz w:val="22"/>
+          <w:szCs w:val="22"/>
+        </w:rPr>
+        <w:t xml:space="preserve">StockHealthScreen: file-text icon in Out of Stock SectionHeader action slot; exportingOOS state + handleExportOOS callback</w:t>
+      </w:r>
+    </w:p>
+    <w:p>
+      <w:pPr>
+        <w:spacing w:after="80"/>
+      </w:pPr>
+      <w:r>
+        <w:rPr>
+          <w:color w:val="1D2D3E"/>
+          <w:sz w:val="22"/>
+          <w:szCs w:val="22"/>
+        </w:rPr>
+        <w:t xml:space="preserve"/>
+      </w:r>
+    </w:p>
+    <w:p>
+      <w:pPr>
+        <w:pStyle w:val="Heading2"/>
+        <w:spacing w:after="120" w:before="300"/>
+      </w:pPr>
+      <w:r>
+        <w:rPr>
+          <w:b/>
+          <w:bCs/>
+          <w:color w:val="1D2D3E"/>
+        </w:rPr>
+        <w:t xml:space="preserve">3.61 AP/AR Combined Flagged Items PDF Export (Session 42)</w:t>
+      </w:r>
+    </w:p>
+    <w:p>
+      <w:pPr>
+        <w:pStyle w:val="ListParagraph"/>
+        <w:numPr>
+          <w:ilvl w:val="0"/>
+          <w:numId w:val="1"/>
+        </w:numPr>
+        <w:spacing w:after="40"/>
+      </w:pPr>
+      <w:r>
+        <w:rPr>
+          <w:color w:val="1D2D3E"/>
+          <w:sz w:val="22"/>
+          <w:szCs w:val="22"/>
+        </w:rPr>
+        <w:t xml:space="preserve">exportFlaggedCombinedPDF() in pdfExport.ts: 4-tile summary, AP bills section + AR invoices section, overdue rows bold</w:t>
+      </w:r>
+    </w:p>
+    <w:p>
+      <w:pPr>
+        <w:pStyle w:val="ListParagraph"/>
+        <w:numPr>
+          <w:ilvl w:val="0"/>
+          <w:numId w:val="1"/>
+        </w:numPr>
+        <w:spacing w:after="40"/>
+      </w:pPr>
+      <w:r>
+        <w:rPr>
+          <w:color w:val="1D2D3E"/>
+          <w:sz w:val="22"/>
+          <w:szCs w:val="22"/>
+        </w:rPr>
+        <w:t xml:space="preserve">DashboardScreen: file-text icon in Pending Actions SectionHeader action; resolves flagged IDs + bill/invoice objects from cache</w:t>
+      </w:r>
+    </w:p>
+    <w:p>
+      <w:pPr>
+        <w:pStyle w:val="ListParagraph"/>
+        <w:numPr>
+          <w:ilvl w:val="1"/>
+          <w:numId w:val="1"/>
+        </w:numPr>
+        <w:spacing w:after="40"/>
+      </w:pPr>
+      <w:r>
+        <w:rPr>
+          <w:color w:val="1D2D3E"/>
+          <w:sz w:val="22"/>
+          <w:szCs w:val="22"/>
+        </w:rPr>
+        <w:t xml:space="preserve">  Only shown when both flaggedBillCount &gt; 0 AND flaggedInvoiceCount &gt; 0</w:t>
+      </w:r>
+    </w:p>
+    <w:p>
+      <w:pPr>
+        <w:spacing w:after="80"/>
+      </w:pPr>
+      <w:r>
+        <w:rPr>
+          <w:color w:val="1D2D3E"/>
+          <w:sz w:val="22"/>
+          <w:szCs w:val="22"/>
+        </w:rPr>
+        <w:t xml:space="preserve"/>
+      </w:r>
+    </w:p>
+    <w:p>
+      <w:pPr>
         <w:pStyle w:val="Heading1"/>
         <w:spacing w:after="120" w:before="300"/>
       </w:pPr>
@@ -24729,6 +25107,380 @@
           </w:p>
         </w:tc>
       </w:tr>
+      <w:tr>
+        <w:tc>
+          <w:p>
+            <w:pPr>
+              <w:spacing w:after="40" w:before="40"/>
+            </w:pPr>
+            <w:r>
+              <w:rPr>
+                <w:b w:val="false"/>
+                <w:bCs w:val="false"/>
+                <w:color w:val="1D2D3E"/>
+                <w:sz w:val="20"/>
+                <w:szCs w:val="20"/>
+              </w:rPr>
+              <w:t xml:space="preserve">Session 42</w:t>
+            </w:r>
+          </w:p>
+        </w:tc>
+        <w:tc>
+          <w:p>
+            <w:pPr>
+              <w:spacing w:after="40" w:before="40"/>
+            </w:pPr>
+            <w:r>
+              <w:rPr>
+                <w:b w:val="false"/>
+                <w:bCs w:val="false"/>
+                <w:color w:val="1D2D3E"/>
+                <w:sz w:val="20"/>
+                <w:szCs w:val="20"/>
+              </w:rPr>
+              <w:t xml:space="preserve">Procurement Analytics date range filter — rawData state + useMemo, custom month buckets, all sections respect filter</w:t>
+            </w:r>
+          </w:p>
+        </w:tc>
+        <w:tc>
+          <w:p>
+            <w:pPr>
+              <w:spacing w:after="40" w:before="40"/>
+            </w:pPr>
+            <w:r>
+              <w:rPr>
+                <w:b w:val="false"/>
+                <w:bCs w:val="false"/>
+                <w:color w:val="1D2D3E"/>
+                <w:sz w:val="20"/>
+                <w:szCs w:val="20"/>
+              </w:rPr>
+              <w:t xml:space="preserve">Done</w:t>
+            </w:r>
+          </w:p>
+        </w:tc>
+        <w:tc>
+          <w:p>
+            <w:pPr>
+              <w:spacing w:after="40" w:before="40"/>
+            </w:pPr>
+            <w:r>
+              <w:rPr>
+                <w:b w:val="false"/>
+                <w:bCs w:val="false"/>
+                <w:color w:val="1D2D3E"/>
+                <w:sz w:val="20"/>
+                <w:szCs w:val="20"/>
+              </w:rPr>
+              <w:t xml:space="preserve">ProcurementAnalyticsScreen.tsx</w:t>
+            </w:r>
+          </w:p>
+        </w:tc>
+      </w:tr>
+      <w:tr>
+        <w:tc>
+          <w:tcPr>
+            <w:shd w:color="F0F4F8" w:val="solid"/>
+          </w:tcPr>
+          <w:p>
+            <w:pPr>
+              <w:spacing w:after="40" w:before="40"/>
+            </w:pPr>
+            <w:r>
+              <w:rPr>
+                <w:b w:val="false"/>
+                <w:bCs w:val="false"/>
+                <w:color w:val="1D2D3E"/>
+                <w:sz w:val="20"/>
+                <w:szCs w:val="20"/>
+              </w:rPr>
+              <w:t xml:space="preserve">Session 42</w:t>
+            </w:r>
+          </w:p>
+        </w:tc>
+        <w:tc>
+          <w:tcPr>
+            <w:shd w:color="F0F4F8" w:val="solid"/>
+          </w:tcPr>
+          <w:p>
+            <w:pPr>
+              <w:spacing w:after="40" w:before="40"/>
+            </w:pPr>
+            <w:r>
+              <w:rPr>
+                <w:b w:val="false"/>
+                <w:bCs w:val="false"/>
+                <w:color w:val="1D2D3E"/>
+                <w:sz w:val="20"/>
+                <w:szCs w:val="20"/>
+              </w:rPr>
+              <w:t xml:space="preserve">SectionHeader subtitle prop — second line below title, fixes silent prop usage in analytics screens</w:t>
+            </w:r>
+          </w:p>
+        </w:tc>
+        <w:tc>
+          <w:tcPr>
+            <w:shd w:color="F0F4F8" w:val="solid"/>
+          </w:tcPr>
+          <w:p>
+            <w:pPr>
+              <w:spacing w:after="40" w:before="40"/>
+            </w:pPr>
+            <w:r>
+              <w:rPr>
+                <w:b w:val="false"/>
+                <w:bCs w:val="false"/>
+                <w:color w:val="1D2D3E"/>
+                <w:sz w:val="20"/>
+                <w:szCs w:val="20"/>
+              </w:rPr>
+              <w:t xml:space="preserve">Done</w:t>
+            </w:r>
+          </w:p>
+        </w:tc>
+        <w:tc>
+          <w:tcPr>
+            <w:shd w:color="F0F4F8" w:val="solid"/>
+          </w:tcPr>
+          <w:p>
+            <w:pPr>
+              <w:spacing w:after="40" w:before="40"/>
+            </w:pPr>
+            <w:r>
+              <w:rPr>
+                <w:b w:val="false"/>
+                <w:bCs w:val="false"/>
+                <w:color w:val="1D2D3E"/>
+                <w:sz w:val="20"/>
+                <w:szCs w:val="20"/>
+              </w:rPr>
+              <w:t xml:space="preserve">SectionHeader.tsx</w:t>
+            </w:r>
+          </w:p>
+        </w:tc>
+      </w:tr>
+      <w:tr>
+        <w:tc>
+          <w:p>
+            <w:pPr>
+              <w:spacing w:after="40" w:before="40"/>
+            </w:pPr>
+            <w:r>
+              <w:rPr>
+                <w:b w:val="false"/>
+                <w:bCs w:val="false"/>
+                <w:color w:val="1D2D3E"/>
+                <w:sz w:val="20"/>
+                <w:szCs w:val="20"/>
+              </w:rPr>
+              <w:t xml:space="preserve">Session 42</w:t>
+            </w:r>
+          </w:p>
+        </w:tc>
+        <w:tc>
+          <w:p>
+            <w:pPr>
+              <w:spacing w:after="40" w:before="40"/>
+            </w:pPr>
+            <w:r>
+              <w:rPr>
+                <w:b w:val="false"/>
+                <w:bCs w:val="false"/>
+                <w:color w:val="1D2D3E"/>
+                <w:sz w:val="20"/>
+                <w:szCs w:val="20"/>
+              </w:rPr>
+              <w:t xml:space="preserve">Dashboard Top Vendors card — top 3 vendors by AP outstanding, rank badge + progress bar, zero extra API calls</w:t>
+            </w:r>
+          </w:p>
+        </w:tc>
+        <w:tc>
+          <w:p>
+            <w:pPr>
+              <w:spacing w:after="40" w:before="40"/>
+            </w:pPr>
+            <w:r>
+              <w:rPr>
+                <w:b w:val="false"/>
+                <w:bCs w:val="false"/>
+                <w:color w:val="1D2D3E"/>
+                <w:sz w:val="20"/>
+                <w:szCs w:val="20"/>
+              </w:rPr>
+              <w:t xml:space="preserve">Done</w:t>
+            </w:r>
+          </w:p>
+        </w:tc>
+        <w:tc>
+          <w:p>
+            <w:pPr>
+              <w:spacing w:after="40" w:before="40"/>
+            </w:pPr>
+            <w:r>
+              <w:rPr>
+                <w:b w:val="false"/>
+                <w:bCs w:val="false"/>
+                <w:color w:val="1D2D3E"/>
+                <w:sz w:val="20"/>
+                <w:szCs w:val="20"/>
+              </w:rPr>
+              <w:t xml:space="preserve">DashboardScreen.tsx</w:t>
+            </w:r>
+          </w:p>
+        </w:tc>
+      </w:tr>
+      <w:tr>
+        <w:tc>
+          <w:tcPr>
+            <w:shd w:color="F0F4F8" w:val="solid"/>
+          </w:tcPr>
+          <w:p>
+            <w:pPr>
+              <w:spacing w:after="40" w:before="40"/>
+            </w:pPr>
+            <w:r>
+              <w:rPr>
+                <w:b w:val="false"/>
+                <w:bCs w:val="false"/>
+                <w:color w:val="1D2D3E"/>
+                <w:sz w:val="20"/>
+                <w:szCs w:val="20"/>
+              </w:rPr>
+              <w:t xml:space="preserve">Session 42</w:t>
+            </w:r>
+          </w:p>
+        </w:tc>
+        <w:tc>
+          <w:tcPr>
+            <w:shd w:color="F0F4F8" w:val="solid"/>
+          </w:tcPr>
+          <w:p>
+            <w:pPr>
+              <w:spacing w:after="40" w:before="40"/>
+            </w:pPr>
+            <w:r>
+              <w:rPr>
+                <w:b w:val="false"/>
+                <w:bCs w:val="false"/>
+                <w:color w:val="1D2D3E"/>
+                <w:sz w:val="20"/>
+                <w:szCs w:val="20"/>
+              </w:rPr>
+              <w:t xml:space="preserve">Out-of-stock standalone reorder PDF — 3-tile summary + full table, export button in section header</w:t>
+            </w:r>
+          </w:p>
+        </w:tc>
+        <w:tc>
+          <w:tcPr>
+            <w:shd w:color="F0F4F8" w:val="solid"/>
+          </w:tcPr>
+          <w:p>
+            <w:pPr>
+              <w:spacing w:after="40" w:before="40"/>
+            </w:pPr>
+            <w:r>
+              <w:rPr>
+                <w:b w:val="false"/>
+                <w:bCs w:val="false"/>
+                <w:color w:val="1D2D3E"/>
+                <w:sz w:val="20"/>
+                <w:szCs w:val="20"/>
+              </w:rPr>
+              <w:t xml:space="preserve">Done</w:t>
+            </w:r>
+          </w:p>
+        </w:tc>
+        <w:tc>
+          <w:tcPr>
+            <w:shd w:color="F0F4F8" w:val="solid"/>
+          </w:tcPr>
+          <w:p>
+            <w:pPr>
+              <w:spacing w:after="40" w:before="40"/>
+            </w:pPr>
+            <w:r>
+              <w:rPr>
+                <w:b w:val="false"/>
+                <w:bCs w:val="false"/>
+                <w:color w:val="1D2D3E"/>
+                <w:sz w:val="20"/>
+                <w:szCs w:val="20"/>
+              </w:rPr>
+              <w:t xml:space="preserve">StockHealthScreen.tsx + pdfExport.ts</w:t>
+            </w:r>
+          </w:p>
+        </w:tc>
+      </w:tr>
+      <w:tr>
+        <w:tc>
+          <w:p>
+            <w:pPr>
+              <w:spacing w:after="40" w:before="40"/>
+            </w:pPr>
+            <w:r>
+              <w:rPr>
+                <w:b w:val="false"/>
+                <w:bCs w:val="false"/>
+                <w:color w:val="1D2D3E"/>
+                <w:sz w:val="20"/>
+                <w:szCs w:val="20"/>
+              </w:rPr>
+              <w:t xml:space="preserve">Session 42</w:t>
+            </w:r>
+          </w:p>
+        </w:tc>
+        <w:tc>
+          <w:p>
+            <w:pPr>
+              <w:spacing w:after="40" w:before="40"/>
+            </w:pPr>
+            <w:r>
+              <w:rPr>
+                <w:b w:val="false"/>
+                <w:bCs w:val="false"/>
+                <w:color w:val="1D2D3E"/>
+                <w:sz w:val="20"/>
+                <w:szCs w:val="20"/>
+              </w:rPr>
+              <w:t xml:space="preserve">AP/AR combined flagged PDF — 4-tile summary, both tables in one PDF, button in Pending Actions when both have flags</w:t>
+            </w:r>
+          </w:p>
+        </w:tc>
+        <w:tc>
+          <w:p>
+            <w:pPr>
+              <w:spacing w:after="40" w:before="40"/>
+            </w:pPr>
+            <w:r>
+              <w:rPr>
+                <w:b w:val="false"/>
+                <w:bCs w:val="false"/>
+                <w:color w:val="1D2D3E"/>
+                <w:sz w:val="20"/>
+                <w:szCs w:val="20"/>
+              </w:rPr>
+              <w:t xml:space="preserve">Done</w:t>
+            </w:r>
+          </w:p>
+        </w:tc>
+        <w:tc>
+          <w:p>
+            <w:pPr>
+              <w:spacing w:after="40" w:before="40"/>
+            </w:pPr>
+            <w:r>
+              <w:rPr>
+                <w:b w:val="false"/>
+                <w:bCs w:val="false"/>
+                <w:color w:val="1D2D3E"/>
+                <w:sz w:val="20"/>
+                <w:szCs w:val="20"/>
+              </w:rPr>
+              <w:t xml:space="preserve">DashboardScreen.tsx + pdfExport.ts</w:t>
+            </w:r>
+          </w:p>
+        </w:tc>
+      </w:tr>
     </w:tbl>
     <w:p>
       <w:pPr>
@@ -29811,6 +30563,357 @@
           <w:szCs w:val="22"/>
         </w:rPr>
         <w:t xml:space="preserve">  Tapping a history row repopulates the query field</w:t>
+      </w:r>
+    </w:p>
+    <w:p>
+      <w:pPr>
+        <w:spacing w:after="80"/>
+      </w:pPr>
+      <w:r>
+        <w:rPr>
+          <w:color w:val="1D2D3E"/>
+          <w:sz w:val="22"/>
+          <w:szCs w:val="22"/>
+        </w:rPr>
+        <w:t xml:space="preserve"/>
+      </w:r>
+    </w:p>
+    <w:p>
+      <w:pPr>
+        <w:pStyle w:val="Heading2"/>
+        <w:spacing w:after="120" w:before="300"/>
+      </w:pPr>
+      <w:r>
+        <w:rPr>
+          <w:b/>
+          <w:bCs/>
+          <w:color w:val="1D2D3E"/>
+        </w:rPr>
+        <w:t xml:space="preserve">Session 42 — 2026-06-04</w:t>
+      </w:r>
+    </w:p>
+    <w:p>
+      <w:pPr>
+        <w:pStyle w:val="ListParagraph"/>
+        <w:numPr>
+          <w:ilvl w:val="0"/>
+          <w:numId w:val="1"/>
+        </w:numPr>
+        <w:spacing w:after="40"/>
+      </w:pPr>
+      <w:r>
+        <w:rPr>
+          <w:color w:val="1D2D3E"/>
+          <w:sz w:val="22"/>
+          <w:szCs w:val="22"/>
+        </w:rPr>
+        <w:t xml:space="preserve">Procurement Analytics date range filter (ProcurementAnalyticsScreen.tsx)</w:t>
+      </w:r>
+    </w:p>
+    <w:p>
+      <w:pPr>
+        <w:pStyle w:val="ListParagraph"/>
+        <w:numPr>
+          <w:ilvl w:val="1"/>
+          <w:numId w:val="1"/>
+        </w:numPr>
+        <w:spacing w:after="40"/>
+      </w:pPr>
+      <w:r>
+        <w:rPr>
+          <w:color w:val="1D2D3E"/>
+          <w:sz w:val="22"/>
+          <w:szCs w:val="22"/>
+        </w:rPr>
+        <w:t xml:space="preserve">  rawData state (pos, sos) — analytics derived via useMemo with client-side date filter applied</w:t>
+      </w:r>
+    </w:p>
+    <w:p>
+      <w:pPr>
+        <w:pStyle w:val="ListParagraph"/>
+        <w:numPr>
+          <w:ilvl w:val="1"/>
+          <w:numId w:val="1"/>
+        </w:numPr>
+        <w:spacing w:after="40"/>
+      </w:pPr>
+      <w:r>
+        <w:rPr>
+          <w:color w:val="1D2D3E"/>
+          <w:sz w:val="22"/>
+          <w:szCs w:val="22"/>
+        </w:rPr>
+        <w:t xml:space="preserve">  Calendar icon in header: tap to show/hide DateRangeBar; active range shown as MM-DD–MM-DD badge</w:t>
+      </w:r>
+    </w:p>
+    <w:p>
+      <w:pPr>
+        <w:pStyle w:val="ListParagraph"/>
+        <w:numPr>
+          <w:ilvl w:val="1"/>
+          <w:numId w:val="1"/>
+        </w:numPr>
+        <w:spacing w:after="40"/>
+      </w:pPr>
+      <w:r>
+        <w:rPr>
+          <w:color w:val="1D2D3E"/>
+          <w:sz w:val="22"/>
+          <w:szCs w:val="22"/>
+        </w:rPr>
+        <w:t xml:space="preserve">  getMonthsInRange() generates month buckets for custom range (capped at 12)</w:t>
+      </w:r>
+    </w:p>
+    <w:p>
+      <w:pPr>
+        <w:pStyle w:val="ListParagraph"/>
+        <w:numPr>
+          <w:ilvl w:val="1"/>
+          <w:numId w:val="1"/>
+        </w:numPr>
+        <w:spacing w:after="40"/>
+      </w:pPr>
+      <w:r>
+        <w:rPr>
+          <w:color w:val="1D2D3E"/>
+          <w:sz w:val="22"/>
+          <w:szCs w:val="22"/>
+        </w:rPr>
+        <w:t xml:space="preserve">  All KPIs, vendor/customer rankings, status grids, and PDF export reflect active date filter</w:t>
+      </w:r>
+    </w:p>
+    <w:p>
+      <w:pPr>
+        <w:pStyle w:val="ListParagraph"/>
+        <w:numPr>
+          <w:ilvl w:val="0"/>
+          <w:numId w:val="1"/>
+        </w:numPr>
+        <w:spacing w:after="40"/>
+      </w:pPr>
+      <w:r>
+        <w:rPr>
+          <w:color w:val="1D2D3E"/>
+          <w:sz w:val="22"/>
+          <w:szCs w:val="22"/>
+        </w:rPr>
+        <w:t xml:space="preserve">SectionHeader subtitle prop (SectionHeader.tsx)</w:t>
+      </w:r>
+    </w:p>
+    <w:p>
+      <w:pPr>
+        <w:pStyle w:val="ListParagraph"/>
+        <w:numPr>
+          <w:ilvl w:val="1"/>
+          <w:numId w:val="1"/>
+        </w:numPr>
+        <w:spacing w:after="40"/>
+      </w:pPr>
+      <w:r>
+        <w:rPr>
+          <w:color w:val="1D2D3E"/>
+          <w:sz w:val="22"/>
+          <w:szCs w:val="22"/>
+        </w:rPr>
+        <w:t xml:space="preserve">  New subtitle?: string prop renders as second line below title; fixes previously silent prop usage</w:t>
+      </w:r>
+    </w:p>
+    <w:p>
+      <w:pPr>
+        <w:pStyle w:val="ListParagraph"/>
+        <w:numPr>
+          <w:ilvl w:val="0"/>
+          <w:numId w:val="1"/>
+        </w:numPr>
+        <w:spacing w:after="40"/>
+      </w:pPr>
+      <w:r>
+        <w:rPr>
+          <w:color w:val="1D2D3E"/>
+          <w:sz w:val="22"/>
+          <w:szCs w:val="22"/>
+        </w:rPr>
+        <w:t xml:space="preserve">Dashboard Top Vendors by Outstanding AP Balance (DashboardScreen.tsx)</w:t>
+      </w:r>
+    </w:p>
+    <w:p>
+      <w:pPr>
+        <w:pStyle w:val="ListParagraph"/>
+        <w:numPr>
+          <w:ilvl w:val="1"/>
+          <w:numId w:val="1"/>
+        </w:numPr>
+        <w:spacing w:after="40"/>
+      </w:pPr>
+      <w:r>
+        <w:rPr>
+          <w:color w:val="1D2D3E"/>
+          <w:sz w:val="22"/>
+          <w:szCs w:val="22"/>
+        </w:rPr>
+        <w:t xml:space="preserve">  topVendors state computed from all cached AP bills (zero extra API calls)</w:t>
+      </w:r>
+    </w:p>
+    <w:p>
+      <w:pPr>
+        <w:pStyle w:val="ListParagraph"/>
+        <w:numPr>
+          <w:ilvl w:val="1"/>
+          <w:numId w:val="1"/>
+        </w:numPr>
+        <w:spacing w:after="40"/>
+      </w:pPr>
+      <w:r>
+        <w:rPr>
+          <w:color w:val="1D2D3E"/>
+          <w:sz w:val="22"/>
+          <w:szCs w:val="22"/>
+        </w:rPr>
+        <w:t xml:space="preserve">  Top 3 vendors by outstanding balance; card with rank badge, name, progress bar, amount + bill count</w:t>
+      </w:r>
+    </w:p>
+    <w:p>
+      <w:pPr>
+        <w:pStyle w:val="ListParagraph"/>
+        <w:numPr>
+          <w:ilvl w:val="1"/>
+          <w:numId w:val="1"/>
+        </w:numPr>
+        <w:spacing w:after="40"/>
+      </w:pPr>
+      <w:r>
+        <w:rPr>
+          <w:color w:val="1D2D3E"/>
+          <w:sz w:val="22"/>
+          <w:szCs w:val="22"/>
+        </w:rPr>
+        <w:t xml:space="preserve">  Placed after Finance Status, before Upcoming Payments; 'View AP' header link</w:t>
+      </w:r>
+    </w:p>
+    <w:p>
+      <w:pPr>
+        <w:pStyle w:val="ListParagraph"/>
+        <w:numPr>
+          <w:ilvl w:val="0"/>
+          <w:numId w:val="1"/>
+        </w:numPr>
+        <w:spacing w:after="40"/>
+      </w:pPr>
+      <w:r>
+        <w:rPr>
+          <w:color w:val="1D2D3E"/>
+          <w:sz w:val="22"/>
+          <w:szCs w:val="22"/>
+        </w:rPr>
+        <w:t xml:space="preserve">Out-of-Stock standalone PDF reorder export (StockHealthScreen.tsx, pdfExport.ts)</w:t>
+      </w:r>
+    </w:p>
+    <w:p>
+      <w:pPr>
+        <w:pStyle w:val="ListParagraph"/>
+        <w:numPr>
+          <w:ilvl w:val="1"/>
+          <w:numId w:val="1"/>
+        </w:numPr>
+        <w:spacing w:after="40"/>
+      </w:pPr>
+      <w:r>
+        <w:rPr>
+          <w:color w:val="1D2D3E"/>
+          <w:sz w:val="22"/>
+          <w:szCs w:val="22"/>
+        </w:rPr>
+        <w:t xml:space="preserve">  exportOutOfStockPDF(): 3-tile summary, full item table with red status column, footer count</w:t>
+      </w:r>
+    </w:p>
+    <w:p>
+      <w:pPr>
+        <w:pStyle w:val="ListParagraph"/>
+        <w:numPr>
+          <w:ilvl w:val="1"/>
+          <w:numId w:val="1"/>
+        </w:numPr>
+        <w:spacing w:after="40"/>
+      </w:pPr>
+      <w:r>
+        <w:rPr>
+          <w:color w:val="1D2D3E"/>
+          <w:sz w:val="22"/>
+          <w:szCs w:val="22"/>
+        </w:rPr>
+        <w:t xml:space="preserve">  File-text icon in Out of Stock SectionHeader action slot (only when outOfStockItems &gt; 0)</w:t>
+      </w:r>
+    </w:p>
+    <w:p>
+      <w:pPr>
+        <w:pStyle w:val="ListParagraph"/>
+        <w:numPr>
+          <w:ilvl w:val="0"/>
+          <w:numId w:val="1"/>
+        </w:numPr>
+        <w:spacing w:after="40"/>
+      </w:pPr>
+      <w:r>
+        <w:rPr>
+          <w:color w:val="1D2D3E"/>
+          <w:sz w:val="22"/>
+          <w:szCs w:val="22"/>
+        </w:rPr>
+        <w:t xml:space="preserve">AP/AR combined flagged items PDF export (DashboardScreen.tsx, pdfExport.ts)</w:t>
+      </w:r>
+    </w:p>
+    <w:p>
+      <w:pPr>
+        <w:pStyle w:val="ListParagraph"/>
+        <w:numPr>
+          <w:ilvl w:val="1"/>
+          <w:numId w:val="1"/>
+        </w:numPr>
+        <w:spacing w:after="40"/>
+      </w:pPr>
+      <w:r>
+        <w:rPr>
+          <w:color w:val="1D2D3E"/>
+          <w:sz w:val="22"/>
+          <w:szCs w:val="22"/>
+        </w:rPr>
+        <w:t xml:space="preserve">  exportFlaggedCombinedPDF(): 4-tile summary, AP bills table + AR invoices table, overdue rows bold</w:t>
+      </w:r>
+    </w:p>
+    <w:p>
+      <w:pPr>
+        <w:pStyle w:val="ListParagraph"/>
+        <w:numPr>
+          <w:ilvl w:val="1"/>
+          <w:numId w:val="1"/>
+        </w:numPr>
+        <w:spacing w:after="40"/>
+      </w:pPr>
+      <w:r>
+        <w:rPr>
+          <w:color w:val="1D2D3E"/>
+          <w:sz w:val="22"/>
+          <w:szCs w:val="22"/>
+        </w:rPr>
+        <w:t xml:space="preserve">  File-text icon in Pending Actions SectionHeader; resolves flagged items from cache</w:t>
+      </w:r>
+    </w:p>
+    <w:p>
+      <w:pPr>
+        <w:pStyle w:val="ListParagraph"/>
+        <w:numPr>
+          <w:ilvl w:val="1"/>
+          <w:numId w:val="1"/>
+        </w:numPr>
+        <w:spacing w:after="40"/>
+      </w:pPr>
+      <w:r>
+        <w:rPr>
+          <w:color w:val="1D2D3E"/>
+          <w:sz w:val="22"/>
+          <w:szCs w:val="22"/>
+        </w:rPr>
+        <w:t xml:space="preserve">  Only shown when flaggedBillCount &gt; 0 AND flaggedInvoiceCount &gt; 0</w:t>
       </w:r>
     </w:p>
     <w:p>

</xml_diff>

<commit_message>
docs(session-43): update PROGRESS.md, generate-docs.js, and FEATURES.docx with Session 43 changelog
- PROGRESS.md: Session 43 section with completed features and next-session ideas
- generate-docs.js: Section 3 entries 3.62-3.64, 3 roadmap rows, Session 43 changelog
- FEATURES.docx: regenerated via generate-docs.js
</commit_message>
<xml_diff>
--- a/FEATURES.docx
+++ b/FEATURES.docx
@@ -45,7 +45,7 @@
           <w:sz w:val="20"/>
           <w:szCs w:val="20"/>
         </w:rPr>
-        <w:t xml:space="preserve">Generated: 2026-06-04</w:t>
+        <w:t xml:space="preserve">Generated: 2026-06-05</w:t>
       </w:r>
     </w:p>
     <w:p>
@@ -12045,6 +12045,393 @@
     </w:p>
     <w:p>
       <w:pPr>
+        <w:pStyle w:val="Heading2"/>
+        <w:spacing w:after="120" w:before="300"/>
+      </w:pPr>
+      <w:r>
+        <w:rPr>
+          <w:b/>
+          <w:bCs/>
+          <w:color w:val="1D2D3E"/>
+        </w:rPr>
+        <w:t xml:space="preserve">3.62 Dashboard Top Customers by Outstanding AR Balance (Session 43)</w:t>
+      </w:r>
+    </w:p>
+    <w:p>
+      <w:pPr>
+        <w:pStyle w:val="ListParagraph"/>
+        <w:numPr>
+          <w:ilvl w:val="0"/>
+          <w:numId w:val="1"/>
+        </w:numPr>
+        <w:spacing w:after="40"/>
+      </w:pPr>
+      <w:r>
+        <w:rPr>
+          <w:color w:val="1D2D3E"/>
+          <w:sz w:val="22"/>
+          <w:szCs w:val="22"/>
+        </w:rPr>
+        <w:t xml:space="preserve">topCustomers state (Array&lt;{name, outstanding, invoiceCount}&gt;) computed in useFocusEffect alongside topVendors</w:t>
+      </w:r>
+    </w:p>
+    <w:p>
+      <w:pPr>
+        <w:pStyle w:val="ListParagraph"/>
+        <w:numPr>
+          <w:ilvl w:val="1"/>
+          <w:numId w:val="1"/>
+        </w:numPr>
+        <w:spacing w:after="40"/>
+      </w:pPr>
+      <w:r>
+        <w:rPr>
+          <w:color w:val="1D2D3E"/>
+          <w:sz w:val="22"/>
+          <w:szCs w:val="22"/>
+        </w:rPr>
+        <w:t xml:space="preserve">  Aggregates outstanding by customer name from AR invoice cache, excludes PAID/RECEIVED/CLOSED/CANCELLED</w:t>
+      </w:r>
+    </w:p>
+    <w:p>
+      <w:pPr>
+        <w:pStyle w:val="ListParagraph"/>
+        <w:numPr>
+          <w:ilvl w:val="1"/>
+          <w:numId w:val="1"/>
+        </w:numPr>
+        <w:spacing w:after="40"/>
+      </w:pPr>
+      <w:r>
+        <w:rPr>
+          <w:color w:val="1D2D3E"/>
+          <w:sz w:val="22"/>
+          <w:szCs w:val="22"/>
+        </w:rPr>
+        <w:t xml:space="preserve">  Top 3 by outstanding; muted-gray bar fill visually distinguishes from vendor blue bar</w:t>
+      </w:r>
+    </w:p>
+    <w:p>
+      <w:pPr>
+        <w:pStyle w:val="ListParagraph"/>
+        <w:numPr>
+          <w:ilvl w:val="1"/>
+          <w:numId w:val="1"/>
+        </w:numPr>
+        <w:spacing w:after="40"/>
+      </w:pPr>
+      <w:r>
+        <w:rPr>
+          <w:color w:val="1D2D3E"/>
+          <w:sz w:val="22"/>
+          <w:szCs w:val="22"/>
+        </w:rPr>
+        <w:t xml:space="preserve">  Card placed after Top Vendors section; 'View AR' header link → AccountsReceivable</w:t>
+      </w:r>
+    </w:p>
+    <w:p>
+      <w:pPr>
+        <w:pStyle w:val="ListParagraph"/>
+        <w:numPr>
+          <w:ilvl w:val="1"/>
+          <w:numId w:val="1"/>
+        </w:numPr>
+        <w:spacing w:after="40"/>
+      </w:pPr>
+      <w:r>
+        <w:rPr>
+          <w:color w:val="1D2D3E"/>
+          <w:sz w:val="22"/>
+          <w:szCs w:val="22"/>
+        </w:rPr>
+        <w:t xml:space="preserve">  Only renders when topCustomers.length &gt; 0; zero extra API calls (reuses AR invoice cache)</w:t>
+      </w:r>
+    </w:p>
+    <w:p>
+      <w:pPr>
+        <w:spacing w:after="80"/>
+      </w:pPr>
+      <w:r>
+        <w:rPr>
+          <w:color w:val="1D2D3E"/>
+          <w:sz w:val="22"/>
+          <w:szCs w:val="22"/>
+        </w:rPr>
+        <w:t xml:space="preserve"/>
+      </w:r>
+    </w:p>
+    <w:p>
+      <w:pPr>
+        <w:pStyle w:val="Heading2"/>
+        <w:spacing w:after="120" w:before="300"/>
+      </w:pPr>
+      <w:r>
+        <w:rPr>
+          <w:b/>
+          <w:bCs/>
+          <w:color w:val="1D2D3E"/>
+        </w:rPr>
+        <w:t xml:space="preserve">3.63 Procurement Analytics Monthly Trend Count/Value Toggle (Session 43)</w:t>
+      </w:r>
+    </w:p>
+    <w:p>
+      <w:pPr>
+        <w:pStyle w:val="ListParagraph"/>
+        <w:numPr>
+          <w:ilvl w:val="0"/>
+          <w:numId w:val="1"/>
+        </w:numPr>
+        <w:spacing w:after="40"/>
+      </w:pPr>
+      <w:r>
+        <w:rPr>
+          <w:color w:val="1D2D3E"/>
+          <w:sz w:val="22"/>
+          <w:szCs w:val="22"/>
+        </w:rPr>
+        <w:t xml:space="preserve">ChartMode type: 'count' | 'value'; chartMode state in ProcurementAnalyticsScreen (default 'count')</w:t>
+      </w:r>
+    </w:p>
+    <w:p>
+      <w:pPr>
+        <w:pStyle w:val="ListParagraph"/>
+        <w:numPr>
+          <w:ilvl w:val="0"/>
+          <w:numId w:val="1"/>
+        </w:numPr>
+        <w:spacing w:after="40"/>
+      </w:pPr>
+      <w:r>
+        <w:rPr>
+          <w:color w:val="1D2D3E"/>
+          <w:sz w:val="22"/>
+          <w:szCs w:val="22"/>
+        </w:rPr>
+        <w:t xml:space="preserve">MonthlyTrendChart: mode prop selects poCount/soCount (count) or poValue/soValue (value) for bar heights</w:t>
+      </w:r>
+    </w:p>
+    <w:p>
+      <w:pPr>
+        <w:pStyle w:val="ListParagraph"/>
+        <w:numPr>
+          <w:ilvl w:val="1"/>
+          <w:numId w:val="1"/>
+        </w:numPr>
+        <w:spacing w:after="40"/>
+      </w:pPr>
+      <w:r>
+        <w:rPr>
+          <w:color w:val="1D2D3E"/>
+          <w:sz w:val="22"/>
+          <w:szCs w:val="22"/>
+        </w:rPr>
+        <w:t xml:space="preserve">  fmtBottom() formats column total: raw integer count or K/M-shortened value string</w:t>
+      </w:r>
+    </w:p>
+    <w:p>
+      <w:pPr>
+        <w:pStyle w:val="ListParagraph"/>
+        <w:numPr>
+          <w:ilvl w:val="0"/>
+          <w:numId w:val="1"/>
+        </w:numPr>
+        <w:spacing w:after="40"/>
+      </w:pPr>
+      <w:r>
+        <w:rPr>
+          <w:color w:val="1D2D3E"/>
+          <w:sz w:val="22"/>
+          <w:szCs w:val="22"/>
+        </w:rPr>
+        <w:t xml:space="preserve">Count / Value chip toggle in Monthly Trend SectionHeader action slot</w:t>
+      </w:r>
+    </w:p>
+    <w:p>
+      <w:pPr>
+        <w:pStyle w:val="ListParagraph"/>
+        <w:numPr>
+          <w:ilvl w:val="1"/>
+          <w:numId w:val="1"/>
+        </w:numPr>
+        <w:spacing w:after="40"/>
+      </w:pPr>
+      <w:r>
+        <w:rPr>
+          <w:color w:val="1D2D3E"/>
+          <w:sz w:val="22"/>
+          <w:szCs w:val="22"/>
+        </w:rPr>
+        <w:t xml:space="preserve">  Active chip: filled dark background + white text; inactive: outline border</w:t>
+      </w:r>
+    </w:p>
+    <w:p>
+      <w:pPr>
+        <w:spacing w:after="80"/>
+      </w:pPr>
+      <w:r>
+        <w:rPr>
+          <w:color w:val="1D2D3E"/>
+          <w:sz w:val="22"/>
+          <w:szCs w:val="22"/>
+        </w:rPr>
+        <w:t xml:space="preserve"/>
+      </w:r>
+    </w:p>
+    <w:p>
+      <w:pPr>
+        <w:pStyle w:val="Heading2"/>
+        <w:spacing w:after="120" w:before="300"/>
+      </w:pPr>
+      <w:r>
+        <w:rPr>
+          <w:b/>
+          <w:bCs/>
+          <w:color w:val="1D2D3E"/>
+        </w:rPr>
+        <w:t xml:space="preserve">3.64 FinancialAnalytics 6-Month AP vs AR Monthly Trend Chart (Session 43)</w:t>
+      </w:r>
+    </w:p>
+    <w:p>
+      <w:pPr>
+        <w:pStyle w:val="ListParagraph"/>
+        <w:numPr>
+          <w:ilvl w:val="0"/>
+          <w:numId w:val="1"/>
+        </w:numPr>
+        <w:spacing w:after="40"/>
+      </w:pPr>
+      <w:r>
+        <w:rPr>
+          <w:color w:val="1D2D3E"/>
+          <w:sz w:val="22"/>
+          <w:szCs w:val="22"/>
+        </w:rPr>
+        <w:t xml:space="preserve">MonthlyNetChart component: grouped bar chart showing last 6 months of AP bills + AR invoices billed amounts</w:t>
+      </w:r>
+    </w:p>
+    <w:p>
+      <w:pPr>
+        <w:pStyle w:val="ListParagraph"/>
+        <w:numPr>
+          <w:ilvl w:val="1"/>
+          <w:numId w:val="1"/>
+        </w:numPr>
+        <w:spacing w:after="40"/>
+      </w:pPr>
+      <w:r>
+        <w:rPr>
+          <w:color w:val="1D2D3E"/>
+          <w:sz w:val="22"/>
+          <w:szCs w:val="22"/>
+        </w:rPr>
+        <w:t xml:space="preserve">  buildMonthlyBuckets(): groups APBill.amount/ARInvoice.amount by dt year-month prefix into 6 buckets</w:t>
+      </w:r>
+    </w:p>
+    <w:p>
+      <w:pPr>
+        <w:pStyle w:val="ListParagraph"/>
+        <w:numPr>
+          <w:ilvl w:val="1"/>
+          <w:numId w:val="1"/>
+        </w:numPr>
+        <w:spacing w:after="40"/>
+      </w:pPr>
+      <w:r>
+        <w:rPr>
+          <w:color w:val="1D2D3E"/>
+          <w:sz w:val="22"/>
+          <w:szCs w:val="22"/>
+        </w:rPr>
+        <w:t xml:space="preserve">  AP bars: muted gray (textSecondary); AR bars: dark (text) — visually distinct grouping per month</w:t>
+      </w:r>
+    </w:p>
+    <w:p>
+      <w:pPr>
+        <w:pStyle w:val="ListParagraph"/>
+        <w:numPr>
+          <w:ilvl w:val="1"/>
+          <w:numId w:val="1"/>
+        </w:numPr>
+        <w:spacing w:after="40"/>
+      </w:pPr>
+      <w:r>
+        <w:rPr>
+          <w:color w:val="1D2D3E"/>
+          <w:sz w:val="22"/>
+          <w:szCs w:val="22"/>
+        </w:rPr>
+        <w:t xml:space="preserve">  Net label below each column: +/- compact (K/M) value showing AR minus AP for that month</w:t>
+      </w:r>
+    </w:p>
+    <w:p>
+      <w:pPr>
+        <w:pStyle w:val="ListParagraph"/>
+        <w:numPr>
+          <w:ilvl w:val="1"/>
+          <w:numId w:val="1"/>
+        </w:numPr>
+        <w:spacing w:after="40"/>
+      </w:pPr>
+      <w:r>
+        <w:rPr>
+          <w:color w:val="1D2D3E"/>
+          <w:sz w:val="22"/>
+          <w:szCs w:val="22"/>
+        </w:rPr>
+        <w:t xml:space="preserve">  Component returns null when all months are zero — no empty-state noise</w:t>
+      </w:r>
+    </w:p>
+    <w:p>
+      <w:pPr>
+        <w:pStyle w:val="ListParagraph"/>
+        <w:numPr>
+          <w:ilvl w:val="0"/>
+          <w:numId w:val="1"/>
+        </w:numPr>
+        <w:spacing w:after="40"/>
+      </w:pPr>
+      <w:r>
+        <w:rPr>
+          <w:color w:val="1D2D3E"/>
+          <w:sz w:val="22"/>
+          <w:szCs w:val="22"/>
+        </w:rPr>
+        <w:t xml:space="preserve">Placed in FinancialAnalyticsScreen below NetPositionCard with '6-Month Trend · AP vs AR · billed per month' header</w:t>
+      </w:r>
+    </w:p>
+    <w:p>
+      <w:pPr>
+        <w:pStyle w:val="ListParagraph"/>
+        <w:numPr>
+          <w:ilvl w:val="0"/>
+          <w:numId w:val="1"/>
+        </w:numPr>
+        <w:spacing w:after="40"/>
+      </w:pPr>
+      <w:r>
+        <w:rPr>
+          <w:color w:val="1D2D3E"/>
+          <w:sz w:val="22"/>
+          <w:szCs w:val="22"/>
+        </w:rPr>
+        <w:t xml:space="preserve">Reads from ap:/ar: AsyncStorage cache first — zero extra API calls when AP/AR screens already visited</w:t>
+      </w:r>
+    </w:p>
+    <w:p>
+      <w:pPr>
+        <w:spacing w:after="80"/>
+      </w:pPr>
+      <w:r>
+        <w:rPr>
+          <w:color w:val="1D2D3E"/>
+          <w:sz w:val="22"/>
+          <w:szCs w:val="22"/>
+        </w:rPr>
+        <w:t xml:space="preserve"/>
+      </w:r>
+    </w:p>
+    <w:p>
+      <w:pPr>
         <w:pStyle w:val="Heading1"/>
         <w:spacing w:after="120" w:before="300"/>
       </w:pPr>
@@ -25481,6 +25868,240 @@
           </w:p>
         </w:tc>
       </w:tr>
+      <w:tr>
+        <w:tc>
+          <w:tcPr>
+            <w:shd w:color="F0F4F8" w:val="solid"/>
+          </w:tcPr>
+          <w:p>
+            <w:pPr>
+              <w:spacing w:after="40" w:before="40"/>
+            </w:pPr>
+            <w:r>
+              <w:rPr>
+                <w:b w:val="false"/>
+                <w:bCs w:val="false"/>
+                <w:color w:val="1D2D3E"/>
+                <w:sz w:val="20"/>
+                <w:szCs w:val="20"/>
+              </w:rPr>
+              <w:t xml:space="preserve">Session 43</w:t>
+            </w:r>
+          </w:p>
+        </w:tc>
+        <w:tc>
+          <w:tcPr>
+            <w:shd w:color="F0F4F8" w:val="solid"/>
+          </w:tcPr>
+          <w:p>
+            <w:pPr>
+              <w:spacing w:after="40" w:before="40"/>
+            </w:pPr>
+            <w:r>
+              <w:rPr>
+                <w:b w:val="false"/>
+                <w:bCs w:val="false"/>
+                <w:color w:val="1D2D3E"/>
+                <w:sz w:val="20"/>
+                <w:szCs w:val="20"/>
+              </w:rPr>
+              <w:t xml:space="preserve">Dashboard Top Customers card — top 3 customers by AR outstanding, muted bar fill, zero extra API calls</w:t>
+            </w:r>
+          </w:p>
+        </w:tc>
+        <w:tc>
+          <w:tcPr>
+            <w:shd w:color="F0F4F8" w:val="solid"/>
+          </w:tcPr>
+          <w:p>
+            <w:pPr>
+              <w:spacing w:after="40" w:before="40"/>
+            </w:pPr>
+            <w:r>
+              <w:rPr>
+                <w:b w:val="false"/>
+                <w:bCs w:val="false"/>
+                <w:color w:val="1D2D3E"/>
+                <w:sz w:val="20"/>
+                <w:szCs w:val="20"/>
+              </w:rPr>
+              <w:t xml:space="preserve">Done</w:t>
+            </w:r>
+          </w:p>
+        </w:tc>
+        <w:tc>
+          <w:tcPr>
+            <w:shd w:color="F0F4F8" w:val="solid"/>
+          </w:tcPr>
+          <w:p>
+            <w:pPr>
+              <w:spacing w:after="40" w:before="40"/>
+            </w:pPr>
+            <w:r>
+              <w:rPr>
+                <w:b w:val="false"/>
+                <w:bCs w:val="false"/>
+                <w:color w:val="1D2D3E"/>
+                <w:sz w:val="20"/>
+                <w:szCs w:val="20"/>
+              </w:rPr>
+              <w:t xml:space="preserve">DashboardScreen.tsx</w:t>
+            </w:r>
+          </w:p>
+        </w:tc>
+      </w:tr>
+      <w:tr>
+        <w:tc>
+          <w:p>
+            <w:pPr>
+              <w:spacing w:after="40" w:before="40"/>
+            </w:pPr>
+            <w:r>
+              <w:rPr>
+                <w:b w:val="false"/>
+                <w:bCs w:val="false"/>
+                <w:color w:val="1D2D3E"/>
+                <w:sz w:val="20"/>
+                <w:szCs w:val="20"/>
+              </w:rPr>
+              <w:t xml:space="preserve">Session 43</w:t>
+            </w:r>
+          </w:p>
+        </w:tc>
+        <w:tc>
+          <w:p>
+            <w:pPr>
+              <w:spacing w:after="40" w:before="40"/>
+            </w:pPr>
+            <w:r>
+              <w:rPr>
+                <w:b w:val="false"/>
+                <w:bCs w:val="false"/>
+                <w:color w:val="1D2D3E"/>
+                <w:sz w:val="20"/>
+                <w:szCs w:val="20"/>
+              </w:rPr>
+              <w:t xml:space="preserve">Procurement Analytics count/value toggle — Count/Value chips in Monthly Trend header switch bar metric</w:t>
+            </w:r>
+          </w:p>
+        </w:tc>
+        <w:tc>
+          <w:p>
+            <w:pPr>
+              <w:spacing w:after="40" w:before="40"/>
+            </w:pPr>
+            <w:r>
+              <w:rPr>
+                <w:b w:val="false"/>
+                <w:bCs w:val="false"/>
+                <w:color w:val="1D2D3E"/>
+                <w:sz w:val="20"/>
+                <w:szCs w:val="20"/>
+              </w:rPr>
+              <w:t xml:space="preserve">Done</w:t>
+            </w:r>
+          </w:p>
+        </w:tc>
+        <w:tc>
+          <w:p>
+            <w:pPr>
+              <w:spacing w:after="40" w:before="40"/>
+            </w:pPr>
+            <w:r>
+              <w:rPr>
+                <w:b w:val="false"/>
+                <w:bCs w:val="false"/>
+                <w:color w:val="1D2D3E"/>
+                <w:sz w:val="20"/>
+                <w:szCs w:val="20"/>
+              </w:rPr>
+              <w:t xml:space="preserve">ProcurementAnalyticsScreen.tsx</w:t>
+            </w:r>
+          </w:p>
+        </w:tc>
+      </w:tr>
+      <w:tr>
+        <w:tc>
+          <w:tcPr>
+            <w:shd w:color="F0F4F8" w:val="solid"/>
+          </w:tcPr>
+          <w:p>
+            <w:pPr>
+              <w:spacing w:after="40" w:before="40"/>
+            </w:pPr>
+            <w:r>
+              <w:rPr>
+                <w:b w:val="false"/>
+                <w:bCs w:val="false"/>
+                <w:color w:val="1D2D3E"/>
+                <w:sz w:val="20"/>
+                <w:szCs w:val="20"/>
+              </w:rPr>
+              <w:t xml:space="preserve">Session 43</w:t>
+            </w:r>
+          </w:p>
+        </w:tc>
+        <w:tc>
+          <w:tcPr>
+            <w:shd w:color="F0F4F8" w:val="solid"/>
+          </w:tcPr>
+          <w:p>
+            <w:pPr>
+              <w:spacing w:after="40" w:before="40"/>
+            </w:pPr>
+            <w:r>
+              <w:rPr>
+                <w:b w:val="false"/>
+                <w:bCs w:val="false"/>
+                <w:color w:val="1D2D3E"/>
+                <w:sz w:val="20"/>
+                <w:szCs w:val="20"/>
+              </w:rPr>
+              <w:t xml:space="preserve">FinancialAnalytics 6-month AP vs AR trend chart — grouped monthly bars with net label per column</w:t>
+            </w:r>
+          </w:p>
+        </w:tc>
+        <w:tc>
+          <w:tcPr>
+            <w:shd w:color="F0F4F8" w:val="solid"/>
+          </w:tcPr>
+          <w:p>
+            <w:pPr>
+              <w:spacing w:after="40" w:before="40"/>
+            </w:pPr>
+            <w:r>
+              <w:rPr>
+                <w:b w:val="false"/>
+                <w:bCs w:val="false"/>
+                <w:color w:val="1D2D3E"/>
+                <w:sz w:val="20"/>
+                <w:szCs w:val="20"/>
+              </w:rPr>
+              <w:t xml:space="preserve">Done</w:t>
+            </w:r>
+          </w:p>
+        </w:tc>
+        <w:tc>
+          <w:tcPr>
+            <w:shd w:color="F0F4F8" w:val="solid"/>
+          </w:tcPr>
+          <w:p>
+            <w:pPr>
+              <w:spacing w:after="40" w:before="40"/>
+            </w:pPr>
+            <w:r>
+              <w:rPr>
+                <w:b w:val="false"/>
+                <w:bCs w:val="false"/>
+                <w:color w:val="1D2D3E"/>
+                <w:sz w:val="20"/>
+                <w:szCs w:val="20"/>
+              </w:rPr>
+              <w:t xml:space="preserve">FinancialAnalyticsScreen.tsx</w:t>
+            </w:r>
+          </w:p>
+        </w:tc>
+      </w:tr>
     </w:tbl>
     <w:p>
       <w:pPr>
@@ -30563,6 +31184,249 @@
           <w:szCs w:val="22"/>
         </w:rPr>
         <w:t xml:space="preserve">  Tapping a history row repopulates the query field</w:t>
+      </w:r>
+    </w:p>
+    <w:p>
+      <w:pPr>
+        <w:spacing w:after="80"/>
+      </w:pPr>
+      <w:r>
+        <w:rPr>
+          <w:color w:val="1D2D3E"/>
+          <w:sz w:val="22"/>
+          <w:szCs w:val="22"/>
+        </w:rPr>
+        <w:t xml:space="preserve"/>
+      </w:r>
+    </w:p>
+    <w:p>
+      <w:pPr>
+        <w:pStyle w:val="Heading2"/>
+        <w:spacing w:after="120" w:before="300"/>
+      </w:pPr>
+      <w:r>
+        <w:rPr>
+          <w:b/>
+          <w:bCs/>
+          <w:color w:val="1D2D3E"/>
+        </w:rPr>
+        <w:t xml:space="preserve">Session 43 — 2026-06-05</w:t>
+      </w:r>
+    </w:p>
+    <w:p>
+      <w:pPr>
+        <w:pStyle w:val="ListParagraph"/>
+        <w:numPr>
+          <w:ilvl w:val="0"/>
+          <w:numId w:val="1"/>
+        </w:numPr>
+        <w:spacing w:after="40"/>
+      </w:pPr>
+      <w:r>
+        <w:rPr>
+          <w:color w:val="1D2D3E"/>
+          <w:sz w:val="22"/>
+          <w:szCs w:val="22"/>
+        </w:rPr>
+        <w:t xml:space="preserve">Dashboard Top Customers by outstanding AR balance card (DashboardScreen.tsx)</w:t>
+      </w:r>
+    </w:p>
+    <w:p>
+      <w:pPr>
+        <w:pStyle w:val="ListParagraph"/>
+        <w:numPr>
+          <w:ilvl w:val="1"/>
+          <w:numId w:val="1"/>
+        </w:numPr>
+        <w:spacing w:after="40"/>
+      </w:pPr>
+      <w:r>
+        <w:rPr>
+          <w:color w:val="1D2D3E"/>
+          <w:sz w:val="22"/>
+          <w:szCs w:val="22"/>
+        </w:rPr>
+        <w:t xml:space="preserve">  Symmetric companion to Top Vendors card; topCustomers state computed from AR invoice cache</w:t>
+      </w:r>
+    </w:p>
+    <w:p>
+      <w:pPr>
+        <w:pStyle w:val="ListParagraph"/>
+        <w:numPr>
+          <w:ilvl w:val="1"/>
+          <w:numId w:val="1"/>
+        </w:numPr>
+        <w:spacing w:after="40"/>
+      </w:pPr>
+      <w:r>
+        <w:rPr>
+          <w:color w:val="1D2D3E"/>
+          <w:sz w:val="22"/>
+          <w:szCs w:val="22"/>
+        </w:rPr>
+        <w:t xml:space="preserve">  Top 3 by outstanding; muted-gray bar fill; 'View AR' header link; renders only when topCustomers.length &gt; 0</w:t>
+      </w:r>
+    </w:p>
+    <w:p>
+      <w:pPr>
+        <w:pStyle w:val="ListParagraph"/>
+        <w:numPr>
+          <w:ilvl w:val="0"/>
+          <w:numId w:val="1"/>
+        </w:numPr>
+        <w:spacing w:after="40"/>
+      </w:pPr>
+      <w:r>
+        <w:rPr>
+          <w:color w:val="1D2D3E"/>
+          <w:sz w:val="22"/>
+          <w:szCs w:val="22"/>
+        </w:rPr>
+        <w:t xml:space="preserve">Procurement Analytics monthly trend count/value toggle (ProcurementAnalyticsScreen.tsx)</w:t>
+      </w:r>
+    </w:p>
+    <w:p>
+      <w:pPr>
+        <w:pStyle w:val="ListParagraph"/>
+        <w:numPr>
+          <w:ilvl w:val="1"/>
+          <w:numId w:val="1"/>
+        </w:numPr>
+        <w:spacing w:after="40"/>
+      </w:pPr>
+      <w:r>
+        <w:rPr>
+          <w:color w:val="1D2D3E"/>
+          <w:sz w:val="22"/>
+          <w:szCs w:val="22"/>
+        </w:rPr>
+        <w:t xml:space="preserve">  ChartMode type + chartMode state (default 'count'); Count/Value chip toggle in SectionHeader action</w:t>
+      </w:r>
+    </w:p>
+    <w:p>
+      <w:pPr>
+        <w:pStyle w:val="ListParagraph"/>
+        <w:numPr>
+          <w:ilvl w:val="1"/>
+          <w:numId w:val="1"/>
+        </w:numPr>
+        <w:spacing w:after="40"/>
+      </w:pPr>
+      <w:r>
+        <w:rPr>
+          <w:color w:val="1D2D3E"/>
+          <w:sz w:val="22"/>
+          <w:szCs w:val="22"/>
+        </w:rPr>
+        <w:t xml:space="preserve">  MonthlyTrendChart: mode prop selects poCount/soCount or poValue/soValue for bar heights + totals</w:t>
+      </w:r>
+    </w:p>
+    <w:p>
+      <w:pPr>
+        <w:pStyle w:val="ListParagraph"/>
+        <w:numPr>
+          <w:ilvl w:val="1"/>
+          <w:numId w:val="1"/>
+        </w:numPr>
+        <w:spacing w:after="40"/>
+      </w:pPr>
+      <w:r>
+        <w:rPr>
+          <w:color w:val="1D2D3E"/>
+          <w:sz w:val="22"/>
+          <w:szCs w:val="22"/>
+        </w:rPr>
+        <w:t xml:space="preserve">  fmtBottom() formats total as raw count or K/M-shortened value string</w:t>
+      </w:r>
+    </w:p>
+    <w:p>
+      <w:pPr>
+        <w:pStyle w:val="ListParagraph"/>
+        <w:numPr>
+          <w:ilvl w:val="0"/>
+          <w:numId w:val="1"/>
+        </w:numPr>
+        <w:spacing w:after="40"/>
+      </w:pPr>
+      <w:r>
+        <w:rPr>
+          <w:color w:val="1D2D3E"/>
+          <w:sz w:val="22"/>
+          <w:szCs w:val="22"/>
+        </w:rPr>
+        <w:t xml:space="preserve">FinancialAnalytics 6-month AP vs AR monthly trend chart (FinancialAnalyticsScreen.tsx)</w:t>
+      </w:r>
+    </w:p>
+    <w:p>
+      <w:pPr>
+        <w:pStyle w:val="ListParagraph"/>
+        <w:numPr>
+          <w:ilvl w:val="1"/>
+          <w:numId w:val="1"/>
+        </w:numPr>
+        <w:spacing w:after="40"/>
+      </w:pPr>
+      <w:r>
+        <w:rPr>
+          <w:color w:val="1D2D3E"/>
+          <w:sz w:val="22"/>
+          <w:szCs w:val="22"/>
+        </w:rPr>
+        <w:t xml:space="preserve">  MonthlyNetChart component: last 6 months AP billed vs AR billed as grouped bars</w:t>
+      </w:r>
+    </w:p>
+    <w:p>
+      <w:pPr>
+        <w:pStyle w:val="ListParagraph"/>
+        <w:numPr>
+          <w:ilvl w:val="1"/>
+          <w:numId w:val="1"/>
+        </w:numPr>
+        <w:spacing w:after="40"/>
+      </w:pPr>
+      <w:r>
+        <w:rPr>
+          <w:color w:val="1D2D3E"/>
+          <w:sz w:val="22"/>
+          <w:szCs w:val="22"/>
+        </w:rPr>
+        <w:t xml:space="preserve">  buildMonthlyBuckets() groups APBill.amount + ARInvoice.amount by dt year-month prefix</w:t>
+      </w:r>
+    </w:p>
+    <w:p>
+      <w:pPr>
+        <w:pStyle w:val="ListParagraph"/>
+        <w:numPr>
+          <w:ilvl w:val="1"/>
+          <w:numId w:val="1"/>
+        </w:numPr>
+        <w:spacing w:after="40"/>
+      </w:pPr>
+      <w:r>
+        <w:rPr>
+          <w:color w:val="1D2D3E"/>
+          <w:sz w:val="22"/>
+          <w:szCs w:val="22"/>
+        </w:rPr>
+        <w:t xml:space="preserve">  Net label per column (AR − AP); uses ap:/ar: AsyncStorage cache — zero extra API calls when cached</w:t>
+      </w:r>
+    </w:p>
+    <w:p>
+      <w:pPr>
+        <w:pStyle w:val="ListParagraph"/>
+        <w:numPr>
+          <w:ilvl w:val="1"/>
+          <w:numId w:val="1"/>
+        </w:numPr>
+        <w:spacing w:after="40"/>
+      </w:pPr>
+      <w:r>
+        <w:rPr>
+          <w:color w:val="1D2D3E"/>
+          <w:sz w:val="22"/>
+          <w:szCs w:val="22"/>
+        </w:rPr>
+        <w:t xml:space="preserve">  Placed below NetPositionCard with '6-Month Trend · AP vs AR · billed per month' section header</w:t>
       </w:r>
     </w:p>
     <w:p>

</xml_diff>

<commit_message>
docs(session-45): update PROGRESS.md, generate-docs.js, and FEATURES.docx with Session 44+45 changelog
- PROGRESS.md: Session 45 (JE summary card, FA DSO/DPO/CCC, PA value dist)
  and Session 44 (Dashboard aging mini-chart, flagged PDF date range, FA aging delta)
- generate-docs.js: roadmap table rows + changelog headings for sessions 44 and 45
- FEATURES.docx: regenerated with full changelog up to Session 45
</commit_message>
<xml_diff>
--- a/FEATURES.docx
+++ b/FEATURES.docx
@@ -45,7 +45,7 @@
           <w:sz w:val="20"/>
           <w:szCs w:val="20"/>
         </w:rPr>
-        <w:t xml:space="preserve">Generated: 2026-06-05</w:t>
+        <w:t xml:space="preserve">Generated: 2026-06-07</w:t>
       </w:r>
     </w:p>
     <w:p>
@@ -26102,6 +26102,532 @@
           </w:p>
         </w:tc>
       </w:tr>
+      <w:tr>
+        <w:tc>
+          <w:p>
+            <w:pPr>
+              <w:spacing w:after="40" w:before="40"/>
+            </w:pPr>
+            <w:r>
+              <w:rPr>
+                <w:b w:val="false"/>
+                <w:bCs w:val="false"/>
+                <w:color w:val="1D2D3E"/>
+                <w:sz w:val="20"/>
+                <w:szCs w:val="20"/>
+              </w:rPr>
+              <w:t xml:space="preserve">Session 44</w:t>
+            </w:r>
+          </w:p>
+        </w:tc>
+        <w:tc>
+          <w:p>
+            <w:pPr>
+              <w:spacing w:after="40" w:before="40"/>
+            </w:pPr>
+            <w:r>
+              <w:rPr>
+                <w:b w:val="false"/>
+                <w:bCs w:val="false"/>
+                <w:color w:val="1D2D3E"/>
+                <w:sz w:val="20"/>
+                <w:szCs w:val="20"/>
+              </w:rPr>
+              <w:t xml:space="preserve">Dashboard AP/AR Aging Mini-Chart — AgingMiniBar with stacked bar + per-bucket legend, zero extra API calls</w:t>
+            </w:r>
+          </w:p>
+        </w:tc>
+        <w:tc>
+          <w:p>
+            <w:pPr>
+              <w:spacing w:after="40" w:before="40"/>
+            </w:pPr>
+            <w:r>
+              <w:rPr>
+                <w:b w:val="false"/>
+                <w:bCs w:val="false"/>
+                <w:color w:val="1D2D3E"/>
+                <w:sz w:val="20"/>
+                <w:szCs w:val="20"/>
+              </w:rPr>
+              <w:t xml:space="preserve">Done</w:t>
+            </w:r>
+          </w:p>
+        </w:tc>
+        <w:tc>
+          <w:p>
+            <w:pPr>
+              <w:spacing w:after="40" w:before="40"/>
+            </w:pPr>
+            <w:r>
+              <w:rPr>
+                <w:b w:val="false"/>
+                <w:bCs w:val="false"/>
+                <w:color w:val="1D2D3E"/>
+                <w:sz w:val="20"/>
+                <w:szCs w:val="20"/>
+              </w:rPr>
+              <w:t xml:space="preserve">DashboardScreen.tsx</w:t>
+            </w:r>
+          </w:p>
+        </w:tc>
+      </w:tr>
+      <w:tr>
+        <w:tc>
+          <w:tcPr>
+            <w:shd w:color="F0F4F8" w:val="solid"/>
+          </w:tcPr>
+          <w:p>
+            <w:pPr>
+              <w:spacing w:after="40" w:before="40"/>
+            </w:pPr>
+            <w:r>
+              <w:rPr>
+                <w:b w:val="false"/>
+                <w:bCs w:val="false"/>
+                <w:color w:val="1D2D3E"/>
+                <w:sz w:val="20"/>
+                <w:szCs w:val="20"/>
+              </w:rPr>
+              <w:t xml:space="preserve">Session 44</w:t>
+            </w:r>
+          </w:p>
+        </w:tc>
+        <w:tc>
+          <w:tcPr>
+            <w:shd w:color="F0F4F8" w:val="solid"/>
+          </w:tcPr>
+          <w:p>
+            <w:pPr>
+              <w:spacing w:after="40" w:before="40"/>
+            </w:pPr>
+            <w:r>
+              <w:rPr>
+                <w:b w:val="false"/>
+                <w:bCs w:val="false"/>
+                <w:color w:val="1D2D3E"/>
+                <w:sz w:val="20"/>
+                <w:szCs w:val="20"/>
+              </w:rPr>
+              <w:t xml:space="preserve">Flagged PDF date range — exportFlaggedBillsPDF/exportFlaggedInvoicesPDF accept fromISO/toISO; AP/AR screens pass active date range</w:t>
+            </w:r>
+          </w:p>
+        </w:tc>
+        <w:tc>
+          <w:tcPr>
+            <w:shd w:color="F0F4F8" w:val="solid"/>
+          </w:tcPr>
+          <w:p>
+            <w:pPr>
+              <w:spacing w:after="40" w:before="40"/>
+            </w:pPr>
+            <w:r>
+              <w:rPr>
+                <w:b w:val="false"/>
+                <w:bCs w:val="false"/>
+                <w:color w:val="1D2D3E"/>
+                <w:sz w:val="20"/>
+                <w:szCs w:val="20"/>
+              </w:rPr>
+              <w:t xml:space="preserve">Done</w:t>
+            </w:r>
+          </w:p>
+        </w:tc>
+        <w:tc>
+          <w:tcPr>
+            <w:shd w:color="F0F4F8" w:val="solid"/>
+          </w:tcPr>
+          <w:p>
+            <w:pPr>
+              <w:spacing w:after="40" w:before="40"/>
+            </w:pPr>
+            <w:r>
+              <w:rPr>
+                <w:b w:val="false"/>
+                <w:bCs w:val="false"/>
+                <w:color w:val="1D2D3E"/>
+                <w:sz w:val="20"/>
+                <w:szCs w:val="20"/>
+              </w:rPr>
+              <w:t xml:space="preserve">pdfExport.ts + AccountsPayableScreen.tsx + AccountsReceivableScreen.tsx</w:t>
+            </w:r>
+          </w:p>
+        </w:tc>
+      </w:tr>
+      <w:tr>
+        <w:tc>
+          <w:p>
+            <w:pPr>
+              <w:spacing w:after="40" w:before="40"/>
+            </w:pPr>
+            <w:r>
+              <w:rPr>
+                <w:b w:val="false"/>
+                <w:bCs w:val="false"/>
+                <w:color w:val="1D2D3E"/>
+                <w:sz w:val="20"/>
+                <w:szCs w:val="20"/>
+              </w:rPr>
+              <w:t xml:space="preserve">Session 44</w:t>
+            </w:r>
+          </w:p>
+        </w:tc>
+        <w:tc>
+          <w:p>
+            <w:pPr>
+              <w:spacing w:after="40" w:before="40"/>
+            </w:pPr>
+            <w:r>
+              <w:rPr>
+                <w:b w:val="false"/>
+                <w:bCs w:val="false"/>
+                <w:color w:val="1D2D3E"/>
+                <w:sz w:val="20"/>
+                <w:szCs w:val="20"/>
+              </w:rPr>
+              <w:t xml:space="preserve">FinancialAnalytics aging delta row — AgingDeltaRow shows per-bucket delta vs last daily snapshot below each aging card</w:t>
+            </w:r>
+          </w:p>
+        </w:tc>
+        <w:tc>
+          <w:p>
+            <w:pPr>
+              <w:spacing w:after="40" w:before="40"/>
+            </w:pPr>
+            <w:r>
+              <w:rPr>
+                <w:b w:val="false"/>
+                <w:bCs w:val="false"/>
+                <w:color w:val="1D2D3E"/>
+                <w:sz w:val="20"/>
+                <w:szCs w:val="20"/>
+              </w:rPr>
+              <w:t xml:space="preserve">Done</w:t>
+            </w:r>
+          </w:p>
+        </w:tc>
+        <w:tc>
+          <w:p>
+            <w:pPr>
+              <w:spacing w:after="40" w:before="40"/>
+            </w:pPr>
+            <w:r>
+              <w:rPr>
+                <w:b w:val="false"/>
+                <w:bCs w:val="false"/>
+                <w:color w:val="1D2D3E"/>
+                <w:sz w:val="20"/>
+                <w:szCs w:val="20"/>
+              </w:rPr>
+              <w:t xml:space="preserve">FinancialAnalyticsScreen.tsx</w:t>
+            </w:r>
+          </w:p>
+        </w:tc>
+      </w:tr>
+      <w:tr>
+        <w:tc>
+          <w:tcPr>
+            <w:shd w:color="F0F4F8" w:val="solid"/>
+          </w:tcPr>
+          <w:p>
+            <w:pPr>
+              <w:spacing w:after="40" w:before="40"/>
+            </w:pPr>
+            <w:r>
+              <w:rPr>
+                <w:b w:val="false"/>
+                <w:bCs w:val="false"/>
+                <w:color w:val="1D2D3E"/>
+                <w:sz w:val="20"/>
+                <w:szCs w:val="20"/>
+              </w:rPr>
+              <w:t xml:space="preserve">Session 44</w:t>
+            </w:r>
+          </w:p>
+        </w:tc>
+        <w:tc>
+          <w:tcPr>
+            <w:shd w:color="F0F4F8" w:val="solid"/>
+          </w:tcPr>
+          <w:p>
+            <w:pPr>
+              <w:spacing w:after="40" w:before="40"/>
+            </w:pPr>
+            <w:r>
+              <w:rPr>
+                <w:b w:val="false"/>
+                <w:bCs w:val="false"/>
+                <w:color w:val="1D2D3E"/>
+                <w:sz w:val="20"/>
+                <w:szCs w:val="20"/>
+              </w:rPr>
+              <w:t xml:space="preserve">agingSnapshot utility — save/load daily aging snapshot to AsyncStorage; skips overwrite if same calendar day</w:t>
+            </w:r>
+          </w:p>
+        </w:tc>
+        <w:tc>
+          <w:tcPr>
+            <w:shd w:color="F0F4F8" w:val="solid"/>
+          </w:tcPr>
+          <w:p>
+            <w:pPr>
+              <w:spacing w:after="40" w:before="40"/>
+            </w:pPr>
+            <w:r>
+              <w:rPr>
+                <w:b w:val="false"/>
+                <w:bCs w:val="false"/>
+                <w:color w:val="1D2D3E"/>
+                <w:sz w:val="20"/>
+                <w:szCs w:val="20"/>
+              </w:rPr>
+              <w:t xml:space="preserve">Done</w:t>
+            </w:r>
+          </w:p>
+        </w:tc>
+        <w:tc>
+          <w:tcPr>
+            <w:shd w:color="F0F4F8" w:val="solid"/>
+          </w:tcPr>
+          <w:p>
+            <w:pPr>
+              <w:spacing w:after="40" w:before="40"/>
+            </w:pPr>
+            <w:r>
+              <w:rPr>
+                <w:b w:val="false"/>
+                <w:bCs w:val="false"/>
+                <w:color w:val="1D2D3E"/>
+                <w:sz w:val="20"/>
+                <w:szCs w:val="20"/>
+              </w:rPr>
+              <w:t xml:space="preserve">utils/agingSnapshot.ts</w:t>
+            </w:r>
+          </w:p>
+        </w:tc>
+      </w:tr>
+      <w:tr>
+        <w:tc>
+          <w:p>
+            <w:pPr>
+              <w:spacing w:after="40" w:before="40"/>
+            </w:pPr>
+            <w:r>
+              <w:rPr>
+                <w:b w:val="false"/>
+                <w:bCs w:val="false"/>
+                <w:color w:val="1D2D3E"/>
+                <w:sz w:val="20"/>
+                <w:szCs w:val="20"/>
+              </w:rPr>
+              <w:t xml:space="preserve">Session 45</w:t>
+            </w:r>
+          </w:p>
+        </w:tc>
+        <w:tc>
+          <w:p>
+            <w:pPr>
+              <w:spacing w:after="40" w:before="40"/>
+            </w:pPr>
+            <w:r>
+              <w:rPr>
+                <w:b w:val="false"/>
+                <w:bCs w:val="false"/>
+                <w:color w:val="1D2D3E"/>
+                <w:sz w:val="20"/>
+                <w:szCs w:val="20"/>
+              </w:rPr>
+              <w:t xml:space="preserve">Journal Entries Summary Card — JESummaryCard shows total entries, Dr/Cr totals, and type-breakdown bar chart above voucher list</w:t>
+            </w:r>
+          </w:p>
+        </w:tc>
+        <w:tc>
+          <w:p>
+            <w:pPr>
+              <w:spacing w:after="40" w:before="40"/>
+            </w:pPr>
+            <w:r>
+              <w:rPr>
+                <w:b w:val="false"/>
+                <w:bCs w:val="false"/>
+                <w:color w:val="1D2D3E"/>
+                <w:sz w:val="20"/>
+                <w:szCs w:val="20"/>
+              </w:rPr>
+              <w:t xml:space="preserve">Done</w:t>
+            </w:r>
+          </w:p>
+        </w:tc>
+        <w:tc>
+          <w:p>
+            <w:pPr>
+              <w:spacing w:after="40" w:before="40"/>
+            </w:pPr>
+            <w:r>
+              <w:rPr>
+                <w:b w:val="false"/>
+                <w:bCs w:val="false"/>
+                <w:color w:val="1D2D3E"/>
+                <w:sz w:val="20"/>
+                <w:szCs w:val="20"/>
+              </w:rPr>
+              <w:t xml:space="preserve">JournalEntriesScreen.tsx</w:t>
+            </w:r>
+          </w:p>
+        </w:tc>
+      </w:tr>
+      <w:tr>
+        <w:tc>
+          <w:tcPr>
+            <w:shd w:color="F0F4F8" w:val="solid"/>
+          </w:tcPr>
+          <w:p>
+            <w:pPr>
+              <w:spacing w:after="40" w:before="40"/>
+            </w:pPr>
+            <w:r>
+              <w:rPr>
+                <w:b w:val="false"/>
+                <w:bCs w:val="false"/>
+                <w:color w:val="1D2D3E"/>
+                <w:sz w:val="20"/>
+                <w:szCs w:val="20"/>
+              </w:rPr>
+              <w:t xml:space="preserve">Session 45</w:t>
+            </w:r>
+          </w:p>
+        </w:tc>
+        <w:tc>
+          <w:tcPr>
+            <w:shd w:color="F0F4F8" w:val="solid"/>
+          </w:tcPr>
+          <w:p>
+            <w:pPr>
+              <w:spacing w:after="40" w:before="40"/>
+            </w:pPr>
+            <w:r>
+              <w:rPr>
+                <w:b w:val="false"/>
+                <w:bCs w:val="false"/>
+                <w:color w:val="1D2D3E"/>
+                <w:sz w:val="20"/>
+                <w:szCs w:val="20"/>
+              </w:rPr>
+              <w:t xml:space="preserve">FinancialAnalytics DSO/DPO/CCC Turnover Card — Days Sales Outstanding, Days Payable Outstanding, Cash Conversion Cycle tiles below Net Position</w:t>
+            </w:r>
+          </w:p>
+        </w:tc>
+        <w:tc>
+          <w:tcPr>
+            <w:shd w:color="F0F4F8" w:val="solid"/>
+          </w:tcPr>
+          <w:p>
+            <w:pPr>
+              <w:spacing w:after="40" w:before="40"/>
+            </w:pPr>
+            <w:r>
+              <w:rPr>
+                <w:b w:val="false"/>
+                <w:bCs w:val="false"/>
+                <w:color w:val="1D2D3E"/>
+                <w:sz w:val="20"/>
+                <w:szCs w:val="20"/>
+              </w:rPr>
+              <w:t xml:space="preserve">Done</w:t>
+            </w:r>
+          </w:p>
+        </w:tc>
+        <w:tc>
+          <w:tcPr>
+            <w:shd w:color="F0F4F8" w:val="solid"/>
+          </w:tcPr>
+          <w:p>
+            <w:pPr>
+              <w:spacing w:after="40" w:before="40"/>
+            </w:pPr>
+            <w:r>
+              <w:rPr>
+                <w:b w:val="false"/>
+                <w:bCs w:val="false"/>
+                <w:color w:val="1D2D3E"/>
+                <w:sz w:val="20"/>
+                <w:szCs w:val="20"/>
+              </w:rPr>
+              <w:t xml:space="preserve">FinancialAnalyticsScreen.tsx</w:t>
+            </w:r>
+          </w:p>
+        </w:tc>
+      </w:tr>
+      <w:tr>
+        <w:tc>
+          <w:p>
+            <w:pPr>
+              <w:spacing w:after="40" w:before="40"/>
+            </w:pPr>
+            <w:r>
+              <w:rPr>
+                <w:b w:val="false"/>
+                <w:bCs w:val="false"/>
+                <w:color w:val="1D2D3E"/>
+                <w:sz w:val="20"/>
+                <w:szCs w:val="20"/>
+              </w:rPr>
+              <w:t xml:space="preserve">Session 45</w:t>
+            </w:r>
+          </w:p>
+        </w:tc>
+        <w:tc>
+          <w:p>
+            <w:pPr>
+              <w:spacing w:after="40" w:before="40"/>
+            </w:pPr>
+            <w:r>
+              <w:rPr>
+                <w:b w:val="false"/>
+                <w:bCs w:val="false"/>
+                <w:color w:val="1D2D3E"/>
+                <w:sz w:val="20"/>
+                <w:szCs w:val="20"/>
+              </w:rPr>
+              <w:t xml:space="preserve">Procurement Analytics order value distribution histogram — &lt;10K / 10-50K / 50-100K / 100-500K / 500K+ buckets with PO vs SO grouped bars</w:t>
+            </w:r>
+          </w:p>
+        </w:tc>
+        <w:tc>
+          <w:p>
+            <w:pPr>
+              <w:spacing w:after="40" w:before="40"/>
+            </w:pPr>
+            <w:r>
+              <w:rPr>
+                <w:b w:val="false"/>
+                <w:bCs w:val="false"/>
+                <w:color w:val="1D2D3E"/>
+                <w:sz w:val="20"/>
+                <w:szCs w:val="20"/>
+              </w:rPr>
+              <w:t xml:space="preserve">Done</w:t>
+            </w:r>
+          </w:p>
+        </w:tc>
+        <w:tc>
+          <w:p>
+            <w:pPr>
+              <w:spacing w:after="40" w:before="40"/>
+            </w:pPr>
+            <w:r>
+              <w:rPr>
+                <w:b w:val="false"/>
+                <w:bCs w:val="false"/>
+                <w:color w:val="1D2D3E"/>
+                <w:sz w:val="20"/>
+                <w:szCs w:val="20"/>
+              </w:rPr>
+              <w:t xml:space="preserve">ProcurementAnalyticsScreen.tsx</w:t>
+            </w:r>
+          </w:p>
+        </w:tc>
+      </w:tr>
     </w:tbl>
     <w:p>
       <w:pPr>
@@ -31184,6 +31710,492 @@
           <w:szCs w:val="22"/>
         </w:rPr>
         <w:t xml:space="preserve">  Tapping a history row repopulates the query field</w:t>
+      </w:r>
+    </w:p>
+    <w:p>
+      <w:pPr>
+        <w:spacing w:after="80"/>
+      </w:pPr>
+      <w:r>
+        <w:rPr>
+          <w:color w:val="1D2D3E"/>
+          <w:sz w:val="22"/>
+          <w:szCs w:val="22"/>
+        </w:rPr>
+        <w:t xml:space="preserve"/>
+      </w:r>
+    </w:p>
+    <w:p>
+      <w:pPr>
+        <w:pStyle w:val="Heading2"/>
+        <w:spacing w:after="120" w:before="300"/>
+      </w:pPr>
+      <w:r>
+        <w:rPr>
+          <w:b/>
+          <w:bCs/>
+          <w:color w:val="1D2D3E"/>
+        </w:rPr>
+        <w:t xml:space="preserve">Session 45 — 2026-06-07</w:t>
+      </w:r>
+    </w:p>
+    <w:p>
+      <w:pPr>
+        <w:pStyle w:val="ListParagraph"/>
+        <w:numPr>
+          <w:ilvl w:val="0"/>
+          <w:numId w:val="1"/>
+        </w:numPr>
+        <w:spacing w:after="40"/>
+      </w:pPr>
+      <w:r>
+        <w:rPr>
+          <w:color w:val="1D2D3E"/>
+          <w:sz w:val="22"/>
+          <w:szCs w:val="22"/>
+        </w:rPr>
+        <w:t xml:space="preserve">Journal Entries Summary Card (JournalEntriesScreen.tsx)</w:t>
+      </w:r>
+    </w:p>
+    <w:p>
+      <w:pPr>
+        <w:pStyle w:val="ListParagraph"/>
+        <w:numPr>
+          <w:ilvl w:val="1"/>
+          <w:numId w:val="1"/>
+        </w:numPr>
+        <w:spacing w:after="40"/>
+      </w:pPr>
+      <w:r>
+        <w:rPr>
+          <w:color w:val="1D2D3E"/>
+          <w:sz w:val="22"/>
+          <w:szCs w:val="22"/>
+        </w:rPr>
+        <w:t xml:space="preserve">  JESummaryCard renders above the voucher list when filtered entries &gt; 0</w:t>
+      </w:r>
+    </w:p>
+    <w:p>
+      <w:pPr>
+        <w:pStyle w:val="ListParagraph"/>
+        <w:numPr>
+          <w:ilvl w:val="1"/>
+          <w:numId w:val="1"/>
+        </w:numPr>
+        <w:spacing w:after="40"/>
+      </w:pPr>
+      <w:r>
+        <w:rPr>
+          <w:color w:val="1D2D3E"/>
+          <w:sz w:val="22"/>
+          <w:szCs w:val="22"/>
+        </w:rPr>
+        <w:t xml:space="preserve">  Shows: total entry count, total debit (compact K/M), total credit; type-breakdown bar chart (top 6 types by count)</w:t>
+      </w:r>
+    </w:p>
+    <w:p>
+      <w:pPr>
+        <w:pStyle w:val="ListParagraph"/>
+        <w:numPr>
+          <w:ilvl w:val="1"/>
+          <w:numId w:val="1"/>
+        </w:numPr>
+        <w:spacing w:after="40"/>
+      </w:pPr>
+      <w:r>
+        <w:rPr>
+          <w:color w:val="1D2D3E"/>
+          <w:sz w:val="22"/>
+          <w:szCs w:val="22"/>
+        </w:rPr>
+        <w:t xml:space="preserve">  fmtCompactJE() helper for compact number formatting; no extra API calls — uses already-loaded filtered list</w:t>
+      </w:r>
+    </w:p>
+    <w:p>
+      <w:pPr>
+        <w:pStyle w:val="ListParagraph"/>
+        <w:numPr>
+          <w:ilvl w:val="0"/>
+          <w:numId w:val="1"/>
+        </w:numPr>
+        <w:spacing w:after="40"/>
+      </w:pPr>
+      <w:r>
+        <w:rPr>
+          <w:color w:val="1D2D3E"/>
+          <w:sz w:val="22"/>
+          <w:szCs w:val="22"/>
+        </w:rPr>
+        <w:t xml:space="preserve">FinancialAnalytics DSO/DPO/CCC Turnover Card (FinancialAnalyticsScreen.tsx)</w:t>
+      </w:r>
+    </w:p>
+    <w:p>
+      <w:pPr>
+        <w:pStyle w:val="ListParagraph"/>
+        <w:numPr>
+          <w:ilvl w:val="1"/>
+          <w:numId w:val="1"/>
+        </w:numPr>
+        <w:spacing w:after="40"/>
+      </w:pPr>
+      <w:r>
+        <w:rPr>
+          <w:color w:val="1D2D3E"/>
+          <w:sz w:val="22"/>
+          <w:szCs w:val="22"/>
+        </w:rPr>
+        <w:t xml:space="preserve">  computeTurnoverMetrics(): DSO = (AR outstanding / 6-month avg monthly AR billed) × 30</w:t>
+      </w:r>
+    </w:p>
+    <w:p>
+      <w:pPr>
+        <w:pStyle w:val="ListParagraph"/>
+        <w:numPr>
+          <w:ilvl w:val="1"/>
+          <w:numId w:val="1"/>
+        </w:numPr>
+        <w:spacing w:after="40"/>
+      </w:pPr>
+      <w:r>
+        <w:rPr>
+          <w:color w:val="1D2D3E"/>
+          <w:sz w:val="22"/>
+          <w:szCs w:val="22"/>
+        </w:rPr>
+        <w:t xml:space="preserve">  DPO = (AP outstanding / 6-month avg monthly AP billed) × 30; CCC = DSO − DPO</w:t>
+      </w:r>
+    </w:p>
+    <w:p>
+      <w:pPr>
+        <w:pStyle w:val="ListParagraph"/>
+        <w:numPr>
+          <w:ilvl w:val="1"/>
+          <w:numId w:val="1"/>
+        </w:numPr>
+        <w:spacing w:after="40"/>
+      </w:pPr>
+      <w:r>
+        <w:rPr>
+          <w:color w:val="1D2D3E"/>
+          <w:sz w:val="22"/>
+          <w:szCs w:val="22"/>
+        </w:rPr>
+        <w:t xml:space="preserve">  TurnoverCard: three-tile card (DSO / DPO / CCC) below Net Position; hint text explains cash position</w:t>
+      </w:r>
+    </w:p>
+    <w:p>
+      <w:pPr>
+        <w:pStyle w:val="ListParagraph"/>
+        <w:numPr>
+          <w:ilvl w:val="1"/>
+          <w:numId w:val="1"/>
+        </w:numPr>
+        <w:spacing w:after="40"/>
+      </w:pPr>
+      <w:r>
+        <w:rPr>
+          <w:color w:val="1D2D3E"/>
+          <w:sz w:val="22"/>
+          <w:szCs w:val="22"/>
+        </w:rPr>
+        <w:t xml:space="preserve">  CCC positive (red) = collecting slower than paying; negative (green) = healthy cash cycle</w:t>
+      </w:r>
+    </w:p>
+    <w:p>
+      <w:pPr>
+        <w:pStyle w:val="ListParagraph"/>
+        <w:numPr>
+          <w:ilvl w:val="0"/>
+          <w:numId w:val="1"/>
+        </w:numPr>
+        <w:spacing w:after="40"/>
+      </w:pPr>
+      <w:r>
+        <w:rPr>
+          <w:color w:val="1D2D3E"/>
+          <w:sz w:val="22"/>
+          <w:szCs w:val="22"/>
+        </w:rPr>
+        <w:t xml:space="preserve">Procurement Analytics Order Value Distribution (ProcurementAnalyticsScreen.tsx)</w:t>
+      </w:r>
+    </w:p>
+    <w:p>
+      <w:pPr>
+        <w:pStyle w:val="ListParagraph"/>
+        <w:numPr>
+          <w:ilvl w:val="1"/>
+          <w:numId w:val="1"/>
+        </w:numPr>
+        <w:spacing w:after="40"/>
+      </w:pPr>
+      <w:r>
+        <w:rPr>
+          <w:color w:val="1D2D3E"/>
+          <w:sz w:val="22"/>
+          <w:szCs w:val="22"/>
+        </w:rPr>
+        <w:t xml:space="preserve">  VALUE_BUCKETS: &lt;10K, 10-50K, 50-100K, 100-500K, 500K+ order size ranges</w:t>
+      </w:r>
+    </w:p>
+    <w:p>
+      <w:pPr>
+        <w:pStyle w:val="ListParagraph"/>
+        <w:numPr>
+          <w:ilvl w:val="1"/>
+          <w:numId w:val="1"/>
+        </w:numPr>
+        <w:spacing w:after="40"/>
+      </w:pPr>
+      <w:r>
+        <w:rPr>
+          <w:color w:val="1D2D3E"/>
+          <w:sz w:val="22"/>
+          <w:szCs w:val="22"/>
+        </w:rPr>
+        <w:t xml:space="preserve">  computeValueDistribution(): counts PO and SO entries per bucket from raw data — zero extra API calls</w:t>
+      </w:r>
+    </w:p>
+    <w:p>
+      <w:pPr>
+        <w:pStyle w:val="ListParagraph"/>
+        <w:numPr>
+          <w:ilvl w:val="1"/>
+          <w:numId w:val="1"/>
+        </w:numPr>
+        <w:spacing w:after="40"/>
+      </w:pPr>
+      <w:r>
+        <w:rPr>
+          <w:color w:val="1D2D3E"/>
+          <w:sz w:val="22"/>
+          <w:szCs w:val="22"/>
+        </w:rPr>
+        <w:t xml:space="preserve">  ValueDistributionChart: vertical grouped bar chart (dark=PO, muted=SO) with bucket total labels</w:t>
+      </w:r>
+    </w:p>
+    <w:p>
+      <w:pPr>
+        <w:pStyle w:val="ListParagraph"/>
+        <w:numPr>
+          <w:ilvl w:val="1"/>
+          <w:numId w:val="1"/>
+        </w:numPr>
+        <w:spacing w:after="40"/>
+      </w:pPr>
+      <w:r>
+        <w:rPr>
+          <w:color w:val="1D2D3E"/>
+          <w:sz w:val="22"/>
+          <w:szCs w:val="22"/>
+        </w:rPr>
+        <w:t xml:space="preserve">  Hidden when no orders loaded; inserted after SO Status breakdown before footer</w:t>
+      </w:r>
+    </w:p>
+    <w:p>
+      <w:pPr>
+        <w:spacing w:after="80"/>
+      </w:pPr>
+      <w:r>
+        <w:rPr>
+          <w:color w:val="1D2D3E"/>
+          <w:sz w:val="22"/>
+          <w:szCs w:val="22"/>
+        </w:rPr>
+        <w:t xml:space="preserve"/>
+      </w:r>
+    </w:p>
+    <w:p>
+      <w:pPr>
+        <w:pStyle w:val="Heading2"/>
+        <w:spacing w:after="120" w:before="300"/>
+      </w:pPr>
+      <w:r>
+        <w:rPr>
+          <w:b/>
+          <w:bCs/>
+          <w:color w:val="1D2D3E"/>
+        </w:rPr>
+        <w:t xml:space="preserve">Session 44 — 2026-06-07</w:t>
+      </w:r>
+    </w:p>
+    <w:p>
+      <w:pPr>
+        <w:pStyle w:val="ListParagraph"/>
+        <w:numPr>
+          <w:ilvl w:val="0"/>
+          <w:numId w:val="1"/>
+        </w:numPr>
+        <w:spacing w:after="40"/>
+      </w:pPr>
+      <w:r>
+        <w:rPr>
+          <w:color w:val="1D2D3E"/>
+          <w:sz w:val="22"/>
+          <w:szCs w:val="22"/>
+        </w:rPr>
+        <w:t xml:space="preserve">Dashboard AP/AR Aging Mini-Chart (DashboardScreen.tsx)</w:t>
+      </w:r>
+    </w:p>
+    <w:p>
+      <w:pPr>
+        <w:pStyle w:val="ListParagraph"/>
+        <w:numPr>
+          <w:ilvl w:val="1"/>
+          <w:numId w:val="1"/>
+        </w:numPr>
+        <w:spacing w:after="40"/>
+      </w:pPr>
+      <w:r>
+        <w:rPr>
+          <w:color w:val="1D2D3E"/>
+          <w:sz w:val="22"/>
+          <w:szCs w:val="22"/>
+        </w:rPr>
+        <w:t xml:space="preserve">  computeClientAging(): builds AP and AR aging buckets from all unpaid bills/invoices in useFocusEffect — zero extra API calls</w:t>
+      </w:r>
+    </w:p>
+    <w:p>
+      <w:pPr>
+        <w:pStyle w:val="ListParagraph"/>
+        <w:numPr>
+          <w:ilvl w:val="1"/>
+          <w:numId w:val="1"/>
+        </w:numPr>
+        <w:spacing w:after="40"/>
+      </w:pPr>
+      <w:r>
+        <w:rPr>
+          <w:color w:val="1D2D3E"/>
+          <w:sz w:val="22"/>
+          <w:szCs w:val="22"/>
+        </w:rPr>
+        <w:t xml:space="preserve">  AgingMiniBar: compact stacked bar with per-bucket legend; card placed between Finance Status and Top Vendors</w:t>
+      </w:r>
+    </w:p>
+    <w:p>
+      <w:pPr>
+        <w:pStyle w:val="ListParagraph"/>
+        <w:numPr>
+          <w:ilvl w:val="0"/>
+          <w:numId w:val="1"/>
+        </w:numPr>
+        <w:spacing w:after="40"/>
+      </w:pPr>
+      <w:r>
+        <w:rPr>
+          <w:color w:val="1D2D3E"/>
+          <w:sz w:val="22"/>
+          <w:szCs w:val="22"/>
+        </w:rPr>
+        <w:t xml:space="preserve">Flagged PDF date range (pdfExport.ts + AP/AR screens)</w:t>
+      </w:r>
+    </w:p>
+    <w:p>
+      <w:pPr>
+        <w:pStyle w:val="ListParagraph"/>
+        <w:numPr>
+          <w:ilvl w:val="1"/>
+          <w:numId w:val="1"/>
+        </w:numPr>
+        <w:spacing w:after="40"/>
+      </w:pPr>
+      <w:r>
+        <w:rPr>
+          <w:color w:val="1D2D3E"/>
+          <w:sz w:val="22"/>
+          <w:szCs w:val="22"/>
+        </w:rPr>
+        <w:t xml:space="preserve">  exportFlaggedBillsPDF / exportFlaggedInvoicesPDF accept optional fromISO/toISO params</w:t>
+      </w:r>
+    </w:p>
+    <w:p>
+      <w:pPr>
+        <w:pStyle w:val="ListParagraph"/>
+        <w:numPr>
+          <w:ilvl w:val="1"/>
+          <w:numId w:val="1"/>
+        </w:numPr>
+        <w:spacing w:after="40"/>
+      </w:pPr>
+      <w:r>
+        <w:rPr>
+          <w:color w:val="1D2D3E"/>
+          <w:sz w:val="22"/>
+          <w:szCs w:val="22"/>
+        </w:rPr>
+        <w:t xml:space="preserve">  Date range appears in PDF header meta line; AP/AR screens pass their active billDateRange/invDateRange</w:t>
+      </w:r>
+    </w:p>
+    <w:p>
+      <w:pPr>
+        <w:pStyle w:val="ListParagraph"/>
+        <w:numPr>
+          <w:ilvl w:val="0"/>
+          <w:numId w:val="1"/>
+        </w:numPr>
+        <w:spacing w:after="40"/>
+      </w:pPr>
+      <w:r>
+        <w:rPr>
+          <w:color w:val="1D2D3E"/>
+          <w:sz w:val="22"/>
+          <w:szCs w:val="22"/>
+        </w:rPr>
+        <w:t xml:space="preserve">FinancialAnalytics aging delta row (FinancialAnalyticsScreen.tsx + utils/agingSnapshot.ts)</w:t>
+      </w:r>
+    </w:p>
+    <w:p>
+      <w:pPr>
+        <w:pStyle w:val="ListParagraph"/>
+        <w:numPr>
+          <w:ilvl w:val="1"/>
+          <w:numId w:val="1"/>
+        </w:numPr>
+        <w:spacing w:after="40"/>
+      </w:pPr>
+      <w:r>
+        <w:rPr>
+          <w:color w:val="1D2D3E"/>
+          <w:sz w:val="22"/>
+          <w:szCs w:val="22"/>
+        </w:rPr>
+        <w:t xml:space="preserve">  saveAgingSnapshot(): saves daily AP+AR aging fields to AsyncStorage; skips overwrite if same calendar day</w:t>
+      </w:r>
+    </w:p>
+    <w:p>
+      <w:pPr>
+        <w:pStyle w:val="ListParagraph"/>
+        <w:numPr>
+          <w:ilvl w:val="1"/>
+          <w:numId w:val="1"/>
+        </w:numPr>
+        <w:spacing w:after="40"/>
+      </w:pPr>
+      <w:r>
+        <w:rPr>
+          <w:color w:val="1D2D3E"/>
+          <w:sz w:val="22"/>
+          <w:szCs w:val="22"/>
+        </w:rPr>
+        <w:t xml:space="preserve">  loadAgingSnapshot(): retrieves previous day's snapshot for comparison</w:t>
+      </w:r>
+    </w:p>
+    <w:p>
+      <w:pPr>
+        <w:pStyle w:val="ListParagraph"/>
+        <w:numPr>
+          <w:ilvl w:val="1"/>
+          <w:numId w:val="1"/>
+        </w:numPr>
+        <w:spacing w:after="40"/>
+      </w:pPr>
+      <w:r>
+        <w:rPr>
+          <w:color w:val="1D2D3E"/>
+          <w:sz w:val="22"/>
+          <w:szCs w:val="22"/>
+        </w:rPr>
+        <w:t xml:space="preserve">  AgingDeltaRow: per-bucket +/− delta vs last snapshot with compact K/M formatting below each aging card</w:t>
       </w:r>
     </w:p>
     <w:p>

</xml_diff>

<commit_message>
docs(session-46): update PROGRESS.md, generate-docs.js, and FEATURES.docx with Session 46 changelog
- PROGRESS.md: Session 46 entry with Dr/Cr flow chart, StockVelocity card, Upcoming Cash card
- generate-docs.js: roadmap rows + sections 3.65/3.66/3.67 + Session 46 changelog entry
- FEATURES.docx: regenerated
</commit_message>
<xml_diff>
--- a/FEATURES.docx
+++ b/FEATURES.docx
@@ -45,7 +45,7 @@
           <w:sz w:val="20"/>
           <w:szCs w:val="20"/>
         </w:rPr>
-        <w:t xml:space="preserve">Generated: 2026-06-07</w:t>
+        <w:t xml:space="preserve">Generated: 2026-06-08</w:t>
       </w:r>
     </w:p>
     <w:p>
@@ -12288,6 +12288,393 @@
           <w:bCs/>
           <w:color w:val="1D2D3E"/>
         </w:rPr>
+        <w:t xml:space="preserve">3.65 Journal Entries Dr/Cr Monthly Flow Chart (Session 46)</w:t>
+      </w:r>
+    </w:p>
+    <w:p>
+      <w:pPr>
+        <w:pStyle w:val="ListParagraph"/>
+        <w:numPr>
+          <w:ilvl w:val="0"/>
+          <w:numId w:val="1"/>
+        </w:numPr>
+        <w:spacing w:after="40"/>
+      </w:pPr>
+      <w:r>
+        <w:rPr>
+          <w:color w:val="1D2D3E"/>
+          <w:sz w:val="22"/>
+          <w:szCs w:val="22"/>
+        </w:rPr>
+        <w:t xml:space="preserve">buildMonthBuckets(): builds a 6-element array for the last 6 calendar months; groups entries by dt.slice(0,7) year-month key</w:t>
+      </w:r>
+    </w:p>
+    <w:p>
+      <w:pPr>
+        <w:pStyle w:val="ListParagraph"/>
+        <w:numPr>
+          <w:ilvl w:val="0"/>
+          <w:numId w:val="1"/>
+        </w:numPr>
+        <w:spacing w:after="40"/>
+      </w:pPr>
+      <w:r>
+        <w:rPr>
+          <w:color w:val="1D2D3E"/>
+          <w:sz w:val="22"/>
+          <w:szCs w:val="22"/>
+        </w:rPr>
+        <w:t xml:space="preserve">DrCrFlowChart component: compact grouped bars (dark=Dr, muted=Cr); BAR_HEIGHT=48px; proportional heights per month</w:t>
+      </w:r>
+    </w:p>
+    <w:p>
+      <w:pPr>
+        <w:pStyle w:val="ListParagraph"/>
+        <w:numPr>
+          <w:ilvl w:val="1"/>
+          <w:numId w:val="1"/>
+        </w:numPr>
+        <w:spacing w:after="40"/>
+      </w:pPr>
+      <w:r>
+        <w:rPr>
+          <w:color w:val="1D2D3E"/>
+          <w:sz w:val="22"/>
+          <w:szCs w:val="22"/>
+        </w:rPr>
+        <w:t xml:space="preserve">  Legend row at top (Dr/Cr colored dots + labels); month abbreviation labels below each column</w:t>
+      </w:r>
+    </w:p>
+    <w:p>
+      <w:pPr>
+        <w:pStyle w:val="ListParagraph"/>
+        <w:numPr>
+          <w:ilvl w:val="1"/>
+          <w:numId w:val="1"/>
+        </w:numPr>
+        <w:spacing w:after="40"/>
+      </w:pPr>
+      <w:r>
+        <w:rPr>
+          <w:color w:val="1D2D3E"/>
+          <w:sz w:val="22"/>
+          <w:szCs w:val="22"/>
+        </w:rPr>
+        <w:t xml:space="preserve">  Returns null when all months have zero debit+credit — no visual noise when entries lack dt fields</w:t>
+      </w:r>
+    </w:p>
+    <w:p>
+      <w:pPr>
+        <w:pStyle w:val="ListParagraph"/>
+        <w:numPr>
+          <w:ilvl w:val="0"/>
+          <w:numId w:val="1"/>
+        </w:numPr>
+        <w:spacing w:after="40"/>
+      </w:pPr>
+      <w:r>
+        <w:rPr>
+          <w:color w:val="1D2D3E"/>
+          <w:sz w:val="22"/>
+          <w:szCs w:val="22"/>
+        </w:rPr>
+        <w:t xml:space="preserve">Rendered as the last section inside JESummaryCard, after the type breakdown grid; zero extra API calls</w:t>
+      </w:r>
+    </w:p>
+    <w:p>
+      <w:pPr>
+        <w:spacing w:after="80"/>
+      </w:pPr>
+      <w:r>
+        <w:rPr>
+          <w:color w:val="1D2D3E"/>
+          <w:sz w:val="22"/>
+          <w:szCs w:val="22"/>
+        </w:rPr>
+        <w:t xml:space="preserve"/>
+      </w:r>
+    </w:p>
+    <w:p>
+      <w:pPr>
+        <w:pStyle w:val="Heading2"/>
+        <w:spacing w:after="120" w:before="300"/>
+      </w:pPr>
+      <w:r>
+        <w:rPr>
+          <w:b/>
+          <w:bCs/>
+          <w:color w:val="1D2D3E"/>
+        </w:rPr>
+        <w:t xml:space="preserve">3.66 StockHealth Stock Velocity Card (Session 46)</w:t>
+      </w:r>
+    </w:p>
+    <w:p>
+      <w:pPr>
+        <w:pStyle w:val="ListParagraph"/>
+        <w:numPr>
+          <w:ilvl w:val="0"/>
+          <w:numId w:val="1"/>
+        </w:numPr>
+        <w:spacing w:after="40"/>
+      </w:pPr>
+      <w:r>
+        <w:rPr>
+          <w:color w:val="1D2D3E"/>
+          <w:sz w:val="22"/>
+          <w:szCs w:val="22"/>
+        </w:rPr>
+        <w:t xml:space="preserve">computeVelocity(): aggregates StockLedgerEntry rows by item_name; totalMovement = qty_in + qty_out; top 8 by totalMovement</w:t>
+      </w:r>
+    </w:p>
+    <w:p>
+      <w:pPr>
+        <w:pStyle w:val="ListParagraph"/>
+        <w:numPr>
+          <w:ilvl w:val="0"/>
+          <w:numId w:val="1"/>
+        </w:numPr>
+        <w:spacing w:after="40"/>
+      </w:pPr>
+      <w:r>
+        <w:rPr>
+          <w:color w:val="1D2D3E"/>
+          <w:sz w:val="22"/>
+          <w:szCs w:val="22"/>
+        </w:rPr>
+        <w:t xml:space="preserve">fetchStockLedger({ companyId }) called in load() alongside stock/warehouses; result cached under stock-velocity:* key</w:t>
+      </w:r>
+    </w:p>
+    <w:p>
+      <w:pPr>
+        <w:pStyle w:val="ListParagraph"/>
+        <w:numPr>
+          <w:ilvl w:val="1"/>
+          <w:numId w:val="1"/>
+        </w:numPr>
+        <w:spacing w:after="40"/>
+      </w:pPr>
+      <w:r>
+        <w:rPr>
+          <w:color w:val="1D2D3E"/>
+          <w:sz w:val="22"/>
+          <w:szCs w:val="22"/>
+        </w:rPr>
+        <w:t xml:space="preserve">  On subsequent loads, both health cache and velocity cache are read simultaneously — instant render from cache</w:t>
+      </w:r>
+    </w:p>
+    <w:p>
+      <w:pPr>
+        <w:pStyle w:val="ListParagraph"/>
+        <w:numPr>
+          <w:ilvl w:val="0"/>
+          <w:numId w:val="1"/>
+        </w:numPr>
+        <w:spacing w:after="40"/>
+      </w:pPr>
+      <w:r>
+        <w:rPr>
+          <w:color w:val="1D2D3E"/>
+          <w:sz w:val="22"/>
+          <w:szCs w:val="22"/>
+        </w:rPr>
+        <w:t xml:space="preserve">VelocityCard: ranked list showing item name, stacked proportional bar (dark segment = IN / muted segment = OUT), and IN/OUT numeric totals</w:t>
+      </w:r>
+    </w:p>
+    <w:p>
+      <w:pPr>
+        <w:pStyle w:val="ListParagraph"/>
+        <w:numPr>
+          <w:ilvl w:val="0"/>
+          <w:numId w:val="1"/>
+        </w:numPr>
+        <w:spacing w:after="40"/>
+      </w:pPr>
+      <w:r>
+        <w:rPr>
+          <w:color w:val="1D2D3E"/>
+          <w:sz w:val="22"/>
+          <w:szCs w:val="22"/>
+        </w:rPr>
+        <w:t xml:space="preserve">Placed between Top Items by Quantity and Warehouse Distribution sections; only visible when velocityItems.length &gt; 0</w:t>
+      </w:r>
+    </w:p>
+    <w:p>
+      <w:pPr>
+        <w:spacing w:after="80"/>
+      </w:pPr>
+      <w:r>
+        <w:rPr>
+          <w:color w:val="1D2D3E"/>
+          <w:sz w:val="22"/>
+          <w:szCs w:val="22"/>
+        </w:rPr>
+        <w:t xml:space="preserve"/>
+      </w:r>
+    </w:p>
+    <w:p>
+      <w:pPr>
+        <w:pStyle w:val="Heading2"/>
+        <w:spacing w:after="120" w:before="300"/>
+      </w:pPr>
+      <w:r>
+        <w:rPr>
+          <w:b/>
+          <w:bCs/>
+          <w:color w:val="1D2D3E"/>
+        </w:rPr>
+        <w:t xml:space="preserve">3.67 Dashboard Upcoming Cash Flow Summary Card (Session 46)</w:t>
+      </w:r>
+    </w:p>
+    <w:p>
+      <w:pPr>
+        <w:pStyle w:val="ListParagraph"/>
+        <w:numPr>
+          <w:ilvl w:val="0"/>
+          <w:numId w:val="1"/>
+        </w:numPr>
+        <w:spacing w:after="40"/>
+      </w:pPr>
+      <w:r>
+        <w:rPr>
+          <w:color w:val="1D2D3E"/>
+          <w:sz w:val="22"/>
+          <w:szCs w:val="22"/>
+        </w:rPr>
+        <w:t xml:space="preserve">3-tile horizontal card: AP Outflow (left) | Net (center) | AR Inflow (right)</w:t>
+      </w:r>
+    </w:p>
+    <w:p>
+      <w:pPr>
+        <w:pStyle w:val="ListParagraph"/>
+        <w:numPr>
+          <w:ilvl w:val="0"/>
+          <w:numId w:val="1"/>
+        </w:numPr>
+        <w:spacing w:after="40"/>
+      </w:pPr>
+      <w:r>
+        <w:rPr>
+          <w:color w:val="1D2D3E"/>
+          <w:sz w:val="22"/>
+          <w:szCs w:val="22"/>
+        </w:rPr>
+        <w:t xml:space="preserve">Computed from existing dueSoonBills and dueSoonInvoices state — zero extra API calls</w:t>
+      </w:r>
+    </w:p>
+    <w:p>
+      <w:pPr>
+        <w:pStyle w:val="ListParagraph"/>
+        <w:numPr>
+          <w:ilvl w:val="1"/>
+          <w:numId w:val="1"/>
+        </w:numPr>
+        <w:spacing w:after="40"/>
+      </w:pPr>
+      <w:r>
+        <w:rPr>
+          <w:color w:val="1D2D3E"/>
+          <w:sz w:val="22"/>
+          <w:szCs w:val="22"/>
+        </w:rPr>
+        <w:t xml:space="preserve">  AP outflow = sum of outstanding for all dueSoonBills; AR inflow = sum of outstanding for all dueSoonInvoices</w:t>
+      </w:r>
+    </w:p>
+    <w:p>
+      <w:pPr>
+        <w:pStyle w:val="ListParagraph"/>
+        <w:numPr>
+          <w:ilvl w:val="1"/>
+          <w:numId w:val="1"/>
+        </w:numPr>
+        <w:spacing w:after="40"/>
+      </w:pPr>
+      <w:r>
+        <w:rPr>
+          <w:color w:val="1D2D3E"/>
+          <w:sz w:val="22"/>
+          <w:szCs w:val="22"/>
+        </w:rPr>
+        <w:t xml:space="preserve">  Net = AR inflow − AP outflow; positive=dark text with 'inflow' hint; negative=muted text with 'outflow' hint</w:t>
+      </w:r>
+    </w:p>
+    <w:p>
+      <w:pPr>
+        <w:pStyle w:val="ListParagraph"/>
+        <w:numPr>
+          <w:ilvl w:val="0"/>
+          <w:numId w:val="1"/>
+        </w:numPr>
+        <w:spacing w:after="40"/>
+      </w:pPr>
+      <w:r>
+        <w:rPr>
+          <w:color w:val="1D2D3E"/>
+          <w:sz w:val="22"/>
+          <w:szCs w:val="22"/>
+        </w:rPr>
+        <w:t xml:space="preserve">fmtK() inline helper formats amounts as K/M abbreviations for compact tile display</w:t>
+      </w:r>
+    </w:p>
+    <w:p>
+      <w:pPr>
+        <w:pStyle w:val="ListParagraph"/>
+        <w:numPr>
+          <w:ilvl w:val="0"/>
+          <w:numId w:val="1"/>
+        </w:numPr>
+        <w:spacing w:after="40"/>
+      </w:pPr>
+      <w:r>
+        <w:rPr>
+          <w:color w:val="1D2D3E"/>
+          <w:sz w:val="22"/>
+          <w:szCs w:val="22"/>
+        </w:rPr>
+        <w:t xml:space="preserve">AP tile taps → AccountsPayable screen; AR tile taps → AccountsReceivable screen; center tile is static</w:t>
+      </w:r>
+    </w:p>
+    <w:p>
+      <w:pPr>
+        <w:pStyle w:val="ListParagraph"/>
+        <w:numPr>
+          <w:ilvl w:val="0"/>
+          <w:numId w:val="1"/>
+        </w:numPr>
+        <w:spacing w:after="40"/>
+      </w:pPr>
+      <w:r>
+        <w:rPr>
+          <w:color w:val="1D2D3E"/>
+          <w:sz w:val="22"/>
+          <w:szCs w:val="22"/>
+        </w:rPr>
+        <w:t xml:space="preserve">Placed between Top Customers section and per-item Upcoming Payments list; hidden when no due-soon data</w:t>
+      </w:r>
+    </w:p>
+    <w:p>
+      <w:pPr>
+        <w:spacing w:after="80"/>
+      </w:pPr>
+      <w:r>
+        <w:rPr>
+          <w:color w:val="1D2D3E"/>
+          <w:sz w:val="22"/>
+          <w:szCs w:val="22"/>
+        </w:rPr>
+        <w:t xml:space="preserve"/>
+      </w:r>
+    </w:p>
+    <w:p>
+      <w:pPr>
+        <w:pStyle w:val="Heading2"/>
+        <w:spacing w:after="120" w:before="300"/>
+      </w:pPr>
+      <w:r>
+        <w:rPr>
+          <w:b/>
+          <w:bCs/>
+          <w:color w:val="1D2D3E"/>
+        </w:rPr>
         <w:t xml:space="preserve">3.64 FinancialAnalytics 6-Month AP vs AR Monthly Trend Chart (Session 43)</w:t>
       </w:r>
     </w:p>
@@ -26628,6 +27015,240 @@
           </w:p>
         </w:tc>
       </w:tr>
+      <w:tr>
+        <w:tc>
+          <w:tcPr>
+            <w:shd w:color="F0F4F8" w:val="solid"/>
+          </w:tcPr>
+          <w:p>
+            <w:pPr>
+              <w:spacing w:after="40" w:before="40"/>
+            </w:pPr>
+            <w:r>
+              <w:rPr>
+                <w:b w:val="false"/>
+                <w:bCs w:val="false"/>
+                <w:color w:val="1D2D3E"/>
+                <w:sz w:val="20"/>
+                <w:szCs w:val="20"/>
+              </w:rPr>
+              <w:t xml:space="preserve">Session 46</w:t>
+            </w:r>
+          </w:p>
+        </w:tc>
+        <w:tc>
+          <w:tcPr>
+            <w:shd w:color="F0F4F8" w:val="solid"/>
+          </w:tcPr>
+          <w:p>
+            <w:pPr>
+              <w:spacing w:after="40" w:before="40"/>
+            </w:pPr>
+            <w:r>
+              <w:rPr>
+                <w:b w:val="false"/>
+                <w:bCs w:val="false"/>
+                <w:color w:val="1D2D3E"/>
+                <w:sz w:val="20"/>
+                <w:szCs w:val="20"/>
+              </w:rPr>
+              <w:t xml:space="preserve">Journal Entries Dr/Cr monthly flow chart — buildMonthBuckets() groups last 6 months, DrCrFlowChart grouped mini-bar in JESummaryCard</w:t>
+            </w:r>
+          </w:p>
+        </w:tc>
+        <w:tc>
+          <w:tcPr>
+            <w:shd w:color="F0F4F8" w:val="solid"/>
+          </w:tcPr>
+          <w:p>
+            <w:pPr>
+              <w:spacing w:after="40" w:before="40"/>
+            </w:pPr>
+            <w:r>
+              <w:rPr>
+                <w:b w:val="false"/>
+                <w:bCs w:val="false"/>
+                <w:color w:val="1D2D3E"/>
+                <w:sz w:val="20"/>
+                <w:szCs w:val="20"/>
+              </w:rPr>
+              <w:t xml:space="preserve">Done</w:t>
+            </w:r>
+          </w:p>
+        </w:tc>
+        <w:tc>
+          <w:tcPr>
+            <w:shd w:color="F0F4F8" w:val="solid"/>
+          </w:tcPr>
+          <w:p>
+            <w:pPr>
+              <w:spacing w:after="40" w:before="40"/>
+            </w:pPr>
+            <w:r>
+              <w:rPr>
+                <w:b w:val="false"/>
+                <w:bCs w:val="false"/>
+                <w:color w:val="1D2D3E"/>
+                <w:sz w:val="20"/>
+                <w:szCs w:val="20"/>
+              </w:rPr>
+              <w:t xml:space="preserve">JournalEntriesScreen.tsx</w:t>
+            </w:r>
+          </w:p>
+        </w:tc>
+      </w:tr>
+      <w:tr>
+        <w:tc>
+          <w:p>
+            <w:pPr>
+              <w:spacing w:after="40" w:before="40"/>
+            </w:pPr>
+            <w:r>
+              <w:rPr>
+                <w:b w:val="false"/>
+                <w:bCs w:val="false"/>
+                <w:color w:val="1D2D3E"/>
+                <w:sz w:val="20"/>
+                <w:szCs w:val="20"/>
+              </w:rPr>
+              <w:t xml:space="preserve">Session 46</w:t>
+            </w:r>
+          </w:p>
+        </w:tc>
+        <w:tc>
+          <w:p>
+            <w:pPr>
+              <w:spacing w:after="40" w:before="40"/>
+            </w:pPr>
+            <w:r>
+              <w:rPr>
+                <w:b w:val="false"/>
+                <w:bCs w:val="false"/>
+                <w:color w:val="1D2D3E"/>
+                <w:sz w:val="20"/>
+                <w:szCs w:val="20"/>
+              </w:rPr>
+              <w:t xml:space="preserve">StockHealth velocity card — computeVelocity() aggregates ledger by item, VelocityCard stacked bar (IN/OUT), fetchStockLedger called at load</w:t>
+            </w:r>
+          </w:p>
+        </w:tc>
+        <w:tc>
+          <w:p>
+            <w:pPr>
+              <w:spacing w:after="40" w:before="40"/>
+            </w:pPr>
+            <w:r>
+              <w:rPr>
+                <w:b w:val="false"/>
+                <w:bCs w:val="false"/>
+                <w:color w:val="1D2D3E"/>
+                <w:sz w:val="20"/>
+                <w:szCs w:val="20"/>
+              </w:rPr>
+              <w:t xml:space="preserve">Done</w:t>
+            </w:r>
+          </w:p>
+        </w:tc>
+        <w:tc>
+          <w:p>
+            <w:pPr>
+              <w:spacing w:after="40" w:before="40"/>
+            </w:pPr>
+            <w:r>
+              <w:rPr>
+                <w:b w:val="false"/>
+                <w:bCs w:val="false"/>
+                <w:color w:val="1D2D3E"/>
+                <w:sz w:val="20"/>
+                <w:szCs w:val="20"/>
+              </w:rPr>
+              <w:t xml:space="preserve">StockHealthScreen.tsx</w:t>
+            </w:r>
+          </w:p>
+        </w:tc>
+      </w:tr>
+      <w:tr>
+        <w:tc>
+          <w:tcPr>
+            <w:shd w:color="F0F4F8" w:val="solid"/>
+          </w:tcPr>
+          <w:p>
+            <w:pPr>
+              <w:spacing w:after="40" w:before="40"/>
+            </w:pPr>
+            <w:r>
+              <w:rPr>
+                <w:b w:val="false"/>
+                <w:bCs w:val="false"/>
+                <w:color w:val="1D2D3E"/>
+                <w:sz w:val="20"/>
+                <w:szCs w:val="20"/>
+              </w:rPr>
+              <w:t xml:space="preserve">Session 46</w:t>
+            </w:r>
+          </w:p>
+        </w:tc>
+        <w:tc>
+          <w:tcPr>
+            <w:shd w:color="F0F4F8" w:val="solid"/>
+          </w:tcPr>
+          <w:p>
+            <w:pPr>
+              <w:spacing w:after="40" w:before="40"/>
+            </w:pPr>
+            <w:r>
+              <w:rPr>
+                <w:b w:val="false"/>
+                <w:bCs w:val="false"/>
+                <w:color w:val="1D2D3E"/>
+                <w:sz w:val="20"/>
+                <w:szCs w:val="20"/>
+              </w:rPr>
+              <w:t xml:space="preserve">Dashboard Upcoming Cash summary — 3-tile card (AP Outflow / Net / AR Inflow) above Upcoming Payments, computed from dueSoonBills/dueSoonInvoices</w:t>
+            </w:r>
+          </w:p>
+        </w:tc>
+        <w:tc>
+          <w:tcPr>
+            <w:shd w:color="F0F4F8" w:val="solid"/>
+          </w:tcPr>
+          <w:p>
+            <w:pPr>
+              <w:spacing w:after="40" w:before="40"/>
+            </w:pPr>
+            <w:r>
+              <w:rPr>
+                <w:b w:val="false"/>
+                <w:bCs w:val="false"/>
+                <w:color w:val="1D2D3E"/>
+                <w:sz w:val="20"/>
+                <w:szCs w:val="20"/>
+              </w:rPr>
+              <w:t xml:space="preserve">Done</w:t>
+            </w:r>
+          </w:p>
+        </w:tc>
+        <w:tc>
+          <w:tcPr>
+            <w:shd w:color="F0F4F8" w:val="solid"/>
+          </w:tcPr>
+          <w:p>
+            <w:pPr>
+              <w:spacing w:after="40" w:before="40"/>
+            </w:pPr>
+            <w:r>
+              <w:rPr>
+                <w:b w:val="false"/>
+                <w:bCs w:val="false"/>
+                <w:color w:val="1D2D3E"/>
+                <w:sz w:val="20"/>
+                <w:szCs w:val="20"/>
+              </w:rPr>
+              <w:t xml:space="preserve">DashboardScreen.tsx</w:t>
+            </w:r>
+          </w:p>
+        </w:tc>
+      </w:tr>
     </w:tbl>
     <w:p>
       <w:pPr>
@@ -31710,6 +32331,303 @@
           <w:szCs w:val="22"/>
         </w:rPr>
         <w:t xml:space="preserve">  Tapping a history row repopulates the query field</w:t>
+      </w:r>
+    </w:p>
+    <w:p>
+      <w:pPr>
+        <w:spacing w:after="80"/>
+      </w:pPr>
+      <w:r>
+        <w:rPr>
+          <w:color w:val="1D2D3E"/>
+          <w:sz w:val="22"/>
+          <w:szCs w:val="22"/>
+        </w:rPr>
+        <w:t xml:space="preserve"/>
+      </w:r>
+    </w:p>
+    <w:p>
+      <w:pPr>
+        <w:pStyle w:val="Heading2"/>
+        <w:spacing w:after="120" w:before="300"/>
+      </w:pPr>
+      <w:r>
+        <w:rPr>
+          <w:b/>
+          <w:bCs/>
+          <w:color w:val="1D2D3E"/>
+        </w:rPr>
+        <w:t xml:space="preserve">Session 46 — 2026-06-08</w:t>
+      </w:r>
+    </w:p>
+    <w:p>
+      <w:pPr>
+        <w:pStyle w:val="ListParagraph"/>
+        <w:numPr>
+          <w:ilvl w:val="0"/>
+          <w:numId w:val="1"/>
+        </w:numPr>
+        <w:spacing w:after="40"/>
+      </w:pPr>
+      <w:r>
+        <w:rPr>
+          <w:color w:val="1D2D3E"/>
+          <w:sz w:val="22"/>
+          <w:szCs w:val="22"/>
+        </w:rPr>
+        <w:t xml:space="preserve">Journal Entries Dr/Cr Monthly Flow Chart (JournalEntriesScreen.tsx)</w:t>
+      </w:r>
+    </w:p>
+    <w:p>
+      <w:pPr>
+        <w:pStyle w:val="ListParagraph"/>
+        <w:numPr>
+          <w:ilvl w:val="1"/>
+          <w:numId w:val="1"/>
+        </w:numPr>
+        <w:spacing w:after="40"/>
+      </w:pPr>
+      <w:r>
+        <w:rPr>
+          <w:color w:val="1D2D3E"/>
+          <w:sz w:val="22"/>
+          <w:szCs w:val="22"/>
+        </w:rPr>
+        <w:t xml:space="preserve">  buildMonthBuckets(): groups filtered entries by year-month (dt.slice(0,7)) for the last 6 months; sums total_debit + total_credit per bucket</w:t>
+      </w:r>
+    </w:p>
+    <w:p>
+      <w:pPr>
+        <w:pStyle w:val="ListParagraph"/>
+        <w:numPr>
+          <w:ilvl w:val="1"/>
+          <w:numId w:val="1"/>
+        </w:numPr>
+        <w:spacing w:after="40"/>
+      </w:pPr>
+      <w:r>
+        <w:rPr>
+          <w:color w:val="1D2D3E"/>
+          <w:sz w:val="22"/>
+          <w:szCs w:val="22"/>
+        </w:rPr>
+        <w:t xml:space="preserve">  DrCrFlowChart component: compact grouped bar chart — dark bar = Dr, muted bar = Cr; month label below; hidden when no dt data</w:t>
+      </w:r>
+    </w:p>
+    <w:p>
+      <w:pPr>
+        <w:pStyle w:val="ListParagraph"/>
+        <w:numPr>
+          <w:ilvl w:val="1"/>
+          <w:numId w:val="1"/>
+        </w:numPr>
+        <w:spacing w:after="40"/>
+      </w:pPr>
+      <w:r>
+        <w:rPr>
+          <w:color w:val="1D2D3E"/>
+          <w:sz w:val="22"/>
+          <w:szCs w:val="22"/>
+        </w:rPr>
+        <w:t xml:space="preserve">  Rendered inside JESummaryCard below the type-breakdown section; zero extra API calls — pure computation from filtered entries</w:t>
+      </w:r>
+    </w:p>
+    <w:p>
+      <w:pPr>
+        <w:pStyle w:val="ListParagraph"/>
+        <w:numPr>
+          <w:ilvl w:val="0"/>
+          <w:numId w:val="1"/>
+        </w:numPr>
+        <w:spacing w:after="40"/>
+      </w:pPr>
+      <w:r>
+        <w:rPr>
+          <w:color w:val="1D2D3E"/>
+          <w:sz w:val="22"/>
+          <w:szCs w:val="22"/>
+        </w:rPr>
+        <w:t xml:space="preserve">StockHealth — Stock Velocity Card (StockHealthScreen.tsx)</w:t>
+      </w:r>
+    </w:p>
+    <w:p>
+      <w:pPr>
+        <w:pStyle w:val="ListParagraph"/>
+        <w:numPr>
+          <w:ilvl w:val="1"/>
+          <w:numId w:val="1"/>
+        </w:numPr>
+        <w:spacing w:after="40"/>
+      </w:pPr>
+      <w:r>
+        <w:rPr>
+          <w:color w:val="1D2D3E"/>
+          <w:sz w:val="22"/>
+          <w:szCs w:val="22"/>
+        </w:rPr>
+        <w:t xml:space="preserve">  computeVelocity(): aggregates all StockLedgerEntry rows by item_name; sums qty_in + qty_out; top 8 items by totalMovement</w:t>
+      </w:r>
+    </w:p>
+    <w:p>
+      <w:pPr>
+        <w:pStyle w:val="ListParagraph"/>
+        <w:numPr>
+          <w:ilvl w:val="1"/>
+          <w:numId w:val="1"/>
+        </w:numPr>
+        <w:spacing w:after="40"/>
+      </w:pPr>
+      <w:r>
+        <w:rPr>
+          <w:color w:val="1D2D3E"/>
+          <w:sz w:val="22"/>
+          <w:szCs w:val="22"/>
+        </w:rPr>
+        <w:t xml:space="preserve">  VelocityCard: ranked list with stacked proportional bar (dark=IN, muted=OUT) + per-item IN/OUT totals; hidden when no data</w:t>
+      </w:r>
+    </w:p>
+    <w:p>
+      <w:pPr>
+        <w:pStyle w:val="ListParagraph"/>
+        <w:numPr>
+          <w:ilvl w:val="1"/>
+          <w:numId w:val="1"/>
+        </w:numPr>
+        <w:spacing w:after="40"/>
+      </w:pPr>
+      <w:r>
+        <w:rPr>
+          <w:color w:val="1D2D3E"/>
+          <w:sz w:val="22"/>
+          <w:szCs w:val="22"/>
+        </w:rPr>
+        <w:t xml:space="preserve">  fetchStockLedger({ companyId }) called at screen load alongside stock/warehouses; cached independently under stock-velocity:* key</w:t>
+      </w:r>
+    </w:p>
+    <w:p>
+      <w:pPr>
+        <w:pStyle w:val="ListParagraph"/>
+        <w:numPr>
+          <w:ilvl w:val="1"/>
+          <w:numId w:val="1"/>
+        </w:numPr>
+        <w:spacing w:after="40"/>
+      </w:pPr>
+      <w:r>
+        <w:rPr>
+          <w:color w:val="1D2D3E"/>
+          <w:sz w:val="22"/>
+          <w:szCs w:val="22"/>
+        </w:rPr>
+        <w:t xml:space="preserve">  Placed between Top Items by Quantity and Warehouse Distribution sections</w:t>
+      </w:r>
+    </w:p>
+    <w:p>
+      <w:pPr>
+        <w:pStyle w:val="ListParagraph"/>
+        <w:numPr>
+          <w:ilvl w:val="0"/>
+          <w:numId w:val="1"/>
+        </w:numPr>
+        <w:spacing w:after="40"/>
+      </w:pPr>
+      <w:r>
+        <w:rPr>
+          <w:color w:val="1D2D3E"/>
+          <w:sz w:val="22"/>
+          <w:szCs w:val="22"/>
+        </w:rPr>
+        <w:t xml:space="preserve">Dashboard Upcoming Cash Flow Summary Card (DashboardScreen.tsx)</w:t>
+      </w:r>
+    </w:p>
+    <w:p>
+      <w:pPr>
+        <w:pStyle w:val="ListParagraph"/>
+        <w:numPr>
+          <w:ilvl w:val="1"/>
+          <w:numId w:val="1"/>
+        </w:numPr>
+        <w:spacing w:after="40"/>
+      </w:pPr>
+      <w:r>
+        <w:rPr>
+          <w:color w:val="1D2D3E"/>
+          <w:sz w:val="22"/>
+          <w:szCs w:val="22"/>
+        </w:rPr>
+        <w:t xml:space="preserve">  3-tile horizontal card: AP Outflow | Net | AR Inflow — computed from existing dueSoonBills/dueSoonInvoices state</w:t>
+      </w:r>
+    </w:p>
+    <w:p>
+      <w:pPr>
+        <w:pStyle w:val="ListParagraph"/>
+        <w:numPr>
+          <w:ilvl w:val="1"/>
+          <w:numId w:val="1"/>
+        </w:numPr>
+        <w:spacing w:after="40"/>
+      </w:pPr>
+      <w:r>
+        <w:rPr>
+          <w:color w:val="1D2D3E"/>
+          <w:sz w:val="22"/>
+          <w:szCs w:val="22"/>
+        </w:rPr>
+        <w:t xml:space="preserve">  fmtK() helper: K/M-shortened number format for compact display</w:t>
+      </w:r>
+    </w:p>
+    <w:p>
+      <w:pPr>
+        <w:pStyle w:val="ListParagraph"/>
+        <w:numPr>
+          <w:ilvl w:val="1"/>
+          <w:numId w:val="1"/>
+        </w:numPr>
+        <w:spacing w:after="40"/>
+      </w:pPr>
+      <w:r>
+        <w:rPr>
+          <w:color w:val="1D2D3E"/>
+          <w:sz w:val="22"/>
+          <w:szCs w:val="22"/>
+        </w:rPr>
+        <w:t xml:space="preserve">  Net tile: dark text when positive (net inflow), muted when negative (net outflow) with hint 'inflow'/'outflow'</w:t>
+      </w:r>
+    </w:p>
+    <w:p>
+      <w:pPr>
+        <w:pStyle w:val="ListParagraph"/>
+        <w:numPr>
+          <w:ilvl w:val="1"/>
+          <w:numId w:val="1"/>
+        </w:numPr>
+        <w:spacing w:after="40"/>
+      </w:pPr>
+      <w:r>
+        <w:rPr>
+          <w:color w:val="1D2D3E"/>
+          <w:sz w:val="22"/>
+          <w:szCs w:val="22"/>
+        </w:rPr>
+        <w:t xml:space="preserve">  AP tile taps → AccountsPayable; AR tile taps → AccountsReceivable</w:t>
+      </w:r>
+    </w:p>
+    <w:p>
+      <w:pPr>
+        <w:pStyle w:val="ListParagraph"/>
+        <w:numPr>
+          <w:ilvl w:val="1"/>
+          <w:numId w:val="1"/>
+        </w:numPr>
+        <w:spacing w:after="40"/>
+      </w:pPr>
+      <w:r>
+        <w:rPr>
+          <w:color w:val="1D2D3E"/>
+          <w:sz w:val="22"/>
+          <w:szCs w:val="22"/>
+        </w:rPr>
+        <w:t xml:space="preserve">  Placed between Top Customers and Upcoming Payments sections; only visible when ≥1 due-soon item exists; zero extra API calls</w:t>
       </w:r>
     </w:p>
     <w:p>

</xml_diff>

<commit_message>
docs(session-47): update PROGRESS.md, generate-docs.js, and FEATURES.docx with Session 47 changelog
- PROGRESS.md: Session 47 entry (aging history chart, avg order value, MoM billing card)
- generate-docs.js: sections 3.68-3.70, 3 roadmap rows, Session 47 changelog entry
- FEATURES.docx: regenerated
</commit_message>
<xml_diff>
--- a/FEATURES.docx
+++ b/FEATURES.docx
@@ -12675,6 +12675,555 @@
           <w:bCs/>
           <w:color w:val="1D2D3E"/>
         </w:rPr>
+        <w:t xml:space="preserve">3.68 FinancialAnalytics 30-Day Aging History Trend Chart (Session 47)</w:t>
+      </w:r>
+    </w:p>
+    <w:p>
+      <w:pPr>
+        <w:pStyle w:val="ListParagraph"/>
+        <w:numPr>
+          <w:ilvl w:val="0"/>
+          <w:numId w:val="1"/>
+        </w:numPr>
+        <w:spacing w:after="40"/>
+      </w:pPr>
+      <w:r>
+        <w:rPr>
+          <w:color w:val="1D2D3E"/>
+          <w:sz w:val="22"/>
+          <w:szCs w:val="22"/>
+        </w:rPr>
+        <w:t xml:space="preserve">agingSnapshot.ts: AgingHistoryEntry type {date, companyId, apTotal, arTotal, apOver90, arOver90}</w:t>
+      </w:r>
+    </w:p>
+    <w:p>
+      <w:pPr>
+        <w:pStyle w:val="ListParagraph"/>
+        <w:numPr>
+          <w:ilvl w:val="0"/>
+          <w:numId w:val="1"/>
+        </w:numPr>
+        <w:spacing w:after="40"/>
+      </w:pPr>
+      <w:r>
+        <w:rPr>
+          <w:color w:val="1D2D3E"/>
+          <w:sz w:val="22"/>
+          <w:szCs w:val="22"/>
+        </w:rPr>
+        <w:t xml:space="preserve">saveAgingHistory(): loads rolling array, skips if same date as last entry, pushes, trims to 30, saves under aging-history:* key</w:t>
+      </w:r>
+    </w:p>
+    <w:p>
+      <w:pPr>
+        <w:pStyle w:val="ListParagraph"/>
+        <w:numPr>
+          <w:ilvl w:val="0"/>
+          <w:numId w:val="1"/>
+        </w:numPr>
+        <w:spacing w:after="40"/>
+      </w:pPr>
+      <w:r>
+        <w:rPr>
+          <w:color w:val="1D2D3E"/>
+          <w:sz w:val="22"/>
+          <w:szCs w:val="22"/>
+        </w:rPr>
+        <w:t xml:space="preserve">loadAgingHistory(): returns AgingHistoryEntry[] from AsyncStorage (empty array on miss)</w:t>
+      </w:r>
+    </w:p>
+    <w:p>
+      <w:pPr>
+        <w:pStyle w:val="ListParagraph"/>
+        <w:numPr>
+          <w:ilvl w:val="0"/>
+          <w:numId w:val="1"/>
+        </w:numPr>
+        <w:spacing w:after="40"/>
+      </w:pPr>
+      <w:r>
+        <w:rPr>
+          <w:color w:val="1D2D3E"/>
+          <w:sz w:val="22"/>
+          <w:szCs w:val="22"/>
+        </w:rPr>
+        <w:t xml:space="preserve">FinancialAnalyticsScreen: agingHistory state; loadAgingHistory() fetched alongside snapshot in Promise.all</w:t>
+      </w:r>
+    </w:p>
+    <w:p>
+      <w:pPr>
+        <w:pStyle w:val="ListParagraph"/>
+        <w:numPr>
+          <w:ilvl w:val="1"/>
+          <w:numId w:val="1"/>
+        </w:numPr>
+        <w:spacing w:after="40"/>
+      </w:pPr>
+      <w:r>
+        <w:rPr>
+          <w:color w:val="1D2D3E"/>
+          <w:sz w:val="22"/>
+          <w:szCs w:val="22"/>
+        </w:rPr>
+        <w:t xml:space="preserve">  saveAgingHistory() called after API fetch; updatedHistory reloaded to reflect today's new entry</w:t>
+      </w:r>
+    </w:p>
+    <w:p>
+      <w:pPr>
+        <w:pStyle w:val="ListParagraph"/>
+        <w:numPr>
+          <w:ilvl w:val="0"/>
+          <w:numId w:val="1"/>
+        </w:numPr>
+        <w:spacing w:after="40"/>
+      </w:pPr>
+      <w:r>
+        <w:rPr>
+          <w:color w:val="1D2D3E"/>
+          <w:sz w:val="22"/>
+          <w:szCs w:val="22"/>
+        </w:rPr>
+        <w:t xml:space="preserve">AgingHistoryChart: grouped daily bars (AP=muted, AR=dark) for last 10 visible entries; BAR_HEIGHT=64px</w:t>
+      </w:r>
+    </w:p>
+    <w:p>
+      <w:pPr>
+        <w:pStyle w:val="ListParagraph"/>
+        <w:numPr>
+          <w:ilvl w:val="1"/>
+          <w:numId w:val="1"/>
+        </w:numPr>
+        <w:spacing w:after="40"/>
+      </w:pPr>
+      <w:r>
+        <w:rPr>
+          <w:color w:val="1D2D3E"/>
+          <w:sz w:val="22"/>
+          <w:szCs w:val="22"/>
+        </w:rPr>
+        <w:t xml:space="preserve">  Legend row with AP/AR dots + 'N days recorded' right-aligned meta</w:t>
+      </w:r>
+    </w:p>
+    <w:p>
+      <w:pPr>
+        <w:pStyle w:val="ListParagraph"/>
+        <w:numPr>
+          <w:ilvl w:val="1"/>
+          <w:numId w:val="1"/>
+        </w:numPr>
+        <w:spacing w:after="40"/>
+      </w:pPr>
+      <w:r>
+        <w:rPr>
+          <w:color w:val="1D2D3E"/>
+          <w:sz w:val="22"/>
+          <w:szCs w:val="22"/>
+        </w:rPr>
+        <w:t xml:space="preserve">  Over-90 summary row (AP 90d+ / AR 90d+) below bars when any entry has over_90 &gt; 0</w:t>
+      </w:r>
+    </w:p>
+    <w:p>
+      <w:pPr>
+        <w:pStyle w:val="ListParagraph"/>
+        <w:numPr>
+          <w:ilvl w:val="1"/>
+          <w:numId w:val="1"/>
+        </w:numPr>
+        <w:spacing w:after="40"/>
+      </w:pPr>
+      <w:r>
+        <w:rPr>
+          <w:color w:val="1D2D3E"/>
+          <w:sz w:val="22"/>
+          <w:szCs w:val="22"/>
+        </w:rPr>
+        <w:t xml:space="preserve">  fmtHistoryDate(): formats YYYY-MM-DD as 'Jun 8' abbreviated date label</w:t>
+      </w:r>
+    </w:p>
+    <w:p>
+      <w:pPr>
+        <w:pStyle w:val="ListParagraph"/>
+        <w:numPr>
+          <w:ilvl w:val="1"/>
+          <w:numId w:val="1"/>
+        </w:numPr>
+        <w:spacing w:after="40"/>
+      </w:pPr>
+      <w:r>
+        <w:rPr>
+          <w:color w:val="1D2D3E"/>
+          <w:sz w:val="22"/>
+          <w:szCs w:val="22"/>
+        </w:rPr>
+        <w:t xml:space="preserve">  Hidden when history.length &lt; 2 — needs at least 2 days to be informative</w:t>
+      </w:r>
+    </w:p>
+    <w:p>
+      <w:pPr>
+        <w:pStyle w:val="ListParagraph"/>
+        <w:numPr>
+          <w:ilvl w:val="0"/>
+          <w:numId w:val="1"/>
+        </w:numPr>
+        <w:spacing w:after="40"/>
+      </w:pPr>
+      <w:r>
+        <w:rPr>
+          <w:color w:val="1D2D3E"/>
+          <w:sz w:val="22"/>
+          <w:szCs w:val="22"/>
+        </w:rPr>
+        <w:t xml:space="preserve">Placed below AR Aging section before Top Customers with 'AP vs AR History · daily outstanding · up to 30 days' header</w:t>
+      </w:r>
+    </w:p>
+    <w:p>
+      <w:pPr>
+        <w:spacing w:after="80"/>
+      </w:pPr>
+      <w:r>
+        <w:rPr>
+          <w:color w:val="1D2D3E"/>
+          <w:sz w:val="22"/>
+          <w:szCs w:val="22"/>
+        </w:rPr>
+        <w:t xml:space="preserve"/>
+      </w:r>
+    </w:p>
+    <w:p>
+      <w:pPr>
+        <w:pStyle w:val="Heading2"/>
+        <w:spacing w:after="120" w:before="300"/>
+      </w:pPr>
+      <w:r>
+        <w:rPr>
+          <w:b/>
+          <w:bCs/>
+          <w:color w:val="1D2D3E"/>
+        </w:rPr>
+        <w:t xml:space="preserve">3.69 ProcurementAnalytics Average Order Value in Ranked Lists (Session 47)</w:t>
+      </w:r>
+    </w:p>
+    <w:p>
+      <w:pPr>
+        <w:pStyle w:val="ListParagraph"/>
+        <w:numPr>
+          <w:ilvl w:val="0"/>
+          <w:numId w:val="1"/>
+        </w:numPr>
+        <w:spacing w:after="40"/>
+      </w:pPr>
+      <w:r>
+        <w:rPr>
+          <w:color w:val="1D2D3E"/>
+          <w:sz w:val="22"/>
+          <w:szCs w:val="22"/>
+        </w:rPr>
+        <w:t xml:space="preserve">VendorRow and CustomerRow interfaces gain avgValue: number field</w:t>
+      </w:r>
+    </w:p>
+    <w:p>
+      <w:pPr>
+        <w:pStyle w:val="ListParagraph"/>
+        <w:numPr>
+          <w:ilvl w:val="0"/>
+          <w:numId w:val="1"/>
+        </w:numPr>
+        <w:spacing w:after="40"/>
+      </w:pPr>
+      <w:r>
+        <w:rPr>
+          <w:color w:val="1D2D3E"/>
+          <w:sz w:val="22"/>
+          <w:szCs w:val="22"/>
+        </w:rPr>
+        <w:t xml:space="preserve">computeAnalytics: topVendors and topCustomers slices .map() to add avgValue = total / count</w:t>
+      </w:r>
+    </w:p>
+    <w:p>
+      <w:pPr>
+        <w:pStyle w:val="ListParagraph"/>
+        <w:numPr>
+          <w:ilvl w:val="0"/>
+          <w:numId w:val="1"/>
+        </w:numPr>
+        <w:spacing w:after="40"/>
+      </w:pPr>
+      <w:r>
+        <w:rPr>
+          <w:color w:val="1D2D3E"/>
+          <w:sz w:val="22"/>
+          <w:szCs w:val="22"/>
+        </w:rPr>
+        <w:t xml:space="preserve">fmtAvg(): formats value with 'avg' suffix in K/M notation (e.g. '45K avg')</w:t>
+      </w:r>
+    </w:p>
+    <w:p>
+      <w:pPr>
+        <w:pStyle w:val="ListParagraph"/>
+        <w:numPr>
+          <w:ilvl w:val="0"/>
+          <w:numId w:val="1"/>
+        </w:numPr>
+        <w:spacing w:after="40"/>
+      </w:pPr>
+      <w:r>
+        <w:rPr>
+          <w:color w:val="1D2D3E"/>
+          <w:sz w:val="22"/>
+          <w:szCs w:val="22"/>
+        </w:rPr>
+        <w:t xml:space="preserve">RankedBarList: renders fmtAvg(row.avgValue) as third line below order count when avgValue &gt; 0</w:t>
+      </w:r>
+    </w:p>
+    <w:p>
+      <w:pPr>
+        <w:pStyle w:val="ListParagraph"/>
+        <w:numPr>
+          <w:ilvl w:val="0"/>
+          <w:numId w:val="1"/>
+        </w:numPr>
+        <w:spacing w:after="40"/>
+      </w:pPr>
+      <w:r>
+        <w:rPr>
+          <w:color w:val="1D2D3E"/>
+          <w:sz w:val="22"/>
+          <w:szCs w:val="22"/>
+        </w:rPr>
+        <w:t xml:space="preserve">Uses rankedStyles.avg style (fontSize 10, textSecondary color) — visually distinct from count line</w:t>
+      </w:r>
+    </w:p>
+    <w:p>
+      <w:pPr>
+        <w:spacing w:after="80"/>
+      </w:pPr>
+      <w:r>
+        <w:rPr>
+          <w:color w:val="1D2D3E"/>
+          <w:sz w:val="22"/>
+          <w:szCs w:val="22"/>
+        </w:rPr>
+        <w:t xml:space="preserve"/>
+      </w:r>
+    </w:p>
+    <w:p>
+      <w:pPr>
+        <w:pStyle w:val="Heading2"/>
+        <w:spacing w:after="120" w:before="300"/>
+      </w:pPr>
+      <w:r>
+        <w:rPr>
+          <w:b/>
+          <w:bCs/>
+          <w:color w:val="1D2D3E"/>
+        </w:rPr>
+        <w:t xml:space="preserve">3.70 Dashboard Month-over-Month AP/AR Billing Comparison Card (Session 47)</w:t>
+      </w:r>
+    </w:p>
+    <w:p>
+      <w:pPr>
+        <w:pStyle w:val="ListParagraph"/>
+        <w:numPr>
+          <w:ilvl w:val="0"/>
+          <w:numId w:val="1"/>
+        </w:numPr>
+        <w:spacing w:after="40"/>
+      </w:pPr>
+      <w:r>
+        <w:rPr>
+          <w:color w:val="1D2D3E"/>
+          <w:sz w:val="22"/>
+          <w:szCs w:val="22"/>
+        </w:rPr>
+        <w:t xml:space="preserve">monthComparison state: {apThis, apPrev, arThis, arPrev, thisLabel, prevLabel} — null when no data</w:t>
+      </w:r>
+    </w:p>
+    <w:p>
+      <w:pPr>
+        <w:pStyle w:val="ListParagraph"/>
+        <w:numPr>
+          <w:ilvl w:val="0"/>
+          <w:numId w:val="1"/>
+        </w:numPr>
+        <w:spacing w:after="40"/>
+      </w:pPr>
+      <w:r>
+        <w:rPr>
+          <w:color w:val="1D2D3E"/>
+          <w:sz w:val="22"/>
+          <w:szCs w:val="22"/>
+        </w:rPr>
+        <w:t xml:space="preserve">Computation in useFocusEffect: filters bills.dt and invoices.dt by current and previous calendar year-month</w:t>
+      </w:r>
+    </w:p>
+    <w:p>
+      <w:pPr>
+        <w:pStyle w:val="ListParagraph"/>
+        <w:numPr>
+          <w:ilvl w:val="1"/>
+          <w:numId w:val="1"/>
+        </w:numPr>
+        <w:spacing w:after="40"/>
+      </w:pPr>
+      <w:r>
+        <w:rPr>
+          <w:color w:val="1D2D3E"/>
+          <w:sz w:val="22"/>
+          <w:szCs w:val="22"/>
+        </w:rPr>
+        <w:t xml:space="preserve">  thisYM = YYYY-MM for this month; prevYM = YYYY-MM for previous month</w:t>
+      </w:r>
+    </w:p>
+    <w:p>
+      <w:pPr>
+        <w:pStyle w:val="ListParagraph"/>
+        <w:numPr>
+          <w:ilvl w:val="1"/>
+          <w:numId w:val="1"/>
+        </w:numPr>
+        <w:spacing w:after="40"/>
+      </w:pPr>
+      <w:r>
+        <w:rPr>
+          <w:color w:val="1D2D3E"/>
+          <w:sz w:val="22"/>
+          <w:szCs w:val="22"/>
+        </w:rPr>
+        <w:t xml:space="preserve">  Only set when at least one of the four values is non-zero</w:t>
+      </w:r>
+    </w:p>
+    <w:p>
+      <w:pPr>
+        <w:pStyle w:val="ListParagraph"/>
+        <w:numPr>
+          <w:ilvl w:val="0"/>
+          <w:numId w:val="1"/>
+        </w:numPr>
+        <w:spacing w:after="40"/>
+      </w:pPr>
+      <w:r>
+        <w:rPr>
+          <w:color w:val="1D2D3E"/>
+          <w:sz w:val="22"/>
+          <w:szCs w:val="22"/>
+        </w:rPr>
+        <w:t xml:space="preserve">fmtK() helper hoisted to module scope (removed duplicate local fn from Upcoming Cash render)</w:t>
+      </w:r>
+    </w:p>
+    <w:p>
+      <w:pPr>
+        <w:pStyle w:val="ListParagraph"/>
+        <w:numPr>
+          <w:ilvl w:val="0"/>
+          <w:numId w:val="1"/>
+        </w:numPr>
+        <w:spacing w:after="40"/>
+      </w:pPr>
+      <w:r>
+        <w:rPr>
+          <w:color w:val="1D2D3E"/>
+          <w:sz w:val="22"/>
+          <w:szCs w:val="22"/>
+        </w:rPr>
+        <w:t xml:space="preserve">MoMRow component: label | prev month block | trending-up/down/minus icon | this month block | % badge</w:t>
+      </w:r>
+    </w:p>
+    <w:p>
+      <w:pPr>
+        <w:pStyle w:val="ListParagraph"/>
+        <w:numPr>
+          <w:ilvl w:val="1"/>
+          <w:numId w:val="1"/>
+        </w:numPr>
+        <w:spacing w:after="40"/>
+      </w:pPr>
+      <w:r>
+        <w:rPr>
+          <w:color w:val="1D2D3E"/>
+          <w:sz w:val="22"/>
+          <w:szCs w:val="22"/>
+        </w:rPr>
+        <w:t xml:space="preserve">  Trend icon: trending-up when pctChange &gt; 0, trending-down when &lt; 0, minus when ≈ 0</w:t>
+      </w:r>
+    </w:p>
+    <w:p>
+      <w:pPr>
+        <w:pStyle w:val="ListParagraph"/>
+        <w:numPr>
+          <w:ilvl w:val="1"/>
+          <w:numId w:val="1"/>
+        </w:numPr>
+        <w:spacing w:after="40"/>
+      </w:pPr>
+      <w:r>
+        <w:rPr>
+          <w:color w:val="1D2D3E"/>
+          <w:sz w:val="22"/>
+          <w:szCs w:val="22"/>
+        </w:rPr>
+        <w:t xml:space="preserve">  % badge: +X% or −X% formatted as integer; uses Colors.borderLight background for neutral look</w:t>
+      </w:r>
+    </w:p>
+    <w:p>
+      <w:pPr>
+        <w:pStyle w:val="ListParagraph"/>
+        <w:numPr>
+          <w:ilvl w:val="0"/>
+          <w:numId w:val="1"/>
+        </w:numPr>
+        <w:spacing w:after="40"/>
+      </w:pPr>
+      <w:r>
+        <w:rPr>
+          <w:color w:val="1D2D3E"/>
+          <w:sz w:val="22"/>
+          <w:szCs w:val="22"/>
+        </w:rPr>
+        <w:t xml:space="preserve">Card with two rows — AP and AR — below Finance Health section before Supply Chain Snapshot</w:t>
+      </w:r>
+    </w:p>
+    <w:p>
+      <w:pPr>
+        <w:pStyle w:val="ListParagraph"/>
+        <w:numPr>
+          <w:ilvl w:val="0"/>
+          <w:numId w:val="1"/>
+        </w:numPr>
+        <w:spacing w:after="40"/>
+      </w:pPr>
+      <w:r>
+        <w:rPr>
+          <w:color w:val="1D2D3E"/>
+          <w:sz w:val="22"/>
+          <w:szCs w:val="22"/>
+        </w:rPr>
+        <w:t xml:space="preserve">Section header 'Month vs Month · AP &amp; AR billed · current vs prior'; card hidden when monthComparison is null</w:t>
+      </w:r>
+    </w:p>
+    <w:p>
+      <w:pPr>
+        <w:spacing w:after="80"/>
+      </w:pPr>
+      <w:r>
+        <w:rPr>
+          <w:color w:val="1D2D3E"/>
+          <w:sz w:val="22"/>
+          <w:szCs w:val="22"/>
+        </w:rPr>
+        <w:t xml:space="preserve"/>
+      </w:r>
+    </w:p>
+    <w:p>
+      <w:pPr>
+        <w:pStyle w:val="Heading2"/>
+        <w:spacing w:after="120" w:before="300"/>
+      </w:pPr>
+      <w:r>
+        <w:rPr>
+          <w:b/>
+          <w:bCs/>
+          <w:color w:val="1D2D3E"/>
+        </w:rPr>
         <w:t xml:space="preserve">3.64 FinancialAnalytics 6-Month AP vs AR Monthly Trend Chart (Session 43)</w:t>
       </w:r>
     </w:p>
@@ -27249,6 +27798,228 @@
           </w:p>
         </w:tc>
       </w:tr>
+      <w:tr>
+        <w:tc>
+          <w:p>
+            <w:pPr>
+              <w:spacing w:after="40" w:before="40"/>
+            </w:pPr>
+            <w:r>
+              <w:rPr>
+                <w:b w:val="false"/>
+                <w:bCs w:val="false"/>
+                <w:color w:val="1D2D3E"/>
+                <w:sz w:val="20"/>
+                <w:szCs w:val="20"/>
+              </w:rPr>
+              <w:t xml:space="preserve">Session 47</w:t>
+            </w:r>
+          </w:p>
+        </w:tc>
+        <w:tc>
+          <w:p>
+            <w:pPr>
+              <w:spacing w:after="40" w:before="40"/>
+            </w:pPr>
+            <w:r>
+              <w:rPr>
+                <w:b w:val="false"/>
+                <w:bCs w:val="false"/>
+                <w:color w:val="1D2D3E"/>
+                <w:sz w:val="20"/>
+                <w:szCs w:val="20"/>
+              </w:rPr>
+              <w:t xml:space="preserve">FinancialAnalytics 30-day aging history trend chart — rolling daily AP/AR outstanding, AgingHistoryChart grouped bar (last 10 visible days)</w:t>
+            </w:r>
+          </w:p>
+        </w:tc>
+        <w:tc>
+          <w:p>
+            <w:pPr>
+              <w:spacing w:after="40" w:before="40"/>
+            </w:pPr>
+            <w:r>
+              <w:rPr>
+                <w:b w:val="false"/>
+                <w:bCs w:val="false"/>
+                <w:color w:val="1D2D3E"/>
+                <w:sz w:val="20"/>
+                <w:szCs w:val="20"/>
+              </w:rPr>
+              <w:t xml:space="preserve">Done</w:t>
+            </w:r>
+          </w:p>
+        </w:tc>
+        <w:tc>
+          <w:p>
+            <w:pPr>
+              <w:spacing w:after="40" w:before="40"/>
+            </w:pPr>
+            <w:r>
+              <w:rPr>
+                <w:b w:val="false"/>
+                <w:bCs w:val="false"/>
+                <w:color w:val="1D2D3E"/>
+                <w:sz w:val="20"/>
+                <w:szCs w:val="20"/>
+              </w:rPr>
+              <w:t xml:space="preserve">FinancialAnalyticsScreen.tsx + agingSnapshot.ts</w:t>
+            </w:r>
+          </w:p>
+        </w:tc>
+      </w:tr>
+      <w:tr>
+        <w:tc>
+          <w:tcPr>
+            <w:shd w:color="F0F4F8" w:val="solid"/>
+          </w:tcPr>
+          <w:p>
+            <w:pPr>
+              <w:spacing w:after="40" w:before="40"/>
+            </w:pPr>
+            <w:r>
+              <w:rPr>
+                <w:b w:val="false"/>
+                <w:bCs w:val="false"/>
+                <w:color w:val="1D2D3E"/>
+                <w:sz w:val="20"/>
+                <w:szCs w:val="20"/>
+              </w:rPr>
+              <w:t xml:space="preserve">Session 47</w:t>
+            </w:r>
+          </w:p>
+        </w:tc>
+        <w:tc>
+          <w:tcPr>
+            <w:shd w:color="F0F4F8" w:val="solid"/>
+          </w:tcPr>
+          <w:p>
+            <w:pPr>
+              <w:spacing w:after="40" w:before="40"/>
+            </w:pPr>
+            <w:r>
+              <w:rPr>
+                <w:b w:val="false"/>
+                <w:bCs w:val="false"/>
+                <w:color w:val="1D2D3E"/>
+                <w:sz w:val="20"/>
+                <w:szCs w:val="20"/>
+              </w:rPr>
+              <w:t xml:space="preserve">ProcurementAnalytics avg order value — avgValue = total / count added to VendorRow/CustomerRow; fmtAvg() rendered in RankedBarList</w:t>
+            </w:r>
+          </w:p>
+        </w:tc>
+        <w:tc>
+          <w:tcPr>
+            <w:shd w:color="F0F4F8" w:val="solid"/>
+          </w:tcPr>
+          <w:p>
+            <w:pPr>
+              <w:spacing w:after="40" w:before="40"/>
+            </w:pPr>
+            <w:r>
+              <w:rPr>
+                <w:b w:val="false"/>
+                <w:bCs w:val="false"/>
+                <w:color w:val="1D2D3E"/>
+                <w:sz w:val="20"/>
+                <w:szCs w:val="20"/>
+              </w:rPr>
+              <w:t xml:space="preserve">Done</w:t>
+            </w:r>
+          </w:p>
+        </w:tc>
+        <w:tc>
+          <w:tcPr>
+            <w:shd w:color="F0F4F8" w:val="solid"/>
+          </w:tcPr>
+          <w:p>
+            <w:pPr>
+              <w:spacing w:after="40" w:before="40"/>
+            </w:pPr>
+            <w:r>
+              <w:rPr>
+                <w:b w:val="false"/>
+                <w:bCs w:val="false"/>
+                <w:color w:val="1D2D3E"/>
+                <w:sz w:val="20"/>
+                <w:szCs w:val="20"/>
+              </w:rPr>
+              <w:t xml:space="preserve">ProcurementAnalyticsScreen.tsx</w:t>
+            </w:r>
+          </w:p>
+        </w:tc>
+      </w:tr>
+      <w:tr>
+        <w:tc>
+          <w:p>
+            <w:pPr>
+              <w:spacing w:after="40" w:before="40"/>
+            </w:pPr>
+            <w:r>
+              <w:rPr>
+                <w:b w:val="false"/>
+                <w:bCs w:val="false"/>
+                <w:color w:val="1D2D3E"/>
+                <w:sz w:val="20"/>
+                <w:szCs w:val="20"/>
+              </w:rPr>
+              <w:t xml:space="preserve">Session 47</w:t>
+            </w:r>
+          </w:p>
+        </w:tc>
+        <w:tc>
+          <w:p>
+            <w:pPr>
+              <w:spacing w:after="40" w:before="40"/>
+            </w:pPr>
+            <w:r>
+              <w:rPr>
+                <w:b w:val="false"/>
+                <w:bCs w:val="false"/>
+                <w:color w:val="1D2D3E"/>
+                <w:sz w:val="20"/>
+                <w:szCs w:val="20"/>
+              </w:rPr>
+              <w:t xml:space="preserve">Dashboard month-over-month AP/AR billing card — MoMRow component with trending icon + % badge; current vs prior calendar month billed amounts</w:t>
+            </w:r>
+          </w:p>
+        </w:tc>
+        <w:tc>
+          <w:p>
+            <w:pPr>
+              <w:spacing w:after="40" w:before="40"/>
+            </w:pPr>
+            <w:r>
+              <w:rPr>
+                <w:b w:val="false"/>
+                <w:bCs w:val="false"/>
+                <w:color w:val="1D2D3E"/>
+                <w:sz w:val="20"/>
+                <w:szCs w:val="20"/>
+              </w:rPr>
+              <w:t xml:space="preserve">Done</w:t>
+            </w:r>
+          </w:p>
+        </w:tc>
+        <w:tc>
+          <w:p>
+            <w:pPr>
+              <w:spacing w:after="40" w:before="40"/>
+            </w:pPr>
+            <w:r>
+              <w:rPr>
+                <w:b w:val="false"/>
+                <w:bCs w:val="false"/>
+                <w:color w:val="1D2D3E"/>
+                <w:sz w:val="20"/>
+                <w:szCs w:val="20"/>
+              </w:rPr>
+              <w:t xml:space="preserve">DashboardScreen.tsx</w:t>
+            </w:r>
+          </w:p>
+        </w:tc>
+      </w:tr>
     </w:tbl>
     <w:p>
       <w:pPr>
@@ -32331,6 +33102,267 @@
           <w:szCs w:val="22"/>
         </w:rPr>
         <w:t xml:space="preserve">  Tapping a history row repopulates the query field</w:t>
+      </w:r>
+    </w:p>
+    <w:p>
+      <w:pPr>
+        <w:spacing w:after="80"/>
+      </w:pPr>
+      <w:r>
+        <w:rPr>
+          <w:color w:val="1D2D3E"/>
+          <w:sz w:val="22"/>
+          <w:szCs w:val="22"/>
+        </w:rPr>
+        <w:t xml:space="preserve"/>
+      </w:r>
+    </w:p>
+    <w:p>
+      <w:pPr>
+        <w:pStyle w:val="Heading2"/>
+        <w:spacing w:after="120" w:before="300"/>
+      </w:pPr>
+      <w:r>
+        <w:rPr>
+          <w:b/>
+          <w:bCs/>
+          <w:color w:val="1D2D3E"/>
+        </w:rPr>
+        <w:t xml:space="preserve">Session 47 — 2026-06-08</w:t>
+      </w:r>
+    </w:p>
+    <w:p>
+      <w:pPr>
+        <w:pStyle w:val="ListParagraph"/>
+        <w:numPr>
+          <w:ilvl w:val="0"/>
+          <w:numId w:val="1"/>
+        </w:numPr>
+        <w:spacing w:after="40"/>
+      </w:pPr>
+      <w:r>
+        <w:rPr>
+          <w:color w:val="1D2D3E"/>
+          <w:sz w:val="22"/>
+          <w:szCs w:val="22"/>
+        </w:rPr>
+        <w:t xml:space="preserve">FinancialAnalytics 30-Day Aging History Trend Chart (FinancialAnalyticsScreen.tsx, agingSnapshot.ts)</w:t>
+      </w:r>
+    </w:p>
+    <w:p>
+      <w:pPr>
+        <w:pStyle w:val="ListParagraph"/>
+        <w:numPr>
+          <w:ilvl w:val="1"/>
+          <w:numId w:val="1"/>
+        </w:numPr>
+        <w:spacing w:after="40"/>
+      </w:pPr>
+      <w:r>
+        <w:rPr>
+          <w:color w:val="1D2D3E"/>
+          <w:sz w:val="22"/>
+          <w:szCs w:val="22"/>
+        </w:rPr>
+        <w:t xml:space="preserve">  AgingHistoryEntry type: {date, companyId, apTotal, arTotal, apOver90, arOver90}</w:t>
+      </w:r>
+    </w:p>
+    <w:p>
+      <w:pPr>
+        <w:pStyle w:val="ListParagraph"/>
+        <w:numPr>
+          <w:ilvl w:val="1"/>
+          <w:numId w:val="1"/>
+        </w:numPr>
+        <w:spacing w:after="40"/>
+      </w:pPr>
+      <w:r>
+        <w:rPr>
+          <w:color w:val="1D2D3E"/>
+          <w:sz w:val="22"/>
+          <w:szCs w:val="22"/>
+        </w:rPr>
+        <w:t xml:space="preserve">  saveAgingHistory() + loadAgingHistory() — rolling 30-entry array, skips same-day overwrite, trims oldest</w:t>
+      </w:r>
+    </w:p>
+    <w:p>
+      <w:pPr>
+        <w:pStyle w:val="ListParagraph"/>
+        <w:numPr>
+          <w:ilvl w:val="1"/>
+          <w:numId w:val="1"/>
+        </w:numPr>
+        <w:spacing w:after="40"/>
+      </w:pPr>
+      <w:r>
+        <w:rPr>
+          <w:color w:val="1D2D3E"/>
+          <w:sz w:val="22"/>
+          <w:szCs w:val="22"/>
+        </w:rPr>
+        <w:t xml:space="preserve">  FinancialAnalyticsScreen: loads history alongside snapshot; saves new entry post-fetch; reloads to reflect today</w:t>
+      </w:r>
+    </w:p>
+    <w:p>
+      <w:pPr>
+        <w:pStyle w:val="ListParagraph"/>
+        <w:numPr>
+          <w:ilvl w:val="1"/>
+          <w:numId w:val="1"/>
+        </w:numPr>
+        <w:spacing w:after="40"/>
+      </w:pPr>
+      <w:r>
+        <w:rPr>
+          <w:color w:val="1D2D3E"/>
+          <w:sz w:val="22"/>
+          <w:szCs w:val="22"/>
+        </w:rPr>
+        <w:t xml:space="preserve">  AgingHistoryChart: grouped bars for last 10 visible days, AP muted vs AR dark, over-90 summary row, ≥2 entries required</w:t>
+      </w:r>
+    </w:p>
+    <w:p>
+      <w:pPr>
+        <w:pStyle w:val="ListParagraph"/>
+        <w:numPr>
+          <w:ilvl w:val="0"/>
+          <w:numId w:val="1"/>
+        </w:numPr>
+        <w:spacing w:after="40"/>
+      </w:pPr>
+      <w:r>
+        <w:rPr>
+          <w:color w:val="1D2D3E"/>
+          <w:sz w:val="22"/>
+          <w:szCs w:val="22"/>
+        </w:rPr>
+        <w:t xml:space="preserve">ProcurementAnalytics Avg Order Value in Ranked Lists (ProcurementAnalyticsScreen.tsx)</w:t>
+      </w:r>
+    </w:p>
+    <w:p>
+      <w:pPr>
+        <w:pStyle w:val="ListParagraph"/>
+        <w:numPr>
+          <w:ilvl w:val="1"/>
+          <w:numId w:val="1"/>
+        </w:numPr>
+        <w:spacing w:after="40"/>
+      </w:pPr>
+      <w:r>
+        <w:rPr>
+          <w:color w:val="1D2D3E"/>
+          <w:sz w:val="22"/>
+          <w:szCs w:val="22"/>
+        </w:rPr>
+        <w:t xml:space="preserve">  VendorRow + CustomerRow gain avgValue = total / count field; computed in computeAnalytics()</w:t>
+      </w:r>
+    </w:p>
+    <w:p>
+      <w:pPr>
+        <w:pStyle w:val="ListParagraph"/>
+        <w:numPr>
+          <w:ilvl w:val="1"/>
+          <w:numId w:val="1"/>
+        </w:numPr>
+        <w:spacing w:after="40"/>
+      </w:pPr>
+      <w:r>
+        <w:rPr>
+          <w:color w:val="1D2D3E"/>
+          <w:sz w:val="22"/>
+          <w:szCs w:val="22"/>
+        </w:rPr>
+        <w:t xml:space="preserve">  RankedBarList: fmtAvg() 'Xavg' sub-label (K/M suffix) rendered as 3rd line when avgValue &gt; 0</w:t>
+      </w:r>
+    </w:p>
+    <w:p>
+      <w:pPr>
+        <w:pStyle w:val="ListParagraph"/>
+        <w:numPr>
+          <w:ilvl w:val="0"/>
+          <w:numId w:val="1"/>
+        </w:numPr>
+        <w:spacing w:after="40"/>
+      </w:pPr>
+      <w:r>
+        <w:rPr>
+          <w:color w:val="1D2D3E"/>
+          <w:sz w:val="22"/>
+          <w:szCs w:val="22"/>
+        </w:rPr>
+        <w:t xml:space="preserve">Dashboard Month-over-Month AP/AR Billing Card (DashboardScreen.tsx)</w:t>
+      </w:r>
+    </w:p>
+    <w:p>
+      <w:pPr>
+        <w:pStyle w:val="ListParagraph"/>
+        <w:numPr>
+          <w:ilvl w:val="1"/>
+          <w:numId w:val="1"/>
+        </w:numPr>
+        <w:spacing w:after="40"/>
+      </w:pPr>
+      <w:r>
+        <w:rPr>
+          <w:color w:val="1D2D3E"/>
+          <w:sz w:val="22"/>
+          <w:szCs w:val="22"/>
+        </w:rPr>
+        <w:t xml:space="preserve">  monthComparison state derived from bills.dt + invoices.dt in existing useFocusEffect — zero extra API calls</w:t>
+      </w:r>
+    </w:p>
+    <w:p>
+      <w:pPr>
+        <w:pStyle w:val="ListParagraph"/>
+        <w:numPr>
+          <w:ilvl w:val="1"/>
+          <w:numId w:val="1"/>
+        </w:numPr>
+        <w:spacing w:after="40"/>
+      </w:pPr>
+      <w:r>
+        <w:rPr>
+          <w:color w:val="1D2D3E"/>
+          <w:sz w:val="22"/>
+          <w:szCs w:val="22"/>
+        </w:rPr>
+        <w:t xml:space="preserve">  MoMRow: prev-month vs this-month amounts with trending icon + integer % change badge</w:t>
+      </w:r>
+    </w:p>
+    <w:p>
+      <w:pPr>
+        <w:pStyle w:val="ListParagraph"/>
+        <w:numPr>
+          <w:ilvl w:val="1"/>
+          <w:numId w:val="1"/>
+        </w:numPr>
+        <w:spacing w:after="40"/>
+      </w:pPr>
+      <w:r>
+        <w:rPr>
+          <w:color w:val="1D2D3E"/>
+          <w:sz w:val="22"/>
+          <w:szCs w:val="22"/>
+        </w:rPr>
+        <w:t xml:space="preserve">  fmtK() hoisted to module scope (removed duplicate from Upcoming Cash inline fn)</w:t>
+      </w:r>
+    </w:p>
+    <w:p>
+      <w:pPr>
+        <w:pStyle w:val="ListParagraph"/>
+        <w:numPr>
+          <w:ilvl w:val="1"/>
+          <w:numId w:val="1"/>
+        </w:numPr>
+        <w:spacing w:after="40"/>
+      </w:pPr>
+      <w:r>
+        <w:rPr>
+          <w:color w:val="1D2D3E"/>
+          <w:sz w:val="22"/>
+          <w:szCs w:val="22"/>
+        </w:rPr>
+        <w:t xml:space="preserve">  Card placed after Finance Health section; hidden when all four billing amounts are zero</w:t>
       </w:r>
     </w:p>
     <w:p>

</xml_diff>

<commit_message>
docs(session-48): update PROGRESS.md, generate-docs.js, and FEATURES.docx with Session 48 changelog
</commit_message>
<xml_diff>
--- a/FEATURES.docx
+++ b/FEATURES.docx
@@ -45,7 +45,7 @@
           <w:sz w:val="20"/>
           <w:szCs w:val="20"/>
         </w:rPr>
-        <w:t xml:space="preserve">Generated: 2026-06-08</w:t>
+        <w:t xml:space="preserve">Generated: 2026-06-09</w:t>
       </w:r>
     </w:p>
     <w:p>
@@ -28020,6 +28020,240 @@
           </w:p>
         </w:tc>
       </w:tr>
+      <w:tr>
+        <w:tc>
+          <w:tcPr>
+            <w:shd w:color="F0F4F8" w:val="solid"/>
+          </w:tcPr>
+          <w:p>
+            <w:pPr>
+              <w:spacing w:after="40" w:before="40"/>
+            </w:pPr>
+            <w:r>
+              <w:rPr>
+                <w:b w:val="false"/>
+                <w:bCs w:val="false"/>
+                <w:color w:val="1D2D3E"/>
+                <w:sz w:val="20"/>
+                <w:szCs w:val="20"/>
+              </w:rPr>
+              <w:t xml:space="preserve">Session 48</w:t>
+            </w:r>
+          </w:p>
+        </w:tc>
+        <w:tc>
+          <w:tcPr>
+            <w:shd w:color="F0F4F8" w:val="solid"/>
+          </w:tcPr>
+          <w:p>
+            <w:pPr>
+              <w:spacing w:after="40" w:before="40"/>
+            </w:pPr>
+            <w:r>
+              <w:rPr>
+                <w:b w:val="false"/>
+                <w:bCs w:val="false"/>
+                <w:color w:val="1D2D3E"/>
+                <w:sz w:val="20"/>
+                <w:szCs w:val="20"/>
+              </w:rPr>
+              <w:t xml:space="preserve">ProcurementAnalytics delivery performance card — DeliveryPerfCard shows overdue/on-track/no-date counts + avg days late for open POs using delivery_date</w:t>
+            </w:r>
+          </w:p>
+        </w:tc>
+        <w:tc>
+          <w:tcPr>
+            <w:shd w:color="F0F4F8" w:val="solid"/>
+          </w:tcPr>
+          <w:p>
+            <w:pPr>
+              <w:spacing w:after="40" w:before="40"/>
+            </w:pPr>
+            <w:r>
+              <w:rPr>
+                <w:b w:val="false"/>
+                <w:bCs w:val="false"/>
+                <w:color w:val="1D2D3E"/>
+                <w:sz w:val="20"/>
+                <w:szCs w:val="20"/>
+              </w:rPr>
+              <w:t xml:space="preserve">Done</w:t>
+            </w:r>
+          </w:p>
+        </w:tc>
+        <w:tc>
+          <w:tcPr>
+            <w:shd w:color="F0F4F8" w:val="solid"/>
+          </w:tcPr>
+          <w:p>
+            <w:pPr>
+              <w:spacing w:after="40" w:before="40"/>
+            </w:pPr>
+            <w:r>
+              <w:rPr>
+                <w:b w:val="false"/>
+                <w:bCs w:val="false"/>
+                <w:color w:val="1D2D3E"/>
+                <w:sz w:val="20"/>
+                <w:szCs w:val="20"/>
+              </w:rPr>
+              <w:t xml:space="preserve">ProcurementAnalyticsScreen.tsx</w:t>
+            </w:r>
+          </w:p>
+        </w:tc>
+      </w:tr>
+      <w:tr>
+        <w:tc>
+          <w:p>
+            <w:pPr>
+              <w:spacing w:after="40" w:before="40"/>
+            </w:pPr>
+            <w:r>
+              <w:rPr>
+                <w:b w:val="false"/>
+                <w:bCs w:val="false"/>
+                <w:color w:val="1D2D3E"/>
+                <w:sz w:val="20"/>
+                <w:szCs w:val="20"/>
+              </w:rPr>
+              <w:t xml:space="preserve">Session 48</w:t>
+            </w:r>
+          </w:p>
+        </w:tc>
+        <w:tc>
+          <w:p>
+            <w:pPr>
+              <w:spacing w:after="40" w:before="40"/>
+            </w:pPr>
+            <w:r>
+              <w:rPr>
+                <w:b w:val="false"/>
+                <w:bCs w:val="false"/>
+                <w:color w:val="1D2D3E"/>
+                <w:sz w:val="20"/>
+                <w:szCs w:val="20"/>
+              </w:rPr>
+              <w:t xml:space="preserve">StockHealth Days Until Stockout badges — computeLedgerAnalysis produces dusMap from ledger velocity; ~Xd chips on low-stock items (dark ≤7d, mid 8-14d, gray 15+d)</w:t>
+            </w:r>
+          </w:p>
+        </w:tc>
+        <w:tc>
+          <w:p>
+            <w:pPr>
+              <w:spacing w:after="40" w:before="40"/>
+            </w:pPr>
+            <w:r>
+              <w:rPr>
+                <w:b w:val="false"/>
+                <w:bCs w:val="false"/>
+                <w:color w:val="1D2D3E"/>
+                <w:sz w:val="20"/>
+                <w:szCs w:val="20"/>
+              </w:rPr>
+              <w:t xml:space="preserve">Done</w:t>
+            </w:r>
+          </w:p>
+        </w:tc>
+        <w:tc>
+          <w:p>
+            <w:pPr>
+              <w:spacing w:after="40" w:before="40"/>
+            </w:pPr>
+            <w:r>
+              <w:rPr>
+                <w:b w:val="false"/>
+                <w:bCs w:val="false"/>
+                <w:color w:val="1D2D3E"/>
+                <w:sz w:val="20"/>
+                <w:szCs w:val="20"/>
+              </w:rPr>
+              <w:t xml:space="preserve">StockHealthScreen.tsx</w:t>
+            </w:r>
+          </w:p>
+        </w:tc>
+      </w:tr>
+      <w:tr>
+        <w:tc>
+          <w:tcPr>
+            <w:shd w:color="F0F4F8" w:val="solid"/>
+          </w:tcPr>
+          <w:p>
+            <w:pPr>
+              <w:spacing w:after="40" w:before="40"/>
+            </w:pPr>
+            <w:r>
+              <w:rPr>
+                <w:b w:val="false"/>
+                <w:bCs w:val="false"/>
+                <w:color w:val="1D2D3E"/>
+                <w:sz w:val="20"/>
+                <w:szCs w:val="20"/>
+              </w:rPr>
+              <w:t xml:space="preserve">Session 48</w:t>
+            </w:r>
+          </w:p>
+        </w:tc>
+        <w:tc>
+          <w:tcPr>
+            <w:shd w:color="F0F4F8" w:val="solid"/>
+          </w:tcPr>
+          <w:p>
+            <w:pPr>
+              <w:spacing w:after="40" w:before="40"/>
+            </w:pPr>
+            <w:r>
+              <w:rPr>
+                <w:b w:val="false"/>
+                <w:bCs w:val="false"/>
+                <w:color w:val="1D2D3E"/>
+                <w:sz w:val="20"/>
+                <w:szCs w:val="20"/>
+              </w:rPr>
+              <w:t xml:space="preserve">FinancialAnalytics NWC trend card — NWCTrendCard sparkline of daily AR-AP from aging history; 3-tile header (Surplus/Change/Days), bar height ∝ |NWC|</w:t>
+            </w:r>
+          </w:p>
+        </w:tc>
+        <w:tc>
+          <w:tcPr>
+            <w:shd w:color="F0F4F8" w:val="solid"/>
+          </w:tcPr>
+          <w:p>
+            <w:pPr>
+              <w:spacing w:after="40" w:before="40"/>
+            </w:pPr>
+            <w:r>
+              <w:rPr>
+                <w:b w:val="false"/>
+                <w:bCs w:val="false"/>
+                <w:color w:val="1D2D3E"/>
+                <w:sz w:val="20"/>
+                <w:szCs w:val="20"/>
+              </w:rPr>
+              <w:t xml:space="preserve">Done</w:t>
+            </w:r>
+          </w:p>
+        </w:tc>
+        <w:tc>
+          <w:tcPr>
+            <w:shd w:color="F0F4F8" w:val="solid"/>
+          </w:tcPr>
+          <w:p>
+            <w:pPr>
+              <w:spacing w:after="40" w:before="40"/>
+            </w:pPr>
+            <w:r>
+              <w:rPr>
+                <w:b w:val="false"/>
+                <w:bCs w:val="false"/>
+                <w:color w:val="1D2D3E"/>
+                <w:sz w:val="20"/>
+                <w:szCs w:val="20"/>
+              </w:rPr>
+              <w:t xml:space="preserve">FinancialAnalyticsScreen.tsx</w:t>
+            </w:r>
+          </w:p>
+        </w:tc>
+      </w:tr>
     </w:tbl>
     <w:p>
       <w:pPr>
@@ -33102,6 +33336,303 @@
           <w:szCs w:val="22"/>
         </w:rPr>
         <w:t xml:space="preserve">  Tapping a history row repopulates the query field</w:t>
+      </w:r>
+    </w:p>
+    <w:p>
+      <w:pPr>
+        <w:spacing w:after="80"/>
+      </w:pPr>
+      <w:r>
+        <w:rPr>
+          <w:color w:val="1D2D3E"/>
+          <w:sz w:val="22"/>
+          <w:szCs w:val="22"/>
+        </w:rPr>
+        <w:t xml:space="preserve"/>
+      </w:r>
+    </w:p>
+    <w:p>
+      <w:pPr>
+        <w:pStyle w:val="Heading2"/>
+        <w:spacing w:after="120" w:before="300"/>
+      </w:pPr>
+      <w:r>
+        <w:rPr>
+          <w:b/>
+          <w:bCs/>
+          <w:color w:val="1D2D3E"/>
+        </w:rPr>
+        <w:t xml:space="preserve">Session 48 — 2026-06-09</w:t>
+      </w:r>
+    </w:p>
+    <w:p>
+      <w:pPr>
+        <w:pStyle w:val="ListParagraph"/>
+        <w:numPr>
+          <w:ilvl w:val="0"/>
+          <w:numId w:val="1"/>
+        </w:numPr>
+        <w:spacing w:after="40"/>
+      </w:pPr>
+      <w:r>
+        <w:rPr>
+          <w:color w:val="1D2D3E"/>
+          <w:sz w:val="22"/>
+          <w:szCs w:val="22"/>
+        </w:rPr>
+        <w:t xml:space="preserve">ProcurementAnalytics Delivery Performance Card (ProcurementAnalyticsScreen.tsx)</w:t>
+      </w:r>
+    </w:p>
+    <w:p>
+      <w:pPr>
+        <w:pStyle w:val="ListParagraph"/>
+        <w:numPr>
+          <w:ilvl w:val="1"/>
+          <w:numId w:val="1"/>
+        </w:numPr>
+        <w:spacing w:after="40"/>
+      </w:pPr>
+      <w:r>
+        <w:rPr>
+          <w:color w:val="1D2D3E"/>
+          <w:sz w:val="22"/>
+          <w:szCs w:val="22"/>
+        </w:rPr>
+        <w:t xml:space="preserve">  computeDeliveryPerformance(): iterates open POs (status=open/approved/pending), classifies by delivery_date vs today</w:t>
+      </w:r>
+    </w:p>
+    <w:p>
+      <w:pPr>
+        <w:pStyle w:val="ListParagraph"/>
+        <w:numPr>
+          <w:ilvl w:val="1"/>
+          <w:numId w:val="1"/>
+        </w:numPr>
+        <w:spacing w:after="40"/>
+      </w:pPr>
+      <w:r>
+        <w:rPr>
+          <w:color w:val="1D2D3E"/>
+          <w:sz w:val="22"/>
+          <w:szCs w:val="22"/>
+        </w:rPr>
+        <w:t xml:space="preserve">  overdueCount/onTrackCount/noDateCount + avgOverdueDays + overdueValue totals</w:t>
+      </w:r>
+    </w:p>
+    <w:p>
+      <w:pPr>
+        <w:pStyle w:val="ListParagraph"/>
+        <w:numPr>
+          <w:ilvl w:val="1"/>
+          <w:numId w:val="1"/>
+        </w:numPr>
+        <w:spacing w:after="40"/>
+      </w:pPr>
+      <w:r>
+        <w:rPr>
+          <w:color w:val="1D2D3E"/>
+          <w:sz w:val="22"/>
+          <w:szCs w:val="22"/>
+        </w:rPr>
+        <w:t xml:space="preserve">  DeliveryPerfCard: 3-tile row (Overdue / On Track / Avg Late) + stacked progress bar + legend with overdue value annotation</w:t>
+      </w:r>
+    </w:p>
+    <w:p>
+      <w:pPr>
+        <w:pStyle w:val="ListParagraph"/>
+        <w:numPr>
+          <w:ilvl w:val="1"/>
+          <w:numId w:val="1"/>
+        </w:numPr>
+        <w:spacing w:after="40"/>
+      </w:pPr>
+      <w:r>
+        <w:rPr>
+          <w:color w:val="1D2D3E"/>
+          <w:sz w:val="22"/>
+          <w:szCs w:val="22"/>
+        </w:rPr>
+        <w:t xml:space="preserve">  Added to Analytics type and computeAnalytics return; rendered after Order Value Distribution</w:t>
+      </w:r>
+    </w:p>
+    <w:p>
+      <w:pPr>
+        <w:pStyle w:val="ListParagraph"/>
+        <w:numPr>
+          <w:ilvl w:val="0"/>
+          <w:numId w:val="1"/>
+        </w:numPr>
+        <w:spacing w:after="40"/>
+      </w:pPr>
+      <w:r>
+        <w:rPr>
+          <w:color w:val="1D2D3E"/>
+          <w:sz w:val="22"/>
+          <w:szCs w:val="22"/>
+        </w:rPr>
+        <w:t xml:space="preserve">StockHealth Days Until Stockout Badges (StockHealthScreen.tsx)</w:t>
+      </w:r>
+    </w:p>
+    <w:p>
+      <w:pPr>
+        <w:pStyle w:val="ListParagraph"/>
+        <w:numPr>
+          <w:ilvl w:val="1"/>
+          <w:numId w:val="1"/>
+        </w:numPr>
+        <w:spacing w:after="40"/>
+      </w:pPr>
+      <w:r>
+        <w:rPr>
+          <w:color w:val="1D2D3E"/>
+          <w:sz w:val="22"/>
+          <w:szCs w:val="22"/>
+        </w:rPr>
+        <w:t xml:space="preserve">  computeLedgerAnalysis(ledger, stock) replaces computeVelocity: detects ledger date range for period calculation</w:t>
+      </w:r>
+    </w:p>
+    <w:p>
+      <w:pPr>
+        <w:pStyle w:val="ListParagraph"/>
+        <w:numPr>
+          <w:ilvl w:val="1"/>
+          <w:numId w:val="1"/>
+        </w:numPr>
+        <w:spacing w:after="40"/>
+      </w:pPr>
+      <w:r>
+        <w:rPr>
+          <w:color w:val="1D2D3E"/>
+          <w:sz w:val="22"/>
+          <w:szCs w:val="22"/>
+        </w:rPr>
+        <w:t xml:space="preserve">  Produces velocityItems (top 8 by movement) + dusMap (Map&lt;itemName, days&gt;) for all items with outflow</w:t>
+      </w:r>
+    </w:p>
+    <w:p>
+      <w:pPr>
+        <w:pStyle w:val="ListParagraph"/>
+        <w:numPr>
+          <w:ilvl w:val="1"/>
+          <w:numId w:val="1"/>
+        </w:numPr>
+        <w:spacing w:after="40"/>
+      </w:pPr>
+      <w:r>
+        <w:rPr>
+          <w:color w:val="1D2D3E"/>
+          <w:sz w:val="22"/>
+          <w:szCs w:val="22"/>
+        </w:rPr>
+        <w:t xml:space="preserve">  DUS = currentQty / (totalOut / periodDays); items ≥365d or 0 stock excluded</w:t>
+      </w:r>
+    </w:p>
+    <w:p>
+      <w:pPr>
+        <w:pStyle w:val="ListParagraph"/>
+        <w:numPr>
+          <w:ilvl w:val="1"/>
+          <w:numId w:val="1"/>
+        </w:numPr>
+        <w:spacing w:after="40"/>
+      </w:pPr>
+      <w:r>
+        <w:rPr>
+          <w:color w:val="1D2D3E"/>
+          <w:sz w:val="22"/>
+          <w:szCs w:val="22"/>
+        </w:rPr>
+        <w:t xml:space="preserve">  RankedItemList: '~Xd' DUS badge shown per item when showLowWarning=true; dark ≤7d, mid 8–14d, gray 15+d</w:t>
+      </w:r>
+    </w:p>
+    <w:p>
+      <w:pPr>
+        <w:pStyle w:val="ListParagraph"/>
+        <w:numPr>
+          <w:ilvl w:val="0"/>
+          <w:numId w:val="1"/>
+        </w:numPr>
+        <w:spacing w:after="40"/>
+      </w:pPr>
+      <w:r>
+        <w:rPr>
+          <w:color w:val="1D2D3E"/>
+          <w:sz w:val="22"/>
+          <w:szCs w:val="22"/>
+        </w:rPr>
+        <w:t xml:space="preserve">FinancialAnalytics Net Working Capital Trend Card (FinancialAnalyticsScreen.tsx)</w:t>
+      </w:r>
+    </w:p>
+    <w:p>
+      <w:pPr>
+        <w:pStyle w:val="ListParagraph"/>
+        <w:numPr>
+          <w:ilvl w:val="1"/>
+          <w:numId w:val="1"/>
+        </w:numPr>
+        <w:spacing w:after="40"/>
+      </w:pPr>
+      <w:r>
+        <w:rPr>
+          <w:color w:val="1D2D3E"/>
+          <w:sz w:val="22"/>
+          <w:szCs w:val="22"/>
+        </w:rPr>
+        <w:t xml:space="preserve">  NWCTrendCard: computes NWC = arTotal − apTotal from last 10 AgingHistoryEntry records</w:t>
+      </w:r>
+    </w:p>
+    <w:p>
+      <w:pPr>
+        <w:pStyle w:val="ListParagraph"/>
+        <w:numPr>
+          <w:ilvl w:val="1"/>
+          <w:numId w:val="1"/>
+        </w:numPr>
+        <w:spacing w:after="40"/>
+      </w:pPr>
+      <w:r>
+        <w:rPr>
+          <w:color w:val="1D2D3E"/>
+          <w:sz w:val="22"/>
+          <w:szCs w:val="22"/>
+        </w:rPr>
+        <w:t xml:space="preserve">  3-tile header: Current NWC (Surplus/Deficit), Change vs earliest entry in window, Days recorded</w:t>
+      </w:r>
+    </w:p>
+    <w:p>
+      <w:pPr>
+        <w:pStyle w:val="ListParagraph"/>
+        <w:numPr>
+          <w:ilvl w:val="1"/>
+          <w:numId w:val="1"/>
+        </w:numPr>
+        <w:spacing w:after="40"/>
+      </w:pPr>
+      <w:r>
+        <w:rPr>
+          <w:color w:val="1D2D3E"/>
+          <w:sz w:val="22"/>
+          <w:szCs w:val="22"/>
+        </w:rPr>
+        <w:t xml:space="preserve">  Sparkline: bar height ∝ |NWC|/max; dark fill positive (AR&gt;AP), muted fill negative (AP&gt;AR)</w:t>
+      </w:r>
+    </w:p>
+    <w:p>
+      <w:pPr>
+        <w:pStyle w:val="ListParagraph"/>
+        <w:numPr>
+          <w:ilvl w:val="1"/>
+          <w:numId w:val="1"/>
+        </w:numPr>
+        <w:spacing w:after="40"/>
+      </w:pPr>
+      <w:r>
+        <w:rPr>
+          <w:color w:val="1D2D3E"/>
+          <w:sz w:val="22"/>
+          <w:szCs w:val="22"/>
+        </w:rPr>
+        <w:t xml:space="preserve">  Baseline axis + date range labels; hidden when &lt; 2 history entries</w:t>
       </w:r>
     </w:p>
     <w:p>

</xml_diff>

<commit_message>
docs(session-49): update PROGRESS.md, generate-docs.js, and FEATURES.docx with Session 49 changelog
</commit_message>
<xml_diff>
--- a/FEATURES.docx
+++ b/FEATURES.docx
@@ -28254,6 +28254,228 @@
           </w:p>
         </w:tc>
       </w:tr>
+      <w:tr>
+        <w:tc>
+          <w:p>
+            <w:pPr>
+              <w:spacing w:after="40" w:before="40"/>
+            </w:pPr>
+            <w:r>
+              <w:rPr>
+                <w:b w:val="false"/>
+                <w:bCs w:val="false"/>
+                <w:color w:val="1D2D3E"/>
+                <w:sz w:val="20"/>
+                <w:szCs w:val="20"/>
+              </w:rPr>
+              <w:t xml:space="preserve">Session 49</w:t>
+            </w:r>
+          </w:p>
+        </w:tc>
+        <w:tc>
+          <w:p>
+            <w:pPr>
+              <w:spacing w:after="40" w:before="40"/>
+            </w:pPr>
+            <w:r>
+              <w:rPr>
+                <w:b w:val="false"/>
+                <w:bCs w:val="false"/>
+                <w:color w:val="1D2D3E"/>
+                <w:sz w:val="20"/>
+                <w:szCs w:val="20"/>
+              </w:rPr>
+              <w:t xml:space="preserve">JournalEntries account activity heat map — AccountActivityList aggregates JE lines by account, shows top 8 with split Dr/Cr stacked bars in JESummaryCard</w:t>
+            </w:r>
+          </w:p>
+        </w:tc>
+        <w:tc>
+          <w:p>
+            <w:pPr>
+              <w:spacing w:after="40" w:before="40"/>
+            </w:pPr>
+            <w:r>
+              <w:rPr>
+                <w:b w:val="false"/>
+                <w:bCs w:val="false"/>
+                <w:color w:val="1D2D3E"/>
+                <w:sz w:val="20"/>
+                <w:szCs w:val="20"/>
+              </w:rPr>
+              <w:t xml:space="preserve">Done</w:t>
+            </w:r>
+          </w:p>
+        </w:tc>
+        <w:tc>
+          <w:p>
+            <w:pPr>
+              <w:spacing w:after="40" w:before="40"/>
+            </w:pPr>
+            <w:r>
+              <w:rPr>
+                <w:b w:val="false"/>
+                <w:bCs w:val="false"/>
+                <w:color w:val="1D2D3E"/>
+                <w:sz w:val="20"/>
+                <w:szCs w:val="20"/>
+              </w:rPr>
+              <w:t xml:space="preserve">JournalEntriesScreen.tsx</w:t>
+            </w:r>
+          </w:p>
+        </w:tc>
+      </w:tr>
+      <w:tr>
+        <w:tc>
+          <w:tcPr>
+            <w:shd w:color="F0F4F8" w:val="solid"/>
+          </w:tcPr>
+          <w:p>
+            <w:pPr>
+              <w:spacing w:after="40" w:before="40"/>
+            </w:pPr>
+            <w:r>
+              <w:rPr>
+                <w:b w:val="false"/>
+                <w:bCs w:val="false"/>
+                <w:color w:val="1D2D3E"/>
+                <w:sz w:val="20"/>
+                <w:szCs w:val="20"/>
+              </w:rPr>
+              <w:t xml:space="preserve">Session 49</w:t>
+            </w:r>
+          </w:p>
+        </w:tc>
+        <w:tc>
+          <w:tcPr>
+            <w:shd w:color="F0F4F8" w:val="solid"/>
+          </w:tcPr>
+          <w:p>
+            <w:pPr>
+              <w:spacing w:after="40" w:before="40"/>
+            </w:pPr>
+            <w:r>
+              <w:rPr>
+                <w:b w:val="false"/>
+                <w:bCs w:val="false"/>
+                <w:color w:val="1D2D3E"/>
+                <w:sz w:val="20"/>
+                <w:szCs w:val="20"/>
+              </w:rPr>
+              <w:t xml:space="preserve">ProcurementAnalytics supplier lead time — computeLeadTime() uses PO dt + delivery_date; LeadTimeChart ranks vendors fastest→slowest with min/max range</w:t>
+            </w:r>
+          </w:p>
+        </w:tc>
+        <w:tc>
+          <w:tcPr>
+            <w:shd w:color="F0F4F8" w:val="solid"/>
+          </w:tcPr>
+          <w:p>
+            <w:pPr>
+              <w:spacing w:after="40" w:before="40"/>
+            </w:pPr>
+            <w:r>
+              <w:rPr>
+                <w:b w:val="false"/>
+                <w:bCs w:val="false"/>
+                <w:color w:val="1D2D3E"/>
+                <w:sz w:val="20"/>
+                <w:szCs w:val="20"/>
+              </w:rPr>
+              <w:t xml:space="preserve">Done</w:t>
+            </w:r>
+          </w:p>
+        </w:tc>
+        <w:tc>
+          <w:tcPr>
+            <w:shd w:color="F0F4F8" w:val="solid"/>
+          </w:tcPr>
+          <w:p>
+            <w:pPr>
+              <w:spacing w:after="40" w:before="40"/>
+            </w:pPr>
+            <w:r>
+              <w:rPr>
+                <w:b w:val="false"/>
+                <w:bCs w:val="false"/>
+                <w:color w:val="1D2D3E"/>
+                <w:sz w:val="20"/>
+                <w:szCs w:val="20"/>
+              </w:rPr>
+              <w:t xml:space="preserve">ProcurementAnalyticsScreen.tsx</w:t>
+            </w:r>
+          </w:p>
+        </w:tc>
+      </w:tr>
+      <w:tr>
+        <w:tc>
+          <w:p>
+            <w:pPr>
+              <w:spacing w:after="40" w:before="40"/>
+            </w:pPr>
+            <w:r>
+              <w:rPr>
+                <w:b w:val="false"/>
+                <w:bCs w:val="false"/>
+                <w:color w:val="1D2D3E"/>
+                <w:sz w:val="20"/>
+                <w:szCs w:val="20"/>
+              </w:rPr>
+              <w:t xml:space="preserve">Session 49</w:t>
+            </w:r>
+          </w:p>
+        </w:tc>
+        <w:tc>
+          <w:p>
+            <w:pPr>
+              <w:spacing w:after="40" w:before="40"/>
+            </w:pPr>
+            <w:r>
+              <w:rPr>
+                <w:b w:val="false"/>
+                <w:bCs w:val="false"/>
+                <w:color w:val="1D2D3E"/>
+                <w:sz w:val="20"/>
+                <w:szCs w:val="20"/>
+              </w:rPr>
+              <w:t xml:space="preserve">Dashboard financial health score card — FinancialHealthCard computes 0-100 score + grade (A-F) from AP/AR aging buckets; shown after Aging Breakdown</w:t>
+            </w:r>
+          </w:p>
+        </w:tc>
+        <w:tc>
+          <w:p>
+            <w:pPr>
+              <w:spacing w:after="40" w:before="40"/>
+            </w:pPr>
+            <w:r>
+              <w:rPr>
+                <w:b w:val="false"/>
+                <w:bCs w:val="false"/>
+                <w:color w:val="1D2D3E"/>
+                <w:sz w:val="20"/>
+                <w:szCs w:val="20"/>
+              </w:rPr>
+              <w:t xml:space="preserve">Done</w:t>
+            </w:r>
+          </w:p>
+        </w:tc>
+        <w:tc>
+          <w:p>
+            <w:pPr>
+              <w:spacing w:after="40" w:before="40"/>
+            </w:pPr>
+            <w:r>
+              <w:rPr>
+                <w:b w:val="false"/>
+                <w:bCs w:val="false"/>
+                <w:color w:val="1D2D3E"/>
+                <w:sz w:val="20"/>
+                <w:szCs w:val="20"/>
+              </w:rPr>
+              <w:t xml:space="preserve">DashboardScreen.tsx</w:t>
+            </w:r>
+          </w:p>
+        </w:tc>
+      </w:tr>
     </w:tbl>
     <w:p>
       <w:pPr>
@@ -33336,6 +33558,267 @@
           <w:szCs w:val="22"/>
         </w:rPr>
         <w:t xml:space="preserve">  Tapping a history row repopulates the query field</w:t>
+      </w:r>
+    </w:p>
+    <w:p>
+      <w:pPr>
+        <w:spacing w:after="80"/>
+      </w:pPr>
+      <w:r>
+        <w:rPr>
+          <w:color w:val="1D2D3E"/>
+          <w:sz w:val="22"/>
+          <w:szCs w:val="22"/>
+        </w:rPr>
+        <w:t xml:space="preserve"/>
+      </w:r>
+    </w:p>
+    <w:p>
+      <w:pPr>
+        <w:pStyle w:val="Heading2"/>
+        <w:spacing w:after="120" w:before="300"/>
+      </w:pPr>
+      <w:r>
+        <w:rPr>
+          <w:b/>
+          <w:bCs/>
+          <w:color w:val="1D2D3E"/>
+        </w:rPr>
+        <w:t xml:space="preserve">Session 49 — 2026-06-09</w:t>
+      </w:r>
+    </w:p>
+    <w:p>
+      <w:pPr>
+        <w:pStyle w:val="ListParagraph"/>
+        <w:numPr>
+          <w:ilvl w:val="0"/>
+          <w:numId w:val="1"/>
+        </w:numPr>
+        <w:spacing w:after="40"/>
+      </w:pPr>
+      <w:r>
+        <w:rPr>
+          <w:color w:val="1D2D3E"/>
+          <w:sz w:val="22"/>
+          <w:szCs w:val="22"/>
+        </w:rPr>
+        <w:t xml:space="preserve">JournalEntries Account Activity Heat Map (JournalEntriesScreen.tsx)</w:t>
+      </w:r>
+    </w:p>
+    <w:p>
+      <w:pPr>
+        <w:pStyle w:val="ListParagraph"/>
+        <w:numPr>
+          <w:ilvl w:val="1"/>
+          <w:numId w:val="1"/>
+        </w:numPr>
+        <w:spacing w:after="40"/>
+      </w:pPr>
+      <w:r>
+        <w:rPr>
+          <w:color w:val="1D2D3E"/>
+          <w:sz w:val="22"/>
+          <w:szCs w:val="22"/>
+        </w:rPr>
+        <w:t xml:space="preserve">  buildAccountActivity(entries): flattens entry.lines, groups by account name, sums Dr/Cr, returns top 8 by total</w:t>
+      </w:r>
+    </w:p>
+    <w:p>
+      <w:pPr>
+        <w:pStyle w:val="ListParagraph"/>
+        <w:numPr>
+          <w:ilvl w:val="1"/>
+          <w:numId w:val="1"/>
+        </w:numPr>
+        <w:spacing w:after="40"/>
+      </w:pPr>
+      <w:r>
+        <w:rPr>
+          <w:color w:val="1D2D3E"/>
+          <w:sz w:val="22"/>
+          <w:szCs w:val="22"/>
+        </w:rPr>
+        <w:t xml:space="preserve">  AccountActivityList: compact ranked rows — account name, split Dr bar (dark) + Cr bar (muted) scaled to max, total amount</w:t>
+      </w:r>
+    </w:p>
+    <w:p>
+      <w:pPr>
+        <w:pStyle w:val="ListParagraph"/>
+        <w:numPr>
+          <w:ilvl w:val="1"/>
+          <w:numId w:val="1"/>
+        </w:numPr>
+        <w:spacing w:after="40"/>
+      </w:pPr>
+      <w:r>
+        <w:rPr>
+          <w:color w:val="1D2D3E"/>
+          <w:sz w:val="22"/>
+          <w:szCs w:val="22"/>
+        </w:rPr>
+        <w:t xml:space="preserve">  Rendered inside JESummaryCard after DrCrFlowChart; hidden when no entries have line data</w:t>
+      </w:r>
+    </w:p>
+    <w:p>
+      <w:pPr>
+        <w:pStyle w:val="ListParagraph"/>
+        <w:numPr>
+          <w:ilvl w:val="0"/>
+          <w:numId w:val="1"/>
+        </w:numPr>
+        <w:spacing w:after="40"/>
+      </w:pPr>
+      <w:r>
+        <w:rPr>
+          <w:color w:val="1D2D3E"/>
+          <w:sz w:val="22"/>
+          <w:szCs w:val="22"/>
+        </w:rPr>
+        <w:t xml:space="preserve">ProcurementAnalytics Supplier Lead Time Chart (ProcurementAnalyticsScreen.tsx)</w:t>
+      </w:r>
+    </w:p>
+    <w:p>
+      <w:pPr>
+        <w:pStyle w:val="ListParagraph"/>
+        <w:numPr>
+          <w:ilvl w:val="1"/>
+          <w:numId w:val="1"/>
+        </w:numPr>
+        <w:spacing w:after="40"/>
+      </w:pPr>
+      <w:r>
+        <w:rPr>
+          <w:color w:val="1D2D3E"/>
+          <w:sz w:val="22"/>
+          <w:szCs w:val="22"/>
+        </w:rPr>
+        <w:t xml:space="preserve">  computeLeadTime(pos): uses PO dt + delivery_date, computes days diff, groups by vendor, returns top 8 sorted fastest→slowest</w:t>
+      </w:r>
+    </w:p>
+    <w:p>
+      <w:pPr>
+        <w:pStyle w:val="ListParagraph"/>
+        <w:numPr>
+          <w:ilvl w:val="1"/>
+          <w:numId w:val="1"/>
+        </w:numPr>
+        <w:spacing w:after="40"/>
+      </w:pPr>
+      <w:r>
+        <w:rPr>
+          <w:color w:val="1D2D3E"/>
+          <w:sz w:val="22"/>
+          <w:szCs w:val="22"/>
+        </w:rPr>
+        <w:t xml:space="preserve">  Skips negative or &gt;365d outliers; calculates avgDays, minDays, maxDays, poCount per vendor</w:t>
+      </w:r>
+    </w:p>
+    <w:p>
+      <w:pPr>
+        <w:pStyle w:val="ListParagraph"/>
+        <w:numPr>
+          <w:ilvl w:val="1"/>
+          <w:numId w:val="1"/>
+        </w:numPr>
+        <w:spacing w:after="40"/>
+      </w:pPr>
+      <w:r>
+        <w:rPr>
+          <w:color w:val="1D2D3E"/>
+          <w:sz w:val="22"/>
+          <w:szCs w:val="22"/>
+        </w:rPr>
+        <w:t xml:space="preserve">  LeadTimeChart: numbered rank badges, vendor name, proportional bar, avg/range/count on right</w:t>
+      </w:r>
+    </w:p>
+    <w:p>
+      <w:pPr>
+        <w:pStyle w:val="ListParagraph"/>
+        <w:numPr>
+          <w:ilvl w:val="1"/>
+          <w:numId w:val="1"/>
+        </w:numPr>
+        <w:spacing w:after="40"/>
+      </w:pPr>
+      <w:r>
+        <w:rPr>
+          <w:color w:val="1D2D3E"/>
+          <w:sz w:val="22"/>
+          <w:szCs w:val="22"/>
+        </w:rPr>
+        <w:t xml:space="preserve">  Empty state: 'No lead time data — set delivery dates on POs'; rendered after Delivery Performance section</w:t>
+      </w:r>
+    </w:p>
+    <w:p>
+      <w:pPr>
+        <w:pStyle w:val="ListParagraph"/>
+        <w:numPr>
+          <w:ilvl w:val="0"/>
+          <w:numId w:val="1"/>
+        </w:numPr>
+        <w:spacing w:after="40"/>
+      </w:pPr>
+      <w:r>
+        <w:rPr>
+          <w:color w:val="1D2D3E"/>
+          <w:sz w:val="22"/>
+          <w:szCs w:val="22"/>
+        </w:rPr>
+        <w:t xml:space="preserve">Dashboard Financial Health Score Card (DashboardScreen.tsx)</w:t>
+      </w:r>
+    </w:p>
+    <w:p>
+      <w:pPr>
+        <w:pStyle w:val="ListParagraph"/>
+        <w:numPr>
+          <w:ilvl w:val="1"/>
+          <w:numId w:val="1"/>
+        </w:numPr>
+        <w:spacing w:after="40"/>
+      </w:pPr>
+      <w:r>
+        <w:rPr>
+          <w:color w:val="1D2D3E"/>
+          <w:sz w:val="22"/>
+          <w:szCs w:val="22"/>
+        </w:rPr>
+        <w:t xml:space="preserve">  computeHealthScore(): 'healthy' = current + 1-30d aging buckets; apPct + arPct = healthy/total; score = avg; grade A/B/C/D/F</w:t>
+      </w:r>
+    </w:p>
+    <w:p>
+      <w:pPr>
+        <w:pStyle w:val="ListParagraph"/>
+        <w:numPr>
+          <w:ilvl w:val="1"/>
+          <w:numId w:val="1"/>
+        </w:numPr>
+        <w:spacing w:after="40"/>
+      </w:pPr>
+      <w:r>
+        <w:rPr>
+          <w:color w:val="1D2D3E"/>
+          <w:sz w:val="22"/>
+          <w:szCs w:val="22"/>
+        </w:rPr>
+        <w:t xml:space="preserve">  FinancialHealthCard: 36px score number + letter grade badge + status label + AP/AR health bars + hint text</w:t>
+      </w:r>
+    </w:p>
+    <w:p>
+      <w:pPr>
+        <w:pStyle w:val="ListParagraph"/>
+        <w:numPr>
+          <w:ilvl w:val="1"/>
+          <w:numId w:val="1"/>
+        </w:numPr>
+        <w:spacing w:after="40"/>
+      </w:pPr>
+      <w:r>
+        <w:rPr>
+          <w:color w:val="1D2D3E"/>
+          <w:sz w:val="22"/>
+          <w:szCs w:val="22"/>
+        </w:rPr>
+        <w:t xml:space="preserve">  Hidden when both AP and AR total = 0; shown after Aging Breakdown, before Top Vendors</w:t>
       </w:r>
     </w:p>
     <w:p>

</xml_diff>

<commit_message>
docs(session-51): update PROGRESS.md, generate-docs.js, and FEATURES.docx with Session 51 changelog
https://claude.ai/code/session_016635zSXzYzy6bTNpTozJzR
</commit_message>
<xml_diff>
--- a/FEATURES.docx
+++ b/FEATURES.docx
@@ -45,7 +45,7 @@
           <w:sz w:val="20"/>
           <w:szCs w:val="20"/>
         </w:rPr>
-        <w:t xml:space="preserve">Generated: 2026-06-09</w:t>
+        <w:t xml:space="preserve">Generated: 2026-06-10</w:t>
       </w:r>
     </w:p>
     <w:p>
@@ -13224,6 +13224,726 @@
           <w:bCs/>
           <w:color w:val="1D2D3E"/>
         </w:rPr>
+        <w:t xml:space="preserve">3.71 JournalEntries Account &amp; Type Drill-Down (Session 51)</w:t>
+      </w:r>
+    </w:p>
+    <w:p>
+      <w:pPr>
+        <w:pStyle w:val="ListParagraph"/>
+        <w:numPr>
+          <w:ilvl w:val="0"/>
+          <w:numId w:val="1"/>
+        </w:numPr>
+        <w:spacing w:after="40"/>
+      </w:pPr>
+      <w:r>
+        <w:rPr>
+          <w:color w:val="1D2D3E"/>
+          <w:sz w:val="22"/>
+          <w:szCs w:val="22"/>
+        </w:rPr>
+        <w:t xml:space="preserve">AccountActivityList gains onSelectAccount?: (account) =&gt; void prop; rows become TouchableOpacity when prop is set</w:t>
+      </w:r>
+    </w:p>
+    <w:p>
+      <w:pPr>
+        <w:pStyle w:val="ListParagraph"/>
+        <w:numPr>
+          <w:ilvl w:val="1"/>
+          <w:numId w:val="1"/>
+        </w:numPr>
+        <w:spacing w:after="40"/>
+      </w:pPr>
+      <w:r>
+        <w:rPr>
+          <w:color w:val="1D2D3E"/>
+          <w:sz w:val="22"/>
+          <w:szCs w:val="22"/>
+        </w:rPr>
+        <w:t xml:space="preserve">  'tap to filter' hint shown in legend row when onSelectAccount is provided; chevron-right icon per row</w:t>
+      </w:r>
+    </w:p>
+    <w:p>
+      <w:pPr>
+        <w:pStyle w:val="ListParagraph"/>
+        <w:numPr>
+          <w:ilvl w:val="0"/>
+          <w:numId w:val="1"/>
+        </w:numPr>
+        <w:spacing w:after="40"/>
+      </w:pPr>
+      <w:r>
+        <w:rPr>
+          <w:color w:val="1D2D3E"/>
+          <w:sz w:val="22"/>
+          <w:szCs w:val="22"/>
+        </w:rPr>
+        <w:t xml:space="preserve">JESummaryCard gains onSelectAccount + onSelectType props; type bars also become TouchableOpacity when onSelectType set</w:t>
+      </w:r>
+    </w:p>
+    <w:p>
+      <w:pPr>
+        <w:pStyle w:val="ListParagraph"/>
+        <w:numPr>
+          <w:ilvl w:val="1"/>
+          <w:numId w:val="1"/>
+        </w:numPr>
+        <w:spacing w:after="40"/>
+      </w:pPr>
+      <w:r>
+        <w:rPr>
+          <w:color w:val="1D2D3E"/>
+          <w:sz w:val="22"/>
+          <w:szCs w:val="22"/>
+        </w:rPr>
+        <w:t xml:space="preserve">  Chevron-right added to each type bar row when tappable</w:t>
+      </w:r>
+    </w:p>
+    <w:p>
+      <w:pPr>
+        <w:pStyle w:val="ListParagraph"/>
+        <w:numPr>
+          <w:ilvl w:val="0"/>
+          <w:numId w:val="1"/>
+        </w:numPr>
+        <w:spacing w:after="40"/>
+      </w:pPr>
+      <w:r>
+        <w:rPr>
+          <w:color w:val="1D2D3E"/>
+          <w:sz w:val="22"/>
+          <w:szCs w:val="22"/>
+        </w:rPr>
+        <w:t xml:space="preserve">JournalEntriesScreen: scrollRef added to ScrollView; handleSelectAccount sets pickedAccount + pickedAccountName + scrolls to top</w:t>
+      </w:r>
+    </w:p>
+    <w:p>
+      <w:pPr>
+        <w:pStyle w:val="ListParagraph"/>
+        <w:numPr>
+          <w:ilvl w:val="1"/>
+          <w:numId w:val="1"/>
+        </w:numPr>
+        <w:spacing w:after="40"/>
+      </w:pPr>
+      <w:r>
+        <w:rPr>
+          <w:color w:val="1D2D3E"/>
+          <w:sz w:val="22"/>
+          <w:szCs w:val="22"/>
+        </w:rPr>
+        <w:t xml:space="preserve">  handleSelectType sets selectedType chip + scrolls to top — mirrors account filter UX</w:t>
+      </w:r>
+    </w:p>
+    <w:p>
+      <w:pPr>
+        <w:pStyle w:val="ListParagraph"/>
+        <w:numPr>
+          <w:ilvl w:val="1"/>
+          <w:numId w:val="1"/>
+        </w:numPr>
+        <w:spacing w:after="40"/>
+      </w:pPr>
+      <w:r>
+        <w:rPr>
+          <w:color w:val="1D2D3E"/>
+          <w:sz w:val="22"/>
+          <w:szCs w:val="22"/>
+        </w:rPr>
+        <w:t xml:space="preserve">  Both callbacks passed to JESummaryCard via onSelectAccount/onSelectType props</w:t>
+      </w:r>
+    </w:p>
+    <w:p>
+      <w:pPr>
+        <w:spacing w:after="80"/>
+      </w:pPr>
+      <w:r>
+        <w:rPr>
+          <w:color w:val="1D2D3E"/>
+          <w:sz w:val="22"/>
+          <w:szCs w:val="22"/>
+        </w:rPr>
+        <w:t xml:space="preserve"/>
+      </w:r>
+    </w:p>
+    <w:p>
+      <w:pPr>
+        <w:pStyle w:val="Heading2"/>
+        <w:spacing w:after="120" w:before="300"/>
+      </w:pPr>
+      <w:r>
+        <w:rPr>
+          <w:b/>
+          <w:bCs/>
+          <w:color w:val="1D2D3E"/>
+        </w:rPr>
+        <w:t xml:space="preserve">3.72 Dashboard Health Card Navigation &amp; KPICard Mini-Charts (Session 51)</w:t>
+      </w:r>
+    </w:p>
+    <w:p>
+      <w:pPr>
+        <w:pStyle w:val="ListParagraph"/>
+        <w:numPr>
+          <w:ilvl w:val="0"/>
+          <w:numId w:val="1"/>
+        </w:numPr>
+        <w:spacing w:after="40"/>
+      </w:pPr>
+      <w:r>
+        <w:rPr>
+          <w:color w:val="1D2D3E"/>
+          <w:sz w:val="22"/>
+          <w:szCs w:val="22"/>
+        </w:rPr>
+        <w:t xml:space="preserve">FinancialHealthCard gains onPress?: () =&gt; void prop; card wraps in TouchableOpacity when provided</w:t>
+      </w:r>
+    </w:p>
+    <w:p>
+      <w:pPr>
+        <w:pStyle w:val="ListParagraph"/>
+        <w:numPr>
+          <w:ilvl w:val="1"/>
+          <w:numId w:val="1"/>
+        </w:numPr>
+        <w:spacing w:after="40"/>
+      </w:pPr>
+      <w:r>
+        <w:rPr>
+          <w:color w:val="1D2D3E"/>
+          <w:sz w:val="22"/>
+          <w:szCs w:val="22"/>
+        </w:rPr>
+        <w:t xml:space="preserve">  Chevron-right icon added to top row; hint text appends '· tap for full breakdown'</w:t>
+      </w:r>
+    </w:p>
+    <w:p>
+      <w:pPr>
+        <w:pStyle w:val="ListParagraph"/>
+        <w:numPr>
+          <w:ilvl w:val="1"/>
+          <w:numId w:val="1"/>
+        </w:numPr>
+        <w:spacing w:after="40"/>
+      </w:pPr>
+      <w:r>
+        <w:rPr>
+          <w:color w:val="1D2D3E"/>
+          <w:sz w:val="22"/>
+          <w:szCs w:val="22"/>
+        </w:rPr>
+        <w:t xml:space="preserve">  Dashboard wires onPress → navigation.navigate('More', { screen: 'FinancialAnalytics' })</w:t>
+      </w:r>
+    </w:p>
+    <w:p>
+      <w:pPr>
+        <w:pStyle w:val="ListParagraph"/>
+        <w:numPr>
+          <w:ilvl w:val="0"/>
+          <w:numId w:val="1"/>
+        </w:numPr>
+        <w:spacing w:after="40"/>
+      </w:pPr>
+      <w:r>
+        <w:rPr>
+          <w:color w:val="1D2D3E"/>
+          <w:sz w:val="22"/>
+          <w:szCs w:val="22"/>
+        </w:rPr>
+        <w:t xml:space="preserve">KPICard gains miniChart?: { prev, curr, prevLabel?, currLabel? } prop</w:t>
+      </w:r>
+    </w:p>
+    <w:p>
+      <w:pPr>
+        <w:pStyle w:val="ListParagraph"/>
+        <w:numPr>
+          <w:ilvl w:val="1"/>
+          <w:numId w:val="1"/>
+        </w:numPr>
+        <w:spacing w:after="40"/>
+      </w:pPr>
+      <w:r>
+        <w:rPr>
+          <w:color w:val="1D2D3E"/>
+          <w:sz w:val="22"/>
+          <w:szCs w:val="22"/>
+        </w:rPr>
+        <w:t xml:space="preserve">  MiniBarChart: two side-by-side bars (prev=light, curr=dark) with month labels; max height 28px</w:t>
+      </w:r>
+    </w:p>
+    <w:p>
+      <w:pPr>
+        <w:pStyle w:val="ListParagraph"/>
+        <w:numPr>
+          <w:ilvl w:val="1"/>
+          <w:numId w:val="1"/>
+        </w:numPr>
+        <w:spacing w:after="40"/>
+      </w:pPr>
+      <w:r>
+        <w:rPr>
+          <w:color w:val="1D2D3E"/>
+          <w:sz w:val="22"/>
+          <w:szCs w:val="22"/>
+        </w:rPr>
+        <w:t xml:space="preserve">  Dashboard Net Income KPI card passes miniChart when prevNetIncome is available</w:t>
+      </w:r>
+    </w:p>
+    <w:p>
+      <w:pPr>
+        <w:pStyle w:val="ListParagraph"/>
+        <w:numPr>
+          <w:ilvl w:val="0"/>
+          <w:numId w:val="1"/>
+        </w:numPr>
+        <w:spacing w:after="40"/>
+      </w:pPr>
+      <w:r>
+        <w:rPr>
+          <w:color w:val="1D2D3E"/>
+          <w:sz w:val="22"/>
+          <w:szCs w:val="22"/>
+        </w:rPr>
+        <w:t xml:space="preserve">Dashboard vouchers section: new KPI row with 'This Month' + 'Today' KPI cards</w:t>
+      </w:r>
+    </w:p>
+    <w:p>
+      <w:pPr>
+        <w:pStyle w:val="ListParagraph"/>
+        <w:numPr>
+          <w:ilvl w:val="1"/>
+          <w:numId w:val="1"/>
+        </w:numPr>
+        <w:spacing w:after="40"/>
+      </w:pPr>
+      <w:r>
+        <w:rPr>
+          <w:color w:val="1D2D3E"/>
+          <w:sz w:val="22"/>
+          <w:szCs w:val="22"/>
+        </w:rPr>
+        <w:t xml:space="preserve">  'This Month' card shows miniChart with prev/curr month voucher counts when vouchersPrevMonth is non-null</w:t>
+      </w:r>
+    </w:p>
+    <w:p>
+      <w:pPr>
+        <w:spacing w:after="80"/>
+      </w:pPr>
+      <w:r>
+        <w:rPr>
+          <w:color w:val="1D2D3E"/>
+          <w:sz w:val="22"/>
+          <w:szCs w:val="22"/>
+        </w:rPr>
+        <w:t xml:space="preserve"/>
+      </w:r>
+    </w:p>
+    <w:p>
+      <w:pPr>
+        <w:pStyle w:val="Heading2"/>
+        <w:spacing w:after="120" w:before="300"/>
+      </w:pPr>
+      <w:r>
+        <w:rPr>
+          <w:b/>
+          <w:bCs/>
+          <w:color w:val="1D2D3E"/>
+        </w:rPr>
+        <w:t xml:space="preserve">3.73 ProcurementAnalytics Lead Time Monthly Trend Chart (Session 51)</w:t>
+      </w:r>
+    </w:p>
+    <w:p>
+      <w:pPr>
+        <w:pStyle w:val="ListParagraph"/>
+        <w:numPr>
+          <w:ilvl w:val="0"/>
+          <w:numId w:val="1"/>
+        </w:numPr>
+        <w:spacing w:after="40"/>
+      </w:pPr>
+      <w:r>
+        <w:rPr>
+          <w:color w:val="1D2D3E"/>
+          <w:sz w:val="22"/>
+          <w:szCs w:val="22"/>
+        </w:rPr>
+        <w:t xml:space="preserve">MonthLeadTime interface: { monthLabel, avgDays, poCount, isCurrent }</w:t>
+      </w:r>
+    </w:p>
+    <w:p>
+      <w:pPr>
+        <w:pStyle w:val="ListParagraph"/>
+        <w:numPr>
+          <w:ilvl w:val="0"/>
+          <w:numId w:val="1"/>
+        </w:numPr>
+        <w:spacing w:after="40"/>
+      </w:pPr>
+      <w:r>
+        <w:rPr>
+          <w:color w:val="1D2D3E"/>
+          <w:sz w:val="22"/>
+          <w:szCs w:val="22"/>
+        </w:rPr>
+        <w:t xml:space="preserve">computeLeadTimeTrend(pos): groups POs by dt month for last 6 months; computes avg order-to-delivery days per month</w:t>
+      </w:r>
+    </w:p>
+    <w:p>
+      <w:pPr>
+        <w:pStyle w:val="ListParagraph"/>
+        <w:numPr>
+          <w:ilvl w:val="1"/>
+          <w:numId w:val="1"/>
+        </w:numPr>
+        <w:spacing w:after="40"/>
+      </w:pPr>
+      <w:r>
+        <w:rPr>
+          <w:color w:val="1D2D3E"/>
+          <w:sz w:val="22"/>
+          <w:szCs w:val="22"/>
+        </w:rPr>
+        <w:t xml:space="preserve">  Skips POs without both dt and delivery_date; excludes outliers &lt;0d or &gt;365d</w:t>
+      </w:r>
+    </w:p>
+    <w:p>
+      <w:pPr>
+        <w:pStyle w:val="ListParagraph"/>
+        <w:numPr>
+          <w:ilvl w:val="1"/>
+          <w:numId w:val="1"/>
+        </w:numPr>
+        <w:spacing w:after="40"/>
+      </w:pPr>
+      <w:r>
+        <w:rPr>
+          <w:color w:val="1D2D3E"/>
+          <w:sz w:val="22"/>
+          <w:szCs w:val="22"/>
+        </w:rPr>
+        <w:t xml:space="preserve">  Months with no qualifying POs show avgDays=0 and poCount=0</w:t>
+      </w:r>
+    </w:p>
+    <w:p>
+      <w:pPr>
+        <w:pStyle w:val="ListParagraph"/>
+        <w:numPr>
+          <w:ilvl w:val="0"/>
+          <w:numId w:val="1"/>
+        </w:numPr>
+        <w:spacing w:after="40"/>
+      </w:pPr>
+      <w:r>
+        <w:rPr>
+          <w:color w:val="1D2D3E"/>
+          <w:sz w:val="22"/>
+          <w:szCs w:val="22"/>
+        </w:rPr>
+        <w:t xml:space="preserve">LeadTimeTrendChart: 6-bar chart — bar height ∝ avgDays/maxDays; current month bar highlighted</w:t>
+      </w:r>
+    </w:p>
+    <w:p>
+      <w:pPr>
+        <w:pStyle w:val="ListParagraph"/>
+        <w:numPr>
+          <w:ilvl w:val="1"/>
+          <w:numId w:val="1"/>
+        </w:numPr>
+        <w:spacing w:after="40"/>
+      </w:pPr>
+      <w:r>
+        <w:rPr>
+          <w:color w:val="1D2D3E"/>
+          <w:sz w:val="22"/>
+          <w:szCs w:val="22"/>
+        </w:rPr>
+        <w:t xml:space="preserve">  Value labels (Xd) above each bar; month labels + poCount footer below</w:t>
+      </w:r>
+    </w:p>
+    <w:p>
+      <w:pPr>
+        <w:pStyle w:val="ListParagraph"/>
+        <w:numPr>
+          <w:ilvl w:val="1"/>
+          <w:numId w:val="1"/>
+        </w:numPr>
+        <w:spacing w:after="40"/>
+      </w:pPr>
+      <w:r>
+        <w:rPr>
+          <w:color w:val="1D2D3E"/>
+          <w:sz w:val="22"/>
+          <w:szCs w:val="22"/>
+        </w:rPr>
+        <w:t xml:space="preserve">  Trend pill shows 'Xd slower/faster' vs first data point when ≥2 months have data</w:t>
+      </w:r>
+    </w:p>
+    <w:p>
+      <w:pPr>
+        <w:pStyle w:val="ListParagraph"/>
+        <w:numPr>
+          <w:ilvl w:val="1"/>
+          <w:numId w:val="1"/>
+        </w:numPr>
+        <w:spacing w:after="40"/>
+      </w:pPr>
+      <w:r>
+        <w:rPr>
+          <w:color w:val="1D2D3E"/>
+          <w:sz w:val="22"/>
+          <w:szCs w:val="22"/>
+        </w:rPr>
+        <w:t xml:space="preserve">  Returns null when no POs have delivery dates — silent empty state</w:t>
+      </w:r>
+    </w:p>
+    <w:p>
+      <w:pPr>
+        <w:pStyle w:val="ListParagraph"/>
+        <w:numPr>
+          <w:ilvl w:val="0"/>
+          <w:numId w:val="1"/>
+        </w:numPr>
+        <w:spacing w:after="40"/>
+      </w:pPr>
+      <w:r>
+        <w:rPr>
+          <w:color w:val="1D2D3E"/>
+          <w:sz w:val="22"/>
+          <w:szCs w:val="22"/>
+        </w:rPr>
+        <w:t xml:space="preserve">Rendered after Supplier Lead Time section with subtitle 'last 6 months'</w:t>
+      </w:r>
+    </w:p>
+    <w:p>
+      <w:pPr>
+        <w:spacing w:after="80"/>
+      </w:pPr>
+      <w:r>
+        <w:rPr>
+          <w:color w:val="1D2D3E"/>
+          <w:sz w:val="22"/>
+          <w:szCs w:val="22"/>
+        </w:rPr>
+        <w:t xml:space="preserve"/>
+      </w:r>
+    </w:p>
+    <w:p>
+      <w:pPr>
+        <w:pStyle w:val="Heading2"/>
+        <w:spacing w:after="120" w:before="300"/>
+      </w:pPr>
+      <w:r>
+        <w:rPr>
+          <w:b/>
+          <w:bCs/>
+          <w:color w:val="1D2D3E"/>
+        </w:rPr>
+        <w:t xml:space="preserve">3.74 StockHealth Per-Item Reorder Thresholds (Session 51)</w:t>
+      </w:r>
+    </w:p>
+    <w:p>
+      <w:pPr>
+        <w:pStyle w:val="ListParagraph"/>
+        <w:numPr>
+          <w:ilvl w:val="0"/>
+          <w:numId w:val="1"/>
+        </w:numPr>
+        <w:spacing w:after="40"/>
+      </w:pPr>
+      <w:r>
+        <w:rPr>
+          <w:color w:val="1D2D3E"/>
+          <w:sz w:val="22"/>
+          <w:szCs w:val="22"/>
+        </w:rPr>
+        <w:t xml:space="preserve">settings.ts: getItemThreshold(itemName) / setItemThreshold(itemName, value|null) / loadAllItemThresholds()</w:t>
+      </w:r>
+    </w:p>
+    <w:p>
+      <w:pPr>
+        <w:pStyle w:val="ListParagraph"/>
+        <w:numPr>
+          <w:ilvl w:val="1"/>
+          <w:numId w:val="1"/>
+        </w:numPr>
+        <w:spacing w:after="40"/>
+      </w:pPr>
+      <w:r>
+        <w:rPr>
+          <w:color w:val="1D2D3E"/>
+          <w:sz w:val="22"/>
+          <w:szCs w:val="22"/>
+        </w:rPr>
+        <w:t xml:space="preserve">  AsyncStorage key: 'setting:itemThreshold:&lt;itemName&gt;'; null clears the key (reverts to global)</w:t>
+      </w:r>
+    </w:p>
+    <w:p>
+      <w:pPr>
+        <w:pStyle w:val="ListParagraph"/>
+        <w:numPr>
+          <w:ilvl w:val="1"/>
+          <w:numId w:val="1"/>
+        </w:numPr>
+        <w:spacing w:after="40"/>
+      </w:pPr>
+      <w:r>
+        <w:rPr>
+          <w:color w:val="1D2D3E"/>
+          <w:sz w:val="22"/>
+          <w:szCs w:val="22"/>
+        </w:rPr>
+        <w:t xml:space="preserve">  loadAllItemThresholds(): getAllKeys() filtered by prefix, multiGet, returns Map&lt;string, number&gt;</w:t>
+      </w:r>
+    </w:p>
+    <w:p>
+      <w:pPr>
+        <w:pStyle w:val="ListParagraph"/>
+        <w:numPr>
+          <w:ilvl w:val="0"/>
+          <w:numId w:val="1"/>
+        </w:numPr>
+        <w:spacing w:after="40"/>
+      </w:pPr>
+      <w:r>
+        <w:rPr>
+          <w:color w:val="1D2D3E"/>
+          <w:sz w:val="22"/>
+          <w:szCs w:val="22"/>
+        </w:rPr>
+        <w:t xml:space="preserve">computeStockHealth accepts perItemThresholds?: Map&lt;string, number&gt;; uses item-specific threshold when available</w:t>
+      </w:r>
+    </w:p>
+    <w:p>
+      <w:pPr>
+        <w:pStyle w:val="ListParagraph"/>
+        <w:numPr>
+          <w:ilvl w:val="0"/>
+          <w:numId w:val="1"/>
+        </w:numPr>
+        <w:spacing w:after="40"/>
+      </w:pPr>
+      <w:r>
+        <w:rPr>
+          <w:color w:val="1D2D3E"/>
+          <w:sz w:val="22"/>
+          <w:szCs w:val="22"/>
+        </w:rPr>
+        <w:t xml:space="preserve">RankedItemList: onLongPress prop (delayLongPress=400) + perItemThresholds prop</w:t>
+      </w:r>
+    </w:p>
+    <w:p>
+      <w:pPr>
+        <w:pStyle w:val="ListParagraph"/>
+        <w:numPr>
+          <w:ilvl w:val="1"/>
+          <w:numId w:val="1"/>
+        </w:numPr>
+        <w:spacing w:after="40"/>
+      </w:pPr>
+      <w:r>
+        <w:rPr>
+          <w:color w:val="1D2D3E"/>
+          <w:sz w:val="22"/>
+          <w:szCs w:val="22"/>
+        </w:rPr>
+        <w:t xml:space="preserve">  Items with custom threshold show a small sliders icon badge next to the item name</w:t>
+      </w:r>
+    </w:p>
+    <w:p>
+      <w:pPr>
+        <w:pStyle w:val="ListParagraph"/>
+        <w:numPr>
+          <w:ilvl w:val="0"/>
+          <w:numId w:val="1"/>
+        </w:numPr>
+        <w:spacing w:after="40"/>
+      </w:pPr>
+      <w:r>
+        <w:rPr>
+          <w:color w:val="1D2D3E"/>
+          <w:sz w:val="22"/>
+          <w:szCs w:val="22"/>
+        </w:rPr>
+        <w:t xml:space="preserve">ThresholdEditModal: bottom-sheet modal (animationType=fade) with numeric TextInput auto-focused on open</w:t>
+      </w:r>
+    </w:p>
+    <w:p>
+      <w:pPr>
+        <w:pStyle w:val="ListParagraph"/>
+        <w:numPr>
+          <w:ilvl w:val="1"/>
+          <w:numId w:val="1"/>
+        </w:numPr>
+        <w:spacing w:after="40"/>
+      </w:pPr>
+      <w:r>
+        <w:rPr>
+          <w:color w:val="1D2D3E"/>
+          <w:sz w:val="22"/>
+          <w:szCs w:val="22"/>
+        </w:rPr>
+        <w:t xml:space="preserve">  'Use Global' button removes custom threshold; Save sets it; Cancel dismisses; Save disabled when invalid</w:t>
+      </w:r>
+    </w:p>
+    <w:p>
+      <w:pPr>
+        <w:pStyle w:val="ListParagraph"/>
+        <w:numPr>
+          <w:ilvl w:val="0"/>
+          <w:numId w:val="1"/>
+        </w:numPr>
+        <w:spacing w:after="40"/>
+      </w:pPr>
+      <w:r>
+        <w:rPr>
+          <w:color w:val="1D2D3E"/>
+          <w:sz w:val="22"/>
+          <w:szCs w:val="22"/>
+        </w:rPr>
+        <w:t xml:space="preserve">StockHealthScreen: loads perItemThresholds alongside stock data; handleThresholdSave updates Map + recomputes</w:t>
+      </w:r>
+    </w:p>
+    <w:p>
+      <w:pPr>
+        <w:pStyle w:val="ListParagraph"/>
+        <w:numPr>
+          <w:ilvl w:val="1"/>
+          <w:numId w:val="1"/>
+        </w:numPr>
+        <w:spacing w:after="40"/>
+      </w:pPr>
+      <w:r>
+        <w:rPr>
+          <w:color w:val="1D2D3E"/>
+          <w:sz w:val="22"/>
+          <w:szCs w:val="22"/>
+        </w:rPr>
+        <w:t xml:space="preserve">  Long-pressing a low-stock item opens ThresholdEditModal; saving triggers immediate data recompute</w:t>
+      </w:r>
+    </w:p>
+    <w:p>
+      <w:pPr>
+        <w:spacing w:after="80"/>
+      </w:pPr>
+      <w:r>
+        <w:rPr>
+          <w:color w:val="1D2D3E"/>
+          <w:sz w:val="22"/>
+          <w:szCs w:val="22"/>
+        </w:rPr>
+        <w:t xml:space="preserve"/>
+      </w:r>
+    </w:p>
+    <w:p>
+      <w:pPr>
+        <w:pStyle w:val="Heading2"/>
+        <w:spacing w:after="120" w:before="300"/>
+      </w:pPr>
+      <w:r>
+        <w:rPr>
+          <w:b/>
+          <w:bCs/>
+          <w:color w:val="1D2D3E"/>
+        </w:rPr>
         <w:t xml:space="preserve">3.64 FinancialAnalytics 6-Month AP vs AR Monthly Trend Chart (Session 43)</w:t>
       </w:r>
     </w:p>
@@ -28476,6 +29196,392 @@
           </w:p>
         </w:tc>
       </w:tr>
+      <w:tr>
+        <w:tc>
+          <w:tcPr>
+            <w:shd w:color="F0F4F8" w:val="solid"/>
+          </w:tcPr>
+          <w:p>
+            <w:pPr>
+              <w:spacing w:after="40" w:before="40"/>
+            </w:pPr>
+            <w:r>
+              <w:rPr>
+                <w:b w:val="false"/>
+                <w:bCs w:val="false"/>
+                <w:color w:val="1D2D3E"/>
+                <w:sz w:val="20"/>
+                <w:szCs w:val="20"/>
+              </w:rPr>
+              <w:t xml:space="preserve">Session 51</w:t>
+            </w:r>
+          </w:p>
+        </w:tc>
+        <w:tc>
+          <w:tcPr>
+            <w:shd w:color="F0F4F8" w:val="solid"/>
+          </w:tcPr>
+          <w:p>
+            <w:pPr>
+              <w:spacing w:after="40" w:before="40"/>
+            </w:pPr>
+            <w:r>
+              <w:rPr>
+                <w:b w:val="false"/>
+                <w:bCs w:val="false"/>
+                <w:color w:val="1D2D3E"/>
+                <w:sz w:val="20"/>
+                <w:szCs w:val="20"/>
+              </w:rPr>
+              <w:t xml:space="preserve">JournalEntries account drill-down — tap account row in TOP ACCOUNTS heat map to set account filter; tap voucher type bar to filter by type</w:t>
+            </w:r>
+          </w:p>
+        </w:tc>
+        <w:tc>
+          <w:tcPr>
+            <w:shd w:color="F0F4F8" w:val="solid"/>
+          </w:tcPr>
+          <w:p>
+            <w:pPr>
+              <w:spacing w:after="40" w:before="40"/>
+            </w:pPr>
+            <w:r>
+              <w:rPr>
+                <w:b w:val="false"/>
+                <w:bCs w:val="false"/>
+                <w:color w:val="1D2D3E"/>
+                <w:sz w:val="20"/>
+                <w:szCs w:val="20"/>
+              </w:rPr>
+              <w:t xml:space="preserve">Done</w:t>
+            </w:r>
+          </w:p>
+        </w:tc>
+        <w:tc>
+          <w:tcPr>
+            <w:shd w:color="F0F4F8" w:val="solid"/>
+          </w:tcPr>
+          <w:p>
+            <w:pPr>
+              <w:spacing w:after="40" w:before="40"/>
+            </w:pPr>
+            <w:r>
+              <w:rPr>
+                <w:b w:val="false"/>
+                <w:bCs w:val="false"/>
+                <w:color w:val="1D2D3E"/>
+                <w:sz w:val="20"/>
+                <w:szCs w:val="20"/>
+              </w:rPr>
+              <w:t xml:space="preserve">JournalEntriesScreen.tsx</w:t>
+            </w:r>
+          </w:p>
+        </w:tc>
+      </w:tr>
+      <w:tr>
+        <w:tc>
+          <w:p>
+            <w:pPr>
+              <w:spacing w:after="40" w:before="40"/>
+            </w:pPr>
+            <w:r>
+              <w:rPr>
+                <w:b w:val="false"/>
+                <w:bCs w:val="false"/>
+                <w:color w:val="1D2D3E"/>
+                <w:sz w:val="20"/>
+                <w:szCs w:val="20"/>
+              </w:rPr>
+              <w:t xml:space="preserve">Session 51</w:t>
+            </w:r>
+          </w:p>
+        </w:tc>
+        <w:tc>
+          <w:p>
+            <w:pPr>
+              <w:spacing w:after="40" w:before="40"/>
+            </w:pPr>
+            <w:r>
+              <w:rPr>
+                <w:b w:val="false"/>
+                <w:bCs w:val="false"/>
+                <w:color w:val="1D2D3E"/>
+                <w:sz w:val="20"/>
+                <w:szCs w:val="20"/>
+              </w:rPr>
+              <w:t xml:space="preserve">Dashboard health card tap — FinancialHealthCard navigates to FinancialAnalytics; KPICard miniChart prop adds inline 2-bar prev/curr comparison</w:t>
+            </w:r>
+          </w:p>
+        </w:tc>
+        <w:tc>
+          <w:p>
+            <w:pPr>
+              <w:spacing w:after="40" w:before="40"/>
+            </w:pPr>
+            <w:r>
+              <w:rPr>
+                <w:b w:val="false"/>
+                <w:bCs w:val="false"/>
+                <w:color w:val="1D2D3E"/>
+                <w:sz w:val="20"/>
+                <w:szCs w:val="20"/>
+              </w:rPr>
+              <w:t xml:space="preserve">Done</w:t>
+            </w:r>
+          </w:p>
+        </w:tc>
+        <w:tc>
+          <w:p>
+            <w:pPr>
+              <w:spacing w:after="40" w:before="40"/>
+            </w:pPr>
+            <w:r>
+              <w:rPr>
+                <w:b w:val="false"/>
+                <w:bCs w:val="false"/>
+                <w:color w:val="1D2D3E"/>
+                <w:sz w:val="20"/>
+                <w:szCs w:val="20"/>
+              </w:rPr>
+              <w:t xml:space="preserve">DashboardScreen.tsx + KPICard.tsx</w:t>
+            </w:r>
+          </w:p>
+        </w:tc>
+      </w:tr>
+      <w:tr>
+        <w:tc>
+          <w:tcPr>
+            <w:shd w:color="F0F4F8" w:val="solid"/>
+          </w:tcPr>
+          <w:p>
+            <w:pPr>
+              <w:spacing w:after="40" w:before="40"/>
+            </w:pPr>
+            <w:r>
+              <w:rPr>
+                <w:b w:val="false"/>
+                <w:bCs w:val="false"/>
+                <w:color w:val="1D2D3E"/>
+                <w:sz w:val="20"/>
+                <w:szCs w:val="20"/>
+              </w:rPr>
+              <w:t xml:space="preserve">Session 51</w:t>
+            </w:r>
+          </w:p>
+        </w:tc>
+        <w:tc>
+          <w:tcPr>
+            <w:shd w:color="F0F4F8" w:val="solid"/>
+          </w:tcPr>
+          <w:p>
+            <w:pPr>
+              <w:spacing w:after="40" w:before="40"/>
+            </w:pPr>
+            <w:r>
+              <w:rPr>
+                <w:b w:val="false"/>
+                <w:bCs w:val="false"/>
+                <w:color w:val="1D2D3E"/>
+                <w:sz w:val="20"/>
+                <w:szCs w:val="20"/>
+              </w:rPr>
+              <w:t xml:space="preserve">Dashboard vouchers KPI row — This Month + Today KPI cards with mini bar chart showing prev month vs current</w:t>
+            </w:r>
+          </w:p>
+        </w:tc>
+        <w:tc>
+          <w:tcPr>
+            <w:shd w:color="F0F4F8" w:val="solid"/>
+          </w:tcPr>
+          <w:p>
+            <w:pPr>
+              <w:spacing w:after="40" w:before="40"/>
+            </w:pPr>
+            <w:r>
+              <w:rPr>
+                <w:b w:val="false"/>
+                <w:bCs w:val="false"/>
+                <w:color w:val="1D2D3E"/>
+                <w:sz w:val="20"/>
+                <w:szCs w:val="20"/>
+              </w:rPr>
+              <w:t xml:space="preserve">Done</w:t>
+            </w:r>
+          </w:p>
+        </w:tc>
+        <w:tc>
+          <w:tcPr>
+            <w:shd w:color="F0F4F8" w:val="solid"/>
+          </w:tcPr>
+          <w:p>
+            <w:pPr>
+              <w:spacing w:after="40" w:before="40"/>
+            </w:pPr>
+            <w:r>
+              <w:rPr>
+                <w:b w:val="false"/>
+                <w:bCs w:val="false"/>
+                <w:color w:val="1D2D3E"/>
+                <w:sz w:val="20"/>
+                <w:szCs w:val="20"/>
+              </w:rPr>
+              <w:t xml:space="preserve">DashboardScreen.tsx</w:t>
+            </w:r>
+          </w:p>
+        </w:tc>
+      </w:tr>
+      <w:tr>
+        <w:tc>
+          <w:p>
+            <w:pPr>
+              <w:spacing w:after="40" w:before="40"/>
+            </w:pPr>
+            <w:r>
+              <w:rPr>
+                <w:b w:val="false"/>
+                <w:bCs w:val="false"/>
+                <w:color w:val="1D2D3E"/>
+                <w:sz w:val="20"/>
+                <w:szCs w:val="20"/>
+              </w:rPr>
+              <w:t xml:space="preserve">Session 51</w:t>
+            </w:r>
+          </w:p>
+        </w:tc>
+        <w:tc>
+          <w:p>
+            <w:pPr>
+              <w:spacing w:after="40" w:before="40"/>
+            </w:pPr>
+            <w:r>
+              <w:rPr>
+                <w:b w:val="false"/>
+                <w:bCs w:val="false"/>
+                <w:color w:val="1D2D3E"/>
+                <w:sz w:val="20"/>
+                <w:szCs w:val="20"/>
+              </w:rPr>
+              <w:t xml:space="preserve">ProcurementAnalytics lead time monthly trend — LeadTimeTrendChart shows 6-bar chart of avg lead days by order month; trend pill shows delta</w:t>
+            </w:r>
+          </w:p>
+        </w:tc>
+        <w:tc>
+          <w:p>
+            <w:pPr>
+              <w:spacing w:after="40" w:before="40"/>
+            </w:pPr>
+            <w:r>
+              <w:rPr>
+                <w:b w:val="false"/>
+                <w:bCs w:val="false"/>
+                <w:color w:val="1D2D3E"/>
+                <w:sz w:val="20"/>
+                <w:szCs w:val="20"/>
+              </w:rPr>
+              <w:t xml:space="preserve">Done</w:t>
+            </w:r>
+          </w:p>
+        </w:tc>
+        <w:tc>
+          <w:p>
+            <w:pPr>
+              <w:spacing w:after="40" w:before="40"/>
+            </w:pPr>
+            <w:r>
+              <w:rPr>
+                <w:b w:val="false"/>
+                <w:bCs w:val="false"/>
+                <w:color w:val="1D2D3E"/>
+                <w:sz w:val="20"/>
+                <w:szCs w:val="20"/>
+              </w:rPr>
+              <w:t xml:space="preserve">ProcurementAnalyticsScreen.tsx</w:t>
+            </w:r>
+          </w:p>
+        </w:tc>
+      </w:tr>
+      <w:tr>
+        <w:tc>
+          <w:tcPr>
+            <w:shd w:color="F0F4F8" w:val="solid"/>
+          </w:tcPr>
+          <w:p>
+            <w:pPr>
+              <w:spacing w:after="40" w:before="40"/>
+            </w:pPr>
+            <w:r>
+              <w:rPr>
+                <w:b w:val="false"/>
+                <w:bCs w:val="false"/>
+                <w:color w:val="1D2D3E"/>
+                <w:sz w:val="20"/>
+                <w:szCs w:val="20"/>
+              </w:rPr>
+              <w:t xml:space="preserve">Session 51</w:t>
+            </w:r>
+          </w:p>
+        </w:tc>
+        <w:tc>
+          <w:tcPr>
+            <w:shd w:color="F0F4F8" w:val="solid"/>
+          </w:tcPr>
+          <w:p>
+            <w:pPr>
+              <w:spacing w:after="40" w:before="40"/>
+            </w:pPr>
+            <w:r>
+              <w:rPr>
+                <w:b w:val="false"/>
+                <w:bCs w:val="false"/>
+                <w:color w:val="1D2D3E"/>
+                <w:sz w:val="20"/>
+                <w:szCs w:val="20"/>
+              </w:rPr>
+              <w:t xml:space="preserve">StockHealth per-item thresholds — long-press low-stock item to set custom min qty; ThresholdEditModal with Use Global/Save; sliders badge indicator</w:t>
+            </w:r>
+          </w:p>
+        </w:tc>
+        <w:tc>
+          <w:tcPr>
+            <w:shd w:color="F0F4F8" w:val="solid"/>
+          </w:tcPr>
+          <w:p>
+            <w:pPr>
+              <w:spacing w:after="40" w:before="40"/>
+            </w:pPr>
+            <w:r>
+              <w:rPr>
+                <w:b w:val="false"/>
+                <w:bCs w:val="false"/>
+                <w:color w:val="1D2D3E"/>
+                <w:sz w:val="20"/>
+                <w:szCs w:val="20"/>
+              </w:rPr>
+              <w:t xml:space="preserve">Done</w:t>
+            </w:r>
+          </w:p>
+        </w:tc>
+        <w:tc>
+          <w:tcPr>
+            <w:shd w:color="F0F4F8" w:val="solid"/>
+          </w:tcPr>
+          <w:p>
+            <w:pPr>
+              <w:spacing w:after="40" w:before="40"/>
+            </w:pPr>
+            <w:r>
+              <w:rPr>
+                <w:b w:val="false"/>
+                <w:bCs w:val="false"/>
+                <w:color w:val="1D2D3E"/>
+                <w:sz w:val="20"/>
+                <w:szCs w:val="20"/>
+              </w:rPr>
+              <w:t xml:space="preserve">StockHealthScreen.tsx + settings.ts</w:t>
+            </w:r>
+          </w:p>
+        </w:tc>
+      </w:tr>
     </w:tbl>
     <w:p>
       <w:pPr>
@@ -33558,6 +34664,375 @@
           <w:szCs w:val="22"/>
         </w:rPr>
         <w:t xml:space="preserve">  Tapping a history row repopulates the query field</w:t>
+      </w:r>
+    </w:p>
+    <w:p>
+      <w:pPr>
+        <w:spacing w:after="80"/>
+      </w:pPr>
+      <w:r>
+        <w:rPr>
+          <w:color w:val="1D2D3E"/>
+          <w:sz w:val="22"/>
+          <w:szCs w:val="22"/>
+        </w:rPr>
+        <w:t xml:space="preserve"/>
+      </w:r>
+    </w:p>
+    <w:p>
+      <w:pPr>
+        <w:pStyle w:val="Heading2"/>
+        <w:spacing w:after="120" w:before="300"/>
+      </w:pPr>
+      <w:r>
+        <w:rPr>
+          <w:b/>
+          <w:bCs/>
+          <w:color w:val="1D2D3E"/>
+        </w:rPr>
+        <w:t xml:space="preserve">Session 51 — 2026-06-10</w:t>
+      </w:r>
+    </w:p>
+    <w:p>
+      <w:pPr>
+        <w:pStyle w:val="ListParagraph"/>
+        <w:numPr>
+          <w:ilvl w:val="0"/>
+          <w:numId w:val="1"/>
+        </w:numPr>
+        <w:spacing w:after="40"/>
+      </w:pPr>
+      <w:r>
+        <w:rPr>
+          <w:color w:val="1D2D3E"/>
+          <w:sz w:val="22"/>
+          <w:szCs w:val="22"/>
+        </w:rPr>
+        <w:t xml:space="preserve">JournalEntries Account &amp; Type Drill-Down (JournalEntriesScreen.tsx)</w:t>
+      </w:r>
+    </w:p>
+    <w:p>
+      <w:pPr>
+        <w:pStyle w:val="ListParagraph"/>
+        <w:numPr>
+          <w:ilvl w:val="1"/>
+          <w:numId w:val="1"/>
+        </w:numPr>
+        <w:spacing w:after="40"/>
+      </w:pPr>
+      <w:r>
+        <w:rPr>
+          <w:color w:val="1D2D3E"/>
+          <w:sz w:val="22"/>
+          <w:szCs w:val="22"/>
+        </w:rPr>
+        <w:t xml:space="preserve">  AccountActivityList rows become tappable when onSelectAccount is provided; tap sets account filter + scrolls to top</w:t>
+      </w:r>
+    </w:p>
+    <w:p>
+      <w:pPr>
+        <w:pStyle w:val="ListParagraph"/>
+        <w:numPr>
+          <w:ilvl w:val="1"/>
+          <w:numId w:val="1"/>
+        </w:numPr>
+        <w:spacing w:after="40"/>
+      </w:pPr>
+      <w:r>
+        <w:rPr>
+          <w:color w:val="1D2D3E"/>
+          <w:sz w:val="22"/>
+          <w:szCs w:val="22"/>
+        </w:rPr>
+        <w:t xml:space="preserve">  JESummaryCard voucher-type bars become tappable when onSelectType is provided; tap sets type chip + scrolls</w:t>
+      </w:r>
+    </w:p>
+    <w:p>
+      <w:pPr>
+        <w:pStyle w:val="ListParagraph"/>
+        <w:numPr>
+          <w:ilvl w:val="1"/>
+          <w:numId w:val="1"/>
+        </w:numPr>
+        <w:spacing w:after="40"/>
+      </w:pPr>
+      <w:r>
+        <w:rPr>
+          <w:color w:val="1D2D3E"/>
+          <w:sz w:val="22"/>
+          <w:szCs w:val="22"/>
+        </w:rPr>
+        <w:t xml:space="preserve">  scrollRef + handleSelectAccount + handleSelectType wired in main screen</w:t>
+      </w:r>
+    </w:p>
+    <w:p>
+      <w:pPr>
+        <w:pStyle w:val="ListParagraph"/>
+        <w:numPr>
+          <w:ilvl w:val="0"/>
+          <w:numId w:val="1"/>
+        </w:numPr>
+        <w:spacing w:after="40"/>
+      </w:pPr>
+      <w:r>
+        <w:rPr>
+          <w:color w:val="1D2D3E"/>
+          <w:sz w:val="22"/>
+          <w:szCs w:val="22"/>
+        </w:rPr>
+        <w:t xml:space="preserve">Dashboard Financial Health Card Navigation (DashboardScreen.tsx)</w:t>
+      </w:r>
+    </w:p>
+    <w:p>
+      <w:pPr>
+        <w:pStyle w:val="ListParagraph"/>
+        <w:numPr>
+          <w:ilvl w:val="1"/>
+          <w:numId w:val="1"/>
+        </w:numPr>
+        <w:spacing w:after="40"/>
+      </w:pPr>
+      <w:r>
+        <w:rPr>
+          <w:color w:val="1D2D3E"/>
+          <w:sz w:val="22"/>
+          <w:szCs w:val="22"/>
+        </w:rPr>
+        <w:t xml:space="preserve">  FinancialHealthCard gains onPress prop → navigates to FinancialAnalytics screen</w:t>
+      </w:r>
+    </w:p>
+    <w:p>
+      <w:pPr>
+        <w:pStyle w:val="ListParagraph"/>
+        <w:numPr>
+          <w:ilvl w:val="1"/>
+          <w:numId w:val="1"/>
+        </w:numPr>
+        <w:spacing w:after="40"/>
+      </w:pPr>
+      <w:r>
+        <w:rPr>
+          <w:color w:val="1D2D3E"/>
+          <w:sz w:val="22"/>
+          <w:szCs w:val="22"/>
+        </w:rPr>
+        <w:t xml:space="preserve">  Chevron-right indicator + 'tap for full breakdown' hint text added when tappable</w:t>
+      </w:r>
+    </w:p>
+    <w:p>
+      <w:pPr>
+        <w:pStyle w:val="ListParagraph"/>
+        <w:numPr>
+          <w:ilvl w:val="0"/>
+          <w:numId w:val="1"/>
+        </w:numPr>
+        <w:spacing w:after="40"/>
+      </w:pPr>
+      <w:r>
+        <w:rPr>
+          <w:color w:val="1D2D3E"/>
+          <w:sz w:val="22"/>
+          <w:szCs w:val="22"/>
+        </w:rPr>
+        <w:t xml:space="preserve">KPICard Mini Bar Chart (KPICard.tsx)</w:t>
+      </w:r>
+    </w:p>
+    <w:p>
+      <w:pPr>
+        <w:pStyle w:val="ListParagraph"/>
+        <w:numPr>
+          <w:ilvl w:val="1"/>
+          <w:numId w:val="1"/>
+        </w:numPr>
+        <w:spacing w:after="40"/>
+      </w:pPr>
+      <w:r>
+        <w:rPr>
+          <w:color w:val="1D2D3E"/>
+          <w:sz w:val="22"/>
+          <w:szCs w:val="22"/>
+        </w:rPr>
+        <w:t xml:space="preserve">  miniChart?: { prev, curr, prevLabel?, currLabel? } prop renders 2-bar inline comparison chart</w:t>
+      </w:r>
+    </w:p>
+    <w:p>
+      <w:pPr>
+        <w:pStyle w:val="ListParagraph"/>
+        <w:numPr>
+          <w:ilvl w:val="1"/>
+          <w:numId w:val="1"/>
+        </w:numPr>
+        <w:spacing w:after="40"/>
+      </w:pPr>
+      <w:r>
+        <w:rPr>
+          <w:color w:val="1D2D3E"/>
+          <w:sz w:val="22"/>
+          <w:szCs w:val="22"/>
+        </w:rPr>
+        <w:t xml:space="preserve">  Net Income KPI card wires miniChart when prevNetIncome is available</w:t>
+      </w:r>
+    </w:p>
+    <w:p>
+      <w:pPr>
+        <w:pStyle w:val="ListParagraph"/>
+        <w:numPr>
+          <w:ilvl w:val="0"/>
+          <w:numId w:val="1"/>
+        </w:numPr>
+        <w:spacing w:after="40"/>
+      </w:pPr>
+      <w:r>
+        <w:rPr>
+          <w:color w:val="1D2D3E"/>
+          <w:sz w:val="22"/>
+          <w:szCs w:val="22"/>
+        </w:rPr>
+        <w:t xml:space="preserve">Dashboard Vouchers KPI Row (DashboardScreen.tsx)</w:t>
+      </w:r>
+    </w:p>
+    <w:p>
+      <w:pPr>
+        <w:pStyle w:val="ListParagraph"/>
+        <w:numPr>
+          <w:ilvl w:val="1"/>
+          <w:numId w:val="1"/>
+        </w:numPr>
+        <w:spacing w:after="40"/>
+      </w:pPr>
+      <w:r>
+        <w:rPr>
+          <w:color w:val="1D2D3E"/>
+          <w:sz w:val="22"/>
+          <w:szCs w:val="22"/>
+        </w:rPr>
+        <w:t xml:space="preserve">  New 'This Month' + 'Today' KPI card row in Vouchers section with mini bar chart vs prev month</w:t>
+      </w:r>
+    </w:p>
+    <w:p>
+      <w:pPr>
+        <w:pStyle w:val="ListParagraph"/>
+        <w:numPr>
+          <w:ilvl w:val="0"/>
+          <w:numId w:val="1"/>
+        </w:numPr>
+        <w:spacing w:after="40"/>
+      </w:pPr>
+      <w:r>
+        <w:rPr>
+          <w:color w:val="1D2D3E"/>
+          <w:sz w:val="22"/>
+          <w:szCs w:val="22"/>
+        </w:rPr>
+        <w:t xml:space="preserve">ProcurementAnalytics Lead Time Monthly Trend (ProcurementAnalyticsScreen.tsx)</w:t>
+      </w:r>
+    </w:p>
+    <w:p>
+      <w:pPr>
+        <w:pStyle w:val="ListParagraph"/>
+        <w:numPr>
+          <w:ilvl w:val="1"/>
+          <w:numId w:val="1"/>
+        </w:numPr>
+        <w:spacing w:after="40"/>
+      </w:pPr>
+      <w:r>
+        <w:rPr>
+          <w:color w:val="1D2D3E"/>
+          <w:sz w:val="22"/>
+          <w:szCs w:val="22"/>
+        </w:rPr>
+        <w:t xml:space="preserve">  computeLeadTimeTrend(): groups POs by order month, computes avg lead days for last 6 months</w:t>
+      </w:r>
+    </w:p>
+    <w:p>
+      <w:pPr>
+        <w:pStyle w:val="ListParagraph"/>
+        <w:numPr>
+          <w:ilvl w:val="1"/>
+          <w:numId w:val="1"/>
+        </w:numPr>
+        <w:spacing w:after="40"/>
+      </w:pPr>
+      <w:r>
+        <w:rPr>
+          <w:color w:val="1D2D3E"/>
+          <w:sz w:val="22"/>
+          <w:szCs w:val="22"/>
+        </w:rPr>
+        <w:t xml:space="preserve">  LeadTimeTrendChart: 6-bar chart with value labels, current month highlighted, trend pill delta</w:t>
+      </w:r>
+    </w:p>
+    <w:p>
+      <w:pPr>
+        <w:pStyle w:val="ListParagraph"/>
+        <w:numPr>
+          <w:ilvl w:val="0"/>
+          <w:numId w:val="1"/>
+        </w:numPr>
+        <w:spacing w:after="40"/>
+      </w:pPr>
+      <w:r>
+        <w:rPr>
+          <w:color w:val="1D2D3E"/>
+          <w:sz w:val="22"/>
+          <w:szCs w:val="22"/>
+        </w:rPr>
+        <w:t xml:space="preserve">StockHealth Per-Item Reorder Thresholds (StockHealthScreen.tsx + settings.ts)</w:t>
+      </w:r>
+    </w:p>
+    <w:p>
+      <w:pPr>
+        <w:pStyle w:val="ListParagraph"/>
+        <w:numPr>
+          <w:ilvl w:val="1"/>
+          <w:numId w:val="1"/>
+        </w:numPr>
+        <w:spacing w:after="40"/>
+      </w:pPr>
+      <w:r>
+        <w:rPr>
+          <w:color w:val="1D2D3E"/>
+          <w:sz w:val="22"/>
+          <w:szCs w:val="22"/>
+        </w:rPr>
+        <w:t xml:space="preserve">  getItemThreshold/setItemThreshold/loadAllItemThresholds added to settings.ts</w:t>
+      </w:r>
+    </w:p>
+    <w:p>
+      <w:pPr>
+        <w:pStyle w:val="ListParagraph"/>
+        <w:numPr>
+          <w:ilvl w:val="1"/>
+          <w:numId w:val="1"/>
+        </w:numPr>
+        <w:spacing w:after="40"/>
+      </w:pPr>
+      <w:r>
+        <w:rPr>
+          <w:color w:val="1D2D3E"/>
+          <w:sz w:val="22"/>
+          <w:szCs w:val="22"/>
+        </w:rPr>
+        <w:t xml:space="preserve">  computeStockHealth uses per-item threshold when set; falls back to global</w:t>
+      </w:r>
+    </w:p>
+    <w:p>
+      <w:pPr>
+        <w:pStyle w:val="ListParagraph"/>
+        <w:numPr>
+          <w:ilvl w:val="1"/>
+          <w:numId w:val="1"/>
+        </w:numPr>
+        <w:spacing w:after="40"/>
+      </w:pPr>
+      <w:r>
+        <w:rPr>
+          <w:color w:val="1D2D3E"/>
+          <w:sz w:val="22"/>
+          <w:szCs w:val="22"/>
+        </w:rPr>
+        <w:t xml:space="preserve">  Long-press low-stock item → ThresholdEditModal; custom items show sliders badge</w:t>
       </w:r>
     </w:p>
     <w:p>

</xml_diff>

<commit_message>
docs(session-53): update PROGRESS.md, generate-docs.js, and FEATURES.docx with Session 53 changelog
</commit_message>
<xml_diff>
--- a/FEATURES.docx
+++ b/FEATURES.docx
@@ -13737,6 +13737,357 @@
           <w:bCs/>
           <w:color w:val="1D2D3E"/>
         </w:rPr>
+        <w:t xml:space="preserve">3.77 JournalEntries Account-to-Ledger Navigation (Session 53)</w:t>
+      </w:r>
+    </w:p>
+    <w:p>
+      <w:pPr>
+        <w:pStyle w:val="ListParagraph"/>
+        <w:numPr>
+          <w:ilvl w:val="0"/>
+          <w:numId w:val="1"/>
+        </w:numPr>
+        <w:spacing w:after="40"/>
+      </w:pPr>
+      <w:r>
+        <w:rPr>
+          <w:color w:val="1D2D3E"/>
+          <w:sz w:val="22"/>
+          <w:szCs w:val="22"/>
+        </w:rPr>
+        <w:t xml:space="preserve">Tapping any account row in AccountActivityList heat map now navigates to AccountStatementScreen</w:t>
+      </w:r>
+    </w:p>
+    <w:p>
+      <w:pPr>
+        <w:pStyle w:val="ListParagraph"/>
+        <w:numPr>
+          <w:ilvl w:val="1"/>
+          <w:numId w:val="1"/>
+        </w:numPr>
+        <w:spacing w:after="40"/>
+      </w:pPr>
+      <w:r>
+        <w:rPr>
+          <w:color w:val="1D2D3E"/>
+          <w:sz w:val="22"/>
+          <w:szCs w:val="22"/>
+        </w:rPr>
+        <w:t xml:space="preserve">  handleSelectAccount calls navigation.navigate('AccountStatement', { accountCode, accountName })</w:t>
+      </w:r>
+    </w:p>
+    <w:p>
+      <w:pPr>
+        <w:pStyle w:val="ListParagraph"/>
+        <w:numPr>
+          <w:ilvl w:val="1"/>
+          <w:numId w:val="1"/>
+        </w:numPr>
+        <w:spacing w:after="40"/>
+      </w:pPr>
+      <w:r>
+        <w:rPr>
+          <w:color w:val="1D2D3E"/>
+          <w:sz w:val="22"/>
+          <w:szCs w:val="22"/>
+        </w:rPr>
+        <w:t xml:space="preserve">  AccountStatementScreen shows full running ledger: date-range picker, per-voucher Dr/Cr/Balance rows, PDF export</w:t>
+      </w:r>
+    </w:p>
+    <w:p>
+      <w:pPr>
+        <w:pStyle w:val="ListParagraph"/>
+        <w:numPr>
+          <w:ilvl w:val="0"/>
+          <w:numId w:val="1"/>
+        </w:numPr>
+        <w:spacing w:after="40"/>
+      </w:pPr>
+      <w:r>
+        <w:rPr>
+          <w:color w:val="1D2D3E"/>
+          <w:sz w:val="22"/>
+          <w:szCs w:val="22"/>
+        </w:rPr>
+        <w:t xml:space="preserve">Tap hint in AccountActivityList legend updated from 'tap to filter' to 'tap for ledger'</w:t>
+      </w:r>
+    </w:p>
+    <w:p>
+      <w:pPr>
+        <w:pStyle w:val="ListParagraph"/>
+        <w:numPr>
+          <w:ilvl w:val="0"/>
+          <w:numId w:val="1"/>
+        </w:numPr>
+        <w:spacing w:after="40"/>
+      </w:pPr>
+      <w:r>
+        <w:rPr>
+          <w:color w:val="1D2D3E"/>
+          <w:sz w:val="22"/>
+          <w:szCs w:val="22"/>
+        </w:rPr>
+        <w:t xml:space="preserve">Existing route-param account filter (pickedAccount state) and account picker modal unchanged for API-level JE filtering</w:t>
+      </w:r>
+    </w:p>
+    <w:p>
+      <w:pPr>
+        <w:spacing w:after="80"/>
+      </w:pPr>
+      <w:r>
+        <w:rPr>
+          <w:color w:val="1D2D3E"/>
+          <w:sz w:val="22"/>
+          <w:szCs w:val="22"/>
+        </w:rPr>
+        <w:t xml:space="preserve"/>
+      </w:r>
+    </w:p>
+    <w:p>
+      <w:pPr>
+        <w:pStyle w:val="Heading2"/>
+        <w:spacing w:after="120" w:before="300"/>
+      </w:pPr>
+      <w:r>
+        <w:rPr>
+          <w:b/>
+          <w:bCs/>
+          <w:color w:val="1D2D3E"/>
+        </w:rPr>
+        <w:t xml:space="preserve">3.78 Settings Per-Item Threshold List (Session 53)</w:t>
+      </w:r>
+    </w:p>
+    <w:p>
+      <w:pPr>
+        <w:pStyle w:val="ListParagraph"/>
+        <w:numPr>
+          <w:ilvl w:val="0"/>
+          <w:numId w:val="1"/>
+        </w:numPr>
+        <w:spacing w:after="40"/>
+      </w:pPr>
+      <w:r>
+        <w:rPr>
+          <w:color w:val="1D2D3E"/>
+          <w:sz w:val="22"/>
+          <w:szCs w:val="22"/>
+        </w:rPr>
+        <w:t xml:space="preserve">New PER-ITEM THRESHOLDS section in SettingsScreen between INVENTORY and DASHBOARD sections</w:t>
+      </w:r>
+    </w:p>
+    <w:p>
+      <w:pPr>
+        <w:pStyle w:val="ListParagraph"/>
+        <w:numPr>
+          <w:ilvl w:val="1"/>
+          <w:numId w:val="1"/>
+        </w:numPr>
+        <w:spacing w:after="40"/>
+      </w:pPr>
+      <w:r>
+        <w:rPr>
+          <w:color w:val="1D2D3E"/>
+          <w:sz w:val="22"/>
+          <w:szCs w:val="22"/>
+        </w:rPr>
+        <w:t xml:space="preserve">  loadAllItemThresholds() fetches all AsyncStorage keys with prefix 'setting:itemThreshold:'</w:t>
+      </w:r>
+    </w:p>
+    <w:p>
+      <w:pPr>
+        <w:pStyle w:val="ListParagraph"/>
+        <w:numPr>
+          <w:ilvl w:val="1"/>
+          <w:numId w:val="1"/>
+        </w:numPr>
+        <w:spacing w:after="40"/>
+      </w:pPr>
+      <w:r>
+        <w:rPr>
+          <w:color w:val="1D2D3E"/>
+          <w:sz w:val="22"/>
+          <w:szCs w:val="22"/>
+        </w:rPr>
+        <w:t xml:space="preserve">  Results sorted A-Z by item name; renders as rows with package icon + name + value + units</w:t>
+      </w:r>
+    </w:p>
+    <w:p>
+      <w:pPr>
+        <w:pStyle w:val="ListParagraph"/>
+        <w:numPr>
+          <w:ilvl w:val="0"/>
+          <w:numId w:val="1"/>
+        </w:numPr>
+        <w:spacing w:after="40"/>
+      </w:pPr>
+      <w:r>
+        <w:rPr>
+          <w:color w:val="1D2D3E"/>
+          <w:sz w:val="22"/>
+          <w:szCs w:val="22"/>
+        </w:rPr>
+        <w:t xml:space="preserve">Inline edit mode: tap value → compact TextInput replaces value display + Save (check) + Cancel (X) buttons</w:t>
+      </w:r>
+    </w:p>
+    <w:p>
+      <w:pPr>
+        <w:pStyle w:val="ListParagraph"/>
+        <w:numPr>
+          <w:ilvl w:val="0"/>
+          <w:numId w:val="1"/>
+        </w:numPr>
+        <w:spacing w:after="40"/>
+      </w:pPr>
+      <w:r>
+        <w:rPr>
+          <w:color w:val="1D2D3E"/>
+          <w:sz w:val="22"/>
+          <w:szCs w:val="22"/>
+        </w:rPr>
+        <w:t xml:space="preserve">Trash icon per row: calls setItemThreshold(name, null) to revert item to global threshold</w:t>
+      </w:r>
+    </w:p>
+    <w:p>
+      <w:pPr>
+        <w:pStyle w:val="ListParagraph"/>
+        <w:numPr>
+          <w:ilvl w:val="0"/>
+          <w:numId w:val="1"/>
+        </w:numPr>
+        <w:spacing w:after="40"/>
+      </w:pPr>
+      <w:r>
+        <w:rPr>
+          <w:color w:val="1D2D3E"/>
+          <w:sz w:val="22"/>
+          <w:szCs w:val="22"/>
+        </w:rPr>
+        <w:t xml:space="preserve">Empty state: sliders icon + italic hint text + note to long-press items in Stock Health to set custom thresholds</w:t>
+      </w:r>
+    </w:p>
+    <w:p>
+      <w:pPr>
+        <w:spacing w:after="80"/>
+      </w:pPr>
+      <w:r>
+        <w:rPr>
+          <w:color w:val="1D2D3E"/>
+          <w:sz w:val="22"/>
+          <w:szCs w:val="22"/>
+        </w:rPr>
+        <w:t xml:space="preserve"/>
+      </w:r>
+    </w:p>
+    <w:p>
+      <w:pPr>
+        <w:pStyle w:val="Heading2"/>
+        <w:spacing w:after="120" w:before="300"/>
+      </w:pPr>
+      <w:r>
+        <w:rPr>
+          <w:b/>
+          <w:bCs/>
+          <w:color w:val="1D2D3E"/>
+        </w:rPr>
+        <w:t xml:space="preserve">3.79 Dashboard Health Score Grade Badge Animation (Session 53)</w:t>
+      </w:r>
+    </w:p>
+    <w:p>
+      <w:pPr>
+        <w:pStyle w:val="ListParagraph"/>
+        <w:numPr>
+          <w:ilvl w:val="0"/>
+          <w:numId w:val="1"/>
+        </w:numPr>
+        <w:spacing w:after="40"/>
+      </w:pPr>
+      <w:r>
+        <w:rPr>
+          <w:color w:val="1D2D3E"/>
+          <w:sz w:val="22"/>
+          <w:szCs w:val="22"/>
+        </w:rPr>
+        <w:t xml:space="preserve">FinancialHealthCard gains gradeAnim Animated.Value ref (via useRef)</w:t>
+      </w:r>
+    </w:p>
+    <w:p>
+      <w:pPr>
+        <w:pStyle w:val="ListParagraph"/>
+        <w:numPr>
+          <w:ilvl w:val="0"/>
+          <w:numId w:val="1"/>
+        </w:numPr>
+        <w:spacing w:after="40"/>
+      </w:pPr>
+      <w:r>
+        <w:rPr>
+          <w:color w:val="1D2D3E"/>
+          <w:sz w:val="22"/>
+          <w:szCs w:val="22"/>
+        </w:rPr>
+        <w:t xml:space="preserve">useEffect on hs?.grade: resets to 0 then Animated.spring to 1.0 (tension 120, friction 6, native driver)</w:t>
+      </w:r>
+    </w:p>
+    <w:p>
+      <w:pPr>
+        <w:pStyle w:val="ListParagraph"/>
+        <w:numPr>
+          <w:ilvl w:val="0"/>
+          <w:numId w:val="1"/>
+        </w:numPr>
+        <w:spacing w:after="40"/>
+      </w:pPr>
+      <w:r>
+        <w:rPr>
+          <w:color w:val="1D2D3E"/>
+          <w:sz w:val="22"/>
+          <w:szCs w:val="22"/>
+        </w:rPr>
+        <w:t xml:space="preserve">Grade badge wrapped in Animated.View with scale interpolation 0.3→1.0</w:t>
+      </w:r>
+    </w:p>
+    <w:p>
+      <w:pPr>
+        <w:pStyle w:val="ListParagraph"/>
+        <w:numPr>
+          <w:ilvl w:val="0"/>
+          <w:numId w:val="1"/>
+        </w:numPr>
+        <w:spacing w:after="40"/>
+      </w:pPr>
+      <w:r>
+        <w:rPr>
+          <w:color w:val="1D2D3E"/>
+          <w:sz w:val="22"/>
+          <w:szCs w:val="22"/>
+        </w:rPr>
+        <w:t xml:space="preserve">Animation re-triggers when grade changes (company switch, data refresh) for continuous feedback</w:t>
+      </w:r>
+    </w:p>
+    <w:p>
+      <w:pPr>
+        <w:spacing w:after="80"/>
+      </w:pPr>
+      <w:r>
+        <w:rPr>
+          <w:color w:val="1D2D3E"/>
+          <w:sz w:val="22"/>
+          <w:szCs w:val="22"/>
+        </w:rPr>
+        <w:t xml:space="preserve"/>
+      </w:r>
+    </w:p>
+    <w:p>
+      <w:pPr>
+        <w:pStyle w:val="Heading2"/>
+        <w:spacing w:after="120" w:before="300"/>
+      </w:pPr>
+      <w:r>
+        <w:rPr>
+          <w:b/>
+          <w:bCs/>
+          <w:color w:val="1D2D3E"/>
+        </w:rPr>
         <w:t xml:space="preserve">3.74 StockHealth Per-Item Reorder Thresholds (Session 51)</w:t>
       </w:r>
     </w:p>
@@ -29582,6 +29933,228 @@
           </w:p>
         </w:tc>
       </w:tr>
+      <w:tr>
+        <w:tc>
+          <w:p>
+            <w:pPr>
+              <w:spacing w:after="40" w:before="40"/>
+            </w:pPr>
+            <w:r>
+              <w:rPr>
+                <w:b w:val="false"/>
+                <w:bCs w:val="false"/>
+                <w:color w:val="1D2D3E"/>
+                <w:sz w:val="20"/>
+                <w:szCs w:val="20"/>
+              </w:rPr>
+              <w:t xml:space="preserve">Session 53</w:t>
+            </w:r>
+          </w:p>
+        </w:tc>
+        <w:tc>
+          <w:p>
+            <w:pPr>
+              <w:spacing w:after="40" w:before="40"/>
+            </w:pPr>
+            <w:r>
+              <w:rPr>
+                <w:b w:val="false"/>
+                <w:bCs w:val="false"/>
+                <w:color w:val="1D2D3E"/>
+                <w:sz w:val="20"/>
+                <w:szCs w:val="20"/>
+              </w:rPr>
+              <w:t xml:space="preserve">JournalEntries account→ledger navigation — tap TOP ACCOUNTS row navigates to AccountStatementScreen with running balance</w:t>
+            </w:r>
+          </w:p>
+        </w:tc>
+        <w:tc>
+          <w:p>
+            <w:pPr>
+              <w:spacing w:after="40" w:before="40"/>
+            </w:pPr>
+            <w:r>
+              <w:rPr>
+                <w:b w:val="false"/>
+                <w:bCs w:val="false"/>
+                <w:color w:val="1D2D3E"/>
+                <w:sz w:val="20"/>
+                <w:szCs w:val="20"/>
+              </w:rPr>
+              <w:t xml:space="preserve">Done</w:t>
+            </w:r>
+          </w:p>
+        </w:tc>
+        <w:tc>
+          <w:p>
+            <w:pPr>
+              <w:spacing w:after="40" w:before="40"/>
+            </w:pPr>
+            <w:r>
+              <w:rPr>
+                <w:b w:val="false"/>
+                <w:bCs w:val="false"/>
+                <w:color w:val="1D2D3E"/>
+                <w:sz w:val="20"/>
+                <w:szCs w:val="20"/>
+              </w:rPr>
+              <w:t xml:space="preserve">JournalEntriesScreen.tsx</w:t>
+            </w:r>
+          </w:p>
+        </w:tc>
+      </w:tr>
+      <w:tr>
+        <w:tc>
+          <w:tcPr>
+            <w:shd w:color="F0F4F8" w:val="solid"/>
+          </w:tcPr>
+          <w:p>
+            <w:pPr>
+              <w:spacing w:after="40" w:before="40"/>
+            </w:pPr>
+            <w:r>
+              <w:rPr>
+                <w:b w:val="false"/>
+                <w:bCs w:val="false"/>
+                <w:color w:val="1D2D3E"/>
+                <w:sz w:val="20"/>
+                <w:szCs w:val="20"/>
+              </w:rPr>
+              <w:t xml:space="preserve">Session 53</w:t>
+            </w:r>
+          </w:p>
+        </w:tc>
+        <w:tc>
+          <w:tcPr>
+            <w:shd w:color="F0F4F8" w:val="solid"/>
+          </w:tcPr>
+          <w:p>
+            <w:pPr>
+              <w:spacing w:after="40" w:before="40"/>
+            </w:pPr>
+            <w:r>
+              <w:rPr>
+                <w:b w:val="false"/>
+                <w:bCs w:val="false"/>
+                <w:color w:val="1D2D3E"/>
+                <w:sz w:val="20"/>
+                <w:szCs w:val="20"/>
+              </w:rPr>
+              <w:t xml:space="preserve">Settings per-item threshold list — view/edit/clear all custom reorder thresholds; inline edit + trash icon per item; empty state hint</w:t>
+            </w:r>
+          </w:p>
+        </w:tc>
+        <w:tc>
+          <w:tcPr>
+            <w:shd w:color="F0F4F8" w:val="solid"/>
+          </w:tcPr>
+          <w:p>
+            <w:pPr>
+              <w:spacing w:after="40" w:before="40"/>
+            </w:pPr>
+            <w:r>
+              <w:rPr>
+                <w:b w:val="false"/>
+                <w:bCs w:val="false"/>
+                <w:color w:val="1D2D3E"/>
+                <w:sz w:val="20"/>
+                <w:szCs w:val="20"/>
+              </w:rPr>
+              <w:t xml:space="preserve">Done</w:t>
+            </w:r>
+          </w:p>
+        </w:tc>
+        <w:tc>
+          <w:tcPr>
+            <w:shd w:color="F0F4F8" w:val="solid"/>
+          </w:tcPr>
+          <w:p>
+            <w:pPr>
+              <w:spacing w:after="40" w:before="40"/>
+            </w:pPr>
+            <w:r>
+              <w:rPr>
+                <w:b w:val="false"/>
+                <w:bCs w:val="false"/>
+                <w:color w:val="1D2D3E"/>
+                <w:sz w:val="20"/>
+                <w:szCs w:val="20"/>
+              </w:rPr>
+              <w:t xml:space="preserve">SettingsScreen.tsx</w:t>
+            </w:r>
+          </w:p>
+        </w:tc>
+      </w:tr>
+      <w:tr>
+        <w:tc>
+          <w:p>
+            <w:pPr>
+              <w:spacing w:after="40" w:before="40"/>
+            </w:pPr>
+            <w:r>
+              <w:rPr>
+                <w:b w:val="false"/>
+                <w:bCs w:val="false"/>
+                <w:color w:val="1D2D3E"/>
+                <w:sz w:val="20"/>
+                <w:szCs w:val="20"/>
+              </w:rPr>
+              <w:t xml:space="preserve">Session 53</w:t>
+            </w:r>
+          </w:p>
+        </w:tc>
+        <w:tc>
+          <w:p>
+            <w:pPr>
+              <w:spacing w:after="40" w:before="40"/>
+            </w:pPr>
+            <w:r>
+              <w:rPr>
+                <w:b w:val="false"/>
+                <w:bCs w:val="false"/>
+                <w:color w:val="1D2D3E"/>
+                <w:sz w:val="20"/>
+                <w:szCs w:val="20"/>
+              </w:rPr>
+              <w:t xml:space="preserve">Dashboard health score animation — grade badge spring-animates (0.3→1.0 scale) on mount and grade change via Animated.spring</w:t>
+            </w:r>
+          </w:p>
+        </w:tc>
+        <w:tc>
+          <w:p>
+            <w:pPr>
+              <w:spacing w:after="40" w:before="40"/>
+            </w:pPr>
+            <w:r>
+              <w:rPr>
+                <w:b w:val="false"/>
+                <w:bCs w:val="false"/>
+                <w:color w:val="1D2D3E"/>
+                <w:sz w:val="20"/>
+                <w:szCs w:val="20"/>
+              </w:rPr>
+              <w:t xml:space="preserve">Done</w:t>
+            </w:r>
+          </w:p>
+        </w:tc>
+        <w:tc>
+          <w:p>
+            <w:pPr>
+              <w:spacing w:after="40" w:before="40"/>
+            </w:pPr>
+            <w:r>
+              <w:rPr>
+                <w:b w:val="false"/>
+                <w:bCs w:val="false"/>
+                <w:color w:val="1D2D3E"/>
+                <w:sz w:val="20"/>
+                <w:szCs w:val="20"/>
+              </w:rPr>
+              <w:t xml:space="preserve">DashboardScreen.tsx</w:t>
+            </w:r>
+          </w:p>
+        </w:tc>
+      </w:tr>
     </w:tbl>
     <w:p>
       <w:pPr>
@@ -34664,6 +35237,267 @@
           <w:szCs w:val="22"/>
         </w:rPr>
         <w:t xml:space="preserve">  Tapping a history row repopulates the query field</w:t>
+      </w:r>
+    </w:p>
+    <w:p>
+      <w:pPr>
+        <w:spacing w:after="80"/>
+      </w:pPr>
+      <w:r>
+        <w:rPr>
+          <w:color w:val="1D2D3E"/>
+          <w:sz w:val="22"/>
+          <w:szCs w:val="22"/>
+        </w:rPr>
+        <w:t xml:space="preserve"/>
+      </w:r>
+    </w:p>
+    <w:p>
+      <w:pPr>
+        <w:pStyle w:val="Heading2"/>
+        <w:spacing w:after="120" w:before="300"/>
+      </w:pPr>
+      <w:r>
+        <w:rPr>
+          <w:b/>
+          <w:bCs/>
+          <w:color w:val="1D2D3E"/>
+        </w:rPr>
+        <w:t xml:space="preserve">Session 53 — 2026-06-10</w:t>
+      </w:r>
+    </w:p>
+    <w:p>
+      <w:pPr>
+        <w:pStyle w:val="ListParagraph"/>
+        <w:numPr>
+          <w:ilvl w:val="0"/>
+          <w:numId w:val="1"/>
+        </w:numPr>
+        <w:spacing w:after="40"/>
+      </w:pPr>
+      <w:r>
+        <w:rPr>
+          <w:color w:val="1D2D3E"/>
+          <w:sz w:val="22"/>
+          <w:szCs w:val="22"/>
+        </w:rPr>
+        <w:t xml:space="preserve">JournalEntries Account → AccountStatement Navigation (JournalEntriesScreen.tsx)</w:t>
+      </w:r>
+    </w:p>
+    <w:p>
+      <w:pPr>
+        <w:pStyle w:val="ListParagraph"/>
+        <w:numPr>
+          <w:ilvl w:val="1"/>
+          <w:numId w:val="1"/>
+        </w:numPr>
+        <w:spacing w:after="40"/>
+      </w:pPr>
+      <w:r>
+        <w:rPr>
+          <w:color w:val="1D2D3E"/>
+          <w:sz w:val="22"/>
+          <w:szCs w:val="22"/>
+        </w:rPr>
+        <w:t xml:space="preserve">  handleSelectAccount changed: navigates to AccountStatementScreen instead of setting pickedAccount filter</w:t>
+      </w:r>
+    </w:p>
+    <w:p>
+      <w:pPr>
+        <w:pStyle w:val="ListParagraph"/>
+        <w:numPr>
+          <w:ilvl w:val="1"/>
+          <w:numId w:val="1"/>
+        </w:numPr>
+        <w:spacing w:after="40"/>
+      </w:pPr>
+      <w:r>
+        <w:rPr>
+          <w:color w:val="1D2D3E"/>
+          <w:sz w:val="22"/>
+          <w:szCs w:val="22"/>
+        </w:rPr>
+        <w:t xml:space="preserve">  navigation.navigate('AccountStatement', { accountCode: account, accountName: account })</w:t>
+      </w:r>
+    </w:p>
+    <w:p>
+      <w:pPr>
+        <w:pStyle w:val="ListParagraph"/>
+        <w:numPr>
+          <w:ilvl w:val="1"/>
+          <w:numId w:val="1"/>
+        </w:numPr>
+        <w:spacing w:after="40"/>
+      </w:pPr>
+      <w:r>
+        <w:rPr>
+          <w:color w:val="1D2D3E"/>
+          <w:sz w:val="22"/>
+          <w:szCs w:val="22"/>
+        </w:rPr>
+        <w:t xml:space="preserve">  Tap hint in AccountActivityList legend: 'tap to filter' → 'tap for ledger'</w:t>
+      </w:r>
+    </w:p>
+    <w:p>
+      <w:pPr>
+        <w:pStyle w:val="ListParagraph"/>
+        <w:numPr>
+          <w:ilvl w:val="0"/>
+          <w:numId w:val="1"/>
+        </w:numPr>
+        <w:spacing w:after="40"/>
+      </w:pPr>
+      <w:r>
+        <w:rPr>
+          <w:color w:val="1D2D3E"/>
+          <w:sz w:val="22"/>
+          <w:szCs w:val="22"/>
+        </w:rPr>
+        <w:t xml:space="preserve">Settings Per-Item Threshold List (SettingsScreen.tsx)</w:t>
+      </w:r>
+    </w:p>
+    <w:p>
+      <w:pPr>
+        <w:pStyle w:val="ListParagraph"/>
+        <w:numPr>
+          <w:ilvl w:val="1"/>
+          <w:numId w:val="1"/>
+        </w:numPr>
+        <w:spacing w:after="40"/>
+      </w:pPr>
+      <w:r>
+        <w:rPr>
+          <w:color w:val="1D2D3E"/>
+          <w:sz w:val="22"/>
+          <w:szCs w:val="22"/>
+        </w:rPr>
+        <w:t xml:space="preserve">  New PER-ITEM THRESHOLDS section between INVENTORY and DASHBOARD</w:t>
+      </w:r>
+    </w:p>
+    <w:p>
+      <w:pPr>
+        <w:pStyle w:val="ListParagraph"/>
+        <w:numPr>
+          <w:ilvl w:val="1"/>
+          <w:numId w:val="1"/>
+        </w:numPr>
+        <w:spacing w:after="40"/>
+      </w:pPr>
+      <w:r>
+        <w:rPr>
+          <w:color w:val="1D2D3E"/>
+          <w:sz w:val="22"/>
+          <w:szCs w:val="22"/>
+        </w:rPr>
+        <w:t xml:space="preserve">  loadAllItemThresholds() loads all custom thresholds on mount; sorted A-Z</w:t>
+      </w:r>
+    </w:p>
+    <w:p>
+      <w:pPr>
+        <w:pStyle w:val="ListParagraph"/>
+        <w:numPr>
+          <w:ilvl w:val="1"/>
+          <w:numId w:val="1"/>
+        </w:numPr>
+        <w:spacing w:after="40"/>
+      </w:pPr>
+      <w:r>
+        <w:rPr>
+          <w:color w:val="1D2D3E"/>
+          <w:sz w:val="22"/>
+          <w:szCs w:val="22"/>
+        </w:rPr>
+        <w:t xml:space="preserve">  Inline edit: tap value → TextInput + Save/Cancel; trash icon to clear</w:t>
+      </w:r>
+    </w:p>
+    <w:p>
+      <w:pPr>
+        <w:pStyle w:val="ListParagraph"/>
+        <w:numPr>
+          <w:ilvl w:val="1"/>
+          <w:numId w:val="1"/>
+        </w:numPr>
+        <w:spacing w:after="40"/>
+      </w:pPr>
+      <w:r>
+        <w:rPr>
+          <w:color w:val="1D2D3E"/>
+          <w:sz w:val="22"/>
+          <w:szCs w:val="22"/>
+        </w:rPr>
+        <w:t xml:space="preserve">  Empty state with hint to use StockHealth screen for new thresholds</w:t>
+      </w:r>
+    </w:p>
+    <w:p>
+      <w:pPr>
+        <w:pStyle w:val="ListParagraph"/>
+        <w:numPr>
+          <w:ilvl w:val="0"/>
+          <w:numId w:val="1"/>
+        </w:numPr>
+        <w:spacing w:after="40"/>
+      </w:pPr>
+      <w:r>
+        <w:rPr>
+          <w:color w:val="1D2D3E"/>
+          <w:sz w:val="22"/>
+          <w:szCs w:val="22"/>
+        </w:rPr>
+        <w:t xml:space="preserve">Dashboard Health Score Grade Badge Animation (DashboardScreen.tsx)</w:t>
+      </w:r>
+    </w:p>
+    <w:p>
+      <w:pPr>
+        <w:pStyle w:val="ListParagraph"/>
+        <w:numPr>
+          <w:ilvl w:val="1"/>
+          <w:numId w:val="1"/>
+        </w:numPr>
+        <w:spacing w:after="40"/>
+      </w:pPr>
+      <w:r>
+        <w:rPr>
+          <w:color w:val="1D2D3E"/>
+          <w:sz w:val="22"/>
+          <w:szCs w:val="22"/>
+        </w:rPr>
+        <w:t xml:space="preserve">  Animated.spring on gradeAnim ref: scale 0.3→1.0 (tension 120, friction 6)</w:t>
+      </w:r>
+    </w:p>
+    <w:p>
+      <w:pPr>
+        <w:pStyle w:val="ListParagraph"/>
+        <w:numPr>
+          <w:ilvl w:val="1"/>
+          <w:numId w:val="1"/>
+        </w:numPr>
+        <w:spacing w:after="40"/>
+      </w:pPr>
+      <w:r>
+        <w:rPr>
+          <w:color w:val="1D2D3E"/>
+          <w:sz w:val="22"/>
+          <w:szCs w:val="22"/>
+        </w:rPr>
+        <w:t xml:space="preserve">  useEffect on hs?.grade re-triggers animation when grade changes</w:t>
+      </w:r>
+    </w:p>
+    <w:p>
+      <w:pPr>
+        <w:pStyle w:val="ListParagraph"/>
+        <w:numPr>
+          <w:ilvl w:val="1"/>
+          <w:numId w:val="1"/>
+        </w:numPr>
+        <w:spacing w:after="40"/>
+      </w:pPr>
+      <w:r>
+        <w:rPr>
+          <w:color w:val="1D2D3E"/>
+          <w:sz w:val="22"/>
+          <w:szCs w:val="22"/>
+        </w:rPr>
+        <w:t xml:space="preserve">  useNativeDriver: true for 60fps performance</w:t>
       </w:r>
     </w:p>
     <w:p>

</xml_diff>

<commit_message>
docs(session-54): update PROGRESS.md, generate-docs.js, and FEATURES.docx with Session 54 changelog
</commit_message>
<xml_diff>
--- a/FEATURES.docx
+++ b/FEATURES.docx
@@ -13737,6 +13737,393 @@
           <w:bCs/>
           <w:color w:val="1D2D3E"/>
         </w:rPr>
+        <w:t xml:space="preserve">3.80 StockHealth Velocity Card Date-Range Filter (Session 54)</w:t>
+      </w:r>
+    </w:p>
+    <w:p>
+      <w:pPr>
+        <w:pStyle w:val="ListParagraph"/>
+        <w:numPr>
+          <w:ilvl w:val="0"/>
+          <w:numId w:val="1"/>
+        </w:numPr>
+        <w:spacing w:after="40"/>
+      </w:pPr>
+      <w:r>
+        <w:rPr>
+          <w:color w:val="1D2D3E"/>
+          <w:sz w:val="22"/>
+          <w:szCs w:val="22"/>
+        </w:rPr>
+        <w:t xml:space="preserve">VelocityPeriod type ('7d' | '30d' | '90d' | 'all') controls which ledger entries are analysed</w:t>
+      </w:r>
+    </w:p>
+    <w:p>
+      <w:pPr>
+        <w:pStyle w:val="ListParagraph"/>
+        <w:numPr>
+          <w:ilvl w:val="1"/>
+          <w:numId w:val="1"/>
+        </w:numPr>
+        <w:spacing w:after="40"/>
+      </w:pPr>
+      <w:r>
+        <w:rPr>
+          <w:color w:val="1D2D3E"/>
+          <w:sz w:val="22"/>
+          <w:szCs w:val="22"/>
+        </w:rPr>
+        <w:t xml:space="preserve">  filterLedgerByPeriod(ledger, period): filters by Date.now() - N*86400000 cutoff; 'all' returns full ledger</w:t>
+      </w:r>
+    </w:p>
+    <w:p>
+      <w:pPr>
+        <w:pStyle w:val="ListParagraph"/>
+        <w:numPr>
+          <w:ilvl w:val="1"/>
+          <w:numId w:val="1"/>
+        </w:numPr>
+        <w:spacing w:after="40"/>
+      </w:pPr>
+      <w:r>
+        <w:rPr>
+          <w:color w:val="1D2D3E"/>
+          <w:sz w:val="22"/>
+          <w:szCs w:val="22"/>
+        </w:rPr>
+        <w:t xml:space="preserve">  rawLedger state stores full unfiltered ledger; velocityPeriod state (default 'all') drives re-computation</w:t>
+      </w:r>
+    </w:p>
+    <w:p>
+      <w:pPr>
+        <w:pStyle w:val="ListParagraph"/>
+        <w:numPr>
+          <w:ilvl w:val="0"/>
+          <w:numId w:val="1"/>
+        </w:numPr>
+        <w:spacing w:after="40"/>
+      </w:pPr>
+      <w:r>
+        <w:rPr>
+          <w:color w:val="1D2D3E"/>
+          <w:sz w:val="22"/>
+          <w:szCs w:val="22"/>
+        </w:rPr>
+        <w:t xml:space="preserve">velocityItems and dusMap are useMemo derived from filterLedgerByPeriod(rawLedger, velocityPeriod) — zero extra API calls</w:t>
+      </w:r>
+    </w:p>
+    <w:p>
+      <w:pPr>
+        <w:pStyle w:val="ListParagraph"/>
+        <w:numPr>
+          <w:ilvl w:val="0"/>
+          <w:numId w:val="1"/>
+        </w:numPr>
+        <w:spacing w:after="40"/>
+      </w:pPr>
+      <w:r>
+        <w:rPr>
+          <w:color w:val="1D2D3E"/>
+          <w:sz w:val="22"/>
+          <w:szCs w:val="22"/>
+        </w:rPr>
+        <w:t xml:space="preserve">Period chips (7d / 30d / 90d / All) in velocity SectionHeader action slot — active chip = filled dark pill</w:t>
+      </w:r>
+    </w:p>
+    <w:p>
+      <w:pPr>
+        <w:pStyle w:val="ListParagraph"/>
+        <w:numPr>
+          <w:ilvl w:val="0"/>
+          <w:numId w:val="1"/>
+        </w:numPr>
+        <w:spacing w:after="40"/>
+      </w:pPr>
+      <w:r>
+        <w:rPr>
+          <w:color w:val="1D2D3E"/>
+          <w:sz w:val="22"/>
+          <w:szCs w:val="22"/>
+        </w:rPr>
+        <w:t xml:space="preserve">DUS (Days Until Stockout) badges on Low Stock items also reflect the selected period outflow rate</w:t>
+      </w:r>
+    </w:p>
+    <w:p>
+      <w:pPr>
+        <w:pStyle w:val="ListParagraph"/>
+        <w:numPr>
+          <w:ilvl w:val="0"/>
+          <w:numId w:val="1"/>
+        </w:numPr>
+        <w:spacing w:after="40"/>
+      </w:pPr>
+      <w:r>
+        <w:rPr>
+          <w:color w:val="1D2D3E"/>
+          <w:sz w:val="22"/>
+          <w:szCs w:val="22"/>
+        </w:rPr>
+        <w:t xml:space="preserve">Empty state shown when no movement exists in the selected period</w:t>
+      </w:r>
+    </w:p>
+    <w:p>
+      <w:pPr>
+        <w:spacing w:after="80"/>
+      </w:pPr>
+      <w:r>
+        <w:rPr>
+          <w:color w:val="1D2D3E"/>
+          <w:sz w:val="22"/>
+          <w:szCs w:val="22"/>
+        </w:rPr>
+        <w:t xml:space="preserve"/>
+      </w:r>
+    </w:p>
+    <w:p>
+      <w:pPr>
+        <w:pStyle w:val="Heading2"/>
+        <w:spacing w:after="120" w:before="300"/>
+      </w:pPr>
+      <w:r>
+        <w:rPr>
+          <w:b/>
+          <w:bCs/>
+          <w:color w:val="1D2D3E"/>
+        </w:rPr>
+        <w:t xml:space="preserve">3.81 Dashboard Week Activity Card (Session 54)</w:t>
+      </w:r>
+    </w:p>
+    <w:p>
+      <w:pPr>
+        <w:pStyle w:val="ListParagraph"/>
+        <w:numPr>
+          <w:ilvl w:val="0"/>
+          <w:numId w:val="1"/>
+        </w:numPr>
+        <w:spacing w:after="40"/>
+      </w:pPr>
+      <w:r>
+        <w:rPr>
+          <w:color w:val="1D2D3E"/>
+          <w:sz w:val="22"/>
+          <w:szCs w:val="22"/>
+        </w:rPr>
+        <w:t xml:space="preserve">computeWeekActivity(vouchers): Monday-anchored week boundaries; counts vouchers + sums amounts for this week and last week</w:t>
+      </w:r>
+    </w:p>
+    <w:p>
+      <w:pPr>
+        <w:pStyle w:val="ListParagraph"/>
+        <w:numPr>
+          <w:ilvl w:val="0"/>
+          <w:numId w:val="1"/>
+        </w:numPr>
+        <w:spacing w:after="40"/>
+      </w:pPr>
+      <w:r>
+        <w:rPr>
+          <w:color w:val="1D2D3E"/>
+          <w:sz w:val="22"/>
+          <w:szCs w:val="22"/>
+        </w:rPr>
+        <w:t xml:space="preserve">weekActivity useMemo([vouchers]) — zero extra API calls; returns null when both weeks are empty</w:t>
+      </w:r>
+    </w:p>
+    <w:p>
+      <w:pPr>
+        <w:pStyle w:val="ListParagraph"/>
+        <w:numPr>
+          <w:ilvl w:val="0"/>
+          <w:numId w:val="1"/>
+        </w:numPr>
+        <w:spacing w:after="40"/>
+      </w:pPr>
+      <w:r>
+        <w:rPr>
+          <w:color w:val="1D2D3E"/>
+          <w:sz w:val="22"/>
+          <w:szCs w:val="22"/>
+        </w:rPr>
+        <w:t xml:space="preserve">WeekActivityCard: 3-column tile — This Week (count + amount) | center trend (icon + % badge + label) | Last Week (count + amount, muted)</w:t>
+      </w:r>
+    </w:p>
+    <w:p>
+      <w:pPr>
+        <w:pStyle w:val="ListParagraph"/>
+        <w:numPr>
+          <w:ilvl w:val="0"/>
+          <w:numId w:val="1"/>
+        </w:numPr>
+        <w:spacing w:after="40"/>
+      </w:pPr>
+      <w:r>
+        <w:rPr>
+          <w:color w:val="1D2D3E"/>
+          <w:sz w:val="22"/>
+          <w:szCs w:val="22"/>
+        </w:rPr>
+        <w:t xml:space="preserve">Trending-up/down/minus Feather icon with colour: text=up, textSecondary=down, textMuted=flat</w:t>
+      </w:r>
+    </w:p>
+    <w:p>
+      <w:pPr>
+        <w:pStyle w:val="ListParagraph"/>
+        <w:numPr>
+          <w:ilvl w:val="0"/>
+          <w:numId w:val="1"/>
+        </w:numPr>
+        <w:spacing w:after="40"/>
+      </w:pPr>
+      <w:r>
+        <w:rPr>
+          <w:color w:val="1D2D3E"/>
+          <w:sz w:val="22"/>
+          <w:szCs w:val="22"/>
+        </w:rPr>
+        <w:t xml:space="preserve">Tapping card navigates to JournalEntries; rendered between Vouchers KPI row and 7-day sparkline</w:t>
+      </w:r>
+    </w:p>
+    <w:p>
+      <w:pPr>
+        <w:spacing w:after="80"/>
+      </w:pPr>
+      <w:r>
+        <w:rPr>
+          <w:color w:val="1D2D3E"/>
+          <w:sz w:val="22"/>
+          <w:szCs w:val="22"/>
+        </w:rPr>
+        <w:t xml:space="preserve"/>
+      </w:r>
+    </w:p>
+    <w:p>
+      <w:pPr>
+        <w:pStyle w:val="Heading2"/>
+        <w:spacing w:after="120" w:before="300"/>
+      </w:pPr>
+      <w:r>
+        <w:rPr>
+          <w:b/>
+          <w:bCs/>
+          <w:color w:val="1D2D3E"/>
+        </w:rPr>
+        <w:t xml:space="preserve">3.82 ProcurementAnalytics Vendor Lead Time Drill-Down Modal (Session 54)</w:t>
+      </w:r>
+    </w:p>
+    <w:p>
+      <w:pPr>
+        <w:pStyle w:val="ListParagraph"/>
+        <w:numPr>
+          <w:ilvl w:val="0"/>
+          <w:numId w:val="1"/>
+        </w:numPr>
+        <w:spacing w:after="40"/>
+      </w:pPr>
+      <w:r>
+        <w:rPr>
+          <w:color w:val="1D2D3E"/>
+          <w:sz w:val="22"/>
+          <w:szCs w:val="22"/>
+        </w:rPr>
+        <w:t xml:space="preserve">computeVendorMonthlyTrend(pos, vendorName): same bucket logic as computeLeadTimeTrend but filtered to one vendor</w:t>
+      </w:r>
+    </w:p>
+    <w:p>
+      <w:pPr>
+        <w:pStyle w:val="ListParagraph"/>
+        <w:numPr>
+          <w:ilvl w:val="0"/>
+          <w:numId w:val="1"/>
+        </w:numPr>
+        <w:spacing w:after="40"/>
+      </w:pPr>
+      <w:r>
+        <w:rPr>
+          <w:color w:val="1D2D3E"/>
+          <w:sz w:val="22"/>
+          <w:szCs w:val="22"/>
+        </w:rPr>
+        <w:t xml:space="preserve">LeadTimeChart gains onPress?(vendor) prop; rows become TouchableOpacity + chevron when provided</w:t>
+      </w:r>
+    </w:p>
+    <w:p>
+      <w:pPr>
+        <w:pStyle w:val="ListParagraph"/>
+        <w:numPr>
+          <w:ilvl w:val="0"/>
+          <w:numId w:val="1"/>
+        </w:numPr>
+        <w:spacing w:after="40"/>
+      </w:pPr>
+      <w:r>
+        <w:rPr>
+          <w:color w:val="1D2D3E"/>
+          <w:sz w:val="22"/>
+          <w:szCs w:val="22"/>
+        </w:rPr>
+        <w:t xml:space="preserve">VendorLeadTimeModal: slide-up bottom sheet — vendor name + subtitle header, summary tiles (avg lead time / total POs), 6-bar monthly chart</w:t>
+      </w:r>
+    </w:p>
+    <w:p>
+      <w:pPr>
+        <w:pStyle w:val="ListParagraph"/>
+        <w:numPr>
+          <w:ilvl w:val="1"/>
+          <w:numId w:val="1"/>
+        </w:numPr>
+        <w:spacing w:after="40"/>
+      </w:pPr>
+      <w:r>
+        <w:rPr>
+          <w:color w:val="1D2D3E"/>
+          <w:sz w:val="22"/>
+          <w:szCs w:val="22"/>
+        </w:rPr>
+        <w:t xml:space="preserve">  Bar chart reuses ltTrendStyles pattern; current month highlighted; empty state when no delivery dates</w:t>
+      </w:r>
+    </w:p>
+    <w:p>
+      <w:pPr>
+        <w:pStyle w:val="ListParagraph"/>
+        <w:numPr>
+          <w:ilvl w:val="0"/>
+          <w:numId w:val="1"/>
+        </w:numPr>
+        <w:spacing w:after="40"/>
+      </w:pPr>
+      <w:r>
+        <w:rPr>
+          <w:color w:val="1D2D3E"/>
+          <w:sz w:val="22"/>
+          <w:szCs w:val="22"/>
+        </w:rPr>
+        <w:t xml:space="preserve">handleLeadTimeVendorPress(vendor) in main screen: calls computeVendorMonthlyTrend(rawData.pos, vendor) then opens modal — zero extra API calls</w:t>
+      </w:r>
+    </w:p>
+    <w:p>
+      <w:pPr>
+        <w:spacing w:after="80"/>
+      </w:pPr>
+      <w:r>
+        <w:rPr>
+          <w:color w:val="1D2D3E"/>
+          <w:sz w:val="22"/>
+          <w:szCs w:val="22"/>
+        </w:rPr>
+        <w:t xml:space="preserve"/>
+      </w:r>
+    </w:p>
+    <w:p>
+      <w:pPr>
+        <w:pStyle w:val="Heading2"/>
+        <w:spacing w:after="120" w:before="300"/>
+      </w:pPr>
+      <w:r>
+        <w:rPr>
+          <w:b/>
+          <w:bCs/>
+          <w:color w:val="1D2D3E"/>
+        </w:rPr>
         <w:t xml:space="preserve">3.77 JournalEntries Account-to-Ledger Navigation (Session 53)</w:t>
       </w:r>
     </w:p>
@@ -30155,6 +30542,240 @@
           </w:p>
         </w:tc>
       </w:tr>
+      <w:tr>
+        <w:tc>
+          <w:tcPr>
+            <w:shd w:color="F0F4F8" w:val="solid"/>
+          </w:tcPr>
+          <w:p>
+            <w:pPr>
+              <w:spacing w:after="40" w:before="40"/>
+            </w:pPr>
+            <w:r>
+              <w:rPr>
+                <w:b w:val="false"/>
+                <w:bCs w:val="false"/>
+                <w:color w:val="1D2D3E"/>
+                <w:sz w:val="20"/>
+                <w:szCs w:val="20"/>
+              </w:rPr>
+              <w:t xml:space="preserve">Session 54</w:t>
+            </w:r>
+          </w:p>
+        </w:tc>
+        <w:tc>
+          <w:tcPr>
+            <w:shd w:color="F0F4F8" w:val="solid"/>
+          </w:tcPr>
+          <w:p>
+            <w:pPr>
+              <w:spacing w:after="40" w:before="40"/>
+            </w:pPr>
+            <w:r>
+              <w:rPr>
+                <w:b w:val="false"/>
+                <w:bCs w:val="false"/>
+                <w:color w:val="1D2D3E"/>
+                <w:sz w:val="20"/>
+                <w:szCs w:val="20"/>
+              </w:rPr>
+              <w:t xml:space="preserve">StockHealth velocity period filter — chips (7d/30d/90d/All) filter ledger client-side via useMemo; DUS badges reflect period; empty state</w:t>
+            </w:r>
+          </w:p>
+        </w:tc>
+        <w:tc>
+          <w:tcPr>
+            <w:shd w:color="F0F4F8" w:val="solid"/>
+          </w:tcPr>
+          <w:p>
+            <w:pPr>
+              <w:spacing w:after="40" w:before="40"/>
+            </w:pPr>
+            <w:r>
+              <w:rPr>
+                <w:b w:val="false"/>
+                <w:bCs w:val="false"/>
+                <w:color w:val="1D2D3E"/>
+                <w:sz w:val="20"/>
+                <w:szCs w:val="20"/>
+              </w:rPr>
+              <w:t xml:space="preserve">Done</w:t>
+            </w:r>
+          </w:p>
+        </w:tc>
+        <w:tc>
+          <w:tcPr>
+            <w:shd w:color="F0F4F8" w:val="solid"/>
+          </w:tcPr>
+          <w:p>
+            <w:pPr>
+              <w:spacing w:after="40" w:before="40"/>
+            </w:pPr>
+            <w:r>
+              <w:rPr>
+                <w:b w:val="false"/>
+                <w:bCs w:val="false"/>
+                <w:color w:val="1D2D3E"/>
+                <w:sz w:val="20"/>
+                <w:szCs w:val="20"/>
+              </w:rPr>
+              <w:t xml:space="preserve">StockHealthScreen.tsx</w:t>
+            </w:r>
+          </w:p>
+        </w:tc>
+      </w:tr>
+      <w:tr>
+        <w:tc>
+          <w:p>
+            <w:pPr>
+              <w:spacing w:after="40" w:before="40"/>
+            </w:pPr>
+            <w:r>
+              <w:rPr>
+                <w:b w:val="false"/>
+                <w:bCs w:val="false"/>
+                <w:color w:val="1D2D3E"/>
+                <w:sz w:val="20"/>
+                <w:szCs w:val="20"/>
+              </w:rPr>
+              <w:t xml:space="preserve">Session 54</w:t>
+            </w:r>
+          </w:p>
+        </w:tc>
+        <w:tc>
+          <w:p>
+            <w:pPr>
+              <w:spacing w:after="40" w:before="40"/>
+            </w:pPr>
+            <w:r>
+              <w:rPr>
+                <w:b w:val="false"/>
+                <w:bCs w:val="false"/>
+                <w:color w:val="1D2D3E"/>
+                <w:sz w:val="20"/>
+                <w:szCs w:val="20"/>
+              </w:rPr>
+              <w:t xml:space="preserve">Dashboard week activity card — this-week vs last-week voucher count + amount; trend icon + % badge; tap → JournalEntries</w:t>
+            </w:r>
+          </w:p>
+        </w:tc>
+        <w:tc>
+          <w:p>
+            <w:pPr>
+              <w:spacing w:after="40" w:before="40"/>
+            </w:pPr>
+            <w:r>
+              <w:rPr>
+                <w:b w:val="false"/>
+                <w:bCs w:val="false"/>
+                <w:color w:val="1D2D3E"/>
+                <w:sz w:val="20"/>
+                <w:szCs w:val="20"/>
+              </w:rPr>
+              <w:t xml:space="preserve">Done</w:t>
+            </w:r>
+          </w:p>
+        </w:tc>
+        <w:tc>
+          <w:p>
+            <w:pPr>
+              <w:spacing w:after="40" w:before="40"/>
+            </w:pPr>
+            <w:r>
+              <w:rPr>
+                <w:b w:val="false"/>
+                <w:bCs w:val="false"/>
+                <w:color w:val="1D2D3E"/>
+                <w:sz w:val="20"/>
+                <w:szCs w:val="20"/>
+              </w:rPr>
+              <w:t xml:space="preserve">DashboardScreen.tsx</w:t>
+            </w:r>
+          </w:p>
+        </w:tc>
+      </w:tr>
+      <w:tr>
+        <w:tc>
+          <w:tcPr>
+            <w:shd w:color="F0F4F8" w:val="solid"/>
+          </w:tcPr>
+          <w:p>
+            <w:pPr>
+              <w:spacing w:after="40" w:before="40"/>
+            </w:pPr>
+            <w:r>
+              <w:rPr>
+                <w:b w:val="false"/>
+                <w:bCs w:val="false"/>
+                <w:color w:val="1D2D3E"/>
+                <w:sz w:val="20"/>
+                <w:szCs w:val="20"/>
+              </w:rPr>
+              <w:t xml:space="preserve">Session 54</w:t>
+            </w:r>
+          </w:p>
+        </w:tc>
+        <w:tc>
+          <w:tcPr>
+            <w:shd w:color="F0F4F8" w:val="solid"/>
+          </w:tcPr>
+          <w:p>
+            <w:pPr>
+              <w:spacing w:after="40" w:before="40"/>
+            </w:pPr>
+            <w:r>
+              <w:rPr>
+                <w:b w:val="false"/>
+                <w:bCs w:val="false"/>
+                <w:color w:val="1D2D3E"/>
+                <w:sz w:val="20"/>
+                <w:szCs w:val="20"/>
+              </w:rPr>
+              <w:t xml:space="preserve">ProcurementAnalytics vendor lead time modal — tap vendor row → 6-month monthly bar chart for that vendor with avg/total summary tiles</w:t>
+            </w:r>
+          </w:p>
+        </w:tc>
+        <w:tc>
+          <w:tcPr>
+            <w:shd w:color="F0F4F8" w:val="solid"/>
+          </w:tcPr>
+          <w:p>
+            <w:pPr>
+              <w:spacing w:after="40" w:before="40"/>
+            </w:pPr>
+            <w:r>
+              <w:rPr>
+                <w:b w:val="false"/>
+                <w:bCs w:val="false"/>
+                <w:color w:val="1D2D3E"/>
+                <w:sz w:val="20"/>
+                <w:szCs w:val="20"/>
+              </w:rPr>
+              <w:t xml:space="preserve">Done</w:t>
+            </w:r>
+          </w:p>
+        </w:tc>
+        <w:tc>
+          <w:tcPr>
+            <w:shd w:color="F0F4F8" w:val="solid"/>
+          </w:tcPr>
+          <w:p>
+            <w:pPr>
+              <w:spacing w:after="40" w:before="40"/>
+            </w:pPr>
+            <w:r>
+              <w:rPr>
+                <w:b w:val="false"/>
+                <w:bCs w:val="false"/>
+                <w:color w:val="1D2D3E"/>
+                <w:sz w:val="20"/>
+                <w:szCs w:val="20"/>
+              </w:rPr>
+              <w:t xml:space="preserve">ProcurementAnalyticsScreen.tsx</w:t>
+            </w:r>
+          </w:p>
+        </w:tc>
+      </w:tr>
     </w:tbl>
     <w:p>
       <w:pPr>
@@ -35237,6 +35858,267 @@
           <w:szCs w:val="22"/>
         </w:rPr>
         <w:t xml:space="preserve">  Tapping a history row repopulates the query field</w:t>
+      </w:r>
+    </w:p>
+    <w:p>
+      <w:pPr>
+        <w:spacing w:after="80"/>
+      </w:pPr>
+      <w:r>
+        <w:rPr>
+          <w:color w:val="1D2D3E"/>
+          <w:sz w:val="22"/>
+          <w:szCs w:val="22"/>
+        </w:rPr>
+        <w:t xml:space="preserve"/>
+      </w:r>
+    </w:p>
+    <w:p>
+      <w:pPr>
+        <w:pStyle w:val="Heading2"/>
+        <w:spacing w:after="120" w:before="300"/>
+      </w:pPr>
+      <w:r>
+        <w:rPr>
+          <w:b/>
+          <w:bCs/>
+          <w:color w:val="1D2D3E"/>
+        </w:rPr>
+        <w:t xml:space="preserve">Session 54 — 2026-06-10</w:t>
+      </w:r>
+    </w:p>
+    <w:p>
+      <w:pPr>
+        <w:pStyle w:val="ListParagraph"/>
+        <w:numPr>
+          <w:ilvl w:val="0"/>
+          <w:numId w:val="1"/>
+        </w:numPr>
+        <w:spacing w:after="40"/>
+      </w:pPr>
+      <w:r>
+        <w:rPr>
+          <w:color w:val="1D2D3E"/>
+          <w:sz w:val="22"/>
+          <w:szCs w:val="22"/>
+        </w:rPr>
+        <w:t xml:space="preserve">StockHealth Velocity Period Filter (StockHealthScreen.tsx)</w:t>
+      </w:r>
+    </w:p>
+    <w:p>
+      <w:pPr>
+        <w:pStyle w:val="ListParagraph"/>
+        <w:numPr>
+          <w:ilvl w:val="1"/>
+          <w:numId w:val="1"/>
+        </w:numPr>
+        <w:spacing w:after="40"/>
+      </w:pPr>
+      <w:r>
+        <w:rPr>
+          <w:color w:val="1D2D3E"/>
+          <w:sz w:val="22"/>
+          <w:szCs w:val="22"/>
+        </w:rPr>
+        <w:t xml:space="preserve">  VelocityPeriod type + VELOCITY_PERIODS array; filterLedgerByPeriod() date-cutoff helper</w:t>
+      </w:r>
+    </w:p>
+    <w:p>
+      <w:pPr>
+        <w:pStyle w:val="ListParagraph"/>
+        <w:numPr>
+          <w:ilvl w:val="1"/>
+          <w:numId w:val="1"/>
+        </w:numPr>
+        <w:spacing w:after="40"/>
+      </w:pPr>
+      <w:r>
+        <w:rPr>
+          <w:color w:val="1D2D3E"/>
+          <w:sz w:val="22"/>
+          <w:szCs w:val="22"/>
+        </w:rPr>
+        <w:t xml:space="preserve">  rawLedger state stores full ledger; velocityPeriod state drives useMemo for velocityItems + dusMap</w:t>
+      </w:r>
+    </w:p>
+    <w:p>
+      <w:pPr>
+        <w:pStyle w:val="ListParagraph"/>
+        <w:numPr>
+          <w:ilvl w:val="1"/>
+          <w:numId w:val="1"/>
+        </w:numPr>
+        <w:spacing w:after="40"/>
+      </w:pPr>
+      <w:r>
+        <w:rPr>
+          <w:color w:val="1D2D3E"/>
+          <w:sz w:val="22"/>
+          <w:szCs w:val="22"/>
+        </w:rPr>
+        <w:t xml:space="preserve">  Period chips (7d/30d/90d/All) in SectionHeader action slot; active=dark filled pill, inactive=outline</w:t>
+      </w:r>
+    </w:p>
+    <w:p>
+      <w:pPr>
+        <w:pStyle w:val="ListParagraph"/>
+        <w:numPr>
+          <w:ilvl w:val="1"/>
+          <w:numId w:val="1"/>
+        </w:numPr>
+        <w:spacing w:after="40"/>
+      </w:pPr>
+      <w:r>
+        <w:rPr>
+          <w:color w:val="1D2D3E"/>
+          <w:sz w:val="22"/>
+          <w:szCs w:val="22"/>
+        </w:rPr>
+        <w:t xml:space="preserve">  Empty state 'No movement in this period' when filtered ledger yields no velocity items</w:t>
+      </w:r>
+    </w:p>
+    <w:p>
+      <w:pPr>
+        <w:pStyle w:val="ListParagraph"/>
+        <w:numPr>
+          <w:ilvl w:val="0"/>
+          <w:numId w:val="1"/>
+        </w:numPr>
+        <w:spacing w:after="40"/>
+      </w:pPr>
+      <w:r>
+        <w:rPr>
+          <w:color w:val="1D2D3E"/>
+          <w:sz w:val="22"/>
+          <w:szCs w:val="22"/>
+        </w:rPr>
+        <w:t xml:space="preserve">Dashboard Week Activity Card (DashboardScreen.tsx)</w:t>
+      </w:r>
+    </w:p>
+    <w:p>
+      <w:pPr>
+        <w:pStyle w:val="ListParagraph"/>
+        <w:numPr>
+          <w:ilvl w:val="1"/>
+          <w:numId w:val="1"/>
+        </w:numPr>
+        <w:spacing w:after="40"/>
+      </w:pPr>
+      <w:r>
+        <w:rPr>
+          <w:color w:val="1D2D3E"/>
+          <w:sz w:val="22"/>
+          <w:szCs w:val="22"/>
+        </w:rPr>
+        <w:t xml:space="preserve">  computeWeekActivity(vouchers): Monday-anchored week boundaries; thisCount/thisAmount/lastCount/lastAmount</w:t>
+      </w:r>
+    </w:p>
+    <w:p>
+      <w:pPr>
+        <w:pStyle w:val="ListParagraph"/>
+        <w:numPr>
+          <w:ilvl w:val="1"/>
+          <w:numId w:val="1"/>
+        </w:numPr>
+        <w:spacing w:after="40"/>
+      </w:pPr>
+      <w:r>
+        <w:rPr>
+          <w:color w:val="1D2D3E"/>
+          <w:sz w:val="22"/>
+          <w:szCs w:val="22"/>
+        </w:rPr>
+        <w:t xml:space="preserve">  weekActivity = useMemo([vouchers]) — zero extra API calls</w:t>
+      </w:r>
+    </w:p>
+    <w:p>
+      <w:pPr>
+        <w:pStyle w:val="ListParagraph"/>
+        <w:numPr>
+          <w:ilvl w:val="1"/>
+          <w:numId w:val="1"/>
+        </w:numPr>
+        <w:spacing w:after="40"/>
+      </w:pPr>
+      <w:r>
+        <w:rPr>
+          <w:color w:val="1D2D3E"/>
+          <w:sz w:val="22"/>
+          <w:szCs w:val="22"/>
+        </w:rPr>
+        <w:t xml:space="preserve">  WeekActivityCard: 3-column tile with trending icon + % badge; tap → JournalEntries</w:t>
+      </w:r>
+    </w:p>
+    <w:p>
+      <w:pPr>
+        <w:pStyle w:val="ListParagraph"/>
+        <w:numPr>
+          <w:ilvl w:val="0"/>
+          <w:numId w:val="1"/>
+        </w:numPr>
+        <w:spacing w:after="40"/>
+      </w:pPr>
+      <w:r>
+        <w:rPr>
+          <w:color w:val="1D2D3E"/>
+          <w:sz w:val="22"/>
+          <w:szCs w:val="22"/>
+        </w:rPr>
+        <w:t xml:space="preserve">ProcurementAnalytics Vendor Lead Time Modal (ProcurementAnalyticsScreen.tsx)</w:t>
+      </w:r>
+    </w:p>
+    <w:p>
+      <w:pPr>
+        <w:pStyle w:val="ListParagraph"/>
+        <w:numPr>
+          <w:ilvl w:val="1"/>
+          <w:numId w:val="1"/>
+        </w:numPr>
+        <w:spacing w:after="40"/>
+      </w:pPr>
+      <w:r>
+        <w:rPr>
+          <w:color w:val="1D2D3E"/>
+          <w:sz w:val="22"/>
+          <w:szCs w:val="22"/>
+        </w:rPr>
+        <w:t xml:space="preserve">  computeVendorMonthlyTrend(pos, vendorName): 6-month buckets filtered to one vendor</w:t>
+      </w:r>
+    </w:p>
+    <w:p>
+      <w:pPr>
+        <w:pStyle w:val="ListParagraph"/>
+        <w:numPr>
+          <w:ilvl w:val="1"/>
+          <w:numId w:val="1"/>
+        </w:numPr>
+        <w:spacing w:after="40"/>
+      </w:pPr>
+      <w:r>
+        <w:rPr>
+          <w:color w:val="1D2D3E"/>
+          <w:sz w:val="22"/>
+          <w:szCs w:val="22"/>
+        </w:rPr>
+        <w:t xml:space="preserve">  LeadTimeChart rows become tappable when onPress provided; legend hint updated</w:t>
+      </w:r>
+    </w:p>
+    <w:p>
+      <w:pPr>
+        <w:pStyle w:val="ListParagraph"/>
+        <w:numPr>
+          <w:ilvl w:val="1"/>
+          <w:numId w:val="1"/>
+        </w:numPr>
+        <w:spacing w:after="40"/>
+      </w:pPr>
+      <w:r>
+        <w:rPr>
+          <w:color w:val="1D2D3E"/>
+          <w:sz w:val="22"/>
+          <w:szCs w:val="22"/>
+        </w:rPr>
+        <w:t xml:space="preserve">  VendorLeadTimeModal: slide-up sheet with avg lead time + PO count tiles + 6-bar chart</w:t>
       </w:r>
     </w:p>
     <w:p>

</xml_diff>

<commit_message>
docs(session-55): update PROGRESS.md, generate-docs.js, and FEATURES.docx with Session 55 changelog
- PROGRESS.md: Session 55 entry with JE account picker dual-action, Dashboard KPI
  history sparkline, and ProcurementAnalytics vendor lead time comparison
- generate-docs.js: Sections 3.85/3.86/3.87 added; roadmap rows for all 3 features;
  Session 55 changelog entry in Section 7
- FEATURES.docx: regenerated
</commit_message>
<xml_diff>
--- a/FEATURES.docx
+++ b/FEATURES.docx
@@ -14007,6 +14007,465 @@
           <w:bCs/>
           <w:color w:val="1D2D3E"/>
         </w:rPr>
+        <w:t xml:space="preserve">3.85 JournalEntries Account Picker Dual-Action (Session 55)</w:t>
+      </w:r>
+    </w:p>
+    <w:p>
+      <w:pPr>
+        <w:pStyle w:val="ListParagraph"/>
+        <w:numPr>
+          <w:ilvl w:val="0"/>
+          <w:numId w:val="1"/>
+        </w:numPr>
+        <w:spacing w:after="40"/>
+      </w:pPr>
+      <w:r>
+        <w:rPr>
+          <w:color w:val="1D2D3E"/>
+          <w:sz w:val="22"/>
+          <w:szCs w:val="22"/>
+        </w:rPr>
+        <w:t xml:space="preserve">AccountPickerModal gains optional onViewLedger prop in addition to onSelect (filter JEs)</w:t>
+      </w:r>
+    </w:p>
+    <w:p>
+      <w:pPr>
+        <w:pStyle w:val="ListParagraph"/>
+        <w:numPr>
+          <w:ilvl w:val="1"/>
+          <w:numId w:val="1"/>
+        </w:numPr>
+        <w:spacing w:after="40"/>
+      </w:pPr>
+      <w:r>
+        <w:rPr>
+          <w:color w:val="1D2D3E"/>
+          <w:sz w:val="22"/>
+          <w:szCs w:val="22"/>
+        </w:rPr>
+        <w:t xml:space="preserve">  Each account row split: main tappable area → filter JEs; book-open icon button → navigate to AccountStatement</w:t>
+      </w:r>
+    </w:p>
+    <w:p>
+      <w:pPr>
+        <w:pStyle w:val="ListParagraph"/>
+        <w:numPr>
+          <w:ilvl w:val="1"/>
+          <w:numId w:val="1"/>
+        </w:numPr>
+        <w:spacing w:after="40"/>
+      </w:pPr>
+      <w:r>
+        <w:rPr>
+          <w:color w:val="1D2D3E"/>
+          <w:sz w:val="22"/>
+          <w:szCs w:val="22"/>
+        </w:rPr>
+        <w:t xml:space="preserve">  Icon changed from chevron-right to filter on main row to clarify intent</w:t>
+      </w:r>
+    </w:p>
+    <w:p>
+      <w:pPr>
+        <w:pStyle w:val="ListParagraph"/>
+        <w:numPr>
+          <w:ilvl w:val="0"/>
+          <w:numId w:val="1"/>
+        </w:numPr>
+        <w:spacing w:after="40"/>
+      </w:pPr>
+      <w:r>
+        <w:rPr>
+          <w:color w:val="1D2D3E"/>
+          <w:sz w:val="22"/>
+          <w:szCs w:val="22"/>
+        </w:rPr>
+        <w:t xml:space="preserve">Modal title updated to 'Select Account'; subtitle 'tap to filter JEs · book icon for ledger' shown when onViewLedger provided</w:t>
+      </w:r>
+    </w:p>
+    <w:p>
+      <w:pPr>
+        <w:pStyle w:val="ListParagraph"/>
+        <w:numPr>
+          <w:ilvl w:val="0"/>
+          <w:numId w:val="1"/>
+        </w:numPr>
+        <w:spacing w:after="40"/>
+      </w:pPr>
+      <w:r>
+        <w:rPr>
+          <w:color w:val="1D2D3E"/>
+          <w:sz w:val="22"/>
+          <w:szCs w:val="22"/>
+        </w:rPr>
+        <w:t xml:space="preserve">Style split: accountRowMain (flex tappable area), accountRowLedgerBtn (right icon with hairline separator)</w:t>
+      </w:r>
+    </w:p>
+    <w:p>
+      <w:pPr>
+        <w:spacing w:after="80"/>
+      </w:pPr>
+      <w:r>
+        <w:rPr>
+          <w:color w:val="1D2D3E"/>
+          <w:sz w:val="22"/>
+          <w:szCs w:val="22"/>
+        </w:rPr>
+        <w:t xml:space="preserve"/>
+      </w:r>
+    </w:p>
+    <w:p>
+      <w:pPr>
+        <w:pStyle w:val="Heading2"/>
+        <w:spacing w:after="120" w:before="300"/>
+      </w:pPr>
+      <w:r>
+        <w:rPr>
+          <w:b/>
+          <w:bCs/>
+          <w:color w:val="1D2D3E"/>
+        </w:rPr>
+        <w:t xml:space="preserve">3.86 Dashboard 7-Day KPI History Sparkline (Session 55)</w:t>
+      </w:r>
+    </w:p>
+    <w:p>
+      <w:pPr>
+        <w:pStyle w:val="ListParagraph"/>
+        <w:numPr>
+          <w:ilvl w:val="0"/>
+          <w:numId w:val="1"/>
+        </w:numPr>
+        <w:spacing w:after="40"/>
+      </w:pPr>
+      <w:r>
+        <w:rPr>
+          <w:color w:val="1D2D3E"/>
+          <w:sz w:val="22"/>
+          <w:szCs w:val="22"/>
+        </w:rPr>
+        <w:t xml:space="preserve">New src/utils/kpiHistory.ts: rolling 7-entry daily KPI snapshot per company</w:t>
+      </w:r>
+    </w:p>
+    <w:p>
+      <w:pPr>
+        <w:pStyle w:val="ListParagraph"/>
+        <w:numPr>
+          <w:ilvl w:val="1"/>
+          <w:numId w:val="1"/>
+        </w:numPr>
+        <w:spacing w:after="40"/>
+      </w:pPr>
+      <w:r>
+        <w:rPr>
+          <w:color w:val="1D2D3E"/>
+          <w:sz w:val="22"/>
+          <w:szCs w:val="22"/>
+        </w:rPr>
+        <w:t xml:space="preserve">  KpiHistoryEntry { date, companyId, revenue, expenses, netIncome, vouchersMonth }</w:t>
+      </w:r>
+    </w:p>
+    <w:p>
+      <w:pPr>
+        <w:pStyle w:val="ListParagraph"/>
+        <w:numPr>
+          <w:ilvl w:val="1"/>
+          <w:numId w:val="1"/>
+        </w:numPr>
+        <w:spacing w:after="40"/>
+      </w:pPr>
+      <w:r>
+        <w:rPr>
+          <w:color w:val="1D2D3E"/>
+          <w:sz w:val="22"/>
+          <w:szCs w:val="22"/>
+        </w:rPr>
+        <w:t xml:space="preserve">  saveKpiSnapshot: upserts today's entry (replaces same-day record with latest values); trims to 7 entries</w:t>
+      </w:r>
+    </w:p>
+    <w:p>
+      <w:pPr>
+        <w:pStyle w:val="ListParagraph"/>
+        <w:numPr>
+          <w:ilvl w:val="1"/>
+          <w:numId w:val="1"/>
+        </w:numPr>
+        <w:spacing w:after="40"/>
+      </w:pPr>
+      <w:r>
+        <w:rPr>
+          <w:color w:val="1D2D3E"/>
+          <w:sz w:val="22"/>
+          <w:szCs w:val="22"/>
+        </w:rPr>
+        <w:t xml:space="preserve">  loadKpiHistory: returns full rolling history array from AsyncStorage</w:t>
+      </w:r>
+    </w:p>
+    <w:p>
+      <w:pPr>
+        <w:pStyle w:val="ListParagraph"/>
+        <w:numPr>
+          <w:ilvl w:val="0"/>
+          <w:numId w:val="1"/>
+        </w:numPr>
+        <w:spacing w:after="40"/>
+      </w:pPr>
+      <w:r>
+        <w:rPr>
+          <w:color w:val="1D2D3E"/>
+          <w:sz w:val="22"/>
+          <w:szCs w:val="22"/>
+        </w:rPr>
+        <w:t xml:space="preserve">DashboardScreen: saves snapshot on fresh API fetch + reloads history; also reloads on company change</w:t>
+      </w:r>
+    </w:p>
+    <w:p>
+      <w:pPr>
+        <w:pStyle w:val="ListParagraph"/>
+        <w:numPr>
+          <w:ilvl w:val="0"/>
+          <w:numId w:val="1"/>
+        </w:numPr>
+        <w:spacing w:after="40"/>
+      </w:pPr>
+      <w:r>
+        <w:rPr>
+          <w:color w:val="1D2D3E"/>
+          <w:sz w:val="22"/>
+          <w:szCs w:val="22"/>
+        </w:rPr>
+        <w:t xml:space="preserve">QuickStatsCard: 7 grouped revenue (dark) + expense (muted) bars per day; today highlighted; trend pill (% vs earliest entry)</w:t>
+      </w:r>
+    </w:p>
+    <w:p>
+      <w:pPr>
+        <w:pStyle w:val="ListParagraph"/>
+        <w:numPr>
+          <w:ilvl w:val="1"/>
+          <w:numId w:val="1"/>
+        </w:numPr>
+        <w:spacing w:after="40"/>
+      </w:pPr>
+      <w:r>
+        <w:rPr>
+          <w:color w:val="1D2D3E"/>
+          <w:sz w:val="22"/>
+          <w:szCs w:val="22"/>
+        </w:rPr>
+        <w:t xml:space="preserve">  Legend row: Rev/Exp amounts + net income; only renders when history has ≥2 entries</w:t>
+      </w:r>
+    </w:p>
+    <w:p>
+      <w:pPr>
+        <w:pStyle w:val="ListParagraph"/>
+        <w:numPr>
+          <w:ilvl w:val="0"/>
+          <w:numId w:val="1"/>
+        </w:numPr>
+        <w:spacing w:after="40"/>
+      </w:pPr>
+      <w:r>
+        <w:rPr>
+          <w:color w:val="1D2D3E"/>
+          <w:sz w:val="22"/>
+          <w:szCs w:val="22"/>
+        </w:rPr>
+        <w:t xml:space="preserve">Placed between KPI grid and Working Capital with 'Revenue Trend' section header</w:t>
+      </w:r>
+    </w:p>
+    <w:p>
+      <w:pPr>
+        <w:spacing w:after="80"/>
+      </w:pPr>
+      <w:r>
+        <w:rPr>
+          <w:color w:val="1D2D3E"/>
+          <w:sz w:val="22"/>
+          <w:szCs w:val="22"/>
+        </w:rPr>
+        <w:t xml:space="preserve"/>
+      </w:r>
+    </w:p>
+    <w:p>
+      <w:pPr>
+        <w:pStyle w:val="Heading2"/>
+        <w:spacing w:after="120" w:before="300"/>
+      </w:pPr>
+      <w:r>
+        <w:rPr>
+          <w:b/>
+          <w:bCs/>
+          <w:color w:val="1D2D3E"/>
+        </w:rPr>
+        <w:t xml:space="preserve">3.87 ProcurementAnalytics Vendor Lead Time Comparison (Session 55)</w:t>
+      </w:r>
+    </w:p>
+    <w:p>
+      <w:pPr>
+        <w:pStyle w:val="ListParagraph"/>
+        <w:numPr>
+          <w:ilvl w:val="0"/>
+          <w:numId w:val="1"/>
+        </w:numPr>
+        <w:spacing w:after="40"/>
+      </w:pPr>
+      <w:r>
+        <w:rPr>
+          <w:color w:val="1D2D3E"/>
+          <w:sz w:val="22"/>
+          <w:szCs w:val="22"/>
+        </w:rPr>
+        <w:t xml:space="preserve">VendorLeadTimeModal gains compareVendor/compareTrend/otherVendors/onSelectCompare/onClearCompare props</w:t>
+      </w:r>
+    </w:p>
+    <w:p>
+      <w:pPr>
+        <w:pStyle w:val="ListParagraph"/>
+        <w:numPr>
+          <w:ilvl w:val="0"/>
+          <w:numId w:val="1"/>
+        </w:numPr>
+        <w:spacing w:after="40"/>
+      </w:pPr>
+      <w:r>
+        <w:rPr>
+          <w:color w:val="1D2D3E"/>
+          <w:sz w:val="22"/>
+          <w:szCs w:val="22"/>
+        </w:rPr>
+        <w:t xml:space="preserve">Solo mode (existing): single bar per month; tiles show avg days + PO count</w:t>
+      </w:r>
+    </w:p>
+    <w:p>
+      <w:pPr>
+        <w:pStyle w:val="ListParagraph"/>
+        <w:numPr>
+          <w:ilvl w:val="0"/>
+          <w:numId w:val="1"/>
+        </w:numPr>
+        <w:spacing w:after="40"/>
+      </w:pPr>
+      <w:r>
+        <w:rPr>
+          <w:color w:val="1D2D3E"/>
+          <w:sz w:val="22"/>
+          <w:szCs w:val="22"/>
+        </w:rPr>
+        <w:t xml:space="preserve">Compare mode: header 'A vs B'; tiles show both avg days + delta; legend with colored dots; dual grouped bars per month</w:t>
+      </w:r>
+    </w:p>
+    <w:p>
+      <w:pPr>
+        <w:pStyle w:val="ListParagraph"/>
+        <w:numPr>
+          <w:ilvl w:val="1"/>
+          <w:numId w:val="1"/>
+        </w:numPr>
+        <w:spacing w:after="40"/>
+      </w:pPr>
+      <w:r>
+        <w:rPr>
+          <w:color w:val="1D2D3E"/>
+          <w:sz w:val="22"/>
+          <w:szCs w:val="22"/>
+        </w:rPr>
+        <w:t xml:space="preserve">  Dark bars = primary vendor; muted bars = compare vendor; shared scale across both</w:t>
+      </w:r>
+    </w:p>
+    <w:p>
+      <w:pPr>
+        <w:pStyle w:val="ListParagraph"/>
+        <w:numPr>
+          <w:ilvl w:val="0"/>
+          <w:numId w:val="1"/>
+        </w:numPr>
+        <w:spacing w:after="40"/>
+      </w:pPr>
+      <w:r>
+        <w:rPr>
+          <w:color w:val="1D2D3E"/>
+          <w:sz w:val="22"/>
+          <w:szCs w:val="22"/>
+        </w:rPr>
+        <w:t xml:space="preserve">'Compare with another vendor' button (git-merge icon) shown when otherVendors.length &gt; 0</w:t>
+      </w:r>
+    </w:p>
+    <w:p>
+      <w:pPr>
+        <w:pStyle w:val="ListParagraph"/>
+        <w:numPr>
+          <w:ilvl w:val="0"/>
+          <w:numId w:val="1"/>
+        </w:numPr>
+        <w:spacing w:after="40"/>
+      </w:pPr>
+      <w:r>
+        <w:rPr>
+          <w:color w:val="1D2D3E"/>
+          <w:sz w:val="22"/>
+          <w:szCs w:val="22"/>
+        </w:rPr>
+        <w:t xml:space="preserve">Inline FlatList vendor picker in modal bottom: shows vendor name + avg days; tap selects and closes picker</w:t>
+      </w:r>
+    </w:p>
+    <w:p>
+      <w:pPr>
+        <w:pStyle w:val="ListParagraph"/>
+        <w:numPr>
+          <w:ilvl w:val="0"/>
+          <w:numId w:val="1"/>
+        </w:numPr>
+        <w:spacing w:after="40"/>
+      </w:pPr>
+      <w:r>
+        <w:rPr>
+          <w:color w:val="1D2D3E"/>
+          <w:sz w:val="22"/>
+          <w:szCs w:val="22"/>
+        </w:rPr>
+        <w:t xml:space="preserve">'Clear' button in legend row resets comparison to solo view</w:t>
+      </w:r>
+    </w:p>
+    <w:p>
+      <w:pPr>
+        <w:pStyle w:val="ListParagraph"/>
+        <w:numPr>
+          <w:ilvl w:val="0"/>
+          <w:numId w:val="1"/>
+        </w:numPr>
+        <w:spacing w:after="40"/>
+      </w:pPr>
+      <w:r>
+        <w:rPr>
+          <w:color w:val="1D2D3E"/>
+          <w:sz w:val="22"/>
+          <w:szCs w:val="22"/>
+        </w:rPr>
+        <w:t xml:space="preserve">compareLeadTimeVendor + compareLeadTrend state + handleCompareVendorSelect callback in ProcurementAnalyticsScreen</w:t>
+      </w:r>
+    </w:p>
+    <w:p>
+      <w:pPr>
+        <w:spacing w:after="80"/>
+      </w:pPr>
+      <w:r>
+        <w:rPr>
+          <w:color w:val="1D2D3E"/>
+          <w:sz w:val="22"/>
+          <w:szCs w:val="22"/>
+        </w:rPr>
+        <w:t xml:space="preserve"/>
+      </w:r>
+    </w:p>
+    <w:p>
+      <w:pPr>
+        <w:pStyle w:val="Heading2"/>
+        <w:spacing w:after="120" w:before="300"/>
+      </w:pPr>
+      <w:r>
+        <w:rPr>
+          <w:b/>
+          <w:bCs/>
+          <w:color w:val="1D2D3E"/>
+        </w:rPr>
         <w:t xml:space="preserve">3.82 ProcurementAnalytics Vendor Lead Time Drill-Down Modal (Session 54)</w:t>
       </w:r>
     </w:p>
@@ -30776,6 +31235,228 @@
           </w:p>
         </w:tc>
       </w:tr>
+      <w:tr>
+        <w:tc>
+          <w:p>
+            <w:pPr>
+              <w:spacing w:after="40" w:before="40"/>
+            </w:pPr>
+            <w:r>
+              <w:rPr>
+                <w:b w:val="false"/>
+                <w:bCs w:val="false"/>
+                <w:color w:val="1D2D3E"/>
+                <w:sz w:val="20"/>
+                <w:szCs w:val="20"/>
+              </w:rPr>
+              <w:t xml:space="preserve">Session 55</w:t>
+            </w:r>
+          </w:p>
+        </w:tc>
+        <w:tc>
+          <w:p>
+            <w:pPr>
+              <w:spacing w:after="40" w:before="40"/>
+            </w:pPr>
+            <w:r>
+              <w:rPr>
+                <w:b w:val="false"/>
+                <w:bCs w:val="false"/>
+                <w:color w:val="1D2D3E"/>
+                <w:sz w:val="20"/>
+                <w:szCs w:val="20"/>
+              </w:rPr>
+              <w:t xml:space="preserve">JE account picker dual-action — main tap filters JEs; book-open icon navigates to AccountStatement ledger; modal subtitle explains both actions</w:t>
+            </w:r>
+          </w:p>
+        </w:tc>
+        <w:tc>
+          <w:p>
+            <w:pPr>
+              <w:spacing w:after="40" w:before="40"/>
+            </w:pPr>
+            <w:r>
+              <w:rPr>
+                <w:b w:val="false"/>
+                <w:bCs w:val="false"/>
+                <w:color w:val="1D2D3E"/>
+                <w:sz w:val="20"/>
+                <w:szCs w:val="20"/>
+              </w:rPr>
+              <w:t xml:space="preserve">Done</w:t>
+            </w:r>
+          </w:p>
+        </w:tc>
+        <w:tc>
+          <w:p>
+            <w:pPr>
+              <w:spacing w:after="40" w:before="40"/>
+            </w:pPr>
+            <w:r>
+              <w:rPr>
+                <w:b w:val="false"/>
+                <w:bCs w:val="false"/>
+                <w:color w:val="1D2D3E"/>
+                <w:sz w:val="20"/>
+                <w:szCs w:val="20"/>
+              </w:rPr>
+              <w:t xml:space="preserve">JournalEntriesScreen.tsx</w:t>
+            </w:r>
+          </w:p>
+        </w:tc>
+      </w:tr>
+      <w:tr>
+        <w:tc>
+          <w:tcPr>
+            <w:shd w:color="F0F4F8" w:val="solid"/>
+          </w:tcPr>
+          <w:p>
+            <w:pPr>
+              <w:spacing w:after="40" w:before="40"/>
+            </w:pPr>
+            <w:r>
+              <w:rPr>
+                <w:b w:val="false"/>
+                <w:bCs w:val="false"/>
+                <w:color w:val="1D2D3E"/>
+                <w:sz w:val="20"/>
+                <w:szCs w:val="20"/>
+              </w:rPr>
+              <w:t xml:space="preserve">Session 55</w:t>
+            </w:r>
+          </w:p>
+        </w:tc>
+        <w:tc>
+          <w:tcPr>
+            <w:shd w:color="F0F4F8" w:val="solid"/>
+          </w:tcPr>
+          <w:p>
+            <w:pPr>
+              <w:spacing w:after="40" w:before="40"/>
+            </w:pPr>
+            <w:r>
+              <w:rPr>
+                <w:b w:val="false"/>
+                <w:bCs w:val="false"/>
+                <w:color w:val="1D2D3E"/>
+                <w:sz w:val="20"/>
+                <w:szCs w:val="20"/>
+              </w:rPr>
+              <w:t xml:space="preserve">Dashboard 7-day KPI sparkline — daily revenue/expense snapshot in AsyncStorage; QuickStatsCard grouped bars + trend pill + net income</w:t>
+            </w:r>
+          </w:p>
+        </w:tc>
+        <w:tc>
+          <w:tcPr>
+            <w:shd w:color="F0F4F8" w:val="solid"/>
+          </w:tcPr>
+          <w:p>
+            <w:pPr>
+              <w:spacing w:after="40" w:before="40"/>
+            </w:pPr>
+            <w:r>
+              <w:rPr>
+                <w:b w:val="false"/>
+                <w:bCs w:val="false"/>
+                <w:color w:val="1D2D3E"/>
+                <w:sz w:val="20"/>
+                <w:szCs w:val="20"/>
+              </w:rPr>
+              <w:t xml:space="preserve">Done</w:t>
+            </w:r>
+          </w:p>
+        </w:tc>
+        <w:tc>
+          <w:tcPr>
+            <w:shd w:color="F0F4F8" w:val="solid"/>
+          </w:tcPr>
+          <w:p>
+            <w:pPr>
+              <w:spacing w:after="40" w:before="40"/>
+            </w:pPr>
+            <w:r>
+              <w:rPr>
+                <w:b w:val="false"/>
+                <w:bCs w:val="false"/>
+                <w:color w:val="1D2D3E"/>
+                <w:sz w:val="20"/>
+                <w:szCs w:val="20"/>
+              </w:rPr>
+              <w:t xml:space="preserve">DashboardScreen.tsx, kpiHistory.ts</w:t>
+            </w:r>
+          </w:p>
+        </w:tc>
+      </w:tr>
+      <w:tr>
+        <w:tc>
+          <w:p>
+            <w:pPr>
+              <w:spacing w:after="40" w:before="40"/>
+            </w:pPr>
+            <w:r>
+              <w:rPr>
+                <w:b w:val="false"/>
+                <w:bCs w:val="false"/>
+                <w:color w:val="1D2D3E"/>
+                <w:sz w:val="20"/>
+                <w:szCs w:val="20"/>
+              </w:rPr>
+              <w:t xml:space="preserve">Session 55</w:t>
+            </w:r>
+          </w:p>
+        </w:tc>
+        <w:tc>
+          <w:p>
+            <w:pPr>
+              <w:spacing w:after="40" w:before="40"/>
+            </w:pPr>
+            <w:r>
+              <w:rPr>
+                <w:b w:val="false"/>
+                <w:bCs w:val="false"/>
+                <w:color w:val="1D2D3E"/>
+                <w:sz w:val="20"/>
+                <w:szCs w:val="20"/>
+              </w:rPr>
+              <w:t xml:space="preserve">ProcurementAnalytics vendor comparison — compare two vendors' 6-month lead times side-by-side; inline picker + delta tile + dual bars</w:t>
+            </w:r>
+          </w:p>
+        </w:tc>
+        <w:tc>
+          <w:p>
+            <w:pPr>
+              <w:spacing w:after="40" w:before="40"/>
+            </w:pPr>
+            <w:r>
+              <w:rPr>
+                <w:b w:val="false"/>
+                <w:bCs w:val="false"/>
+                <w:color w:val="1D2D3E"/>
+                <w:sz w:val="20"/>
+                <w:szCs w:val="20"/>
+              </w:rPr>
+              <w:t xml:space="preserve">Done</w:t>
+            </w:r>
+          </w:p>
+        </w:tc>
+        <w:tc>
+          <w:p>
+            <w:pPr>
+              <w:spacing w:after="40" w:before="40"/>
+            </w:pPr>
+            <w:r>
+              <w:rPr>
+                <w:b w:val="false"/>
+                <w:bCs w:val="false"/>
+                <w:color w:val="1D2D3E"/>
+                <w:sz w:val="20"/>
+                <w:szCs w:val="20"/>
+              </w:rPr>
+              <w:t xml:space="preserve">ProcurementAnalyticsScreen.tsx</w:t>
+            </w:r>
+          </w:p>
+        </w:tc>
+      </w:tr>
     </w:tbl>
     <w:p>
       <w:pPr>
@@ -35858,6 +36539,267 @@
           <w:szCs w:val="22"/>
         </w:rPr>
         <w:t xml:space="preserve">  Tapping a history row repopulates the query field</w:t>
+      </w:r>
+    </w:p>
+    <w:p>
+      <w:pPr>
+        <w:spacing w:after="80"/>
+      </w:pPr>
+      <w:r>
+        <w:rPr>
+          <w:color w:val="1D2D3E"/>
+          <w:sz w:val="22"/>
+          <w:szCs w:val="22"/>
+        </w:rPr>
+        <w:t xml:space="preserve"/>
+      </w:r>
+    </w:p>
+    <w:p>
+      <w:pPr>
+        <w:pStyle w:val="Heading2"/>
+        <w:spacing w:after="120" w:before="300"/>
+      </w:pPr>
+      <w:r>
+        <w:rPr>
+          <w:b/>
+          <w:bCs/>
+          <w:color w:val="1D2D3E"/>
+        </w:rPr>
+        <w:t xml:space="preserve">Session 55 — 2026-06-10</w:t>
+      </w:r>
+    </w:p>
+    <w:p>
+      <w:pPr>
+        <w:pStyle w:val="ListParagraph"/>
+        <w:numPr>
+          <w:ilvl w:val="0"/>
+          <w:numId w:val="1"/>
+        </w:numPr>
+        <w:spacing w:after="40"/>
+      </w:pPr>
+      <w:r>
+        <w:rPr>
+          <w:color w:val="1D2D3E"/>
+          <w:sz w:val="22"/>
+          <w:szCs w:val="22"/>
+        </w:rPr>
+        <w:t xml:space="preserve">JE Account Picker Dual-Action (JournalEntriesScreen.tsx)</w:t>
+      </w:r>
+    </w:p>
+    <w:p>
+      <w:pPr>
+        <w:pStyle w:val="ListParagraph"/>
+        <w:numPr>
+          <w:ilvl w:val="1"/>
+          <w:numId w:val="1"/>
+        </w:numPr>
+        <w:spacing w:after="40"/>
+      </w:pPr>
+      <w:r>
+        <w:rPr>
+          <w:color w:val="1D2D3E"/>
+          <w:sz w:val="22"/>
+          <w:szCs w:val="22"/>
+        </w:rPr>
+        <w:t xml:space="preserve">  AccountPickerModal: main row tap → filter JEs; book-open icon → AccountStatement ledger</w:t>
+      </w:r>
+    </w:p>
+    <w:p>
+      <w:pPr>
+        <w:pStyle w:val="ListParagraph"/>
+        <w:numPr>
+          <w:ilvl w:val="1"/>
+          <w:numId w:val="1"/>
+        </w:numPr>
+        <w:spacing w:after="40"/>
+      </w:pPr>
+      <w:r>
+        <w:rPr>
+          <w:color w:val="1D2D3E"/>
+          <w:sz w:val="22"/>
+          <w:szCs w:val="22"/>
+        </w:rPr>
+        <w:t xml:space="preserve">  Modal title 'Select Account' + subtitle explaining dual purpose</w:t>
+      </w:r>
+    </w:p>
+    <w:p>
+      <w:pPr>
+        <w:pStyle w:val="ListParagraph"/>
+        <w:numPr>
+          <w:ilvl w:val="1"/>
+          <w:numId w:val="1"/>
+        </w:numPr>
+        <w:spacing w:after="40"/>
+      </w:pPr>
+      <w:r>
+        <w:rPr>
+          <w:color w:val="1D2D3E"/>
+          <w:sz w:val="22"/>
+          <w:szCs w:val="22"/>
+        </w:rPr>
+        <w:t xml:space="preserve">  Style split into accountRowMain (flex) + accountRowLedgerBtn (right icon, hairline separator)</w:t>
+      </w:r>
+    </w:p>
+    <w:p>
+      <w:pPr>
+        <w:pStyle w:val="ListParagraph"/>
+        <w:numPr>
+          <w:ilvl w:val="0"/>
+          <w:numId w:val="1"/>
+        </w:numPr>
+        <w:spacing w:after="40"/>
+      </w:pPr>
+      <w:r>
+        <w:rPr>
+          <w:color w:val="1D2D3E"/>
+          <w:sz w:val="22"/>
+          <w:szCs w:val="22"/>
+        </w:rPr>
+        <w:t xml:space="preserve">Dashboard 7-Day KPI Sparkline (DashboardScreen.tsx, src/utils/kpiHistory.ts)</w:t>
+      </w:r>
+    </w:p>
+    <w:p>
+      <w:pPr>
+        <w:pStyle w:val="ListParagraph"/>
+        <w:numPr>
+          <w:ilvl w:val="1"/>
+          <w:numId w:val="1"/>
+        </w:numPr>
+        <w:spacing w:after="40"/>
+      </w:pPr>
+      <w:r>
+        <w:rPr>
+          <w:color w:val="1D2D3E"/>
+          <w:sz w:val="22"/>
+          <w:szCs w:val="22"/>
+        </w:rPr>
+        <w:t xml:space="preserve">  kpiHistory.ts: rolling 7-entry daily snapshot — saveKpiSnapshot + loadKpiHistory per company</w:t>
+      </w:r>
+    </w:p>
+    <w:p>
+      <w:pPr>
+        <w:pStyle w:val="ListParagraph"/>
+        <w:numPr>
+          <w:ilvl w:val="1"/>
+          <w:numId w:val="1"/>
+        </w:numPr>
+        <w:spacing w:after="40"/>
+      </w:pPr>
+      <w:r>
+        <w:rPr>
+          <w:color w:val="1D2D3E"/>
+          <w:sz w:val="22"/>
+          <w:szCs w:val="22"/>
+        </w:rPr>
+        <w:t xml:space="preserve">  Snapshot upserts today's entry with latest values; trims to 7 entries max</w:t>
+      </w:r>
+    </w:p>
+    <w:p>
+      <w:pPr>
+        <w:pStyle w:val="ListParagraph"/>
+        <w:numPr>
+          <w:ilvl w:val="1"/>
+          <w:numId w:val="1"/>
+        </w:numPr>
+        <w:spacing w:after="40"/>
+      </w:pPr>
+      <w:r>
+        <w:rPr>
+          <w:color w:val="1D2D3E"/>
+          <w:sz w:val="22"/>
+          <w:szCs w:val="22"/>
+        </w:rPr>
+        <w:t xml:space="preserve">  QuickStatsCard: grouped rev/exp bars per day; today highlighted; trend pill vs earliest; legend row</w:t>
+      </w:r>
+    </w:p>
+    <w:p>
+      <w:pPr>
+        <w:pStyle w:val="ListParagraph"/>
+        <w:numPr>
+          <w:ilvl w:val="1"/>
+          <w:numId w:val="1"/>
+        </w:numPr>
+        <w:spacing w:after="40"/>
+      </w:pPr>
+      <w:r>
+        <w:rPr>
+          <w:color w:val="1D2D3E"/>
+          <w:sz w:val="22"/>
+          <w:szCs w:val="22"/>
+        </w:rPr>
+        <w:t xml:space="preserve">  Renders only when history ≥ 2 entries; tap → FinancialReports</w:t>
+      </w:r>
+    </w:p>
+    <w:p>
+      <w:pPr>
+        <w:pStyle w:val="ListParagraph"/>
+        <w:numPr>
+          <w:ilvl w:val="0"/>
+          <w:numId w:val="1"/>
+        </w:numPr>
+        <w:spacing w:after="40"/>
+      </w:pPr>
+      <w:r>
+        <w:rPr>
+          <w:color w:val="1D2D3E"/>
+          <w:sz w:val="22"/>
+          <w:szCs w:val="22"/>
+        </w:rPr>
+        <w:t xml:space="preserve">ProcurementAnalytics Vendor Comparison (ProcurementAnalyticsScreen.tsx)</w:t>
+      </w:r>
+    </w:p>
+    <w:p>
+      <w:pPr>
+        <w:pStyle w:val="ListParagraph"/>
+        <w:numPr>
+          <w:ilvl w:val="1"/>
+          <w:numId w:val="1"/>
+        </w:numPr>
+        <w:spacing w:after="40"/>
+      </w:pPr>
+      <w:r>
+        <w:rPr>
+          <w:color w:val="1D2D3E"/>
+          <w:sz w:val="22"/>
+          <w:szCs w:val="22"/>
+        </w:rPr>
+        <w:t xml:space="preserve">  VendorLeadTimeModal extended with compare props: compareVendor/compareTrend/otherVendors</w:t>
+      </w:r>
+    </w:p>
+    <w:p>
+      <w:pPr>
+        <w:pStyle w:val="ListParagraph"/>
+        <w:numPr>
+          <w:ilvl w:val="1"/>
+          <w:numId w:val="1"/>
+        </w:numPr>
+        <w:spacing w:after="40"/>
+      </w:pPr>
+      <w:r>
+        <w:rPr>
+          <w:color w:val="1D2D3E"/>
+          <w:sz w:val="22"/>
+          <w:szCs w:val="22"/>
+        </w:rPr>
+        <w:t xml:space="preserve">  Compare mode: 'A vs B' header, dual avg tiles + delta, legend dots, grouped dual bars per month</w:t>
+      </w:r>
+    </w:p>
+    <w:p>
+      <w:pPr>
+        <w:pStyle w:val="ListParagraph"/>
+        <w:numPr>
+          <w:ilvl w:val="1"/>
+          <w:numId w:val="1"/>
+        </w:numPr>
+        <w:spacing w:after="40"/>
+      </w:pPr>
+      <w:r>
+        <w:rPr>
+          <w:color w:val="1D2D3E"/>
+          <w:sz w:val="22"/>
+          <w:szCs w:val="22"/>
+        </w:rPr>
+        <w:t xml:space="preserve">  Inline vendor picker FlatList in modal; 'Compare with…' button; 'Clear' to reset to solo view</w:t>
       </w:r>
     </w:p>
     <w:p>

</xml_diff>

<commit_message>
docs(session-57): update PROGRESS.md, generate-docs.js, and FEATURES.docx with Session 57 changelog
- PROGRESS.md: full session 57 summary (7 features); updated Next Session notes
- generate-docs.js: Section 3.94-3.100 new feature entries; Section 4 roadmap
  rows for all 7 session-57 items; Section 7 changelog entry
- FEATURES.docx: regenerated with new content
</commit_message>
<xml_diff>
--- a/FEATURES.docx
+++ b/FEATURES.docx
@@ -45,7 +45,7 @@
           <w:sz w:val="20"/>
           <w:szCs w:val="20"/>
         </w:rPr>
-        <w:t xml:space="preserve">Generated: 2026-06-10</w:t>
+        <w:t xml:space="preserve">Generated: 2026-06-11</w:t>
       </w:r>
     </w:p>
     <w:p>
@@ -14295,6 +14295,663 @@
           <w:bCs/>
           <w:color w:val="1D2D3E"/>
         </w:rPr>
+        <w:t xml:space="preserve">3.94 StockHealth Warehouse Velocity Filter (Session 57)</w:t>
+      </w:r>
+    </w:p>
+    <w:p>
+      <w:pPr>
+        <w:pStyle w:val="ListParagraph"/>
+        <w:numPr>
+          <w:ilvl w:val="0"/>
+          <w:numId w:val="1"/>
+        </w:numPr>
+        <w:spacing w:after="40"/>
+      </w:pPr>
+      <w:r>
+        <w:rPr>
+          <w:color w:val="1D2D3E"/>
+          <w:sz w:val="22"/>
+          <w:szCs w:val="22"/>
+        </w:rPr>
+        <w:t xml:space="preserve">velocityWarehouse state (string|null) + velocityWarehouses useMemo (unique warehouse names from rawLedger)</w:t>
+      </w:r>
+    </w:p>
+    <w:p>
+      <w:pPr>
+        <w:pStyle w:val="ListParagraph"/>
+        <w:numPr>
+          <w:ilvl w:val="0"/>
+          <w:numId w:val="1"/>
+        </w:numPr>
+        <w:spacing w:after="40"/>
+      </w:pPr>
+      <w:r>
+        <w:rPr>
+          <w:color w:val="1D2D3E"/>
+          <w:sz w:val="22"/>
+          <w:szCs w:val="22"/>
+        </w:rPr>
+        <w:t xml:space="preserve">Velocity useMemo applies warehouse filter before computeLedgerAnalysis — zero extra API calls</w:t>
+      </w:r>
+    </w:p>
+    <w:p>
+      <w:pPr>
+        <w:pStyle w:val="ListParagraph"/>
+        <w:numPr>
+          <w:ilvl w:val="0"/>
+          <w:numId w:val="1"/>
+        </w:numPr>
+        <w:spacing w:after="40"/>
+      </w:pPr>
+      <w:r>
+        <w:rPr>
+          <w:color w:val="1D2D3E"/>
+          <w:sz w:val="22"/>
+          <w:szCs w:val="22"/>
+        </w:rPr>
+        <w:t xml:space="preserve">Compact 'All warehouses / [name]' button with layers icon appears below SectionHeader when 2+ warehouses</w:t>
+      </w:r>
+    </w:p>
+    <w:p>
+      <w:pPr>
+        <w:pStyle w:val="ListParagraph"/>
+        <w:numPr>
+          <w:ilvl w:val="0"/>
+          <w:numId w:val="1"/>
+        </w:numPr>
+        <w:spacing w:after="40"/>
+      </w:pPr>
+      <w:r>
+        <w:rPr>
+          <w:color w:val="1D2D3E"/>
+          <w:sz w:val="22"/>
+          <w:szCs w:val="22"/>
+        </w:rPr>
+        <w:t xml:space="preserve">FlatList bottom-sheet modal with 'All warehouses' row + per-warehouse rows; active row = dark filled</w:t>
+      </w:r>
+    </w:p>
+    <w:p>
+      <w:pPr>
+        <w:pStyle w:val="ListParagraph"/>
+        <w:numPr>
+          <w:ilvl w:val="0"/>
+          <w:numId w:val="1"/>
+        </w:numPr>
+        <w:spacing w:after="40"/>
+      </w:pPr>
+      <w:r>
+        <w:rPr>
+          <w:color w:val="1D2D3E"/>
+          <w:sz w:val="22"/>
+          <w:szCs w:val="22"/>
+        </w:rPr>
+        <w:t xml:space="preserve">SectionHeader subtitle shows 'warehouse · period' when warehouse is selected</w:t>
+      </w:r>
+    </w:p>
+    <w:p>
+      <w:pPr>
+        <w:spacing w:after="80"/>
+      </w:pPr>
+      <w:r>
+        <w:rPr>
+          <w:color w:val="1D2D3E"/>
+          <w:sz w:val="22"/>
+          <w:szCs w:val="22"/>
+        </w:rPr>
+        <w:t xml:space="preserve"/>
+      </w:r>
+    </w:p>
+    <w:p>
+      <w:pPr>
+        <w:pStyle w:val="Heading2"/>
+        <w:spacing w:after="120" w:before="300"/>
+      </w:pPr>
+      <w:r>
+        <w:rPr>
+          <w:b/>
+          <w:bCs/>
+          <w:color w:val="1D2D3E"/>
+        </w:rPr>
+        <w:t xml:space="preserve">3.95 FinancialAnalytics NWC Polyline Chart (Session 57)</w:t>
+      </w:r>
+    </w:p>
+    <w:p>
+      <w:pPr>
+        <w:pStyle w:val="ListParagraph"/>
+        <w:numPr>
+          <w:ilvl w:val="0"/>
+          <w:numId w:val="1"/>
+        </w:numPr>
+        <w:spacing w:after="40"/>
+      </w:pPr>
+      <w:r>
+        <w:rPr>
+          <w:color w:val="1D2D3E"/>
+          <w:sz w:val="22"/>
+          <w:szCs w:val="22"/>
+        </w:rPr>
+        <w:t xml:space="preserve">NWCPolyline component replaces bar chart in NWCTrendCard</w:t>
+      </w:r>
+    </w:p>
+    <w:p>
+      <w:pPr>
+        <w:pStyle w:val="ListParagraph"/>
+        <w:numPr>
+          <w:ilvl w:val="0"/>
+          <w:numId w:val="1"/>
+        </w:numPr>
+        <w:spacing w:after="40"/>
+      </w:pPr>
+      <w:r>
+        <w:rPr>
+          <w:color w:val="1D2D3E"/>
+          <w:sz w:val="22"/>
+          <w:szCs w:val="22"/>
+        </w:rPr>
+        <w:t xml:space="preserve">Each segment: midpoint-positioned View with width=length, rotated by atan2 angle using transform</w:t>
+      </w:r>
+    </w:p>
+    <w:p>
+      <w:pPr>
+        <w:pStyle w:val="ListParagraph"/>
+        <w:numPr>
+          <w:ilvl w:val="0"/>
+          <w:numId w:val="1"/>
+        </w:numPr>
+        <w:spacing w:after="40"/>
+      </w:pPr>
+      <w:r>
+        <w:rPr>
+          <w:color w:val="1D2D3E"/>
+          <w:sz w:val="22"/>
+          <w:szCs w:val="22"/>
+        </w:rPr>
+        <w:t xml:space="preserve">Positive region fill: 6% opacity dark rectangles column-width wide from zero line to data point</w:t>
+      </w:r>
+    </w:p>
+    <w:p>
+      <w:pPr>
+        <w:pStyle w:val="ListParagraph"/>
+        <w:numPr>
+          <w:ilvl w:val="0"/>
+          <w:numId w:val="1"/>
+        </w:numPr>
+        <w:spacing w:after="40"/>
+      </w:pPr>
+      <w:r>
+        <w:rPr>
+          <w:color w:val="1D2D3E"/>
+          <w:sz w:val="22"/>
+          <w:szCs w:val="22"/>
+        </w:rPr>
+        <w:t xml:space="preserve">Filled dots (dark=positive, muted=negative) at each data point with white border; NWC_DOT_R=3</w:t>
+      </w:r>
+    </w:p>
+    <w:p>
+      <w:pPr>
+        <w:pStyle w:val="ListParagraph"/>
+        <w:numPr>
+          <w:ilvl w:val="0"/>
+          <w:numId w:val="1"/>
+        </w:numPr>
+        <w:spacing w:after="40"/>
+      </w:pPr>
+      <w:r>
+        <w:rPr>
+          <w:color w:val="1D2D3E"/>
+          <w:sz w:val="22"/>
+          <w:szCs w:val="22"/>
+        </w:rPr>
+        <w:t xml:space="preserve">Zero reference hairline; onLayout callback provides actual container width</w:t>
+      </w:r>
+    </w:p>
+    <w:p>
+      <w:pPr>
+        <w:spacing w:after="80"/>
+      </w:pPr>
+      <w:r>
+        <w:rPr>
+          <w:color w:val="1D2D3E"/>
+          <w:sz w:val="22"/>
+          <w:szCs w:val="22"/>
+        </w:rPr>
+        <w:t xml:space="preserve"/>
+      </w:r>
+    </w:p>
+    <w:p>
+      <w:pPr>
+        <w:pStyle w:val="Heading2"/>
+        <w:spacing w:after="120" w:before="300"/>
+      </w:pPr>
+      <w:r>
+        <w:rPr>
+          <w:b/>
+          <w:bCs/>
+          <w:color w:val="1D2D3E"/>
+        </w:rPr>
+        <w:t xml:space="preserve">3.96 Dashboard KPI Sparkline on First Day (Session 57)</w:t>
+      </w:r>
+    </w:p>
+    <w:p>
+      <w:pPr>
+        <w:pStyle w:val="ListParagraph"/>
+        <w:numPr>
+          <w:ilvl w:val="0"/>
+          <w:numId w:val="1"/>
+        </w:numPr>
+        <w:spacing w:after="40"/>
+      </w:pPr>
+      <w:r>
+        <w:rPr>
+          <w:color w:val="1D2D3E"/>
+          <w:sz w:val="22"/>
+          <w:szCs w:val="22"/>
+        </w:rPr>
+        <w:t xml:space="preserve">Lowered kpiHistory threshold from ≥2 to ≥1 in render condition and QuickStatsCard</w:t>
+      </w:r>
+    </w:p>
+    <w:p>
+      <w:pPr>
+        <w:pStyle w:val="ListParagraph"/>
+        <w:numPr>
+          <w:ilvl w:val="0"/>
+          <w:numId w:val="1"/>
+        </w:numPr>
+        <w:spacing w:after="40"/>
+      </w:pPr>
+      <w:r>
+        <w:rPr>
+          <w:color w:val="1D2D3E"/>
+          <w:sz w:val="22"/>
+          <w:szCs w:val="22"/>
+        </w:rPr>
+        <w:t xml:space="preserve">isSingleDay flag: shows 'TODAY'S SNAPSHOT' header + 'First day — trend builds over 7 days' subtitle</w:t>
+      </w:r>
+    </w:p>
+    <w:p>
+      <w:pPr>
+        <w:pStyle w:val="ListParagraph"/>
+        <w:numPr>
+          <w:ilvl w:val="0"/>
+          <w:numId w:val="1"/>
+        </w:numPr>
+        <w:spacing w:after="40"/>
+      </w:pPr>
+      <w:r>
+        <w:rPr>
+          <w:color w:val="1D2D3E"/>
+          <w:sz w:val="22"/>
+          <w:szCs w:val="22"/>
+        </w:rPr>
+        <w:t xml:space="preserve">Trend pill hidden when isSingleDay; netChangePct calculation skipped for single entry</w:t>
+      </w:r>
+    </w:p>
+    <w:p>
+      <w:pPr>
+        <w:spacing w:after="80"/>
+      </w:pPr>
+      <w:r>
+        <w:rPr>
+          <w:color w:val="1D2D3E"/>
+          <w:sz w:val="22"/>
+          <w:szCs w:val="22"/>
+        </w:rPr>
+        <w:t xml:space="preserve"/>
+      </w:r>
+    </w:p>
+    <w:p>
+      <w:pPr>
+        <w:pStyle w:val="Heading2"/>
+        <w:spacing w:after="120" w:before="300"/>
+      </w:pPr>
+      <w:r>
+        <w:rPr>
+          <w:b/>
+          <w:bCs/>
+          <w:color w:val="1D2D3E"/>
+        </w:rPr>
+        <w:t xml:space="preserve">3.97 ProcurementAnalytics Top Vendor/Customer Comparison Modal (Session 57)</w:t>
+      </w:r>
+    </w:p>
+    <w:p>
+      <w:pPr>
+        <w:pStyle w:val="ListParagraph"/>
+        <w:numPr>
+          <w:ilvl w:val="0"/>
+          <w:numId w:val="1"/>
+        </w:numPr>
+        <w:spacing w:after="40"/>
+      </w:pPr>
+      <w:r>
+        <w:rPr>
+          <w:color w:val="1D2D3E"/>
+          <w:sz w:val="22"/>
+          <w:szCs w:val="22"/>
+        </w:rPr>
+        <w:t xml:space="preserve">computeEntityMonthlyValues(items, nameField, entityName): last-6-month zero-seeded bucket aggregation</w:t>
+      </w:r>
+    </w:p>
+    <w:p>
+      <w:pPr>
+        <w:pStyle w:val="ListParagraph"/>
+        <w:numPr>
+          <w:ilvl w:val="0"/>
+          <w:numId w:val="1"/>
+        </w:numPr>
+        <w:spacing w:after="40"/>
+      </w:pPr>
+      <w:r>
+        <w:rPr>
+          <w:color w:val="1D2D3E"/>
+          <w:sz w:val="22"/>
+          <w:szCs w:val="22"/>
+        </w:rPr>
+        <w:t xml:space="preserve">RankedBarList gains optional onPress prop; rows become TouchableOpacity with bar-chart-2 icon</w:t>
+      </w:r>
+    </w:p>
+    <w:p>
+      <w:pPr>
+        <w:pStyle w:val="ListParagraph"/>
+        <w:numPr>
+          <w:ilvl w:val="0"/>
+          <w:numId w:val="1"/>
+        </w:numPr>
+        <w:spacing w:after="40"/>
+      </w:pPr>
+      <w:r>
+        <w:rPr>
+          <w:color w:val="1D2D3E"/>
+          <w:sz w:val="22"/>
+          <w:szCs w:val="22"/>
+        </w:rPr>
+        <w:t xml:space="preserve">RankedCompareModal: entity stats tiles, 'Compare' dashed button, FlatList picker, dual monthly bars, legend</w:t>
+      </w:r>
+    </w:p>
+    <w:p>
+      <w:pPr>
+        <w:pStyle w:val="ListParagraph"/>
+        <w:numPr>
+          <w:ilvl w:val="0"/>
+          <w:numId w:val="1"/>
+        </w:numPr>
+        <w:spacing w:after="40"/>
+      </w:pPr>
+      <w:r>
+        <w:rPr>
+          <w:color w:val="1D2D3E"/>
+          <w:sz w:val="22"/>
+          <w:szCs w:val="22"/>
+        </w:rPr>
+        <w:t xml:space="preserve">Main screen: selectedRankedVendor/Customer + compareRanked* state; useMemo monthly value hooks</w:t>
+      </w:r>
+    </w:p>
+    <w:p>
+      <w:pPr>
+        <w:spacing w:after="80"/>
+      </w:pPr>
+      <w:r>
+        <w:rPr>
+          <w:color w:val="1D2D3E"/>
+          <w:sz w:val="22"/>
+          <w:szCs w:val="22"/>
+        </w:rPr>
+        <w:t xml:space="preserve"/>
+      </w:r>
+    </w:p>
+    <w:p>
+      <w:pPr>
+        <w:pStyle w:val="Heading2"/>
+        <w:spacing w:after="120" w:before="300"/>
+      </w:pPr>
+      <w:r>
+        <w:rPr>
+          <w:b/>
+          <w:bCs/>
+          <w:color w:val="1D2D3E"/>
+        </w:rPr>
+        <w:t xml:space="preserve">3.98 StockHealth 'View Full Ledger' from Item Modal (Session 57)</w:t>
+      </w:r>
+    </w:p>
+    <w:p>
+      <w:pPr>
+        <w:pStyle w:val="ListParagraph"/>
+        <w:numPr>
+          <w:ilvl w:val="0"/>
+          <w:numId w:val="1"/>
+        </w:numPr>
+        <w:spacing w:after="40"/>
+      </w:pPr>
+      <w:r>
+        <w:rPr>
+          <w:color w:val="1D2D3E"/>
+          <w:sz w:val="22"/>
+          <w:szCs w:val="22"/>
+        </w:rPr>
+        <w:t xml:space="preserve">ItemDetailModal gains optional onViewLedger prop; 'View Full Ledger' button at bottom of modal</w:t>
+      </w:r>
+    </w:p>
+    <w:p>
+      <w:pPr>
+        <w:pStyle w:val="ListParagraph"/>
+        <w:numPr>
+          <w:ilvl w:val="0"/>
+          <w:numId w:val="1"/>
+        </w:numPr>
+        <w:spacing w:after="40"/>
+      </w:pPr>
+      <w:r>
+        <w:rPr>
+          <w:color w:val="1D2D3E"/>
+          <w:sz w:val="22"/>
+          <w:szCs w:val="22"/>
+        </w:rPr>
+        <w:t xml:space="preserve">Main screen wires onViewLedger to close modal + cross-stack navigate to Inventory &gt; ItemLedger</w:t>
+      </w:r>
+    </w:p>
+    <w:p>
+      <w:pPr>
+        <w:pStyle w:val="ListParagraph"/>
+        <w:numPr>
+          <w:ilvl w:val="0"/>
+          <w:numId w:val="1"/>
+        </w:numPr>
+        <w:spacing w:after="40"/>
+      </w:pPr>
+      <w:r>
+        <w:rPr>
+          <w:color w:val="1D2D3E"/>
+          <w:sz w:val="22"/>
+          <w:szCs w:val="22"/>
+        </w:rPr>
+        <w:t xml:space="preserve">Button only rendered when item has an item_id (undefined for items without it)</w:t>
+      </w:r>
+    </w:p>
+    <w:p>
+      <w:pPr>
+        <w:spacing w:after="80"/>
+      </w:pPr>
+      <w:r>
+        <w:rPr>
+          <w:color w:val="1D2D3E"/>
+          <w:sz w:val="22"/>
+          <w:szCs w:val="22"/>
+        </w:rPr>
+        <w:t xml:space="preserve"/>
+      </w:r>
+    </w:p>
+    <w:p>
+      <w:pPr>
+        <w:pStyle w:val="Heading2"/>
+        <w:spacing w:after="120" w:before="300"/>
+      </w:pPr>
+      <w:r>
+        <w:rPr>
+          <w:b/>
+          <w:bCs/>
+          <w:color w:val="1D2D3E"/>
+        </w:rPr>
+        <w:t xml:space="preserve">3.99 FinancialAnalytics AgingHistory Period Chips (Session 57)</w:t>
+      </w:r>
+    </w:p>
+    <w:p>
+      <w:pPr>
+        <w:pStyle w:val="ListParagraph"/>
+        <w:numPr>
+          <w:ilvl w:val="0"/>
+          <w:numId w:val="1"/>
+        </w:numPr>
+        <w:spacing w:after="40"/>
+      </w:pPr>
+      <w:r>
+        <w:rPr>
+          <w:color w:val="1D2D3E"/>
+          <w:sz w:val="22"/>
+          <w:szCs w:val="22"/>
+        </w:rPr>
+        <w:t xml:space="preserve">historyPeriod state: 7|14|30 days, default 14</w:t>
+      </w:r>
+    </w:p>
+    <w:p>
+      <w:pPr>
+        <w:pStyle w:val="ListParagraph"/>
+        <w:numPr>
+          <w:ilvl w:val="0"/>
+          <w:numId w:val="1"/>
+        </w:numPr>
+        <w:spacing w:after="40"/>
+      </w:pPr>
+      <w:r>
+        <w:rPr>
+          <w:color w:val="1D2D3E"/>
+          <w:sz w:val="22"/>
+          <w:szCs w:val="22"/>
+        </w:rPr>
+        <w:t xml:space="preserve">Period chips (7d/14d/30d) in 'AP vs AR History' SectionHeader action slot</w:t>
+      </w:r>
+    </w:p>
+    <w:p>
+      <w:pPr>
+        <w:pStyle w:val="ListParagraph"/>
+        <w:numPr>
+          <w:ilvl w:val="0"/>
+          <w:numId w:val="1"/>
+        </w:numPr>
+        <w:spacing w:after="40"/>
+      </w:pPr>
+      <w:r>
+        <w:rPr>
+          <w:color w:val="1D2D3E"/>
+          <w:sz w:val="22"/>
+          <w:szCs w:val="22"/>
+        </w:rPr>
+        <w:t xml:space="preserve">agingHistory.slice(-historyPeriod) passed to both AgingHistoryChart and NWCTrendCard</w:t>
+      </w:r>
+    </w:p>
+    <w:p>
+      <w:pPr>
+        <w:spacing w:after="80"/>
+      </w:pPr>
+      <w:r>
+        <w:rPr>
+          <w:color w:val="1D2D3E"/>
+          <w:sz w:val="22"/>
+          <w:szCs w:val="22"/>
+        </w:rPr>
+        <w:t xml:space="preserve"/>
+      </w:r>
+    </w:p>
+    <w:p>
+      <w:pPr>
+        <w:pStyle w:val="Heading2"/>
+        <w:spacing w:after="120" w:before="300"/>
+      </w:pPr>
+      <w:r>
+        <w:rPr>
+          <w:b/>
+          <w:bCs/>
+          <w:color w:val="1D2D3E"/>
+        </w:rPr>
+        <w:t xml:space="preserve">3.100 InventoryScreen Warehouse Filter Chips (Session 57)</w:t>
+      </w:r>
+    </w:p>
+    <w:p>
+      <w:pPr>
+        <w:pStyle w:val="ListParagraph"/>
+        <w:numPr>
+          <w:ilvl w:val="0"/>
+          <w:numId w:val="1"/>
+        </w:numPr>
+        <w:spacing w:after="40"/>
+      </w:pPr>
+      <w:r>
+        <w:rPr>
+          <w:color w:val="1D2D3E"/>
+          <w:sz w:val="22"/>
+          <w:szCs w:val="22"/>
+        </w:rPr>
+        <w:t xml:space="preserve">stockWarehouses useMemo: unique warehouse names from stockData</w:t>
+      </w:r>
+    </w:p>
+    <w:p>
+      <w:pPr>
+        <w:pStyle w:val="ListParagraph"/>
+        <w:numPr>
+          <w:ilvl w:val="0"/>
+          <w:numId w:val="1"/>
+        </w:numPr>
+        <w:spacing w:after="40"/>
+      </w:pPr>
+      <w:r>
+        <w:rPr>
+          <w:color w:val="1D2D3E"/>
+          <w:sz w:val="22"/>
+          <w:szCs w:val="22"/>
+        </w:rPr>
+        <w:t xml:space="preserve">stockWarehouse state; filteredStock adds matchesWarehouse predicate</w:t>
+      </w:r>
+    </w:p>
+    <w:p>
+      <w:pPr>
+        <w:pStyle w:val="ListParagraph"/>
+        <w:numPr>
+          <w:ilvl w:val="0"/>
+          <w:numId w:val="1"/>
+        </w:numPr>
+        <w:spacing w:after="40"/>
+      </w:pPr>
+      <w:r>
+        <w:rPr>
+          <w:color w:val="1D2D3E"/>
+          <w:sz w:val="22"/>
+          <w:szCs w:val="22"/>
+        </w:rPr>
+        <w:t xml:space="preserve">Horizontal ScrollView of chips below status filter bar; 'All' chip clears filter; dark filled active</w:t>
+      </w:r>
+    </w:p>
+    <w:p>
+      <w:pPr>
+        <w:spacing w:after="80"/>
+      </w:pPr>
+      <w:r>
+        <w:rPr>
+          <w:color w:val="1D2D3E"/>
+          <w:sz w:val="22"/>
+          <w:szCs w:val="22"/>
+        </w:rPr>
+        <w:t xml:space="preserve"/>
+      </w:r>
+    </w:p>
+    <w:p>
+      <w:pPr>
+        <w:pStyle w:val="Heading2"/>
+        <w:spacing w:after="120" w:before="300"/>
+      </w:pPr>
+      <w:r>
+        <w:rPr>
+          <w:b/>
+          <w:bCs/>
+          <w:color w:val="1D2D3E"/>
+        </w:rPr>
         <w:t xml:space="preserve">3.87 ProcurementAnalytics Vendor Lead Time Comparison (Session 55)</w:t>
       </w:r>
     </w:p>
@@ -31457,6 +32114,544 @@
           </w:p>
         </w:tc>
       </w:tr>
+      <w:tr>
+        <w:tc>
+          <w:tcPr>
+            <w:shd w:color="F0F4F8" w:val="solid"/>
+          </w:tcPr>
+          <w:p>
+            <w:pPr>
+              <w:spacing w:after="40" w:before="40"/>
+            </w:pPr>
+            <w:r>
+              <w:rPr>
+                <w:b w:val="false"/>
+                <w:bCs w:val="false"/>
+                <w:color w:val="1D2D3E"/>
+                <w:sz w:val="20"/>
+                <w:szCs w:val="20"/>
+              </w:rPr>
+              <w:t xml:space="preserve">Session 57</w:t>
+            </w:r>
+          </w:p>
+        </w:tc>
+        <w:tc>
+          <w:tcPr>
+            <w:shd w:color="F0F4F8" w:val="solid"/>
+          </w:tcPr>
+          <w:p>
+            <w:pPr>
+              <w:spacing w:after="40" w:before="40"/>
+            </w:pPr>
+            <w:r>
+              <w:rPr>
+                <w:b w:val="false"/>
+                <w:bCs w:val="false"/>
+                <w:color w:val="1D2D3E"/>
+                <w:sz w:val="20"/>
+                <w:szCs w:val="20"/>
+              </w:rPr>
+              <w:t xml:space="preserve">StockHealth warehouse velocity filter — FlatList bottom-sheet picker; filters movement data by warehouse with SectionHeader subtitle update</w:t>
+            </w:r>
+          </w:p>
+        </w:tc>
+        <w:tc>
+          <w:tcPr>
+            <w:shd w:color="F0F4F8" w:val="solid"/>
+          </w:tcPr>
+          <w:p>
+            <w:pPr>
+              <w:spacing w:after="40" w:before="40"/>
+            </w:pPr>
+            <w:r>
+              <w:rPr>
+                <w:b w:val="false"/>
+                <w:bCs w:val="false"/>
+                <w:color w:val="1D2D3E"/>
+                <w:sz w:val="20"/>
+                <w:szCs w:val="20"/>
+              </w:rPr>
+              <w:t xml:space="preserve">Done</w:t>
+            </w:r>
+          </w:p>
+        </w:tc>
+        <w:tc>
+          <w:tcPr>
+            <w:shd w:color="F0F4F8" w:val="solid"/>
+          </w:tcPr>
+          <w:p>
+            <w:pPr>
+              <w:spacing w:after="40" w:before="40"/>
+            </w:pPr>
+            <w:r>
+              <w:rPr>
+                <w:b w:val="false"/>
+                <w:bCs w:val="false"/>
+                <w:color w:val="1D2D3E"/>
+                <w:sz w:val="20"/>
+                <w:szCs w:val="20"/>
+              </w:rPr>
+              <w:t xml:space="preserve">StockHealthScreen.tsx</w:t>
+            </w:r>
+          </w:p>
+        </w:tc>
+      </w:tr>
+      <w:tr>
+        <w:tc>
+          <w:p>
+            <w:pPr>
+              <w:spacing w:after="40" w:before="40"/>
+            </w:pPr>
+            <w:r>
+              <w:rPr>
+                <w:b w:val="false"/>
+                <w:bCs w:val="false"/>
+                <w:color w:val="1D2D3E"/>
+                <w:sz w:val="20"/>
+                <w:szCs w:val="20"/>
+              </w:rPr>
+              <w:t xml:space="preserve">Session 57</w:t>
+            </w:r>
+          </w:p>
+        </w:tc>
+        <w:tc>
+          <w:p>
+            <w:pPr>
+              <w:spacing w:after="40" w:before="40"/>
+            </w:pPr>
+            <w:r>
+              <w:rPr>
+                <w:b w:val="false"/>
+                <w:bCs w:val="false"/>
+                <w:color w:val="1D2D3E"/>
+                <w:sz w:val="20"/>
+                <w:szCs w:val="20"/>
+              </w:rPr>
+              <w:t xml:space="preserve">FinancialAnalytics NWC polyline chart — View transforms for line segments; dots; fill; zero reference line replacing bar chart</w:t>
+            </w:r>
+          </w:p>
+        </w:tc>
+        <w:tc>
+          <w:p>
+            <w:pPr>
+              <w:spacing w:after="40" w:before="40"/>
+            </w:pPr>
+            <w:r>
+              <w:rPr>
+                <w:b w:val="false"/>
+                <w:bCs w:val="false"/>
+                <w:color w:val="1D2D3E"/>
+                <w:sz w:val="20"/>
+                <w:szCs w:val="20"/>
+              </w:rPr>
+              <w:t xml:space="preserve">Done</w:t>
+            </w:r>
+          </w:p>
+        </w:tc>
+        <w:tc>
+          <w:p>
+            <w:pPr>
+              <w:spacing w:after="40" w:before="40"/>
+            </w:pPr>
+            <w:r>
+              <w:rPr>
+                <w:b w:val="false"/>
+                <w:bCs w:val="false"/>
+                <w:color w:val="1D2D3E"/>
+                <w:sz w:val="20"/>
+                <w:szCs w:val="20"/>
+              </w:rPr>
+              <w:t xml:space="preserve">FinancialAnalyticsScreen.tsx</w:t>
+            </w:r>
+          </w:p>
+        </w:tc>
+      </w:tr>
+      <w:tr>
+        <w:tc>
+          <w:tcPr>
+            <w:shd w:color="F0F4F8" w:val="solid"/>
+          </w:tcPr>
+          <w:p>
+            <w:pPr>
+              <w:spacing w:after="40" w:before="40"/>
+            </w:pPr>
+            <w:r>
+              <w:rPr>
+                <w:b w:val="false"/>
+                <w:bCs w:val="false"/>
+                <w:color w:val="1D2D3E"/>
+                <w:sz w:val="20"/>
+                <w:szCs w:val="20"/>
+              </w:rPr>
+              <w:t xml:space="preserve">Session 57</w:t>
+            </w:r>
+          </w:p>
+        </w:tc>
+        <w:tc>
+          <w:tcPr>
+            <w:shd w:color="F0F4F8" w:val="solid"/>
+          </w:tcPr>
+          <w:p>
+            <w:pPr>
+              <w:spacing w:after="40" w:before="40"/>
+            </w:pPr>
+            <w:r>
+              <w:rPr>
+                <w:b w:val="false"/>
+                <w:bCs w:val="false"/>
+                <w:color w:val="1D2D3E"/>
+                <w:sz w:val="20"/>
+                <w:szCs w:val="20"/>
+              </w:rPr>
+              <w:t xml:space="preserve">Dashboard KPI sparkline first-day — threshold 1; TODAY'S SNAPSHOT mode; trend pill hidden for single entry</w:t>
+            </w:r>
+          </w:p>
+        </w:tc>
+        <w:tc>
+          <w:tcPr>
+            <w:shd w:color="F0F4F8" w:val="solid"/>
+          </w:tcPr>
+          <w:p>
+            <w:pPr>
+              <w:spacing w:after="40" w:before="40"/>
+            </w:pPr>
+            <w:r>
+              <w:rPr>
+                <w:b w:val="false"/>
+                <w:bCs w:val="false"/>
+                <w:color w:val="1D2D3E"/>
+                <w:sz w:val="20"/>
+                <w:szCs w:val="20"/>
+              </w:rPr>
+              <w:t xml:space="preserve">Done</w:t>
+            </w:r>
+          </w:p>
+        </w:tc>
+        <w:tc>
+          <w:tcPr>
+            <w:shd w:color="F0F4F8" w:val="solid"/>
+          </w:tcPr>
+          <w:p>
+            <w:pPr>
+              <w:spacing w:after="40" w:before="40"/>
+            </w:pPr>
+            <w:r>
+              <w:rPr>
+                <w:b w:val="false"/>
+                <w:bCs w:val="false"/>
+                <w:color w:val="1D2D3E"/>
+                <w:sz w:val="20"/>
+                <w:szCs w:val="20"/>
+              </w:rPr>
+              <w:t xml:space="preserve">DashboardScreen.tsx</w:t>
+            </w:r>
+          </w:p>
+        </w:tc>
+      </w:tr>
+      <w:tr>
+        <w:tc>
+          <w:p>
+            <w:pPr>
+              <w:spacing w:after="40" w:before="40"/>
+            </w:pPr>
+            <w:r>
+              <w:rPr>
+                <w:b w:val="false"/>
+                <w:bCs w:val="false"/>
+                <w:color w:val="1D2D3E"/>
+                <w:sz w:val="20"/>
+                <w:szCs w:val="20"/>
+              </w:rPr>
+              <w:t xml:space="preserve">Session 57</w:t>
+            </w:r>
+          </w:p>
+        </w:tc>
+        <w:tc>
+          <w:p>
+            <w:pPr>
+              <w:spacing w:after="40" w:before="40"/>
+            </w:pPr>
+            <w:r>
+              <w:rPr>
+                <w:b w:val="false"/>
+                <w:bCs w:val="false"/>
+                <w:color w:val="1D2D3E"/>
+                <w:sz w:val="20"/>
+                <w:szCs w:val="20"/>
+              </w:rPr>
+              <w:t xml:space="preserve">ProcurementAnalytics ranked comparison modal — tap vendor/customer row; solo + compare modes with dual monthly bars</w:t>
+            </w:r>
+          </w:p>
+        </w:tc>
+        <w:tc>
+          <w:p>
+            <w:pPr>
+              <w:spacing w:after="40" w:before="40"/>
+            </w:pPr>
+            <w:r>
+              <w:rPr>
+                <w:b w:val="false"/>
+                <w:bCs w:val="false"/>
+                <w:color w:val="1D2D3E"/>
+                <w:sz w:val="20"/>
+                <w:szCs w:val="20"/>
+              </w:rPr>
+              <w:t xml:space="preserve">Done</w:t>
+            </w:r>
+          </w:p>
+        </w:tc>
+        <w:tc>
+          <w:p>
+            <w:pPr>
+              <w:spacing w:after="40" w:before="40"/>
+            </w:pPr>
+            <w:r>
+              <w:rPr>
+                <w:b w:val="false"/>
+                <w:bCs w:val="false"/>
+                <w:color w:val="1D2D3E"/>
+                <w:sz w:val="20"/>
+                <w:szCs w:val="20"/>
+              </w:rPr>
+              <w:t xml:space="preserve">ProcurementAnalyticsScreen.tsx</w:t>
+            </w:r>
+          </w:p>
+        </w:tc>
+      </w:tr>
+      <w:tr>
+        <w:tc>
+          <w:tcPr>
+            <w:shd w:color="F0F4F8" w:val="solid"/>
+          </w:tcPr>
+          <w:p>
+            <w:pPr>
+              <w:spacing w:after="40" w:before="40"/>
+            </w:pPr>
+            <w:r>
+              <w:rPr>
+                <w:b w:val="false"/>
+                <w:bCs w:val="false"/>
+                <w:color w:val="1D2D3E"/>
+                <w:sz w:val="20"/>
+                <w:szCs w:val="20"/>
+              </w:rPr>
+              <w:t xml:space="preserve">Session 57</w:t>
+            </w:r>
+          </w:p>
+        </w:tc>
+        <w:tc>
+          <w:tcPr>
+            <w:shd w:color="F0F4F8" w:val="solid"/>
+          </w:tcPr>
+          <w:p>
+            <w:pPr>
+              <w:spacing w:after="40" w:before="40"/>
+            </w:pPr>
+            <w:r>
+              <w:rPr>
+                <w:b w:val="false"/>
+                <w:bCs w:val="false"/>
+                <w:color w:val="1D2D3E"/>
+                <w:sz w:val="20"/>
+                <w:szCs w:val="20"/>
+              </w:rPr>
+              <w:t xml:space="preserve">StockHealth View Full Ledger — cross-stack navigate to ItemLedger from item detail modal</w:t>
+            </w:r>
+          </w:p>
+        </w:tc>
+        <w:tc>
+          <w:tcPr>
+            <w:shd w:color="F0F4F8" w:val="solid"/>
+          </w:tcPr>
+          <w:p>
+            <w:pPr>
+              <w:spacing w:after="40" w:before="40"/>
+            </w:pPr>
+            <w:r>
+              <w:rPr>
+                <w:b w:val="false"/>
+                <w:bCs w:val="false"/>
+                <w:color w:val="1D2D3E"/>
+                <w:sz w:val="20"/>
+                <w:szCs w:val="20"/>
+              </w:rPr>
+              <w:t xml:space="preserve">Done</w:t>
+            </w:r>
+          </w:p>
+        </w:tc>
+        <w:tc>
+          <w:tcPr>
+            <w:shd w:color="F0F4F8" w:val="solid"/>
+          </w:tcPr>
+          <w:p>
+            <w:pPr>
+              <w:spacing w:after="40" w:before="40"/>
+            </w:pPr>
+            <w:r>
+              <w:rPr>
+                <w:b w:val="false"/>
+                <w:bCs w:val="false"/>
+                <w:color w:val="1D2D3E"/>
+                <w:sz w:val="20"/>
+                <w:szCs w:val="20"/>
+              </w:rPr>
+              <w:t xml:space="preserve">StockHealthScreen.tsx</w:t>
+            </w:r>
+          </w:p>
+        </w:tc>
+      </w:tr>
+      <w:tr>
+        <w:tc>
+          <w:p>
+            <w:pPr>
+              <w:spacing w:after="40" w:before="40"/>
+            </w:pPr>
+            <w:r>
+              <w:rPr>
+                <w:b w:val="false"/>
+                <w:bCs w:val="false"/>
+                <w:color w:val="1D2D3E"/>
+                <w:sz w:val="20"/>
+                <w:szCs w:val="20"/>
+              </w:rPr>
+              <w:t xml:space="preserve">Session 57</w:t>
+            </w:r>
+          </w:p>
+        </w:tc>
+        <w:tc>
+          <w:p>
+            <w:pPr>
+              <w:spacing w:after="40" w:before="40"/>
+            </w:pPr>
+            <w:r>
+              <w:rPr>
+                <w:b w:val="false"/>
+                <w:bCs w:val="false"/>
+                <w:color w:val="1D2D3E"/>
+                <w:sz w:val="20"/>
+                <w:szCs w:val="20"/>
+              </w:rPr>
+              <w:t xml:space="preserve">FinancialAnalytics aging history period chips — 7d/14d/30d selector for AP vs AR history and NWC trend</w:t>
+            </w:r>
+          </w:p>
+        </w:tc>
+        <w:tc>
+          <w:p>
+            <w:pPr>
+              <w:spacing w:after="40" w:before="40"/>
+            </w:pPr>
+            <w:r>
+              <w:rPr>
+                <w:b w:val="false"/>
+                <w:bCs w:val="false"/>
+                <w:color w:val="1D2D3E"/>
+                <w:sz w:val="20"/>
+                <w:szCs w:val="20"/>
+              </w:rPr>
+              <w:t xml:space="preserve">Done</w:t>
+            </w:r>
+          </w:p>
+        </w:tc>
+        <w:tc>
+          <w:p>
+            <w:pPr>
+              <w:spacing w:after="40" w:before="40"/>
+            </w:pPr>
+            <w:r>
+              <w:rPr>
+                <w:b w:val="false"/>
+                <w:bCs w:val="false"/>
+                <w:color w:val="1D2D3E"/>
+                <w:sz w:val="20"/>
+                <w:szCs w:val="20"/>
+              </w:rPr>
+              <w:t xml:space="preserve">FinancialAnalyticsScreen.tsx</w:t>
+            </w:r>
+          </w:p>
+        </w:tc>
+      </w:tr>
+      <w:tr>
+        <w:tc>
+          <w:tcPr>
+            <w:shd w:color="F0F4F8" w:val="solid"/>
+          </w:tcPr>
+          <w:p>
+            <w:pPr>
+              <w:spacing w:after="40" w:before="40"/>
+            </w:pPr>
+            <w:r>
+              <w:rPr>
+                <w:b w:val="false"/>
+                <w:bCs w:val="false"/>
+                <w:color w:val="1D2D3E"/>
+                <w:sz w:val="20"/>
+                <w:szCs w:val="20"/>
+              </w:rPr>
+              <w:t xml:space="preserve">Session 57</w:t>
+            </w:r>
+          </w:p>
+        </w:tc>
+        <w:tc>
+          <w:tcPr>
+            <w:shd w:color="F0F4F8" w:val="solid"/>
+          </w:tcPr>
+          <w:p>
+            <w:pPr>
+              <w:spacing w:after="40" w:before="40"/>
+            </w:pPr>
+            <w:r>
+              <w:rPr>
+                <w:b w:val="false"/>
+                <w:bCs w:val="false"/>
+                <w:color w:val="1D2D3E"/>
+                <w:sz w:val="20"/>
+                <w:szCs w:val="20"/>
+              </w:rPr>
+              <w:t xml:space="preserve">InventoryScreen warehouse chips — horizontal filter chips for stock tab; filters filteredStock by warehouse_name</w:t>
+            </w:r>
+          </w:p>
+        </w:tc>
+        <w:tc>
+          <w:tcPr>
+            <w:shd w:color="F0F4F8" w:val="solid"/>
+          </w:tcPr>
+          <w:p>
+            <w:pPr>
+              <w:spacing w:after="40" w:before="40"/>
+            </w:pPr>
+            <w:r>
+              <w:rPr>
+                <w:b w:val="false"/>
+                <w:bCs w:val="false"/>
+                <w:color w:val="1D2D3E"/>
+                <w:sz w:val="20"/>
+                <w:szCs w:val="20"/>
+              </w:rPr>
+              <w:t xml:space="preserve">Done</w:t>
+            </w:r>
+          </w:p>
+        </w:tc>
+        <w:tc>
+          <w:tcPr>
+            <w:shd w:color="F0F4F8" w:val="solid"/>
+          </w:tcPr>
+          <w:p>
+            <w:pPr>
+              <w:spacing w:after="40" w:before="40"/>
+            </w:pPr>
+            <w:r>
+              <w:rPr>
+                <w:b w:val="false"/>
+                <w:bCs w:val="false"/>
+                <w:color w:val="1D2D3E"/>
+                <w:sz w:val="20"/>
+                <w:szCs w:val="20"/>
+              </w:rPr>
+              <w:t xml:space="preserve">InventoryScreen.tsx</w:t>
+            </w:r>
+          </w:p>
+        </w:tc>
+      </w:tr>
     </w:tbl>
     <w:p>
       <w:pPr>
@@ -36539,6 +37734,339 @@
           <w:szCs w:val="22"/>
         </w:rPr>
         <w:t xml:space="preserve">  Tapping a history row repopulates the query field</w:t>
+      </w:r>
+    </w:p>
+    <w:p>
+      <w:pPr>
+        <w:spacing w:after="80"/>
+      </w:pPr>
+      <w:r>
+        <w:rPr>
+          <w:color w:val="1D2D3E"/>
+          <w:sz w:val="22"/>
+          <w:szCs w:val="22"/>
+        </w:rPr>
+        <w:t xml:space="preserve"/>
+      </w:r>
+    </w:p>
+    <w:p>
+      <w:pPr>
+        <w:pStyle w:val="Heading2"/>
+        <w:spacing w:after="120" w:before="300"/>
+      </w:pPr>
+      <w:r>
+        <w:rPr>
+          <w:b/>
+          <w:bCs/>
+          <w:color w:val="1D2D3E"/>
+        </w:rPr>
+        <w:t xml:space="preserve">Session 57 — 2026-06-11</w:t>
+      </w:r>
+    </w:p>
+    <w:p>
+      <w:pPr>
+        <w:pStyle w:val="ListParagraph"/>
+        <w:numPr>
+          <w:ilvl w:val="0"/>
+          <w:numId w:val="1"/>
+        </w:numPr>
+        <w:spacing w:after="40"/>
+      </w:pPr>
+      <w:r>
+        <w:rPr>
+          <w:color w:val="1D2D3E"/>
+          <w:sz w:val="22"/>
+          <w:szCs w:val="22"/>
+        </w:rPr>
+        <w:t xml:space="preserve">StockHealth Warehouse Velocity Filter (StockHealthScreen.tsx)</w:t>
+      </w:r>
+    </w:p>
+    <w:p>
+      <w:pPr>
+        <w:pStyle w:val="ListParagraph"/>
+        <w:numPr>
+          <w:ilvl w:val="1"/>
+          <w:numId w:val="1"/>
+        </w:numPr>
+        <w:spacing w:after="40"/>
+      </w:pPr>
+      <w:r>
+        <w:rPr>
+          <w:color w:val="1D2D3E"/>
+          <w:sz w:val="22"/>
+          <w:szCs w:val="22"/>
+        </w:rPr>
+        <w:t xml:space="preserve">  velocityWarehouses useMemo from rawLedger; velocityWarehouse state; filter button + bottom-sheet modal</w:t>
+      </w:r>
+    </w:p>
+    <w:p>
+      <w:pPr>
+        <w:pStyle w:val="ListParagraph"/>
+        <w:numPr>
+          <w:ilvl w:val="1"/>
+          <w:numId w:val="1"/>
+        </w:numPr>
+        <w:spacing w:after="40"/>
+      </w:pPr>
+      <w:r>
+        <w:rPr>
+          <w:color w:val="1D2D3E"/>
+          <w:sz w:val="22"/>
+          <w:szCs w:val="22"/>
+        </w:rPr>
+        <w:t xml:space="preserve">  SectionHeader subtitle updates to show 'warehouse · period' when warehouse filtered</w:t>
+      </w:r>
+    </w:p>
+    <w:p>
+      <w:pPr>
+        <w:pStyle w:val="ListParagraph"/>
+        <w:numPr>
+          <w:ilvl w:val="0"/>
+          <w:numId w:val="1"/>
+        </w:numPr>
+        <w:spacing w:after="40"/>
+      </w:pPr>
+      <w:r>
+        <w:rPr>
+          <w:color w:val="1D2D3E"/>
+          <w:sz w:val="22"/>
+          <w:szCs w:val="22"/>
+        </w:rPr>
+        <w:t xml:space="preserve">FinancialAnalytics NWC Polyline Chart (FinancialAnalyticsScreen.tsx)</w:t>
+      </w:r>
+    </w:p>
+    <w:p>
+      <w:pPr>
+        <w:pStyle w:val="ListParagraph"/>
+        <w:numPr>
+          <w:ilvl w:val="1"/>
+          <w:numId w:val="1"/>
+        </w:numPr>
+        <w:spacing w:after="40"/>
+      </w:pPr>
+      <w:r>
+        <w:rPr>
+          <w:color w:val="1D2D3E"/>
+          <w:sz w:val="22"/>
+          <w:szCs w:val="22"/>
+        </w:rPr>
+        <w:t xml:space="preserve">  NWCPolyline component: View transforms for line segments (midpoint positioning + atan2 rotation)</w:t>
+      </w:r>
+    </w:p>
+    <w:p>
+      <w:pPr>
+        <w:pStyle w:val="ListParagraph"/>
+        <w:numPr>
+          <w:ilvl w:val="1"/>
+          <w:numId w:val="1"/>
+        </w:numPr>
+        <w:spacing w:after="40"/>
+      </w:pPr>
+      <w:r>
+        <w:rPr>
+          <w:color w:val="1D2D3E"/>
+          <w:sz w:val="22"/>
+          <w:szCs w:val="22"/>
+        </w:rPr>
+        <w:t xml:space="preserve">  Positive fill (6% opacity), dots with white border, zero reference hairline</w:t>
+      </w:r>
+    </w:p>
+    <w:p>
+      <w:pPr>
+        <w:pStyle w:val="ListParagraph"/>
+        <w:numPr>
+          <w:ilvl w:val="0"/>
+          <w:numId w:val="1"/>
+        </w:numPr>
+        <w:spacing w:after="40"/>
+      </w:pPr>
+      <w:r>
+        <w:rPr>
+          <w:color w:val="1D2D3E"/>
+          <w:sz w:val="22"/>
+          <w:szCs w:val="22"/>
+        </w:rPr>
+        <w:t xml:space="preserve">Dashboard KPI Sparkline First Day (DashboardScreen.tsx)</w:t>
+      </w:r>
+    </w:p>
+    <w:p>
+      <w:pPr>
+        <w:pStyle w:val="ListParagraph"/>
+        <w:numPr>
+          <w:ilvl w:val="1"/>
+          <w:numId w:val="1"/>
+        </w:numPr>
+        <w:spacing w:after="40"/>
+      </w:pPr>
+      <w:r>
+        <w:rPr>
+          <w:color w:val="1D2D3E"/>
+          <w:sz w:val="22"/>
+          <w:szCs w:val="22"/>
+        </w:rPr>
+        <w:t xml:space="preserve">  Threshold lowered from ≥2 to ≥1; TODAY'S SNAPSHOT mode for single entry; trend pill hidden</w:t>
+      </w:r>
+    </w:p>
+    <w:p>
+      <w:pPr>
+        <w:pStyle w:val="ListParagraph"/>
+        <w:numPr>
+          <w:ilvl w:val="0"/>
+          <w:numId w:val="1"/>
+        </w:numPr>
+        <w:spacing w:after="40"/>
+      </w:pPr>
+      <w:r>
+        <w:rPr>
+          <w:color w:val="1D2D3E"/>
+          <w:sz w:val="22"/>
+          <w:szCs w:val="22"/>
+        </w:rPr>
+        <w:t xml:space="preserve">ProcurementAnalytics Ranked Comparison Modal (ProcurementAnalyticsScreen.tsx)</w:t>
+      </w:r>
+    </w:p>
+    <w:p>
+      <w:pPr>
+        <w:pStyle w:val="ListParagraph"/>
+        <w:numPr>
+          <w:ilvl w:val="1"/>
+          <w:numId w:val="1"/>
+        </w:numPr>
+        <w:spacing w:after="40"/>
+      </w:pPr>
+      <w:r>
+        <w:rPr>
+          <w:color w:val="1D2D3E"/>
+          <w:sz w:val="22"/>
+          <w:szCs w:val="22"/>
+        </w:rPr>
+        <w:t xml:space="preserve">  RankedBarList gains onPress; RankedCompareModal with entity stats, dual monthly bars, legend</w:t>
+      </w:r>
+    </w:p>
+    <w:p>
+      <w:pPr>
+        <w:pStyle w:val="ListParagraph"/>
+        <w:numPr>
+          <w:ilvl w:val="1"/>
+          <w:numId w:val="1"/>
+        </w:numPr>
+        <w:spacing w:after="40"/>
+      </w:pPr>
+      <w:r>
+        <w:rPr>
+          <w:color w:val="1D2D3E"/>
+          <w:sz w:val="22"/>
+          <w:szCs w:val="22"/>
+        </w:rPr>
+        <w:t xml:space="preserve">  computeEntityMonthlyValues helper; separate vendor + customer modal instances</w:t>
+      </w:r>
+    </w:p>
+    <w:p>
+      <w:pPr>
+        <w:pStyle w:val="ListParagraph"/>
+        <w:numPr>
+          <w:ilvl w:val="0"/>
+          <w:numId w:val="1"/>
+        </w:numPr>
+        <w:spacing w:after="40"/>
+      </w:pPr>
+      <w:r>
+        <w:rPr>
+          <w:color w:val="1D2D3E"/>
+          <w:sz w:val="22"/>
+          <w:szCs w:val="22"/>
+        </w:rPr>
+        <w:t xml:space="preserve">StockHealth View Full Ledger from Item Modal (StockHealthScreen.tsx)</w:t>
+      </w:r>
+    </w:p>
+    <w:p>
+      <w:pPr>
+        <w:pStyle w:val="ListParagraph"/>
+        <w:numPr>
+          <w:ilvl w:val="1"/>
+          <w:numId w:val="1"/>
+        </w:numPr>
+        <w:spacing w:after="40"/>
+      </w:pPr>
+      <w:r>
+        <w:rPr>
+          <w:color w:val="1D2D3E"/>
+          <w:sz w:val="22"/>
+          <w:szCs w:val="22"/>
+        </w:rPr>
+        <w:t xml:space="preserve">  ItemDetailModal onViewLedger prop; cross-stack navigate to Inventory &gt; ItemLedger</w:t>
+      </w:r>
+    </w:p>
+    <w:p>
+      <w:pPr>
+        <w:pStyle w:val="ListParagraph"/>
+        <w:numPr>
+          <w:ilvl w:val="0"/>
+          <w:numId w:val="1"/>
+        </w:numPr>
+        <w:spacing w:after="40"/>
+      </w:pPr>
+      <w:r>
+        <w:rPr>
+          <w:color w:val="1D2D3E"/>
+          <w:sz w:val="22"/>
+          <w:szCs w:val="22"/>
+        </w:rPr>
+        <w:t xml:space="preserve">FinancialAnalytics Aging History Period Chips (FinancialAnalyticsScreen.tsx)</w:t>
+      </w:r>
+    </w:p>
+    <w:p>
+      <w:pPr>
+        <w:pStyle w:val="ListParagraph"/>
+        <w:numPr>
+          <w:ilvl w:val="1"/>
+          <w:numId w:val="1"/>
+        </w:numPr>
+        <w:spacing w:after="40"/>
+      </w:pPr>
+      <w:r>
+        <w:rPr>
+          <w:color w:val="1D2D3E"/>
+          <w:sz w:val="22"/>
+          <w:szCs w:val="22"/>
+        </w:rPr>
+        <w:t xml:space="preserve">  historyPeriod state (7|14|30); chips in SectionHeader action; slice applied to both charts</w:t>
+      </w:r>
+    </w:p>
+    <w:p>
+      <w:pPr>
+        <w:pStyle w:val="ListParagraph"/>
+        <w:numPr>
+          <w:ilvl w:val="0"/>
+          <w:numId w:val="1"/>
+        </w:numPr>
+        <w:spacing w:after="40"/>
+      </w:pPr>
+      <w:r>
+        <w:rPr>
+          <w:color w:val="1D2D3E"/>
+          <w:sz w:val="22"/>
+          <w:szCs w:val="22"/>
+        </w:rPr>
+        <w:t xml:space="preserve">InventoryScreen Warehouse Filter Chips (InventoryScreen.tsx)</w:t>
+      </w:r>
+    </w:p>
+    <w:p>
+      <w:pPr>
+        <w:pStyle w:val="ListParagraph"/>
+        <w:numPr>
+          <w:ilvl w:val="1"/>
+          <w:numId w:val="1"/>
+        </w:numPr>
+        <w:spacing w:after="40"/>
+      </w:pPr>
+      <w:r>
+        <w:rPr>
+          <w:color w:val="1D2D3E"/>
+          <w:sz w:val="22"/>
+          <w:szCs w:val="22"/>
+        </w:rPr>
+        <w:t xml:space="preserve">  stockWarehouses useMemo; stockWarehouse state; horizontal chip row on stock tab</w:t>
       </w:r>
     </w:p>
     <w:p>

</xml_diff>

<commit_message>
docs(session-58): update PROGRESS.md, generate-docs.js, and FEATURES.docx with Session 58 changelog
</commit_message>
<xml_diff>
--- a/FEATURES.docx
+++ b/FEATURES.docx
@@ -14952,6 +14952,375 @@
           <w:bCs/>
           <w:color w:val="1D2D3E"/>
         </w:rPr>
+        <w:t xml:space="preserve">3.101 FinancialAnalytics AgingHistoryChart Dual Polyline (Session 58)</w:t>
+      </w:r>
+    </w:p>
+    <w:p>
+      <w:pPr>
+        <w:pStyle w:val="ListParagraph"/>
+        <w:numPr>
+          <w:ilvl w:val="0"/>
+          <w:numId w:val="1"/>
+        </w:numPr>
+        <w:spacing w:after="40"/>
+      </w:pPr>
+      <w:r>
+        <w:rPr>
+          <w:color w:val="1D2D3E"/>
+          <w:sz w:val="22"/>
+          <w:szCs w:val="22"/>
+        </w:rPr>
+        <w:t xml:space="preserve">Replaced bar chart with dual connected polylines: AP = Colors.textSecondary, AR = Colors.text</w:t>
+      </w:r>
+    </w:p>
+    <w:p>
+      <w:pPr>
+        <w:pStyle w:val="ListParagraph"/>
+        <w:numPr>
+          <w:ilvl w:val="0"/>
+          <w:numId w:val="1"/>
+        </w:numPr>
+        <w:spacing w:after="40"/>
+      </w:pPr>
+      <w:r>
+        <w:rPr>
+          <w:color w:val="1D2D3E"/>
+          <w:sz w:val="22"/>
+          <w:szCs w:val="22"/>
+        </w:rPr>
+        <w:t xml:space="preserve">AgingHistoryPolylines component: position:absolute + rotate(θdeg) segment technique, same as NWCPolyline</w:t>
+      </w:r>
+    </w:p>
+    <w:p>
+      <w:pPr>
+        <w:pStyle w:val="ListParagraph"/>
+        <w:numPr>
+          <w:ilvl w:val="0"/>
+          <w:numId w:val="1"/>
+        </w:numPr>
+        <w:spacing w:after="40"/>
+      </w:pPr>
+      <w:r>
+        <w:rPr>
+          <w:color w:val="1D2D3E"/>
+          <w:sz w:val="22"/>
+          <w:szCs w:val="22"/>
+        </w:rPr>
+        <w:t xml:space="preserve">renderSegments(pts, color, key) + renderDots(pts, color, key) helpers; AGING_CHART_H=64, AGING_DOT_R=3</w:t>
+      </w:r>
+    </w:p>
+    <w:p>
+      <w:pPr>
+        <w:pStyle w:val="ListParagraph"/>
+        <w:numPr>
+          <w:ilvl w:val="0"/>
+          <w:numId w:val="1"/>
+        </w:numPr>
+        <w:spacing w:after="40"/>
+      </w:pPr>
+      <w:r>
+        <w:rPr>
+          <w:color w:val="1D2D3E"/>
+          <w:sz w:val="22"/>
+          <w:szCs w:val="22"/>
+        </w:rPr>
+        <w:t xml:space="preserve">dateRow shows first/last date as start/end labels; polylineContainer replaces bar styles</w:t>
+      </w:r>
+    </w:p>
+    <w:p>
+      <w:pPr>
+        <w:pStyle w:val="ListParagraph"/>
+        <w:numPr>
+          <w:ilvl w:val="0"/>
+          <w:numId w:val="1"/>
+        </w:numPr>
+        <w:spacing w:after="40"/>
+      </w:pPr>
+      <w:r>
+        <w:rPr>
+          <w:color w:val="1D2D3E"/>
+          <w:sz w:val="22"/>
+          <w:szCs w:val="22"/>
+        </w:rPr>
+        <w:t xml:space="preserve">Removed: barsRow, dayCol, track, barsBottom, bar styles; legend and Over-90 row unchanged</w:t>
+      </w:r>
+    </w:p>
+    <w:p>
+      <w:pPr>
+        <w:spacing w:after="80"/>
+      </w:pPr>
+      <w:r>
+        <w:rPr>
+          <w:color w:val="1D2D3E"/>
+          <w:sz w:val="22"/>
+          <w:szCs w:val="22"/>
+        </w:rPr>
+        <w:t xml:space="preserve"/>
+      </w:r>
+    </w:p>
+    <w:p>
+      <w:pPr>
+        <w:pStyle w:val="Heading2"/>
+        <w:spacing w:after="120" w:before="300"/>
+      </w:pPr>
+      <w:r>
+        <w:rPr>
+          <w:b/>
+          <w:bCs/>
+          <w:color w:val="1D2D3E"/>
+        </w:rPr>
+        <w:t xml:space="preserve">3.102 Inventory Grouped/Aggregate Stock View (Session 58)</w:t>
+      </w:r>
+    </w:p>
+    <w:p>
+      <w:pPr>
+        <w:pStyle w:val="ListParagraph"/>
+        <w:numPr>
+          <w:ilvl w:val="0"/>
+          <w:numId w:val="1"/>
+        </w:numPr>
+        <w:spacing w:after="40"/>
+      </w:pPr>
+      <w:r>
+        <w:rPr>
+          <w:color w:val="1D2D3E"/>
+          <w:sz w:val="22"/>
+          <w:szCs w:val="22"/>
+        </w:rPr>
+        <w:t xml:space="preserve">GroupedStock interface: { item_id, item_name, item_code, totalQty, unit, warehouses: StockBalance[] }</w:t>
+      </w:r>
+    </w:p>
+    <w:p>
+      <w:pPr>
+        <w:pStyle w:val="ListParagraph"/>
+        <w:numPr>
+          <w:ilvl w:val="0"/>
+          <w:numId w:val="1"/>
+        </w:numPr>
+        <w:spacing w:after="40"/>
+      </w:pPr>
+      <w:r>
+        <w:rPr>
+          <w:color w:val="1D2D3E"/>
+          <w:sz w:val="22"/>
+          <w:szCs w:val="22"/>
+        </w:rPr>
+        <w:t xml:space="preserve">stockGrouped boolean + expandedItems Set&lt;string&gt; states; groupedStock useMemo groups filteredStock by item_name</w:t>
+      </w:r>
+    </w:p>
+    <w:p>
+      <w:pPr>
+        <w:pStyle w:val="ListParagraph"/>
+        <w:numPr>
+          <w:ilvl w:val="0"/>
+          <w:numId w:val="1"/>
+        </w:numPr>
+        <w:spacing w:after="40"/>
+      </w:pPr>
+      <w:r>
+        <w:rPr>
+          <w:color w:val="1D2D3E"/>
+          <w:sz w:val="22"/>
+          <w:szCs w:val="22"/>
+        </w:rPr>
+        <w:t xml:space="preserve">Header layers/list toggle button — dark fill when active (exportBtnActive style)</w:t>
+      </w:r>
+    </w:p>
+    <w:p>
+      <w:pPr>
+        <w:pStyle w:val="ListParagraph"/>
+        <w:numPr>
+          <w:ilvl w:val="0"/>
+          <w:numId w:val="1"/>
+        </w:numPr>
+        <w:spacing w:after="40"/>
+      </w:pPr>
+      <w:r>
+        <w:rPr>
+          <w:color w:val="1D2D3E"/>
+          <w:sz w:val="22"/>
+          <w:szCs w:val="22"/>
+        </w:rPr>
+        <w:t xml:space="preserve">GroupedStockCard: single-warehouse shows warehouse name + ledger nav; multi-warehouse shows badge + accordion</w:t>
+      </w:r>
+    </w:p>
+    <w:p>
+      <w:pPr>
+        <w:pStyle w:val="ListParagraph"/>
+        <w:numPr>
+          <w:ilvl w:val="0"/>
+          <w:numId w:val="1"/>
+        </w:numPr>
+        <w:spacing w:after="40"/>
+      </w:pPr>
+      <w:r>
+        <w:rPr>
+          <w:color w:val="1D2D3E"/>
+          <w:sz w:val="22"/>
+          <w:szCs w:val="22"/>
+        </w:rPr>
+        <w:t xml:space="preserve">Accordion expansion: per-warehouse sub-rows with corner-down-right icon, warehouse qty, Out/Low pill, chevron-right</w:t>
+      </w:r>
+    </w:p>
+    <w:p>
+      <w:pPr>
+        <w:pStyle w:val="ListParagraph"/>
+        <w:numPr>
+          <w:ilvl w:val="0"/>
+          <w:numId w:val="1"/>
+        </w:numPr>
+        <w:spacing w:after="40"/>
+      </w:pPr>
+      <w:r>
+        <w:rPr>
+          <w:color w:val="1D2D3E"/>
+          <w:sz w:val="22"/>
+          <w:szCs w:val="22"/>
+        </w:rPr>
+        <w:t xml:space="preserve">SectionHeader meta shows 'N items · M rows (filtered)' in grouped mode</w:t>
+      </w:r>
+    </w:p>
+    <w:p>
+      <w:pPr>
+        <w:spacing w:after="80"/>
+      </w:pPr>
+      <w:r>
+        <w:rPr>
+          <w:color w:val="1D2D3E"/>
+          <w:sz w:val="22"/>
+          <w:szCs w:val="22"/>
+        </w:rPr>
+        <w:t xml:space="preserve"/>
+      </w:r>
+    </w:p>
+    <w:p>
+      <w:pPr>
+        <w:pStyle w:val="Heading2"/>
+        <w:spacing w:after="120" w:before="300"/>
+      </w:pPr>
+      <w:r>
+        <w:rPr>
+          <w:b/>
+          <w:bCs/>
+          <w:color w:val="1D2D3E"/>
+        </w:rPr>
+        <w:t xml:space="preserve">3.103 JournalEntries Sticky Filter Stats Strip (Session 58)</w:t>
+      </w:r>
+    </w:p>
+    <w:p>
+      <w:pPr>
+        <w:pStyle w:val="ListParagraph"/>
+        <w:numPr>
+          <w:ilvl w:val="0"/>
+          <w:numId w:val="1"/>
+        </w:numPr>
+        <w:spacing w:after="40"/>
+      </w:pPr>
+      <w:r>
+        <w:rPr>
+          <w:color w:val="1D2D3E"/>
+          <w:sz w:val="22"/>
+          <w:szCs w:val="22"/>
+        </w:rPr>
+        <w:t xml:space="preserve">filteredDebit + filteredCredit computed inline (reduce on total_debit/total_credit) from filtered array</w:t>
+      </w:r>
+    </w:p>
+    <w:p>
+      <w:pPr>
+        <w:pStyle w:val="ListParagraph"/>
+        <w:numPr>
+          <w:ilvl w:val="0"/>
+          <w:numId w:val="1"/>
+        </w:numPr>
+        <w:spacing w:after="40"/>
+      </w:pPr>
+      <w:r>
+        <w:rPr>
+          <w:color w:val="1D2D3E"/>
+          <w:sz w:val="22"/>
+          <w:szCs w:val="22"/>
+        </w:rPr>
+        <w:t xml:space="preserve">statsStrip view inserted between type-chips and main ScrollView — always visible while scrolling entries</w:t>
+      </w:r>
+    </w:p>
+    <w:p>
+      <w:pPr>
+        <w:pStyle w:val="ListParagraph"/>
+        <w:numPr>
+          <w:ilvl w:val="0"/>
+          <w:numId w:val="1"/>
+        </w:numPr>
+        <w:spacing w:after="40"/>
+      </w:pPr>
+      <w:r>
+        <w:rPr>
+          <w:color w:val="1D2D3E"/>
+          <w:sz w:val="22"/>
+          <w:szCs w:val="22"/>
+        </w:rPr>
+        <w:t xml:space="preserve">Shows: N vouchers · Dr X · Cr X with hairline dividers between segments</w:t>
+      </w:r>
+    </w:p>
+    <w:p>
+      <w:pPr>
+        <w:pStyle w:val="ListParagraph"/>
+        <w:numPr>
+          <w:ilvl w:val="0"/>
+          <w:numId w:val="1"/>
+        </w:numPr>
+        <w:spacing w:after="40"/>
+      </w:pPr>
+      <w:r>
+        <w:rPr>
+          <w:color w:val="1D2D3E"/>
+          <w:sz w:val="22"/>
+          <w:szCs w:val="22"/>
+        </w:rPr>
+        <w:t xml:space="preserve">Balance-check icon at right: check-circle (muted) when Dr≈Cr; alert-circle when imbalanced</w:t>
+      </w:r>
+    </w:p>
+    <w:p>
+      <w:pPr>
+        <w:pStyle w:val="ListParagraph"/>
+        <w:numPr>
+          <w:ilvl w:val="0"/>
+          <w:numId w:val="1"/>
+        </w:numPr>
+        <w:spacing w:after="40"/>
+      </w:pPr>
+      <w:r>
+        <w:rPr>
+          <w:color w:val="1D2D3E"/>
+          <w:sz w:val="22"/>
+          <w:szCs w:val="22"/>
+        </w:rPr>
+        <w:t xml:space="preserve">Only rendered when filtered.length &gt; 0; hidden during loading</w:t>
+      </w:r>
+    </w:p>
+    <w:p>
+      <w:pPr>
+        <w:spacing w:after="80"/>
+      </w:pPr>
+      <w:r>
+        <w:rPr>
+          <w:color w:val="1D2D3E"/>
+          <w:sz w:val="22"/>
+          <w:szCs w:val="22"/>
+        </w:rPr>
+        <w:t xml:space="preserve"/>
+      </w:r>
+    </w:p>
+    <w:p>
+      <w:pPr>
+        <w:pStyle w:val="Heading2"/>
+        <w:spacing w:after="120" w:before="300"/>
+      </w:pPr>
+      <w:r>
+        <w:rPr>
+          <w:b/>
+          <w:bCs/>
+          <w:color w:val="1D2D3E"/>
+        </w:rPr>
         <w:t xml:space="preserve">3.87 ProcurementAnalytics Vendor Lead Time Comparison (Session 55)</w:t>
       </w:r>
     </w:p>
@@ -32652,6 +33021,228 @@
           </w:p>
         </w:tc>
       </w:tr>
+      <w:tr>
+        <w:tc>
+          <w:p>
+            <w:pPr>
+              <w:spacing w:after="40" w:before="40"/>
+            </w:pPr>
+            <w:r>
+              <w:rPr>
+                <w:b w:val="false"/>
+                <w:bCs w:val="false"/>
+                <w:color w:val="1D2D3E"/>
+                <w:sz w:val="20"/>
+                <w:szCs w:val="20"/>
+              </w:rPr>
+              <w:t xml:space="preserve">Session 58</w:t>
+            </w:r>
+          </w:p>
+        </w:tc>
+        <w:tc>
+          <w:p>
+            <w:pPr>
+              <w:spacing w:after="40" w:before="40"/>
+            </w:pPr>
+            <w:r>
+              <w:rPr>
+                <w:b w:val="false"/>
+                <w:bCs w:val="false"/>
+                <w:color w:val="1D2D3E"/>
+                <w:sz w:val="20"/>
+                <w:szCs w:val="20"/>
+              </w:rPr>
+              <w:t xml:space="preserve">FinancialAnalytics AgingHistoryChart polyline — dual AP/AR polylines replace bar chart; same position:absolute segment technique as NWCPolyline</w:t>
+            </w:r>
+          </w:p>
+        </w:tc>
+        <w:tc>
+          <w:p>
+            <w:pPr>
+              <w:spacing w:after="40" w:before="40"/>
+            </w:pPr>
+            <w:r>
+              <w:rPr>
+                <w:b w:val="false"/>
+                <w:bCs w:val="false"/>
+                <w:color w:val="1D2D3E"/>
+                <w:sz w:val="20"/>
+                <w:szCs w:val="20"/>
+              </w:rPr>
+              <w:t xml:space="preserve">Done</w:t>
+            </w:r>
+          </w:p>
+        </w:tc>
+        <w:tc>
+          <w:p>
+            <w:pPr>
+              <w:spacing w:after="40" w:before="40"/>
+            </w:pPr>
+            <w:r>
+              <w:rPr>
+                <w:b w:val="false"/>
+                <w:bCs w:val="false"/>
+                <w:color w:val="1D2D3E"/>
+                <w:sz w:val="20"/>
+                <w:szCs w:val="20"/>
+              </w:rPr>
+              <w:t xml:space="preserve">FinancialAnalyticsScreen.tsx</w:t>
+            </w:r>
+          </w:p>
+        </w:tc>
+      </w:tr>
+      <w:tr>
+        <w:tc>
+          <w:tcPr>
+            <w:shd w:color="F0F4F8" w:val="solid"/>
+          </w:tcPr>
+          <w:p>
+            <w:pPr>
+              <w:spacing w:after="40" w:before="40"/>
+            </w:pPr>
+            <w:r>
+              <w:rPr>
+                <w:b w:val="false"/>
+                <w:bCs w:val="false"/>
+                <w:color w:val="1D2D3E"/>
+                <w:sz w:val="20"/>
+                <w:szCs w:val="20"/>
+              </w:rPr>
+              <w:t xml:space="preserve">Session 58</w:t>
+            </w:r>
+          </w:p>
+        </w:tc>
+        <w:tc>
+          <w:tcPr>
+            <w:shd w:color="F0F4F8" w:val="solid"/>
+          </w:tcPr>
+          <w:p>
+            <w:pPr>
+              <w:spacing w:after="40" w:before="40"/>
+            </w:pPr>
+            <w:r>
+              <w:rPr>
+                <w:b w:val="false"/>
+                <w:bCs w:val="false"/>
+                <w:color w:val="1D2D3E"/>
+                <w:sz w:val="20"/>
+                <w:szCs w:val="20"/>
+              </w:rPr>
+              <w:t xml:space="preserve">Inventory grouped/aggregate view — layers toggle collapses same-item rows; GroupedStockCard with accordion warehouse expansion</w:t>
+            </w:r>
+          </w:p>
+        </w:tc>
+        <w:tc>
+          <w:tcPr>
+            <w:shd w:color="F0F4F8" w:val="solid"/>
+          </w:tcPr>
+          <w:p>
+            <w:pPr>
+              <w:spacing w:after="40" w:before="40"/>
+            </w:pPr>
+            <w:r>
+              <w:rPr>
+                <w:b w:val="false"/>
+                <w:bCs w:val="false"/>
+                <w:color w:val="1D2D3E"/>
+                <w:sz w:val="20"/>
+                <w:szCs w:val="20"/>
+              </w:rPr>
+              <w:t xml:space="preserve">Done</w:t>
+            </w:r>
+          </w:p>
+        </w:tc>
+        <w:tc>
+          <w:tcPr>
+            <w:shd w:color="F0F4F8" w:val="solid"/>
+          </w:tcPr>
+          <w:p>
+            <w:pPr>
+              <w:spacing w:after="40" w:before="40"/>
+            </w:pPr>
+            <w:r>
+              <w:rPr>
+                <w:b w:val="false"/>
+                <w:bCs w:val="false"/>
+                <w:color w:val="1D2D3E"/>
+                <w:sz w:val="20"/>
+                <w:szCs w:val="20"/>
+              </w:rPr>
+              <w:t xml:space="preserve">InventoryScreen.tsx</w:t>
+            </w:r>
+          </w:p>
+        </w:tc>
+      </w:tr>
+      <w:tr>
+        <w:tc>
+          <w:p>
+            <w:pPr>
+              <w:spacing w:after="40" w:before="40"/>
+            </w:pPr>
+            <w:r>
+              <w:rPr>
+                <w:b w:val="false"/>
+                <w:bCs w:val="false"/>
+                <w:color w:val="1D2D3E"/>
+                <w:sz w:val="20"/>
+                <w:szCs w:val="20"/>
+              </w:rPr>
+              <w:t xml:space="preserve">Session 58</w:t>
+            </w:r>
+          </w:p>
+        </w:tc>
+        <w:tc>
+          <w:p>
+            <w:pPr>
+              <w:spacing w:after="40" w:before="40"/>
+            </w:pPr>
+            <w:r>
+              <w:rPr>
+                <w:b w:val="false"/>
+                <w:bCs w:val="false"/>
+                <w:color w:val="1D2D3E"/>
+                <w:sz w:val="20"/>
+                <w:szCs w:val="20"/>
+              </w:rPr>
+              <w:t xml:space="preserve">JournalEntries sticky stats strip — filteredDebit/Credit + balance-check icon above ScrollView, always visible while scrolling</w:t>
+            </w:r>
+          </w:p>
+        </w:tc>
+        <w:tc>
+          <w:p>
+            <w:pPr>
+              <w:spacing w:after="40" w:before="40"/>
+            </w:pPr>
+            <w:r>
+              <w:rPr>
+                <w:b w:val="false"/>
+                <w:bCs w:val="false"/>
+                <w:color w:val="1D2D3E"/>
+                <w:sz w:val="20"/>
+                <w:szCs w:val="20"/>
+              </w:rPr>
+              <w:t xml:space="preserve">Done</w:t>
+            </w:r>
+          </w:p>
+        </w:tc>
+        <w:tc>
+          <w:p>
+            <w:pPr>
+              <w:spacing w:after="40" w:before="40"/>
+            </w:pPr>
+            <w:r>
+              <w:rPr>
+                <w:b w:val="false"/>
+                <w:bCs w:val="false"/>
+                <w:color w:val="1D2D3E"/>
+                <w:sz w:val="20"/>
+                <w:szCs w:val="20"/>
+              </w:rPr>
+              <w:t xml:space="preserve">JournalEntriesScreen.tsx</w:t>
+            </w:r>
+          </w:p>
+        </w:tc>
+      </w:tr>
     </w:tbl>
     <w:p>
       <w:pPr>
@@ -37734,6 +38325,231 @@
           <w:szCs w:val="22"/>
         </w:rPr>
         <w:t xml:space="preserve">  Tapping a history row repopulates the query field</w:t>
+      </w:r>
+    </w:p>
+    <w:p>
+      <w:pPr>
+        <w:spacing w:after="80"/>
+      </w:pPr>
+      <w:r>
+        <w:rPr>
+          <w:color w:val="1D2D3E"/>
+          <w:sz w:val="22"/>
+          <w:szCs w:val="22"/>
+        </w:rPr>
+        <w:t xml:space="preserve"/>
+      </w:r>
+    </w:p>
+    <w:p>
+      <w:pPr>
+        <w:pStyle w:val="Heading2"/>
+        <w:spacing w:after="120" w:before="300"/>
+      </w:pPr>
+      <w:r>
+        <w:rPr>
+          <w:b/>
+          <w:bCs/>
+          <w:color w:val="1D2D3E"/>
+        </w:rPr>
+        <w:t xml:space="preserve">Session 58 — 2026-06-11</w:t>
+      </w:r>
+    </w:p>
+    <w:p>
+      <w:pPr>
+        <w:pStyle w:val="ListParagraph"/>
+        <w:numPr>
+          <w:ilvl w:val="0"/>
+          <w:numId w:val="1"/>
+        </w:numPr>
+        <w:spacing w:after="40"/>
+      </w:pPr>
+      <w:r>
+        <w:rPr>
+          <w:color w:val="1D2D3E"/>
+          <w:sz w:val="22"/>
+          <w:szCs w:val="22"/>
+        </w:rPr>
+        <w:t xml:space="preserve">FinancialAnalytics AgingHistoryChart Dual Polyline (FinancialAnalyticsScreen.tsx)</w:t>
+      </w:r>
+    </w:p>
+    <w:p>
+      <w:pPr>
+        <w:pStyle w:val="ListParagraph"/>
+        <w:numPr>
+          <w:ilvl w:val="1"/>
+          <w:numId w:val="1"/>
+        </w:numPr>
+        <w:spacing w:after="40"/>
+      </w:pPr>
+      <w:r>
+        <w:rPr>
+          <w:color w:val="1D2D3E"/>
+          <w:sz w:val="22"/>
+          <w:szCs w:val="22"/>
+        </w:rPr>
+        <w:t xml:space="preserve">  AgingHistoryPolylines: AP + AR as position:absolute segment lines, same technique as NWCPolyline</w:t>
+      </w:r>
+    </w:p>
+    <w:p>
+      <w:pPr>
+        <w:pStyle w:val="ListParagraph"/>
+        <w:numPr>
+          <w:ilvl w:val="1"/>
+          <w:numId w:val="1"/>
+        </w:numPr>
+        <w:spacing w:after="40"/>
+      </w:pPr>
+      <w:r>
+        <w:rPr>
+          <w:color w:val="1D2D3E"/>
+          <w:sz w:val="22"/>
+          <w:szCs w:val="22"/>
+        </w:rPr>
+        <w:t xml:space="preserve">  renderSegments + renderDots helpers per series; dateRow shows first/last date; bar styles removed</w:t>
+      </w:r>
+    </w:p>
+    <w:p>
+      <w:pPr>
+        <w:pStyle w:val="ListParagraph"/>
+        <w:numPr>
+          <w:ilvl w:val="0"/>
+          <w:numId w:val="1"/>
+        </w:numPr>
+        <w:spacing w:after="40"/>
+      </w:pPr>
+      <w:r>
+        <w:rPr>
+          <w:color w:val="1D2D3E"/>
+          <w:sz w:val="22"/>
+          <w:szCs w:val="22"/>
+        </w:rPr>
+        <w:t xml:space="preserve">Inventory Grouped/Aggregate Stock View (InventoryScreen.tsx)</w:t>
+      </w:r>
+    </w:p>
+    <w:p>
+      <w:pPr>
+        <w:pStyle w:val="ListParagraph"/>
+        <w:numPr>
+          <w:ilvl w:val="1"/>
+          <w:numId w:val="1"/>
+        </w:numPr>
+        <w:spacing w:after="40"/>
+      </w:pPr>
+      <w:r>
+        <w:rPr>
+          <w:color w:val="1D2D3E"/>
+          <w:sz w:val="22"/>
+          <w:szCs w:val="22"/>
+        </w:rPr>
+        <w:t xml:space="preserve">  GroupedStock interface; groupedStock useMemo groups filteredStock by item_name; accordion expansion</w:t>
+      </w:r>
+    </w:p>
+    <w:p>
+      <w:pPr>
+        <w:pStyle w:val="ListParagraph"/>
+        <w:numPr>
+          <w:ilvl w:val="1"/>
+          <w:numId w:val="1"/>
+        </w:numPr>
+        <w:spacing w:after="40"/>
+      </w:pPr>
+      <w:r>
+        <w:rPr>
+          <w:color w:val="1D2D3E"/>
+          <w:sz w:val="22"/>
+          <w:szCs w:val="22"/>
+        </w:rPr>
+        <w:t xml:space="preserve">  GroupedStockCard: single-warehouse (ledger nav) vs multi-warehouse (badge + chevron down/up)</w:t>
+      </w:r>
+    </w:p>
+    <w:p>
+      <w:pPr>
+        <w:pStyle w:val="ListParagraph"/>
+        <w:numPr>
+          <w:ilvl w:val="1"/>
+          <w:numId w:val="1"/>
+        </w:numPr>
+        <w:spacing w:after="40"/>
+      </w:pPr>
+      <w:r>
+        <w:rPr>
+          <w:color w:val="1D2D3E"/>
+          <w:sz w:val="22"/>
+          <w:szCs w:val="22"/>
+        </w:rPr>
+        <w:t xml:space="preserve">  Per-warehouse sub-rows with corner-down-right icon, qty, Out/Low pill, ItemLedger nav</w:t>
+      </w:r>
+    </w:p>
+    <w:p>
+      <w:pPr>
+        <w:pStyle w:val="ListParagraph"/>
+        <w:numPr>
+          <w:ilvl w:val="1"/>
+          <w:numId w:val="1"/>
+        </w:numPr>
+        <w:spacing w:after="40"/>
+      </w:pPr>
+      <w:r>
+        <w:rPr>
+          <w:color w:val="1D2D3E"/>
+          <w:sz w:val="22"/>
+          <w:szCs w:val="22"/>
+        </w:rPr>
+        <w:t xml:space="preserve">  layers/list toggle button in header; exportBtnActive dark fill when grouped mode active</w:t>
+      </w:r>
+    </w:p>
+    <w:p>
+      <w:pPr>
+        <w:pStyle w:val="ListParagraph"/>
+        <w:numPr>
+          <w:ilvl w:val="0"/>
+          <w:numId w:val="1"/>
+        </w:numPr>
+        <w:spacing w:after="40"/>
+      </w:pPr>
+      <w:r>
+        <w:rPr>
+          <w:color w:val="1D2D3E"/>
+          <w:sz w:val="22"/>
+          <w:szCs w:val="22"/>
+        </w:rPr>
+        <w:t xml:space="preserve">JournalEntries Sticky Filter Stats Strip (JournalEntriesScreen.tsx)</w:t>
+      </w:r>
+    </w:p>
+    <w:p>
+      <w:pPr>
+        <w:pStyle w:val="ListParagraph"/>
+        <w:numPr>
+          <w:ilvl w:val="1"/>
+          <w:numId w:val="1"/>
+        </w:numPr>
+        <w:spacing w:after="40"/>
+      </w:pPr>
+      <w:r>
+        <w:rPr>
+          <w:color w:val="1D2D3E"/>
+          <w:sz w:val="22"/>
+          <w:szCs w:val="22"/>
+        </w:rPr>
+        <w:t xml:space="preserve">  filteredDebit/Credit via reduce; statsStrip outside ScrollView — always visible while scrolling</w:t>
+      </w:r>
+    </w:p>
+    <w:p>
+      <w:pPr>
+        <w:pStyle w:val="ListParagraph"/>
+        <w:numPr>
+          <w:ilvl w:val="1"/>
+          <w:numId w:val="1"/>
+        </w:numPr>
+        <w:spacing w:after="40"/>
+      </w:pPr>
+      <w:r>
+        <w:rPr>
+          <w:color w:val="1D2D3E"/>
+          <w:sz w:val="22"/>
+          <w:szCs w:val="22"/>
+        </w:rPr>
+        <w:t xml:space="preserve">  Shows: N vouchers · Dr X · Cr X with dividers; check-circle/alert-circle balance-check icon</w:t>
       </w:r>
     </w:p>
     <w:p>

</xml_diff>

<commit_message>
docs(session-59): update PROGRESS.md, generate-docs.js, and FEATURES.docx with Session 59 changelog
</commit_message>
<xml_diff>
--- a/FEATURES.docx
+++ b/FEATURES.docx
@@ -15321,6 +15321,357 @@
           <w:bCs/>
           <w:color w:val="1D2D3E"/>
         </w:rPr>
+        <w:t xml:space="preserve">3.104 JournalEntries Per-Account Running Balance (Session 59)</w:t>
+      </w:r>
+    </w:p>
+    <w:p>
+      <w:pPr>
+        <w:pStyle w:val="ListParagraph"/>
+        <w:numPr>
+          <w:ilvl w:val="0"/>
+          <w:numId w:val="1"/>
+        </w:numPr>
+        <w:spacing w:after="40"/>
+      </w:pPr>
+      <w:r>
+        <w:rPr>
+          <w:color w:val="1D2D3E"/>
+          <w:sz w:val="22"/>
+          <w:szCs w:val="22"/>
+        </w:rPr>
+        <w:t xml:space="preserve">filteredWithBalance useMemo: when pickedAccount is active, sorts filtered entries chronologically and accumulates Dr−Cr per entry</w:t>
+      </w:r>
+    </w:p>
+    <w:p>
+      <w:pPr>
+        <w:pStyle w:val="ListParagraph"/>
+        <w:numPr>
+          <w:ilvl w:val="0"/>
+          <w:numId w:val="1"/>
+        </w:numPr>
+        <w:spacing w:after="40"/>
+      </w:pPr>
+      <w:r>
+        <w:rPr>
+          <w:color w:val="1D2D3E"/>
+          <w:sz w:val="22"/>
+          <w:szCs w:val="22"/>
+        </w:rPr>
+        <w:t xml:space="preserve">JECard gains optional runningBalance prop; renders a third 'Balance' column in the amount row when provided</w:t>
+      </w:r>
+    </w:p>
+    <w:p>
+      <w:pPr>
+        <w:pStyle w:val="ListParagraph"/>
+        <w:numPr>
+          <w:ilvl w:val="0"/>
+          <w:numId w:val="1"/>
+        </w:numPr>
+        <w:spacing w:after="40"/>
+      </w:pPr>
+      <w:r>
+        <w:rPr>
+          <w:color w:val="1D2D3E"/>
+          <w:sz w:val="22"/>
+          <w:szCs w:val="22"/>
+        </w:rPr>
+        <w:t xml:space="preserve">Sign-aware formatting: '−' prefix for negative balance; muted secondary colour for negative values</w:t>
+      </w:r>
+    </w:p>
+    <w:p>
+      <w:pPr>
+        <w:pStyle w:val="ListParagraph"/>
+        <w:numPr>
+          <w:ilvl w:val="0"/>
+          <w:numId w:val="1"/>
+        </w:numPr>
+        <w:spacing w:after="40"/>
+      </w:pPr>
+      <w:r>
+        <w:rPr>
+          <w:color w:val="1D2D3E"/>
+          <w:sz w:val="22"/>
+          <w:szCs w:val="22"/>
+        </w:rPr>
+        <w:t xml:space="preserve">When running balance column is visible, footer row moves lines-hint + chevron-right below the amount row</w:t>
+      </w:r>
+    </w:p>
+    <w:p>
+      <w:pPr>
+        <w:pStyle w:val="ListParagraph"/>
+        <w:numPr>
+          <w:ilvl w:val="0"/>
+          <w:numId w:val="1"/>
+        </w:numPr>
+        <w:spacing w:after="40"/>
+      </w:pPr>
+      <w:r>
+        <w:rPr>
+          <w:color w:val="1D2D3E"/>
+          <w:sz w:val="22"/>
+          <w:szCs w:val="22"/>
+        </w:rPr>
+        <w:t xml:space="preserve">New styles: runningBalanceCol, runningBalanceVal, runningBalanceNeg, runningBalanceFooter</w:t>
+      </w:r>
+    </w:p>
+    <w:p>
+      <w:pPr>
+        <w:spacing w:after="80"/>
+      </w:pPr>
+      <w:r>
+        <w:rPr>
+          <w:color w:val="1D2D3E"/>
+          <w:sz w:val="22"/>
+          <w:szCs w:val="22"/>
+        </w:rPr>
+        <w:t xml:space="preserve"/>
+      </w:r>
+    </w:p>
+    <w:p>
+      <w:pPr>
+        <w:pStyle w:val="Heading2"/>
+        <w:spacing w:after="120" w:before="300"/>
+      </w:pPr>
+      <w:r>
+        <w:rPr>
+          <w:b/>
+          <w:bCs/>
+          <w:color w:val="1D2D3E"/>
+        </w:rPr>
+        <w:t xml:space="preserve">3.105 Inventory ItemLedger Per-Warehouse Navigation (Session 59)</w:t>
+      </w:r>
+    </w:p>
+    <w:p>
+      <w:pPr>
+        <w:pStyle w:val="ListParagraph"/>
+        <w:numPr>
+          <w:ilvl w:val="0"/>
+          <w:numId w:val="1"/>
+        </w:numPr>
+        <w:spacing w:after="40"/>
+      </w:pPr>
+      <w:r>
+        <w:rPr>
+          <w:color w:val="1D2D3E"/>
+          <w:sz w:val="22"/>
+          <w:szCs w:val="22"/>
+        </w:rPr>
+        <w:t xml:space="preserve">InventoryStackParamList.ItemLedger gains optional warehouse_id and warehouse_name params</w:t>
+      </w:r>
+    </w:p>
+    <w:p>
+      <w:pPr>
+        <w:pStyle w:val="ListParagraph"/>
+        <w:numPr>
+          <w:ilvl w:val="0"/>
+          <w:numId w:val="1"/>
+        </w:numPr>
+        <w:spacing w:after="40"/>
+      </w:pPr>
+      <w:r>
+        <w:rPr>
+          <w:color w:val="1D2D3E"/>
+          <w:sz w:val="22"/>
+          <w:szCs w:val="22"/>
+        </w:rPr>
+        <w:t xml:space="preserve">ItemLedgerScreen passes warehouseId to fetchStockLedger so API filters entries to that warehouse</w:t>
+      </w:r>
+    </w:p>
+    <w:p>
+      <w:pPr>
+        <w:pStyle w:val="ListParagraph"/>
+        <w:numPr>
+          <w:ilvl w:val="0"/>
+          <w:numId w:val="1"/>
+        </w:numPr>
+        <w:spacing w:after="40"/>
+      </w:pPr>
+      <w:r>
+        <w:rPr>
+          <w:color w:val="1D2D3E"/>
+          <w:sz w:val="22"/>
+          <w:szCs w:val="22"/>
+        </w:rPr>
+        <w:t xml:space="preserve">Header shows map-pin + warehouse name when warehouse filter is active (headerSubRow layout)</w:t>
+      </w:r>
+    </w:p>
+    <w:p>
+      <w:pPr>
+        <w:pStyle w:val="ListParagraph"/>
+        <w:numPr>
+          <w:ilvl w:val="0"/>
+          <w:numId w:val="1"/>
+        </w:numPr>
+        <w:spacing w:after="40"/>
+      </w:pPr>
+      <w:r>
+        <w:rPr>
+          <w:color w:val="1D2D3E"/>
+          <w:sz w:val="22"/>
+          <w:szCs w:val="22"/>
+        </w:rPr>
+        <w:t xml:space="preserve">GroupedStockCard gains onNavigateWarehouse prop; accordion sub-rows call it with wh.warehouse_id when available</w:t>
+      </w:r>
+    </w:p>
+    <w:p>
+      <w:pPr>
+        <w:pStyle w:val="ListParagraph"/>
+        <w:numPr>
+          <w:ilvl w:val="0"/>
+          <w:numId w:val="1"/>
+        </w:numPr>
+        <w:spacing w:after="40"/>
+      </w:pPr>
+      <w:r>
+        <w:rPr>
+          <w:color w:val="1D2D3E"/>
+          <w:sz w:val="22"/>
+          <w:szCs w:val="22"/>
+        </w:rPr>
+        <w:t xml:space="preserve">Falls back to onNavigate (item-level, no warehouse filter) when warehouse_id is missing</w:t>
+      </w:r>
+    </w:p>
+    <w:p>
+      <w:pPr>
+        <w:spacing w:after="80"/>
+      </w:pPr>
+      <w:r>
+        <w:rPr>
+          <w:color w:val="1D2D3E"/>
+          <w:sz w:val="22"/>
+          <w:szCs w:val="22"/>
+        </w:rPr>
+        <w:t xml:space="preserve"/>
+      </w:r>
+    </w:p>
+    <w:p>
+      <w:pPr>
+        <w:pStyle w:val="Heading2"/>
+        <w:spacing w:after="120" w:before="300"/>
+      </w:pPr>
+      <w:r>
+        <w:rPr>
+          <w:b/>
+          <w:bCs/>
+          <w:color w:val="1D2D3E"/>
+        </w:rPr>
+        <w:t xml:space="preserve">3.106 Dashboard Pending Approvals Card (Session 59)</w:t>
+      </w:r>
+    </w:p>
+    <w:p>
+      <w:pPr>
+        <w:pStyle w:val="ListParagraph"/>
+        <w:numPr>
+          <w:ilvl w:val="0"/>
+          <w:numId w:val="1"/>
+        </w:numPr>
+        <w:spacing w:after="40"/>
+      </w:pPr>
+      <w:r>
+        <w:rPr>
+          <w:color w:val="1D2D3E"/>
+          <w:sz w:val="22"/>
+          <w:szCs w:val="22"/>
+        </w:rPr>
+        <w:t xml:space="preserve">SupplyChainSnapshot gains pendingApprovalPOs and pendingApprovalSOs fields</w:t>
+      </w:r>
+    </w:p>
+    <w:p>
+      <w:pPr>
+        <w:pStyle w:val="ListParagraph"/>
+        <w:numPr>
+          <w:ilvl w:val="0"/>
+          <w:numId w:val="1"/>
+        </w:numPr>
+        <w:spacing w:after="40"/>
+      </w:pPr>
+      <w:r>
+        <w:rPr>
+          <w:color w:val="1D2D3E"/>
+          <w:sz w:val="22"/>
+          <w:szCs w:val="22"/>
+        </w:rPr>
+        <w:t xml:space="preserve">fetchSupplyChainSnapshot filters openPOList/openSOList for status in {draft, submitted, pending, pending_approval}</w:t>
+      </w:r>
+    </w:p>
+    <w:p>
+      <w:pPr>
+        <w:pStyle w:val="ListParagraph"/>
+        <w:numPr>
+          <w:ilvl w:val="0"/>
+          <w:numId w:val="1"/>
+        </w:numPr>
+        <w:spacing w:after="40"/>
+      </w:pPr>
+      <w:r>
+        <w:rPr>
+          <w:color w:val="1D2D3E"/>
+          <w:sz w:val="22"/>
+          <w:szCs w:val="22"/>
+        </w:rPr>
+        <w:t xml:space="preserve">PendingApprovalsCard: clock icon header + total badge, tappable PO/SO tiles with counts, italic hint text</w:t>
+      </w:r>
+    </w:p>
+    <w:p>
+      <w:pPr>
+        <w:pStyle w:val="ListParagraph"/>
+        <w:numPr>
+          <w:ilvl w:val="0"/>
+          <w:numId w:val="1"/>
+        </w:numPr>
+        <w:spacing w:after="40"/>
+      </w:pPr>
+      <w:r>
+        <w:rPr>
+          <w:color w:val="1D2D3E"/>
+          <w:sz w:val="22"/>
+          <w:szCs w:val="22"/>
+        </w:rPr>
+        <w:t xml:space="preserve">Rendered between Supply Chain row and Upcoming Deliveries when any pending approvals exist</w:t>
+      </w:r>
+    </w:p>
+    <w:p>
+      <w:pPr>
+        <w:pStyle w:val="ListParagraph"/>
+        <w:numPr>
+          <w:ilvl w:val="0"/>
+          <w:numId w:val="1"/>
+        </w:numPr>
+        <w:spacing w:after="40"/>
+      </w:pPr>
+      <w:r>
+        <w:rPr>
+          <w:color w:val="1D2D3E"/>
+          <w:sz w:val="22"/>
+          <w:szCs w:val="22"/>
+        </w:rPr>
+        <w:t xml:space="preserve">Tiles navigate to PurchaseOrders/SalesOrders screens respectively</w:t>
+      </w:r>
+    </w:p>
+    <w:p>
+      <w:pPr>
+        <w:spacing w:after="80"/>
+      </w:pPr>
+      <w:r>
+        <w:rPr>
+          <w:color w:val="1D2D3E"/>
+          <w:sz w:val="22"/>
+          <w:szCs w:val="22"/>
+        </w:rPr>
+        <w:t xml:space="preserve"/>
+      </w:r>
+    </w:p>
+    <w:p>
+      <w:pPr>
+        <w:pStyle w:val="Heading2"/>
+        <w:spacing w:after="120" w:before="300"/>
+      </w:pPr>
+      <w:r>
+        <w:rPr>
+          <w:b/>
+          <w:bCs/>
+          <w:color w:val="1D2D3E"/>
+        </w:rPr>
         <w:t xml:space="preserve">3.87 ProcurementAnalytics Vendor Lead Time Comparison (Session 55)</w:t>
       </w:r>
     </w:p>
@@ -33243,6 +33594,240 @@
           </w:p>
         </w:tc>
       </w:tr>
+      <w:tr>
+        <w:tc>
+          <w:tcPr>
+            <w:shd w:color="F0F4F8" w:val="solid"/>
+          </w:tcPr>
+          <w:p>
+            <w:pPr>
+              <w:spacing w:after="40" w:before="40"/>
+            </w:pPr>
+            <w:r>
+              <w:rPr>
+                <w:b w:val="false"/>
+                <w:bCs w:val="false"/>
+                <w:color w:val="1D2D3E"/>
+                <w:sz w:val="20"/>
+                <w:szCs w:val="20"/>
+              </w:rPr>
+              <w:t xml:space="preserve">Session 59</w:t>
+            </w:r>
+          </w:p>
+        </w:tc>
+        <w:tc>
+          <w:tcPr>
+            <w:shd w:color="F0F4F8" w:val="solid"/>
+          </w:tcPr>
+          <w:p>
+            <w:pPr>
+              <w:spacing w:after="40" w:before="40"/>
+            </w:pPr>
+            <w:r>
+              <w:rPr>
+                <w:b w:val="false"/>
+                <w:bCs w:val="false"/>
+                <w:color w:val="1D2D3E"/>
+                <w:sz w:val="20"/>
+                <w:szCs w:val="20"/>
+              </w:rPr>
+              <w:t xml:space="preserve">JournalEntries per-account running balance — filteredWithBalance useMemo; JECard Balance column; sign-aware formatting; Dr−Cr accumulation</w:t>
+            </w:r>
+          </w:p>
+        </w:tc>
+        <w:tc>
+          <w:tcPr>
+            <w:shd w:color="F0F4F8" w:val="solid"/>
+          </w:tcPr>
+          <w:p>
+            <w:pPr>
+              <w:spacing w:after="40" w:before="40"/>
+            </w:pPr>
+            <w:r>
+              <w:rPr>
+                <w:b w:val="false"/>
+                <w:bCs w:val="false"/>
+                <w:color w:val="1D2D3E"/>
+                <w:sz w:val="20"/>
+                <w:szCs w:val="20"/>
+              </w:rPr>
+              <w:t xml:space="preserve">Done</w:t>
+            </w:r>
+          </w:p>
+        </w:tc>
+        <w:tc>
+          <w:tcPr>
+            <w:shd w:color="F0F4F8" w:val="solid"/>
+          </w:tcPr>
+          <w:p>
+            <w:pPr>
+              <w:spacing w:after="40" w:before="40"/>
+            </w:pPr>
+            <w:r>
+              <w:rPr>
+                <w:b w:val="false"/>
+                <w:bCs w:val="false"/>
+                <w:color w:val="1D2D3E"/>
+                <w:sz w:val="20"/>
+                <w:szCs w:val="20"/>
+              </w:rPr>
+              <w:t xml:space="preserve">JournalEntriesScreen.tsx</w:t>
+            </w:r>
+          </w:p>
+        </w:tc>
+      </w:tr>
+      <w:tr>
+        <w:tc>
+          <w:p>
+            <w:pPr>
+              <w:spacing w:after="40" w:before="40"/>
+            </w:pPr>
+            <w:r>
+              <w:rPr>
+                <w:b w:val="false"/>
+                <w:bCs w:val="false"/>
+                <w:color w:val="1D2D3E"/>
+                <w:sz w:val="20"/>
+                <w:szCs w:val="20"/>
+              </w:rPr>
+              <w:t xml:space="preserve">Session 59</w:t>
+            </w:r>
+          </w:p>
+        </w:tc>
+        <w:tc>
+          <w:p>
+            <w:pPr>
+              <w:spacing w:after="40" w:before="40"/>
+            </w:pPr>
+            <w:r>
+              <w:rPr>
+                <w:b w:val="false"/>
+                <w:bCs w:val="false"/>
+                <w:color w:val="1D2D3E"/>
+                <w:sz w:val="20"/>
+                <w:szCs w:val="20"/>
+              </w:rPr>
+              <w:t xml:space="preserve">Inventory ItemLedger warehouse filter — optional warehouse_id/name params; fetchStockLedger filtered; GroupedStockCard sub-rows navigate per-warehouse</w:t>
+            </w:r>
+          </w:p>
+        </w:tc>
+        <w:tc>
+          <w:p>
+            <w:pPr>
+              <w:spacing w:after="40" w:before="40"/>
+            </w:pPr>
+            <w:r>
+              <w:rPr>
+                <w:b w:val="false"/>
+                <w:bCs w:val="false"/>
+                <w:color w:val="1D2D3E"/>
+                <w:sz w:val="20"/>
+                <w:szCs w:val="20"/>
+              </w:rPr>
+              <w:t xml:space="preserve">Done</w:t>
+            </w:r>
+          </w:p>
+        </w:tc>
+        <w:tc>
+          <w:p>
+            <w:pPr>
+              <w:spacing w:after="40" w:before="40"/>
+            </w:pPr>
+            <w:r>
+              <w:rPr>
+                <w:b w:val="false"/>
+                <w:bCs w:val="false"/>
+                <w:color w:val="1D2D3E"/>
+                <w:sz w:val="20"/>
+                <w:szCs w:val="20"/>
+              </w:rPr>
+              <w:t xml:space="preserve">InventoryScreen.tsx + ItemLedgerScreen.tsx</w:t>
+            </w:r>
+          </w:p>
+        </w:tc>
+      </w:tr>
+      <w:tr>
+        <w:tc>
+          <w:tcPr>
+            <w:shd w:color="F0F4F8" w:val="solid"/>
+          </w:tcPr>
+          <w:p>
+            <w:pPr>
+              <w:spacing w:after="40" w:before="40"/>
+            </w:pPr>
+            <w:r>
+              <w:rPr>
+                <w:b w:val="false"/>
+                <w:bCs w:val="false"/>
+                <w:color w:val="1D2D3E"/>
+                <w:sz w:val="20"/>
+                <w:szCs w:val="20"/>
+              </w:rPr>
+              <w:t xml:space="preserve">Session 59</w:t>
+            </w:r>
+          </w:p>
+        </w:tc>
+        <w:tc>
+          <w:tcPr>
+            <w:shd w:color="F0F4F8" w:val="solid"/>
+          </w:tcPr>
+          <w:p>
+            <w:pPr>
+              <w:spacing w:after="40" w:before="40"/>
+            </w:pPr>
+            <w:r>
+              <w:rPr>
+                <w:b w:val="false"/>
+                <w:bCs w:val="false"/>
+                <w:color w:val="1D2D3E"/>
+                <w:sz w:val="20"/>
+                <w:szCs w:val="20"/>
+              </w:rPr>
+              <w:t xml:space="preserve">Dashboard Pending Approvals card — PendingApprovalsCard; pendingApprovalPOs/SOs in SupplyChainSnapshot; shown when draft/submitted POs exist</w:t>
+            </w:r>
+          </w:p>
+        </w:tc>
+        <w:tc>
+          <w:tcPr>
+            <w:shd w:color="F0F4F8" w:val="solid"/>
+          </w:tcPr>
+          <w:p>
+            <w:pPr>
+              <w:spacing w:after="40" w:before="40"/>
+            </w:pPr>
+            <w:r>
+              <w:rPr>
+                <w:b w:val="false"/>
+                <w:bCs w:val="false"/>
+                <w:color w:val="1D2D3E"/>
+                <w:sz w:val="20"/>
+                <w:szCs w:val="20"/>
+              </w:rPr>
+              <w:t xml:space="preserve">Done</w:t>
+            </w:r>
+          </w:p>
+        </w:tc>
+        <w:tc>
+          <w:tcPr>
+            <w:shd w:color="F0F4F8" w:val="solid"/>
+          </w:tcPr>
+          <w:p>
+            <w:pPr>
+              <w:spacing w:after="40" w:before="40"/>
+            </w:pPr>
+            <w:r>
+              <w:rPr>
+                <w:b w:val="false"/>
+                <w:bCs w:val="false"/>
+                <w:color w:val="1D2D3E"/>
+                <w:sz w:val="20"/>
+                <w:szCs w:val="20"/>
+              </w:rPr>
+              <w:t xml:space="preserve">DashboardScreen.tsx + dashboard.ts</w:t>
+            </w:r>
+          </w:p>
+        </w:tc>
+      </w:tr>
     </w:tbl>
     <w:p>
       <w:pPr>
@@ -38550,6 +39135,249 @@
           <w:szCs w:val="22"/>
         </w:rPr>
         <w:t xml:space="preserve">  Shows: N vouchers · Dr X · Cr X with dividers; check-circle/alert-circle balance-check icon</w:t>
+      </w:r>
+    </w:p>
+    <w:p>
+      <w:pPr>
+        <w:spacing w:after="80"/>
+      </w:pPr>
+      <w:r>
+        <w:rPr>
+          <w:color w:val="1D2D3E"/>
+          <w:sz w:val="22"/>
+          <w:szCs w:val="22"/>
+        </w:rPr>
+        <w:t xml:space="preserve"/>
+      </w:r>
+    </w:p>
+    <w:p>
+      <w:pPr>
+        <w:pStyle w:val="Heading2"/>
+        <w:spacing w:after="120" w:before="300"/>
+      </w:pPr>
+      <w:r>
+        <w:rPr>
+          <w:b/>
+          <w:bCs/>
+          <w:color w:val="1D2D3E"/>
+        </w:rPr>
+        <w:t xml:space="preserve">Session 59 — 2026-06-11</w:t>
+      </w:r>
+    </w:p>
+    <w:p>
+      <w:pPr>
+        <w:pStyle w:val="ListParagraph"/>
+        <w:numPr>
+          <w:ilvl w:val="0"/>
+          <w:numId w:val="1"/>
+        </w:numPr>
+        <w:spacing w:after="40"/>
+      </w:pPr>
+      <w:r>
+        <w:rPr>
+          <w:color w:val="1D2D3E"/>
+          <w:sz w:val="22"/>
+          <w:szCs w:val="22"/>
+        </w:rPr>
+        <w:t xml:space="preserve">JournalEntries Per-Account Running Balance (JournalEntriesScreen.tsx)</w:t>
+      </w:r>
+    </w:p>
+    <w:p>
+      <w:pPr>
+        <w:pStyle w:val="ListParagraph"/>
+        <w:numPr>
+          <w:ilvl w:val="1"/>
+          <w:numId w:val="1"/>
+        </w:numPr>
+        <w:spacing w:after="40"/>
+      </w:pPr>
+      <w:r>
+        <w:rPr>
+          <w:color w:val="1D2D3E"/>
+          <w:sz w:val="22"/>
+          <w:szCs w:val="22"/>
+        </w:rPr>
+        <w:t xml:space="preserve">  filteredWithBalance useMemo: when pickedAccount active, sort chronologically + accumulate Dr−Cr</w:t>
+      </w:r>
+    </w:p>
+    <w:p>
+      <w:pPr>
+        <w:pStyle w:val="ListParagraph"/>
+        <w:numPr>
+          <w:ilvl w:val="1"/>
+          <w:numId w:val="1"/>
+        </w:numPr>
+        <w:spacing w:after="40"/>
+      </w:pPr>
+      <w:r>
+        <w:rPr>
+          <w:color w:val="1D2D3E"/>
+          <w:sz w:val="22"/>
+          <w:szCs w:val="22"/>
+        </w:rPr>
+        <w:t xml:space="preserve">  JECard: optional runningBalance prop → third 'Balance' column; sign-aware '−' prefix; muted negative colour</w:t>
+      </w:r>
+    </w:p>
+    <w:p>
+      <w:pPr>
+        <w:pStyle w:val="ListParagraph"/>
+        <w:numPr>
+          <w:ilvl w:val="1"/>
+          <w:numId w:val="1"/>
+        </w:numPr>
+        <w:spacing w:after="40"/>
+      </w:pPr>
+      <w:r>
+        <w:rPr>
+          <w:color w:val="1D2D3E"/>
+          <w:sz w:val="22"/>
+          <w:szCs w:val="22"/>
+        </w:rPr>
+        <w:t xml:space="preserve">  Footer row with lines-hint + chevron moved below amount row when balance column present</w:t>
+      </w:r>
+    </w:p>
+    <w:p>
+      <w:pPr>
+        <w:pStyle w:val="ListParagraph"/>
+        <w:numPr>
+          <w:ilvl w:val="0"/>
+          <w:numId w:val="1"/>
+        </w:numPr>
+        <w:spacing w:after="40"/>
+      </w:pPr>
+      <w:r>
+        <w:rPr>
+          <w:color w:val="1D2D3E"/>
+          <w:sz w:val="22"/>
+          <w:szCs w:val="22"/>
+        </w:rPr>
+        <w:t xml:space="preserve">Inventory ItemLedger Warehouse Filter (InventoryScreen.tsx, ItemLedgerScreen.tsx, InventoryNavigator.tsx)</w:t>
+      </w:r>
+    </w:p>
+    <w:p>
+      <w:pPr>
+        <w:pStyle w:val="ListParagraph"/>
+        <w:numPr>
+          <w:ilvl w:val="1"/>
+          <w:numId w:val="1"/>
+        </w:numPr>
+        <w:spacing w:after="40"/>
+      </w:pPr>
+      <w:r>
+        <w:rPr>
+          <w:color w:val="1D2D3E"/>
+          <w:sz w:val="22"/>
+          <w:szCs w:val="22"/>
+        </w:rPr>
+        <w:t xml:space="preserve">  InventoryStackParamList.ItemLedger: optional warehouse_id + warehouse_name params</w:t>
+      </w:r>
+    </w:p>
+    <w:p>
+      <w:pPr>
+        <w:pStyle w:val="ListParagraph"/>
+        <w:numPr>
+          <w:ilvl w:val="1"/>
+          <w:numId w:val="1"/>
+        </w:numPr>
+        <w:spacing w:after="40"/>
+      </w:pPr>
+      <w:r>
+        <w:rPr>
+          <w:color w:val="1D2D3E"/>
+          <w:sz w:val="22"/>
+          <w:szCs w:val="22"/>
+        </w:rPr>
+        <w:t xml:space="preserve">  ItemLedgerScreen passes warehouseId to fetchStockLedger; header shows map-pin + warehouse chip</w:t>
+      </w:r>
+    </w:p>
+    <w:p>
+      <w:pPr>
+        <w:pStyle w:val="ListParagraph"/>
+        <w:numPr>
+          <w:ilvl w:val="1"/>
+          <w:numId w:val="1"/>
+        </w:numPr>
+        <w:spacing w:after="40"/>
+      </w:pPr>
+      <w:r>
+        <w:rPr>
+          <w:color w:val="1D2D3E"/>
+          <w:sz w:val="22"/>
+          <w:szCs w:val="22"/>
+        </w:rPr>
+        <w:t xml:space="preserve">  GroupedStockCard onNavigateWarehouse prop; accordion sub-rows use per-warehouse nav when wh.warehouse_id set</w:t>
+      </w:r>
+    </w:p>
+    <w:p>
+      <w:pPr>
+        <w:pStyle w:val="ListParagraph"/>
+        <w:numPr>
+          <w:ilvl w:val="0"/>
+          <w:numId w:val="1"/>
+        </w:numPr>
+        <w:spacing w:after="40"/>
+      </w:pPr>
+      <w:r>
+        <w:rPr>
+          <w:color w:val="1D2D3E"/>
+          <w:sz w:val="22"/>
+          <w:szCs w:val="22"/>
+        </w:rPr>
+        <w:t xml:space="preserve">Dashboard Pending Approvals Card (DashboardScreen.tsx, dashboard.ts)</w:t>
+      </w:r>
+    </w:p>
+    <w:p>
+      <w:pPr>
+        <w:pStyle w:val="ListParagraph"/>
+        <w:numPr>
+          <w:ilvl w:val="1"/>
+          <w:numId w:val="1"/>
+        </w:numPr>
+        <w:spacing w:after="40"/>
+      </w:pPr>
+      <w:r>
+        <w:rPr>
+          <w:color w:val="1D2D3E"/>
+          <w:sz w:val="22"/>
+          <w:szCs w:val="22"/>
+        </w:rPr>
+        <w:t xml:space="preserve">  SupplyChainSnapshot gains pendingApprovalPOs/SOs; computed from status in {draft,submitted,pending}</w:t>
+      </w:r>
+    </w:p>
+    <w:p>
+      <w:pPr>
+        <w:pStyle w:val="ListParagraph"/>
+        <w:numPr>
+          <w:ilvl w:val="1"/>
+          <w:numId w:val="1"/>
+        </w:numPr>
+        <w:spacing w:after="40"/>
+      </w:pPr>
+      <w:r>
+        <w:rPr>
+          <w:color w:val="1D2D3E"/>
+          <w:sz w:val="22"/>
+          <w:szCs w:val="22"/>
+        </w:rPr>
+        <w:t xml:space="preserve">  PendingApprovalsCard: clock icon, total badge, tappable PO/SO tiles, italic hint text</w:t>
+      </w:r>
+    </w:p>
+    <w:p>
+      <w:pPr>
+        <w:pStyle w:val="ListParagraph"/>
+        <w:numPr>
+          <w:ilvl w:val="1"/>
+          <w:numId w:val="1"/>
+        </w:numPr>
+        <w:spacing w:after="40"/>
+      </w:pPr>
+      <w:r>
+        <w:rPr>
+          <w:color w:val="1D2D3E"/>
+          <w:sz w:val="22"/>
+          <w:szCs w:val="22"/>
+        </w:rPr>
+        <w:t xml:space="preserve">  Shown between Supply Chain row and Upcoming Deliveries when count &gt; 0</w:t>
       </w:r>
     </w:p>
     <w:p>

</xml_diff>

<commit_message>
docs(session-60): update PROGRESS.md, generate-docs.js, and FEATURES.docx with Session 60 changelog
- PROGRESS.md: Session 60 block with all 4 features documented
- generate-docs.js: sections 3.107–3.110, roadmap rows, changelog entry
- FEATURES.docx: regenerated
</commit_message>
<xml_diff>
--- a/FEATURES.docx
+++ b/FEATURES.docx
@@ -15321,6 +15321,510 @@
           <w:bCs/>
           <w:color w:val="1D2D3E"/>
         </w:rPr>
+        <w:t xml:space="preserve">3.107 ItemLedger Computed Running Balance (Session 60)</w:t>
+      </w:r>
+    </w:p>
+    <w:p>
+      <w:pPr>
+        <w:pStyle w:val="ListParagraph"/>
+        <w:numPr>
+          <w:ilvl w:val="0"/>
+          <w:numId w:val="1"/>
+        </w:numPr>
+        <w:spacing w:after="40"/>
+      </w:pPr>
+      <w:r>
+        <w:rPr>
+          <w:color w:val="1D2D3E"/>
+          <w:sz w:val="22"/>
+          <w:szCs w:val="22"/>
+        </w:rPr>
+        <w:t xml:space="preserve">When all ledger entries have null balance (API doesn't provide it), compute running balance client-side</w:t>
+      </w:r>
+    </w:p>
+    <w:p>
+      <w:pPr>
+        <w:pStyle w:val="ListParagraph"/>
+        <w:numPr>
+          <w:ilvl w:val="0"/>
+          <w:numId w:val="1"/>
+        </w:numPr>
+        <w:spacing w:after="40"/>
+      </w:pPr>
+      <w:r>
+        <w:rPr>
+          <w:color w:val="1D2D3E"/>
+          <w:sz w:val="22"/>
+          <w:szCs w:val="22"/>
+        </w:rPr>
+        <w:t xml:space="preserve">Entries sorted chronologically, cumulative qty_in − qty_out accumulated as computedBalance</w:t>
+      </w:r>
+    </w:p>
+    <w:p>
+      <w:pPr>
+        <w:pStyle w:val="ListParagraph"/>
+        <w:numPr>
+          <w:ilvl w:val="0"/>
+          <w:numId w:val="1"/>
+        </w:numPr>
+        <w:spacing w:after="40"/>
+      </w:pPr>
+      <w:r>
+        <w:rPr>
+          <w:color w:val="1D2D3E"/>
+          <w:sz w:val="22"/>
+          <w:szCs w:val="22"/>
+        </w:rPr>
+        <w:t xml:space="preserve">LedgerCard gains computedBalance prop; displays as ~BAL with italic/muted style to signal it's estimated</w:t>
+      </w:r>
+    </w:p>
+    <w:p>
+      <w:pPr>
+        <w:pStyle w:val="ListParagraph"/>
+        <w:numPr>
+          <w:ilvl w:val="0"/>
+          <w:numId w:val="1"/>
+        </w:numPr>
+        <w:spacing w:after="40"/>
+      </w:pPr>
+      <w:r>
+        <w:rPr>
+          <w:color w:val="1D2D3E"/>
+          <w:sz w:val="22"/>
+          <w:szCs w:val="22"/>
+        </w:rPr>
+        <w:t xml:space="preserve">latestBalance in summary bar uses computed value as fallback when entry.balance is null</w:t>
+      </w:r>
+    </w:p>
+    <w:p>
+      <w:pPr>
+        <w:pStyle w:val="ListParagraph"/>
+        <w:numPr>
+          <w:ilvl w:val="0"/>
+          <w:numId w:val="1"/>
+        </w:numPr>
+        <w:spacing w:after="40"/>
+      </w:pPr>
+      <w:r>
+        <w:rPr>
+          <w:color w:val="1D2D3E"/>
+          <w:sz w:val="22"/>
+          <w:szCs w:val="22"/>
+        </w:rPr>
+        <w:t xml:space="preserve">If any entry has API-provided balance, computed balance is not applied (API data takes priority)</w:t>
+      </w:r>
+    </w:p>
+    <w:p>
+      <w:pPr>
+        <w:spacing w:after="80"/>
+      </w:pPr>
+      <w:r>
+        <w:rPr>
+          <w:color w:val="1D2D3E"/>
+          <w:sz w:val="22"/>
+          <w:szCs w:val="22"/>
+        </w:rPr>
+        <w:t xml:space="preserve"/>
+      </w:r>
+    </w:p>
+    <w:p>
+      <w:pPr>
+        <w:pStyle w:val="Heading2"/>
+        <w:spacing w:after="120" w:before="300"/>
+      </w:pPr>
+      <w:r>
+        <w:rPr>
+          <w:b/>
+          <w:bCs/>
+          <w:color w:val="1D2D3E"/>
+        </w:rPr>
+        <w:t xml:space="preserve">3.108 JournalEntries Zero-Crossing Highlight (Session 60)</w:t>
+      </w:r>
+    </w:p>
+    <w:p>
+      <w:pPr>
+        <w:pStyle w:val="ListParagraph"/>
+        <w:numPr>
+          <w:ilvl w:val="0"/>
+          <w:numId w:val="1"/>
+        </w:numPr>
+        <w:spacing w:after="40"/>
+      </w:pPr>
+      <w:r>
+        <w:rPr>
+          <w:color w:val="1D2D3E"/>
+          <w:sz w:val="22"/>
+          <w:szCs w:val="22"/>
+        </w:rPr>
+        <w:t xml:space="preserve">zeroCrossingIdx useMemo: scans filteredWithBalance for first index where running balance sign flips</w:t>
+      </w:r>
+    </w:p>
+    <w:p>
+      <w:pPr>
+        <w:pStyle w:val="ListParagraph"/>
+        <w:numPr>
+          <w:ilvl w:val="0"/>
+          <w:numId w:val="1"/>
+        </w:numPr>
+        <w:spacing w:after="40"/>
+      </w:pPr>
+      <w:r>
+        <w:rPr>
+          <w:color w:val="1D2D3E"/>
+          <w:sz w:val="22"/>
+          <w:szCs w:val="22"/>
+        </w:rPr>
+        <w:t xml:space="preserve">Detects positive→negative OR negative→positive transitions in the chronologically sorted list</w:t>
+      </w:r>
+    </w:p>
+    <w:p>
+      <w:pPr>
+        <w:pStyle w:val="ListParagraph"/>
+        <w:numPr>
+          <w:ilvl w:val="0"/>
+          <w:numId w:val="1"/>
+        </w:numPr>
+        <w:spacing w:after="40"/>
+      </w:pPr>
+      <w:r>
+        <w:rPr>
+          <w:color w:val="1D2D3E"/>
+          <w:sz w:val="22"/>
+          <w:szCs w:val="22"/>
+        </w:rPr>
+        <w:t xml:space="preserve">Renders a hairline divider row with shuffle icon + 'balance crosses zero' italic label at the crossing point</w:t>
+      </w:r>
+    </w:p>
+    <w:p>
+      <w:pPr>
+        <w:pStyle w:val="ListParagraph"/>
+        <w:numPr>
+          <w:ilvl w:val="0"/>
+          <w:numId w:val="1"/>
+        </w:numPr>
+        <w:spacing w:after="40"/>
+      </w:pPr>
+      <w:r>
+        <w:rPr>
+          <w:color w:val="1D2D3E"/>
+          <w:sz w:val="22"/>
+          <w:szCs w:val="22"/>
+        </w:rPr>
+        <w:t xml:space="preserve">Marker rendered via React.Fragment wrapping, inserted between the two adjacent JECard entries</w:t>
+      </w:r>
+    </w:p>
+    <w:p>
+      <w:pPr>
+        <w:pStyle w:val="ListParagraph"/>
+        <w:numPr>
+          <w:ilvl w:val="0"/>
+          <w:numId w:val="1"/>
+        </w:numPr>
+        <w:spacing w:after="40"/>
+      </w:pPr>
+      <w:r>
+        <w:rPr>
+          <w:color w:val="1D2D3E"/>
+          <w:sz w:val="22"/>
+          <w:szCs w:val="22"/>
+        </w:rPr>
+        <w:t xml:space="preserve">Styles: zeroCrossMarker (row), zeroCrossLine (flex hairline), zeroCrossText (italic muted)</w:t>
+      </w:r>
+    </w:p>
+    <w:p>
+      <w:pPr>
+        <w:spacing w:after="80"/>
+      </w:pPr>
+      <w:r>
+        <w:rPr>
+          <w:color w:val="1D2D3E"/>
+          <w:sz w:val="22"/>
+          <w:szCs w:val="22"/>
+        </w:rPr>
+        <w:t xml:space="preserve"/>
+      </w:r>
+    </w:p>
+    <w:p>
+      <w:pPr>
+        <w:pStyle w:val="Heading2"/>
+        <w:spacing w:after="120" w:before="300"/>
+      </w:pPr>
+      <w:r>
+        <w:rPr>
+          <w:b/>
+          <w:bCs/>
+          <w:color w:val="1D2D3E"/>
+        </w:rPr>
+        <w:t xml:space="preserve">3.109 Dashboard Today's Activity Card (Session 60)</w:t>
+      </w:r>
+    </w:p>
+    <w:p>
+      <w:pPr>
+        <w:pStyle w:val="ListParagraph"/>
+        <w:numPr>
+          <w:ilvl w:val="0"/>
+          <w:numId w:val="1"/>
+        </w:numPr>
+        <w:spacing w:after="40"/>
+      </w:pPr>
+      <w:r>
+        <w:rPr>
+          <w:color w:val="1D2D3E"/>
+          <w:sz w:val="22"/>
+          <w:szCs w:val="22"/>
+        </w:rPr>
+        <w:t xml:space="preserve">computeTodayActivity(vouchers): filters recent vouchers by today's ISO date prefix; groups by voucher type</w:t>
+      </w:r>
+    </w:p>
+    <w:p>
+      <w:pPr>
+        <w:pStyle w:val="ListParagraph"/>
+        <w:numPr>
+          <w:ilvl w:val="0"/>
+          <w:numId w:val="1"/>
+        </w:numPr>
+        <w:spacing w:after="40"/>
+      </w:pPr>
+      <w:r>
+        <w:rPr>
+          <w:color w:val="1D2D3E"/>
+          <w:sz w:val="22"/>
+          <w:szCs w:val="22"/>
+        </w:rPr>
+        <w:t xml:space="preserve">Returns TodayActivity { count, totalAmount, byType[] } or null when no vouchers today</w:t>
+      </w:r>
+    </w:p>
+    <w:p>
+      <w:pPr>
+        <w:pStyle w:val="ListParagraph"/>
+        <w:numPr>
+          <w:ilvl w:val="0"/>
+          <w:numId w:val="1"/>
+        </w:numPr>
+        <w:spacing w:after="40"/>
+      </w:pPr>
+      <w:r>
+        <w:rPr>
+          <w:color w:val="1D2D3E"/>
+          <w:sz w:val="22"/>
+          <w:szCs w:val="22"/>
+        </w:rPr>
+        <w:t xml:space="preserve">TodayActivityCard: header row with count + total amount; per-type proportional bar rows with badge + fill + count</w:t>
+      </w:r>
+    </w:p>
+    <w:p>
+      <w:pPr>
+        <w:pStyle w:val="ListParagraph"/>
+        <w:numPr>
+          <w:ilvl w:val="0"/>
+          <w:numId w:val="1"/>
+        </w:numPr>
+        <w:spacing w:after="40"/>
+      </w:pPr>
+      <w:r>
+        <w:rPr>
+          <w:color w:val="1D2D3E"/>
+          <w:sz w:val="22"/>
+          <w:szCs w:val="22"/>
+        </w:rPr>
+        <w:t xml:space="preserve">Bar width = (type.count / maxCount) × 100% for visual proportion across types</w:t>
+      </w:r>
+    </w:p>
+    <w:p>
+      <w:pPr>
+        <w:pStyle w:val="ListParagraph"/>
+        <w:numPr>
+          <w:ilvl w:val="0"/>
+          <w:numId w:val="1"/>
+        </w:numPr>
+        <w:spacing w:after="40"/>
+      </w:pPr>
+      <w:r>
+        <w:rPr>
+          <w:color w:val="1D2D3E"/>
+          <w:sz w:val="22"/>
+          <w:szCs w:val="22"/>
+        </w:rPr>
+        <w:t xml:space="preserve">Rendered in 'Today's Activity' section above Week Activity when todayActivity is non-null</w:t>
+      </w:r>
+    </w:p>
+    <w:p>
+      <w:pPr>
+        <w:spacing w:after="80"/>
+      </w:pPr>
+      <w:r>
+        <w:rPr>
+          <w:color w:val="1D2D3E"/>
+          <w:sz w:val="22"/>
+          <w:szCs w:val="22"/>
+        </w:rPr>
+        <w:t xml:space="preserve"/>
+      </w:r>
+    </w:p>
+    <w:p>
+      <w:pPr>
+        <w:pStyle w:val="Heading2"/>
+        <w:spacing w:after="120" w:before="300"/>
+      </w:pPr>
+      <w:r>
+        <w:rPr>
+          <w:b/>
+          <w:bCs/>
+          <w:color w:val="1D2D3E"/>
+        </w:rPr>
+        <w:t xml:space="preserve">3.110 FinancialAnalytics AgingHistoryChart Interactive Dots (Session 60)</w:t>
+      </w:r>
+    </w:p>
+    <w:p>
+      <w:pPr>
+        <w:pStyle w:val="ListParagraph"/>
+        <w:numPr>
+          <w:ilvl w:val="0"/>
+          <w:numId w:val="1"/>
+        </w:numPr>
+        <w:spacing w:after="40"/>
+      </w:pPr>
+      <w:r>
+        <w:rPr>
+          <w:color w:val="1D2D3E"/>
+          <w:sz w:val="22"/>
+          <w:szCs w:val="22"/>
+        </w:rPr>
+        <w:t xml:space="preserve">AgingHistoryPolylines gains selectedIdx + onSelectIdx props for controlled selection state</w:t>
+      </w:r>
+    </w:p>
+    <w:p>
+      <w:pPr>
+        <w:pStyle w:val="ListParagraph"/>
+        <w:numPr>
+          <w:ilvl w:val="0"/>
+          <w:numId w:val="1"/>
+        </w:numPr>
+        <w:spacing w:after="40"/>
+      </w:pPr>
+      <w:r>
+        <w:rPr>
+          <w:color w:val="1D2D3E"/>
+          <w:sz w:val="22"/>
+          <w:szCs w:val="22"/>
+        </w:rPr>
+        <w:t xml:space="preserve">Dots replaced with TouchableOpacity (hitSlop ±12/10px) for easy mobile tapping</w:t>
+      </w:r>
+    </w:p>
+    <w:p>
+      <w:pPr>
+        <w:pStyle w:val="ListParagraph"/>
+        <w:numPr>
+          <w:ilvl w:val="0"/>
+          <w:numId w:val="1"/>
+        </w:numPr>
+        <w:spacing w:after="40"/>
+      </w:pPr>
+      <w:r>
+        <w:rPr>
+          <w:color w:val="1D2D3E"/>
+          <w:sz w:val="22"/>
+          <w:szCs w:val="22"/>
+        </w:rPr>
+        <w:t xml:space="preserve">Selected dot renders larger (r+2) with 2px border ring; toggles on/off by tapping same dot</w:t>
+      </w:r>
+    </w:p>
+    <w:p>
+      <w:pPr>
+        <w:pStyle w:val="ListParagraph"/>
+        <w:numPr>
+          <w:ilvl w:val="0"/>
+          <w:numId w:val="1"/>
+        </w:numPr>
+        <w:spacing w:after="40"/>
+      </w:pPr>
+      <w:r>
+        <w:rPr>
+          <w:color w:val="1D2D3E"/>
+          <w:sz w:val="22"/>
+          <w:szCs w:val="22"/>
+        </w:rPr>
+        <w:t xml:space="preserve">Vertical cursor hairline drawn at selected x-position across chart height</w:t>
+      </w:r>
+    </w:p>
+    <w:p>
+      <w:pPr>
+        <w:pStyle w:val="ListParagraph"/>
+        <w:numPr>
+          <w:ilvl w:val="0"/>
+          <w:numId w:val="1"/>
+        </w:numPr>
+        <w:spacing w:after="40"/>
+      </w:pPr>
+      <w:r>
+        <w:rPr>
+          <w:color w:val="1D2D3E"/>
+          <w:sz w:val="22"/>
+          <w:szCs w:val="22"/>
+        </w:rPr>
+        <w:t xml:space="preserve">AgingHistoryChart: selectedIdx state; snapRow shown when selection active — AP/AR/NWC tiles + 90d+ column</w:t>
+      </w:r>
+    </w:p>
+    <w:p>
+      <w:pPr>
+        <w:pStyle w:val="ListParagraph"/>
+        <w:numPr>
+          <w:ilvl w:val="0"/>
+          <w:numId w:val="1"/>
+        </w:numPr>
+        <w:spacing w:after="40"/>
+      </w:pPr>
+      <w:r>
+        <w:rPr>
+          <w:color w:val="1D2D3E"/>
+          <w:sz w:val="22"/>
+          <w:szCs w:val="22"/>
+        </w:rPr>
+        <w:t xml:space="preserve">Legend meta switches: '{N} days · tap dot' (default) → selected date when a point is active</w:t>
+      </w:r>
+    </w:p>
+    <w:p>
+      <w:pPr>
+        <w:pStyle w:val="ListParagraph"/>
+        <w:numPr>
+          <w:ilvl w:val="0"/>
+          <w:numId w:val="1"/>
+        </w:numPr>
+        <w:spacing w:after="40"/>
+      </w:pPr>
+      <w:r>
+        <w:rPr>
+          <w:color w:val="1D2D3E"/>
+          <w:sz w:val="22"/>
+          <w:szCs w:val="22"/>
+        </w:rPr>
+        <w:t xml:space="preserve">NWC tile styled muted when AR &lt; AP (negative working capital)</w:t>
+      </w:r>
+    </w:p>
+    <w:p>
+      <w:pPr>
+        <w:spacing w:after="80"/>
+      </w:pPr>
+      <w:r>
+        <w:rPr>
+          <w:color w:val="1D2D3E"/>
+          <w:sz w:val="22"/>
+          <w:szCs w:val="22"/>
+        </w:rPr>
+        <w:t xml:space="preserve"/>
+      </w:r>
+    </w:p>
+    <w:p>
+      <w:pPr>
+        <w:pStyle w:val="Heading2"/>
+        <w:spacing w:after="120" w:before="300"/>
+      </w:pPr>
+      <w:r>
+        <w:rPr>
+          <w:b/>
+          <w:bCs/>
+          <w:color w:val="1D2D3E"/>
+        </w:rPr>
         <w:t xml:space="preserve">3.104 JournalEntries Per-Account Running Balance (Session 59)</w:t>
       </w:r>
     </w:p>
@@ -33828,6 +34332,310 @@
           </w:p>
         </w:tc>
       </w:tr>
+      <w:tr>
+        <w:tc>
+          <w:p>
+            <w:pPr>
+              <w:spacing w:after="40" w:before="40"/>
+            </w:pPr>
+            <w:r>
+              <w:rPr>
+                <w:b w:val="false"/>
+                <w:bCs w:val="false"/>
+                <w:color w:val="1D2D3E"/>
+                <w:sz w:val="20"/>
+                <w:szCs w:val="20"/>
+              </w:rPr>
+              <w:t xml:space="preserve">Session 60</w:t>
+            </w:r>
+          </w:p>
+        </w:tc>
+        <w:tc>
+          <w:p>
+            <w:pPr>
+              <w:spacing w:after="40" w:before="40"/>
+            </w:pPr>
+            <w:r>
+              <w:rPr>
+                <w:b w:val="false"/>
+                <w:bCs w:val="false"/>
+                <w:color w:val="1D2D3E"/>
+                <w:sz w:val="20"/>
+                <w:szCs w:val="20"/>
+              </w:rPr>
+              <w:t xml:space="preserve">ItemLedger computed running balance — when API returns no balance fields, compute cumulative qty_in−qty_out; show as ~BAL italic</w:t>
+            </w:r>
+          </w:p>
+        </w:tc>
+        <w:tc>
+          <w:p>
+            <w:pPr>
+              <w:spacing w:after="40" w:before="40"/>
+            </w:pPr>
+            <w:r>
+              <w:rPr>
+                <w:b w:val="false"/>
+                <w:bCs w:val="false"/>
+                <w:color w:val="1D2D3E"/>
+                <w:sz w:val="20"/>
+                <w:szCs w:val="20"/>
+              </w:rPr>
+              <w:t xml:space="preserve">Done</w:t>
+            </w:r>
+          </w:p>
+        </w:tc>
+        <w:tc>
+          <w:p>
+            <w:pPr>
+              <w:spacing w:after="40" w:before="40"/>
+            </w:pPr>
+            <w:r>
+              <w:rPr>
+                <w:b w:val="false"/>
+                <w:bCs w:val="false"/>
+                <w:color w:val="1D2D3E"/>
+                <w:sz w:val="20"/>
+                <w:szCs w:val="20"/>
+              </w:rPr>
+              <w:t xml:space="preserve">ItemLedgerScreen.tsx</w:t>
+            </w:r>
+          </w:p>
+        </w:tc>
+      </w:tr>
+      <w:tr>
+        <w:tc>
+          <w:tcPr>
+            <w:shd w:color="F0F4F8" w:val="solid"/>
+          </w:tcPr>
+          <w:p>
+            <w:pPr>
+              <w:spacing w:after="40" w:before="40"/>
+            </w:pPr>
+            <w:r>
+              <w:rPr>
+                <w:b w:val="false"/>
+                <w:bCs w:val="false"/>
+                <w:color w:val="1D2D3E"/>
+                <w:sz w:val="20"/>
+                <w:szCs w:val="20"/>
+              </w:rPr>
+              <w:t xml:space="preserve">Session 60</w:t>
+            </w:r>
+          </w:p>
+        </w:tc>
+        <w:tc>
+          <w:tcPr>
+            <w:shd w:color="F0F4F8" w:val="solid"/>
+          </w:tcPr>
+          <w:p>
+            <w:pPr>
+              <w:spacing w:after="40" w:before="40"/>
+            </w:pPr>
+            <w:r>
+              <w:rPr>
+                <w:b w:val="false"/>
+                <w:bCs w:val="false"/>
+                <w:color w:val="1D2D3E"/>
+                <w:sz w:val="20"/>
+                <w:szCs w:val="20"/>
+              </w:rPr>
+              <w:t xml:space="preserve">JournalEntries zero-crossing highlight — detect first sign-flip in per-account running balance; insert hairline divider marker</w:t>
+            </w:r>
+          </w:p>
+        </w:tc>
+        <w:tc>
+          <w:tcPr>
+            <w:shd w:color="F0F4F8" w:val="solid"/>
+          </w:tcPr>
+          <w:p>
+            <w:pPr>
+              <w:spacing w:after="40" w:before="40"/>
+            </w:pPr>
+            <w:r>
+              <w:rPr>
+                <w:b w:val="false"/>
+                <w:bCs w:val="false"/>
+                <w:color w:val="1D2D3E"/>
+                <w:sz w:val="20"/>
+                <w:szCs w:val="20"/>
+              </w:rPr>
+              <w:t xml:space="preserve">Done</w:t>
+            </w:r>
+          </w:p>
+        </w:tc>
+        <w:tc>
+          <w:tcPr>
+            <w:shd w:color="F0F4F8" w:val="solid"/>
+          </w:tcPr>
+          <w:p>
+            <w:pPr>
+              <w:spacing w:after="40" w:before="40"/>
+            </w:pPr>
+            <w:r>
+              <w:rPr>
+                <w:b w:val="false"/>
+                <w:bCs w:val="false"/>
+                <w:color w:val="1D2D3E"/>
+                <w:sz w:val="20"/>
+                <w:szCs w:val="20"/>
+              </w:rPr>
+              <w:t xml:space="preserve">JournalEntriesScreen.tsx</w:t>
+            </w:r>
+          </w:p>
+        </w:tc>
+      </w:tr>
+      <w:tr>
+        <w:tc>
+          <w:p>
+            <w:pPr>
+              <w:spacing w:after="40" w:before="40"/>
+            </w:pPr>
+            <w:r>
+              <w:rPr>
+                <w:b w:val="false"/>
+                <w:bCs w:val="false"/>
+                <w:color w:val="1D2D3E"/>
+                <w:sz w:val="20"/>
+                <w:szCs w:val="20"/>
+              </w:rPr>
+              <w:t xml:space="preserve">Session 60</w:t>
+            </w:r>
+          </w:p>
+        </w:tc>
+        <w:tc>
+          <w:p>
+            <w:pPr>
+              <w:spacing w:after="40" w:before="40"/>
+            </w:pPr>
+            <w:r>
+              <w:rPr>
+                <w:b w:val="false"/>
+                <w:bCs w:val="false"/>
+                <w:color w:val="1D2D3E"/>
+                <w:sz w:val="20"/>
+                <w:szCs w:val="20"/>
+              </w:rPr>
+              <w:t xml:space="preserve">Dashboard Today's Activity card — TodayActivityCard with type breakdown bars; shown when any vouchers exist for today</w:t>
+            </w:r>
+          </w:p>
+        </w:tc>
+        <w:tc>
+          <w:p>
+            <w:pPr>
+              <w:spacing w:after="40" w:before="40"/>
+            </w:pPr>
+            <w:r>
+              <w:rPr>
+                <w:b w:val="false"/>
+                <w:bCs w:val="false"/>
+                <w:color w:val="1D2D3E"/>
+                <w:sz w:val="20"/>
+                <w:szCs w:val="20"/>
+              </w:rPr>
+              <w:t xml:space="preserve">Done</w:t>
+            </w:r>
+          </w:p>
+        </w:tc>
+        <w:tc>
+          <w:p>
+            <w:pPr>
+              <w:spacing w:after="40" w:before="40"/>
+            </w:pPr>
+            <w:r>
+              <w:rPr>
+                <w:b w:val="false"/>
+                <w:bCs w:val="false"/>
+                <w:color w:val="1D2D3E"/>
+                <w:sz w:val="20"/>
+                <w:szCs w:val="20"/>
+              </w:rPr>
+              <w:t xml:space="preserve">DashboardScreen.tsx</w:t>
+            </w:r>
+          </w:p>
+        </w:tc>
+      </w:tr>
+      <w:tr>
+        <w:tc>
+          <w:tcPr>
+            <w:shd w:color="F0F4F8" w:val="solid"/>
+          </w:tcPr>
+          <w:p>
+            <w:pPr>
+              <w:spacing w:after="40" w:before="40"/>
+            </w:pPr>
+            <w:r>
+              <w:rPr>
+                <w:b w:val="false"/>
+                <w:bCs w:val="false"/>
+                <w:color w:val="1D2D3E"/>
+                <w:sz w:val="20"/>
+                <w:szCs w:val="20"/>
+              </w:rPr>
+              <w:t xml:space="preserve">Session 60</w:t>
+            </w:r>
+          </w:p>
+        </w:tc>
+        <w:tc>
+          <w:tcPr>
+            <w:shd w:color="F0F4F8" w:val="solid"/>
+          </w:tcPr>
+          <w:p>
+            <w:pPr>
+              <w:spacing w:after="40" w:before="40"/>
+            </w:pPr>
+            <w:r>
+              <w:rPr>
+                <w:b w:val="false"/>
+                <w:bCs w:val="false"/>
+                <w:color w:val="1D2D3E"/>
+                <w:sz w:val="20"/>
+                <w:szCs w:val="20"/>
+              </w:rPr>
+              <w:t xml:space="preserve">FinancialAnalytics AgingHistoryChart interactive dots — tap dot to see snapshot; selectedIdx state; snapRow tiles; vertical cursor</w:t>
+            </w:r>
+          </w:p>
+        </w:tc>
+        <w:tc>
+          <w:tcPr>
+            <w:shd w:color="F0F4F8" w:val="solid"/>
+          </w:tcPr>
+          <w:p>
+            <w:pPr>
+              <w:spacing w:after="40" w:before="40"/>
+            </w:pPr>
+            <w:r>
+              <w:rPr>
+                <w:b w:val="false"/>
+                <w:bCs w:val="false"/>
+                <w:color w:val="1D2D3E"/>
+                <w:sz w:val="20"/>
+                <w:szCs w:val="20"/>
+              </w:rPr>
+              <w:t xml:space="preserve">Done</w:t>
+            </w:r>
+          </w:p>
+        </w:tc>
+        <w:tc>
+          <w:tcPr>
+            <w:shd w:color="F0F4F8" w:val="solid"/>
+          </w:tcPr>
+          <w:p>
+            <w:pPr>
+              <w:spacing w:after="40" w:before="40"/>
+            </w:pPr>
+            <w:r>
+              <w:rPr>
+                <w:b w:val="false"/>
+                <w:bCs w:val="false"/>
+                <w:color w:val="1D2D3E"/>
+                <w:sz w:val="20"/>
+                <w:szCs w:val="20"/>
+              </w:rPr>
+              <w:t xml:space="preserve">FinancialAnalyticsScreen.tsx</w:t>
+            </w:r>
+          </w:p>
+        </w:tc>
+      </w:tr>
     </w:tbl>
     <w:p>
       <w:pPr>
@@ -39135,6 +39943,303 @@
           <w:szCs w:val="22"/>
         </w:rPr>
         <w:t xml:space="preserve">  Shows: N vouchers · Dr X · Cr X with dividers; check-circle/alert-circle balance-check icon</w:t>
+      </w:r>
+    </w:p>
+    <w:p>
+      <w:pPr>
+        <w:spacing w:after="80"/>
+      </w:pPr>
+      <w:r>
+        <w:rPr>
+          <w:color w:val="1D2D3E"/>
+          <w:sz w:val="22"/>
+          <w:szCs w:val="22"/>
+        </w:rPr>
+        <w:t xml:space="preserve"/>
+      </w:r>
+    </w:p>
+    <w:p>
+      <w:pPr>
+        <w:pStyle w:val="Heading2"/>
+        <w:spacing w:after="120" w:before="300"/>
+      </w:pPr>
+      <w:r>
+        <w:rPr>
+          <w:b/>
+          <w:bCs/>
+          <w:color w:val="1D2D3E"/>
+        </w:rPr>
+        <w:t xml:space="preserve">Session 60 — 2026-06-11</w:t>
+      </w:r>
+    </w:p>
+    <w:p>
+      <w:pPr>
+        <w:pStyle w:val="ListParagraph"/>
+        <w:numPr>
+          <w:ilvl w:val="0"/>
+          <w:numId w:val="1"/>
+        </w:numPr>
+        <w:spacing w:after="40"/>
+      </w:pPr>
+      <w:r>
+        <w:rPr>
+          <w:color w:val="1D2D3E"/>
+          <w:sz w:val="22"/>
+          <w:szCs w:val="22"/>
+        </w:rPr>
+        <w:t xml:space="preserve">ItemLedger Computed Running Balance (ItemLedgerScreen.tsx)</w:t>
+      </w:r>
+    </w:p>
+    <w:p>
+      <w:pPr>
+        <w:pStyle w:val="ListParagraph"/>
+        <w:numPr>
+          <w:ilvl w:val="1"/>
+          <w:numId w:val="1"/>
+        </w:numPr>
+        <w:spacing w:after="40"/>
+      </w:pPr>
+      <w:r>
+        <w:rPr>
+          <w:color w:val="1D2D3E"/>
+          <w:sz w:val="22"/>
+          <w:szCs w:val="22"/>
+        </w:rPr>
+        <w:t xml:space="preserve">  When all entries have null balance, sort chronologically and accumulate qty_in−qty_out</w:t>
+      </w:r>
+    </w:p>
+    <w:p>
+      <w:pPr>
+        <w:pStyle w:val="ListParagraph"/>
+        <w:numPr>
+          <w:ilvl w:val="1"/>
+          <w:numId w:val="1"/>
+        </w:numPr>
+        <w:spacing w:after="40"/>
+      </w:pPr>
+      <w:r>
+        <w:rPr>
+          <w:color w:val="1D2D3E"/>
+          <w:sz w:val="22"/>
+          <w:szCs w:val="22"/>
+        </w:rPr>
+        <w:t xml:space="preserve">  LedgerCard shows ~BAL label with italic/muted style; latestBalance in summary bar uses computed fallback</w:t>
+      </w:r>
+    </w:p>
+    <w:p>
+      <w:pPr>
+        <w:pStyle w:val="ListParagraph"/>
+        <w:numPr>
+          <w:ilvl w:val="0"/>
+          <w:numId w:val="1"/>
+        </w:numPr>
+        <w:spacing w:after="40"/>
+      </w:pPr>
+      <w:r>
+        <w:rPr>
+          <w:color w:val="1D2D3E"/>
+          <w:sz w:val="22"/>
+          <w:szCs w:val="22"/>
+        </w:rPr>
+        <w:t xml:space="preserve">JournalEntries Zero-Crossing Highlight (JournalEntriesScreen.tsx)</w:t>
+      </w:r>
+    </w:p>
+    <w:p>
+      <w:pPr>
+        <w:pStyle w:val="ListParagraph"/>
+        <w:numPr>
+          <w:ilvl w:val="1"/>
+          <w:numId w:val="1"/>
+        </w:numPr>
+        <w:spacing w:after="40"/>
+      </w:pPr>
+      <w:r>
+        <w:rPr>
+          <w:color w:val="1D2D3E"/>
+          <w:sz w:val="22"/>
+          <w:szCs w:val="22"/>
+        </w:rPr>
+        <w:t xml:space="preserve">  zeroCrossingIdx: first index where running balance flips sign (pos→neg or neg→pos)</w:t>
+      </w:r>
+    </w:p>
+    <w:p>
+      <w:pPr>
+        <w:pStyle w:val="ListParagraph"/>
+        <w:numPr>
+          <w:ilvl w:val="1"/>
+          <w:numId w:val="1"/>
+        </w:numPr>
+        <w:spacing w:after="40"/>
+      </w:pPr>
+      <w:r>
+        <w:rPr>
+          <w:color w:val="1D2D3E"/>
+          <w:sz w:val="22"/>
+          <w:szCs w:val="22"/>
+        </w:rPr>
+        <w:t xml:space="preserve">  Hairline divider row with shuffle icon + 'balance crosses zero' italic label inserted between cards</w:t>
+      </w:r>
+    </w:p>
+    <w:p>
+      <w:pPr>
+        <w:pStyle w:val="ListParagraph"/>
+        <w:numPr>
+          <w:ilvl w:val="0"/>
+          <w:numId w:val="1"/>
+        </w:numPr>
+        <w:spacing w:after="40"/>
+      </w:pPr>
+      <w:r>
+        <w:rPr>
+          <w:color w:val="1D2D3E"/>
+          <w:sz w:val="22"/>
+          <w:szCs w:val="22"/>
+        </w:rPr>
+        <w:t xml:space="preserve">Dashboard Today's Activity Card (DashboardScreen.tsx)</w:t>
+      </w:r>
+    </w:p>
+    <w:p>
+      <w:pPr>
+        <w:pStyle w:val="ListParagraph"/>
+        <w:numPr>
+          <w:ilvl w:val="1"/>
+          <w:numId w:val="1"/>
+        </w:numPr>
+        <w:spacing w:after="40"/>
+      </w:pPr>
+      <w:r>
+        <w:rPr>
+          <w:color w:val="1D2D3E"/>
+          <w:sz w:val="22"/>
+          <w:szCs w:val="22"/>
+        </w:rPr>
+        <w:t xml:space="preserve">  computeTodayActivity groups today's recent vouchers by type; returns null when none</w:t>
+      </w:r>
+    </w:p>
+    <w:p>
+      <w:pPr>
+        <w:pStyle w:val="ListParagraph"/>
+        <w:numPr>
+          <w:ilvl w:val="1"/>
+          <w:numId w:val="1"/>
+        </w:numPr>
+        <w:spacing w:after="40"/>
+      </w:pPr>
+      <w:r>
+        <w:rPr>
+          <w:color w:val="1D2D3E"/>
+          <w:sz w:val="22"/>
+          <w:szCs w:val="22"/>
+        </w:rPr>
+        <w:t xml:space="preserve">  TodayActivityCard: count + total amount header + proportional type breakdown bars</w:t>
+      </w:r>
+    </w:p>
+    <w:p>
+      <w:pPr>
+        <w:pStyle w:val="ListParagraph"/>
+        <w:numPr>
+          <w:ilvl w:val="1"/>
+          <w:numId w:val="1"/>
+        </w:numPr>
+        <w:spacing w:after="40"/>
+      </w:pPr>
+      <w:r>
+        <w:rPr>
+          <w:color w:val="1D2D3E"/>
+          <w:sz w:val="22"/>
+          <w:szCs w:val="22"/>
+        </w:rPr>
+        <w:t xml:space="preserve">  Rendered in 'Today's Activity' section above Week Activity when non-null</w:t>
+      </w:r>
+    </w:p>
+    <w:p>
+      <w:pPr>
+        <w:pStyle w:val="ListParagraph"/>
+        <w:numPr>
+          <w:ilvl w:val="0"/>
+          <w:numId w:val="1"/>
+        </w:numPr>
+        <w:spacing w:after="40"/>
+      </w:pPr>
+      <w:r>
+        <w:rPr>
+          <w:color w:val="1D2D3E"/>
+          <w:sz w:val="22"/>
+          <w:szCs w:val="22"/>
+        </w:rPr>
+        <w:t xml:space="preserve">FinancialAnalytics AgingHistoryChart Interactive Dots (FinancialAnalyticsScreen.tsx)</w:t>
+      </w:r>
+    </w:p>
+    <w:p>
+      <w:pPr>
+        <w:pStyle w:val="ListParagraph"/>
+        <w:numPr>
+          <w:ilvl w:val="1"/>
+          <w:numId w:val="1"/>
+        </w:numPr>
+        <w:spacing w:after="40"/>
+      </w:pPr>
+      <w:r>
+        <w:rPr>
+          <w:color w:val="1D2D3E"/>
+          <w:sz w:val="22"/>
+          <w:szCs w:val="22"/>
+        </w:rPr>
+        <w:t xml:space="preserve">  TouchableOpacity dots with hitSlop for easy tap; selectedIdx state + onSelectIdx callback</w:t>
+      </w:r>
+    </w:p>
+    <w:p>
+      <w:pPr>
+        <w:pStyle w:val="ListParagraph"/>
+        <w:numPr>
+          <w:ilvl w:val="1"/>
+          <w:numId w:val="1"/>
+        </w:numPr>
+        <w:spacing w:after="40"/>
+      </w:pPr>
+      <w:r>
+        <w:rPr>
+          <w:color w:val="1D2D3E"/>
+          <w:sz w:val="22"/>
+          <w:szCs w:val="22"/>
+        </w:rPr>
+        <w:t xml:space="preserve">  Selected dot enlarges + 2px border; vertical cursor hairline at x-position</w:t>
+      </w:r>
+    </w:p>
+    <w:p>
+      <w:pPr>
+        <w:pStyle w:val="ListParagraph"/>
+        <w:numPr>
+          <w:ilvl w:val="1"/>
+          <w:numId w:val="1"/>
+        </w:numPr>
+        <w:spacing w:after="40"/>
+      </w:pPr>
+      <w:r>
+        <w:rPr>
+          <w:color w:val="1D2D3E"/>
+          <w:sz w:val="22"/>
+          <w:szCs w:val="22"/>
+        </w:rPr>
+        <w:t xml:space="preserve">  snapRow below chart: AP/AR/NWC tiles + 90d+ column for selected day's snapshot</w:t>
+      </w:r>
+    </w:p>
+    <w:p>
+      <w:pPr>
+        <w:pStyle w:val="ListParagraph"/>
+        <w:numPr>
+          <w:ilvl w:val="1"/>
+          <w:numId w:val="1"/>
+        </w:numPr>
+        <w:spacing w:after="40"/>
+      </w:pPr>
+      <w:r>
+        <w:rPr>
+          <w:color w:val="1D2D3E"/>
+          <w:sz w:val="22"/>
+          <w:szCs w:val="22"/>
+        </w:rPr>
+        <w:t xml:space="preserve">  Legend meta shows selected date when a point is active</w:t>
       </w:r>
     </w:p>
     <w:p>

</xml_diff>

<commit_message>
docs(session-61): update PROGRESS.md, generate-docs.js, and FEATURES.docx with Session 61 changelog
Session 61 features:
- FinancialAnalytics NWCTrendCard interactive dot tap (AP/AR/NWC/Status snapRow)
- ProcurementAnalytics ValueDistributionChart bucket tap (PO/SO/Total/PO% snapRow)
- JournalEntries multi-word AND search + JECard inline line items preview
- StockHealth threshold CSV export (Share) and paste-import modal
</commit_message>
<xml_diff>
--- a/FEATURES.docx
+++ b/FEATURES.docx
@@ -15672,6 +15672,681 @@
           <w:bCs/>
           <w:color w:val="1D2D3E"/>
         </w:rPr>
+        <w:t xml:space="preserve">3.115 StockHealth Threshold CSV Export &amp; Paste Import (Session 61)</w:t>
+      </w:r>
+    </w:p>
+    <w:p>
+      <w:pPr>
+        <w:pStyle w:val="ListParagraph"/>
+        <w:numPr>
+          <w:ilvl w:val="0"/>
+          <w:numId w:val="1"/>
+        </w:numPr>
+        <w:spacing w:after="40"/>
+      </w:pPr>
+      <w:r>
+        <w:rPr>
+          <w:color w:val="1D2D3E"/>
+          <w:sz w:val="22"/>
+          <w:szCs w:val="22"/>
+        </w:rPr>
+        <w:t xml:space="preserve">Share button in header exports all per-item thresholds as CSV via Share API</w:t>
+      </w:r>
+    </w:p>
+    <w:p>
+      <w:pPr>
+        <w:pStyle w:val="ListParagraph"/>
+        <w:numPr>
+          <w:ilvl w:val="1"/>
+          <w:numId w:val="1"/>
+        </w:numPr>
+        <w:spacing w:after="40"/>
+      </w:pPr>
+      <w:r>
+        <w:rPr>
+          <w:color w:val="1D2D3E"/>
+          <w:sz w:val="22"/>
+          <w:szCs w:val="22"/>
+        </w:rPr>
+        <w:t xml:space="preserve">  Rows sorted alphabetically; items with commas in name quoted; empty case produces '(no custom thresholds)'</w:t>
+      </w:r>
+    </w:p>
+    <w:p>
+      <w:pPr>
+        <w:pStyle w:val="ListParagraph"/>
+        <w:numPr>
+          <w:ilvl w:val="0"/>
+          <w:numId w:val="1"/>
+        </w:numPr>
+        <w:spacing w:after="40"/>
+      </w:pPr>
+      <w:r>
+        <w:rPr>
+          <w:color w:val="1D2D3E"/>
+          <w:sz w:val="22"/>
+          <w:szCs w:val="22"/>
+        </w:rPr>
+        <w:t xml:space="preserve">Upload button opens ThresholdImportModal — full-page sheet with monospace TextInput for pasting CSV</w:t>
+      </w:r>
+    </w:p>
+    <w:p>
+      <w:pPr>
+        <w:pStyle w:val="ListParagraph"/>
+        <w:numPr>
+          <w:ilvl w:val="1"/>
+          <w:numId w:val="1"/>
+        </w:numPr>
+        <w:spacing w:after="40"/>
+      </w:pPr>
+      <w:r>
+        <w:rPr>
+          <w:color w:val="1D2D3E"/>
+          <w:sz w:val="22"/>
+          <w:szCs w:val="22"/>
+        </w:rPr>
+        <w:t xml:space="preserve">  parseThresholdCSV: skips header, strips quotes, validates name + threshold ≥ 0; returns rows + errors count</w:t>
+      </w:r>
+    </w:p>
+    <w:p>
+      <w:pPr>
+        <w:pStyle w:val="ListParagraph"/>
+        <w:numPr>
+          <w:ilvl w:val="1"/>
+          <w:numId w:val="1"/>
+        </w:numPr>
+        <w:spacing w:after="40"/>
+      </w:pPr>
+      <w:r>
+        <w:rPr>
+          <w:color w:val="1D2D3E"/>
+          <w:sz w:val="22"/>
+          <w:szCs w:val="22"/>
+        </w:rPr>
+        <w:t xml:space="preserve">  Live preview row: 'N rows parsed · M errors' with check-circle / alert-circle icon</w:t>
+      </w:r>
+    </w:p>
+    <w:p>
+      <w:pPr>
+        <w:pStyle w:val="ListParagraph"/>
+        <w:numPr>
+          <w:ilvl w:val="1"/>
+          <w:numId w:val="1"/>
+        </w:numPr>
+        <w:spacing w:after="40"/>
+      </w:pPr>
+      <w:r>
+        <w:rPr>
+          <w:color w:val="1D2D3E"/>
+          <w:sz w:val="22"/>
+          <w:szCs w:val="22"/>
+        </w:rPr>
+        <w:t xml:space="preserve">  Import applies via setItemThreshold, reloads loadAllItemThresholds, recomputes stock health in-place</w:t>
+      </w:r>
+    </w:p>
+    <w:p>
+      <w:pPr>
+        <w:pStyle w:val="ListParagraph"/>
+        <w:numPr>
+          <w:ilvl w:val="1"/>
+          <w:numId w:val="1"/>
+        </w:numPr>
+        <w:spacing w:after="40"/>
+      </w:pPr>
+      <w:r>
+        <w:rPr>
+          <w:color w:val="1D2D3E"/>
+          <w:sz w:val="22"/>
+          <w:szCs w:val="22"/>
+        </w:rPr>
+        <w:t xml:space="preserve">  importStyles StyleSheet with monospace font, hint text, result feedback row</w:t>
+      </w:r>
+    </w:p>
+    <w:p>
+      <w:pPr>
+        <w:spacing w:after="80"/>
+      </w:pPr>
+      <w:r>
+        <w:rPr>
+          <w:color w:val="1D2D3E"/>
+          <w:sz w:val="22"/>
+          <w:szCs w:val="22"/>
+        </w:rPr>
+        <w:t xml:space="preserve"/>
+      </w:r>
+    </w:p>
+    <w:p>
+      <w:pPr>
+        <w:pStyle w:val="Heading2"/>
+        <w:spacing w:after="120" w:before="300"/>
+      </w:pPr>
+      <w:r>
+        <w:rPr>
+          <w:b/>
+          <w:bCs/>
+          <w:color w:val="1D2D3E"/>
+        </w:rPr>
+        <w:t xml:space="preserve">3.114 JournalEntries Inline Line Items Preview (Session 61)</w:t>
+      </w:r>
+    </w:p>
+    <w:p>
+      <w:pPr>
+        <w:pStyle w:val="ListParagraph"/>
+        <w:numPr>
+          <w:ilvl w:val="0"/>
+          <w:numId w:val="1"/>
+        </w:numPr>
+        <w:spacing w:after="40"/>
+      </w:pPr>
+      <w:r>
+        <w:rPr>
+          <w:color w:val="1D2D3E"/>
+          <w:sz w:val="22"/>
+          <w:szCs w:val="22"/>
+        </w:rPr>
+        <w:t xml:space="preserve">JECard gains linesExpanded state; 'N lines' becomes tappable toggle button with list/chevron-up icon</w:t>
+      </w:r>
+    </w:p>
+    <w:p>
+      <w:pPr>
+        <w:pStyle w:val="ListParagraph"/>
+        <w:numPr>
+          <w:ilvl w:val="1"/>
+          <w:numId w:val="1"/>
+        </w:numPr>
+        <w:spacing w:after="40"/>
+      </w:pPr>
+      <w:r>
+        <w:rPr>
+          <w:color w:val="1D2D3E"/>
+          <w:sz w:val="22"/>
+          <w:szCs w:val="22"/>
+        </w:rPr>
+        <w:t xml:space="preserve">  stopPropagation on tap to avoid triggering card navigation</w:t>
+      </w:r>
+    </w:p>
+    <w:p>
+      <w:pPr>
+        <w:pStyle w:val="ListParagraph"/>
+        <w:numPr>
+          <w:ilvl w:val="0"/>
+          <w:numId w:val="1"/>
+        </w:numPr>
+        <w:spacing w:after="40"/>
+      </w:pPr>
+      <w:r>
+        <w:rPr>
+          <w:color w:val="1D2D3E"/>
+          <w:sz w:val="22"/>
+          <w:szCs w:val="22"/>
+        </w:rPr>
+        <w:t xml:space="preserve">When expanded, compact inline table shows: Account | Dr | Cr columns</w:t>
+      </w:r>
+    </w:p>
+    <w:p>
+      <w:pPr>
+        <w:pStyle w:val="ListParagraph"/>
+        <w:numPr>
+          <w:ilvl w:val="1"/>
+          <w:numId w:val="1"/>
+        </w:numPr>
+        <w:spacing w:after="40"/>
+      </w:pPr>
+      <w:r>
+        <w:rPr>
+          <w:color w:val="1D2D3E"/>
+          <w:sz w:val="22"/>
+          <w:szCs w:val="22"/>
+        </w:rPr>
+        <w:t xml:space="preserve">  Up to JE_LINES_PREVIEW=4 lines; '+N more — tap card for full detail' italic footer for longer entries</w:t>
+      </w:r>
+    </w:p>
+    <w:p>
+      <w:pPr>
+        <w:pStyle w:val="ListParagraph"/>
+        <w:numPr>
+          <w:ilvl w:val="1"/>
+          <w:numId w:val="1"/>
+        </w:numPr>
+        <w:spacing w:after="40"/>
+      </w:pPr>
+      <w:r>
+        <w:rPr>
+          <w:color w:val="1D2D3E"/>
+          <w:sz w:val="22"/>
+          <w:szCs w:val="22"/>
+        </w:rPr>
+        <w:t xml:space="preserve">  Dr amounts bold/dark; Cr amounts bold/secondary; account names truncated with numberOfLines=1</w:t>
+      </w:r>
+    </w:p>
+    <w:p>
+      <w:pPr>
+        <w:pStyle w:val="ListParagraph"/>
+        <w:numPr>
+          <w:ilvl w:val="0"/>
+          <w:numId w:val="1"/>
+        </w:numPr>
+        <w:spacing w:after="40"/>
+      </w:pPr>
+      <w:r>
+        <w:rPr>
+          <w:color w:val="1D2D3E"/>
+          <w:sz w:val="22"/>
+          <w:szCs w:val="22"/>
+        </w:rPr>
+        <w:t xml:space="preserve">linesToggleBtn placed in both normal footer path and runningBalance footer path</w:t>
+      </w:r>
+    </w:p>
+    <w:p>
+      <w:pPr>
+        <w:pStyle w:val="ListParagraph"/>
+        <w:numPr>
+          <w:ilvl w:val="0"/>
+          <w:numId w:val="1"/>
+        </w:numPr>
+        <w:spacing w:after="40"/>
+      </w:pPr>
+      <w:r>
+        <w:rPr>
+          <w:color w:val="1D2D3E"/>
+          <w:sz w:val="22"/>
+          <w:szCs w:val="22"/>
+        </w:rPr>
+        <w:t xml:space="preserve">New styles: linesHintActive, linesToggleBtn, linesPreview, linesPreviewHeader, linesPreviewCol, linesPreviewAmtCol, linesPreviewRow, linesPreviewAccount, linesPreviewAmt, linesPreviewDr, linesPreviewCr, linesPreviewMore</w:t>
+      </w:r>
+    </w:p>
+    <w:p>
+      <w:pPr>
+        <w:spacing w:after="80"/>
+      </w:pPr>
+      <w:r>
+        <w:rPr>
+          <w:color w:val="1D2D3E"/>
+          <w:sz w:val="22"/>
+          <w:szCs w:val="22"/>
+        </w:rPr>
+        <w:t xml:space="preserve"/>
+      </w:r>
+    </w:p>
+    <w:p>
+      <w:pPr>
+        <w:pStyle w:val="Heading2"/>
+        <w:spacing w:after="120" w:before="300"/>
+      </w:pPr>
+      <w:r>
+        <w:rPr>
+          <w:b/>
+          <w:bCs/>
+          <w:color w:val="1D2D3E"/>
+        </w:rPr>
+        <w:t xml:space="preserve">3.113 JournalEntries Multi-Word AND Search (Session 61)</w:t>
+      </w:r>
+    </w:p>
+    <w:p>
+      <w:pPr>
+        <w:pStyle w:val="ListParagraph"/>
+        <w:numPr>
+          <w:ilvl w:val="0"/>
+          <w:numId w:val="1"/>
+        </w:numPr>
+        <w:spacing w:after="40"/>
+      </w:pPr>
+      <w:r>
+        <w:rPr>
+          <w:color w:val="1D2D3E"/>
+          <w:sz w:val="22"/>
+          <w:szCs w:val="22"/>
+        </w:rPr>
+        <w:t xml:space="preserve">Search splits on whitespace: every word must match somewhere in voucher_no + narration + voucher_type (AND logic)</w:t>
+      </w:r>
+    </w:p>
+    <w:p>
+      <w:pPr>
+        <w:pStyle w:val="ListParagraph"/>
+        <w:numPr>
+          <w:ilvl w:val="1"/>
+          <w:numId w:val="1"/>
+        </w:numPr>
+        <w:spacing w:after="40"/>
+      </w:pPr>
+      <w:r>
+        <w:rPr>
+          <w:color w:val="1D2D3E"/>
+          <w:sz w:val="22"/>
+          <w:szCs w:val="22"/>
+        </w:rPr>
+        <w:t xml:space="preserve">  Previously single includes() call; now words.every(w =&gt; haystack.includes(w)) for refined multi-term search</w:t>
+      </w:r>
+    </w:p>
+    <w:p>
+      <w:pPr>
+        <w:pStyle w:val="ListParagraph"/>
+        <w:numPr>
+          <w:ilvl w:val="0"/>
+          <w:numId w:val="1"/>
+        </w:numPr>
+        <w:spacing w:after="40"/>
+      </w:pPr>
+      <w:r>
+        <w:rPr>
+          <w:color w:val="1D2D3E"/>
+          <w:sz w:val="22"/>
+          <w:szCs w:val="22"/>
+        </w:rPr>
+        <w:t xml:space="preserve">Updated placeholder text: 'Search by voucher, narration, type…'</w:t>
+      </w:r>
+    </w:p>
+    <w:p>
+      <w:pPr>
+        <w:spacing w:after="80"/>
+      </w:pPr>
+      <w:r>
+        <w:rPr>
+          <w:color w:val="1D2D3E"/>
+          <w:sz w:val="22"/>
+          <w:szCs w:val="22"/>
+        </w:rPr>
+        <w:t xml:space="preserve"/>
+      </w:r>
+    </w:p>
+    <w:p>
+      <w:pPr>
+        <w:pStyle w:val="Heading2"/>
+        <w:spacing w:after="120" w:before="300"/>
+      </w:pPr>
+      <w:r>
+        <w:rPr>
+          <w:b/>
+          <w:bCs/>
+          <w:color w:val="1D2D3E"/>
+        </w:rPr>
+        <w:t xml:space="preserve">3.112 ProcurementAnalytics ValueDistributionChart Bucket Tap (Session 61)</w:t>
+      </w:r>
+    </w:p>
+    <w:p>
+      <w:pPr>
+        <w:pStyle w:val="ListParagraph"/>
+        <w:numPr>
+          <w:ilvl w:val="0"/>
+          <w:numId w:val="1"/>
+        </w:numPr>
+        <w:spacing w:after="40"/>
+      </w:pPr>
+      <w:r>
+        <w:rPr>
+          <w:color w:val="1D2D3E"/>
+          <w:sz w:val="22"/>
+          <w:szCs w:val="22"/>
+        </w:rPr>
+        <w:t xml:space="preserve">Each bucket column is now TouchableOpacity; tap selects/deselects that price-range bucket</w:t>
+      </w:r>
+    </w:p>
+    <w:p>
+      <w:pPr>
+        <w:pStyle w:val="ListParagraph"/>
+        <w:numPr>
+          <w:ilvl w:val="1"/>
+          <w:numId w:val="1"/>
+        </w:numPr>
+        <w:spacing w:after="40"/>
+      </w:pPr>
+      <w:r>
+        <w:rPr>
+          <w:color w:val="1D2D3E"/>
+          <w:sz w:val="22"/>
+          <w:szCs w:val="22"/>
+        </w:rPr>
+        <w:t xml:space="preserve">  Selected column: background highlight (Colors.background + borderRadius), unselected cols at 0.7 opacity</w:t>
+      </w:r>
+    </w:p>
+    <w:p>
+      <w:pPr>
+        <w:pStyle w:val="ListParagraph"/>
+        <w:numPr>
+          <w:ilvl w:val="0"/>
+          <w:numId w:val="1"/>
+        </w:numPr>
+        <w:spacing w:after="40"/>
+      </w:pPr>
+      <w:r>
+        <w:rPr>
+          <w:color w:val="1D2D3E"/>
+          <w:sz w:val="22"/>
+          <w:szCs w:val="22"/>
+        </w:rPr>
+        <w:t xml:space="preserve">legendMeta label shows 'BUCKET · tap to clear' when a bucket is selected</w:t>
+      </w:r>
+    </w:p>
+    <w:p>
+      <w:pPr>
+        <w:pStyle w:val="ListParagraph"/>
+        <w:numPr>
+          <w:ilvl w:val="0"/>
+          <w:numId w:val="1"/>
+        </w:numPr>
+        <w:spacing w:after="40"/>
+      </w:pPr>
+      <w:r>
+        <w:rPr>
+          <w:color w:val="1D2D3E"/>
+          <w:sz w:val="22"/>
+          <w:szCs w:val="22"/>
+        </w:rPr>
+        <w:t xml:space="preserve">snapRow below bars when bucket active: PO count, SO count, Total, PO % (4-tile layout with hairline dividers)</w:t>
+      </w:r>
+    </w:p>
+    <w:p>
+      <w:pPr>
+        <w:pStyle w:val="ListParagraph"/>
+        <w:numPr>
+          <w:ilvl w:val="0"/>
+          <w:numId w:val="1"/>
+        </w:numPr>
+        <w:spacing w:after="40"/>
+      </w:pPr>
+      <w:r>
+        <w:rPr>
+          <w:color w:val="1D2D3E"/>
+          <w:sz w:val="22"/>
+          <w:szCs w:val="22"/>
+        </w:rPr>
+        <w:t xml:space="preserve">New styles: barTrackSelected, bucketLabelSelected, bucketTotalSelected, legendMeta, snapRow, snapItem, snapDivider, snapLabel, snapVal</w:t>
+      </w:r>
+    </w:p>
+    <w:p>
+      <w:pPr>
+        <w:spacing w:after="80"/>
+      </w:pPr>
+      <w:r>
+        <w:rPr>
+          <w:color w:val="1D2D3E"/>
+          <w:sz w:val="22"/>
+          <w:szCs w:val="22"/>
+        </w:rPr>
+        <w:t xml:space="preserve"/>
+      </w:r>
+    </w:p>
+    <w:p>
+      <w:pPr>
+        <w:pStyle w:val="Heading2"/>
+        <w:spacing w:after="120" w:before="300"/>
+      </w:pPr>
+      <w:r>
+        <w:rPr>
+          <w:b/>
+          <w:bCs/>
+          <w:color w:val="1D2D3E"/>
+        </w:rPr>
+        <w:t xml:space="preserve">3.111 FinancialAnalytics NWCTrendCard Interactive Dots (Session 61)</w:t>
+      </w:r>
+    </w:p>
+    <w:p>
+      <w:pPr>
+        <w:pStyle w:val="ListParagraph"/>
+        <w:numPr>
+          <w:ilvl w:val="0"/>
+          <w:numId w:val="1"/>
+        </w:numPr>
+        <w:spacing w:after="40"/>
+      </w:pPr>
+      <w:r>
+        <w:rPr>
+          <w:color w:val="1D2D3E"/>
+          <w:sz w:val="22"/>
+          <w:szCs w:val="22"/>
+        </w:rPr>
+        <w:t xml:space="preserve">NWCPolyline gains selectedIdx + onSelectIdx props matching AgingHistoryPolylines pattern</w:t>
+      </w:r>
+    </w:p>
+    <w:p>
+      <w:pPr>
+        <w:pStyle w:val="ListParagraph"/>
+        <w:numPr>
+          <w:ilvl w:val="1"/>
+          <w:numId w:val="1"/>
+        </w:numPr>
+        <w:spacing w:after="40"/>
+      </w:pPr>
+      <w:r>
+        <w:rPr>
+          <w:color w:val="1D2D3E"/>
+          <w:sz w:val="22"/>
+          <w:szCs w:val="22"/>
+        </w:rPr>
+        <w:t xml:space="preserve">  Dots become TouchableOpacity with hitSlop ±12/10px; tap same dot to deselect</w:t>
+      </w:r>
+    </w:p>
+    <w:p>
+      <w:pPr>
+        <w:pStyle w:val="ListParagraph"/>
+        <w:numPr>
+          <w:ilvl w:val="1"/>
+          <w:numId w:val="1"/>
+        </w:numPr>
+        <w:spacing w:after="40"/>
+      </w:pPr>
+      <w:r>
+        <w:rPr>
+          <w:color w:val="1D2D3E"/>
+          <w:sz w:val="22"/>
+          <w:szCs w:val="22"/>
+        </w:rPr>
+        <w:t xml:space="preserve">  Selected dot enlarges (r+2 radius, 2px border); vertical cursor hairline at selected x-position</w:t>
+      </w:r>
+    </w:p>
+    <w:p>
+      <w:pPr>
+        <w:pStyle w:val="ListParagraph"/>
+        <w:numPr>
+          <w:ilvl w:val="0"/>
+          <w:numId w:val="1"/>
+        </w:numPr>
+        <w:spacing w:after="40"/>
+      </w:pPr>
+      <w:r>
+        <w:rPr>
+          <w:color w:val="1D2D3E"/>
+          <w:sz w:val="22"/>
+          <w:szCs w:val="22"/>
+        </w:rPr>
+        <w:t xml:space="preserve">NWCTrendCard adds selectedIdx state; meta text switches from '{N}d · tap dot' to selected date string</w:t>
+      </w:r>
+    </w:p>
+    <w:p>
+      <w:pPr>
+        <w:pStyle w:val="ListParagraph"/>
+        <w:numPr>
+          <w:ilvl w:val="0"/>
+          <w:numId w:val="1"/>
+        </w:numPr>
+        <w:spacing w:after="40"/>
+      </w:pPr>
+      <w:r>
+        <w:rPr>
+          <w:color w:val="1D2D3E"/>
+          <w:sz w:val="22"/>
+          <w:szCs w:val="22"/>
+        </w:rPr>
+        <w:t xml:space="preserve">centerLabel toggles: 'positive = AR &gt; AP' (default) → 'tap same dot to clear' when selection active</w:t>
+      </w:r>
+    </w:p>
+    <w:p>
+      <w:pPr>
+        <w:pStyle w:val="ListParagraph"/>
+        <w:numPr>
+          <w:ilvl w:val="0"/>
+          <w:numId w:val="1"/>
+        </w:numPr>
+        <w:spacing w:after="40"/>
+      </w:pPr>
+      <w:r>
+        <w:rPr>
+          <w:color w:val="1D2D3E"/>
+          <w:sz w:val="22"/>
+          <w:szCs w:val="22"/>
+        </w:rPr>
+        <w:t xml:space="preserve">snapRow below date labels when a dot selected: AP / AR / NWC / STATUS tiles</w:t>
+      </w:r>
+    </w:p>
+    <w:p>
+      <w:pPr>
+        <w:pStyle w:val="ListParagraph"/>
+        <w:numPr>
+          <w:ilvl w:val="1"/>
+          <w:numId w:val="1"/>
+        </w:numPr>
+        <w:spacing w:after="40"/>
+      </w:pPr>
+      <w:r>
+        <w:rPr>
+          <w:color w:val="1D2D3E"/>
+          <w:sz w:val="22"/>
+          <w:szCs w:val="22"/>
+        </w:rPr>
+        <w:t xml:space="preserve">  NWC and STATUS tiles use negative (Colors.textSecondary) style when snapNWC &lt; 0</w:t>
+      </w:r>
+    </w:p>
+    <w:p>
+      <w:pPr>
+        <w:pStyle w:val="ListParagraph"/>
+        <w:numPr>
+          <w:ilvl w:val="0"/>
+          <w:numId w:val="1"/>
+        </w:numPr>
+        <w:spacing w:after="40"/>
+      </w:pPr>
+      <w:r>
+        <w:rPr>
+          <w:color w:val="1D2D3E"/>
+          <w:sz w:val="22"/>
+          <w:szCs w:val="22"/>
+        </w:rPr>
+        <w:t xml:space="preserve">New nwcStyles: snapRow, snapItem, snapDivider, snapLabel, snapVal</w:t>
+      </w:r>
+    </w:p>
+    <w:p>
+      <w:pPr>
+        <w:spacing w:after="80"/>
+      </w:pPr>
+      <w:r>
+        <w:rPr>
+          <w:color w:val="1D2D3E"/>
+          <w:sz w:val="22"/>
+          <w:szCs w:val="22"/>
+        </w:rPr>
+        <w:t xml:space="preserve"/>
+      </w:r>
+    </w:p>
+    <w:p>
+      <w:pPr>
+        <w:pStyle w:val="Heading2"/>
+        <w:spacing w:after="120" w:before="300"/>
+      </w:pPr>
+      <w:r>
+        <w:rPr>
+          <w:b/>
+          <w:bCs/>
+          <w:color w:val="1D2D3E"/>
+        </w:rPr>
         <w:t xml:space="preserve">3.110 FinancialAnalytics AgingHistoryChart Interactive Dots (Session 60)</w:t>
       </w:r>
     </w:p>
@@ -34346,24 +35021,24 @@
                 <w:sz w:val="20"/>
                 <w:szCs w:val="20"/>
               </w:rPr>
-              <w:t xml:space="preserve">Session 60</w:t>
-            </w:r>
-          </w:p>
-        </w:tc>
-        <w:tc>
-          <w:p>
-            <w:pPr>
-              <w:spacing w:after="40" w:before="40"/>
-            </w:pPr>
-            <w:r>
-              <w:rPr>
-                <w:b w:val="false"/>
-                <w:bCs w:val="false"/>
-                <w:color w:val="1D2D3E"/>
-                <w:sz w:val="20"/>
-                <w:szCs w:val="20"/>
-              </w:rPr>
-              <w:t xml:space="preserve">ItemLedger computed running balance — when API returns no balance fields, compute cumulative qty_in−qty_out; show as ~BAL italic</w:t>
+              <w:t xml:space="preserve">Session 61</w:t>
+            </w:r>
+          </w:p>
+        </w:tc>
+        <w:tc>
+          <w:p>
+            <w:pPr>
+              <w:spacing w:after="40" w:before="40"/>
+            </w:pPr>
+            <w:r>
+              <w:rPr>
+                <w:b w:val="false"/>
+                <w:bCs w:val="false"/>
+                <w:color w:val="1D2D3E"/>
+                <w:sz w:val="20"/>
+                <w:szCs w:val="20"/>
+              </w:rPr>
+              <w:t xml:space="preserve">NWCTrendCard interactive dots — TouchableOpacity dots, selectedIdx state, snapRow AP/AR/NWC/Status tiles, cursor hairline</w:t>
             </w:r>
           </w:p>
         </w:tc>
@@ -34397,7 +35072,7 @@
                 <w:sz w:val="20"/>
                 <w:szCs w:val="20"/>
               </w:rPr>
-              <w:t xml:space="preserve">ItemLedgerScreen.tsx</w:t>
+              <w:t xml:space="preserve">FinancialAnalyticsScreen.tsx</w:t>
             </w:r>
           </w:p>
         </w:tc>
@@ -34419,7 +35094,7 @@
                 <w:sz w:val="20"/>
                 <w:szCs w:val="20"/>
               </w:rPr>
-              <w:t xml:space="preserve">Session 60</w:t>
+              <w:t xml:space="preserve">Session 61</w:t>
             </w:r>
           </w:p>
         </w:tc>
@@ -34439,7 +35114,7 @@
                 <w:sz w:val="20"/>
                 <w:szCs w:val="20"/>
               </w:rPr>
-              <w:t xml:space="preserve">JournalEntries zero-crossing highlight — detect first sign-flip in per-account running balance; insert hairline divider marker</w:t>
+              <w:t xml:space="preserve">ValueDistributionChart bucket tap — column select/deselect, snapRow with PO/SO/Total/PO% tiles, legendMeta label</w:t>
             </w:r>
           </w:p>
         </w:tc>
@@ -34479,7 +35154,7 @@
                 <w:sz w:val="20"/>
                 <w:szCs w:val="20"/>
               </w:rPr>
-              <w:t xml:space="preserve">JournalEntriesScreen.tsx</w:t>
+              <w:t xml:space="preserve">ProcurementAnalyticsScreen.tsx</w:t>
             </w:r>
           </w:p>
         </w:tc>
@@ -34498,24 +35173,24 @@
                 <w:sz w:val="20"/>
                 <w:szCs w:val="20"/>
               </w:rPr>
-              <w:t xml:space="preserve">Session 60</w:t>
-            </w:r>
-          </w:p>
-        </w:tc>
-        <w:tc>
-          <w:p>
-            <w:pPr>
-              <w:spacing w:after="40" w:before="40"/>
-            </w:pPr>
-            <w:r>
-              <w:rPr>
-                <w:b w:val="false"/>
-                <w:bCs w:val="false"/>
-                <w:color w:val="1D2D3E"/>
-                <w:sz w:val="20"/>
-                <w:szCs w:val="20"/>
-              </w:rPr>
-              <w:t xml:space="preserve">Dashboard Today's Activity card — TodayActivityCard with type breakdown bars; shown when any vouchers exist for today</w:t>
+              <w:t xml:space="preserve">Session 61</w:t>
+            </w:r>
+          </w:p>
+        </w:tc>
+        <w:tc>
+          <w:p>
+            <w:pPr>
+              <w:spacing w:after="40" w:before="40"/>
+            </w:pPr>
+            <w:r>
+              <w:rPr>
+                <w:b w:val="false"/>
+                <w:bCs w:val="false"/>
+                <w:color w:val="1D2D3E"/>
+                <w:sz w:val="20"/>
+                <w:szCs w:val="20"/>
+              </w:rPr>
+              <w:t xml:space="preserve">JournalEntries multi-word AND search — split on whitespace, every word must match in haystack of all fields</w:t>
             </w:r>
           </w:p>
         </w:tc>
@@ -34549,7 +35224,7 @@
                 <w:sz w:val="20"/>
                 <w:szCs w:val="20"/>
               </w:rPr>
-              <w:t xml:space="preserve">DashboardScreen.tsx</w:t>
+              <w:t xml:space="preserve">JournalEntriesScreen.tsx</w:t>
             </w:r>
           </w:p>
         </w:tc>
@@ -34571,7 +35246,7 @@
                 <w:sz w:val="20"/>
                 <w:szCs w:val="20"/>
               </w:rPr>
-              <w:t xml:space="preserve">Session 60</w:t>
+              <w:t xml:space="preserve">Session 61</w:t>
             </w:r>
           </w:p>
         </w:tc>
@@ -34591,7 +35266,7 @@
                 <w:sz w:val="20"/>
                 <w:szCs w:val="20"/>
               </w:rPr>
-              <w:t xml:space="preserve">FinancialAnalytics AgingHistoryChart interactive dots — tap dot to see snapshot; selectedIdx state; snapRow tiles; vertical cursor</w:t>
+              <w:t xml:space="preserve">JECard inline line items preview — tappable 'N lines' expands Account|Dr|Cr table in-card, up to 4 rows + overflow hint</w:t>
             </w:r>
           </w:p>
         </w:tc>
@@ -34631,6 +35306,380 @@
                 <w:sz w:val="20"/>
                 <w:szCs w:val="20"/>
               </w:rPr>
+              <w:t xml:space="preserve">JournalEntriesScreen.tsx</w:t>
+            </w:r>
+          </w:p>
+        </w:tc>
+      </w:tr>
+      <w:tr>
+        <w:tc>
+          <w:p>
+            <w:pPr>
+              <w:spacing w:after="40" w:before="40"/>
+            </w:pPr>
+            <w:r>
+              <w:rPr>
+                <w:b w:val="false"/>
+                <w:bCs w:val="false"/>
+                <w:color w:val="1D2D3E"/>
+                <w:sz w:val="20"/>
+                <w:szCs w:val="20"/>
+              </w:rPr>
+              <w:t xml:space="preserve">Session 61</w:t>
+            </w:r>
+          </w:p>
+        </w:tc>
+        <w:tc>
+          <w:p>
+            <w:pPr>
+              <w:spacing w:after="40" w:before="40"/>
+            </w:pPr>
+            <w:r>
+              <w:rPr>
+                <w:b w:val="false"/>
+                <w:bCs w:val="false"/>
+                <w:color w:val="1D2D3E"/>
+                <w:sz w:val="20"/>
+                <w:szCs w:val="20"/>
+              </w:rPr>
+              <w:t xml:space="preserve">StockHealth threshold CSV export (Share) and paste-import modal (parseThresholdCSV, bulk setItemThreshold)</w:t>
+            </w:r>
+          </w:p>
+        </w:tc>
+        <w:tc>
+          <w:p>
+            <w:pPr>
+              <w:spacing w:after="40" w:before="40"/>
+            </w:pPr>
+            <w:r>
+              <w:rPr>
+                <w:b w:val="false"/>
+                <w:bCs w:val="false"/>
+                <w:color w:val="1D2D3E"/>
+                <w:sz w:val="20"/>
+                <w:szCs w:val="20"/>
+              </w:rPr>
+              <w:t xml:space="preserve">Done</w:t>
+            </w:r>
+          </w:p>
+        </w:tc>
+        <w:tc>
+          <w:p>
+            <w:pPr>
+              <w:spacing w:after="40" w:before="40"/>
+            </w:pPr>
+            <w:r>
+              <w:rPr>
+                <w:b w:val="false"/>
+                <w:bCs w:val="false"/>
+                <w:color w:val="1D2D3E"/>
+                <w:sz w:val="20"/>
+                <w:szCs w:val="20"/>
+              </w:rPr>
+              <w:t xml:space="preserve">StockHealthScreen.tsx</w:t>
+            </w:r>
+          </w:p>
+        </w:tc>
+      </w:tr>
+      <w:tr>
+        <w:tc>
+          <w:tcPr>
+            <w:shd w:color="F0F4F8" w:val="solid"/>
+          </w:tcPr>
+          <w:p>
+            <w:pPr>
+              <w:spacing w:after="40" w:before="40"/>
+            </w:pPr>
+            <w:r>
+              <w:rPr>
+                <w:b w:val="false"/>
+                <w:bCs w:val="false"/>
+                <w:color w:val="1D2D3E"/>
+                <w:sz w:val="20"/>
+                <w:szCs w:val="20"/>
+              </w:rPr>
+              <w:t xml:space="preserve">Session 60</w:t>
+            </w:r>
+          </w:p>
+        </w:tc>
+        <w:tc>
+          <w:tcPr>
+            <w:shd w:color="F0F4F8" w:val="solid"/>
+          </w:tcPr>
+          <w:p>
+            <w:pPr>
+              <w:spacing w:after="40" w:before="40"/>
+            </w:pPr>
+            <w:r>
+              <w:rPr>
+                <w:b w:val="false"/>
+                <w:bCs w:val="false"/>
+                <w:color w:val="1D2D3E"/>
+                <w:sz w:val="20"/>
+                <w:szCs w:val="20"/>
+              </w:rPr>
+              <w:t xml:space="preserve">ItemLedger computed running balance — when API returns no balance fields, compute cumulative qty_in−qty_out; show as ~BAL italic</w:t>
+            </w:r>
+          </w:p>
+        </w:tc>
+        <w:tc>
+          <w:tcPr>
+            <w:shd w:color="F0F4F8" w:val="solid"/>
+          </w:tcPr>
+          <w:p>
+            <w:pPr>
+              <w:spacing w:after="40" w:before="40"/>
+            </w:pPr>
+            <w:r>
+              <w:rPr>
+                <w:b w:val="false"/>
+                <w:bCs w:val="false"/>
+                <w:color w:val="1D2D3E"/>
+                <w:sz w:val="20"/>
+                <w:szCs w:val="20"/>
+              </w:rPr>
+              <w:t xml:space="preserve">Done</w:t>
+            </w:r>
+          </w:p>
+        </w:tc>
+        <w:tc>
+          <w:tcPr>
+            <w:shd w:color="F0F4F8" w:val="solid"/>
+          </w:tcPr>
+          <w:p>
+            <w:pPr>
+              <w:spacing w:after="40" w:before="40"/>
+            </w:pPr>
+            <w:r>
+              <w:rPr>
+                <w:b w:val="false"/>
+                <w:bCs w:val="false"/>
+                <w:color w:val="1D2D3E"/>
+                <w:sz w:val="20"/>
+                <w:szCs w:val="20"/>
+              </w:rPr>
+              <w:t xml:space="preserve">ItemLedgerScreen.tsx</w:t>
+            </w:r>
+          </w:p>
+        </w:tc>
+      </w:tr>
+      <w:tr>
+        <w:tc>
+          <w:p>
+            <w:pPr>
+              <w:spacing w:after="40" w:before="40"/>
+            </w:pPr>
+            <w:r>
+              <w:rPr>
+                <w:b w:val="false"/>
+                <w:bCs w:val="false"/>
+                <w:color w:val="1D2D3E"/>
+                <w:sz w:val="20"/>
+                <w:szCs w:val="20"/>
+              </w:rPr>
+              <w:t xml:space="preserve">Session 60</w:t>
+            </w:r>
+          </w:p>
+        </w:tc>
+        <w:tc>
+          <w:p>
+            <w:pPr>
+              <w:spacing w:after="40" w:before="40"/>
+            </w:pPr>
+            <w:r>
+              <w:rPr>
+                <w:b w:val="false"/>
+                <w:bCs w:val="false"/>
+                <w:color w:val="1D2D3E"/>
+                <w:sz w:val="20"/>
+                <w:szCs w:val="20"/>
+              </w:rPr>
+              <w:t xml:space="preserve">JournalEntries zero-crossing highlight — detect first sign-flip in per-account running balance; insert hairline divider marker</w:t>
+            </w:r>
+          </w:p>
+        </w:tc>
+        <w:tc>
+          <w:p>
+            <w:pPr>
+              <w:spacing w:after="40" w:before="40"/>
+            </w:pPr>
+            <w:r>
+              <w:rPr>
+                <w:b w:val="false"/>
+                <w:bCs w:val="false"/>
+                <w:color w:val="1D2D3E"/>
+                <w:sz w:val="20"/>
+                <w:szCs w:val="20"/>
+              </w:rPr>
+              <w:t xml:space="preserve">Done</w:t>
+            </w:r>
+          </w:p>
+        </w:tc>
+        <w:tc>
+          <w:p>
+            <w:pPr>
+              <w:spacing w:after="40" w:before="40"/>
+            </w:pPr>
+            <w:r>
+              <w:rPr>
+                <w:b w:val="false"/>
+                <w:bCs w:val="false"/>
+                <w:color w:val="1D2D3E"/>
+                <w:sz w:val="20"/>
+                <w:szCs w:val="20"/>
+              </w:rPr>
+              <w:t xml:space="preserve">JournalEntriesScreen.tsx</w:t>
+            </w:r>
+          </w:p>
+        </w:tc>
+      </w:tr>
+      <w:tr>
+        <w:tc>
+          <w:tcPr>
+            <w:shd w:color="F0F4F8" w:val="solid"/>
+          </w:tcPr>
+          <w:p>
+            <w:pPr>
+              <w:spacing w:after="40" w:before="40"/>
+            </w:pPr>
+            <w:r>
+              <w:rPr>
+                <w:b w:val="false"/>
+                <w:bCs w:val="false"/>
+                <w:color w:val="1D2D3E"/>
+                <w:sz w:val="20"/>
+                <w:szCs w:val="20"/>
+              </w:rPr>
+              <w:t xml:space="preserve">Session 60</w:t>
+            </w:r>
+          </w:p>
+        </w:tc>
+        <w:tc>
+          <w:tcPr>
+            <w:shd w:color="F0F4F8" w:val="solid"/>
+          </w:tcPr>
+          <w:p>
+            <w:pPr>
+              <w:spacing w:after="40" w:before="40"/>
+            </w:pPr>
+            <w:r>
+              <w:rPr>
+                <w:b w:val="false"/>
+                <w:bCs w:val="false"/>
+                <w:color w:val="1D2D3E"/>
+                <w:sz w:val="20"/>
+                <w:szCs w:val="20"/>
+              </w:rPr>
+              <w:t xml:space="preserve">Dashboard Today's Activity card — TodayActivityCard with type breakdown bars; shown when any vouchers exist for today</w:t>
+            </w:r>
+          </w:p>
+        </w:tc>
+        <w:tc>
+          <w:tcPr>
+            <w:shd w:color="F0F4F8" w:val="solid"/>
+          </w:tcPr>
+          <w:p>
+            <w:pPr>
+              <w:spacing w:after="40" w:before="40"/>
+            </w:pPr>
+            <w:r>
+              <w:rPr>
+                <w:b w:val="false"/>
+                <w:bCs w:val="false"/>
+                <w:color w:val="1D2D3E"/>
+                <w:sz w:val="20"/>
+                <w:szCs w:val="20"/>
+              </w:rPr>
+              <w:t xml:space="preserve">Done</w:t>
+            </w:r>
+          </w:p>
+        </w:tc>
+        <w:tc>
+          <w:tcPr>
+            <w:shd w:color="F0F4F8" w:val="solid"/>
+          </w:tcPr>
+          <w:p>
+            <w:pPr>
+              <w:spacing w:after="40" w:before="40"/>
+            </w:pPr>
+            <w:r>
+              <w:rPr>
+                <w:b w:val="false"/>
+                <w:bCs w:val="false"/>
+                <w:color w:val="1D2D3E"/>
+                <w:sz w:val="20"/>
+                <w:szCs w:val="20"/>
+              </w:rPr>
+              <w:t xml:space="preserve">DashboardScreen.tsx</w:t>
+            </w:r>
+          </w:p>
+        </w:tc>
+      </w:tr>
+      <w:tr>
+        <w:tc>
+          <w:p>
+            <w:pPr>
+              <w:spacing w:after="40" w:before="40"/>
+            </w:pPr>
+            <w:r>
+              <w:rPr>
+                <w:b w:val="false"/>
+                <w:bCs w:val="false"/>
+                <w:color w:val="1D2D3E"/>
+                <w:sz w:val="20"/>
+                <w:szCs w:val="20"/>
+              </w:rPr>
+              <w:t xml:space="preserve">Session 60</w:t>
+            </w:r>
+          </w:p>
+        </w:tc>
+        <w:tc>
+          <w:p>
+            <w:pPr>
+              <w:spacing w:after="40" w:before="40"/>
+            </w:pPr>
+            <w:r>
+              <w:rPr>
+                <w:b w:val="false"/>
+                <w:bCs w:val="false"/>
+                <w:color w:val="1D2D3E"/>
+                <w:sz w:val="20"/>
+                <w:szCs w:val="20"/>
+              </w:rPr>
+              <w:t xml:space="preserve">FinancialAnalytics AgingHistoryChart interactive dots — tap dot to see snapshot; selectedIdx state; snapRow tiles; vertical cursor</w:t>
+            </w:r>
+          </w:p>
+        </w:tc>
+        <w:tc>
+          <w:p>
+            <w:pPr>
+              <w:spacing w:after="40" w:before="40"/>
+            </w:pPr>
+            <w:r>
+              <w:rPr>
+                <w:b w:val="false"/>
+                <w:bCs w:val="false"/>
+                <w:color w:val="1D2D3E"/>
+                <w:sz w:val="20"/>
+                <w:szCs w:val="20"/>
+              </w:rPr>
+              <w:t xml:space="preserve">Done</w:t>
+            </w:r>
+          </w:p>
+        </w:tc>
+        <w:tc>
+          <w:p>
+            <w:pPr>
+              <w:spacing w:after="40" w:before="40"/>
+            </w:pPr>
+            <w:r>
+              <w:rPr>
+                <w:b w:val="false"/>
+                <w:bCs w:val="false"/>
+                <w:color w:val="1D2D3E"/>
+                <w:sz w:val="20"/>
+                <w:szCs w:val="20"/>
+              </w:rPr>
               <w:t xml:space="preserve">FinancialAnalyticsScreen.tsx</w:t>
             </w:r>
           </w:p>
@@ -39943,6 +40992,303 @@
           <w:szCs w:val="22"/>
         </w:rPr>
         <w:t xml:space="preserve">  Shows: N vouchers · Dr X · Cr X with dividers; check-circle/alert-circle balance-check icon</w:t>
+      </w:r>
+    </w:p>
+    <w:p>
+      <w:pPr>
+        <w:spacing w:after="80"/>
+      </w:pPr>
+      <w:r>
+        <w:rPr>
+          <w:color w:val="1D2D3E"/>
+          <w:sz w:val="22"/>
+          <w:szCs w:val="22"/>
+        </w:rPr>
+        <w:t xml:space="preserve"/>
+      </w:r>
+    </w:p>
+    <w:p>
+      <w:pPr>
+        <w:pStyle w:val="Heading2"/>
+        <w:spacing w:after="120" w:before="300"/>
+      </w:pPr>
+      <w:r>
+        <w:rPr>
+          <w:b/>
+          <w:bCs/>
+          <w:color w:val="1D2D3E"/>
+        </w:rPr>
+        <w:t xml:space="preserve">Session 61 — 2026-06-11</w:t>
+      </w:r>
+    </w:p>
+    <w:p>
+      <w:pPr>
+        <w:pStyle w:val="ListParagraph"/>
+        <w:numPr>
+          <w:ilvl w:val="0"/>
+          <w:numId w:val="1"/>
+        </w:numPr>
+        <w:spacing w:after="40"/>
+      </w:pPr>
+      <w:r>
+        <w:rPr>
+          <w:color w:val="1D2D3E"/>
+          <w:sz w:val="22"/>
+          <w:szCs w:val="22"/>
+        </w:rPr>
+        <w:t xml:space="preserve">NWCTrendCard Interactive Dots (FinancialAnalyticsScreen.tsx)</w:t>
+      </w:r>
+    </w:p>
+    <w:p>
+      <w:pPr>
+        <w:pStyle w:val="ListParagraph"/>
+        <w:numPr>
+          <w:ilvl w:val="1"/>
+          <w:numId w:val="1"/>
+        </w:numPr>
+        <w:spacing w:after="40"/>
+      </w:pPr>
+      <w:r>
+        <w:rPr>
+          <w:color w:val="1D2D3E"/>
+          <w:sz w:val="22"/>
+          <w:szCs w:val="22"/>
+        </w:rPr>
+        <w:t xml:space="preserve">  NWCPolyline: dots are TouchableOpacity with hitSlop; selected dot enlarges + cursor hairline</w:t>
+      </w:r>
+    </w:p>
+    <w:p>
+      <w:pPr>
+        <w:pStyle w:val="ListParagraph"/>
+        <w:numPr>
+          <w:ilvl w:val="1"/>
+          <w:numId w:val="1"/>
+        </w:numPr>
+        <w:spacing w:after="40"/>
+      </w:pPr>
+      <w:r>
+        <w:rPr>
+          <w:color w:val="1D2D3E"/>
+          <w:sz w:val="22"/>
+          <w:szCs w:val="22"/>
+        </w:rPr>
+        <w:t xml:space="preserve">  NWCTrendCard: selectedIdx state; meta switches to date; centerLabel updates; snapRow AP/AR/NWC/Status tiles</w:t>
+      </w:r>
+    </w:p>
+    <w:p>
+      <w:pPr>
+        <w:pStyle w:val="ListParagraph"/>
+        <w:numPr>
+          <w:ilvl w:val="0"/>
+          <w:numId w:val="1"/>
+        </w:numPr>
+        <w:spacing w:after="40"/>
+      </w:pPr>
+      <w:r>
+        <w:rPr>
+          <w:color w:val="1D2D3E"/>
+          <w:sz w:val="22"/>
+          <w:szCs w:val="22"/>
+        </w:rPr>
+        <w:t xml:space="preserve">ValueDistributionChart Bucket Tap (ProcurementAnalyticsScreen.tsx)</w:t>
+      </w:r>
+    </w:p>
+    <w:p>
+      <w:pPr>
+        <w:pStyle w:val="ListParagraph"/>
+        <w:numPr>
+          <w:ilvl w:val="1"/>
+          <w:numId w:val="1"/>
+        </w:numPr>
+        <w:spacing w:after="40"/>
+      </w:pPr>
+      <w:r>
+        <w:rPr>
+          <w:color w:val="1D2D3E"/>
+          <w:sz w:val="22"/>
+          <w:szCs w:val="22"/>
+        </w:rPr>
+        <w:t xml:space="preserve">  Columns become TouchableOpacity; selected col gets background highlight; unselected at 0.7 opacity</w:t>
+      </w:r>
+    </w:p>
+    <w:p>
+      <w:pPr>
+        <w:pStyle w:val="ListParagraph"/>
+        <w:numPr>
+          <w:ilvl w:val="1"/>
+          <w:numId w:val="1"/>
+        </w:numPr>
+        <w:spacing w:after="40"/>
+      </w:pPr>
+      <w:r>
+        <w:rPr>
+          <w:color w:val="1D2D3E"/>
+          <w:sz w:val="22"/>
+          <w:szCs w:val="22"/>
+        </w:rPr>
+        <w:t xml:space="preserve">  legendMeta label; snapRow shows PO count, SO count, Total, PO% for selected bucket</w:t>
+      </w:r>
+    </w:p>
+    <w:p>
+      <w:pPr>
+        <w:pStyle w:val="ListParagraph"/>
+        <w:numPr>
+          <w:ilvl w:val="0"/>
+          <w:numId w:val="1"/>
+        </w:numPr>
+        <w:spacing w:after="40"/>
+      </w:pPr>
+      <w:r>
+        <w:rPr>
+          <w:color w:val="1D2D3E"/>
+          <w:sz w:val="22"/>
+          <w:szCs w:val="22"/>
+        </w:rPr>
+        <w:t xml:space="preserve">JournalEntries Multi-Word AND Search (JournalEntriesScreen.tsx)</w:t>
+      </w:r>
+    </w:p>
+    <w:p>
+      <w:pPr>
+        <w:pStyle w:val="ListParagraph"/>
+        <w:numPr>
+          <w:ilvl w:val="1"/>
+          <w:numId w:val="1"/>
+        </w:numPr>
+        <w:spacing w:after="40"/>
+      </w:pPr>
+      <w:r>
+        <w:rPr>
+          <w:color w:val="1D2D3E"/>
+          <w:sz w:val="22"/>
+          <w:szCs w:val="22"/>
+        </w:rPr>
+        <w:t xml:space="preserve">  search.split(/\s+/).filter(Boolean) — every word must match haystack of voucher_no + narration + type</w:t>
+      </w:r>
+    </w:p>
+    <w:p>
+      <w:pPr>
+        <w:pStyle w:val="ListParagraph"/>
+        <w:numPr>
+          <w:ilvl w:val="1"/>
+          <w:numId w:val="1"/>
+        </w:numPr>
+        <w:spacing w:after="40"/>
+      </w:pPr>
+      <w:r>
+        <w:rPr>
+          <w:color w:val="1D2D3E"/>
+          <w:sz w:val="22"/>
+          <w:szCs w:val="22"/>
+        </w:rPr>
+        <w:t xml:space="preserve">  Updated placeholder text to reflect broader search coverage</w:t>
+      </w:r>
+    </w:p>
+    <w:p>
+      <w:pPr>
+        <w:pStyle w:val="ListParagraph"/>
+        <w:numPr>
+          <w:ilvl w:val="0"/>
+          <w:numId w:val="1"/>
+        </w:numPr>
+        <w:spacing w:after="40"/>
+      </w:pPr>
+      <w:r>
+        <w:rPr>
+          <w:color w:val="1D2D3E"/>
+          <w:sz w:val="22"/>
+          <w:szCs w:val="22"/>
+        </w:rPr>
+        <w:t xml:space="preserve">JECard Inline Line Items Preview (JournalEntriesScreen.tsx)</w:t>
+      </w:r>
+    </w:p>
+    <w:p>
+      <w:pPr>
+        <w:pStyle w:val="ListParagraph"/>
+        <w:numPr>
+          <w:ilvl w:val="1"/>
+          <w:numId w:val="1"/>
+        </w:numPr>
+        <w:spacing w:after="40"/>
+      </w:pPr>
+      <w:r>
+        <w:rPr>
+          <w:color w:val="1D2D3E"/>
+          <w:sz w:val="22"/>
+          <w:szCs w:val="22"/>
+        </w:rPr>
+        <w:t xml:space="preserve">  'N lines' becomes tappable toggle; expands Account|Dr|Cr mini-table in-card for up to 4 lines</w:t>
+      </w:r>
+    </w:p>
+    <w:p>
+      <w:pPr>
+        <w:pStyle w:val="ListParagraph"/>
+        <w:numPr>
+          <w:ilvl w:val="1"/>
+          <w:numId w:val="1"/>
+        </w:numPr>
+        <w:spacing w:after="40"/>
+      </w:pPr>
+      <w:r>
+        <w:rPr>
+          <w:color w:val="1D2D3E"/>
+          <w:sz w:val="22"/>
+          <w:szCs w:val="22"/>
+        </w:rPr>
+        <w:t xml:space="preserve">  linesToggleBtn placed in both footer paths (normal and runningBalance); stopPropagation on tap</w:t>
+      </w:r>
+    </w:p>
+    <w:p>
+      <w:pPr>
+        <w:pStyle w:val="ListParagraph"/>
+        <w:numPr>
+          <w:ilvl w:val="0"/>
+          <w:numId w:val="1"/>
+        </w:numPr>
+        <w:spacing w:after="40"/>
+      </w:pPr>
+      <w:r>
+        <w:rPr>
+          <w:color w:val="1D2D3E"/>
+          <w:sz w:val="22"/>
+          <w:szCs w:val="22"/>
+        </w:rPr>
+        <w:t xml:space="preserve">StockHealth Threshold CSV Export + Paste Import (StockHealthScreen.tsx)</w:t>
+      </w:r>
+    </w:p>
+    <w:p>
+      <w:pPr>
+        <w:pStyle w:val="ListParagraph"/>
+        <w:numPr>
+          <w:ilvl w:val="1"/>
+          <w:numId w:val="1"/>
+        </w:numPr>
+        <w:spacing w:after="40"/>
+      </w:pPr>
+      <w:r>
+        <w:rPr>
+          <w:color w:val="1D2D3E"/>
+          <w:sz w:val="22"/>
+          <w:szCs w:val="22"/>
+        </w:rPr>
+        <w:t xml:space="preserve">  Share button exports all thresholds as CSV; Upload button opens ThresholdImportModal</w:t>
+      </w:r>
+    </w:p>
+    <w:p>
+      <w:pPr>
+        <w:pStyle w:val="ListParagraph"/>
+        <w:numPr>
+          <w:ilvl w:val="1"/>
+          <w:numId w:val="1"/>
+        </w:numPr>
+        <w:spacing w:after="40"/>
+      </w:pPr>
+      <w:r>
+        <w:rPr>
+          <w:color w:val="1D2D3E"/>
+          <w:sz w:val="22"/>
+          <w:szCs w:val="22"/>
+        </w:rPr>
+        <w:t xml:space="preserve">  parseThresholdCSV validates, skips header, strips quotes; live row count + error preview before import</w:t>
       </w:r>
     </w:p>
     <w:p>

</xml_diff>

<commit_message>
docs(session-62): update PROGRESS.md, generate-docs.js, and FEATURES.docx with Session 62 changelog
- PROGRESS.md: Session 62 completed items + next session suggestions
- generate-docs.js: sections 3.116-3.118 for new features; roadmap table rows; Session 62 changelog
- FEATURES.docx: regenerated with all Session 62 documentation
</commit_message>
<xml_diff>
--- a/FEATURES.docx
+++ b/FEATURES.docx
@@ -45,7 +45,7 @@
           <w:sz w:val="20"/>
           <w:szCs w:val="20"/>
         </w:rPr>
-        <w:t xml:space="preserve">Generated: 2026-06-11</w:t>
+        <w:t xml:space="preserve">Generated: 2026-06-12</w:t>
       </w:r>
     </w:p>
     <w:p>
@@ -15672,6 +15672,411 @@
           <w:bCs/>
           <w:color w:val="1D2D3E"/>
         </w:rPr>
+        <w:t xml:space="preserve">3.118 FinancialAnalytics NWCTrendCard Surplus/Deficit Drill-Down Modal (Session 62)</w:t>
+      </w:r>
+    </w:p>
+    <w:p>
+      <w:pPr>
+        <w:pStyle w:val="ListParagraph"/>
+        <w:numPr>
+          <w:ilvl w:val="0"/>
+          <w:numId w:val="1"/>
+        </w:numPr>
+        <w:spacing w:after="40"/>
+      </w:pPr>
+      <w:r>
+        <w:rPr>
+          <w:color w:val="1D2D3E"/>
+          <w:sz w:val="22"/>
+          <w:szCs w:val="22"/>
+        </w:rPr>
+        <w:t xml:space="preserve">NWCDrillDownModal: bottom-sheet Modal listing top-6 outstanding AP bills + top-6 AR invoices</w:t>
+      </w:r>
+    </w:p>
+    <w:p>
+      <w:pPr>
+        <w:pStyle w:val="ListParagraph"/>
+        <w:numPr>
+          <w:ilvl w:val="1"/>
+          <w:numId w:val="1"/>
+        </w:numPr>
+        <w:spacing w:after="40"/>
+      </w:pPr>
+      <w:r>
+        <w:rPr>
+          <w:color w:val="1D2D3E"/>
+          <w:sz w:val="22"/>
+          <w:szCs w:val="22"/>
+        </w:rPr>
+        <w:t xml:space="preserve">  Bills/invoices filtered to exclude paid/cancelled; sorted by outstanding amount descending</w:t>
+      </w:r>
+    </w:p>
+    <w:p>
+      <w:pPr>
+        <w:pStyle w:val="ListParagraph"/>
+        <w:numPr>
+          <w:ilvl w:val="1"/>
+          <w:numId w:val="1"/>
+        </w:numPr>
+        <w:spacing w:after="40"/>
+      </w:pPr>
+      <w:r>
+        <w:rPr>
+          <w:color w:val="1D2D3E"/>
+          <w:sz w:val="22"/>
+          <w:szCs w:val="22"/>
+        </w:rPr>
+        <w:t xml:space="preserve">  Overdue indicator shown when due_date &lt; today; AR amounts shown as +value, AP as −value (muted)</w:t>
+      </w:r>
+    </w:p>
+    <w:p>
+      <w:pPr>
+        <w:pStyle w:val="ListParagraph"/>
+        <w:numPr>
+          <w:ilvl w:val="0"/>
+          <w:numId w:val="1"/>
+        </w:numPr>
+        <w:spacing w:after="40"/>
+      </w:pPr>
+      <w:r>
+        <w:rPr>
+          <w:color w:val="1D2D3E"/>
+          <w:sz w:val="22"/>
+          <w:szCs w:val="22"/>
+        </w:rPr>
+        <w:t xml:space="preserve">NWCTrendCard gains bills?: APBill[], invoices?: ARInvoice[] props</w:t>
+      </w:r>
+    </w:p>
+    <w:p>
+      <w:pPr>
+        <w:pStyle w:val="ListParagraph"/>
+        <w:numPr>
+          <w:ilvl w:val="0"/>
+          <w:numId w:val="1"/>
+        </w:numPr>
+        <w:spacing w:after="40"/>
+      </w:pPr>
+      <w:r>
+        <w:rPr>
+          <w:color w:val="1D2D3E"/>
+          <w:sz w:val="22"/>
+          <w:szCs w:val="22"/>
+        </w:rPr>
+        <w:t xml:space="preserve">Surplus/Deficit tile becomes TouchableOpacity with ⓘ icon when drill-down data available</w:t>
+      </w:r>
+    </w:p>
+    <w:p>
+      <w:pPr>
+        <w:pStyle w:val="ListParagraph"/>
+        <w:numPr>
+          <w:ilvl w:val="0"/>
+          <w:numId w:val="1"/>
+        </w:numPr>
+        <w:spacing w:after="40"/>
+      </w:pPr>
+      <w:r>
+        <w:rPr>
+          <w:color w:val="1D2D3E"/>
+          <w:sz w:val="22"/>
+          <w:szCs w:val="22"/>
+        </w:rPr>
+        <w:t xml:space="preserve">drillDownVisible state controls Modal; call site passes apBills/arInvoices from FinancialData</w:t>
+      </w:r>
+    </w:p>
+    <w:p>
+      <w:pPr>
+        <w:pStyle w:val="ListParagraph"/>
+        <w:numPr>
+          <w:ilvl w:val="0"/>
+          <w:numId w:val="1"/>
+        </w:numPr>
+        <w:spacing w:after="40"/>
+      </w:pPr>
+      <w:r>
+        <w:rPr>
+          <w:color w:val="1D2D3E"/>
+          <w:sz w:val="22"/>
+          <w:szCs w:val="22"/>
+        </w:rPr>
+        <w:t xml:space="preserve">SectionHeader meta updated to 'tap Surplus/Deficit for breakdown'</w:t>
+      </w:r>
+    </w:p>
+    <w:p>
+      <w:pPr>
+        <w:spacing w:after="80"/>
+      </w:pPr>
+      <w:r>
+        <w:rPr>
+          <w:color w:val="1D2D3E"/>
+          <w:sz w:val="22"/>
+          <w:szCs w:val="22"/>
+        </w:rPr>
+        <w:t xml:space="preserve"/>
+      </w:r>
+    </w:p>
+    <w:p>
+      <w:pPr>
+        <w:pStyle w:val="Heading2"/>
+        <w:spacing w:after="120" w:before="300"/>
+      </w:pPr>
+      <w:r>
+        <w:rPr>
+          <w:b/>
+          <w:bCs/>
+          <w:color w:val="1D2D3E"/>
+        </w:rPr>
+        <w:t xml:space="preserve">3.117 ProcurementAnalytics Top Items Card with ItemLedger Navigation (Session 62)</w:t>
+      </w:r>
+    </w:p>
+    <w:p>
+      <w:pPr>
+        <w:pStyle w:val="ListParagraph"/>
+        <w:numPr>
+          <w:ilvl w:val="0"/>
+          <w:numId w:val="1"/>
+        </w:numPr>
+        <w:spacing w:after="40"/>
+      </w:pPr>
+      <w:r>
+        <w:rPr>
+          <w:color w:val="1D2D3E"/>
+          <w:sz w:val="22"/>
+          <w:szCs w:val="22"/>
+        </w:rPr>
+        <w:t xml:space="preserve">TopItemRow: itemName, itemId?, itemCode?, poCount, totalValue, avgValue</w:t>
+      </w:r>
+    </w:p>
+    <w:p>
+      <w:pPr>
+        <w:pStyle w:val="ListParagraph"/>
+        <w:numPr>
+          <w:ilvl w:val="0"/>
+          <w:numId w:val="1"/>
+        </w:numPr>
+        <w:spacing w:after="40"/>
+      </w:pPr>
+      <w:r>
+        <w:rPr>
+          <w:color w:val="1D2D3E"/>
+          <w:sz w:val="22"/>
+          <w:szCs w:val="22"/>
+        </w:rPr>
+        <w:t xml:space="preserve">computeTopItems(pos): aggregates PO line items by name, captures item_id, top-8 by total value</w:t>
+      </w:r>
+    </w:p>
+    <w:p>
+      <w:pPr>
+        <w:pStyle w:val="ListParagraph"/>
+        <w:numPr>
+          <w:ilvl w:val="0"/>
+          <w:numId w:val="1"/>
+        </w:numPr>
+        <w:spacing w:after="40"/>
+      </w:pPr>
+      <w:r>
+        <w:rPr>
+          <w:color w:val="1D2D3E"/>
+          <w:sz w:val="22"/>
+          <w:szCs w:val="22"/>
+        </w:rPr>
+        <w:t xml:space="preserve">TopItemsCard: ranked list with proportional fill bars, PO count, value; rows with itemId tappable</w:t>
+      </w:r>
+    </w:p>
+    <w:p>
+      <w:pPr>
+        <w:pStyle w:val="ListParagraph"/>
+        <w:numPr>
+          <w:ilvl w:val="0"/>
+          <w:numId w:val="1"/>
+        </w:numPr>
+        <w:spacing w:after="40"/>
+      </w:pPr>
+      <w:r>
+        <w:rPr>
+          <w:color w:val="1D2D3E"/>
+          <w:sz w:val="22"/>
+          <w:szCs w:val="22"/>
+        </w:rPr>
+        <w:t xml:space="preserve">Cross-tab navigation: handleNavigateItemLedger → Inventory &gt; ItemLedger with item_id/item_name</w:t>
+      </w:r>
+    </w:p>
+    <w:p>
+      <w:pPr>
+        <w:pStyle w:val="ListParagraph"/>
+        <w:numPr>
+          <w:ilvl w:val="0"/>
+          <w:numId w:val="1"/>
+        </w:numPr>
+        <w:spacing w:after="40"/>
+      </w:pPr>
+      <w:r>
+        <w:rPr>
+          <w:color w:val="1D2D3E"/>
+          <w:sz w:val="22"/>
+          <w:szCs w:val="22"/>
+        </w:rPr>
+        <w:t xml:space="preserve">Section appears between Value Distribution and Delivery Performance when topItems.length &gt; 0</w:t>
+      </w:r>
+    </w:p>
+    <w:p>
+      <w:pPr>
+        <w:spacing w:after="80"/>
+      </w:pPr>
+      <w:r>
+        <w:rPr>
+          <w:color w:val="1D2D3E"/>
+          <w:sz w:val="22"/>
+          <w:szCs w:val="22"/>
+        </w:rPr>
+        <w:t xml:space="preserve"/>
+      </w:r>
+    </w:p>
+    <w:p>
+      <w:pPr>
+        <w:pStyle w:val="Heading2"/>
+        <w:spacing w:after="120" w:before="300"/>
+      </w:pPr>
+      <w:r>
+        <w:rPr>
+          <w:b/>
+          <w:bCs/>
+          <w:color w:val="1D2D3E"/>
+        </w:rPr>
+        <w:t xml:space="preserve">3.116 Dashboard FinancialHealthCard 14-Day Score History Sparkline (Session 62)</w:t>
+      </w:r>
+    </w:p>
+    <w:p>
+      <w:pPr>
+        <w:pStyle w:val="ListParagraph"/>
+        <w:numPr>
+          <w:ilvl w:val="0"/>
+          <w:numId w:val="1"/>
+        </w:numPr>
+        <w:spacing w:after="40"/>
+      </w:pPr>
+      <w:r>
+        <w:rPr>
+          <w:color w:val="1D2D3E"/>
+          <w:sz w:val="22"/>
+          <w:szCs w:val="22"/>
+        </w:rPr>
+        <w:t xml:space="preserve">New src/utils/healthHistory.ts: saveHealthSnapshot/loadHealthHistory with AsyncStorage, 30-entry cap, per-company key</w:t>
+      </w:r>
+    </w:p>
+    <w:p>
+      <w:pPr>
+        <w:pStyle w:val="ListParagraph"/>
+        <w:numPr>
+          <w:ilvl w:val="0"/>
+          <w:numId w:val="1"/>
+        </w:numPr>
+        <w:spacing w:after="40"/>
+      </w:pPr>
+      <w:r>
+        <w:rPr>
+          <w:color w:val="1D2D3E"/>
+          <w:sz w:val="22"/>
+          <w:szCs w:val="22"/>
+        </w:rPr>
+        <w:t xml:space="preserve">HealthHistoryEntry: date, companyId, score, grade (A-F), apPct, arPct</w:t>
+      </w:r>
+    </w:p>
+    <w:p>
+      <w:pPr>
+        <w:pStyle w:val="ListParagraph"/>
+        <w:numPr>
+          <w:ilvl w:val="0"/>
+          <w:numId w:val="1"/>
+        </w:numPr>
+        <w:spacing w:after="40"/>
+      </w:pPr>
+      <w:r>
+        <w:rPr>
+          <w:color w:val="1D2D3E"/>
+          <w:sz w:val="22"/>
+          <w:szCs w:val="22"/>
+        </w:rPr>
+        <w:t xml:space="preserve">After aging buckets computed, health score saved daily; history reloaded into healthHistory state</w:t>
+      </w:r>
+    </w:p>
+    <w:p>
+      <w:pPr>
+        <w:pStyle w:val="ListParagraph"/>
+        <w:numPr>
+          <w:ilvl w:val="0"/>
+          <w:numId w:val="1"/>
+        </w:numPr>
+        <w:spacing w:after="40"/>
+      </w:pPr>
+      <w:r>
+        <w:rPr>
+          <w:color w:val="1D2D3E"/>
+          <w:sz w:val="22"/>
+          <w:szCs w:val="22"/>
+        </w:rPr>
+        <w:t xml:space="preserve">HealthScoreSparkline component: last-14-entry bar chart with opacity fading older→newer, last bar full-dark</w:t>
+      </w:r>
+    </w:p>
+    <w:p>
+      <w:pPr>
+        <w:pStyle w:val="ListParagraph"/>
+        <w:numPr>
+          <w:ilvl w:val="0"/>
+          <w:numId w:val="1"/>
+        </w:numPr>
+        <w:spacing w:after="40"/>
+      </w:pPr>
+      <w:r>
+        <w:rPr>
+          <w:color w:val="1D2D3E"/>
+          <w:sz w:val="22"/>
+          <w:szCs w:val="22"/>
+        </w:rPr>
+        <w:t xml:space="preserve">FinancialHealthCard gains history?: HealthHistoryEntry[] prop; sparkline shown when ≥2 entries</w:t>
+      </w:r>
+    </w:p>
+    <w:p>
+      <w:pPr>
+        <w:pStyle w:val="ListParagraph"/>
+        <w:numPr>
+          <w:ilvl w:val="0"/>
+          <w:numId w:val="1"/>
+        </w:numPr>
+        <w:spacing w:after="40"/>
+      </w:pPr>
+      <w:r>
+        <w:rPr>
+          <w:color w:val="1D2D3E"/>
+          <w:sz w:val="22"/>
+          <w:szCs w:val="22"/>
+        </w:rPr>
+        <w:t xml:space="preserve">Sparkline meta shows date range (MM-DD → MM-DD) and 'Nd trend' label</w:t>
+      </w:r>
+    </w:p>
+    <w:p>
+      <w:pPr>
+        <w:spacing w:after="80"/>
+      </w:pPr>
+      <w:r>
+        <w:rPr>
+          <w:color w:val="1D2D3E"/>
+          <w:sz w:val="22"/>
+          <w:szCs w:val="22"/>
+        </w:rPr>
+        <w:t xml:space="preserve"/>
+      </w:r>
+    </w:p>
+    <w:p>
+      <w:pPr>
+        <w:pStyle w:val="Heading2"/>
+        <w:spacing w:after="120" w:before="300"/>
+      </w:pPr>
+      <w:r>
+        <w:rPr>
+          <w:b/>
+          <w:bCs/>
+          <w:color w:val="1D2D3E"/>
+        </w:rPr>
         <w:t xml:space="preserve">3.115 StockHealth Threshold CSV Export &amp; Paste Import (Session 61)</w:t>
       </w:r>
     </w:p>
@@ -35685,6 +36090,240 @@
           </w:p>
         </w:tc>
       </w:tr>
+      <w:tr>
+        <w:tc>
+          <w:tcPr>
+            <w:shd w:color="F0F4F8" w:val="solid"/>
+          </w:tcPr>
+          <w:p>
+            <w:pPr>
+              <w:spacing w:after="40" w:before="40"/>
+            </w:pPr>
+            <w:r>
+              <w:rPr>
+                <w:b w:val="false"/>
+                <w:bCs w:val="false"/>
+                <w:color w:val="1D2D3E"/>
+                <w:sz w:val="20"/>
+                <w:szCs w:val="20"/>
+              </w:rPr>
+              <w:t xml:space="preserve">Session 62</w:t>
+            </w:r>
+          </w:p>
+        </w:tc>
+        <w:tc>
+          <w:tcPr>
+            <w:shd w:color="F0F4F8" w:val="solid"/>
+          </w:tcPr>
+          <w:p>
+            <w:pPr>
+              <w:spacing w:after="40" w:before="40"/>
+            </w:pPr>
+            <w:r>
+              <w:rPr>
+                <w:b w:val="false"/>
+                <w:bCs w:val="false"/>
+                <w:color w:val="1D2D3E"/>
+                <w:sz w:val="20"/>
+                <w:szCs w:val="20"/>
+              </w:rPr>
+              <w:t xml:space="preserve">Dashboard FinancialHealthCard 14-day score sparkline — healthHistory.ts, HealthScoreSparkline bars with opacity fade, shown when ≥2 entries</w:t>
+            </w:r>
+          </w:p>
+        </w:tc>
+        <w:tc>
+          <w:tcPr>
+            <w:shd w:color="F0F4F8" w:val="solid"/>
+          </w:tcPr>
+          <w:p>
+            <w:pPr>
+              <w:spacing w:after="40" w:before="40"/>
+            </w:pPr>
+            <w:r>
+              <w:rPr>
+                <w:b w:val="false"/>
+                <w:bCs w:val="false"/>
+                <w:color w:val="1D2D3E"/>
+                <w:sz w:val="20"/>
+                <w:szCs w:val="20"/>
+              </w:rPr>
+              <w:t xml:space="preserve">Done</w:t>
+            </w:r>
+          </w:p>
+        </w:tc>
+        <w:tc>
+          <w:tcPr>
+            <w:shd w:color="F0F4F8" w:val="solid"/>
+          </w:tcPr>
+          <w:p>
+            <w:pPr>
+              <w:spacing w:after="40" w:before="40"/>
+            </w:pPr>
+            <w:r>
+              <w:rPr>
+                <w:b w:val="false"/>
+                <w:bCs w:val="false"/>
+                <w:color w:val="1D2D3E"/>
+                <w:sz w:val="20"/>
+                <w:szCs w:val="20"/>
+              </w:rPr>
+              <w:t xml:space="preserve">DashboardScreen.tsx + healthHistory.ts</w:t>
+            </w:r>
+          </w:p>
+        </w:tc>
+      </w:tr>
+      <w:tr>
+        <w:tc>
+          <w:p>
+            <w:pPr>
+              <w:spacing w:after="40" w:before="40"/>
+            </w:pPr>
+            <w:r>
+              <w:rPr>
+                <w:b w:val="false"/>
+                <w:bCs w:val="false"/>
+                <w:color w:val="1D2D3E"/>
+                <w:sz w:val="20"/>
+                <w:szCs w:val="20"/>
+              </w:rPr>
+              <w:t xml:space="preserve">Session 62</w:t>
+            </w:r>
+          </w:p>
+        </w:tc>
+        <w:tc>
+          <w:p>
+            <w:pPr>
+              <w:spacing w:after="40" w:before="40"/>
+            </w:pPr>
+            <w:r>
+              <w:rPr>
+                <w:b w:val="false"/>
+                <w:bCs w:val="false"/>
+                <w:color w:val="1D2D3E"/>
+                <w:sz w:val="20"/>
+                <w:szCs w:val="20"/>
+              </w:rPr>
+              <w:t xml:space="preserve">ProcurementAnalytics Top Items card — computeTopItems from PO.items[], TopItemsCard with ranked bars, tap → ItemLedger cross-tab nav</w:t>
+            </w:r>
+          </w:p>
+        </w:tc>
+        <w:tc>
+          <w:p>
+            <w:pPr>
+              <w:spacing w:after="40" w:before="40"/>
+            </w:pPr>
+            <w:r>
+              <w:rPr>
+                <w:b w:val="false"/>
+                <w:bCs w:val="false"/>
+                <w:color w:val="1D2D3E"/>
+                <w:sz w:val="20"/>
+                <w:szCs w:val="20"/>
+              </w:rPr>
+              <w:t xml:space="preserve">Done</w:t>
+            </w:r>
+          </w:p>
+        </w:tc>
+        <w:tc>
+          <w:p>
+            <w:pPr>
+              <w:spacing w:after="40" w:before="40"/>
+            </w:pPr>
+            <w:r>
+              <w:rPr>
+                <w:b w:val="false"/>
+                <w:bCs w:val="false"/>
+                <w:color w:val="1D2D3E"/>
+                <w:sz w:val="20"/>
+                <w:szCs w:val="20"/>
+              </w:rPr>
+              <w:t xml:space="preserve">ProcurementAnalyticsScreen.tsx</w:t>
+            </w:r>
+          </w:p>
+        </w:tc>
+      </w:tr>
+      <w:tr>
+        <w:tc>
+          <w:tcPr>
+            <w:shd w:color="F0F4F8" w:val="solid"/>
+          </w:tcPr>
+          <w:p>
+            <w:pPr>
+              <w:spacing w:after="40" w:before="40"/>
+            </w:pPr>
+            <w:r>
+              <w:rPr>
+                <w:b w:val="false"/>
+                <w:bCs w:val="false"/>
+                <w:color w:val="1D2D3E"/>
+                <w:sz w:val="20"/>
+                <w:szCs w:val="20"/>
+              </w:rPr>
+              <w:t xml:space="preserve">Session 62</w:t>
+            </w:r>
+          </w:p>
+        </w:tc>
+        <w:tc>
+          <w:tcPr>
+            <w:shd w:color="F0F4F8" w:val="solid"/>
+          </w:tcPr>
+          <w:p>
+            <w:pPr>
+              <w:spacing w:after="40" w:before="40"/>
+            </w:pPr>
+            <w:r>
+              <w:rPr>
+                <w:b w:val="false"/>
+                <w:bCs w:val="false"/>
+                <w:color w:val="1D2D3E"/>
+                <w:sz w:val="20"/>
+                <w:szCs w:val="20"/>
+              </w:rPr>
+              <w:t xml:space="preserve">FinancialAnalytics NWCTrendCard drill-down — NWCDrillDownModal with top-6 AP bills + AR invoices; Surplus/Deficit tile opens it</w:t>
+            </w:r>
+          </w:p>
+        </w:tc>
+        <w:tc>
+          <w:tcPr>
+            <w:shd w:color="F0F4F8" w:val="solid"/>
+          </w:tcPr>
+          <w:p>
+            <w:pPr>
+              <w:spacing w:after="40" w:before="40"/>
+            </w:pPr>
+            <w:r>
+              <w:rPr>
+                <w:b w:val="false"/>
+                <w:bCs w:val="false"/>
+                <w:color w:val="1D2D3E"/>
+                <w:sz w:val="20"/>
+                <w:szCs w:val="20"/>
+              </w:rPr>
+              <w:t xml:space="preserve">Done</w:t>
+            </w:r>
+          </w:p>
+        </w:tc>
+        <w:tc>
+          <w:tcPr>
+            <w:shd w:color="F0F4F8" w:val="solid"/>
+          </w:tcPr>
+          <w:p>
+            <w:pPr>
+              <w:spacing w:after="40" w:before="40"/>
+            </w:pPr>
+            <w:r>
+              <w:rPr>
+                <w:b w:val="false"/>
+                <w:bCs w:val="false"/>
+                <w:color w:val="1D2D3E"/>
+                <w:sz w:val="20"/>
+                <w:szCs w:val="20"/>
+              </w:rPr>
+              <w:t xml:space="preserve">FinancialAnalyticsScreen.tsx</w:t>
+            </w:r>
+          </w:p>
+        </w:tc>
+      </w:tr>
     </w:tbl>
     <w:p>
       <w:pPr>
@@ -40992,6 +41631,231 @@
           <w:szCs w:val="22"/>
         </w:rPr>
         <w:t xml:space="preserve">  Shows: N vouchers · Dr X · Cr X with dividers; check-circle/alert-circle balance-check icon</w:t>
+      </w:r>
+    </w:p>
+    <w:p>
+      <w:pPr>
+        <w:spacing w:after="80"/>
+      </w:pPr>
+      <w:r>
+        <w:rPr>
+          <w:color w:val="1D2D3E"/>
+          <w:sz w:val="22"/>
+          <w:szCs w:val="22"/>
+        </w:rPr>
+        <w:t xml:space="preserve"/>
+      </w:r>
+    </w:p>
+    <w:p>
+      <w:pPr>
+        <w:pStyle w:val="Heading2"/>
+        <w:spacing w:after="120" w:before="300"/>
+      </w:pPr>
+      <w:r>
+        <w:rPr>
+          <w:b/>
+          <w:bCs/>
+          <w:color w:val="1D2D3E"/>
+        </w:rPr>
+        <w:t xml:space="preserve">Session 62 — 2026-06-12</w:t>
+      </w:r>
+    </w:p>
+    <w:p>
+      <w:pPr>
+        <w:pStyle w:val="ListParagraph"/>
+        <w:numPr>
+          <w:ilvl w:val="0"/>
+          <w:numId w:val="1"/>
+        </w:numPr>
+        <w:spacing w:after="40"/>
+      </w:pPr>
+      <w:r>
+        <w:rPr>
+          <w:color w:val="1D2D3E"/>
+          <w:sz w:val="22"/>
+          <w:szCs w:val="22"/>
+        </w:rPr>
+        <w:t xml:space="preserve">Dashboard FinancialHealthCard 14-Day Score History Sparkline (DashboardScreen.tsx + healthHistory.ts)</w:t>
+      </w:r>
+    </w:p>
+    <w:p>
+      <w:pPr>
+        <w:pStyle w:val="ListParagraph"/>
+        <w:numPr>
+          <w:ilvl w:val="1"/>
+          <w:numId w:val="1"/>
+        </w:numPr>
+        <w:spacing w:after="40"/>
+      </w:pPr>
+      <w:r>
+        <w:rPr>
+          <w:color w:val="1D2D3E"/>
+          <w:sz w:val="22"/>
+          <w:szCs w:val="22"/>
+        </w:rPr>
+        <w:t xml:space="preserve">  New healthHistory.ts: saveHealthSnapshot/loadHealthHistory, 30-entry AsyncStorage per company</w:t>
+      </w:r>
+    </w:p>
+    <w:p>
+      <w:pPr>
+        <w:pStyle w:val="ListParagraph"/>
+        <w:numPr>
+          <w:ilvl w:val="1"/>
+          <w:numId w:val="1"/>
+        </w:numPr>
+        <w:spacing w:after="40"/>
+      </w:pPr>
+      <w:r>
+        <w:rPr>
+          <w:color w:val="1D2D3E"/>
+          <w:sz w:val="22"/>
+          <w:szCs w:val="22"/>
+        </w:rPr>
+        <w:t xml:space="preserve">  HealthScoreSparkline: last-14 bar chart with opacity fade older→newer; sparklineMeta date range label</w:t>
+      </w:r>
+    </w:p>
+    <w:p>
+      <w:pPr>
+        <w:pStyle w:val="ListParagraph"/>
+        <w:numPr>
+          <w:ilvl w:val="1"/>
+          <w:numId w:val="1"/>
+        </w:numPr>
+        <w:spacing w:after="40"/>
+      </w:pPr>
+      <w:r>
+        <w:rPr>
+          <w:color w:val="1D2D3E"/>
+          <w:sz w:val="22"/>
+          <w:szCs w:val="22"/>
+        </w:rPr>
+        <w:t xml:space="preserve">  FinancialHealthCard gains history prop; sparkline shown between AP/AR bars and hint when ≥2 entries</w:t>
+      </w:r>
+    </w:p>
+    <w:p>
+      <w:pPr>
+        <w:pStyle w:val="ListParagraph"/>
+        <w:numPr>
+          <w:ilvl w:val="0"/>
+          <w:numId w:val="1"/>
+        </w:numPr>
+        <w:spacing w:after="40"/>
+      </w:pPr>
+      <w:r>
+        <w:rPr>
+          <w:color w:val="1D2D3E"/>
+          <w:sz w:val="22"/>
+          <w:szCs w:val="22"/>
+        </w:rPr>
+        <w:t xml:space="preserve">ProcurementAnalytics Top Items Card with ItemLedger Navigation (ProcurementAnalyticsScreen.tsx)</w:t>
+      </w:r>
+    </w:p>
+    <w:p>
+      <w:pPr>
+        <w:pStyle w:val="ListParagraph"/>
+        <w:numPr>
+          <w:ilvl w:val="1"/>
+          <w:numId w:val="1"/>
+        </w:numPr>
+        <w:spacing w:after="40"/>
+      </w:pPr>
+      <w:r>
+        <w:rPr>
+          <w:color w:val="1D2D3E"/>
+          <w:sz w:val="22"/>
+          <w:szCs w:val="22"/>
+        </w:rPr>
+        <w:t xml:space="preserve">  computeTopItems aggregates PO line items by name; captures item_id; top-8 by total value</w:t>
+      </w:r>
+    </w:p>
+    <w:p>
+      <w:pPr>
+        <w:pStyle w:val="ListParagraph"/>
+        <w:numPr>
+          <w:ilvl w:val="1"/>
+          <w:numId w:val="1"/>
+        </w:numPr>
+        <w:spacing w:after="40"/>
+      </w:pPr>
+      <w:r>
+        <w:rPr>
+          <w:color w:val="1D2D3E"/>
+          <w:sz w:val="22"/>
+          <w:szCs w:val="22"/>
+        </w:rPr>
+        <w:t xml:space="preserve">  TopItemsCard: ranked list with proportional bars, PO count; items with item_id navigate to ItemLedger</w:t>
+      </w:r>
+    </w:p>
+    <w:p>
+      <w:pPr>
+        <w:pStyle w:val="ListParagraph"/>
+        <w:numPr>
+          <w:ilvl w:val="1"/>
+          <w:numId w:val="1"/>
+        </w:numPr>
+        <w:spacing w:after="40"/>
+      </w:pPr>
+      <w:r>
+        <w:rPr>
+          <w:color w:val="1D2D3E"/>
+          <w:sz w:val="22"/>
+          <w:szCs w:val="22"/>
+        </w:rPr>
+        <w:t xml:space="preserve">  Cross-tab: (navigation as any).navigate('Inventory', { screen: 'ItemLedger', params: {...} })</w:t>
+      </w:r>
+    </w:p>
+    <w:p>
+      <w:pPr>
+        <w:pStyle w:val="ListParagraph"/>
+        <w:numPr>
+          <w:ilvl w:val="0"/>
+          <w:numId w:val="1"/>
+        </w:numPr>
+        <w:spacing w:after="40"/>
+      </w:pPr>
+      <w:r>
+        <w:rPr>
+          <w:color w:val="1D2D3E"/>
+          <w:sz w:val="22"/>
+          <w:szCs w:val="22"/>
+        </w:rPr>
+        <w:t xml:space="preserve">FinancialAnalytics NWCTrendCard Surplus/Deficit Drill-Down Modal (FinancialAnalyticsScreen.tsx)</w:t>
+      </w:r>
+    </w:p>
+    <w:p>
+      <w:pPr>
+        <w:pStyle w:val="ListParagraph"/>
+        <w:numPr>
+          <w:ilvl w:val="1"/>
+          <w:numId w:val="1"/>
+        </w:numPr>
+        <w:spacing w:after="40"/>
+      </w:pPr>
+      <w:r>
+        <w:rPr>
+          <w:color w:val="1D2D3E"/>
+          <w:sz w:val="22"/>
+          <w:szCs w:val="22"/>
+        </w:rPr>
+        <w:t xml:space="preserve">  NWCDrillDownModal: bottom sheet with top-6 AP bills + top-6 AR invoices; overdue flags; +/− amounts</w:t>
+      </w:r>
+    </w:p>
+    <w:p>
+      <w:pPr>
+        <w:pStyle w:val="ListParagraph"/>
+        <w:numPr>
+          <w:ilvl w:val="1"/>
+          <w:numId w:val="1"/>
+        </w:numPr>
+        <w:spacing w:after="40"/>
+      </w:pPr>
+      <w:r>
+        <w:rPr>
+          <w:color w:val="1D2D3E"/>
+          <w:sz w:val="22"/>
+          <w:szCs w:val="22"/>
+        </w:rPr>
+        <w:t xml:space="preserve">  NWCTrendCard: Surplus/Deficit tile → TouchableOpacity with ⓘ icon; modal state: drillDownVisible</w:t>
       </w:r>
     </w:p>
     <w:p>

</xml_diff>

<commit_message>
docs(session-63): update PROGRESS.md, generate-docs.js, and FEATURES.docx with Session 63 changelog
</commit_message>
<xml_diff>
--- a/FEATURES.docx
+++ b/FEATURES.docx
@@ -36324,6 +36324,228 @@
           </w:p>
         </w:tc>
       </w:tr>
+      <w:tr>
+        <w:tc>
+          <w:p>
+            <w:pPr>
+              <w:spacing w:after="40" w:before="40"/>
+            </w:pPr>
+            <w:r>
+              <w:rPr>
+                <w:b w:val="false"/>
+                <w:bCs w:val="false"/>
+                <w:color w:val="1D2D3E"/>
+                <w:sz w:val="20"/>
+                <w:szCs w:val="20"/>
+              </w:rPr>
+              <w:t xml:space="preserve">Session 63</w:t>
+            </w:r>
+          </w:p>
+        </w:tc>
+        <w:tc>
+          <w:p>
+            <w:pPr>
+              <w:spacing w:after="40" w:before="40"/>
+            </w:pPr>
+            <w:r>
+              <w:rPr>
+                <w:b w:val="false"/>
+                <w:bCs w:val="false"/>
+                <w:color w:val="1D2D3E"/>
+                <w:sz w:val="20"/>
+                <w:szCs w:val="20"/>
+              </w:rPr>
+              <w:t xml:space="preserve">AccountStatement opening balance from trial balance — fetch TB as_of day before period; OB row in table; Opening Bal/Net Movement/Closing Bal tiles</w:t>
+            </w:r>
+          </w:p>
+        </w:tc>
+        <w:tc>
+          <w:p>
+            <w:pPr>
+              <w:spacing w:after="40" w:before="40"/>
+            </w:pPr>
+            <w:r>
+              <w:rPr>
+                <w:b w:val="false"/>
+                <w:bCs w:val="false"/>
+                <w:color w:val="1D2D3E"/>
+                <w:sz w:val="20"/>
+                <w:szCs w:val="20"/>
+              </w:rPr>
+              <w:t xml:space="preserve">Done</w:t>
+            </w:r>
+          </w:p>
+        </w:tc>
+        <w:tc>
+          <w:p>
+            <w:pPr>
+              <w:spacing w:after="40" w:before="40"/>
+            </w:pPr>
+            <w:r>
+              <w:rPr>
+                <w:b w:val="false"/>
+                <w:bCs w:val="false"/>
+                <w:color w:val="1D2D3E"/>
+                <w:sz w:val="20"/>
+                <w:szCs w:val="20"/>
+              </w:rPr>
+              <w:t xml:space="preserve">AccountStatementScreen.tsx</w:t>
+            </w:r>
+          </w:p>
+        </w:tc>
+      </w:tr>
+      <w:tr>
+        <w:tc>
+          <w:tcPr>
+            <w:shd w:color="F0F4F8" w:val="solid"/>
+          </w:tcPr>
+          <w:p>
+            <w:pPr>
+              <w:spacing w:after="40" w:before="40"/>
+            </w:pPr>
+            <w:r>
+              <w:rPr>
+                <w:b w:val="false"/>
+                <w:bCs w:val="false"/>
+                <w:color w:val="1D2D3E"/>
+                <w:sz w:val="20"/>
+                <w:szCs w:val="20"/>
+              </w:rPr>
+              <w:t xml:space="preserve">Session 63</w:t>
+            </w:r>
+          </w:p>
+        </w:tc>
+        <w:tc>
+          <w:tcPr>
+            <w:shd w:color="F0F4F8" w:val="solid"/>
+          </w:tcPr>
+          <w:p>
+            <w:pPr>
+              <w:spacing w:after="40" w:before="40"/>
+            </w:pPr>
+            <w:r>
+              <w:rPr>
+                <w:b w:val="false"/>
+                <w:bCs w:val="false"/>
+                <w:color w:val="1D2D3E"/>
+                <w:sz w:val="20"/>
+                <w:szCs w:val="20"/>
+              </w:rPr>
+              <w:t xml:space="preserve">Dashboard FinancialHealthCard grade change alert — pill banner when grade improved/dropped vs previous day history entry</w:t>
+            </w:r>
+          </w:p>
+        </w:tc>
+        <w:tc>
+          <w:tcPr>
+            <w:shd w:color="F0F4F8" w:val="solid"/>
+          </w:tcPr>
+          <w:p>
+            <w:pPr>
+              <w:spacing w:after="40" w:before="40"/>
+            </w:pPr>
+            <w:r>
+              <w:rPr>
+                <w:b w:val="false"/>
+                <w:bCs w:val="false"/>
+                <w:color w:val="1D2D3E"/>
+                <w:sz w:val="20"/>
+                <w:szCs w:val="20"/>
+              </w:rPr>
+              <w:t xml:space="preserve">Done</w:t>
+            </w:r>
+          </w:p>
+        </w:tc>
+        <w:tc>
+          <w:tcPr>
+            <w:shd w:color="F0F4F8" w:val="solid"/>
+          </w:tcPr>
+          <w:p>
+            <w:pPr>
+              <w:spacing w:after="40" w:before="40"/>
+            </w:pPr>
+            <w:r>
+              <w:rPr>
+                <w:b w:val="false"/>
+                <w:bCs w:val="false"/>
+                <w:color w:val="1D2D3E"/>
+                <w:sz w:val="20"/>
+                <w:szCs w:val="20"/>
+              </w:rPr>
+              <w:t xml:space="preserve">DashboardScreen.tsx</w:t>
+            </w:r>
+          </w:p>
+        </w:tc>
+      </w:tr>
+      <w:tr>
+        <w:tc>
+          <w:p>
+            <w:pPr>
+              <w:spacing w:after="40" w:before="40"/>
+            </w:pPr>
+            <w:r>
+              <w:rPr>
+                <w:b w:val="false"/>
+                <w:bCs w:val="false"/>
+                <w:color w:val="1D2D3E"/>
+                <w:sz w:val="20"/>
+                <w:szCs w:val="20"/>
+              </w:rPr>
+              <w:t xml:space="preserve">Session 63</w:t>
+            </w:r>
+          </w:p>
+        </w:tc>
+        <w:tc>
+          <w:p>
+            <w:pPr>
+              <w:spacing w:after="40" w:before="40"/>
+            </w:pPr>
+            <w:r>
+              <w:rPr>
+                <w:b w:val="false"/>
+                <w:bCs w:val="false"/>
+                <w:color w:val="1D2D3E"/>
+                <w:sz w:val="20"/>
+                <w:szCs w:val="20"/>
+              </w:rPr>
+              <w:t xml:space="preserve">ProcurementAnalytics VendorLeadTimeModal recent POs — top-8 POs for vendor with amount, status, lead-time badge; ScrollView sheet</w:t>
+            </w:r>
+          </w:p>
+        </w:tc>
+        <w:tc>
+          <w:p>
+            <w:pPr>
+              <w:spacing w:after="40" w:before="40"/>
+            </w:pPr>
+            <w:r>
+              <w:rPr>
+                <w:b w:val="false"/>
+                <w:bCs w:val="false"/>
+                <w:color w:val="1D2D3E"/>
+                <w:sz w:val="20"/>
+                <w:szCs w:val="20"/>
+              </w:rPr>
+              <w:t xml:space="preserve">Done</w:t>
+            </w:r>
+          </w:p>
+        </w:tc>
+        <w:tc>
+          <w:p>
+            <w:pPr>
+              <w:spacing w:after="40" w:before="40"/>
+            </w:pPr>
+            <w:r>
+              <w:rPr>
+                <w:b w:val="false"/>
+                <w:bCs w:val="false"/>
+                <w:color w:val="1D2D3E"/>
+                <w:sz w:val="20"/>
+                <w:szCs w:val="20"/>
+              </w:rPr>
+              <w:t xml:space="preserve">ProcurementAnalyticsScreen.tsx</w:t>
+            </w:r>
+          </w:p>
+        </w:tc>
+      </w:tr>
     </w:tbl>
     <w:p>
       <w:pPr>
@@ -41631,6 +41853,213 @@
           <w:szCs w:val="22"/>
         </w:rPr>
         <w:t xml:space="preserve">  Shows: N vouchers · Dr X · Cr X with dividers; check-circle/alert-circle balance-check icon</w:t>
+      </w:r>
+    </w:p>
+    <w:p>
+      <w:pPr>
+        <w:spacing w:after="80"/>
+      </w:pPr>
+      <w:r>
+        <w:rPr>
+          <w:color w:val="1D2D3E"/>
+          <w:sz w:val="22"/>
+          <w:szCs w:val="22"/>
+        </w:rPr>
+        <w:t xml:space="preserve"/>
+      </w:r>
+    </w:p>
+    <w:p>
+      <w:pPr>
+        <w:pStyle w:val="Heading2"/>
+        <w:spacing w:after="120" w:before="300"/>
+      </w:pPr>
+      <w:r>
+        <w:rPr>
+          <w:b/>
+          <w:bCs/>
+          <w:color w:val="1D2D3E"/>
+        </w:rPr>
+        <w:t xml:space="preserve">Session 63 — 2026-06-12</w:t>
+      </w:r>
+    </w:p>
+    <w:p>
+      <w:pPr>
+        <w:pStyle w:val="ListParagraph"/>
+        <w:numPr>
+          <w:ilvl w:val="0"/>
+          <w:numId w:val="1"/>
+        </w:numPr>
+        <w:spacing w:after="40"/>
+      </w:pPr>
+      <w:r>
+        <w:rPr>
+          <w:color w:val="1D2D3E"/>
+          <w:sz w:val="22"/>
+          <w:szCs w:val="22"/>
+        </w:rPr>
+        <w:t xml:space="preserve">AccountStatement Opening Balance from Trial Balance (AccountStatementScreen.tsx)</w:t>
+      </w:r>
+    </w:p>
+    <w:p>
+      <w:pPr>
+        <w:pStyle w:val="ListParagraph"/>
+        <w:numPr>
+          <w:ilvl w:val="1"/>
+          <w:numId w:val="1"/>
+        </w:numPr>
+        <w:spacing w:after="40"/>
+      </w:pPr>
+      <w:r>
+        <w:rPr>
+          <w:color w:val="1D2D3E"/>
+          <w:sz w:val="22"/>
+          <w:szCs w:val="22"/>
+        </w:rPr>
+        <w:t xml:space="preserve">  fetchTrialBalance as_of day-before period start; match account_code or account_name; debitNormal convention</w:t>
+      </w:r>
+    </w:p>
+    <w:p>
+      <w:pPr>
+        <w:pStyle w:val="ListParagraph"/>
+        <w:numPr>
+          <w:ilvl w:val="1"/>
+          <w:numId w:val="1"/>
+        </w:numPr>
+        <w:spacing w:after="40"/>
+      </w:pPr>
+      <w:r>
+        <w:rPr>
+          <w:color w:val="1D2D3E"/>
+          <w:sz w:val="22"/>
+          <w:szCs w:val="22"/>
+        </w:rPr>
+        <w:t xml:space="preserve">  Running balance starts from opening balance; tiles switch to Opening Bal / Net Movement / Closing Bal</w:t>
+      </w:r>
+    </w:p>
+    <w:p>
+      <w:pPr>
+        <w:pStyle w:val="ListParagraph"/>
+        <w:numPr>
+          <w:ilvl w:val="1"/>
+          <w:numId w:val="1"/>
+        </w:numPr>
+        <w:spacing w:after="40"/>
+      </w:pPr>
+      <w:r>
+        <w:rPr>
+          <w:color w:val="1D2D3E"/>
+          <w:sz w:val="22"/>
+          <w:szCs w:val="22"/>
+        </w:rPr>
+        <w:t xml:space="preserve">  OB row at top of table: dark badge, highlight background; graceful fallback to 0 if TB unavailable</w:t>
+      </w:r>
+    </w:p>
+    <w:p>
+      <w:pPr>
+        <w:pStyle w:val="ListParagraph"/>
+        <w:numPr>
+          <w:ilvl w:val="0"/>
+          <w:numId w:val="1"/>
+        </w:numPr>
+        <w:spacing w:after="40"/>
+      </w:pPr>
+      <w:r>
+        <w:rPr>
+          <w:color w:val="1D2D3E"/>
+          <w:sz w:val="22"/>
+          <w:szCs w:val="22"/>
+        </w:rPr>
+        <w:t xml:space="preserve">Dashboard FinancialHealthCard Grade Change Alert (DashboardScreen.tsx)</w:t>
+      </w:r>
+    </w:p>
+    <w:p>
+      <w:pPr>
+        <w:pStyle w:val="ListParagraph"/>
+        <w:numPr>
+          <w:ilvl w:val="1"/>
+          <w:numId w:val="1"/>
+        </w:numPr>
+        <w:spacing w:after="40"/>
+      </w:pPr>
+      <w:r>
+        <w:rPr>
+          <w:color w:val="1D2D3E"/>
+          <w:sz w:val="22"/>
+          <w:szCs w:val="22"/>
+        </w:rPr>
+        <w:t xml:space="preserve">  GRADE_ORDER map; find prev-day entry via history.slice().reverse().find(e.date &lt; today)</w:t>
+      </w:r>
+    </w:p>
+    <w:p>
+      <w:pPr>
+        <w:pStyle w:val="ListParagraph"/>
+        <w:numPr>
+          <w:ilvl w:val="1"/>
+          <w:numId w:val="1"/>
+        </w:numPr>
+        <w:spacing w:after="40"/>
+      </w:pPr>
+      <w:r>
+        <w:rPr>
+          <w:color w:val="1D2D3E"/>
+          <w:sz w:val="22"/>
+          <w:szCs w:val="22"/>
+        </w:rPr>
+        <w:t xml:space="preserve">  Pill banner between topRow and AP/AR bars: green improved / red dropped with icon + 'A → B' text</w:t>
+      </w:r>
+    </w:p>
+    <w:p>
+      <w:pPr>
+        <w:pStyle w:val="ListParagraph"/>
+        <w:numPr>
+          <w:ilvl w:val="0"/>
+          <w:numId w:val="1"/>
+        </w:numPr>
+        <w:spacing w:after="40"/>
+      </w:pPr>
+      <w:r>
+        <w:rPr>
+          <w:color w:val="1D2D3E"/>
+          <w:sz w:val="22"/>
+          <w:szCs w:val="22"/>
+        </w:rPr>
+        <w:t xml:space="preserve">ProcurementAnalytics VendorLeadTimeModal Recent POs List (ProcurementAnalyticsScreen.tsx)</w:t>
+      </w:r>
+    </w:p>
+    <w:p>
+      <w:pPr>
+        <w:pStyle w:val="ListParagraph"/>
+        <w:numPr>
+          <w:ilvl w:val="1"/>
+          <w:numId w:val="1"/>
+        </w:numPr>
+        <w:spacing w:after="40"/>
+      </w:pPr>
+      <w:r>
+        <w:rPr>
+          <w:color w:val="1D2D3E"/>
+          <w:sz w:val="22"/>
+          <w:szCs w:val="22"/>
+        </w:rPr>
+        <w:t xml:space="preserve">  vendorPOs prop: top-8 POs sorted desc by date; shown in solo mode below compare button</w:t>
+      </w:r>
+    </w:p>
+    <w:p>
+      <w:pPr>
+        <w:pStyle w:val="ListParagraph"/>
+        <w:numPr>
+          <w:ilvl w:val="1"/>
+          <w:numId w:val="1"/>
+        </w:numPr>
+        <w:spacing w:after="40"/>
+      </w:pPr>
+      <w:r>
+        <w:rPr>
+          <w:color w:val="1D2D3E"/>
+          <w:sz w:val="22"/>
+          <w:szCs w:val="22"/>
+        </w:rPr>
+        <w:t xml:space="preserve">  Each row: PO number+date | amount+status+lead-time badge; sheet → maxHeight 85% + ScrollView</w:t>
       </w:r>
     </w:p>
     <w:p>

</xml_diff>

<commit_message>
docs(session-64): update PROGRESS.md, generate-docs.js, and FEATURES.docx with Session 64 changelog
</commit_message>
<xml_diff>
--- a/FEATURES.docx
+++ b/FEATURES.docx
@@ -36546,6 +36546,240 @@
           </w:p>
         </w:tc>
       </w:tr>
+      <w:tr>
+        <w:tc>
+          <w:tcPr>
+            <w:shd w:color="F0F4F8" w:val="solid"/>
+          </w:tcPr>
+          <w:p>
+            <w:pPr>
+              <w:spacing w:after="40" w:before="40"/>
+            </w:pPr>
+            <w:r>
+              <w:rPr>
+                <w:b w:val="false"/>
+                <w:bCs w:val="false"/>
+                <w:color w:val="1D2D3E"/>
+                <w:sz w:val="20"/>
+                <w:szCs w:val="20"/>
+              </w:rPr>
+              <w:t xml:space="preserve">Session 64</w:t>
+            </w:r>
+          </w:p>
+        </w:tc>
+        <w:tc>
+          <w:tcPr>
+            <w:shd w:color="F0F4F8" w:val="solid"/>
+          </w:tcPr>
+          <w:p>
+            <w:pPr>
+              <w:spacing w:after="40" w:before="40"/>
+            </w:pPr>
+            <w:r>
+              <w:rPr>
+                <w:b w:val="false"/>
+                <w:bCs w:val="false"/>
+                <w:color w:val="1D2D3E"/>
+                <w:sz w:val="20"/>
+                <w:szCs w:val="20"/>
+              </w:rPr>
+              <w:t xml:space="preserve">AccountStatement tap-row→JournalEntryDetail — store _entry ref per line; rows wrapped in TouchableOpacity; chevron indicator</w:t>
+            </w:r>
+          </w:p>
+        </w:tc>
+        <w:tc>
+          <w:tcPr>
+            <w:shd w:color="F0F4F8" w:val="solid"/>
+          </w:tcPr>
+          <w:p>
+            <w:pPr>
+              <w:spacing w:after="40" w:before="40"/>
+            </w:pPr>
+            <w:r>
+              <w:rPr>
+                <w:b w:val="false"/>
+                <w:bCs w:val="false"/>
+                <w:color w:val="1D2D3E"/>
+                <w:sz w:val="20"/>
+                <w:szCs w:val="20"/>
+              </w:rPr>
+              <w:t xml:space="preserve">Done</w:t>
+            </w:r>
+          </w:p>
+        </w:tc>
+        <w:tc>
+          <w:tcPr>
+            <w:shd w:color="F0F4F8" w:val="solid"/>
+          </w:tcPr>
+          <w:p>
+            <w:pPr>
+              <w:spacing w:after="40" w:before="40"/>
+            </w:pPr>
+            <w:r>
+              <w:rPr>
+                <w:b w:val="false"/>
+                <w:bCs w:val="false"/>
+                <w:color w:val="1D2D3E"/>
+                <w:sz w:val="20"/>
+                <w:szCs w:val="20"/>
+              </w:rPr>
+              <w:t xml:space="preserve">AccountStatementScreen.tsx</w:t>
+            </w:r>
+          </w:p>
+        </w:tc>
+      </w:tr>
+      <w:tr>
+        <w:tc>
+          <w:p>
+            <w:pPr>
+              <w:spacing w:after="40" w:before="40"/>
+            </w:pPr>
+            <w:r>
+              <w:rPr>
+                <w:b w:val="false"/>
+                <w:bCs w:val="false"/>
+                <w:color w:val="1D2D3E"/>
+                <w:sz w:val="20"/>
+                <w:szCs w:val="20"/>
+              </w:rPr>
+              <w:t xml:space="preserve">Session 64</w:t>
+            </w:r>
+          </w:p>
+        </w:tc>
+        <w:tc>
+          <w:p>
+            <w:pPr>
+              <w:spacing w:after="40" w:before="40"/>
+            </w:pPr>
+            <w:r>
+              <w:rPr>
+                <w:b w:val="false"/>
+                <w:bCs w:val="false"/>
+                <w:color w:val="1D2D3E"/>
+                <w:sz w:val="20"/>
+                <w:szCs w:val="20"/>
+              </w:rPr>
+              <w:t xml:space="preserve">VendorLeadTimeModal 'View all POs' button — closes modal, navigates to PurchaseOrders pre-filtered by vendor via initialVendor param</w:t>
+            </w:r>
+          </w:p>
+        </w:tc>
+        <w:tc>
+          <w:p>
+            <w:pPr>
+              <w:spacing w:after="40" w:before="40"/>
+            </w:pPr>
+            <w:r>
+              <w:rPr>
+                <w:b w:val="false"/>
+                <w:bCs w:val="false"/>
+                <w:color w:val="1D2D3E"/>
+                <w:sz w:val="20"/>
+                <w:szCs w:val="20"/>
+              </w:rPr>
+              <w:t xml:space="preserve">Done</w:t>
+            </w:r>
+          </w:p>
+        </w:tc>
+        <w:tc>
+          <w:p>
+            <w:pPr>
+              <w:spacing w:after="40" w:before="40"/>
+            </w:pPr>
+            <w:r>
+              <w:rPr>
+                <w:b w:val="false"/>
+                <w:bCs w:val="false"/>
+                <w:color w:val="1D2D3E"/>
+                <w:sz w:val="20"/>
+                <w:szCs w:val="20"/>
+              </w:rPr>
+              <w:t xml:space="preserve">ProcurementAnalyticsScreen.tsx</w:t>
+            </w:r>
+          </w:p>
+        </w:tc>
+      </w:tr>
+      <w:tr>
+        <w:tc>
+          <w:tcPr>
+            <w:shd w:color="F0F4F8" w:val="solid"/>
+          </w:tcPr>
+          <w:p>
+            <w:pPr>
+              <w:spacing w:after="40" w:before="40"/>
+            </w:pPr>
+            <w:r>
+              <w:rPr>
+                <w:b w:val="false"/>
+                <w:bCs w:val="false"/>
+                <w:color w:val="1D2D3E"/>
+                <w:sz w:val="20"/>
+                <w:szCs w:val="20"/>
+              </w:rPr>
+              <w:t xml:space="preserve">Session 64</w:t>
+            </w:r>
+          </w:p>
+        </w:tc>
+        <w:tc>
+          <w:tcPr>
+            <w:shd w:color="F0F4F8" w:val="solid"/>
+          </w:tcPr>
+          <w:p>
+            <w:pPr>
+              <w:spacing w:after="40" w:before="40"/>
+            </w:pPr>
+            <w:r>
+              <w:rPr>
+                <w:b w:val="false"/>
+                <w:bCs w:val="false"/>
+                <w:color w:val="1D2D3E"/>
+                <w:sz w:val="20"/>
+                <w:szCs w:val="20"/>
+              </w:rPr>
+              <w:t xml:space="preserve">Dashboard overdue payments banner — amber banner above KPI grid when bills/invoices are overdue; AP/AR quick-navigate buttons</w:t>
+            </w:r>
+          </w:p>
+        </w:tc>
+        <w:tc>
+          <w:tcPr>
+            <w:shd w:color="F0F4F8" w:val="solid"/>
+          </w:tcPr>
+          <w:p>
+            <w:pPr>
+              <w:spacing w:after="40" w:before="40"/>
+            </w:pPr>
+            <w:r>
+              <w:rPr>
+                <w:b w:val="false"/>
+                <w:bCs w:val="false"/>
+                <w:color w:val="1D2D3E"/>
+                <w:sz w:val="20"/>
+                <w:szCs w:val="20"/>
+              </w:rPr>
+              <w:t xml:space="preserve">Done</w:t>
+            </w:r>
+          </w:p>
+        </w:tc>
+        <w:tc>
+          <w:tcPr>
+            <w:shd w:color="F0F4F8" w:val="solid"/>
+          </w:tcPr>
+          <w:p>
+            <w:pPr>
+              <w:spacing w:after="40" w:before="40"/>
+            </w:pPr>
+            <w:r>
+              <w:rPr>
+                <w:b w:val="false"/>
+                <w:bCs w:val="false"/>
+                <w:color w:val="1D2D3E"/>
+                <w:sz w:val="20"/>
+                <w:szCs w:val="20"/>
+              </w:rPr>
+              <w:t xml:space="preserve">DashboardScreen.tsx</w:t>
+            </w:r>
+          </w:p>
+        </w:tc>
+      </w:tr>
     </w:tbl>
     <w:p>
       <w:pPr>
@@ -41853,6 +42087,267 @@
           <w:szCs w:val="22"/>
         </w:rPr>
         <w:t xml:space="preserve">  Shows: N vouchers · Dr X · Cr X with dividers; check-circle/alert-circle balance-check icon</w:t>
+      </w:r>
+    </w:p>
+    <w:p>
+      <w:pPr>
+        <w:spacing w:after="80"/>
+      </w:pPr>
+      <w:r>
+        <w:rPr>
+          <w:color w:val="1D2D3E"/>
+          <w:sz w:val="22"/>
+          <w:szCs w:val="22"/>
+        </w:rPr>
+        <w:t xml:space="preserve"/>
+      </w:r>
+    </w:p>
+    <w:p>
+      <w:pPr>
+        <w:pStyle w:val="Heading2"/>
+        <w:spacing w:after="120" w:before="300"/>
+      </w:pPr>
+      <w:r>
+        <w:rPr>
+          <w:b/>
+          <w:bCs/>
+          <w:color w:val="1D2D3E"/>
+        </w:rPr>
+        <w:t xml:space="preserve">Session 64 — 2026-06-12</w:t>
+      </w:r>
+    </w:p>
+    <w:p>
+      <w:pPr>
+        <w:pStyle w:val="ListParagraph"/>
+        <w:numPr>
+          <w:ilvl w:val="0"/>
+          <w:numId w:val="1"/>
+        </w:numPr>
+        <w:spacing w:after="40"/>
+      </w:pPr>
+      <w:r>
+        <w:rPr>
+          <w:color w:val="1D2D3E"/>
+          <w:sz w:val="22"/>
+          <w:szCs w:val="22"/>
+        </w:rPr>
+        <w:t xml:space="preserve">AccountStatement Tap-Row → JournalEntryDetail Navigation (AccountStatementScreen.tsx)</w:t>
+      </w:r>
+    </w:p>
+    <w:p>
+      <w:pPr>
+        <w:pStyle w:val="ListParagraph"/>
+        <w:numPr>
+          <w:ilvl w:val="1"/>
+          <w:numId w:val="1"/>
+        </w:numPr>
+        <w:spacing w:after="40"/>
+      </w:pPr>
+      <w:r>
+        <w:rPr>
+          <w:color w:val="1D2D3E"/>
+          <w:sz w:val="22"/>
+          <w:szCs w:val="22"/>
+        </w:rPr>
+        <w:t xml:space="preserve">  _entry field added to AccountStatementLine; stored per line during load()</w:t>
+      </w:r>
+    </w:p>
+    <w:p>
+      <w:pPr>
+        <w:pStyle w:val="ListParagraph"/>
+        <w:numPr>
+          <w:ilvl w:val="1"/>
+          <w:numId w:val="1"/>
+        </w:numPr>
+        <w:spacing w:after="40"/>
+      </w:pPr>
+      <w:r>
+        <w:rPr>
+          <w:color w:val="1D2D3E"/>
+          <w:sz w:val="22"/>
+          <w:szCs w:val="22"/>
+        </w:rPr>
+        <w:t xml:space="preserve">  Each transaction row wrapped in TouchableOpacity; navigates to JournalEntryDetail with full entry object</w:t>
+      </w:r>
+    </w:p>
+    <w:p>
+      <w:pPr>
+        <w:pStyle w:val="ListParagraph"/>
+        <w:numPr>
+          <w:ilvl w:val="1"/>
+          <w:numId w:val="1"/>
+        </w:numPr>
+        <w:spacing w:after="40"/>
+      </w:pPr>
+      <w:r>
+        <w:rPr>
+          <w:color w:val="1D2D3E"/>
+          <w:sz w:val="22"/>
+          <w:szCs w:val="22"/>
+        </w:rPr>
+        <w:t xml:space="preserve">  Chevron indicator (Feather chevron-right) shown on rows with entry reference; balanceCell View for alignment</w:t>
+      </w:r>
+    </w:p>
+    <w:p>
+      <w:pPr>
+        <w:pStyle w:val="ListParagraph"/>
+        <w:numPr>
+          <w:ilvl w:val="0"/>
+          <w:numId w:val="1"/>
+        </w:numPr>
+        <w:spacing w:after="40"/>
+      </w:pPr>
+      <w:r>
+        <w:rPr>
+          <w:color w:val="1D2D3E"/>
+          <w:sz w:val="22"/>
+          <w:szCs w:val="22"/>
+        </w:rPr>
+        <w:t xml:space="preserve">VendorLeadTimeModal 'View all POs' Link Navigation (ProcurementAnalyticsScreen.tsx)</w:t>
+      </w:r>
+    </w:p>
+    <w:p>
+      <w:pPr>
+        <w:pStyle w:val="ListParagraph"/>
+        <w:numPr>
+          <w:ilvl w:val="1"/>
+          <w:numId w:val="1"/>
+        </w:numPr>
+        <w:spacing w:after="40"/>
+      </w:pPr>
+      <w:r>
+        <w:rPr>
+          <w:color w:val="1D2D3E"/>
+          <w:sz w:val="22"/>
+          <w:szCs w:val="22"/>
+        </w:rPr>
+        <w:t xml:space="preserve">  onViewAllPOs prop added to VendorLeadTimeModal; button rendered below recent POs list in solo mode</w:t>
+      </w:r>
+    </w:p>
+    <w:p>
+      <w:pPr>
+        <w:pStyle w:val="ListParagraph"/>
+        <w:numPr>
+          <w:ilvl w:val="1"/>
+          <w:numId w:val="1"/>
+        </w:numPr>
+        <w:spacing w:after="40"/>
+      </w:pPr>
+      <w:r>
+        <w:rPr>
+          <w:color w:val="1D2D3E"/>
+          <w:sz w:val="22"/>
+          <w:szCs w:val="22"/>
+        </w:rPr>
+        <w:t xml:space="preserve">  Button closes modal then navigates to PurchaseOrders with initialVendor param pre-filtering search</w:t>
+      </w:r>
+    </w:p>
+    <w:p>
+      <w:pPr>
+        <w:pStyle w:val="ListParagraph"/>
+        <w:numPr>
+          <w:ilvl w:val="1"/>
+          <w:numId w:val="1"/>
+        </w:numPr>
+        <w:spacing w:after="40"/>
+      </w:pPr>
+      <w:r>
+        <w:rPr>
+          <w:color w:val="1D2D3E"/>
+          <w:sz w:val="22"/>
+          <w:szCs w:val="22"/>
+        </w:rPr>
+        <w:t xml:space="preserve">  MoreStackParamList.PurchaseOrders updated to accept { initialVendor?: string } | undefined</w:t>
+      </w:r>
+    </w:p>
+    <w:p>
+      <w:pPr>
+        <w:pStyle w:val="ListParagraph"/>
+        <w:numPr>
+          <w:ilvl w:val="1"/>
+          <w:numId w:val="1"/>
+        </w:numPr>
+        <w:spacing w:after="40"/>
+      </w:pPr>
+      <w:r>
+        <w:rPr>
+          <w:color w:val="1D2D3E"/>
+          <w:sz w:val="22"/>
+          <w:szCs w:val="22"/>
+        </w:rPr>
+        <w:t xml:space="preserve">  PurchaseOrdersScreen reads route.params?.initialVendor and initialises search state with it</w:t>
+      </w:r>
+    </w:p>
+    <w:p>
+      <w:pPr>
+        <w:pStyle w:val="ListParagraph"/>
+        <w:numPr>
+          <w:ilvl w:val="0"/>
+          <w:numId w:val="1"/>
+        </w:numPr>
+        <w:spacing w:after="40"/>
+      </w:pPr>
+      <w:r>
+        <w:rPr>
+          <w:color w:val="1D2D3E"/>
+          <w:sz w:val="22"/>
+          <w:szCs w:val="22"/>
+        </w:rPr>
+        <w:t xml:space="preserve">Dashboard Overdue Payments Banner (DashboardScreen.tsx)</w:t>
+      </w:r>
+    </w:p>
+    <w:p>
+      <w:pPr>
+        <w:pStyle w:val="ListParagraph"/>
+        <w:numPr>
+          <w:ilvl w:val="1"/>
+          <w:numId w:val="1"/>
+        </w:numPr>
+        <w:spacing w:after="40"/>
+      </w:pPr>
+      <w:r>
+        <w:rPr>
+          <w:color w:val="1D2D3E"/>
+          <w:sz w:val="22"/>
+          <w:szCs w:val="22"/>
+        </w:rPr>
+        <w:t xml:space="preserve">  New overdueBills/overdueInvoices state; isActiveStatus helper; filterOverdue checks due_date &lt; today</w:t>
+      </w:r>
+    </w:p>
+    <w:p>
+      <w:pPr>
+        <w:pStyle w:val="ListParagraph"/>
+        <w:numPr>
+          <w:ilvl w:val="1"/>
+          <w:numId w:val="1"/>
+        </w:numPr>
+        <w:spacing w:after="40"/>
+      </w:pPr>
+      <w:r>
+        <w:rPr>
+          <w:color w:val="1D2D3E"/>
+          <w:sz w:val="22"/>
+          <w:szCs w:val="22"/>
+        </w:rPr>
+        <w:t xml:space="preserve">  Amber banner (fffbeb bg, fcd34d border) above KPI grid when any overdue items exist</w:t>
+      </w:r>
+    </w:p>
+    <w:p>
+      <w:pPr>
+        <w:pStyle w:val="ListParagraph"/>
+        <w:numPr>
+          <w:ilvl w:val="1"/>
+          <w:numId w:val="1"/>
+        </w:numPr>
+        <w:spacing w:after="40"/>
+      </w:pPr>
+      <w:r>
+        <w:rPr>
+          <w:color w:val="1D2D3E"/>
+          <w:sz w:val="22"/>
+          <w:szCs w:val="22"/>
+        </w:rPr>
+        <w:t xml:space="preserve">  Shows count: 'N bills payable · M invoices receivable'; AP/AR quick-navigate buttons</w:t>
       </w:r>
     </w:p>
     <w:p>

</xml_diff>

<commit_message>
docs(session-65): update PROGRESS.md, generate-docs.js, and FEATURES.docx with Session 65 changelog
</commit_message>
<xml_diff>
--- a/FEATURES.docx
+++ b/FEATURES.docx
@@ -36780,6 +36780,228 @@
           </w:p>
         </w:tc>
       </w:tr>
+      <w:tr>
+        <w:tc>
+          <w:p>
+            <w:pPr>
+              <w:spacing w:after="40" w:before="40"/>
+            </w:pPr>
+            <w:r>
+              <w:rPr>
+                <w:b w:val="false"/>
+                <w:bCs w:val="false"/>
+                <w:color w:val="1D2D3E"/>
+                <w:sz w:val="20"/>
+                <w:szCs w:val="20"/>
+              </w:rPr>
+              <w:t xml:space="preserve">Session 65</w:t>
+            </w:r>
+          </w:p>
+        </w:tc>
+        <w:tc>
+          <w:p>
+            <w:pPr>
+              <w:spacing w:after="40" w:before="40"/>
+            </w:pPr>
+            <w:r>
+              <w:rPr>
+                <w:b w:val="false"/>
+                <w:bCs w:val="false"/>
+                <w:color w:val="1D2D3E"/>
+                <w:sz w:val="20"/>
+                <w:szCs w:val="20"/>
+              </w:rPr>
+              <w:t xml:space="preserve">AccountStatement balance zero-crossing highlight — zeroCrossingIdx memo detects sign change; dashed separator row inserted at crossing</w:t>
+            </w:r>
+          </w:p>
+        </w:tc>
+        <w:tc>
+          <w:p>
+            <w:pPr>
+              <w:spacing w:after="40" w:before="40"/>
+            </w:pPr>
+            <w:r>
+              <w:rPr>
+                <w:b w:val="false"/>
+                <w:bCs w:val="false"/>
+                <w:color w:val="1D2D3E"/>
+                <w:sz w:val="20"/>
+                <w:szCs w:val="20"/>
+              </w:rPr>
+              <w:t xml:space="preserve">Done</w:t>
+            </w:r>
+          </w:p>
+        </w:tc>
+        <w:tc>
+          <w:p>
+            <w:pPr>
+              <w:spacing w:after="40" w:before="40"/>
+            </w:pPr>
+            <w:r>
+              <w:rPr>
+                <w:b w:val="false"/>
+                <w:bCs w:val="false"/>
+                <w:color w:val="1D2D3E"/>
+                <w:sz w:val="20"/>
+                <w:szCs w:val="20"/>
+              </w:rPr>
+              <w:t xml:space="preserve">AccountStatementScreen.tsx</w:t>
+            </w:r>
+          </w:p>
+        </w:tc>
+      </w:tr>
+      <w:tr>
+        <w:tc>
+          <w:tcPr>
+            <w:shd w:color="F0F4F8" w:val="solid"/>
+          </w:tcPr>
+          <w:p>
+            <w:pPr>
+              <w:spacing w:after="40" w:before="40"/>
+            </w:pPr>
+            <w:r>
+              <w:rPr>
+                <w:b w:val="false"/>
+                <w:bCs w:val="false"/>
+                <w:color w:val="1D2D3E"/>
+                <w:sz w:val="20"/>
+                <w:szCs w:val="20"/>
+              </w:rPr>
+              <w:t xml:space="preserve">Session 65</w:t>
+            </w:r>
+          </w:p>
+        </w:tc>
+        <w:tc>
+          <w:tcPr>
+            <w:shd w:color="F0F4F8" w:val="solid"/>
+          </w:tcPr>
+          <w:p>
+            <w:pPr>
+              <w:spacing w:after="40" w:before="40"/>
+            </w:pPr>
+            <w:r>
+              <w:rPr>
+                <w:b w:val="false"/>
+                <w:bCs w:val="false"/>
+                <w:color w:val="1D2D3E"/>
+                <w:sz w:val="20"/>
+                <w:szCs w:val="20"/>
+              </w:rPr>
+              <w:t xml:space="preserve">StockHealth import diff preview — buildDiff tags each CSV row NEW/CHG/SAME vs currentThresholds; diff card shows old→new; only changed rows applied</w:t>
+            </w:r>
+          </w:p>
+        </w:tc>
+        <w:tc>
+          <w:tcPr>
+            <w:shd w:color="F0F4F8" w:val="solid"/>
+          </w:tcPr>
+          <w:p>
+            <w:pPr>
+              <w:spacing w:after="40" w:before="40"/>
+            </w:pPr>
+            <w:r>
+              <w:rPr>
+                <w:b w:val="false"/>
+                <w:bCs w:val="false"/>
+                <w:color w:val="1D2D3E"/>
+                <w:sz w:val="20"/>
+                <w:szCs w:val="20"/>
+              </w:rPr>
+              <w:t xml:space="preserve">Done</w:t>
+            </w:r>
+          </w:p>
+        </w:tc>
+        <w:tc>
+          <w:tcPr>
+            <w:shd w:color="F0F4F8" w:val="solid"/>
+          </w:tcPr>
+          <w:p>
+            <w:pPr>
+              <w:spacing w:after="40" w:before="40"/>
+            </w:pPr>
+            <w:r>
+              <w:rPr>
+                <w:b w:val="false"/>
+                <w:bCs w:val="false"/>
+                <w:color w:val="1D2D3E"/>
+                <w:sz w:val="20"/>
+                <w:szCs w:val="20"/>
+              </w:rPr>
+              <w:t xml:space="preserve">StockHealthScreen.tsx</w:t>
+            </w:r>
+          </w:p>
+        </w:tc>
+      </w:tr>
+      <w:tr>
+        <w:tc>
+          <w:p>
+            <w:pPr>
+              <w:spacing w:after="40" w:before="40"/>
+            </w:pPr>
+            <w:r>
+              <w:rPr>
+                <w:b w:val="false"/>
+                <w:bCs w:val="false"/>
+                <w:color w:val="1D2D3E"/>
+                <w:sz w:val="20"/>
+                <w:szCs w:val="20"/>
+              </w:rPr>
+              <w:t xml:space="preserve">Session 65</w:t>
+            </w:r>
+          </w:p>
+        </w:tc>
+        <w:tc>
+          <w:p>
+            <w:pPr>
+              <w:spacing w:after="40" w:before="40"/>
+            </w:pPr>
+            <w:r>
+              <w:rPr>
+                <w:b w:val="false"/>
+                <w:bCs w:val="false"/>
+                <w:color w:val="1D2D3E"/>
+                <w:sz w:val="20"/>
+                <w:szCs w:val="20"/>
+              </w:rPr>
+              <w:t xml:space="preserve">ProcurementAnalytics TopItemsCard sort toggle — Value/Count/Avg pills; bar widths and metric text update per mode</w:t>
+            </w:r>
+          </w:p>
+        </w:tc>
+        <w:tc>
+          <w:p>
+            <w:pPr>
+              <w:spacing w:after="40" w:before="40"/>
+            </w:pPr>
+            <w:r>
+              <w:rPr>
+                <w:b w:val="false"/>
+                <w:bCs w:val="false"/>
+                <w:color w:val="1D2D3E"/>
+                <w:sz w:val="20"/>
+                <w:szCs w:val="20"/>
+              </w:rPr>
+              <w:t xml:space="preserve">Done</w:t>
+            </w:r>
+          </w:p>
+        </w:tc>
+        <w:tc>
+          <w:p>
+            <w:pPr>
+              <w:spacing w:after="40" w:before="40"/>
+            </w:pPr>
+            <w:r>
+              <w:rPr>
+                <w:b w:val="false"/>
+                <w:bCs w:val="false"/>
+                <w:color w:val="1D2D3E"/>
+                <w:sz w:val="20"/>
+                <w:szCs w:val="20"/>
+              </w:rPr>
+              <w:t xml:space="preserve">ProcurementAnalyticsScreen.tsx</w:t>
+            </w:r>
+          </w:p>
+        </w:tc>
+      </w:tr>
     </w:tbl>
     <w:p>
       <w:pPr>
@@ -42087,6 +42309,303 @@
           <w:szCs w:val="22"/>
         </w:rPr>
         <w:t xml:space="preserve">  Shows: N vouchers · Dr X · Cr X with dividers; check-circle/alert-circle balance-check icon</w:t>
+      </w:r>
+    </w:p>
+    <w:p>
+      <w:pPr>
+        <w:spacing w:after="80"/>
+      </w:pPr>
+      <w:r>
+        <w:rPr>
+          <w:color w:val="1D2D3E"/>
+          <w:sz w:val="22"/>
+          <w:szCs w:val="22"/>
+        </w:rPr>
+        <w:t xml:space="preserve"/>
+      </w:r>
+    </w:p>
+    <w:p>
+      <w:pPr>
+        <w:pStyle w:val="Heading2"/>
+        <w:spacing w:after="120" w:before="300"/>
+      </w:pPr>
+      <w:r>
+        <w:rPr>
+          <w:b/>
+          <w:bCs/>
+          <w:color w:val="1D2D3E"/>
+        </w:rPr>
+        <w:t xml:space="preserve">Session 65 — 2026-06-12</w:t>
+      </w:r>
+    </w:p>
+    <w:p>
+      <w:pPr>
+        <w:pStyle w:val="ListParagraph"/>
+        <w:numPr>
+          <w:ilvl w:val="0"/>
+          <w:numId w:val="1"/>
+        </w:numPr>
+        <w:spacing w:after="40"/>
+      </w:pPr>
+      <w:r>
+        <w:rPr>
+          <w:color w:val="1D2D3E"/>
+          <w:sz w:val="22"/>
+          <w:szCs w:val="22"/>
+        </w:rPr>
+        <w:t xml:space="preserve">AccountStatement Balance Zero-Crossing Highlight (AccountStatementScreen.tsx)</w:t>
+      </w:r>
+    </w:p>
+    <w:p>
+      <w:pPr>
+        <w:pStyle w:val="ListParagraph"/>
+        <w:numPr>
+          <w:ilvl w:val="1"/>
+          <w:numId w:val="1"/>
+        </w:numPr>
+        <w:spacing w:after="40"/>
+      </w:pPr>
+      <w:r>
+        <w:rPr>
+          <w:color w:val="1D2D3E"/>
+          <w:sz w:val="22"/>
+          <w:szCs w:val="22"/>
+        </w:rPr>
+        <w:t xml:space="preserve">  zeroCrossingIdx memo scans lines for first index where balance changes sign (pos↔neg)</w:t>
+      </w:r>
+    </w:p>
+    <w:p>
+      <w:pPr>
+        <w:pStyle w:val="ListParagraph"/>
+        <w:numPr>
+          <w:ilvl w:val="1"/>
+          <w:numId w:val="1"/>
+        </w:numPr>
+        <w:spacing w:after="40"/>
+      </w:pPr>
+      <w:r>
+        <w:rPr>
+          <w:color w:val="1D2D3E"/>
+          <w:sz w:val="22"/>
+          <w:szCs w:val="22"/>
+        </w:rPr>
+        <w:t xml:space="preserve">  React.Fragment wrapper allows inserting the separator between rows without extra DOM nodes</w:t>
+      </w:r>
+    </w:p>
+    <w:p>
+      <w:pPr>
+        <w:pStyle w:val="ListParagraph"/>
+        <w:numPr>
+          <w:ilvl w:val="1"/>
+          <w:numId w:val="1"/>
+        </w:numPr>
+        <w:spacing w:after="40"/>
+      </w:pPr>
+      <w:r>
+        <w:rPr>
+          <w:color w:val="1D2D3E"/>
+          <w:sz w:val="22"/>
+          <w:szCs w:val="22"/>
+        </w:rPr>
+        <w:t xml:space="preserve">  Dashed 'balance crosses zero' row with hairline lines on either side, matching JE screen UX</w:t>
+      </w:r>
+    </w:p>
+    <w:p>
+      <w:pPr>
+        <w:pStyle w:val="ListParagraph"/>
+        <w:numPr>
+          <w:ilvl w:val="0"/>
+          <w:numId w:val="1"/>
+        </w:numPr>
+        <w:spacing w:after="40"/>
+      </w:pPr>
+      <w:r>
+        <w:rPr>
+          <w:color w:val="1D2D3E"/>
+          <w:sz w:val="22"/>
+          <w:szCs w:val="22"/>
+        </w:rPr>
+        <w:t xml:space="preserve">StockHealth Threshold Import Diff Preview (StockHealthScreen.tsx)</w:t>
+      </w:r>
+    </w:p>
+    <w:p>
+      <w:pPr>
+        <w:pStyle w:val="ListParagraph"/>
+        <w:numPr>
+          <w:ilvl w:val="1"/>
+          <w:numId w:val="1"/>
+        </w:numPr>
+        <w:spacing w:after="40"/>
+      </w:pPr>
+      <w:r>
+        <w:rPr>
+          <w:color w:val="1D2D3E"/>
+          <w:sz w:val="22"/>
+          <w:szCs w:val="22"/>
+        </w:rPr>
+        <w:t xml:space="preserve">  buildDiff() tags each CSV row: NEW (no current threshold), CHG (different value), SAME (unchanged)</w:t>
+      </w:r>
+    </w:p>
+    <w:p>
+      <w:pPr>
+        <w:pStyle w:val="ListParagraph"/>
+        <w:numPr>
+          <w:ilvl w:val="1"/>
+          <w:numId w:val="1"/>
+        </w:numPr>
+        <w:spacing w:after="40"/>
+      </w:pPr>
+      <w:r>
+        <w:rPr>
+          <w:color w:val="1D2D3E"/>
+          <w:sz w:val="22"/>
+          <w:szCs w:val="22"/>
+        </w:rPr>
+        <w:t xml:space="preserve">  Diff card rendered below parse summary; pill shows kind; value column shows old→new or '→ N'</w:t>
+      </w:r>
+    </w:p>
+    <w:p>
+      <w:pPr>
+        <w:pStyle w:val="ListParagraph"/>
+        <w:numPr>
+          <w:ilvl w:val="1"/>
+          <w:numId w:val="1"/>
+        </w:numPr>
+        <w:spacing w:after="40"/>
+      </w:pPr>
+      <w:r>
+        <w:rPr>
+          <w:color w:val="1D2D3E"/>
+          <w:sz w:val="22"/>
+          <w:szCs w:val="22"/>
+        </w:rPr>
+        <w:t xml:space="preserve">  Only NEW + CHG rows passed to onImport; unchanged rows silently skipped</w:t>
+      </w:r>
+    </w:p>
+    <w:p>
+      <w:pPr>
+        <w:pStyle w:val="ListParagraph"/>
+        <w:numPr>
+          <w:ilvl w:val="1"/>
+          <w:numId w:val="1"/>
+        </w:numPr>
+        <w:spacing w:after="40"/>
+      </w:pPr>
+      <w:r>
+        <w:rPr>
+          <w:color w:val="1D2D3E"/>
+          <w:sz w:val="22"/>
+          <w:szCs w:val="22"/>
+        </w:rPr>
+        <w:t xml:space="preserve">  Import button label: 'Apply N changes' / disabled when nothing actionable</w:t>
+      </w:r>
+    </w:p>
+    <w:p>
+      <w:pPr>
+        <w:pStyle w:val="ListParagraph"/>
+        <w:numPr>
+          <w:ilvl w:val="1"/>
+          <w:numId w:val="1"/>
+        </w:numPr>
+        <w:spacing w:after="40"/>
+      </w:pPr>
+      <w:r>
+        <w:rPr>
+          <w:color w:val="1D2D3E"/>
+          <w:sz w:val="22"/>
+          <w:szCs w:val="22"/>
+        </w:rPr>
+        <w:t xml:space="preserve">  ThresholdImportModal gains currentThresholds prop; result message reports applied/unchanged/errors</w:t>
+      </w:r>
+    </w:p>
+    <w:p>
+      <w:pPr>
+        <w:pStyle w:val="ListParagraph"/>
+        <w:numPr>
+          <w:ilvl w:val="0"/>
+          <w:numId w:val="1"/>
+        </w:numPr>
+        <w:spacing w:after="40"/>
+      </w:pPr>
+      <w:r>
+        <w:rPr>
+          <w:color w:val="1D2D3E"/>
+          <w:sz w:val="22"/>
+          <w:szCs w:val="22"/>
+        </w:rPr>
+        <w:t xml:space="preserve">ProcurementAnalytics TopItemsCard Sort Toggle (ProcurementAnalyticsScreen.tsx)</w:t>
+      </w:r>
+    </w:p>
+    <w:p>
+      <w:pPr>
+        <w:pStyle w:val="ListParagraph"/>
+        <w:numPr>
+          <w:ilvl w:val="1"/>
+          <w:numId w:val="1"/>
+        </w:numPr>
+        <w:spacing w:after="40"/>
+      </w:pPr>
+      <w:r>
+        <w:rPr>
+          <w:color w:val="1D2D3E"/>
+          <w:sz w:val="22"/>
+          <w:szCs w:val="22"/>
+        </w:rPr>
+        <w:t xml:space="preserve">  TopItemSortMode type: 'value' | 'count' | 'avg'</w:t>
+      </w:r>
+    </w:p>
+    <w:p>
+      <w:pPr>
+        <w:pStyle w:val="ListParagraph"/>
+        <w:numPr>
+          <w:ilvl w:val="1"/>
+          <w:numId w:val="1"/>
+        </w:numPr>
+        <w:spacing w:after="40"/>
+      </w:pPr>
+      <w:r>
+        <w:rPr>
+          <w:color w:val="1D2D3E"/>
+          <w:sz w:val="22"/>
+          <w:szCs w:val="22"/>
+        </w:rPr>
+        <w:t xml:space="preserve">  Pill bar at top of card with three mode pills; active pill inverted (dark bg, white text)</w:t>
+      </w:r>
+    </w:p>
+    <w:p>
+      <w:pPr>
+        <w:pStyle w:val="ListParagraph"/>
+        <w:numPr>
+          <w:ilvl w:val="1"/>
+          <w:numId w:val="1"/>
+        </w:numPr>
+        <w:spacing w:after="40"/>
+      </w:pPr>
+      <w:r>
+        <w:rPr>
+          <w:color w:val="1D2D3E"/>
+          <w:sz w:val="22"/>
+          <w:szCs w:val="22"/>
+        </w:rPr>
+        <w:t xml:space="preserve">  sortedItems, getMetric, formatMetric, formatSub all update to reflect active sort mode</w:t>
+      </w:r>
+    </w:p>
+    <w:p>
+      <w:pPr>
+        <w:pStyle w:val="ListParagraph"/>
+        <w:numPr>
+          <w:ilvl w:val="1"/>
+          <w:numId w:val="1"/>
+        </w:numPr>
+        <w:spacing w:after="40"/>
+      </w:pPr>
+      <w:r>
+        <w:rPr>
+          <w:color w:val="1D2D3E"/>
+          <w:sz w:val="22"/>
+          <w:szCs w:val="22"/>
+        </w:rPr>
+        <w:t xml:space="preserve">  Default sort remains 'value' to preserve existing behaviour</w:t>
       </w:r>
     </w:p>
     <w:p>

</xml_diff>

<commit_message>
docs(session-66): update PROGRESS.md, generate-docs.js, and FEATURES.docx with Session 66 changelog
</commit_message>
<xml_diff>
--- a/FEATURES.docx
+++ b/FEATURES.docx
@@ -45,7 +45,7 @@
           <w:sz w:val="20"/>
           <w:szCs w:val="20"/>
         </w:rPr>
-        <w:t xml:space="preserve">Generated: 2026-06-12</w:t>
+        <w:t xml:space="preserve">Generated: 2026-06-13</w:t>
       </w:r>
     </w:p>
     <w:p>
@@ -37002,6 +37002,240 @@
           </w:p>
         </w:tc>
       </w:tr>
+      <w:tr>
+        <w:tc>
+          <w:tcPr>
+            <w:shd w:color="F0F4F8" w:val="solid"/>
+          </w:tcPr>
+          <w:p>
+            <w:pPr>
+              <w:spacing w:after="40" w:before="40"/>
+            </w:pPr>
+            <w:r>
+              <w:rPr>
+                <w:b w:val="false"/>
+                <w:bCs w:val="false"/>
+                <w:color w:val="1D2D3E"/>
+                <w:sz w:val="20"/>
+                <w:szCs w:val="20"/>
+              </w:rPr>
+              <w:t xml:space="preserve">Session 66</w:t>
+            </w:r>
+          </w:p>
+        </w:tc>
+        <w:tc>
+          <w:tcPr>
+            <w:shd w:color="F0F4F8" w:val="solid"/>
+          </w:tcPr>
+          <w:p>
+            <w:pPr>
+              <w:spacing w:after="40" w:before="40"/>
+            </w:pPr>
+            <w:r>
+              <w:rPr>
+                <w:b w:val="false"/>
+                <w:bCs w:val="false"/>
+                <w:color w:val="1D2D3E"/>
+                <w:sz w:val="20"/>
+                <w:szCs w:val="20"/>
+              </w:rPr>
+              <w:t xml:space="preserve">JournalEntries line-level account search — entry.lines[].account added to search haystack; all words must match (AND logic)</w:t>
+            </w:r>
+          </w:p>
+        </w:tc>
+        <w:tc>
+          <w:tcPr>
+            <w:shd w:color="F0F4F8" w:val="solid"/>
+          </w:tcPr>
+          <w:p>
+            <w:pPr>
+              <w:spacing w:after="40" w:before="40"/>
+            </w:pPr>
+            <w:r>
+              <w:rPr>
+                <w:b w:val="false"/>
+                <w:bCs w:val="false"/>
+                <w:color w:val="1D2D3E"/>
+                <w:sz w:val="20"/>
+                <w:szCs w:val="20"/>
+              </w:rPr>
+              <w:t xml:space="preserve">Done</w:t>
+            </w:r>
+          </w:p>
+        </w:tc>
+        <w:tc>
+          <w:tcPr>
+            <w:shd w:color="F0F4F8" w:val="solid"/>
+          </w:tcPr>
+          <w:p>
+            <w:pPr>
+              <w:spacing w:after="40" w:before="40"/>
+            </w:pPr>
+            <w:r>
+              <w:rPr>
+                <w:b w:val="false"/>
+                <w:bCs w:val="false"/>
+                <w:color w:val="1D2D3E"/>
+                <w:sz w:val="20"/>
+                <w:szCs w:val="20"/>
+              </w:rPr>
+              <w:t xml:space="preserve">JournalEntriesScreen.tsx</w:t>
+            </w:r>
+          </w:p>
+        </w:tc>
+      </w:tr>
+      <w:tr>
+        <w:tc>
+          <w:p>
+            <w:pPr>
+              <w:spacing w:after="40" w:before="40"/>
+            </w:pPr>
+            <w:r>
+              <w:rPr>
+                <w:b w:val="false"/>
+                <w:bCs w:val="false"/>
+                <w:color w:val="1D2D3E"/>
+                <w:sz w:val="20"/>
+                <w:szCs w:val="20"/>
+              </w:rPr>
+              <w:t xml:space="preserve">Session 66</w:t>
+            </w:r>
+          </w:p>
+        </w:tc>
+        <w:tc>
+          <w:p>
+            <w:pPr>
+              <w:spacing w:after="40" w:before="40"/>
+            </w:pPr>
+            <w:r>
+              <w:rPr>
+                <w:b w:val="false"/>
+                <w:bCs w:val="false"/>
+                <w:color w:val="1D2D3E"/>
+                <w:sz w:val="20"/>
+                <w:szCs w:val="20"/>
+              </w:rPr>
+              <w:t xml:space="preserve">AccountStatement row search + type filter — compact search bar filters rows by narration/voucher; type chips filter by voucher type; filtered totals row and entry count</w:t>
+            </w:r>
+          </w:p>
+        </w:tc>
+        <w:tc>
+          <w:p>
+            <w:pPr>
+              <w:spacing w:after="40" w:before="40"/>
+            </w:pPr>
+            <w:r>
+              <w:rPr>
+                <w:b w:val="false"/>
+                <w:bCs w:val="false"/>
+                <w:color w:val="1D2D3E"/>
+                <w:sz w:val="20"/>
+                <w:szCs w:val="20"/>
+              </w:rPr>
+              <w:t xml:space="preserve">Done</w:t>
+            </w:r>
+          </w:p>
+        </w:tc>
+        <w:tc>
+          <w:p>
+            <w:pPr>
+              <w:spacing w:after="40" w:before="40"/>
+            </w:pPr>
+            <w:r>
+              <w:rPr>
+                <w:b w:val="false"/>
+                <w:bCs w:val="false"/>
+                <w:color w:val="1D2D3E"/>
+                <w:sz w:val="20"/>
+                <w:szCs w:val="20"/>
+              </w:rPr>
+              <w:t xml:space="preserve">AccountStatementScreen.tsx</w:t>
+            </w:r>
+          </w:p>
+        </w:tc>
+      </w:tr>
+      <w:tr>
+        <w:tc>
+          <w:tcPr>
+            <w:shd w:color="F0F4F8" w:val="solid"/>
+          </w:tcPr>
+          <w:p>
+            <w:pPr>
+              <w:spacing w:after="40" w:before="40"/>
+            </w:pPr>
+            <w:r>
+              <w:rPr>
+                <w:b w:val="false"/>
+                <w:bCs w:val="false"/>
+                <w:color w:val="1D2D3E"/>
+                <w:sz w:val="20"/>
+                <w:szCs w:val="20"/>
+              </w:rPr>
+              <w:t xml:space="preserve">Session 66</w:t>
+            </w:r>
+          </w:p>
+        </w:tc>
+        <w:tc>
+          <w:tcPr>
+            <w:shd w:color="F0F4F8" w:val="solid"/>
+          </w:tcPr>
+          <w:p>
+            <w:pPr>
+              <w:spacing w:after="40" w:before="40"/>
+            </w:pPr>
+            <w:r>
+              <w:rPr>
+                <w:b w:val="false"/>
+                <w:bCs w:val="false"/>
+                <w:color w:val="1D2D3E"/>
+                <w:sz w:val="20"/>
+                <w:szCs w:val="20"/>
+              </w:rPr>
+              <w:t xml:space="preserve">AgingHistory 90-day cap + 60d/90d/All period chips — storage bumped from 30→90 entries; chips 7d/14d/30d/60d/90d/All; 0=All shows entire history</w:t>
+            </w:r>
+          </w:p>
+        </w:tc>
+        <w:tc>
+          <w:tcPr>
+            <w:shd w:color="F0F4F8" w:val="solid"/>
+          </w:tcPr>
+          <w:p>
+            <w:pPr>
+              <w:spacing w:after="40" w:before="40"/>
+            </w:pPr>
+            <w:r>
+              <w:rPr>
+                <w:b w:val="false"/>
+                <w:bCs w:val="false"/>
+                <w:color w:val="1D2D3E"/>
+                <w:sz w:val="20"/>
+                <w:szCs w:val="20"/>
+              </w:rPr>
+              <w:t xml:space="preserve">Done</w:t>
+            </w:r>
+          </w:p>
+        </w:tc>
+        <w:tc>
+          <w:tcPr>
+            <w:shd w:color="F0F4F8" w:val="solid"/>
+          </w:tcPr>
+          <w:p>
+            <w:pPr>
+              <w:spacing w:after="40" w:before="40"/>
+            </w:pPr>
+            <w:r>
+              <w:rPr>
+                <w:b w:val="false"/>
+                <w:bCs w:val="false"/>
+                <w:color w:val="1D2D3E"/>
+                <w:sz w:val="20"/>
+                <w:szCs w:val="20"/>
+              </w:rPr>
+              <w:t xml:space="preserve">agingSnapshot.ts, FinancialAnalyticsScreen.tsx</w:t>
+            </w:r>
+          </w:p>
+        </w:tc>
+      </w:tr>
     </w:tbl>
     <w:p>
       <w:pPr>
@@ -42309,6 +42543,357 @@
           <w:szCs w:val="22"/>
         </w:rPr>
         <w:t xml:space="preserve">  Shows: N vouchers · Dr X · Cr X with dividers; check-circle/alert-circle balance-check icon</w:t>
+      </w:r>
+    </w:p>
+    <w:p>
+      <w:pPr>
+        <w:spacing w:after="80"/>
+      </w:pPr>
+      <w:r>
+        <w:rPr>
+          <w:color w:val="1D2D3E"/>
+          <w:sz w:val="22"/>
+          <w:szCs w:val="22"/>
+        </w:rPr>
+        <w:t xml:space="preserve"/>
+      </w:r>
+    </w:p>
+    <w:p>
+      <w:pPr>
+        <w:pStyle w:val="Heading2"/>
+        <w:spacing w:after="120" w:before="300"/>
+      </w:pPr>
+      <w:r>
+        <w:rPr>
+          <w:b/>
+          <w:bCs/>
+          <w:color w:val="1D2D3E"/>
+        </w:rPr>
+        <w:t xml:space="preserve">Session 66 — 2026-06-13</w:t>
+      </w:r>
+    </w:p>
+    <w:p>
+      <w:pPr>
+        <w:pStyle w:val="ListParagraph"/>
+        <w:numPr>
+          <w:ilvl w:val="0"/>
+          <w:numId w:val="1"/>
+        </w:numPr>
+        <w:spacing w:after="40"/>
+      </w:pPr>
+      <w:r>
+        <w:rPr>
+          <w:color w:val="1D2D3E"/>
+          <w:sz w:val="22"/>
+          <w:szCs w:val="22"/>
+        </w:rPr>
+        <w:t xml:space="preserve">JournalEntries Line-Level Account Search (JournalEntriesScreen.tsx)</w:t>
+      </w:r>
+    </w:p>
+    <w:p>
+      <w:pPr>
+        <w:pStyle w:val="ListParagraph"/>
+        <w:numPr>
+          <w:ilvl w:val="1"/>
+          <w:numId w:val="1"/>
+        </w:numPr>
+        <w:spacing w:after="40"/>
+      </w:pPr>
+      <w:r>
+        <w:rPr>
+          <w:color w:val="1D2D3E"/>
+          <w:sz w:val="22"/>
+          <w:szCs w:val="22"/>
+        </w:rPr>
+        <w:t xml:space="preserve">  Search haystack now includes entry.lines[].account names joined with spaces</w:t>
+      </w:r>
+    </w:p>
+    <w:p>
+      <w:pPr>
+        <w:pStyle w:val="ListParagraph"/>
+        <w:numPr>
+          <w:ilvl w:val="1"/>
+          <w:numId w:val="1"/>
+        </w:numPr>
+        <w:spacing w:after="40"/>
+      </w:pPr>
+      <w:r>
+        <w:rPr>
+          <w:color w:val="1D2D3E"/>
+          <w:sz w:val="22"/>
+          <w:szCs w:val="22"/>
+        </w:rPr>
+        <w:t xml:space="preserve">  All search words must match (AND logic) against voucher_no + narration + type + line accounts</w:t>
+      </w:r>
+    </w:p>
+    <w:p>
+      <w:pPr>
+        <w:pStyle w:val="ListParagraph"/>
+        <w:numPr>
+          <w:ilvl w:val="1"/>
+          <w:numId w:val="1"/>
+        </w:numPr>
+        <w:spacing w:after="40"/>
+      </w:pPr>
+      <w:r>
+        <w:rPr>
+          <w:color w:val="1D2D3E"/>
+          <w:sz w:val="22"/>
+          <w:szCs w:val="22"/>
+        </w:rPr>
+        <w:t xml:space="preserve">  Search placeholder updated: 'Search by voucher, narration, type, account…'</w:t>
+      </w:r>
+    </w:p>
+    <w:p>
+      <w:pPr>
+        <w:pStyle w:val="ListParagraph"/>
+        <w:numPr>
+          <w:ilvl w:val="0"/>
+          <w:numId w:val="1"/>
+        </w:numPr>
+        <w:spacing w:after="40"/>
+      </w:pPr>
+      <w:r>
+        <w:rPr>
+          <w:color w:val="1D2D3E"/>
+          <w:sz w:val="22"/>
+          <w:szCs w:val="22"/>
+        </w:rPr>
+        <w:t xml:space="preserve">AccountStatement Row Search + Voucher-Type Filter (AccountStatementScreen.tsx)</w:t>
+      </w:r>
+    </w:p>
+    <w:p>
+      <w:pPr>
+        <w:pStyle w:val="ListParagraph"/>
+        <w:numPr>
+          <w:ilvl w:val="1"/>
+          <w:numId w:val="1"/>
+        </w:numPr>
+        <w:spacing w:after="40"/>
+      </w:pPr>
+      <w:r>
+        <w:rPr>
+          <w:color w:val="1D2D3E"/>
+          <w:sz w:val="22"/>
+          <w:szCs w:val="22"/>
+        </w:rPr>
+        <w:t xml:space="preserve">  rowSearch state + TextInput: filters table rows by narration/voucherNo/voucherType (multi-word AND)</w:t>
+      </w:r>
+    </w:p>
+    <w:p>
+      <w:pPr>
+        <w:pStyle w:val="ListParagraph"/>
+        <w:numPr>
+          <w:ilvl w:val="1"/>
+          <w:numId w:val="1"/>
+        </w:numPr>
+        <w:spacing w:after="40"/>
+      </w:pPr>
+      <w:r>
+        <w:rPr>
+          <w:color w:val="1D2D3E"/>
+          <w:sz w:val="22"/>
+          <w:szCs w:val="22"/>
+        </w:rPr>
+        <w:t xml:space="preserve">  rowTypeFilter state + type chips: uniqueTypes derived from lines; chip tap toggles type filter</w:t>
+      </w:r>
+    </w:p>
+    <w:p>
+      <w:pPr>
+        <w:pStyle w:val="ListParagraph"/>
+        <w:numPr>
+          <w:ilvl w:val="1"/>
+          <w:numId w:val="1"/>
+        </w:numPr>
+        <w:spacing w:after="40"/>
+      </w:pPr>
+      <w:r>
+        <w:rPr>
+          <w:color w:val="1D2D3E"/>
+          <w:sz w:val="22"/>
+          <w:szCs w:val="22"/>
+        </w:rPr>
+        <w:t xml:space="preserve">  filteredLines useMemo: applies both search and type filter; renders subset with accurate row borders</w:t>
+      </w:r>
+    </w:p>
+    <w:p>
+      <w:pPr>
+        <w:pStyle w:val="ListParagraph"/>
+        <w:numPr>
+          <w:ilvl w:val="1"/>
+          <w:numId w:val="1"/>
+        </w:numPr>
+        <w:spacing w:after="40"/>
+      </w:pPr>
+      <w:r>
+        <w:rPr>
+          <w:color w:val="1D2D3E"/>
+          <w:sz w:val="22"/>
+          <w:szCs w:val="22"/>
+        </w:rPr>
+        <w:t xml:space="preserve">  SectionHeader meta shows 'N of M' when a filter is active; empty state when filtered to zero</w:t>
+      </w:r>
+    </w:p>
+    <w:p>
+      <w:pPr>
+        <w:pStyle w:val="ListParagraph"/>
+        <w:numPr>
+          <w:ilvl w:val="1"/>
+          <w:numId w:val="1"/>
+        </w:numPr>
+        <w:spacing w:after="40"/>
+      </w:pPr>
+      <w:r>
+        <w:rPr>
+          <w:color w:val="1D2D3E"/>
+          <w:sz w:val="22"/>
+          <w:szCs w:val="22"/>
+        </w:rPr>
+        <w:t xml:space="preserve">  Opening balance row hidden while a filter is active (balance context would be misleading)</w:t>
+      </w:r>
+    </w:p>
+    <w:p>
+      <w:pPr>
+        <w:pStyle w:val="ListParagraph"/>
+        <w:numPr>
+          <w:ilvl w:val="1"/>
+          <w:numId w:val="1"/>
+        </w:numPr>
+        <w:spacing w:after="40"/>
+      </w:pPr>
+      <w:r>
+        <w:rPr>
+          <w:color w:val="1D2D3E"/>
+          <w:sz w:val="22"/>
+          <w:szCs w:val="22"/>
+        </w:rPr>
+        <w:t xml:space="preserve">  Totals row shows filtered debit/credit totals and label changes to 'Filtered' when active</w:t>
+      </w:r>
+    </w:p>
+    <w:p>
+      <w:pPr>
+        <w:pStyle w:val="ListParagraph"/>
+        <w:numPr>
+          <w:ilvl w:val="1"/>
+          <w:numId w:val="1"/>
+        </w:numPr>
+        <w:spacing w:after="40"/>
+      </w:pPr>
+      <w:r>
+        <w:rPr>
+          <w:color w:val="1D2D3E"/>
+          <w:sz w:val="22"/>
+          <w:szCs w:val="22"/>
+        </w:rPr>
+        <w:t xml:space="preserve">  zeroCrossingIdx recomputed on filteredLines so crossing marker tracks visible rows correctly</w:t>
+      </w:r>
+    </w:p>
+    <w:p>
+      <w:pPr>
+        <w:pStyle w:val="ListParagraph"/>
+        <w:numPr>
+          <w:ilvl w:val="0"/>
+          <w:numId w:val="1"/>
+        </w:numPr>
+        <w:spacing w:after="40"/>
+      </w:pPr>
+      <w:r>
+        <w:rPr>
+          <w:color w:val="1D2D3E"/>
+          <w:sz w:val="22"/>
+          <w:szCs w:val="22"/>
+        </w:rPr>
+        <w:t xml:space="preserve">AgingHistory 90-Day Storage + Extended Period Chips (agingSnapshot.ts, FinancialAnalyticsScreen.tsx)</w:t>
+      </w:r>
+    </w:p>
+    <w:p>
+      <w:pPr>
+        <w:pStyle w:val="ListParagraph"/>
+        <w:numPr>
+          <w:ilvl w:val="1"/>
+          <w:numId w:val="1"/>
+        </w:numPr>
+        <w:spacing w:after="40"/>
+      </w:pPr>
+      <w:r>
+        <w:rPr>
+          <w:color w:val="1D2D3E"/>
+          <w:sz w:val="22"/>
+          <w:szCs w:val="22"/>
+        </w:rPr>
+        <w:t xml:space="preserve">  MAX_HISTORY_DAYS increased from 30 to 90 in agingSnapshot.ts — accumulates up to 90 daily entries</w:t>
+      </w:r>
+    </w:p>
+    <w:p>
+      <w:pPr>
+        <w:pStyle w:val="ListParagraph"/>
+        <w:numPr>
+          <w:ilvl w:val="1"/>
+          <w:numId w:val="1"/>
+        </w:numPr>
+        <w:spacing w:after="40"/>
+      </w:pPr>
+      <w:r>
+        <w:rPr>
+          <w:color w:val="1D2D3E"/>
+          <w:sz w:val="22"/>
+          <w:szCs w:val="22"/>
+        </w:rPr>
+        <w:t xml:space="preserve">  historyPeriod type extended to 7 | 14 | 30 | 60 | 90 | 0 (0 = All)</w:t>
+      </w:r>
+    </w:p>
+    <w:p>
+      <w:pPr>
+        <w:pStyle w:val="ListParagraph"/>
+        <w:numPr>
+          <w:ilvl w:val="1"/>
+          <w:numId w:val="1"/>
+        </w:numPr>
+        <w:spacing w:after="40"/>
+      </w:pPr>
+      <w:r>
+        <w:rPr>
+          <w:color w:val="1D2D3E"/>
+          <w:sz w:val="22"/>
+          <w:szCs w:val="22"/>
+        </w:rPr>
+        <w:t xml:space="preserve">  PERIOD_OPTS array replaces hardcoded [7,14,30] with 6 options: 7d/14d/30d/60d/90d/All</w:t>
+      </w:r>
+    </w:p>
+    <w:p>
+      <w:pPr>
+        <w:pStyle w:val="ListParagraph"/>
+        <w:numPr>
+          <w:ilvl w:val="1"/>
+          <w:numId w:val="1"/>
+        </w:numPr>
+        <w:spacing w:after="40"/>
+      </w:pPr>
+      <w:r>
+        <w:rPr>
+          <w:color w:val="1D2D3E"/>
+          <w:sz w:val="22"/>
+          <w:szCs w:val="22"/>
+        </w:rPr>
+        <w:t xml:space="preserve">  Period 0 skips slice (shows full agingHistory); other periods use agingHistory.slice(-period)</w:t>
+      </w:r>
+    </w:p>
+    <w:p>
+      <w:pPr>
+        <w:pStyle w:val="ListParagraph"/>
+        <w:numPr>
+          <w:ilvl w:val="1"/>
+          <w:numId w:val="1"/>
+        </w:numPr>
+        <w:spacing w:after="40"/>
+      </w:pPr>
+      <w:r>
+        <w:rPr>
+          <w:color w:val="1D2D3E"/>
+          <w:sz w:val="22"/>
+          <w:szCs w:val="22"/>
+        </w:rPr>
+        <w:t xml:space="preserve">  SectionHeader meta now shows 'N days · M total' (period length vs full history length)</w:t>
       </w:r>
     </w:p>
     <w:p>

</xml_diff>

<commit_message>
docs(session-67): update PROGRESS.md, generate-docs.js, and FEATURES.docx with Session 67 changelog
https://claude.ai/code/session_01BfxwcM6EfFEdj8eLuEEcKN
</commit_message>
<xml_diff>
--- a/FEATURES.docx
+++ b/FEATURES.docx
@@ -37236,6 +37236,228 @@
           </w:p>
         </w:tc>
       </w:tr>
+      <w:tr>
+        <w:tc>
+          <w:p>
+            <w:pPr>
+              <w:spacing w:after="40" w:before="40"/>
+            </w:pPr>
+            <w:r>
+              <w:rPr>
+                <w:b w:val="false"/>
+                <w:bCs w:val="false"/>
+                <w:color w:val="1D2D3E"/>
+                <w:sz w:val="20"/>
+                <w:szCs w:val="20"/>
+              </w:rPr>
+              <w:t xml:space="preserve">Session 67</w:t>
+            </w:r>
+          </w:p>
+        </w:tc>
+        <w:tc>
+          <w:p>
+            <w:pPr>
+              <w:spacing w:after="40" w:before="40"/>
+            </w:pPr>
+            <w:r>
+              <w:rPr>
+                <w:b w:val="false